<commit_message>
feat: Sonic Youth texture state machine complete
Co-authored-by: Cursor <cursoragent@cursor.com>
</commit_message>
<xml_diff>
--- a/docs/COMPOSER_OS_PLAYBOOK.docx
+++ b/docs/COMPOSER_OS_PLAYBOOK.docx
@@ -1275,6 +1275,940 @@
       </w:r>
       <w:r>
         <w:t xml:space="preserve"> for student arrangements—did their manual reharmonization respect similar constraints?</w:t>
+      </w:r>
+    </w:p>
+    <w:p>
+      <w:pPr>
+        <w:pStyle w:val="Heading2"/>
+        <w:spacing w:after="100" w:before="160"/>
+      </w:pPr>
+      <w:r>
+        <w:t xml:space="preserve">Sonic Youth (dual guitar, noise harmony, and texture)</w:t>
+      </w:r>
+    </w:p>
+    <w:p>
+      <w:pPr>
+        <w:spacing w:after="160"/>
+      </w:pPr>
+      <w:r>
+        <w:rPr>
+          <w:b/>
+          <w:bCs/>
+        </w:rPr>
+        <w:t xml:space="preserve">Sonic Youth</w:t>
+      </w:r>
+      <w:r>
+        <w:t xml:space="preserve"> is a </w:t>
+      </w:r>
+      <w:r>
+        <w:rPr>
+          <w:b/>
+          <w:bCs/>
+        </w:rPr>
+        <w:t xml:space="preserve">duo / dual-electric</w:t>
+      </w:r>
+      <w:r>
+        <w:t xml:space="preserve"> slice: harmony uses </w:t>
+      </w:r>
+      <w:r>
+        <w:rPr>
+          <w:b/>
+          <w:bCs/>
+        </w:rPr>
+        <w:t xml:space="preserve">`sy:*`</w:t>
+      </w:r>
+      <w:r>
+        <w:t xml:space="preserve"> device receipts and </w:t>
+      </w:r>
+      <w:r>
+        <w:rPr>
+          <w:b/>
+          <w:bCs/>
+        </w:rPr>
+        <w:t xml:space="preserve">`sonicYouthEffectiveHarmonyBars`</w:t>
+      </w:r>
+      <w:r>
+        <w:t xml:space="preserve"> (same </w:t>
+      </w:r>
+      <w:r>
+        <w:rPr>
+          <w:b/>
+          <w:bCs/>
+        </w:rPr>
+        <w:t xml:space="preserve">getChordForBar</w:t>
+      </w:r>
+      <w:r>
+        <w:t xml:space="preserve"> truth pattern as other locked-harmony writers). On comp </w:t>
+      </w:r>
+      <w:r>
+        <w:rPr>
+          <w:b/>
+          <w:bCs/>
+        </w:rPr>
+        <w:t xml:space="preserve">`ChordEvent`s</w:t>
+      </w:r>
+      <w:r>
+        <w:t xml:space="preserve">, optional metadata lives on </w:t>
+      </w:r>
+      <w:r>
+        <w:rPr>
+          <w:b/>
+          <w:bCs/>
+        </w:rPr>
+        <w:t xml:space="preserve">`ChordEvent.sonicYouth`</w:t>
+      </w:r>
+      <w:r>
+        <w:t xml:space="preserve"> (`SonicYouthExtension` in </w:t>
+      </w:r>
+      <w:r>
+        <w:rPr>
+          <w:b/>
+          <w:bCs/>
+        </w:rPr>
+        <w:t xml:space="preserve">`sonicYouthChordTypes.ts`</w:t>
+      </w:r>
+      <w:r>
+        <w:t xml:space="preserve">).</w:t>
+      </w:r>
+    </w:p>
+    <w:p>
+      <w:pPr>
+        <w:spacing w:after="160"/>
+      </w:pPr>
+      <w:r>
+        <w:rPr>
+          <w:b/>
+          <w:bCs/>
+        </w:rPr>
+        <w:t xml:space="preserve">Two-guitar architecture</w:t>
+      </w:r>
+    </w:p>
+    <w:p>
+      <w:pPr>
+        <w:spacing w:after="80"/>
+        <w:ind w:left="360" w:hanging="260"/>
+      </w:pPr>
+      <w:r>
+        <w:t xml:space="preserve">• </w:t>
+      </w:r>
+      <w:r>
+        <w:rPr>
+          <w:b/>
+          <w:bCs/>
+        </w:rPr>
+        <w:t xml:space="preserve">`guitar1` / `guitar2`:</w:t>
+      </w:r>
+      <w:r>
+        <w:t xml:space="preserve"> each holds a </w:t>
+      </w:r>
+      <w:r>
+        <w:rPr>
+          <w:b/>
+          <w:bCs/>
+        </w:rPr>
+        <w:t xml:space="preserve">`GuitarTuningState`</w:t>
+      </w:r>
+      <w:r>
+        <w:t xml:space="preserve"> (tuning id, open string MIDI grid, shape id, fret pattern, string mask, </w:t>
+      </w:r>
+      <w:r>
+        <w:rPr>
+          <w:b/>
+          <w:bCs/>
+        </w:rPr>
+        <w:t xml:space="preserve">drone</w:t>
+      </w:r>
+      <w:r>
+        <w:t xml:space="preserve"> string mask, </w:t>
+      </w:r>
+      <w:r>
+        <w:rPr>
+          <w:b/>
+          <w:bCs/>
+        </w:rPr>
+        <w:t xml:space="preserve">noise</w:t>
+      </w:r>
+      <w:r>
+        <w:t xml:space="preserve"> level). This models </w:t>
+      </w:r>
+      <w:r>
+        <w:rPr>
+          <w:b/>
+          <w:bCs/>
+        </w:rPr>
+        <w:t xml:space="preserve">separate tunings</w:t>
+      </w:r>
+      <w:r>
+        <w:t xml:space="preserve"> and </w:t>
+      </w:r>
+      <w:r>
+        <w:rPr>
+          <w:b/>
+          <w:bCs/>
+        </w:rPr>
+        <w:t xml:space="preserve">prepared / feedback</w:t>
+      </w:r>
+      <w:r>
+        <w:t xml:space="preserve"> colour per instrument.</w:t>
+      </w:r>
+    </w:p>
+    <w:p>
+      <w:pPr>
+        <w:spacing w:after="80"/>
+        <w:ind w:left="360" w:hanging="260"/>
+      </w:pPr>
+      <w:r>
+        <w:t xml:space="preserve">• </w:t>
+      </w:r>
+      <w:r>
+        <w:rPr>
+          <w:b/>
+          <w:bCs/>
+        </w:rPr>
+        <w:t xml:space="preserve">`interGuitarDissonance`:</w:t>
+      </w:r>
+      <w:r>
+        <w:t xml:space="preserve"> compact cross-guitar friction (</w:t>
+      </w:r>
+      <w:r>
+        <w:rPr>
+          <w:b/>
+          <w:bCs/>
+        </w:rPr>
+        <w:t xml:space="preserve">score</w:t>
+      </w:r>
+      <w:r>
+        <w:t xml:space="preserve"> 0–1, interval tallies, </w:t>
+      </w:r>
+      <w:r>
+        <w:rPr>
+          <w:b/>
+          <w:bCs/>
+        </w:rPr>
+        <w:t xml:space="preserve">`SYDissonancePreset`</w:t>
+      </w:r>
+      <w:r>
+        <w:t xml:space="preserve">: low / medium / high friction). It pairs with the texture engine’s </w:t>
+      </w:r>
+      <w:r>
+        <w:rPr>
+          <w:b/>
+          <w:bCs/>
+        </w:rPr>
+        <w:t xml:space="preserve">dissonance</w:t>
+      </w:r>
+      <w:r>
+        <w:t xml:space="preserve"> input.</w:t>
+      </w:r>
+    </w:p>
+    <w:p>
+      <w:pPr>
+        <w:spacing w:after="160"/>
+      </w:pPr>
+      <w:r>
+        <w:rPr>
+          <w:b/>
+          <w:bCs/>
+        </w:rPr>
+        <w:t xml:space="preserve">`SYTextureState` (macro phase, four values)</w:t>
+      </w:r>
+    </w:p>
+    <w:p>
+      <w:pPr>
+        <w:spacing w:after="160"/>
+      </w:pPr>
+      <w:r>
+        <w:t xml:space="preserve">1. </w:t>
+      </w:r>
+      <w:r>
+        <w:rPr>
+          <w:b/>
+          <w:bCs/>
+        </w:rPr>
+        <w:t xml:space="preserve">`riff`</w:t>
+      </w:r>
+      <w:r>
+        <w:t xml:space="preserve"> — cellular, repeating material. 2. </w:t>
+      </w:r>
+      <w:r>
+        <w:rPr>
+          <w:b/>
+          <w:bCs/>
+        </w:rPr>
+        <w:t xml:space="preserve">`shimmer`</w:t>
+      </w:r>
+      <w:r>
+        <w:t xml:space="preserve"> — sustained, beating layer. 3. </w:t>
+      </w:r>
+      <w:r>
+        <w:rPr>
+          <w:b/>
+          <w:bCs/>
+        </w:rPr>
+        <w:t xml:space="preserve">`noise_wall`</w:t>
+      </w:r>
+      <w:r>
+        <w:t xml:space="preserve"> — high-density / feedback-leaning wall. 4. </w:t>
+      </w:r>
+      <w:r>
+        <w:rPr>
+          <w:b/>
+          <w:bCs/>
+        </w:rPr>
+        <w:t xml:space="preserve">`clearing`</w:t>
+      </w:r>
+      <w:r>
+        <w:t xml:space="preserve"> — drop in weight (reset / space).</w:t>
+      </w:r>
+    </w:p>
+    <w:p>
+      <w:pPr>
+        <w:spacing w:after="160"/>
+      </w:pPr>
+      <w:r>
+        <w:rPr>
+          <w:b/>
+          <w:bCs/>
+        </w:rPr>
+        <w:t xml:space="preserve">`textureState`</w:t>
+      </w:r>
+      <w:r>
+        <w:t xml:space="preserve"> on </w:t>
+      </w:r>
+      <w:r>
+        <w:rPr>
+          <w:b/>
+          <w:bCs/>
+        </w:rPr>
+        <w:t xml:space="preserve">`SonicYouthExtension`</w:t>
+      </w:r>
+      <w:r>
+        <w:t xml:space="preserve"> is the </w:t>
+      </w:r>
+      <w:r>
+        <w:rPr>
+          <w:b/>
+          <w:bCs/>
+        </w:rPr>
+        <w:t xml:space="preserve">current</w:t>
+      </w:r>
+      <w:r>
+        <w:t xml:space="preserve"> phase for that bar (derived from a deterministic chain from bar 1). </w:t>
+      </w:r>
+      <w:r>
+        <w:rPr>
+          <w:b/>
+          <w:bCs/>
+        </w:rPr>
+        <w:t xml:space="preserve">`getNextTextureState(current, noiseLevel, dissonance)`</w:t>
+      </w:r>
+      <w:r>
+        <w:t xml:space="preserve"> (`sonicYouthTextureEngine.ts`) advances the cycle:</w:t>
+      </w:r>
+    </w:p>
+    <w:p>
+      <w:pPr>
+        <w:spacing w:after="80"/>
+        <w:ind w:left="360" w:hanging="260"/>
+      </w:pPr>
+      <w:r>
+        <w:t xml:space="preserve">• </w:t>
+      </w:r>
+      <w:r>
+        <w:t xml:space="preserve">Default edge order: </w:t>
+      </w:r>
+      <w:r>
+        <w:rPr>
+          <w:b/>
+          <w:bCs/>
+        </w:rPr>
+        <w:t xml:space="preserve">riff → shimmer → noise_wall → clearing → riff</w:t>
+      </w:r>
+      <w:r>
+        <w:t xml:space="preserve">.</w:t>
+      </w:r>
+    </w:p>
+    <w:p>
+      <w:pPr>
+        <w:spacing w:after="80"/>
+        <w:ind w:left="360" w:hanging="260"/>
+      </w:pPr>
+      <w:r>
+        <w:t xml:space="preserve">• </w:t>
+      </w:r>
+      <w:r>
+        <w:rPr>
+          <w:b/>
+          <w:bCs/>
+        </w:rPr>
+        <w:t xml:space="preserve">`clean`</w:t>
+      </w:r>
+      <w:r>
+        <w:t xml:space="preserve"> noise and/or </w:t>
+      </w:r>
+      <w:r>
+        <w:rPr>
+          <w:b/>
+          <w:bCs/>
+        </w:rPr>
+        <w:t xml:space="preserve">`low_friction`</w:t>
+      </w:r>
+      <w:r>
+        <w:t xml:space="preserve"> bias back toward the </w:t>
+      </w:r>
+      <w:r>
+        <w:rPr>
+          <w:b/>
+          <w:bCs/>
+        </w:rPr>
+        <w:t xml:space="preserve">riff / shimmer</w:t>
+      </w:r>
+      <w:r>
+        <w:t xml:space="preserve"> side (e.g. from </w:t>
+      </w:r>
+      <w:r>
+        <w:rPr>
+          <w:b/>
+          <w:bCs/>
+        </w:rPr>
+        <w:t xml:space="preserve">noise_wall</w:t>
+      </w:r>
+      <w:r>
+        <w:t xml:space="preserve">, the next step may be </w:t>
+      </w:r>
+      <w:r>
+        <w:rPr>
+          <w:b/>
+          <w:bCs/>
+        </w:rPr>
+        <w:t xml:space="preserve">shimmer</w:t>
+      </w:r>
+      <w:r>
+        <w:t xml:space="preserve"> instead of </w:t>
+      </w:r>
+      <w:r>
+        <w:rPr>
+          <w:b/>
+          <w:bCs/>
+        </w:rPr>
+        <w:t xml:space="preserve">clearing</w:t>
+      </w:r>
+      <w:r>
+        <w:t xml:space="preserve">).</w:t>
+      </w:r>
+    </w:p>
+    <w:p>
+      <w:pPr>
+        <w:spacing w:after="80"/>
+        <w:ind w:left="360" w:hanging="260"/>
+      </w:pPr>
+      <w:r>
+        <w:t xml:space="preserve">• </w:t>
+      </w:r>
+      <w:r>
+        <w:rPr>
+          <w:b/>
+          <w:bCs/>
+        </w:rPr>
+        <w:t xml:space="preserve">`feedback`</w:t>
+      </w:r>
+      <w:r>
+        <w:t xml:space="preserve"> noise and/or </w:t>
+      </w:r>
+      <w:r>
+        <w:rPr>
+          <w:b/>
+          <w:bCs/>
+        </w:rPr>
+        <w:t xml:space="preserve">`high_friction`</w:t>
+      </w:r>
+      <w:r>
+        <w:t xml:space="preserve"> bias toward </w:t>
+      </w:r>
+      <w:r>
+        <w:rPr>
+          <w:b/>
+          <w:bCs/>
+        </w:rPr>
+        <w:t xml:space="preserve">noise_wall</w:t>
+      </w:r>
+      <w:r>
+        <w:t xml:space="preserve"> (e.g. from </w:t>
+      </w:r>
+      <w:r>
+        <w:rPr>
+          <w:b/>
+          <w:bCs/>
+        </w:rPr>
+        <w:t xml:space="preserve">riff</w:t>
+      </w:r>
+      <w:r>
+        <w:t xml:space="preserve"> / </w:t>
+      </w:r>
+      <w:r>
+        <w:rPr>
+          <w:b/>
+          <w:bCs/>
+        </w:rPr>
+        <w:t xml:space="preserve">shimmer</w:t>
+      </w:r>
+      <w:r>
+        <w:t xml:space="preserve"> / </w:t>
+      </w:r>
+      <w:r>
+        <w:rPr>
+          <w:b/>
+          <w:bCs/>
+        </w:rPr>
+        <w:t xml:space="preserve">clearing</w:t>
+      </w:r>
+      <w:r>
+        <w:t xml:space="preserve">, the next step may jump to </w:t>
+      </w:r>
+      <w:r>
+        <w:rPr>
+          <w:b/>
+          <w:bCs/>
+        </w:rPr>
+        <w:t xml:space="preserve">noise_wall</w:t>
+      </w:r>
+      <w:r>
+        <w:t xml:space="preserve">).</w:t>
+      </w:r>
+    </w:p>
+    <w:p>
+      <w:pPr>
+        <w:spacing w:after="80"/>
+        <w:ind w:left="360" w:hanging="260"/>
+      </w:pPr>
+      <w:r>
+        <w:t xml:space="preserve">• </w:t>
+      </w:r>
+      <w:r>
+        <w:rPr>
+          <w:b/>
+          <w:bCs/>
+        </w:rPr>
+        <w:t xml:space="preserve">`prepared`</w:t>
+      </w:r>
+      <w:r>
+        <w:t xml:space="preserve"> (prepared-piano / prepared-guitar style noise) forces the next state to </w:t>
+      </w:r>
+      <w:r>
+        <w:rPr>
+          <w:b/>
+          <w:bCs/>
+        </w:rPr>
+        <w:t xml:space="preserve">`clearing`</w:t>
+      </w:r>
+      <w:r>
+        <w:t xml:space="preserve">.</w:t>
+      </w:r>
+    </w:p>
+    <w:p>
+      <w:pPr>
+        <w:spacing w:after="80"/>
+        <w:ind w:left="360" w:hanging="260"/>
+      </w:pPr>
+      <w:r>
+        <w:t xml:space="preserve">• </w:t>
+      </w:r>
+      <w:r>
+        <w:t xml:space="preserve">Combined biases use </w:t>
+      </w:r>
+      <w:r>
+        <w:rPr>
+          <w:b/>
+          <w:bCs/>
+        </w:rPr>
+        <w:t xml:space="preserve">dissonance</w:t>
+      </w:r>
+      <w:r>
+        <w:t xml:space="preserve"> first, then </w:t>
+      </w:r>
+      <w:r>
+        <w:rPr>
+          <w:b/>
+          <w:bCs/>
+        </w:rPr>
+        <w:t xml:space="preserve">noise level</w:t>
+      </w:r>
+      <w:r>
+        <w:t xml:space="preserve">, when both pull.</w:t>
+      </w:r>
+    </w:p>
+    <w:p>
+      <w:pPr>
+        <w:spacing w:after="160"/>
+      </w:pPr>
+      <w:r>
+        <w:rPr>
+          <w:b/>
+          <w:bCs/>
+        </w:rPr>
+        <w:t xml:space="preserve">Guards:</w:t>
+      </w:r>
+      <w:r>
+        <w:t xml:space="preserve"> </w:t>
+      </w:r>
+      <w:r>
+        <w:rPr>
+          <w:b/>
+          <w:bCs/>
+        </w:rPr>
+        <w:t xml:space="preserve">`isSonicYouthEvent`</w:t>
+      </w:r>
+      <w:r>
+        <w:t xml:space="preserve">, </w:t>
+      </w:r>
+      <w:r>
+        <w:rPr>
+          <w:b/>
+          <w:bCs/>
+        </w:rPr>
+        <w:t xml:space="preserve">`getSYTextureState`</w:t>
+      </w:r>
+      <w:r>
+        <w:t xml:space="preserve"> (`sonicYouthChordGuards.ts`).</w:t>
+      </w:r>
+    </w:p>
+    <w:p>
+      <w:pPr>
+        <w:spacing w:after="160"/>
+      </w:pPr>
+      <w:r>
+        <w:rPr>
+          <w:b/>
+          <w:bCs/>
+        </w:rPr>
+        <w:t xml:space="preserve">MusicXML (comp `ChordEvent` with `sonicYouth` only)</w:t>
+      </w:r>
+      <w:r>
+        <w:t xml:space="preserve"> — </w:t>
+      </w:r>
+      <w:r>
+        <w:rPr>
+          <w:b/>
+          <w:bCs/>
+        </w:rPr>
+        <w:t xml:space="preserve">`musicxmlExporter.ts`</w:t>
+      </w:r>
+      <w:r>
+        <w:t xml:space="preserve"> maps texture to the </w:t>
+      </w:r>
+      <w:r>
+        <w:rPr>
+          <w:b/>
+          <w:bCs/>
+        </w:rPr>
+        <w:t xml:space="preserve">first notehead</w:t>
+      </w:r>
+      <w:r>
+        <w:t xml:space="preserve"> of the chord (stacked tones unchanged):</w:t>
+      </w:r>
+    </w:p>
+    <w:tbl>
+      <w:tblPr>
+        <w:tblW w:type="pct" w:w="100%"/>
+        <w:tblBorders>
+          <w:top w:val="single" w:color="auto" w:sz="4"/>
+          <w:left w:val="single" w:color="auto" w:sz="4"/>
+          <w:bottom w:val="single" w:color="auto" w:sz="4"/>
+          <w:right w:val="single" w:color="auto" w:sz="4"/>
+          <w:insideH w:val="single" w:color="auto" w:sz="4"/>
+          <w:insideV w:val="single" w:color="auto" w:sz="4"/>
+        </w:tblBorders>
+      </w:tblPr>
+      <w:tblGrid>
+        <w:gridCol w:w="4500"/>
+        <w:gridCol w:w="4500"/>
+      </w:tblGrid>
+      <w:tr>
+        <w:tc>
+          <w:tcPr>
+            <w:tcW w:type="pct" w:w="4500%"/>
+          </w:tcPr>
+          <w:p>
+            <w:pPr>
+              <w:spacing w:after="60"/>
+            </w:pPr>
+            <w:r>
+              <w:t xml:space="preserve">Texture</w:t>
+            </w:r>
+          </w:p>
+        </w:tc>
+        <w:tc>
+          <w:tcPr>
+            <w:tcW w:type="pct" w:w="4500%"/>
+          </w:tcPr>
+          <w:p>
+            <w:pPr>
+              <w:spacing w:after="60"/>
+            </w:pPr>
+            <w:r>
+              <w:t xml:space="preserve">Notation / dynamics</w:t>
+            </w:r>
+          </w:p>
+        </w:tc>
+      </w:tr>
+      <w:tr>
+        <w:tc>
+          <w:tcPr>
+            <w:tcW w:type="pct" w:w="4500%"/>
+          </w:tcPr>
+          <w:p>
+            <w:pPr>
+              <w:spacing w:after="60"/>
+            </w:pPr>
+            <w:r>
+              <w:rPr>
+                <w:b/>
+                <w:bCs/>
+              </w:rPr>
+              <w:t xml:space="preserve">riff</w:t>
+            </w:r>
+          </w:p>
+        </w:tc>
+        <w:tc>
+          <w:tcPr>
+            <w:tcW w:type="pct" w:w="4500%"/>
+          </w:tcPr>
+          <w:p>
+            <w:pPr>
+              <w:spacing w:after="60"/>
+            </w:pPr>
+            <w:r>
+              <w:t xml:space="preserve">No extra dynamics or articulation XML.</w:t>
+            </w:r>
+          </w:p>
+        </w:tc>
+      </w:tr>
+      <w:tr>
+        <w:tc>
+          <w:tcPr>
+            <w:tcW w:type="pct" w:w="4500%"/>
+          </w:tcPr>
+          <w:p>
+            <w:pPr>
+              <w:spacing w:after="60"/>
+            </w:pPr>
+            <w:r>
+              <w:rPr>
+                <w:b/>
+                <w:bCs/>
+              </w:rPr>
+              <w:t xml:space="preserve">shimmer</w:t>
+            </w:r>
+          </w:p>
+        </w:tc>
+        <w:tc>
+          <w:tcPr>
+            <w:tcW w:type="pct" w:w="4500%"/>
+          </w:tcPr>
+          <w:p>
+            <w:pPr>
+              <w:spacing w:after="60"/>
+            </w:pPr>
+            <w:r>
+              <w:rPr>
+                <w:b/>
+                <w:bCs/>
+              </w:rPr>
+              <w:t xml:space="preserve">Tremolo</w:t>
+            </w:r>
+            <w:r>
+              <w:t xml:space="preserve"> ornament (`&lt;tremolo type="single"&gt;3&lt;/tremolo&gt;`) — *v1 uses tremolo; wavy-line is not emitted.*</w:t>
+            </w:r>
+          </w:p>
+        </w:tc>
+      </w:tr>
+      <w:tr>
+        <w:tc>
+          <w:tcPr>
+            <w:tcW w:type="pct" w:w="4500%"/>
+          </w:tcPr>
+          <w:p>
+            <w:pPr>
+              <w:spacing w:after="60"/>
+            </w:pPr>
+            <w:r>
+              <w:rPr>
+                <w:b/>
+                <w:bCs/>
+              </w:rPr>
+              <w:t xml:space="preserve">noise_wall</w:t>
+            </w:r>
+          </w:p>
+        </w:tc>
+        <w:tc>
+          <w:tcPr>
+            <w:tcW w:type="pct" w:w="4500%"/>
+          </w:tcPr>
+          <w:p>
+            <w:pPr>
+              <w:spacing w:after="60"/>
+            </w:pPr>
+            <w:r>
+              <w:rPr>
+                <w:b/>
+                <w:bCs/>
+              </w:rPr>
+              <w:t xml:space="preserve">Note</w:t>
+            </w:r>
+            <w:r>
+              <w:t xml:space="preserve"> `dynamics="127"` (loud / </w:t>
+            </w:r>
+            <w:r>
+              <w:rPr>
+                <w:b/>
+                <w:bCs/>
+              </w:rPr>
+              <w:t xml:space="preserve">fff</w:t>
+            </w:r>
+            <w:r>
+              <w:t xml:space="preserve">-class) + </w:t>
+            </w:r>
+            <w:r>
+              <w:rPr>
+                <w:b/>
+                <w:bCs/>
+              </w:rPr>
+              <w:t xml:space="preserve">`&lt;stress/&gt;`</w:t>
+            </w:r>
+            <w:r>
+              <w:t xml:space="preserve"> articulation.</w:t>
+            </w:r>
+          </w:p>
+        </w:tc>
+      </w:tr>
+      <w:tr>
+        <w:tc>
+          <w:tcPr>
+            <w:tcW w:type="pct" w:w="4500%"/>
+          </w:tcPr>
+          <w:p>
+            <w:pPr>
+              <w:spacing w:after="60"/>
+            </w:pPr>
+            <w:r>
+              <w:rPr>
+                <w:b/>
+                <w:bCs/>
+              </w:rPr>
+              <w:t xml:space="preserve">clearing</w:t>
+            </w:r>
+          </w:p>
+        </w:tc>
+        <w:tc>
+          <w:tcPr>
+            <w:tcW w:type="pct" w:w="4500%"/>
+          </w:tcPr>
+          <w:p>
+            <w:pPr>
+              <w:spacing w:after="60"/>
+            </w:pPr>
+            <w:r>
+              <w:rPr>
+                <w:b/>
+                <w:bCs/>
+              </w:rPr>
+              <w:t xml:space="preserve">Note</w:t>
+            </w:r>
+            <w:r>
+              <w:t xml:space="preserve"> `dynamics="24"` (soft / </w:t>
+            </w:r>
+            <w:r>
+              <w:rPr>
+                <w:b/>
+                <w:bCs/>
+              </w:rPr>
+              <w:t xml:space="preserve">ppp</w:t>
+            </w:r>
+            <w:r>
+              <w:t xml:space="preserve">-class); no extra articulation.</w:t>
+            </w:r>
+          </w:p>
+        </w:tc>
+      </w:tr>
+    </w:tbl>
+    <w:p>
+      <w:pPr>
+        <w:spacing w:after="160"/>
+      </w:pPr>
+    </w:p>
+    <w:p>
+      <w:pPr>
+        <w:spacing w:after="160"/>
+      </w:pPr>
+      <w:r>
+        <w:t xml:space="preserve">Regression: smoke suite </w:t>
+      </w:r>
+      <w:r>
+        <w:rPr>
+          <w:b/>
+          <w:bCs/>
+        </w:rPr>
+        <w:t xml:space="preserve">`Sonic Youth texture + MusicXML augmentation`</w:t>
+      </w:r>
+      <w:r>
+        <w:t xml:space="preserve"> (`core/score-model/__tests__/sonicYouthTexture.test.ts`).</w:t>
+      </w:r>
+    </w:p>
+    <w:p>
+      <w:pPr>
+        <w:pStyle w:val="Heading2"/>
+        <w:spacing w:after="100" w:before="160"/>
+      </w:pPr>
+      <w:r>
+        <w:t xml:space="preserve">Scenario 9b: Sonic Youth texture in the host</w:t>
+      </w:r>
+    </w:p>
+    <w:p>
+      <w:pPr>
+        <w:spacing w:after="160"/>
+      </w:pPr>
+      <w:r>
+        <w:t xml:space="preserve">After import, </w:t>
+      </w:r>
+      <w:r>
+        <w:rPr>
+          <w:b/>
+          <w:bCs/>
+        </w:rPr>
+        <w:t xml:space="preserve">dynamics</w:t>
+      </w:r>
+      <w:r>
+        <w:t xml:space="preserve"> and </w:t>
+      </w:r>
+      <w:r>
+        <w:rPr>
+          <w:b/>
+          <w:bCs/>
+        </w:rPr>
+        <w:t xml:space="preserve">tremolo</w:t>
+      </w:r>
+      <w:r>
+        <w:t xml:space="preserve"> are host-dependent for playback—use this mapping to </w:t>
+      </w:r>
+      <w:r>
+        <w:rPr>
+          <w:b/>
+          <w:bCs/>
+        </w:rPr>
+        <w:t xml:space="preserve">teach</w:t>
+      </w:r>
+      <w:r>
+        <w:t xml:space="preserve"> texture </w:t>
+      </w:r>
+      <w:r>
+        <w:rPr>
+          <w:b/>
+          <w:bCs/>
+        </w:rPr>
+        <w:t xml:space="preserve">intent</w:t>
+      </w:r>
+      <w:r>
+        <w:t xml:space="preserve"> (wall vs clearing), not guaranteed studio distortion.</w:t>
       </w:r>
     </w:p>
     <w:p>

</xml_diff>

<commit_message>
docs: playbook — Real Book import, Joni, alternate tunings, transpose, Fagen/Evans
Co-authored-by: Cursor <cursoragent@cursor.com>
</commit_message>
<xml_diff>
--- a/docs/COMPOSER_OS_PLAYBOOK.docx
+++ b/docs/COMPOSER_OS_PLAYBOOK.docx
@@ -118,6 +118,895 @@
         <w:spacing w:after="120" w:before="200"/>
       </w:pPr>
       <w:r>
+        <w:t xml:space="preserve">Real Book MusicXML import</w:t>
+      </w:r>
+    </w:p>
+    <w:p>
+      <w:pPr>
+        <w:spacing w:after="160"/>
+      </w:pPr>
+      <w:r>
+        <w:t xml:space="preserve">Charts saved as </w:t>
+      </w:r>
+      <w:r>
+        <w:rPr>
+          <w:b/>
+          <w:bCs/>
+        </w:rPr>
+        <w:t xml:space="preserve">MusicXML</w:t>
+      </w:r>
+      <w:r>
+        <w:t xml:space="preserve"> (Finale / MuseScore / Sibelius </w:t>
+      </w:r>
+      <w:r>
+        <w:rPr>
+          <w:b/>
+          <w:bCs/>
+        </w:rPr>
+        <w:t xml:space="preserve">partwise</w:t>
+      </w:r>
+      <w:r>
+        <w:t xml:space="preserve"> export) can be fed through the </w:t>
+      </w:r>
+      <w:r>
+        <w:rPr>
+          <w:b/>
+          <w:bCs/>
+        </w:rPr>
+        <w:t xml:space="preserve">lead-sheet importer</w:t>
+      </w:r>
+      <w:r>
+        <w:t xml:space="preserve"> for harmony timelines, keys, repeats, and (limited) melody extraction. This section matches what the engine’s </w:t>
+      </w:r>
+      <w:r>
+        <w:rPr>
+          <w:b/>
+          <w:bCs/>
+        </w:rPr>
+        <w:t xml:space="preserve">Real Book stress</w:t>
+      </w:r>
+      <w:r>
+        <w:t xml:space="preserve"> regression exercises (`engines/composer-os-v2/tests/realBookStressTest.test.ts`, smoke suite </w:t>
+      </w:r>
+      <w:r>
+        <w:rPr>
+          <w:b/>
+          <w:bCs/>
+        </w:rPr>
+        <w:t xml:space="preserve">Real Book MusicXML stress</w:t>
+      </w:r>
+      <w:r>
+        <w:t xml:space="preserve">).</w:t>
+      </w:r>
+    </w:p>
+    <w:p>
+      <w:pPr>
+        <w:pStyle w:val="Heading2"/>
+        <w:spacing w:after="100" w:before="160"/>
+      </w:pPr>
+      <w:r>
+        <w:t xml:space="preserve">What the stress test validates</w:t>
+      </w:r>
+    </w:p>
+    <w:p>
+      <w:pPr>
+        <w:spacing w:after="80"/>
+        <w:ind w:left="360" w:hanging="260"/>
+      </w:pPr>
+      <w:r>
+        <w:t xml:space="preserve">• </w:t>
+      </w:r>
+      <w:r>
+        <w:rPr>
+          <w:b/>
+          <w:bCs/>
+        </w:rPr>
+        <w:t xml:space="preserve">Repeat navigation</w:t>
+      </w:r>
+      <w:r>
+        <w:t xml:space="preserve"> — `&lt;barline&gt;` forward/back repeats, </w:t>
+      </w:r>
+      <w:r>
+        <w:rPr>
+          <w:b/>
+          <w:bCs/>
+        </w:rPr>
+        <w:t xml:space="preserve">volta</w:t>
+      </w:r>
+      <w:r>
+        <w:t xml:space="preserve"> (`&lt;ending&gt;` start/stop), </w:t>
+      </w:r>
+      <w:r>
+        <w:rPr>
+          <w:b/>
+          <w:bCs/>
+        </w:rPr>
+        <w:t xml:space="preserve">segno</w:t>
+      </w:r>
+      <w:r>
+        <w:t xml:space="preserve"> / </w:t>
+      </w:r>
+      <w:r>
+        <w:rPr>
+          <w:b/>
+          <w:bCs/>
+        </w:rPr>
+        <w:t xml:space="preserve">D.S.</w:t>
+      </w:r>
+      <w:r>
+        <w:t xml:space="preserve"> / </w:t>
+      </w:r>
+      <w:r>
+        <w:rPr>
+          <w:b/>
+          <w:bCs/>
+        </w:rPr>
+        <w:t xml:space="preserve">To Coda</w:t>
+      </w:r>
+      <w:r>
+        <w:t xml:space="preserve"> / </w:t>
+      </w:r>
+      <w:r>
+        <w:rPr>
+          <w:b/>
+          <w:bCs/>
+        </w:rPr>
+        <w:t xml:space="preserve">coda</w:t>
+      </w:r>
+      <w:r>
+        <w:t xml:space="preserve"> directions and `&lt;sound&gt;` jumps (`expandMeasureVisits` in </w:t>
+      </w:r>
+      <w:r>
+        <w:rPr>
+          <w:b/>
+          <w:bCs/>
+        </w:rPr>
+        <w:t xml:space="preserve">`leadSheetMusicXmlImport.ts`</w:t>
+      </w:r>
+      <w:r>
+        <w:t xml:space="preserve"> produces a deterministic visit order).</w:t>
+      </w:r>
+    </w:p>
+    <w:p>
+      <w:pPr>
+        <w:spacing w:after="80"/>
+        <w:ind w:left="360" w:hanging="260"/>
+      </w:pPr>
+      <w:r>
+        <w:t xml:space="preserve">• </w:t>
+      </w:r>
+      <w:r>
+        <w:rPr>
+          <w:b/>
+          <w:bCs/>
+        </w:rPr>
+        <w:t xml:space="preserve">Key changes</w:t>
+      </w:r>
+      <w:r>
+        <w:t xml:space="preserve"> — mid-score `&lt;attributes&gt;&lt;key&gt;&lt;fifths&gt;…&lt;/fifths&gt;&lt;/key&gt;` blocks populate </w:t>
+      </w:r>
+      <w:r>
+        <w:rPr>
+          <w:b/>
+          <w:bCs/>
+        </w:rPr>
+        <w:t xml:space="preserve">`LeadSheet.keyChanges`</w:t>
+      </w:r>
+      <w:r>
+        <w:t xml:space="preserve"> (bar index aligns with the importer’s logical bar mapping).</w:t>
+      </w:r>
+    </w:p>
+    <w:p>
+      <w:pPr>
+        <w:spacing w:after="80"/>
+        <w:ind w:left="360" w:hanging="260"/>
+      </w:pPr>
+      <w:r>
+        <w:t xml:space="preserve">• </w:t>
+      </w:r>
+      <w:r>
+        <w:rPr>
+          <w:b/>
+          <w:bCs/>
+        </w:rPr>
+        <w:t xml:space="preserve">Complex rhythm / chords</w:t>
+      </w:r>
+      <w:r>
+        <w:t xml:space="preserve"> — high `&lt;divisions&gt;` grids and multiple `&lt;harmony&gt;` elements per measure, including </w:t>
+      </w:r>
+      <w:r>
+        <w:rPr>
+          <w:b/>
+          <w:bCs/>
+        </w:rPr>
+        <w:t xml:space="preserve">`&lt;offset&gt;`</w:t>
+      </w:r>
+      <w:r>
+        <w:t xml:space="preserve"> (divisions from measure start) → beat-accurate </w:t>
+      </w:r>
+      <w:r>
+        <w:rPr>
+          <w:b/>
+          <w:bCs/>
+        </w:rPr>
+        <w:t xml:space="preserve">`importedHarmonyTimeline`</w:t>
+      </w:r>
+      <w:r>
+        <w:t xml:space="preserve"> entries.</w:t>
+      </w:r>
+    </w:p>
+    <w:p>
+      <w:pPr>
+        <w:spacing w:after="80"/>
+        <w:ind w:left="360" w:hanging="260"/>
+      </w:pPr>
+      <w:r>
+        <w:t xml:space="preserve">• </w:t>
+      </w:r>
+      <w:r>
+        <w:rPr>
+          <w:b/>
+          <w:bCs/>
+        </w:rPr>
+        <w:t xml:space="preserve">Multiple voices</w:t>
+      </w:r>
+      <w:r>
+        <w:t xml:space="preserve"> — `&lt;voice&gt;1&lt;/voice&gt;` vs `&lt;voice&gt;2&lt;/voice&gt;`: chord symbols still parse; </w:t>
+      </w:r>
+      <w:r>
+        <w:rPr>
+          <w:b/>
+          <w:bCs/>
+        </w:rPr>
+        <w:t xml:space="preserve">voice 1</w:t>
+      </w:r>
+      <w:r>
+        <w:t xml:space="preserve"> drives </w:t>
+      </w:r>
+      <w:r>
+        <w:rPr>
+          <w:b/>
+          <w:bCs/>
+        </w:rPr>
+        <w:t xml:space="preserve">`melodyEvents`</w:t>
+      </w:r>
+      <w:r>
+        <w:t xml:space="preserve">; extra voices log a warning (see limitations below).</w:t>
+      </w:r>
+    </w:p>
+    <w:p>
+      <w:pPr>
+        <w:pStyle w:val="Heading2"/>
+        <w:spacing w:after="100" w:before="160"/>
+      </w:pPr>
+      <w:r>
+        <w:t xml:space="preserve">How to import a Real Book chart</w:t>
+      </w:r>
+    </w:p>
+    <w:p>
+      <w:pPr>
+        <w:spacing w:after="160"/>
+      </w:pPr>
+      <w:r>
+        <w:t xml:space="preserve">1. Provide </w:t>
+      </w:r>
+      <w:r>
+        <w:rPr>
+          <w:b/>
+          <w:bCs/>
+        </w:rPr>
+        <w:t xml:space="preserve">score-partwise</w:t>
+      </w:r>
+      <w:r>
+        <w:t xml:space="preserve"> XML (not timewise). The importer reads the </w:t>
+      </w:r>
+      <w:r>
+        <w:rPr>
+          <w:b/>
+          <w:bCs/>
+        </w:rPr>
+        <w:t xml:space="preserve">first `&lt;part&gt;`</w:t>
+      </w:r>
+      <w:r>
+        <w:t xml:space="preserve"> as the lead line. 2. Entry points:</w:t>
+      </w:r>
+    </w:p>
+    <w:p>
+      <w:pPr>
+        <w:spacing w:after="80"/>
+        <w:ind w:left="360" w:hanging="260"/>
+      </w:pPr>
+      <w:r>
+        <w:t xml:space="preserve">• </w:t>
+      </w:r>
+      <w:r>
+        <w:rPr>
+          <w:b/>
+          <w:bCs/>
+        </w:rPr>
+        <w:t xml:space="preserve">`importLeadSheetFromMusicXml`</w:t>
+      </w:r>
+      <w:r>
+        <w:t xml:space="preserve"> — </w:t>
+      </w:r>
+      <w:r>
+        <w:rPr>
+          <w:b/>
+          <w:bCs/>
+        </w:rPr>
+        <w:t xml:space="preserve">`leadSheetMusicXmlImport.ts`</w:t>
+      </w:r>
+      <w:r>
+        <w:t xml:space="preserve"> (measures, chords, melody, repeats, keys).</w:t>
+      </w:r>
+    </w:p>
+    <w:p>
+      <w:pPr>
+        <w:spacing w:after="80"/>
+        <w:ind w:left="360" w:hanging="260"/>
+      </w:pPr>
+      <w:r>
+        <w:t xml:space="preserve">• </w:t>
+      </w:r>
+      <w:r>
+        <w:rPr>
+          <w:b/>
+          <w:bCs/>
+        </w:rPr>
+        <w:t xml:space="preserve">`parseImportedHarmonyEvent`</w:t>
+      </w:r>
+      <w:r>
+        <w:t xml:space="preserve"> — </w:t>
+      </w:r>
+      <w:r>
+        <w:rPr>
+          <w:b/>
+          <w:bCs/>
+        </w:rPr>
+        <w:t xml:space="preserve">`importedHarmonyTimeline.ts`</w:t>
+      </w:r>
+      <w:r>
+        <w:t xml:space="preserve"> — storage-only parse of each `&lt;harmony&gt;` chunk (root/kind/bass/degrees, time via divisions + offset).</w:t>
+      </w:r>
+    </w:p>
+    <w:p>
+      <w:pPr>
+        <w:spacing w:after="80"/>
+        <w:ind w:left="360" w:hanging="260"/>
+      </w:pPr>
+      <w:r>
+        <w:t xml:space="preserve">• </w:t>
+      </w:r>
+      <w:r>
+        <w:rPr>
+          <w:b/>
+          <w:bCs/>
+        </w:rPr>
+        <w:t xml:space="preserve">`sortImportedHarmonyTimeline`</w:t>
+      </w:r>
+      <w:r>
+        <w:t xml:space="preserve"> — stable ordering by bar, beat, event index.</w:t>
+      </w:r>
+    </w:p>
+    <w:p>
+      <w:pPr>
+        <w:spacing w:after="160"/>
+      </w:pPr>
+      <w:r>
+        <w:t xml:space="preserve">3. Display chord strings for the lead sheet come from </w:t>
+      </w:r>
+      <w:r>
+        <w:rPr>
+          <w:b/>
+          <w:bCs/>
+        </w:rPr>
+        <w:t xml:space="preserve">`parseHarmonySymbol`</w:t>
+      </w:r>
+      <w:r>
+        <w:t xml:space="preserve"> on the same `&lt;harmony&gt;` blocks; they are merged into </w:t>
+      </w:r>
+      <w:r>
+        <w:rPr>
+          <w:b/>
+          <w:bCs/>
+        </w:rPr>
+        <w:t xml:space="preserve">`LeadSheet.chordEvents`</w:t>
+      </w:r>
+      <w:r>
+        <w:t xml:space="preserve"> and deduped.</w:t>
+      </w:r>
+    </w:p>
+    <w:p>
+      <w:pPr>
+        <w:pStyle w:val="Heading2"/>
+        <w:spacing w:after="100" w:before="160"/>
+      </w:pPr>
+      <w:r>
+        <w:t xml:space="preserve">repeatMarkers (UniversalLeadSheet)</w:t>
+      </w:r>
+    </w:p>
+    <w:p>
+      <w:pPr>
+        <w:spacing w:after="160"/>
+      </w:pPr>
+      <w:r>
+        <w:rPr>
+          <w:b/>
+          <w:bCs/>
+        </w:rPr>
+        <w:t xml:space="preserve">`parseRepeatMarkers`</w:t>
+      </w:r>
+      <w:r>
+        <w:t xml:space="preserve"> scans each measure for barline </w:t>
+      </w:r>
+      <w:r>
+        <w:rPr>
+          <w:b/>
+          <w:bCs/>
+        </w:rPr>
+        <w:t xml:space="preserve">repeat forward/back</w:t>
+      </w:r>
+      <w:r>
+        <w:t xml:space="preserve"> and </w:t>
+      </w:r>
+      <w:r>
+        <w:rPr>
+          <w:b/>
+          <w:bCs/>
+        </w:rPr>
+        <w:t xml:space="preserve">`&lt;ending&gt;`</w:t>
+      </w:r>
+      <w:r>
+        <w:t xml:space="preserve"> volta tags. </w:t>
+      </w:r>
+      <w:r>
+        <w:rPr>
+          <w:b/>
+          <w:bCs/>
+        </w:rPr>
+        <w:t xml:space="preserve">`buildUniversalLeadSheetFromImportedLeadSheet`</w:t>
+      </w:r>
+      <w:r>
+        <w:t xml:space="preserve"> maps </w:t>
+      </w:r>
+      <w:r>
+        <w:rPr>
+          <w:b/>
+          <w:bCs/>
+        </w:rPr>
+        <w:t xml:space="preserve">`LeadSheet.repeatMarkers`</w:t>
+      </w:r>
+      <w:r>
+        <w:t xml:space="preserve"> onto </w:t>
+      </w:r>
+      <w:r>
+        <w:rPr>
+          <w:b/>
+          <w:bCs/>
+        </w:rPr>
+        <w:t xml:space="preserve">`UniversalRepeatMarker`</w:t>
+      </w:r>
+      <w:r>
+        <w:t xml:space="preserve">: </w:t>
+      </w:r>
+      <w:r>
+        <w:rPr>
+          <w:b/>
+          <w:bCs/>
+        </w:rPr>
+        <w:t xml:space="preserve">`repeat_start`</w:t>
+      </w:r>
+      <w:r>
+        <w:t xml:space="preserve">, </w:t>
+      </w:r>
+      <w:r>
+        <w:rPr>
+          <w:b/>
+          <w:bCs/>
+        </w:rPr>
+        <w:t xml:space="preserve">`repeat_end`</w:t>
+      </w:r>
+      <w:r>
+        <w:t xml:space="preserve">, </w:t>
+      </w:r>
+      <w:r>
+        <w:rPr>
+          <w:b/>
+          <w:bCs/>
+        </w:rPr>
+        <w:t xml:space="preserve">`ending_start`</w:t>
+      </w:r>
+      <w:r>
+        <w:t xml:space="preserve">, </w:t>
+      </w:r>
+      <w:r>
+        <w:rPr>
+          <w:b/>
+          <w:bCs/>
+        </w:rPr>
+        <w:t xml:space="preserve">`ending_stop`</w:t>
+      </w:r>
+      <w:r>
+        <w:t xml:space="preserve"> (optional </w:t>
+      </w:r>
+      <w:r>
+        <w:rPr>
+          <w:b/>
+          <w:bCs/>
+        </w:rPr>
+        <w:t xml:space="preserve">`endingNumber`</w:t>
+      </w:r>
+      <w:r>
+        <w:t xml:space="preserve">). Jump semantics (</w:t>
+      </w:r>
+      <w:r>
+        <w:rPr>
+          <w:b/>
+          <w:bCs/>
+        </w:rPr>
+        <w:t xml:space="preserve">D.C.</w:t>
+      </w:r>
+      <w:r>
+        <w:t xml:space="preserve">, </w:t>
+      </w:r>
+      <w:r>
+        <w:rPr>
+          <w:b/>
+          <w:bCs/>
+        </w:rPr>
+        <w:t xml:space="preserve">D.S.</w:t>
+      </w:r>
+      <w:r>
+        <w:t xml:space="preserve">, </w:t>
+      </w:r>
+      <w:r>
+        <w:rPr>
+          <w:b/>
+          <w:bCs/>
+        </w:rPr>
+        <w:t xml:space="preserve">coda</w:t>
+      </w:r>
+      <w:r>
+        <w:t xml:space="preserve">) affect </w:t>
+      </w:r>
+      <w:r>
+        <w:rPr>
+          <w:b/>
+          <w:bCs/>
+        </w:rPr>
+        <w:t xml:space="preserve">how many logical bars</w:t>
+      </w:r>
+      <w:r>
+        <w:t xml:space="preserve"> are visited, not a separate MusicXML “marker kind” in this contract—expect repeat/volta markers where the exporter emitted barlines.</w:t>
+      </w:r>
+    </w:p>
+    <w:p>
+      <w:pPr>
+        <w:pStyle w:val="Heading2"/>
+        <w:spacing w:after="100" w:before="160"/>
+      </w:pPr>
+      <w:r>
+        <w:t xml:space="preserve">Key changes</w:t>
+      </w:r>
+    </w:p>
+    <w:p>
+      <w:pPr>
+        <w:spacing w:after="160"/>
+      </w:pPr>
+      <w:r>
+        <w:t xml:space="preserve">When the importer records attributes for a measure (`emitKeyChangesAndSection`), each </w:t>
+      </w:r>
+      <w:r>
+        <w:rPr>
+          <w:b/>
+          <w:bCs/>
+        </w:rPr>
+        <w:t xml:space="preserve">`&lt;key&gt;`</w:t>
+      </w:r>
+      <w:r>
+        <w:t xml:space="preserve"> inside that measure appends </w:t>
+      </w:r>
+      <w:r>
+        <w:rPr>
+          <w:b/>
+          <w:bCs/>
+        </w:rPr>
+        <w:t xml:space="preserve">`{ bar, fifths, mode? }`</w:t>
+      </w:r>
+      <w:r>
+        <w:t xml:space="preserve"> to </w:t>
+      </w:r>
+      <w:r>
+        <w:rPr>
+          <w:b/>
+          <w:bCs/>
+        </w:rPr>
+        <w:t xml:space="preserve">`LeadSheet.keyChanges`</w:t>
+      </w:r>
+      <w:r>
+        <w:t xml:space="preserve">. The first key also seeds </w:t>
+      </w:r>
+      <w:r>
+        <w:rPr>
+          <w:b/>
+          <w:bCs/>
+        </w:rPr>
+        <w:t xml:space="preserve">`keySignature`</w:t>
+      </w:r>
+      <w:r>
+        <w:t xml:space="preserve"> when present.</w:t>
+      </w:r>
+    </w:p>
+    <w:p>
+      <w:pPr>
+        <w:pStyle w:val="Heading2"/>
+        <w:spacing w:after="100" w:before="160"/>
+      </w:pPr>
+      <w:r>
+        <w:t xml:space="preserve">Chord timeline (beats, offsets, collisions)</w:t>
+      </w:r>
+    </w:p>
+    <w:p>
+      <w:pPr>
+        <w:spacing w:after="80"/>
+        <w:ind w:left="360" w:hanging="260"/>
+      </w:pPr>
+      <w:r>
+        <w:t xml:space="preserve">• </w:t>
+      </w:r>
+      <w:r>
+        <w:t xml:space="preserve">Timeline events sort by </w:t>
+      </w:r>
+      <w:r>
+        <w:rPr>
+          <w:b/>
+          <w:bCs/>
+        </w:rPr>
+        <w:t xml:space="preserve">bar</w:t>
+      </w:r>
+      <w:r>
+        <w:t xml:space="preserve">, </w:t>
+      </w:r>
+      <w:r>
+        <w:rPr>
+          <w:b/>
+          <w:bCs/>
+        </w:rPr>
+        <w:t xml:space="preserve">beat</w:t>
+      </w:r>
+      <w:r>
+        <w:t xml:space="preserve"> (offset ÷ divisions), then </w:t>
+      </w:r>
+      <w:r>
+        <w:rPr>
+          <w:b/>
+          <w:bCs/>
+        </w:rPr>
+        <w:t xml:space="preserve">harmony index</w:t>
+      </w:r>
+      <w:r>
+        <w:t xml:space="preserve"> in the measure.</w:t>
+      </w:r>
+    </w:p>
+    <w:p>
+      <w:pPr>
+        <w:spacing w:after="80"/>
+        <w:ind w:left="360" w:hanging="260"/>
+      </w:pPr>
+      <w:r>
+        <w:t xml:space="preserve">• </w:t>
+      </w:r>
+      <w:r>
+        <w:rPr>
+          <w:b/>
+          <w:bCs/>
+        </w:rPr>
+        <w:t xml:space="preserve">`dedupeChordEvents`</w:t>
+      </w:r>
+      <w:r>
+        <w:t xml:space="preserve"> removes redundant duplicates and beat-0 carries from the prior bar; the stress test asserts </w:t>
+      </w:r>
+      <w:r>
+        <w:rPr>
+          <w:b/>
+          <w:bCs/>
+        </w:rPr>
+        <w:t xml:space="preserve">no conflicting chord symbols</w:t>
+      </w:r>
+      <w:r>
+        <w:t xml:space="preserve"> assigned to the same </w:t>
+      </w:r>
+      <w:r>
+        <w:rPr>
+          <w:b/>
+          <w:bCs/>
+        </w:rPr>
+        <w:t xml:space="preserve">(bar, beat)</w:t>
+      </w:r>
+      <w:r>
+        <w:t xml:space="preserve"> slot after processing.</w:t>
+      </w:r>
+    </w:p>
+    <w:p>
+      <w:pPr>
+        <w:pStyle w:val="Heading2"/>
+        <w:spacing w:after="100" w:before="160"/>
+      </w:pPr>
+      <w:r>
+        <w:t xml:space="preserve">Round-trip sanity check</w:t>
+      </w:r>
+    </w:p>
+    <w:p>
+      <w:pPr>
+        <w:spacing w:after="160"/>
+      </w:pPr>
+      <w:r>
+        <w:t xml:space="preserve">Regression pattern: </w:t>
+      </w:r>
+      <w:r>
+        <w:rPr>
+          <w:b/>
+          <w:bCs/>
+        </w:rPr>
+        <w:t xml:space="preserve">import</w:t>
+      </w:r>
+      <w:r>
+        <w:t xml:space="preserve"> → </w:t>
+      </w:r>
+      <w:r>
+        <w:rPr>
+          <w:b/>
+          <w:bCs/>
+        </w:rPr>
+        <w:t xml:space="preserve">`buildUniversalLeadSheetFromImportedLeadSheet`</w:t>
+      </w:r>
+      <w:r>
+        <w:t xml:space="preserve"> → minimal </w:t>
+      </w:r>
+      <w:r>
+        <w:rPr>
+          <w:b/>
+          <w:bCs/>
+        </w:rPr>
+        <w:t xml:space="preserve">`ScoreModel`</w:t>
+      </w:r>
+      <w:r>
+        <w:t xml:space="preserve"> (</w:t>
+      </w:r>
+      <w:r>
+        <w:rPr>
+          <w:b/>
+          <w:bCs/>
+        </w:rPr>
+        <w:t xml:space="preserve">`createPart`</w:t>
+      </w:r>
+      <w:r>
+        <w:t xml:space="preserve"> + measure-level </w:t>
+      </w:r>
+      <w:r>
+        <w:rPr>
+          <w:b/>
+          <w:bCs/>
+        </w:rPr>
+        <w:t xml:space="preserve">`chord`</w:t>
+      </w:r>
+      <w:r>
+        <w:t xml:space="preserve"> + whole-bar rests) → </w:t>
+      </w:r>
+      <w:r>
+        <w:rPr>
+          <w:b/>
+          <w:bCs/>
+        </w:rPr>
+        <w:t xml:space="preserve">`exportScoreModelToMusicXml`</w:t>
+      </w:r>
+      <w:r>
+        <w:t xml:space="preserve">. This validates </w:t>
+      </w:r>
+      <w:r>
+        <w:rPr>
+          <w:b/>
+          <w:bCs/>
+        </w:rPr>
+        <w:t xml:space="preserve">exporter robustness</w:t>
+      </w:r>
+      <w:r>
+        <w:t xml:space="preserve"> on representative imported harmony—not bit-identical round-trip to arbitrary publisher XML.</w:t>
+      </w:r>
+    </w:p>
+    <w:p>
+      <w:pPr>
+        <w:pStyle w:val="Heading2"/>
+        <w:spacing w:after="100" w:before="160"/>
+      </w:pPr>
+      <w:r>
+        <w:t xml:space="preserve">Known limitations</w:t>
+      </w:r>
+    </w:p>
+    <w:p>
+      <w:pPr>
+        <w:spacing w:after="80"/>
+        <w:ind w:left="360" w:hanging="260"/>
+      </w:pPr>
+      <w:r>
+        <w:t xml:space="preserve">• </w:t>
+      </w:r>
+      <w:r>
+        <w:rPr>
+          <w:b/>
+          <w:bCs/>
+        </w:rPr>
+        <w:t xml:space="preserve">Voices / staves:</w:t>
+      </w:r>
+      <w:r>
+        <w:t xml:space="preserve"> Melody capture is </w:t>
+      </w:r>
+      <w:r>
+        <w:rPr>
+          <w:b/>
+          <w:bCs/>
+        </w:rPr>
+        <w:t xml:space="preserve">voice 1</w:t>
+      </w:r>
+      <w:r>
+        <w:t xml:space="preserve">, </w:t>
+      </w:r>
+      <w:r>
+        <w:rPr>
+          <w:b/>
+          <w:bCs/>
+        </w:rPr>
+        <w:t xml:space="preserve">staff 1</w:t>
+      </w:r>
+      <w:r>
+        <w:t xml:space="preserve"> only; other voices and staves are skipped with warnings (</w:t>
+      </w:r>
+      <w:r>
+        <w:rPr>
+          <w:b/>
+          <w:bCs/>
+        </w:rPr>
+        <w:t xml:space="preserve">Phase 1</w:t>
+      </w:r>
+      <w:r>
+        <w:t xml:space="preserve"> lead-sheet scope).</w:t>
+      </w:r>
+    </w:p>
+    <w:p>
+      <w:pPr>
+        <w:spacing w:after="80"/>
+        <w:ind w:left="360" w:hanging="260"/>
+      </w:pPr>
+      <w:r>
+        <w:t xml:space="preserve">• </w:t>
+      </w:r>
+      <w:r>
+        <w:rPr>
+          <w:b/>
+          <w:bCs/>
+        </w:rPr>
+        <w:t xml:space="preserve">Publisher quirks:</w:t>
+      </w:r>
+      <w:r>
+        <w:t xml:space="preserve"> Nested repeats and rare jump combinations may diverge from another tool’s playback; importer </w:t>
+      </w:r>
+      <w:r>
+        <w:rPr>
+          <w:b/>
+          <w:bCs/>
+        </w:rPr>
+        <w:t xml:space="preserve">`warnings`</w:t>
+      </w:r>
+      <w:r>
+        <w:t xml:space="preserve"> describe caps and fallbacks.</w:t>
+      </w:r>
+    </w:p>
+    <w:p>
+      <w:pPr>
+        <w:pStyle w:val="Heading1"/>
+        <w:spacing w:after="120" w:before="200"/>
+      </w:pPr>
+      <w:r>
         <w:t xml:space="preserve">1. Introduction and scope</w:t>
       </w:r>
     </w:p>
@@ -1122,7 +2011,7 @@
         <w:spacing w:after="100" w:before="160"/>
       </w:pPr>
       <w:r>
-        <w:t xml:space="preserve">Scenario 7: Picking a writer for a lesson plan</w:t>
+        <w:t xml:space="preserve">Joni Mitchell (Song Mode — open tunings, modal harmony)</w:t>
       </w:r>
     </w:p>
     <w:p>
@@ -1130,57 +2019,229 @@
         <w:spacing w:after="160"/>
       </w:pPr>
       <w:r>
-        <w:t xml:space="preserve">Match </w:t>
-      </w:r>
-      <w:r>
-        <w:rPr>
-          <w:b/>
-          <w:bCs/>
-        </w:rPr>
-        <w:t xml:space="preserve">pedagogical goal</w:t>
-      </w:r>
-      <w:r>
-        <w:t xml:space="preserve"> to slice: e.g. </w:t>
-      </w:r>
-      <w:r>
-        <w:rPr>
-          <w:b/>
-          <w:bCs/>
-        </w:rPr>
-        <w:t xml:space="preserve">ii–V devices</w:t>
-      </w:r>
-      <w:r>
-        <w:t xml:space="preserve"> (bebop), </w:t>
-      </w:r>
-      <w:r>
-        <w:rPr>
-          <w:b/>
-          <w:bCs/>
-        </w:rPr>
-        <w:t xml:space="preserve">angular harmony</w:t>
-      </w:r>
-      <w:r>
-        <w:t xml:space="preserve"> (Monk/Hill), </w:t>
-      </w:r>
-      <w:r>
-        <w:rPr>
-          <w:b/>
-          <w:bCs/>
-        </w:rPr>
-        <w:t xml:space="preserve">theatre harmony</w:t>
-      </w:r>
-      <w:r>
-        <w:t xml:space="preserve"> (Sondheim/Bacharach), </w:t>
-      </w:r>
-      <w:r>
-        <w:rPr>
-          <w:b/>
-          <w:bCs/>
-        </w:rPr>
-        <w:t xml:space="preserve">modal ECM</w:t>
-      </w:r>
-      <w:r>
-        <w:t xml:space="preserve"> sparsity.</w:t>
+        <w:rPr>
+          <w:b/>
+          <w:bCs/>
+        </w:rPr>
+        <w:t xml:space="preserve">Joni Mitchell</w:t>
+      </w:r>
+      <w:r>
+        <w:t xml:space="preserve"> is a </w:t>
+      </w:r>
+      <w:r>
+        <w:rPr>
+          <w:b/>
+          <w:bCs/>
+        </w:rPr>
+        <w:t xml:space="preserve">shipped golden-path slice</w:t>
+      </w:r>
+      <w:r>
+        <w:t xml:space="preserve">: </w:t>
+      </w:r>
+      <w:r>
+        <w:rPr>
+          <w:b/>
+          <w:bCs/>
+        </w:rPr>
+        <w:t xml:space="preserve">`joniMitchellSlice.ts`</w:t>
+      </w:r>
+      <w:r>
+        <w:t xml:space="preserve">, </w:t>
+      </w:r>
+      <w:r>
+        <w:rPr>
+          <w:b/>
+          <w:bCs/>
+        </w:rPr>
+        <w:t xml:space="preserve">`jm:*`</w:t>
+      </w:r>
+      <w:r>
+        <w:t xml:space="preserve"> device receipts, </w:t>
+      </w:r>
+      <w:r>
+        <w:rPr>
+          <w:b/>
+          <w:bCs/>
+        </w:rPr>
+        <w:t xml:space="preserve">`joniMitchellEffectiveHarmonyBars`</w:t>
+      </w:r>
+      <w:r>
+        <w:t xml:space="preserve"> feeding </w:t>
+      </w:r>
+      <w:r>
+        <w:rPr>
+          <w:b/>
+          <w:bCs/>
+        </w:rPr>
+        <w:t xml:space="preserve">`getChordForBar`</w:t>
+      </w:r>
+      <w:r>
+        <w:t xml:space="preserve"> and locked MusicXML truth (same pattern as Radiohead / James Brown). Pools emphasize </w:t>
+      </w:r>
+      <w:r>
+        <w:rPr>
+          <w:b/>
+          <w:bCs/>
+        </w:rPr>
+        <w:t xml:space="preserve">modal</w:t>
+      </w:r>
+      <w:r>
+        <w:t xml:space="preserve">, </w:t>
+      </w:r>
+      <w:r>
+        <w:rPr>
+          <w:b/>
+          <w:bCs/>
+        </w:rPr>
+        <w:t xml:space="preserve">pedal</w:t>
+      </w:r>
+      <w:r>
+        <w:t xml:space="preserve">, and </w:t>
+      </w:r>
+      <w:r>
+        <w:rPr>
+          <w:b/>
+          <w:bCs/>
+        </w:rPr>
+        <w:t xml:space="preserve">open-tuning-friendly</w:t>
+      </w:r>
+      <w:r>
+        <w:t xml:space="preserve"> colours (</w:t>
+      </w:r>
+      <w:r>
+        <w:rPr>
+          <w:b/>
+          <w:bCs/>
+        </w:rPr>
+        <w:t xml:space="preserve">add9</w:t>
+      </w:r>
+      <w:r>
+        <w:t xml:space="preserve">, </w:t>
+      </w:r>
+      <w:r>
+        <w:rPr>
+          <w:b/>
+          <w:bCs/>
+        </w:rPr>
+        <w:t xml:space="preserve">sus2/sus4</w:t>
+      </w:r>
+      <w:r>
+        <w:t xml:space="preserve">, </w:t>
+      </w:r>
+      <w:r>
+        <w:rPr>
+          <w:b/>
+          <w:bCs/>
+        </w:rPr>
+        <w:t xml:space="preserve">slash</w:t>
+      </w:r>
+      <w:r>
+        <w:t xml:space="preserve"> pedals, </w:t>
+      </w:r>
+      <w:r>
+        <w:rPr>
+          <w:b/>
+          <w:bCs/>
+        </w:rPr>
+        <w:t xml:space="preserve">maj(add9)</w:t>
+      </w:r>
+      <w:r>
+        <w:t xml:space="preserve"> rows — see </w:t>
+      </w:r>
+      <w:r>
+        <w:rPr>
+          <w:b/>
+          <w:bCs/>
+        </w:rPr>
+        <w:t xml:space="preserve">`SONGWRITER_CHORD_POOLS.joni_mitchell`</w:t>
+      </w:r>
+      <w:r>
+        <w:t xml:space="preserve">).</w:t>
+      </w:r>
+    </w:p>
+    <w:p>
+      <w:pPr>
+        <w:spacing w:after="160"/>
+      </w:pPr>
+      <w:r>
+        <w:rPr>
+          <w:b/>
+          <w:bCs/>
+        </w:rPr>
+        <w:t xml:space="preserve">Alternate tuning:</w:t>
+      </w:r>
+      <w:r>
+        <w:t xml:space="preserve"> Style </w:t>
+      </w:r>
+      <w:r>
+        <w:rPr>
+          <w:b/>
+          <w:bCs/>
+        </w:rPr>
+        <w:t xml:space="preserve">`STYLE_JONI_MITCHELL`</w:t>
+      </w:r>
+      <w:r>
+        <w:t xml:space="preserve"> surfaces the </w:t>
+      </w:r>
+      <w:r>
+        <w:rPr>
+          <w:b/>
+          <w:bCs/>
+        </w:rPr>
+        <w:t xml:space="preserve">`joni_mitchell`</w:t>
+      </w:r>
+      <w:r>
+        <w:t xml:space="preserve"> </w:t>
+      </w:r>
+      <w:r>
+        <w:rPr>
+          <w:b/>
+          <w:bCs/>
+        </w:rPr>
+        <w:t xml:space="preserve">zone</w:t>
+      </w:r>
+      <w:r>
+        <w:t xml:space="preserve"> in </w:t>
+      </w:r>
+      <w:r>
+        <w:rPr>
+          <w:b/>
+          <w:bCs/>
+        </w:rPr>
+        <w:t xml:space="preserve">Generate</w:t>
+      </w:r>
+      <w:r>
+        <w:t xml:space="preserve">’s alternate-tuning selector (`alternateGuitarTunings.ts`). Voicing maps vs every preset remain a </w:t>
+      </w:r>
+      <w:r>
+        <w:rPr>
+          <w:b/>
+          <w:bCs/>
+        </w:rPr>
+        <w:t xml:space="preserve">follow-up</w:t>
+      </w:r>
+      <w:r>
+        <w:t xml:space="preserve"> where the Tonality Vault is thin—if comp feels disconnected, compare </w:t>
+      </w:r>
+      <w:r>
+        <w:rPr>
+          <w:b/>
+          <w:bCs/>
+        </w:rPr>
+        <w:t xml:space="preserve">standard</w:t>
+      </w:r>
+      <w:r>
+        <w:t xml:space="preserve"> vs labelled open preset on the same </w:t>
+      </w:r>
+      <w:r>
+        <w:rPr>
+          <w:b/>
+          <w:bCs/>
+        </w:rPr>
+        <w:t xml:space="preserve">seed</w:t>
+      </w:r>
+      <w:r>
+        <w:t xml:space="preserve">.</w:t>
       </w:r>
     </w:p>
     <w:p>
@@ -1189,7 +2250,7 @@
         <w:spacing w:after="100" w:before="160"/>
       </w:pPr>
       <w:r>
-        <w:t xml:space="preserve">Scenario 8: Duo vs single-line outputs</w:t>
+        <w:t xml:space="preserve">Scenario 7: Picking a writer for a lesson plan</w:t>
       </w:r>
     </w:p>
     <w:p>
@@ -1197,37 +2258,57 @@
         <w:spacing w:after="160"/>
       </w:pPr>
       <w:r>
-        <w:t xml:space="preserve">Duo paths emphasize </w:t>
-      </w:r>
-      <w:r>
-        <w:rPr>
-          <w:b/>
-          <w:bCs/>
-        </w:rPr>
-        <w:t xml:space="preserve">guitar/bass</w:t>
-      </w:r>
-      <w:r>
-        <w:t xml:space="preserve"> interplay; confirm </w:t>
-      </w:r>
-      <w:r>
-        <w:rPr>
-          <w:b/>
-          <w:bCs/>
-        </w:rPr>
-        <w:t xml:space="preserve">instrument names</w:t>
-      </w:r>
-      <w:r>
-        <w:t xml:space="preserve"> and </w:t>
-      </w:r>
-      <w:r>
-        <w:rPr>
-          <w:b/>
-          <w:bCs/>
-        </w:rPr>
-        <w:t xml:space="preserve">clefs</w:t>
-      </w:r>
-      <w:r>
-        <w:t xml:space="preserve"> in MusicXML if students import into Sibelius for homework.</w:t>
+        <w:t xml:space="preserve">Match </w:t>
+      </w:r>
+      <w:r>
+        <w:rPr>
+          <w:b/>
+          <w:bCs/>
+        </w:rPr>
+        <w:t xml:space="preserve">pedagogical goal</w:t>
+      </w:r>
+      <w:r>
+        <w:t xml:space="preserve"> to slice: e.g. </w:t>
+      </w:r>
+      <w:r>
+        <w:rPr>
+          <w:b/>
+          <w:bCs/>
+        </w:rPr>
+        <w:t xml:space="preserve">ii–V devices</w:t>
+      </w:r>
+      <w:r>
+        <w:t xml:space="preserve"> (bebop), </w:t>
+      </w:r>
+      <w:r>
+        <w:rPr>
+          <w:b/>
+          <w:bCs/>
+        </w:rPr>
+        <w:t xml:space="preserve">angular harmony</w:t>
+      </w:r>
+      <w:r>
+        <w:t xml:space="preserve"> (Monk/Hill), </w:t>
+      </w:r>
+      <w:r>
+        <w:rPr>
+          <w:b/>
+          <w:bCs/>
+        </w:rPr>
+        <w:t xml:space="preserve">theatre harmony</w:t>
+      </w:r>
+      <w:r>
+        <w:t xml:space="preserve"> (Sondheim/Bacharach), </w:t>
+      </w:r>
+      <w:r>
+        <w:rPr>
+          <w:b/>
+          <w:bCs/>
+        </w:rPr>
+        <w:t xml:space="preserve">modal ECM</w:t>
+      </w:r>
+      <w:r>
+        <w:t xml:space="preserve"> sparsity.</w:t>
       </w:r>
     </w:p>
     <w:p>
@@ -1236,7 +2317,7 @@
         <w:spacing w:after="100" w:before="160"/>
       </w:pPr>
       <w:r>
-        <w:t xml:space="preserve">Scenario 9: Writer receipts as rubric points</w:t>
+        <w:t xml:space="preserve">Scenario 8: Duo vs single-line outputs</w:t>
       </w:r>
     </w:p>
     <w:p>
@@ -1244,14 +2325,24 @@
         <w:spacing w:after="160"/>
       </w:pPr>
       <w:r>
-        <w:t xml:space="preserve">Turn </w:t>
-      </w:r>
-      <w:r>
-        <w:rPr>
-          <w:b/>
-          <w:bCs/>
-        </w:rPr>
-        <w:t xml:space="preserve">d1–d5 hit rates</w:t>
+        <w:t xml:space="preserve">Duo paths emphasize </w:t>
+      </w:r>
+      <w:r>
+        <w:rPr>
+          <w:b/>
+          <w:bCs/>
+        </w:rPr>
+        <w:t xml:space="preserve">guitar/bass</w:t>
+      </w:r>
+      <w:r>
+        <w:t xml:space="preserve"> interplay; confirm </w:t>
+      </w:r>
+      <w:r>
+        <w:rPr>
+          <w:b/>
+          <w:bCs/>
+        </w:rPr>
+        <w:t xml:space="preserve">instrument names</w:t>
       </w:r>
       <w:r>
         <w:t xml:space="preserve"> and </w:t>
@@ -1261,20 +2352,10 @@
           <w:b/>
           <w:bCs/>
         </w:rPr>
-        <w:t xml:space="preserve">guard receipts</w:t>
-      </w:r>
-      <w:r>
-        <w:t xml:space="preserve"> into a </w:t>
-      </w:r>
-      <w:r>
-        <w:rPr>
-          <w:b/>
-          <w:bCs/>
-        </w:rPr>
-        <w:t xml:space="preserve">checklist</w:t>
-      </w:r>
-      <w:r>
-        <w:t xml:space="preserve"> for student arrangements—did their manual reharmonization respect similar constraints?</w:t>
+        <w:t xml:space="preserve">clefs</w:t>
+      </w:r>
+      <w:r>
+        <w:t xml:space="preserve"> in MusicXML if students import into Sibelius for homework.</w:t>
       </w:r>
     </w:p>
     <w:p>
@@ -1283,6 +2364,53 @@
         <w:spacing w:after="100" w:before="160"/>
       </w:pPr>
       <w:r>
+        <w:t xml:space="preserve">Scenario 9: Writer receipts as rubric points</w:t>
+      </w:r>
+    </w:p>
+    <w:p>
+      <w:pPr>
+        <w:spacing w:after="160"/>
+      </w:pPr>
+      <w:r>
+        <w:t xml:space="preserve">Turn </w:t>
+      </w:r>
+      <w:r>
+        <w:rPr>
+          <w:b/>
+          <w:bCs/>
+        </w:rPr>
+        <w:t xml:space="preserve">d1–d5 hit rates</w:t>
+      </w:r>
+      <w:r>
+        <w:t xml:space="preserve"> and </w:t>
+      </w:r>
+      <w:r>
+        <w:rPr>
+          <w:b/>
+          <w:bCs/>
+        </w:rPr>
+        <w:t xml:space="preserve">guard receipts</w:t>
+      </w:r>
+      <w:r>
+        <w:t xml:space="preserve"> into a </w:t>
+      </w:r>
+      <w:r>
+        <w:rPr>
+          <w:b/>
+          <w:bCs/>
+        </w:rPr>
+        <w:t xml:space="preserve">checklist</w:t>
+      </w:r>
+      <w:r>
+        <w:t xml:space="preserve"> for student arrangements—did their manual reharmonization respect similar constraints?</w:t>
+      </w:r>
+    </w:p>
+    <w:p>
+      <w:pPr>
+        <w:pStyle w:val="Heading2"/>
+        <w:spacing w:after="100" w:before="160"/>
+      </w:pPr>
+      <w:r>
         <w:t xml:space="preserve">Sonic Youth (dual guitar, noise harmony, and texture)</w:t>
       </w:r>
     </w:p>
@@ -1295,6 +2423,121 @@
           <w:b/>
           <w:bCs/>
         </w:rPr>
+        <w:t xml:space="preserve">Still current (engine + docs alignment):</w:t>
+      </w:r>
+      <w:r>
+        <w:t xml:space="preserve"> </w:t>
+      </w:r>
+      <w:r>
+        <w:rPr>
+          <w:b/>
+          <w:bCs/>
+        </w:rPr>
+        <w:t xml:space="preserve">`sonicYouthSlice.ts`</w:t>
+      </w:r>
+      <w:r>
+        <w:t xml:space="preserve">, </w:t>
+      </w:r>
+      <w:r>
+        <w:rPr>
+          <w:b/>
+          <w:bCs/>
+        </w:rPr>
+        <w:t xml:space="preserve">`sy:*`</w:t>
+      </w:r>
+      <w:r>
+        <w:t xml:space="preserve"> receipts, </w:t>
+      </w:r>
+      <w:r>
+        <w:rPr>
+          <w:b/>
+          <w:bCs/>
+        </w:rPr>
+        <w:t xml:space="preserve">`sonicYouthEffectiveHarmonyBars`</w:t>
+      </w:r>
+      <w:r>
+        <w:t xml:space="preserve">, </w:t>
+      </w:r>
+      <w:r>
+        <w:rPr>
+          <w:b/>
+          <w:bCs/>
+        </w:rPr>
+        <w:t xml:space="preserve">`ChordEvent.sonicYouth`</w:t>
+      </w:r>
+      <w:r>
+        <w:t xml:space="preserve"> + </w:t>
+      </w:r>
+      <w:r>
+        <w:rPr>
+          <w:b/>
+          <w:bCs/>
+        </w:rPr>
+        <w:t xml:space="preserve">`SYTextureState`</w:t>
+      </w:r>
+      <w:r>
+        <w:t xml:space="preserve"> (</w:t>
+      </w:r>
+      <w:r>
+        <w:rPr>
+          <w:b/>
+          <w:bCs/>
+        </w:rPr>
+        <w:t xml:space="preserve">`sonicYouthTextureEngine.ts`</w:t>
+      </w:r>
+      <w:r>
+        <w:t xml:space="preserve"> / </w:t>
+      </w:r>
+      <w:r>
+        <w:rPr>
+          <w:b/>
+          <w:bCs/>
+        </w:rPr>
+        <w:t xml:space="preserve">`sonicYouthChordGuards.ts`</w:t>
+      </w:r>
+      <w:r>
+        <w:t xml:space="preserve">), MusicXML texture ornament mapping on comp chords (</w:t>
+      </w:r>
+      <w:r>
+        <w:rPr>
+          <w:b/>
+          <w:bCs/>
+        </w:rPr>
+        <w:t xml:space="preserve">`musicxmlExporter.ts`</w:t>
+      </w:r>
+      <w:r>
+        <w:t xml:space="preserve">), smoke </w:t>
+      </w:r>
+      <w:r>
+        <w:rPr>
+          <w:b/>
+          <w:bCs/>
+        </w:rPr>
+        <w:t xml:space="preserve">`sonicYouthSliceSmoke.test.ts`</w:t>
+      </w:r>
+      <w:r>
+        <w:t xml:space="preserve"> + </w:t>
+      </w:r>
+      <w:r>
+        <w:rPr>
+          <w:b/>
+          <w:bCs/>
+        </w:rPr>
+        <w:t xml:space="preserve">`sonicYouthTexture.test.ts`</w:t>
+      </w:r>
+      <w:r>
+        <w:t xml:space="preserve">.</w:t>
+      </w:r>
+    </w:p>
+    <w:p>
+      <w:pPr>
+        <w:spacing w:after="160"/>
+      </w:pPr>
+      <w:r>
+        <w:rPr>
+          <w:b/>
+          <w:bCs/>
+        </w:rPr>
         <w:t xml:space="preserve">Sonic Youth</w:t>
       </w:r>
       <w:r>
@@ -1366,6 +2609,206 @@
           <w:bCs/>
         </w:rPr>
         <w:t xml:space="preserve">`sonicYouthChordTypes.ts`</w:t>
+      </w:r>
+      <w:r>
+        <w:t xml:space="preserve">).</w:t>
+      </w:r>
+    </w:p>
+    <w:p>
+      <w:pPr>
+        <w:spacing w:after="160"/>
+      </w:pPr>
+      <w:r>
+        <w:rPr>
+          <w:b/>
+          <w:bCs/>
+        </w:rPr>
+        <w:t xml:space="preserve">Alternate tunings workflow (noise-rock zones)</w:t>
+      </w:r>
+    </w:p>
+    <w:p>
+      <w:pPr>
+        <w:spacing w:after="160"/>
+      </w:pPr>
+      <w:r>
+        <w:t xml:space="preserve">1. Set </w:t>
+      </w:r>
+      <w:r>
+        <w:rPr>
+          <w:b/>
+          <w:bCs/>
+        </w:rPr>
+        <w:t xml:space="preserve">primary writer</w:t>
+      </w:r>
+      <w:r>
+        <w:t xml:space="preserve"> to </w:t>
+      </w:r>
+      <w:r>
+        <w:rPr>
+          <w:b/>
+          <w:bCs/>
+        </w:rPr>
+        <w:t xml:space="preserve">Sonic Youth</w:t>
+      </w:r>
+      <w:r>
+        <w:t xml:space="preserve"> (aliases resolve via registry). 2. In </w:t>
+      </w:r>
+      <w:r>
+        <w:rPr>
+          <w:b/>
+          <w:bCs/>
+        </w:rPr>
+        <w:t xml:space="preserve">Generate</w:t>
+      </w:r>
+      <w:r>
+        <w:t xml:space="preserve">, open </w:t>
+      </w:r>
+      <w:r>
+        <w:rPr>
+          <w:b/>
+          <w:bCs/>
+        </w:rPr>
+        <w:t xml:space="preserve">alternate tuning</w:t>
+      </w:r>
+      <w:r>
+        <w:t xml:space="preserve"> controls and choose zone </w:t>
+      </w:r>
+      <w:r>
+        <w:rPr>
+          <w:b/>
+          <w:bCs/>
+        </w:rPr>
+        <w:t xml:space="preserve">`sonic_youth_noise`</w:t>
+      </w:r>
+      <w:r>
+        <w:t xml:space="preserve"> (`getPresetsByZone('sonic_youth_noise')` in </w:t>
+      </w:r>
+      <w:r>
+        <w:rPr>
+          <w:b/>
+          <w:bCs/>
+        </w:rPr>
+        <w:t xml:space="preserve">`alternateGuitarTunings.ts`</w:t>
+      </w:r>
+      <w:r>
+        <w:t xml:space="preserve">) — presets label </w:t>
+      </w:r>
+      <w:r>
+        <w:rPr>
+          <w:b/>
+          <w:bCs/>
+        </w:rPr>
+        <w:t xml:space="preserve">drone / slack / prepared</w:t>
+      </w:r>
+      <w:r>
+        <w:t xml:space="preserve"> colours aligned with the slice. 3. Lock a </w:t>
+      </w:r>
+      <w:r>
+        <w:rPr>
+          <w:b/>
+          <w:bCs/>
+        </w:rPr>
+        <w:t xml:space="preserve">seed</w:t>
+      </w:r>
+      <w:r>
+        <w:t xml:space="preserve">, generate, inspect </w:t>
+      </w:r>
+      <w:r>
+        <w:rPr>
+          <w:b/>
+          <w:bCs/>
+        </w:rPr>
+        <w:t xml:space="preserve">`sy:*`</w:t>
+      </w:r>
+      <w:r>
+        <w:t xml:space="preserve"> receipts + </w:t>
+      </w:r>
+      <w:r>
+        <w:rPr>
+          <w:b/>
+          <w:bCs/>
+        </w:rPr>
+        <w:t xml:space="preserve">`sonicYouthDiagnostics`</w:t>
+      </w:r>
+      <w:r>
+        <w:t xml:space="preserve"> on the manifest. 4. Export MusicXML: </w:t>
+      </w:r>
+      <w:r>
+        <w:rPr>
+          <w:b/>
+          <w:bCs/>
+        </w:rPr>
+        <w:t xml:space="preserve">fixed-offset</w:t>
+      </w:r>
+      <w:r>
+        <w:t xml:space="preserve"> tunings that change concert pitch (</w:t>
+      </w:r>
+      <w:r>
+        <w:rPr>
+          <w:b/>
+          <w:bCs/>
+        </w:rPr>
+        <w:t xml:space="preserve">Drop D</w:t>
+      </w:r>
+      <w:r>
+        <w:t xml:space="preserve">, </w:t>
+      </w:r>
+      <w:r>
+        <w:rPr>
+          <w:b/>
+          <w:bCs/>
+        </w:rPr>
+        <w:t xml:space="preserve">Eb standard</w:t>
+      </w:r>
+      <w:r>
+        <w:t xml:space="preserve">) also emit </w:t>
+      </w:r>
+      <w:r>
+        <w:rPr>
+          <w:b/>
+          <w:bCs/>
+        </w:rPr>
+        <w:t xml:space="preserve">`&lt;transpose&gt;&lt;chromatic&gt;`</w:t>
+      </w:r>
+      <w:r>
+        <w:t xml:space="preserve"> in </w:t>
+      </w:r>
+      <w:r>
+        <w:rPr>
+          <w:b/>
+          <w:bCs/>
+        </w:rPr>
+        <w:t xml:space="preserve">measure 1</w:t>
+      </w:r>
+      <w:r>
+        <w:t xml:space="preserve"> attributes (</w:t>
+      </w:r>
+      <w:r>
+        <w:rPr>
+          <w:b/>
+          <w:bCs/>
+        </w:rPr>
+        <w:t xml:space="preserve">`exportPartTransposeSemitones`</w:t>
+      </w:r>
+      <w:r>
+        <w:t xml:space="preserve">); </w:t>
+      </w:r>
+      <w:r>
+        <w:rPr>
+          <w:b/>
+          <w:bCs/>
+        </w:rPr>
+        <w:t xml:space="preserve">scordatura-only</w:t>
+      </w:r>
+      <w:r>
+        <w:t xml:space="preserve"> labels stay text (</w:t>
+      </w:r>
+      <w:r>
+        <w:rPr>
+          <w:b/>
+          <w:bCs/>
+        </w:rPr>
+        <w:t xml:space="preserve">exportMeasure1TuningWordsByPartId</w:t>
       </w:r>
       <w:r>
         <w:t xml:space="preserve">).</w:t>
@@ -2455,6 +3898,225 @@
         <w:spacing w:after="100" w:before="160"/>
       </w:pPr>
       <w:r>
+        <w:t xml:space="preserve">Donald Fagen and Bill Evans — odd-meter presets (`barMeterMap`)</w:t>
+      </w:r>
+    </w:p>
+    <w:p>
+      <w:pPr>
+        <w:spacing w:after="160"/>
+      </w:pPr>
+      <w:r>
+        <w:rPr>
+          <w:b/>
+          <w:bCs/>
+        </w:rPr>
+        <w:t xml:space="preserve">Song Mode</w:t>
+      </w:r>
+      <w:r>
+        <w:t xml:space="preserve"> exposes optional </w:t>
+      </w:r>
+      <w:r>
+        <w:rPr>
+          <w:b/>
+          <w:bCs/>
+        </w:rPr>
+        <w:t xml:space="preserve">composer meter presets</w:t>
+      </w:r>
+      <w:r>
+        <w:t xml:space="preserve"> for </w:t>
+      </w:r>
+      <w:r>
+        <w:rPr>
+          <w:b/>
+          <w:bCs/>
+        </w:rPr>
+        <w:t xml:space="preserve">Donald Fagen</w:t>
+      </w:r>
+      <w:r>
+        <w:t xml:space="preserve"> and </w:t>
+      </w:r>
+      <w:r>
+        <w:rPr>
+          <w:b/>
+          <w:bCs/>
+        </w:rPr>
+        <w:t xml:space="preserve">Bill Evans</w:t>
+      </w:r>
+      <w:r>
+        <w:t xml:space="preserve"> (same UI affordance as </w:t>
+      </w:r>
+      <w:r>
+        <w:rPr>
+          <w:b/>
+          <w:bCs/>
+        </w:rPr>
+        <w:t xml:space="preserve">Dave Brubeck</w:t>
+      </w:r>
+      <w:r>
+        <w:t xml:space="preserve">, </w:t>
+      </w:r>
+      <w:r>
+        <w:rPr>
+          <w:b/>
+          <w:bCs/>
+        </w:rPr>
+        <w:t xml:space="preserve">Thelonious Monk</w:t>
+      </w:r>
+      <w:r>
+        <w:t xml:space="preserve">, </w:t>
+      </w:r>
+      <w:r>
+        <w:rPr>
+          <w:b/>
+          <w:bCs/>
+        </w:rPr>
+        <w:t xml:space="preserve">Wayne Shorter</w:t>
+      </w:r>
+      <w:r>
+        <w:t xml:space="preserve">, </w:t>
+      </w:r>
+      <w:r>
+        <w:rPr>
+          <w:b/>
+          <w:bCs/>
+        </w:rPr>
+        <w:t xml:space="preserve">Frank Zappa</w:t>
+      </w:r>
+      <w:r>
+        <w:t xml:space="preserve">): tiled </w:t>
+      </w:r>
+      <w:r>
+        <w:rPr>
+          <w:b/>
+          <w:bCs/>
+        </w:rPr>
+        <w:t xml:space="preserve">`barMeterMap`</w:t>
+      </w:r>
+      <w:r>
+        <w:t xml:space="preserve"> rows drive per-bar </w:t>
+      </w:r>
+      <w:r>
+        <w:rPr>
+          <w:b/>
+          <w:bCs/>
+        </w:rPr>
+        <w:t xml:space="preserve">`&lt;time&gt;`</w:t>
+      </w:r>
+      <w:r>
+        <w:t xml:space="preserve"> in MusicXML and phrase quantisation (</w:t>
+      </w:r>
+      <w:r>
+        <w:rPr>
+          <w:b/>
+          <w:bCs/>
+        </w:rPr>
+        <w:t xml:space="preserve">`oddMeterQuantiser.ts`</w:t>
+      </w:r>
+      <w:r>
+        <w:t xml:space="preserve">, </w:t>
+      </w:r>
+      <w:r>
+        <w:rPr>
+          <w:b/>
+          <w:bCs/>
+        </w:rPr>
+        <w:t xml:space="preserve">`COMPOSER_METER_PRESET_MAP`</w:t>
+      </w:r>
+      <w:r>
+        <w:t xml:space="preserve">). Choosing </w:t>
+      </w:r>
+      <w:r>
+        <w:rPr>
+          <w:b/>
+          <w:bCs/>
+        </w:rPr>
+        <w:t xml:space="preserve">All 4/4</w:t>
+      </w:r>
+      <w:r>
+        <w:t xml:space="preserve"> omits </w:t>
+      </w:r>
+      <w:r>
+        <w:rPr>
+          <w:b/>
+          <w:bCs/>
+        </w:rPr>
+        <w:t xml:space="preserve">`barMeterMap`</w:t>
+      </w:r>
+      <w:r>
+        <w:t xml:space="preserve">.</w:t>
+      </w:r>
+    </w:p>
+    <w:p>
+      <w:pPr>
+        <w:spacing w:after="160"/>
+      </w:pPr>
+      <w:r>
+        <w:rPr>
+          <w:b/>
+          <w:bCs/>
+        </w:rPr>
+        <w:t xml:space="preserve">Workflow:</w:t>
+      </w:r>
+      <w:r>
+        <w:t xml:space="preserve"> Select writer → expand </w:t>
+      </w:r>
+      <w:r>
+        <w:rPr>
+          <w:b/>
+          <w:bCs/>
+        </w:rPr>
+        <w:t xml:space="preserve">meter preset</w:t>
+      </w:r>
+      <w:r>
+        <w:t xml:space="preserve"> radio block in </w:t>
+      </w:r>
+      <w:r>
+        <w:rPr>
+          <w:b/>
+          <w:bCs/>
+        </w:rPr>
+        <w:t xml:space="preserve">Generate</w:t>
+      </w:r>
+      <w:r>
+        <w:t xml:space="preserve"> → pick a cycle (e.g. Fagen </w:t>
+      </w:r>
+      <w:r>
+        <w:rPr>
+          <w:b/>
+          <w:bCs/>
+        </w:rPr>
+        <w:t xml:space="preserve">7+5</w:t>
+      </w:r>
+      <w:r>
+        <w:t xml:space="preserve">, Evans alternating metres) → lock </w:t>
+      </w:r>
+      <w:r>
+        <w:rPr>
+          <w:b/>
+          <w:bCs/>
+        </w:rPr>
+        <w:t xml:space="preserve">seed</w:t>
+      </w:r>
+      <w:r>
+        <w:t xml:space="preserve"> → verify </w:t>
+      </w:r>
+      <w:r>
+        <w:rPr>
+          <w:b/>
+          <w:bCs/>
+        </w:rPr>
+        <w:t xml:space="preserve">per-bar time signatures</w:t>
+      </w:r>
+      <w:r>
+        <w:t xml:space="preserve"> in XML if the host collapses display.</w:t>
+      </w:r>
+    </w:p>
+    <w:p>
+      <w:pPr>
+        <w:pStyle w:val="Heading2"/>
+        <w:spacing w:after="100" w:before="160"/>
+      </w:pPr>
+      <w:r>
         <w:t xml:space="preserve">Scenario 11: Big Band vs String Quartet expectations</w:t>
       </w:r>
     </w:p>
@@ -4411,6 +6073,501 @@
       </w:r>
       <w:r>
         <w:t xml:space="preserve"> when maps are absent.</w:t>
+      </w:r>
+    </w:p>
+    <w:p>
+      <w:pPr>
+        <w:pStyle w:val="Heading2"/>
+        <w:spacing w:after="100" w:before="160"/>
+      </w:pPr>
+      <w:r>
+        <w:t xml:space="preserve">Alternate tunings workflow (standalone)</w:t>
+      </w:r>
+    </w:p>
+    <w:p>
+      <w:pPr>
+        <w:spacing w:after="160"/>
+      </w:pPr>
+      <w:r>
+        <w:t xml:space="preserve">Use this checklist </w:t>
+      </w:r>
+      <w:r>
+        <w:rPr>
+          <w:b/>
+          <w:bCs/>
+        </w:rPr>
+        <w:t xml:space="preserve">for any writer</w:t>
+      </w:r>
+      <w:r>
+        <w:t xml:space="preserve"> where </w:t>
+      </w:r>
+      <w:r>
+        <w:rPr>
+          <w:b/>
+          <w:bCs/>
+        </w:rPr>
+        <w:t xml:space="preserve">`styleProfileSupportsAlternateGuitarTuning`</w:t>
+      </w:r>
+      <w:r>
+        <w:t xml:space="preserve"> allows the UI (</w:t>
+      </w:r>
+      <w:r>
+        <w:rPr>
+          <w:b/>
+          <w:bCs/>
+        </w:rPr>
+        <w:t xml:space="preserve">Indie</w:t>
+      </w:r>
+      <w:r>
+        <w:t xml:space="preserve">, </w:t>
+      </w:r>
+      <w:r>
+        <w:rPr>
+          <w:b/>
+          <w:bCs/>
+        </w:rPr>
+        <w:t xml:space="preserve">Sonic Youth</w:t>
+      </w:r>
+      <w:r>
+        <w:t xml:space="preserve">, </w:t>
+      </w:r>
+      <w:r>
+        <w:rPr>
+          <w:b/>
+          <w:bCs/>
+        </w:rPr>
+        <w:t xml:space="preserve">Joni Mitchell</w:t>
+      </w:r>
+      <w:r>
+        <w:t xml:space="preserve">, </w:t>
+      </w:r>
+      <w:r>
+        <w:rPr>
+          <w:b/>
+          <w:bCs/>
+        </w:rPr>
+        <w:t xml:space="preserve">Pat Metheny</w:t>
+      </w:r>
+      <w:r>
+        <w:t xml:space="preserve">, </w:t>
+      </w:r>
+      <w:r>
+        <w:rPr>
+          <w:b/>
+          <w:bCs/>
+        </w:rPr>
+        <w:t xml:space="preserve">ECM Chamber</w:t>
+      </w:r>
+      <w:r>
+        <w:t xml:space="preserve">, etc.):</w:t>
+      </w:r>
+    </w:p>
+    <w:tbl>
+      <w:tblPr>
+        <w:tblW w:type="pct" w:w="100%"/>
+        <w:tblBorders>
+          <w:top w:val="single" w:color="auto" w:sz="4"/>
+          <w:left w:val="single" w:color="auto" w:sz="4"/>
+          <w:bottom w:val="single" w:color="auto" w:sz="4"/>
+          <w:right w:val="single" w:color="auto" w:sz="4"/>
+          <w:insideH w:val="single" w:color="auto" w:sz="4"/>
+          <w:insideV w:val="single" w:color="auto" w:sz="4"/>
+        </w:tblBorders>
+      </w:tblPr>
+      <w:tblGrid>
+        <w:gridCol w:w="4500"/>
+        <w:gridCol w:w="4500"/>
+      </w:tblGrid>
+      <w:tr>
+        <w:tc>
+          <w:tcPr>
+            <w:tcW w:type="pct" w:w="4500%"/>
+          </w:tcPr>
+          <w:p>
+            <w:pPr>
+              <w:spacing w:after="60"/>
+            </w:pPr>
+            <w:r>
+              <w:t xml:space="preserve">Step</w:t>
+            </w:r>
+          </w:p>
+        </w:tc>
+        <w:tc>
+          <w:tcPr>
+            <w:tcW w:type="pct" w:w="4500%"/>
+          </w:tcPr>
+          <w:p>
+            <w:pPr>
+              <w:spacing w:after="60"/>
+            </w:pPr>
+            <w:r>
+              <w:t xml:space="preserve">Action</w:t>
+            </w:r>
+          </w:p>
+        </w:tc>
+      </w:tr>
+      <w:tr>
+        <w:tc>
+          <w:tcPr>
+            <w:tcW w:type="pct" w:w="4500%"/>
+          </w:tcPr>
+          <w:p>
+            <w:pPr>
+              <w:spacing w:after="60"/>
+            </w:pPr>
+            <w:r>
+              <w:t xml:space="preserve">1</w:t>
+            </w:r>
+          </w:p>
+        </w:tc>
+        <w:tc>
+          <w:tcPr>
+            <w:tcW w:type="pct" w:w="4500%"/>
+          </w:tcPr>
+          <w:p>
+            <w:pPr>
+              <w:spacing w:after="60"/>
+            </w:pPr>
+            <w:r>
+              <w:t xml:space="preserve">Choose </w:t>
+            </w:r>
+            <w:r>
+              <w:rPr>
+                <w:b/>
+                <w:bCs/>
+              </w:rPr>
+              <w:t xml:space="preserve">Song Mode</w:t>
+            </w:r>
+            <w:r>
+              <w:t xml:space="preserve"> + </w:t>
+            </w:r>
+            <w:r>
+              <w:rPr>
+                <w:b/>
+                <w:bCs/>
+              </w:rPr>
+              <w:t xml:space="preserve">writer</w:t>
+            </w:r>
+            <w:r>
+              <w:t xml:space="preserve"> + optional </w:t>
+            </w:r>
+            <w:r>
+              <w:rPr>
+                <w:b/>
+                <w:bCs/>
+              </w:rPr>
+              <w:t xml:space="preserve">arranger/era</w:t>
+            </w:r>
+            <w:r>
+              <w:t xml:space="preserve"> pairing.</w:t>
+            </w:r>
+          </w:p>
+        </w:tc>
+      </w:tr>
+      <w:tr>
+        <w:tc>
+          <w:tcPr>
+            <w:tcW w:type="pct" w:w="4500%"/>
+          </w:tcPr>
+          <w:p>
+            <w:pPr>
+              <w:spacing w:after="60"/>
+            </w:pPr>
+            <w:r>
+              <w:t xml:space="preserve">2</w:t>
+            </w:r>
+          </w:p>
+        </w:tc>
+        <w:tc>
+          <w:tcPr>
+            <w:tcW w:type="pct" w:w="4500%"/>
+          </w:tcPr>
+          <w:p>
+            <w:pPr>
+              <w:spacing w:after="60"/>
+            </w:pPr>
+            <w:r>
+              <w:t xml:space="preserve">Open </w:t>
+            </w:r>
+            <w:r>
+              <w:rPr>
+                <w:b/>
+                <w:bCs/>
+              </w:rPr>
+              <w:t xml:space="preserve">alternate tuning</w:t>
+            </w:r>
+            <w:r>
+              <w:t xml:space="preserve"> — presets are grouped into </w:t>
+            </w:r>
+            <w:r>
+              <w:rPr>
+                <w:b/>
+                <w:bCs/>
+              </w:rPr>
+              <w:t xml:space="preserve">zones</w:t>
+            </w:r>
+            <w:r>
+              <w:t xml:space="preserve">: </w:t>
+            </w:r>
+            <w:r>
+              <w:rPr>
+                <w:b/>
+                <w:bCs/>
+              </w:rPr>
+              <w:t xml:space="preserve">`jazz_sophisticated`</w:t>
+            </w:r>
+            <w:r>
+              <w:t xml:space="preserve">, </w:t>
+            </w:r>
+            <w:r>
+              <w:rPr>
+                <w:b/>
+                <w:bCs/>
+              </w:rPr>
+              <w:t xml:space="preserve">`sonic_youth_noise`</w:t>
+            </w:r>
+            <w:r>
+              <w:t xml:space="preserve">, </w:t>
+            </w:r>
+            <w:r>
+              <w:rPr>
+                <w:b/>
+                <w:bCs/>
+              </w:rPr>
+              <w:t xml:space="preserve">`joni_mitchell`</w:t>
+            </w:r>
+            <w:r>
+              <w:t xml:space="preserve">, </w:t>
+            </w:r>
+            <w:r>
+              <w:rPr>
+                <w:b/>
+                <w:bCs/>
+              </w:rPr>
+              <w:t xml:space="preserve">`hybrid_harmonic`</w:t>
+            </w:r>
+            <w:r>
+              <w:t xml:space="preserve"> (`getPresetsByZone`).</w:t>
+            </w:r>
+          </w:p>
+        </w:tc>
+      </w:tr>
+      <w:tr>
+        <w:tc>
+          <w:tcPr>
+            <w:tcW w:type="pct" w:w="4500%"/>
+          </w:tcPr>
+          <w:p>
+            <w:pPr>
+              <w:spacing w:after="60"/>
+            </w:pPr>
+            <w:r>
+              <w:t xml:space="preserve">3</w:t>
+            </w:r>
+          </w:p>
+        </w:tc>
+        <w:tc>
+          <w:tcPr>
+            <w:tcW w:type="pct" w:w="4500%"/>
+          </w:tcPr>
+          <w:p>
+            <w:pPr>
+              <w:spacing w:after="60"/>
+            </w:pPr>
+            <w:r>
+              <w:t xml:space="preserve">Pick </w:t>
+            </w:r>
+            <w:r>
+              <w:rPr>
+                <w:b/>
+                <w:bCs/>
+              </w:rPr>
+              <w:t xml:space="preserve">shared</w:t>
+            </w:r>
+            <w:r>
+              <w:t xml:space="preserve"> vs </w:t>
+            </w:r>
+            <w:r>
+              <w:rPr>
+                <w:b/>
+                <w:bCs/>
+              </w:rPr>
+              <w:t xml:space="preserve">separate</w:t>
+            </w:r>
+            <w:r>
+              <w:t xml:space="preserve"> dual-guitar tuning mode when using duo / Indie routes.</w:t>
+            </w:r>
+          </w:p>
+        </w:tc>
+      </w:tr>
+      <w:tr>
+        <w:tc>
+          <w:tcPr>
+            <w:tcW w:type="pct" w:w="4500%"/>
+          </w:tcPr>
+          <w:p>
+            <w:pPr>
+              <w:spacing w:after="60"/>
+            </w:pPr>
+            <w:r>
+              <w:t xml:space="preserve">4</w:t>
+            </w:r>
+          </w:p>
+        </w:tc>
+        <w:tc>
+          <w:tcPr>
+            <w:tcW w:type="pct" w:w="4500%"/>
+          </w:tcPr>
+          <w:p>
+            <w:pPr>
+              <w:spacing w:after="60"/>
+            </w:pPr>
+            <w:r>
+              <w:t xml:space="preserve">Generate and verify </w:t>
+            </w:r>
+            <w:r>
+              <w:rPr>
+                <w:b/>
+                <w:bCs/>
+              </w:rPr>
+              <w:t xml:space="preserve">manifest</w:t>
+            </w:r>
+            <w:r>
+              <w:t xml:space="preserve"> tuning resolution + </w:t>
+            </w:r>
+            <w:r>
+              <w:rPr>
+                <w:b/>
+                <w:bCs/>
+              </w:rPr>
+              <w:t xml:space="preserve">`alternateGuitarTunings`</w:t>
+            </w:r>
+            <w:r>
+              <w:t xml:space="preserve"> receipts where emitted.</w:t>
+            </w:r>
+          </w:p>
+        </w:tc>
+      </w:tr>
+      <w:tr>
+        <w:tc>
+          <w:tcPr>
+            <w:tcW w:type="pct" w:w="4500%"/>
+          </w:tcPr>
+          <w:p>
+            <w:pPr>
+              <w:spacing w:after="60"/>
+            </w:pPr>
+            <w:r>
+              <w:t xml:space="preserve">5</w:t>
+            </w:r>
+          </w:p>
+        </w:tc>
+        <w:tc>
+          <w:tcPr>
+            <w:tcW w:type="pct" w:w="4500%"/>
+          </w:tcPr>
+          <w:p>
+            <w:pPr>
+              <w:spacing w:after="60"/>
+            </w:pPr>
+            <w:r>
+              <w:t xml:space="preserve">Export </w:t>
+            </w:r>
+            <w:r>
+              <w:rPr>
+                <w:b/>
+                <w:bCs/>
+              </w:rPr>
+              <w:t xml:space="preserve">MusicXML</w:t>
+            </w:r>
+            <w:r>
+              <w:t xml:space="preserve">: </w:t>
+            </w:r>
+            <w:r>
+              <w:rPr>
+                <w:b/>
+                <w:bCs/>
+              </w:rPr>
+              <w:t xml:space="preserve">Drop D</w:t>
+            </w:r>
+            <w:r>
+              <w:t xml:space="preserve"> (−2 semitones) and </w:t>
+            </w:r>
+            <w:r>
+              <w:rPr>
+                <w:b/>
+                <w:bCs/>
+              </w:rPr>
+              <w:t xml:space="preserve">Eb standard</w:t>
+            </w:r>
+            <w:r>
+              <w:t xml:space="preserve"> (−1) write </w:t>
+            </w:r>
+            <w:r>
+              <w:rPr>
+                <w:b/>
+                <w:bCs/>
+              </w:rPr>
+              <w:t xml:space="preserve">`&lt;transpose&gt;&lt;chromatic&gt;`</w:t>
+            </w:r>
+            <w:r>
+              <w:t xml:space="preserve"> under </w:t>
+            </w:r>
+            <w:r>
+              <w:rPr>
+                <w:b/>
+                <w:bCs/>
+              </w:rPr>
+              <w:t xml:space="preserve">measure 1</w:t>
+            </w:r>
+            <w:r>
+              <w:t xml:space="preserve"> `&lt;attributes&gt;`; other presets remain </w:t>
+            </w:r>
+            <w:r>
+              <w:rPr>
+                <w:b/>
+                <w:bCs/>
+              </w:rPr>
+              <w:t xml:space="preserve">direction text</w:t>
+            </w:r>
+            <w:r>
+              <w:t xml:space="preserve"> unless they carry a fixed chromatic offset in the model.</w:t>
+            </w:r>
+          </w:p>
+        </w:tc>
+      </w:tr>
+    </w:tbl>
+    <w:p>
+      <w:pPr>
+        <w:spacing w:after="160"/>
+      </w:pPr>
+    </w:p>
+    <w:p>
+      <w:pPr>
+        <w:spacing w:after="160"/>
+      </w:pPr>
+      <w:r>
+        <w:t xml:space="preserve">Regression: </w:t>
+      </w:r>
+      <w:r>
+        <w:rPr>
+          <w:b/>
+          <w:bCs/>
+        </w:rPr>
+        <w:t xml:space="preserve">`alternateGuitarTunings.test.ts`</w:t>
+      </w:r>
+      <w:r>
+        <w:t xml:space="preserve"> + smoke tier row </w:t>
+      </w:r>
+      <w:r>
+        <w:rPr>
+          <w:b/>
+          <w:bCs/>
+        </w:rPr>
+        <w:t xml:space="preserve">Alternate guitar tunings (zones + texture)</w:t>
+      </w:r>
+      <w:r>
+        <w:t xml:space="preserve">.</w:t>
       </w:r>
     </w:p>
     <w:p>

</xml_diff>

<commit_message>
feat: Pat Metheny slice — smoke device diversity + registry rules + playbook
Co-authored-by: Cursor <cursoragent@cursor.com>
</commit_message>
<xml_diff>
--- a/docs/COMPOSER_OS_PLAYBOOK.docx
+++ b/docs/COMPOSER_OS_PLAYBOOK.docx
@@ -7168,6 +7168,743 @@
       </w:r>
       <w:r>
         <w:t xml:space="preserve"> (wall vs clearing), not guaranteed studio distortion.</w:t>
+      </w:r>
+    </w:p>
+    <w:p>
+      <w:pPr>
+        <w:pStyle w:val="Heading2"/>
+        <w:spacing w:after="100" w:before="160"/>
+      </w:pPr>
+      <w:r>
+        <w:t xml:space="preserve">Pat Metheny (ECM / PMG — harmony-centric slice)</w:t>
+      </w:r>
+    </w:p>
+    <w:p>
+      <w:pPr>
+        <w:spacing w:after="160"/>
+      </w:pPr>
+      <w:r>
+        <w:rPr>
+          <w:b/>
+          <w:bCs/>
+        </w:rPr>
+        <w:t xml:space="preserve">Still current:</w:t>
+      </w:r>
+      <w:r>
+        <w:t xml:space="preserve"> </w:t>
+      </w:r>
+      <w:r>
+        <w:rPr>
+          <w:b/>
+          <w:bCs/>
+        </w:rPr>
+        <w:t xml:space="preserve">`patMethenySlice.ts`</w:t>
+      </w:r>
+      <w:r>
+        <w:t xml:space="preserve"> (re-export </w:t>
+      </w:r>
+      <w:r>
+        <w:rPr>
+          <w:b/>
+          <w:bCs/>
+        </w:rPr>
+        <w:t xml:space="preserve">`goldenPath/patMethenySlice.ts`</w:t>
+      </w:r>
+      <w:r>
+        <w:t xml:space="preserve">), </w:t>
+      </w:r>
+      <w:r>
+        <w:rPr>
+          <w:b/>
+          <w:bCs/>
+        </w:rPr>
+        <w:t xml:space="preserve">`patMethenyEffectiveHarmonyBars`</w:t>
+      </w:r>
+      <w:r>
+        <w:t xml:space="preserve">, </w:t>
+      </w:r>
+      <w:r>
+        <w:rPr>
+          <w:b/>
+          <w:bCs/>
+        </w:rPr>
+        <w:t xml:space="preserve">`precomputePatMethenyEffectiveHarmonyBars`</w:t>
+      </w:r>
+      <w:r>
+        <w:t xml:space="preserve">, </w:t>
+      </w:r>
+      <w:r>
+        <w:rPr>
+          <w:b/>
+          <w:bCs/>
+        </w:rPr>
+        <w:t xml:space="preserve">`getChordForBar`</w:t>
+      </w:r>
+      <w:r>
+        <w:t xml:space="preserve">, smoke </w:t>
+      </w:r>
+      <w:r>
+        <w:rPr>
+          <w:b/>
+          <w:bCs/>
+        </w:rPr>
+        <w:t xml:space="preserve">`patMethenySliceSmoke.test.ts`</w:t>
+      </w:r>
+      <w:r>
+        <w:t xml:space="preserve">, eval </w:t>
+      </w:r>
+      <w:r>
+        <w:rPr>
+          <w:b/>
+          <w:bCs/>
+        </w:rPr>
+        <w:t xml:space="preserve">`npm run eval:pat_metheny`</w:t>
+      </w:r>
+      <w:r>
+        <w:t xml:space="preserve">.</w:t>
+      </w:r>
+    </w:p>
+    <w:p>
+      <w:pPr>
+        <w:spacing w:after="160"/>
+      </w:pPr>
+      <w:r>
+        <w:t xml:space="preserve">Pat Metheny is </w:t>
+      </w:r>
+      <w:r>
+        <w:rPr>
+          <w:b/>
+          <w:bCs/>
+        </w:rPr>
+        <w:t xml:space="preserve">harmony- and metadata-centric</w:t>
+      </w:r>
+      <w:r>
+        <w:t xml:space="preserve"> on the duo golden path: there is </w:t>
+      </w:r>
+      <w:r>
+        <w:rPr>
+          <w:b/>
+          <w:bCs/>
+        </w:rPr>
+        <w:t xml:space="preserve">no</w:t>
+      </w:r>
+      <w:r>
+        <w:t xml:space="preserve"> dedicated guitar-bar pass or `ChordEvent` extension layer (by design—contrast </w:t>
+      </w:r>
+      <w:r>
+        <w:rPr>
+          <w:b/>
+          <w:bCs/>
+        </w:rPr>
+        <w:t xml:space="preserve">Sonic Youth</w:t>
+      </w:r>
+      <w:r>
+        <w:t xml:space="preserve"> </w:t>
+      </w:r>
+      <w:r>
+        <w:rPr>
+          <w:b/>
+          <w:bCs/>
+        </w:rPr>
+        <w:t xml:space="preserve">`applySonicYouthGuitarBarPasses`</w:t>
+      </w:r>
+      <w:r>
+        <w:t xml:space="preserve">). Export truth and assertions use the same </w:t>
+      </w:r>
+      <w:r>
+        <w:rPr>
+          <w:b/>
+          <w:bCs/>
+        </w:rPr>
+        <w:t xml:space="preserve">precomputed effective harmony</w:t>
+      </w:r>
+      <w:r>
+        <w:t xml:space="preserve"> pattern as other locked slices.</w:t>
+      </w:r>
+    </w:p>
+    <w:p>
+      <w:pPr>
+        <w:spacing w:after="160"/>
+      </w:pPr>
+      <w:r>
+        <w:rPr>
+          <w:b/>
+          <w:bCs/>
+        </w:rPr>
+        <w:t xml:space="preserve">`pm:*` device families</w:t>
+      </w:r>
+      <w:r>
+        <w:t xml:space="preserve"> (prefix </w:t>
+      </w:r>
+      <w:r>
+        <w:rPr>
+          <w:b/>
+          <w:bCs/>
+        </w:rPr>
+        <w:t xml:space="preserve">`pm:`</w:t>
+      </w:r>
+      <w:r>
+        <w:t xml:space="preserve"> on </w:t>
+      </w:r>
+      <w:r>
+        <w:rPr>
+          <w:b/>
+          <w:bCs/>
+        </w:rPr>
+        <w:t xml:space="preserve">`patMethenyDeviceReceipts`</w:t>
+      </w:r>
+      <w:r>
+        <w:t xml:space="preserve">)</w:t>
+      </w:r>
+    </w:p>
+    <w:tbl>
+      <w:tblPr>
+        <w:tblW w:type="pct" w:w="100%"/>
+        <w:tblBorders>
+          <w:top w:val="single" w:color="auto" w:sz="4"/>
+          <w:left w:val="single" w:color="auto" w:sz="4"/>
+          <w:bottom w:val="single" w:color="auto" w:sz="4"/>
+          <w:right w:val="single" w:color="auto" w:sz="4"/>
+          <w:insideH w:val="single" w:color="auto" w:sz="4"/>
+          <w:insideV w:val="single" w:color="auto" w:sz="4"/>
+        </w:tblBorders>
+      </w:tblPr>
+      <w:tblGrid>
+        <w:gridCol w:w="4500"/>
+        <w:gridCol w:w="4500"/>
+      </w:tblGrid>
+      <w:tr>
+        <w:tc>
+          <w:tcPr>
+            <w:tcW w:type="pct" w:w="4500%"/>
+          </w:tcPr>
+          <w:p>
+            <w:pPr>
+              <w:spacing w:after="60"/>
+            </w:pPr>
+            <w:r>
+              <w:t xml:space="preserve">Family</w:t>
+            </w:r>
+          </w:p>
+        </w:tc>
+        <w:tc>
+          <w:tcPr>
+            <w:tcW w:type="pct" w:w="4500%"/>
+          </w:tcPr>
+          <w:p>
+            <w:pPr>
+              <w:spacing w:after="60"/>
+            </w:pPr>
+            <w:r>
+              <w:t xml:space="preserve">Role</w:t>
+            </w:r>
+          </w:p>
+        </w:tc>
+      </w:tr>
+      <w:tr>
+        <w:tc>
+          <w:tcPr>
+            <w:tcW w:type="pct" w:w="4500%"/>
+          </w:tcPr>
+          <w:p>
+            <w:pPr>
+              <w:spacing w:after="60"/>
+            </w:pPr>
+            <w:r>
+              <w:rPr>
+                <w:b/>
+                <w:bCs/>
+              </w:rPr>
+              <w:t xml:space="preserve">`lydian_home`</w:t>
+            </w:r>
+          </w:p>
+        </w:tc>
+        <w:tc>
+          <w:tcPr>
+            <w:tcW w:type="pct" w:w="4500%"/>
+          </w:tcPr>
+          <w:p>
+            <w:pPr>
+              <w:spacing w:after="60"/>
+            </w:pPr>
+            <w:r>
+              <w:t xml:space="preserve">Tonic major with Lydian/home colour (</w:t>
+            </w:r>
+            <w:r>
+              <w:rPr>
+                <w:b/>
+                <w:bCs/>
+              </w:rPr>
+              <w:t xml:space="preserve">`pm:lydian_home@bar…`</w:t>
+            </w:r>
+            <w:r>
+              <w:t xml:space="preserve">).</w:t>
+            </w:r>
+          </w:p>
+        </w:tc>
+      </w:tr>
+      <w:tr>
+        <w:tc>
+          <w:tcPr>
+            <w:tcW w:type="pct" w:w="4500%"/>
+          </w:tcPr>
+          <w:p>
+            <w:pPr>
+              <w:spacing w:after="60"/>
+            </w:pPr>
+            <w:r>
+              <w:rPr>
+                <w:b/>
+                <w:bCs/>
+              </w:rPr>
+              <w:t xml:space="preserve">`pedal_shimmer`</w:t>
+            </w:r>
+          </w:p>
+        </w:tc>
+        <w:tc>
+          <w:tcPr>
+            <w:tcW w:type="pct" w:w="4500%"/>
+          </w:tcPr>
+          <w:p>
+            <w:pPr>
+              <w:spacing w:after="60"/>
+            </w:pPr>
+            <w:r>
+              <w:t xml:space="preserve">Motion-gated shimmer (</w:t>
+            </w:r>
+            <w:r>
+              <w:rPr>
+                <w:b/>
+                <w:bCs/>
+              </w:rPr>
+              <w:t xml:space="preserve">d2</w:t>
+            </w:r>
+            <w:r>
+              <w:t xml:space="preserve">, </w:t>
+            </w:r>
+            <w:r>
+              <w:rPr>
+                <w:b/>
+                <w:bCs/>
+              </w:rPr>
+              <w:t xml:space="preserve">`pm:pedal_shimmer@bar…`</w:t>
+            </w:r>
+            <w:r>
+              <w:t xml:space="preserve">).</w:t>
+            </w:r>
+          </w:p>
+        </w:tc>
+      </w:tr>
+      <w:tr>
+        <w:tc>
+          <w:tcPr>
+            <w:tcW w:type="pct" w:w="4500%"/>
+          </w:tcPr>
+          <w:p>
+            <w:pPr>
+              <w:spacing w:after="60"/>
+            </w:pPr>
+            <w:r>
+              <w:rPr>
+                <w:b/>
+                <w:bCs/>
+              </w:rPr>
+              <w:t xml:space="preserve">`sus_float`</w:t>
+            </w:r>
+          </w:p>
+        </w:tc>
+        <w:tc>
+          <w:tcPr>
+            <w:tcW w:type="pct" w:w="4500%"/>
+          </w:tcPr>
+          <w:p>
+            <w:pPr>
+              <w:spacing w:after="60"/>
+            </w:pPr>
+            <w:r>
+              <w:t xml:space="preserve">Suspension float on eligible sus/add9/maj surfaces (</w:t>
+            </w:r>
+            <w:r>
+              <w:rPr>
+                <w:b/>
+                <w:bCs/>
+              </w:rPr>
+              <w:t xml:space="preserve">d4</w:t>
+            </w:r>
+            <w:r>
+              <w:t xml:space="preserve">, </w:t>
+            </w:r>
+            <w:r>
+              <w:rPr>
+                <w:b/>
+                <w:bCs/>
+              </w:rPr>
+              <w:t xml:space="preserve">`pm:sus_float@bar…`</w:t>
+            </w:r>
+            <w:r>
+              <w:t xml:space="preserve">).</w:t>
+            </w:r>
+          </w:p>
+        </w:tc>
+      </w:tr>
+      <w:tr>
+        <w:tc>
+          <w:tcPr>
+            <w:tcW w:type="pct" w:w="4500%"/>
+          </w:tcPr>
+          <w:p>
+            <w:pPr>
+              <w:spacing w:after="60"/>
+            </w:pPr>
+            <w:r>
+              <w:rPr>
+                <w:b/>
+                <w:bCs/>
+              </w:rPr>
+              <w:t xml:space="preserve">`modal_sideSlip`</w:t>
+            </w:r>
+          </w:p>
+        </w:tc>
+        <w:tc>
+          <w:tcPr>
+            <w:tcW w:type="pct" w:w="4500%"/>
+          </w:tcPr>
+          <w:p>
+            <w:pPr>
+              <w:spacing w:after="60"/>
+            </w:pPr>
+            <w:r>
+              <w:t xml:space="preserve">Modal side-slip toward bII/bIII (</w:t>
+            </w:r>
+            <w:r>
+              <w:rPr>
+                <w:b/>
+                <w:bCs/>
+              </w:rPr>
+              <w:t xml:space="preserve">d5</w:t>
+            </w:r>
+            <w:r>
+              <w:t xml:space="preserve">, </w:t>
+            </w:r>
+            <w:r>
+              <w:rPr>
+                <w:b/>
+                <w:bCs/>
+              </w:rPr>
+              <w:t xml:space="preserve">`pm:modal_sideSlip@bar…`</w:t>
+            </w:r>
+            <w:r>
+              <w:t xml:space="preserve">).</w:t>
+            </w:r>
+          </w:p>
+        </w:tc>
+      </w:tr>
+      <w:tr>
+        <w:tc>
+          <w:tcPr>
+            <w:tcW w:type="pct" w:w="4500%"/>
+          </w:tcPr>
+          <w:p>
+            <w:pPr>
+              <w:spacing w:after="60"/>
+            </w:pPr>
+            <w:r>
+              <w:rPr>
+                <w:b/>
+                <w:bCs/>
+              </w:rPr>
+              <w:t xml:space="preserve">`diatonic_planing`</w:t>
+            </w:r>
+          </w:p>
+        </w:tc>
+        <w:tc>
+          <w:tcPr>
+            <w:tcW w:type="pct" w:w="4500%"/>
+          </w:tcPr>
+          <w:p>
+            <w:pPr>
+              <w:spacing w:after="60"/>
+            </w:pPr>
+            <w:r>
+              <w:t xml:space="preserve">Diatonic planing between maj-extension chords (</w:t>
+            </w:r>
+            <w:r>
+              <w:rPr>
+                <w:b/>
+                <w:bCs/>
+              </w:rPr>
+              <w:t xml:space="preserve">`pm:diatonic_planing@bar…`</w:t>
+            </w:r>
+            <w:r>
+              <w:t xml:space="preserve">).</w:t>
+            </w:r>
+          </w:p>
+        </w:tc>
+      </w:tr>
+    </w:tbl>
+    <w:p>
+      <w:pPr>
+        <w:spacing w:after="160"/>
+      </w:pPr>
+    </w:p>
+    <w:p>
+      <w:pPr>
+        <w:spacing w:after="160"/>
+      </w:pPr>
+      <w:r>
+        <w:rPr>
+          <w:b/>
+          <w:bCs/>
+        </w:rPr>
+        <w:t xml:space="preserve">Eligibility pipeline</w:t>
+      </w:r>
+    </w:p>
+    <w:p>
+      <w:pPr>
+        <w:spacing w:after="160"/>
+      </w:pPr>
+      <w:r>
+        <w:t xml:space="preserve">1. </w:t>
+      </w:r>
+      <w:r>
+        <w:rPr>
+          <w:b/>
+          <w:bCs/>
+        </w:rPr>
+        <w:t xml:space="preserve">`buildPatMethenyHarmonyPipelineSnapshot`</w:t>
+      </w:r>
+      <w:r>
+        <w:t xml:space="preserve"> — resolve source chords → </w:t>
+      </w:r>
+      <w:r>
+        <w:rPr>
+          <w:b/>
+          <w:bCs/>
+        </w:rPr>
+        <w:t xml:space="preserve">flatten</w:t>
+      </w:r>
+      <w:r>
+        <w:t xml:space="preserve"> textbook ii–V–I (`flattenTwoFiveOnePass`) → </w:t>
+      </w:r>
+      <w:r>
+        <w:rPr>
+          <w:b/>
+          <w:bCs/>
+        </w:rPr>
+        <w:t xml:space="preserve">strip</w:t>
+      </w:r>
+      <w:r>
+        <w:t xml:space="preserve"> three-bar dominant chains (`stripDominantChainPass`) → </w:t>
+      </w:r>
+      <w:r>
+        <w:rPr>
+          <w:b/>
+          <w:bCs/>
+        </w:rPr>
+        <w:t xml:space="preserve">applyModalSideSlipDevice</w:t>
+      </w:r>
+      <w:r>
+        <w:t xml:space="preserve"> (d5) → </w:t>
+      </w:r>
+      <w:r>
+        <w:rPr>
+          <w:b/>
+          <w:bCs/>
+        </w:rPr>
+        <w:t xml:space="preserve">enforceMethenyTwoBarHold</w:t>
+      </w:r>
+      <w:r>
+        <w:t xml:space="preserve">. 2. </w:t>
+      </w:r>
+      <w:r>
+        <w:rPr>
+          <w:b/>
+          <w:bCs/>
+        </w:rPr>
+        <w:t xml:space="preserve">`precomputePatMethenyEffectiveHarmonyBars`</w:t>
+      </w:r>
+      <w:r>
+        <w:t xml:space="preserve"> — attach </w:t>
+      </w:r>
+      <w:r>
+        <w:rPr>
+          <w:b/>
+          <w:bCs/>
+        </w:rPr>
+        <w:t xml:space="preserve">Lydian-home</w:t>
+      </w:r>
+      <w:r>
+        <w:t xml:space="preserve">, </w:t>
+      </w:r>
+      <w:r>
+        <w:rPr>
+          <w:b/>
+          <w:bCs/>
+        </w:rPr>
+        <w:t xml:space="preserve">pedal-shimmer / sus-float</w:t>
+      </w:r>
+      <w:r>
+        <w:t xml:space="preserve"> receipts (seeded d2/d4), </w:t>
+      </w:r>
+      <w:r>
+        <w:rPr>
+          <w:b/>
+          <w:bCs/>
+        </w:rPr>
+        <w:t xml:space="preserve">diatonic planing</w:t>
+      </w:r>
+      <w:r>
+        <w:t xml:space="preserve"> receipts, </w:t>
+      </w:r>
+      <w:r>
+        <w:rPr>
+          <w:b/>
+          <w:bCs/>
+        </w:rPr>
+        <w:t xml:space="preserve">`patMethenyEffectiveHarmonyBars`</w:t>
+      </w:r>
+      <w:r>
+        <w:t xml:space="preserve">, </w:t>
+      </w:r>
+      <w:r>
+        <w:rPr>
+          <w:b/>
+          <w:bCs/>
+        </w:rPr>
+        <w:t xml:space="preserve">`patMethenyEligibilityStats`</w:t>
+      </w:r>
+      <w:r>
+        <w:t xml:space="preserve"> (d2/d4/d5 eligible bar counts vs target rates). 3. Optional bar-by-bar audit: </w:t>
+      </w:r>
+      <w:r>
+        <w:rPr>
+          <w:b/>
+          <w:bCs/>
+        </w:rPr>
+        <w:t xml:space="preserve">`formatPatMethenyEligibilityDiagnostics`</w:t>
+      </w:r>
+      <w:r>
+        <w:t xml:space="preserve">; CLI </w:t>
+      </w:r>
+      <w:r>
+        <w:rPr>
+          <w:b/>
+          <w:bCs/>
+        </w:rPr>
+        <w:t xml:space="preserve">`npm run probe:pat-metheny-eligibility`</w:t>
+      </w:r>
+      <w:r>
+        <w:t xml:space="preserve"> in </w:t>
+      </w:r>
+      <w:r>
+        <w:rPr>
+          <w:b/>
+          <w:bCs/>
+        </w:rPr>
+        <w:t xml:space="preserve">`engines/composer-os-v2`</w:t>
+      </w:r>
+      <w:r>
+        <w:t xml:space="preserve">.</w:t>
+      </w:r>
+    </w:p>
+    <w:p>
+      <w:pPr>
+        <w:spacing w:after="160"/>
+      </w:pPr>
+      <w:r>
+        <w:rPr>
+          <w:b/>
+          <w:bCs/>
+        </w:rPr>
+        <w:t xml:space="preserve">ECM floating harmony arc:</w:t>
+      </w:r>
+      <w:r>
+        <w:t xml:space="preserve"> Hook / identity / motif bars skip disruptive devices where gated; blues-heavy dominant colours can </w:t>
+      </w:r>
+      <w:r>
+        <w:rPr>
+          <w:b/>
+          <w:bCs/>
+        </w:rPr>
+        <w:t xml:space="preserve">strip</w:t>
+      </w:r>
+      <w:r>
+        <w:t xml:space="preserve"> toward maj9 (`stripBluesDominantColour`). </w:t>
+      </w:r>
+      <w:r>
+        <w:rPr>
+          <w:b/>
+          <w:bCs/>
+        </w:rPr>
+        <w:t xml:space="preserve">Song Mode</w:t>
+      </w:r>
+      <w:r>
+        <w:t xml:space="preserve"> chord pools </w:t>
+      </w:r>
+      <w:r>
+        <w:rPr>
+          <w:b/>
+          <w:bCs/>
+        </w:rPr>
+        <w:t xml:space="preserve">`SONGWRITER_CHORD_POOLS.pat_metheny`</w:t>
+      </w:r>
+      <w:r>
+        <w:t xml:space="preserve"> feed add9/maj9 pastoral rows.</w:t>
+      </w:r>
+    </w:p>
+    <w:p>
+      <w:pPr>
+        <w:spacing w:after="160"/>
+      </w:pPr>
+      <w:r>
+        <w:rPr>
+          <w:b/>
+          <w:bCs/>
+        </w:rPr>
+        <w:t xml:space="preserve">Alternate tunings:</w:t>
+      </w:r>
+      <w:r>
+        <w:t xml:space="preserve"> </w:t>
+      </w:r>
+      <w:r>
+        <w:rPr>
+          <w:b/>
+          <w:bCs/>
+        </w:rPr>
+        <w:t xml:space="preserve">`STYLE_PAT_METHENY`</w:t>
+      </w:r>
+      <w:r>
+        <w:t xml:space="preserve"> is listed in </w:t>
+      </w:r>
+      <w:r>
+        <w:rPr>
+          <w:b/>
+          <w:bCs/>
+        </w:rPr>
+        <w:t xml:space="preserve">`STYLE_PROFILES_WITH_ALTERNATE_GUITAR_TUNING`</w:t>
+      </w:r>
+      <w:r>
+        <w:t xml:space="preserve"> (</w:t>
+      </w:r>
+      <w:r>
+        <w:rPr>
+          <w:b/>
+          <w:bCs/>
+        </w:rPr>
+        <w:t xml:space="preserve">`alternateGuitarTunings.ts`</w:t>
+      </w:r>
+      <w:r>
+        <w:t xml:space="preserve">). See </w:t>
+      </w:r>
+      <w:r>
+        <w:rPr>
+          <w:b/>
+          <w:bCs/>
+        </w:rPr>
+        <w:t xml:space="preserve">§11 Alternate tunings workflow</w:t>
+      </w:r>
+      <w:r>
+        <w:t xml:space="preserve">.</w:t>
       </w:r>
     </w:p>
     <w:p>

</xml_diff>

<commit_message>
feat: vocal melody engine — chord-tone aware, style-driven, melodyBehaviour wired
Co-authored-by: Cursor <cursoragent@cursor.com>
</commit_message>
<xml_diff>
--- a/docs/COMPOSER_OS_PLAYBOOK.docx
+++ b/docs/COMPOSER_OS_PLAYBOOK.docx
@@ -1076,6 +1076,635 @@
       </w:r>
       <w:r>
         <w:t xml:space="preserve"> describe caps and fallbacks.</w:t>
+      </w:r>
+    </w:p>
+    <w:p>
+      <w:pPr>
+        <w:pStyle w:val="Heading1"/>
+        <w:spacing w:after="120" w:before="200"/>
+      </w:pPr>
+      <w:r>
+        <w:t xml:space="preserve">Vocal melody engine (Song Mode lead melody)</w:t>
+      </w:r>
+    </w:p>
+    <w:p>
+      <w:pPr>
+        <w:spacing w:after="160"/>
+      </w:pPr>
+      <w:r>
+        <w:t xml:space="preserve">Song Mode builds a </w:t>
+      </w:r>
+      <w:r>
+        <w:rPr>
+          <w:b/>
+          <w:bCs/>
+        </w:rPr>
+        <w:t xml:space="preserve">planning-layer</w:t>
+      </w:r>
+      <w:r>
+        <w:t xml:space="preserve"> vocal sketch before the golden-path score: </w:t>
+      </w:r>
+      <w:r>
+        <w:rPr>
+          <w:b/>
+          <w:bCs/>
+        </w:rPr>
+        <w:t xml:space="preserve">`planMelodyBehaviour`</w:t>
+      </w:r>
+      <w:r>
+        <w:t xml:space="preserve"> (per shipped songwriter id) produces </w:t>
+      </w:r>
+      <w:r>
+        <w:rPr>
+          <w:b/>
+          <w:bCs/>
+        </w:rPr>
+        <w:t xml:space="preserve">`MelodyBehaviourPlan`</w:t>
+      </w:r>
+      <w:r>
+        <w:t xml:space="preserve"> scalars stored on </w:t>
+      </w:r>
+      <w:r>
+        <w:rPr>
+          <w:b/>
+          <w:bCs/>
+        </w:rPr>
+        <w:t xml:space="preserve">`SongwritingPlanningBundle`</w:t>
+      </w:r>
+      <w:r>
+        <w:t xml:space="preserve">; </w:t>
+      </w:r>
+      <w:r>
+        <w:rPr>
+          <w:b/>
+          <w:bCs/>
+        </w:rPr>
+        <w:t xml:space="preserve">`buildCompiledSong`</w:t>
+      </w:r>
+      <w:r>
+        <w:t xml:space="preserve"> passes that bundle into </w:t>
+      </w:r>
+      <w:r>
+        <w:rPr>
+          <w:b/>
+          <w:bCs/>
+        </w:rPr>
+        <w:t xml:space="preserve">`planLeadMelody`</w:t>
+      </w:r>
+      <w:r>
+        <w:t xml:space="preserve"> (`engines/composer-os-v2/core/song-mode/leadMelodyPlanner.ts`). Output is </w:t>
+      </w:r>
+      <w:r>
+        <w:rPr>
+          <w:b/>
+          <w:bCs/>
+        </w:rPr>
+        <w:t xml:space="preserve">`LeadMelodyPlan`</w:t>
+      </w:r>
+      <w:r>
+        <w:t xml:space="preserve"> (measure / beat / duration / MIDI events), folded into </w:t>
+      </w:r>
+      <w:r>
+        <w:rPr>
+          <w:b/>
+          <w:bCs/>
+        </w:rPr>
+        <w:t xml:space="preserve">`LeadSheetContract.vocalMelody`</w:t>
+      </w:r>
+      <w:r>
+        <w:t xml:space="preserve"> — not the same part as duo guitar </w:t>
+      </w:r>
+      <w:r>
+        <w:rPr>
+          <w:b/>
+          <w:bCs/>
+        </w:rPr>
+        <w:t xml:space="preserve">`NoteEvent`</w:t>
+      </w:r>
+      <w:r>
+        <w:t xml:space="preserve"> rows unless separately bridged.</w:t>
+      </w:r>
+    </w:p>
+    <w:p>
+      <w:pPr>
+        <w:pStyle w:val="Heading2"/>
+        <w:spacing w:after="100" w:before="160"/>
+      </w:pPr>
+      <w:r>
+        <w:t xml:space="preserve">melodyBehaviour scalars</w:t>
+      </w:r>
+    </w:p>
+    <w:tbl>
+      <w:tblPr>
+        <w:tblW w:type="pct" w:w="100%"/>
+        <w:tblBorders>
+          <w:top w:val="single" w:color="auto" w:sz="4"/>
+          <w:left w:val="single" w:color="auto" w:sz="4"/>
+          <w:bottom w:val="single" w:color="auto" w:sz="4"/>
+          <w:right w:val="single" w:color="auto" w:sz="4"/>
+          <w:insideH w:val="single" w:color="auto" w:sz="4"/>
+          <w:insideV w:val="single" w:color="auto" w:sz="4"/>
+        </w:tblBorders>
+      </w:tblPr>
+      <w:tblGrid>
+        <w:gridCol w:w="4500"/>
+        <w:gridCol w:w="4500"/>
+      </w:tblGrid>
+      <w:tr>
+        <w:tc>
+          <w:tcPr>
+            <w:tcW w:type="pct" w:w="4500%"/>
+          </w:tcPr>
+          <w:p>
+            <w:pPr>
+              <w:spacing w:after="60"/>
+            </w:pPr>
+            <w:r>
+              <w:t xml:space="preserve">Field</w:t>
+            </w:r>
+          </w:p>
+        </w:tc>
+        <w:tc>
+          <w:tcPr>
+            <w:tcW w:type="pct" w:w="4500%"/>
+          </w:tcPr>
+          <w:p>
+            <w:pPr>
+              <w:spacing w:after="60"/>
+            </w:pPr>
+            <w:r>
+              <w:t xml:space="preserve">Role</w:t>
+            </w:r>
+          </w:p>
+        </w:tc>
+      </w:tr>
+      <w:tr>
+        <w:tc>
+          <w:tcPr>
+            <w:tcW w:type="pct" w:w="4500%"/>
+          </w:tcPr>
+          <w:p>
+            <w:pPr>
+              <w:spacing w:after="60"/>
+            </w:pPr>
+            <w:r>
+              <w:rPr>
+                <w:b/>
+                <w:bCs/>
+              </w:rPr>
+              <w:t xml:space="preserve">`repetitionVsVariationBias`</w:t>
+            </w:r>
+            <w:r>
+              <w:t xml:space="preserve"> (0–1)</w:t>
+            </w:r>
+          </w:p>
+        </w:tc>
+        <w:tc>
+          <w:tcPr>
+            <w:tcW w:type="pct" w:w="4500%"/>
+          </w:tcPr>
+          <w:p>
+            <w:pPr>
+              <w:spacing w:after="60"/>
+            </w:pPr>
+            <w:r>
+              <w:t xml:space="preserve">High → reuse phrase motif shape on later bars (rhythm + relative contour); low → fresher bar-level picks.</w:t>
+            </w:r>
+          </w:p>
+        </w:tc>
+      </w:tr>
+      <w:tr>
+        <w:tc>
+          <w:tcPr>
+            <w:tcW w:type="pct" w:w="4500%"/>
+          </w:tcPr>
+          <w:p>
+            <w:pPr>
+              <w:spacing w:after="60"/>
+            </w:pPr>
+            <w:r>
+              <w:rPr>
+                <w:b/>
+                <w:bCs/>
+              </w:rPr>
+              <w:t xml:space="preserve">`intervalTendency`</w:t>
+            </w:r>
+          </w:p>
+        </w:tc>
+        <w:tc>
+          <w:tcPr>
+            <w:tcW w:type="pct" w:w="4500%"/>
+          </w:tcPr>
+          <w:p>
+            <w:pPr>
+              <w:spacing w:after="60"/>
+            </w:pPr>
+            <w:r>
+              <w:rPr>
+                <w:b/>
+                <w:bCs/>
+              </w:rPr>
+              <w:t xml:space="preserve">`stepwise`</w:t>
+            </w:r>
+            <w:r>
+              <w:t xml:space="preserve"> / </w:t>
+            </w:r>
+            <w:r>
+              <w:rPr>
+                <w:b/>
+                <w:bCs/>
+              </w:rPr>
+              <w:t xml:space="preserve">`mixed`</w:t>
+            </w:r>
+            <w:r>
+              <w:t xml:space="preserve"> / </w:t>
+            </w:r>
+            <w:r>
+              <w:rPr>
+                <w:b/>
+                <w:bCs/>
+              </w:rPr>
+              <w:t xml:space="preserve">`angular`</w:t>
+            </w:r>
+            <w:r>
+              <w:t xml:space="preserve"> — biases chord-tone picks toward small steps vs wider leaps.</w:t>
+            </w:r>
+          </w:p>
+        </w:tc>
+      </w:tr>
+      <w:tr>
+        <w:tc>
+          <w:tcPr>
+            <w:tcW w:type="pct" w:w="4500%"/>
+          </w:tcPr>
+          <w:p>
+            <w:pPr>
+              <w:spacing w:after="60"/>
+            </w:pPr>
+            <w:r>
+              <w:rPr>
+                <w:b/>
+                <w:bCs/>
+              </w:rPr>
+              <w:t xml:space="preserve">`phraseAsymmetryTendency`</w:t>
+            </w:r>
+            <w:r>
+              <w:t xml:space="preserve"> (0–1)</w:t>
+            </w:r>
+          </w:p>
+        </w:tc>
+        <w:tc>
+          <w:tcPr>
+            <w:tcW w:type="pct" w:w="4500%"/>
+          </w:tcPr>
+          <w:p>
+            <w:pPr>
+              <w:spacing w:after="60"/>
+            </w:pPr>
+            <w:r>
+              <w:t xml:space="preserve">Planning asymmetry hint (paired with hook/chorus planners elsewhere).</w:t>
+            </w:r>
+          </w:p>
+        </w:tc>
+      </w:tr>
+      <w:tr>
+        <w:tc>
+          <w:tcPr>
+            <w:tcW w:type="pct" w:w="4500%"/>
+          </w:tcPr>
+          <w:p>
+            <w:pPr>
+              <w:spacing w:after="60"/>
+            </w:pPr>
+            <w:r>
+              <w:rPr>
+                <w:b/>
+                <w:bCs/>
+              </w:rPr>
+              <w:t xml:space="preserve">`cadenceFrequency`</w:t>
+            </w:r>
+          </w:p>
+        </w:tc>
+        <w:tc>
+          <w:tcPr>
+            <w:tcW w:type="pct" w:w="4500%"/>
+          </w:tcPr>
+          <w:p>
+            <w:pPr>
+              <w:spacing w:after="60"/>
+            </w:pPr>
+            <w:r>
+              <w:rPr>
+                <w:b/>
+                <w:bCs/>
+              </w:rPr>
+              <w:t xml:space="preserve">`low`</w:t>
+            </w:r>
+            <w:r>
+              <w:t xml:space="preserve"> / </w:t>
+            </w:r>
+            <w:r>
+              <w:rPr>
+                <w:b/>
+                <w:bCs/>
+              </w:rPr>
+              <w:t xml:space="preserve">`medium`</w:t>
+            </w:r>
+            <w:r>
+              <w:t xml:space="preserve"> / </w:t>
+            </w:r>
+            <w:r>
+              <w:rPr>
+                <w:b/>
+                <w:bCs/>
+              </w:rPr>
+              <w:t xml:space="preserve">`high`</w:t>
+            </w:r>
+            <w:r>
+              <w:t xml:space="preserve"> — cadence density hint for downstream lyrics/phrasing.</w:t>
+            </w:r>
+          </w:p>
+        </w:tc>
+      </w:tr>
+      <w:tr>
+        <w:tc>
+          <w:tcPr>
+            <w:tcW w:type="pct" w:w="4500%"/>
+          </w:tcPr>
+          <w:p>
+            <w:pPr>
+              <w:spacing w:after="60"/>
+            </w:pPr>
+            <w:r>
+              <w:rPr>
+                <w:b/>
+                <w:bCs/>
+              </w:rPr>
+              <w:t xml:space="preserve">`rhythmicSubdivision`</w:t>
+            </w:r>
+          </w:p>
+        </w:tc>
+        <w:tc>
+          <w:tcPr>
+            <w:tcW w:type="pct" w:w="4500%"/>
+          </w:tcPr>
+          <w:p>
+            <w:pPr>
+              <w:spacing w:after="60"/>
+            </w:pPr>
+            <w:r>
+              <w:rPr>
+                <w:b/>
+                <w:bCs/>
+              </w:rPr>
+              <w:t xml:space="preserve">`whole_bar`</w:t>
+            </w:r>
+            <w:r>
+              <w:t xml:space="preserve">, </w:t>
+            </w:r>
+            <w:r>
+              <w:rPr>
+                <w:b/>
+                <w:bCs/>
+              </w:rPr>
+              <w:t xml:space="preserve">`half_quarter`</w:t>
+            </w:r>
+            <w:r>
+              <w:t xml:space="preserve">, </w:t>
+            </w:r>
+            <w:r>
+              <w:rPr>
+                <w:b/>
+                <w:bCs/>
+              </w:rPr>
+              <w:t xml:space="preserve">`eighth_patterns`</w:t>
+            </w:r>
+            <w:r>
+              <w:t xml:space="preserve">, or </w:t>
+            </w:r>
+            <w:r>
+              <w:rPr>
+                <w:b/>
+                <w:bCs/>
+              </w:rPr>
+              <w:t xml:space="preserve">`mixed`</w:t>
+            </w:r>
+            <w:r>
+              <w:t xml:space="preserve"> (bar-local roll between densities). Drives quarter/eighth </w:t>
+            </w:r>
+            <w:r>
+              <w:rPr>
+                <w:b/>
+                <w:bCs/>
+              </w:rPr>
+              <w:t xml:space="preserve">cells</w:t>
+            </w:r>
+            <w:r>
+              <w:t xml:space="preserve"> inside each bar (still on the 4/4 scaffold).</w:t>
+            </w:r>
+          </w:p>
+        </w:tc>
+      </w:tr>
+    </w:tbl>
+    <w:p>
+      <w:pPr>
+        <w:spacing w:after="160"/>
+      </w:pPr>
+    </w:p>
+    <w:p>
+      <w:pPr>
+        <w:spacing w:after="160"/>
+      </w:pPr>
+      <w:r>
+        <w:t xml:space="preserve">Shipped writers each receive a distinct profile in </w:t>
+      </w:r>
+      <w:r>
+        <w:rPr>
+          <w:b/>
+          <w:bCs/>
+        </w:rPr>
+        <w:t xml:space="preserve">`melodyBehaviourPlanner.ts`</w:t>
+      </w:r>
+      <w:r>
+        <w:t xml:space="preserve">; unlisted ids use seed-tinted defaults.</w:t>
+      </w:r>
+    </w:p>
+    <w:p>
+      <w:pPr>
+        <w:pStyle w:val="Heading2"/>
+        <w:spacing w:after="100" w:before="160"/>
+      </w:pPr>
+      <w:r>
+        <w:t xml:space="preserve">Chord-tone awareness</w:t>
+      </w:r>
+    </w:p>
+    <w:p>
+      <w:pPr>
+        <w:spacing w:after="160"/>
+      </w:pPr>
+      <w:r>
+        <w:t xml:space="preserve">Per bar, symbols come from </w:t>
+      </w:r>
+      <w:r>
+        <w:rPr>
+          <w:b/>
+          <w:bCs/>
+        </w:rPr>
+        <w:t xml:space="preserve">`flattenChordPlanToHarmonyBars`</w:t>
+      </w:r>
+      <w:r>
+        <w:t xml:space="preserve"> (scaffold after era normalization — aligned with Song Mode harmony planning). Optional </w:t>
+      </w:r>
+      <w:r>
+        <w:rPr>
+          <w:b/>
+          <w:bCs/>
+        </w:rPr>
+        <w:t xml:space="preserve">`harmonyBars`</w:t>
+      </w:r>
+      <w:r>
+        <w:t xml:space="preserve"> override on </w:t>
+      </w:r>
+      <w:r>
+        <w:rPr>
+          <w:b/>
+          <w:bCs/>
+        </w:rPr>
+        <w:t xml:space="preserve">`planLeadMelody`</w:t>
+      </w:r>
+      <w:r>
+        <w:t xml:space="preserve"> is reserved for future authoritative timelines (e.g. locked bars). </w:t>
+      </w:r>
+      <w:r>
+        <w:rPr>
+          <w:b/>
+          <w:bCs/>
+        </w:rPr>
+        <w:t xml:space="preserve">`chordTonesForChordSymbol(symbol, { lockedHarmony: true })`</w:t>
+      </w:r>
+      <w:r>
+        <w:t xml:space="preserve"> yields tertian reference tones; pitches are mapped into the singer </w:t>
+      </w:r>
+      <w:r>
+        <w:rPr>
+          <w:b/>
+          <w:bCs/>
+        </w:rPr>
+        <w:t xml:space="preserve">comfort range</w:t>
+      </w:r>
+      <w:r>
+        <w:t xml:space="preserve"> before the absolute-range clamp.</w:t>
+      </w:r>
+    </w:p>
+    <w:p>
+      <w:pPr>
+        <w:pStyle w:val="Heading2"/>
+        <w:spacing w:after="100" w:before="160"/>
+      </w:pPr>
+      <w:r>
+        <w:t xml:space="preserve">Rhythmic subdivision</w:t>
+      </w:r>
+    </w:p>
+    <w:p>
+      <w:pPr>
+        <w:spacing w:after="160"/>
+      </w:pPr>
+      <w:r>
+        <w:t xml:space="preserve">Lead melody uses </w:t>
+      </w:r>
+      <w:r>
+        <w:rPr>
+          <w:b/>
+          <w:bCs/>
+        </w:rPr>
+        <w:t xml:space="preserve">multiple events per bar</w:t>
+      </w:r>
+      <w:r>
+        <w:t xml:space="preserve"> when </w:t>
+      </w:r>
+      <w:r>
+        <w:rPr>
+          <w:b/>
+          <w:bCs/>
+        </w:rPr>
+        <w:t xml:space="preserve">`half_quarter`</w:t>
+      </w:r>
+      <w:r>
+        <w:t xml:space="preserve"> or </w:t>
+      </w:r>
+      <w:r>
+        <w:rPr>
+          <w:b/>
+          <w:bCs/>
+        </w:rPr>
+        <w:t xml:space="preserve">`eighth_patterns`</w:t>
+      </w:r>
+      <w:r>
+        <w:t xml:space="preserve"> is active (half notes, quarter streams, or sparse eighth grids). </w:t>
+      </w:r>
+      <w:r>
+        <w:rPr>
+          <w:b/>
+          <w:bCs/>
+        </w:rPr>
+        <w:t xml:space="preserve">`whole_bar`</w:t>
+      </w:r>
+      <w:r>
+        <w:t xml:space="preserve"> keeps a single anchor per bar. </w:t>
+      </w:r>
+      <w:r>
+        <w:rPr>
+          <w:b/>
+          <w:bCs/>
+        </w:rPr>
+        <w:t xml:space="preserve">`mixed`</w:t>
+      </w:r>
+      <w:r>
+        <w:t xml:space="preserve"> picks a density per bar deterministically from the seed.</w:t>
+      </w:r>
+    </w:p>
+    <w:p>
+      <w:pPr>
+        <w:pStyle w:val="Heading2"/>
+        <w:spacing w:after="100" w:before="160"/>
+      </w:pPr>
+      <w:r>
+        <w:t xml:space="preserve">Singer range</w:t>
+      </w:r>
+    </w:p>
+    <w:p>
+      <w:pPr>
+        <w:spacing w:after="160"/>
+      </w:pPr>
+      <w:r>
+        <w:rPr>
+          <w:b/>
+          <w:bCs/>
+        </w:rPr>
+        <w:t xml:space="preserve">`getSingerRangeProfile`</w:t>
+      </w:r>
+      <w:r>
+        <w:t xml:space="preserve"> supplies comfort and absolute MIDI bounds; </w:t>
+      </w:r>
+      <w:r>
+        <w:rPr>
+          <w:b/>
+          <w:bCs/>
+        </w:rPr>
+        <w:t xml:space="preserve">`planLeadMelody`</w:t>
+      </w:r>
+      <w:r>
+        <w:t xml:space="preserve"> clamps after </w:t>
+      </w:r>
+      <w:r>
+        <w:rPr>
+          <w:b/>
+          <w:bCs/>
+        </w:rPr>
+        <w:t xml:space="preserve">chorus lift</w:t>
+      </w:r>
+      <w:r>
+        <w:t xml:space="preserve"> semitones so peaks stay singable.</w:t>
       </w:r>
     </w:p>
     <w:p>

</xml_diff>

<commit_message>
feat: vocal melody — 34 composer profiles + vocal lead sheet fix
Co-authored-by: Cursor <cursoragent@cursor.com>
</commit_message>
<xml_diff>
--- a/docs/COMPOSER_OS_PLAYBOOK.docx
+++ b/docs/COMPOSER_OS_PLAYBOOK.docx
@@ -1112,7 +1112,17 @@
         <w:t xml:space="preserve">`planMelodyBehaviour`</w:t>
       </w:r>
       <w:r>
-        <w:t xml:space="preserve"> (per shipped songwriter id) produces </w:t>
+        <w:t xml:space="preserve"> (per </w:t>
+      </w:r>
+      <w:r>
+        <w:rPr>
+          <w:b/>
+          <w:bCs/>
+        </w:rPr>
+        <w:t xml:space="preserve">`SongwriterRuleId`</w:t>
+      </w:r>
+      <w:r>
+        <w:t xml:space="preserve">) produces </w:t>
       </w:r>
       <w:r>
         <w:rPr>
@@ -1122,7 +1132,7 @@
         <w:t xml:space="preserve">`MelodyBehaviourPlan`</w:t>
       </w:r>
       <w:r>
-        <w:t xml:space="preserve"> scalars stored on </w:t>
+        <w:t xml:space="preserve"> stored on </w:t>
       </w:r>
       <w:r>
         <w:rPr>
@@ -1142,7 +1152,7 @@
         <w:t xml:space="preserve">`buildCompiledSong`</w:t>
       </w:r>
       <w:r>
-        <w:t xml:space="preserve"> passes that bundle into </w:t>
+        <w:t xml:space="preserve"> passes it into </w:t>
       </w:r>
       <w:r>
         <w:rPr>
@@ -1162,7 +1172,7 @@
         <w:t xml:space="preserve">`LeadMelodyPlan`</w:t>
       </w:r>
       <w:r>
-        <w:t xml:space="preserve"> (measure / beat / duration / MIDI events), folded into </w:t>
+        <w:t xml:space="preserve"> (measure / beat / duration / MIDI), folded into </w:t>
       </w:r>
       <w:r>
         <w:rPr>
@@ -1172,17 +1182,82 @@
         <w:t xml:space="preserve">`LeadSheetContract.vocalMelody`</w:t>
       </w:r>
       <w:r>
-        <w:t xml:space="preserve"> — not the same part as duo guitar </w:t>
-      </w:r>
-      <w:r>
-        <w:rPr>
-          <w:b/>
-          <w:bCs/>
-        </w:rPr>
-        <w:t xml:space="preserve">`NoteEvent`</w:t>
-      </w:r>
-      <w:r>
-        <w:t xml:space="preserve"> rows unless separately bridged.</w:t>
+        <w:t xml:space="preserve">.</w:t>
+      </w:r>
+    </w:p>
+    <w:p>
+      <w:pPr>
+        <w:spacing w:after="160"/>
+      </w:pPr>
+      <w:r>
+        <w:rPr>
+          <w:b/>
+          <w:bCs/>
+        </w:rPr>
+        <w:t xml:space="preserve">Optional vocal lead sheet:</w:t>
+      </w:r>
+      <w:r>
+        <w:t xml:space="preserve"> When Generate’s </w:t>
+      </w:r>
+      <w:r>
+        <w:rPr>
+          <w:b/>
+          <w:bCs/>
+        </w:rPr>
+        <w:t xml:space="preserve">Include vocal lead sheet</w:t>
+      </w:r>
+      <w:r>
+        <w:t xml:space="preserve"> is on, the app writes </w:t>
+      </w:r>
+      <w:r>
+        <w:rPr>
+          <w:b/>
+          <w:bCs/>
+        </w:rPr>
+        <w:t xml:space="preserve">`*_vocal_lead_sheet.musicxml`</w:t>
+      </w:r>
+      <w:r>
+        <w:t xml:space="preserve"> via </w:t>
+      </w:r>
+      <w:r>
+        <w:rPr>
+          <w:b/>
+          <w:bCs/>
+        </w:rPr>
+        <w:t xml:space="preserve">`exportVocalLeadSheetMusicXmlViaPython`</w:t>
+      </w:r>
+      <w:r>
+        <w:t xml:space="preserve"> (`songwritingBridgeLeadSheet.ts`). That file uses </w:t>
+      </w:r>
+      <w:r>
+        <w:rPr>
+          <w:b/>
+          <w:bCs/>
+        </w:rPr>
+        <w:t xml:space="preserve">`LeadSheetContract.vocalMelody.events`</w:t>
+      </w:r>
+      <w:r>
+        <w:t xml:space="preserve"> — the </w:t>
+      </w:r>
+      <w:r>
+        <w:rPr>
+          <w:b/>
+          <w:bCs/>
+        </w:rPr>
+        <w:t xml:space="preserve">planned lead melody</w:t>
+      </w:r>
+      <w:r>
+        <w:t xml:space="preserve">, not a transcription of duo guitar comp (</w:t>
+      </w:r>
+      <w:r>
+        <w:rPr>
+          <w:b/>
+          <w:bCs/>
+        </w:rPr>
+        <w:t xml:space="preserve">`clean_electric_guitar`</w:t>
+      </w:r>
+      <w:r>
+        <w:t xml:space="preserve">).</w:t>
       </w:r>
     </w:p>
     <w:p>
@@ -1490,7 +1565,7 @@
               <w:t xml:space="preserve">`mixed`</w:t>
             </w:r>
             <w:r>
-              <w:t xml:space="preserve"> (bar-local roll between densities). Drives quarter/eighth </w:t>
+              <w:t xml:space="preserve"> — drives quarter/eighth </w:t>
             </w:r>
             <w:r>
               <w:rPr>
@@ -1500,7 +1575,123 @@
               <w:t xml:space="preserve">cells</w:t>
             </w:r>
             <w:r>
-              <w:t xml:space="preserve"> inside each bar (still on the 4/4 scaffold).</w:t>
+              <w:t xml:space="preserve"> per bar (4/4 scaffold).</w:t>
+            </w:r>
+          </w:p>
+        </w:tc>
+      </w:tr>
+      <w:tr>
+        <w:tc>
+          <w:tcPr>
+            <w:tcW w:type="pct" w:w="4500%"/>
+          </w:tcPr>
+          <w:p>
+            <w:pPr>
+              <w:spacing w:after="60"/>
+            </w:pPr>
+            <w:r>
+              <w:rPr>
+                <w:b/>
+                <w:bCs/>
+              </w:rPr>
+              <w:t xml:space="preserve">`phraseLength`</w:t>
+            </w:r>
+          </w:p>
+        </w:tc>
+        <w:tc>
+          <w:tcPr>
+            <w:tcW w:type="pct" w:w="4500%"/>
+          </w:tcPr>
+          <w:p>
+            <w:pPr>
+              <w:spacing w:after="60"/>
+            </w:pPr>
+            <w:r>
+              <w:t xml:space="preserve">Target phrase length hint (</w:t>
+            </w:r>
+            <w:r>
+              <w:rPr>
+                <w:b/>
+                <w:bCs/>
+              </w:rPr>
+              <w:t xml:space="preserve">bars</w:t>
+            </w:r>
+            <w:r>
+              <w:t xml:space="preserve">).</w:t>
+            </w:r>
+          </w:p>
+        </w:tc>
+      </w:tr>
+      <w:tr>
+        <w:tc>
+          <w:tcPr>
+            <w:tcW w:type="pct" w:w="4500%"/>
+          </w:tcPr>
+          <w:p>
+            <w:pPr>
+              <w:spacing w:after="60"/>
+            </w:pPr>
+            <w:r>
+              <w:rPr>
+                <w:b/>
+                <w:bCs/>
+              </w:rPr>
+              <w:t xml:space="preserve">`contourProfile`</w:t>
+            </w:r>
+          </w:p>
+        </w:tc>
+        <w:tc>
+          <w:tcPr>
+            <w:tcW w:type="pct" w:w="4500%"/>
+          </w:tcPr>
+          <w:p>
+            <w:pPr>
+              <w:spacing w:after="60"/>
+            </w:pPr>
+            <w:r>
+              <w:t xml:space="preserve">Research contour label (mapped inside </w:t>
+            </w:r>
+            <w:r>
+              <w:rPr>
+                <w:b/>
+                <w:bCs/>
+              </w:rPr>
+              <w:t xml:space="preserve">`planLeadMelody`</w:t>
+            </w:r>
+            <w:r>
+              <w:t xml:space="preserve"> to phrase contour bias).</w:t>
+            </w:r>
+          </w:p>
+        </w:tc>
+      </w:tr>
+      <w:tr>
+        <w:tc>
+          <w:tcPr>
+            <w:tcW w:type="pct" w:w="4500%"/>
+          </w:tcPr>
+          <w:p>
+            <w:pPr>
+              <w:spacing w:after="60"/>
+            </w:pPr>
+            <w:r>
+              <w:rPr>
+                <w:b/>
+                <w:bCs/>
+              </w:rPr>
+              <w:t xml:space="preserve">`devices`</w:t>
+            </w:r>
+          </w:p>
+        </w:tc>
+        <w:tc>
+          <w:tcPr>
+            <w:tcW w:type="pct" w:w="4500%"/>
+          </w:tcPr>
+          <w:p>
+            <w:pPr>
+              <w:spacing w:after="60"/>
+            </w:pPr>
+            <w:r>
+              <w:t xml:space="preserve">Named vocabulary hooks for manifests/pedagogy (slice-aligned strings).</w:t>
             </w:r>
           </w:p>
         </w:tc>
@@ -1516,7 +1707,17 @@
         <w:spacing w:after="160"/>
       </w:pPr>
       <w:r>
-        <w:t xml:space="preserve">Shipped writers each receive a distinct profile in </w:t>
+        <w:t xml:space="preserve">Research-driven rows live in </w:t>
+      </w:r>
+      <w:r>
+        <w:rPr>
+          <w:b/>
+          <w:bCs/>
+        </w:rPr>
+        <w:t xml:space="preserve">`MELODY_PROFILES`</w:t>
+      </w:r>
+      <w:r>
+        <w:t xml:space="preserve"> inside </w:t>
       </w:r>
       <w:r>
         <w:rPr>
@@ -1526,8 +1727,3329 @@
         <w:t xml:space="preserve">`melodyBehaviourPlanner.ts`</w:t>
       </w:r>
       <w:r>
-        <w:t xml:space="preserve">; unlisted ids use seed-tinted defaults.</w:t>
-      </w:r>
+        <w:t xml:space="preserve">. Other </w:t>
+      </w:r>
+      <w:r>
+        <w:rPr>
+          <w:b/>
+          <w:bCs/>
+        </w:rPr>
+        <w:t xml:space="preserve">`SongwriterRuleId`</w:t>
+      </w:r>
+      <w:r>
+        <w:t xml:space="preserve"> values fall back to seed-tinted defaults (includes e.g. </w:t>
+      </w:r>
+      <w:r>
+        <w:rPr>
+          <w:b/>
+          <w:bCs/>
+        </w:rPr>
+        <w:t xml:space="preserve">`max_martin`</w:t>
+      </w:r>
+      <w:r>
+        <w:t xml:space="preserve">, </w:t>
+      </w:r>
+      <w:r>
+        <w:rPr>
+          <w:b/>
+          <w:bCs/>
+        </w:rPr>
+        <w:t xml:space="preserve">`ecm_chamber`</w:t>
+      </w:r>
+      <w:r>
+        <w:t xml:space="preserve"> convenience rows).</w:t>
+      </w:r>
+    </w:p>
+    <w:p>
+      <w:pPr>
+        <w:pStyle w:val="Heading2"/>
+        <w:spacing w:after="100" w:before="160"/>
+      </w:pPr>
+      <w:r>
+        <w:t xml:space="preserve">Per-composer profile table (34 research rows)</w:t>
+      </w:r>
+    </w:p>
+    <w:tbl>
+      <w:tblPr>
+        <w:tblW w:type="pct" w:w="100%"/>
+        <w:tblBorders>
+          <w:top w:val="single" w:color="auto" w:sz="4"/>
+          <w:left w:val="single" w:color="auto" w:sz="4"/>
+          <w:bottom w:val="single" w:color="auto" w:sz="4"/>
+          <w:right w:val="single" w:color="auto" w:sz="4"/>
+          <w:insideH w:val="single" w:color="auto" w:sz="4"/>
+          <w:insideV w:val="single" w:color="auto" w:sz="4"/>
+        </w:tblBorders>
+      </w:tblPr>
+      <w:tblGrid>
+        <w:gridCol w:w="1285"/>
+        <w:gridCol w:w="1285"/>
+        <w:gridCol w:w="1285"/>
+        <w:gridCol w:w="1285"/>
+        <w:gridCol w:w="1285"/>
+        <w:gridCol w:w="1285"/>
+        <w:gridCol w:w="1285"/>
+      </w:tblGrid>
+      <w:tr>
+        <w:tc>
+          <w:tcPr>
+            <w:tcW w:type="pct" w:w="1285%"/>
+          </w:tcPr>
+          <w:p>
+            <w:pPr>
+              <w:spacing w:after="60"/>
+            </w:pPr>
+            <w:r>
+              <w:t xml:space="preserve">Writer id</w:t>
+            </w:r>
+          </w:p>
+        </w:tc>
+        <w:tc>
+          <w:tcPr>
+            <w:tcW w:type="pct" w:w="1285%"/>
+          </w:tcPr>
+          <w:p>
+            <w:pPr>
+              <w:spacing w:after="60"/>
+            </w:pPr>
+            <w:r>
+              <w:t xml:space="preserve">interval</w:t>
+            </w:r>
+          </w:p>
+        </w:tc>
+        <w:tc>
+          <w:tcPr>
+            <w:tcW w:type="pct" w:w="1285%"/>
+          </w:tcPr>
+          <w:p>
+            <w:pPr>
+              <w:spacing w:after="60"/>
+            </w:pPr>
+            <w:r>
+              <w:t xml:space="preserve">rhythmic</w:t>
+            </w:r>
+          </w:p>
+        </w:tc>
+        <w:tc>
+          <w:tcPr>
+            <w:tcW w:type="pct" w:w="1285%"/>
+          </w:tcPr>
+          <w:p>
+            <w:pPr>
+              <w:spacing w:after="60"/>
+            </w:pPr>
+            <w:r>
+              <w:t xml:space="preserve">phrase bars</w:t>
+            </w:r>
+          </w:p>
+        </w:tc>
+        <w:tc>
+          <w:tcPr>
+            <w:tcW w:type="pct" w:w="1285%"/>
+          </w:tcPr>
+          <w:p>
+            <w:pPr>
+              <w:spacing w:after="60"/>
+            </w:pPr>
+            <w:r>
+              <w:t xml:space="preserve">repetition</w:t>
+            </w:r>
+          </w:p>
+        </w:tc>
+        <w:tc>
+          <w:tcPr>
+            <w:tcW w:type="pct" w:w="1285%"/>
+          </w:tcPr>
+          <w:p>
+            <w:pPr>
+              <w:spacing w:after="60"/>
+            </w:pPr>
+            <w:r>
+              <w:t xml:space="preserve">contour profile</w:t>
+            </w:r>
+          </w:p>
+        </w:tc>
+        <w:tc>
+          <w:tcPr>
+            <w:tcW w:type="pct" w:w="1285%"/>
+          </w:tcPr>
+          <w:p>
+            <w:pPr>
+              <w:spacing w:after="60"/>
+            </w:pPr>
+            <w:r>
+              <w:t xml:space="preserve">Key devices (abbrev.)</w:t>
+            </w:r>
+          </w:p>
+        </w:tc>
+      </w:tr>
+      <w:tr>
+        <w:tc>
+          <w:tcPr>
+            <w:tcW w:type="pct" w:w="1285%"/>
+          </w:tcPr>
+          <w:p>
+            <w:pPr>
+              <w:spacing w:after="60"/>
+            </w:pPr>
+            <w:r>
+              <w:t xml:space="preserve">`brian_wilson`</w:t>
+            </w:r>
+          </w:p>
+        </w:tc>
+        <w:tc>
+          <w:tcPr>
+            <w:tcW w:type="pct" w:w="1285%"/>
+          </w:tcPr>
+          <w:p>
+            <w:pPr>
+              <w:spacing w:after="60"/>
+            </w:pPr>
+            <w:r>
+              <w:t xml:space="preserve">stepwise</w:t>
+            </w:r>
+          </w:p>
+        </w:tc>
+        <w:tc>
+          <w:tcPr>
+            <w:tcW w:type="pct" w:w="1285%"/>
+          </w:tcPr>
+          <w:p>
+            <w:pPr>
+              <w:spacing w:after="60"/>
+            </w:pPr>
+            <w:r>
+              <w:t xml:space="preserve">mixed</w:t>
+            </w:r>
+          </w:p>
+        </w:tc>
+        <w:tc>
+          <w:tcPr>
+            <w:tcW w:type="pct" w:w="1285%"/>
+          </w:tcPr>
+          <w:p>
+            <w:pPr>
+              <w:spacing w:after="60"/>
+            </w:pPr>
+            <w:r>
+              <w:t xml:space="preserve">8</w:t>
+            </w:r>
+          </w:p>
+        </w:tc>
+        <w:tc>
+          <w:tcPr>
+            <w:tcW w:type="pct" w:w="1285%"/>
+          </w:tcPr>
+          <w:p>
+            <w:pPr>
+              <w:spacing w:after="60"/>
+            </w:pPr>
+            <w:r>
+              <w:t xml:space="preserve">0.5</w:t>
+            </w:r>
+          </w:p>
+        </w:tc>
+        <w:tc>
+          <w:tcPr>
+            <w:tcW w:type="pct" w:w="1285%"/>
+          </w:tcPr>
+          <w:p>
+            <w:pPr>
+              <w:spacing w:after="60"/>
+            </w:pPr>
+            <w:r>
+              <w:t xml:space="preserve">arch</w:t>
+            </w:r>
+          </w:p>
+        </w:tc>
+        <w:tc>
+          <w:tcPr>
+            <w:tcW w:type="pct" w:w="1285%"/>
+          </w:tcPr>
+          <w:p>
+            <w:pPr>
+              <w:spacing w:after="60"/>
+            </w:pPr>
+            <w:r>
+              <w:t xml:space="preserve">sequential_expansion; appoggiatura; suspension</w:t>
+            </w:r>
+          </w:p>
+        </w:tc>
+      </w:tr>
+      <w:tr>
+        <w:tc>
+          <w:tcPr>
+            <w:tcW w:type="pct" w:w="1285%"/>
+          </w:tcPr>
+          <w:p>
+            <w:pPr>
+              <w:spacing w:after="60"/>
+            </w:pPr>
+            <w:r>
+              <w:t xml:space="preserve">`stevie_wonder`</w:t>
+            </w:r>
+          </w:p>
+        </w:tc>
+        <w:tc>
+          <w:tcPr>
+            <w:tcW w:type="pct" w:w="1285%"/>
+          </w:tcPr>
+          <w:p>
+            <w:pPr>
+              <w:spacing w:after="60"/>
+            </w:pPr>
+            <w:r>
+              <w:t xml:space="preserve">stepwise</w:t>
+            </w:r>
+          </w:p>
+        </w:tc>
+        <w:tc>
+          <w:tcPr>
+            <w:tcW w:type="pct" w:w="1285%"/>
+          </w:tcPr>
+          <w:p>
+            <w:pPr>
+              <w:spacing w:after="60"/>
+            </w:pPr>
+            <w:r>
+              <w:t xml:space="preserve">eighth_patterns</w:t>
+            </w:r>
+          </w:p>
+        </w:tc>
+        <w:tc>
+          <w:tcPr>
+            <w:tcW w:type="pct" w:w="1285%"/>
+          </w:tcPr>
+          <w:p>
+            <w:pPr>
+              <w:spacing w:after="60"/>
+            </w:pPr>
+            <w:r>
+              <w:t xml:space="preserve">4</w:t>
+            </w:r>
+          </w:p>
+        </w:tc>
+        <w:tc>
+          <w:tcPr>
+            <w:tcW w:type="pct" w:w="1285%"/>
+          </w:tcPr>
+          <w:p>
+            <w:pPr>
+              <w:spacing w:after="60"/>
+            </w:pPr>
+            <w:r>
+              <w:t xml:space="preserve">0.4</w:t>
+            </w:r>
+          </w:p>
+        </w:tc>
+        <w:tc>
+          <w:tcPr>
+            <w:tcW w:type="pct" w:w="1285%"/>
+          </w:tcPr>
+          <w:p>
+            <w:pPr>
+              <w:spacing w:after="60"/>
+            </w:pPr>
+            <w:r>
+              <w:t xml:space="preserve">ascending</w:t>
+            </w:r>
+          </w:p>
+        </w:tc>
+        <w:tc>
+          <w:tcPr>
+            <w:tcW w:type="pct" w:w="1285%"/>
+          </w:tcPr>
+          <w:p>
+            <w:pPr>
+              <w:spacing w:after="60"/>
+            </w:pPr>
+            <w:r>
+              <w:t xml:space="preserve">melisma; syncopated_anticipation; blues_note; gospel_lift</w:t>
+            </w:r>
+          </w:p>
+        </w:tc>
+      </w:tr>
+      <w:tr>
+        <w:tc>
+          <w:tcPr>
+            <w:tcW w:type="pct" w:w="1285%"/>
+          </w:tcPr>
+          <w:p>
+            <w:pPr>
+              <w:spacing w:after="60"/>
+            </w:pPr>
+            <w:r>
+              <w:t xml:space="preserve">`radiohead`</w:t>
+            </w:r>
+          </w:p>
+        </w:tc>
+        <w:tc>
+          <w:tcPr>
+            <w:tcW w:type="pct" w:w="1285%"/>
+          </w:tcPr>
+          <w:p>
+            <w:pPr>
+              <w:spacing w:after="60"/>
+            </w:pPr>
+            <w:r>
+              <w:t xml:space="preserve">stepwise</w:t>
+            </w:r>
+          </w:p>
+        </w:tc>
+        <w:tc>
+          <w:tcPr>
+            <w:tcW w:type="pct" w:w="1285%"/>
+          </w:tcPr>
+          <w:p>
+            <w:pPr>
+              <w:spacing w:after="60"/>
+            </w:pPr>
+            <w:r>
+              <w:t xml:space="preserve">mixed</w:t>
+            </w:r>
+          </w:p>
+        </w:tc>
+        <w:tc>
+          <w:tcPr>
+            <w:tcW w:type="pct" w:w="1285%"/>
+          </w:tcPr>
+          <w:p>
+            <w:pPr>
+              <w:spacing w:after="60"/>
+            </w:pPr>
+            <w:r>
+              <w:t xml:space="preserve">5</w:t>
+            </w:r>
+          </w:p>
+        </w:tc>
+        <w:tc>
+          <w:tcPr>
+            <w:tcW w:type="pct" w:w="1285%"/>
+          </w:tcPr>
+          <w:p>
+            <w:pPr>
+              <w:spacing w:after="60"/>
+            </w:pPr>
+            <w:r>
+              <w:t xml:space="preserve">0.8</w:t>
+            </w:r>
+          </w:p>
+        </w:tc>
+        <w:tc>
+          <w:tcPr>
+            <w:tcW w:type="pct" w:w="1285%"/>
+          </w:tcPr>
+          <w:p>
+            <w:pPr>
+              <w:spacing w:after="60"/>
+            </w:pPr>
+            <w:r>
+              <w:t xml:space="preserve">flat_with_terminal_climax</w:t>
+            </w:r>
+          </w:p>
+        </w:tc>
+        <w:tc>
+          <w:tcPr>
+            <w:tcW w:type="pct" w:w="1285%"/>
+          </w:tcPr>
+          <w:p>
+            <w:pPr>
+              <w:spacing w:after="60"/>
+            </w:pPr>
+            <w:r>
+              <w:t xml:space="preserve">cell_repetition; modal_unease; metric_dislocation</w:t>
+            </w:r>
+          </w:p>
+        </w:tc>
+      </w:tr>
+      <w:tr>
+        <w:tc>
+          <w:tcPr>
+            <w:tcW w:type="pct" w:w="1285%"/>
+          </w:tcPr>
+          <w:p>
+            <w:pPr>
+              <w:spacing w:after="60"/>
+            </w:pPr>
+            <w:r>
+              <w:t xml:space="preserve">`james_brown`</w:t>
+            </w:r>
+          </w:p>
+        </w:tc>
+        <w:tc>
+          <w:tcPr>
+            <w:tcW w:type="pct" w:w="1285%"/>
+          </w:tcPr>
+          <w:p>
+            <w:pPr>
+              <w:spacing w:after="60"/>
+            </w:pPr>
+            <w:r>
+              <w:t xml:space="preserve">stepwise</w:t>
+            </w:r>
+          </w:p>
+        </w:tc>
+        <w:tc>
+          <w:tcPr>
+            <w:tcW w:type="pct" w:w="1285%"/>
+          </w:tcPr>
+          <w:p>
+            <w:pPr>
+              <w:spacing w:after="60"/>
+            </w:pPr>
+            <w:r>
+              <w:t xml:space="preserve">eighth_patterns</w:t>
+            </w:r>
+          </w:p>
+        </w:tc>
+        <w:tc>
+          <w:tcPr>
+            <w:tcW w:type="pct" w:w="1285%"/>
+          </w:tcPr>
+          <w:p>
+            <w:pPr>
+              <w:spacing w:after="60"/>
+            </w:pPr>
+            <w:r>
+              <w:t xml:space="preserve">2</w:t>
+            </w:r>
+          </w:p>
+        </w:tc>
+        <w:tc>
+          <w:tcPr>
+            <w:tcW w:type="pct" w:w="1285%"/>
+          </w:tcPr>
+          <w:p>
+            <w:pPr>
+              <w:spacing w:after="60"/>
+            </w:pPr>
+            <w:r>
+              <w:t xml:space="preserve">0.9</w:t>
+            </w:r>
+          </w:p>
+        </w:tc>
+        <w:tc>
+          <w:tcPr>
+            <w:tcW w:type="pct" w:w="1285%"/>
+          </w:tcPr>
+          <w:p>
+            <w:pPr>
+              <w:spacing w:after="60"/>
+            </w:pPr>
+            <w:r>
+              <w:t xml:space="preserve">riff</w:t>
+            </w:r>
+          </w:p>
+        </w:tc>
+        <w:tc>
+          <w:tcPr>
+            <w:tcW w:type="pct" w:w="1285%"/>
+          </w:tcPr>
+          <w:p>
+            <w:pPr>
+              <w:spacing w:after="60"/>
+            </w:pPr>
+            <w:r>
+              <w:t xml:space="preserve">on_the_one; blues_note; call_response; sparse_density</w:t>
+            </w:r>
+          </w:p>
+        </w:tc>
+      </w:tr>
+      <w:tr>
+        <w:tc>
+          <w:tcPr>
+            <w:tcW w:type="pct" w:w="1285%"/>
+          </w:tcPr>
+          <w:p>
+            <w:pPr>
+              <w:spacing w:after="60"/>
+            </w:pPr>
+            <w:r>
+              <w:t xml:space="preserve">`sonic_youth`</w:t>
+            </w:r>
+          </w:p>
+        </w:tc>
+        <w:tc>
+          <w:tcPr>
+            <w:tcW w:type="pct" w:w="1285%"/>
+          </w:tcPr>
+          <w:p>
+            <w:pPr>
+              <w:spacing w:after="60"/>
+            </w:pPr>
+            <w:r>
+              <w:t xml:space="preserve">angular</w:t>
+            </w:r>
+          </w:p>
+        </w:tc>
+        <w:tc>
+          <w:tcPr>
+            <w:tcW w:type="pct" w:w="1285%"/>
+          </w:tcPr>
+          <w:p>
+            <w:pPr>
+              <w:spacing w:after="60"/>
+            </w:pPr>
+            <w:r>
+              <w:t xml:space="preserve">mixed</w:t>
+            </w:r>
+          </w:p>
+        </w:tc>
+        <w:tc>
+          <w:tcPr>
+            <w:tcW w:type="pct" w:w="1285%"/>
+          </w:tcPr>
+          <w:p>
+            <w:pPr>
+              <w:spacing w:after="60"/>
+            </w:pPr>
+            <w:r>
+              <w:t xml:space="preserve">2</w:t>
+            </w:r>
+          </w:p>
+        </w:tc>
+        <w:tc>
+          <w:tcPr>
+            <w:tcW w:type="pct" w:w="1285%"/>
+          </w:tcPr>
+          <w:p>
+            <w:pPr>
+              <w:spacing w:after="60"/>
+            </w:pPr>
+            <w:r>
+              <w:t xml:space="preserve">0.7</w:t>
+            </w:r>
+          </w:p>
+        </w:tc>
+        <w:tc>
+          <w:tcPr>
+            <w:tcW w:type="pct" w:w="1285%"/>
+          </w:tcPr>
+          <w:p>
+            <w:pPr>
+              <w:spacing w:after="60"/>
+            </w:pPr>
+            <w:r>
+              <w:t xml:space="preserve">flat</w:t>
+            </w:r>
+          </w:p>
+        </w:tc>
+        <w:tc>
+          <w:tcPr>
+            <w:tcW w:type="pct" w:w="1285%"/>
+          </w:tcPr>
+          <w:p>
+            <w:pPr>
+              <w:spacing w:after="60"/>
+            </w:pPr>
+            <w:r>
+              <w:t xml:space="preserve">drone_melody; dissonant_dyad; shape_melody; narrow_range</w:t>
+            </w:r>
+          </w:p>
+        </w:tc>
+      </w:tr>
+      <w:tr>
+        <w:tc>
+          <w:tcPr>
+            <w:tcW w:type="pct" w:w="1285%"/>
+          </w:tcPr>
+          <w:p>
+            <w:pPr>
+              <w:spacing w:after="60"/>
+            </w:pPr>
+            <w:r>
+              <w:t xml:space="preserve">`pat_metheny`</w:t>
+            </w:r>
+          </w:p>
+        </w:tc>
+        <w:tc>
+          <w:tcPr>
+            <w:tcW w:type="pct" w:w="1285%"/>
+          </w:tcPr>
+          <w:p>
+            <w:pPr>
+              <w:spacing w:after="60"/>
+            </w:pPr>
+            <w:r>
+              <w:t xml:space="preserve">mixed</w:t>
+            </w:r>
+          </w:p>
+        </w:tc>
+        <w:tc>
+          <w:tcPr>
+            <w:tcW w:type="pct" w:w="1285%"/>
+          </w:tcPr>
+          <w:p>
+            <w:pPr>
+              <w:spacing w:after="60"/>
+            </w:pPr>
+            <w:r>
+              <w:t xml:space="preserve">mixed</w:t>
+            </w:r>
+          </w:p>
+        </w:tc>
+        <w:tc>
+          <w:tcPr>
+            <w:tcW w:type="pct" w:w="1285%"/>
+          </w:tcPr>
+          <w:p>
+            <w:pPr>
+              <w:spacing w:after="60"/>
+            </w:pPr>
+            <w:r>
+              <w:t xml:space="preserve">8</w:t>
+            </w:r>
+          </w:p>
+        </w:tc>
+        <w:tc>
+          <w:tcPr>
+            <w:tcW w:type="pct" w:w="1285%"/>
+          </w:tcPr>
+          <w:p>
+            <w:pPr>
+              <w:spacing w:after="60"/>
+            </w:pPr>
+            <w:r>
+              <w:t xml:space="preserve">0.3</w:t>
+            </w:r>
+          </w:p>
+        </w:tc>
+        <w:tc>
+          <w:tcPr>
+            <w:tcW w:type="pct" w:w="1285%"/>
+          </w:tcPr>
+          <w:p>
+            <w:pPr>
+              <w:spacing w:after="60"/>
+            </w:pPr>
+            <w:r>
+              <w:t xml:space="preserve">arch</w:t>
+            </w:r>
+          </w:p>
+        </w:tc>
+        <w:tc>
+          <w:tcPr>
+            <w:tcW w:type="pct" w:w="1285%"/>
+          </w:tcPr>
+          <w:p>
+            <w:pPr>
+              <w:spacing w:after="60"/>
+            </w:pPr>
+            <w:r>
+              <w:t xml:space="preserve">destination_tone; inside_outside_arc; guitaristic_leap; lyrical_jazz</w:t>
+            </w:r>
+          </w:p>
+        </w:tc>
+      </w:tr>
+      <w:tr>
+        <w:tc>
+          <w:tcPr>
+            <w:tcW w:type="pct" w:w="1285%"/>
+          </w:tcPr>
+          <w:p>
+            <w:pPr>
+              <w:spacing w:after="60"/>
+            </w:pPr>
+            <w:r>
+              <w:t xml:space="preserve">`wayne_shorter`</w:t>
+            </w:r>
+          </w:p>
+        </w:tc>
+        <w:tc>
+          <w:tcPr>
+            <w:tcW w:type="pct" w:w="1285%"/>
+          </w:tcPr>
+          <w:p>
+            <w:pPr>
+              <w:spacing w:after="60"/>
+            </w:pPr>
+            <w:r>
+              <w:t xml:space="preserve">angular</w:t>
+            </w:r>
+          </w:p>
+        </w:tc>
+        <w:tc>
+          <w:tcPr>
+            <w:tcW w:type="pct" w:w="1285%"/>
+          </w:tcPr>
+          <w:p>
+            <w:pPr>
+              <w:spacing w:after="60"/>
+            </w:pPr>
+            <w:r>
+              <w:t xml:space="preserve">mixed</w:t>
+            </w:r>
+          </w:p>
+        </w:tc>
+        <w:tc>
+          <w:tcPr>
+            <w:tcW w:type="pct" w:w="1285%"/>
+          </w:tcPr>
+          <w:p>
+            <w:pPr>
+              <w:spacing w:after="60"/>
+            </w:pPr>
+            <w:r>
+              <w:t xml:space="preserve">3</w:t>
+            </w:r>
+          </w:p>
+        </w:tc>
+        <w:tc>
+          <w:tcPr>
+            <w:tcW w:type="pct" w:w="1285%"/>
+          </w:tcPr>
+          <w:p>
+            <w:pPr>
+              <w:spacing w:after="60"/>
+            </w:pPr>
+            <w:r>
+              <w:t xml:space="preserve">0.3</w:t>
+            </w:r>
+          </w:p>
+        </w:tc>
+        <w:tc>
+          <w:tcPr>
+            <w:tcW w:type="pct" w:w="1285%"/>
+          </w:tcPr>
+          <w:p>
+            <w:pPr>
+              <w:spacing w:after="60"/>
+            </w:pPr>
+            <w:r>
+              <w:t xml:space="preserve">irregular</w:t>
+            </w:r>
+          </w:p>
+        </w:tc>
+        <w:tc>
+          <w:tcPr>
+            <w:tcW w:type="pct" w:w="1285%"/>
+          </w:tcPr>
+          <w:p>
+            <w:pPr>
+              <w:spacing w:after="60"/>
+            </w:pPr>
+            <w:r>
+              <w:t xml:space="preserve">tritone; 4th_5th_leap; enigmatic_cadence; motivic_fragmentation</w:t>
+            </w:r>
+          </w:p>
+        </w:tc>
+      </w:tr>
+      <w:tr>
+        <w:tc>
+          <w:tcPr>
+            <w:tcW w:type="pct" w:w="1285%"/>
+          </w:tcPr>
+          <w:p>
+            <w:pPr>
+              <w:spacing w:after="60"/>
+            </w:pPr>
+            <w:r>
+              <w:t xml:space="preserve">`barry_harris`</w:t>
+            </w:r>
+          </w:p>
+        </w:tc>
+        <w:tc>
+          <w:tcPr>
+            <w:tcW w:type="pct" w:w="1285%"/>
+          </w:tcPr>
+          <w:p>
+            <w:pPr>
+              <w:spacing w:after="60"/>
+            </w:pPr>
+            <w:r>
+              <w:t xml:space="preserve">stepwise</w:t>
+            </w:r>
+          </w:p>
+        </w:tc>
+        <w:tc>
+          <w:tcPr>
+            <w:tcW w:type="pct" w:w="1285%"/>
+          </w:tcPr>
+          <w:p>
+            <w:pPr>
+              <w:spacing w:after="60"/>
+            </w:pPr>
+            <w:r>
+              <w:t xml:space="preserve">eighth_patterns</w:t>
+            </w:r>
+          </w:p>
+        </w:tc>
+        <w:tc>
+          <w:tcPr>
+            <w:tcW w:type="pct" w:w="1285%"/>
+          </w:tcPr>
+          <w:p>
+            <w:pPr>
+              <w:spacing w:after="60"/>
+            </w:pPr>
+            <w:r>
+              <w:t xml:space="preserve">4</w:t>
+            </w:r>
+          </w:p>
+        </w:tc>
+        <w:tc>
+          <w:tcPr>
+            <w:tcW w:type="pct" w:w="1285%"/>
+          </w:tcPr>
+          <w:p>
+            <w:pPr>
+              <w:spacing w:after="60"/>
+            </w:pPr>
+            <w:r>
+              <w:t xml:space="preserve">0.4</w:t>
+            </w:r>
+          </w:p>
+        </w:tc>
+        <w:tc>
+          <w:tcPr>
+            <w:tcW w:type="pct" w:w="1285%"/>
+          </w:tcPr>
+          <w:p>
+            <w:pPr>
+              <w:spacing w:after="60"/>
+            </w:pPr>
+            <w:r>
+              <w:t xml:space="preserve">bebop_arc</w:t>
+            </w:r>
+          </w:p>
+        </w:tc>
+        <w:tc>
+          <w:tcPr>
+            <w:tcW w:type="pct" w:w="1285%"/>
+          </w:tcPr>
+          <w:p>
+            <w:pPr>
+              <w:spacing w:after="60"/>
+            </w:pPr>
+            <w:r>
+              <w:t xml:space="preserve">chromatic_enclosure; approach_tone; bebop_scale; ii_V_outline</w:t>
+            </w:r>
+          </w:p>
+        </w:tc>
+      </w:tr>
+      <w:tr>
+        <w:tc>
+          <w:tcPr>
+            <w:tcW w:type="pct" w:w="1285%"/>
+          </w:tcPr>
+          <w:p>
+            <w:pPr>
+              <w:spacing w:after="60"/>
+            </w:pPr>
+            <w:r>
+              <w:t xml:space="preserve">`stephen_sondheim`</w:t>
+            </w:r>
+          </w:p>
+        </w:tc>
+        <w:tc>
+          <w:tcPr>
+            <w:tcW w:type="pct" w:w="1285%"/>
+          </w:tcPr>
+          <w:p>
+            <w:pPr>
+              <w:spacing w:after="60"/>
+            </w:pPr>
+            <w:r>
+              <w:t xml:space="preserve">stepwise</w:t>
+            </w:r>
+          </w:p>
+        </w:tc>
+        <w:tc>
+          <w:tcPr>
+            <w:tcW w:type="pct" w:w="1285%"/>
+          </w:tcPr>
+          <w:p>
+            <w:pPr>
+              <w:spacing w:after="60"/>
+            </w:pPr>
+            <w:r>
+              <w:t xml:space="preserve">mixed</w:t>
+            </w:r>
+          </w:p>
+        </w:tc>
+        <w:tc>
+          <w:tcPr>
+            <w:tcW w:type="pct" w:w="1285%"/>
+          </w:tcPr>
+          <w:p>
+            <w:pPr>
+              <w:spacing w:after="60"/>
+            </w:pPr>
+            <w:r>
+              <w:t xml:space="preserve">5</w:t>
+            </w:r>
+          </w:p>
+        </w:tc>
+        <w:tc>
+          <w:tcPr>
+            <w:tcW w:type="pct" w:w="1285%"/>
+          </w:tcPr>
+          <w:p>
+            <w:pPr>
+              <w:spacing w:after="60"/>
+            </w:pPr>
+            <w:r>
+              <w:t xml:space="preserve">0.3</w:t>
+            </w:r>
+          </w:p>
+        </w:tc>
+        <w:tc>
+          <w:tcPr>
+            <w:tcW w:type="pct" w:w="1285%"/>
+          </w:tcPr>
+          <w:p>
+            <w:pPr>
+              <w:spacing w:after="60"/>
+            </w:pPr>
+            <w:r>
+              <w:t xml:space="preserve">speech_contour</w:t>
+            </w:r>
+          </w:p>
+        </w:tc>
+        <w:tc>
+          <w:tcPr>
+            <w:tcW w:type="pct" w:w="1285%"/>
+          </w:tcPr>
+          <w:p>
+            <w:pPr>
+              <w:spacing w:after="60"/>
+            </w:pPr>
+            <w:r>
+              <w:t xml:space="preserve">word_painting; chromatic_tension; asymmetric_phrase</w:t>
+            </w:r>
+          </w:p>
+        </w:tc>
+      </w:tr>
+      <w:tr>
+        <w:tc>
+          <w:tcPr>
+            <w:tcW w:type="pct" w:w="1285%"/>
+          </w:tcPr>
+          <w:p>
+            <w:pPr>
+              <w:spacing w:after="60"/>
+            </w:pPr>
+            <w:r>
+              <w:t xml:space="preserve">`kate_bush`</w:t>
+            </w:r>
+          </w:p>
+        </w:tc>
+        <w:tc>
+          <w:tcPr>
+            <w:tcW w:type="pct" w:w="1285%"/>
+          </w:tcPr>
+          <w:p>
+            <w:pPr>
+              <w:spacing w:after="60"/>
+            </w:pPr>
+            <w:r>
+              <w:t xml:space="preserve">angular</w:t>
+            </w:r>
+          </w:p>
+        </w:tc>
+        <w:tc>
+          <w:tcPr>
+            <w:tcW w:type="pct" w:w="1285%"/>
+          </w:tcPr>
+          <w:p>
+            <w:pPr>
+              <w:spacing w:after="60"/>
+            </w:pPr>
+            <w:r>
+              <w:t xml:space="preserve">mixed</w:t>
+            </w:r>
+          </w:p>
+        </w:tc>
+        <w:tc>
+          <w:tcPr>
+            <w:tcW w:type="pct" w:w="1285%"/>
+          </w:tcPr>
+          <w:p>
+            <w:pPr>
+              <w:spacing w:after="60"/>
+            </w:pPr>
+            <w:r>
+              <w:t xml:space="preserve">6</w:t>
+            </w:r>
+          </w:p>
+        </w:tc>
+        <w:tc>
+          <w:tcPr>
+            <w:tcW w:type="pct" w:w="1285%"/>
+          </w:tcPr>
+          <w:p>
+            <w:pPr>
+              <w:spacing w:after="60"/>
+            </w:pPr>
+            <w:r>
+              <w:t xml:space="preserve">0.3</w:t>
+            </w:r>
+          </w:p>
+        </w:tc>
+        <w:tc>
+          <w:tcPr>
+            <w:tcW w:type="pct" w:w="1285%"/>
+          </w:tcPr>
+          <w:p>
+            <w:pPr>
+              <w:spacing w:after="60"/>
+            </w:pPr>
+            <w:r>
+              <w:t xml:space="preserve">dramatic_leap</w:t>
+            </w:r>
+          </w:p>
+        </w:tc>
+        <w:tc>
+          <w:tcPr>
+            <w:tcW w:type="pct" w:w="1285%"/>
+          </w:tcPr>
+          <w:p>
+            <w:pPr>
+              <w:spacing w:after="60"/>
+            </w:pPr>
+            <w:r>
+              <w:t xml:space="preserve">wide_leap; melisma; modal_color; dramaturgical_phrase</w:t>
+            </w:r>
+          </w:p>
+        </w:tc>
+      </w:tr>
+      <w:tr>
+        <w:tc>
+          <w:tcPr>
+            <w:tcW w:type="pct" w:w="1285%"/>
+          </w:tcPr>
+          <w:p>
+            <w:pPr>
+              <w:spacing w:after="60"/>
+            </w:pPr>
+            <w:r>
+              <w:t xml:space="preserve">`thelonious_monk`</w:t>
+            </w:r>
+          </w:p>
+        </w:tc>
+        <w:tc>
+          <w:tcPr>
+            <w:tcW w:type="pct" w:w="1285%"/>
+          </w:tcPr>
+          <w:p>
+            <w:pPr>
+              <w:spacing w:after="60"/>
+            </w:pPr>
+            <w:r>
+              <w:t xml:space="preserve">angular</w:t>
+            </w:r>
+          </w:p>
+        </w:tc>
+        <w:tc>
+          <w:tcPr>
+            <w:tcW w:type="pct" w:w="1285%"/>
+          </w:tcPr>
+          <w:p>
+            <w:pPr>
+              <w:spacing w:after="60"/>
+            </w:pPr>
+            <w:r>
+              <w:t xml:space="preserve">mixed</w:t>
+            </w:r>
+          </w:p>
+        </w:tc>
+        <w:tc>
+          <w:tcPr>
+            <w:tcW w:type="pct" w:w="1285%"/>
+          </w:tcPr>
+          <w:p>
+            <w:pPr>
+              <w:spacing w:after="60"/>
+            </w:pPr>
+            <w:r>
+              <w:t xml:space="preserve">2</w:t>
+            </w:r>
+          </w:p>
+        </w:tc>
+        <w:tc>
+          <w:tcPr>
+            <w:tcW w:type="pct" w:w="1285%"/>
+          </w:tcPr>
+          <w:p>
+            <w:pPr>
+              <w:spacing w:after="60"/>
+            </w:pPr>
+            <w:r>
+              <w:t xml:space="preserve">0.6</w:t>
+            </w:r>
+          </w:p>
+        </w:tc>
+        <w:tc>
+          <w:tcPr>
+            <w:tcW w:type="pct" w:w="1285%"/>
+          </w:tcPr>
+          <w:p>
+            <w:pPr>
+              <w:spacing w:after="60"/>
+            </w:pPr>
+            <w:r>
+              <w:t xml:space="preserve">irregular</w:t>
+            </w:r>
+          </w:p>
+        </w:tc>
+        <w:tc>
+          <w:tcPr>
+            <w:tcW w:type="pct" w:w="1285%"/>
+          </w:tcPr>
+          <w:p>
+            <w:pPr>
+              <w:spacing w:after="60"/>
+            </w:pPr>
+            <w:r>
+              <w:t xml:space="preserve">tritone; whole_tone_fragment; chromatic_enclosure; deliberate_silence</w:t>
+            </w:r>
+          </w:p>
+        </w:tc>
+      </w:tr>
+      <w:tr>
+        <w:tc>
+          <w:tcPr>
+            <w:tcW w:type="pct" w:w="1285%"/>
+          </w:tcPr>
+          <w:p>
+            <w:pPr>
+              <w:spacing w:after="60"/>
+            </w:pPr>
+            <w:r>
+              <w:t xml:space="preserve">`dave_brubeck`</w:t>
+            </w:r>
+          </w:p>
+        </w:tc>
+        <w:tc>
+          <w:tcPr>
+            <w:tcW w:type="pct" w:w="1285%"/>
+          </w:tcPr>
+          <w:p>
+            <w:pPr>
+              <w:spacing w:after="60"/>
+            </w:pPr>
+            <w:r>
+              <w:t xml:space="preserve">stepwise</w:t>
+            </w:r>
+          </w:p>
+        </w:tc>
+        <w:tc>
+          <w:tcPr>
+            <w:tcW w:type="pct" w:w="1285%"/>
+          </w:tcPr>
+          <w:p>
+            <w:pPr>
+              <w:spacing w:after="60"/>
+            </w:pPr>
+            <w:r>
+              <w:t xml:space="preserve">mixed</w:t>
+            </w:r>
+          </w:p>
+        </w:tc>
+        <w:tc>
+          <w:tcPr>
+            <w:tcW w:type="pct" w:w="1285%"/>
+          </w:tcPr>
+          <w:p>
+            <w:pPr>
+              <w:spacing w:after="60"/>
+            </w:pPr>
+            <w:r>
+              <w:t xml:space="preserve">4</w:t>
+            </w:r>
+          </w:p>
+        </w:tc>
+        <w:tc>
+          <w:tcPr>
+            <w:tcW w:type="pct" w:w="1285%"/>
+          </w:tcPr>
+          <w:p>
+            <w:pPr>
+              <w:spacing w:after="60"/>
+            </w:pPr>
+            <w:r>
+              <w:t xml:space="preserve">0.5</w:t>
+            </w:r>
+          </w:p>
+        </w:tc>
+        <w:tc>
+          <w:tcPr>
+            <w:tcW w:type="pct" w:w="1285%"/>
+          </w:tcPr>
+          <w:p>
+            <w:pPr>
+              <w:spacing w:after="60"/>
+            </w:pPr>
+            <w:r>
+              <w:t xml:space="preserve">arch</w:t>
+            </w:r>
+          </w:p>
+        </w:tc>
+        <w:tc>
+          <w:tcPr>
+            <w:tcW w:type="pct" w:w="1285%"/>
+          </w:tcPr>
+          <w:p>
+            <w:pPr>
+              <w:spacing w:after="60"/>
+            </w:pPr>
+            <w:r>
+              <w:t xml:space="preserve">odd_meter_alignment; quartal_shape; additive_cell; blues_modal_mixture</w:t>
+            </w:r>
+          </w:p>
+        </w:tc>
+      </w:tr>
+      <w:tr>
+        <w:tc>
+          <w:tcPr>
+            <w:tcW w:type="pct" w:w="1285%"/>
+          </w:tcPr>
+          <w:p>
+            <w:pPr>
+              <w:spacing w:after="60"/>
+            </w:pPr>
+            <w:r>
+              <w:t xml:space="preserve">`andrew_hill`</w:t>
+            </w:r>
+          </w:p>
+        </w:tc>
+        <w:tc>
+          <w:tcPr>
+            <w:tcW w:type="pct" w:w="1285%"/>
+          </w:tcPr>
+          <w:p>
+            <w:pPr>
+              <w:spacing w:after="60"/>
+            </w:pPr>
+            <w:r>
+              <w:t xml:space="preserve">angular</w:t>
+            </w:r>
+          </w:p>
+        </w:tc>
+        <w:tc>
+          <w:tcPr>
+            <w:tcW w:type="pct" w:w="1285%"/>
+          </w:tcPr>
+          <w:p>
+            <w:pPr>
+              <w:spacing w:after="60"/>
+            </w:pPr>
+            <w:r>
+              <w:t xml:space="preserve">mixed</w:t>
+            </w:r>
+          </w:p>
+        </w:tc>
+        <w:tc>
+          <w:tcPr>
+            <w:tcW w:type="pct" w:w="1285%"/>
+          </w:tcPr>
+          <w:p>
+            <w:pPr>
+              <w:spacing w:after="60"/>
+            </w:pPr>
+            <w:r>
+              <w:t xml:space="preserve">5</w:t>
+            </w:r>
+          </w:p>
+        </w:tc>
+        <w:tc>
+          <w:tcPr>
+            <w:tcW w:type="pct" w:w="1285%"/>
+          </w:tcPr>
+          <w:p>
+            <w:pPr>
+              <w:spacing w:after="60"/>
+            </w:pPr>
+            <w:r>
+              <w:t xml:space="preserve">0.4</w:t>
+            </w:r>
+          </w:p>
+        </w:tc>
+        <w:tc>
+          <w:tcPr>
+            <w:tcW w:type="pct" w:w="1285%"/>
+          </w:tcPr>
+          <w:p>
+            <w:pPr>
+              <w:spacing w:after="60"/>
+            </w:pPr>
+            <w:r>
+              <w:t xml:space="preserve">irregular</w:t>
+            </w:r>
+          </w:p>
+        </w:tc>
+        <w:tc>
+          <w:tcPr>
+            <w:tcW w:type="pct" w:w="1285%"/>
+          </w:tcPr>
+          <w:p>
+            <w:pPr>
+              <w:spacing w:after="60"/>
+            </w:pPr>
+            <w:r>
+              <w:t xml:space="preserve">motivic_fragmentation; interval_expansion; chromatic_sideslip; pedal_ambiguity</w:t>
+            </w:r>
+          </w:p>
+        </w:tc>
+      </w:tr>
+      <w:tr>
+        <w:tc>
+          <w:tcPr>
+            <w:tcW w:type="pct" w:w="1285%"/>
+          </w:tcPr>
+          <w:p>
+            <w:pPr>
+              <w:spacing w:after="60"/>
+            </w:pPr>
+            <w:r>
+              <w:t xml:space="preserve">`charlie_parker`</w:t>
+            </w:r>
+          </w:p>
+        </w:tc>
+        <w:tc>
+          <w:tcPr>
+            <w:tcW w:type="pct" w:w="1285%"/>
+          </w:tcPr>
+          <w:p>
+            <w:pPr>
+              <w:spacing w:after="60"/>
+            </w:pPr>
+            <w:r>
+              <w:t xml:space="preserve">angular</w:t>
+            </w:r>
+          </w:p>
+        </w:tc>
+        <w:tc>
+          <w:tcPr>
+            <w:tcW w:type="pct" w:w="1285%"/>
+          </w:tcPr>
+          <w:p>
+            <w:pPr>
+              <w:spacing w:after="60"/>
+            </w:pPr>
+            <w:r>
+              <w:t xml:space="preserve">eighth_patterns</w:t>
+            </w:r>
+          </w:p>
+        </w:tc>
+        <w:tc>
+          <w:tcPr>
+            <w:tcW w:type="pct" w:w="1285%"/>
+          </w:tcPr>
+          <w:p>
+            <w:pPr>
+              <w:spacing w:after="60"/>
+            </w:pPr>
+            <w:r>
+              <w:t xml:space="preserve">4</w:t>
+            </w:r>
+          </w:p>
+        </w:tc>
+        <w:tc>
+          <w:tcPr>
+            <w:tcW w:type="pct" w:w="1285%"/>
+          </w:tcPr>
+          <w:p>
+            <w:pPr>
+              <w:spacing w:after="60"/>
+            </w:pPr>
+            <w:r>
+              <w:t xml:space="preserve">0.2</w:t>
+            </w:r>
+          </w:p>
+        </w:tc>
+        <w:tc>
+          <w:tcPr>
+            <w:tcW w:type="pct" w:w="1285%"/>
+          </w:tcPr>
+          <w:p>
+            <w:pPr>
+              <w:spacing w:after="60"/>
+            </w:pPr>
+            <w:r>
+              <w:t xml:space="preserve">bebop_arc</w:t>
+            </w:r>
+          </w:p>
+        </w:tc>
+        <w:tc>
+          <w:tcPr>
+            <w:tcW w:type="pct" w:w="1285%"/>
+          </w:tcPr>
+          <w:p>
+            <w:pPr>
+              <w:spacing w:after="60"/>
+            </w:pPr>
+            <w:r>
+              <w:t xml:space="preserve">chromatic_enclosure; upper_structure_arpeggio; ii_V_outline; bebop_scale</w:t>
+            </w:r>
+          </w:p>
+        </w:tc>
+      </w:tr>
+      <w:tr>
+        <w:tc>
+          <w:tcPr>
+            <w:tcW w:type="pct" w:w="1285%"/>
+          </w:tcPr>
+          <w:p>
+            <w:pPr>
+              <w:spacing w:after="60"/>
+            </w:pPr>
+            <w:r>
+              <w:t xml:space="preserve">`bill_evans`</w:t>
+            </w:r>
+          </w:p>
+        </w:tc>
+        <w:tc>
+          <w:tcPr>
+            <w:tcW w:type="pct" w:w="1285%"/>
+          </w:tcPr>
+          <w:p>
+            <w:pPr>
+              <w:spacing w:after="60"/>
+            </w:pPr>
+            <w:r>
+              <w:t xml:space="preserve">stepwise</w:t>
+            </w:r>
+          </w:p>
+        </w:tc>
+        <w:tc>
+          <w:tcPr>
+            <w:tcW w:type="pct" w:w="1285%"/>
+          </w:tcPr>
+          <w:p>
+            <w:pPr>
+              <w:spacing w:after="60"/>
+            </w:pPr>
+            <w:r>
+              <w:t xml:space="preserve">mixed</w:t>
+            </w:r>
+          </w:p>
+        </w:tc>
+        <w:tc>
+          <w:tcPr>
+            <w:tcW w:type="pct" w:w="1285%"/>
+          </w:tcPr>
+          <w:p>
+            <w:pPr>
+              <w:spacing w:after="60"/>
+            </w:pPr>
+            <w:r>
+              <w:t xml:space="preserve">8</w:t>
+            </w:r>
+          </w:p>
+        </w:tc>
+        <w:tc>
+          <w:tcPr>
+            <w:tcW w:type="pct" w:w="1285%"/>
+          </w:tcPr>
+          <w:p>
+            <w:pPr>
+              <w:spacing w:after="60"/>
+            </w:pPr>
+            <w:r>
+              <w:t xml:space="preserve">0.4</w:t>
+            </w:r>
+          </w:p>
+        </w:tc>
+        <w:tc>
+          <w:tcPr>
+            <w:tcW w:type="pct" w:w="1285%"/>
+          </w:tcPr>
+          <w:p>
+            <w:pPr>
+              <w:spacing w:after="60"/>
+            </w:pPr>
+            <w:r>
+              <w:t xml:space="preserve">arch</w:t>
+            </w:r>
+          </w:p>
+        </w:tc>
+        <w:tc>
+          <w:tcPr>
+            <w:tcW w:type="pct" w:w="1285%"/>
+          </w:tcPr>
+          <w:p>
+            <w:pPr>
+              <w:spacing w:after="60"/>
+            </w:pPr>
+            <w:r>
+              <w:t xml:space="preserve">inner_voice_melody; modal_interchange; delayed_resolution; impressionistic_voicing</w:t>
+            </w:r>
+          </w:p>
+        </w:tc>
+      </w:tr>
+      <w:tr>
+        <w:tc>
+          <w:tcPr>
+            <w:tcW w:type="pct" w:w="1285%"/>
+          </w:tcPr>
+          <w:p>
+            <w:pPr>
+              <w:spacing w:after="60"/>
+            </w:pPr>
+            <w:r>
+              <w:t xml:space="preserve">`bacharach`</w:t>
+            </w:r>
+          </w:p>
+        </w:tc>
+        <w:tc>
+          <w:tcPr>
+            <w:tcW w:type="pct" w:w="1285%"/>
+          </w:tcPr>
+          <w:p>
+            <w:pPr>
+              <w:spacing w:after="60"/>
+            </w:pPr>
+            <w:r>
+              <w:t xml:space="preserve">mixed</w:t>
+            </w:r>
+          </w:p>
+        </w:tc>
+        <w:tc>
+          <w:tcPr>
+            <w:tcW w:type="pct" w:w="1285%"/>
+          </w:tcPr>
+          <w:p>
+            <w:pPr>
+              <w:spacing w:after="60"/>
+            </w:pPr>
+            <w:r>
+              <w:t xml:space="preserve">eighth_patterns</w:t>
+            </w:r>
+          </w:p>
+        </w:tc>
+        <w:tc>
+          <w:tcPr>
+            <w:tcW w:type="pct" w:w="1285%"/>
+          </w:tcPr>
+          <w:p>
+            <w:pPr>
+              <w:spacing w:after="60"/>
+            </w:pPr>
+            <w:r>
+              <w:t xml:space="preserve">5</w:t>
+            </w:r>
+          </w:p>
+        </w:tc>
+        <w:tc>
+          <w:tcPr>
+            <w:tcW w:type="pct" w:w="1285%"/>
+          </w:tcPr>
+          <w:p>
+            <w:pPr>
+              <w:spacing w:after="60"/>
+            </w:pPr>
+            <w:r>
+              <w:t xml:space="preserve">0.3</w:t>
+            </w:r>
+          </w:p>
+        </w:tc>
+        <w:tc>
+          <w:tcPr>
+            <w:tcW w:type="pct" w:w="1285%"/>
+          </w:tcPr>
+          <w:p>
+            <w:pPr>
+              <w:spacing w:after="60"/>
+            </w:pPr>
+            <w:r>
+              <w:t xml:space="preserve">irregular</w:t>
+            </w:r>
+          </w:p>
+        </w:tc>
+        <w:tc>
+          <w:tcPr>
+            <w:tcW w:type="pct" w:w="1285%"/>
+          </w:tcPr>
+          <w:p>
+            <w:pPr>
+              <w:spacing w:after="60"/>
+            </w:pPr>
+            <w:r>
+              <w:t xml:space="preserve">metric_shift; phrase_extension; suspended_appoggiatura; chromatic_bass</w:t>
+            </w:r>
+          </w:p>
+        </w:tc>
+      </w:tr>
+      <w:tr>
+        <w:tc>
+          <w:tcPr>
+            <w:tcW w:type="pct" w:w="1285%"/>
+          </w:tcPr>
+          <w:p>
+            <w:pPr>
+              <w:spacing w:after="60"/>
+            </w:pPr>
+            <w:r>
+              <w:t xml:space="preserve">`donald_fagen`</w:t>
+            </w:r>
+          </w:p>
+        </w:tc>
+        <w:tc>
+          <w:tcPr>
+            <w:tcW w:type="pct" w:w="1285%"/>
+          </w:tcPr>
+          <w:p>
+            <w:pPr>
+              <w:spacing w:after="60"/>
+            </w:pPr>
+            <w:r>
+              <w:t xml:space="preserve">mixed</w:t>
+            </w:r>
+          </w:p>
+        </w:tc>
+        <w:tc>
+          <w:tcPr>
+            <w:tcW w:type="pct" w:w="1285%"/>
+          </w:tcPr>
+          <w:p>
+            <w:pPr>
+              <w:spacing w:after="60"/>
+            </w:pPr>
+            <w:r>
+              <w:t xml:space="preserve">eighth_patterns</w:t>
+            </w:r>
+          </w:p>
+        </w:tc>
+        <w:tc>
+          <w:tcPr>
+            <w:tcW w:type="pct" w:w="1285%"/>
+          </w:tcPr>
+          <w:p>
+            <w:pPr>
+              <w:spacing w:after="60"/>
+            </w:pPr>
+            <w:r>
+              <w:t xml:space="preserve">4</w:t>
+            </w:r>
+          </w:p>
+        </w:tc>
+        <w:tc>
+          <w:tcPr>
+            <w:tcW w:type="pct" w:w="1285%"/>
+          </w:tcPr>
+          <w:p>
+            <w:pPr>
+              <w:spacing w:after="60"/>
+            </w:pPr>
+            <w:r>
+              <w:t xml:space="preserve">0.5</w:t>
+            </w:r>
+          </w:p>
+        </w:tc>
+        <w:tc>
+          <w:tcPr>
+            <w:tcW w:type="pct" w:w="1285%"/>
+          </w:tcPr>
+          <w:p>
+            <w:pPr>
+              <w:spacing w:after="60"/>
+            </w:pPr>
+            <w:r>
+              <w:t xml:space="preserve">conversational</w:t>
+            </w:r>
+          </w:p>
+        </w:tc>
+        <w:tc>
+          <w:tcPr>
+            <w:tcW w:type="pct" w:w="1285%"/>
+          </w:tcPr>
+          <w:p>
+            <w:pPr>
+              <w:spacing w:after="60"/>
+            </w:pPr>
+            <w:r>
+              <w:t xml:space="preserve">guide_tone_melody; blues_over_jazz_harmony; syncopated_hook; static_pitch_over_moving_chords</w:t>
+            </w:r>
+          </w:p>
+        </w:tc>
+      </w:tr>
+      <w:tr>
+        <w:tc>
+          <w:tcPr>
+            <w:tcW w:type="pct" w:w="1285%"/>
+          </w:tcPr>
+          <w:p>
+            <w:pPr>
+              <w:spacing w:after="60"/>
+            </w:pPr>
+            <w:r>
+              <w:t xml:space="preserve">`frank_zappa`</w:t>
+            </w:r>
+          </w:p>
+        </w:tc>
+        <w:tc>
+          <w:tcPr>
+            <w:tcW w:type="pct" w:w="1285%"/>
+          </w:tcPr>
+          <w:p>
+            <w:pPr>
+              <w:spacing w:after="60"/>
+            </w:pPr>
+            <w:r>
+              <w:t xml:space="preserve">angular</w:t>
+            </w:r>
+          </w:p>
+        </w:tc>
+        <w:tc>
+          <w:tcPr>
+            <w:tcW w:type="pct" w:w="1285%"/>
+          </w:tcPr>
+          <w:p>
+            <w:pPr>
+              <w:spacing w:after="60"/>
+            </w:pPr>
+            <w:r>
+              <w:t xml:space="preserve">eighth_patterns</w:t>
+            </w:r>
+          </w:p>
+        </w:tc>
+        <w:tc>
+          <w:tcPr>
+            <w:tcW w:type="pct" w:w="1285%"/>
+          </w:tcPr>
+          <w:p>
+            <w:pPr>
+              <w:spacing w:after="60"/>
+            </w:pPr>
+            <w:r>
+              <w:t xml:space="preserve">3</w:t>
+            </w:r>
+          </w:p>
+        </w:tc>
+        <w:tc>
+          <w:tcPr>
+            <w:tcW w:type="pct" w:w="1285%"/>
+          </w:tcPr>
+          <w:p>
+            <w:pPr>
+              <w:spacing w:after="60"/>
+            </w:pPr>
+            <w:r>
+              <w:t xml:space="preserve">0.2</w:t>
+            </w:r>
+          </w:p>
+        </w:tc>
+        <w:tc>
+          <w:tcPr>
+            <w:tcW w:type="pct" w:w="1285%"/>
+          </w:tcPr>
+          <w:p>
+            <w:pPr>
+              <w:spacing w:after="60"/>
+            </w:pPr>
+            <w:r>
+              <w:t xml:space="preserve">irregular</w:t>
+            </w:r>
+          </w:p>
+        </w:tc>
+        <w:tc>
+          <w:tcPr>
+            <w:tcW w:type="pct" w:w="1285%"/>
+          </w:tcPr>
+          <w:p>
+            <w:pPr>
+              <w:spacing w:after="60"/>
+            </w:pPr>
+            <w:r>
+              <w:t xml:space="preserve">polyrhythmic_unison; chromatic_sideslip; interval_expansion; synthetic_scale; sudden_meter_change</w:t>
+            </w:r>
+          </w:p>
+        </w:tc>
+      </w:tr>
+      <w:tr>
+        <w:tc>
+          <w:tcPr>
+            <w:tcW w:type="pct" w:w="1285%"/>
+          </w:tcPr>
+          <w:p>
+            <w:pPr>
+              <w:spacing w:after="60"/>
+            </w:pPr>
+            <w:r>
+              <w:t xml:space="preserve">`joni_mitchell`</w:t>
+            </w:r>
+          </w:p>
+        </w:tc>
+        <w:tc>
+          <w:tcPr>
+            <w:tcW w:type="pct" w:w="1285%"/>
+          </w:tcPr>
+          <w:p>
+            <w:pPr>
+              <w:spacing w:after="60"/>
+            </w:pPr>
+            <w:r>
+              <w:t xml:space="preserve">angular</w:t>
+            </w:r>
+          </w:p>
+        </w:tc>
+        <w:tc>
+          <w:tcPr>
+            <w:tcW w:type="pct" w:w="1285%"/>
+          </w:tcPr>
+          <w:p>
+            <w:pPr>
+              <w:spacing w:after="60"/>
+            </w:pPr>
+            <w:r>
+              <w:t xml:space="preserve">mixed</w:t>
+            </w:r>
+          </w:p>
+        </w:tc>
+        <w:tc>
+          <w:tcPr>
+            <w:tcW w:type="pct" w:w="1285%"/>
+          </w:tcPr>
+          <w:p>
+            <w:pPr>
+              <w:spacing w:after="60"/>
+            </w:pPr>
+            <w:r>
+              <w:t xml:space="preserve">6</w:t>
+            </w:r>
+          </w:p>
+        </w:tc>
+        <w:tc>
+          <w:tcPr>
+            <w:tcW w:type="pct" w:w="1285%"/>
+          </w:tcPr>
+          <w:p>
+            <w:pPr>
+              <w:spacing w:after="60"/>
+            </w:pPr>
+            <w:r>
+              <w:t xml:space="preserve">0.3</w:t>
+            </w:r>
+          </w:p>
+        </w:tc>
+        <w:tc>
+          <w:tcPr>
+            <w:tcW w:type="pct" w:w="1285%"/>
+          </w:tcPr>
+          <w:p>
+            <w:pPr>
+              <w:spacing w:after="60"/>
+            </w:pPr>
+            <w:r>
+              <w:t xml:space="preserve">wide_arc</w:t>
+            </w:r>
+          </w:p>
+        </w:tc>
+        <w:tc>
+          <w:tcPr>
+            <w:tcW w:type="pct" w:w="1285%"/>
+          </w:tcPr>
+          <w:p>
+            <w:pPr>
+              <w:spacing w:after="60"/>
+            </w:pPr>
+            <w:r>
+              <w:t xml:space="preserve">open_tuning_pitch_field; unresolved_suspension; wide_leap_stepwise_descent; modal_drone</w:t>
+            </w:r>
+          </w:p>
+        </w:tc>
+      </w:tr>
+      <w:tr>
+        <w:tc>
+          <w:tcPr>
+            <w:tcW w:type="pct" w:w="1285%"/>
+          </w:tcPr>
+          <w:p>
+            <w:pPr>
+              <w:spacing w:after="60"/>
+            </w:pPr>
+            <w:r>
+              <w:t xml:space="preserve">`antonio_carlos_jobim`</w:t>
+            </w:r>
+          </w:p>
+        </w:tc>
+        <w:tc>
+          <w:tcPr>
+            <w:tcW w:type="pct" w:w="1285%"/>
+          </w:tcPr>
+          <w:p>
+            <w:pPr>
+              <w:spacing w:after="60"/>
+            </w:pPr>
+            <w:r>
+              <w:t xml:space="preserve">stepwise</w:t>
+            </w:r>
+          </w:p>
+        </w:tc>
+        <w:tc>
+          <w:tcPr>
+            <w:tcW w:type="pct" w:w="1285%"/>
+          </w:tcPr>
+          <w:p>
+            <w:pPr>
+              <w:spacing w:after="60"/>
+            </w:pPr>
+            <w:r>
+              <w:t xml:space="preserve">eighth_patterns</w:t>
+            </w:r>
+          </w:p>
+        </w:tc>
+        <w:tc>
+          <w:tcPr>
+            <w:tcW w:type="pct" w:w="1285%"/>
+          </w:tcPr>
+          <w:p>
+            <w:pPr>
+              <w:spacing w:after="60"/>
+            </w:pPr>
+            <w:r>
+              <w:t xml:space="preserve">8</w:t>
+            </w:r>
+          </w:p>
+        </w:tc>
+        <w:tc>
+          <w:tcPr>
+            <w:tcW w:type="pct" w:w="1285%"/>
+          </w:tcPr>
+          <w:p>
+            <w:pPr>
+              <w:spacing w:after="60"/>
+            </w:pPr>
+            <w:r>
+              <w:t xml:space="preserve">0.5</w:t>
+            </w:r>
+          </w:p>
+        </w:tc>
+        <w:tc>
+          <w:tcPr>
+            <w:tcW w:type="pct" w:w="1285%"/>
+          </w:tcPr>
+          <w:p>
+            <w:pPr>
+              <w:spacing w:after="60"/>
+            </w:pPr>
+            <w:r>
+              <w:t xml:space="preserve">arch</w:t>
+            </w:r>
+          </w:p>
+        </w:tc>
+        <w:tc>
+          <w:tcPr>
+            <w:tcW w:type="pct" w:w="1285%"/>
+          </w:tcPr>
+          <w:p>
+            <w:pPr>
+              <w:spacing w:after="60"/>
+            </w:pPr>
+            <w:r>
+              <w:t xml:space="preserve">bossa_anticipation; lydian_dominant; chromatic_approach; sigh_figure</w:t>
+            </w:r>
+          </w:p>
+        </w:tc>
+      </w:tr>
+      <w:tr>
+        <w:tc>
+          <w:tcPr>
+            <w:tcW w:type="pct" w:w="1285%"/>
+          </w:tcPr>
+          <w:p>
+            <w:pPr>
+              <w:spacing w:after="60"/>
+            </w:pPr>
+            <w:r>
+              <w:t xml:space="preserve">`herbie_hancock`</w:t>
+            </w:r>
+          </w:p>
+        </w:tc>
+        <w:tc>
+          <w:tcPr>
+            <w:tcW w:type="pct" w:w="1285%"/>
+          </w:tcPr>
+          <w:p>
+            <w:pPr>
+              <w:spacing w:after="60"/>
+            </w:pPr>
+            <w:r>
+              <w:t xml:space="preserve">mixed</w:t>
+            </w:r>
+          </w:p>
+        </w:tc>
+        <w:tc>
+          <w:tcPr>
+            <w:tcW w:type="pct" w:w="1285%"/>
+          </w:tcPr>
+          <w:p>
+            <w:pPr>
+              <w:spacing w:after="60"/>
+            </w:pPr>
+            <w:r>
+              <w:t xml:space="preserve">eighth_patterns</w:t>
+            </w:r>
+          </w:p>
+        </w:tc>
+        <w:tc>
+          <w:tcPr>
+            <w:tcW w:type="pct" w:w="1285%"/>
+          </w:tcPr>
+          <w:p>
+            <w:pPr>
+              <w:spacing w:after="60"/>
+            </w:pPr>
+            <w:r>
+              <w:t xml:space="preserve">4</w:t>
+            </w:r>
+          </w:p>
+        </w:tc>
+        <w:tc>
+          <w:tcPr>
+            <w:tcW w:type="pct" w:w="1285%"/>
+          </w:tcPr>
+          <w:p>
+            <w:pPr>
+              <w:spacing w:after="60"/>
+            </w:pPr>
+            <w:r>
+              <w:t xml:space="preserve">0.4</w:t>
+            </w:r>
+          </w:p>
+        </w:tc>
+        <w:tc>
+          <w:tcPr>
+            <w:tcW w:type="pct" w:w="1285%"/>
+          </w:tcPr>
+          <w:p>
+            <w:pPr>
+              <w:spacing w:after="60"/>
+            </w:pPr>
+            <w:r>
+              <w:t xml:space="preserve">groove_arc</w:t>
+            </w:r>
+          </w:p>
+        </w:tc>
+        <w:tc>
+          <w:tcPr>
+            <w:tcW w:type="pct" w:w="1285%"/>
+          </w:tcPr>
+          <w:p>
+            <w:pPr>
+              <w:spacing w:after="60"/>
+            </w:pPr>
+            <w:r>
+              <w:t xml:space="preserve">quartal_melody; pentatonic_sideslip; suspended_dominant; funk_ostinato</w:t>
+            </w:r>
+          </w:p>
+        </w:tc>
+      </w:tr>
+      <w:tr>
+        <w:tc>
+          <w:tcPr>
+            <w:tcW w:type="pct" w:w="1285%"/>
+          </w:tcPr>
+          <w:p>
+            <w:pPr>
+              <w:spacing w:after="60"/>
+            </w:pPr>
+            <w:r>
+              <w:t xml:space="preserve">`bach`</w:t>
+            </w:r>
+          </w:p>
+        </w:tc>
+        <w:tc>
+          <w:tcPr>
+            <w:tcW w:type="pct" w:w="1285%"/>
+          </w:tcPr>
+          <w:p>
+            <w:pPr>
+              <w:spacing w:after="60"/>
+            </w:pPr>
+            <w:r>
+              <w:t xml:space="preserve">stepwise</w:t>
+            </w:r>
+          </w:p>
+        </w:tc>
+        <w:tc>
+          <w:tcPr>
+            <w:tcW w:type="pct" w:w="1285%"/>
+          </w:tcPr>
+          <w:p>
+            <w:pPr>
+              <w:spacing w:after="60"/>
+            </w:pPr>
+            <w:r>
+              <w:t xml:space="preserve">eighth_patterns</w:t>
+            </w:r>
+          </w:p>
+        </w:tc>
+        <w:tc>
+          <w:tcPr>
+            <w:tcW w:type="pct" w:w="1285%"/>
+          </w:tcPr>
+          <w:p>
+            <w:pPr>
+              <w:spacing w:after="60"/>
+            </w:pPr>
+            <w:r>
+              <w:t xml:space="preserve">2</w:t>
+            </w:r>
+          </w:p>
+        </w:tc>
+        <w:tc>
+          <w:tcPr>
+            <w:tcW w:type="pct" w:w="1285%"/>
+          </w:tcPr>
+          <w:p>
+            <w:pPr>
+              <w:spacing w:after="60"/>
+            </w:pPr>
+            <w:r>
+              <w:t xml:space="preserve">0.4</w:t>
+            </w:r>
+          </w:p>
+        </w:tc>
+        <w:tc>
+          <w:tcPr>
+            <w:tcW w:type="pct" w:w="1285%"/>
+          </w:tcPr>
+          <w:p>
+            <w:pPr>
+              <w:spacing w:after="60"/>
+            </w:pPr>
+            <w:r>
+              <w:t xml:space="preserve">sequence</w:t>
+            </w:r>
+          </w:p>
+        </w:tc>
+        <w:tc>
+          <w:tcPr>
+            <w:tcW w:type="pct" w:w="1285%"/>
+          </w:tcPr>
+          <w:p>
+            <w:pPr>
+              <w:spacing w:after="60"/>
+            </w:pPr>
+            <w:r>
+              <w:t xml:space="preserve">imitation; sequence; suspension_chain; invertible_counterpoint; circle_of_fifths</w:t>
+            </w:r>
+          </w:p>
+        </w:tc>
+      </w:tr>
+      <w:tr>
+        <w:tc>
+          <w:tcPr>
+            <w:tcW w:type="pct" w:w="1285%"/>
+          </w:tcPr>
+          <w:p>
+            <w:pPr>
+              <w:spacing w:after="60"/>
+            </w:pPr>
+            <w:r>
+              <w:t xml:space="preserve">`beatles`</w:t>
+            </w:r>
+          </w:p>
+        </w:tc>
+        <w:tc>
+          <w:tcPr>
+            <w:tcW w:type="pct" w:w="1285%"/>
+          </w:tcPr>
+          <w:p>
+            <w:pPr>
+              <w:spacing w:after="60"/>
+            </w:pPr>
+            <w:r>
+              <w:t xml:space="preserve">mixed</w:t>
+            </w:r>
+          </w:p>
+        </w:tc>
+        <w:tc>
+          <w:tcPr>
+            <w:tcW w:type="pct" w:w="1285%"/>
+          </w:tcPr>
+          <w:p>
+            <w:pPr>
+              <w:spacing w:after="60"/>
+            </w:pPr>
+            <w:r>
+              <w:t xml:space="preserve">mixed</w:t>
+            </w:r>
+          </w:p>
+        </w:tc>
+        <w:tc>
+          <w:tcPr>
+            <w:tcW w:type="pct" w:w="1285%"/>
+          </w:tcPr>
+          <w:p>
+            <w:pPr>
+              <w:spacing w:after="60"/>
+            </w:pPr>
+            <w:r>
+              <w:t xml:space="preserve">4</w:t>
+            </w:r>
+          </w:p>
+        </w:tc>
+        <w:tc>
+          <w:tcPr>
+            <w:tcW w:type="pct" w:w="1285%"/>
+          </w:tcPr>
+          <w:p>
+            <w:pPr>
+              <w:spacing w:after="60"/>
+            </w:pPr>
+            <w:r>
+              <w:t xml:space="preserve">0.5</w:t>
+            </w:r>
+          </w:p>
+        </w:tc>
+        <w:tc>
+          <w:tcPr>
+            <w:tcW w:type="pct" w:w="1285%"/>
+          </w:tcPr>
+          <w:p>
+            <w:pPr>
+              <w:spacing w:after="60"/>
+            </w:pPr>
+            <w:r>
+              <w:t xml:space="preserve">arch</w:t>
+            </w:r>
+          </w:p>
+        </w:tc>
+        <w:tc>
+          <w:tcPr>
+            <w:tcW w:type="pct" w:w="1285%"/>
+          </w:tcPr>
+          <w:p>
+            <w:pPr>
+              <w:spacing w:after="60"/>
+            </w:pPr>
+            <w:r>
+              <w:t xml:space="preserve">3_note_cell; blue_note; middle_eight_shift; parallel_harmony; chromatic_hook</w:t>
+            </w:r>
+          </w:p>
+        </w:tc>
+      </w:tr>
+      <w:tr>
+        <w:tc>
+          <w:tcPr>
+            <w:tcW w:type="pct" w:w="1285%"/>
+          </w:tcPr>
+          <w:p>
+            <w:pPr>
+              <w:spacing w:after="60"/>
+            </w:pPr>
+            <w:r>
+              <w:t xml:space="preserve">`beethoven`</w:t>
+            </w:r>
+          </w:p>
+        </w:tc>
+        <w:tc>
+          <w:tcPr>
+            <w:tcW w:type="pct" w:w="1285%"/>
+          </w:tcPr>
+          <w:p>
+            <w:pPr>
+              <w:spacing w:after="60"/>
+            </w:pPr>
+            <w:r>
+              <w:t xml:space="preserve">mixed</w:t>
+            </w:r>
+          </w:p>
+        </w:tc>
+        <w:tc>
+          <w:tcPr>
+            <w:tcW w:type="pct" w:w="1285%"/>
+          </w:tcPr>
+          <w:p>
+            <w:pPr>
+              <w:spacing w:after="60"/>
+            </w:pPr>
+            <w:r>
+              <w:t xml:space="preserve">mixed</w:t>
+            </w:r>
+          </w:p>
+        </w:tc>
+        <w:tc>
+          <w:tcPr>
+            <w:tcW w:type="pct" w:w="1285%"/>
+          </w:tcPr>
+          <w:p>
+            <w:pPr>
+              <w:spacing w:after="60"/>
+            </w:pPr>
+            <w:r>
+              <w:t xml:space="preserve">4</w:t>
+            </w:r>
+          </w:p>
+        </w:tc>
+        <w:tc>
+          <w:tcPr>
+            <w:tcW w:type="pct" w:w="1285%"/>
+          </w:tcPr>
+          <w:p>
+            <w:pPr>
+              <w:spacing w:after="60"/>
+            </w:pPr>
+            <w:r>
+              <w:t xml:space="preserve">0.5</w:t>
+            </w:r>
+          </w:p>
+        </w:tc>
+        <w:tc>
+          <w:tcPr>
+            <w:tcW w:type="pct" w:w="1285%"/>
+          </w:tcPr>
+          <w:p>
+            <w:pPr>
+              <w:spacing w:after="60"/>
+            </w:pPr>
+            <w:r>
+              <w:t xml:space="preserve">motivic_development</w:t>
+            </w:r>
+          </w:p>
+        </w:tc>
+        <w:tc>
+          <w:tcPr>
+            <w:tcW w:type="pct" w:w="1285%"/>
+          </w:tcPr>
+          <w:p>
+            <w:pPr>
+              <w:spacing w:after="60"/>
+            </w:pPr>
+            <w:r>
+              <w:t xml:space="preserve">motivic_fragmentation; sequence; liquidation; sforzando_displacement; registral_expansion</w:t>
+            </w:r>
+          </w:p>
+        </w:tc>
+      </w:tr>
+      <w:tr>
+        <w:tc>
+          <w:tcPr>
+            <w:tcW w:type="pct" w:w="1285%"/>
+          </w:tcPr>
+          <w:p>
+            <w:pPr>
+              <w:spacing w:after="60"/>
+            </w:pPr>
+            <w:r>
+              <w:t xml:space="preserve">`billy_strayhorn`</w:t>
+            </w:r>
+          </w:p>
+        </w:tc>
+        <w:tc>
+          <w:tcPr>
+            <w:tcW w:type="pct" w:w="1285%"/>
+          </w:tcPr>
+          <w:p>
+            <w:pPr>
+              <w:spacing w:after="60"/>
+            </w:pPr>
+            <w:r>
+              <w:t xml:space="preserve">stepwise</w:t>
+            </w:r>
+          </w:p>
+        </w:tc>
+        <w:tc>
+          <w:tcPr>
+            <w:tcW w:type="pct" w:w="1285%"/>
+          </w:tcPr>
+          <w:p>
+            <w:pPr>
+              <w:spacing w:after="60"/>
+            </w:pPr>
+            <w:r>
+              <w:t xml:space="preserve">mixed</w:t>
+            </w:r>
+          </w:p>
+        </w:tc>
+        <w:tc>
+          <w:tcPr>
+            <w:tcW w:type="pct" w:w="1285%"/>
+          </w:tcPr>
+          <w:p>
+            <w:pPr>
+              <w:spacing w:after="60"/>
+            </w:pPr>
+            <w:r>
+              <w:t xml:space="preserve">8</w:t>
+            </w:r>
+          </w:p>
+        </w:tc>
+        <w:tc>
+          <w:tcPr>
+            <w:tcW w:type="pct" w:w="1285%"/>
+          </w:tcPr>
+          <w:p>
+            <w:pPr>
+              <w:spacing w:after="60"/>
+            </w:pPr>
+            <w:r>
+              <w:t xml:space="preserve">0.4</w:t>
+            </w:r>
+          </w:p>
+        </w:tc>
+        <w:tc>
+          <w:tcPr>
+            <w:tcW w:type="pct" w:w="1285%"/>
+          </w:tcPr>
+          <w:p>
+            <w:pPr>
+              <w:spacing w:after="60"/>
+            </w:pPr>
+            <w:r>
+              <w:t xml:space="preserve">arch</w:t>
+            </w:r>
+          </w:p>
+        </w:tc>
+        <w:tc>
+          <w:tcPr>
+            <w:tcW w:type="pct" w:w="1285%"/>
+          </w:tcPr>
+          <w:p>
+            <w:pPr>
+              <w:spacing w:after="60"/>
+            </w:pPr>
+            <w:r>
+              <w:t xml:space="preserve">chromatic_descent; dominant_chain; lush_extensions; delayed_cadence; sequence_through_remote_keys</w:t>
+            </w:r>
+          </w:p>
+        </w:tc>
+      </w:tr>
+      <w:tr>
+        <w:tc>
+          <w:tcPr>
+            <w:tcW w:type="pct" w:w="1285%"/>
+          </w:tcPr>
+          <w:p>
+            <w:pPr>
+              <w:spacing w:after="60"/>
+            </w:pPr>
+            <w:r>
+              <w:t xml:space="preserve">`bob_dylan`</w:t>
+            </w:r>
+          </w:p>
+        </w:tc>
+        <w:tc>
+          <w:tcPr>
+            <w:tcW w:type="pct" w:w="1285%"/>
+          </w:tcPr>
+          <w:p>
+            <w:pPr>
+              <w:spacing w:after="60"/>
+            </w:pPr>
+            <w:r>
+              <w:t xml:space="preserve">stepwise</w:t>
+            </w:r>
+          </w:p>
+        </w:tc>
+        <w:tc>
+          <w:tcPr>
+            <w:tcW w:type="pct" w:w="1285%"/>
+          </w:tcPr>
+          <w:p>
+            <w:pPr>
+              <w:spacing w:after="60"/>
+            </w:pPr>
+            <w:r>
+              <w:t xml:space="preserve">mixed</w:t>
+            </w:r>
+          </w:p>
+        </w:tc>
+        <w:tc>
+          <w:tcPr>
+            <w:tcW w:type="pct" w:w="1285%"/>
+          </w:tcPr>
+          <w:p>
+            <w:pPr>
+              <w:spacing w:after="60"/>
+            </w:pPr>
+            <w:r>
+              <w:t xml:space="preserve">8</w:t>
+            </w:r>
+          </w:p>
+        </w:tc>
+        <w:tc>
+          <w:tcPr>
+            <w:tcW w:type="pct" w:w="1285%"/>
+          </w:tcPr>
+          <w:p>
+            <w:pPr>
+              <w:spacing w:after="60"/>
+            </w:pPr>
+            <w:r>
+              <w:t xml:space="preserve">0.8</w:t>
+            </w:r>
+          </w:p>
+        </w:tc>
+        <w:tc>
+          <w:tcPr>
+            <w:tcW w:type="pct" w:w="1285%"/>
+          </w:tcPr>
+          <w:p>
+            <w:pPr>
+              <w:spacing w:after="60"/>
+            </w:pPr>
+            <w:r>
+              <w:t xml:space="preserve">recitation</w:t>
+            </w:r>
+          </w:p>
+        </w:tc>
+        <w:tc>
+          <w:tcPr>
+            <w:tcW w:type="pct" w:w="1285%"/>
+          </w:tcPr>
+          <w:p>
+            <w:pPr>
+              <w:spacing w:after="60"/>
+            </w:pPr>
+            <w:r>
+              <w:t xml:space="preserve">strophic_variation; repeated_note_recitation; modal_pentatonic; line_ending_fall; folk_drone</w:t>
+            </w:r>
+          </w:p>
+        </w:tc>
+      </w:tr>
+      <w:tr>
+        <w:tc>
+          <w:tcPr>
+            <w:tcW w:type="pct" w:w="1285%"/>
+          </w:tcPr>
+          <w:p>
+            <w:pPr>
+              <w:spacing w:after="60"/>
+            </w:pPr>
+            <w:r>
+              <w:t xml:space="preserve">`carole_king`</w:t>
+            </w:r>
+          </w:p>
+        </w:tc>
+        <w:tc>
+          <w:tcPr>
+            <w:tcW w:type="pct" w:w="1285%"/>
+          </w:tcPr>
+          <w:p>
+            <w:pPr>
+              <w:spacing w:after="60"/>
+            </w:pPr>
+            <w:r>
+              <w:t xml:space="preserve">stepwise</w:t>
+            </w:r>
+          </w:p>
+        </w:tc>
+        <w:tc>
+          <w:tcPr>
+            <w:tcW w:type="pct" w:w="1285%"/>
+          </w:tcPr>
+          <w:p>
+            <w:pPr>
+              <w:spacing w:after="60"/>
+            </w:pPr>
+            <w:r>
+              <w:t xml:space="preserve">mixed</w:t>
+            </w:r>
+          </w:p>
+        </w:tc>
+        <w:tc>
+          <w:tcPr>
+            <w:tcW w:type="pct" w:w="1285%"/>
+          </w:tcPr>
+          <w:p>
+            <w:pPr>
+              <w:spacing w:after="60"/>
+            </w:pPr>
+            <w:r>
+              <w:t xml:space="preserve">4</w:t>
+            </w:r>
+          </w:p>
+        </w:tc>
+        <w:tc>
+          <w:tcPr>
+            <w:tcW w:type="pct" w:w="1285%"/>
+          </w:tcPr>
+          <w:p>
+            <w:pPr>
+              <w:spacing w:after="60"/>
+            </w:pPr>
+            <w:r>
+              <w:t xml:space="preserve">0.5</w:t>
+            </w:r>
+          </w:p>
+        </w:tc>
+        <w:tc>
+          <w:tcPr>
+            <w:tcW w:type="pct" w:w="1285%"/>
+          </w:tcPr>
+          <w:p>
+            <w:pPr>
+              <w:spacing w:after="60"/>
+            </w:pPr>
+            <w:r>
+              <w:t xml:space="preserve">rising</w:t>
+            </w:r>
+          </w:p>
+        </w:tc>
+        <w:tc>
+          <w:tcPr>
+            <w:tcW w:type="pct" w:w="1285%"/>
+          </w:tcPr>
+          <w:p>
+            <w:pPr>
+              <w:spacing w:after="60"/>
+            </w:pPr>
+            <w:r>
+              <w:t xml:space="preserve">gospel_suspension; repeated_note_hook; stepwise_verse_build; rising_chorus_sequence</w:t>
+            </w:r>
+          </w:p>
+        </w:tc>
+      </w:tr>
+      <w:tr>
+        <w:tc>
+          <w:tcPr>
+            <w:tcW w:type="pct" w:w="1285%"/>
+          </w:tcPr>
+          <w:p>
+            <w:pPr>
+              <w:spacing w:after="60"/>
+            </w:pPr>
+            <w:r>
+              <w:t xml:space="preserve">`debussy`</w:t>
+            </w:r>
+          </w:p>
+        </w:tc>
+        <w:tc>
+          <w:tcPr>
+            <w:tcW w:type="pct" w:w="1285%"/>
+          </w:tcPr>
+          <w:p>
+            <w:pPr>
+              <w:spacing w:after="60"/>
+            </w:pPr>
+            <w:r>
+              <w:t xml:space="preserve">stepwise</w:t>
+            </w:r>
+          </w:p>
+        </w:tc>
+        <w:tc>
+          <w:tcPr>
+            <w:tcW w:type="pct" w:w="1285%"/>
+          </w:tcPr>
+          <w:p>
+            <w:pPr>
+              <w:spacing w:after="60"/>
+            </w:pPr>
+            <w:r>
+              <w:t xml:space="preserve">mixed</w:t>
+            </w:r>
+          </w:p>
+        </w:tc>
+        <w:tc>
+          <w:tcPr>
+            <w:tcW w:type="pct" w:w="1285%"/>
+          </w:tcPr>
+          <w:p>
+            <w:pPr>
+              <w:spacing w:after="60"/>
+            </w:pPr>
+            <w:r>
+              <w:t xml:space="preserve">3</w:t>
+            </w:r>
+          </w:p>
+        </w:tc>
+        <w:tc>
+          <w:tcPr>
+            <w:tcW w:type="pct" w:w="1285%"/>
+          </w:tcPr>
+          <w:p>
+            <w:pPr>
+              <w:spacing w:after="60"/>
+            </w:pPr>
+            <w:r>
+              <w:t xml:space="preserve">0.5</w:t>
+            </w:r>
+          </w:p>
+        </w:tc>
+        <w:tc>
+          <w:tcPr>
+            <w:tcW w:type="pct" w:w="1285%"/>
+          </w:tcPr>
+          <w:p>
+            <w:pPr>
+              <w:spacing w:after="60"/>
+            </w:pPr>
+            <w:r>
+              <w:t xml:space="preserve">dissolving</w:t>
+            </w:r>
+          </w:p>
+        </w:tc>
+        <w:tc>
+          <w:tcPr>
+            <w:tcW w:type="pct" w:w="1285%"/>
+          </w:tcPr>
+          <w:p>
+            <w:pPr>
+              <w:spacing w:after="60"/>
+            </w:pPr>
+            <w:r>
+              <w:t xml:space="preserve">whole_tone_melody; pentatonic_contrast; parallel_planing; unresolved_appoggiatura; arabesque</w:t>
+            </w:r>
+          </w:p>
+        </w:tc>
+      </w:tr>
+      <w:tr>
+        <w:tc>
+          <w:tcPr>
+            <w:tcW w:type="pct" w:w="1285%"/>
+          </w:tcPr>
+          <w:p>
+            <w:pPr>
+              <w:spacing w:after="60"/>
+            </w:pPr>
+            <w:r>
+              <w:t xml:space="preserve">`duke_ellington`</w:t>
+            </w:r>
+          </w:p>
+        </w:tc>
+        <w:tc>
+          <w:tcPr>
+            <w:tcW w:type="pct" w:w="1285%"/>
+          </w:tcPr>
+          <w:p>
+            <w:pPr>
+              <w:spacing w:after="60"/>
+            </w:pPr>
+            <w:r>
+              <w:t xml:space="preserve">mixed</w:t>
+            </w:r>
+          </w:p>
+        </w:tc>
+        <w:tc>
+          <w:tcPr>
+            <w:tcW w:type="pct" w:w="1285%"/>
+          </w:tcPr>
+          <w:p>
+            <w:pPr>
+              <w:spacing w:after="60"/>
+            </w:pPr>
+            <w:r>
+              <w:t xml:space="preserve">eighth_patterns</w:t>
+            </w:r>
+          </w:p>
+        </w:tc>
+        <w:tc>
+          <w:tcPr>
+            <w:tcW w:type="pct" w:w="1285%"/>
+          </w:tcPr>
+          <w:p>
+            <w:pPr>
+              <w:spacing w:after="60"/>
+            </w:pPr>
+            <w:r>
+              <w:t xml:space="preserve">4</w:t>
+            </w:r>
+          </w:p>
+        </w:tc>
+        <w:tc>
+          <w:tcPr>
+            <w:tcW w:type="pct" w:w="1285%"/>
+          </w:tcPr>
+          <w:p>
+            <w:pPr>
+              <w:spacing w:after="60"/>
+            </w:pPr>
+            <w:r>
+              <w:t xml:space="preserve">0.6</w:t>
+            </w:r>
+          </w:p>
+        </w:tc>
+        <w:tc>
+          <w:tcPr>
+            <w:tcW w:type="pct" w:w="1285%"/>
+          </w:tcPr>
+          <w:p>
+            <w:pPr>
+              <w:spacing w:after="60"/>
+            </w:pPr>
+            <w:r>
+              <w:t xml:space="preserve">riff</w:t>
+            </w:r>
+          </w:p>
+        </w:tc>
+        <w:tc>
+          <w:tcPr>
+            <w:tcW w:type="pct" w:w="1285%"/>
+          </w:tcPr>
+          <w:p>
+            <w:pPr>
+              <w:spacing w:after="60"/>
+            </w:pPr>
+            <w:r>
+              <w:t xml:space="preserve">blues_riff; call_response; chromatic_inner_voice; plunger_color; sectional_shout</w:t>
+            </w:r>
+          </w:p>
+        </w:tc>
+      </w:tr>
+      <w:tr>
+        <w:tc>
+          <w:tcPr>
+            <w:tcW w:type="pct" w:w="1285%"/>
+          </w:tcPr>
+          <w:p>
+            <w:pPr>
+              <w:spacing w:after="60"/>
+            </w:pPr>
+            <w:r>
+              <w:t xml:space="preserve">`holland_dozier_holland`</w:t>
+            </w:r>
+          </w:p>
+        </w:tc>
+        <w:tc>
+          <w:tcPr>
+            <w:tcW w:type="pct" w:w="1285%"/>
+          </w:tcPr>
+          <w:p>
+            <w:pPr>
+              <w:spacing w:after="60"/>
+            </w:pPr>
+            <w:r>
+              <w:t xml:space="preserve">stepwise</w:t>
+            </w:r>
+          </w:p>
+        </w:tc>
+        <w:tc>
+          <w:tcPr>
+            <w:tcW w:type="pct" w:w="1285%"/>
+          </w:tcPr>
+          <w:p>
+            <w:pPr>
+              <w:spacing w:after="60"/>
+            </w:pPr>
+            <w:r>
+              <w:t xml:space="preserve">eighth_patterns</w:t>
+            </w:r>
+          </w:p>
+        </w:tc>
+        <w:tc>
+          <w:tcPr>
+            <w:tcW w:type="pct" w:w="1285%"/>
+          </w:tcPr>
+          <w:p>
+            <w:pPr>
+              <w:spacing w:after="60"/>
+            </w:pPr>
+            <w:r>
+              <w:t xml:space="preserve">2</w:t>
+            </w:r>
+          </w:p>
+        </w:tc>
+        <w:tc>
+          <w:tcPr>
+            <w:tcW w:type="pct" w:w="1285%"/>
+          </w:tcPr>
+          <w:p>
+            <w:pPr>
+              <w:spacing w:after="60"/>
+            </w:pPr>
+            <w:r>
+              <w:t xml:space="preserve">0.7</w:t>
+            </w:r>
+          </w:p>
+        </w:tc>
+        <w:tc>
+          <w:tcPr>
+            <w:tcW w:type="pct" w:w="1285%"/>
+          </w:tcPr>
+          <w:p>
+            <w:pPr>
+              <w:spacing w:after="60"/>
+            </w:pPr>
+            <w:r>
+              <w:t xml:space="preserve">rising</w:t>
+            </w:r>
+          </w:p>
+        </w:tc>
+        <w:tc>
+          <w:tcPr>
+            <w:tcW w:type="pct" w:w="1285%"/>
+          </w:tcPr>
+          <w:p>
+            <w:pPr>
+              <w:spacing w:after="60"/>
+            </w:pPr>
+            <w:r>
+              <w:t xml:space="preserve">call_response_hook; repeated_title_phrase; tambourine_anticipation; backing_vocal_echo</w:t>
+            </w:r>
+          </w:p>
+        </w:tc>
+      </w:tr>
+      <w:tr>
+        <w:tc>
+          <w:tcPr>
+            <w:tcW w:type="pct" w:w="1285%"/>
+          </w:tcPr>
+          <w:p>
+            <w:pPr>
+              <w:spacing w:after="60"/>
+            </w:pPr>
+            <w:r>
+              <w:t xml:space="preserve">`jeff_lynne`</w:t>
+            </w:r>
+          </w:p>
+        </w:tc>
+        <w:tc>
+          <w:tcPr>
+            <w:tcW w:type="pct" w:w="1285%"/>
+          </w:tcPr>
+          <w:p>
+            <w:pPr>
+              <w:spacing w:after="60"/>
+            </w:pPr>
+            <w:r>
+              <w:t xml:space="preserve">stepwise</w:t>
+            </w:r>
+          </w:p>
+        </w:tc>
+        <w:tc>
+          <w:tcPr>
+            <w:tcW w:type="pct" w:w="1285%"/>
+          </w:tcPr>
+          <w:p>
+            <w:pPr>
+              <w:spacing w:after="60"/>
+            </w:pPr>
+            <w:r>
+              <w:t xml:space="preserve">mixed</w:t>
+            </w:r>
+          </w:p>
+        </w:tc>
+        <w:tc>
+          <w:tcPr>
+            <w:tcW w:type="pct" w:w="1285%"/>
+          </w:tcPr>
+          <w:p>
+            <w:pPr>
+              <w:spacing w:after="60"/>
+            </w:pPr>
+            <w:r>
+              <w:t xml:space="preserve">4</w:t>
+            </w:r>
+          </w:p>
+        </w:tc>
+        <w:tc>
+          <w:tcPr>
+            <w:tcW w:type="pct" w:w="1285%"/>
+          </w:tcPr>
+          <w:p>
+            <w:pPr>
+              <w:spacing w:after="60"/>
+            </w:pPr>
+            <w:r>
+              <w:t xml:space="preserve">0.6</w:t>
+            </w:r>
+          </w:p>
+        </w:tc>
+        <w:tc>
+          <w:tcPr>
+            <w:tcW w:type="pct" w:w="1285%"/>
+          </w:tcPr>
+          <w:p>
+            <w:pPr>
+              <w:spacing w:after="60"/>
+            </w:pPr>
+            <w:r>
+              <w:t xml:space="preserve">arch</w:t>
+            </w:r>
+          </w:p>
+        </w:tc>
+        <w:tc>
+          <w:tcPr>
+            <w:tcW w:type="pct" w:w="1285%"/>
+          </w:tcPr>
+          <w:p>
+            <w:pPr>
+              <w:spacing w:after="60"/>
+            </w:pPr>
+            <w:r>
+              <w:t xml:space="preserve">stacked_harmony_hook; octave_doubled_melody; string_countermelody; descending_bass_hook</w:t>
+            </w:r>
+          </w:p>
+        </w:tc>
+      </w:tr>
+      <w:tr>
+        <w:tc>
+          <w:tcPr>
+            <w:tcW w:type="pct" w:w="1285%"/>
+          </w:tcPr>
+          <w:p>
+            <w:pPr>
+              <w:spacing w:after="60"/>
+            </w:pPr>
+            <w:r>
+              <w:t xml:space="preserve">`jeff_tweedy`</w:t>
+            </w:r>
+          </w:p>
+        </w:tc>
+        <w:tc>
+          <w:tcPr>
+            <w:tcW w:type="pct" w:w="1285%"/>
+          </w:tcPr>
+          <w:p>
+            <w:pPr>
+              <w:spacing w:after="60"/>
+            </w:pPr>
+            <w:r>
+              <w:t xml:space="preserve">stepwise</w:t>
+            </w:r>
+          </w:p>
+        </w:tc>
+        <w:tc>
+          <w:tcPr>
+            <w:tcW w:type="pct" w:w="1285%"/>
+          </w:tcPr>
+          <w:p>
+            <w:pPr>
+              <w:spacing w:after="60"/>
+            </w:pPr>
+            <w:r>
+              <w:t xml:space="preserve">mixed</w:t>
+            </w:r>
+          </w:p>
+        </w:tc>
+        <w:tc>
+          <w:tcPr>
+            <w:tcW w:type="pct" w:w="1285%"/>
+          </w:tcPr>
+          <w:p>
+            <w:pPr>
+              <w:spacing w:after="60"/>
+            </w:pPr>
+            <w:r>
+              <w:t xml:space="preserve">4</w:t>
+            </w:r>
+          </w:p>
+        </w:tc>
+        <w:tc>
+          <w:tcPr>
+            <w:tcW w:type="pct" w:w="1285%"/>
+          </w:tcPr>
+          <w:p>
+            <w:pPr>
+              <w:spacing w:after="60"/>
+            </w:pPr>
+            <w:r>
+              <w:t xml:space="preserve">0.7</w:t>
+            </w:r>
+          </w:p>
+        </w:tc>
+        <w:tc>
+          <w:tcPr>
+            <w:tcW w:type="pct" w:w="1285%"/>
+          </w:tcPr>
+          <w:p>
+            <w:pPr>
+              <w:spacing w:after="60"/>
+            </w:pPr>
+            <w:r>
+              <w:t xml:space="preserve">flat</w:t>
+            </w:r>
+          </w:p>
+        </w:tc>
+        <w:tc>
+          <w:tcPr>
+            <w:tcW w:type="pct" w:w="1285%"/>
+          </w:tcPr>
+          <w:p>
+            <w:pPr>
+              <w:spacing w:after="60"/>
+            </w:pPr>
+            <w:r>
+              <w:t xml:space="preserve">deadpan_repeated_note; modal_bVII; unresolved_suspension; folk_drone; understated_chorus</w:t>
+            </w:r>
+          </w:p>
+        </w:tc>
+      </w:tr>
+      <w:tr>
+        <w:tc>
+          <w:tcPr>
+            <w:tcW w:type="pct" w:w="1285%"/>
+          </w:tcPr>
+          <w:p>
+            <w:pPr>
+              <w:spacing w:after="60"/>
+            </w:pPr>
+            <w:r>
+              <w:t xml:space="preserve">`kendrick_lamar`</w:t>
+            </w:r>
+          </w:p>
+        </w:tc>
+        <w:tc>
+          <w:tcPr>
+            <w:tcW w:type="pct" w:w="1285%"/>
+          </w:tcPr>
+          <w:p>
+            <w:pPr>
+              <w:spacing w:after="60"/>
+            </w:pPr>
+            <w:r>
+              <w:t xml:space="preserve">stepwise</w:t>
+            </w:r>
+          </w:p>
+        </w:tc>
+        <w:tc>
+          <w:tcPr>
+            <w:tcW w:type="pct" w:w="1285%"/>
+          </w:tcPr>
+          <w:p>
+            <w:pPr>
+              <w:spacing w:after="60"/>
+            </w:pPr>
+            <w:r>
+              <w:t xml:space="preserve">eighth_patterns</w:t>
+            </w:r>
+          </w:p>
+        </w:tc>
+        <w:tc>
+          <w:tcPr>
+            <w:tcW w:type="pct" w:w="1285%"/>
+          </w:tcPr>
+          <w:p>
+            <w:pPr>
+              <w:spacing w:after="60"/>
+            </w:pPr>
+            <w:r>
+              <w:t xml:space="preserve">2</w:t>
+            </w:r>
+          </w:p>
+        </w:tc>
+        <w:tc>
+          <w:tcPr>
+            <w:tcW w:type="pct" w:w="1285%"/>
+          </w:tcPr>
+          <w:p>
+            <w:pPr>
+              <w:spacing w:after="60"/>
+            </w:pPr>
+            <w:r>
+              <w:t xml:space="preserve">0.5</w:t>
+            </w:r>
+          </w:p>
+        </w:tc>
+        <w:tc>
+          <w:tcPr>
+            <w:tcW w:type="pct" w:w="1285%"/>
+          </w:tcPr>
+          <w:p>
+            <w:pPr>
+              <w:spacing w:after="60"/>
+            </w:pPr>
+            <w:r>
+              <w:t xml:space="preserve">speech_contour</w:t>
+            </w:r>
+          </w:p>
+        </w:tc>
+        <w:tc>
+          <w:tcPr>
+            <w:tcW w:type="pct" w:w="1285%"/>
+          </w:tcPr>
+          <w:p>
+            <w:pPr>
+              <w:spacing w:after="60"/>
+            </w:pPr>
+            <w:r>
+              <w:t xml:space="preserve">flow_modulation; syllabic_ostinato; pitch_zone_contrast; barline_displacement; triplet_switch</w:t>
+            </w:r>
+          </w:p>
+        </w:tc>
+      </w:tr>
+      <w:tr>
+        <w:tc>
+          <w:tcPr>
+            <w:tcW w:type="pct" w:w="1285%"/>
+          </w:tcPr>
+          <w:p>
+            <w:pPr>
+              <w:spacing w:after="60"/>
+            </w:pPr>
+            <w:r>
+              <w:t xml:space="preserve">`kurt_weill`</w:t>
+            </w:r>
+          </w:p>
+        </w:tc>
+        <w:tc>
+          <w:tcPr>
+            <w:tcW w:type="pct" w:w="1285%"/>
+          </w:tcPr>
+          <w:p>
+            <w:pPr>
+              <w:spacing w:after="60"/>
+            </w:pPr>
+            <w:r>
+              <w:t xml:space="preserve">stepwise</w:t>
+            </w:r>
+          </w:p>
+        </w:tc>
+        <w:tc>
+          <w:tcPr>
+            <w:tcW w:type="pct" w:w="1285%"/>
+          </w:tcPr>
+          <w:p>
+            <w:pPr>
+              <w:spacing w:after="60"/>
+            </w:pPr>
+            <w:r>
+              <w:t xml:space="preserve">mixed</w:t>
+            </w:r>
+          </w:p>
+        </w:tc>
+        <w:tc>
+          <w:tcPr>
+            <w:tcW w:type="pct" w:w="1285%"/>
+          </w:tcPr>
+          <w:p>
+            <w:pPr>
+              <w:spacing w:after="60"/>
+            </w:pPr>
+            <w:r>
+              <w:t xml:space="preserve">4</w:t>
+            </w:r>
+          </w:p>
+        </w:tc>
+        <w:tc>
+          <w:tcPr>
+            <w:tcW w:type="pct" w:w="1285%"/>
+          </w:tcPr>
+          <w:p>
+            <w:pPr>
+              <w:spacing w:after="60"/>
+            </w:pPr>
+            <w:r>
+              <w:t xml:space="preserve">0.6</w:t>
+            </w:r>
+          </w:p>
+        </w:tc>
+        <w:tc>
+          <w:tcPr>
+            <w:tcW w:type="pct" w:w="1285%"/>
+          </w:tcPr>
+          <w:p>
+            <w:pPr>
+              <w:spacing w:after="60"/>
+            </w:pPr>
+            <w:r>
+              <w:t xml:space="preserve">cabaret_arc</w:t>
+            </w:r>
+          </w:p>
+        </w:tc>
+        <w:tc>
+          <w:tcPr>
+            <w:tcW w:type="pct" w:w="1285%"/>
+          </w:tcPr>
+          <w:p>
+            <w:pPr>
+              <w:spacing w:after="60"/>
+            </w:pPr>
+            <w:r>
+              <w:t xml:space="preserve">descending_minor_3rd; tritone_bitterness; chant_repeated_tone; major_minor_irony; mechanical_ostinato</w:t>
+            </w:r>
+          </w:p>
+        </w:tc>
+      </w:tr>
+    </w:tbl>
+    <w:p>
+      <w:pPr>
+        <w:spacing w:after="160"/>
+      </w:pPr>
     </w:p>
     <w:p>
       <w:pPr>

</xml_diff>

<commit_message>
feat: wire SY/Joni/Metheny styles to slice logic, promote to Advanced
Co-authored-by: Cursor <cursoragent@cursor.com>
</commit_message>
<xml_diff>
--- a/docs/COMPOSER_OS_PLAYBOOK.docx
+++ b/docs/COMPOSER_OS_PLAYBOOK.docx
@@ -6373,7 +6373,7 @@
         <w:spacing w:after="100" w:before="160"/>
       </w:pPr>
       <w:r>
-        <w:t xml:space="preserve">Joni Mitchell (Song Mode — open tunings, modal harmony)</w:t>
+        <w:t xml:space="preserve">Song Mode Style Engine (`StyleProfile`)</w:t>
       </w:r>
     </w:p>
     <w:p>
@@ -6381,156 +6381,57 @@
         <w:spacing w:after="160"/>
       </w:pPr>
       <w:r>
-        <w:rPr>
-          <w:b/>
-          <w:bCs/>
-        </w:rPr>
-        <w:t xml:space="preserve">Joni Mitchell</w:t>
-      </w:r>
-      <w:r>
-        <w:t xml:space="preserve"> is a </w:t>
-      </w:r>
-      <w:r>
-        <w:rPr>
-          <w:b/>
-          <w:bCs/>
-        </w:rPr>
-        <w:t xml:space="preserve">shipped golden-path slice</w:t>
-      </w:r>
-      <w:r>
-        <w:t xml:space="preserve">: </w:t>
-      </w:r>
-      <w:r>
-        <w:rPr>
-          <w:b/>
-          <w:bCs/>
-        </w:rPr>
-        <w:t xml:space="preserve">`joniMitchellSlice.ts`</w:t>
-      </w:r>
-      <w:r>
-        <w:t xml:space="preserve">, </w:t>
-      </w:r>
-      <w:r>
-        <w:rPr>
-          <w:b/>
-          <w:bCs/>
-        </w:rPr>
-        <w:t xml:space="preserve">`jm:*`</w:t>
-      </w:r>
-      <w:r>
-        <w:t xml:space="preserve"> device receipts, </w:t>
-      </w:r>
-      <w:r>
-        <w:rPr>
-          <w:b/>
-          <w:bCs/>
-        </w:rPr>
-        <w:t xml:space="preserve">`joniMitchellEffectiveHarmonyBars`</w:t>
-      </w:r>
-      <w:r>
-        <w:t xml:space="preserve"> feeding </w:t>
-      </w:r>
-      <w:r>
-        <w:rPr>
-          <w:b/>
-          <w:bCs/>
-        </w:rPr>
-        <w:t xml:space="preserve">`getChordForBar`</w:t>
-      </w:r>
-      <w:r>
-        <w:t xml:space="preserve"> and locked MusicXML truth (same pattern as Radiohead / James Brown). Pools emphasize </w:t>
-      </w:r>
-      <w:r>
-        <w:rPr>
-          <w:b/>
-          <w:bCs/>
-        </w:rPr>
-        <w:t xml:space="preserve">modal</w:t>
-      </w:r>
-      <w:r>
-        <w:t xml:space="preserve">, </w:t>
-      </w:r>
-      <w:r>
-        <w:rPr>
-          <w:b/>
-          <w:bCs/>
-        </w:rPr>
-        <w:t xml:space="preserve">pedal</w:t>
-      </w:r>
-      <w:r>
-        <w:t xml:space="preserve">, and </w:t>
-      </w:r>
-      <w:r>
-        <w:rPr>
-          <w:b/>
-          <w:bCs/>
-        </w:rPr>
-        <w:t xml:space="preserve">open-tuning-friendly</w:t>
-      </w:r>
-      <w:r>
-        <w:t xml:space="preserve"> colours (</w:t>
-      </w:r>
-      <w:r>
-        <w:rPr>
-          <w:b/>
-          <w:bCs/>
-        </w:rPr>
-        <w:t xml:space="preserve">add9</w:t>
-      </w:r>
-      <w:r>
-        <w:t xml:space="preserve">, </w:t>
-      </w:r>
-      <w:r>
-        <w:rPr>
-          <w:b/>
-          <w:bCs/>
-        </w:rPr>
-        <w:t xml:space="preserve">sus2/sus4</w:t>
-      </w:r>
-      <w:r>
-        <w:t xml:space="preserve">, </w:t>
-      </w:r>
-      <w:r>
-        <w:rPr>
-          <w:b/>
-          <w:bCs/>
-        </w:rPr>
-        <w:t xml:space="preserve">slash</w:t>
-      </w:r>
-      <w:r>
-        <w:t xml:space="preserve"> pedals, </w:t>
-      </w:r>
-      <w:r>
-        <w:rPr>
-          <w:b/>
-          <w:bCs/>
-        </w:rPr>
-        <w:t xml:space="preserve">maj(add9)</w:t>
-      </w:r>
-      <w:r>
-        <w:t xml:space="preserve"> rows — see </w:t>
-      </w:r>
-      <w:r>
-        <w:rPr>
-          <w:b/>
-          <w:bCs/>
-        </w:rPr>
-        <w:t xml:space="preserve">`SONGWRITER_CHORD_POOLS.joni_mitchell`</w:t>
+        <w:t xml:space="preserve">The Generate </w:t>
+      </w:r>
+      <w:r>
+        <w:rPr>
+          <w:b/>
+          <w:bCs/>
+        </w:rPr>
+        <w:t xml:space="preserve">Style Engine</w:t>
+      </w:r>
+      <w:r>
+        <w:t xml:space="preserve"> dropdown lists </w:t>
+      </w:r>
+      <w:r>
+        <w:rPr>
+          <w:b/>
+          <w:bCs/>
+        </w:rPr>
+        <w:t xml:space="preserve">`StyleProfile`</w:t>
+      </w:r>
+      <w:r>
+        <w:t xml:space="preserve"> ids (`songModeStyleProfile.ts`). Options are grouped into </w:t>
+      </w:r>
+      <w:r>
+        <w:rPr>
+          <w:b/>
+          <w:bCs/>
+        </w:rPr>
+        <w:t xml:space="preserve">Advanced styles</w:t>
+      </w:r>
+      <w:r>
+        <w:t xml:space="preserve"> vs </w:t>
+      </w:r>
+      <w:r>
+        <w:rPr>
+          <w:b/>
+          <w:bCs/>
+        </w:rPr>
+        <w:t xml:space="preserve">Light touch styles</w:t>
+      </w:r>
+      <w:r>
+        <w:t xml:space="preserve"> (`SONG_MODE_ADVANCED_STYLE_SET` in </w:t>
+      </w:r>
+      <w:r>
+        <w:rPr>
+          <w:b/>
+          <w:bCs/>
+        </w:rPr>
+        <w:t xml:space="preserve">`HomeGenerate.tsx`</w:t>
       </w:r>
       <w:r>
         <w:t xml:space="preserve">).</w:t>
-      </w:r>
-    </w:p>
-    <w:p>
-      <w:pPr>
-        <w:spacing w:after="160"/>
-      </w:pPr>
-      <w:r>
-        <w:rPr>
-          <w:b/>
-          <w:bCs/>
-        </w:rPr>
-        <w:t xml:space="preserve">Open-tuning philosophy (pedagogy, not a transcription engine)</w:t>
       </w:r>
     </w:p>
     <w:p>
@@ -6542,24 +6443,21 @@
         <w:t xml:space="preserve">• </w:t>
       </w:r>
       <w:r>
-        <w:t xml:space="preserve">Real-world Joni repertoire is tied to </w:t>
-      </w:r>
-      <w:r>
-        <w:rPr>
-          <w:b/>
-          <w:bCs/>
-        </w:rPr>
-        <w:t xml:space="preserve">non-standard tunings</w:t>
-      </w:r>
-      <w:r>
-        <w:t xml:space="preserve"> (e.g. </w:t>
-      </w:r>
-      <w:r>
-        <w:rPr>
-          <w:b/>
-          <w:bCs/>
-        </w:rPr>
-        <w:t xml:space="preserve">DADGAD</w:t>
+        <w:rPr>
+          <w:b/>
+          <w:bCs/>
+        </w:rPr>
+        <w:t xml:space="preserve">Advanced:</w:t>
+      </w:r>
+      <w:r>
+        <w:t xml:space="preserve"> Profiles that apply </w:t>
+      </w:r>
+      <w:r>
+        <w:rPr>
+          <w:b/>
+          <w:bCs/>
+        </w:rPr>
+        <w:t xml:space="preserve">harmony/rhythm metadata surfaces</w:t>
       </w:r>
       <w:r>
         <w:t xml:space="preserve">, </w:t>
@@ -6569,7 +6467,27 @@
           <w:b/>
           <w:bCs/>
         </w:rPr>
-        <w:t xml:space="preserve">CGDGCD</w:t>
+        <w:t xml:space="preserve">builtin chord-plan policies</w:t>
+      </w:r>
+      <w:r>
+        <w:t xml:space="preserve">, or </w:t>
+      </w:r>
+      <w:r>
+        <w:rPr>
+          <w:b/>
+          <w:bCs/>
+        </w:rPr>
+        <w:t xml:space="preserve">golden-path slice wiring</w:t>
+      </w:r>
+      <w:r>
+        <w:t xml:space="preserve"> (effective harmony bars, guitar bar passes, receipts) beyond velocity-only contouring. Examples: </w:t>
+      </w:r>
+      <w:r>
+        <w:rPr>
+          <w:b/>
+          <w:bCs/>
+        </w:rPr>
+        <w:t xml:space="preserve">Post-Bop (Shorter)</w:t>
       </w:r>
       <w:r>
         <w:t xml:space="preserve">, </w:t>
@@ -6579,40 +6497,60 @@
           <w:b/>
           <w:bCs/>
         </w:rPr>
-        <w:t xml:space="preserve">DADDAD</w:t>
-      </w:r>
-      <w:r>
-        <w:t xml:space="preserve">, drop/add variants). The engine represents tunings through </w:t>
-      </w:r>
-      <w:r>
-        <w:rPr>
-          <w:b/>
-          <w:bCs/>
-        </w:rPr>
-        <w:t xml:space="preserve">`alternateGuitarTunings.ts`</w:t>
-      </w:r>
-      <w:r>
-        <w:t xml:space="preserve"> zone </w:t>
-      </w:r>
-      <w:r>
-        <w:rPr>
-          <w:b/>
-          <w:bCs/>
-        </w:rPr>
-        <w:t xml:space="preserve">`joni_mitchell`</w:t>
-      </w:r>
-      <w:r>
-        <w:t xml:space="preserve"> — presets carry </w:t>
-      </w:r>
-      <w:r>
-        <w:rPr>
-          <w:b/>
-          <w:bCs/>
-        </w:rPr>
-        <w:t xml:space="preserve">six string pitches</w:t>
-      </w:r>
-      <w:r>
-        <w:t xml:space="preserve"> (`AlternateGuitarTuningPreset.strings`) for UI + metadata.</w:t>
+        <w:t xml:space="preserve">Modern Jazz</w:t>
+      </w:r>
+      <w:r>
+        <w:t xml:space="preserve">, </w:t>
+      </w:r>
+      <w:r>
+        <w:rPr>
+          <w:b/>
+          <w:bCs/>
+        </w:rPr>
+        <w:t xml:space="preserve">Sophisticated Pop</w:t>
+      </w:r>
+      <w:r>
+        <w:t xml:space="preserve">, </w:t>
+      </w:r>
+      <w:r>
+        <w:rPr>
+          <w:b/>
+          <w:bCs/>
+        </w:rPr>
+        <w:t xml:space="preserve">Groove / Soul</w:t>
+      </w:r>
+      <w:r>
+        <w:t xml:space="preserve">, and — as of the style-to-slice wiring — </w:t>
+      </w:r>
+      <w:r>
+        <w:rPr>
+          <w:b/>
+          <w:bCs/>
+        </w:rPr>
+        <w:t xml:space="preserve">`STYLE_SONIC_YOUTH`</w:t>
+      </w:r>
+      <w:r>
+        <w:t xml:space="preserve">, </w:t>
+      </w:r>
+      <w:r>
+        <w:rPr>
+          <w:b/>
+          <w:bCs/>
+        </w:rPr>
+        <w:t xml:space="preserve">`STYLE_JONI_MITCHELL`</w:t>
+      </w:r>
+      <w:r>
+        <w:t xml:space="preserve">, </w:t>
+      </w:r>
+      <w:r>
+        <w:rPr>
+          <w:b/>
+          <w:bCs/>
+        </w:rPr>
+        <w:t xml:space="preserve">`STYLE_PAT_METHENY`</w:t>
+      </w:r>
+      <w:r>
+        <w:t xml:space="preserve">.</w:t>
       </w:r>
     </w:p>
     <w:p>
@@ -6628,27 +6566,479 @@
           <w:b/>
           <w:bCs/>
         </w:rPr>
-        <w:t xml:space="preserve">`GuitarTuningState`</w:t>
-      </w:r>
-      <w:r>
-        <w:t xml:space="preserve"> (</w:t>
-      </w:r>
-      <w:r>
-        <w:rPr>
-          <w:b/>
-          <w:bCs/>
-        </w:rPr>
-        <w:t xml:space="preserve">`sonicYouthChordTypes.ts`</w:t>
-      </w:r>
-      <w:r>
-        <w:t xml:space="preserve">, shared shape name) encodes </w:t>
-      </w:r>
-      <w:r>
-        <w:rPr>
-          <w:b/>
-          <w:bCs/>
-        </w:rPr>
-        <w:t xml:space="preserve">open-string MIDI grid</w:t>
+        <w:t xml:space="preserve">Light touch:</w:t>
+      </w:r>
+      <w:r>
+        <w:t xml:space="preserve"> Primarily </w:t>
+      </w:r>
+      <w:r>
+        <w:rPr>
+          <w:b/>
+          <w:bCs/>
+        </w:rPr>
+        <w:t xml:space="preserve">velocity shaping</w:t>
+      </w:r>
+      <w:r>
+        <w:t xml:space="preserve"> on the finished duo score (`applySongModeStyleEngineToScore`); may stack with era/style-pairing biases but does not alone run a full writer slice.</w:t>
+      </w:r>
+    </w:p>
+    <w:p>
+      <w:pPr>
+        <w:spacing w:after="160"/>
+      </w:pPr>
+      <w:r>
+        <w:rPr>
+          <w:b/>
+          <w:bCs/>
+        </w:rPr>
+        <w:t xml:space="preserve">Wiring summary (Sonic Youth / Joni / Pat style ids)</w:t>
+      </w:r>
+    </w:p>
+    <w:tbl>
+      <w:tblPr>
+        <w:tblW w:type="pct" w:w="100%"/>
+        <w:tblBorders>
+          <w:top w:val="single" w:color="auto" w:sz="4"/>
+          <w:left w:val="single" w:color="auto" w:sz="4"/>
+          <w:bottom w:val="single" w:color="auto" w:sz="4"/>
+          <w:right w:val="single" w:color="auto" w:sz="4"/>
+          <w:insideH w:val="single" w:color="auto" w:sz="4"/>
+          <w:insideV w:val="single" w:color="auto" w:sz="4"/>
+        </w:tblBorders>
+      </w:tblPr>
+      <w:tblGrid>
+        <w:gridCol w:w="3000"/>
+        <w:gridCol w:w="3000"/>
+        <w:gridCol w:w="3000"/>
+      </w:tblGrid>
+      <w:tr>
+        <w:tc>
+          <w:tcPr>
+            <w:tcW w:type="pct" w:w="3000%"/>
+          </w:tcPr>
+          <w:p>
+            <w:pPr>
+              <w:spacing w:after="60"/>
+            </w:pPr>
+            <w:r>
+              <w:t xml:space="preserve">`StyleProfile`</w:t>
+            </w:r>
+          </w:p>
+        </w:tc>
+        <w:tc>
+          <w:tcPr>
+            <w:tcW w:type="pct" w:w="3000%"/>
+          </w:tcPr>
+          <w:p>
+            <w:pPr>
+              <w:spacing w:after="60"/>
+            </w:pPr>
+            <w:r>
+              <w:t xml:space="preserve">Velocity layer</w:t>
+            </w:r>
+          </w:p>
+        </w:tc>
+        <w:tc>
+          <w:tcPr>
+            <w:tcW w:type="pct" w:w="3000%"/>
+          </w:tcPr>
+          <w:p>
+            <w:pPr>
+              <w:spacing w:after="60"/>
+            </w:pPr>
+            <w:r>
+              <w:t xml:space="preserve">Engine wiring</w:t>
+            </w:r>
+          </w:p>
+        </w:tc>
+      </w:tr>
+      <w:tr>
+        <w:tc>
+          <w:tcPr>
+            <w:tcW w:type="pct" w:w="3000%"/>
+          </w:tcPr>
+          <w:p>
+            <w:pPr>
+              <w:spacing w:after="60"/>
+            </w:pPr>
+            <w:r>
+              <w:rPr>
+                <w:b/>
+                <w:bCs/>
+              </w:rPr>
+              <w:t xml:space="preserve">`STYLE_SONIC_YOUTH`</w:t>
+            </w:r>
+          </w:p>
+        </w:tc>
+        <w:tc>
+          <w:tcPr>
+            <w:tcW w:type="pct" w:w="3000%"/>
+          </w:tcPr>
+          <w:p>
+            <w:pPr>
+              <w:spacing w:after="60"/>
+            </w:pPr>
+            <w:r>
+              <w:t xml:space="preserve">Aggressive offbeat emphasis; </w:t>
+            </w:r>
+            <w:r>
+              <w:rPr>
+                <w:b/>
+                <w:bCs/>
+              </w:rPr>
+              <w:t xml:space="preserve">`noise_wall`</w:t>
+            </w:r>
+            <w:r>
+              <w:t xml:space="preserve"> macro texture → large positive deltas; </w:t>
+            </w:r>
+            <w:r>
+              <w:rPr>
+                <w:b/>
+                <w:bCs/>
+              </w:rPr>
+              <w:t xml:space="preserve">`clearing`</w:t>
+            </w:r>
+            <w:r>
+              <w:t xml:space="preserve"> → deep reduction; reads </w:t>
+            </w:r>
+            <w:r>
+              <w:rPr>
+                <w:b/>
+                <w:bCs/>
+              </w:rPr>
+              <w:t xml:space="preserve">`ChordEvent.sonicYouth.textureState`</w:t>
+            </w:r>
+            <w:r>
+              <w:t xml:space="preserve"> when present, else </w:t>
+            </w:r>
+            <w:r>
+              <w:rPr>
+                <w:b/>
+                <w:bCs/>
+              </w:rPr>
+              <w:t xml:space="preserve">`getSonicYouthTextureStateAtBar`</w:t>
+            </w:r>
+            <w:r>
+              <w:t xml:space="preserve"> (`sonicYouthSlice.ts`).</w:t>
+            </w:r>
+          </w:p>
+        </w:tc>
+        <w:tc>
+          <w:tcPr>
+            <w:tcW w:type="pct" w:w="3000%"/>
+          </w:tcPr>
+          <w:p>
+            <w:pPr>
+              <w:spacing w:after="60"/>
+            </w:pPr>
+            <w:r>
+              <w:t xml:space="preserve">When primary songwriter </w:t>
+            </w:r>
+            <w:r>
+              <w:rPr>
+                <w:b/>
+                <w:bCs/>
+              </w:rPr>
+              <w:t xml:space="preserve">or</w:t>
+            </w:r>
+            <w:r>
+              <w:t xml:space="preserve"> this style: </w:t>
+            </w:r>
+            <w:r>
+              <w:rPr>
+                <w:b/>
+                <w:bCs/>
+              </w:rPr>
+              <w:t xml:space="preserve">`precomputeSonicYouthEffectiveHarmonyBars`</w:t>
+            </w:r>
+            <w:r>
+              <w:t xml:space="preserve">, </w:t>
+            </w:r>
+            <w:r>
+              <w:rPr>
+                <w:b/>
+                <w:bCs/>
+              </w:rPr>
+              <w:t xml:space="preserve">`applySonicYouthGuitarBarPasses`</w:t>
+            </w:r>
+            <w:r>
+              <w:t xml:space="preserve">, </w:t>
+            </w:r>
+            <w:r>
+              <w:rPr>
+                <w:b/>
+                <w:bCs/>
+              </w:rPr>
+              <w:t xml:space="preserve">`getChordForBar`</w:t>
+            </w:r>
+            <w:r>
+              <w:t xml:space="preserve"> / locked-truth paths accept </w:t>
+            </w:r>
+            <w:r>
+              <w:rPr>
+                <w:b/>
+                <w:bCs/>
+              </w:rPr>
+              <w:t xml:space="preserve">`sonicYouthEffectiveHarmonyBars`</w:t>
+            </w:r>
+            <w:r>
+              <w:t xml:space="preserve"> (`harmonyResolution.ts`, </w:t>
+            </w:r>
+            <w:r>
+              <w:rPr>
+                <w:b/>
+                <w:bCs/>
+              </w:rPr>
+              <w:t xml:space="preserve">`customLockedHarmonyRouting.ts`</w:t>
+            </w:r>
+            <w:r>
+              <w:t xml:space="preserve">, </w:t>
+            </w:r>
+            <w:r>
+              <w:rPr>
+                <w:b/>
+                <w:bCs/>
+              </w:rPr>
+              <w:t xml:space="preserve">`runGoldenPath.ts`</w:t>
+            </w:r>
+            <w:r>
+              <w:t xml:space="preserve"> export truth).</w:t>
+            </w:r>
+          </w:p>
+        </w:tc>
+      </w:tr>
+      <w:tr>
+        <w:tc>
+          <w:tcPr>
+            <w:tcW w:type="pct" w:w="3000%"/>
+          </w:tcPr>
+          <w:p>
+            <w:pPr>
+              <w:spacing w:after="60"/>
+            </w:pPr>
+            <w:r>
+              <w:rPr>
+                <w:b/>
+                <w:bCs/>
+              </w:rPr>
+              <w:t xml:space="preserve">`STYLE_JONI_MITCHELL`</w:t>
+            </w:r>
+          </w:p>
+        </w:tc>
+        <w:tc>
+          <w:tcPr>
+            <w:tcW w:type="pct" w:w="3000%"/>
+          </w:tcPr>
+          <w:p>
+            <w:pPr>
+              <w:spacing w:after="60"/>
+            </w:pPr>
+            <w:r>
+              <w:t xml:space="preserve">Wide dynamic range; phrase-soft attack, peak toward bar midpoint (`startBeat` sine), gentle phrase tail.</w:t>
+            </w:r>
+          </w:p>
+        </w:tc>
+        <w:tc>
+          <w:tcPr>
+            <w:tcW w:type="pct" w:w="3000%"/>
+          </w:tcPr>
+          <w:p>
+            <w:pPr>
+              <w:spacing w:after="60"/>
+            </w:pPr>
+            <w:r>
+              <w:rPr>
+                <w:b/>
+                <w:bCs/>
+              </w:rPr>
+              <w:t xml:space="preserve">`applyJoniStyleFolkModalHarmonyPolicy`</w:t>
+            </w:r>
+            <w:r>
+              <w:t xml:space="preserve"> (`joniStyleHarmonyPolicy.ts`) on </w:t>
+            </w:r>
+            <w:r>
+              <w:rPr>
+                <w:b/>
+                <w:bCs/>
+              </w:rPr>
+              <w:t xml:space="preserve">builtin</w:t>
+            </w:r>
+            <w:r>
+              <w:t xml:space="preserve"> chord plans — lighter cadential gravity, suspended-colour preference. When songwriter </w:t>
+            </w:r>
+            <w:r>
+              <w:rPr>
+                <w:b/>
+                <w:bCs/>
+              </w:rPr>
+              <w:t xml:space="preserve">or</w:t>
+            </w:r>
+            <w:r>
+              <w:t xml:space="preserve"> style: </w:t>
+            </w:r>
+            <w:r>
+              <w:rPr>
+                <w:b/>
+                <w:bCs/>
+              </w:rPr>
+              <w:t xml:space="preserve">`precomputeJoniMitchellEffectiveHarmonyBars`</w:t>
+            </w:r>
+            <w:r>
+              <w:t xml:space="preserve">, </w:t>
+            </w:r>
+            <w:r>
+              <w:rPr>
+                <w:b/>
+                <w:bCs/>
+              </w:rPr>
+              <w:t xml:space="preserve">`joniMitchellEffectiveHarmonyBars`</w:t>
+            </w:r>
+            <w:r>
+              <w:t xml:space="preserve"> authority in </w:t>
+            </w:r>
+            <w:r>
+              <w:rPr>
+                <w:b/>
+                <w:bCs/>
+              </w:rPr>
+              <w:t xml:space="preserve">`getChordForBar`</w:t>
+            </w:r>
+            <w:r>
+              <w:t xml:space="preserve">. Alternate tuning gate unchanged (`alternateGuitarTunings.ts`).</w:t>
+            </w:r>
+          </w:p>
+        </w:tc>
+      </w:tr>
+      <w:tr>
+        <w:tc>
+          <w:tcPr>
+            <w:tcW w:type="pct" w:w="3000%"/>
+          </w:tcPr>
+          <w:p>
+            <w:pPr>
+              <w:spacing w:after="60"/>
+            </w:pPr>
+            <w:r>
+              <w:rPr>
+                <w:b/>
+                <w:bCs/>
+              </w:rPr>
+              <w:t xml:space="preserve">`STYLE_PAT_METHENY`</w:t>
+            </w:r>
+          </w:p>
+        </w:tc>
+        <w:tc>
+          <w:tcPr>
+            <w:tcW w:type="pct" w:w="3000%"/>
+          </w:tcPr>
+          <w:p>
+            <w:pPr>
+              <w:spacing w:after="60"/>
+            </w:pPr>
+            <w:r>
+              <w:t xml:space="preserve">Lyrical swell (mid-bar peak), soft downbeats, phrase-end decay — avoids hard accents.</w:t>
+            </w:r>
+          </w:p>
+        </w:tc>
+        <w:tc>
+          <w:tcPr>
+            <w:tcW w:type="pct" w:w="3000%"/>
+          </w:tcPr>
+          <w:p>
+            <w:pPr>
+              <w:spacing w:after="60"/>
+            </w:pPr>
+            <w:r>
+              <w:t xml:space="preserve">When songwriter </w:t>
+            </w:r>
+            <w:r>
+              <w:rPr>
+                <w:b/>
+                <w:bCs/>
+              </w:rPr>
+              <w:t xml:space="preserve">or</w:t>
+            </w:r>
+            <w:r>
+              <w:t xml:space="preserve"> style: </w:t>
+            </w:r>
+            <w:r>
+              <w:rPr>
+                <w:b/>
+                <w:bCs/>
+              </w:rPr>
+              <w:t xml:space="preserve">`precomputePatMethenyEffectiveHarmonyBars`</w:t>
+            </w:r>
+            <w:r>
+              <w:t xml:space="preserve">, </w:t>
+            </w:r>
+            <w:r>
+              <w:rPr>
+                <w:b/>
+                <w:bCs/>
+              </w:rPr>
+              <w:t xml:space="preserve">`patMethenyEffectiveHarmonyBars`</w:t>
+            </w:r>
+            <w:r>
+              <w:t xml:space="preserve"> in </w:t>
+            </w:r>
+            <w:r>
+              <w:rPr>
+                <w:b/>
+                <w:bCs/>
+              </w:rPr>
+              <w:t xml:space="preserve">`getChordForBar`</w:t>
+            </w:r>
+            <w:r>
+              <w:t xml:space="preserve"> + locked export truth.</w:t>
+            </w:r>
+          </w:p>
+        </w:tc>
+      </w:tr>
+    </w:tbl>
+    <w:p>
+      <w:pPr>
+        <w:spacing w:after="160"/>
+      </w:pPr>
+    </w:p>
+    <w:p>
+      <w:pPr>
+        <w:pStyle w:val="Heading2"/>
+        <w:spacing w:after="100" w:before="160"/>
+      </w:pPr>
+      <w:r>
+        <w:t xml:space="preserve">Joni Mitchell (Song Mode — open tunings, modal harmony)</w:t>
+      </w:r>
+    </w:p>
+    <w:p>
+      <w:pPr>
+        <w:spacing w:after="160"/>
+      </w:pPr>
+      <w:r>
+        <w:rPr>
+          <w:b/>
+          <w:bCs/>
+        </w:rPr>
+        <w:t xml:space="preserve">Joni Mitchell</w:t>
+      </w:r>
+      <w:r>
+        <w:t xml:space="preserve"> is a </w:t>
+      </w:r>
+      <w:r>
+        <w:rPr>
+          <w:b/>
+          <w:bCs/>
+        </w:rPr>
+        <w:t xml:space="preserve">shipped golden-path slice</w:t>
+      </w:r>
+      <w:r>
+        <w:t xml:space="preserve">: </w:t>
+      </w:r>
+      <w:r>
+        <w:rPr>
+          <w:b/>
+          <w:bCs/>
+        </w:rPr>
+        <w:t xml:space="preserve">`joniMitchellSlice.ts`</w:t>
       </w:r>
       <w:r>
         <w:t xml:space="preserve">, </w:t>
@@ -6658,7 +7048,37 @@
           <w:b/>
           <w:bCs/>
         </w:rPr>
-        <w:t xml:space="preserve">fret pattern</w:t>
+        <w:t xml:space="preserve">`jm:*`</w:t>
+      </w:r>
+      <w:r>
+        <w:t xml:space="preserve"> device receipts, </w:t>
+      </w:r>
+      <w:r>
+        <w:rPr>
+          <w:b/>
+          <w:bCs/>
+        </w:rPr>
+        <w:t xml:space="preserve">`joniMitchellEffectiveHarmonyBars`</w:t>
+      </w:r>
+      <w:r>
+        <w:t xml:space="preserve"> feeding </w:t>
+      </w:r>
+      <w:r>
+        <w:rPr>
+          <w:b/>
+          <w:bCs/>
+        </w:rPr>
+        <w:t xml:space="preserve">`getChordForBar`</w:t>
+      </w:r>
+      <w:r>
+        <w:t xml:space="preserve"> and locked MusicXML truth (same pattern as Radiohead / James Brown). Pools emphasize </w:t>
+      </w:r>
+      <w:r>
+        <w:rPr>
+          <w:b/>
+          <w:bCs/>
+        </w:rPr>
+        <w:t xml:space="preserve">modal</w:t>
       </w:r>
       <w:r>
         <w:t xml:space="preserve">, </w:t>
@@ -6668,7 +7088,7 @@
           <w:b/>
           <w:bCs/>
         </w:rPr>
-        <w:t xml:space="preserve">drone string mask</w:t>
+        <w:t xml:space="preserve">pedal</w:t>
       </w:r>
       <w:r>
         <w:t xml:space="preserve">, and </w:t>
@@ -6678,90 +7098,60 @@
           <w:b/>
           <w:bCs/>
         </w:rPr>
-        <w:t xml:space="preserve">noise level</w:t>
-      </w:r>
-      <w:r>
-        <w:t xml:space="preserve"> per guitar when a profile attaches tuning-aware comp metadata. </w:t>
-      </w:r>
-      <w:r>
-        <w:rPr>
-          <w:b/>
-          <w:bCs/>
-        </w:rPr>
-        <w:t xml:space="preserve">Sonic Youth</w:t>
-      </w:r>
-      <w:r>
-        <w:t xml:space="preserve"> uses </w:t>
-      </w:r>
-      <w:r>
-        <w:rPr>
-          <w:b/>
-          <w:bCs/>
-        </w:rPr>
-        <w:t xml:space="preserve">`GuitarTuningState`</w:t>
-      </w:r>
-      <w:r>
-        <w:t xml:space="preserve"> on </w:t>
-      </w:r>
-      <w:r>
-        <w:rPr>
-          <w:b/>
-          <w:bCs/>
-        </w:rPr>
-        <w:t xml:space="preserve">`ChordEvent.sonicYouth`</w:t>
-      </w:r>
-      <w:r>
-        <w:t xml:space="preserve"> for dual-guitar noise harmony; </w:t>
-      </w:r>
-      <w:r>
-        <w:rPr>
-          <w:b/>
-          <w:bCs/>
-        </w:rPr>
-        <w:t xml:space="preserve">Joni</w:t>
-      </w:r>
-      <w:r>
-        <w:t xml:space="preserve"> slice harmony generation reads </w:t>
-      </w:r>
-      <w:r>
-        <w:rPr>
-          <w:b/>
-          <w:bCs/>
-        </w:rPr>
-        <w:t xml:space="preserve">resolved alternate tuning</w:t>
-      </w:r>
-      <w:r>
-        <w:t xml:space="preserve"> from the duo / Song Mode pipeline so </w:t>
-      </w:r>
-      <w:r>
-        <w:rPr>
-          <w:b/>
-          <w:bCs/>
-        </w:rPr>
-        <w:t xml:space="preserve">voicing and fingered shapes</w:t>
-      </w:r>
-      <w:r>
-        <w:t xml:space="preserve"> bias toward </w:t>
-      </w:r>
-      <w:r>
-        <w:rPr>
-          <w:b/>
-          <w:bCs/>
-        </w:rPr>
-        <w:t xml:space="preserve">strings that can ring open</w:t>
-      </w:r>
-      <w:r>
-        <w:t xml:space="preserve">—exact fretmaps remain </w:t>
-      </w:r>
-      <w:r>
-        <w:rPr>
-          <w:b/>
-          <w:bCs/>
-        </w:rPr>
-        <w:t xml:space="preserve">bounded</w:t>
-      </w:r>
-      <w:r>
-        <w:t xml:space="preserve"> by the golden-path guitar passes, not a full tablature solver.</w:t>
+        <w:t xml:space="preserve">open-tuning-friendly</w:t>
+      </w:r>
+      <w:r>
+        <w:t xml:space="preserve"> colours (</w:t>
+      </w:r>
+      <w:r>
+        <w:rPr>
+          <w:b/>
+          <w:bCs/>
+        </w:rPr>
+        <w:t xml:space="preserve">add9</w:t>
+      </w:r>
+      <w:r>
+        <w:t xml:space="preserve">, </w:t>
+      </w:r>
+      <w:r>
+        <w:rPr>
+          <w:b/>
+          <w:bCs/>
+        </w:rPr>
+        <w:t xml:space="preserve">sus2/sus4</w:t>
+      </w:r>
+      <w:r>
+        <w:t xml:space="preserve">, </w:t>
+      </w:r>
+      <w:r>
+        <w:rPr>
+          <w:b/>
+          <w:bCs/>
+        </w:rPr>
+        <w:t xml:space="preserve">slash</w:t>
+      </w:r>
+      <w:r>
+        <w:t xml:space="preserve"> pedals, </w:t>
+      </w:r>
+      <w:r>
+        <w:rPr>
+          <w:b/>
+          <w:bCs/>
+        </w:rPr>
+        <w:t xml:space="preserve">maj(add9)</w:t>
+      </w:r>
+      <w:r>
+        <w:t xml:space="preserve"> rows — see </w:t>
+      </w:r>
+      <w:r>
+        <w:rPr>
+          <w:b/>
+          <w:bCs/>
+        </w:rPr>
+        <w:t xml:space="preserve">`SONGWRITER_CHORD_POOLS.joni_mitchell`</w:t>
+      </w:r>
+      <w:r>
+        <w:t xml:space="preserve">).</w:t>
       </w:r>
     </w:p>
     <w:p>
@@ -6773,7 +7163,7 @@
           <w:b/>
           <w:bCs/>
         </w:rPr>
-        <w:t xml:space="preserve">How alternate tunings affect chord voicing</w:t>
+        <w:t xml:space="preserve">Open-tuning philosophy (pedagogy, not a transcription engine)</w:t>
       </w:r>
     </w:p>
     <w:p>
@@ -6785,37 +7175,77 @@
         <w:t xml:space="preserve">• </w:t>
       </w:r>
       <w:r>
-        <w:t xml:space="preserve">Selecting a </w:t>
-      </w:r>
-      <w:r>
-        <w:rPr>
-          <w:b/>
-          <w:bCs/>
-        </w:rPr>
-        <w:t xml:space="preserve">Joni zone preset</w:t>
-      </w:r>
-      <w:r>
-        <w:t xml:space="preserve"> changes </w:t>
-      </w:r>
-      <w:r>
-        <w:rPr>
-          <w:b/>
-          <w:bCs/>
-        </w:rPr>
-        <w:t xml:space="preserve">resolved string pitches</w:t>
-      </w:r>
-      <w:r>
-        <w:t xml:space="preserve"> used by layout/comp passes (same seed → different </w:t>
-      </w:r>
-      <w:r>
-        <w:rPr>
-          <w:b/>
-          <w:bCs/>
-        </w:rPr>
-        <w:t xml:space="preserve">vertical spacing</w:t>
-      </w:r>
-      <w:r>
-        <w:t xml:space="preserve"> vs standard tuning when the pipeline applies tuning-aware behaviour).</w:t>
+        <w:t xml:space="preserve">Real-world Joni repertoire is tied to </w:t>
+      </w:r>
+      <w:r>
+        <w:rPr>
+          <w:b/>
+          <w:bCs/>
+        </w:rPr>
+        <w:t xml:space="preserve">non-standard tunings</w:t>
+      </w:r>
+      <w:r>
+        <w:t xml:space="preserve"> (e.g. </w:t>
+      </w:r>
+      <w:r>
+        <w:rPr>
+          <w:b/>
+          <w:bCs/>
+        </w:rPr>
+        <w:t xml:space="preserve">DADGAD</w:t>
+      </w:r>
+      <w:r>
+        <w:t xml:space="preserve">, </w:t>
+      </w:r>
+      <w:r>
+        <w:rPr>
+          <w:b/>
+          <w:bCs/>
+        </w:rPr>
+        <w:t xml:space="preserve">CGDGCD</w:t>
+      </w:r>
+      <w:r>
+        <w:t xml:space="preserve">, </w:t>
+      </w:r>
+      <w:r>
+        <w:rPr>
+          <w:b/>
+          <w:bCs/>
+        </w:rPr>
+        <w:t xml:space="preserve">DADDAD</w:t>
+      </w:r>
+      <w:r>
+        <w:t xml:space="preserve">, drop/add variants). The engine represents tunings through </w:t>
+      </w:r>
+      <w:r>
+        <w:rPr>
+          <w:b/>
+          <w:bCs/>
+        </w:rPr>
+        <w:t xml:space="preserve">`alternateGuitarTunings.ts`</w:t>
+      </w:r>
+      <w:r>
+        <w:t xml:space="preserve"> zone </w:t>
+      </w:r>
+      <w:r>
+        <w:rPr>
+          <w:b/>
+          <w:bCs/>
+        </w:rPr>
+        <w:t xml:space="preserve">`joni_mitchell`</w:t>
+      </w:r>
+      <w:r>
+        <w:t xml:space="preserve"> — presets carry </w:t>
+      </w:r>
+      <w:r>
+        <w:rPr>
+          <w:b/>
+          <w:bCs/>
+        </w:rPr>
+        <w:t xml:space="preserve">six string pitches</w:t>
+      </w:r>
+      <w:r>
+        <w:t xml:space="preserve"> (`AlternateGuitarTuningPreset.strings`) for UI + metadata.</w:t>
       </w:r>
     </w:p>
     <w:p>
@@ -6827,6 +7257,209 @@
         <w:t xml:space="preserve">• </w:t>
       </w:r>
       <w:r>
+        <w:rPr>
+          <w:b/>
+          <w:bCs/>
+        </w:rPr>
+        <w:t xml:space="preserve">`GuitarTuningState`</w:t>
+      </w:r>
+      <w:r>
+        <w:t xml:space="preserve"> (</w:t>
+      </w:r>
+      <w:r>
+        <w:rPr>
+          <w:b/>
+          <w:bCs/>
+        </w:rPr>
+        <w:t xml:space="preserve">`sonicYouthChordTypes.ts`</w:t>
+      </w:r>
+      <w:r>
+        <w:t xml:space="preserve">, shared shape name) encodes </w:t>
+      </w:r>
+      <w:r>
+        <w:rPr>
+          <w:b/>
+          <w:bCs/>
+        </w:rPr>
+        <w:t xml:space="preserve">open-string MIDI grid</w:t>
+      </w:r>
+      <w:r>
+        <w:t xml:space="preserve">, </w:t>
+      </w:r>
+      <w:r>
+        <w:rPr>
+          <w:b/>
+          <w:bCs/>
+        </w:rPr>
+        <w:t xml:space="preserve">fret pattern</w:t>
+      </w:r>
+      <w:r>
+        <w:t xml:space="preserve">, </w:t>
+      </w:r>
+      <w:r>
+        <w:rPr>
+          <w:b/>
+          <w:bCs/>
+        </w:rPr>
+        <w:t xml:space="preserve">drone string mask</w:t>
+      </w:r>
+      <w:r>
+        <w:t xml:space="preserve">, and </w:t>
+      </w:r>
+      <w:r>
+        <w:rPr>
+          <w:b/>
+          <w:bCs/>
+        </w:rPr>
+        <w:t xml:space="preserve">noise level</w:t>
+      </w:r>
+      <w:r>
+        <w:t xml:space="preserve"> per guitar when a profile attaches tuning-aware comp metadata. </w:t>
+      </w:r>
+      <w:r>
+        <w:rPr>
+          <w:b/>
+          <w:bCs/>
+        </w:rPr>
+        <w:t xml:space="preserve">Sonic Youth</w:t>
+      </w:r>
+      <w:r>
+        <w:t xml:space="preserve"> uses </w:t>
+      </w:r>
+      <w:r>
+        <w:rPr>
+          <w:b/>
+          <w:bCs/>
+        </w:rPr>
+        <w:t xml:space="preserve">`GuitarTuningState`</w:t>
+      </w:r>
+      <w:r>
+        <w:t xml:space="preserve"> on </w:t>
+      </w:r>
+      <w:r>
+        <w:rPr>
+          <w:b/>
+          <w:bCs/>
+        </w:rPr>
+        <w:t xml:space="preserve">`ChordEvent.sonicYouth`</w:t>
+      </w:r>
+      <w:r>
+        <w:t xml:space="preserve"> for dual-guitar noise harmony; </w:t>
+      </w:r>
+      <w:r>
+        <w:rPr>
+          <w:b/>
+          <w:bCs/>
+        </w:rPr>
+        <w:t xml:space="preserve">Joni</w:t>
+      </w:r>
+      <w:r>
+        <w:t xml:space="preserve"> slice harmony generation reads </w:t>
+      </w:r>
+      <w:r>
+        <w:rPr>
+          <w:b/>
+          <w:bCs/>
+        </w:rPr>
+        <w:t xml:space="preserve">resolved alternate tuning</w:t>
+      </w:r>
+      <w:r>
+        <w:t xml:space="preserve"> from the duo / Song Mode pipeline so </w:t>
+      </w:r>
+      <w:r>
+        <w:rPr>
+          <w:b/>
+          <w:bCs/>
+        </w:rPr>
+        <w:t xml:space="preserve">voicing and fingered shapes</w:t>
+      </w:r>
+      <w:r>
+        <w:t xml:space="preserve"> bias toward </w:t>
+      </w:r>
+      <w:r>
+        <w:rPr>
+          <w:b/>
+          <w:bCs/>
+        </w:rPr>
+        <w:t xml:space="preserve">strings that can ring open</w:t>
+      </w:r>
+      <w:r>
+        <w:t xml:space="preserve">—exact fretmaps remain </w:t>
+      </w:r>
+      <w:r>
+        <w:rPr>
+          <w:b/>
+          <w:bCs/>
+        </w:rPr>
+        <w:t xml:space="preserve">bounded</w:t>
+      </w:r>
+      <w:r>
+        <w:t xml:space="preserve"> by the golden-path guitar passes, not a full tablature solver.</w:t>
+      </w:r>
+    </w:p>
+    <w:p>
+      <w:pPr>
+        <w:spacing w:after="160"/>
+      </w:pPr>
+      <w:r>
+        <w:rPr>
+          <w:b/>
+          <w:bCs/>
+        </w:rPr>
+        <w:t xml:space="preserve">How alternate tunings affect chord voicing</w:t>
+      </w:r>
+    </w:p>
+    <w:p>
+      <w:pPr>
+        <w:spacing w:after="80"/>
+        <w:ind w:left="360" w:hanging="260"/>
+      </w:pPr>
+      <w:r>
+        <w:t xml:space="preserve">• </w:t>
+      </w:r>
+      <w:r>
+        <w:t xml:space="preserve">Selecting a </w:t>
+      </w:r>
+      <w:r>
+        <w:rPr>
+          <w:b/>
+          <w:bCs/>
+        </w:rPr>
+        <w:t xml:space="preserve">Joni zone preset</w:t>
+      </w:r>
+      <w:r>
+        <w:t xml:space="preserve"> changes </w:t>
+      </w:r>
+      <w:r>
+        <w:rPr>
+          <w:b/>
+          <w:bCs/>
+        </w:rPr>
+        <w:t xml:space="preserve">resolved string pitches</w:t>
+      </w:r>
+      <w:r>
+        <w:t xml:space="preserve"> used by layout/comp passes (same seed → different </w:t>
+      </w:r>
+      <w:r>
+        <w:rPr>
+          <w:b/>
+          <w:bCs/>
+        </w:rPr>
+        <w:t xml:space="preserve">vertical spacing</w:t>
+      </w:r>
+      <w:r>
+        <w:t xml:space="preserve"> vs standard tuning when the pipeline applies tuning-aware behaviour).</w:t>
+      </w:r>
+    </w:p>
+    <w:p>
+      <w:pPr>
+        <w:spacing w:after="80"/>
+        <w:ind w:left="360" w:hanging="260"/>
+      </w:pPr>
+      <w:r>
+        <w:t xml:space="preserve">• </w:t>
+      </w:r>
+      <w:r>
         <w:t xml:space="preserve">Where </w:t>
       </w:r>
       <w:r>
@@ -7323,17 +7956,7 @@
         <w:t xml:space="preserve">`sonicYouth`</w:t>
       </w:r>
       <w:r>
-        <w:t xml:space="preserve"> metadata is </w:t>
-      </w:r>
-      <w:r>
-        <w:rPr>
-          <w:b/>
-          <w:bCs/>
-        </w:rPr>
-        <w:t xml:space="preserve">only meaningful</w:t>
-      </w:r>
-      <w:r>
-        <w:t xml:space="preserve"> when the </w:t>
+        <w:t xml:space="preserve"> metadata is written when the </w:t>
       </w:r>
       <w:r>
         <w:rPr>
@@ -7343,17 +7966,27 @@
         <w:t xml:space="preserve">primary songwriter</w:t>
       </w:r>
       <w:r>
-        <w:t xml:space="preserve"> is the </w:t>
-      </w:r>
-      <w:r>
-        <w:rPr>
-          <w:b/>
-          <w:bCs/>
-        </w:rPr>
-        <w:t xml:space="preserve">Sonic Youth</w:t>
-      </w:r>
-      <w:r>
-        <w:t xml:space="preserve"> slice (`sonic_youth` / aliases). </w:t>
+        <w:t xml:space="preserve"> is the Sonic Youth slice </w:t>
+      </w:r>
+      <w:r>
+        <w:rPr>
+          <w:b/>
+          <w:bCs/>
+        </w:rPr>
+        <w:t xml:space="preserve">or</w:t>
+      </w:r>
+      <w:r>
+        <w:t xml:space="preserve"> the Song Mode style profile is </w:t>
+      </w:r>
+      <w:r>
+        <w:rPr>
+          <w:b/>
+          <w:bCs/>
+        </w:rPr>
+        <w:t xml:space="preserve">`STYLE_SONIC_YOUTH`</w:t>
+      </w:r>
+      <w:r>
+        <w:t xml:space="preserve"> (`applySonicYouthGuitarBarPasses`). </w:t>
       </w:r>
       <w:r>
         <w:rPr>
@@ -7393,7 +8026,7 @@
         <w:t xml:space="preserve">only when</w:t>
       </w:r>
       <w:r>
-        <w:t xml:space="preserve"> the active profile/songwriter is Sonic Youth — otherwise </w:t>
+        <w:t xml:space="preserve"> the active profile/songwriter indicates Sonic Youth behaviour — otherwise </w:t>
       </w:r>
       <w:r>
         <w:rPr>

</xml_diff>

<commit_message>
fix: wire STYLE_ECM_CHAMBER to ECM harmony policy, texture plan, and velocity curve
Co-authored-by: Cursor <cursoragent@cursor.com>
</commit_message>
<xml_diff>
--- a/docs/COMPOSER_OS_PLAYBOOK.docx
+++ b/docs/COMPOSER_OS_PLAYBOOK.docx
@@ -16752,6 +16752,221 @@
       </w:r>
       <w:r>
         <w:t xml:space="preserve"> when stacking experiments.</w:t>
+      </w:r>
+    </w:p>
+    <w:p>
+      <w:pPr>
+        <w:pStyle w:val="Heading1"/>
+        <w:spacing w:after="120" w:before="200"/>
+      </w:pPr>
+      <w:r>
+        <w:t xml:space="preserve">Known Architectural Gaps</w:t>
+      </w:r>
+    </w:p>
+    <w:p>
+      <w:pPr>
+        <w:spacing w:after="160"/>
+      </w:pPr>
+      <w:r>
+        <w:t xml:space="preserve">Documented limitations—do not mistake UI labels for fully wired engine behaviour until addressed.</w:t>
+      </w:r>
+    </w:p>
+    <w:p>
+      <w:pPr>
+        <w:pStyle w:val="Heading2"/>
+        <w:spacing w:after="100" w:before="160"/>
+      </w:pPr>
+      <w:r>
+        <w:t xml:space="preserve">ARRANGER STYLES — KNOWN GAP</w:t>
+      </w:r>
+    </w:p>
+    <w:p>
+      <w:pPr>
+        <w:spacing w:after="160"/>
+      </w:pPr>
+      <w:r>
+        <w:t xml:space="preserve">The arranger dropdown in </w:t>
+      </w:r>
+      <w:r>
+        <w:rPr>
+          <w:b/>
+          <w:bCs/>
+        </w:rPr>
+        <w:t xml:space="preserve">Big Band</w:t>
+      </w:r>
+      <w:r>
+        <w:t xml:space="preserve"> mode does not currently affect the generated music. The </w:t>
+      </w:r>
+      <w:r>
+        <w:rPr>
+          <w:b/>
+          <w:bCs/>
+        </w:rPr>
+        <w:t xml:space="preserve">`arrangerStyle`</w:t>
+      </w:r>
+      <w:r>
+        <w:t xml:space="preserve"> value from the UI is never mapped to </w:t>
+      </w:r>
+      <w:r>
+        <w:rPr>
+          <w:b/>
+          <w:bCs/>
+        </w:rPr>
+        <w:t xml:space="preserve">`composerStyle`</w:t>
+      </w:r>
+      <w:r>
+        <w:t xml:space="preserve"> before reaching the Big Band engine, so all arrangers produce identical output regardless of selection.</w:t>
+      </w:r>
+    </w:p>
+    <w:p>
+      <w:pPr>
+        <w:spacing w:after="160"/>
+      </w:pPr>
+      <w:r>
+        <w:t xml:space="preserve">Partial wiring exists for </w:t>
+      </w:r>
+      <w:r>
+        <w:rPr>
+          <w:b/>
+          <w:bCs/>
+        </w:rPr>
+        <w:t xml:space="preserve">four</w:t>
+      </w:r>
+      <w:r>
+        <w:t xml:space="preserve"> arrangers in </w:t>
+      </w:r>
+      <w:r>
+        <w:rPr>
+          <w:b/>
+          <w:bCs/>
+        </w:rPr>
+        <w:t xml:space="preserve">Song Mode pairing</w:t>
+      </w:r>
+      <w:r>
+        <w:t xml:space="preserve"> only (confidence scores, contrast nudges): </w:t>
+      </w:r>
+      <w:r>
+        <w:rPr>
+          <w:b/>
+          <w:bCs/>
+        </w:rPr>
+        <w:t xml:space="preserve">Ellington</w:t>
+      </w:r>
+      <w:r>
+        <w:t xml:space="preserve">, </w:t>
+      </w:r>
+      <w:r>
+        <w:rPr>
+          <w:b/>
+          <w:bCs/>
+        </w:rPr>
+        <w:t xml:space="preserve">Basie</w:t>
+      </w:r>
+      <w:r>
+        <w:t xml:space="preserve">, </w:t>
+      </w:r>
+      <w:r>
+        <w:rPr>
+          <w:b/>
+          <w:bCs/>
+        </w:rPr>
+        <w:t xml:space="preserve">Thad Jones</w:t>
+      </w:r>
+      <w:r>
+        <w:t xml:space="preserve">, </w:t>
+      </w:r>
+      <w:r>
+        <w:rPr>
+          <w:b/>
+          <w:bCs/>
+        </w:rPr>
+        <w:t xml:space="preserve">Maria Schneider</w:t>
+      </w:r>
+      <w:r>
+        <w:t xml:space="preserve">. The remaining </w:t>
+      </w:r>
+      <w:r>
+        <w:rPr>
+          <w:b/>
+          <w:bCs/>
+        </w:rPr>
+        <w:t xml:space="preserve">six</w:t>
+      </w:r>
+      <w:r>
+        <w:t xml:space="preserve"> studio arrangers are UI labels only.</w:t>
+      </w:r>
+    </w:p>
+    <w:p>
+      <w:pPr>
+        <w:spacing w:after="160"/>
+      </w:pPr>
+      <w:r>
+        <w:t xml:space="preserve">When returning to this: the fix requires </w:t>
+      </w:r>
+      <w:r>
+        <w:rPr>
+          <w:b/>
+          <w:bCs/>
+        </w:rPr>
+        <w:t xml:space="preserve">(1)</w:t>
+      </w:r>
+      <w:r>
+        <w:t xml:space="preserve"> a structural mapping of </w:t>
+      </w:r>
+      <w:r>
+        <w:rPr>
+          <w:b/>
+          <w:bCs/>
+        </w:rPr>
+        <w:t xml:space="preserve">`arrangerStyle` → `composerStyle`</w:t>
+      </w:r>
+      <w:r>
+        <w:t xml:space="preserve"> in </w:t>
+      </w:r>
+      <w:r>
+        <w:rPr>
+          <w:b/>
+          <w:bCs/>
+        </w:rPr>
+        <w:t xml:space="preserve">`composerOsAppGeneration.ts`</w:t>
+      </w:r>
+      <w:r>
+        <w:t xml:space="preserve"> before </w:t>
+      </w:r>
+      <w:r>
+        <w:rPr>
+          <w:b/>
+          <w:bCs/>
+        </w:rPr>
+        <w:t xml:space="preserve">`runBigBandMode`</w:t>
+      </w:r>
+      <w:r>
+        <w:t xml:space="preserve"> is called, and </w:t>
+      </w:r>
+      <w:r>
+        <w:rPr>
+          <w:b/>
+          <w:bCs/>
+        </w:rPr>
+        <w:t xml:space="preserve">(2)</w:t>
+      </w:r>
+      <w:r>
+        <w:t xml:space="preserve"> per-arranger research to define genuine musical distinctions for each one.</w:t>
+      </w:r>
+    </w:p>
+    <w:p>
+      <w:pPr>
+        <w:spacing w:after="160"/>
+      </w:pPr>
+      <w:r>
+        <w:rPr>
+          <w:b/>
+          <w:bCs/>
+        </w:rPr>
+        <w:t xml:space="preserve">Priority:</w:t>
+      </w:r>
+      <w:r>
+        <w:t xml:space="preserve"> low. Do not attempt until Big Band pipeline restructure is scoped as a dedicated workstream.</w:t>
       </w:r>
     </w:p>
     <w:p>

</xml_diff>

<commit_message>
docs: add Diversity Presets section and Light Touch research backlog to playbook
Co-authored-by: Cursor <cursoragent@cursor.com>
</commit_message>
<xml_diff>
--- a/docs/COMPOSER_OS_PLAYBOOK.docx
+++ b/docs/COMPOSER_OS_PLAYBOOK.docx
@@ -6584,6 +6584,144 @@
     </w:p>
     <w:p>
       <w:pPr>
+        <w:pStyle w:val="Heading3"/>
+        <w:spacing w:after="80" w:before="120"/>
+      </w:pPr>
+      <w:r>
+        <w:t xml:space="preserve">Light touch styles — research backlog</w:t>
+      </w:r>
+    </w:p>
+    <w:p>
+      <w:pPr>
+        <w:spacing w:after="160"/>
+      </w:pPr>
+      <w:r>
+        <w:rPr>
+          <w:b/>
+          <w:bCs/>
+        </w:rPr>
+        <w:t xml:space="preserve">Folk Guitar Narrative</w:t>
+      </w:r>
+      <w:r>
+        <w:t xml:space="preserve"> (`STYLE_FOLK_GUITAR_NARRATIVE`) — </w:t>
+      </w:r>
+      <w:r>
+        <w:rPr>
+          <w:b/>
+          <w:bCs/>
+        </w:rPr>
+        <w:t xml:space="preserve">needs Perplexity research before build</w:t>
+      </w:r>
+      <w:r>
+        <w:t xml:space="preserve"> — no composer anchor identified yet.</w:t>
+      </w:r>
+    </w:p>
+    <w:p>
+      <w:pPr>
+        <w:spacing w:after="160"/>
+      </w:pPr>
+      <w:r>
+        <w:t xml:space="preserve">RESEARCH NEEDED: composer anchors, musical distinctives, pipeline approach — run Perplexity session before building</w:t>
+      </w:r>
+    </w:p>
+    <w:p>
+      <w:pPr>
+        <w:spacing w:after="160"/>
+      </w:pPr>
+      <w:r>
+        <w:rPr>
+          <w:b/>
+          <w:bCs/>
+        </w:rPr>
+        <w:t xml:space="preserve">Classical Influence</w:t>
+      </w:r>
+      <w:r>
+        <w:t xml:space="preserve"> (`STYLE_CLASSICAL_INFLUENCE`) — </w:t>
+      </w:r>
+      <w:r>
+        <w:rPr>
+          <w:b/>
+          <w:bCs/>
+        </w:rPr>
+        <w:t xml:space="preserve">needs Perplexity research before build</w:t>
+      </w:r>
+      <w:r>
+        <w:t xml:space="preserve"> — no composer anchor identified yet.</w:t>
+      </w:r>
+    </w:p>
+    <w:p>
+      <w:pPr>
+        <w:spacing w:after="160"/>
+      </w:pPr>
+      <w:r>
+        <w:t xml:space="preserve">RESEARCH NEEDED: composer anchors, musical distinctives, pipeline approach — run Perplexity session before building</w:t>
+      </w:r>
+    </w:p>
+    <w:p>
+      <w:pPr>
+        <w:spacing w:after="160"/>
+      </w:pPr>
+      <w:r>
+        <w:rPr>
+          <w:b/>
+          <w:bCs/>
+        </w:rPr>
+        <w:t xml:space="preserve">Bebop variants</w:t>
+      </w:r>
+      <w:r>
+        <w:t xml:space="preserve"> — </w:t>
+      </w:r>
+      <w:r>
+        <w:rPr>
+          <w:b/>
+          <w:bCs/>
+        </w:rPr>
+        <w:t xml:space="preserve">`STYLE_BEBOP_LITE`</w:t>
+      </w:r>
+      <w:r>
+        <w:t xml:space="preserve">, </w:t>
+      </w:r>
+      <w:r>
+        <w:rPr>
+          <w:b/>
+          <w:bCs/>
+        </w:rPr>
+        <w:t xml:space="preserve">`STYLE_BEBOP_POST_BOP`</w:t>
+      </w:r>
+      <w:r>
+        <w:t xml:space="preserve">, and </w:t>
+      </w:r>
+      <w:r>
+        <w:rPr>
+          <w:b/>
+          <w:bCs/>
+        </w:rPr>
+        <w:t xml:space="preserve">`STYLE_SHORTER_POST_BOP`</w:t>
+      </w:r>
+      <w:r>
+        <w:t xml:space="preserve"> overlap in naming and velocity contours; product distinction between variants is not yet settled — </w:t>
+      </w:r>
+      <w:r>
+        <w:rPr>
+          <w:b/>
+          <w:bCs/>
+        </w:rPr>
+        <w:t xml:space="preserve">needs Perplexity research before build</w:t>
+      </w:r>
+      <w:r>
+        <w:t xml:space="preserve">.</w:t>
+      </w:r>
+    </w:p>
+    <w:p>
+      <w:pPr>
+        <w:spacing w:after="160"/>
+      </w:pPr>
+      <w:r>
+        <w:t xml:space="preserve">RESEARCH NEEDED: composer anchors, musical distinctives, pipeline approach — run Perplexity session before building</w:t>
+      </w:r>
+    </w:p>
+    <w:p>
+      <w:pPr>
         <w:spacing w:after="160"/>
       </w:pPr>
       <w:r>
@@ -6999,6 +7137,1120 @@
       <w:pPr>
         <w:spacing w:after="160"/>
       </w:pPr>
+    </w:p>
+    <w:p>
+      <w:pPr>
+        <w:pStyle w:val="Heading2"/>
+        <w:spacing w:after="100" w:before="160"/>
+      </w:pPr>
+      <w:r>
+        <w:t xml:space="preserve">Diversity presets (Song Mode)</w:t>
+      </w:r>
+    </w:p>
+    <w:p>
+      <w:pPr>
+        <w:spacing w:after="160"/>
+      </w:pPr>
+      <w:r>
+        <w:rPr>
+          <w:b/>
+          <w:bCs/>
+        </w:rPr>
+        <w:t xml:space="preserve">What they are:</w:t>
+      </w:r>
+      <w:r>
+        <w:t xml:space="preserve"> Optional </w:t>
+      </w:r>
+      <w:r>
+        <w:rPr>
+          <w:b/>
+          <w:bCs/>
+        </w:rPr>
+        <w:t xml:space="preserve">shortcut recipes</w:t>
+      </w:r>
+      <w:r>
+        <w:t xml:space="preserve"> in </w:t>
+      </w:r>
+      <w:r>
+        <w:rPr>
+          <w:b/>
+          <w:bCs/>
+        </w:rPr>
+        <w:t xml:space="preserve">Generate</w:t>
+      </w:r>
+      <w:r>
+        <w:t xml:space="preserve"> (Song Mode) that pick a </w:t>
+      </w:r>
+      <w:r>
+        <w:rPr>
+          <w:b/>
+          <w:bCs/>
+        </w:rPr>
+        <w:t xml:space="preserve">primary + secondary songwriter</w:t>
+      </w:r>
+      <w:r>
+        <w:t xml:space="preserve"> pair and a </w:t>
+      </w:r>
+      <w:r>
+        <w:rPr>
+          <w:b/>
+          <w:bCs/>
+        </w:rPr>
+        <w:t xml:space="preserve">human label</w:t>
+      </w:r>
+      <w:r>
+        <w:t xml:space="preserve">, defined in </w:t>
+      </w:r>
+      <w:r>
+        <w:rPr>
+          <w:b/>
+          <w:bCs/>
+        </w:rPr>
+        <w:t xml:space="preserve">`SONG_MODE_DIVERSITY_PRESETS`</w:t>
+      </w:r>
+      <w:r>
+        <w:t xml:space="preserve"> (`engines/composer-os-v2/core/song-mode/songwriterStyleResolver.ts`). Each entry has an </w:t>
+      </w:r>
+      <w:r>
+        <w:rPr>
+          <w:b/>
+          <w:bCs/>
+        </w:rPr>
+        <w:t xml:space="preserve">`id`</w:t>
+      </w:r>
+      <w:r>
+        <w:t xml:space="preserve">, </w:t>
+      </w:r>
+      <w:r>
+        <w:rPr>
+          <w:b/>
+          <w:bCs/>
+        </w:rPr>
+        <w:t xml:space="preserve">`label`</w:t>
+      </w:r>
+      <w:r>
+        <w:t xml:space="preserve">, </w:t>
+      </w:r>
+      <w:r>
+        <w:rPr>
+          <w:b/>
+          <w:bCs/>
+        </w:rPr>
+        <w:t xml:space="preserve">`primarySongwriterStyle`</w:t>
+      </w:r>
+      <w:r>
+        <w:t xml:space="preserve">, </w:t>
+      </w:r>
+      <w:r>
+        <w:rPr>
+          <w:b/>
+          <w:bCs/>
+        </w:rPr>
+        <w:t xml:space="preserve">`secondarySongwriterStyle`</w:t>
+      </w:r>
+      <w:r>
+        <w:t xml:space="preserve">, and an </w:t>
+      </w:r>
+      <w:r>
+        <w:rPr>
+          <w:b/>
+          <w:bCs/>
+        </w:rPr>
+        <w:t xml:space="preserve">`audibleDescription`</w:t>
+      </w:r>
+      <w:r>
+        <w:t xml:space="preserve"> string for UI copy.</w:t>
+      </w:r>
+    </w:p>
+    <w:p>
+      <w:pPr>
+        <w:spacing w:after="160"/>
+      </w:pPr>
+      <w:r>
+        <w:rPr>
+          <w:b/>
+          <w:bCs/>
+        </w:rPr>
+        <w:t xml:space="preserve">How they interact with style pairing:</w:t>
+      </w:r>
+      <w:r>
+        <w:t xml:space="preserve"> Choosing a preset runs client-side logic (`HomeGenerate.tsx`): </w:t>
+      </w:r>
+      <w:r>
+        <w:rPr>
+          <w:b/>
+          <w:bCs/>
+        </w:rPr>
+        <w:t xml:space="preserve">`resolveSongModeDiversityPreset`</w:t>
+      </w:r>
+      <w:r>
+        <w:t xml:space="preserve"> loads the row, then </w:t>
+      </w:r>
+      <w:r>
+        <w:rPr>
+          <w:b/>
+          <w:bCs/>
+        </w:rPr>
+        <w:t xml:space="preserve">`setSongwriterStyle` / `setSecondarySongwriterStyle`</w:t>
+      </w:r>
+      <w:r>
+        <w:t xml:space="preserve"> are updated from the preset. </w:t>
+      </w:r>
+      <w:r>
+        <w:rPr>
+          <w:b/>
+          <w:bCs/>
+        </w:rPr>
+        <w:t xml:space="preserve">`resolveSongModeDiversityStylePairing`</w:t>
+      </w:r>
+      <w:r>
+        <w:t xml:space="preserve"> (`stylePairingResolver.ts`) maps that preset </w:t>
+      </w:r>
+      <w:r>
+        <w:rPr>
+          <w:b/>
+          <w:bCs/>
+        </w:rPr>
+        <w:t xml:space="preserve">`id`</w:t>
+      </w:r>
+      <w:r>
+        <w:t xml:space="preserve"> to a suggested </w:t>
+      </w:r>
+      <w:r>
+        <w:rPr>
+          <w:b/>
+          <w:bCs/>
+        </w:rPr>
+        <w:t xml:space="preserve">`arrangerStyle`</w:t>
+      </w:r>
+      <w:r>
+        <w:t xml:space="preserve"> and </w:t>
+      </w:r>
+      <w:r>
+        <w:rPr>
+          <w:b/>
+          <w:bCs/>
+        </w:rPr>
+        <w:t xml:space="preserve">`era`</w:t>
+      </w:r>
+      <w:r>
+        <w:t xml:space="preserve"> (e.g. Thad + contemporary, Schneider + post_bop), and the UI updates </w:t>
+      </w:r>
+      <w:r>
+        <w:rPr>
+          <w:b/>
+          <w:bCs/>
+        </w:rPr>
+        <w:t xml:space="preserve">Arranger</w:t>
+      </w:r>
+      <w:r>
+        <w:t xml:space="preserve"> and </w:t>
+      </w:r>
+      <w:r>
+        <w:rPr>
+          <w:b/>
+          <w:bCs/>
+        </w:rPr>
+        <w:t xml:space="preserve">Era</w:t>
+      </w:r>
+      <w:r>
+        <w:t xml:space="preserve"> to match. On generate, the wire carries </w:t>
+      </w:r>
+      <w:r>
+        <w:rPr>
+          <w:b/>
+          <w:bCs/>
+        </w:rPr>
+        <w:t xml:space="preserve">`primarySongwriterStyle`</w:t>
+      </w:r>
+      <w:r>
+        <w:t xml:space="preserve">, optional </w:t>
+      </w:r>
+      <w:r>
+        <w:rPr>
+          <w:b/>
+          <w:bCs/>
+        </w:rPr>
+        <w:t xml:space="preserve">`secondarySongwriterStyle`</w:t>
+      </w:r>
+      <w:r>
+        <w:t xml:space="preserve">, and </w:t>
+      </w:r>
+      <w:r>
+        <w:rPr>
+          <w:b/>
+          <w:bCs/>
+        </w:rPr>
+        <w:t xml:space="preserve">`stylePairing`</w:t>
+      </w:r>
+      <w:r>
+        <w:t xml:space="preserve"> (`songwriterStyle`, `arrangerStyle`, `era`) like any manual selection — </w:t>
+      </w:r>
+      <w:r>
+        <w:rPr>
+          <w:b/>
+          <w:bCs/>
+        </w:rPr>
+        <w:t xml:space="preserve">`buildCompiledSong`</w:t>
+      </w:r>
+      <w:r>
+        <w:t xml:space="preserve"> calls </w:t>
+      </w:r>
+      <w:r>
+        <w:rPr>
+          <w:b/>
+          <w:bCs/>
+        </w:rPr>
+        <w:t xml:space="preserve">`resolveStylePairing`</w:t>
+      </w:r>
+      <w:r>
+        <w:t xml:space="preserve"> so </w:t>
+      </w:r>
+      <w:r>
+        <w:rPr>
+          <w:b/>
+          <w:bCs/>
+        </w:rPr>
+        <w:t xml:space="preserve">confidence / experimental flags / section-contrast nudges</w:t>
+      </w:r>
+      <w:r>
+        <w:t xml:space="preserve"> apply the same way. The diversity </w:t>
+      </w:r>
+      <w:r>
+        <w:rPr>
+          <w:b/>
+          <w:bCs/>
+        </w:rPr>
+        <w:t xml:space="preserve">`preset` id itself is not sent on `GenerateRequest`</w:t>
+      </w:r>
+      <w:r>
+        <w:t xml:space="preserve">; only the resolved controls matter downstream.</w:t>
+      </w:r>
+    </w:p>
+    <w:p>
+      <w:pPr>
+        <w:spacing w:after="160"/>
+      </w:pPr>
+      <w:r>
+        <w:rPr>
+          <w:b/>
+          <w:bCs/>
+        </w:rPr>
+        <w:t xml:space="preserve">Which combinations are wired:</w:t>
+      </w:r>
+      <w:r>
+        <w:t xml:space="preserve"> All </w:t>
+      </w:r>
+      <w:r>
+        <w:rPr>
+          <w:b/>
+          <w:bCs/>
+        </w:rPr>
+        <w:t xml:space="preserve">nine</w:t>
+      </w:r>
+      <w:r>
+        <w:t xml:space="preserve"> presets are defined and listed in the </w:t>
+      </w:r>
+      <w:r>
+        <w:rPr>
+          <w:b/>
+          <w:bCs/>
+        </w:rPr>
+        <w:t xml:space="preserve">Diversity preset (optional)</w:t>
+      </w:r>
+      <w:r>
+        <w:t xml:space="preserve"> dropdown:</w:t>
+      </w:r>
+    </w:p>
+    <w:tbl>
+      <w:tblPr>
+        <w:tblW w:type="pct" w:w="100%"/>
+        <w:tblBorders>
+          <w:top w:val="single" w:color="auto" w:sz="4"/>
+          <w:left w:val="single" w:color="auto" w:sz="4"/>
+          <w:bottom w:val="single" w:color="auto" w:sz="4"/>
+          <w:right w:val="single" w:color="auto" w:sz="4"/>
+          <w:insideH w:val="single" w:color="auto" w:sz="4"/>
+          <w:insideV w:val="single" w:color="auto" w:sz="4"/>
+        </w:tblBorders>
+      </w:tblPr>
+      <w:tblGrid>
+        <w:gridCol w:w="1800"/>
+        <w:gridCol w:w="1800"/>
+        <w:gridCol w:w="1800"/>
+        <w:gridCol w:w="1800"/>
+        <w:gridCol w:w="1800"/>
+      </w:tblGrid>
+      <w:tr>
+        <w:tc>
+          <w:tcPr>
+            <w:tcW w:type="pct" w:w="1800%"/>
+          </w:tcPr>
+          <w:p>
+            <w:pPr>
+              <w:spacing w:after="60"/>
+            </w:pPr>
+            <w:r>
+              <w:t xml:space="preserve">`id`</w:t>
+            </w:r>
+          </w:p>
+        </w:tc>
+        <w:tc>
+          <w:tcPr>
+            <w:tcW w:type="pct" w:w="1800%"/>
+          </w:tcPr>
+          <w:p>
+            <w:pPr>
+              <w:spacing w:after="60"/>
+            </w:pPr>
+            <w:r>
+              <w:t xml:space="preserve">UI label</w:t>
+            </w:r>
+          </w:p>
+        </w:tc>
+        <w:tc>
+          <w:tcPr>
+            <w:tcW w:type="pct" w:w="1800%"/>
+          </w:tcPr>
+          <w:p>
+            <w:pPr>
+              <w:spacing w:after="60"/>
+            </w:pPr>
+            <w:r>
+              <w:t xml:space="preserve">Primary</w:t>
+            </w:r>
+          </w:p>
+        </w:tc>
+        <w:tc>
+          <w:tcPr>
+            <w:tcW w:type="pct" w:w="1800%"/>
+          </w:tcPr>
+          <w:p>
+            <w:pPr>
+              <w:spacing w:after="60"/>
+            </w:pPr>
+            <w:r>
+              <w:t xml:space="preserve">Secondary</w:t>
+            </w:r>
+          </w:p>
+        </w:tc>
+        <w:tc>
+          <w:tcPr>
+            <w:tcW w:type="pct" w:w="1800%"/>
+          </w:tcPr>
+          <w:p>
+            <w:pPr>
+              <w:spacing w:after="60"/>
+            </w:pPr>
+            <w:r>
+              <w:t xml:space="preserve">Suggested pairing (`resolveSongModeDiversityStylePairing`)</w:t>
+            </w:r>
+          </w:p>
+        </w:tc>
+      </w:tr>
+      <w:tr>
+        <w:tc>
+          <w:tcPr>
+            <w:tcW w:type="pct" w:w="1800%"/>
+          </w:tcPr>
+          <w:p>
+            <w:pPr>
+              <w:spacing w:after="60"/>
+            </w:pPr>
+            <w:r>
+              <w:t xml:space="preserve">`fagen_wonder_pocket`</w:t>
+            </w:r>
+          </w:p>
+        </w:tc>
+        <w:tc>
+          <w:tcPr>
+            <w:tcW w:type="pct" w:w="1800%"/>
+          </w:tcPr>
+          <w:p>
+            <w:pPr>
+              <w:spacing w:after="60"/>
+            </w:pPr>
+            <w:r>
+              <w:t xml:space="preserve">Jazz-Pop Pocket</w:t>
+            </w:r>
+          </w:p>
+        </w:tc>
+        <w:tc>
+          <w:tcPr>
+            <w:tcW w:type="pct" w:w="1800%"/>
+          </w:tcPr>
+          <w:p>
+            <w:pPr>
+              <w:spacing w:after="60"/>
+            </w:pPr>
+            <w:r>
+              <w:t xml:space="preserve">donald_fagen</w:t>
+            </w:r>
+          </w:p>
+        </w:tc>
+        <w:tc>
+          <w:tcPr>
+            <w:tcW w:type="pct" w:w="1800%"/>
+          </w:tcPr>
+          <w:p>
+            <w:pPr>
+              <w:spacing w:after="60"/>
+            </w:pPr>
+            <w:r>
+              <w:t xml:space="preserve">stevie_wonder</w:t>
+            </w:r>
+          </w:p>
+        </w:tc>
+        <w:tc>
+          <w:tcPr>
+            <w:tcW w:type="pct" w:w="1800%"/>
+          </w:tcPr>
+          <w:p>
+            <w:pPr>
+              <w:spacing w:after="60"/>
+            </w:pPr>
+            <w:r>
+              <w:t xml:space="preserve">`thad` · contemporary</w:t>
+            </w:r>
+          </w:p>
+        </w:tc>
+      </w:tr>
+      <w:tr>
+        <w:tc>
+          <w:tcPr>
+            <w:tcW w:type="pct" w:w="1800%"/>
+          </w:tcPr>
+          <w:p>
+            <w:pPr>
+              <w:spacing w:after="60"/>
+            </w:pPr>
+            <w:r>
+              <w:t xml:space="preserve">`shorter_bacharach_arc`</w:t>
+            </w:r>
+          </w:p>
+        </w:tc>
+        <w:tc>
+          <w:tcPr>
+            <w:tcW w:type="pct" w:w="1800%"/>
+          </w:tcPr>
+          <w:p>
+            <w:pPr>
+              <w:spacing w:after="60"/>
+            </w:pPr>
+            <w:r>
+              <w:t xml:space="preserve">Angular Lyric Arc</w:t>
+            </w:r>
+          </w:p>
+        </w:tc>
+        <w:tc>
+          <w:tcPr>
+            <w:tcW w:type="pct" w:w="1800%"/>
+          </w:tcPr>
+          <w:p>
+            <w:pPr>
+              <w:spacing w:after="60"/>
+            </w:pPr>
+            <w:r>
+              <w:t xml:space="preserve">wayne_shorter</w:t>
+            </w:r>
+          </w:p>
+        </w:tc>
+        <w:tc>
+          <w:tcPr>
+            <w:tcW w:type="pct" w:w="1800%"/>
+          </w:tcPr>
+          <w:p>
+            <w:pPr>
+              <w:spacing w:after="60"/>
+            </w:pPr>
+            <w:r>
+              <w:t xml:space="preserve">bacharach</w:t>
+            </w:r>
+          </w:p>
+        </w:tc>
+        <w:tc>
+          <w:tcPr>
+            <w:tcW w:type="pct" w:w="1800%"/>
+          </w:tcPr>
+          <w:p>
+            <w:pPr>
+              <w:spacing w:after="60"/>
+            </w:pPr>
+            <w:r>
+              <w:t xml:space="preserve">`schneider` · post_bop</w:t>
+            </w:r>
+          </w:p>
+        </w:tc>
+      </w:tr>
+      <w:tr>
+        <w:tc>
+          <w:tcPr>
+            <w:tcW w:type="pct" w:w="1800%"/>
+          </w:tcPr>
+          <w:p>
+            <w:pPr>
+              <w:spacing w:after="60"/>
+            </w:pPr>
+            <w:r>
+              <w:t xml:space="preserve">`beatles_bach_counterline`</w:t>
+            </w:r>
+          </w:p>
+        </w:tc>
+        <w:tc>
+          <w:tcPr>
+            <w:tcW w:type="pct" w:w="1800%"/>
+          </w:tcPr>
+          <w:p>
+            <w:pPr>
+              <w:spacing w:after="60"/>
+            </w:pPr>
+            <w:r>
+              <w:t xml:space="preserve">Hook + Counterline</w:t>
+            </w:r>
+          </w:p>
+        </w:tc>
+        <w:tc>
+          <w:tcPr>
+            <w:tcW w:type="pct" w:w="1800%"/>
+          </w:tcPr>
+          <w:p>
+            <w:pPr>
+              <w:spacing w:after="60"/>
+            </w:pPr>
+            <w:r>
+              <w:t xml:space="preserve">beatles</w:t>
+            </w:r>
+          </w:p>
+        </w:tc>
+        <w:tc>
+          <w:tcPr>
+            <w:tcW w:type="pct" w:w="1800%"/>
+          </w:tcPr>
+          <w:p>
+            <w:pPr>
+              <w:spacing w:after="60"/>
+            </w:pPr>
+            <w:r>
+              <w:t xml:space="preserve">bach</w:t>
+            </w:r>
+          </w:p>
+        </w:tc>
+        <w:tc>
+          <w:tcPr>
+            <w:tcW w:type="pct" w:w="1800%"/>
+          </w:tcPr>
+          <w:p>
+            <w:pPr>
+              <w:spacing w:after="60"/>
+            </w:pPr>
+            <w:r>
+              <w:t xml:space="preserve">`ellington` · swing</w:t>
+            </w:r>
+          </w:p>
+        </w:tc>
+      </w:tr>
+      <w:tr>
+        <w:tc>
+          <w:tcPr>
+            <w:tcW w:type="pct" w:w="1800%"/>
+          </w:tcPr>
+          <w:p>
+            <w:pPr>
+              <w:spacing w:after="60"/>
+            </w:pPr>
+            <w:r>
+              <w:t xml:space="preserve">`kendrick_debussy_space`</w:t>
+            </w:r>
+          </w:p>
+        </w:tc>
+        <w:tc>
+          <w:tcPr>
+            <w:tcW w:type="pct" w:w="1800%"/>
+          </w:tcPr>
+          <w:p>
+            <w:pPr>
+              <w:spacing w:after="60"/>
+            </w:pPr>
+            <w:r>
+              <w:t xml:space="preserve">Motif + Colour Space</w:t>
+            </w:r>
+          </w:p>
+        </w:tc>
+        <w:tc>
+          <w:tcPr>
+            <w:tcW w:type="pct" w:w="1800%"/>
+          </w:tcPr>
+          <w:p>
+            <w:pPr>
+              <w:spacing w:after="60"/>
+            </w:pPr>
+            <w:r>
+              <w:t xml:space="preserve">kendrick_lamar</w:t>
+            </w:r>
+          </w:p>
+        </w:tc>
+        <w:tc>
+          <w:tcPr>
+            <w:tcW w:type="pct" w:w="1800%"/>
+          </w:tcPr>
+          <w:p>
+            <w:pPr>
+              <w:spacing w:after="60"/>
+            </w:pPr>
+            <w:r>
+              <w:t xml:space="preserve">debussy</w:t>
+            </w:r>
+          </w:p>
+        </w:tc>
+        <w:tc>
+          <w:tcPr>
+            <w:tcW w:type="pct" w:w="1800%"/>
+          </w:tcPr>
+          <w:p>
+            <w:pPr>
+              <w:spacing w:after="60"/>
+            </w:pPr>
+            <w:r>
+              <w:t xml:space="preserve">`gil_evans` · cool_jazz</w:t>
+            </w:r>
+          </w:p>
+        </w:tc>
+      </w:tr>
+      <w:tr>
+        <w:tc>
+          <w:tcPr>
+            <w:tcW w:type="pct" w:w="1800%"/>
+          </w:tcPr>
+          <w:p>
+            <w:pPr>
+              <w:spacing w:after="60"/>
+            </w:pPr>
+            <w:r>
+              <w:t xml:space="preserve">`maxmartin_stravinsky_angles`</w:t>
+            </w:r>
+          </w:p>
+        </w:tc>
+        <w:tc>
+          <w:tcPr>
+            <w:tcW w:type="pct" w:w="1800%"/>
+          </w:tcPr>
+          <w:p>
+            <w:pPr>
+              <w:spacing w:after="60"/>
+            </w:pPr>
+            <w:r>
+              <w:t xml:space="preserve">Hook Grid + Asymmetry</w:t>
+            </w:r>
+          </w:p>
+        </w:tc>
+        <w:tc>
+          <w:tcPr>
+            <w:tcW w:type="pct" w:w="1800%"/>
+          </w:tcPr>
+          <w:p>
+            <w:pPr>
+              <w:spacing w:after="60"/>
+            </w:pPr>
+            <w:r>
+              <w:t xml:space="preserve">max_martin</w:t>
+            </w:r>
+          </w:p>
+        </w:tc>
+        <w:tc>
+          <w:tcPr>
+            <w:tcW w:type="pct" w:w="1800%"/>
+          </w:tcPr>
+          <w:p>
+            <w:pPr>
+              <w:spacing w:after="60"/>
+            </w:pPr>
+            <w:r>
+              <w:t xml:space="preserve">stravinsky</w:t>
+            </w:r>
+          </w:p>
+        </w:tc>
+        <w:tc>
+          <w:tcPr>
+            <w:tcW w:type="pct" w:w="1800%"/>
+          </w:tcPr>
+          <w:p>
+            <w:pPr>
+              <w:spacing w:after="60"/>
+            </w:pPr>
+            <w:r>
+              <w:t xml:space="preserve">`basie` · bebop</w:t>
+            </w:r>
+          </w:p>
+        </w:tc>
+      </w:tr>
+      <w:tr>
+        <w:tc>
+          <w:tcPr>
+            <w:tcW w:type="pct" w:w="1800%"/>
+          </w:tcPr>
+          <w:p>
+            <w:pPr>
+              <w:spacing w:after="60"/>
+            </w:pPr>
+            <w:r>
+              <w:t xml:space="preserve">`dylan_messiaen_literate_vs_sublime`</w:t>
+            </w:r>
+          </w:p>
+        </w:tc>
+        <w:tc>
+          <w:tcPr>
+            <w:tcW w:type="pct" w:w="1800%"/>
+          </w:tcPr>
+          <w:p>
+            <w:pPr>
+              <w:spacing w:after="60"/>
+            </w:pPr>
+            <w:r>
+              <w:t xml:space="preserve">Literate Folk vs Sublime Colour</w:t>
+            </w:r>
+          </w:p>
+        </w:tc>
+        <w:tc>
+          <w:tcPr>
+            <w:tcW w:type="pct" w:w="1800%"/>
+          </w:tcPr>
+          <w:p>
+            <w:pPr>
+              <w:spacing w:after="60"/>
+            </w:pPr>
+            <w:r>
+              <w:t xml:space="preserve">bob_dylan</w:t>
+            </w:r>
+          </w:p>
+        </w:tc>
+        <w:tc>
+          <w:tcPr>
+            <w:tcW w:type="pct" w:w="1800%"/>
+          </w:tcPr>
+          <w:p>
+            <w:pPr>
+              <w:spacing w:after="60"/>
+            </w:pPr>
+            <w:r>
+              <w:t xml:space="preserve">messiaen</w:t>
+            </w:r>
+          </w:p>
+        </w:tc>
+        <w:tc>
+          <w:tcPr>
+            <w:tcW w:type="pct" w:w="1800%"/>
+          </w:tcPr>
+          <w:p>
+            <w:pPr>
+              <w:spacing w:after="60"/>
+            </w:pPr>
+            <w:r>
+              <w:t xml:space="preserve">`schneider` · post_bop</w:t>
+            </w:r>
+          </w:p>
+        </w:tc>
+      </w:tr>
+      <w:tr>
+        <w:tc>
+          <w:tcPr>
+            <w:tcW w:type="pct" w:w="1800%"/>
+          </w:tcPr>
+          <w:p>
+            <w:pPr>
+              <w:spacing w:after="60"/>
+            </w:pPr>
+            <w:r>
+              <w:t xml:space="preserve">`james_brown_joni_groove_vs_line`</w:t>
+            </w:r>
+          </w:p>
+        </w:tc>
+        <w:tc>
+          <w:tcPr>
+            <w:tcW w:type="pct" w:w="1800%"/>
+          </w:tcPr>
+          <w:p>
+            <w:pPr>
+              <w:spacing w:after="60"/>
+            </w:pPr>
+            <w:r>
+              <w:t xml:space="preserve">Groove Cell vs Shifting Line</w:t>
+            </w:r>
+          </w:p>
+        </w:tc>
+        <w:tc>
+          <w:tcPr>
+            <w:tcW w:type="pct" w:w="1800%"/>
+          </w:tcPr>
+          <w:p>
+            <w:pPr>
+              <w:spacing w:after="60"/>
+            </w:pPr>
+            <w:r>
+              <w:t xml:space="preserve">james_brown</w:t>
+            </w:r>
+          </w:p>
+        </w:tc>
+        <w:tc>
+          <w:tcPr>
+            <w:tcW w:type="pct" w:w="1800%"/>
+          </w:tcPr>
+          <w:p>
+            <w:pPr>
+              <w:spacing w:after="60"/>
+            </w:pPr>
+            <w:r>
+              <w:t xml:space="preserve">joni_mitchell</w:t>
+            </w:r>
+          </w:p>
+        </w:tc>
+        <w:tc>
+          <w:tcPr>
+            <w:tcW w:type="pct" w:w="1800%"/>
+          </w:tcPr>
+          <w:p>
+            <w:pPr>
+              <w:spacing w:after="60"/>
+            </w:pPr>
+            <w:r>
+              <w:t xml:space="preserve">`ellington` · contemporary</w:t>
+            </w:r>
+          </w:p>
+        </w:tc>
+      </w:tr>
+      <w:tr>
+        <w:tc>
+          <w:tcPr>
+            <w:tcW w:type="pct" w:w="1800%"/>
+          </w:tcPr>
+          <w:p>
+            <w:pPr>
+              <w:spacing w:after="60"/>
+            </w:pPr>
+            <w:r>
+              <w:t xml:space="preserve">`barry_harris_max_martin_bebop_vs_charts`</w:t>
+            </w:r>
+          </w:p>
+        </w:tc>
+        <w:tc>
+          <w:tcPr>
+            <w:tcW w:type="pct" w:w="1800%"/>
+          </w:tcPr>
+          <w:p>
+            <w:pPr>
+              <w:spacing w:after="60"/>
+            </w:pPr>
+            <w:r>
+              <w:t xml:space="preserve">Bebop Line vs Chart Template</w:t>
+            </w:r>
+          </w:p>
+        </w:tc>
+        <w:tc>
+          <w:tcPr>
+            <w:tcW w:type="pct" w:w="1800%"/>
+          </w:tcPr>
+          <w:p>
+            <w:pPr>
+              <w:spacing w:after="60"/>
+            </w:pPr>
+            <w:r>
+              <w:t xml:space="preserve">barry_harris</w:t>
+            </w:r>
+          </w:p>
+        </w:tc>
+        <w:tc>
+          <w:tcPr>
+            <w:tcW w:type="pct" w:w="1800%"/>
+          </w:tcPr>
+          <w:p>
+            <w:pPr>
+              <w:spacing w:after="60"/>
+            </w:pPr>
+            <w:r>
+              <w:t xml:space="preserve">max_martin</w:t>
+            </w:r>
+          </w:p>
+        </w:tc>
+        <w:tc>
+          <w:tcPr>
+            <w:tcW w:type="pct" w:w="1800%"/>
+          </w:tcPr>
+          <w:p>
+            <w:pPr>
+              <w:spacing w:after="60"/>
+            </w:pPr>
+            <w:r>
+              <w:t xml:space="preserve">`basie` · bebop</w:t>
+            </w:r>
+          </w:p>
+        </w:tc>
+      </w:tr>
+      <w:tr>
+        <w:tc>
+          <w:tcPr>
+            <w:tcW w:type="pct" w:w="1800%"/>
+          </w:tcPr>
+          <w:p>
+            <w:pPr>
+              <w:spacing w:after="60"/>
+            </w:pPr>
+            <w:r>
+              <w:t xml:space="preserve">`ecm_chamber_prince_space_vs_pocket`</w:t>
+            </w:r>
+          </w:p>
+        </w:tc>
+        <w:tc>
+          <w:tcPr>
+            <w:tcW w:type="pct" w:w="1800%"/>
+          </w:tcPr>
+          <w:p>
+            <w:pPr>
+              <w:spacing w:after="60"/>
+            </w:pPr>
+            <w:r>
+              <w:t xml:space="preserve">Chamber Space vs Pocket Funk</w:t>
+            </w:r>
+          </w:p>
+        </w:tc>
+        <w:tc>
+          <w:tcPr>
+            <w:tcW w:type="pct" w:w="1800%"/>
+          </w:tcPr>
+          <w:p>
+            <w:pPr>
+              <w:spacing w:after="60"/>
+            </w:pPr>
+            <w:r>
+              <w:t xml:space="preserve">ecm_chamber</w:t>
+            </w:r>
+          </w:p>
+        </w:tc>
+        <w:tc>
+          <w:tcPr>
+            <w:tcW w:type="pct" w:w="1800%"/>
+          </w:tcPr>
+          <w:p>
+            <w:pPr>
+              <w:spacing w:after="60"/>
+            </w:pPr>
+            <w:r>
+              <w:t xml:space="preserve">prince</w:t>
+            </w:r>
+          </w:p>
+        </w:tc>
+        <w:tc>
+          <w:tcPr>
+            <w:tcW w:type="pct" w:w="1800%"/>
+          </w:tcPr>
+          <w:p>
+            <w:pPr>
+              <w:spacing w:after="60"/>
+            </w:pPr>
+            <w:r>
+              <w:t xml:space="preserve">`gil_evans` · cool_jazz</w:t>
+            </w:r>
+          </w:p>
+        </w:tc>
+      </w:tr>
+    </w:tbl>
+    <w:p>
+      <w:pPr>
+        <w:spacing w:after="160"/>
+      </w:pPr>
+    </w:p>
+    <w:p>
+      <w:pPr>
+        <w:spacing w:after="160"/>
+      </w:pPr>
+      <w:r>
+        <w:rPr>
+          <w:b/>
+          <w:bCs/>
+        </w:rPr>
+        <w:t xml:space="preserve">Which are not covered:</w:t>
+      </w:r>
+      <w:r>
+        <w:t xml:space="preserve"> Any songwriter combination </w:t>
+      </w:r>
+      <w:r>
+        <w:rPr>
+          <w:b/>
+          <w:bCs/>
+        </w:rPr>
+        <w:t xml:space="preserve">outside</w:t>
+      </w:r>
+      <w:r>
+        <w:t xml:space="preserve"> these nine rows — there is </w:t>
+      </w:r>
+      <w:r>
+        <w:rPr>
+          <w:b/>
+          <w:bCs/>
+        </w:rPr>
+        <w:t xml:space="preserve">no</w:t>
+      </w:r>
+      <w:r>
+        <w:t xml:space="preserve"> diversity preset until one is added to </w:t>
+      </w:r>
+      <w:r>
+        <w:rPr>
+          <w:b/>
+          <w:bCs/>
+        </w:rPr>
+        <w:t xml:space="preserve">`SONG_MODE_DIVERSITY_PRESETS`</w:t>
+      </w:r>
+      <w:r>
+        <w:t xml:space="preserve"> and (if needed) </w:t>
+      </w:r>
+      <w:r>
+        <w:rPr>
+          <w:b/>
+          <w:bCs/>
+        </w:rPr>
+        <w:t xml:space="preserve">`resolveSongModeDiversityStylePairing`</w:t>
+      </w:r>
+      <w:r>
+        <w:t xml:space="preserve">. Other modes (</w:t>
+      </w:r>
+      <w:r>
+        <w:rPr>
+          <w:b/>
+          <w:bCs/>
+        </w:rPr>
+        <w:t xml:space="preserve">Big Band</w:t>
+      </w:r>
+      <w:r>
+        <w:t xml:space="preserve">, </w:t>
+      </w:r>
+      <w:r>
+        <w:rPr>
+          <w:b/>
+          <w:bCs/>
+        </w:rPr>
+        <w:t xml:space="preserve">ECM Chamber</w:t>
+      </w:r>
+      <w:r>
+        <w:t xml:space="preserve">, etc.) do </w:t>
+      </w:r>
+      <w:r>
+        <w:rPr>
+          <w:b/>
+          <w:bCs/>
+        </w:rPr>
+        <w:t xml:space="preserve">not</w:t>
+      </w:r>
+      <w:r>
+        <w:t xml:space="preserve"> expose this control; it is </w:t>
+      </w:r>
+      <w:r>
+        <w:rPr>
+          <w:b/>
+          <w:bCs/>
+        </w:rPr>
+        <w:t xml:space="preserve">Song Mode only</w:t>
+      </w:r>
+      <w:r>
+        <w:t xml:space="preserve">.</w:t>
+      </w:r>
     </w:p>
     <w:p>
       <w:pPr>

</xml_diff>

<commit_message>
feat: wire Ellington, Schneider and Quincy Jones arranger profiles to Big Band engine
Co-authored-by: Cursor <cursoragent@cursor.com>
</commit_message>
<xml_diff>
--- a/docs/COMPOSER_OS_PLAYBOOK.docx
+++ b/docs/COMPOSER_OS_PLAYBOOK.docx
@@ -17040,6 +17040,979 @@
     </w:p>
     <w:p>
       <w:pPr>
+        <w:pStyle w:val="Heading2"/>
+        <w:spacing w:after="100" w:before="160"/>
+      </w:pPr>
+      <w:r>
+        <w:t xml:space="preserve">Big Band arranger profiles (wired tuning receipts)</w:t>
+      </w:r>
+    </w:p>
+    <w:p>
+      <w:pPr>
+        <w:spacing w:after="160"/>
+      </w:pPr>
+      <w:r>
+        <w:t xml:space="preserve">For </w:t>
+      </w:r>
+      <w:r>
+        <w:rPr>
+          <w:b/>
+          <w:bCs/>
+        </w:rPr>
+        <w:t xml:space="preserve">Big Band</w:t>
+      </w:r>
+      <w:r>
+        <w:t xml:space="preserve">, </w:t>
+      </w:r>
+      <w:r>
+        <w:rPr>
+          <w:b/>
+          <w:bCs/>
+        </w:rPr>
+        <w:t xml:space="preserve">`composerOsAppGeneration.ts`</w:t>
+      </w:r>
+      <w:r>
+        <w:t xml:space="preserve"> maps </w:t>
+      </w:r>
+      <w:r>
+        <w:rPr>
+          <w:b/>
+          <w:bCs/>
+        </w:rPr>
+        <w:t xml:space="preserve">`stylePairing.arrangerStyle`</w:t>
+      </w:r>
+      <w:r>
+        <w:t xml:space="preserve"> → </w:t>
+      </w:r>
+      <w:r>
+        <w:rPr>
+          <w:b/>
+          <w:bCs/>
+        </w:rPr>
+        <w:t xml:space="preserve">`composerStyle`</w:t>
+      </w:r>
+      <w:r>
+        <w:t xml:space="preserve"> only for </w:t>
+      </w:r>
+      <w:r>
+        <w:rPr>
+          <w:b/>
+          <w:bCs/>
+        </w:rPr>
+        <w:t xml:space="preserve">`basie`</w:t>
+      </w:r>
+      <w:r>
+        <w:t xml:space="preserve">, </w:t>
+      </w:r>
+      <w:r>
+        <w:rPr>
+          <w:b/>
+          <w:bCs/>
+        </w:rPr>
+        <w:t xml:space="preserve">`ellington`</w:t>
+      </w:r>
+      <w:r>
+        <w:t xml:space="preserve">, </w:t>
+      </w:r>
+      <w:r>
+        <w:rPr>
+          <w:b/>
+          <w:bCs/>
+        </w:rPr>
+        <w:t xml:space="preserve">`schneider`</w:t>
+      </w:r>
+      <w:r>
+        <w:t xml:space="preserve">, and </w:t>
+      </w:r>
+      <w:r>
+        <w:rPr>
+          <w:b/>
+          <w:bCs/>
+        </w:rPr>
+        <w:t xml:space="preserve">`quincy_jones`</w:t>
+      </w:r>
+      <w:r>
+        <w:t xml:space="preserve">. </w:t>
+      </w:r>
+      <w:r>
+        <w:rPr>
+          <w:b/>
+          <w:bCs/>
+        </w:rPr>
+        <w:t xml:space="preserve">`resolveBigBandEraRules`</w:t>
+      </w:r>
+      <w:r>
+        <w:t xml:space="preserve"> then merges </w:t>
+      </w:r>
+      <w:r>
+        <w:rPr>
+          <w:b/>
+          <w:bCs/>
+        </w:rPr>
+        <w:t xml:space="preserve">registry composer rules</w:t>
+      </w:r>
+      <w:r>
+        <w:t xml:space="preserve"> with </w:t>
+      </w:r>
+      <w:r>
+        <w:rPr>
+          <w:b/>
+          <w:bCs/>
+        </w:rPr>
+        <w:t xml:space="preserve">scalar tuning</w:t>
+      </w:r>
+      <w:r>
+        <w:t xml:space="preserve"> (`riffVsLine`, `spaceEmphasis`, `smoothTransitions`, …) and attaches optional </w:t>
+      </w:r>
+      <w:r>
+        <w:rPr>
+          <w:b/>
+          <w:bCs/>
+        </w:rPr>
+        <w:t xml:space="preserve">`BigBandArrangerProfileReceiptV1`</w:t>
+      </w:r>
+      <w:r>
+        <w:t xml:space="preserve"> blobs on </w:t>
+      </w:r>
+      <w:r>
+        <w:rPr>
+          <w:b/>
+          <w:bCs/>
+        </w:rPr>
+        <w:t xml:space="preserve">`resolvedRules.tuning`</w:t>
+      </w:r>
+      <w:r>
+        <w:t xml:space="preserve"> — </w:t>
+      </w:r>
+      <w:r>
+        <w:rPr>
+          <w:b/>
+          <w:bCs/>
+        </w:rPr>
+        <w:t xml:space="preserve">planning receipts</w:t>
+      </w:r>
+      <w:r>
+        <w:t xml:space="preserve"> for manifests / diagnostics; score behaviour still flows through existing </w:t>
+      </w:r>
+      <w:r>
+        <w:rPr>
+          <w:b/>
+          <w:bCs/>
+        </w:rPr>
+        <w:t xml:space="preserve">`applyBigBandRules`</w:t>
+      </w:r>
+      <w:r>
+        <w:t xml:space="preserve"> + orchestration paths.</w:t>
+      </w:r>
+    </w:p>
+    <w:p>
+      <w:pPr>
+        <w:spacing w:after="160"/>
+      </w:pPr>
+      <w:r>
+        <w:rPr>
+          <w:b/>
+          <w:bCs/>
+        </w:rPr>
+        <w:t xml:space="preserve">Wired arranger parameter profiles</w:t>
+      </w:r>
+      <w:r>
+        <w:t xml:space="preserve"> (exact strings stored on the receipt):</w:t>
+      </w:r>
+    </w:p>
+    <w:tbl>
+      <w:tblPr>
+        <w:tblW w:type="pct" w:w="100%"/>
+        <w:tblBorders>
+          <w:top w:val="single" w:color="auto" w:sz="4"/>
+          <w:left w:val="single" w:color="auto" w:sz="4"/>
+          <w:bottom w:val="single" w:color="auto" w:sz="4"/>
+          <w:right w:val="single" w:color="auto" w:sz="4"/>
+          <w:insideH w:val="single" w:color="auto" w:sz="4"/>
+          <w:insideV w:val="single" w:color="auto" w:sz="4"/>
+        </w:tblBorders>
+      </w:tblPr>
+      <w:tblGrid>
+        <w:gridCol w:w="2250"/>
+        <w:gridCol w:w="2250"/>
+        <w:gridCol w:w="2250"/>
+        <w:gridCol w:w="2250"/>
+      </w:tblGrid>
+      <w:tr>
+        <w:tc>
+          <w:tcPr>
+            <w:tcW w:type="pct" w:w="2250%"/>
+          </w:tcPr>
+          <w:p>
+            <w:pPr>
+              <w:spacing w:after="60"/>
+            </w:pPr>
+            <w:r>
+              <w:t xml:space="preserve">Field</w:t>
+            </w:r>
+          </w:p>
+        </w:tc>
+        <w:tc>
+          <w:tcPr>
+            <w:tcW w:type="pct" w:w="2250%"/>
+          </w:tcPr>
+          <w:p>
+            <w:pPr>
+              <w:spacing w:after="60"/>
+            </w:pPr>
+            <w:r>
+              <w:t xml:space="preserve">Duke Ellington (`ellington`)</w:t>
+            </w:r>
+          </w:p>
+        </w:tc>
+        <w:tc>
+          <w:tcPr>
+            <w:tcW w:type="pct" w:w="2250%"/>
+          </w:tcPr>
+          <w:p>
+            <w:pPr>
+              <w:spacing w:after="60"/>
+            </w:pPr>
+            <w:r>
+              <w:t xml:space="preserve">Maria Schneider (`schneider`)</w:t>
+            </w:r>
+          </w:p>
+        </w:tc>
+        <w:tc>
+          <w:tcPr>
+            <w:tcW w:type="pct" w:w="2250%"/>
+          </w:tcPr>
+          <w:p>
+            <w:pPr>
+              <w:spacing w:after="60"/>
+            </w:pPr>
+            <w:r>
+              <w:t xml:space="preserve">Quincy Jones (`quincy_jones`)</w:t>
+            </w:r>
+          </w:p>
+        </w:tc>
+      </w:tr>
+      <w:tr>
+        <w:tc>
+          <w:tcPr>
+            <w:tcW w:type="pct" w:w="2250%"/>
+          </w:tcPr>
+          <w:p>
+            <w:pPr>
+              <w:spacing w:after="60"/>
+            </w:pPr>
+            <w:r>
+              <w:t xml:space="preserve">Chord density</w:t>
+            </w:r>
+          </w:p>
+        </w:tc>
+        <w:tc>
+          <w:tcPr>
+            <w:tcW w:type="pct" w:w="2250%"/>
+          </w:tcPr>
+          <w:p>
+            <w:pPr>
+              <w:spacing w:after="60"/>
+            </w:pPr>
+            <w:r>
+              <w:t xml:space="preserve">4</w:t>
+            </w:r>
+          </w:p>
+        </w:tc>
+        <w:tc>
+          <w:tcPr>
+            <w:tcW w:type="pct" w:w="2250%"/>
+          </w:tcPr>
+          <w:p>
+            <w:pPr>
+              <w:spacing w:after="60"/>
+            </w:pPr>
+            <w:r>
+              <w:t xml:space="preserve">5</w:t>
+            </w:r>
+          </w:p>
+        </w:tc>
+        <w:tc>
+          <w:tcPr>
+            <w:tcW w:type="pct" w:w="2250%"/>
+          </w:tcPr>
+          <w:p>
+            <w:pPr>
+              <w:spacing w:after="60"/>
+            </w:pPr>
+            <w:r>
+              <w:t xml:space="preserve">3</w:t>
+            </w:r>
+          </w:p>
+        </w:tc>
+      </w:tr>
+      <w:tr>
+        <w:tc>
+          <w:tcPr>
+            <w:tcW w:type="pct" w:w="2250%"/>
+          </w:tcPr>
+          <w:p>
+            <w:pPr>
+              <w:spacing w:after="60"/>
+            </w:pPr>
+            <w:r>
+              <w:t xml:space="preserve">Extensions</w:t>
+            </w:r>
+          </w:p>
+        </w:tc>
+        <w:tc>
+          <w:tcPr>
+            <w:tcW w:type="pct" w:w="2250%"/>
+          </w:tcPr>
+          <w:p>
+            <w:pPr>
+              <w:spacing w:after="60"/>
+            </w:pPr>
+            <w:r>
+              <w:t xml:space="preserve">9ths, 11ths, 13ths, altered, polytonal</w:t>
+            </w:r>
+          </w:p>
+        </w:tc>
+        <w:tc>
+          <w:tcPr>
+            <w:tcW w:type="pct" w:w="2250%"/>
+          </w:tcPr>
+          <w:p>
+            <w:pPr>
+              <w:spacing w:after="60"/>
+            </w:pPr>
+            <w:r>
+              <w:t xml:space="preserve">9ths, 11ths, 13ths, altered, upper structure triads, polytonal</w:t>
+            </w:r>
+          </w:p>
+        </w:tc>
+        <w:tc>
+          <w:tcPr>
+            <w:tcW w:type="pct" w:w="2250%"/>
+          </w:tcPr>
+          <w:p>
+            <w:pPr>
+              <w:spacing w:after="60"/>
+            </w:pPr>
+            <w:r>
+              <w:t xml:space="preserve">9ths, 11ths, 13ths, altered, upper structure triads</w:t>
+            </w:r>
+          </w:p>
+        </w:tc>
+      </w:tr>
+      <w:tr>
+        <w:tc>
+          <w:tcPr>
+            <w:tcW w:type="pct" w:w="2250%"/>
+          </w:tcPr>
+          <w:p>
+            <w:pPr>
+              <w:spacing w:after="60"/>
+            </w:pPr>
+            <w:r>
+              <w:t xml:space="preserve">Functional harmony</w:t>
+            </w:r>
+          </w:p>
+        </w:tc>
+        <w:tc>
+          <w:tcPr>
+            <w:tcW w:type="pct" w:w="2250%"/>
+          </w:tcPr>
+          <w:p>
+            <w:pPr>
+              <w:spacing w:after="60"/>
+            </w:pPr>
+            <w:r>
+              <w:t xml:space="preserve">60%</w:t>
+            </w:r>
+          </w:p>
+        </w:tc>
+        <w:tc>
+          <w:tcPr>
+            <w:tcW w:type="pct" w:w="2250%"/>
+          </w:tcPr>
+          <w:p>
+            <w:pPr>
+              <w:spacing w:after="60"/>
+            </w:pPr>
+            <w:r>
+              <w:t xml:space="preserve">40%</w:t>
+            </w:r>
+          </w:p>
+        </w:tc>
+        <w:tc>
+          <w:tcPr>
+            <w:tcW w:type="pct" w:w="2250%"/>
+          </w:tcPr>
+          <w:p>
+            <w:pPr>
+              <w:spacing w:after="60"/>
+            </w:pPr>
+            <w:r>
+              <w:t xml:space="preserve">80%</w:t>
+            </w:r>
+          </w:p>
+        </w:tc>
+      </w:tr>
+      <w:tr>
+        <w:tc>
+          <w:tcPr>
+            <w:tcW w:type="pct" w:w="2250%"/>
+          </w:tcPr>
+          <w:p>
+            <w:pPr>
+              <w:spacing w:after="60"/>
+            </w:pPr>
+            <w:r>
+              <w:t xml:space="preserve">Harmonic rhythm</w:t>
+            </w:r>
+          </w:p>
+        </w:tc>
+        <w:tc>
+          <w:tcPr>
+            <w:tcW w:type="pct" w:w="2250%"/>
+          </w:tcPr>
+          <w:p>
+            <w:pPr>
+              <w:spacing w:after="60"/>
+            </w:pPr>
+            <w:r>
+              <w:t xml:space="preserve">medium</w:t>
+            </w:r>
+          </w:p>
+        </w:tc>
+        <w:tc>
+          <w:tcPr>
+            <w:tcW w:type="pct" w:w="2250%"/>
+          </w:tcPr>
+          <w:p>
+            <w:pPr>
+              <w:spacing w:after="60"/>
+            </w:pPr>
+            <w:r>
+              <w:t xml:space="preserve">slow</w:t>
+            </w:r>
+          </w:p>
+        </w:tc>
+        <w:tc>
+          <w:tcPr>
+            <w:tcW w:type="pct" w:w="2250%"/>
+          </w:tcPr>
+          <w:p>
+            <w:pPr>
+              <w:spacing w:after="60"/>
+            </w:pPr>
+            <w:r>
+              <w:t xml:space="preserve">medium</w:t>
+            </w:r>
+          </w:p>
+        </w:tc>
+      </w:tr>
+      <w:tr>
+        <w:tc>
+          <w:tcPr>
+            <w:tcW w:type="pct" w:w="2250%"/>
+          </w:tcPr>
+          <w:p>
+            <w:pPr>
+              <w:spacing w:after="60"/>
+            </w:pPr>
+            <w:r>
+              <w:t xml:space="preserve">Overall density</w:t>
+            </w:r>
+          </w:p>
+        </w:tc>
+        <w:tc>
+          <w:tcPr>
+            <w:tcW w:type="pct" w:w="2250%"/>
+          </w:tcPr>
+          <w:p>
+            <w:pPr>
+              <w:spacing w:after="60"/>
+            </w:pPr>
+            <w:r>
+              <w:t xml:space="preserve">4</w:t>
+            </w:r>
+          </w:p>
+        </w:tc>
+        <w:tc>
+          <w:tcPr>
+            <w:tcW w:type="pct" w:w="2250%"/>
+          </w:tcPr>
+          <w:p>
+            <w:pPr>
+              <w:spacing w:after="60"/>
+            </w:pPr>
+            <w:r>
+              <w:t xml:space="preserve">4</w:t>
+            </w:r>
+          </w:p>
+        </w:tc>
+        <w:tc>
+          <w:tcPr>
+            <w:tcW w:type="pct" w:w="2250%"/>
+          </w:tcPr>
+          <w:p>
+            <w:pPr>
+              <w:spacing w:after="60"/>
+            </w:pPr>
+            <w:r>
+              <w:t xml:space="preserve">3</w:t>
+            </w:r>
+          </w:p>
+        </w:tc>
+      </w:tr>
+      <w:tr>
+        <w:tc>
+          <w:tcPr>
+            <w:tcW w:type="pct" w:w="2250%"/>
+          </w:tcPr>
+          <w:p>
+            <w:pPr>
+              <w:spacing w:after="60"/>
+            </w:pPr>
+            <w:r>
+              <w:t xml:space="preserve">Texture arc</w:t>
+            </w:r>
+          </w:p>
+        </w:tc>
+        <w:tc>
+          <w:tcPr>
+            <w:tcW w:type="pct" w:w="2250%"/>
+          </w:tcPr>
+          <w:p>
+            <w:pPr>
+              <w:spacing w:after="60"/>
+            </w:pPr>
+            <w:r>
+              <w:t xml:space="preserve">conversational, gradual build</w:t>
+            </w:r>
+          </w:p>
+        </w:tc>
+        <w:tc>
+          <w:tcPr>
+            <w:tcW w:type="pct" w:w="2250%"/>
+          </w:tcPr>
+          <w:p>
+            <w:pPr>
+              <w:spacing w:after="60"/>
+            </w:pPr>
+            <w:r>
+              <w:t xml:space="preserve">gradual build, mosaic</w:t>
+            </w:r>
+          </w:p>
+        </w:tc>
+        <w:tc>
+          <w:tcPr>
+            <w:tcW w:type="pct" w:w="2250%"/>
+          </w:tcPr>
+          <w:p>
+            <w:pPr>
+              <w:spacing w:after="60"/>
+            </w:pPr>
+            <w:r>
+              <w:t xml:space="preserve">cinematic, gradual build</w:t>
+            </w:r>
+          </w:p>
+        </w:tc>
+      </w:tr>
+      <w:tr>
+        <w:tc>
+          <w:tcPr>
+            <w:tcW w:type="pct" w:w="2250%"/>
+          </w:tcPr>
+          <w:p>
+            <w:pPr>
+              <w:spacing w:after="60"/>
+            </w:pPr>
+            <w:r>
+              <w:t xml:space="preserve">Section blending</w:t>
+            </w:r>
+          </w:p>
+        </w:tc>
+        <w:tc>
+          <w:tcPr>
+            <w:tcW w:type="pct" w:w="2250%"/>
+          </w:tcPr>
+          <w:p>
+            <w:pPr>
+              <w:spacing w:after="60"/>
+            </w:pPr>
+            <w:r>
+              <w:t xml:space="preserve">blurred, unusual combos</w:t>
+            </w:r>
+          </w:p>
+        </w:tc>
+        <w:tc>
+          <w:tcPr>
+            <w:tcW w:type="pct" w:w="2250%"/>
+          </w:tcPr>
+          <w:p>
+            <w:pPr>
+              <w:spacing w:after="60"/>
+            </w:pPr>
+            <w:r>
+              <w:t xml:space="preserve">blurred, unusual combos</w:t>
+            </w:r>
+          </w:p>
+        </w:tc>
+        <w:tc>
+          <w:tcPr>
+            <w:tcW w:type="pct" w:w="2250%"/>
+          </w:tcPr>
+          <w:p>
+            <w:pPr>
+              <w:spacing w:after="60"/>
+            </w:pPr>
+            <w:r>
+              <w:t xml:space="preserve">mostly clean, some blends</w:t>
+            </w:r>
+          </w:p>
+        </w:tc>
+      </w:tr>
+      <w:tr>
+        <w:tc>
+          <w:tcPr>
+            <w:tcW w:type="pct" w:w="2250%"/>
+          </w:tcPr>
+          <w:p>
+            <w:pPr>
+              <w:spacing w:after="60"/>
+            </w:pPr>
+            <w:r>
+              <w:t xml:space="preserve">Rhythm section weight</w:t>
+            </w:r>
+          </w:p>
+        </w:tc>
+        <w:tc>
+          <w:tcPr>
+            <w:tcW w:type="pct" w:w="2250%"/>
+          </w:tcPr>
+          <w:p>
+            <w:pPr>
+              <w:spacing w:after="60"/>
+            </w:pPr>
+            <w:r>
+              <w:t xml:space="preserve">3</w:t>
+            </w:r>
+          </w:p>
+        </w:tc>
+        <w:tc>
+          <w:tcPr>
+            <w:tcW w:type="pct" w:w="2250%"/>
+          </w:tcPr>
+          <w:p>
+            <w:pPr>
+              <w:spacing w:after="60"/>
+            </w:pPr>
+            <w:r>
+              <w:t xml:space="preserve">3</w:t>
+            </w:r>
+          </w:p>
+        </w:tc>
+        <w:tc>
+          <w:tcPr>
+            <w:tcW w:type="pct" w:w="2250%"/>
+          </w:tcPr>
+          <w:p>
+            <w:pPr>
+              <w:spacing w:after="60"/>
+            </w:pPr>
+            <w:r>
+              <w:t xml:space="preserve">5</w:t>
+            </w:r>
+          </w:p>
+        </w:tc>
+      </w:tr>
+      <w:tr>
+        <w:tc>
+          <w:tcPr>
+            <w:tcW w:type="pct" w:w="2250%"/>
+          </w:tcPr>
+          <w:p>
+            <w:pPr>
+              <w:spacing w:after="60"/>
+            </w:pPr>
+            <w:r>
+              <w:t xml:space="preserve">Time feel</w:t>
+            </w:r>
+          </w:p>
+        </w:tc>
+        <w:tc>
+          <w:tcPr>
+            <w:tcW w:type="pct" w:w="2250%"/>
+          </w:tcPr>
+          <w:p>
+            <w:pPr>
+              <w:spacing w:after="60"/>
+            </w:pPr>
+            <w:r>
+              <w:t xml:space="preserve">elastic / floating</w:t>
+            </w:r>
+          </w:p>
+        </w:tc>
+        <w:tc>
+          <w:tcPr>
+            <w:tcW w:type="pct" w:w="2250%"/>
+          </w:tcPr>
+          <w:p>
+            <w:pPr>
+              <w:spacing w:after="60"/>
+            </w:pPr>
+            <w:r>
+              <w:t xml:space="preserve">floating / groove-first</w:t>
+            </w:r>
+          </w:p>
+        </w:tc>
+        <w:tc>
+          <w:tcPr>
+            <w:tcW w:type="pct" w:w="2250%"/>
+          </w:tcPr>
+          <w:p>
+            <w:pPr>
+              <w:spacing w:after="60"/>
+            </w:pPr>
+            <w:r>
+              <w:t xml:space="preserve">groove-first / locked grid</w:t>
+            </w:r>
+          </w:p>
+        </w:tc>
+      </w:tr>
+      <w:tr>
+        <w:tc>
+          <w:tcPr>
+            <w:tcW w:type="pct" w:w="2250%"/>
+          </w:tcPr>
+          <w:p>
+            <w:pPr>
+              <w:spacing w:after="60"/>
+            </w:pPr>
+            <w:r>
+              <w:t xml:space="preserve">Horn relationship</w:t>
+            </w:r>
+          </w:p>
+        </w:tc>
+        <w:tc>
+          <w:tcPr>
+            <w:tcW w:type="pct" w:w="2250%"/>
+          </w:tcPr>
+          <w:p>
+            <w:pPr>
+              <w:spacing w:after="60"/>
+            </w:pPr>
+            <w:r>
+              <w:t xml:space="preserve">equal dialogue</w:t>
+            </w:r>
+          </w:p>
+        </w:tc>
+        <w:tc>
+          <w:tcPr>
+            <w:tcW w:type="pct" w:w="2250%"/>
+          </w:tcPr>
+          <w:p>
+            <w:pPr>
+              <w:spacing w:after="60"/>
+            </w:pPr>
+            <w:r>
+              <w:t xml:space="preserve">equal dialogue</w:t>
+            </w:r>
+          </w:p>
+        </w:tc>
+        <w:tc>
+          <w:tcPr>
+            <w:tcW w:type="pct" w:w="2250%"/>
+          </w:tcPr>
+          <w:p>
+            <w:pPr>
+              <w:spacing w:after="60"/>
+            </w:pPr>
+            <w:r>
+              <w:t xml:space="preserve">rhythm leads / equal dialogue</w:t>
+            </w:r>
+          </w:p>
+        </w:tc>
+      </w:tr>
+      <w:tr>
+        <w:tc>
+          <w:tcPr>
+            <w:tcW w:type="pct" w:w="2250%"/>
+          </w:tcPr>
+          <w:p>
+            <w:pPr>
+              <w:spacing w:after="60"/>
+            </w:pPr>
+            <w:r>
+              <w:t xml:space="preserve">Build strategy</w:t>
+            </w:r>
+          </w:p>
+        </w:tc>
+        <w:tc>
+          <w:tcPr>
+            <w:tcW w:type="pct" w:w="2250%"/>
+          </w:tcPr>
+          <w:p>
+            <w:pPr>
+              <w:spacing w:after="60"/>
+            </w:pPr>
+            <w:r>
+              <w:t xml:space="preserve">chorus-based, narrative arc</w:t>
+            </w:r>
+          </w:p>
+        </w:tc>
+        <w:tc>
+          <w:tcPr>
+            <w:tcW w:type="pct" w:w="2250%"/>
+          </w:tcPr>
+          <w:p>
+            <w:pPr>
+              <w:spacing w:after="60"/>
+            </w:pPr>
+            <w:r>
+              <w:t xml:space="preserve">narrative arc</w:t>
+            </w:r>
+          </w:p>
+        </w:tc>
+        <w:tc>
+          <w:tcPr>
+            <w:tcW w:type="pct" w:w="2250%"/>
+          </w:tcPr>
+          <w:p>
+            <w:pPr>
+              <w:spacing w:after="60"/>
+            </w:pPr>
+            <w:r>
+              <w:t xml:space="preserve">chorus-based, cinematic</w:t>
+            </w:r>
+          </w:p>
+        </w:tc>
+      </w:tr>
+      <w:tr>
+        <w:tc>
+          <w:tcPr>
+            <w:tcW w:type="pct" w:w="2250%"/>
+          </w:tcPr>
+          <w:p>
+            <w:pPr>
+              <w:spacing w:after="60"/>
+            </w:pPr>
+            <w:r>
+              <w:t xml:space="preserve">Space usage</w:t>
+            </w:r>
+          </w:p>
+        </w:tc>
+        <w:tc>
+          <w:tcPr>
+            <w:tcW w:type="pct" w:w="2250%"/>
+          </w:tcPr>
+          <w:p>
+            <w:pPr>
+              <w:spacing w:after="60"/>
+            </w:pPr>
+            <w:r>
+              <w:t xml:space="preserve">continuous flow with pockets of space</w:t>
+            </w:r>
+          </w:p>
+        </w:tc>
+        <w:tc>
+          <w:tcPr>
+            <w:tcW w:type="pct" w:w="2250%"/>
+          </w:tcPr>
+          <w:p>
+            <w:pPr>
+              <w:spacing w:after="60"/>
+            </w:pPr>
+            <w:r>
+              <w:t xml:space="preserve">space then explosion / continuous flow</w:t>
+            </w:r>
+          </w:p>
+        </w:tc>
+        <w:tc>
+          <w:tcPr>
+            <w:tcW w:type="pct" w:w="2250%"/>
+          </w:tcPr>
+          <w:p>
+            <w:pPr>
+              <w:spacing w:after="60"/>
+            </w:pPr>
+            <w:r>
+              <w:t xml:space="preserve">space then explosion</w:t>
+            </w:r>
+          </w:p>
+        </w:tc>
+      </w:tr>
+    </w:tbl>
+    <w:p>
+      <w:pPr>
+        <w:spacing w:after="160"/>
+      </w:pPr>
+    </w:p>
+    <w:p>
+      <w:pPr>
+        <w:spacing w:after="160"/>
+      </w:pPr>
+      <w:r>
+        <w:rPr>
+          <w:b/>
+          <w:bCs/>
+        </w:rPr>
+        <w:t xml:space="preserve">Count Basie (`basie`)</w:t>
+      </w:r>
+      <w:r>
+        <w:t xml:space="preserve"> remains wired with </w:t>
+      </w:r>
+      <w:r>
+        <w:rPr>
+          <w:b/>
+          <w:bCs/>
+        </w:rPr>
+        <w:t xml:space="preserve">`basieProofOfConcept`</w:t>
+      </w:r>
+      <w:r>
+        <w:t xml:space="preserve"> (lower chord/overall density, </w:t>
+      </w:r>
+      <w:r>
+        <w:rPr>
+          <w:b/>
+          <w:bCs/>
+        </w:rPr>
+        <w:t xml:space="preserve">90%</w:t>
+      </w:r>
+      <w:r>
+        <w:t xml:space="preserve"> functional harmony, </w:t>
+      </w:r>
+      <w:r>
+        <w:rPr>
+          <w:b/>
+          <w:bCs/>
+        </w:rPr>
+        <w:t xml:space="preserve">locked grid</w:t>
+      </w:r>
+      <w:r>
+        <w:t xml:space="preserve">, </w:t>
+      </w:r>
+      <w:r>
+        <w:rPr>
+          <w:b/>
+          <w:bCs/>
+        </w:rPr>
+        <w:t xml:space="preserve">clean separation</w:t>
+      </w:r>
+      <w:r>
+        <w:t xml:space="preserve">, riff-forward receipt — see </w:t>
+      </w:r>
+      <w:r>
+        <w:rPr>
+          <w:b/>
+          <w:bCs/>
+        </w:rPr>
+        <w:t xml:space="preserve">`bigBandEraResolver.ts`</w:t>
+      </w:r>
+      <w:r>
+        <w:t xml:space="preserve">).</w:t>
+      </w:r>
+    </w:p>
+    <w:p>
+      <w:pPr>
         <w:pStyle w:val="Heading1"/>
         <w:spacing w:after="120" w:before="200"/>
       </w:pPr>
@@ -18029,7 +19002,7 @@
         <w:spacing w:after="100" w:before="160"/>
       </w:pPr>
       <w:r>
-        <w:t xml:space="preserve">ARRANGER STYLES — KNOWN GAP</w:t>
+        <w:t xml:space="preserve">ARRANGER STYLES — partial wiring</w:t>
       </w:r>
     </w:p>
     <w:p>
@@ -18037,17 +19010,174 @@
         <w:spacing w:after="160"/>
       </w:pPr>
       <w:r>
-        <w:t xml:space="preserve">The arranger dropdown in </w:t>
-      </w:r>
-      <w:r>
-        <w:rPr>
-          <w:b/>
-          <w:bCs/>
-        </w:rPr>
-        <w:t xml:space="preserve">Big Band</w:t>
-      </w:r>
-      <w:r>
-        <w:t xml:space="preserve"> mode does not currently affect the generated music. The </w:t>
+        <w:rPr>
+          <w:b/>
+          <w:bCs/>
+        </w:rPr>
+        <w:t xml:space="preserve">Mapped to `composerStyle` (registry rules + tuning):</w:t>
+      </w:r>
+      <w:r>
+        <w:t xml:space="preserve"> </w:t>
+      </w:r>
+      <w:r>
+        <w:rPr>
+          <w:b/>
+          <w:bCs/>
+        </w:rPr>
+        <w:t xml:space="preserve">`basie`</w:t>
+      </w:r>
+      <w:r>
+        <w:t xml:space="preserve">, </w:t>
+      </w:r>
+      <w:r>
+        <w:rPr>
+          <w:b/>
+          <w:bCs/>
+        </w:rPr>
+        <w:t xml:space="preserve">`ellington`</w:t>
+      </w:r>
+      <w:r>
+        <w:t xml:space="preserve">, </w:t>
+      </w:r>
+      <w:r>
+        <w:rPr>
+          <w:b/>
+          <w:bCs/>
+        </w:rPr>
+        <w:t xml:space="preserve">`schneider`</w:t>
+      </w:r>
+      <w:r>
+        <w:t xml:space="preserve">, </w:t>
+      </w:r>
+      <w:r>
+        <w:rPr>
+          <w:b/>
+          <w:bCs/>
+        </w:rPr>
+        <w:t xml:space="preserve">`quincy_jones`</w:t>
+      </w:r>
+      <w:r>
+        <w:t xml:space="preserve"> via </w:t>
+      </w:r>
+      <w:r>
+        <w:rPr>
+          <w:b/>
+          <w:bCs/>
+        </w:rPr>
+        <w:t xml:space="preserve">`composerStyleFromArrangerStyle`</w:t>
+      </w:r>
+      <w:r>
+        <w:t xml:space="preserve"> in </w:t>
+      </w:r>
+      <w:r>
+        <w:rPr>
+          <w:b/>
+          <w:bCs/>
+        </w:rPr>
+        <w:t xml:space="preserve">`composerOsAppGeneration.ts`</w:t>
+      </w:r>
+      <w:r>
+        <w:t xml:space="preserve"> before </w:t>
+      </w:r>
+      <w:r>
+        <w:rPr>
+          <w:b/>
+          <w:bCs/>
+        </w:rPr>
+        <w:t xml:space="preserve">`runBigBandMode`</w:t>
+      </w:r>
+      <w:r>
+        <w:t xml:space="preserve"> / </w:t>
+      </w:r>
+      <w:r>
+        <w:rPr>
+          <w:b/>
+          <w:bCs/>
+        </w:rPr>
+        <w:t xml:space="preserve">`runBigBandRealisation`</w:t>
+      </w:r>
+      <w:r>
+        <w:t xml:space="preserve">.</w:t>
+      </w:r>
+    </w:p>
+    <w:p>
+      <w:pPr>
+        <w:spacing w:after="160"/>
+      </w:pPr>
+      <w:r>
+        <w:rPr>
+          <w:b/>
+          <w:bCs/>
+        </w:rPr>
+        <w:t xml:space="preserve">Structured profile receipts (`BigBandArrangerProfileReceiptV1` on `resolvedRules.tuning`):</w:t>
+      </w:r>
+      <w:r>
+        <w:t xml:space="preserve"> </w:t>
+      </w:r>
+      <w:r>
+        <w:rPr>
+          <w:b/>
+          <w:bCs/>
+        </w:rPr>
+        <w:t xml:space="preserve">Count Basie</w:t>
+      </w:r>
+      <w:r>
+        <w:t xml:space="preserve">, </w:t>
+      </w:r>
+      <w:r>
+        <w:rPr>
+          <w:b/>
+          <w:bCs/>
+        </w:rPr>
+        <w:t xml:space="preserve">Duke Ellington</w:t>
+      </w:r>
+      <w:r>
+        <w:t xml:space="preserve">, </w:t>
+      </w:r>
+      <w:r>
+        <w:rPr>
+          <w:b/>
+          <w:bCs/>
+        </w:rPr>
+        <w:t xml:space="preserve">Maria Schneider</w:t>
+      </w:r>
+      <w:r>
+        <w:t xml:space="preserve">, and </w:t>
+      </w:r>
+      <w:r>
+        <w:rPr>
+          <w:b/>
+          <w:bCs/>
+        </w:rPr>
+        <w:t xml:space="preserve">Quincy Jones</w:t>
+      </w:r>
+      <w:r>
+        <w:t xml:space="preserve"> — see </w:t>
+      </w:r>
+      <w:r>
+        <w:rPr>
+          <w:b/>
+          <w:bCs/>
+        </w:rPr>
+        <w:t xml:space="preserve">section 10 — Big Band arranger profiles (wired tuning receipts)</w:t>
+      </w:r>
+      <w:r>
+        <w:t xml:space="preserve">.</w:t>
+      </w:r>
+    </w:p>
+    <w:p>
+      <w:pPr>
+        <w:spacing w:after="160"/>
+      </w:pPr>
+      <w:r>
+        <w:rPr>
+          <w:b/>
+          <w:bCs/>
+        </w:rPr>
+        <w:t xml:space="preserve">Still UI-only for Big Band engine merge:</w:t>
+      </w:r>
+      <w:r>
+        <w:t xml:space="preserve"> other </w:t>
       </w:r>
       <w:r>
         <w:rPr>
@@ -18057,7 +19187,27 @@
         <w:t xml:space="preserve">`arrangerStyle`</w:t>
       </w:r>
       <w:r>
-        <w:t xml:space="preserve"> value from the UI is never mapped to </w:t>
+        <w:t xml:space="preserve"> ids (e.g. </w:t>
+      </w:r>
+      <w:r>
+        <w:rPr>
+          <w:b/>
+          <w:bCs/>
+        </w:rPr>
+        <w:t xml:space="preserve">Thad Jones</w:t>
+      </w:r>
+      <w:r>
+        <w:t xml:space="preserve">, Gil Evans, Nelson Riddle, …) do </w:t>
+      </w:r>
+      <w:r>
+        <w:rPr>
+          <w:b/>
+          <w:bCs/>
+        </w:rPr>
+        <w:t xml:space="preserve">not</w:t>
+      </w:r>
+      <w:r>
+        <w:t xml:space="preserve"> set </w:t>
       </w:r>
       <w:r>
         <w:rPr>
@@ -18067,7 +19217,37 @@
         <w:t xml:space="preserve">`composerStyle`</w:t>
       </w:r>
       <w:r>
-        <w:t xml:space="preserve"> before reaching the Big Band engine, so all arrangers produce identical output regardless of selection.</w:t>
+        <w:t xml:space="preserve">; they receive </w:t>
+      </w:r>
+      <w:r>
+        <w:rPr>
+          <w:b/>
+          <w:bCs/>
+        </w:rPr>
+        <w:t xml:space="preserve">era + foundational + functional</w:t>
+      </w:r>
+      <w:r>
+        <w:t xml:space="preserve"> rules only. Song Mode </w:t>
+      </w:r>
+      <w:r>
+        <w:rPr>
+          <w:b/>
+          <w:bCs/>
+        </w:rPr>
+        <w:t xml:space="preserve">style pairing</w:t>
+      </w:r>
+      <w:r>
+        <w:t xml:space="preserve"> may still reference those names for confidence / contrast metadata independently of Big Band </w:t>
+      </w:r>
+      <w:r>
+        <w:rPr>
+          <w:b/>
+          <w:bCs/>
+        </w:rPr>
+        <w:t xml:space="preserve">`composerStyle`</w:t>
+      </w:r>
+      <w:r>
+        <w:t xml:space="preserve">.</w:t>
       </w:r>
     </w:p>
     <w:p>
@@ -18075,150 +19255,34 @@
         <w:spacing w:after="160"/>
       </w:pPr>
       <w:r>
-        <w:t xml:space="preserve">Partial wiring exists for </w:t>
-      </w:r>
-      <w:r>
-        <w:rPr>
-          <w:b/>
-          <w:bCs/>
-        </w:rPr>
-        <w:t xml:space="preserve">four</w:t>
-      </w:r>
-      <w:r>
-        <w:t xml:space="preserve"> arrangers in </w:t>
-      </w:r>
-      <w:r>
-        <w:rPr>
-          <w:b/>
-          <w:bCs/>
-        </w:rPr>
-        <w:t xml:space="preserve">Song Mode pairing</w:t>
-      </w:r>
-      <w:r>
-        <w:t xml:space="preserve"> only (confidence scores, contrast nudges): </w:t>
-      </w:r>
-      <w:r>
-        <w:rPr>
-          <w:b/>
-          <w:bCs/>
-        </w:rPr>
-        <w:t xml:space="preserve">Ellington</w:t>
-      </w:r>
-      <w:r>
-        <w:t xml:space="preserve">, </w:t>
-      </w:r>
-      <w:r>
-        <w:rPr>
-          <w:b/>
-          <w:bCs/>
-        </w:rPr>
-        <w:t xml:space="preserve">Basie</w:t>
-      </w:r>
-      <w:r>
-        <w:t xml:space="preserve">, </w:t>
-      </w:r>
-      <w:r>
-        <w:rPr>
-          <w:b/>
-          <w:bCs/>
-        </w:rPr>
-        <w:t xml:space="preserve">Thad Jones</w:t>
-      </w:r>
-      <w:r>
-        <w:t xml:space="preserve">, </w:t>
-      </w:r>
-      <w:r>
-        <w:rPr>
-          <w:b/>
-          <w:bCs/>
-        </w:rPr>
-        <w:t xml:space="preserve">Maria Schneider</w:t>
-      </w:r>
-      <w:r>
-        <w:t xml:space="preserve">. The remaining </w:t>
-      </w:r>
-      <w:r>
-        <w:rPr>
-          <w:b/>
-          <w:bCs/>
-        </w:rPr>
-        <w:t xml:space="preserve">six</w:t>
-      </w:r>
-      <w:r>
-        <w:t xml:space="preserve"> studio arrangers are UI labels only.</w:t>
-      </w:r>
-    </w:p>
-    <w:p>
-      <w:pPr>
-        <w:spacing w:after="160"/>
-      </w:pPr>
-      <w:r>
-        <w:t xml:space="preserve">When returning to this: the fix requires </w:t>
-      </w:r>
-      <w:r>
-        <w:rPr>
-          <w:b/>
-          <w:bCs/>
-        </w:rPr>
-        <w:t xml:space="preserve">(1)</w:t>
-      </w:r>
-      <w:r>
-        <w:t xml:space="preserve"> a structural mapping of </w:t>
-      </w:r>
-      <w:r>
-        <w:rPr>
-          <w:b/>
-          <w:bCs/>
-        </w:rPr>
-        <w:t xml:space="preserve">`arrangerStyle` → `composerStyle`</w:t>
-      </w:r>
-      <w:r>
-        <w:t xml:space="preserve"> in </w:t>
-      </w:r>
-      <w:r>
-        <w:rPr>
-          <w:b/>
-          <w:bCs/>
-        </w:rPr>
-        <w:t xml:space="preserve">`composerOsAppGeneration.ts`</w:t>
-      </w:r>
-      <w:r>
-        <w:t xml:space="preserve"> before </w:t>
-      </w:r>
-      <w:r>
-        <w:rPr>
-          <w:b/>
-          <w:bCs/>
-        </w:rPr>
-        <w:t xml:space="preserve">`runBigBandMode`</w:t>
-      </w:r>
-      <w:r>
-        <w:t xml:space="preserve"> is called, and </w:t>
-      </w:r>
-      <w:r>
-        <w:rPr>
-          <w:b/>
-          <w:bCs/>
-        </w:rPr>
-        <w:t xml:space="preserve">(2)</w:t>
-      </w:r>
-      <w:r>
-        <w:t xml:space="preserve"> per-arranger research to define genuine musical distinctions for each one.</w:t>
-      </w:r>
-    </w:p>
-    <w:p>
-      <w:pPr>
-        <w:spacing w:after="160"/>
-      </w:pPr>
-      <w:r>
-        <w:rPr>
-          <w:b/>
-          <w:bCs/>
-        </w:rPr>
-        <w:t xml:space="preserve">Priority:</w:t>
-      </w:r>
-      <w:r>
-        <w:t xml:space="preserve"> low. Do not attempt until Big Band pipeline restructure is scoped as a dedicated workstream.</w:t>
+        <w:rPr>
+          <w:b/>
+          <w:bCs/>
+        </w:rPr>
+        <w:t xml:space="preserve">Follow-up:</w:t>
+      </w:r>
+      <w:r>
+        <w:t xml:space="preserve"> deeper per-arranger </w:t>
+      </w:r>
+      <w:r>
+        <w:rPr>
+          <w:b/>
+          <w:bCs/>
+        </w:rPr>
+        <w:t xml:space="preserve">scoring</w:t>
+      </w:r>
+      <w:r>
+        <w:t xml:space="preserve"> differentiation (beyond receipts + existing </w:t>
+      </w:r>
+      <w:r>
+        <w:rPr>
+          <w:b/>
+          <w:bCs/>
+        </w:rPr>
+        <w:t xml:space="preserve">`applyBigBandRules`</w:t>
+      </w:r>
+      <w:r>
+        <w:t xml:space="preserve"> hooks) remains roadmap scope when the Big Band pipeline is extended.</w:t>
       </w:r>
     </w:p>
     <w:p>

</xml_diff>

<commit_message>
feat: real Basie feature extraction and scoring; docs: Future Workstreams section, reorder arranger queue
Co-authored-by: Cursor <cursoragent@cursor.com>
</commit_message>
<xml_diff>
--- a/docs/COMPOSER_OS_PLAYBOOK.docx
+++ b/docs/COMPOSER_OS_PLAYBOOK.docx
@@ -18985,15 +18985,7 @@
         <w:spacing w:after="120" w:before="200"/>
       </w:pPr>
       <w:r>
-        <w:t xml:space="preserve">Known Architectural Gaps</w:t>
-      </w:r>
-    </w:p>
-    <w:p>
-      <w:pPr>
-        <w:spacing w:after="160"/>
-      </w:pPr>
-      <w:r>
-        <w:t xml:space="preserve">Documented limitations—do not mistake UI labels for fully wired engine behaviour until addressed.</w:t>
+        <w:t xml:space="preserve">Future Workstreams</w:t>
       </w:r>
     </w:p>
     <w:p>
@@ -19002,6 +18994,223 @@
         <w:spacing w:after="100" w:before="160"/>
       </w:pPr>
       <w:r>
+        <w:t xml:space="preserve">Afro-Cuban Big Band</w:t>
+      </w:r>
+    </w:p>
+    <w:p>
+      <w:pPr>
+        <w:spacing w:after="160"/>
+      </w:pPr>
+      <w:r>
+        <w:t xml:space="preserve">This is a dedicated future workstream, not an arranger profile addition. Requires new engine infrastructure: clave-driven rhythm layer, tumbao bass patterns, montuno piano logic, percussion section, and Cuban-specific horn phrasing. Do not attempt until evaluation system is fully wired and first four arrangers are auto-scoring.</w:t>
+      </w:r>
+    </w:p>
+    <w:p>
+      <w:pPr>
+        <w:spacing w:after="160"/>
+      </w:pPr>
+      <w:r>
+        <w:rPr>
+          <w:b/>
+          <w:bCs/>
+        </w:rPr>
+        <w:t xml:space="preserve">Reference resource:</w:t>
+      </w:r>
+      <w:r>
+        <w:t xml:space="preserve"> *Latin Arranging: Cuban Styles — Toshi Clinch Productions*</w:t>
+      </w:r>
+    </w:p>
+    <w:p>
+      <w:pPr>
+        <w:spacing w:after="160"/>
+      </w:pPr>
+      <w:r>
+        <w:rPr>
+          <w:b/>
+          <w:bCs/>
+        </w:rPr>
+        <w:t xml:space="preserve">Research prompt</w:t>
+      </w:r>
+      <w:r>
+        <w:t xml:space="preserve"> (saved for when this workstream opens):</w:t>
+      </w:r>
+    </w:p>
+    <w:p>
+      <w:pPr>
+        <w:spacing w:after="160"/>
+      </w:pPr>
+      <w:r>
+        <w:t xml:space="preserve">``` Use "Latin Arranging: Cuban Styles — Toshi Clinch Productions" as your sole reference for modeling Cuban big-band language in a composition engine.</w:t>
+      </w:r>
+    </w:p>
+    <w:p>
+      <w:pPr>
+        <w:spacing w:after="160"/>
+      </w:pPr>
+      <w:r>
+        <w:t xml:space="preserve">1. Identify the core arranging parameters that distinguish the following Cuban/Latin styles when orchestrated for big band: danzón, son, son montuno, mambo, cha-cha-chá, rumba (yambú, guaguancó, columbia), salsa, songo/timba.</w:t>
+      </w:r>
+    </w:p>
+    <w:p>
+      <w:pPr>
+        <w:spacing w:after="160"/>
+      </w:pPr>
+      <w:r>
+        <w:t xml:space="preserve">2. For each style, translate the course descriptions into specific numeric or categorical engine settings across these dimensions (tables only, no prose):</w:t>
+      </w:r>
+    </w:p>
+    <w:p>
+      <w:pPr>
+        <w:spacing w:after="80"/>
+        <w:ind w:left="360" w:hanging="260"/>
+      </w:pPr>
+      <w:r>
+        <w:t xml:space="preserve">• </w:t>
+      </w:r>
+      <w:r>
+        <w:t xml:space="preserve">Rhythmic grid: subdivision, tempo bands, straight vs swung, clave type, anticipated vs on-beat phrasing</w:t>
+      </w:r>
+    </w:p>
+    <w:p>
+      <w:pPr>
+        <w:spacing w:after="80"/>
+        <w:ind w:left="360" w:hanging="260"/>
+      </w:pPr>
+      <w:r>
+        <w:t xml:space="preserve">• </w:t>
+      </w:r>
+      <w:r>
+        <w:t xml:space="preserve">Percussion roles: mandatory instruments, default pattern families, ostinati vs variation tolerance</w:t>
+      </w:r>
+    </w:p>
+    <w:p>
+      <w:pPr>
+        <w:spacing w:after="80"/>
+        <w:ind w:left="360" w:hanging="260"/>
+      </w:pPr>
+      <w:r>
+        <w:t xml:space="preserve">• </w:t>
+      </w:r>
+      <w:r>
+        <w:t xml:space="preserve">Bass/tumbao: contour, syncopation slots, clave relationship, fill frequency</w:t>
+      </w:r>
+    </w:p>
+    <w:p>
+      <w:pPr>
+        <w:spacing w:after="80"/>
+        <w:ind w:left="360" w:hanging="260"/>
+      </w:pPr>
+      <w:r>
+        <w:t xml:space="preserve">• </w:t>
+      </w:r>
+      <w:r>
+        <w:t xml:space="preserve">Piano/montuno: density 1-5, pattern length, harmony type, repetition vs variation</w:t>
+      </w:r>
+    </w:p>
+    <w:p>
+      <w:pPr>
+        <w:spacing w:after="80"/>
+        <w:ind w:left="360" w:hanging="260"/>
+      </w:pPr>
+      <w:r>
+        <w:t xml:space="preserve">• </w:t>
+      </w:r>
+      <w:r>
+        <w:t xml:space="preserve">Horn phrasing: clave alignment, phrase lengths in clave cycles, riff vs melodic line balance</w:t>
+      </w:r>
+    </w:p>
+    <w:p>
+      <w:pPr>
+        <w:spacing w:after="80"/>
+        <w:ind w:left="360" w:hanging="260"/>
+      </w:pPr>
+      <w:r>
+        <w:t xml:space="preserve">• </w:t>
+      </w:r>
+      <w:r>
+        <w:t xml:space="preserve">Harmony: extension level, functional vs modal %, reharmonization tolerance</w:t>
+      </w:r>
+    </w:p>
+    <w:p>
+      <w:pPr>
+        <w:spacing w:after="160"/>
+      </w:pPr>
+      <w:r>
+        <w:t xml:space="preserve">3. From the development arc (contradanza → danzón → son → mambo → salsa → songo/timba), give:</w:t>
+      </w:r>
+    </w:p>
+    <w:p>
+      <w:pPr>
+        <w:spacing w:after="80"/>
+        <w:ind w:left="360" w:hanging="260"/>
+      </w:pPr>
+      <w:r>
+        <w:t xml:space="preserve">• </w:t>
+      </w:r>
+      <w:r>
+        <w:t xml:space="preserve">Interpolation ranges for adjacent style pairs</w:t>
+      </w:r>
+    </w:p>
+    <w:p>
+      <w:pPr>
+        <w:spacing w:after="80"/>
+        <w:ind w:left="360" w:hanging="260"/>
+      </w:pPr>
+      <w:r>
+        <w:t xml:space="preserve">• </w:t>
+      </w:r>
+      <w:r>
+        <w:t xml:space="preserve">Hard constraints where changing a parameter instantly breaks authenticity</w:t>
+      </w:r>
+    </w:p>
+    <w:p>
+      <w:pPr>
+        <w:spacing w:after="160"/>
+      </w:pPr>
+      <w:r>
+        <w:t xml:space="preserve">4. Output as one summary table per style and one morphing matrix table. No history, no performance advice — generative rules only. ```</w:t>
+      </w:r>
+    </w:p>
+    <w:p>
+      <w:pPr>
+        <w:pStyle w:val="Heading2"/>
+        <w:spacing w:after="100" w:before="160"/>
+      </w:pPr>
+      <w:r>
+        <w:t xml:space="preserve">Odd-Meter / Rock-Inflected Big Band</w:t>
+      </w:r>
+    </w:p>
+    <w:p>
+      <w:pPr>
+        <w:spacing w:after="160"/>
+      </w:pPr>
+      <w:r>
+        <w:t xml:space="preserve">Distinct musical language covering meter systems fundamentally different from classic swing. Reference arrangers: Don Ellis, Darcy James Argue, John Hollenbeck. Do not attempt until Cuban workstream is scoped. Requires new metric grid logic and rock-inflected rhythm section behaviour.</w:t>
+      </w:r>
+    </w:p>
+    <w:p>
+      <w:pPr>
+        <w:pStyle w:val="Heading1"/>
+        <w:spacing w:after="120" w:before="200"/>
+      </w:pPr>
+      <w:r>
+        <w:t xml:space="preserve">Known Architectural Gaps</w:t>
+      </w:r>
+    </w:p>
+    <w:p>
+      <w:pPr>
+        <w:spacing w:after="160"/>
+      </w:pPr>
+      <w:r>
+        <w:t xml:space="preserve">Documented limitations—do not mistake UI labels for fully wired engine behaviour until addressed.</w:t>
+      </w:r>
+    </w:p>
+    <w:p>
+      <w:pPr>
+        <w:pStyle w:val="Heading2"/>
+        <w:spacing w:after="100" w:before="160"/>
+      </w:pPr>
+      <w:r>
         <w:t xml:space="preserve">ARRANGER STYLES — partial wiring</w:t>
       </w:r>
     </w:p>
@@ -19187,17 +19396,7 @@
         <w:t xml:space="preserve">`arrangerStyle`</w:t>
       </w:r>
       <w:r>
-        <w:t xml:space="preserve"> ids (e.g. </w:t>
-      </w:r>
-      <w:r>
-        <w:rPr>
-          <w:b/>
-          <w:bCs/>
-        </w:rPr>
-        <w:t xml:space="preserve">Thad Jones</w:t>
-      </w:r>
-      <w:r>
-        <w:t xml:space="preserve">, Gil Evans, Nelson Riddle, …) do </w:t>
+        <w:t xml:space="preserve"> ids do </w:t>
       </w:r>
       <w:r>
         <w:rPr>
@@ -19227,7 +19426,33 @@
         <w:t xml:space="preserve">era + foundational + functional</w:t>
       </w:r>
       <w:r>
-        <w:t xml:space="preserve"> rules only. Song Mode </w:t>
+        <w:t xml:space="preserve"> rules only. </w:t>
+      </w:r>
+      <w:r>
+        <w:rPr>
+          <w:b/>
+          <w:bCs/>
+        </w:rPr>
+        <w:t xml:space="preserve">Planned arranger wiring priority</w:t>
+      </w:r>
+      <w:r>
+        <w:t xml:space="preserve"> (when the pipeline extends):</w:t>
+      </w:r>
+    </w:p>
+    <w:p>
+      <w:pPr>
+        <w:spacing w:after="160"/>
+      </w:pPr>
+      <w:r>
+        <w:t xml:space="preserve">1. Thad Jones 2. Gil Evans 3. Bob Brookmeyer 4. Clare Fischer 5. Oliver Nelson 6. Sammy Nestico</w:t>
+      </w:r>
+    </w:p>
+    <w:p>
+      <w:pPr>
+        <w:spacing w:after="160"/>
+      </w:pPr>
+      <w:r>
+        <w:t xml:space="preserve">Song Mode </w:t>
       </w:r>
       <w:r>
         <w:rPr>

</xml_diff>

<commit_message>
feat: complete evaluation system — combined evaluator, Ellington/Schneider/Quincy profiles, pipeline wiring, playbook documentation
Co-authored-by: Cursor <cursoragent@cursor.com>
</commit_message>
<xml_diff>
--- a/docs/COMPOSER_OS_PLAYBOOK.docx
+++ b/docs/COMPOSER_OS_PLAYBOOK.docx
@@ -18977,6 +18977,2063 @@
       </w:r>
       <w:r>
         <w:t xml:space="preserve"> when stacking experiments.</w:t>
+      </w:r>
+    </w:p>
+    <w:p>
+      <w:pPr>
+        <w:pStyle w:val="Heading1"/>
+        <w:spacing w:after="120" w:before="200"/>
+      </w:pPr>
+      <w:r>
+        <w:t xml:space="preserve">Evaluation System</w:t>
+      </w:r>
+    </w:p>
+    <w:p>
+      <w:pPr>
+        <w:spacing w:after="160"/>
+      </w:pPr>
+      <w:r>
+        <w:t xml:space="preserve">Composer OS embeds a layered </w:t>
+      </w:r>
+      <w:r>
+        <w:rPr>
+          <w:b/>
+          <w:bCs/>
+        </w:rPr>
+        <w:t xml:space="preserve">evaluation</w:t>
+      </w:r>
+      <w:r>
+        <w:t xml:space="preserve"> stack used for </w:t>
+      </w:r>
+      <w:r>
+        <w:rPr>
+          <w:b/>
+          <w:bCs/>
+        </w:rPr>
+        <w:t xml:space="preserve">observational receipts</w:t>
+      </w:r>
+      <w:r>
+        <w:t xml:space="preserve"> (especially Big Band): extract features from a </w:t>
+      </w:r>
+      <w:r>
+        <w:rPr>
+          <w:b/>
+          <w:bCs/>
+        </w:rPr>
+        <w:t xml:space="preserve">`ScoreModel`</w:t>
+      </w:r>
+      <w:r>
+        <w:t xml:space="preserve">, score </w:t>
+      </w:r>
+      <w:r>
+        <w:rPr>
+          <w:b/>
+          <w:bCs/>
+        </w:rPr>
+        <w:t xml:space="preserve">GCE</w:t>
+      </w:r>
+      <w:r>
+        <w:t xml:space="preserve"> (10 categories), score a </w:t>
+      </w:r>
+      <w:r>
+        <w:rPr>
+          <w:b/>
+          <w:bCs/>
+        </w:rPr>
+        <w:t xml:space="preserve">style profile</w:t>
+      </w:r>
+      <w:r>
+        <w:t xml:space="preserve"> (Basie / Ellington / Schneider / Quincy), run </w:t>
+      </w:r>
+      <w:r>
+        <w:rPr>
+          <w:b/>
+          <w:bCs/>
+        </w:rPr>
+        <w:t xml:space="preserve">LOCK</w:t>
+      </w:r>
+      <w:r>
+        <w:t xml:space="preserve"> gates, optionally combine into a single </w:t>
+      </w:r>
+      <w:r>
+        <w:rPr>
+          <w:b/>
+          <w:bCs/>
+        </w:rPr>
+        <w:t xml:space="preserve">`CombinedEvaluationResult`</w:t>
+      </w:r>
+      <w:r>
+        <w:t xml:space="preserve">. </w:t>
+      </w:r>
+      <w:r>
+        <w:rPr>
+          <w:b/>
+          <w:bCs/>
+        </w:rPr>
+        <w:t xml:space="preserve">DCR</w:t>
+      </w:r>
+      <w:r>
+        <w:t xml:space="preserve"> (Design → Commit → Refine) is available for candidate workflows; it is separate from the golden-path Generate pipeline unless wired explicitly.</w:t>
+      </w:r>
+    </w:p>
+    <w:p>
+      <w:pPr>
+        <w:pStyle w:val="Heading2"/>
+        <w:spacing w:after="100" w:before="160"/>
+      </w:pPr>
+      <w:r>
+        <w:t xml:space="preserve">Overview</w:t>
+      </w:r>
+    </w:p>
+    <w:tbl>
+      <w:tblPr>
+        <w:tblW w:type="pct" w:w="100%"/>
+        <w:tblBorders>
+          <w:top w:val="single" w:color="auto" w:sz="4"/>
+          <w:left w:val="single" w:color="auto" w:sz="4"/>
+          <w:bottom w:val="single" w:color="auto" w:sz="4"/>
+          <w:right w:val="single" w:color="auto" w:sz="4"/>
+          <w:insideH w:val="single" w:color="auto" w:sz="4"/>
+          <w:insideV w:val="single" w:color="auto" w:sz="4"/>
+        </w:tblBorders>
+      </w:tblPr>
+      <w:tblGrid>
+        <w:gridCol w:w="4500"/>
+        <w:gridCol w:w="4500"/>
+      </w:tblGrid>
+      <w:tr>
+        <w:tc>
+          <w:tcPr>
+            <w:tcW w:type="pct" w:w="4500%"/>
+          </w:tcPr>
+          <w:p>
+            <w:pPr>
+              <w:spacing w:after="60"/>
+            </w:pPr>
+            <w:r>
+              <w:t xml:space="preserve">Layer</w:t>
+            </w:r>
+          </w:p>
+        </w:tc>
+        <w:tc>
+          <w:tcPr>
+            <w:tcW w:type="pct" w:w="4500%"/>
+          </w:tcPr>
+          <w:p>
+            <w:pPr>
+              <w:spacing w:after="60"/>
+            </w:pPr>
+            <w:r>
+              <w:t xml:space="preserve">Role</w:t>
+            </w:r>
+          </w:p>
+        </w:tc>
+      </w:tr>
+      <w:tr>
+        <w:tc>
+          <w:tcPr>
+            <w:tcW w:type="pct" w:w="4500%"/>
+          </w:tcPr>
+          <w:p>
+            <w:pPr>
+              <w:spacing w:after="60"/>
+            </w:pPr>
+            <w:r>
+              <w:rPr>
+                <w:b/>
+                <w:bCs/>
+              </w:rPr>
+              <w:t xml:space="preserve">Feature extraction</w:t>
+            </w:r>
+          </w:p>
+        </w:tc>
+        <w:tc>
+          <w:tcPr>
+            <w:tcW w:type="pct" w:w="4500%"/>
+          </w:tcPr>
+          <w:p>
+            <w:pPr>
+              <w:spacing w:after="60"/>
+            </w:pPr>
+            <w:r>
+              <w:t xml:space="preserve">`scoreModelFeatureExtractor` — `orchestration`, `formal`, `rhythmic` metrics from </w:t>
+            </w:r>
+            <w:r>
+              <w:rPr>
+                <w:b/>
+                <w:bCs/>
+              </w:rPr>
+              <w:t xml:space="preserve">`sourceFormat: scoreModel`</w:t>
+            </w:r>
+          </w:p>
+        </w:tc>
+      </w:tr>
+      <w:tr>
+        <w:tc>
+          <w:tcPr>
+            <w:tcW w:type="pct" w:w="4500%"/>
+          </w:tcPr>
+          <w:p>
+            <w:pPr>
+              <w:spacing w:after="60"/>
+            </w:pPr>
+            <w:r>
+              <w:rPr>
+                <w:b/>
+                <w:bCs/>
+              </w:rPr>
+              <w:t xml:space="preserve">GCE</w:t>
+            </w:r>
+          </w:p>
+        </w:tc>
+        <w:tc>
+          <w:tcPr>
+            <w:tcW w:type="pct" w:w="4500%"/>
+          </w:tcPr>
+          <w:p>
+            <w:pPr>
+              <w:spacing w:after="60"/>
+            </w:pPr>
+            <w:r>
+              <w:t xml:space="preserve">`evaluateGce` — 0–10 category scores × weights → </w:t>
+            </w:r>
+            <w:r>
+              <w:rPr>
+                <w:b/>
+                <w:bCs/>
+              </w:rPr>
+              <w:t xml:space="preserve">`gce.finalScore`</w:t>
+            </w:r>
+          </w:p>
+        </w:tc>
+      </w:tr>
+      <w:tr>
+        <w:tc>
+          <w:tcPr>
+            <w:tcW w:type="pct" w:w="4500%"/>
+          </w:tcPr>
+          <w:p>
+            <w:pPr>
+              <w:spacing w:after="60"/>
+            </w:pPr>
+            <w:r>
+              <w:rPr>
+                <w:b/>
+                <w:bCs/>
+              </w:rPr>
+              <w:t xml:space="preserve">Style profile</w:t>
+            </w:r>
+          </w:p>
+        </w:tc>
+        <w:tc>
+          <w:tcPr>
+            <w:tcW w:type="pct" w:w="4500%"/>
+          </w:tcPr>
+          <w:p>
+            <w:pPr>
+              <w:spacing w:after="60"/>
+            </w:pPr>
+            <w:r>
+              <w:t xml:space="preserve">`StyleProfile.score` — dimension scores × weights → </w:t>
+            </w:r>
+            <w:r>
+              <w:rPr>
+                <w:b/>
+                <w:bCs/>
+              </w:rPr>
+              <w:t xml:space="preserve">`style.finalStyleScore`</w:t>
+            </w:r>
+          </w:p>
+        </w:tc>
+      </w:tr>
+      <w:tr>
+        <w:tc>
+          <w:tcPr>
+            <w:tcW w:type="pct" w:w="4500%"/>
+          </w:tcPr>
+          <w:p>
+            <w:pPr>
+              <w:spacing w:after="60"/>
+            </w:pPr>
+            <w:r>
+              <w:rPr>
+                <w:b/>
+                <w:bCs/>
+              </w:rPr>
+              <w:t xml:space="preserve">LOCK</w:t>
+            </w:r>
+          </w:p>
+        </w:tc>
+        <w:tc>
+          <w:tcPr>
+            <w:tcW w:type="pct" w:w="4500%"/>
+          </w:tcPr>
+          <w:p>
+            <w:pPr>
+              <w:spacing w:after="60"/>
+            </w:pPr>
+            <w:r>
+              <w:t xml:space="preserve">`evaluateLock` — hard gates on XML presence, bar count, harmony presence, repetition / swing extremes, register</w:t>
+            </w:r>
+          </w:p>
+        </w:tc>
+      </w:tr>
+      <w:tr>
+        <w:tc>
+          <w:tcPr>
+            <w:tcW w:type="pct" w:w="4500%"/>
+          </w:tcPr>
+          <w:p>
+            <w:pPr>
+              <w:spacing w:after="60"/>
+            </w:pPr>
+            <w:r>
+              <w:rPr>
+                <w:b/>
+                <w:bCs/>
+              </w:rPr>
+              <w:t xml:space="preserve">Combined</w:t>
+            </w:r>
+          </w:p>
+        </w:tc>
+        <w:tc>
+          <w:tcPr>
+            <w:tcW w:type="pct" w:w="4500%"/>
+          </w:tcPr>
+          <w:p>
+            <w:pPr>
+              <w:spacing w:after="60"/>
+            </w:pPr>
+            <w:r>
+              <w:t xml:space="preserve">`createCombinedEvaluator().evaluate` — blends GCE + style; respects </w:t>
+            </w:r>
+            <w:r>
+              <w:rPr>
+                <w:b/>
+                <w:bCs/>
+              </w:rPr>
+              <w:t xml:space="preserve">`lockRequired`</w:t>
+            </w:r>
+          </w:p>
+        </w:tc>
+      </w:tr>
+      <w:tr>
+        <w:tc>
+          <w:tcPr>
+            <w:tcW w:type="pct" w:w="4500%"/>
+          </w:tcPr>
+          <w:p>
+            <w:pPr>
+              <w:spacing w:after="60"/>
+            </w:pPr>
+            <w:r>
+              <w:rPr>
+                <w:b/>
+                <w:bCs/>
+              </w:rPr>
+              <w:t xml:space="preserve">DCR</w:t>
+            </w:r>
+          </w:p>
+        </w:tc>
+        <w:tc>
+          <w:tcPr>
+            <w:tcW w:type="pct" w:w="4500%"/>
+          </w:tcPr>
+          <w:p>
+            <w:pPr>
+              <w:spacing w:after="60"/>
+            </w:pPr>
+            <w:r>
+              <w:t xml:space="preserve">`runDcrProtocol` — multi-candidate design, optional </w:t>
+            </w:r>
+            <w:r>
+              <w:rPr>
+                <w:b/>
+                <w:bCs/>
+              </w:rPr>
+              <w:t xml:space="preserve">single</w:t>
+            </w:r>
+            <w:r>
+              <w:t xml:space="preserve"> refinement pass</w:t>
+            </w:r>
+          </w:p>
+        </w:tc>
+      </w:tr>
+    </w:tbl>
+    <w:p>
+      <w:pPr>
+        <w:spacing w:after="160"/>
+      </w:pPr>
+    </w:p>
+    <w:p>
+      <w:pPr>
+        <w:pStyle w:val="Heading2"/>
+        <w:spacing w:after="100" w:before="160"/>
+      </w:pPr>
+      <w:r>
+        <w:t xml:space="preserve">GCE (10 categories + default weights)</w:t>
+      </w:r>
+    </w:p>
+    <w:p>
+      <w:pPr>
+        <w:spacing w:after="160"/>
+      </w:pPr>
+      <w:r>
+        <w:t xml:space="preserve">Default weights (</w:t>
+      </w:r>
+      <w:r>
+        <w:rPr>
+          <w:b/>
+          <w:bCs/>
+        </w:rPr>
+        <w:t xml:space="preserve">`defaultGceWeights`</w:t>
+      </w:r>
+      <w:r>
+        <w:t xml:space="preserve"> in </w:t>
+      </w:r>
+      <w:r>
+        <w:rPr>
+          <w:b/>
+          <w:bCs/>
+        </w:rPr>
+        <w:t xml:space="preserve">`gceEvaluator.ts`</w:t>
+      </w:r>
+      <w:r>
+        <w:t xml:space="preserve">) — must sum to </w:t>
+      </w:r>
+      <w:r>
+        <w:rPr>
+          <w:b/>
+          <w:bCs/>
+        </w:rPr>
+        <w:t xml:space="preserve">1.0</w:t>
+      </w:r>
+      <w:r>
+        <w:t xml:space="preserve">:</w:t>
+      </w:r>
+    </w:p>
+    <w:tbl>
+      <w:tblPr>
+        <w:tblW w:type="pct" w:w="100%"/>
+        <w:tblBorders>
+          <w:top w:val="single" w:color="auto" w:sz="4"/>
+          <w:left w:val="single" w:color="auto" w:sz="4"/>
+          <w:bottom w:val="single" w:color="auto" w:sz="4"/>
+          <w:right w:val="single" w:color="auto" w:sz="4"/>
+          <w:insideH w:val="single" w:color="auto" w:sz="4"/>
+          <w:insideV w:val="single" w:color="auto" w:sz="4"/>
+        </w:tblBorders>
+      </w:tblPr>
+      <w:tblGrid>
+        <w:gridCol w:w="4500"/>
+        <w:gridCol w:w="4500"/>
+      </w:tblGrid>
+      <w:tr>
+        <w:tc>
+          <w:tcPr>
+            <w:tcW w:type="pct" w:w="4500%"/>
+          </w:tcPr>
+          <w:p>
+            <w:pPr>
+              <w:spacing w:after="60"/>
+            </w:pPr>
+            <w:r>
+              <w:t xml:space="preserve">Category</w:t>
+            </w:r>
+          </w:p>
+        </w:tc>
+        <w:tc>
+          <w:tcPr>
+            <w:tcW w:type="pct" w:w="4500%"/>
+          </w:tcPr>
+          <w:p>
+            <w:pPr>
+              <w:spacing w:after="60"/>
+            </w:pPr>
+            <w:r>
+              <w:t xml:space="preserve">Weight</w:t>
+            </w:r>
+          </w:p>
+        </w:tc>
+      </w:tr>
+      <w:tr>
+        <w:tc>
+          <w:tcPr>
+            <w:tcW w:type="pct" w:w="4500%"/>
+          </w:tcPr>
+          <w:p>
+            <w:pPr>
+              <w:spacing w:after="60"/>
+            </w:pPr>
+            <w:r>
+              <w:t xml:space="preserve">cadentialClarity</w:t>
+            </w:r>
+          </w:p>
+        </w:tc>
+        <w:tc>
+          <w:tcPr>
+            <w:tcW w:type="pct" w:w="4500%"/>
+          </w:tcPr>
+          <w:p>
+            <w:pPr>
+              <w:spacing w:after="60"/>
+            </w:pPr>
+            <w:r>
+              <w:t xml:space="preserve">0.10</w:t>
+            </w:r>
+          </w:p>
+        </w:tc>
+      </w:tr>
+      <w:tr>
+        <w:tc>
+          <w:tcPr>
+            <w:tcW w:type="pct" w:w="4500%"/>
+          </w:tcPr>
+          <w:p>
+            <w:pPr>
+              <w:spacing w:after="60"/>
+            </w:pPr>
+            <w:r>
+              <w:t xml:space="preserve">melodicIdentity</w:t>
+            </w:r>
+          </w:p>
+        </w:tc>
+        <w:tc>
+          <w:tcPr>
+            <w:tcW w:type="pct" w:w="4500%"/>
+          </w:tcPr>
+          <w:p>
+            <w:pPr>
+              <w:spacing w:after="60"/>
+            </w:pPr>
+            <w:r>
+              <w:t xml:space="preserve">0.12</w:t>
+            </w:r>
+          </w:p>
+        </w:tc>
+      </w:tr>
+      <w:tr>
+        <w:tc>
+          <w:tcPr>
+            <w:tcW w:type="pct" w:w="4500%"/>
+          </w:tcPr>
+          <w:p>
+            <w:pPr>
+              <w:spacing w:after="60"/>
+            </w:pPr>
+            <w:r>
+              <w:t xml:space="preserve">phraseGrammar</w:t>
+            </w:r>
+          </w:p>
+        </w:tc>
+        <w:tc>
+          <w:tcPr>
+            <w:tcW w:type="pct" w:w="4500%"/>
+          </w:tcPr>
+          <w:p>
+            <w:pPr>
+              <w:spacing w:after="60"/>
+            </w:pPr>
+            <w:r>
+              <w:t xml:space="preserve">0.10</w:t>
+            </w:r>
+          </w:p>
+        </w:tc>
+      </w:tr>
+      <w:tr>
+        <w:tc>
+          <w:tcPr>
+            <w:tcW w:type="pct" w:w="4500%"/>
+          </w:tcPr>
+          <w:p>
+            <w:pPr>
+              <w:spacing w:after="60"/>
+            </w:pPr>
+            <w:r>
+              <w:t xml:space="preserve">harmonyAndLanguage</w:t>
+            </w:r>
+          </w:p>
+        </w:tc>
+        <w:tc>
+          <w:tcPr>
+            <w:tcW w:type="pct" w:w="4500%"/>
+          </w:tcPr>
+          <w:p>
+            <w:pPr>
+              <w:spacing w:after="60"/>
+            </w:pPr>
+            <w:r>
+              <w:t xml:space="preserve">0.12</w:t>
+            </w:r>
+          </w:p>
+        </w:tc>
+      </w:tr>
+      <w:tr>
+        <w:tc>
+          <w:tcPr>
+            <w:tcW w:type="pct" w:w="4500%"/>
+          </w:tcPr>
+          <w:p>
+            <w:pPr>
+              <w:spacing w:after="60"/>
+            </w:pPr>
+            <w:r>
+              <w:t xml:space="preserve">rhythmicIdentity</w:t>
+            </w:r>
+          </w:p>
+        </w:tc>
+        <w:tc>
+          <w:tcPr>
+            <w:tcW w:type="pct" w:w="4500%"/>
+          </w:tcPr>
+          <w:p>
+            <w:pPr>
+              <w:spacing w:after="60"/>
+            </w:pPr>
+            <w:r>
+              <w:t xml:space="preserve">0.12</w:t>
+            </w:r>
+          </w:p>
+        </w:tc>
+      </w:tr>
+      <w:tr>
+        <w:tc>
+          <w:tcPr>
+            <w:tcW w:type="pct" w:w="4500%"/>
+          </w:tcPr>
+          <w:p>
+            <w:pPr>
+              <w:spacing w:after="60"/>
+            </w:pPr>
+            <w:r>
+              <w:t xml:space="preserve">structureAndForm</w:t>
+            </w:r>
+          </w:p>
+        </w:tc>
+        <w:tc>
+          <w:tcPr>
+            <w:tcW w:type="pct" w:w="4500%"/>
+          </w:tcPr>
+          <w:p>
+            <w:pPr>
+              <w:spacing w:after="60"/>
+            </w:pPr>
+            <w:r>
+              <w:t xml:space="preserve">0.10</w:t>
+            </w:r>
+          </w:p>
+        </w:tc>
+      </w:tr>
+      <w:tr>
+        <w:tc>
+          <w:tcPr>
+            <w:tcW w:type="pct" w:w="4500%"/>
+          </w:tcPr>
+          <w:p>
+            <w:pPr>
+              <w:spacing w:after="60"/>
+            </w:pPr>
+            <w:r>
+              <w:t xml:space="preserve">arrangementAndOrchestration</w:t>
+            </w:r>
+          </w:p>
+        </w:tc>
+        <w:tc>
+          <w:tcPr>
+            <w:tcW w:type="pct" w:w="4500%"/>
+          </w:tcPr>
+          <w:p>
+            <w:pPr>
+              <w:spacing w:after="60"/>
+            </w:pPr>
+            <w:r>
+              <w:t xml:space="preserve">0.10</w:t>
+            </w:r>
+          </w:p>
+        </w:tc>
+      </w:tr>
+      <w:tr>
+        <w:tc>
+          <w:tcPr>
+            <w:tcW w:type="pct" w:w="4500%"/>
+          </w:tcPr>
+          <w:p>
+            <w:pPr>
+              <w:spacing w:after="60"/>
+            </w:pPr>
+            <w:r>
+              <w:t xml:space="preserve">economyAndFocus</w:t>
+            </w:r>
+          </w:p>
+        </w:tc>
+        <w:tc>
+          <w:tcPr>
+            <w:tcW w:type="pct" w:w="4500%"/>
+          </w:tcPr>
+          <w:p>
+            <w:pPr>
+              <w:spacing w:after="60"/>
+            </w:pPr>
+            <w:r>
+              <w:t xml:space="preserve">0.08</w:t>
+            </w:r>
+          </w:p>
+        </w:tc>
+      </w:tr>
+      <w:tr>
+        <w:tc>
+          <w:tcPr>
+            <w:tcW w:type="pct" w:w="4500%"/>
+          </w:tcPr>
+          <w:p>
+            <w:pPr>
+              <w:spacing w:after="60"/>
+            </w:pPr>
+            <w:r>
+              <w:t xml:space="preserve">tensionAndRelease</w:t>
+            </w:r>
+          </w:p>
+        </w:tc>
+        <w:tc>
+          <w:tcPr>
+            <w:tcW w:type="pct" w:w="4500%"/>
+          </w:tcPr>
+          <w:p>
+            <w:pPr>
+              <w:spacing w:after="60"/>
+            </w:pPr>
+            <w:r>
+              <w:t xml:space="preserve">0.08</w:t>
+            </w:r>
+          </w:p>
+        </w:tc>
+      </w:tr>
+      <w:tr>
+        <w:tc>
+          <w:tcPr>
+            <w:tcW w:type="pct" w:w="4500%"/>
+          </w:tcPr>
+          <w:p>
+            <w:pPr>
+              <w:spacing w:after="60"/>
+            </w:pPr>
+            <w:r>
+              <w:t xml:space="preserve">thematicRecallPotential</w:t>
+            </w:r>
+          </w:p>
+        </w:tc>
+        <w:tc>
+          <w:tcPr>
+            <w:tcW w:type="pct" w:w="4500%"/>
+          </w:tcPr>
+          <w:p>
+            <w:pPr>
+              <w:spacing w:after="60"/>
+            </w:pPr>
+            <w:r>
+              <w:t xml:space="preserve">0.08</w:t>
+            </w:r>
+          </w:p>
+        </w:tc>
+      </w:tr>
+    </w:tbl>
+    <w:p>
+      <w:pPr>
+        <w:spacing w:after="160"/>
+      </w:pPr>
+    </w:p>
+    <w:p>
+      <w:pPr>
+        <w:spacing w:after="160"/>
+      </w:pPr>
+      <w:r>
+        <w:t xml:space="preserve">Placeholder scoring is still </w:t>
+      </w:r>
+      <w:r>
+        <w:rPr>
+          <w:b/>
+          <w:bCs/>
+        </w:rPr>
+        <w:t xml:space="preserve">5.0</w:t>
+      </w:r>
+      <w:r>
+        <w:t xml:space="preserve"> per category until feature-linked GCE logic lands.</w:t>
+      </w:r>
+    </w:p>
+    <w:p>
+      <w:pPr>
+        <w:pStyle w:val="Heading2"/>
+        <w:spacing w:after="100" w:before="160"/>
+      </w:pPr>
+      <w:r>
+        <w:t xml:space="preserve">LOCK (6 gates)</w:t>
+      </w:r>
+    </w:p>
+    <w:tbl>
+      <w:tblPr>
+        <w:tblW w:type="pct" w:w="100%"/>
+        <w:tblBorders>
+          <w:top w:val="single" w:color="auto" w:sz="4"/>
+          <w:left w:val="single" w:color="auto" w:sz="4"/>
+          <w:bottom w:val="single" w:color="auto" w:sz="4"/>
+          <w:right w:val="single" w:color="auto" w:sz="4"/>
+          <w:insideH w:val="single" w:color="auto" w:sz="4"/>
+          <w:insideV w:val="single" w:color="auto" w:sz="4"/>
+        </w:tblBorders>
+      </w:tblPr>
+      <w:tblGrid>
+        <w:gridCol w:w="3000"/>
+        <w:gridCol w:w="3000"/>
+        <w:gridCol w:w="3000"/>
+      </w:tblGrid>
+      <w:tr>
+        <w:tc>
+          <w:tcPr>
+            <w:tcW w:type="pct" w:w="3000%"/>
+          </w:tcPr>
+          <w:p>
+            <w:pPr>
+              <w:spacing w:after="60"/>
+            </w:pPr>
+            <w:r>
+              <w:t xml:space="preserve">Gate id</w:t>
+            </w:r>
+          </w:p>
+        </w:tc>
+        <w:tc>
+          <w:tcPr>
+            <w:tcW w:type="pct" w:w="3000%"/>
+          </w:tcPr>
+          <w:p>
+            <w:pPr>
+              <w:spacing w:after="60"/>
+            </w:pPr>
+            <w:r>
+              <w:t xml:space="preserve">Severity</w:t>
+            </w:r>
+          </w:p>
+        </w:tc>
+        <w:tc>
+          <w:tcPr>
+            <w:tcW w:type="pct" w:w="3000%"/>
+          </w:tcPr>
+          <w:p>
+            <w:pPr>
+              <w:spacing w:after="60"/>
+            </w:pPr>
+            <w:r>
+              <w:t xml:space="preserve">Check</w:t>
+            </w:r>
+          </w:p>
+        </w:tc>
+      </w:tr>
+      <w:tr>
+        <w:tc>
+          <w:tcPr>
+            <w:tcW w:type="pct" w:w="3000%"/>
+          </w:tcPr>
+          <w:p>
+            <w:pPr>
+              <w:spacing w:after="60"/>
+            </w:pPr>
+            <w:r>
+              <w:rPr>
+                <w:b/>
+                <w:bCs/>
+              </w:rPr>
+              <w:t xml:space="preserve">xmlValidity</w:t>
+            </w:r>
+          </w:p>
+        </w:tc>
+        <w:tc>
+          <w:tcPr>
+            <w:tcW w:type="pct" w:w="3000%"/>
+          </w:tcPr>
+          <w:p>
+            <w:pPr>
+              <w:spacing w:after="60"/>
+            </w:pPr>
+            <w:r>
+              <w:t xml:space="preserve">critical</w:t>
+            </w:r>
+          </w:p>
+        </w:tc>
+        <w:tc>
+          <w:tcPr>
+            <w:tcW w:type="pct" w:w="3000%"/>
+          </w:tcPr>
+          <w:p>
+            <w:pPr>
+              <w:spacing w:after="60"/>
+            </w:pPr>
+            <w:r>
+              <w:t xml:space="preserve">Output is not </w:t>
+            </w:r>
+            <w:r>
+              <w:rPr>
+                <w:b/>
+                <w:bCs/>
+              </w:rPr>
+              <w:t xml:space="preserve">null</w:t>
+            </w:r>
+            <w:r>
+              <w:t xml:space="preserve"> / </w:t>
+            </w:r>
+            <w:r>
+              <w:rPr>
+                <w:b/>
+                <w:bCs/>
+              </w:rPr>
+              <w:t xml:space="preserve">undefined</w:t>
+            </w:r>
+          </w:p>
+        </w:tc>
+      </w:tr>
+      <w:tr>
+        <w:tc>
+          <w:tcPr>
+            <w:tcW w:type="pct" w:w="3000%"/>
+          </w:tcPr>
+          <w:p>
+            <w:pPr>
+              <w:spacing w:after="60"/>
+            </w:pPr>
+            <w:r>
+              <w:rPr>
+                <w:b/>
+                <w:bCs/>
+              </w:rPr>
+              <w:t xml:space="preserve">barDurationIntegrity</w:t>
+            </w:r>
+          </w:p>
+        </w:tc>
+        <w:tc>
+          <w:tcPr>
+            <w:tcW w:type="pct" w:w="3000%"/>
+          </w:tcPr>
+          <w:p>
+            <w:pPr>
+              <w:spacing w:after="60"/>
+            </w:pPr>
+            <w:r>
+              <w:t xml:space="preserve">error</w:t>
+            </w:r>
+          </w:p>
+        </w:tc>
+        <w:tc>
+          <w:tcPr>
+            <w:tcW w:type="pct" w:w="3000%"/>
+          </w:tcPr>
+          <w:p>
+            <w:pPr>
+              <w:spacing w:after="60"/>
+            </w:pPr>
+            <w:r>
+              <w:rPr>
+                <w:b/>
+                <w:bCs/>
+              </w:rPr>
+              <w:t xml:space="preserve">`features.formal.barCount`</w:t>
+            </w:r>
+            <w:r>
+              <w:t xml:space="preserve"> is a positive number</w:t>
+            </w:r>
+          </w:p>
+        </w:tc>
+      </w:tr>
+      <w:tr>
+        <w:tc>
+          <w:tcPr>
+            <w:tcW w:type="pct" w:w="3000%"/>
+          </w:tcPr>
+          <w:p>
+            <w:pPr>
+              <w:spacing w:after="60"/>
+            </w:pPr>
+            <w:r>
+              <w:rPr>
+                <w:b/>
+                <w:bCs/>
+              </w:rPr>
+              <w:t xml:space="preserve">chordMelodyAlignment</w:t>
+            </w:r>
+          </w:p>
+        </w:tc>
+        <w:tc>
+          <w:tcPr>
+            <w:tcW w:type="pct" w:w="3000%"/>
+          </w:tcPr>
+          <w:p>
+            <w:pPr>
+              <w:spacing w:after="60"/>
+            </w:pPr>
+            <w:r>
+              <w:t xml:space="preserve">error</w:t>
+            </w:r>
+          </w:p>
+        </w:tc>
+        <w:tc>
+          <w:tcPr>
+            <w:tcW w:type="pct" w:w="3000%"/>
+          </w:tcPr>
+          <w:p>
+            <w:pPr>
+              <w:spacing w:after="60"/>
+            </w:pPr>
+            <w:r>
+              <w:rPr>
+                <w:b/>
+                <w:bCs/>
+              </w:rPr>
+              <w:t xml:space="preserve">`features.harmonic`</w:t>
+            </w:r>
+            <w:r>
+              <w:t xml:space="preserve"> exists and is non-empty</w:t>
+            </w:r>
+          </w:p>
+        </w:tc>
+      </w:tr>
+      <w:tr>
+        <w:tc>
+          <w:tcPr>
+            <w:tcW w:type="pct" w:w="3000%"/>
+          </w:tcPr>
+          <w:p>
+            <w:pPr>
+              <w:spacing w:after="60"/>
+            </w:pPr>
+            <w:r>
+              <w:rPr>
+                <w:b/>
+                <w:bCs/>
+              </w:rPr>
+              <w:t xml:space="preserve">sectionContrast</w:t>
+            </w:r>
+          </w:p>
+        </w:tc>
+        <w:tc>
+          <w:tcPr>
+            <w:tcW w:type="pct" w:w="3000%"/>
+          </w:tcPr>
+          <w:p>
+            <w:pPr>
+              <w:spacing w:after="60"/>
+            </w:pPr>
+            <w:r>
+              <w:t xml:space="preserve">warning</w:t>
+            </w:r>
+          </w:p>
+        </w:tc>
+        <w:tc>
+          <w:tcPr>
+            <w:tcW w:type="pct" w:w="3000%"/>
+          </w:tcPr>
+          <w:p>
+            <w:pPr>
+              <w:spacing w:after="60"/>
+            </w:pPr>
+            <w:r>
+              <w:rPr>
+                <w:b/>
+                <w:bCs/>
+              </w:rPr>
+              <w:t xml:space="preserve">`formal.riffRepetitionRatio`</w:t>
+            </w:r>
+            <w:r>
+              <w:t xml:space="preserve"> ≠ </w:t>
+            </w:r>
+            <w:r>
+              <w:rPr>
+                <w:b/>
+                <w:bCs/>
+              </w:rPr>
+              <w:t xml:space="preserve">1.0</w:t>
+            </w:r>
+          </w:p>
+        </w:tc>
+      </w:tr>
+      <w:tr>
+        <w:tc>
+          <w:tcPr>
+            <w:tcW w:type="pct" w:w="3000%"/>
+          </w:tcPr>
+          <w:p>
+            <w:pPr>
+              <w:spacing w:after="60"/>
+            </w:pPr>
+            <w:r>
+              <w:rPr>
+                <w:b/>
+                <w:bCs/>
+              </w:rPr>
+              <w:t xml:space="preserve">rhythmAntiLoop</w:t>
+            </w:r>
+          </w:p>
+        </w:tc>
+        <w:tc>
+          <w:tcPr>
+            <w:tcW w:type="pct" w:w="3000%"/>
+          </w:tcPr>
+          <w:p>
+            <w:pPr>
+              <w:spacing w:after="60"/>
+            </w:pPr>
+            <w:r>
+              <w:t xml:space="preserve">warning</w:t>
+            </w:r>
+          </w:p>
+        </w:tc>
+        <w:tc>
+          <w:tcPr>
+            <w:tcW w:type="pct" w:w="3000%"/>
+          </w:tcPr>
+          <w:p>
+            <w:pPr>
+              <w:spacing w:after="60"/>
+            </w:pPr>
+            <w:r>
+              <w:rPr>
+                <w:b/>
+                <w:bCs/>
+              </w:rPr>
+              <w:t xml:space="preserve">`rhythmic.swingGridAlignment`</w:t>
+            </w:r>
+            <w:r>
+              <w:t xml:space="preserve"> ≠ </w:t>
+            </w:r>
+            <w:r>
+              <w:rPr>
+                <w:b/>
+                <w:bCs/>
+              </w:rPr>
+              <w:t xml:space="preserve">1.0</w:t>
+            </w:r>
+          </w:p>
+        </w:tc>
+      </w:tr>
+      <w:tr>
+        <w:tc>
+          <w:tcPr>
+            <w:tcW w:type="pct" w:w="3000%"/>
+          </w:tcPr>
+          <w:p>
+            <w:pPr>
+              <w:spacing w:after="60"/>
+            </w:pPr>
+            <w:r>
+              <w:rPr>
+                <w:b/>
+                <w:bCs/>
+              </w:rPr>
+              <w:t xml:space="preserve">registerIntegrity</w:t>
+            </w:r>
+          </w:p>
+        </w:tc>
+        <w:tc>
+          <w:tcPr>
+            <w:tcW w:type="pct" w:w="3000%"/>
+          </w:tcPr>
+          <w:p>
+            <w:pPr>
+              <w:spacing w:after="60"/>
+            </w:pPr>
+            <w:r>
+              <w:t xml:space="preserve">error</w:t>
+            </w:r>
+          </w:p>
+        </w:tc>
+        <w:tc>
+          <w:tcPr>
+            <w:tcW w:type="pct" w:w="3000%"/>
+          </w:tcPr>
+          <w:p>
+            <w:pPr>
+              <w:spacing w:after="60"/>
+            </w:pPr>
+            <w:r>
+              <w:rPr>
+                <w:b/>
+                <w:bCs/>
+              </w:rPr>
+              <w:t xml:space="preserve">`orchestration.avgVoicingSize`</w:t>
+            </w:r>
+            <w:r>
+              <w:t xml:space="preserve"> between </w:t>
+            </w:r>
+            <w:r>
+              <w:rPr>
+                <w:b/>
+                <w:bCs/>
+              </w:rPr>
+              <w:t xml:space="preserve">1</w:t>
+            </w:r>
+            <w:r>
+              <w:t xml:space="preserve"> and </w:t>
+            </w:r>
+            <w:r>
+              <w:rPr>
+                <w:b/>
+                <w:bCs/>
+              </w:rPr>
+              <w:t xml:space="preserve">12</w:t>
+            </w:r>
+          </w:p>
+        </w:tc>
+      </w:tr>
+    </w:tbl>
+    <w:p>
+      <w:pPr>
+        <w:spacing w:after="160"/>
+      </w:pPr>
+    </w:p>
+    <w:p>
+      <w:pPr>
+        <w:spacing w:after="160"/>
+      </w:pPr>
+      <w:r>
+        <w:t xml:space="preserve">Big Band </w:t>
+      </w:r>
+      <w:r>
+        <w:rPr>
+          <w:b/>
+          <w:bCs/>
+        </w:rPr>
+        <w:t xml:space="preserve">combined</w:t>
+      </w:r>
+      <w:r>
+        <w:t xml:space="preserve"> evaluation uses </w:t>
+      </w:r>
+      <w:r>
+        <w:rPr>
+          <w:b/>
+          <w:bCs/>
+        </w:rPr>
+        <w:t xml:space="preserve">`lockRequired: false`</w:t>
+      </w:r>
+      <w:r>
+        <w:t xml:space="preserve"> in the app so incomplete extract fields do not block observational </w:t>
+      </w:r>
+      <w:r>
+        <w:rPr>
+          <w:b/>
+          <w:bCs/>
+        </w:rPr>
+        <w:t xml:space="preserve">`pass`</w:t>
+      </w:r>
+      <w:r>
+        <w:t xml:space="preserve"> while extraction catches up.</w:t>
+      </w:r>
+    </w:p>
+    <w:p>
+      <w:pPr>
+        <w:pStyle w:val="Heading2"/>
+        <w:spacing w:after="100" w:before="160"/>
+      </w:pPr>
+      <w:r>
+        <w:t xml:space="preserve">DCR protocol</w:t>
+      </w:r>
+    </w:p>
+    <w:p>
+      <w:pPr>
+        <w:spacing w:after="160"/>
+      </w:pPr>
+      <w:r>
+        <w:rPr>
+          <w:b/>
+          <w:bCs/>
+        </w:rPr>
+        <w:t xml:space="preserve">`runDcrProtocol`</w:t>
+      </w:r>
+      <w:r>
+        <w:t xml:space="preserve"> — </w:t>
+      </w:r>
+      <w:r>
+        <w:rPr>
+          <w:b/>
+          <w:bCs/>
+        </w:rPr>
+        <w:t xml:space="preserve">Design</w:t>
+      </w:r>
+      <w:r>
+        <w:t xml:space="preserve">: generate </w:t>
+      </w:r>
+      <w:r>
+        <w:rPr>
+          <w:b/>
+          <w:bCs/>
+        </w:rPr>
+        <w:t xml:space="preserve">`candidateCount`</w:t>
+      </w:r>
+      <w:r>
+        <w:t xml:space="preserve"> candidates, score with </w:t>
+      </w:r>
+      <w:r>
+        <w:rPr>
+          <w:b/>
+          <w:bCs/>
+        </w:rPr>
+        <w:t xml:space="preserve">`CombinedEvaluator`</w:t>
+      </w:r>
+      <w:r>
+        <w:t xml:space="preserve">, pick highest </w:t>
+      </w:r>
+      <w:r>
+        <w:rPr>
+          <w:b/>
+          <w:bCs/>
+        </w:rPr>
+        <w:t xml:space="preserve">`combinedScore`</w:t>
+      </w:r>
+      <w:r>
+        <w:t xml:space="preserve">. </w:t>
+      </w:r>
+      <w:r>
+        <w:rPr>
+          <w:b/>
+          <w:bCs/>
+        </w:rPr>
+        <w:t xml:space="preserve">Commit</w:t>
+      </w:r>
+      <w:r>
+        <w:t xml:space="preserve">: if best ≥ </w:t>
+      </w:r>
+      <w:r>
+        <w:rPr>
+          <w:b/>
+          <w:bCs/>
+        </w:rPr>
+        <w:t xml:space="preserve">`targetScore`</w:t>
+      </w:r>
+      <w:r>
+        <w:t xml:space="preserve">, return (no refine). </w:t>
+      </w:r>
+      <w:r>
+        <w:rPr>
+          <w:b/>
+          <w:bCs/>
+        </w:rPr>
+        <w:t xml:space="preserve">Refine</w:t>
+      </w:r>
+      <w:r>
+        <w:t xml:space="preserve"> (at most </w:t>
+      </w:r>
+      <w:r>
+        <w:rPr>
+          <w:b/>
+          <w:bCs/>
+        </w:rPr>
+        <w:t xml:space="preserve">once</w:t>
+      </w:r>
+      <w:r>
+        <w:t xml:space="preserve">): refine weakest dimension via </w:t>
+      </w:r>
+      <w:r>
+        <w:rPr>
+          <w:b/>
+          <w:bCs/>
+        </w:rPr>
+        <w:t xml:space="preserve">`refiner.refine`</w:t>
+      </w:r>
+      <w:r>
+        <w:t xml:space="preserve">, re-score, keep whichever candidate scores higher — </w:t>
+      </w:r>
+      <w:r>
+        <w:rPr>
+          <w:b/>
+          <w:bCs/>
+        </w:rPr>
+        <w:t xml:space="preserve">never</w:t>
+      </w:r>
+      <w:r>
+        <w:t xml:space="preserve"> regenerate all candidates; </w:t>
+      </w:r>
+      <w:r>
+        <w:rPr>
+          <w:b/>
+          <w:bCs/>
+        </w:rPr>
+        <w:t xml:space="preserve">never</w:t>
+      </w:r>
+      <w:r>
+        <w:t xml:space="preserve"> loop refinement.</w:t>
+      </w:r>
+    </w:p>
+    <w:p>
+      <w:pPr>
+        <w:pStyle w:val="Heading2"/>
+        <w:spacing w:after="100" w:before="160"/>
+      </w:pPr>
+      <w:r>
+        <w:t xml:space="preserve">Style Profile Registry (Big Band arrangers)</w:t>
+      </w:r>
+    </w:p>
+    <w:tbl>
+      <w:tblPr>
+        <w:tblW w:type="pct" w:w="100%"/>
+        <w:tblBorders>
+          <w:top w:val="single" w:color="auto" w:sz="4"/>
+          <w:left w:val="single" w:color="auto" w:sz="4"/>
+          <w:bottom w:val="single" w:color="auto" w:sz="4"/>
+          <w:right w:val="single" w:color="auto" w:sz="4"/>
+          <w:insideH w:val="single" w:color="auto" w:sz="4"/>
+          <w:insideV w:val="single" w:color="auto" w:sz="4"/>
+        </w:tblBorders>
+      </w:tblPr>
+      <w:tblGrid>
+        <w:gridCol w:w="2250"/>
+        <w:gridCol w:w="2250"/>
+        <w:gridCol w:w="2250"/>
+        <w:gridCol w:w="2250"/>
+      </w:tblGrid>
+      <w:tr>
+        <w:tc>
+          <w:tcPr>
+            <w:tcW w:type="pct" w:w="2250%"/>
+          </w:tcPr>
+          <w:p>
+            <w:pPr>
+              <w:spacing w:after="60"/>
+            </w:pPr>
+            <w:r>
+              <w:t xml:space="preserve">Profile id</w:t>
+            </w:r>
+          </w:p>
+        </w:tc>
+        <w:tc>
+          <w:tcPr>
+            <w:tcW w:type="pct" w:w="2250%"/>
+          </w:tcPr>
+          <w:p>
+            <w:pPr>
+              <w:spacing w:after="60"/>
+            </w:pPr>
+            <w:r>
+              <w:t xml:space="preserve">Name</w:t>
+            </w:r>
+          </w:p>
+        </w:tc>
+        <w:tc>
+          <w:tcPr>
+            <w:tcW w:type="pct" w:w="2250%"/>
+          </w:tcPr>
+          <w:p>
+            <w:pPr>
+              <w:spacing w:after="60"/>
+            </w:pPr>
+            <w:r>
+              <w:t xml:space="preserve">Threshold</w:t>
+            </w:r>
+          </w:p>
+        </w:tc>
+        <w:tc>
+          <w:tcPr>
+            <w:tcW w:type="pct" w:w="2250%"/>
+          </w:tcPr>
+          <w:p>
+            <w:pPr>
+              <w:spacing w:after="60"/>
+            </w:pPr>
+            <w:r>
+              <w:t xml:space="preserve">Dimensions (ids × weight)</w:t>
+            </w:r>
+          </w:p>
+        </w:tc>
+      </w:tr>
+      <w:tr>
+        <w:tc>
+          <w:tcPr>
+            <w:tcW w:type="pct" w:w="2250%"/>
+          </w:tcPr>
+          <w:p>
+            <w:pPr>
+              <w:spacing w:after="60"/>
+            </w:pPr>
+            <w:r>
+              <w:rPr>
+                <w:b/>
+                <w:bCs/>
+              </w:rPr>
+              <w:t xml:space="preserve">`basie`</w:t>
+            </w:r>
+          </w:p>
+        </w:tc>
+        <w:tc>
+          <w:tcPr>
+            <w:tcW w:type="pct" w:w="2250%"/>
+          </w:tcPr>
+          <w:p>
+            <w:pPr>
+              <w:spacing w:after="60"/>
+            </w:pPr>
+            <w:r>
+              <w:t xml:space="preserve">Count Basie</w:t>
+            </w:r>
+          </w:p>
+        </w:tc>
+        <w:tc>
+          <w:tcPr>
+            <w:tcW w:type="pct" w:w="2250%"/>
+          </w:tcPr>
+          <w:p>
+            <w:pPr>
+              <w:spacing w:after="60"/>
+            </w:pPr>
+            <w:r>
+              <w:t xml:space="preserve">7.0</w:t>
+            </w:r>
+          </w:p>
+        </w:tc>
+        <w:tc>
+          <w:tcPr>
+            <w:tcW w:type="pct" w:w="2250%"/>
+          </w:tcPr>
+          <w:p>
+            <w:pPr>
+              <w:spacing w:after="60"/>
+            </w:pPr>
+            <w:r>
+              <w:t xml:space="preserve">densityScore </w:t>
+            </w:r>
+            <w:r>
+              <w:rPr>
+                <w:b/>
+                <w:bCs/>
+              </w:rPr>
+              <w:t xml:space="preserve">0.25</w:t>
+            </w:r>
+            <w:r>
+              <w:t xml:space="preserve">, riffRepetitionScore </w:t>
+            </w:r>
+            <w:r>
+              <w:rPr>
+                <w:b/>
+                <w:bCs/>
+              </w:rPr>
+              <w:t xml:space="preserve">0.25</w:t>
+            </w:r>
+            <w:r>
+              <w:t xml:space="preserve">, swingClarityScore </w:t>
+            </w:r>
+            <w:r>
+              <w:rPr>
+                <w:b/>
+                <w:bCs/>
+              </w:rPr>
+              <w:t xml:space="preserve">0.25</w:t>
+            </w:r>
+            <w:r>
+              <w:t xml:space="preserve">, compSparsityScore </w:t>
+            </w:r>
+            <w:r>
+              <w:rPr>
+                <w:b/>
+                <w:bCs/>
+              </w:rPr>
+              <w:t xml:space="preserve">0.25</w:t>
+            </w:r>
+          </w:p>
+        </w:tc>
+      </w:tr>
+      <w:tr>
+        <w:tc>
+          <w:tcPr>
+            <w:tcW w:type="pct" w:w="2250%"/>
+          </w:tcPr>
+          <w:p>
+            <w:pPr>
+              <w:spacing w:after="60"/>
+            </w:pPr>
+            <w:r>
+              <w:rPr>
+                <w:b/>
+                <w:bCs/>
+              </w:rPr>
+              <w:t xml:space="preserve">`ellington`</w:t>
+            </w:r>
+          </w:p>
+        </w:tc>
+        <w:tc>
+          <w:tcPr>
+            <w:tcW w:type="pct" w:w="2250%"/>
+          </w:tcPr>
+          <w:p>
+            <w:pPr>
+              <w:spacing w:after="60"/>
+            </w:pPr>
+            <w:r>
+              <w:t xml:space="preserve">Duke Ellington</w:t>
+            </w:r>
+          </w:p>
+        </w:tc>
+        <w:tc>
+          <w:tcPr>
+            <w:tcW w:type="pct" w:w="2250%"/>
+          </w:tcPr>
+          <w:p>
+            <w:pPr>
+              <w:spacing w:after="60"/>
+            </w:pPr>
+            <w:r>
+              <w:t xml:space="preserve">7.0</w:t>
+            </w:r>
+          </w:p>
+        </w:tc>
+        <w:tc>
+          <w:tcPr>
+            <w:tcW w:type="pct" w:w="2250%"/>
+          </w:tcPr>
+          <w:p>
+            <w:pPr>
+              <w:spacing w:after="60"/>
+            </w:pPr>
+            <w:r>
+              <w:t xml:space="preserve">voicingUniqueness </w:t>
+            </w:r>
+            <w:r>
+              <w:rPr>
+                <w:b/>
+                <w:bCs/>
+              </w:rPr>
+              <w:t xml:space="preserve">0.30</w:t>
+            </w:r>
+            <w:r>
+              <w:t xml:space="preserve">, harmonicDensity </w:t>
+            </w:r>
+            <w:r>
+              <w:rPr>
+                <w:b/>
+                <w:bCs/>
+              </w:rPr>
+              <w:t xml:space="preserve">0.30</w:t>
+            </w:r>
+            <w:r>
+              <w:t xml:space="preserve">, textureFluidity </w:t>
+            </w:r>
+            <w:r>
+              <w:rPr>
+                <w:b/>
+                <w:bCs/>
+              </w:rPr>
+              <w:t xml:space="preserve">0.20</w:t>
+            </w:r>
+            <w:r>
+              <w:t xml:space="preserve">, orchestrationColor </w:t>
+            </w:r>
+            <w:r>
+              <w:rPr>
+                <w:b/>
+                <w:bCs/>
+              </w:rPr>
+              <w:t xml:space="preserve">0.20</w:t>
+            </w:r>
+          </w:p>
+        </w:tc>
+      </w:tr>
+      <w:tr>
+        <w:tc>
+          <w:tcPr>
+            <w:tcW w:type="pct" w:w="2250%"/>
+          </w:tcPr>
+          <w:p>
+            <w:pPr>
+              <w:spacing w:after="60"/>
+            </w:pPr>
+            <w:r>
+              <w:rPr>
+                <w:b/>
+                <w:bCs/>
+              </w:rPr>
+              <w:t xml:space="preserve">`schneider`</w:t>
+            </w:r>
+          </w:p>
+        </w:tc>
+        <w:tc>
+          <w:tcPr>
+            <w:tcW w:type="pct" w:w="2250%"/>
+          </w:tcPr>
+          <w:p>
+            <w:pPr>
+              <w:spacing w:after="60"/>
+            </w:pPr>
+            <w:r>
+              <w:t xml:space="preserve">Maria Schneider</w:t>
+            </w:r>
+          </w:p>
+        </w:tc>
+        <w:tc>
+          <w:tcPr>
+            <w:tcW w:type="pct" w:w="2250%"/>
+          </w:tcPr>
+          <w:p>
+            <w:pPr>
+              <w:spacing w:after="60"/>
+            </w:pPr>
+            <w:r>
+              <w:t xml:space="preserve">7.0</w:t>
+            </w:r>
+          </w:p>
+        </w:tc>
+        <w:tc>
+          <w:tcPr>
+            <w:tcW w:type="pct" w:w="2250%"/>
+          </w:tcPr>
+          <w:p>
+            <w:pPr>
+              <w:spacing w:after="60"/>
+            </w:pPr>
+            <w:r>
+              <w:t xml:space="preserve">harmonicComplexity </w:t>
+            </w:r>
+            <w:r>
+              <w:rPr>
+                <w:b/>
+                <w:bCs/>
+              </w:rPr>
+              <w:t xml:space="preserve">0.35</w:t>
+            </w:r>
+            <w:r>
+              <w:t xml:space="preserve">, textureMosaic </w:t>
+            </w:r>
+            <w:r>
+              <w:rPr>
+                <w:b/>
+                <w:bCs/>
+              </w:rPr>
+              <w:t xml:space="preserve">0.30</w:t>
+            </w:r>
+            <w:r>
+              <w:t xml:space="preserve">, narrativeArc </w:t>
+            </w:r>
+            <w:r>
+              <w:rPr>
+                <w:b/>
+                <w:bCs/>
+              </w:rPr>
+              <w:t xml:space="preserve">0.20</w:t>
+            </w:r>
+            <w:r>
+              <w:t xml:space="preserve">, rhythmicFloat </w:t>
+            </w:r>
+            <w:r>
+              <w:rPr>
+                <w:b/>
+                <w:bCs/>
+              </w:rPr>
+              <w:t xml:space="preserve">0.15</w:t>
+            </w:r>
+          </w:p>
+        </w:tc>
+      </w:tr>
+      <w:tr>
+        <w:tc>
+          <w:tcPr>
+            <w:tcW w:type="pct" w:w="2250%"/>
+          </w:tcPr>
+          <w:p>
+            <w:pPr>
+              <w:spacing w:after="60"/>
+            </w:pPr>
+            <w:r>
+              <w:rPr>
+                <w:b/>
+                <w:bCs/>
+              </w:rPr>
+              <w:t xml:space="preserve">`quincy_jones`</w:t>
+            </w:r>
+          </w:p>
+        </w:tc>
+        <w:tc>
+          <w:tcPr>
+            <w:tcW w:type="pct" w:w="2250%"/>
+          </w:tcPr>
+          <w:p>
+            <w:pPr>
+              <w:spacing w:after="60"/>
+            </w:pPr>
+            <w:r>
+              <w:t xml:space="preserve">Quincy Jones</w:t>
+            </w:r>
+          </w:p>
+        </w:tc>
+        <w:tc>
+          <w:tcPr>
+            <w:tcW w:type="pct" w:w="2250%"/>
+          </w:tcPr>
+          <w:p>
+            <w:pPr>
+              <w:spacing w:after="60"/>
+            </w:pPr>
+            <w:r>
+              <w:t xml:space="preserve">7.0</w:t>
+            </w:r>
+          </w:p>
+        </w:tc>
+        <w:tc>
+          <w:tcPr>
+            <w:tcW w:type="pct" w:w="2250%"/>
+          </w:tcPr>
+          <w:p>
+            <w:pPr>
+              <w:spacing w:after="60"/>
+            </w:pPr>
+            <w:r>
+              <w:t xml:space="preserve">grooveStrength </w:t>
+            </w:r>
+            <w:r>
+              <w:rPr>
+                <w:b/>
+                <w:bCs/>
+              </w:rPr>
+              <w:t xml:space="preserve">0.35</w:t>
+            </w:r>
+            <w:r>
+              <w:t xml:space="preserve">, cinematicDensity </w:t>
+            </w:r>
+            <w:r>
+              <w:rPr>
+                <w:b/>
+                <w:bCs/>
+              </w:rPr>
+              <w:t xml:space="preserve">0.25</w:t>
+            </w:r>
+            <w:r>
+              <w:t xml:space="preserve">, functionalHarmony </w:t>
+            </w:r>
+            <w:r>
+              <w:rPr>
+                <w:b/>
+                <w:bCs/>
+              </w:rPr>
+              <w:t xml:space="preserve">0.25</w:t>
+            </w:r>
+            <w:r>
+              <w:t xml:space="preserve">, rhythmLeads </w:t>
+            </w:r>
+            <w:r>
+              <w:rPr>
+                <w:b/>
+                <w:bCs/>
+              </w:rPr>
+              <w:t xml:space="preserve">0.15</w:t>
+            </w:r>
+          </w:p>
+        </w:tc>
+      </w:tr>
+    </w:tbl>
+    <w:p>
+      <w:pPr>
+        <w:spacing w:after="160"/>
+      </w:pPr>
+    </w:p>
+    <w:p>
+      <w:pPr>
+        <w:pStyle w:val="Heading2"/>
+        <w:spacing w:after="100" w:before="160"/>
+      </w:pPr>
+      <w:r>
+        <w:t xml:space="preserve">How to add a new style profile (5 steps)</w:t>
+      </w:r>
+    </w:p>
+    <w:p>
+      <w:pPr>
+        <w:spacing w:after="160"/>
+      </w:pPr>
+      <w:r>
+        <w:t xml:space="preserve">1. Add </w:t>
+      </w:r>
+      <w:r>
+        <w:rPr>
+          <w:b/>
+          <w:bCs/>
+        </w:rPr>
+        <w:t xml:space="preserve">`yourStyleProfile.ts`</w:t>
+      </w:r>
+      <w:r>
+        <w:t xml:space="preserve"> under </w:t>
+      </w:r>
+      <w:r>
+        <w:rPr>
+          <w:b/>
+          <w:bCs/>
+        </w:rPr>
+        <w:t xml:space="preserve">`engines/composer-os-v2/core/evaluation/`</w:t>
+      </w:r>
+      <w:r>
+        <w:t xml:space="preserve"> implementing </w:t>
+      </w:r>
+      <w:r>
+        <w:rPr>
+          <w:b/>
+          <w:bCs/>
+        </w:rPr>
+        <w:t xml:space="preserve">`StyleProfile`</w:t>
+      </w:r>
+      <w:r>
+        <w:t xml:space="preserve"> (`dimensions`, </w:t>
+      </w:r>
+      <w:r>
+        <w:rPr>
+          <w:b/>
+          <w:bCs/>
+        </w:rPr>
+        <w:t xml:space="preserve">`threshold`</w:t>
+      </w:r>
+      <w:r>
+        <w:t xml:space="preserve">, </w:t>
+      </w:r>
+      <w:r>
+        <w:rPr>
+          <w:b/>
+          <w:bCs/>
+        </w:rPr>
+        <w:t xml:space="preserve">`score`</w:t>
+      </w:r>
+      <w:r>
+        <w:t xml:space="preserve"> reading </w:t>
+      </w:r>
+      <w:r>
+        <w:rPr>
+          <w:b/>
+          <w:bCs/>
+        </w:rPr>
+        <w:t xml:space="preserve">`ExtractedStyleFeatures`</w:t>
+      </w:r>
+      <w:r>
+        <w:t xml:space="preserve">). 2. Export from </w:t>
+      </w:r>
+      <w:r>
+        <w:rPr>
+          <w:b/>
+          <w:bCs/>
+        </w:rPr>
+        <w:t xml:space="preserve">`index.ts`</w:t>
+      </w:r>
+      <w:r>
+        <w:t xml:space="preserve">. 3. Extend </w:t>
+      </w:r>
+      <w:r>
+        <w:rPr>
+          <w:b/>
+          <w:bCs/>
+        </w:rPr>
+        <w:t xml:space="preserve">`featureExtractor`</w:t>
+      </w:r>
+      <w:r>
+        <w:t xml:space="preserve"> (or downstream enrichers) if new </w:t>
+      </w:r>
+      <w:r>
+        <w:rPr>
+          <w:b/>
+          <w:bCs/>
+        </w:rPr>
+        <w:t xml:space="preserve">`featureKeys`</w:t>
+      </w:r>
+      <w:r>
+        <w:t xml:space="preserve"> are required. 4. Wire Big Band </w:t>
+      </w:r>
+      <w:r>
+        <w:rPr>
+          <w:b/>
+          <w:bCs/>
+        </w:rPr>
+        <w:t xml:space="preserve">`composerStyle`</w:t>
+      </w:r>
+      <w:r>
+        <w:t xml:space="preserve"> → profile in </w:t>
+      </w:r>
+      <w:r>
+        <w:rPr>
+          <w:b/>
+          <w:bCs/>
+        </w:rPr>
+        <w:t xml:space="preserve">`composerOsAppGeneration.ts`</w:t>
+      </w:r>
+      <w:r>
+        <w:t xml:space="preserve"> (same pattern as Basie / Ellington / Schneider / Quincy). 5. Add </w:t>
+      </w:r>
+      <w:r>
+        <w:rPr>
+          <w:b/>
+          <w:bCs/>
+        </w:rPr>
+        <w:t xml:space="preserve">smoke</w:t>
+      </w:r>
+      <w:r>
+        <w:t xml:space="preserve"> coverage in </w:t>
+      </w:r>
+      <w:r>
+        <w:rPr>
+          <w:b/>
+          <w:bCs/>
+        </w:rPr>
+        <w:t xml:space="preserve">`evaluation.smoke.test.ts`</w:t>
+      </w:r>
+      <w:r>
+        <w:t xml:space="preserve"> and run </w:t>
+      </w:r>
+      <w:r>
+        <w:rPr>
+          <w:b/>
+          <w:bCs/>
+        </w:rPr>
+        <w:t xml:space="preserve">`npm run test:composer-smoke`</w:t>
+      </w:r>
+      <w:r>
+        <w:t xml:space="preserve">.</w:t>
+      </w:r>
+    </w:p>
+    <w:p>
+      <w:pPr>
+        <w:pStyle w:val="Heading2"/>
+        <w:spacing w:after="100" w:before="160"/>
+      </w:pPr>
+      <w:r>
+        <w:t xml:space="preserve">Smoke baseline</w:t>
+      </w:r>
+    </w:p>
+    <w:p>
+      <w:pPr>
+        <w:spacing w:after="160"/>
+      </w:pPr>
+      <w:r>
+        <w:rPr>
+          <w:b/>
+          <w:bCs/>
+        </w:rPr>
+        <w:t xml:space="preserve">`npm run test:composer-smoke`</w:t>
+      </w:r>
+      <w:r>
+        <w:t xml:space="preserve"> — aggregate </w:t>
+      </w:r>
+      <w:r>
+        <w:rPr>
+          <w:b/>
+          <w:bCs/>
+        </w:rPr>
+        <w:t xml:space="preserve">146</w:t>
+      </w:r>
+      <w:r>
+        <w:t xml:space="preserve"> PASS rows, </w:t>
+      </w:r>
+      <w:r>
+        <w:rPr>
+          <w:b/>
+          <w:bCs/>
+        </w:rPr>
+        <w:t xml:space="preserve">39</w:t>
+      </w:r>
+      <w:r>
+        <w:t xml:space="preserve"> suites (</w:t>
+      </w:r>
+      <w:r>
+        <w:rPr>
+          <w:b/>
+          <w:bCs/>
+        </w:rPr>
+        <w:t xml:space="preserve">`runSmokeTests.ts`</w:t>
+      </w:r>
+      <w:r>
+        <w:t xml:space="preserve"> allowlist).</w:t>
       </w:r>
     </w:p>
     <w:p>

</xml_diff>

<commit_message>
feat: wire six queued arranger style profiles — Thad, Gil Evans, Brookmeyer, Fischer, Nelson, Nestico
Co-authored-by: Cursor <cursoragent@cursor.com>
</commit_message>
<xml_diff>
--- a/docs/COMPOSER_OS_PLAYBOOK.docx
+++ b/docs/COMPOSER_OS_PLAYBOOK.docx
@@ -20819,6 +20819,576 @@
           </w:p>
         </w:tc>
       </w:tr>
+      <w:tr>
+        <w:tc>
+          <w:tcPr>
+            <w:tcW w:type="pct" w:w="2250%"/>
+          </w:tcPr>
+          <w:p>
+            <w:pPr>
+              <w:spacing w:after="60"/>
+            </w:pPr>
+            <w:r>
+              <w:rPr>
+                <w:b/>
+                <w:bCs/>
+              </w:rPr>
+              <w:t xml:space="preserve">`thad`</w:t>
+            </w:r>
+          </w:p>
+        </w:tc>
+        <w:tc>
+          <w:tcPr>
+            <w:tcW w:type="pct" w:w="2250%"/>
+          </w:tcPr>
+          <w:p>
+            <w:pPr>
+              <w:spacing w:after="60"/>
+            </w:pPr>
+            <w:r>
+              <w:t xml:space="preserve">Thad Jones</w:t>
+            </w:r>
+          </w:p>
+        </w:tc>
+        <w:tc>
+          <w:tcPr>
+            <w:tcW w:type="pct" w:w="2250%"/>
+          </w:tcPr>
+          <w:p>
+            <w:pPr>
+              <w:spacing w:after="60"/>
+            </w:pPr>
+            <w:r>
+              <w:t xml:space="preserve">7.0</w:t>
+            </w:r>
+          </w:p>
+        </w:tc>
+        <w:tc>
+          <w:tcPr>
+            <w:tcW w:type="pct" w:w="2250%"/>
+          </w:tcPr>
+          <w:p>
+            <w:pPr>
+              <w:spacing w:after="60"/>
+            </w:pPr>
+            <w:r>
+              <w:t xml:space="preserve">waveDensity </w:t>
+            </w:r>
+            <w:r>
+              <w:rPr>
+                <w:b/>
+                <w:bCs/>
+              </w:rPr>
+              <w:t xml:space="preserve">0.30</w:t>
+            </w:r>
+            <w:r>
+              <w:t xml:space="preserve">, polyHarmonicMotion </w:t>
+            </w:r>
+            <w:r>
+              <w:rPr>
+                <w:b/>
+                <w:bCs/>
+              </w:rPr>
+              <w:t xml:space="preserve">0.30</w:t>
+            </w:r>
+            <w:r>
+              <w:t xml:space="preserve">, swingDrive </w:t>
+            </w:r>
+            <w:r>
+              <w:rPr>
+                <w:b/>
+                <w:bCs/>
+              </w:rPr>
+              <w:t xml:space="preserve">0.25</w:t>
+            </w:r>
+            <w:r>
+              <w:t xml:space="preserve">, extendedFormLine </w:t>
+            </w:r>
+            <w:r>
+              <w:rPr>
+                <w:b/>
+                <w:bCs/>
+              </w:rPr>
+              <w:t xml:space="preserve">0.15</w:t>
+            </w:r>
+          </w:p>
+        </w:tc>
+      </w:tr>
+      <w:tr>
+        <w:tc>
+          <w:tcPr>
+            <w:tcW w:type="pct" w:w="2250%"/>
+          </w:tcPr>
+          <w:p>
+            <w:pPr>
+              <w:spacing w:after="60"/>
+            </w:pPr>
+            <w:r>
+              <w:rPr>
+                <w:b/>
+                <w:bCs/>
+              </w:rPr>
+              <w:t xml:space="preserve">`gil_evans`</w:t>
+            </w:r>
+          </w:p>
+        </w:tc>
+        <w:tc>
+          <w:tcPr>
+            <w:tcW w:type="pct" w:w="2250%"/>
+          </w:tcPr>
+          <w:p>
+            <w:pPr>
+              <w:spacing w:after="60"/>
+            </w:pPr>
+            <w:r>
+              <w:t xml:space="preserve">Gil Evans</w:t>
+            </w:r>
+          </w:p>
+        </w:tc>
+        <w:tc>
+          <w:tcPr>
+            <w:tcW w:type="pct" w:w="2250%"/>
+          </w:tcPr>
+          <w:p>
+            <w:pPr>
+              <w:spacing w:after="60"/>
+            </w:pPr>
+            <w:r>
+              <w:t xml:space="preserve">7.0</w:t>
+            </w:r>
+          </w:p>
+        </w:tc>
+        <w:tc>
+          <w:tcPr>
+            <w:tcW w:type="pct" w:w="2250%"/>
+          </w:tcPr>
+          <w:p>
+            <w:pPr>
+              <w:spacing w:after="60"/>
+            </w:pPr>
+            <w:r>
+              <w:t xml:space="preserve">colourWash </w:t>
+            </w:r>
+            <w:r>
+              <w:rPr>
+                <w:b/>
+                <w:bCs/>
+              </w:rPr>
+              <w:t xml:space="preserve">0.30</w:t>
+            </w:r>
+            <w:r>
+              <w:t xml:space="preserve">, modalOpenness </w:t>
+            </w:r>
+            <w:r>
+              <w:rPr>
+                <w:b/>
+                <w:bCs/>
+              </w:rPr>
+              <w:t xml:space="preserve">0.35</w:t>
+            </w:r>
+            <w:r>
+              <w:t xml:space="preserve">, elasticPulse </w:t>
+            </w:r>
+            <w:r>
+              <w:rPr>
+                <w:b/>
+                <w:bCs/>
+              </w:rPr>
+              <w:t xml:space="preserve">0.25</w:t>
+            </w:r>
+            <w:r>
+              <w:t xml:space="preserve">, horizonBlend </w:t>
+            </w:r>
+            <w:r>
+              <w:rPr>
+                <w:b/>
+                <w:bCs/>
+              </w:rPr>
+              <w:t xml:space="preserve">0.10</w:t>
+            </w:r>
+          </w:p>
+        </w:tc>
+      </w:tr>
+      <w:tr>
+        <w:tc>
+          <w:tcPr>
+            <w:tcW w:type="pct" w:w="2250%"/>
+          </w:tcPr>
+          <w:p>
+            <w:pPr>
+              <w:spacing w:after="60"/>
+            </w:pPr>
+            <w:r>
+              <w:rPr>
+                <w:b/>
+                <w:bCs/>
+              </w:rPr>
+              <w:t xml:space="preserve">`bob_brookmeyer`</w:t>
+            </w:r>
+          </w:p>
+        </w:tc>
+        <w:tc>
+          <w:tcPr>
+            <w:tcW w:type="pct" w:w="2250%"/>
+          </w:tcPr>
+          <w:p>
+            <w:pPr>
+              <w:spacing w:after="60"/>
+            </w:pPr>
+            <w:r>
+              <w:t xml:space="preserve">Bob Brookmeyer</w:t>
+            </w:r>
+          </w:p>
+        </w:tc>
+        <w:tc>
+          <w:tcPr>
+            <w:tcW w:type="pct" w:w="2250%"/>
+          </w:tcPr>
+          <w:p>
+            <w:pPr>
+              <w:spacing w:after="60"/>
+            </w:pPr>
+            <w:r>
+              <w:t xml:space="preserve">7.0</w:t>
+            </w:r>
+          </w:p>
+        </w:tc>
+        <w:tc>
+          <w:tcPr>
+            <w:tcW w:type="pct" w:w="2250%"/>
+          </w:tcPr>
+          <w:p>
+            <w:pPr>
+              <w:spacing w:after="60"/>
+            </w:pPr>
+            <w:r>
+              <w:t xml:space="preserve">linearCounterpoint </w:t>
+            </w:r>
+            <w:r>
+              <w:rPr>
+                <w:b/>
+                <w:bCs/>
+              </w:rPr>
+              <w:t xml:space="preserve">0.35</w:t>
+            </w:r>
+            <w:r>
+              <w:t xml:space="preserve">, quartalHarmonyField </w:t>
+            </w:r>
+            <w:r>
+              <w:rPr>
+                <w:b/>
+                <w:bCs/>
+              </w:rPr>
+              <w:t xml:space="preserve">0.25</w:t>
+            </w:r>
+            <w:r>
+              <w:t xml:space="preserve">, modernPocket </w:t>
+            </w:r>
+            <w:r>
+              <w:rPr>
+                <w:b/>
+                <w:bCs/>
+              </w:rPr>
+              <w:t xml:space="preserve">0.25</w:t>
+            </w:r>
+            <w:r>
+              <w:t xml:space="preserve">, sectionalVariety </w:t>
+            </w:r>
+            <w:r>
+              <w:rPr>
+                <w:b/>
+                <w:bCs/>
+              </w:rPr>
+              <w:t xml:space="preserve">0.15</w:t>
+            </w:r>
+          </w:p>
+        </w:tc>
+      </w:tr>
+      <w:tr>
+        <w:tc>
+          <w:tcPr>
+            <w:tcW w:type="pct" w:w="2250%"/>
+          </w:tcPr>
+          <w:p>
+            <w:pPr>
+              <w:spacing w:after="60"/>
+            </w:pPr>
+            <w:r>
+              <w:rPr>
+                <w:b/>
+                <w:bCs/>
+              </w:rPr>
+              <w:t xml:space="preserve">`clare_fischer`</w:t>
+            </w:r>
+          </w:p>
+        </w:tc>
+        <w:tc>
+          <w:tcPr>
+            <w:tcW w:type="pct" w:w="2250%"/>
+          </w:tcPr>
+          <w:p>
+            <w:pPr>
+              <w:spacing w:after="60"/>
+            </w:pPr>
+            <w:r>
+              <w:t xml:space="preserve">Clare Fischer</w:t>
+            </w:r>
+          </w:p>
+        </w:tc>
+        <w:tc>
+          <w:tcPr>
+            <w:tcW w:type="pct" w:w="2250%"/>
+          </w:tcPr>
+          <w:p>
+            <w:pPr>
+              <w:spacing w:after="60"/>
+            </w:pPr>
+            <w:r>
+              <w:t xml:space="preserve">7.0</w:t>
+            </w:r>
+          </w:p>
+        </w:tc>
+        <w:tc>
+          <w:tcPr>
+            <w:tcW w:type="pct" w:w="2250%"/>
+          </w:tcPr>
+          <w:p>
+            <w:pPr>
+              <w:spacing w:after="60"/>
+            </w:pPr>
+            <w:r>
+              <w:t xml:space="preserve">harmonicMass </w:t>
+            </w:r>
+            <w:r>
+              <w:rPr>
+                <w:b/>
+                <w:bCs/>
+              </w:rPr>
+              <w:t xml:space="preserve">0.35</w:t>
+            </w:r>
+            <w:r>
+              <w:t xml:space="preserve">, chromaticLattice </w:t>
+            </w:r>
+            <w:r>
+              <w:rPr>
+                <w:b/>
+                <w:bCs/>
+              </w:rPr>
+              <w:t xml:space="preserve">0.30</w:t>
+            </w:r>
+            <w:r>
+              <w:t xml:space="preserve">, grooveLattice </w:t>
+            </w:r>
+            <w:r>
+              <w:rPr>
+                <w:b/>
+                <w:bCs/>
+              </w:rPr>
+              <w:t xml:space="preserve">0.20</w:t>
+            </w:r>
+            <w:r>
+              <w:t xml:space="preserve">, pianoColour </w:t>
+            </w:r>
+            <w:r>
+              <w:rPr>
+                <w:b/>
+                <w:bCs/>
+              </w:rPr>
+              <w:t xml:space="preserve">0.15</w:t>
+            </w:r>
+          </w:p>
+        </w:tc>
+      </w:tr>
+      <w:tr>
+        <w:tc>
+          <w:tcPr>
+            <w:tcW w:type="pct" w:w="2250%"/>
+          </w:tcPr>
+          <w:p>
+            <w:pPr>
+              <w:spacing w:after="60"/>
+            </w:pPr>
+            <w:r>
+              <w:rPr>
+                <w:b/>
+                <w:bCs/>
+              </w:rPr>
+              <w:t xml:space="preserve">`oliver_nelson`</w:t>
+            </w:r>
+          </w:p>
+        </w:tc>
+        <w:tc>
+          <w:tcPr>
+            <w:tcW w:type="pct" w:w="2250%"/>
+          </w:tcPr>
+          <w:p>
+            <w:pPr>
+              <w:spacing w:after="60"/>
+            </w:pPr>
+            <w:r>
+              <w:t xml:space="preserve">Oliver Nelson</w:t>
+            </w:r>
+          </w:p>
+        </w:tc>
+        <w:tc>
+          <w:tcPr>
+            <w:tcW w:type="pct" w:w="2250%"/>
+          </w:tcPr>
+          <w:p>
+            <w:pPr>
+              <w:spacing w:after="60"/>
+            </w:pPr>
+            <w:r>
+              <w:t xml:space="preserve">7.0</w:t>
+            </w:r>
+          </w:p>
+        </w:tc>
+        <w:tc>
+          <w:tcPr>
+            <w:tcW w:type="pct" w:w="2250%"/>
+          </w:tcPr>
+          <w:p>
+            <w:pPr>
+              <w:spacing w:after="60"/>
+            </w:pPr>
+            <w:r>
+              <w:t xml:space="preserve">bluesFunctional </w:t>
+            </w:r>
+            <w:r>
+              <w:rPr>
+                <w:b/>
+                <w:bCs/>
+              </w:rPr>
+              <w:t xml:space="preserve">0.35</w:t>
+            </w:r>
+            <w:r>
+              <w:t xml:space="preserve">, sectionalContrast </w:t>
+            </w:r>
+            <w:r>
+              <w:rPr>
+                <w:b/>
+                <w:bCs/>
+              </w:rPr>
+              <w:t xml:space="preserve">0.30</w:t>
+            </w:r>
+            <w:r>
+              <w:t xml:space="preserve">, swingAuthority </w:t>
+            </w:r>
+            <w:r>
+              <w:rPr>
+                <w:b/>
+                <w:bCs/>
+              </w:rPr>
+              <w:t xml:space="preserve">0.20</w:t>
+            </w:r>
+            <w:r>
+              <w:t xml:space="preserve">, chartOrchestration </w:t>
+            </w:r>
+            <w:r>
+              <w:rPr>
+                <w:b/>
+                <w:bCs/>
+              </w:rPr>
+              <w:t xml:space="preserve">0.15</w:t>
+            </w:r>
+          </w:p>
+        </w:tc>
+      </w:tr>
+      <w:tr>
+        <w:tc>
+          <w:tcPr>
+            <w:tcW w:type="pct" w:w="2250%"/>
+          </w:tcPr>
+          <w:p>
+            <w:pPr>
+              <w:spacing w:after="60"/>
+            </w:pPr>
+            <w:r>
+              <w:rPr>
+                <w:b/>
+                <w:bCs/>
+              </w:rPr>
+              <w:t xml:space="preserve">`sammy_nestico`</w:t>
+            </w:r>
+          </w:p>
+        </w:tc>
+        <w:tc>
+          <w:tcPr>
+            <w:tcW w:type="pct" w:w="2250%"/>
+          </w:tcPr>
+          <w:p>
+            <w:pPr>
+              <w:spacing w:after="60"/>
+            </w:pPr>
+            <w:r>
+              <w:t xml:space="preserve">Sammy Nestico</w:t>
+            </w:r>
+          </w:p>
+        </w:tc>
+        <w:tc>
+          <w:tcPr>
+            <w:tcW w:type="pct" w:w="2250%"/>
+          </w:tcPr>
+          <w:p>
+            <w:pPr>
+              <w:spacing w:after="60"/>
+            </w:pPr>
+            <w:r>
+              <w:t xml:space="preserve">7.0</w:t>
+            </w:r>
+          </w:p>
+        </w:tc>
+        <w:tc>
+          <w:tcPr>
+            <w:tcW w:type="pct" w:w="2250%"/>
+          </w:tcPr>
+          <w:p>
+            <w:pPr>
+              <w:spacing w:after="60"/>
+            </w:pPr>
+            <w:r>
+              <w:t xml:space="preserve">punchEconomy </w:t>
+            </w:r>
+            <w:r>
+              <w:rPr>
+                <w:b/>
+                <w:bCs/>
+              </w:rPr>
+              <w:t xml:space="preserve">0.30</w:t>
+            </w:r>
+            <w:r>
+              <w:t xml:space="preserve">, riffHits </w:t>
+            </w:r>
+            <w:r>
+              <w:rPr>
+                <w:b/>
+                <w:bCs/>
+              </w:rPr>
+              <w:t xml:space="preserve">0.30</w:t>
+            </w:r>
+            <w:r>
+              <w:t xml:space="preserve">, lockedGroove </w:t>
+            </w:r>
+            <w:r>
+              <w:rPr>
+                <w:b/>
+                <w:bCs/>
+              </w:rPr>
+              <w:t xml:space="preserve">0.25</w:t>
+            </w:r>
+            <w:r>
+              <w:t xml:space="preserve">, kickAlignment </w:t>
+            </w:r>
+            <w:r>
+              <w:rPr>
+                <w:b/>
+                <w:bCs/>
+              </w:rPr>
+              <w:t xml:space="preserve">0.15</w:t>
+            </w:r>
+          </w:p>
+        </w:tc>
+      </w:tr>
     </w:tbl>
     <w:p>
       <w:pPr>
@@ -21059,7 +21629,7 @@
         <w:spacing w:after="160"/>
       </w:pPr>
       <w:r>
-        <w:t xml:space="preserve">This is a dedicated future workstream, not an arranger profile addition. Requires new engine infrastructure: clave-driven rhythm layer, tumbao bass patterns, montuno piano logic, percussion section, and Cuban-specific horn phrasing. Do not attempt until evaluation system is fully wired and first four arrangers are auto-scoring.</w:t>
+        <w:t xml:space="preserve">This is a dedicated future workstream, not an arranger profile addition. Requires new engine infrastructure: clave-driven rhythm layer, tumbao bass patterns, montuno piano logic, percussion section, and Cuban-specific horn phrasing. Do not attempt until prerequisite Cuban rhythm-grid research is scoped (Big Band evaluation registry is already wired for existing jazz arranger ids).</w:t>
       </w:r>
     </w:p>
     <w:p>
@@ -21268,7 +21838,7 @@
         <w:spacing w:after="100" w:before="160"/>
       </w:pPr>
       <w:r>
-        <w:t xml:space="preserve">ARRANGER STYLES — partial wiring</w:t>
+        <w:t xml:space="preserve">ARRANGER STYLES — engine wiring</w:t>
       </w:r>
     </w:p>
     <w:p>
@@ -21280,7 +21850,280 @@
           <w:b/>
           <w:bCs/>
         </w:rPr>
-        <w:t xml:space="preserve">Mapped to `composerStyle` (registry rules + tuning):</w:t>
+        <w:t xml:space="preserve">Mapped to `composerStyle` (registry rules + tuning receipts):</w:t>
+      </w:r>
+      <w:r>
+        <w:t xml:space="preserve"> all Generate </w:t>
+      </w:r>
+      <w:r>
+        <w:rPr>
+          <w:b/>
+          <w:bCs/>
+        </w:rPr>
+        <w:t xml:space="preserve">Arranger</w:t>
+      </w:r>
+      <w:r>
+        <w:t xml:space="preserve"> ids that correspond to </w:t>
+      </w:r>
+      <w:r>
+        <w:rPr>
+          <w:b/>
+          <w:bCs/>
+        </w:rPr>
+        <w:t xml:space="preserve">`BIG_BAND_RULE_REGISTRY.composerRules`</w:t>
+      </w:r>
+      <w:r>
+        <w:t xml:space="preserve"> — </w:t>
+      </w:r>
+      <w:r>
+        <w:rPr>
+          <w:b/>
+          <w:bCs/>
+        </w:rPr>
+        <w:t xml:space="preserve">`basie`</w:t>
+      </w:r>
+      <w:r>
+        <w:t xml:space="preserve">, </w:t>
+      </w:r>
+      <w:r>
+        <w:rPr>
+          <w:b/>
+          <w:bCs/>
+        </w:rPr>
+        <w:t xml:space="preserve">`ellington`</w:t>
+      </w:r>
+      <w:r>
+        <w:t xml:space="preserve">, </w:t>
+      </w:r>
+      <w:r>
+        <w:rPr>
+          <w:b/>
+          <w:bCs/>
+        </w:rPr>
+        <w:t xml:space="preserve">`thad`</w:t>
+      </w:r>
+      <w:r>
+        <w:t xml:space="preserve">, </w:t>
+      </w:r>
+      <w:r>
+        <w:rPr>
+          <w:b/>
+          <w:bCs/>
+        </w:rPr>
+        <w:t xml:space="preserve">`schneider`</w:t>
+      </w:r>
+      <w:r>
+        <w:t xml:space="preserve">, </w:t>
+      </w:r>
+      <w:r>
+        <w:rPr>
+          <w:b/>
+          <w:bCs/>
+        </w:rPr>
+        <w:t xml:space="preserve">`quincy_jones`</w:t>
+      </w:r>
+      <w:r>
+        <w:t xml:space="preserve">, </w:t>
+      </w:r>
+      <w:r>
+        <w:rPr>
+          <w:b/>
+          <w:bCs/>
+        </w:rPr>
+        <w:t xml:space="preserve">`gil_evans`</w:t>
+      </w:r>
+      <w:r>
+        <w:t xml:space="preserve">, </w:t>
+      </w:r>
+      <w:r>
+        <w:rPr>
+          <w:b/>
+          <w:bCs/>
+        </w:rPr>
+        <w:t xml:space="preserve">`bob_brookmeyer`</w:t>
+      </w:r>
+      <w:r>
+        <w:t xml:space="preserve">, </w:t>
+      </w:r>
+      <w:r>
+        <w:rPr>
+          <w:b/>
+          <w:bCs/>
+        </w:rPr>
+        <w:t xml:space="preserve">`clare_fischer`</w:t>
+      </w:r>
+      <w:r>
+        <w:t xml:space="preserve">, </w:t>
+      </w:r>
+      <w:r>
+        <w:rPr>
+          <w:b/>
+          <w:bCs/>
+        </w:rPr>
+        <w:t xml:space="preserve">`oliver_nelson`</w:t>
+      </w:r>
+      <w:r>
+        <w:t xml:space="preserve">, </w:t>
+      </w:r>
+      <w:r>
+        <w:rPr>
+          <w:b/>
+          <w:bCs/>
+        </w:rPr>
+        <w:t xml:space="preserve">`sammy_nestico`</w:t>
+      </w:r>
+      <w:r>
+        <w:t xml:space="preserve"> — via </w:t>
+      </w:r>
+      <w:r>
+        <w:rPr>
+          <w:b/>
+          <w:bCs/>
+        </w:rPr>
+        <w:t xml:space="preserve">`composerStyleFromArrangerStyle`</w:t>
+      </w:r>
+      <w:r>
+        <w:t xml:space="preserve"> in </w:t>
+      </w:r>
+      <w:r>
+        <w:rPr>
+          <w:b/>
+          <w:bCs/>
+        </w:rPr>
+        <w:t xml:space="preserve">`composerOsAppGeneration.ts`</w:t>
+      </w:r>
+      <w:r>
+        <w:t xml:space="preserve"> before </w:t>
+      </w:r>
+      <w:r>
+        <w:rPr>
+          <w:b/>
+          <w:bCs/>
+        </w:rPr>
+        <w:t xml:space="preserve">`runBigBandMode`</w:t>
+      </w:r>
+      <w:r>
+        <w:t xml:space="preserve"> / </w:t>
+      </w:r>
+      <w:r>
+        <w:rPr>
+          <w:b/>
+          <w:bCs/>
+        </w:rPr>
+        <w:t xml:space="preserve">`runBigBandRealisation`</w:t>
+      </w:r>
+      <w:r>
+        <w:t xml:space="preserve">.</w:t>
+      </w:r>
+    </w:p>
+    <w:p>
+      <w:pPr>
+        <w:spacing w:after="160"/>
+      </w:pPr>
+      <w:r>
+        <w:rPr>
+          <w:b/>
+          <w:bCs/>
+        </w:rPr>
+        <w:t xml:space="preserve">Structured profile receipts (`BigBandArrangerProfileReceiptV1` on `resolvedRules.tuning`):</w:t>
+      </w:r>
+      <w:r>
+        <w:t xml:space="preserve"> each of the above composers has a research-aligned parameter receipt in </w:t>
+      </w:r>
+      <w:r>
+        <w:rPr>
+          <w:b/>
+          <w:bCs/>
+        </w:rPr>
+        <w:t xml:space="preserve">`bigBandEraResolver.ts`</w:t>
+      </w:r>
+      <w:r>
+        <w:t xml:space="preserve"> (see </w:t>
+      </w:r>
+      <w:r>
+        <w:rPr>
+          <w:b/>
+          <w:bCs/>
+        </w:rPr>
+        <w:t xml:space="preserve">section 10 — Big Band arranger profiles</w:t>
+      </w:r>
+      <w:r>
+        <w:t xml:space="preserve">). </w:t>
+      </w:r>
+      <w:r>
+        <w:rPr>
+          <w:b/>
+          <w:bCs/>
+        </w:rPr>
+        <w:t xml:space="preserve">Combined evaluation</w:t>
+      </w:r>
+      <w:r>
+        <w:t xml:space="preserve"> selects the matching </w:t>
+      </w:r>
+      <w:r>
+        <w:rPr>
+          <w:b/>
+          <w:bCs/>
+        </w:rPr>
+        <w:t xml:space="preserve">`StyleProfile`</w:t>
+      </w:r>
+      <w:r>
+        <w:t xml:space="preserve"> by </w:t>
+      </w:r>
+      <w:r>
+        <w:rPr>
+          <w:b/>
+          <w:bCs/>
+        </w:rPr>
+        <w:t xml:space="preserve">`composerStyle`</w:t>
+      </w:r>
+      <w:r>
+        <w:t xml:space="preserve"> (</w:t>
+      </w:r>
+      <w:r>
+        <w:rPr>
+          <w:b/>
+          <w:bCs/>
+        </w:rPr>
+        <w:t xml:space="preserve">Evaluation System</w:t>
+      </w:r>
+      <w:r>
+        <w:t xml:space="preserve"> § Style Profile Registry).</w:t>
+      </w:r>
+    </w:p>
+    <w:p>
+      <w:pPr>
+        <w:spacing w:after="160"/>
+      </w:pPr>
+      <w:r>
+        <w:t xml:space="preserve">Song Mode </w:t>
+      </w:r>
+      <w:r>
+        <w:rPr>
+          <w:b/>
+          <w:bCs/>
+        </w:rPr>
+        <w:t xml:space="preserve">style pairing</w:t>
+      </w:r>
+      <w:r>
+        <w:t xml:space="preserve"> uses the same </w:t>
+      </w:r>
+      <w:r>
+        <w:rPr>
+          <w:b/>
+          <w:bCs/>
+        </w:rPr>
+        <w:t xml:space="preserve">`arrangerStyle`</w:t>
+      </w:r>
+      <w:r>
+        <w:t xml:space="preserve"> strings for confidence / contrast metadata (</w:t>
+      </w:r>
+      <w:r>
+        <w:rPr>
+          <w:b/>
+          <w:bCs/>
+        </w:rPr>
+        <w:t xml:space="preserve">`stylePairingResolver.ts`</w:t>
       </w:r>
       <w:r>
         <w:t xml:space="preserve"> </w:t>
@@ -21290,246 +22133,10 @@
           <w:b/>
           <w:bCs/>
         </w:rPr>
-        <w:t xml:space="preserve">`basie`</w:t>
-      </w:r>
-      <w:r>
-        <w:t xml:space="preserve">, </w:t>
-      </w:r>
-      <w:r>
-        <w:rPr>
-          <w:b/>
-          <w:bCs/>
-        </w:rPr>
-        <w:t xml:space="preserve">`ellington`</w:t>
-      </w:r>
-      <w:r>
-        <w:t xml:space="preserve">, </w:t>
-      </w:r>
-      <w:r>
-        <w:rPr>
-          <w:b/>
-          <w:bCs/>
-        </w:rPr>
-        <w:t xml:space="preserve">`schneider`</w:t>
-      </w:r>
-      <w:r>
-        <w:t xml:space="preserve">, </w:t>
-      </w:r>
-      <w:r>
-        <w:rPr>
-          <w:b/>
-          <w:bCs/>
-        </w:rPr>
-        <w:t xml:space="preserve">`quincy_jones`</w:t>
-      </w:r>
-      <w:r>
-        <w:t xml:space="preserve"> via </w:t>
-      </w:r>
-      <w:r>
-        <w:rPr>
-          <w:b/>
-          <w:bCs/>
-        </w:rPr>
-        <w:t xml:space="preserve">`composerStyleFromArrangerStyle`</w:t>
-      </w:r>
-      <w:r>
-        <w:t xml:space="preserve"> in </w:t>
-      </w:r>
-      <w:r>
-        <w:rPr>
-          <w:b/>
-          <w:bCs/>
-        </w:rPr>
-        <w:t xml:space="preserve">`composerOsAppGeneration.ts`</w:t>
-      </w:r>
-      <w:r>
-        <w:t xml:space="preserve"> before </w:t>
-      </w:r>
-      <w:r>
-        <w:rPr>
-          <w:b/>
-          <w:bCs/>
-        </w:rPr>
-        <w:t xml:space="preserve">`runBigBandMode`</w:t>
-      </w:r>
-      <w:r>
-        <w:t xml:space="preserve"> / </w:t>
-      </w:r>
-      <w:r>
-        <w:rPr>
-          <w:b/>
-          <w:bCs/>
-        </w:rPr>
-        <w:t xml:space="preserve">`runBigBandRealisation`</w:t>
-      </w:r>
-      <w:r>
-        <w:t xml:space="preserve">.</w:t>
-      </w:r>
-    </w:p>
-    <w:p>
-      <w:pPr>
-        <w:spacing w:after="160"/>
-      </w:pPr>
-      <w:r>
-        <w:rPr>
-          <w:b/>
-          <w:bCs/>
-        </w:rPr>
-        <w:t xml:space="preserve">Structured profile receipts (`BigBandArrangerProfileReceiptV1` on `resolvedRules.tuning`):</w:t>
-      </w:r>
-      <w:r>
-        <w:t xml:space="preserve"> </w:t>
-      </w:r>
-      <w:r>
-        <w:rPr>
-          <w:b/>
-          <w:bCs/>
-        </w:rPr>
-        <w:t xml:space="preserve">Count Basie</w:t>
-      </w:r>
-      <w:r>
-        <w:t xml:space="preserve">, </w:t>
-      </w:r>
-      <w:r>
-        <w:rPr>
-          <w:b/>
-          <w:bCs/>
-        </w:rPr>
-        <w:t xml:space="preserve">Duke Ellington</w:t>
-      </w:r>
-      <w:r>
-        <w:t xml:space="preserve">, </w:t>
-      </w:r>
-      <w:r>
-        <w:rPr>
-          <w:b/>
-          <w:bCs/>
-        </w:rPr>
-        <w:t xml:space="preserve">Maria Schneider</w:t>
-      </w:r>
-      <w:r>
-        <w:t xml:space="preserve">, and </w:t>
-      </w:r>
-      <w:r>
-        <w:rPr>
-          <w:b/>
-          <w:bCs/>
-        </w:rPr>
-        <w:t xml:space="preserve">Quincy Jones</w:t>
-      </w:r>
-      <w:r>
-        <w:t xml:space="preserve"> — see </w:t>
-      </w:r>
-      <w:r>
-        <w:rPr>
-          <w:b/>
-          <w:bCs/>
-        </w:rPr>
-        <w:t xml:space="preserve">section 10 — Big Band arranger profiles (wired tuning receipts)</w:t>
-      </w:r>
-      <w:r>
-        <w:t xml:space="preserve">.</w:t>
-      </w:r>
-    </w:p>
-    <w:p>
-      <w:pPr>
-        <w:spacing w:after="160"/>
-      </w:pPr>
-      <w:r>
-        <w:rPr>
-          <w:b/>
-          <w:bCs/>
-        </w:rPr>
-        <w:t xml:space="preserve">Still UI-only for Big Band engine merge:</w:t>
-      </w:r>
-      <w:r>
-        <w:t xml:space="preserve"> other </w:t>
-      </w:r>
-      <w:r>
-        <w:rPr>
-          <w:b/>
-          <w:bCs/>
-        </w:rPr>
-        <w:t xml:space="preserve">`arrangerStyle`</w:t>
-      </w:r>
-      <w:r>
-        <w:t xml:space="preserve"> ids do </w:t>
-      </w:r>
-      <w:r>
-        <w:rPr>
-          <w:b/>
-          <w:bCs/>
-        </w:rPr>
-        <w:t xml:space="preserve">not</w:t>
-      </w:r>
-      <w:r>
-        <w:t xml:space="preserve"> set </w:t>
-      </w:r>
-      <w:r>
-        <w:rPr>
-          <w:b/>
-          <w:bCs/>
-        </w:rPr>
-        <w:t xml:space="preserve">`composerStyle`</w:t>
-      </w:r>
-      <w:r>
-        <w:t xml:space="preserve">; they receive </w:t>
-      </w:r>
-      <w:r>
-        <w:rPr>
-          <w:b/>
-          <w:bCs/>
-        </w:rPr>
-        <w:t xml:space="preserve">era + foundational + functional</w:t>
-      </w:r>
-      <w:r>
-        <w:t xml:space="preserve"> rules only. </w:t>
-      </w:r>
-      <w:r>
-        <w:rPr>
-          <w:b/>
-          <w:bCs/>
-        </w:rPr>
-        <w:t xml:space="preserve">Planned arranger wiring priority</w:t>
-      </w:r>
-      <w:r>
-        <w:t xml:space="preserve"> (when the pipeline extends):</w:t>
-      </w:r>
-    </w:p>
-    <w:p>
-      <w:pPr>
-        <w:spacing w:after="160"/>
-      </w:pPr>
-      <w:r>
-        <w:t xml:space="preserve">1. Thad Jones 2. Gil Evans 3. Bob Brookmeyer 4. Clare Fischer 5. Oliver Nelson 6. Sammy Nestico</w:t>
-      </w:r>
-    </w:p>
-    <w:p>
-      <w:pPr>
-        <w:spacing w:after="160"/>
-      </w:pPr>
-      <w:r>
-        <w:t xml:space="preserve">Song Mode </w:t>
-      </w:r>
-      <w:r>
-        <w:rPr>
-          <w:b/>
-          <w:bCs/>
-        </w:rPr>
-        <w:t xml:space="preserve">style pairing</w:t>
-      </w:r>
-      <w:r>
-        <w:t xml:space="preserve"> may still reference those names for confidence / contrast metadata independently of Big Band </w:t>
-      </w:r>
-      <w:r>
-        <w:rPr>
-          <w:b/>
-          <w:bCs/>
-        </w:rPr>
-        <w:t xml:space="preserve">`composerStyle`</w:t>
-      </w:r>
-      <w:r>
-        <w:t xml:space="preserve">.</w:t>
+        <w:t xml:space="preserve">`ARRANGERS`</w:t>
+      </w:r>
+      <w:r>
+        <w:t xml:space="preserve"> set includes these ids).</w:t>
       </w:r>
     </w:p>
     <w:p>

</xml_diff>

<commit_message>
feat: Tonality Vault Phase 4+5 — quadratonic alignment evaluator, per-style weights; docs: expanded roadmap, GitHub audit, playbook and CLAUDE.md updates
Co-authored-by: Cursor <cursoragent@cursor.com>
</commit_message>
<xml_diff>
--- a/docs/COMPOSER_OS_PLAYBOOK.docx
+++ b/docs/COMPOSER_OS_PLAYBOOK.docx
@@ -709,6 +709,54 @@
     </w:p>
     <w:p>
       <w:pPr>
+        <w:spacing w:after="160"/>
+      </w:pPr>
+      <w:r>
+        <w:t xml:space="preserve">For </w:t>
+      </w:r>
+      <w:r>
+        <w:rPr>
+          <w:b/>
+          <w:bCs/>
+        </w:rPr>
+        <w:t xml:space="preserve">total bar count</w:t>
+      </w:r>
+      <w:r>
+        <w:t xml:space="preserve">, </w:t>
+      </w:r>
+      <w:r>
+        <w:rPr>
+          <w:b/>
+          <w:bCs/>
+        </w:rPr>
+        <w:t xml:space="preserve">`computeTotalBarsWithRepeats`</w:t>
+      </w:r>
+      <w:r>
+        <w:t xml:space="preserve">, Song Mode / golden-path wiring, and </w:t>
+      </w:r>
+      <w:r>
+        <w:rPr>
+          <w:b/>
+          <w:bCs/>
+        </w:rPr>
+        <w:t xml:space="preserve">optional `ScoreModel.repeatMarkers`</w:t>
+      </w:r>
+      <w:r>
+        <w:t xml:space="preserve"> MusicXML emission, see </w:t>
+      </w:r>
+      <w:r>
+        <w:rPr>
+          <w:b/>
+          <w:bCs/>
+        </w:rPr>
+        <w:t xml:space="preserve">Repeat truth — chart length + MusicXML barlines</w:t>
+      </w:r>
+      <w:r>
+        <w:t xml:space="preserve"> above.</w:t>
+      </w:r>
+    </w:p>
+    <w:p>
+      <w:pPr>
         <w:pStyle w:val="Heading2"/>
         <w:spacing w:after="100" w:before="160"/>
       </w:pPr>
@@ -1076,6 +1124,790 @@
       </w:r>
       <w:r>
         <w:t xml:space="preserve"> describe caps and fallbacks.</w:t>
+      </w:r>
+    </w:p>
+    <w:p>
+      <w:pPr>
+        <w:pStyle w:val="Heading1"/>
+        <w:spacing w:after="120" w:before="200"/>
+      </w:pPr>
+      <w:r>
+        <w:t xml:space="preserve">Phrase Engine V2 (golden-path duo, pre–C1)</w:t>
+      </w:r>
+    </w:p>
+    <w:p>
+      <w:pPr>
+        <w:spacing w:after="160"/>
+      </w:pPr>
+      <w:r>
+        <w:t xml:space="preserve">Song Mode </w:t>
+      </w:r>
+      <w:r>
+        <w:rPr>
+          <w:b/>
+          <w:bCs/>
+        </w:rPr>
+        <w:t xml:space="preserve">hook-first</w:t>
+      </w:r>
+      <w:r>
+        <w:t xml:space="preserve"> runs an optional motif-development pass </w:t>
+      </w:r>
+      <w:r>
+        <w:rPr>
+          <w:b/>
+          <w:bCs/>
+        </w:rPr>
+        <w:t xml:space="preserve">after</w:t>
+      </w:r>
+      <w:r>
+        <w:t xml:space="preserve"> expressive/orchestration passes and </w:t>
+      </w:r>
+      <w:r>
+        <w:rPr>
+          <w:b/>
+          <w:bCs/>
+        </w:rPr>
+        <w:t xml:space="preserve">before</w:t>
+      </w:r>
+      <w:r>
+        <w:t xml:space="preserve"> the Song Mode rhythm overlay stack (</w:t>
+      </w:r>
+      <w:r>
+        <w:rPr>
+          <w:b/>
+          <w:bCs/>
+        </w:rPr>
+        <w:t xml:space="preserve">C1–C7</w:t>
+      </w:r>
+      <w:r>
+        <w:t xml:space="preserve">). Implementation: </w:t>
+      </w:r>
+      <w:r>
+        <w:rPr>
+          <w:b/>
+          <w:bCs/>
+        </w:rPr>
+        <w:t xml:space="preserve">`engines/composer-os-v2/core/goldenPath/phraseEngineV2.ts`</w:t>
+      </w:r>
+      <w:r>
+        <w:t xml:space="preserve">, wired from </w:t>
+      </w:r>
+      <w:r>
+        <w:rPr>
+          <w:b/>
+          <w:bCs/>
+        </w:rPr>
+        <w:t xml:space="preserve">`generateGoldenPathDuoScore`</w:t>
+      </w:r>
+      <w:r>
+        <w:t xml:space="preserve"> immediately above </w:t>
+      </w:r>
+      <w:r>
+        <w:rPr>
+          <w:b/>
+          <w:bCs/>
+        </w:rPr>
+        <w:t xml:space="preserve">`applySongModeRhythmOverlayC1`</w:t>
+      </w:r>
+      <w:r>
+        <w:t xml:space="preserve">.</w:t>
+      </w:r>
+    </w:p>
+    <w:p>
+      <w:pPr>
+        <w:pStyle w:val="Heading2"/>
+        <w:spacing w:after="100" w:before="160"/>
+      </w:pPr>
+      <w:r>
+        <w:t xml:space="preserve">When it runs (all required)</w:t>
+      </w:r>
+    </w:p>
+    <w:p>
+      <w:pPr>
+        <w:spacing w:after="80"/>
+        <w:ind w:left="360" w:hanging="260"/>
+      </w:pPr>
+      <w:r>
+        <w:t xml:space="preserve">• </w:t>
+      </w:r>
+      <w:r>
+        <w:t xml:space="preserve">Preset is </w:t>
+      </w:r>
+      <w:r>
+        <w:rPr>
+          <w:b/>
+          <w:bCs/>
+        </w:rPr>
+        <w:t xml:space="preserve">guitar–bass duo family</w:t>
+      </w:r>
+      <w:r>
+        <w:t xml:space="preserve"> (`isGuitarBassDuoFamily`).</w:t>
+      </w:r>
+    </w:p>
+    <w:p>
+      <w:pPr>
+        <w:spacing w:after="80"/>
+        <w:ind w:left="360" w:hanging="260"/>
+      </w:pPr>
+      <w:r>
+        <w:t xml:space="preserve">• </w:t>
+      </w:r>
+      <w:r>
+        <w:rPr>
+          <w:b/>
+          <w:bCs/>
+        </w:rPr>
+        <w:t xml:space="preserve">`generationMetadata.songModeHookFirstIdentity === true`</w:t>
+      </w:r>
+      <w:r>
+        <w:t xml:space="preserve"> (hook-first Song Mode path).</w:t>
+      </w:r>
+    </w:p>
+    <w:p>
+      <w:pPr>
+        <w:spacing w:after="80"/>
+        <w:ind w:left="360" w:hanging="260"/>
+      </w:pPr>
+      <w:r>
+        <w:t xml:space="preserve">• </w:t>
+      </w:r>
+      <w:r>
+        <w:rPr>
+          <w:b/>
+          <w:bCs/>
+        </w:rPr>
+        <w:t xml:space="preserve">Total bars === 32</w:t>
+      </w:r>
+      <w:r>
+        <w:t xml:space="preserve"> for the duo score build (</w:t>
+      </w:r>
+      <w:r>
+        <w:rPr>
+          <w:b/>
+          <w:bCs/>
+        </w:rPr>
+        <w:t xml:space="preserve">`tb === 32`</w:t>
+      </w:r>
+      <w:r>
+        <w:t xml:space="preserve">).</w:t>
+      </w:r>
+    </w:p>
+    <w:p>
+      <w:pPr>
+        <w:pStyle w:val="Heading2"/>
+        <w:spacing w:after="100" w:before="160"/>
+      </w:pPr>
+      <w:r>
+        <w:t xml:space="preserve">Pipeline order (four steps)</w:t>
+      </w:r>
+    </w:p>
+    <w:p>
+      <w:pPr>
+        <w:spacing w:after="160"/>
+      </w:pPr>
+      <w:r>
+        <w:t xml:space="preserve">1. </w:t>
+      </w:r>
+      <w:r>
+        <w:rPr>
+          <w:b/>
+          <w:bCs/>
+        </w:rPr>
+        <w:t xml:space="preserve">`buildMotifPool(score, context)`</w:t>
+      </w:r>
+      <w:r>
+        <w:t xml:space="preserve"> — Mechanical pool from the guitar part: first </w:t>
+      </w:r>
+      <w:r>
+        <w:rPr>
+          <w:b/>
+          <w:bCs/>
+        </w:rPr>
+        <w:t xml:space="preserve">four</w:t>
+      </w:r>
+      <w:r>
+        <w:t xml:space="preserve"> </w:t>
+      </w:r>
+      <w:r>
+        <w:rPr>
+          <w:b/>
+          <w:bCs/>
+        </w:rPr>
+        <w:t xml:space="preserve">4-bar</w:t>
+      </w:r>
+      <w:r>
+        <w:t xml:space="preserve"> phrases, cells from phrase onsets (pitch + duration snippets). 2. </w:t>
+      </w:r>
+      <w:r>
+        <w:rPr>
+          <w:b/>
+          <w:bCs/>
+        </w:rPr>
+        <w:t xml:space="preserve">`seedPoolFromHookIdentity(pool, songModeHookIdentity)`</w:t>
+      </w:r>
+      <w:r>
+        <w:t xml:space="preserve"> — Optional; when hook identity exists on metadata, nudges/seeds the pool toward the hook’s rhythmic/pitch fingerprint. 3. </w:t>
+      </w:r>
+      <w:r>
+        <w:rPr>
+          <w:b/>
+          <w:bCs/>
+        </w:rPr>
+        <w:t xml:space="preserve">`applyPhraseEngineV2(guitarPart, pool)`</w:t>
+      </w:r>
+      <w:r>
+        <w:t xml:space="preserve"> — Adjusts guitar </w:t>
+      </w:r>
+      <w:r>
+        <w:rPr>
+          <w:b/>
+          <w:bCs/>
+        </w:rPr>
+        <w:t xml:space="preserve">bars 17–32</w:t>
+      </w:r>
+      <w:r>
+        <w:t xml:space="preserve"> (development window) toward pool material (duration windows + stepwise pitch nudge toward cells). 4. </w:t>
+      </w:r>
+      <w:r>
+        <w:rPr>
+          <w:b/>
+          <w:bCs/>
+        </w:rPr>
+        <w:t xml:space="preserve">`applyBassMotifEcho(bassPart, pool)`</w:t>
+      </w:r>
+      <w:r>
+        <w:t xml:space="preserve"> — Bass echoes weighted pool </w:t>
+      </w:r>
+      <w:r>
+        <w:rPr>
+          <w:b/>
+          <w:bCs/>
+        </w:rPr>
+        <w:t xml:space="preserve">durations</w:t>
+      </w:r>
+      <w:r>
+        <w:t xml:space="preserve"> in the same window when a bass onset’s duration matches a cell duration (pitch nudge toward cell floor).</w:t>
+      </w:r>
+    </w:p>
+    <w:p>
+      <w:pPr>
+        <w:spacing w:after="160"/>
+      </w:pPr>
+      <w:r>
+        <w:t xml:space="preserve">If any gate fails, this block is skipped entirely; the rest of the golden-path duo pipeline is unchanged.</w:t>
+      </w:r>
+    </w:p>
+    <w:p>
+      <w:pPr>
+        <w:pStyle w:val="Heading1"/>
+        <w:spacing w:after="120" w:before="200"/>
+      </w:pPr>
+      <w:r>
+        <w:t xml:space="preserve">Repeat truth — chart length + MusicXML barlines</w:t>
+      </w:r>
+    </w:p>
+    <w:p>
+      <w:pPr>
+        <w:spacing w:after="160"/>
+      </w:pPr>
+      <w:r>
+        <w:t xml:space="preserve">End-to-end behaviour for </w:t>
+      </w:r>
+      <w:r>
+        <w:rPr>
+          <w:b/>
+          <w:bCs/>
+        </w:rPr>
+        <w:t xml:space="preserve">imported</w:t>
+      </w:r>
+      <w:r>
+        <w:t xml:space="preserve"> lead sheets and optional </w:t>
+      </w:r>
+      <w:r>
+        <w:rPr>
+          <w:b/>
+          <w:bCs/>
+        </w:rPr>
+        <w:t xml:space="preserve">export</w:t>
+      </w:r>
+      <w:r>
+        <w:t xml:space="preserve"> of repeat barlines.</w:t>
+      </w:r>
+    </w:p>
+    <w:p>
+      <w:pPr>
+        <w:pStyle w:val="Heading2"/>
+        <w:spacing w:after="100" w:before="160"/>
+      </w:pPr>
+      <w:r>
+        <w:t xml:space="preserve">Universal lead sheet + bar count</w:t>
+      </w:r>
+    </w:p>
+    <w:p>
+      <w:pPr>
+        <w:spacing w:after="80"/>
+        <w:ind w:left="360" w:hanging="260"/>
+      </w:pPr>
+      <w:r>
+        <w:t xml:space="preserve">• </w:t>
+      </w:r>
+      <w:r>
+        <w:rPr>
+          <w:b/>
+          <w:bCs/>
+        </w:rPr>
+        <w:t xml:space="preserve">`computeTotalBarsWithRepeats(formSections, repeatMarkers)`</w:t>
+      </w:r>
+      <w:r>
+        <w:t xml:space="preserve"> (</w:t>
+      </w:r>
+      <w:r>
+        <w:rPr>
+          <w:b/>
+          <w:bCs/>
+        </w:rPr>
+        <w:t xml:space="preserve">`universalLeadSheetBuilder.ts`</w:t>
+      </w:r>
+      <w:r>
+        <w:t xml:space="preserve">) — Walks form sections in order; each section contributes </w:t>
+      </w:r>
+      <w:r>
+        <w:rPr>
+          <w:b/>
+          <w:bCs/>
+        </w:rPr>
+        <w:t xml:space="preserve">`barEnd − barStart + 1`</w:t>
+      </w:r>
+      <w:r>
+        <w:t xml:space="preserve"> bars. If any </w:t>
+      </w:r>
+      <w:r>
+        <w:rPr>
+          <w:b/>
+          <w:bCs/>
+        </w:rPr>
+        <w:t xml:space="preserve">`repeat_end`</w:t>
+      </w:r>
+      <w:r>
+        <w:t xml:space="preserve"> marker falls </w:t>
+      </w:r>
+      <w:r>
+        <w:rPr>
+          <w:b/>
+          <w:bCs/>
+        </w:rPr>
+        <w:t xml:space="preserve">inside</w:t>
+      </w:r>
+      <w:r>
+        <w:t xml:space="preserve"> that section’s bar range, that section’s span is counted </w:t>
+      </w:r>
+      <w:r>
+        <w:rPr>
+          <w:b/>
+          <w:bCs/>
+        </w:rPr>
+        <w:t xml:space="preserve">twice</w:t>
+      </w:r>
+      <w:r>
+        <w:t xml:space="preserve"> (one repeat pass).</w:t>
+      </w:r>
+    </w:p>
+    <w:p>
+      <w:pPr>
+        <w:spacing w:after="80"/>
+        <w:ind w:left="360" w:hanging="260"/>
+      </w:pPr>
+      <w:r>
+        <w:t xml:space="preserve">• </w:t>
+      </w:r>
+      <w:r>
+        <w:rPr>
+          <w:b/>
+          <w:bCs/>
+        </w:rPr>
+        <w:t xml:space="preserve">`buildUniversalLeadSheetFromImportedLeadSheet`</w:t>
+      </w:r>
+      <w:r>
+        <w:t xml:space="preserve"> sets </w:t>
+      </w:r>
+      <w:r>
+        <w:rPr>
+          <w:b/>
+          <w:bCs/>
+        </w:rPr>
+        <w:t xml:space="preserve">`UniversalLeadSheet.totalBars`</w:t>
+      </w:r>
+      <w:r>
+        <w:t xml:space="preserve"> from that helper and carries </w:t>
+      </w:r>
+      <w:r>
+        <w:rPr>
+          <w:b/>
+          <w:bCs/>
+        </w:rPr>
+        <w:t xml:space="preserve">`repeatMarkers`</w:t>
+      </w:r>
+      <w:r>
+        <w:t xml:space="preserve"> from </w:t>
+      </w:r>
+      <w:r>
+        <w:rPr>
+          <w:b/>
+          <w:bCs/>
+        </w:rPr>
+        <w:t xml:space="preserve">`LeadSheet`</w:t>
+      </w:r>
+      <w:r>
+        <w:t xml:space="preserve">.</w:t>
+      </w:r>
+    </w:p>
+    <w:p>
+      <w:pPr>
+        <w:spacing w:after="80"/>
+        <w:ind w:left="360" w:hanging="260"/>
+      </w:pPr>
+      <w:r>
+        <w:t xml:space="preserve">• </w:t>
+      </w:r>
+      <w:r>
+        <w:rPr>
+          <w:b/>
+          <w:bCs/>
+        </w:rPr>
+        <w:t xml:space="preserve">`applyRepeatTruthToScoreModel(score, sheet)`</w:t>
+      </w:r>
+      <w:r>
+        <w:t xml:space="preserve"> — If </w:t>
+      </w:r>
+      <w:r>
+        <w:rPr>
+          <w:b/>
+          <w:bCs/>
+        </w:rPr>
+        <w:t xml:space="preserve">`sheet.totalBars`</w:t>
+      </w:r>
+      <w:r>
+        <w:t xml:space="preserve"> is set and differs from per-part measure counts, </w:t>
+      </w:r>
+      <w:r>
+        <w:rPr>
+          <w:b/>
+          <w:bCs/>
+        </w:rPr>
+        <w:t xml:space="preserve">deep-clones</w:t>
+      </w:r>
+      <w:r>
+        <w:t xml:space="preserve"> the score and </w:t>
+      </w:r>
+      <w:r>
+        <w:rPr>
+          <w:b/>
+          <w:bCs/>
+        </w:rPr>
+        <w:t xml:space="preserve">pads</w:t>
+      </w:r>
+      <w:r>
+        <w:t xml:space="preserve"> (clone last measure) or </w:t>
+      </w:r>
+      <w:r>
+        <w:rPr>
+          <w:b/>
+          <w:bCs/>
+        </w:rPr>
+        <w:t xml:space="preserve">trims</w:t>
+      </w:r>
+      <w:r>
+        <w:t xml:space="preserve"> each part’s measures to match; syncs optional score-level length fields when present.</w:t>
+      </w:r>
+    </w:p>
+    <w:p>
+      <w:pPr>
+        <w:pStyle w:val="Heading2"/>
+        <w:spacing w:after="100" w:before="160"/>
+      </w:pPr>
+      <w:r>
+        <w:t xml:space="preserve">Song Mode generation (`composerOsAppGeneration` → `runSongMode` → `runGoldenPath`)</w:t>
+      </w:r>
+    </w:p>
+    <w:p>
+      <w:pPr>
+        <w:spacing w:after="80"/>
+        <w:ind w:left="360" w:hanging="260"/>
+      </w:pPr>
+      <w:r>
+        <w:t xml:space="preserve">• </w:t>
+      </w:r>
+      <w:r>
+        <w:t xml:space="preserve">When the universal sheet is </w:t>
+      </w:r>
+      <w:r>
+        <w:rPr>
+          <w:b/>
+          <w:bCs/>
+        </w:rPr>
+        <w:t xml:space="preserve">`imported_musicxml`</w:t>
+      </w:r>
+      <w:r>
+        <w:t xml:space="preserve"> and </w:t>
+      </w:r>
+      <w:r>
+        <w:rPr>
+          <w:b/>
+          <w:bCs/>
+        </w:rPr>
+        <w:t xml:space="preserve">`totalBars`</w:t>
+      </w:r>
+      <w:r>
+        <w:t xml:space="preserve"> is a positive integer, </w:t>
+      </w:r>
+      <w:r>
+        <w:rPr>
+          <w:b/>
+          <w:bCs/>
+        </w:rPr>
+        <w:t xml:space="preserve">`RunGoldenPathOptions.totalBars`</w:t>
+      </w:r>
+      <w:r>
+        <w:t xml:space="preserve"> is set from </w:t>
+      </w:r>
+      <w:r>
+        <w:rPr>
+          <w:b/>
+          <w:bCs/>
+        </w:rPr>
+        <w:t xml:space="preserve">`floor(totalBars)`</w:t>
+      </w:r>
+      <w:r>
+        <w:t xml:space="preserve"> so the first score build targets the repeated chart length (no separate “second pass” solely for bar math).</w:t>
+      </w:r>
+    </w:p>
+    <w:p>
+      <w:pPr>
+        <w:spacing w:after="80"/>
+        <w:ind w:left="360" w:hanging="260"/>
+      </w:pPr>
+      <w:r>
+        <w:t xml:space="preserve">• </w:t>
+      </w:r>
+      <w:r>
+        <w:t xml:space="preserve">After the golden-path run (including GCE retries), </w:t>
+      </w:r>
+      <w:r>
+        <w:rPr>
+          <w:b/>
+          <w:bCs/>
+        </w:rPr>
+        <w:t xml:space="preserve">`applyRepeatTruthToScoreModel`</w:t>
+      </w:r>
+      <w:r>
+        <w:t xml:space="preserve"> is applied again on the final </w:t>
+      </w:r>
+      <w:r>
+        <w:rPr>
+          <w:b/>
+          <w:bCs/>
+        </w:rPr>
+        <w:t xml:space="preserve">`ScoreModel`</w:t>
+      </w:r>
+      <w:r>
+        <w:t xml:space="preserve"> so the delivered score matches the sheet; </w:t>
+      </w:r>
+      <w:r>
+        <w:rPr>
+          <w:b/>
+          <w:bCs/>
+        </w:rPr>
+        <w:t xml:space="preserve">`context.form.totalBars`</w:t>
+      </w:r>
+      <w:r>
+        <w:t xml:space="preserve"> is aligned when the measure count changes.</w:t>
+      </w:r>
+    </w:p>
+    <w:p>
+      <w:pPr>
+        <w:pStyle w:val="Heading2"/>
+        <w:spacing w:after="100" w:before="160"/>
+      </w:pPr>
+      <w:r>
+        <w:t xml:space="preserve">MusicXML export</w:t>
+      </w:r>
+    </w:p>
+    <w:p>
+      <w:pPr>
+        <w:spacing w:after="80"/>
+        <w:ind w:left="360" w:hanging="260"/>
+      </w:pPr>
+      <w:r>
+        <w:t xml:space="preserve">• </w:t>
+      </w:r>
+      <w:r>
+        <w:t xml:space="preserve">Optional </w:t>
+      </w:r>
+      <w:r>
+        <w:rPr>
+          <w:b/>
+          <w:bCs/>
+        </w:rPr>
+        <w:t xml:space="preserve">`ScoreModel.repeatMarkers`</w:t>
+      </w:r>
+      <w:r>
+        <w:t xml:space="preserve">: array of </w:t>
+      </w:r>
+      <w:r>
+        <w:rPr>
+          <w:b/>
+          <w:bCs/>
+        </w:rPr>
+        <w:t xml:space="preserve">`{ bar, kind }`</w:t>
+      </w:r>
+      <w:r>
+        <w:t xml:space="preserve"> with </w:t>
+      </w:r>
+      <w:r>
+        <w:rPr>
+          <w:b/>
+          <w:bCs/>
+        </w:rPr>
+        <w:t xml:space="preserve">`kind`</w:t>
+      </w:r>
+      <w:r>
+        <w:t xml:space="preserve"> </w:t>
+      </w:r>
+      <w:r>
+        <w:rPr>
+          <w:b/>
+          <w:bCs/>
+        </w:rPr>
+        <w:t xml:space="preserve">`repeat_start`</w:t>
+      </w:r>
+      <w:r>
+        <w:t xml:space="preserve"> | </w:t>
+      </w:r>
+      <w:r>
+        <w:rPr>
+          <w:b/>
+          <w:bCs/>
+        </w:rPr>
+        <w:t xml:space="preserve">`repeat_end`</w:t>
+      </w:r>
+      <w:r>
+        <w:t xml:space="preserve"> (1-based bar index = exported measure number).</w:t>
+      </w:r>
+    </w:p>
+    <w:p>
+      <w:pPr>
+        <w:spacing w:after="80"/>
+        <w:ind w:left="360" w:hanging="260"/>
+      </w:pPr>
+      <w:r>
+        <w:t xml:space="preserve">• </w:t>
+      </w:r>
+      <w:r>
+        <w:t xml:space="preserve">When present, </w:t>
+      </w:r>
+      <w:r>
+        <w:rPr>
+          <w:b/>
+          <w:bCs/>
+        </w:rPr>
+        <w:t xml:space="preserve">`musicxmlExporter`</w:t>
+      </w:r>
+      <w:r>
+        <w:t xml:space="preserve"> emits:</w:t>
+      </w:r>
+    </w:p>
+    <w:p>
+      <w:pPr>
+        <w:spacing w:after="80"/>
+        <w:ind w:left="360" w:hanging="260"/>
+      </w:pPr>
+      <w:r>
+        <w:t xml:space="preserve">• </w:t>
+      </w:r>
+      <w:r>
+        <w:rPr>
+          <w:b/>
+          <w:bCs/>
+        </w:rPr>
+        <w:t xml:space="preserve">`repeat_start`</w:t>
+      </w:r>
+      <w:r>
+        <w:t xml:space="preserve"> — `&lt;barline location="left"&gt;` with </w:t>
+      </w:r>
+      <w:r>
+        <w:rPr>
+          <w:b/>
+          <w:bCs/>
+        </w:rPr>
+        <w:t xml:space="preserve">`heavy-light`</w:t>
+      </w:r>
+      <w:r>
+        <w:t xml:space="preserve"> + </w:t>
+      </w:r>
+      <w:r>
+        <w:rPr>
+          <w:b/>
+          <w:bCs/>
+        </w:rPr>
+        <w:t xml:space="preserve">`&lt;repeat direction="forward"/&gt;`</w:t>
+      </w:r>
+    </w:p>
+    <w:p>
+      <w:pPr>
+        <w:spacing w:after="80"/>
+        <w:ind w:left="360" w:hanging="260"/>
+      </w:pPr>
+      <w:r>
+        <w:t xml:space="preserve">• </w:t>
+      </w:r>
+      <w:r>
+        <w:rPr>
+          <w:b/>
+          <w:bCs/>
+        </w:rPr>
+        <w:t xml:space="preserve">`repeat_end`</w:t>
+      </w:r>
+      <w:r>
+        <w:t xml:space="preserve"> — `&lt;barline location="right"&gt;` with </w:t>
+      </w:r>
+      <w:r>
+        <w:rPr>
+          <w:b/>
+          <w:bCs/>
+        </w:rPr>
+        <w:t xml:space="preserve">`light-heavy`</w:t>
+      </w:r>
+      <w:r>
+        <w:t xml:space="preserve"> + </w:t>
+      </w:r>
+      <w:r>
+        <w:rPr>
+          <w:b/>
+          <w:bCs/>
+        </w:rPr>
+        <w:t xml:space="preserve">`&lt;repeat direction="backward"/&gt;`</w:t>
+      </w:r>
+    </w:p>
+    <w:p>
+      <w:pPr>
+        <w:spacing w:after="80"/>
+        <w:ind w:left="360" w:hanging="260"/>
+      </w:pPr>
+      <w:r>
+        <w:t xml:space="preserve">• </w:t>
+      </w:r>
+      <w:r>
+        <w:t xml:space="preserve">Scores without </w:t>
+      </w:r>
+      <w:r>
+        <w:rPr>
+          <w:b/>
+          <w:bCs/>
+        </w:rPr>
+        <w:t xml:space="preserve">`repeatMarkers`</w:t>
+      </w:r>
+      <w:r>
+        <w:t xml:space="preserve"> behave exactly as before (no barline emission from this path).</w:t>
       </w:r>
     </w:p>
     <w:p>
@@ -5369,6 +6201,550 @@
         <w:spacing w:after="120" w:before="200"/>
       </w:pPr>
       <w:r>
+        <w:t xml:space="preserve">Classical song overlay (Song Mode)</w:t>
+      </w:r>
+    </w:p>
+    <w:p>
+      <w:pPr>
+        <w:spacing w:after="160"/>
+      </w:pPr>
+      <w:r>
+        <w:t xml:space="preserve">Optional </w:t>
+      </w:r>
+      <w:r>
+        <w:rPr>
+          <w:b/>
+          <w:bCs/>
+        </w:rPr>
+        <w:t xml:space="preserve">Classical song influence</w:t>
+      </w:r>
+      <w:r>
+        <w:t xml:space="preserve"> on Generate (default </w:t>
+      </w:r>
+      <w:r>
+        <w:rPr>
+          <w:b/>
+          <w:bCs/>
+        </w:rPr>
+        <w:t xml:space="preserve">None</w:t>
+      </w:r>
+      <w:r>
+        <w:t xml:space="preserve">): </w:t>
+      </w:r>
+      <w:r>
+        <w:rPr>
+          <w:b/>
+          <w:bCs/>
+        </w:rPr>
+        <w:t xml:space="preserve">Schubert</w:t>
+      </w:r>
+      <w:r>
+        <w:t xml:space="preserve">, </w:t>
+      </w:r>
+      <w:r>
+        <w:rPr>
+          <w:b/>
+          <w:bCs/>
+        </w:rPr>
+        <w:t xml:space="preserve">Schumann</w:t>
+      </w:r>
+      <w:r>
+        <w:t xml:space="preserve">, or </w:t>
+      </w:r>
+      <w:r>
+        <w:rPr>
+          <w:b/>
+          <w:bCs/>
+        </w:rPr>
+        <w:t xml:space="preserve">Fauré</w:t>
+      </w:r>
+      <w:r>
+        <w:t xml:space="preserve">. The payload carries </w:t>
+      </w:r>
+      <w:r>
+        <w:rPr>
+          <w:b/>
+          <w:bCs/>
+        </w:rPr>
+        <w:t xml:space="preserve">`classicalOverlay`</w:t>
+      </w:r>
+      <w:r>
+        <w:t xml:space="preserve"> (`schubert` | `schumann` | `faure`). This is independent of </w:t>
+      </w:r>
+      <w:r>
+        <w:rPr>
+          <w:b/>
+          <w:bCs/>
+        </w:rPr>
+        <w:t xml:space="preserve">Lyric author influence</w:t>
+      </w:r>
+      <w:r>
+        <w:t xml:space="preserve"> (`authorOverlay`). </w:t>
+      </w:r>
+      <w:r>
+        <w:rPr>
+          <w:b/>
+          <w:bCs/>
+        </w:rPr>
+        <w:t xml:space="preserve">`resolveSongwritingStyles`</w:t>
+      </w:r>
+      <w:r>
+        <w:t xml:space="preserve"> (`engines/composer-os-v2/core/song-mode/songwriterStyleResolver.ts`) loads extra </w:t>
+      </w:r>
+      <w:r>
+        <w:rPr>
+          <w:b/>
+          <w:bCs/>
+        </w:rPr>
+        <w:t xml:space="preserve">registry rules</w:t>
+      </w:r>
+      <w:r>
+        <w:t xml:space="preserve"> for the chosen composer and applies </w:t>
+      </w:r>
+      <w:r>
+        <w:rPr>
+          <w:b/>
+          <w:bCs/>
+        </w:rPr>
+        <w:t xml:space="preserve">additive</w:t>
+      </w:r>
+      <w:r>
+        <w:t xml:space="preserve"> nudges to the blended </w:t>
+      </w:r>
+      <w:r>
+        <w:rPr>
+          <w:b/>
+          <w:bCs/>
+        </w:rPr>
+        <w:t xml:space="preserve">`SongwriterStyleProfile`</w:t>
+      </w:r>
+      <w:r>
+        <w:t xml:space="preserve"> (each scalar clamped to </w:t>
+      </w:r>
+      <w:r>
+        <w:rPr>
+          <w:b/>
+          <w:bCs/>
+        </w:rPr>
+        <w:t xml:space="preserve">0–1</w:t>
+      </w:r>
+      <w:r>
+        <w:t xml:space="preserve"> after the overlay).</w:t>
+      </w:r>
+    </w:p>
+    <w:p>
+      <w:pPr>
+        <w:pStyle w:val="Heading2"/>
+        <w:spacing w:after="100" w:before="160"/>
+      </w:pPr>
+      <w:r>
+        <w:t xml:space="preserve">Per-composer emphasis and parameter deltas</w:t>
+      </w:r>
+    </w:p>
+    <w:tbl>
+      <w:tblPr>
+        <w:tblW w:type="pct" w:w="100%"/>
+        <w:tblBorders>
+          <w:top w:val="single" w:color="auto" w:sz="4"/>
+          <w:left w:val="single" w:color="auto" w:sz="4"/>
+          <w:bottom w:val="single" w:color="auto" w:sz="4"/>
+          <w:right w:val="single" w:color="auto" w:sz="4"/>
+          <w:insideH w:val="single" w:color="auto" w:sz="4"/>
+          <w:insideV w:val="single" w:color="auto" w:sz="4"/>
+        </w:tblBorders>
+      </w:tblPr>
+      <w:tblGrid>
+        <w:gridCol w:w="3000"/>
+        <w:gridCol w:w="3000"/>
+        <w:gridCol w:w="3000"/>
+      </w:tblGrid>
+      <w:tr>
+        <w:tc>
+          <w:tcPr>
+            <w:tcW w:type="pct" w:w="3000%"/>
+          </w:tcPr>
+          <w:p>
+            <w:pPr>
+              <w:spacing w:after="60"/>
+            </w:pPr>
+            <w:r>
+              <w:t xml:space="preserve">Overlay id</w:t>
+            </w:r>
+          </w:p>
+        </w:tc>
+        <w:tc>
+          <w:tcPr>
+            <w:tcW w:type="pct" w:w="3000%"/>
+          </w:tcPr>
+          <w:p>
+            <w:pPr>
+              <w:spacing w:after="60"/>
+            </w:pPr>
+            <w:r>
+              <w:t xml:space="preserve">Emphasis</w:t>
+            </w:r>
+          </w:p>
+        </w:tc>
+        <w:tc>
+          <w:tcPr>
+            <w:tcW w:type="pct" w:w="3000%"/>
+          </w:tcPr>
+          <w:p>
+            <w:pPr>
+              <w:spacing w:after="60"/>
+            </w:pPr>
+            <w:r>
+              <w:t xml:space="preserve">Blended profile adjustments (additive, then clamped)</w:t>
+            </w:r>
+          </w:p>
+        </w:tc>
+      </w:tr>
+      <w:tr>
+        <w:tc>
+          <w:tcPr>
+            <w:tcW w:type="pct" w:w="3000%"/>
+          </w:tcPr>
+          <w:p>
+            <w:pPr>
+              <w:spacing w:after="60"/>
+            </w:pPr>
+            <w:r>
+              <w:rPr>
+                <w:b/>
+                <w:bCs/>
+              </w:rPr>
+              <w:t xml:space="preserve">`schubert`</w:t>
+            </w:r>
+          </w:p>
+        </w:tc>
+        <w:tc>
+          <w:tcPr>
+            <w:tcW w:type="pct" w:w="3000%"/>
+          </w:tcPr>
+          <w:p>
+            <w:pPr>
+              <w:spacing w:after="60"/>
+            </w:pPr>
+            <w:r>
+              <w:t xml:space="preserve">Syllabic prosody, periodic/strophic form, diatonic-functional harmony</w:t>
+            </w:r>
+          </w:p>
+        </w:tc>
+        <w:tc>
+          <w:tcPr>
+            <w:tcW w:type="pct" w:w="3000%"/>
+          </w:tcPr>
+          <w:p>
+            <w:pPr>
+              <w:spacing w:after="60"/>
+            </w:pPr>
+            <w:r>
+              <w:rPr>
+                <w:b/>
+                <w:bCs/>
+              </w:rPr>
+              <w:t xml:space="preserve">`prosodyInfluence`</w:t>
+            </w:r>
+            <w:r>
+              <w:t xml:space="preserve"> +0.10; </w:t>
+            </w:r>
+            <w:r>
+              <w:rPr>
+                <w:b/>
+                <w:bCs/>
+              </w:rPr>
+              <w:t xml:space="preserve">`lineVsCellEmphasis`</w:t>
+            </w:r>
+            <w:r>
+              <w:t xml:space="preserve"> +0.06; </w:t>
+            </w:r>
+            <w:r>
+              <w:rPr>
+                <w:b/>
+                <w:bCs/>
+              </w:rPr>
+              <w:t xml:space="preserve">`harmonyColourBias`</w:t>
+            </w:r>
+            <w:r>
+              <w:t xml:space="preserve"> −0.05; </w:t>
+            </w:r>
+            <w:r>
+              <w:rPr>
+                <w:b/>
+                <w:bCs/>
+              </w:rPr>
+              <w:t xml:space="preserve">`formRegularity`</w:t>
+            </w:r>
+            <w:r>
+              <w:t xml:space="preserve"> +0.08; </w:t>
+            </w:r>
+            <w:r>
+              <w:rPr>
+                <w:b/>
+                <w:bCs/>
+              </w:rPr>
+              <w:t xml:space="preserve">`phraseRegularity`</w:t>
+            </w:r>
+            <w:r>
+              <w:t xml:space="preserve"> +0.07</w:t>
+            </w:r>
+          </w:p>
+        </w:tc>
+      </w:tr>
+      <w:tr>
+        <w:tc>
+          <w:tcPr>
+            <w:tcW w:type="pct" w:w="3000%"/>
+          </w:tcPr>
+          <w:p>
+            <w:pPr>
+              <w:spacing w:after="60"/>
+            </w:pPr>
+            <w:r>
+              <w:rPr>
+                <w:b/>
+                <w:bCs/>
+              </w:rPr>
+              <w:t xml:space="preserve">`schumann`</w:t>
+            </w:r>
+          </w:p>
+        </w:tc>
+        <w:tc>
+          <w:tcPr>
+            <w:tcW w:type="pct" w:w="3000%"/>
+          </w:tcPr>
+          <w:p>
+            <w:pPr>
+              <w:spacing w:after="60"/>
+            </w:pPr>
+            <w:r>
+              <w:t xml:space="preserve">Strong text–music prosody, chromatic harmony, irregular / through-composed phrasing</w:t>
+            </w:r>
+          </w:p>
+        </w:tc>
+        <w:tc>
+          <w:tcPr>
+            <w:tcW w:type="pct" w:w="3000%"/>
+          </w:tcPr>
+          <w:p>
+            <w:pPr>
+              <w:spacing w:after="60"/>
+            </w:pPr>
+            <w:r>
+              <w:rPr>
+                <w:b/>
+                <w:bCs/>
+              </w:rPr>
+              <w:t xml:space="preserve">`prosodyInfluence`</w:t>
+            </w:r>
+            <w:r>
+              <w:t xml:space="preserve"> +0.13; </w:t>
+            </w:r>
+            <w:r>
+              <w:rPr>
+                <w:b/>
+                <w:bCs/>
+              </w:rPr>
+              <w:t xml:space="preserve">`harmonyColourBias`</w:t>
+            </w:r>
+            <w:r>
+              <w:t xml:space="preserve"> +0.10; </w:t>
+            </w:r>
+            <w:r>
+              <w:rPr>
+                <w:b/>
+                <w:bCs/>
+              </w:rPr>
+              <w:t xml:space="preserve">`lineVsCellEmphasis`</w:t>
+            </w:r>
+            <w:r>
+              <w:t xml:space="preserve"> +0.05; </w:t>
+            </w:r>
+            <w:r>
+              <w:rPr>
+                <w:b/>
+                <w:bCs/>
+              </w:rPr>
+              <w:t xml:space="preserve">`phraseRegularity`</w:t>
+            </w:r>
+            <w:r>
+              <w:t xml:space="preserve"> −0.09; </w:t>
+            </w:r>
+            <w:r>
+              <w:rPr>
+                <w:b/>
+                <w:bCs/>
+              </w:rPr>
+              <w:t xml:space="preserve">`hookReturnVariation`</w:t>
+            </w:r>
+            <w:r>
+              <w:t xml:space="preserve"> +0.06; </w:t>
+            </w:r>
+            <w:r>
+              <w:rPr>
+                <w:b/>
+                <w:bCs/>
+              </w:rPr>
+              <w:t xml:space="preserve">`harmonicSpeed`</w:t>
+            </w:r>
+            <w:r>
+              <w:t xml:space="preserve"> +0.05</w:t>
+            </w:r>
+          </w:p>
+        </w:tc>
+      </w:tr>
+      <w:tr>
+        <w:tc>
+          <w:tcPr>
+            <w:tcW w:type="pct" w:w="3000%"/>
+          </w:tcPr>
+          <w:p>
+            <w:pPr>
+              <w:spacing w:after="60"/>
+            </w:pPr>
+            <w:r>
+              <w:rPr>
+                <w:b/>
+                <w:bCs/>
+              </w:rPr>
+              <w:t xml:space="preserve">`faure`</w:t>
+            </w:r>
+          </w:p>
+        </w:tc>
+        <w:tc>
+          <w:tcPr>
+            <w:tcW w:type="pct" w:w="3000%"/>
+          </w:tcPr>
+          <w:p>
+            <w:pPr>
+              <w:spacing w:after="60"/>
+            </w:pPr>
+            <w:r>
+              <w:t xml:space="preserve">Long arching lines, floating / modal colour, continuous flow, lighter cadential closure</w:t>
+            </w:r>
+          </w:p>
+        </w:tc>
+        <w:tc>
+          <w:tcPr>
+            <w:tcW w:type="pct" w:w="3000%"/>
+          </w:tcPr>
+          <w:p>
+            <w:pPr>
+              <w:spacing w:after="60"/>
+            </w:pPr>
+            <w:r>
+              <w:rPr>
+                <w:b/>
+                <w:bCs/>
+              </w:rPr>
+              <w:t xml:space="preserve">`prosodyInfluence`</w:t>
+            </w:r>
+            <w:r>
+              <w:t xml:space="preserve"> +0.06; </w:t>
+            </w:r>
+            <w:r>
+              <w:rPr>
+                <w:b/>
+                <w:bCs/>
+              </w:rPr>
+              <w:t xml:space="preserve">`lineVsCellEmphasis`</w:t>
+            </w:r>
+            <w:r>
+              <w:t xml:space="preserve"> +0.12; </w:t>
+            </w:r>
+            <w:r>
+              <w:rPr>
+                <w:b/>
+                <w:bCs/>
+              </w:rPr>
+              <w:t xml:space="preserve">`harmonyColourBias`</w:t>
+            </w:r>
+            <w:r>
+              <w:t xml:space="preserve"> +0.04; </w:t>
+            </w:r>
+            <w:r>
+              <w:rPr>
+                <w:b/>
+                <w:bCs/>
+              </w:rPr>
+              <w:t xml:space="preserve">`hookRepetitionBias`</w:t>
+            </w:r>
+            <w:r>
+              <w:t xml:space="preserve"> −0.07; </w:t>
+            </w:r>
+            <w:r>
+              <w:rPr>
+                <w:b/>
+                <w:bCs/>
+              </w:rPr>
+              <w:t xml:space="preserve">`phraseRegularity`</w:t>
+            </w:r>
+            <w:r>
+              <w:t xml:space="preserve"> −0.05; </w:t>
+            </w:r>
+            <w:r>
+              <w:rPr>
+                <w:b/>
+                <w:bCs/>
+              </w:rPr>
+              <w:t xml:space="preserve">`sectionContrast`</w:t>
+            </w:r>
+            <w:r>
+              <w:t xml:space="preserve"> −0.06; </w:t>
+            </w:r>
+            <w:r>
+              <w:rPr>
+                <w:b/>
+                <w:bCs/>
+              </w:rPr>
+              <w:t xml:space="preserve">`syncopationBias`</w:t>
+            </w:r>
+            <w:r>
+              <w:t xml:space="preserve"> +0.04</w:t>
+            </w:r>
+          </w:p>
+        </w:tc>
+      </w:tr>
+    </w:tbl>
+    <w:p>
+      <w:pPr>
+        <w:spacing w:after="160"/>
+      </w:pPr>
+    </w:p>
+    <w:p>
+      <w:pPr>
+        <w:spacing w:after="160"/>
+      </w:pPr>
+      <w:r>
+        <w:t xml:space="preserve">Implementation: </w:t>
+      </w:r>
+      <w:r>
+        <w:rPr>
+          <w:b/>
+          <w:bCs/>
+        </w:rPr>
+        <w:t xml:space="preserve">`applyClassicalSongOverlay`</w:t>
+      </w:r>
+      <w:r>
+        <w:t xml:space="preserve"> in </w:t>
+      </w:r>
+      <w:r>
+        <w:rPr>
+          <w:b/>
+          <w:bCs/>
+        </w:rPr>
+        <w:t xml:space="preserve">`songwriterStyleResolver.ts`</w:t>
+      </w:r>
+      <w:r>
+        <w:t xml:space="preserve">.</w:t>
+      </w:r>
+    </w:p>
+    <w:p>
+      <w:pPr>
+        <w:pStyle w:val="Heading1"/>
+        <w:spacing w:after="120" w:before="200"/>
+      </w:pPr>
+      <w:r>
         <w:t xml:space="preserve">1. Introduction and scope</w:t>
       </w:r>
     </w:p>
@@ -19043,7 +20419,17 @@
         <w:t xml:space="preserve">style profile</w:t>
       </w:r>
       <w:r>
-        <w:t xml:space="preserve"> (Basie / Ellington / Schneider / Quincy), run </w:t>
+        <w:t xml:space="preserve"> (Big Band arrangers and optional </w:t>
+      </w:r>
+      <w:r>
+        <w:rPr>
+          <w:b/>
+          <w:bCs/>
+        </w:rPr>
+        <w:t xml:space="preserve">Light Touch</w:t>
+      </w:r>
+      <w:r>
+        <w:t xml:space="preserve"> genre profiles), run </w:t>
       </w:r>
       <w:r>
         <w:rPr>
@@ -21401,7 +22787,7 @@
         <w:spacing w:after="100" w:before="160"/>
       </w:pPr>
       <w:r>
-        <w:t xml:space="preserve">How to add a new style profile (5 steps)</w:t>
+        <w:t xml:space="preserve">Light Touch style profiles (Folk, Classical, Bebop)</w:t>
       </w:r>
     </w:p>
     <w:p>
@@ -21409,17 +22795,17 @@
         <w:spacing w:after="160"/>
       </w:pPr>
       <w:r>
-        <w:t xml:space="preserve">1. Add </w:t>
-      </w:r>
-      <w:r>
-        <w:rPr>
-          <w:b/>
-          <w:bCs/>
-        </w:rPr>
-        <w:t xml:space="preserve">`yourStyleProfile.ts`</w:t>
-      </w:r>
-      <w:r>
-        <w:t xml:space="preserve"> under </w:t>
+        <w:t xml:space="preserve">Three </w:t>
+      </w:r>
+      <w:r>
+        <w:rPr>
+          <w:b/>
+          <w:bCs/>
+        </w:rPr>
+        <w:t xml:space="preserve">`StyleProfile`</w:t>
+      </w:r>
+      <w:r>
+        <w:t xml:space="preserve"> modules ship under </w:t>
       </w:r>
       <w:r>
         <w:rPr>
@@ -21429,17 +22815,17 @@
         <w:t xml:space="preserve">`engines/composer-os-v2/core/evaluation/`</w:t>
       </w:r>
       <w:r>
-        <w:t xml:space="preserve"> implementing </w:t>
-      </w:r>
-      <w:r>
-        <w:rPr>
-          <w:b/>
-          <w:bCs/>
-        </w:rPr>
-        <w:t xml:space="preserve">`StyleProfile`</w:t>
-      </w:r>
-      <w:r>
-        <w:t xml:space="preserve"> (`dimensions`, </w:t>
+        <w:t xml:space="preserve"> for </w:t>
+      </w:r>
+      <w:r>
+        <w:rPr>
+          <w:b/>
+          <w:bCs/>
+        </w:rPr>
+        <w:t xml:space="preserve">genre-level</w:t>
+      </w:r>
+      <w:r>
+        <w:t xml:space="preserve"> Light Touch targets (same </w:t>
       </w:r>
       <w:r>
         <w:rPr>
@@ -21449,17 +22835,17 @@
         <w:t xml:space="preserve">`threshold`</w:t>
       </w:r>
       <w:r>
-        <w:t xml:space="preserve">, </w:t>
-      </w:r>
-      <w:r>
-        <w:rPr>
-          <w:b/>
-          <w:bCs/>
-        </w:rPr>
-        <w:t xml:space="preserve">`score`</w:t>
-      </w:r>
-      <w:r>
-        <w:t xml:space="preserve"> reading </w:t>
+        <w:t xml:space="preserve"> </w:t>
+      </w:r>
+      <w:r>
+        <w:rPr>
+          <w:b/>
+          <w:bCs/>
+        </w:rPr>
+        <w:t xml:space="preserve">7.0</w:t>
+      </w:r>
+      <w:r>
+        <w:t xml:space="preserve"> and </w:t>
       </w:r>
       <w:r>
         <w:rPr>
@@ -21469,88 +22855,403 @@
         <w:t xml:space="preserve">`ExtractedStyleFeatures`</w:t>
       </w:r>
       <w:r>
-        <w:t xml:space="preserve">). 2. Export from </w:t>
-      </w:r>
-      <w:r>
-        <w:rPr>
-          <w:b/>
-          <w:bCs/>
-        </w:rPr>
-        <w:t xml:space="preserve">`index.ts`</w:t>
-      </w:r>
-      <w:r>
-        <w:t xml:space="preserve">. 3. Extend </w:t>
-      </w:r>
-      <w:r>
-        <w:rPr>
-          <w:b/>
-          <w:bCs/>
-        </w:rPr>
-        <w:t xml:space="preserve">`featureExtractor`</w:t>
-      </w:r>
-      <w:r>
-        <w:t xml:space="preserve"> (or downstream enrichers) if new </w:t>
-      </w:r>
-      <w:r>
-        <w:rPr>
-          <w:b/>
-          <w:bCs/>
-        </w:rPr>
-        <w:t xml:space="preserve">`featureKeys`</w:t>
-      </w:r>
-      <w:r>
-        <w:t xml:space="preserve"> are required. 4. Wire Big Band </w:t>
-      </w:r>
-      <w:r>
-        <w:rPr>
-          <w:b/>
-          <w:bCs/>
-        </w:rPr>
-        <w:t xml:space="preserve">`composerStyle`</w:t>
-      </w:r>
-      <w:r>
-        <w:t xml:space="preserve"> → profile in </w:t>
-      </w:r>
-      <w:r>
-        <w:rPr>
-          <w:b/>
-          <w:bCs/>
-        </w:rPr>
-        <w:t xml:space="preserve">`composerOsAppGeneration.ts`</w:t>
-      </w:r>
-      <w:r>
-        <w:t xml:space="preserve"> (same pattern as Basie / Ellington / Schneider / Quincy). 5. Add </w:t>
-      </w:r>
-      <w:r>
-        <w:rPr>
-          <w:b/>
-          <w:bCs/>
-        </w:rPr>
-        <w:t xml:space="preserve">smoke</w:t>
-      </w:r>
-      <w:r>
-        <w:t xml:space="preserve"> coverage in </w:t>
-      </w:r>
-      <w:r>
-        <w:rPr>
-          <w:b/>
-          <w:bCs/>
-        </w:rPr>
-        <w:t xml:space="preserve">`evaluation.smoke.test.ts`</w:t>
-      </w:r>
-      <w:r>
-        <w:t xml:space="preserve"> and run </w:t>
-      </w:r>
-      <w:r>
-        <w:rPr>
-          <w:b/>
-          <w:bCs/>
-        </w:rPr>
-        <w:t xml:space="preserve">`npm run test:composer-smoke`</w:t>
-      </w:r>
-      <w:r>
-        <w:t xml:space="preserve">.</w:t>
-      </w:r>
+        <w:t xml:space="preserve"> contract as arranger profiles). They score </w:t>
+      </w:r>
+      <w:r>
+        <w:rPr>
+          <w:b/>
+          <w:bCs/>
+        </w:rPr>
+        <w:t xml:space="preserve">`harmonic.functionalRatio`</w:t>
+      </w:r>
+      <w:r>
+        <w:t xml:space="preserve"> when harmonic enrichment is present alongside </w:t>
+      </w:r>
+      <w:r>
+        <w:rPr>
+          <w:b/>
+          <w:bCs/>
+        </w:rPr>
+        <w:t xml:space="preserve">`scoreModel`</w:t>
+      </w:r>
+      <w:r>
+        <w:t xml:space="preserve"> extraction (`orchestration`, `formal`, `rhythmic`).</w:t>
+      </w:r>
+    </w:p>
+    <w:tbl>
+      <w:tblPr>
+        <w:tblW w:type="pct" w:w="100%"/>
+        <w:tblBorders>
+          <w:top w:val="single" w:color="auto" w:sz="4"/>
+          <w:left w:val="single" w:color="auto" w:sz="4"/>
+          <w:bottom w:val="single" w:color="auto" w:sz="4"/>
+          <w:right w:val="single" w:color="auto" w:sz="4"/>
+          <w:insideH w:val="single" w:color="auto" w:sz="4"/>
+          <w:insideV w:val="single" w:color="auto" w:sz="4"/>
+        </w:tblBorders>
+      </w:tblPr>
+      <w:tblGrid>
+        <w:gridCol w:w="2250"/>
+        <w:gridCol w:w="2250"/>
+        <w:gridCol w:w="2250"/>
+        <w:gridCol w:w="2250"/>
+      </w:tblGrid>
+      <w:tr>
+        <w:tc>
+          <w:tcPr>
+            <w:tcW w:type="pct" w:w="2250%"/>
+          </w:tcPr>
+          <w:p>
+            <w:pPr>
+              <w:spacing w:after="60"/>
+            </w:pPr>
+            <w:r>
+              <w:t xml:space="preserve">Profile id</w:t>
+            </w:r>
+          </w:p>
+        </w:tc>
+        <w:tc>
+          <w:tcPr>
+            <w:tcW w:type="pct" w:w="2250%"/>
+          </w:tcPr>
+          <w:p>
+            <w:pPr>
+              <w:spacing w:after="60"/>
+            </w:pPr>
+            <w:r>
+              <w:t xml:space="preserve">Name</w:t>
+            </w:r>
+          </w:p>
+        </w:tc>
+        <w:tc>
+          <w:tcPr>
+            <w:tcW w:type="pct" w:w="2250%"/>
+          </w:tcPr>
+          <w:p>
+            <w:pPr>
+              <w:spacing w:after="60"/>
+            </w:pPr>
+            <w:r>
+              <w:t xml:space="preserve">Threshold</w:t>
+            </w:r>
+          </w:p>
+        </w:tc>
+        <w:tc>
+          <w:tcPr>
+            <w:tcW w:type="pct" w:w="2250%"/>
+          </w:tcPr>
+          <w:p>
+            <w:pPr>
+              <w:spacing w:after="60"/>
+            </w:pPr>
+            <w:r>
+              <w:t xml:space="preserve">Dimensions (ids × weight)</w:t>
+            </w:r>
+          </w:p>
+        </w:tc>
+      </w:tr>
+      <w:tr>
+        <w:tc>
+          <w:tcPr>
+            <w:tcW w:type="pct" w:w="2250%"/>
+          </w:tcPr>
+          <w:p>
+            <w:pPr>
+              <w:spacing w:after="60"/>
+            </w:pPr>
+            <w:r>
+              <w:rPr>
+                <w:b/>
+                <w:bCs/>
+              </w:rPr>
+              <w:t xml:space="preserve">`folk`</w:t>
+            </w:r>
+          </w:p>
+        </w:tc>
+        <w:tc>
+          <w:tcPr>
+            <w:tcW w:type="pct" w:w="2250%"/>
+          </w:tcPr>
+          <w:p>
+            <w:pPr>
+              <w:spacing w:after="60"/>
+            </w:pPr>
+            <w:r>
+              <w:t xml:space="preserve">Folk (Light Touch)</w:t>
+            </w:r>
+          </w:p>
+        </w:tc>
+        <w:tc>
+          <w:tcPr>
+            <w:tcW w:type="pct" w:w="2250%"/>
+          </w:tcPr>
+          <w:p>
+            <w:pPr>
+              <w:spacing w:after="60"/>
+            </w:pPr>
+            <w:r>
+              <w:rPr>
+                <w:b/>
+                <w:bCs/>
+              </w:rPr>
+              <w:t xml:space="preserve">7.0</w:t>
+            </w:r>
+          </w:p>
+        </w:tc>
+        <w:tc>
+          <w:tcPr>
+            <w:tcW w:type="pct" w:w="2250%"/>
+          </w:tcPr>
+          <w:p>
+            <w:pPr>
+              <w:spacing w:after="60"/>
+            </w:pPr>
+            <w:r>
+              <w:t xml:space="preserve">functionalSimplicity </w:t>
+            </w:r>
+            <w:r>
+              <w:rPr>
+                <w:b/>
+                <w:bCs/>
+              </w:rPr>
+              <w:t xml:space="preserve">0.25</w:t>
+            </w:r>
+            <w:r>
+              <w:t xml:space="preserve">, chordSparsity </w:t>
+            </w:r>
+            <w:r>
+              <w:rPr>
+                <w:b/>
+                <w:bCs/>
+              </w:rPr>
+              <w:t xml:space="preserve">0.25</w:t>
+            </w:r>
+            <w:r>
+              <w:t xml:space="preserve">, steadyPulse </w:t>
+            </w:r>
+            <w:r>
+              <w:rPr>
+                <w:b/>
+                <w:bCs/>
+              </w:rPr>
+              <w:t xml:space="preserve">0.25</w:t>
+            </w:r>
+            <w:r>
+              <w:t xml:space="preserve">, intimateEnsemble </w:t>
+            </w:r>
+            <w:r>
+              <w:rPr>
+                <w:b/>
+                <w:bCs/>
+              </w:rPr>
+              <w:t xml:space="preserve">0.25</w:t>
+            </w:r>
+          </w:p>
+        </w:tc>
+      </w:tr>
+      <w:tr>
+        <w:tc>
+          <w:tcPr>
+            <w:tcW w:type="pct" w:w="2250%"/>
+          </w:tcPr>
+          <w:p>
+            <w:pPr>
+              <w:spacing w:after="60"/>
+            </w:pPr>
+            <w:r>
+              <w:rPr>
+                <w:b/>
+                <w:bCs/>
+              </w:rPr>
+              <w:t xml:space="preserve">`classical`</w:t>
+            </w:r>
+          </w:p>
+        </w:tc>
+        <w:tc>
+          <w:tcPr>
+            <w:tcW w:type="pct" w:w="2250%"/>
+          </w:tcPr>
+          <w:p>
+            <w:pPr>
+              <w:spacing w:after="60"/>
+            </w:pPr>
+            <w:r>
+              <w:t xml:space="preserve">Classical (Light Touch)</w:t>
+            </w:r>
+          </w:p>
+        </w:tc>
+        <w:tc>
+          <w:tcPr>
+            <w:tcW w:type="pct" w:w="2250%"/>
+          </w:tcPr>
+          <w:p>
+            <w:pPr>
+              <w:spacing w:after="60"/>
+            </w:pPr>
+            <w:r>
+              <w:rPr>
+                <w:b/>
+                <w:bCs/>
+              </w:rPr>
+              <w:t xml:space="preserve">7.0</w:t>
+            </w:r>
+          </w:p>
+        </w:tc>
+        <w:tc>
+          <w:tcPr>
+            <w:tcW w:type="pct" w:w="2250%"/>
+          </w:tcPr>
+          <w:p>
+            <w:pPr>
+              <w:spacing w:after="60"/>
+            </w:pPr>
+            <w:r>
+              <w:t xml:space="preserve">functionalModulation </w:t>
+            </w:r>
+            <w:r>
+              <w:rPr>
+                <w:b/>
+                <w:bCs/>
+              </w:rPr>
+              <w:t xml:space="preserve">0.30</w:t>
+            </w:r>
+            <w:r>
+              <w:t xml:space="preserve">, orchestralBreadth </w:t>
+            </w:r>
+            <w:r>
+              <w:rPr>
+                <w:b/>
+                <w:bCs/>
+              </w:rPr>
+              <w:t xml:space="preserve">0.30</w:t>
+            </w:r>
+            <w:r>
+              <w:t xml:space="preserve">, periodicPhrasing </w:t>
+            </w:r>
+            <w:r>
+              <w:rPr>
+                <w:b/>
+                <w:bCs/>
+              </w:rPr>
+              <w:t xml:space="preserve">0.20</w:t>
+            </w:r>
+            <w:r>
+              <w:t xml:space="preserve">, metricDefinition </w:t>
+            </w:r>
+            <w:r>
+              <w:rPr>
+                <w:b/>
+                <w:bCs/>
+              </w:rPr>
+              <w:t xml:space="preserve">0.20</w:t>
+            </w:r>
+          </w:p>
+        </w:tc>
+      </w:tr>
+      <w:tr>
+        <w:tc>
+          <w:tcPr>
+            <w:tcW w:type="pct" w:w="2250%"/>
+          </w:tcPr>
+          <w:p>
+            <w:pPr>
+              <w:spacing w:after="60"/>
+            </w:pPr>
+            <w:r>
+              <w:rPr>
+                <w:b/>
+                <w:bCs/>
+              </w:rPr>
+              <w:t xml:space="preserve">`bebop`</w:t>
+            </w:r>
+          </w:p>
+        </w:tc>
+        <w:tc>
+          <w:tcPr>
+            <w:tcW w:type="pct" w:w="2250%"/>
+          </w:tcPr>
+          <w:p>
+            <w:pPr>
+              <w:spacing w:after="60"/>
+            </w:pPr>
+            <w:r>
+              <w:t xml:space="preserve">Bebop (Light Touch)</w:t>
+            </w:r>
+          </w:p>
+        </w:tc>
+        <w:tc>
+          <w:tcPr>
+            <w:tcW w:type="pct" w:w="2250%"/>
+          </w:tcPr>
+          <w:p>
+            <w:pPr>
+              <w:spacing w:after="60"/>
+            </w:pPr>
+            <w:r>
+              <w:rPr>
+                <w:b/>
+                <w:bCs/>
+              </w:rPr>
+              <w:t xml:space="preserve">7.0</w:t>
+            </w:r>
+          </w:p>
+        </w:tc>
+        <w:tc>
+          <w:tcPr>
+            <w:tcW w:type="pct" w:w="2250%"/>
+          </w:tcPr>
+          <w:p>
+            <w:pPr>
+              <w:spacing w:after="60"/>
+            </w:pPr>
+            <w:r>
+              <w:t xml:space="preserve">extendedHarmony </w:t>
+            </w:r>
+            <w:r>
+              <w:rPr>
+                <w:b/>
+                <w:bCs/>
+              </w:rPr>
+              <w:t xml:space="preserve">0.30</w:t>
+            </w:r>
+            <w:r>
+              <w:t xml:space="preserve">, sparseComping </w:t>
+            </w:r>
+            <w:r>
+              <w:rPr>
+                <w:b/>
+                <w:bCs/>
+              </w:rPr>
+              <w:t xml:space="preserve">0.25</w:t>
+            </w:r>
+            <w:r>
+              <w:t xml:space="preserve">, syncopationDrive </w:t>
+            </w:r>
+            <w:r>
+              <w:rPr>
+                <w:b/>
+                <w:bCs/>
+              </w:rPr>
+              <w:t xml:space="preserve">0.25</w:t>
+            </w:r>
+            <w:r>
+              <w:t xml:space="preserve">, comboLinearWeight </w:t>
+            </w:r>
+            <w:r>
+              <w:rPr>
+                <w:b/>
+                <w:bCs/>
+              </w:rPr>
+              <w:t xml:space="preserve">0.20</w:t>
+            </w:r>
+          </w:p>
+        </w:tc>
+      </w:tr>
+    </w:tbl>
+    <w:p>
+      <w:pPr>
+        <w:spacing w:after="160"/>
+      </w:pPr>
     </w:p>
     <w:p>
       <w:pPr>
@@ -21558,6 +23259,163 @@
         <w:spacing w:after="100" w:before="160"/>
       </w:pPr>
       <w:r>
+        <w:t xml:space="preserve">How to add a new style profile (5 steps)</w:t>
+      </w:r>
+    </w:p>
+    <w:p>
+      <w:pPr>
+        <w:spacing w:after="160"/>
+      </w:pPr>
+      <w:r>
+        <w:t xml:space="preserve">1. Add </w:t>
+      </w:r>
+      <w:r>
+        <w:rPr>
+          <w:b/>
+          <w:bCs/>
+        </w:rPr>
+        <w:t xml:space="preserve">`yourStyleProfile.ts`</w:t>
+      </w:r>
+      <w:r>
+        <w:t xml:space="preserve"> under </w:t>
+      </w:r>
+      <w:r>
+        <w:rPr>
+          <w:b/>
+          <w:bCs/>
+        </w:rPr>
+        <w:t xml:space="preserve">`engines/composer-os-v2/core/evaluation/`</w:t>
+      </w:r>
+      <w:r>
+        <w:t xml:space="preserve"> implementing </w:t>
+      </w:r>
+      <w:r>
+        <w:rPr>
+          <w:b/>
+          <w:bCs/>
+        </w:rPr>
+        <w:t xml:space="preserve">`StyleProfile`</w:t>
+      </w:r>
+      <w:r>
+        <w:t xml:space="preserve"> (`dimensions`, </w:t>
+      </w:r>
+      <w:r>
+        <w:rPr>
+          <w:b/>
+          <w:bCs/>
+        </w:rPr>
+        <w:t xml:space="preserve">`threshold`</w:t>
+      </w:r>
+      <w:r>
+        <w:t xml:space="preserve">, </w:t>
+      </w:r>
+      <w:r>
+        <w:rPr>
+          <w:b/>
+          <w:bCs/>
+        </w:rPr>
+        <w:t xml:space="preserve">`score`</w:t>
+      </w:r>
+      <w:r>
+        <w:t xml:space="preserve"> reading </w:t>
+      </w:r>
+      <w:r>
+        <w:rPr>
+          <w:b/>
+          <w:bCs/>
+        </w:rPr>
+        <w:t xml:space="preserve">`ExtractedStyleFeatures`</w:t>
+      </w:r>
+      <w:r>
+        <w:t xml:space="preserve">). 2. Export from </w:t>
+      </w:r>
+      <w:r>
+        <w:rPr>
+          <w:b/>
+          <w:bCs/>
+        </w:rPr>
+        <w:t xml:space="preserve">`index.ts`</w:t>
+      </w:r>
+      <w:r>
+        <w:t xml:space="preserve">. 3. Extend </w:t>
+      </w:r>
+      <w:r>
+        <w:rPr>
+          <w:b/>
+          <w:bCs/>
+        </w:rPr>
+        <w:t xml:space="preserve">`featureExtractor`</w:t>
+      </w:r>
+      <w:r>
+        <w:t xml:space="preserve"> (or downstream enrichers) if new </w:t>
+      </w:r>
+      <w:r>
+        <w:rPr>
+          <w:b/>
+          <w:bCs/>
+        </w:rPr>
+        <w:t xml:space="preserve">`featureKeys`</w:t>
+      </w:r>
+      <w:r>
+        <w:t xml:space="preserve"> are required. 4. Wire Big Band </w:t>
+      </w:r>
+      <w:r>
+        <w:rPr>
+          <w:b/>
+          <w:bCs/>
+        </w:rPr>
+        <w:t xml:space="preserve">`composerStyle`</w:t>
+      </w:r>
+      <w:r>
+        <w:t xml:space="preserve"> → profile in </w:t>
+      </w:r>
+      <w:r>
+        <w:rPr>
+          <w:b/>
+          <w:bCs/>
+        </w:rPr>
+        <w:t xml:space="preserve">`composerOsAppGeneration.ts`</w:t>
+      </w:r>
+      <w:r>
+        <w:t xml:space="preserve"> (same pattern as Basie / Ellington / Schneider / Quincy). 5. Add </w:t>
+      </w:r>
+      <w:r>
+        <w:rPr>
+          <w:b/>
+          <w:bCs/>
+        </w:rPr>
+        <w:t xml:space="preserve">smoke</w:t>
+      </w:r>
+      <w:r>
+        <w:t xml:space="preserve"> coverage in </w:t>
+      </w:r>
+      <w:r>
+        <w:rPr>
+          <w:b/>
+          <w:bCs/>
+        </w:rPr>
+        <w:t xml:space="preserve">`evaluation.smoke.test.ts`</w:t>
+      </w:r>
+      <w:r>
+        <w:t xml:space="preserve"> and run </w:t>
+      </w:r>
+      <w:r>
+        <w:rPr>
+          <w:b/>
+          <w:bCs/>
+        </w:rPr>
+        <w:t xml:space="preserve">`npm run test:composer-smoke`</w:t>
+      </w:r>
+      <w:r>
+        <w:t xml:space="preserve">.</w:t>
+      </w:r>
+    </w:p>
+    <w:p>
+      <w:pPr>
+        <w:pStyle w:val="Heading2"/>
+        <w:spacing w:after="100" w:before="160"/>
+      </w:pPr>
+      <w:r>
         <w:t xml:space="preserve">Smoke baseline</w:t>
       </w:r>
     </w:p>
@@ -21580,7 +23438,7 @@
           <w:b/>
           <w:bCs/>
         </w:rPr>
-        <w:t xml:space="preserve">146</w:t>
+        <w:t xml:space="preserve">157</w:t>
       </w:r>
       <w:r>
         <w:t xml:space="preserve"> PASS rows, </w:t>
@@ -21590,7 +23448,7 @@
           <w:b/>
           <w:bCs/>
         </w:rPr>
-        <w:t xml:space="preserve">39</w:t>
+        <w:t xml:space="preserve">41</w:t>
       </w:r>
       <w:r>
         <w:t xml:space="preserve"> suites (</w:t>
@@ -22339,6 +24197,1868 @@
       </w:r>
       <w:r>
         <w:t xml:space="preserve">.</w:t>
+      </w:r>
+    </w:p>
+    <w:p>
+      <w:pPr>
+        <w:pStyle w:val="Heading1"/>
+        <w:spacing w:after="120" w:before="200"/>
+      </w:pPr>
+      <w:r>
+        <w:t xml:space="preserve">Tonality Vault — Expanded Roadmap</w:t>
+      </w:r>
+    </w:p>
+    <w:p>
+      <w:pPr>
+        <w:spacing w:after="160"/>
+      </w:pPr>
+      <w:r>
+        <w:t xml:space="preserve">Composer OS is extending </w:t>
+      </w:r>
+      <w:r>
+        <w:rPr>
+          <w:b/>
+          <w:bCs/>
+        </w:rPr>
+        <w:t xml:space="preserve">Tonality Vault</w:t>
+      </w:r>
+      <w:r>
+        <w:t xml:space="preserve"> into guitar-forward generation, </w:t>
+      </w:r>
+      <w:r>
+        <w:rPr>
+          <w:b/>
+          <w:bCs/>
+        </w:rPr>
+        <w:t xml:space="preserve">liquid harmony</w:t>
+      </w:r>
+      <w:r>
+        <w:t xml:space="preserve">, </w:t>
+      </w:r>
+      <w:r>
+        <w:rPr>
+          <w:b/>
+          <w:bCs/>
+        </w:rPr>
+        <w:t xml:space="preserve">reharmonisation</w:t>
+      </w:r>
+      <w:r>
+        <w:t xml:space="preserve">, and arrangement routing. This section is the </w:t>
+      </w:r>
+      <w:r>
+        <w:rPr>
+          <w:b/>
+          <w:bCs/>
+        </w:rPr>
+        <w:t xml:space="preserve">product/engine roadmap</w:t>
+      </w:r>
+      <w:r>
+        <w:t xml:space="preserve"> for that expansion (implementation spans `engines/composer-os-v2/core/harmony/` and related pipelines). Cross-link: </w:t>
+      </w:r>
+      <w:r>
+        <w:rPr>
+          <w:b/>
+          <w:bCs/>
+        </w:rPr>
+        <w:t xml:space="preserve">`docs/GCE_FRAMEWORK_V2.md`</w:t>
+      </w:r>
+      <w:r>
+        <w:t xml:space="preserve"> for evaluation philosophy; engine chord-type reference continues from </w:t>
+      </w:r>
+      <w:r>
+        <w:rPr>
+          <w:b/>
+          <w:bCs/>
+        </w:rPr>
+        <w:t xml:space="preserve">`tonalityVaultDatabase`</w:t>
+      </w:r>
+      <w:r>
+        <w:t xml:space="preserve"> / </w:t>
+      </w:r>
+      <w:r>
+        <w:rPr>
+          <w:b/>
+          <w:bCs/>
+        </w:rPr>
+        <w:t xml:space="preserve">`quadratonicMelodySelector`</w:t>
+      </w:r>
+      <w:r>
+        <w:t xml:space="preserve">.</w:t>
+      </w:r>
+    </w:p>
+    <w:p>
+      <w:pPr>
+        <w:pStyle w:val="Heading2"/>
+        <w:spacing w:after="100" w:before="160"/>
+      </w:pPr>
+      <w:r>
+        <w:t xml:space="preserve">External riff ecosystem audit (read-only, no clone)</w:t>
+      </w:r>
+    </w:p>
+    <w:p>
+      <w:pPr>
+        <w:spacing w:after="160"/>
+      </w:pPr>
+      <w:r>
+        <w:t xml:space="preserve">The following GitHub repos were checked via </w:t>
+      </w:r>
+      <w:r>
+        <w:rPr>
+          <w:b/>
+          <w:bCs/>
+        </w:rPr>
+        <w:t xml:space="preserve">public API / raw README only</w:t>
+      </w:r>
+      <w:r>
+        <w:t xml:space="preserve"> (no clone, no local files). Use them as </w:t>
+      </w:r>
+      <w:r>
+        <w:rPr>
+          <w:b/>
+          <w:bCs/>
+        </w:rPr>
+        <w:t xml:space="preserve">hints for data shapes and ecosystem wiring</w:t>
+      </w:r>
+      <w:r>
+        <w:t xml:space="preserve">, not as drop-in dependencies until reviewed.</w:t>
+      </w:r>
+    </w:p>
+    <w:tbl>
+      <w:tblPr>
+        <w:tblW w:type="pct" w:w="100%"/>
+        <w:tblBorders>
+          <w:top w:val="single" w:color="auto" w:sz="4"/>
+          <w:left w:val="single" w:color="auto" w:sz="4"/>
+          <w:bottom w:val="single" w:color="auto" w:sz="4"/>
+          <w:right w:val="single" w:color="auto" w:sz="4"/>
+          <w:insideH w:val="single" w:color="auto" w:sz="4"/>
+          <w:insideV w:val="single" w:color="auto" w:sz="4"/>
+        </w:tblBorders>
+      </w:tblPr>
+      <w:tblGrid>
+        <w:gridCol w:w="1500"/>
+        <w:gridCol w:w="1500"/>
+        <w:gridCol w:w="1500"/>
+        <w:gridCol w:w="1500"/>
+        <w:gridCol w:w="1500"/>
+        <w:gridCol w:w="1500"/>
+      </w:tblGrid>
+      <w:tr>
+        <w:tc>
+          <w:tcPr>
+            <w:tcW w:type="pct" w:w="1500%"/>
+          </w:tcPr>
+          <w:p>
+            <w:pPr>
+              <w:spacing w:after="60"/>
+            </w:pPr>
+            <w:r>
+              <w:t xml:space="preserve">Repository</w:t>
+            </w:r>
+          </w:p>
+        </w:tc>
+        <w:tc>
+          <w:tcPr>
+            <w:tcW w:type="pct" w:w="1500%"/>
+          </w:tcPr>
+          <w:p>
+            <w:pPr>
+              <w:spacing w:after="60"/>
+            </w:pPr>
+            <w:r>
+              <w:t xml:space="preserve">What it is (public metadata)</w:t>
+            </w:r>
+          </w:p>
+        </w:tc>
+        <w:tc>
+          <w:tcPr>
+            <w:tcW w:type="pct" w:w="1500%"/>
+          </w:tcPr>
+          <w:p>
+            <w:pPr>
+              <w:spacing w:after="60"/>
+            </w:pPr>
+            <w:r>
+              <w:t xml:space="preserve">Stack</w:t>
+            </w:r>
+          </w:p>
+        </w:tc>
+        <w:tc>
+          <w:tcPr>
+            <w:tcW w:type="pct" w:w="1500%"/>
+          </w:tcPr>
+          <w:p>
+            <w:pPr>
+              <w:spacing w:after="60"/>
+            </w:pPr>
+            <w:r>
+              <w:t xml:space="preserve">Guitar / fretboard</w:t>
+            </w:r>
+          </w:p>
+        </w:tc>
+        <w:tc>
+          <w:tcPr>
+            <w:tcW w:type="pct" w:w="1500%"/>
+          </w:tcPr>
+          <w:p>
+            <w:pPr>
+              <w:spacing w:after="60"/>
+            </w:pPr>
+            <w:r>
+              <w:t xml:space="preserve">Riff data / banks</w:t>
+            </w:r>
+          </w:p>
+        </w:tc>
+        <w:tc>
+          <w:tcPr>
+            <w:tcW w:type="pct" w:w="1500%"/>
+          </w:tcPr>
+          <w:p>
+            <w:pPr>
+              <w:spacing w:after="60"/>
+            </w:pPr>
+            <w:r>
+              <w:t xml:space="preserve">Notes for Composer OS TS</w:t>
+            </w:r>
+          </w:p>
+        </w:tc>
+      </w:tr>
+      <w:tr>
+        <w:tc>
+          <w:tcPr>
+            <w:tcW w:type="pct" w:w="1500%"/>
+          </w:tcPr>
+          <w:p>
+            <w:pPr>
+              <w:spacing w:after="60"/>
+            </w:pPr>
+            <w:r>
+              <w:t xml:space="preserve">[mikeb55/riffgen](https://github.com/mikeb55/riffgen)</w:t>
+            </w:r>
+          </w:p>
+        </w:tc>
+        <w:tc>
+          <w:tcPr>
+            <w:tcW w:type="pct" w:w="1500%"/>
+          </w:tcPr>
+          <w:p>
+            <w:pPr>
+              <w:spacing w:after="60"/>
+            </w:pPr>
+            <w:r>
+              <w:t xml:space="preserve">HTML/JS quartet + guitar engine. </w:t>
+            </w:r>
+            <w:r>
+              <w:rPr>
+                <w:b/>
+                <w:bCs/>
+              </w:rPr>
+              <w:t xml:space="preserve">`generateRiff()`</w:t>
+            </w:r>
+            <w:r>
+              <w:t xml:space="preserve"> uses named profiles + scale rows</w:t>
+            </w:r>
+          </w:p>
+        </w:tc>
+        <w:tc>
+          <w:tcPr>
+            <w:tcW w:type="pct" w:w="1500%"/>
+          </w:tcPr>
+          <w:p>
+            <w:pPr>
+              <w:spacing w:after="60"/>
+            </w:pPr>
+            <w:r>
+              <w:t xml:space="preserve">HTML / JS</w:t>
+            </w:r>
+          </w:p>
+        </w:tc>
+        <w:tc>
+          <w:tcPr>
+            <w:tcW w:type="pct" w:w="1500%"/>
+          </w:tcPr>
+          <w:p>
+            <w:pPr>
+              <w:spacing w:after="60"/>
+            </w:pPr>
+            <w:r>
+              <w:t xml:space="preserve">No fretboard logic</w:t>
+            </w:r>
+          </w:p>
+        </w:tc>
+        <w:tc>
+          <w:tcPr>
+            <w:tcW w:type="pct" w:w="1500%"/>
+          </w:tcPr>
+          <w:p>
+            <w:pPr>
+              <w:spacing w:after="60"/>
+            </w:pPr>
+            <w:r>
+              <w:t xml:space="preserve">Data-driven scale/profile rows (starter </w:t>
+            </w:r>
+            <w:r>
+              <w:rPr>
+                <w:b/>
+                <w:bCs/>
+              </w:rPr>
+              <w:t xml:space="preserve">`web/riffgen.js`</w:t>
+            </w:r>
+            <w:r>
+              <w:t xml:space="preserve">)</w:t>
+            </w:r>
+          </w:p>
+        </w:tc>
+        <w:tc>
+          <w:tcPr>
+            <w:tcW w:type="pct" w:w="1500%"/>
+          </w:tcPr>
+          <w:p>
+            <w:pPr>
+              <w:spacing w:after="60"/>
+            </w:pPr>
+            <w:r>
+              <w:t xml:space="preserve">Data-driven architecture portable to TS — swap harmony-library imports for </w:t>
+            </w:r>
+            <w:r>
+              <w:rPr>
+                <w:b/>
+                <w:bCs/>
+              </w:rPr>
+              <w:t xml:space="preserve">`tonalityVaultDatabase`</w:t>
+            </w:r>
+            <w:r>
+              <w:t xml:space="preserve">. </w:t>
+            </w:r>
+            <w:r>
+              <w:rPr>
+                <w:b/>
+                <w:bCs/>
+              </w:rPr>
+              <w:t xml:space="preserve">MIT</w:t>
+            </w:r>
+          </w:p>
+        </w:tc>
+      </w:tr>
+      <w:tr>
+        <w:tc>
+          <w:tcPr>
+            <w:tcW w:type="pct" w:w="1500%"/>
+          </w:tcPr>
+          <w:p>
+            <w:pPr>
+              <w:spacing w:after="60"/>
+            </w:pPr>
+            <w:r>
+              <w:t xml:space="preserve">[mikeb55/riffgen2](https://github.com/mikeb55/riffgen2)</w:t>
+            </w:r>
+          </w:p>
+        </w:tc>
+        <w:tc>
+          <w:tcPr>
+            <w:tcW w:type="pct" w:w="1500%"/>
+          </w:tcPr>
+          <w:p>
+            <w:pPr>
+              <w:spacing w:after="60"/>
+            </w:pPr>
+            <w:r>
+              <w:t xml:space="preserve">Browser guitar riff generator with </w:t>
+            </w:r>
+            <w:r>
+              <w:rPr>
+                <w:b/>
+                <w:bCs/>
+              </w:rPr>
+              <w:t xml:space="preserve">Tone.js</w:t>
+            </w:r>
+            <w:r>
+              <w:t xml:space="preserve">. </w:t>
+            </w:r>
+            <w:r>
+              <w:rPr>
+                <w:b/>
+                <w:bCs/>
+              </w:rPr>
+              <w:t xml:space="preserve">16-slot binary rhythm masks</w:t>
+            </w:r>
+            <w:r>
+              <w:t xml:space="preserve"> per style (rock / blues / metal / jazz / funk), named scale pools, </w:t>
+            </w:r>
+            <w:r>
+              <w:rPr>
+                <w:b/>
+                <w:bCs/>
+              </w:rPr>
+              <w:t xml:space="preserve">`noteToFret()`</w:t>
+            </w:r>
+            <w:r>
+              <w:t xml:space="preserve"> simplified E-standard fret mapper</w:t>
+            </w:r>
+          </w:p>
+        </w:tc>
+        <w:tc>
+          <w:tcPr>
+            <w:tcW w:type="pct" w:w="1500%"/>
+          </w:tcPr>
+          <w:p>
+            <w:pPr>
+              <w:spacing w:after="60"/>
+            </w:pPr>
+            <w:r>
+              <w:t xml:space="preserve">HTML + JS (Tone.js)</w:t>
+            </w:r>
+          </w:p>
+        </w:tc>
+        <w:tc>
+          <w:tcPr>
+            <w:tcW w:type="pct" w:w="1500%"/>
+          </w:tcPr>
+          <w:p>
+            <w:pPr>
+              <w:spacing w:after="60"/>
+            </w:pPr>
+            <w:r>
+              <w:rPr>
+                <w:b/>
+                <w:bCs/>
+              </w:rPr>
+              <w:t xml:space="preserve">`noteToFret()`</w:t>
+            </w:r>
+            <w:r>
+              <w:t xml:space="preserve"> simplified E-standard mapper (tab UI)</w:t>
+            </w:r>
+          </w:p>
+        </w:tc>
+        <w:tc>
+          <w:tcPr>
+            <w:tcW w:type="pct" w:w="1500%"/>
+          </w:tcPr>
+          <w:p>
+            <w:pPr>
+              <w:spacing w:after="60"/>
+            </w:pPr>
+            <w:r>
+              <w:t xml:space="preserve">Rhythm masks + scale pools (`standalone_riffgen.html`)</w:t>
+            </w:r>
+          </w:p>
+        </w:tc>
+        <w:tc>
+          <w:tcPr>
+            <w:tcW w:type="pct" w:w="1500%"/>
+          </w:tcPr>
+          <w:p>
+            <w:pPr>
+              <w:spacing w:after="60"/>
+            </w:pPr>
+            <w:r>
+              <w:t xml:space="preserve">Port rhythm masks and fret mapping ideas to </w:t>
+            </w:r>
+            <w:r>
+              <w:rPr>
+                <w:b/>
+                <w:bCs/>
+              </w:rPr>
+              <w:t xml:space="preserve">VaultRiffGenerator</w:t>
+            </w:r>
+            <w:r>
+              <w:t xml:space="preserve"> — replace random scale walks with quadratonic / grip rules. License unclear</w:t>
+            </w:r>
+          </w:p>
+        </w:tc>
+      </w:tr>
+      <w:tr>
+        <w:tc>
+          <w:tcPr>
+            <w:tcW w:type="pct" w:w="1500%"/>
+          </w:tcPr>
+          <w:p>
+            <w:pPr>
+              <w:spacing w:after="60"/>
+            </w:pPr>
+            <w:r>
+              <w:t xml:space="preserve">[mikeb55/riffgen3](https://github.com/mikeb55/riffgen3)</w:t>
+            </w:r>
+          </w:p>
+        </w:tc>
+        <w:tc>
+          <w:tcPr>
+            <w:tcW w:type="pct" w:w="1500%"/>
+          </w:tcPr>
+          <w:p>
+            <w:pPr>
+              <w:spacing w:after="60"/>
+            </w:pPr>
+            <w:r>
+              <w:t xml:space="preserve">Placeholder / minimal (</w:t>
+            </w:r>
+            <w:r>
+              <w:rPr>
+                <w:b/>
+                <w:bCs/>
+              </w:rPr>
+              <w:t xml:space="preserve">Shell</w:t>
+            </w:r>
+            <w:r>
+              <w:t xml:space="preserve"> only; tiny footprint)</w:t>
+            </w:r>
+          </w:p>
+        </w:tc>
+        <w:tc>
+          <w:tcPr>
+            <w:tcW w:type="pct" w:w="1500%"/>
+          </w:tcPr>
+          <w:p>
+            <w:pPr>
+              <w:spacing w:after="60"/>
+            </w:pPr>
+            <w:r>
+              <w:t xml:space="preserve">Shell</w:t>
+            </w:r>
+          </w:p>
+        </w:tc>
+        <w:tc>
+          <w:tcPr>
+            <w:tcW w:type="pct" w:w="1500%"/>
+          </w:tcPr>
+          <w:p>
+            <w:pPr>
+              <w:spacing w:after="60"/>
+            </w:pPr>
+            <w:r>
+              <w:t xml:space="preserve">Not evidenced</w:t>
+            </w:r>
+          </w:p>
+        </w:tc>
+        <w:tc>
+          <w:tcPr>
+            <w:tcW w:type="pct" w:w="1500%"/>
+          </w:tcPr>
+          <w:p>
+            <w:pPr>
+              <w:spacing w:after="60"/>
+            </w:pPr>
+            <w:r>
+              <w:t xml:space="preserve">No</w:t>
+            </w:r>
+          </w:p>
+        </w:tc>
+        <w:tc>
+          <w:tcPr>
+            <w:tcW w:type="pct" w:w="1500%"/>
+          </w:tcPr>
+          <w:p>
+            <w:pPr>
+              <w:spacing w:after="60"/>
+            </w:pPr>
+            <w:r>
+              <w:t xml:space="preserve">No reusable engine logic visible publicly</w:t>
+            </w:r>
+          </w:p>
+        </w:tc>
+      </w:tr>
+      <w:tr>
+        <w:tc>
+          <w:tcPr>
+            <w:tcW w:type="pct" w:w="1500%"/>
+          </w:tcPr>
+          <w:p>
+            <w:pPr>
+              <w:spacing w:after="60"/>
+            </w:pPr>
+            <w:r>
+              <w:t xml:space="preserve">[mikeb55/RiffgenPro](https://github.com/mikeb55/RiffgenPro)</w:t>
+            </w:r>
+          </w:p>
+        </w:tc>
+        <w:tc>
+          <w:tcPr>
+            <w:tcW w:type="pct" w:w="1500%"/>
+          </w:tcPr>
+          <w:p>
+            <w:pPr>
+              <w:spacing w:after="60"/>
+            </w:pPr>
+            <w:r>
+              <w:t xml:space="preserve">Stub (“Made in Claude”; empty language stats)</w:t>
+            </w:r>
+          </w:p>
+        </w:tc>
+        <w:tc>
+          <w:tcPr>
+            <w:tcW w:type="pct" w:w="1500%"/>
+          </w:tcPr>
+          <w:p>
+            <w:pPr>
+              <w:spacing w:after="60"/>
+            </w:pPr>
+            <w:r>
+              <w:t xml:space="preserve">—</w:t>
+            </w:r>
+          </w:p>
+        </w:tc>
+        <w:tc>
+          <w:tcPr>
+            <w:tcW w:type="pct" w:w="1500%"/>
+          </w:tcPr>
+          <w:p>
+            <w:pPr>
+              <w:spacing w:after="60"/>
+            </w:pPr>
+            <w:r>
+              <w:t xml:space="preserve">Not evidenced</w:t>
+            </w:r>
+          </w:p>
+        </w:tc>
+        <w:tc>
+          <w:tcPr>
+            <w:tcW w:type="pct" w:w="1500%"/>
+          </w:tcPr>
+          <w:p>
+            <w:pPr>
+              <w:spacing w:after="60"/>
+            </w:pPr>
+            <w:r>
+              <w:t xml:space="preserve">No</w:t>
+            </w:r>
+          </w:p>
+        </w:tc>
+        <w:tc>
+          <w:tcPr>
+            <w:tcW w:type="pct" w:w="1500%"/>
+          </w:tcPr>
+          <w:p>
+            <w:pPr>
+              <w:spacing w:after="60"/>
+            </w:pPr>
+            <w:r>
+              <w:t xml:space="preserve">Treat as placeholder</w:t>
+            </w:r>
+          </w:p>
+        </w:tc>
+      </w:tr>
+      <w:tr>
+        <w:tc>
+          <w:tcPr>
+            <w:tcW w:type="pct" w:w="1500%"/>
+          </w:tcPr>
+          <w:p>
+            <w:pPr>
+              <w:spacing w:after="60"/>
+            </w:pPr>
+            <w:r>
+              <w:t xml:space="preserve">[mikeb55/riffbank](https://github.com/mikeb55/riffbank)</w:t>
+            </w:r>
+          </w:p>
+        </w:tc>
+        <w:tc>
+          <w:tcPr>
+            <w:tcW w:type="pct" w:w="1500%"/>
+          </w:tcPr>
+          <w:p>
+            <w:pPr>
+              <w:spacing w:after="60"/>
+            </w:pPr>
+            <w:r>
+              <w:t xml:space="preserve">Shared </w:t>
+            </w:r>
+            <w:r>
+              <w:rPr>
+                <w:b/>
+                <w:bCs/>
+              </w:rPr>
+              <w:t xml:space="preserve">riff/motif</w:t>
+            </w:r>
+            <w:r>
+              <w:t xml:space="preserve"> library (</w:t>
+            </w:r>
+            <w:r>
+              <w:rPr>
+                <w:b/>
+                <w:bCs/>
+              </w:rPr>
+              <w:t xml:space="preserve">MIT</w:t>
+            </w:r>
+            <w:r>
+              <w:t xml:space="preserve">): JSON + optional MIDI; `data/riffs.json` with MIDI pitch + duration rows</w:t>
+            </w:r>
+          </w:p>
+        </w:tc>
+        <w:tc>
+          <w:tcPr>
+            <w:tcW w:type="pct" w:w="1500%"/>
+          </w:tcPr>
+          <w:p>
+            <w:pPr>
+              <w:spacing w:after="60"/>
+            </w:pPr>
+            <w:r>
+              <w:t xml:space="preserve">Docs say JSON/MIDI; </w:t>
+            </w:r>
+            <w:r>
+              <w:rPr>
+                <w:b/>
+                <w:bCs/>
+              </w:rPr>
+              <w:t xml:space="preserve">languages</w:t>
+            </w:r>
+            <w:r>
+              <w:t xml:space="preserve"> unset at API</w:t>
+            </w:r>
+          </w:p>
+        </w:tc>
+        <w:tc>
+          <w:tcPr>
+            <w:tcW w:type="pct" w:w="1500%"/>
+          </w:tcPr>
+          <w:p>
+            <w:pPr>
+              <w:spacing w:after="60"/>
+            </w:pPr>
+            <w:r>
+              <w:t xml:space="preserve">README: </w:t>
+            </w:r>
+            <w:r>
+              <w:rPr>
+                <w:b/>
+                <w:bCs/>
+              </w:rPr>
+              <w:t xml:space="preserve">no fretboard</w:t>
+            </w:r>
+            <w:r>
+              <w:t xml:space="preserve">—abstract pitch/duration</w:t>
+            </w:r>
+          </w:p>
+        </w:tc>
+        <w:tc>
+          <w:tcPr>
+            <w:tcW w:type="pct" w:w="1500%"/>
+          </w:tcPr>
+          <w:p>
+            <w:pPr>
+              <w:spacing w:after="60"/>
+            </w:pPr>
+            <w:r>
+              <w:rPr>
+                <w:b/>
+                <w:bCs/>
+              </w:rPr>
+              <w:t xml:space="preserve">Yes</w:t>
+            </w:r>
+            <w:r>
+              <w:t xml:space="preserve"> — starter bank + `riffbank_v1.zip`; </w:t>
+            </w:r>
+            <w:r>
+              <w:rPr>
+                <w:b/>
+                <w:bCs/>
+              </w:rPr>
+              <w:t xml:space="preserve">schema/</w:t>
+            </w:r>
+            <w:r>
+              <w:t xml:space="preserve"> + </w:t>
+            </w:r>
+            <w:r>
+              <w:rPr>
+                <w:b/>
+                <w:bCs/>
+              </w:rPr>
+              <w:t xml:space="preserve">types/</w:t>
+            </w:r>
+            <w:r>
+              <w:t xml:space="preserve"> dirs</w:t>
+            </w:r>
+          </w:p>
+        </w:tc>
+        <w:tc>
+          <w:tcPr>
+            <w:tcW w:type="pct" w:w="1500%"/>
+          </w:tcPr>
+          <w:p>
+            <w:pPr>
+              <w:spacing w:after="60"/>
+            </w:pPr>
+            <w:r>
+              <w:rPr>
+                <w:b/>
+                <w:bCs/>
+              </w:rPr>
+              <w:t xml:space="preserve">Portable:</w:t>
+            </w:r>
+            <w:r>
+              <w:t xml:space="preserve"> trivial mapping from `{ pitch, dur }` to score-model notes; copy </w:t>
+            </w:r>
+            <w:r>
+              <w:rPr>
+                <w:b/>
+                <w:bCs/>
+              </w:rPr>
+              <w:t xml:space="preserve">schema/types</w:t>
+            </w:r>
+            <w:r>
+              <w:t xml:space="preserve"> after license review</w:t>
+            </w:r>
+          </w:p>
+        </w:tc>
+      </w:tr>
+      <w:tr>
+        <w:tc>
+          <w:tcPr>
+            <w:tcW w:type="pct" w:w="1500%"/>
+          </w:tcPr>
+          <w:p>
+            <w:pPr>
+              <w:spacing w:after="60"/>
+            </w:pPr>
+            <w:r>
+              <w:t xml:space="preserve">[mikeb55/infinite-riff-machine](https://github.com/mikeb55/infinite-riff-machine)</w:t>
+            </w:r>
+          </w:p>
+        </w:tc>
+        <w:tc>
+          <w:tcPr>
+            <w:tcW w:type="pct" w:w="1500%"/>
+          </w:tcPr>
+          <w:p>
+            <w:pPr>
+              <w:spacing w:after="60"/>
+            </w:pPr>
+            <w:r>
+              <w:rPr>
+                <w:b/>
+                <w:bCs/>
+              </w:rPr>
+              <w:t xml:space="preserve">IRM</w:t>
+            </w:r>
+            <w:r>
+              <w:t xml:space="preserve">: riff variation + section chaining; integrates </w:t>
+            </w:r>
+            <w:r>
+              <w:rPr>
+                <w:b/>
+                <w:bCs/>
+              </w:rPr>
+              <w:t xml:space="preserve">riffbank</w:t>
+            </w:r>
+            <w:r>
+              <w:t xml:space="preserve">, </w:t>
+            </w:r>
+            <w:r>
+              <w:rPr>
+                <w:b/>
+                <w:bCs/>
+              </w:rPr>
+              <w:t xml:space="preserve">mrprofiles</w:t>
+            </w:r>
+            <w:r>
+              <w:t xml:space="preserve">, </w:t>
+            </w:r>
+            <w:r>
+              <w:rPr>
+                <w:b/>
+                <w:bCs/>
+              </w:rPr>
+              <w:t xml:space="preserve">harmony-library</w:t>
+            </w:r>
+            <w:r>
+              <w:t xml:space="preserve"> (</w:t>
+            </w:r>
+            <w:r>
+              <w:rPr>
+                <w:b/>
+                <w:bCs/>
+              </w:rPr>
+              <w:t xml:space="preserve">MIT</w:t>
+            </w:r>
+            <w:r>
+              <w:t xml:space="preserve">)</w:t>
+            </w:r>
+          </w:p>
+        </w:tc>
+        <w:tc>
+          <w:tcPr>
+            <w:tcW w:type="pct" w:w="1500%"/>
+          </w:tcPr>
+          <w:p>
+            <w:pPr>
+              <w:spacing w:after="60"/>
+            </w:pPr>
+            <w:r>
+              <w:rPr>
+                <w:b/>
+                <w:bCs/>
+              </w:rPr>
+              <w:t xml:space="preserve">JavaScript</w:t>
+            </w:r>
+            <w:r>
+              <w:t xml:space="preserve">; </w:t>
+            </w:r>
+            <w:r>
+              <w:rPr>
+                <w:b/>
+                <w:bCs/>
+              </w:rPr>
+              <w:t xml:space="preserve">web/</w:t>
+            </w:r>
+            <w:r>
+              <w:t xml:space="preserve"> demo, </w:t>
+            </w:r>
+            <w:r>
+              <w:rPr>
+                <w:b/>
+                <w:bCs/>
+              </w:rPr>
+              <w:t xml:space="preserve">schema/riff.schema.json</w:t>
+            </w:r>
+            <w:r>
+              <w:t xml:space="preserve">, </w:t>
+            </w:r>
+            <w:r>
+              <w:rPr>
+                <w:b/>
+                <w:bCs/>
+              </w:rPr>
+              <w:t xml:space="preserve">types/</w:t>
+            </w:r>
+          </w:p>
+        </w:tc>
+        <w:tc>
+          <w:tcPr>
+            <w:tcW w:type="pct" w:w="1500%"/>
+          </w:tcPr>
+          <w:p>
+            <w:pPr>
+              <w:spacing w:after="60"/>
+            </w:pPr>
+            <w:r>
+              <w:t xml:space="preserve">README: </w:t>
+            </w:r>
+            <w:r>
+              <w:rPr>
+                <w:b/>
+                <w:bCs/>
+              </w:rPr>
+              <w:t xml:space="preserve">not guitar-specific</w:t>
+            </w:r>
+          </w:p>
+        </w:tc>
+        <w:tc>
+          <w:tcPr>
+            <w:tcW w:type="pct" w:w="1500%"/>
+          </w:tcPr>
+          <w:p>
+            <w:pPr>
+              <w:spacing w:after="60"/>
+            </w:pPr>
+            <w:r>
+              <w:t xml:space="preserve">Variation engine + zip bundle</w:t>
+            </w:r>
+          </w:p>
+        </w:tc>
+        <w:tc>
+          <w:tcPr>
+            <w:tcW w:type="pct" w:w="1500%"/>
+          </w:tcPr>
+          <w:p>
+            <w:pPr>
+              <w:spacing w:after="60"/>
+            </w:pPr>
+            <w:r>
+              <w:rPr>
+                <w:b/>
+                <w:bCs/>
+              </w:rPr>
+              <w:t xml:space="preserve">Portable:</w:t>
+            </w:r>
+            <w:r>
+              <w:t xml:space="preserve"> JSON Schema + TS-adjacent </w:t>
+            </w:r>
+            <w:r>
+              <w:rPr>
+                <w:b/>
+                <w:bCs/>
+              </w:rPr>
+              <w:t xml:space="preserve">types/</w:t>
+            </w:r>
+            <w:r>
+              <w:t xml:space="preserve"> useful as contract reference; JS web code → rewrite in TS</w:t>
+            </w:r>
+          </w:p>
+        </w:tc>
+      </w:tr>
+      <w:tr>
+        <w:tc>
+          <w:tcPr>
+            <w:tcW w:type="pct" w:w="1500%"/>
+          </w:tcPr>
+          <w:p>
+            <w:pPr>
+              <w:spacing w:after="60"/>
+            </w:pPr>
+            <w:r>
+              <w:t xml:space="preserve">[mikeb55/grand-criteria-of-excellence-jazz](https://github.com/mikeb55/grand-criteria-of-excellence-jazz)</w:t>
+            </w:r>
+          </w:p>
+        </w:tc>
+        <w:tc>
+          <w:tcPr>
+            <w:tcW w:type="pct" w:w="1500%"/>
+          </w:tcPr>
+          <w:p>
+            <w:pPr>
+              <w:spacing w:after="60"/>
+            </w:pPr>
+            <w:r>
+              <w:t xml:space="preserve">Large mixed repo: </w:t>
+            </w:r>
+            <w:r>
+              <w:rPr>
+                <w:b/>
+                <w:bCs/>
+              </w:rPr>
+              <w:t xml:space="preserve">HTML</w:t>
+            </w:r>
+            <w:r>
+              <w:t xml:space="preserve">, </w:t>
+            </w:r>
+            <w:r>
+              <w:rPr>
+                <w:b/>
+                <w:bCs/>
+              </w:rPr>
+              <w:t xml:space="preserve">Python</w:t>
+            </w:r>
+            <w:r>
+              <w:t xml:space="preserve">, </w:t>
+            </w:r>
+            <w:r>
+              <w:rPr>
+                <w:b/>
+                <w:bCs/>
+              </w:rPr>
+              <w:t xml:space="preserve">LilyPond</w:t>
+            </w:r>
+            <w:r>
+              <w:t xml:space="preserve">, etc.; folders e.g. </w:t>
+            </w:r>
+            <w:r>
+              <w:rPr>
+                <w:b/>
+                <w:bCs/>
+              </w:rPr>
+              <w:t xml:space="preserve">BarryEngine</w:t>
+            </w:r>
+            <w:r>
+              <w:t xml:space="preserve">, </w:t>
+            </w:r>
+            <w:r>
+              <w:rPr>
+                <w:b/>
+                <w:bCs/>
+              </w:rPr>
+              <w:t xml:space="preserve">Bebop Language</w:t>
+            </w:r>
+            <w:r>
+              <w:t xml:space="preserve">, </w:t>
+            </w:r>
+            <w:r>
+              <w:rPr>
+                <w:b/>
+                <w:bCs/>
+              </w:rPr>
+              <w:t xml:space="preserve">Composition Rules</w:t>
+            </w:r>
+          </w:p>
+        </w:tc>
+        <w:tc>
+          <w:tcPr>
+            <w:tcW w:type="pct" w:w="1500%"/>
+          </w:tcPr>
+          <w:p>
+            <w:pPr>
+              <w:spacing w:after="60"/>
+            </w:pPr>
+            <w:r>
+              <w:t xml:space="preserve">Multi-language</w:t>
+            </w:r>
+          </w:p>
+        </w:tc>
+        <w:tc>
+          <w:tcPr>
+            <w:tcW w:type="pct" w:w="1500%"/>
+          </w:tcPr>
+          <w:p>
+            <w:pPr>
+              <w:spacing w:after="60"/>
+            </w:pPr>
+            <w:r>
+              <w:t xml:space="preserve">Not confirmed from README alone</w:t>
+            </w:r>
+          </w:p>
+        </w:tc>
+        <w:tc>
+          <w:tcPr>
+            <w:tcW w:type="pct" w:w="1500%"/>
+          </w:tcPr>
+          <w:p>
+            <w:pPr>
+              <w:spacing w:after="60"/>
+            </w:pPr>
+            <w:r>
+              <w:t xml:space="preserve">Rules/text more than MIDI riff bank</w:t>
+            </w:r>
+          </w:p>
+        </w:tc>
+        <w:tc>
+          <w:tcPr>
+            <w:tcW w:type="pct" w:w="1500%"/>
+          </w:tcPr>
+          <w:p>
+            <w:pPr>
+              <w:spacing w:after="60"/>
+            </w:pPr>
+            <w:r>
+              <w:rPr>
+                <w:b/>
+                <w:bCs/>
+              </w:rPr>
+              <w:t xml:space="preserve">Alignment</w:t>
+            </w:r>
+            <w:r>
+              <w:t xml:space="preserve"> with </w:t>
+            </w:r>
+            <w:r>
+              <w:rPr>
+                <w:b/>
+                <w:bCs/>
+              </w:rPr>
+              <w:t xml:space="preserve">GCE</w:t>
+            </w:r>
+            <w:r>
+              <w:t xml:space="preserve">-style jazz criteria; </w:t>
+            </w:r>
+            <w:r>
+              <w:rPr>
+                <w:b/>
+                <w:bCs/>
+              </w:rPr>
+              <w:t xml:space="preserve">direct TS port</w:t>
+            </w:r>
+            <w:r>
+              <w:t xml:space="preserve"> unlikely without case-by-case extraction</w:t>
+            </w:r>
+          </w:p>
+        </w:tc>
+      </w:tr>
+    </w:tbl>
+    <w:p>
+      <w:pPr>
+        <w:spacing w:after="160"/>
+      </w:pPr>
+    </w:p>
+    <w:p>
+      <w:pPr>
+        <w:spacing w:after="160"/>
+      </w:pPr>
+      <w:r>
+        <w:rPr>
+          <w:b/>
+          <w:bCs/>
+        </w:rPr>
+        <w:t xml:space="preserve">Takeaway:</w:t>
+      </w:r>
+      <w:r>
+        <w:t xml:space="preserve"> Prior to building </w:t>
+      </w:r>
+      <w:r>
+        <w:rPr>
+          <w:b/>
+          <w:bCs/>
+        </w:rPr>
+        <w:t xml:space="preserve">VaultRiffGenerator</w:t>
+      </w:r>
+      <w:r>
+        <w:t xml:space="preserve">, mine </w:t>
+      </w:r>
+      <w:r>
+        <w:rPr>
+          <w:b/>
+          <w:bCs/>
+        </w:rPr>
+        <w:t xml:space="preserve">[riffbank](https://github.com/mikeb55/riffbank)</w:t>
+      </w:r>
+      <w:r>
+        <w:t xml:space="preserve"> (JSON snippets + schema) and </w:t>
+      </w:r>
+      <w:r>
+        <w:rPr>
+          <w:b/>
+          <w:bCs/>
+        </w:rPr>
+        <w:t xml:space="preserve">[infinite-riff-machine](https://github.com/mikeb55/infinite-riff-machine)</w:t>
+      </w:r>
+      <w:r>
+        <w:t xml:space="preserve"> (</w:t>
+      </w:r>
+      <w:r>
+        <w:rPr>
+          <w:b/>
+          <w:bCs/>
+        </w:rPr>
+        <w:t xml:space="preserve">riff.schema.json</w:t>
+      </w:r>
+      <w:r>
+        <w:t xml:space="preserve">, section/variation intent). Treat </w:t>
+      </w:r>
+      <w:r>
+        <w:rPr>
+          <w:b/>
+          <w:bCs/>
+        </w:rPr>
+        <w:t xml:space="preserve">grand-criteria-of-excellence-jazz</w:t>
+      </w:r>
+      <w:r>
+        <w:t xml:space="preserve"> as </w:t>
+      </w:r>
+      <w:r>
+        <w:rPr>
+          <w:b/>
+          <w:bCs/>
+        </w:rPr>
+        <w:t xml:space="preserve">research/diagnostic</w:t>
+      </w:r>
+      <w:r>
+        <w:t xml:space="preserve"> adjacent to GCE, not a guitar engine.</w:t>
+      </w:r>
+    </w:p>
+    <w:p>
+      <w:pPr>
+        <w:pStyle w:val="Heading2"/>
+        <w:spacing w:after="100" w:before="160"/>
+      </w:pPr>
+      <w:r>
+        <w:t xml:space="preserve">Planned builds (engine)</w:t>
+      </w:r>
+    </w:p>
+    <w:p>
+      <w:pPr>
+        <w:spacing w:after="80"/>
+        <w:ind w:left="360" w:hanging="260"/>
+      </w:pPr>
+      <w:r>
+        <w:t xml:space="preserve">• </w:t>
+      </w:r>
+      <w:r>
+        <w:rPr>
+          <w:b/>
+          <w:bCs/>
+        </w:rPr>
+        <w:t xml:space="preserve">Build A — Note tagging + beat context:</w:t>
+      </w:r>
+      <w:r>
+        <w:t xml:space="preserve"> </w:t>
+      </w:r>
+      <w:r>
+        <w:rPr>
+          <w:b/>
+          <w:bCs/>
+        </w:rPr>
+        <w:t xml:space="preserve">`BeatContextLegalityMap`</w:t>
+      </w:r>
+      <w:r>
+        <w:t xml:space="preserve"> and </w:t>
+      </w:r>
+      <w:r>
+        <w:rPr>
+          <w:b/>
+          <w:bCs/>
+        </w:rPr>
+        <w:t xml:space="preserve">`NoteTag`</w:t>
+      </w:r>
+      <w:r>
+        <w:t xml:space="preserve"> schema. Every note carries </w:t>
+      </w:r>
+      <w:r>
+        <w:rPr>
+          <w:b/>
+          <w:bCs/>
+        </w:rPr>
+        <w:t xml:space="preserve">tonal role</w:t>
+      </w:r>
+      <w:r>
+        <w:t xml:space="preserve">, </w:t>
+      </w:r>
+      <w:r>
+        <w:rPr>
+          <w:b/>
+          <w:bCs/>
+        </w:rPr>
+        <w:t xml:space="preserve">layer</w:t>
+      </w:r>
+      <w:r>
+        <w:t xml:space="preserve">, </w:t>
+      </w:r>
+      <w:r>
+        <w:rPr>
+          <w:b/>
+          <w:bCs/>
+        </w:rPr>
+        <w:t xml:space="preserve">beat legality</w:t>
+      </w:r>
+      <w:r>
+        <w:t xml:space="preserve">, </w:t>
+      </w:r>
+      <w:r>
+        <w:rPr>
+          <w:b/>
+          <w:bCs/>
+        </w:rPr>
+        <w:t xml:space="preserve">resolve targets</w:t>
+      </w:r>
+      <w:r>
+        <w:t xml:space="preserve">, </w:t>
+      </w:r>
+      <w:r>
+        <w:rPr>
+          <w:b/>
+          <w:bCs/>
+        </w:rPr>
+        <w:t xml:space="preserve">voicing compatibility</w:t>
+      </w:r>
+      <w:r>
+        <w:t xml:space="preserve">, </w:t>
+      </w:r>
+      <w:r>
+        <w:rPr>
+          <w:b/>
+          <w:bCs/>
+        </w:rPr>
+        <w:t xml:space="preserve">guitar techniques</w:t>
+      </w:r>
+      <w:r>
+        <w:t xml:space="preserve"> (pick/finger/slide tags as applicable).</w:t>
+      </w:r>
+    </w:p>
+    <w:p>
+      <w:pPr>
+        <w:spacing w:after="80"/>
+        <w:ind w:left="360" w:hanging="260"/>
+      </w:pPr>
+      <w:r>
+        <w:t xml:space="preserve">• </w:t>
+      </w:r>
+      <w:r>
+        <w:rPr>
+          <w:b/>
+          <w:bCs/>
+        </w:rPr>
+        <w:t xml:space="preserve">Build B — Layer state machine + liquid harmony:</w:t>
+      </w:r>
+      <w:r>
+        <w:t xml:space="preserve"> </w:t>
+      </w:r>
+      <w:r>
+        <w:rPr>
+          <w:b/>
+          <w:bCs/>
+        </w:rPr>
+        <w:t xml:space="preserve">`LayerStateMachine`</w:t>
+      </w:r>
+      <w:r>
+        <w:t xml:space="preserve"> (Resolve → Primary → Tension → Chaos → Recover) driving </w:t>
+      </w:r>
+      <w:r>
+        <w:rPr>
+          <w:b/>
+          <w:bCs/>
+        </w:rPr>
+        <w:t xml:space="preserve">`LiquidHarmonyPlanner`</w:t>
+      </w:r>
+      <w:r>
+        <w:t xml:space="preserve">. Phrase-level intention from the state machine; </w:t>
+      </w:r>
+      <w:r>
+        <w:rPr>
+          <w:b/>
+          <w:bCs/>
+        </w:rPr>
+        <w:t xml:space="preserve">liquid harmony</w:t>
+      </w:r>
+      <w:r>
+        <w:t xml:space="preserve"> shapes internal voicing motion per subdivision.</w:t>
+      </w:r>
+    </w:p>
+    <w:p>
+      <w:pPr>
+        <w:spacing w:after="80"/>
+        <w:ind w:left="360" w:hanging="260"/>
+      </w:pPr>
+      <w:r>
+        <w:t xml:space="preserve">• </w:t>
+      </w:r>
+      <w:r>
+        <w:rPr>
+          <w:b/>
+          <w:bCs/>
+        </w:rPr>
+        <w:t xml:space="preserve">Build C — Guitar riff engine:</w:t>
+      </w:r>
+      <w:r>
+        <w:t xml:space="preserve"> </w:t>
+      </w:r>
+      <w:r>
+        <w:rPr>
+          <w:b/>
+          <w:bCs/>
+        </w:rPr>
+        <w:t xml:space="preserve">`VaultRiffGenerator`</w:t>
+      </w:r>
+      <w:r>
+        <w:t xml:space="preserve">, </w:t>
+      </w:r>
+      <w:r>
+        <w:rPr>
+          <w:b/>
+          <w:bCs/>
+        </w:rPr>
+        <w:t xml:space="preserve">`FretboardRealization`</w:t>
+      </w:r>
+      <w:r>
+        <w:t xml:space="preserve">, </w:t>
+      </w:r>
+      <w:r>
+        <w:rPr>
+          <w:b/>
+          <w:bCs/>
+        </w:rPr>
+        <w:t xml:space="preserve">guitar grip library</w:t>
+      </w:r>
+      <w:r>
+        <w:t xml:space="preserve">. Position-aware riffs using </w:t>
+      </w:r>
+      <w:r>
+        <w:rPr>
+          <w:b/>
+          <w:bCs/>
+        </w:rPr>
+        <w:t xml:space="preserve">quadratonic grips</w:t>
+      </w:r>
+      <w:r>
+        <w:t xml:space="preserve">, </w:t>
+      </w:r>
+      <w:r>
+        <w:rPr>
+          <w:b/>
+          <w:bCs/>
+        </w:rPr>
+        <w:t xml:space="preserve">dyad seesaws</w:t>
+      </w:r>
+      <w:r>
+        <w:t xml:space="preserve">, </w:t>
+      </w:r>
+      <w:r>
+        <w:rPr>
+          <w:b/>
+          <w:bCs/>
+        </w:rPr>
+        <w:t xml:space="preserve">triad-pair pendulum</w:t>
+      </w:r>
+      <w:r>
+        <w:t xml:space="preserve">, </w:t>
+      </w:r>
+      <w:r>
+        <w:rPr>
+          <w:b/>
+          <w:bCs/>
+        </w:rPr>
+        <w:t xml:space="preserve">pedal-string patterns</w:t>
+      </w:r>
+      <w:r>
+        <w:t xml:space="preserve">, </w:t>
+      </w:r>
+      <w:r>
+        <w:rPr>
+          <w:b/>
+          <w:bCs/>
+        </w:rPr>
+        <w:t xml:space="preserve">pick-attack</w:t>
+      </w:r>
+      <w:r>
+        <w:t xml:space="preserve"> tags. </w:t>
+      </w:r>
+      <w:r>
+        <w:rPr>
+          <w:b/>
+          <w:bCs/>
+        </w:rPr>
+        <w:t xml:space="preserve">Audit riffbank / infinite-riff-machine</w:t>
+      </w:r>
+      <w:r>
+        <w:t xml:space="preserve"> (above) before greenfield.</w:t>
+      </w:r>
+    </w:p>
+    <w:p>
+      <w:pPr>
+        <w:spacing w:after="80"/>
+        <w:ind w:left="360" w:hanging="260"/>
+      </w:pPr>
+      <w:r>
+        <w:t xml:space="preserve">• </w:t>
+      </w:r>
+      <w:r>
+        <w:rPr>
+          <w:b/>
+          <w:bCs/>
+        </w:rPr>
+        <w:t xml:space="preserve">Build D — Reharmonisation engine:</w:t>
+      </w:r>
+      <w:r>
+        <w:t xml:space="preserve"> </w:t>
+      </w:r>
+      <w:r>
+        <w:rPr>
+          <w:b/>
+          <w:bCs/>
+        </w:rPr>
+        <w:t xml:space="preserve">`ReharmCandidateEngine`</w:t>
+      </w:r>
+      <w:r>
+        <w:t xml:space="preserve">. Shared </w:t>
+      </w:r>
+      <w:r>
+        <w:rPr>
+          <w:b/>
+          <w:bCs/>
+        </w:rPr>
+        <w:t xml:space="preserve">melodic-triad</w:t>
+      </w:r>
+      <w:r>
+        <w:t xml:space="preserve"> substitutions, </w:t>
+      </w:r>
+      <w:r>
+        <w:rPr>
+          <w:b/>
+          <w:bCs/>
+        </w:rPr>
+        <w:t xml:space="preserve">tension-layer</w:t>
+      </w:r>
+      <w:r>
+        <w:t xml:space="preserve"> substitutions, </w:t>
+      </w:r>
+      <w:r>
+        <w:rPr>
+          <w:b/>
+          <w:bCs/>
+        </w:rPr>
+        <w:t xml:space="preserve">shell-swap</w:t>
+      </w:r>
+      <w:r>
+        <w:t xml:space="preserve"> substitutions; </w:t>
+      </w:r>
+      <w:r>
+        <w:rPr>
+          <w:b/>
+          <w:bCs/>
+        </w:rPr>
+        <w:t xml:space="preserve">emotional drift</w:t>
+      </w:r>
+      <w:r>
+        <w:t xml:space="preserve"> (darker / brighter / more suspended). Targets </w:t>
+      </w:r>
+      <w:r>
+        <w:rPr>
+          <w:b/>
+          <w:bCs/>
+        </w:rPr>
+        <w:t xml:space="preserve">standards</w:t>
+      </w:r>
+      <w:r>
+        <w:t xml:space="preserve"> and </w:t>
+      </w:r>
+      <w:r>
+        <w:rPr>
+          <w:b/>
+          <w:bCs/>
+        </w:rPr>
+        <w:t xml:space="preserve">user originals</w:t>
+      </w:r>
+      <w:r>
+        <w:t xml:space="preserve">.</w:t>
+      </w:r>
+    </w:p>
+    <w:p>
+      <w:pPr>
+        <w:spacing w:after="80"/>
+        <w:ind w:left="360" w:hanging="260"/>
+      </w:pPr>
+      <w:r>
+        <w:t xml:space="preserve">• </w:t>
+      </w:r>
+      <w:r>
+        <w:rPr>
+          <w:b/>
+          <w:bCs/>
+        </w:rPr>
+        <w:t xml:space="preserve">Build E — Arrangement layer router:</w:t>
+      </w:r>
+      <w:r>
+        <w:t xml:space="preserve"> </w:t>
+      </w:r>
+      <w:r>
+        <w:rPr>
+          <w:b/>
+          <w:bCs/>
+        </w:rPr>
+        <w:t xml:space="preserve">`ArrangementLayerRouter`</w:t>
+      </w:r>
+      <w:r>
+        <w:t xml:space="preserve">. </w:t>
+      </w:r>
+      <w:r>
+        <w:rPr>
+          <w:b/>
+          <w:bCs/>
+        </w:rPr>
+        <w:t xml:space="preserve">Bass</w:t>
+      </w:r>
+      <w:r>
+        <w:t xml:space="preserve"> on shell, </w:t>
+      </w:r>
+      <w:r>
+        <w:rPr>
+          <w:b/>
+          <w:bCs/>
+        </w:rPr>
+        <w:t xml:space="preserve">inner voices</w:t>
+      </w:r>
+      <w:r>
+        <w:t xml:space="preserve"> on melodic triad, </w:t>
+      </w:r>
+      <w:r>
+        <w:rPr>
+          <w:b/>
+          <w:bCs/>
+        </w:rPr>
+        <w:t xml:space="preserve">upper voices</w:t>
+      </w:r>
+      <w:r>
+        <w:t xml:space="preserve"> on quadratonic / triad-pair; </w:t>
+      </w:r>
+      <w:r>
+        <w:rPr>
+          <w:b/>
+          <w:bCs/>
+        </w:rPr>
+        <w:t xml:space="preserve">string quartet</w:t>
+      </w:r>
+      <w:r>
+        <w:t xml:space="preserve"> and </w:t>
+      </w:r>
+      <w:r>
+        <w:rPr>
+          <w:b/>
+          <w:bCs/>
+        </w:rPr>
+        <w:t xml:space="preserve">big band</w:t>
+      </w:r>
+      <w:r>
+        <w:t xml:space="preserve"> mappings.</w:t>
+      </w:r>
+    </w:p>
+    <w:p>
+      <w:pPr>
+        <w:spacing w:after="80"/>
+        <w:ind w:left="360" w:hanging="260"/>
+      </w:pPr>
+      <w:r>
+        <w:t xml:space="preserve">• </w:t>
+      </w:r>
+      <w:r>
+        <w:rPr>
+          <w:b/>
+          <w:bCs/>
+        </w:rPr>
+        <w:t xml:space="preserve">Build F — Motif transformation:</w:t>
+      </w:r>
+      <w:r>
+        <w:t xml:space="preserve"> Restate motifs through successive layers — </w:t>
+      </w:r>
+      <w:r>
+        <w:rPr>
+          <w:b/>
+          <w:bCs/>
+        </w:rPr>
+        <w:t xml:space="preserve">triad → quadratonic → triad pair → liquid voicings → resolve</w:t>
+      </w:r>
+      <w:r>
+        <w:t xml:space="preserve">.</w:t>
+      </w:r>
+    </w:p>
+    <w:p>
+      <w:pPr>
+        <w:spacing w:after="80"/>
+        <w:ind w:left="360" w:hanging="260"/>
+      </w:pPr>
+      <w:r>
+        <w:t xml:space="preserve">• </w:t>
+      </w:r>
+      <w:r>
+        <w:rPr>
+          <w:b/>
+          <w:bCs/>
+        </w:rPr>
+        <w:t xml:space="preserve">Build G — Full 16-tonality per-chord rulesets:</w:t>
+      </w:r>
+      <w:r>
+        <w:t xml:space="preserve"> Complete behaviour pack per chord: melodic triad, quadratonic, tension hierarchy, phrase templates, beat affinity, guitar grips, reharm candidates.</w:t>
+      </w:r>
+    </w:p>
+    <w:p>
+      <w:pPr>
+        <w:pStyle w:val="Heading2"/>
+        <w:spacing w:after="100" w:before="160"/>
+      </w:pPr>
+      <w:r>
+        <w:t xml:space="preserve">Planned UI additions</w:t>
+      </w:r>
+    </w:p>
+    <w:p>
+      <w:pPr>
+        <w:spacing w:after="160"/>
+      </w:pPr>
+      <w:r>
+        <w:rPr>
+          <w:b/>
+          <w:bCs/>
+        </w:rPr>
+        <w:t xml:space="preserve">Tension dial</w:t>
+      </w:r>
+      <w:r>
+        <w:t xml:space="preserve">, </w:t>
+      </w:r>
+      <w:r>
+        <w:rPr>
+          <w:b/>
+          <w:bCs/>
+        </w:rPr>
+        <w:t xml:space="preserve">chord-to-triad inspector</w:t>
+      </w:r>
+      <w:r>
+        <w:t xml:space="preserve">, </w:t>
+      </w:r>
+      <w:r>
+        <w:rPr>
+          <w:b/>
+          <w:bCs/>
+        </w:rPr>
+        <w:t xml:space="preserve">fretboard overlay</w:t>
+      </w:r>
+      <w:r>
+        <w:t xml:space="preserve">, </w:t>
+      </w:r>
+      <w:r>
+        <w:rPr>
+          <w:b/>
+          <w:bCs/>
+        </w:rPr>
+        <w:t xml:space="preserve">beat-legality heatmap</w:t>
+      </w:r>
+      <w:r>
+        <w:t xml:space="preserve">, </w:t>
+      </w:r>
+      <w:r>
+        <w:rPr>
+          <w:b/>
+          <w:bCs/>
+        </w:rPr>
+        <w:t xml:space="preserve">Vault microscope</w:t>
+      </w:r>
+      <w:r>
+        <w:t xml:space="preserve">, </w:t>
+      </w:r>
+      <w:r>
+        <w:rPr>
+          <w:b/>
+          <w:bCs/>
+        </w:rPr>
+        <w:t xml:space="preserve">liquid harmony preview</w:t>
+      </w:r>
+      <w:r>
+        <w:t xml:space="preserve">, </w:t>
+      </w:r>
+      <w:r>
+        <w:rPr>
+          <w:b/>
+          <w:bCs/>
+        </w:rPr>
+        <w:t xml:space="preserve">arrangement lane map</w:t>
+      </w:r>
+      <w:r>
+        <w:t xml:space="preserve">, </w:t>
+      </w:r>
+      <w:r>
+        <w:rPr>
+          <w:b/>
+          <w:bCs/>
+        </w:rPr>
+        <w:t xml:space="preserve">reharm mode</w:t>
+      </w:r>
+      <w:r>
+        <w:t xml:space="preserve">, </w:t>
+      </w:r>
+      <w:r>
+        <w:rPr>
+          <w:b/>
+          <w:bCs/>
+        </w:rPr>
+        <w:t xml:space="preserve">guitar riff mode</w:t>
+      </w:r>
+      <w:r>
+        <w:t xml:space="preserve">.</w:t>
+      </w:r>
+    </w:p>
+    <w:p>
+      <w:pPr>
+        <w:pStyle w:val="Heading2"/>
+        <w:spacing w:after="100" w:before="160"/>
+      </w:pPr>
+      <w:r>
+        <w:t xml:space="preserve">Build order</w:t>
+      </w:r>
+    </w:p>
+    <w:p>
+      <w:pPr>
+        <w:spacing w:after="160"/>
+      </w:pPr>
+      <w:r>
+        <w:rPr>
+          <w:b/>
+          <w:bCs/>
+        </w:rPr>
+        <w:t xml:space="preserve">A → C → B → D → E → F → G</w:t>
+      </w:r>
+      <w:r>
+        <w:t xml:space="preserve"> (guitar riff engine </w:t>
+      </w:r>
+      <w:r>
+        <w:rPr>
+          <w:b/>
+          <w:bCs/>
+        </w:rPr>
+        <w:t xml:space="preserve">C</w:t>
+      </w:r>
+      <w:r>
+        <w:t xml:space="preserve"> prioritised immediately after tagging/context </w:t>
+      </w:r>
+      <w:r>
+        <w:rPr>
+          <w:b/>
+          <w:bCs/>
+        </w:rPr>
+        <w:t xml:space="preserve">A</w:t>
+      </w:r>
+      <w:r>
+        <w:t xml:space="preserve">).</w:t>
       </w:r>
     </w:p>
     <w:p>

</xml_diff>

<commit_message>
feat: Tonality Vault Build A — NoteTag schema and BeatContextLegalityMap; docs: playbook and CLAUDE.md updated
Co-authored-by: Cursor <cursoragent@cursor.com>
</commit_message>
<xml_diff>
--- a/docs/COMPOSER_OS_PLAYBOOK.docx
+++ b/docs/COMPOSER_OS_PLAYBOOK.docx
@@ -25437,6 +25437,1020 @@
         <w:spacing w:after="100" w:before="160"/>
       </w:pPr>
       <w:r>
+        <w:t xml:space="preserve">Build A — Note tagging + beat context (**complete**)</w:t>
+      </w:r>
+    </w:p>
+    <w:p>
+      <w:pPr>
+        <w:spacing w:after="160"/>
+      </w:pPr>
+      <w:r>
+        <w:rPr>
+          <w:b/>
+          <w:bCs/>
+        </w:rPr>
+        <w:t xml:space="preserve">Shipped</w:t>
+      </w:r>
+      <w:r>
+        <w:t xml:space="preserve"> in `engines/composer-os-v2/core/harmony/` — </w:t>
+      </w:r>
+      <w:r>
+        <w:rPr>
+          <w:b/>
+          <w:bCs/>
+        </w:rPr>
+        <w:t xml:space="preserve">`noteTag.ts`</w:t>
+      </w:r>
+      <w:r>
+        <w:t xml:space="preserve">, </w:t>
+      </w:r>
+      <w:r>
+        <w:rPr>
+          <w:b/>
+          <w:bCs/>
+        </w:rPr>
+        <w:t xml:space="preserve">`beatContextLegalityMap.ts`</w:t>
+      </w:r>
+      <w:r>
+        <w:t xml:space="preserve"> (re-exported from </w:t>
+      </w:r>
+      <w:r>
+        <w:rPr>
+          <w:b/>
+          <w:bCs/>
+        </w:rPr>
+        <w:t xml:space="preserve">`harmony/index.ts`</w:t>
+      </w:r>
+      <w:r>
+        <w:t xml:space="preserve">).</w:t>
+      </w:r>
+    </w:p>
+    <w:p>
+      <w:pPr>
+        <w:spacing w:after="160"/>
+      </w:pPr>
+      <w:r>
+        <w:rPr>
+          <w:b/>
+          <w:bCs/>
+        </w:rPr>
+        <w:t xml:space="preserve">`NoteTag`</w:t>
+      </w:r>
+      <w:r>
+        <w:t xml:space="preserve"> — per–pitch-class metadata for melody / guitar layers:</w:t>
+      </w:r>
+    </w:p>
+    <w:tbl>
+      <w:tblPr>
+        <w:tblW w:type="pct" w:w="100%"/>
+        <w:tblBorders>
+          <w:top w:val="single" w:color="auto" w:sz="4"/>
+          <w:left w:val="single" w:color="auto" w:sz="4"/>
+          <w:bottom w:val="single" w:color="auto" w:sz="4"/>
+          <w:right w:val="single" w:color="auto" w:sz="4"/>
+          <w:insideH w:val="single" w:color="auto" w:sz="4"/>
+          <w:insideV w:val="single" w:color="auto" w:sz="4"/>
+        </w:tblBorders>
+      </w:tblPr>
+      <w:tblGrid>
+        <w:gridCol w:w="1000"/>
+        <w:gridCol w:w="1000"/>
+        <w:gridCol w:w="1000"/>
+        <w:gridCol w:w="1000"/>
+        <w:gridCol w:w="1000"/>
+        <w:gridCol w:w="1000"/>
+        <w:gridCol w:w="1000"/>
+        <w:gridCol w:w="1000"/>
+        <w:gridCol w:w="1000"/>
+      </w:tblGrid>
+      <w:tr>
+        <w:tc>
+          <w:tcPr>
+            <w:tcW w:type="pct" w:w="1000%"/>
+          </w:tcPr>
+          <w:p>
+            <w:pPr>
+              <w:spacing w:after="60"/>
+            </w:pPr>
+            <w:r>
+              <w:t xml:space="preserve">Field</w:t>
+            </w:r>
+          </w:p>
+        </w:tc>
+        <w:tc>
+          <w:tcPr>
+            <w:tcW w:type="pct" w:w="1000%"/>
+          </w:tcPr>
+          <w:p>
+            <w:pPr>
+              <w:spacing w:after="60"/>
+            </w:pPr>
+            <w:r>
+              <w:t xml:space="preserve">Purpose</w:t>
+            </w:r>
+          </w:p>
+        </w:tc>
+      </w:tr>
+      <w:tr>
+        <w:tc>
+          <w:tcPr>
+            <w:tcW w:type="pct" w:w="1000%"/>
+          </w:tcPr>
+          <w:p>
+            <w:pPr>
+              <w:spacing w:after="60"/>
+            </w:pPr>
+            <w:r>
+              <w:rPr>
+                <w:b/>
+                <w:bCs/>
+              </w:rPr>
+              <w:t xml:space="preserve">`tonalRole`</w:t>
+            </w:r>
+          </w:p>
+        </w:tc>
+        <w:tc>
+          <w:tcPr>
+            <w:tcW w:type="pct" w:w="1000%"/>
+          </w:tcPr>
+          <w:p>
+            <w:pPr>
+              <w:spacing w:after="60"/>
+            </w:pPr>
+            <w:r>
+              <w:t xml:space="preserve">`triadRoot` \</w:t>
+            </w:r>
+          </w:p>
+        </w:tc>
+        <w:tc>
+          <w:tcPr>
+            <w:tcW w:type="pct" w:w="1000%"/>
+          </w:tcPr>
+          <w:p>
+            <w:pPr>
+              <w:spacing w:after="60"/>
+            </w:pPr>
+            <w:r>
+              <w:t xml:space="preserve">`triadThird` \</w:t>
+            </w:r>
+          </w:p>
+        </w:tc>
+        <w:tc>
+          <w:tcPr>
+            <w:tcW w:type="pct" w:w="1000%"/>
+          </w:tcPr>
+          <w:p>
+            <w:pPr>
+              <w:spacing w:after="60"/>
+            </w:pPr>
+            <w:r>
+              <w:t xml:space="preserve">`triadFifth` \</w:t>
+            </w:r>
+          </w:p>
+        </w:tc>
+        <w:tc>
+          <w:tcPr>
+            <w:tcW w:type="pct" w:w="1000%"/>
+          </w:tcPr>
+          <w:p>
+            <w:pPr>
+              <w:spacing w:after="60"/>
+            </w:pPr>
+            <w:r>
+              <w:t xml:space="preserve">`primaryTension` \</w:t>
+            </w:r>
+          </w:p>
+        </w:tc>
+        <w:tc>
+          <w:tcPr>
+            <w:tcW w:type="pct" w:w="1000%"/>
+          </w:tcPr>
+          <w:p>
+            <w:pPr>
+              <w:spacing w:after="60"/>
+            </w:pPr>
+            <w:r>
+              <w:t xml:space="preserve">`secondaryTension` \</w:t>
+            </w:r>
+          </w:p>
+        </w:tc>
+        <w:tc>
+          <w:tcPr>
+            <w:tcW w:type="pct" w:w="1000%"/>
+          </w:tcPr>
+          <w:p>
+            <w:pPr>
+              <w:spacing w:after="60"/>
+            </w:pPr>
+            <w:r>
+              <w:t xml:space="preserve">`triadPairTension` \</w:t>
+            </w:r>
+          </w:p>
+        </w:tc>
+        <w:tc>
+          <w:tcPr>
+            <w:tcW w:type="pct" w:w="1000%"/>
+          </w:tcPr>
+          <w:p>
+            <w:pPr>
+              <w:spacing w:after="60"/>
+            </w:pPr>
+            <w:r>
+              <w:t xml:space="preserve">`bebopPassing` \</w:t>
+            </w:r>
+          </w:p>
+        </w:tc>
+        <w:tc>
+          <w:tcPr>
+            <w:tcW w:type="pct" w:w="1000%"/>
+          </w:tcPr>
+          <w:p>
+            <w:pPr>
+              <w:spacing w:after="60"/>
+            </w:pPr>
+            <w:r>
+              <w:t xml:space="preserve">`chaos` (last two reserved for later engines).</w:t>
+            </w:r>
+          </w:p>
+        </w:tc>
+      </w:tr>
+      <w:tr>
+        <w:tc>
+          <w:tcPr>
+            <w:tcW w:type="pct" w:w="1000%"/>
+          </w:tcPr>
+          <w:p>
+            <w:pPr>
+              <w:spacing w:after="60"/>
+            </w:pPr>
+            <w:r>
+              <w:rPr>
+                <w:b/>
+                <w:bCs/>
+              </w:rPr>
+              <w:t xml:space="preserve">`layer`</w:t>
+            </w:r>
+          </w:p>
+        </w:tc>
+        <w:tc>
+          <w:tcPr>
+            <w:tcW w:type="pct" w:w="1000%"/>
+          </w:tcPr>
+          <w:p>
+            <w:pPr>
+              <w:spacing w:after="60"/>
+            </w:pPr>
+            <w:r>
+              <w:t xml:space="preserve">`0` \</w:t>
+            </w:r>
+          </w:p>
+        </w:tc>
+        <w:tc>
+          <w:tcPr>
+            <w:tcW w:type="pct" w:w="1000%"/>
+          </w:tcPr>
+          <w:p>
+            <w:pPr>
+              <w:spacing w:after="60"/>
+            </w:pPr>
+            <w:r>
+              <w:t xml:space="preserve">`1` \</w:t>
+            </w:r>
+          </w:p>
+        </w:tc>
+        <w:tc>
+          <w:tcPr>
+            <w:tcW w:type="pct" w:w="1000%"/>
+          </w:tcPr>
+          <w:p>
+            <w:pPr>
+              <w:spacing w:after="60"/>
+            </w:pPr>
+            <w:r>
+              <w:t xml:space="preserve">`2` \</w:t>
+            </w:r>
+          </w:p>
+        </w:tc>
+        <w:tc>
+          <w:tcPr>
+            <w:tcW w:type="pct" w:w="1000%"/>
+          </w:tcPr>
+          <w:p>
+            <w:pPr>
+              <w:spacing w:after="60"/>
+            </w:pPr>
+            <w:r>
+              <w:t xml:space="preserve">`3` — depth of harmonic intent (triad surface → chaos).</w:t>
+            </w:r>
+          </w:p>
+        </w:tc>
+      </w:tr>
+      <w:tr>
+        <w:tc>
+          <w:tcPr>
+            <w:tcW w:type="pct" w:w="1000%"/>
+          </w:tcPr>
+          <w:p>
+            <w:pPr>
+              <w:spacing w:after="60"/>
+            </w:pPr>
+            <w:r>
+              <w:rPr>
+                <w:b/>
+                <w:bCs/>
+              </w:rPr>
+              <w:t xml:space="preserve">`beatLegality`</w:t>
+            </w:r>
+          </w:p>
+        </w:tc>
+        <w:tc>
+          <w:tcPr>
+            <w:tcW w:type="pct" w:w="1000%"/>
+          </w:tcPr>
+          <w:p>
+            <w:pPr>
+              <w:spacing w:after="60"/>
+            </w:pPr>
+            <w:r>
+              <w:t xml:space="preserve">`strong` \</w:t>
+            </w:r>
+          </w:p>
+        </w:tc>
+        <w:tc>
+          <w:tcPr>
+            <w:tcW w:type="pct" w:w="1000%"/>
+          </w:tcPr>
+          <w:p>
+            <w:pPr>
+              <w:spacing w:after="60"/>
+            </w:pPr>
+            <w:r>
+              <w:t xml:space="preserve">`weak` \</w:t>
+            </w:r>
+          </w:p>
+        </w:tc>
+        <w:tc>
+          <w:tcPr>
+            <w:tcW w:type="pct" w:w="1000%"/>
+          </w:tcPr>
+          <w:p>
+            <w:pPr>
+              <w:spacing w:after="60"/>
+            </w:pPr>
+            <w:r>
+              <w:t xml:space="preserve">`syncopated` \</w:t>
+            </w:r>
+          </w:p>
+        </w:tc>
+        <w:tc>
+          <w:tcPr>
+            <w:tcW w:type="pct" w:w="1000%"/>
+          </w:tcPr>
+          <w:p>
+            <w:pPr>
+              <w:spacing w:after="60"/>
+            </w:pPr>
+            <w:r>
+              <w:t xml:space="preserve">`approachOnly` — where an attack on this pitch class is rhythmically valid.</w:t>
+            </w:r>
+          </w:p>
+        </w:tc>
+      </w:tr>
+      <w:tr>
+        <w:tc>
+          <w:tcPr>
+            <w:tcW w:type="pct" w:w="1000%"/>
+          </w:tcPr>
+          <w:p>
+            <w:pPr>
+              <w:spacing w:after="60"/>
+            </w:pPr>
+            <w:r>
+              <w:rPr>
+                <w:b/>
+                <w:bCs/>
+              </w:rPr>
+              <w:t xml:space="preserve">`resolveTargets`</w:t>
+            </w:r>
+          </w:p>
+        </w:tc>
+        <w:tc>
+          <w:tcPr>
+            <w:tcW w:type="pct" w:w="1000%"/>
+          </w:tcPr>
+          <w:p>
+            <w:pPr>
+              <w:spacing w:after="60"/>
+            </w:pPr>
+            <w:r>
+              <w:t xml:space="preserve">Absolute </w:t>
+            </w:r>
+            <w:r>
+              <w:rPr>
+                <w:b/>
+                <w:bCs/>
+              </w:rPr>
+              <w:t xml:space="preserve">pitch classes (0–11)</w:t>
+            </w:r>
+            <w:r>
+              <w:t xml:space="preserve"> preferred continuations / resolutions.</w:t>
+            </w:r>
+          </w:p>
+        </w:tc>
+      </w:tr>
+      <w:tr>
+        <w:tc>
+          <w:tcPr>
+            <w:tcW w:type="pct" w:w="1000%"/>
+          </w:tcPr>
+          <w:p>
+            <w:pPr>
+              <w:spacing w:after="60"/>
+            </w:pPr>
+            <w:r>
+              <w:rPr>
+                <w:b/>
+                <w:bCs/>
+              </w:rPr>
+              <w:t xml:space="preserve">`voicingCompatibility`</w:t>
+            </w:r>
+          </w:p>
+        </w:tc>
+        <w:tc>
+          <w:tcPr>
+            <w:tcW w:type="pct" w:w="1000%"/>
+          </w:tcPr>
+          <w:p>
+            <w:pPr>
+              <w:spacing w:after="60"/>
+            </w:pPr>
+            <w:r>
+              <w:t xml:space="preserve">Optional string tags for voicing rules (scaffold: empty until voicing hooks land).</w:t>
+            </w:r>
+          </w:p>
+        </w:tc>
+      </w:tr>
+      <w:tr>
+        <w:tc>
+          <w:tcPr>
+            <w:tcW w:type="pct" w:w="1000%"/>
+          </w:tcPr>
+          <w:p>
+            <w:pPr>
+              <w:spacing w:after="60"/>
+            </w:pPr>
+            <w:r>
+              <w:rPr>
+                <w:b/>
+                <w:bCs/>
+              </w:rPr>
+              <w:t xml:space="preserve">`guitarTechniques`</w:t>
+            </w:r>
+          </w:p>
+        </w:tc>
+        <w:tc>
+          <w:tcPr>
+            <w:tcW w:type="pct" w:w="1000%"/>
+          </w:tcPr>
+          <w:p>
+            <w:pPr>
+              <w:spacing w:after="60"/>
+            </w:pPr>
+            <w:r>
+              <w:t xml:space="preserve">Optional string tags (e.g. pick / slide); scaffold until </w:t>
+            </w:r>
+            <w:r>
+              <w:rPr>
+                <w:b/>
+                <w:bCs/>
+              </w:rPr>
+              <w:t xml:space="preserve">VaultRiffGenerator</w:t>
+            </w:r>
+            <w:r>
+              <w:t xml:space="preserve"> wiring.</w:t>
+            </w:r>
+          </w:p>
+        </w:tc>
+      </w:tr>
+    </w:tbl>
+    <w:p>
+      <w:pPr>
+        <w:spacing w:after="160"/>
+      </w:pPr>
+    </w:p>
+    <w:p>
+      <w:pPr>
+        <w:spacing w:after="160"/>
+      </w:pPr>
+      <w:r>
+        <w:rPr>
+          <w:b/>
+          <w:bCs/>
+        </w:rPr>
+        <w:t xml:space="preserve">`buildBeatContextLegalityMap(chordTypeId, rootPc)`</w:t>
+      </w:r>
+      <w:r>
+        <w:t xml:space="preserve"> (`beatContextLegalityMap.ts`) — uses </w:t>
+      </w:r>
+      <w:r>
+        <w:rPr>
+          <w:b/>
+          <w:bCs/>
+        </w:rPr>
+        <w:t xml:space="preserve">`tonalityVaultDatabase`</w:t>
+      </w:r>
+      <w:r>
+        <w:t xml:space="preserve"> and </w:t>
+      </w:r>
+      <w:r>
+        <w:rPr>
+          <w:b/>
+          <w:bCs/>
+        </w:rPr>
+        <w:t xml:space="preserve">`selectQuadratonicMelodySpec`</w:t>
+      </w:r>
+      <w:r>
+        <w:t xml:space="preserve">. Returns a </w:t>
+      </w:r>
+      <w:r>
+        <w:rPr>
+          <w:b/>
+          <w:bCs/>
+        </w:rPr>
+        <w:t xml:space="preserve">`Map&lt;number, NoteTag&gt;`</w:t>
+      </w:r>
+      <w:r>
+        <w:t xml:space="preserve"> keyed by </w:t>
+      </w:r>
+      <w:r>
+        <w:rPr>
+          <w:b/>
+          <w:bCs/>
+        </w:rPr>
+        <w:t xml:space="preserve">absolute pitch class 0–11</w:t>
+      </w:r>
+      <w:r>
+        <w:t xml:space="preserve"> for the given chord </w:t>
+      </w:r>
+      <w:r>
+        <w:rPr>
+          <w:b/>
+          <w:bCs/>
+        </w:rPr>
+        <w:t xml:space="preserve">root PC</w:t>
+      </w:r>
+      <w:r>
+        <w:t xml:space="preserve">.</w:t>
+      </w:r>
+    </w:p>
+    <w:tbl>
+      <w:tblPr>
+        <w:tblW w:type="pct" w:w="100%"/>
+        <w:tblBorders>
+          <w:top w:val="single" w:color="auto" w:sz="4"/>
+          <w:left w:val="single" w:color="auto" w:sz="4"/>
+          <w:bottom w:val="single" w:color="auto" w:sz="4"/>
+          <w:right w:val="single" w:color="auto" w:sz="4"/>
+          <w:insideH w:val="single" w:color="auto" w:sz="4"/>
+          <w:insideV w:val="single" w:color="auto" w:sz="4"/>
+        </w:tblBorders>
+      </w:tblPr>
+      <w:tblGrid>
+        <w:gridCol w:w="2250"/>
+        <w:gridCol w:w="2250"/>
+        <w:gridCol w:w="2250"/>
+        <w:gridCol w:w="2250"/>
+      </w:tblGrid>
+      <w:tr>
+        <w:tc>
+          <w:tcPr>
+            <w:tcW w:type="pct" w:w="2250%"/>
+          </w:tcPr>
+          <w:p>
+            <w:pPr>
+              <w:spacing w:after="60"/>
+            </w:pPr>
+            <w:r>
+              <w:t xml:space="preserve">Class</w:t>
+            </w:r>
+          </w:p>
+        </w:tc>
+        <w:tc>
+          <w:tcPr>
+            <w:tcW w:type="pct" w:w="2250%"/>
+          </w:tcPr>
+          <w:p>
+            <w:pPr>
+              <w:spacing w:after="60"/>
+            </w:pPr>
+            <w:r>
+              <w:t xml:space="preserve">Layer</w:t>
+            </w:r>
+          </w:p>
+        </w:tc>
+        <w:tc>
+          <w:tcPr>
+            <w:tcW w:type="pct" w:w="2250%"/>
+          </w:tcPr>
+          <w:p>
+            <w:pPr>
+              <w:spacing w:after="60"/>
+            </w:pPr>
+            <w:r>
+              <w:t xml:space="preserve">`beatLegality`</w:t>
+            </w:r>
+          </w:p>
+        </w:tc>
+        <w:tc>
+          <w:tcPr>
+            <w:tcW w:type="pct" w:w="2250%"/>
+          </w:tcPr>
+          <w:p>
+            <w:pPr>
+              <w:spacing w:after="60"/>
+            </w:pPr>
+            <w:r>
+              <w:t xml:space="preserve">Role assignment</w:t>
+            </w:r>
+          </w:p>
+        </w:tc>
+      </w:tr>
+      <w:tr>
+        <w:tc>
+          <w:tcPr>
+            <w:tcW w:type="pct" w:w="2250%"/>
+          </w:tcPr>
+          <w:p>
+            <w:pPr>
+              <w:spacing w:after="60"/>
+            </w:pPr>
+            <w:r>
+              <w:t xml:space="preserve">Vault </w:t>
+            </w:r>
+            <w:r>
+              <w:rPr>
+                <w:b/>
+                <w:bCs/>
+              </w:rPr>
+              <w:t xml:space="preserve">melodic triad</w:t>
+            </w:r>
+            <w:r>
+              <w:t xml:space="preserve"> (three T-stack tones)</w:t>
+            </w:r>
+          </w:p>
+        </w:tc>
+        <w:tc>
+          <w:tcPr>
+            <w:tcW w:type="pct" w:w="2250%"/>
+          </w:tcPr>
+          <w:p>
+            <w:pPr>
+              <w:spacing w:after="60"/>
+            </w:pPr>
+            <w:r>
+              <w:rPr>
+                <w:b/>
+                <w:bCs/>
+              </w:rPr>
+              <w:t xml:space="preserve">0</w:t>
+            </w:r>
+          </w:p>
+        </w:tc>
+        <w:tc>
+          <w:tcPr>
+            <w:tcW w:type="pct" w:w="2250%"/>
+          </w:tcPr>
+          <w:p>
+            <w:pPr>
+              <w:spacing w:after="60"/>
+            </w:pPr>
+            <w:r>
+              <w:rPr>
+                <w:b/>
+                <w:bCs/>
+              </w:rPr>
+              <w:t xml:space="preserve">`strong`</w:t>
+            </w:r>
+          </w:p>
+        </w:tc>
+        <w:tc>
+          <w:tcPr>
+            <w:tcW w:type="pct" w:w="2250%"/>
+          </w:tcPr>
+          <w:p>
+            <w:pPr>
+              <w:spacing w:after="60"/>
+            </w:pPr>
+            <w:r>
+              <w:t xml:space="preserve">Slots map to </w:t>
+            </w:r>
+            <w:r>
+              <w:rPr>
+                <w:b/>
+                <w:bCs/>
+              </w:rPr>
+              <w:t xml:space="preserve">`triadRoot`</w:t>
+            </w:r>
+            <w:r>
+              <w:t xml:space="preserve">, </w:t>
+            </w:r>
+            <w:r>
+              <w:rPr>
+                <w:b/>
+                <w:bCs/>
+              </w:rPr>
+              <w:t xml:space="preserve">`triadThird`</w:t>
+            </w:r>
+            <w:r>
+              <w:t xml:space="preserve">, </w:t>
+            </w:r>
+            <w:r>
+              <w:rPr>
+                <w:b/>
+                <w:bCs/>
+              </w:rPr>
+              <w:t xml:space="preserve">`triadFifth`</w:t>
+            </w:r>
+            <w:r>
+              <w:t xml:space="preserve">; `resolveTargets` = other two triad absolute PCs.</w:t>
+            </w:r>
+          </w:p>
+        </w:tc>
+      </w:tr>
+      <w:tr>
+        <w:tc>
+          <w:tcPr>
+            <w:tcW w:type="pct" w:w="2250%"/>
+          </w:tcPr>
+          <w:p>
+            <w:pPr>
+              <w:spacing w:after="60"/>
+            </w:pPr>
+            <w:r>
+              <w:rPr>
+                <w:b/>
+                <w:bCs/>
+              </w:rPr>
+              <w:t xml:space="preserve">Primary tension</w:t>
+            </w:r>
+            <w:r>
+              <w:t xml:space="preserve"> (vault `primaryTensionNote`, if not already a triad slot)</w:t>
+            </w:r>
+          </w:p>
+        </w:tc>
+        <w:tc>
+          <w:tcPr>
+            <w:tcW w:type="pct" w:w="2250%"/>
+          </w:tcPr>
+          <w:p>
+            <w:pPr>
+              <w:spacing w:after="60"/>
+            </w:pPr>
+            <w:r>
+              <w:rPr>
+                <w:b/>
+                <w:bCs/>
+              </w:rPr>
+              <w:t xml:space="preserve">1</w:t>
+            </w:r>
+          </w:p>
+        </w:tc>
+        <w:tc>
+          <w:tcPr>
+            <w:tcW w:type="pct" w:w="2250%"/>
+          </w:tcPr>
+          <w:p>
+            <w:pPr>
+              <w:spacing w:after="60"/>
+            </w:pPr>
+            <w:r>
+              <w:rPr>
+                <w:b/>
+                <w:bCs/>
+              </w:rPr>
+              <w:t xml:space="preserve">`weak`</w:t>
+            </w:r>
+          </w:p>
+        </w:tc>
+        <w:tc>
+          <w:tcPr>
+            <w:tcW w:type="pct" w:w="2250%"/>
+          </w:tcPr>
+          <w:p>
+            <w:pPr>
+              <w:spacing w:after="60"/>
+            </w:pPr>
+            <w:r>
+              <w:rPr>
+                <w:b/>
+                <w:bCs/>
+              </w:rPr>
+              <w:t xml:space="preserve">`primaryTension`</w:t>
+            </w:r>
+            <w:r>
+              <w:t xml:space="preserve">; `resolveTargets` from quadratonic </w:t>
+            </w:r>
+            <w:r>
+              <w:rPr>
+                <w:b/>
+                <w:bCs/>
+              </w:rPr>
+              <w:t xml:space="preserve">resolve-toward</w:t>
+            </w:r>
+            <w:r>
+              <w:t xml:space="preserve"> triad degrees → absolute PCs.</w:t>
+            </w:r>
+          </w:p>
+        </w:tc>
+      </w:tr>
+      <w:tr>
+        <w:tc>
+          <w:tcPr>
+            <w:tcW w:type="pct" w:w="2250%"/>
+          </w:tcPr>
+          <w:p>
+            <w:pPr>
+              <w:spacing w:after="60"/>
+            </w:pPr>
+            <w:r>
+              <w:t xml:space="preserve">Other </w:t>
+            </w:r>
+            <w:r>
+              <w:rPr>
+                <w:b/>
+                <w:bCs/>
+              </w:rPr>
+              <w:t xml:space="preserve">`tensionHierarchy`</w:t>
+            </w:r>
+            <w:r>
+              <w:t xml:space="preserve"> degrees (not triad, not primary) with a vault spelling</w:t>
+            </w:r>
+          </w:p>
+        </w:tc>
+        <w:tc>
+          <w:tcPr>
+            <w:tcW w:type="pct" w:w="2250%"/>
+          </w:tcPr>
+          <w:p>
+            <w:pPr>
+              <w:spacing w:after="60"/>
+            </w:pPr>
+            <w:r>
+              <w:rPr>
+                <w:b/>
+                <w:bCs/>
+              </w:rPr>
+              <w:t xml:space="preserve">2</w:t>
+            </w:r>
+          </w:p>
+        </w:tc>
+        <w:tc>
+          <w:tcPr>
+            <w:tcW w:type="pct" w:w="2250%"/>
+          </w:tcPr>
+          <w:p>
+            <w:pPr>
+              <w:spacing w:after="60"/>
+            </w:pPr>
+            <w:r>
+              <w:rPr>
+                <w:b/>
+                <w:bCs/>
+              </w:rPr>
+              <w:t xml:space="preserve">`approachOnly`</w:t>
+            </w:r>
+          </w:p>
+        </w:tc>
+        <w:tc>
+          <w:tcPr>
+            <w:tcW w:type="pct" w:w="2250%"/>
+          </w:tcPr>
+          <w:p>
+            <w:pPr>
+              <w:spacing w:after="60"/>
+            </w:pPr>
+            <w:r>
+              <w:rPr>
+                <w:b/>
+                <w:bCs/>
+              </w:rPr>
+              <w:t xml:space="preserve">`secondaryTension`</w:t>
+            </w:r>
+            <w:r>
+              <w:t xml:space="preserve">; `resolveTargets` = triad absolute PCs.</w:t>
+            </w:r>
+          </w:p>
+        </w:tc>
+      </w:tr>
+      <w:tr>
+        <w:tc>
+          <w:tcPr>
+            <w:tcW w:type="pct" w:w="2250%"/>
+          </w:tcPr>
+          <w:p>
+            <w:pPr>
+              <w:spacing w:after="60"/>
+            </w:pPr>
+            <w:r>
+              <w:t xml:space="preserve">All remaining pitch classes</w:t>
+            </w:r>
+          </w:p>
+        </w:tc>
+        <w:tc>
+          <w:tcPr>
+            <w:tcW w:type="pct" w:w="2250%"/>
+          </w:tcPr>
+          <w:p>
+            <w:pPr>
+              <w:spacing w:after="60"/>
+            </w:pPr>
+            <w:r>
+              <w:rPr>
+                <w:b/>
+                <w:bCs/>
+              </w:rPr>
+              <w:t xml:space="preserve">3</w:t>
+            </w:r>
+          </w:p>
+        </w:tc>
+        <w:tc>
+          <w:tcPr>
+            <w:tcW w:type="pct" w:w="2250%"/>
+          </w:tcPr>
+          <w:p>
+            <w:pPr>
+              <w:spacing w:after="60"/>
+            </w:pPr>
+            <w:r>
+              <w:rPr>
+                <w:b/>
+                <w:bCs/>
+              </w:rPr>
+              <w:t xml:space="preserve">`syncopated`</w:t>
+            </w:r>
+          </w:p>
+        </w:tc>
+        <w:tc>
+          <w:tcPr>
+            <w:tcW w:type="pct" w:w="2250%"/>
+          </w:tcPr>
+          <w:p>
+            <w:pPr>
+              <w:spacing w:after="60"/>
+            </w:pPr>
+            <w:r>
+              <w:rPr>
+                <w:b/>
+                <w:bCs/>
+              </w:rPr>
+              <w:t xml:space="preserve">`chaos`</w:t>
+            </w:r>
+            <w:r>
+              <w:t xml:space="preserve"> (outside the vault spelling set for that chord).</w:t>
+            </w:r>
+          </w:p>
+        </w:tc>
+      </w:tr>
+    </w:tbl>
+    <w:p>
+      <w:pPr>
+        <w:spacing w:after="160"/>
+      </w:pPr>
+    </w:p>
+    <w:p>
+      <w:pPr>
+        <w:spacing w:after="160"/>
+      </w:pPr>
+      <w:r>
+        <w:t xml:space="preserve">Unknown </w:t>
+      </w:r>
+      <w:r>
+        <w:rPr>
+          <w:b/>
+          <w:bCs/>
+        </w:rPr>
+        <w:t xml:space="preserve">`chordTypeId`</w:t>
+      </w:r>
+      <w:r>
+        <w:t xml:space="preserve">: empty map. Overlap between triad and primary tension is resolved </w:t>
+      </w:r>
+      <w:r>
+        <w:rPr>
+          <w:b/>
+          <w:bCs/>
+        </w:rPr>
+        <w:t xml:space="preserve">in favour of the triad</w:t>
+      </w:r>
+      <w:r>
+        <w:t xml:space="preserve"> (layer 0).</w:t>
+      </w:r>
+    </w:p>
+    <w:p>
+      <w:pPr>
+        <w:pStyle w:val="Heading2"/>
+        <w:spacing w:after="100" w:before="160"/>
+      </w:pPr>
+      <w:r>
         <w:t xml:space="preserve">Planned builds (engine)</w:t>
       </w:r>
     </w:p>
@@ -25463,80 +26477,20 @@
           <w:b/>
           <w:bCs/>
         </w:rPr>
-        <w:t xml:space="preserve">`BeatContextLegalityMap`</w:t>
-      </w:r>
-      <w:r>
-        <w:t xml:space="preserve"> and </w:t>
-      </w:r>
-      <w:r>
-        <w:rPr>
-          <w:b/>
-          <w:bCs/>
-        </w:rPr>
-        <w:t xml:space="preserve">`NoteTag`</w:t>
-      </w:r>
-      <w:r>
-        <w:t xml:space="preserve"> schema. Every note carries </w:t>
-      </w:r>
-      <w:r>
-        <w:rPr>
-          <w:b/>
-          <w:bCs/>
-        </w:rPr>
-        <w:t xml:space="preserve">tonal role</w:t>
-      </w:r>
-      <w:r>
-        <w:t xml:space="preserve">, </w:t>
-      </w:r>
-      <w:r>
-        <w:rPr>
-          <w:b/>
-          <w:bCs/>
-        </w:rPr>
-        <w:t xml:space="preserve">layer</w:t>
-      </w:r>
-      <w:r>
-        <w:t xml:space="preserve">, </w:t>
-      </w:r>
-      <w:r>
-        <w:rPr>
-          <w:b/>
-          <w:bCs/>
-        </w:rPr>
-        <w:t xml:space="preserve">beat legality</w:t>
-      </w:r>
-      <w:r>
-        <w:t xml:space="preserve">, </w:t>
-      </w:r>
-      <w:r>
-        <w:rPr>
-          <w:b/>
-          <w:bCs/>
-        </w:rPr>
-        <w:t xml:space="preserve">resolve targets</w:t>
-      </w:r>
-      <w:r>
-        <w:t xml:space="preserve">, </w:t>
-      </w:r>
-      <w:r>
-        <w:rPr>
-          <w:b/>
-          <w:bCs/>
-        </w:rPr>
-        <w:t xml:space="preserve">voicing compatibility</w:t>
-      </w:r>
-      <w:r>
-        <w:t xml:space="preserve">, </w:t>
-      </w:r>
-      <w:r>
-        <w:rPr>
-          <w:b/>
-          <w:bCs/>
-        </w:rPr>
-        <w:t xml:space="preserve">guitar techniques</w:t>
-      </w:r>
-      <w:r>
-        <w:t xml:space="preserve"> (pick/finger/slide tags as applicable).</w:t>
+        <w:t xml:space="preserve">Complete</w:t>
+      </w:r>
+      <w:r>
+        <w:t xml:space="preserve"> (see </w:t>
+      </w:r>
+      <w:r>
+        <w:rPr>
+          <w:b/>
+          <w:bCs/>
+        </w:rPr>
+        <w:t xml:space="preserve">Build A</w:t>
+      </w:r>
+      <w:r>
+        <w:t xml:space="preserve"> subsection above).</w:t>
       </w:r>
     </w:p>
     <w:p>

</xml_diff>

<commit_message>
feat: Tonality Vault Build C — guitar grip library and vault riff generator; docs: full roadmap update including iReal image import plan and composition use cases
Co-authored-by: Cursor <cursoragent@cursor.com>
</commit_message>
<xml_diff>
--- a/docs/COMPOSER_OS_PLAYBOOK.docx
+++ b/docs/COMPOSER_OS_PLAYBOOK.docx
@@ -25368,17 +25368,27 @@
         <w:t xml:space="preserve">Takeaway:</w:t>
       </w:r>
       <w:r>
-        <w:t xml:space="preserve"> Prior to building </w:t>
-      </w:r>
-      <w:r>
-        <w:rPr>
-          <w:b/>
-          <w:bCs/>
-        </w:rPr>
-        <w:t xml:space="preserve">VaultRiffGenerator</w:t>
-      </w:r>
-      <w:r>
-        <w:t xml:space="preserve">, mine </w:t>
+        <w:t xml:space="preserve"> </w:t>
+      </w:r>
+      <w:r>
+        <w:rPr>
+          <w:b/>
+          <w:bCs/>
+        </w:rPr>
+        <w:t xml:space="preserve">Build C</w:t>
+      </w:r>
+      <w:r>
+        <w:t xml:space="preserve"> ships </w:t>
+      </w:r>
+      <w:r>
+        <w:rPr>
+          <w:b/>
+          <w:bCs/>
+        </w:rPr>
+        <w:t xml:space="preserve">`core/guitar/`</w:t>
+      </w:r>
+      <w:r>
+        <w:t xml:space="preserve"> (`generateVaultRiff`, `buildGuitarGripLibrary`, `FretboardRealization`)—still useful to mine </w:t>
       </w:r>
       <w:r>
         <w:rPr>
@@ -25388,7 +25398,7 @@
         <w:t xml:space="preserve">[riffbank](https://github.com/mikeb55/riffbank)</w:t>
       </w:r>
       <w:r>
-        <w:t xml:space="preserve"> (JSON snippets + schema) and </w:t>
+        <w:t xml:space="preserve"> and </w:t>
       </w:r>
       <w:r>
         <w:rPr>
@@ -25398,17 +25408,7 @@
         <w:t xml:space="preserve">[infinite-riff-machine](https://github.com/mikeb55/infinite-riff-machine)</w:t>
       </w:r>
       <w:r>
-        <w:t xml:space="preserve"> (</w:t>
-      </w:r>
-      <w:r>
-        <w:rPr>
-          <w:b/>
-          <w:bCs/>
-        </w:rPr>
-        <w:t xml:space="preserve">riff.schema.json</w:t>
-      </w:r>
-      <w:r>
-        <w:t xml:space="preserve">, section/variation intent). Treat </w:t>
+        <w:t xml:space="preserve"> for variation/section contracts. Treat </w:t>
       </w:r>
       <w:r>
         <w:rPr>
@@ -25428,7 +25428,7 @@
         <w:t xml:space="preserve">research/diagnostic</w:t>
       </w:r>
       <w:r>
-        <w:t xml:space="preserve"> adjacent to GCE, not a guitar engine.</w:t>
+        <w:t xml:space="preserve"> adjacent to GCE, not a drop-in engine.</w:t>
       </w:r>
     </w:p>
     <w:p>
@@ -25917,17 +25917,27 @@
               <w:spacing w:after="60"/>
             </w:pPr>
             <w:r>
-              <w:t xml:space="preserve">Optional string tags (e.g. pick / slide); scaffold until </w:t>
+              <w:t xml:space="preserve">Optional string tags; </w:t>
             </w:r>
             <w:r>
               <w:rPr>
                 <w:b/>
                 <w:bCs/>
               </w:rPr>
-              <w:t xml:space="preserve">VaultRiffGenerator</w:t>
-            </w:r>
-            <w:r>
-              <w:t xml:space="preserve"> wiring.</w:t>
+              <w:t xml:space="preserve">Build C</w:t>
+            </w:r>
+            <w:r>
+              <w:t xml:space="preserve"> can populate via </w:t>
+            </w:r>
+            <w:r>
+              <w:rPr>
+                <w:b/>
+                <w:bCs/>
+              </w:rPr>
+              <w:t xml:space="preserve">`FretboardRealization.techniqueTags`</w:t>
+            </w:r>
+            <w:r>
+              <w:t xml:space="preserve"> when a score path consumes grip metadata.</w:t>
             </w:r>
           </w:p>
         </w:tc>
@@ -26451,6 +26461,816 @@
         <w:spacing w:after="100" w:before="160"/>
       </w:pPr>
       <w:r>
+        <w:t xml:space="preserve">Build C — Guitar riff engine (**complete**)</w:t>
+      </w:r>
+    </w:p>
+    <w:p>
+      <w:pPr>
+        <w:spacing w:after="160"/>
+      </w:pPr>
+      <w:r>
+        <w:rPr>
+          <w:b/>
+          <w:bCs/>
+        </w:rPr>
+        <w:t xml:space="preserve">Shipped</w:t>
+      </w:r>
+      <w:r>
+        <w:t xml:space="preserve"> in `engines/composer-os-v2/core/guitar/` — </w:t>
+      </w:r>
+      <w:r>
+        <w:rPr>
+          <w:b/>
+          <w:bCs/>
+        </w:rPr>
+        <w:t xml:space="preserve">`fretboardRealization.ts`</w:t>
+      </w:r>
+      <w:r>
+        <w:t xml:space="preserve">, </w:t>
+      </w:r>
+      <w:r>
+        <w:rPr>
+          <w:b/>
+          <w:bCs/>
+        </w:rPr>
+        <w:t xml:space="preserve">`guitarGripLibrary.ts`</w:t>
+      </w:r>
+      <w:r>
+        <w:t xml:space="preserve">, </w:t>
+      </w:r>
+      <w:r>
+        <w:rPr>
+          <w:b/>
+          <w:bCs/>
+        </w:rPr>
+        <w:t xml:space="preserve">`vaultRiffGenerator.ts`</w:t>
+      </w:r>
+      <w:r>
+        <w:t xml:space="preserve">, barrel </w:t>
+      </w:r>
+      <w:r>
+        <w:rPr>
+          <w:b/>
+          <w:bCs/>
+        </w:rPr>
+        <w:t xml:space="preserve">`index.ts`</w:t>
+      </w:r>
+      <w:r>
+        <w:t xml:space="preserve">.</w:t>
+      </w:r>
+    </w:p>
+    <w:p>
+      <w:pPr>
+        <w:spacing w:after="160"/>
+      </w:pPr>
+      <w:r>
+        <w:rPr>
+          <w:b/>
+          <w:bCs/>
+        </w:rPr>
+        <w:t xml:space="preserve">`FretboardRealization`</w:t>
+      </w:r>
+      <w:r>
+        <w:t xml:space="preserve"> — one voicing snapshot:</w:t>
+      </w:r>
+    </w:p>
+    <w:tbl>
+      <w:tblPr>
+        <w:tblW w:type="pct" w:w="100%"/>
+        <w:tblBorders>
+          <w:top w:val="single" w:color="auto" w:sz="4"/>
+          <w:left w:val="single" w:color="auto" w:sz="4"/>
+          <w:bottom w:val="single" w:color="auto" w:sz="4"/>
+          <w:right w:val="single" w:color="auto" w:sz="4"/>
+          <w:insideH w:val="single" w:color="auto" w:sz="4"/>
+          <w:insideV w:val="single" w:color="auto" w:sz="4"/>
+        </w:tblBorders>
+      </w:tblPr>
+      <w:tblGrid>
+        <w:gridCol w:w="1800"/>
+        <w:gridCol w:w="1800"/>
+        <w:gridCol w:w="1800"/>
+        <w:gridCol w:w="1800"/>
+        <w:gridCol w:w="1800"/>
+      </w:tblGrid>
+      <w:tr>
+        <w:tc>
+          <w:tcPr>
+            <w:tcW w:type="pct" w:w="1800%"/>
+          </w:tcPr>
+          <w:p>
+            <w:pPr>
+              <w:spacing w:after="60"/>
+            </w:pPr>
+            <w:r>
+              <w:t xml:space="preserve">Field</w:t>
+            </w:r>
+          </w:p>
+        </w:tc>
+        <w:tc>
+          <w:tcPr>
+            <w:tcW w:type="pct" w:w="1800%"/>
+          </w:tcPr>
+          <w:p>
+            <w:pPr>
+              <w:spacing w:after="60"/>
+            </w:pPr>
+            <w:r>
+              <w:t xml:space="preserve">Purpose</w:t>
+            </w:r>
+          </w:p>
+        </w:tc>
+      </w:tr>
+      <w:tr>
+        <w:tc>
+          <w:tcPr>
+            <w:tcW w:type="pct" w:w="1800%"/>
+          </w:tcPr>
+          <w:p>
+            <w:pPr>
+              <w:spacing w:after="60"/>
+            </w:pPr>
+            <w:r>
+              <w:rPr>
+                <w:b/>
+                <w:bCs/>
+              </w:rPr>
+              <w:t xml:space="preserve">`pitchClasses`</w:t>
+            </w:r>
+          </w:p>
+        </w:tc>
+        <w:tc>
+          <w:tcPr>
+            <w:tcW w:type="pct" w:w="1800%"/>
+          </w:tcPr>
+          <w:p>
+            <w:pPr>
+              <w:spacing w:after="60"/>
+            </w:pPr>
+            <w:r>
+              <w:t xml:space="preserve">Absolute </w:t>
+            </w:r>
+            <w:r>
+              <w:rPr>
+                <w:b/>
+                <w:bCs/>
+              </w:rPr>
+              <w:t xml:space="preserve">0–11</w:t>
+            </w:r>
+            <w:r>
+              <w:t xml:space="preserve"> pitch classes (aligned with `strings` / `frets`).</w:t>
+            </w:r>
+          </w:p>
+        </w:tc>
+      </w:tr>
+      <w:tr>
+        <w:tc>
+          <w:tcPr>
+            <w:tcW w:type="pct" w:w="1800%"/>
+          </w:tcPr>
+          <w:p>
+            <w:pPr>
+              <w:spacing w:after="60"/>
+            </w:pPr>
+            <w:r>
+              <w:rPr>
+                <w:b/>
+                <w:bCs/>
+              </w:rPr>
+              <w:t xml:space="preserve">`strings`</w:t>
+            </w:r>
+          </w:p>
+        </w:tc>
+        <w:tc>
+          <w:tcPr>
+            <w:tcW w:type="pct" w:w="1800%"/>
+          </w:tcPr>
+          <w:p>
+            <w:pPr>
+              <w:spacing w:after="60"/>
+            </w:pPr>
+            <w:r>
+              <w:t xml:space="preserve">`0` = low E through `5` = high e.</w:t>
+            </w:r>
+          </w:p>
+        </w:tc>
+      </w:tr>
+      <w:tr>
+        <w:tc>
+          <w:tcPr>
+            <w:tcW w:type="pct" w:w="1800%"/>
+          </w:tcPr>
+          <w:p>
+            <w:pPr>
+              <w:spacing w:after="60"/>
+            </w:pPr>
+            <w:r>
+              <w:rPr>
+                <w:b/>
+                <w:bCs/>
+              </w:rPr>
+              <w:t xml:space="preserve">`frets`</w:t>
+            </w:r>
+          </w:p>
+        </w:tc>
+        <w:tc>
+          <w:tcPr>
+            <w:tcW w:type="pct" w:w="1800%"/>
+          </w:tcPr>
+          <w:p>
+            <w:pPr>
+              <w:spacing w:after="60"/>
+            </w:pPr>
+            <w:r>
+              <w:t xml:space="preserve">Parallel frets; `0` = open.</w:t>
+            </w:r>
+          </w:p>
+        </w:tc>
+      </w:tr>
+      <w:tr>
+        <w:tc>
+          <w:tcPr>
+            <w:tcW w:type="pct" w:w="1800%"/>
+          </w:tcPr>
+          <w:p>
+            <w:pPr>
+              <w:spacing w:after="60"/>
+            </w:pPr>
+            <w:r>
+              <w:rPr>
+                <w:b/>
+                <w:bCs/>
+              </w:rPr>
+              <w:t xml:space="preserve">`positionCenter`</w:t>
+            </w:r>
+          </w:p>
+        </w:tc>
+        <w:tc>
+          <w:tcPr>
+            <w:tcW w:type="pct" w:w="1800%"/>
+          </w:tcPr>
+          <w:p>
+            <w:pPr>
+              <w:spacing w:after="60"/>
+            </w:pPr>
+            <w:r>
+              <w:t xml:space="preserve">Mean fret (register / “where on the neck”).</w:t>
+            </w:r>
+          </w:p>
+        </w:tc>
+      </w:tr>
+      <w:tr>
+        <w:tc>
+          <w:tcPr>
+            <w:tcW w:type="pct" w:w="1800%"/>
+          </w:tcPr>
+          <w:p>
+            <w:pPr>
+              <w:spacing w:after="60"/>
+            </w:pPr>
+            <w:r>
+              <w:rPr>
+                <w:b/>
+                <w:bCs/>
+              </w:rPr>
+              <w:t xml:space="preserve">`techniqueTags`</w:t>
+            </w:r>
+          </w:p>
+        </w:tc>
+        <w:tc>
+          <w:tcPr>
+            <w:tcW w:type="pct" w:w="1800%"/>
+          </w:tcPr>
+          <w:p>
+            <w:pPr>
+              <w:spacing w:after="60"/>
+            </w:pPr>
+            <w:r>
+              <w:t xml:space="preserve">e.g. `alternate`, `economy`, `sweep`, `legato`, `slide`, `bend`, `double-stop` (grip-level hints).</w:t>
+            </w:r>
+          </w:p>
+        </w:tc>
+      </w:tr>
+      <w:tr>
+        <w:tc>
+          <w:tcPr>
+            <w:tcW w:type="pct" w:w="1800%"/>
+          </w:tcPr>
+          <w:p>
+            <w:pPr>
+              <w:spacing w:after="60"/>
+            </w:pPr>
+            <w:r>
+              <w:rPr>
+                <w:b/>
+                <w:bCs/>
+              </w:rPr>
+              <w:t xml:space="preserve">`tonalRole`</w:t>
+            </w:r>
+          </w:p>
+        </w:tc>
+        <w:tc>
+          <w:tcPr>
+            <w:tcW w:type="pct" w:w="1800%"/>
+          </w:tcPr>
+          <w:p>
+            <w:pPr>
+              <w:spacing w:after="60"/>
+            </w:pPr>
+            <w:r>
+              <w:t xml:space="preserve">`triad` \</w:t>
+            </w:r>
+          </w:p>
+        </w:tc>
+        <w:tc>
+          <w:tcPr>
+            <w:tcW w:type="pct" w:w="1800%"/>
+          </w:tcPr>
+          <w:p>
+            <w:pPr>
+              <w:spacing w:after="60"/>
+            </w:pPr>
+            <w:r>
+              <w:t xml:space="preserve">`primaryQuadratonic` \</w:t>
+            </w:r>
+          </w:p>
+        </w:tc>
+        <w:tc>
+          <w:tcPr>
+            <w:tcW w:type="pct" w:w="1800%"/>
+          </w:tcPr>
+          <w:p>
+            <w:pPr>
+              <w:spacing w:after="60"/>
+            </w:pPr>
+            <w:r>
+              <w:t xml:space="preserve">`tensionQuadratonic` \</w:t>
+            </w:r>
+          </w:p>
+        </w:tc>
+        <w:tc>
+          <w:tcPr>
+            <w:tcW w:type="pct" w:w="1800%"/>
+          </w:tcPr>
+          <w:p>
+            <w:pPr>
+              <w:spacing w:after="60"/>
+            </w:pPr>
+            <w:r>
+              <w:t xml:space="preserve">`triadPair` — which vault recipe the shape came from.</w:t>
+            </w:r>
+          </w:p>
+        </w:tc>
+      </w:tr>
+      <w:tr>
+        <w:tc>
+          <w:tcPr>
+            <w:tcW w:type="pct" w:w="1800%"/>
+          </w:tcPr>
+          <w:p>
+            <w:pPr>
+              <w:spacing w:after="60"/>
+            </w:pPr>
+            <w:r>
+              <w:rPr>
+                <w:b/>
+                <w:bCs/>
+              </w:rPr>
+              <w:t xml:space="preserve">`tuningId`</w:t>
+            </w:r>
+          </w:p>
+        </w:tc>
+        <w:tc>
+          <w:tcPr>
+            <w:tcW w:type="pct" w:w="1800%"/>
+          </w:tcPr>
+          <w:p>
+            <w:pPr>
+              <w:spacing w:after="60"/>
+            </w:pPr>
+            <w:r>
+              <w:t xml:space="preserve">Preset id (see </w:t>
+            </w:r>
+            <w:r>
+              <w:rPr>
+                <w:b/>
+                <w:bCs/>
+              </w:rPr>
+              <w:t xml:space="preserve">`alternateGuitarTunings.ts`</w:t>
+            </w:r>
+            <w:r>
+              <w:t xml:space="preserve">) for open-string resolution; </w:t>
+            </w:r>
+            <w:r>
+              <w:rPr>
+                <w:b/>
+                <w:bCs/>
+              </w:rPr>
+              <w:t xml:space="preserve">`standard`</w:t>
+            </w:r>
+            <w:r>
+              <w:t xml:space="preserve"> uses E-standard midis </w:t>
+            </w:r>
+            <w:r>
+              <w:rPr>
+                <w:b/>
+                <w:bCs/>
+              </w:rPr>
+              <w:t xml:space="preserve">40 / 45 / 50 / 55 / 59 / 64</w:t>
+            </w:r>
+            <w:r>
+              <w:t xml:space="preserve">.</w:t>
+            </w:r>
+          </w:p>
+        </w:tc>
+      </w:tr>
+    </w:tbl>
+    <w:p>
+      <w:pPr>
+        <w:spacing w:after="160"/>
+      </w:pPr>
+    </w:p>
+    <w:p>
+      <w:pPr>
+        <w:spacing w:after="160"/>
+      </w:pPr>
+      <w:r>
+        <w:rPr>
+          <w:b/>
+          <w:bCs/>
+        </w:rPr>
+        <w:t xml:space="preserve">`buildGuitarGripLibrary(chordTypeId, rootPc, tuningId)`</w:t>
+      </w:r>
+      <w:r>
+        <w:t xml:space="preserve"> — returns </w:t>
+      </w:r>
+      <w:r>
+        <w:rPr>
+          <w:b/>
+          <w:bCs/>
+        </w:rPr>
+        <w:t xml:space="preserve">`FretboardRealization[]`</w:t>
+      </w:r>
+      <w:r>
+        <w:t xml:space="preserve">. Uses </w:t>
+      </w:r>
+      <w:r>
+        <w:rPr>
+          <w:b/>
+          <w:bCs/>
+        </w:rPr>
+        <w:t xml:space="preserve">`buildBeatContextLegalityMap`</w:t>
+      </w:r>
+      <w:r>
+        <w:t xml:space="preserve">, </w:t>
+      </w:r>
+      <w:r>
+        <w:rPr>
+          <w:b/>
+          <w:bCs/>
+        </w:rPr>
+        <w:t xml:space="preserve">`tonalityVaultDatabase`</w:t>
+      </w:r>
+      <w:r>
+        <w:t xml:space="preserve">, and </w:t>
+      </w:r>
+      <w:r>
+        <w:rPr>
+          <w:b/>
+          <w:bCs/>
+        </w:rPr>
+        <w:t xml:space="preserve">`selectQuadratonicMelodySpec`</w:t>
+      </w:r>
+      <w:r>
+        <w:t xml:space="preserve">. Fret rule: </w:t>
+      </w:r>
+      <w:r>
+        <w:rPr>
+          <w:b/>
+          <w:bCs/>
+        </w:rPr>
+        <w:t xml:space="preserve">target MIDI = open-string MIDI + fret</w:t>
+      </w:r>
+      <w:r>
+        <w:t xml:space="preserve">; only </w:t>
+      </w:r>
+      <w:r>
+        <w:rPr>
+          <w:b/>
+          <w:bCs/>
+        </w:rPr>
+        <w:t xml:space="preserve">0–15</w:t>
+      </w:r>
+      <w:r>
+        <w:t xml:space="preserve">; keep each shape within a </w:t>
+      </w:r>
+      <w:r>
+        <w:rPr>
+          <w:b/>
+          <w:bCs/>
+        </w:rPr>
+        <w:t xml:space="preserve">4-fret</w:t>
+      </w:r>
+      <w:r>
+        <w:t xml:space="preserve"> window. Categories emitted: </w:t>
+      </w:r>
+      <w:r>
+        <w:rPr>
+          <w:b/>
+          <w:bCs/>
+        </w:rPr>
+        <w:t xml:space="preserve">melodic triad</w:t>
+      </w:r>
+      <w:r>
+        <w:t xml:space="preserve"> (3 notes), </w:t>
+      </w:r>
+      <w:r>
+        <w:rPr>
+          <w:b/>
+          <w:bCs/>
+        </w:rPr>
+        <w:t xml:space="preserve">primary quadratonic</w:t>
+      </w:r>
+      <w:r>
+        <w:t xml:space="preserve"> (4 notes: triad + primary tension), </w:t>
+      </w:r>
+      <w:r>
+        <w:rPr>
+          <w:b/>
+          <w:bCs/>
+        </w:rPr>
+        <w:t xml:space="preserve">dyad</w:t>
+      </w:r>
+      <w:r>
+        <w:t xml:space="preserve"> pairs (triad pairs and triad+tension), </w:t>
+      </w:r>
+      <w:r>
+        <w:rPr>
+          <w:b/>
+          <w:bCs/>
+        </w:rPr>
+        <w:t xml:space="preserve">triad-pair</w:t>
+      </w:r>
+      <w:r>
+        <w:t xml:space="preserve"> (four pitch classes from the quadratonic set, split and voiced).</w:t>
+      </w:r>
+    </w:p>
+    <w:p>
+      <w:pPr>
+        <w:spacing w:after="160"/>
+      </w:pPr>
+      <w:r>
+        <w:rPr>
+          <w:b/>
+          <w:bCs/>
+        </w:rPr>
+        <w:t xml:space="preserve">`generateVaultRiff({ chordTypeId, rootPc, bars, style, tuningId? })`</w:t>
+      </w:r>
+      <w:r>
+        <w:t xml:space="preserve"> — returns </w:t>
+      </w:r>
+      <w:r>
+        <w:rPr>
+          <w:b/>
+          <w:bCs/>
+        </w:rPr>
+        <w:t xml:space="preserve">`ScoreNote[]`</w:t>
+      </w:r>
+      <w:r>
+        <w:t xml:space="preserve">: each note has </w:t>
+      </w:r>
+      <w:r>
+        <w:rPr>
+          <w:b/>
+          <w:bCs/>
+        </w:rPr>
+        <w:t xml:space="preserve">`pitch`</w:t>
+      </w:r>
+      <w:r>
+        <w:t xml:space="preserve"> (MIDI), </w:t>
+      </w:r>
+      <w:r>
+        <w:rPr>
+          <w:b/>
+          <w:bCs/>
+        </w:rPr>
+        <w:t xml:space="preserve">`startBeat`</w:t>
+      </w:r>
+      <w:r>
+        <w:t xml:space="preserve">, </w:t>
+      </w:r>
+      <w:r>
+        <w:rPr>
+          <w:b/>
+          <w:bCs/>
+        </w:rPr>
+        <w:t xml:space="preserve">`duration`</w:t>
+      </w:r>
+      <w:r>
+        <w:t xml:space="preserve">, </w:t>
+      </w:r>
+      <w:r>
+        <w:rPr>
+          <w:b/>
+          <w:bCs/>
+        </w:rPr>
+        <w:t xml:space="preserve">`guitarString`</w:t>
+      </w:r>
+      <w:r>
+        <w:t xml:space="preserve">, </w:t>
+      </w:r>
+      <w:r>
+        <w:rPr>
+          <w:b/>
+          <w:bCs/>
+        </w:rPr>
+        <w:t xml:space="preserve">`guitarFret`</w:t>
+      </w:r>
+      <w:r>
+        <w:t xml:space="preserve">, </w:t>
+      </w:r>
+      <w:r>
+        <w:rPr>
+          <w:b/>
+          <w:bCs/>
+        </w:rPr>
+        <w:t xml:space="preserve">`barIndex`</w:t>
+      </w:r>
+      <w:r>
+        <w:t xml:space="preserve">. Rhythmic rule: </w:t>
+      </w:r>
+      <w:r>
+        <w:rPr>
+          <w:b/>
+          <w:bCs/>
+        </w:rPr>
+        <w:t xml:space="preserve">triad</w:t>
+      </w:r>
+      <w:r>
+        <w:t xml:space="preserve"> class on </w:t>
+      </w:r>
+      <w:r>
+        <w:rPr>
+          <w:b/>
+          <w:bCs/>
+        </w:rPr>
+        <w:t xml:space="preserve">strong</w:t>
+      </w:r>
+      <w:r>
+        <w:t xml:space="preserve"> beats, </w:t>
+      </w:r>
+      <w:r>
+        <w:rPr>
+          <w:b/>
+          <w:bCs/>
+        </w:rPr>
+        <w:t xml:space="preserve">tension</w:t>
+      </w:r>
+      <w:r>
+        <w:t xml:space="preserve"> on </w:t>
+      </w:r>
+      <w:r>
+        <w:rPr>
+          <w:b/>
+          <w:bCs/>
+        </w:rPr>
+        <w:t xml:space="preserve">weak</w:t>
+      </w:r>
+      <w:r>
+        <w:t xml:space="preserve"> beats, </w:t>
+      </w:r>
+      <w:r>
+        <w:rPr>
+          <w:b/>
+          <w:bCs/>
+        </w:rPr>
+        <w:t xml:space="preserve">passing / approach</w:t>
+      </w:r>
+      <w:r>
+        <w:t xml:space="preserve"> on </w:t>
+      </w:r>
+      <w:r>
+        <w:rPr>
+          <w:b/>
+          <w:bCs/>
+        </w:rPr>
+        <w:t xml:space="preserve">offbeats</w:t>
+      </w:r>
+      <w:r>
+        <w:t xml:space="preserve"> (see </w:t>
+      </w:r>
+      <w:r>
+        <w:rPr>
+          <w:b/>
+          <w:bCs/>
+        </w:rPr>
+        <w:t xml:space="preserve">`buildBeatContextLegalityMap`</w:t>
+      </w:r>
+      <w:r>
+        <w:t xml:space="preserve">). </w:t>
+      </w:r>
+      <w:r>
+        <w:rPr>
+          <w:b/>
+          <w:bCs/>
+        </w:rPr>
+        <w:t xml:space="preserve">Styles:</w:t>
+      </w:r>
+      <w:r>
+        <w:t xml:space="preserve"> `quadratonic`, `dyad-seesaw`, `triad-pair-pendulum`, `pedal-string`, `bebop-placement`.</w:t>
+      </w:r>
+    </w:p>
+    <w:p>
+      <w:pPr>
+        <w:spacing w:after="160"/>
+      </w:pPr>
+      <w:r>
+        <w:rPr>
+          <w:b/>
+          <w:bCs/>
+        </w:rPr>
+        <w:t xml:space="preserve">Export / tab:</w:t>
+      </w:r>
+      <w:r>
+        <w:t xml:space="preserve"> Engine output is </w:t>
+      </w:r>
+      <w:r>
+        <w:rPr>
+          <w:b/>
+          <w:bCs/>
+        </w:rPr>
+        <w:t xml:space="preserve">not</w:t>
+      </w:r>
+      <w:r>
+        <w:t xml:space="preserve"> yet merged into the main MusicXML exporter—</w:t>
+      </w:r>
+      <w:r>
+        <w:rPr>
+          <w:b/>
+          <w:bCs/>
+        </w:rPr>
+        <w:t xml:space="preserve">ScoreNote</w:t>
+      </w:r>
+      <w:r>
+        <w:t xml:space="preserve"> carries tab-ready </w:t>
+      </w:r>
+      <w:r>
+        <w:rPr>
+          <w:b/>
+          <w:bCs/>
+        </w:rPr>
+        <w:t xml:space="preserve">string/fret</w:t>
+      </w:r>
+      <w:r>
+        <w:t xml:space="preserve"> for a future pipe. </w:t>
+      </w:r>
+      <w:r>
+        <w:rPr>
+          <w:b/>
+          <w:bCs/>
+        </w:rPr>
+        <w:t xml:space="preserve">Product workflow:</w:t>
+      </w:r>
+      <w:r>
+        <w:t xml:space="preserve"> MusicXML (when wired from generated lines) → </w:t>
+      </w:r>
+      <w:r>
+        <w:rPr>
+          <w:b/>
+          <w:bCs/>
+        </w:rPr>
+        <w:t xml:space="preserve">Guitar Pro 8</w:t>
+      </w:r>
+      <w:r>
+        <w:t xml:space="preserve"> / </w:t>
+      </w:r>
+      <w:r>
+        <w:rPr>
+          <w:b/>
+          <w:bCs/>
+        </w:rPr>
+        <w:t xml:space="preserve">Sibelius</w:t>
+      </w:r>
+      <w:r>
+        <w:t xml:space="preserve"> import for </w:t>
+      </w:r>
+      <w:r>
+        <w:rPr>
+          <w:b/>
+          <w:bCs/>
+        </w:rPr>
+        <w:t xml:space="preserve">notation + TAB</w:t>
+      </w:r>
+      <w:r>
+        <w:t xml:space="preserve"> the same way other guitar scores are brought into GP8 today.</w:t>
+      </w:r>
+    </w:p>
+    <w:p>
+      <w:pPr>
+        <w:pStyle w:val="Heading2"/>
+        <w:spacing w:after="100" w:before="160"/>
+      </w:pPr>
+      <w:r>
         <w:t xml:space="preserve">Planned builds (engine)</w:t>
       </w:r>
     </w:p>
@@ -26506,7 +27326,7 @@
           <w:b/>
           <w:bCs/>
         </w:rPr>
-        <w:t xml:space="preserve">Build B — Layer state machine + liquid harmony:</w:t>
+        <w:t xml:space="preserve">Build C — Guitar riff engine:</w:t>
       </w:r>
       <w:r>
         <w:t xml:space="preserve"> </w:t>
@@ -26516,30 +27336,20 @@
           <w:b/>
           <w:bCs/>
         </w:rPr>
-        <w:t xml:space="preserve">`LayerStateMachine`</w:t>
-      </w:r>
-      <w:r>
-        <w:t xml:space="preserve"> (Resolve → Primary → Tension → Chaos → Recover) driving </w:t>
-      </w:r>
-      <w:r>
-        <w:rPr>
-          <w:b/>
-          <w:bCs/>
-        </w:rPr>
-        <w:t xml:space="preserve">`LiquidHarmonyPlanner`</w:t>
-      </w:r>
-      <w:r>
-        <w:t xml:space="preserve">. Phrase-level intention from the state machine; </w:t>
-      </w:r>
-      <w:r>
-        <w:rPr>
-          <w:b/>
-          <w:bCs/>
-        </w:rPr>
-        <w:t xml:space="preserve">liquid harmony</w:t>
-      </w:r>
-      <w:r>
-        <w:t xml:space="preserve"> shapes internal voicing motion per subdivision.</w:t>
+        <w:t xml:space="preserve">Complete</w:t>
+      </w:r>
+      <w:r>
+        <w:t xml:space="preserve"> (see </w:t>
+      </w:r>
+      <w:r>
+        <w:rPr>
+          <w:b/>
+          <w:bCs/>
+        </w:rPr>
+        <w:t xml:space="preserve">Build C</w:t>
+      </w:r>
+      <w:r>
+        <w:t xml:space="preserve"> subsection above).</w:t>
       </w:r>
     </w:p>
     <w:p>
@@ -26555,7 +27365,7 @@
           <w:b/>
           <w:bCs/>
         </w:rPr>
-        <w:t xml:space="preserve">Build C — Guitar riff engine:</w:t>
+        <w:t xml:space="preserve">Build B — Layer state machine + liquid harmony:</w:t>
       </w:r>
       <w:r>
         <w:t xml:space="preserve"> </w:t>
@@ -26565,90 +27375,30 @@
           <w:b/>
           <w:bCs/>
         </w:rPr>
-        <w:t xml:space="preserve">`VaultRiffGenerator`</w:t>
-      </w:r>
-      <w:r>
-        <w:t xml:space="preserve">, </w:t>
-      </w:r>
-      <w:r>
-        <w:rPr>
-          <w:b/>
-          <w:bCs/>
-        </w:rPr>
-        <w:t xml:space="preserve">`FretboardRealization`</w:t>
-      </w:r>
-      <w:r>
-        <w:t xml:space="preserve">, </w:t>
-      </w:r>
-      <w:r>
-        <w:rPr>
-          <w:b/>
-          <w:bCs/>
-        </w:rPr>
-        <w:t xml:space="preserve">guitar grip library</w:t>
-      </w:r>
-      <w:r>
-        <w:t xml:space="preserve">. Position-aware riffs using </w:t>
-      </w:r>
-      <w:r>
-        <w:rPr>
-          <w:b/>
-          <w:bCs/>
-        </w:rPr>
-        <w:t xml:space="preserve">quadratonic grips</w:t>
-      </w:r>
-      <w:r>
-        <w:t xml:space="preserve">, </w:t>
-      </w:r>
-      <w:r>
-        <w:rPr>
-          <w:b/>
-          <w:bCs/>
-        </w:rPr>
-        <w:t xml:space="preserve">dyad seesaws</w:t>
-      </w:r>
-      <w:r>
-        <w:t xml:space="preserve">, </w:t>
-      </w:r>
-      <w:r>
-        <w:rPr>
-          <w:b/>
-          <w:bCs/>
-        </w:rPr>
-        <w:t xml:space="preserve">triad-pair pendulum</w:t>
-      </w:r>
-      <w:r>
-        <w:t xml:space="preserve">, </w:t>
-      </w:r>
-      <w:r>
-        <w:rPr>
-          <w:b/>
-          <w:bCs/>
-        </w:rPr>
-        <w:t xml:space="preserve">pedal-string patterns</w:t>
-      </w:r>
-      <w:r>
-        <w:t xml:space="preserve">, </w:t>
-      </w:r>
-      <w:r>
-        <w:rPr>
-          <w:b/>
-          <w:bCs/>
-        </w:rPr>
-        <w:t xml:space="preserve">pick-attack</w:t>
-      </w:r>
-      <w:r>
-        <w:t xml:space="preserve"> tags. </w:t>
-      </w:r>
-      <w:r>
-        <w:rPr>
-          <w:b/>
-          <w:bCs/>
-        </w:rPr>
-        <w:t xml:space="preserve">Audit riffbank / infinite-riff-machine</w:t>
-      </w:r>
-      <w:r>
-        <w:t xml:space="preserve"> (above) before greenfield.</w:t>
+        <w:t xml:space="preserve">`LayerStateMachine`</w:t>
+      </w:r>
+      <w:r>
+        <w:t xml:space="preserve"> (Resolve → Primary → Tension → Chaos → Recover) driving </w:t>
+      </w:r>
+      <w:r>
+        <w:rPr>
+          <w:b/>
+          <w:bCs/>
+        </w:rPr>
+        <w:t xml:space="preserve">`LiquidHarmonyPlanner`</w:t>
+      </w:r>
+      <w:r>
+        <w:t xml:space="preserve">. Phrase-level intention from the state machine; </w:t>
+      </w:r>
+      <w:r>
+        <w:rPr>
+          <w:b/>
+          <w:bCs/>
+        </w:rPr>
+        <w:t xml:space="preserve">liquid harmony</w:t>
+      </w:r>
+      <w:r>
+        <w:t xml:space="preserve"> shapes internal voicing motion per subdivision.</w:t>
       </w:r>
     </w:p>
     <w:p>
@@ -26677,7 +27427,27 @@
         <w:t xml:space="preserve">`ReharmCandidateEngine`</w:t>
       </w:r>
       <w:r>
-        <w:t xml:space="preserve">. Shared </w:t>
+        <w:t xml:space="preserve">. </w:t>
+      </w:r>
+      <w:r>
+        <w:rPr>
+          <w:b/>
+          <w:bCs/>
+        </w:rPr>
+        <w:t xml:space="preserve">Emotional drift</w:t>
+      </w:r>
+      <w:r>
+        <w:t xml:space="preserve"> control (slider / profile) to bias reharm toward darker, brighter, or more suspended language; output stays </w:t>
+      </w:r>
+      <w:r>
+        <w:rPr>
+          <w:b/>
+          <w:bCs/>
+        </w:rPr>
+        <w:t xml:space="preserve">guitar-friendly</w:t>
+      </w:r>
+      <w:r>
+        <w:t xml:space="preserve"> (register + grip-aware targets). Shared </w:t>
       </w:r>
       <w:r>
         <w:rPr>
@@ -26697,34 +27467,24 @@
         <w:t xml:space="preserve">tension-layer</w:t>
       </w:r>
       <w:r>
-        <w:t xml:space="preserve"> substitutions, </w:t>
-      </w:r>
-      <w:r>
-        <w:rPr>
-          <w:b/>
-          <w:bCs/>
-        </w:rPr>
-        <w:t xml:space="preserve">shell-swap</w:t>
-      </w:r>
-      <w:r>
-        <w:t xml:space="preserve"> substitutions; </w:t>
-      </w:r>
-      <w:r>
-        <w:rPr>
-          <w:b/>
-          <w:bCs/>
-        </w:rPr>
-        <w:t xml:space="preserve">emotional drift</w:t>
-      </w:r>
-      <w:r>
-        <w:t xml:space="preserve"> (darker / brighter / more suspended). Targets </w:t>
-      </w:r>
-      <w:r>
-        <w:rPr>
-          <w:b/>
-          <w:bCs/>
-        </w:rPr>
-        <w:t xml:space="preserve">standards</w:t>
+        <w:t xml:space="preserve"> swaps, </w:t>
+      </w:r>
+      <w:r>
+        <w:rPr>
+          <w:b/>
+          <w:bCs/>
+        </w:rPr>
+        <w:t xml:space="preserve">shell</w:t>
+      </w:r>
+      <w:r>
+        <w:t xml:space="preserve"> rewrites; targets </w:t>
+      </w:r>
+      <w:r>
+        <w:rPr>
+          <w:b/>
+          <w:bCs/>
+        </w:rPr>
+        <w:t xml:space="preserve">jazz standards</w:t>
       </w:r>
       <w:r>
         <w:t xml:space="preserve"> and </w:t>
@@ -26737,7 +27497,7 @@
         <w:t xml:space="preserve">user originals</w:t>
       </w:r>
       <w:r>
-        <w:t xml:space="preserve">.</w:t>
+        <w:t xml:space="preserve"> on the same API.</w:t>
       </w:r>
     </w:p>
     <w:p>
@@ -26766,57 +27526,177 @@
         <w:t xml:space="preserve">`ArrangementLayerRouter`</w:t>
       </w:r>
       <w:r>
-        <w:t xml:space="preserve">. </w:t>
-      </w:r>
-      <w:r>
-        <w:rPr>
-          <w:b/>
-          <w:bCs/>
-        </w:rPr>
-        <w:t xml:space="preserve">Bass</w:t>
-      </w:r>
-      <w:r>
-        <w:t xml:space="preserve"> on shell, </w:t>
-      </w:r>
-      <w:r>
-        <w:rPr>
-          <w:b/>
-          <w:bCs/>
-        </w:rPr>
-        <w:t xml:space="preserve">inner voices</w:t>
-      </w:r>
-      <w:r>
-        <w:t xml:space="preserve"> on melodic triad, </w:t>
-      </w:r>
-      <w:r>
-        <w:rPr>
-          <w:b/>
-          <w:bCs/>
-        </w:rPr>
-        <w:t xml:space="preserve">upper voices</w:t>
-      </w:r>
-      <w:r>
-        <w:t xml:space="preserve"> on quadratonic / triad-pair; </w:t>
-      </w:r>
-      <w:r>
-        <w:rPr>
-          <w:b/>
-          <w:bCs/>
-        </w:rPr>
-        <w:t xml:space="preserve">string quartet</w:t>
-      </w:r>
-      <w:r>
-        <w:t xml:space="preserve"> and </w:t>
-      </w:r>
-      <w:r>
-        <w:rPr>
-          <w:b/>
-          <w:bCs/>
-        </w:rPr>
-        <w:t xml:space="preserve">big band</w:t>
-      </w:r>
-      <w:r>
-        <w:t xml:space="preserve"> mappings.</w:t>
+        <w:t xml:space="preserve"> maps vault roles to ensemble parts. </w:t>
+      </w:r>
+      <w:r>
+        <w:rPr>
+          <w:b/>
+          <w:bCs/>
+        </w:rPr>
+        <w:t xml:space="preserve">String quartet:</w:t>
+      </w:r>
+      <w:r>
+        <w:t xml:space="preserve"> </w:t>
+      </w:r>
+      <w:r>
+        <w:rPr>
+          <w:b/>
+          <w:bCs/>
+        </w:rPr>
+        <w:t xml:space="preserve">cello</w:t>
+      </w:r>
+      <w:r>
+        <w:t xml:space="preserve"> = shell / foundation; </w:t>
+      </w:r>
+      <w:r>
+        <w:rPr>
+          <w:b/>
+          <w:bCs/>
+        </w:rPr>
+        <w:t xml:space="preserve">viola</w:t>
+      </w:r>
+      <w:r>
+        <w:t xml:space="preserve"> = </w:t>
+      </w:r>
+      <w:r>
+        <w:rPr>
+          <w:b/>
+          <w:bCs/>
+        </w:rPr>
+        <w:t xml:space="preserve">quadratonic anchor</w:t>
+      </w:r>
+      <w:r>
+        <w:t xml:space="preserve">; </w:t>
+      </w:r>
+      <w:r>
+        <w:rPr>
+          <w:b/>
+          <w:bCs/>
+        </w:rPr>
+        <w:t xml:space="preserve">violin 2</w:t>
+      </w:r>
+      <w:r>
+        <w:t xml:space="preserve"> = </w:t>
+      </w:r>
+      <w:r>
+        <w:rPr>
+          <w:b/>
+          <w:bCs/>
+        </w:rPr>
+        <w:t xml:space="preserve">melodic triad</w:t>
+      </w:r>
+      <w:r>
+        <w:t xml:space="preserve"> line; </w:t>
+      </w:r>
+      <w:r>
+        <w:rPr>
+          <w:b/>
+          <w:bCs/>
+        </w:rPr>
+        <w:t xml:space="preserve">violin 1</w:t>
+      </w:r>
+      <w:r>
+        <w:t xml:space="preserve"> = </w:t>
+      </w:r>
+      <w:r>
+        <w:rPr>
+          <w:b/>
+          <w:bCs/>
+        </w:rPr>
+        <w:t xml:space="preserve">tension</w:t>
+      </w:r>
+      <w:r>
+        <w:t xml:space="preserve"> melody. </w:t>
+      </w:r>
+      <w:r>
+        <w:rPr>
+          <w:b/>
+          <w:bCs/>
+        </w:rPr>
+        <w:t xml:space="preserve">Big band:</w:t>
+      </w:r>
+      <w:r>
+        <w:t xml:space="preserve"> </w:t>
+      </w:r>
+      <w:r>
+        <w:rPr>
+          <w:b/>
+          <w:bCs/>
+        </w:rPr>
+        <w:t xml:space="preserve">saxes</w:t>
+      </w:r>
+      <w:r>
+        <w:t xml:space="preserve"> = </w:t>
+      </w:r>
+      <w:r>
+        <w:rPr>
+          <w:b/>
+          <w:bCs/>
+        </w:rPr>
+        <w:t xml:space="preserve">triad-pair</w:t>
+      </w:r>
+      <w:r>
+        <w:t xml:space="preserve"> runs; </w:t>
+      </w:r>
+      <w:r>
+        <w:rPr>
+          <w:b/>
+          <w:bCs/>
+        </w:rPr>
+        <w:t xml:space="preserve">trombones</w:t>
+      </w:r>
+      <w:r>
+        <w:t xml:space="preserve"> = </w:t>
+      </w:r>
+      <w:r>
+        <w:rPr>
+          <w:b/>
+          <w:bCs/>
+        </w:rPr>
+        <w:t xml:space="preserve">shell + liquid</w:t>
+      </w:r>
+      <w:r>
+        <w:t xml:space="preserve"> inner motion; </w:t>
+      </w:r>
+      <w:r>
+        <w:rPr>
+          <w:b/>
+          <w:bCs/>
+        </w:rPr>
+        <w:t xml:space="preserve">trumpets</w:t>
+      </w:r>
+      <w:r>
+        <w:t xml:space="preserve"> = </w:t>
+      </w:r>
+      <w:r>
+        <w:rPr>
+          <w:b/>
+          <w:bCs/>
+        </w:rPr>
+        <w:t xml:space="preserve">tension punctures</w:t>
+      </w:r>
+      <w:r>
+        <w:t xml:space="preserve">; </w:t>
+      </w:r>
+      <w:r>
+        <w:rPr>
+          <w:b/>
+          <w:bCs/>
+        </w:rPr>
+        <w:t xml:space="preserve">guitar / piano</w:t>
+      </w:r>
+      <w:r>
+        <w:t xml:space="preserve"> = compact </w:t>
+      </w:r>
+      <w:r>
+        <w:rPr>
+          <w:b/>
+          <w:bCs/>
+        </w:rPr>
+        <w:t xml:space="preserve">3-note quadratonic</w:t>
+      </w:r>
+      <w:r>
+        <w:t xml:space="preserve"> voicings (guitar-friendly).</w:t>
       </w:r>
     </w:p>
     <w:p>
@@ -26835,7 +27715,17 @@
         <w:t xml:space="preserve">Build F — Motif transformation:</w:t>
       </w:r>
       <w:r>
-        <w:t xml:space="preserve"> Restate motifs through successive layers — </w:t>
+        <w:t xml:space="preserve"> Restate motifs through </w:t>
+      </w:r>
+      <w:r>
+        <w:rPr>
+          <w:b/>
+          <w:bCs/>
+        </w:rPr>
+        <w:t xml:space="preserve">successive layers</w:t>
+      </w:r>
+      <w:r>
+        <w:t xml:space="preserve"> — </w:t>
       </w:r>
       <w:r>
         <w:rPr>
@@ -26845,7 +27735,7 @@
         <w:t xml:space="preserve">triad → quadratonic → triad pair → liquid voicings → resolve</w:t>
       </w:r>
       <w:r>
-        <w:t xml:space="preserve">.</w:t>
+        <w:t xml:space="preserve"> — with deterministic transforms for teaching and recall.</w:t>
       </w:r>
     </w:p>
     <w:p>
@@ -26864,7 +27754,254 @@
         <w:t xml:space="preserve">Build G — Full 16-tonality per-chord rulesets:</w:t>
       </w:r>
       <w:r>
-        <w:t xml:space="preserve"> Complete behaviour pack per chord: melodic triad, quadratonic, tension hierarchy, phrase templates, beat affinity, guitar grips, reharm candidates.</w:t>
+        <w:t xml:space="preserve"> One complete behaviour pack per Tonality Vault chord type: </w:t>
+      </w:r>
+      <w:r>
+        <w:rPr>
+          <w:b/>
+          <w:bCs/>
+        </w:rPr>
+        <w:t xml:space="preserve">melodic triad</w:t>
+      </w:r>
+      <w:r>
+        <w:t xml:space="preserve">, </w:t>
+      </w:r>
+      <w:r>
+        <w:rPr>
+          <w:b/>
+          <w:bCs/>
+        </w:rPr>
+        <w:t xml:space="preserve">quadratonic</w:t>
+      </w:r>
+      <w:r>
+        <w:t xml:space="preserve">, </w:t>
+      </w:r>
+      <w:r>
+        <w:rPr>
+          <w:b/>
+          <w:bCs/>
+        </w:rPr>
+        <w:t xml:space="preserve">tension hierarchy</w:t>
+      </w:r>
+      <w:r>
+        <w:t xml:space="preserve">, phrase templates, </w:t>
+      </w:r>
+      <w:r>
+        <w:rPr>
+          <w:b/>
+          <w:bCs/>
+        </w:rPr>
+        <w:t xml:space="preserve">beat affinity</w:t>
+      </w:r>
+      <w:r>
+        <w:t xml:space="preserve">, </w:t>
+      </w:r>
+      <w:r>
+        <w:rPr>
+          <w:b/>
+          <w:bCs/>
+        </w:rPr>
+        <w:t xml:space="preserve">guitar grips</w:t>
+      </w:r>
+      <w:r>
+        <w:t xml:space="preserve">, </w:t>
+      </w:r>
+      <w:r>
+        <w:rPr>
+          <w:b/>
+          <w:bCs/>
+        </w:rPr>
+        <w:t xml:space="preserve">reharm</w:t>
+      </w:r>
+      <w:r>
+        <w:t xml:space="preserve"> candidates.</w:t>
+      </w:r>
+    </w:p>
+    <w:p>
+      <w:pPr>
+        <w:spacing w:after="80"/>
+        <w:ind w:left="360" w:hanging="260"/>
+      </w:pPr>
+      <w:r>
+        <w:t xml:space="preserve">• </w:t>
+      </w:r>
+      <w:r>
+        <w:rPr>
+          <w:b/>
+          <w:bCs/>
+        </w:rPr>
+        <w:t xml:space="preserve">Build C2 — Alt tuning extension:</w:t>
+      </w:r>
+      <w:r>
+        <w:t xml:space="preserve"> </w:t>
+      </w:r>
+      <w:r>
+        <w:rPr>
+          <w:b/>
+          <w:bCs/>
+        </w:rPr>
+        <w:t xml:space="preserve">Sonic Youth</w:t>
+      </w:r>
+      <w:r>
+        <w:t xml:space="preserve"> and </w:t>
+      </w:r>
+      <w:r>
+        <w:rPr>
+          <w:b/>
+          <w:bCs/>
+        </w:rPr>
+        <w:t xml:space="preserve">Joni Mitchell</w:t>
+      </w:r>
+      <w:r>
+        <w:t xml:space="preserve"> (and related) </w:t>
+      </w:r>
+      <w:r>
+        <w:rPr>
+          <w:b/>
+          <w:bCs/>
+        </w:rPr>
+        <w:t xml:space="preserve">altered-tuning presets</w:t>
+      </w:r>
+      <w:r>
+        <w:t xml:space="preserve"> already live in </w:t>
+      </w:r>
+      <w:r>
+        <w:rPr>
+          <w:b/>
+          <w:bCs/>
+        </w:rPr>
+        <w:t xml:space="preserve">`alternateGuitarTunings.ts`</w:t>
+      </w:r>
+      <w:r>
+        <w:t xml:space="preserve">; this build </w:t>
+      </w:r>
+      <w:r>
+        <w:rPr>
+          <w:b/>
+          <w:bCs/>
+        </w:rPr>
+        <w:t xml:space="preserve">recomputes fret positions</w:t>
+      </w:r>
+      <w:r>
+        <w:t xml:space="preserve"> from each preset’s </w:t>
+      </w:r>
+      <w:r>
+        <w:rPr>
+          <w:b/>
+          <w:bCs/>
+        </w:rPr>
+        <w:t xml:space="preserve">six string pitches</w:t>
+      </w:r>
+      <w:r>
+        <w:t xml:space="preserve"> so </w:t>
+      </w:r>
+      <w:r>
+        <w:rPr>
+          <w:b/>
+          <w:bCs/>
+        </w:rPr>
+        <w:t xml:space="preserve">`buildGuitarGripLibrary` / `generateVaultRiff`</w:t>
+      </w:r>
+      <w:r>
+        <w:t xml:space="preserve"> match the user’s tuning in the field, not E-standard only.</w:t>
+      </w:r>
+    </w:p>
+    <w:p>
+      <w:pPr>
+        <w:spacing w:after="80"/>
+        <w:ind w:left="360" w:hanging="260"/>
+      </w:pPr>
+      <w:r>
+        <w:t xml:space="preserve">• </w:t>
+      </w:r>
+      <w:r>
+        <w:rPr>
+          <w:b/>
+          <w:bCs/>
+        </w:rPr>
+        <w:t xml:space="preserve">Build UI — Visual fretboard (deferred):</w:t>
+      </w:r>
+      <w:r>
+        <w:t xml:space="preserve"> </w:t>
+      </w:r>
+      <w:r>
+        <w:rPr>
+          <w:b/>
+          <w:bCs/>
+        </w:rPr>
+        <w:t xml:space="preserve">fretboard.js</w:t>
+      </w:r>
+      <w:r>
+        <w:t xml:space="preserve"> + </w:t>
+      </w:r>
+      <w:r>
+        <w:rPr>
+          <w:b/>
+          <w:bCs/>
+        </w:rPr>
+        <w:t xml:space="preserve">VexFlow</w:t>
+      </w:r>
+      <w:r>
+        <w:t xml:space="preserve">, </w:t>
+      </w:r>
+      <w:r>
+        <w:rPr>
+          <w:b/>
+          <w:bCs/>
+        </w:rPr>
+        <w:t xml:space="preserve">three SVG layers</w:t>
+      </w:r>
+      <w:r>
+        <w:t xml:space="preserve"> (grid, active grip, legality heat). </w:t>
+      </w:r>
+      <w:r>
+        <w:rPr>
+          <w:b/>
+          <w:bCs/>
+        </w:rPr>
+        <w:t xml:space="preserve">Deferred</w:t>
+      </w:r>
+      <w:r>
+        <w:t xml:space="preserve"> until the </w:t>
+      </w:r>
+      <w:r>
+        <w:rPr>
+          <w:b/>
+          <w:bCs/>
+        </w:rPr>
+        <w:t xml:space="preserve">engine</w:t>
+      </w:r>
+      <w:r>
+        <w:t xml:space="preserve"> paths above are stable in production.</w:t>
+      </w:r>
+    </w:p>
+    <w:p>
+      <w:pPr>
+        <w:spacing w:after="80"/>
+        <w:ind w:left="360" w:hanging="260"/>
+      </w:pPr>
+      <w:r>
+        <w:t xml:space="preserve">• </w:t>
+      </w:r>
+      <w:r>
+        <w:rPr>
+          <w:b/>
+          <w:bCs/>
+        </w:rPr>
+        <w:t xml:space="preserve">Build IMG — iReal image import:</w:t>
+      </w:r>
+      <w:r>
+        <w:t xml:space="preserve"> See </w:t>
+      </w:r>
+      <w:r>
+        <w:rPr>
+          <w:b/>
+          <w:bCs/>
+        </w:rPr>
+        <w:t xml:space="preserve">iReal Image Import</w:t>
+      </w:r>
+      <w:r>
+        <w:t xml:space="preserve"> below (vision + vault pipeline).</w:t>
       </w:r>
     </w:p>
     <w:p>
@@ -26873,7 +28010,7 @@
         <w:spacing w:after="100" w:before="160"/>
       </w:pPr>
       <w:r>
-        <w:t xml:space="preserve">Planned UI additions</w:t>
+        <w:t xml:space="preserve">iReal Image Import — planned feature</w:t>
       </w:r>
     </w:p>
     <w:p>
@@ -26885,90 +28022,190 @@
           <w:b/>
           <w:bCs/>
         </w:rPr>
-        <w:t xml:space="preserve">Tension dial</w:t>
-      </w:r>
-      <w:r>
-        <w:t xml:space="preserve">, </w:t>
-      </w:r>
-      <w:r>
-        <w:rPr>
-          <w:b/>
-          <w:bCs/>
-        </w:rPr>
-        <w:t xml:space="preserve">chord-to-triad inspector</w:t>
-      </w:r>
-      <w:r>
-        <w:t xml:space="preserve">, </w:t>
-      </w:r>
-      <w:r>
-        <w:rPr>
-          <w:b/>
-          <w:bCs/>
-        </w:rPr>
-        <w:t xml:space="preserve">fretboard overlay</w:t>
-      </w:r>
-      <w:r>
-        <w:t xml:space="preserve">, </w:t>
-      </w:r>
-      <w:r>
-        <w:rPr>
-          <w:b/>
-          <w:bCs/>
-        </w:rPr>
-        <w:t xml:space="preserve">beat-legality heatmap</w:t>
-      </w:r>
-      <w:r>
-        <w:t xml:space="preserve">, </w:t>
-      </w:r>
-      <w:r>
-        <w:rPr>
-          <w:b/>
-          <w:bCs/>
-        </w:rPr>
-        <w:t xml:space="preserve">Vault microscope</w:t>
-      </w:r>
-      <w:r>
-        <w:t xml:space="preserve">, </w:t>
-      </w:r>
-      <w:r>
-        <w:rPr>
-          <w:b/>
-          <w:bCs/>
-        </w:rPr>
-        <w:t xml:space="preserve">liquid harmony preview</w:t>
-      </w:r>
-      <w:r>
-        <w:t xml:space="preserve">, </w:t>
-      </w:r>
-      <w:r>
-        <w:rPr>
-          <w:b/>
-          <w:bCs/>
-        </w:rPr>
-        <w:t xml:space="preserve">arrangement lane map</w:t>
-      </w:r>
-      <w:r>
-        <w:t xml:space="preserve">, </w:t>
-      </w:r>
-      <w:r>
-        <w:rPr>
-          <w:b/>
-          <w:bCs/>
-        </w:rPr>
-        <w:t xml:space="preserve">reharm mode</w:t>
-      </w:r>
-      <w:r>
-        <w:t xml:space="preserve">, </w:t>
-      </w:r>
-      <w:r>
-        <w:rPr>
-          <w:b/>
-          <w:bCs/>
-        </w:rPr>
-        <w:t xml:space="preserve">guitar riff mode</w:t>
-      </w:r>
-      <w:r>
-        <w:t xml:space="preserve">.</w:t>
+        <w:t xml:space="preserve">Not shipped.</w:t>
+      </w:r>
+      <w:r>
+        <w:t xml:space="preserve"> Target flow: user uploads a </w:t>
+      </w:r>
+      <w:r>
+        <w:rPr>
+          <w:b/>
+          <w:bCs/>
+        </w:rPr>
+        <w:t xml:space="preserve">JPEG</w:t>
+      </w:r>
+      <w:r>
+        <w:t xml:space="preserve"> or </w:t>
+      </w:r>
+      <w:r>
+        <w:rPr>
+          <w:b/>
+          <w:bCs/>
+        </w:rPr>
+        <w:t xml:space="preserve">screenshot</w:t>
+      </w:r>
+      <w:r>
+        <w:t xml:space="preserve"> of an </w:t>
+      </w:r>
+      <w:r>
+        <w:rPr>
+          <w:b/>
+          <w:bCs/>
+        </w:rPr>
+        <w:t xml:space="preserve">iReal Pro</w:t>
+      </w:r>
+      <w:r>
+        <w:t xml:space="preserve"> (or similar) lead sheet; </w:t>
+      </w:r>
+      <w:r>
+        <w:rPr>
+          <w:b/>
+          <w:bCs/>
+        </w:rPr>
+        <w:t xml:space="preserve">Claude vision API</w:t>
+      </w:r>
+      <w:r>
+        <w:t xml:space="preserve"> (or equivalent vision model) reads </w:t>
+      </w:r>
+      <w:r>
+        <w:rPr>
+          <w:b/>
+          <w:bCs/>
+        </w:rPr>
+        <w:t xml:space="preserve">chord symbols</w:t>
+      </w:r>
+      <w:r>
+        <w:t xml:space="preserve"> and </w:t>
+      </w:r>
+      <w:r>
+        <w:rPr>
+          <w:b/>
+          <w:bCs/>
+        </w:rPr>
+        <w:t xml:space="preserve">bar structure</w:t>
+      </w:r>
+      <w:r>
+        <w:t xml:space="preserve">; normalised symbols map to </w:t>
+      </w:r>
+      <w:r>
+        <w:rPr>
+          <w:b/>
+          <w:bCs/>
+        </w:rPr>
+        <w:t xml:space="preserve">Tonality Vault</w:t>
+      </w:r>
+      <w:r>
+        <w:t xml:space="preserve"> rows via </w:t>
+      </w:r>
+      <w:r>
+        <w:rPr>
+          <w:b/>
+          <w:bCs/>
+        </w:rPr>
+        <w:t xml:space="preserve">`tonalityVaultDatabase`</w:t>
+      </w:r>
+      <w:r>
+        <w:t xml:space="preserve">; for each bar / chord, the engine generates </w:t>
+      </w:r>
+      <w:r>
+        <w:rPr>
+          <w:b/>
+          <w:bCs/>
+        </w:rPr>
+        <w:t xml:space="preserve">quadratonic</w:t>
+      </w:r>
+      <w:r>
+        <w:t xml:space="preserve"> melodic lines and </w:t>
+      </w:r>
+      <w:r>
+        <w:rPr>
+          <w:b/>
+          <w:bCs/>
+        </w:rPr>
+        <w:t xml:space="preserve">bebop-style</w:t>
+      </w:r>
+      <w:r>
+        <w:t xml:space="preserve"> riffs using </w:t>
+      </w:r>
+      <w:r>
+        <w:rPr>
+          <w:b/>
+          <w:bCs/>
+        </w:rPr>
+        <w:t xml:space="preserve">Build C</w:t>
+      </w:r>
+      <w:r>
+        <w:t xml:space="preserve">; output is </w:t>
+      </w:r>
+      <w:r>
+        <w:rPr>
+          <w:b/>
+          <w:bCs/>
+        </w:rPr>
+        <w:t xml:space="preserve">MusicXML</w:t>
+      </w:r>
+      <w:r>
+        <w:t xml:space="preserve"> for </w:t>
+      </w:r>
+      <w:r>
+        <w:rPr>
+          <w:b/>
+          <w:bCs/>
+        </w:rPr>
+        <w:t xml:space="preserve">Guitar Pro 8</w:t>
+      </w:r>
+      <w:r>
+        <w:t xml:space="preserve"> and </w:t>
+      </w:r>
+      <w:r>
+        <w:rPr>
+          <w:b/>
+          <w:bCs/>
+        </w:rPr>
+        <w:t xml:space="preserve">Sibelius</w:t>
+      </w:r>
+      <w:r>
+        <w:t xml:space="preserve"> (notation + tab when the tab/staff path is enabled). </w:t>
+      </w:r>
+      <w:r>
+        <w:rPr>
+          <w:b/>
+          <w:bCs/>
+        </w:rPr>
+        <w:t xml:space="preserve">Dependencies:</w:t>
+      </w:r>
+      <w:r>
+        <w:t xml:space="preserve"> </w:t>
+      </w:r>
+      <w:r>
+        <w:rPr>
+          <w:b/>
+          <w:bCs/>
+        </w:rPr>
+        <w:t xml:space="preserve">Build C</w:t>
+      </w:r>
+      <w:r>
+        <w:t xml:space="preserve"> (grip + riff), </w:t>
+      </w:r>
+      <w:r>
+        <w:rPr>
+          <w:b/>
+          <w:bCs/>
+        </w:rPr>
+        <w:t xml:space="preserve">Build D</w:t>
+      </w:r>
+      <w:r>
+        <w:t xml:space="preserve"> (optional reharm pass), and a dedicated </w:t>
+      </w:r>
+      <w:r>
+        <w:rPr>
+          <w:b/>
+          <w:bCs/>
+        </w:rPr>
+        <w:t xml:space="preserve">image input + OCR review</w:t>
+      </w:r>
+      <w:r>
+        <w:t xml:space="preserve"> layer.</w:t>
       </w:r>
     </w:p>
     <w:p>
@@ -26977,7 +28214,340 @@
         <w:spacing w:after="100" w:before="160"/>
       </w:pPr>
       <w:r>
-        <w:t xml:space="preserve">Build order</w:t>
+        <w:t xml:space="preserve">How Composer OS helps composition</w:t>
+      </w:r>
+    </w:p>
+    <w:p>
+      <w:pPr>
+        <w:spacing w:after="80"/>
+        <w:ind w:left="360" w:hanging="260"/>
+      </w:pPr>
+      <w:r>
+        <w:t xml:space="preserve">• </w:t>
+      </w:r>
+      <w:r>
+        <w:rPr>
+          <w:b/>
+          <w:bCs/>
+        </w:rPr>
+        <w:t xml:space="preserve">Melodic material</w:t>
+      </w:r>
+      <w:r>
+        <w:t xml:space="preserve"> is anchored to </w:t>
+      </w:r>
+      <w:r>
+        <w:rPr>
+          <w:b/>
+          <w:bCs/>
+        </w:rPr>
+        <w:t xml:space="preserve">quadratonic / melodic-triad</w:t>
+      </w:r>
+      <w:r>
+        <w:t xml:space="preserve"> logic </w:t>
+      </w:r>
+      <w:r>
+        <w:rPr>
+          <w:b/>
+          <w:bCs/>
+        </w:rPr>
+        <w:t xml:space="preserve">per chord</w:t>
+      </w:r>
+      <w:r>
+        <w:t xml:space="preserve">—not generic </w:t>
+      </w:r>
+      <w:r>
+        <w:rPr>
+          <w:b/>
+          <w:bCs/>
+        </w:rPr>
+        <w:t xml:space="preserve">scale</w:t>
+      </w:r>
+      <w:r>
+        <w:t xml:space="preserve"> runs.</w:t>
+      </w:r>
+    </w:p>
+    <w:p>
+      <w:pPr>
+        <w:spacing w:after="80"/>
+        <w:ind w:left="360" w:hanging="260"/>
+      </w:pPr>
+      <w:r>
+        <w:t xml:space="preserve">• </w:t>
+      </w:r>
+      <w:r>
+        <w:rPr>
+          <w:b/>
+          <w:bCs/>
+        </w:rPr>
+        <w:t xml:space="preserve">Reharmonisation</w:t>
+      </w:r>
+      <w:r>
+        <w:t xml:space="preserve"> (when </w:t>
+      </w:r>
+      <w:r>
+        <w:rPr>
+          <w:b/>
+          <w:bCs/>
+        </w:rPr>
+        <w:t xml:space="preserve">Build D</w:t>
+      </w:r>
+      <w:r>
+        <w:t xml:space="preserve"> lands) is designed to </w:t>
+      </w:r>
+      <w:r>
+        <w:rPr>
+          <w:b/>
+          <w:bCs/>
+        </w:rPr>
+        <w:t xml:space="preserve">preserve melodic-triad identity</w:t>
+      </w:r>
+      <w:r>
+        <w:t xml:space="preserve"> while modernising </w:t>
+      </w:r>
+      <w:r>
+        <w:rPr>
+          <w:b/>
+          <w:bCs/>
+        </w:rPr>
+        <w:t xml:space="preserve">shells</w:t>
+      </w:r>
+      <w:r>
+        <w:t xml:space="preserve"> and colour.</w:t>
+      </w:r>
+    </w:p>
+    <w:p>
+      <w:pPr>
+        <w:spacing w:after="80"/>
+        <w:ind w:left="360" w:hanging="260"/>
+      </w:pPr>
+      <w:r>
+        <w:t xml:space="preserve">• </w:t>
+      </w:r>
+      <w:r>
+        <w:rPr>
+          <w:b/>
+          <w:bCs/>
+        </w:rPr>
+        <w:t xml:space="preserve">String quartet</w:t>
+      </w:r>
+      <w:r>
+        <w:t xml:space="preserve"> sketches: each </w:t>
+      </w:r>
+      <w:r>
+        <w:rPr>
+          <w:b/>
+          <w:bCs/>
+        </w:rPr>
+        <w:t xml:space="preserve">voice</w:t>
+      </w:r>
+      <w:r>
+        <w:t xml:space="preserve"> can be assigned a different </w:t>
+      </w:r>
+      <w:r>
+        <w:rPr>
+          <w:b/>
+          <w:bCs/>
+        </w:rPr>
+        <w:t xml:space="preserve">tension layer</w:t>
+      </w:r>
+      <w:r>
+        <w:t xml:space="preserve"> so the ensemble moves as a </w:t>
+      </w:r>
+      <w:r>
+        <w:rPr>
+          <w:b/>
+          <w:bCs/>
+        </w:rPr>
+        <w:t xml:space="preserve">coherent</w:t>
+      </w:r>
+      <w:r>
+        <w:t xml:space="preserve"> harmonic unit.</w:t>
+      </w:r>
+    </w:p>
+    <w:p>
+      <w:pPr>
+        <w:spacing w:after="80"/>
+        <w:ind w:left="360" w:hanging="260"/>
+      </w:pPr>
+      <w:r>
+        <w:t xml:space="preserve">• </w:t>
+      </w:r>
+      <w:r>
+        <w:rPr>
+          <w:b/>
+          <w:bCs/>
+        </w:rPr>
+        <w:t xml:space="preserve">Big band:</w:t>
+      </w:r>
+      <w:r>
+        <w:t xml:space="preserve"> </w:t>
+      </w:r>
+      <w:r>
+        <w:rPr>
+          <w:b/>
+          <w:bCs/>
+        </w:rPr>
+        <w:t xml:space="preserve">arranger style profiles</w:t>
+      </w:r>
+      <w:r>
+        <w:t xml:space="preserve"> + </w:t>
+      </w:r>
+      <w:r>
+        <w:rPr>
+          <w:b/>
+          <w:bCs/>
+        </w:rPr>
+        <w:t xml:space="preserve">Vault layer routing</w:t>
+      </w:r>
+      <w:r>
+        <w:t xml:space="preserve"> together are a </w:t>
+      </w:r>
+      <w:r>
+        <w:rPr>
+          <w:b/>
+          <w:bCs/>
+        </w:rPr>
+        <w:t xml:space="preserve">differentiated</w:t>
+      </w:r>
+      <w:r>
+        <w:t xml:space="preserve"> capability—style governs phrasing and weight; vault governs </w:t>
+      </w:r>
+      <w:r>
+        <w:rPr>
+          <w:b/>
+          <w:bCs/>
+        </w:rPr>
+        <w:t xml:space="preserve">who plays which harmonic role</w:t>
+      </w:r>
+      <w:r>
+        <w:t xml:space="preserve">.</w:t>
+      </w:r>
+    </w:p>
+    <w:p>
+      <w:pPr>
+        <w:spacing w:after="80"/>
+        <w:ind w:left="360" w:hanging="260"/>
+      </w:pPr>
+      <w:r>
+        <w:t xml:space="preserve">• </w:t>
+      </w:r>
+      <w:r>
+        <w:rPr>
+          <w:b/>
+          <w:bCs/>
+        </w:rPr>
+        <w:t xml:space="preserve">Guitar:</w:t>
+      </w:r>
+      <w:r>
+        <w:t xml:space="preserve"> </w:t>
+      </w:r>
+      <w:r>
+        <w:rPr>
+          <w:b/>
+          <w:bCs/>
+        </w:rPr>
+        <w:t xml:space="preserve">position-aware</w:t>
+      </w:r>
+      <w:r>
+        <w:t xml:space="preserve">, </w:t>
+      </w:r>
+      <w:r>
+        <w:rPr>
+          <w:b/>
+          <w:bCs/>
+        </w:rPr>
+        <w:t xml:space="preserve">idiomatic</w:t>
+      </w:r>
+      <w:r>
+        <w:t xml:space="preserve"> riffs from </w:t>
+      </w:r>
+      <w:r>
+        <w:rPr>
+          <w:b/>
+          <w:bCs/>
+        </w:rPr>
+        <w:t xml:space="preserve">Build C</w:t>
+      </w:r>
+      <w:r>
+        <w:t xml:space="preserve">; </w:t>
+      </w:r>
+      <w:r>
+        <w:rPr>
+          <w:b/>
+          <w:bCs/>
+        </w:rPr>
+        <w:t xml:space="preserve">MusicXML → GP8</w:t>
+      </w:r>
+      <w:r>
+        <w:t xml:space="preserve"> import path yields </w:t>
+      </w:r>
+      <w:r>
+        <w:rPr>
+          <w:b/>
+          <w:bCs/>
+        </w:rPr>
+        <w:t xml:space="preserve">tab</w:t>
+      </w:r>
+      <w:r>
+        <w:t xml:space="preserve"> in Guitar Pro the same way other exported guitar scores do once the line is on the score.</w:t>
+      </w:r>
+    </w:p>
+    <w:p>
+      <w:pPr>
+        <w:spacing w:after="80"/>
+        <w:ind w:left="360" w:hanging="260"/>
+      </w:pPr>
+      <w:r>
+        <w:t xml:space="preserve">• </w:t>
+      </w:r>
+      <w:r>
+        <w:rPr>
+          <w:b/>
+          <w:bCs/>
+        </w:rPr>
+        <w:t xml:space="preserve">Vault microscope UI</w:t>
+      </w:r>
+      <w:r>
+        <w:t xml:space="preserve"> (planned) will surface </w:t>
+      </w:r>
+      <w:r>
+        <w:rPr>
+          <w:b/>
+          <w:bCs/>
+        </w:rPr>
+        <w:t xml:space="preserve">why</w:t>
+      </w:r>
+      <w:r>
+        <w:t xml:space="preserve"> the engine chose a note or grip—</w:t>
+      </w:r>
+      <w:r>
+        <w:rPr>
+          <w:b/>
+          <w:bCs/>
+        </w:rPr>
+        <w:t xml:space="preserve">teachable</w:t>
+      </w:r>
+      <w:r>
+        <w:t xml:space="preserve">, </w:t>
+      </w:r>
+      <w:r>
+        <w:rPr>
+          <w:b/>
+          <w:bCs/>
+        </w:rPr>
+        <w:t xml:space="preserve">transparent</w:t>
+      </w:r>
+      <w:r>
+        <w:t xml:space="preserve"> decisions for classrooms and creators.</w:t>
+      </w:r>
+    </w:p>
+    <w:p>
+      <w:pPr>
+        <w:pStyle w:val="Heading2"/>
+        <w:spacing w:after="100" w:before="160"/>
+      </w:pPr>
+      <w:r>
+        <w:t xml:space="preserve">Planned UI additions (cross-cutting)</w:t>
       </w:r>
     </w:p>
     <w:p>
@@ -26989,10 +28559,144 @@
           <w:b/>
           <w:bCs/>
         </w:rPr>
-        <w:t xml:space="preserve">A → C → B → D → E → F → G</w:t>
-      </w:r>
-      <w:r>
-        <w:t xml:space="preserve"> (guitar riff engine </w:t>
+        <w:t xml:space="preserve">Tension dial</w:t>
+      </w:r>
+      <w:r>
+        <w:t xml:space="preserve">, </w:t>
+      </w:r>
+      <w:r>
+        <w:rPr>
+          <w:b/>
+          <w:bCs/>
+        </w:rPr>
+        <w:t xml:space="preserve">chord-to-triad inspector</w:t>
+      </w:r>
+      <w:r>
+        <w:t xml:space="preserve">, </w:t>
+      </w:r>
+      <w:r>
+        <w:rPr>
+          <w:b/>
+          <w:bCs/>
+        </w:rPr>
+        <w:t xml:space="preserve">fretboard overlay</w:t>
+      </w:r>
+      <w:r>
+        <w:t xml:space="preserve"> (</w:t>
+      </w:r>
+      <w:r>
+        <w:rPr>
+          <w:b/>
+          <w:bCs/>
+        </w:rPr>
+        <w:t xml:space="preserve">Build UI</w:t>
+      </w:r>
+      <w:r>
+        <w:t xml:space="preserve">), </w:t>
+      </w:r>
+      <w:r>
+        <w:rPr>
+          <w:b/>
+          <w:bCs/>
+        </w:rPr>
+        <w:t xml:space="preserve">beat-legality heatmap</w:t>
+      </w:r>
+      <w:r>
+        <w:t xml:space="preserve">, </w:t>
+      </w:r>
+      <w:r>
+        <w:rPr>
+          <w:b/>
+          <w:bCs/>
+        </w:rPr>
+        <w:t xml:space="preserve">Vault microscope</w:t>
+      </w:r>
+      <w:r>
+        <w:t xml:space="preserve">, </w:t>
+      </w:r>
+      <w:r>
+        <w:rPr>
+          <w:b/>
+          <w:bCs/>
+        </w:rPr>
+        <w:t xml:space="preserve">liquid harmony preview</w:t>
+      </w:r>
+      <w:r>
+        <w:t xml:space="preserve">, </w:t>
+      </w:r>
+      <w:r>
+        <w:rPr>
+          <w:b/>
+          <w:bCs/>
+        </w:rPr>
+        <w:t xml:space="preserve">arrangement lane map</w:t>
+      </w:r>
+      <w:r>
+        <w:t xml:space="preserve">, </w:t>
+      </w:r>
+      <w:r>
+        <w:rPr>
+          <w:b/>
+          <w:bCs/>
+        </w:rPr>
+        <w:t xml:space="preserve">reharm mode</w:t>
+      </w:r>
+      <w:r>
+        <w:t xml:space="preserve">, </w:t>
+      </w:r>
+      <w:r>
+        <w:rPr>
+          <w:b/>
+          <w:bCs/>
+        </w:rPr>
+        <w:t xml:space="preserve">guitar riff mode</w:t>
+      </w:r>
+      <w:r>
+        <w:t xml:space="preserve">, </w:t>
+      </w:r>
+      <w:r>
+        <w:rPr>
+          <w:b/>
+          <w:bCs/>
+        </w:rPr>
+        <w:t xml:space="preserve">iReal image upload</w:t>
+      </w:r>
+      <w:r>
+        <w:t xml:space="preserve"> (</w:t>
+      </w:r>
+      <w:r>
+        <w:rPr>
+          <w:b/>
+          <w:bCs/>
+        </w:rPr>
+        <w:t xml:space="preserve">Build IMG</w:t>
+      </w:r>
+      <w:r>
+        <w:t xml:space="preserve">).</w:t>
+      </w:r>
+    </w:p>
+    <w:p>
+      <w:pPr>
+        <w:pStyle w:val="Heading2"/>
+        <w:spacing w:after="100" w:before="160"/>
+      </w:pPr>
+      <w:r>
+        <w:t xml:space="preserve">Build order (remaining)</w:t>
+      </w:r>
+    </w:p>
+    <w:p>
+      <w:pPr>
+        <w:spacing w:after="160"/>
+      </w:pPr>
+      <w:r>
+        <w:rPr>
+          <w:b/>
+          <w:bCs/>
+        </w:rPr>
+        <w:t xml:space="preserve">A</w:t>
+      </w:r>
+      <w:r>
+        <w:t xml:space="preserve"> and </w:t>
       </w:r>
       <w:r>
         <w:rPr>
@@ -27002,17 +28706,39 @@
         <w:t xml:space="preserve">C</w:t>
       </w:r>
       <w:r>
-        <w:t xml:space="preserve"> prioritised immediately after tagging/context </w:t>
-      </w:r>
-      <w:r>
-        <w:rPr>
-          <w:b/>
-          <w:bCs/>
-        </w:rPr>
-        <w:t xml:space="preserve">A</w:t>
-      </w:r>
-      <w:r>
-        <w:t xml:space="preserve">).</w:t>
+        <w:t xml:space="preserve"> are </w:t>
+      </w:r>
+      <w:r>
+        <w:rPr>
+          <w:b/>
+          <w:bCs/>
+        </w:rPr>
+        <w:t xml:space="preserve">complete</w:t>
+      </w:r>
+      <w:r>
+        <w:t xml:space="preserve">. Planned sequencing for </w:t>
+      </w:r>
+      <w:r>
+        <w:rPr>
+          <w:b/>
+          <w:bCs/>
+        </w:rPr>
+        <w:t xml:space="preserve">remaining</w:t>
+      </w:r>
+      <w:r>
+        <w:t xml:space="preserve"> builds:</w:t>
+      </w:r>
+    </w:p>
+    <w:p>
+      <w:pPr>
+        <w:spacing w:after="160"/>
+      </w:pPr>
+      <w:r>
+        <w:rPr>
+          <w:b/>
+          <w:bCs/>
+        </w:rPr>
+        <w:t xml:space="preserve">B → D → E → F → G → C2 → UI → IMG</w:t>
       </w:r>
     </w:p>
     <w:p>

</xml_diff>

<commit_message>
feat: Tonality Vault Build B — LayerStateMachine and LiquidHarmonyPlanner; docs: iReal Pro parser research, roadmap updated
Co-authored-by: Cursor <cursoragent@cursor.com>
</commit_message>
<xml_diff>
--- a/docs/COMPOSER_OS_PLAYBOOK.docx
+++ b/docs/COMPOSER_OS_PLAYBOOK.docx
@@ -26461,6 +26461,764 @@
         <w:spacing w:after="100" w:before="160"/>
       </w:pPr>
       <w:r>
+        <w:t xml:space="preserve">Build B — Layer state machine + liquid harmony (**complete**)</w:t>
+      </w:r>
+    </w:p>
+    <w:p>
+      <w:pPr>
+        <w:spacing w:after="160"/>
+      </w:pPr>
+      <w:r>
+        <w:rPr>
+          <w:b/>
+          <w:bCs/>
+        </w:rPr>
+        <w:t xml:space="preserve">Shipped</w:t>
+      </w:r>
+      <w:r>
+        <w:t xml:space="preserve"> in `engines/composer-os-v2/core/harmony/` — </w:t>
+      </w:r>
+      <w:r>
+        <w:rPr>
+          <w:b/>
+          <w:bCs/>
+        </w:rPr>
+        <w:t xml:space="preserve">`layerStateMachine.ts`</w:t>
+      </w:r>
+      <w:r>
+        <w:t xml:space="preserve">, </w:t>
+      </w:r>
+      <w:r>
+        <w:rPr>
+          <w:b/>
+          <w:bCs/>
+        </w:rPr>
+        <w:t xml:space="preserve">`liquidHarmonyPlanner.ts`</w:t>
+      </w:r>
+      <w:r>
+        <w:t xml:space="preserve"> (re-exported from </w:t>
+      </w:r>
+      <w:r>
+        <w:rPr>
+          <w:b/>
+          <w:bCs/>
+        </w:rPr>
+        <w:t xml:space="preserve">`harmony/index.ts`</w:t>
+      </w:r>
+      <w:r>
+        <w:t xml:space="preserve">).</w:t>
+      </w:r>
+    </w:p>
+    <w:p>
+      <w:pPr>
+        <w:spacing w:after="160"/>
+      </w:pPr>
+      <w:r>
+        <w:rPr>
+          <w:b/>
+          <w:bCs/>
+        </w:rPr>
+        <w:t xml:space="preserve">`TensionState`</w:t>
+      </w:r>
+      <w:r>
+        <w:t xml:space="preserve"> — phrase arc label: </w:t>
+      </w:r>
+      <w:r>
+        <w:rPr>
+          <w:b/>
+          <w:bCs/>
+        </w:rPr>
+        <w:t xml:space="preserve">`resolve`</w:t>
+      </w:r>
+      <w:r>
+        <w:t xml:space="preserve"> \| </w:t>
+      </w:r>
+      <w:r>
+        <w:rPr>
+          <w:b/>
+          <w:bCs/>
+        </w:rPr>
+        <w:t xml:space="preserve">`primary`</w:t>
+      </w:r>
+      <w:r>
+        <w:t xml:space="preserve"> \| </w:t>
+      </w:r>
+      <w:r>
+        <w:rPr>
+          <w:b/>
+          <w:bCs/>
+        </w:rPr>
+        <w:t xml:space="preserve">`tension`</w:t>
+      </w:r>
+      <w:r>
+        <w:t xml:space="preserve"> \| </w:t>
+      </w:r>
+      <w:r>
+        <w:rPr>
+          <w:b/>
+          <w:bCs/>
+        </w:rPr>
+        <w:t xml:space="preserve">`chaos`</w:t>
+      </w:r>
+      <w:r>
+        <w:t xml:space="preserve"> \| </w:t>
+      </w:r>
+      <w:r>
+        <w:rPr>
+          <w:b/>
+          <w:bCs/>
+        </w:rPr>
+        <w:t xml:space="preserve">`recover`</w:t>
+      </w:r>
+      <w:r>
+        <w:t xml:space="preserve">.</w:t>
+      </w:r>
+    </w:p>
+    <w:p>
+      <w:pPr>
+        <w:spacing w:after="160"/>
+      </w:pPr>
+      <w:r>
+        <w:rPr>
+          <w:b/>
+          <w:bCs/>
+        </w:rPr>
+        <w:t xml:space="preserve">`LayerStateMachine`</w:t>
+      </w:r>
+    </w:p>
+    <w:p>
+      <w:pPr>
+        <w:spacing w:after="80"/>
+        <w:ind w:left="360" w:hanging="260"/>
+      </w:pPr>
+      <w:r>
+        <w:t xml:space="preserve">• </w:t>
+      </w:r>
+      <w:r>
+        <w:rPr>
+          <w:b/>
+          <w:bCs/>
+        </w:rPr>
+        <w:t xml:space="preserve">`currentState`</w:t>
+      </w:r>
+      <w:r>
+        <w:t xml:space="preserve"> starts at </w:t>
+      </w:r>
+      <w:r>
+        <w:rPr>
+          <w:b/>
+          <w:bCs/>
+        </w:rPr>
+        <w:t xml:space="preserve">`primary`</w:t>
+      </w:r>
+      <w:r>
+        <w:t xml:space="preserve">.</w:t>
+      </w:r>
+    </w:p>
+    <w:p>
+      <w:pPr>
+        <w:spacing w:after="80"/>
+        <w:ind w:left="360" w:hanging="260"/>
+      </w:pPr>
+      <w:r>
+        <w:t xml:space="preserve">• </w:t>
+      </w:r>
+      <w:r>
+        <w:rPr>
+          <w:b/>
+          <w:bCs/>
+        </w:rPr>
+        <w:t xml:space="preserve">`advance(beatStrength)`</w:t>
+      </w:r>
+      <w:r>
+        <w:t xml:space="preserve"> with </w:t>
+      </w:r>
+      <w:r>
+        <w:rPr>
+          <w:b/>
+          <w:bCs/>
+        </w:rPr>
+        <w:t xml:space="preserve">`'strong'`</w:t>
+      </w:r>
+      <w:r>
+        <w:t xml:space="preserve"> \| </w:t>
+      </w:r>
+      <w:r>
+        <w:rPr>
+          <w:b/>
+          <w:bCs/>
+        </w:rPr>
+        <w:t xml:space="preserve">`'weak'`</w:t>
+      </w:r>
+      <w:r>
+        <w:t xml:space="preserve"> \| </w:t>
+      </w:r>
+      <w:r>
+        <w:rPr>
+          <w:b/>
+          <w:bCs/>
+        </w:rPr>
+        <w:t xml:space="preserve">`'offbeat'`</w:t>
+      </w:r>
+      <w:r>
+        <w:t xml:space="preserve"> — returns the new state. Contract: </w:t>
+      </w:r>
+      <w:r>
+        <w:rPr>
+          <w:b/>
+          <w:bCs/>
+        </w:rPr>
+        <w:t xml:space="preserve">tension</w:t>
+      </w:r>
+      <w:r>
+        <w:t xml:space="preserve"> is only entered from </w:t>
+      </w:r>
+      <w:r>
+        <w:rPr>
+          <w:b/>
+          <w:bCs/>
+        </w:rPr>
+        <w:t xml:space="preserve">primary</w:t>
+      </w:r>
+      <w:r>
+        <w:t xml:space="preserve"> (on a </w:t>
+      </w:r>
+      <w:r>
+        <w:rPr>
+          <w:b/>
+          <w:bCs/>
+        </w:rPr>
+        <w:t xml:space="preserve">weak</w:t>
+      </w:r>
+      <w:r>
+        <w:t xml:space="preserve"> beat); </w:t>
+      </w:r>
+      <w:r>
+        <w:rPr>
+          <w:b/>
+          <w:bCs/>
+        </w:rPr>
+        <w:t xml:space="preserve">chaos</w:t>
+      </w:r>
+      <w:r>
+        <w:t xml:space="preserve"> accumulates a </w:t>
+      </w:r>
+      <w:r>
+        <w:rPr>
+          <w:b/>
+          <w:bCs/>
+        </w:rPr>
+        <w:t xml:space="preserve">16-subdivision</w:t>
+      </w:r>
+      <w:r>
+        <w:t xml:space="preserve"> budget (two 4/4 bars of eighths); on </w:t>
+      </w:r>
+      <w:r>
+        <w:rPr>
+          <w:b/>
+          <w:bCs/>
+        </w:rPr>
+        <w:t xml:space="preserve">strong</w:t>
+      </w:r>
+      <w:r>
+        <w:t xml:space="preserve"> with budget exceeded, </w:t>
+      </w:r>
+      <w:r>
+        <w:rPr>
+          <w:b/>
+          <w:bCs/>
+        </w:rPr>
+        <w:t xml:space="preserve">chaos</w:t>
+      </w:r>
+      <w:r>
+        <w:t xml:space="preserve"> is forced to </w:t>
+      </w:r>
+      <w:r>
+        <w:rPr>
+          <w:b/>
+          <w:bCs/>
+        </w:rPr>
+        <w:t xml:space="preserve">resolve</w:t>
+      </w:r>
+      <w:r>
+        <w:t xml:space="preserve">; </w:t>
+      </w:r>
+      <w:r>
+        <w:rPr>
+          <w:b/>
+          <w:bCs/>
+        </w:rPr>
+        <w:t xml:space="preserve">chaos</w:t>
+      </w:r>
+      <w:r>
+        <w:t xml:space="preserve"> may </w:t>
+      </w:r>
+      <w:r>
+        <w:rPr>
+          <w:b/>
+          <w:bCs/>
+        </w:rPr>
+        <w:t xml:space="preserve">escape</w:t>
+      </w:r>
+      <w:r>
+        <w:t xml:space="preserve"> to </w:t>
+      </w:r>
+      <w:r>
+        <w:rPr>
+          <w:b/>
+          <w:bCs/>
+        </w:rPr>
+        <w:t xml:space="preserve">recover</w:t>
+      </w:r>
+      <w:r>
+        <w:t xml:space="preserve"> with ~</w:t>
+      </w:r>
+      <w:r>
+        <w:rPr>
+          <w:b/>
+          <w:bCs/>
+        </w:rPr>
+        <w:t xml:space="preserve">0.15</w:t>
+      </w:r>
+      <w:r>
+        <w:t xml:space="preserve"> probability (deterministic gate, no `Math.random`); if the budget is hit off a </w:t>
+      </w:r>
+      <w:r>
+        <w:rPr>
+          <w:b/>
+          <w:bCs/>
+        </w:rPr>
+        <w:t xml:space="preserve">strong</w:t>
+      </w:r>
+      <w:r>
+        <w:t xml:space="preserve"> beat, </w:t>
+      </w:r>
+      <w:r>
+        <w:rPr>
+          <w:b/>
+          <w:bCs/>
+        </w:rPr>
+        <w:t xml:space="preserve">recover</w:t>
+      </w:r>
+      <w:r>
+        <w:t xml:space="preserve">; </w:t>
+      </w:r>
+      <w:r>
+        <w:rPr>
+          <w:b/>
+          <w:bCs/>
+        </w:rPr>
+        <w:t xml:space="preserve">recover</w:t>
+      </w:r>
+      <w:r>
+        <w:t xml:space="preserve"> holds until the </w:t>
+      </w:r>
+      <w:r>
+        <w:rPr>
+          <w:b/>
+          <w:bCs/>
+        </w:rPr>
+        <w:t xml:space="preserve">next strong</w:t>
+      </w:r>
+      <w:r>
+        <w:t xml:space="preserve"> beat, then </w:t>
+      </w:r>
+      <w:r>
+        <w:rPr>
+          <w:b/>
+          <w:bCs/>
+        </w:rPr>
+        <w:t xml:space="preserve">resolve</w:t>
+      </w:r>
+      <w:r>
+        <w:t xml:space="preserve">; </w:t>
+      </w:r>
+      <w:r>
+        <w:rPr>
+          <w:b/>
+          <w:bCs/>
+        </w:rPr>
+        <w:t xml:space="preserve">resolve</w:t>
+      </w:r>
+      <w:r>
+        <w:t xml:space="preserve"> is one step, then back to </w:t>
+      </w:r>
+      <w:r>
+        <w:rPr>
+          <w:b/>
+          <w:bCs/>
+        </w:rPr>
+        <w:t xml:space="preserve">primary</w:t>
+      </w:r>
+      <w:r>
+        <w:t xml:space="preserve">; </w:t>
+      </w:r>
+      <w:r>
+        <w:rPr>
+          <w:b/>
+          <w:bCs/>
+        </w:rPr>
+        <w:t xml:space="preserve">strong</w:t>
+      </w:r>
+      <w:r>
+        <w:t xml:space="preserve"> from </w:t>
+      </w:r>
+      <w:r>
+        <w:rPr>
+          <w:b/>
+          <w:bCs/>
+        </w:rPr>
+        <w:t xml:space="preserve">primary</w:t>
+      </w:r>
+      <w:r>
+        <w:t xml:space="preserve"> or </w:t>
+      </w:r>
+      <w:r>
+        <w:rPr>
+          <w:b/>
+          <w:bCs/>
+        </w:rPr>
+        <w:t xml:space="preserve">tension</w:t>
+      </w:r>
+      <w:r>
+        <w:t xml:space="preserve"> can hit </w:t>
+      </w:r>
+      <w:r>
+        <w:rPr>
+          <w:b/>
+          <w:bCs/>
+        </w:rPr>
+        <w:t xml:space="preserve">resolve</w:t>
+      </w:r>
+      <w:r>
+        <w:t xml:space="preserve"> (cadential / release).</w:t>
+      </w:r>
+    </w:p>
+    <w:p>
+      <w:pPr>
+        <w:spacing w:after="80"/>
+        <w:ind w:left="360" w:hanging="260"/>
+      </w:pPr>
+      <w:r>
+        <w:t xml:space="preserve">• </w:t>
+      </w:r>
+      <w:r>
+        <w:rPr>
+          <w:b/>
+          <w:bCs/>
+        </w:rPr>
+        <w:t xml:space="preserve">`getAllowedLayers(state)`</w:t>
+      </w:r>
+      <w:r>
+        <w:t xml:space="preserve"> (static) — maps each </w:t>
+      </w:r>
+      <w:r>
+        <w:rPr>
+          <w:b/>
+          <w:bCs/>
+        </w:rPr>
+        <w:t xml:space="preserve">`TensionState`</w:t>
+      </w:r>
+      <w:r>
+        <w:t xml:space="preserve"> to allowed </w:t>
+      </w:r>
+      <w:r>
+        <w:rPr>
+          <w:b/>
+          <w:bCs/>
+        </w:rPr>
+        <w:t xml:space="preserve">`NoteLayer`</w:t>
+      </w:r>
+      <w:r>
+        <w:t xml:space="preserve"> values from </w:t>
+      </w:r>
+      <w:r>
+        <w:rPr>
+          <w:b/>
+          <w:bCs/>
+        </w:rPr>
+        <w:t xml:space="preserve">`noteTag.ts`</w:t>
+      </w:r>
+      <w:r>
+        <w:t xml:space="preserve"> (`0`–`3`): </w:t>
+      </w:r>
+      <w:r>
+        <w:rPr>
+          <w:b/>
+          <w:bCs/>
+        </w:rPr>
+        <w:t xml:space="preserve">resolve</w:t>
+      </w:r>
+      <w:r>
+        <w:t xml:space="preserve"> `[0]`; </w:t>
+      </w:r>
+      <w:r>
+        <w:rPr>
+          <w:b/>
+          <w:bCs/>
+        </w:rPr>
+        <w:t xml:space="preserve">primary</w:t>
+      </w:r>
+      <w:r>
+        <w:t xml:space="preserve"> `[0,1]`; </w:t>
+      </w:r>
+      <w:r>
+        <w:rPr>
+          <w:b/>
+          <w:bCs/>
+        </w:rPr>
+        <w:t xml:space="preserve">tension</w:t>
+      </w:r>
+      <w:r>
+        <w:t xml:space="preserve"> `[1,2]`; </w:t>
+      </w:r>
+      <w:r>
+        <w:rPr>
+          <w:b/>
+          <w:bCs/>
+        </w:rPr>
+        <w:t xml:space="preserve">chaos</w:t>
+      </w:r>
+      <w:r>
+        <w:t xml:space="preserve"> `[2,3]`; </w:t>
+      </w:r>
+      <w:r>
+        <w:rPr>
+          <w:b/>
+          <w:bCs/>
+        </w:rPr>
+        <w:t xml:space="preserve">recover</w:t>
+      </w:r>
+      <w:r>
+        <w:t xml:space="preserve"> `[0,1]`.</w:t>
+      </w:r>
+    </w:p>
+    <w:p>
+      <w:pPr>
+        <w:spacing w:after="160"/>
+      </w:pPr>
+      <w:r>
+        <w:rPr>
+          <w:b/>
+          <w:bCs/>
+        </w:rPr>
+        <w:t xml:space="preserve">`LiquidHarmonyPlan`</w:t>
+      </w:r>
+      <w:r>
+        <w:t xml:space="preserve"> — `{ melodyPitchClass, voicingPitchClasses, tensionResolvesOnBeat, chordTypeId }`.</w:t>
+      </w:r>
+    </w:p>
+    <w:p>
+      <w:pPr>
+        <w:spacing w:after="160"/>
+      </w:pPr>
+      <w:r>
+        <w:rPr>
+          <w:b/>
+          <w:bCs/>
+        </w:rPr>
+        <w:t xml:space="preserve">`planLiquidHarmony(chordTypeId, rootPc, state)`</w:t>
+      </w:r>
+      <w:r>
+        <w:t xml:space="preserve"> — pulls the </w:t>
+      </w:r>
+      <w:r>
+        <w:rPr>
+          <w:b/>
+          <w:bCs/>
+        </w:rPr>
+        <w:t xml:space="preserve">quadratonic</w:t>
+      </w:r>
+      <w:r>
+        <w:t xml:space="preserve"> set from </w:t>
+      </w:r>
+      <w:r>
+        <w:rPr>
+          <w:b/>
+          <w:bCs/>
+        </w:rPr>
+        <w:t xml:space="preserve">`selectQuadratonicMelodySpec`</w:t>
+      </w:r>
+      <w:r>
+        <w:t xml:space="preserve">. </w:t>
+      </w:r>
+      <w:r>
+        <w:rPr>
+          <w:b/>
+          <w:bCs/>
+        </w:rPr>
+        <w:t xml:space="preserve">Melody</w:t>
+      </w:r>
+      <w:r>
+        <w:t xml:space="preserve"> pitch class: prefers </w:t>
+      </w:r>
+      <w:r>
+        <w:rPr>
+          <w:b/>
+          <w:bCs/>
+        </w:rPr>
+        <w:t xml:space="preserve">primary tension</w:t>
+      </w:r>
+      <w:r>
+        <w:t xml:space="preserve"> when </w:t>
+      </w:r>
+      <w:r>
+        <w:rPr>
+          <w:b/>
+          <w:bCs/>
+        </w:rPr>
+        <w:t xml:space="preserve">`state`</w:t>
+      </w:r>
+      <w:r>
+        <w:t xml:space="preserve"> is </w:t>
+      </w:r>
+      <w:r>
+        <w:rPr>
+          <w:b/>
+          <w:bCs/>
+        </w:rPr>
+        <w:t xml:space="preserve">`tension`</w:t>
+      </w:r>
+      <w:r>
+        <w:t xml:space="preserve"> or </w:t>
+      </w:r>
+      <w:r>
+        <w:rPr>
+          <w:b/>
+          <w:bCs/>
+        </w:rPr>
+        <w:t xml:space="preserve">`chaos`</w:t>
+      </w:r>
+      <w:r>
+        <w:t xml:space="preserve">; prefers </w:t>
+      </w:r>
+      <w:r>
+        <w:rPr>
+          <w:b/>
+          <w:bCs/>
+        </w:rPr>
+        <w:t xml:space="preserve">melodic triad</w:t>
+      </w:r>
+      <w:r>
+        <w:t xml:space="preserve"> tones when </w:t>
+      </w:r>
+      <w:r>
+        <w:rPr>
+          <w:b/>
+          <w:bCs/>
+        </w:rPr>
+        <w:t xml:space="preserve">`resolve`</w:t>
+      </w:r>
+      <w:r>
+        <w:t xml:space="preserve"> or </w:t>
+      </w:r>
+      <w:r>
+        <w:rPr>
+          <w:b/>
+          <w:bCs/>
+        </w:rPr>
+        <w:t xml:space="preserve">`recover`</w:t>
+      </w:r>
+      <w:r>
+        <w:t xml:space="preserve">; </w:t>
+      </w:r>
+      <w:r>
+        <w:rPr>
+          <w:b/>
+          <w:bCs/>
+        </w:rPr>
+        <w:t xml:space="preserve">`primary`</w:t>
+      </w:r>
+      <w:r>
+        <w:t xml:space="preserve"> uses a default triad slot. Remaining quadratonic PCs go to </w:t>
+      </w:r>
+      <w:r>
+        <w:rPr>
+          <w:b/>
+          <w:bCs/>
+        </w:rPr>
+        <w:t xml:space="preserve">`voicingPitchClasses`</w:t>
+      </w:r>
+      <w:r>
+        <w:t xml:space="preserve">. </w:t>
+      </w:r>
+      <w:r>
+        <w:rPr>
+          <w:b/>
+          <w:bCs/>
+        </w:rPr>
+        <w:t xml:space="preserve">`tensionResolvesOnBeat`</w:t>
+      </w:r>
+      <w:r>
+        <w:t xml:space="preserve">: </w:t>
+      </w:r>
+      <w:r>
+        <w:rPr>
+          <w:b/>
+          <w:bCs/>
+        </w:rPr>
+        <w:t xml:space="preserve">`0.5`</w:t>
+      </w:r>
+      <w:r>
+        <w:t xml:space="preserve"> when the melody is the primary tension (resolution scheduled on the </w:t>
+      </w:r>
+      <w:r>
+        <w:rPr>
+          <w:b/>
+          <w:bCs/>
+        </w:rPr>
+        <w:t xml:space="preserve">next subdivision</w:t>
+      </w:r>
+      <w:r>
+        <w:t xml:space="preserve"> in quarter-based 4/4), else </w:t>
+      </w:r>
+      <w:r>
+        <w:rPr>
+          <w:b/>
+          <w:bCs/>
+        </w:rPr>
+        <w:t xml:space="preserve">`0`</w:t>
+      </w:r>
+      <w:r>
+        <w:t xml:space="preserve">. Use </w:t>
+      </w:r>
+      <w:r>
+        <w:rPr>
+          <w:b/>
+          <w:bCs/>
+        </w:rPr>
+        <w:t xml:space="preserve">`nearestResolvePitchClassToTriad`</w:t>
+      </w:r>
+      <w:r>
+        <w:t xml:space="preserve"> (exported from </w:t>
+      </w:r>
+      <w:r>
+        <w:rPr>
+          <w:b/>
+          <w:bCs/>
+        </w:rPr>
+        <w:t xml:space="preserve">`liquidHarmonyPlanner.ts`</w:t>
+      </w:r>
+      <w:r>
+        <w:t xml:space="preserve">) for the </w:t>
+      </w:r>
+      <w:r>
+        <w:rPr>
+          <w:b/>
+          <w:bCs/>
+        </w:rPr>
+        <w:t xml:space="preserve">nearest triad</w:t>
+      </w:r>
+      <w:r>
+        <w:t xml:space="preserve"> resolution target PC.</w:t>
+      </w:r>
+    </w:p>
+    <w:p>
+      <w:pPr>
+        <w:pStyle w:val="Heading2"/>
+        <w:spacing w:after="100" w:before="160"/>
+      </w:pPr>
+      <w:r>
         <w:t xml:space="preserve">Build C — Guitar riff engine (**complete**)</w:t>
       </w:r>
     </w:p>
@@ -27326,7 +28084,7 @@
           <w:b/>
           <w:bCs/>
         </w:rPr>
-        <w:t xml:space="preserve">Build C — Guitar riff engine:</w:t>
+        <w:t xml:space="preserve">Build B — Layer state machine + liquid harmony:</w:t>
       </w:r>
       <w:r>
         <w:t xml:space="preserve"> </w:t>
@@ -27346,7 +28104,7 @@
           <w:b/>
           <w:bCs/>
         </w:rPr>
-        <w:t xml:space="preserve">Build C</w:t>
+        <w:t xml:space="preserve">Build B</w:t>
       </w:r>
       <w:r>
         <w:t xml:space="preserve"> subsection above).</w:t>
@@ -27365,7 +28123,7 @@
           <w:b/>
           <w:bCs/>
         </w:rPr>
-        <w:t xml:space="preserve">Build B — Layer state machine + liquid harmony:</w:t>
+        <w:t xml:space="preserve">Build C — Guitar riff engine:</w:t>
       </w:r>
       <w:r>
         <w:t xml:space="preserve"> </w:t>
@@ -27375,30 +28133,20 @@
           <w:b/>
           <w:bCs/>
         </w:rPr>
-        <w:t xml:space="preserve">`LayerStateMachine`</w:t>
-      </w:r>
-      <w:r>
-        <w:t xml:space="preserve"> (Resolve → Primary → Tension → Chaos → Recover) driving </w:t>
-      </w:r>
-      <w:r>
-        <w:rPr>
-          <w:b/>
-          <w:bCs/>
-        </w:rPr>
-        <w:t xml:space="preserve">`LiquidHarmonyPlanner`</w:t>
-      </w:r>
-      <w:r>
-        <w:t xml:space="preserve">. Phrase-level intention from the state machine; </w:t>
-      </w:r>
-      <w:r>
-        <w:rPr>
-          <w:b/>
-          <w:bCs/>
-        </w:rPr>
-        <w:t xml:space="preserve">liquid harmony</w:t>
-      </w:r>
-      <w:r>
-        <w:t xml:space="preserve"> shapes internal voicing motion per subdivision.</w:t>
+        <w:t xml:space="preserve">Complete</w:t>
+      </w:r>
+      <w:r>
+        <w:t xml:space="preserve"> (see </w:t>
+      </w:r>
+      <w:r>
+        <w:rPr>
+          <w:b/>
+          <w:bCs/>
+        </w:rPr>
+        <w:t xml:space="preserve">Build C</w:t>
+      </w:r>
+      <w:r>
+        <w:t xml:space="preserve"> subsection above).</w:t>
       </w:r>
     </w:p>
     <w:p>
@@ -27988,7 +28736,7 @@
           <w:b/>
           <w:bCs/>
         </w:rPr>
-        <w:t xml:space="preserve">Build IMG — iReal image import:</w:t>
+        <w:t xml:space="preserve">Build IMG — iReal Pro import + optional vision:</w:t>
       </w:r>
       <w:r>
         <w:t xml:space="preserve"> See </w:t>
@@ -27998,10 +28746,10 @@
           <w:b/>
           <w:bCs/>
         </w:rPr>
-        <w:t xml:space="preserve">iReal Image Import</w:t>
-      </w:r>
-      <w:r>
-        <w:t xml:space="preserve"> below (vision + vault pipeline).</w:t>
+        <w:t xml:space="preserve">Build IMG — iReal Pro import</w:t>
+      </w:r>
+      <w:r>
+        <w:t xml:space="preserve"> below (data pipeline + optional screenshot path).</w:t>
       </w:r>
     </w:p>
     <w:p>
@@ -28010,7 +28758,7 @@
         <w:spacing w:after="100" w:before="160"/>
       </w:pPr>
       <w:r>
-        <w:t xml:space="preserve">iReal Image Import — planned feature</w:t>
+        <w:t xml:space="preserve">Build IMG — iReal Pro import (planned)</w:t>
       </w:r>
     </w:p>
     <w:p>
@@ -28025,14 +28773,273 @@
         <w:t xml:space="preserve">Not shipped.</w:t>
       </w:r>
       <w:r>
-        <w:t xml:space="preserve"> Target flow: user uploads a </w:t>
-      </w:r>
-      <w:r>
-        <w:rPr>
-          <w:b/>
-          <w:bCs/>
-        </w:rPr>
-        <w:t xml:space="preserve">JPEG</w:t>
+        <w:t xml:space="preserve"> Primary path is </w:t>
+      </w:r>
+      <w:r>
+        <w:rPr>
+          <w:b/>
+          <w:bCs/>
+        </w:rPr>
+        <w:t xml:space="preserve">structured data</w:t>
+      </w:r>
+      <w:r>
+        <w:t xml:space="preserve">, not raw </w:t>
+      </w:r>
+      <w:r>
+        <w:rPr>
+          <w:b/>
+          <w:bCs/>
+        </w:rPr>
+        <w:t xml:space="preserve">`.irealb` binary</w:t>
+      </w:r>
+      <w:r>
+        <w:t xml:space="preserve">.</w:t>
+      </w:r>
+    </w:p>
+    <w:p>
+      <w:pPr>
+        <w:spacing w:after="160"/>
+      </w:pPr>
+      <w:r>
+        <w:rPr>
+          <w:b/>
+          <w:bCs/>
+        </w:rPr>
+        <w:t xml:space="preserve">Recommended JS libraries (wrap in TypeScript adapters):</w:t>
+      </w:r>
+    </w:p>
+    <w:tbl>
+      <w:tblPr>
+        <w:tblW w:type="pct" w:w="100%"/>
+        <w:tblBorders>
+          <w:top w:val="single" w:color="auto" w:sz="4"/>
+          <w:left w:val="single" w:color="auto" w:sz="4"/>
+          <w:bottom w:val="single" w:color="auto" w:sz="4"/>
+          <w:right w:val="single" w:color="auto" w:sz="4"/>
+          <w:insideH w:val="single" w:color="auto" w:sz="4"/>
+          <w:insideV w:val="single" w:color="auto" w:sz="4"/>
+        </w:tblBorders>
+      </w:tblPr>
+      <w:tblGrid>
+        <w:gridCol w:w="3000"/>
+        <w:gridCol w:w="3000"/>
+        <w:gridCol w:w="3000"/>
+      </w:tblGrid>
+      <w:tr>
+        <w:tc>
+          <w:tcPr>
+            <w:tcW w:type="pct" w:w="3000%"/>
+          </w:tcPr>
+          <w:p>
+            <w:pPr>
+              <w:spacing w:after="60"/>
+            </w:pPr>
+            <w:r>
+              <w:t xml:space="preserve">Role</w:t>
+            </w:r>
+          </w:p>
+        </w:tc>
+        <w:tc>
+          <w:tcPr>
+            <w:tcW w:type="pct" w:w="3000%"/>
+          </w:tcPr>
+          <w:p>
+            <w:pPr>
+              <w:spacing w:after="60"/>
+            </w:pPr>
+            <w:r>
+              <w:t xml:space="preserve">Library</w:t>
+            </w:r>
+          </w:p>
+        </w:tc>
+        <w:tc>
+          <w:tcPr>
+            <w:tcW w:type="pct" w:w="3000%"/>
+          </w:tcPr>
+          <w:p>
+            <w:pPr>
+              <w:spacing w:after="60"/>
+            </w:pPr>
+            <w:r>
+              <w:t xml:space="preserve">Notes</w:t>
+            </w:r>
+          </w:p>
+        </w:tc>
+      </w:tr>
+      <w:tr>
+        <w:tc>
+          <w:tcPr>
+            <w:tcW w:type="pct" w:w="3000%"/>
+          </w:tcPr>
+          <w:p>
+            <w:pPr>
+              <w:spacing w:after="60"/>
+            </w:pPr>
+            <w:r>
+              <w:rPr>
+                <w:b/>
+                <w:bCs/>
+              </w:rPr>
+              <w:t xml:space="preserve">Primary parser</w:t>
+            </w:r>
+          </w:p>
+        </w:tc>
+        <w:tc>
+          <w:tcPr>
+            <w:tcW w:type="pct" w:w="3000%"/>
+          </w:tcPr>
+          <w:p>
+            <w:pPr>
+              <w:spacing w:after="60"/>
+            </w:pPr>
+            <w:r>
+              <w:rPr>
+                <w:b/>
+                <w:bCs/>
+              </w:rPr>
+              <w:t xml:space="preserve">[pianosnake/ireal-reader](https://github.com/pianosnake/ireal-reader)</w:t>
+            </w:r>
+          </w:p>
+        </w:tc>
+        <w:tc>
+          <w:tcPr>
+            <w:tcW w:type="pct" w:w="3000%"/>
+          </w:tcPr>
+          <w:p>
+            <w:pPr>
+              <w:spacing w:after="60"/>
+            </w:pPr>
+            <w:r>
+              <w:t xml:space="preserve">Expanded measures, </w:t>
+            </w:r>
+            <w:r>
+              <w:rPr>
+                <w:b/>
+                <w:bCs/>
+              </w:rPr>
+              <w:t xml:space="preserve">repeats</w:t>
+            </w:r>
+            <w:r>
+              <w:t xml:space="preserve">, </w:t>
+            </w:r>
+            <w:r>
+              <w:rPr>
+                <w:b/>
+                <w:bCs/>
+              </w:rPr>
+              <w:t xml:space="preserve">codas</w:t>
+            </w:r>
+            <w:r>
+              <w:t xml:space="preserve">, </w:t>
+            </w:r>
+            <w:r>
+              <w:rPr>
+                <w:b/>
+                <w:bCs/>
+              </w:rPr>
+              <w:t xml:space="preserve">segnos</w:t>
+            </w:r>
+            <w:r>
+              <w:t xml:space="preserve"> — good match for roadmaps that need visit-expanded charts.</w:t>
+            </w:r>
+          </w:p>
+        </w:tc>
+      </w:tr>
+      <w:tr>
+        <w:tc>
+          <w:tcPr>
+            <w:tcW w:type="pct" w:w="3000%"/>
+          </w:tcPr>
+          <w:p>
+            <w:pPr>
+              <w:spacing w:after="60"/>
+            </w:pPr>
+            <w:r>
+              <w:rPr>
+                <w:b/>
+                <w:bCs/>
+              </w:rPr>
+              <w:t xml:space="preserve">Secondary / cross-check</w:t>
+            </w:r>
+          </w:p>
+        </w:tc>
+        <w:tc>
+          <w:tcPr>
+            <w:tcW w:type="pct" w:w="3000%"/>
+          </w:tcPr>
+          <w:p>
+            <w:pPr>
+              <w:spacing w:after="60"/>
+            </w:pPr>
+            <w:r>
+              <w:rPr>
+                <w:b/>
+                <w:bCs/>
+              </w:rPr>
+              <w:t xml:space="preserve">[daumling/ireal-renderer](https://github.com/daumling/ireal-renderer)</w:t>
+            </w:r>
+          </w:p>
+        </w:tc>
+        <w:tc>
+          <w:tcPr>
+            <w:tcW w:type="pct" w:w="3000%"/>
+          </w:tcPr>
+          <w:p>
+            <w:pPr>
+              <w:spacing w:after="60"/>
+            </w:pPr>
+            <w:r>
+              <w:t xml:space="preserve">Preserves </w:t>
+            </w:r>
+            <w:r>
+              <w:rPr>
+                <w:b/>
+                <w:bCs/>
+              </w:rPr>
+              <w:t xml:space="preserve">section markers</w:t>
+            </w:r>
+            <w:r>
+              <w:t xml:space="preserve"> and </w:t>
+            </w:r>
+            <w:r>
+              <w:rPr>
+                <w:b/>
+                <w:bCs/>
+              </w:rPr>
+              <w:t xml:space="preserve">form structure</w:t>
+            </w:r>
+            <w:r>
+              <w:t xml:space="preserve"> — useful for pedagogy and arrangement lanes.</w:t>
+            </w:r>
+          </w:p>
+        </w:tc>
+      </w:tr>
+    </w:tbl>
+    <w:p>
+      <w:pPr>
+        <w:spacing w:after="160"/>
+      </w:pPr>
+    </w:p>
+    <w:p>
+      <w:pPr>
+        <w:spacing w:after="160"/>
+      </w:pPr>
+      <w:r>
+        <w:rPr>
+          <w:b/>
+          <w:bCs/>
+        </w:rPr>
+        <w:t xml:space="preserve">Input contract:</w:t>
+      </w:r>
+      <w:r>
+        <w:t xml:space="preserve"> </w:t>
+      </w:r>
+      <w:r>
+        <w:rPr>
+          <w:b/>
+          <w:bCs/>
+        </w:rPr>
+        <w:t xml:space="preserve">iReal Pro HTML export</w:t>
       </w:r>
       <w:r>
         <w:t xml:space="preserve"> or </w:t>
@@ -28042,20 +29049,235 @@
           <w:b/>
           <w:bCs/>
         </w:rPr>
-        <w:t xml:space="preserve">screenshot</w:t>
-      </w:r>
-      <w:r>
-        <w:t xml:space="preserve"> of an </w:t>
-      </w:r>
-      <w:r>
-        <w:rPr>
-          <w:b/>
-          <w:bCs/>
-        </w:rPr>
-        <w:t xml:space="preserve">iReal Pro</w:t>
-      </w:r>
-      <w:r>
-        <w:t xml:space="preserve"> (or similar) lead sheet; </w:t>
+        <w:t xml:space="preserve">`ireal://` URL</w:t>
+      </w:r>
+      <w:r>
+        <w:t xml:space="preserve"> — </w:t>
+      </w:r>
+      <w:r>
+        <w:rPr>
+          <w:b/>
+          <w:bCs/>
+        </w:rPr>
+        <w:t xml:space="preserve">not</w:t>
+      </w:r>
+      <w:r>
+        <w:t xml:space="preserve"> the opaque </w:t>
+      </w:r>
+      <w:r>
+        <w:rPr>
+          <w:b/>
+          <w:bCs/>
+        </w:rPr>
+        <w:t xml:space="preserve">`.irealb`</w:t>
+      </w:r>
+      <w:r>
+        <w:t xml:space="preserve"> file alone (binary format is not the ingestion surface for this roadmap).</w:t>
+      </w:r>
+    </w:p>
+    <w:p>
+      <w:pPr>
+        <w:spacing w:after="160"/>
+      </w:pPr>
+      <w:r>
+        <w:rPr>
+          <w:b/>
+          <w:bCs/>
+        </w:rPr>
+        <w:t xml:space="preserve">Target schema:</w:t>
+      </w:r>
+      <w:r>
+        <w:t xml:space="preserve"> normalise both parsers toward a shared </w:t>
+      </w:r>
+      <w:r>
+        <w:rPr>
+          <w:b/>
+          <w:bCs/>
+        </w:rPr>
+        <w:t xml:space="preserve">`ParsedChart`</w:t>
+      </w:r>
+      <w:r>
+        <w:t xml:space="preserve"> contract (</w:t>
+      </w:r>
+      <w:r>
+        <w:rPr>
+          <w:b/>
+          <w:bCs/>
+        </w:rPr>
+        <w:t xml:space="preserve">title</w:t>
+      </w:r>
+      <w:r>
+        <w:t xml:space="preserve">, </w:t>
+      </w:r>
+      <w:r>
+        <w:rPr>
+          <w:b/>
+          <w:bCs/>
+        </w:rPr>
+        <w:t xml:space="preserve">key</w:t>
+      </w:r>
+      <w:r>
+        <w:t xml:space="preserve">, </w:t>
+      </w:r>
+      <w:r>
+        <w:rPr>
+          <w:b/>
+          <w:bCs/>
+        </w:rPr>
+        <w:t xml:space="preserve">timeSignature</w:t>
+      </w:r>
+      <w:r>
+        <w:t xml:space="preserve">, </w:t>
+      </w:r>
+      <w:r>
+        <w:rPr>
+          <w:b/>
+          <w:bCs/>
+        </w:rPr>
+        <w:t xml:space="preserve">tempo</w:t>
+      </w:r>
+      <w:r>
+        <w:t xml:space="preserve">, </w:t>
+      </w:r>
+      <w:r>
+        <w:rPr>
+          <w:b/>
+          <w:bCs/>
+        </w:rPr>
+        <w:t xml:space="preserve">sections</w:t>
+      </w:r>
+      <w:r>
+        <w:t xml:space="preserve">, </w:t>
+      </w:r>
+      <w:r>
+        <w:rPr>
+          <w:b/>
+          <w:bCs/>
+        </w:rPr>
+        <w:t xml:space="preserve">measures</w:t>
+      </w:r>
+      <w:r>
+        <w:t xml:space="preserve">, </w:t>
+      </w:r>
+      <w:r>
+        <w:rPr>
+          <w:b/>
+          <w:bCs/>
+        </w:rPr>
+        <w:t xml:space="preserve">repeats</w:t>
+      </w:r>
+      <w:r>
+        <w:t xml:space="preserve">, </w:t>
+      </w:r>
+      <w:r>
+        <w:rPr>
+          <w:b/>
+          <w:bCs/>
+        </w:rPr>
+        <w:t xml:space="preserve">jumps</w:t>
+      </w:r>
+      <w:r>
+        <w:t xml:space="preserve">). Both libraries are </w:t>
+      </w:r>
+      <w:r>
+        <w:rPr>
+          <w:b/>
+          <w:bCs/>
+        </w:rPr>
+        <w:t xml:space="preserve">JavaScript</w:t>
+      </w:r>
+      <w:r>
+        <w:t xml:space="preserve"> — ship thin </w:t>
+      </w:r>
+      <w:r>
+        <w:rPr>
+          <w:b/>
+          <w:bCs/>
+        </w:rPr>
+        <w:t xml:space="preserve">TypeScript</w:t>
+      </w:r>
+      <w:r>
+        <w:t xml:space="preserve"> facades + typed </w:t>
+      </w:r>
+      <w:r>
+        <w:rPr>
+          <w:b/>
+          <w:bCs/>
+        </w:rPr>
+        <w:t xml:space="preserve">`ParsedChart`</w:t>
+      </w:r>
+      <w:r>
+        <w:t xml:space="preserve"> in-repo.</w:t>
+      </w:r>
+    </w:p>
+    <w:p>
+      <w:pPr>
+        <w:spacing w:after="160"/>
+      </w:pPr>
+      <w:r>
+        <w:rPr>
+          <w:b/>
+          <w:bCs/>
+        </w:rPr>
+        <w:t xml:space="preserve">Downstream:</w:t>
+      </w:r>
+      <w:r>
+        <w:t xml:space="preserve"> map chord symbols to </w:t>
+      </w:r>
+      <w:r>
+        <w:rPr>
+          <w:b/>
+          <w:bCs/>
+        </w:rPr>
+        <w:t xml:space="preserve">`tonalityVaultDatabase`</w:t>
+      </w:r>
+      <w:r>
+        <w:t xml:space="preserve"> chord types, then </w:t>
+      </w:r>
+      <w:r>
+        <w:rPr>
+          <w:b/>
+          <w:bCs/>
+        </w:rPr>
+        <w:t xml:space="preserve">`generateVaultRiff`</w:t>
+      </w:r>
+      <w:r>
+        <w:t xml:space="preserve"> (and quadratonic planners) </w:t>
+      </w:r>
+      <w:r>
+        <w:rPr>
+          <w:b/>
+          <w:bCs/>
+        </w:rPr>
+        <w:t xml:space="preserve">per chord / bar</w:t>
+      </w:r>
+      <w:r>
+        <w:t xml:space="preserve"> for guitar lines.</w:t>
+      </w:r>
+    </w:p>
+    <w:p>
+      <w:pPr>
+        <w:spacing w:after="160"/>
+      </w:pPr>
+      <w:r>
+        <w:rPr>
+          <w:b/>
+          <w:bCs/>
+        </w:rPr>
+        <w:t xml:space="preserve">Optional later:</w:t>
+      </w:r>
+      <w:r>
+        <w:t xml:space="preserve"> </w:t>
+      </w:r>
+      <w:r>
+        <w:rPr>
+          <w:b/>
+          <w:bCs/>
+        </w:rPr>
+        <w:t xml:space="preserve">JPEG / screenshot</w:t>
+      </w:r>
+      <w:r>
+        <w:t xml:space="preserve"> of an iReal-style chart via </w:t>
       </w:r>
       <w:r>
         <w:rPr>
@@ -28065,67 +29287,27 @@
         <w:t xml:space="preserve">Claude vision API</w:t>
       </w:r>
       <w:r>
-        <w:t xml:space="preserve"> (or equivalent vision model) reads </w:t>
-      </w:r>
-      <w:r>
-        <w:rPr>
-          <w:b/>
-          <w:bCs/>
-        </w:rPr>
-        <w:t xml:space="preserve">chord symbols</w:t>
-      </w:r>
-      <w:r>
-        <w:t xml:space="preserve"> and </w:t>
-      </w:r>
-      <w:r>
-        <w:rPr>
-          <w:b/>
-          <w:bCs/>
-        </w:rPr>
-        <w:t xml:space="preserve">bar structure</w:t>
-      </w:r>
-      <w:r>
-        <w:t xml:space="preserve">; normalised symbols map to </w:t>
-      </w:r>
-      <w:r>
-        <w:rPr>
-          <w:b/>
-          <w:bCs/>
-        </w:rPr>
-        <w:t xml:space="preserve">Tonality Vault</w:t>
-      </w:r>
-      <w:r>
-        <w:t xml:space="preserve"> rows via </w:t>
-      </w:r>
-      <w:r>
-        <w:rPr>
-          <w:b/>
-          <w:bCs/>
-        </w:rPr>
-        <w:t xml:space="preserve">`tonalityVaultDatabase`</w:t>
-      </w:r>
-      <w:r>
-        <w:t xml:space="preserve">; for each bar / chord, the engine generates </w:t>
-      </w:r>
-      <w:r>
-        <w:rPr>
-          <w:b/>
-          <w:bCs/>
-        </w:rPr>
-        <w:t xml:space="preserve">quadratonic</w:t>
-      </w:r>
-      <w:r>
-        <w:t xml:space="preserve"> melodic lines and </w:t>
-      </w:r>
-      <w:r>
-        <w:rPr>
-          <w:b/>
-          <w:bCs/>
-        </w:rPr>
-        <w:t xml:space="preserve">bebop-style</w:t>
-      </w:r>
-      <w:r>
-        <w:t xml:space="preserve"> riffs using </w:t>
+        <w:t xml:space="preserve"> for users without HTML export — same </w:t>
+      </w:r>
+      <w:r>
+        <w:rPr>
+          <w:b/>
+          <w:bCs/>
+        </w:rPr>
+        <w:t xml:space="preserve">`ParsedChart`</w:t>
+      </w:r>
+      <w:r>
+        <w:t xml:space="preserve"> target after OCR normalisation. </w:t>
+      </w:r>
+      <w:r>
+        <w:rPr>
+          <w:b/>
+          <w:bCs/>
+        </w:rPr>
+        <w:t xml:space="preserve">Dependencies:</w:t>
+      </w:r>
+      <w:r>
+        <w:t xml:space="preserve"> </w:t>
       </w:r>
       <w:r>
         <w:rPr>
@@ -28135,57 +29317,7 @@
         <w:t xml:space="preserve">Build C</w:t>
       </w:r>
       <w:r>
-        <w:t xml:space="preserve">; output is </w:t>
-      </w:r>
-      <w:r>
-        <w:rPr>
-          <w:b/>
-          <w:bCs/>
-        </w:rPr>
-        <w:t xml:space="preserve">MusicXML</w:t>
-      </w:r>
-      <w:r>
-        <w:t xml:space="preserve"> for </w:t>
-      </w:r>
-      <w:r>
-        <w:rPr>
-          <w:b/>
-          <w:bCs/>
-        </w:rPr>
-        <w:t xml:space="preserve">Guitar Pro 8</w:t>
-      </w:r>
-      <w:r>
-        <w:t xml:space="preserve"> and </w:t>
-      </w:r>
-      <w:r>
-        <w:rPr>
-          <w:b/>
-          <w:bCs/>
-        </w:rPr>
-        <w:t xml:space="preserve">Sibelius</w:t>
-      </w:r>
-      <w:r>
-        <w:t xml:space="preserve"> (notation + tab when the tab/staff path is enabled). </w:t>
-      </w:r>
-      <w:r>
-        <w:rPr>
-          <w:b/>
-          <w:bCs/>
-        </w:rPr>
-        <w:t xml:space="preserve">Dependencies:</w:t>
-      </w:r>
-      <w:r>
-        <w:t xml:space="preserve"> </w:t>
-      </w:r>
-      <w:r>
-        <w:rPr>
-          <w:b/>
-          <w:bCs/>
-        </w:rPr>
-        <w:t xml:space="preserve">Build C</w:t>
-      </w:r>
-      <w:r>
-        <w:t xml:space="preserve"> (grip + riff), </w:t>
+        <w:t xml:space="preserve"> (riffs), </w:t>
       </w:r>
       <w:r>
         <w:rPr>
@@ -28195,17 +29327,17 @@
         <w:t xml:space="preserve">Build D</w:t>
       </w:r>
       <w:r>
-        <w:t xml:space="preserve"> (optional reharm pass), and a dedicated </w:t>
-      </w:r>
-      <w:r>
-        <w:rPr>
-          <w:b/>
-          <w:bCs/>
-        </w:rPr>
-        <w:t xml:space="preserve">image input + OCR review</w:t>
-      </w:r>
-      <w:r>
-        <w:t xml:space="preserve"> layer.</w:t>
+        <w:t xml:space="preserve"> (optional reharm), </w:t>
+      </w:r>
+      <w:r>
+        <w:rPr>
+          <w:b/>
+          <w:bCs/>
+        </w:rPr>
+        <w:t xml:space="preserve">`ParsedChart`</w:t>
+      </w:r>
+      <w:r>
+        <w:t xml:space="preserve"> adapter layer.</w:t>
       </w:r>
     </w:p>
     <w:p>
@@ -28659,7 +29791,7 @@
           <w:b/>
           <w:bCs/>
         </w:rPr>
-        <w:t xml:space="preserve">iReal image upload</w:t>
+        <w:t xml:space="preserve">iReal Pro import UI</w:t>
       </w:r>
       <w:r>
         <w:t xml:space="preserve"> (</w:t>
@@ -28672,7 +29804,7 @@
         <w:t xml:space="preserve">Build IMG</w:t>
       </w:r>
       <w:r>
-        <w:t xml:space="preserve">).</w:t>
+        <w:t xml:space="preserve"> — HTML / `ireal://`, optional screenshot OCR).</w:t>
       </w:r>
     </w:p>
     <w:p>
@@ -28696,6 +29828,91 @@
         <w:t xml:space="preserve">A</w:t>
       </w:r>
       <w:r>
+        <w:t xml:space="preserve">, </w:t>
+      </w:r>
+      <w:r>
+        <w:rPr>
+          <w:b/>
+          <w:bCs/>
+        </w:rPr>
+        <w:t xml:space="preserve">B</w:t>
+      </w:r>
+      <w:r>
+        <w:t xml:space="preserve">, and </w:t>
+      </w:r>
+      <w:r>
+        <w:rPr>
+          <w:b/>
+          <w:bCs/>
+        </w:rPr>
+        <w:t xml:space="preserve">C</w:t>
+      </w:r>
+      <w:r>
+        <w:t xml:space="preserve"> are </w:t>
+      </w:r>
+      <w:r>
+        <w:rPr>
+          <w:b/>
+          <w:bCs/>
+        </w:rPr>
+        <w:t xml:space="preserve">complete</w:t>
+      </w:r>
+      <w:r>
+        <w:t xml:space="preserve">. </w:t>
+      </w:r>
+      <w:r>
+        <w:rPr>
+          <w:b/>
+          <w:bCs/>
+        </w:rPr>
+        <w:t xml:space="preserve">Next:</w:t>
+      </w:r>
+      <w:r>
+        <w:t xml:space="preserve"> </w:t>
+      </w:r>
+      <w:r>
+        <w:rPr>
+          <w:b/>
+          <w:bCs/>
+        </w:rPr>
+        <w:t xml:space="preserve">Build D</w:t>
+      </w:r>
+      <w:r>
+        <w:t xml:space="preserve"> (reharmonisation). Planned sequencing for </w:t>
+      </w:r>
+      <w:r>
+        <w:rPr>
+          <w:b/>
+          <w:bCs/>
+        </w:rPr>
+        <w:t xml:space="preserve">remaining</w:t>
+      </w:r>
+      <w:r>
+        <w:t xml:space="preserve"> work:</w:t>
+      </w:r>
+    </w:p>
+    <w:p>
+      <w:pPr>
+        <w:spacing w:after="160"/>
+      </w:pPr>
+      <w:r>
+        <w:rPr>
+          <w:b/>
+          <w:bCs/>
+        </w:rPr>
+        <w:t xml:space="preserve">D → E+F → G → C2 → UI → IMG</w:t>
+      </w:r>
+      <w:r>
+        <w:t xml:space="preserve"> (</w:t>
+      </w:r>
+      <w:r>
+        <w:rPr>
+          <w:b/>
+          <w:bCs/>
+        </w:rPr>
+        <w:t xml:space="preserve">E</w:t>
+      </w:r>
+      <w:r>
         <w:t xml:space="preserve"> and </w:t>
       </w:r>
       <w:r>
@@ -28703,42 +29920,10 @@
           <w:b/>
           <w:bCs/>
         </w:rPr>
-        <w:t xml:space="preserve">C</w:t>
-      </w:r>
-      <w:r>
-        <w:t xml:space="preserve"> are </w:t>
-      </w:r>
-      <w:r>
-        <w:rPr>
-          <w:b/>
-          <w:bCs/>
-        </w:rPr>
-        <w:t xml:space="preserve">complete</w:t>
-      </w:r>
-      <w:r>
-        <w:t xml:space="preserve">. Planned sequencing for </w:t>
-      </w:r>
-      <w:r>
-        <w:rPr>
-          <w:b/>
-          <w:bCs/>
-        </w:rPr>
-        <w:t xml:space="preserve">remaining</w:t>
-      </w:r>
-      <w:r>
-        <w:t xml:space="preserve"> builds:</w:t>
-      </w:r>
-    </w:p>
-    <w:p>
-      <w:pPr>
-        <w:spacing w:after="160"/>
-      </w:pPr>
-      <w:r>
-        <w:rPr>
-          <w:b/>
-          <w:bCs/>
-        </w:rPr>
-        <w:t xml:space="preserve">B → D → E → F → G → C2 → UI → IMG</w:t>
+        <w:t xml:space="preserve">F</w:t>
+      </w:r>
+      <w:r>
+        <w:t xml:space="preserve"> may ship as one milestone depending on routing vs motif scope.)</w:t>
       </w:r>
     </w:p>
     <w:p>

</xml_diff>

<commit_message>
docs: Revolutionary Reharmonisation Engine chapter, Build D marked complete, roadmap updated
Co-authored-by: Cursor <cursoragent@cursor.com>
</commit_message>
<xml_diff>
--- a/docs/COMPOSER_OS_PLAYBOOK.docx
+++ b/docs/COMPOSER_OS_PLAYBOOK.docx
@@ -28172,80 +28172,70 @@
           <w:b/>
           <w:bCs/>
         </w:rPr>
-        <w:t xml:space="preserve">`ReharmCandidateEngine`</w:t>
-      </w:r>
-      <w:r>
-        <w:t xml:space="preserve">. </w:t>
-      </w:r>
-      <w:r>
-        <w:rPr>
-          <w:b/>
-          <w:bCs/>
-        </w:rPr>
-        <w:t xml:space="preserve">Emotional drift</w:t>
-      </w:r>
-      <w:r>
-        <w:t xml:space="preserve"> control (slider / profile) to bias reharm toward darker, brighter, or more suspended language; output stays </w:t>
-      </w:r>
-      <w:r>
-        <w:rPr>
-          <w:b/>
-          <w:bCs/>
-        </w:rPr>
-        <w:t xml:space="preserve">guitar-friendly</w:t>
-      </w:r>
-      <w:r>
-        <w:t xml:space="preserve"> (register + grip-aware targets). Shared </w:t>
-      </w:r>
-      <w:r>
-        <w:rPr>
-          <w:b/>
-          <w:bCs/>
-        </w:rPr>
-        <w:t xml:space="preserve">melodic-triad</w:t>
-      </w:r>
-      <w:r>
-        <w:t xml:space="preserve"> substitutions, </w:t>
-      </w:r>
-      <w:r>
-        <w:rPr>
-          <w:b/>
-          <w:bCs/>
-        </w:rPr>
-        <w:t xml:space="preserve">tension-layer</w:t>
-      </w:r>
-      <w:r>
-        <w:t xml:space="preserve"> swaps, </w:t>
-      </w:r>
-      <w:r>
-        <w:rPr>
-          <w:b/>
-          <w:bCs/>
-        </w:rPr>
-        <w:t xml:space="preserve">shell</w:t>
-      </w:r>
-      <w:r>
-        <w:t xml:space="preserve"> rewrites; targets </w:t>
-      </w:r>
-      <w:r>
-        <w:rPr>
-          <w:b/>
-          <w:bCs/>
-        </w:rPr>
-        <w:t xml:space="preserve">jazz standards</w:t>
-      </w:r>
-      <w:r>
-        <w:t xml:space="preserve"> and </w:t>
-      </w:r>
-      <w:r>
-        <w:rPr>
-          <w:b/>
-          <w:bCs/>
-        </w:rPr>
-        <w:t xml:space="preserve">user originals</w:t>
-      </w:r>
-      <w:r>
-        <w:t xml:space="preserve"> on the same API.</w:t>
+        <w:t xml:space="preserve">Complete</w:t>
+      </w:r>
+      <w:r>
+        <w:t xml:space="preserve"> — see </w:t>
+      </w:r>
+      <w:r>
+        <w:rPr>
+          <w:b/>
+          <w:bCs/>
+        </w:rPr>
+        <w:t xml:space="preserve">Revolutionary Reharmonisation Engine</w:t>
+      </w:r>
+      <w:r>
+        <w:t xml:space="preserve"> below; shipped as </w:t>
+      </w:r>
+      <w:r>
+        <w:rPr>
+          <w:b/>
+          <w:bCs/>
+        </w:rPr>
+        <w:t xml:space="preserve">`reharmCandidateEngine.ts`</w:t>
+      </w:r>
+      <w:r>
+        <w:t xml:space="preserve"> (</w:t>
+      </w:r>
+      <w:r>
+        <w:rPr>
+          <w:b/>
+          <w:bCs/>
+        </w:rPr>
+        <w:t xml:space="preserve">`generateReharmCandidates`</w:t>
+      </w:r>
+      <w:r>
+        <w:t xml:space="preserve">, </w:t>
+      </w:r>
+      <w:r>
+        <w:rPr>
+          <w:b/>
+          <w:bCs/>
+        </w:rPr>
+        <w:t xml:space="preserve">`ReharmCandidate`</w:t>
+      </w:r>
+      <w:r>
+        <w:t xml:space="preserve">, </w:t>
+      </w:r>
+      <w:r>
+        <w:rPr>
+          <w:b/>
+          <w:bCs/>
+        </w:rPr>
+        <w:t xml:space="preserve">`EmotionalDrift`</w:t>
+      </w:r>
+      <w:r>
+        <w:t xml:space="preserve">, </w:t>
+      </w:r>
+      <w:r>
+        <w:rPr>
+          <w:b/>
+          <w:bCs/>
+        </w:rPr>
+        <w:t xml:space="preserve">`ReharmStrategy`</w:t>
+      </w:r>
+      <w:r>
+        <w:t xml:space="preserve">).</w:t>
       </w:r>
     </w:p>
     <w:p>
@@ -29327,7 +29317,17 @@
         <w:t xml:space="preserve">Build D</w:t>
       </w:r>
       <w:r>
-        <w:t xml:space="preserve"> (optional reharm), </w:t>
+        <w:t xml:space="preserve"> (optional </w:t>
+      </w:r>
+      <w:r>
+        <w:rPr>
+          <w:b/>
+          <w:bCs/>
+        </w:rPr>
+        <w:t xml:space="preserve">`generateReharmCandidates`</w:t>
+      </w:r>
+      <w:r>
+        <w:t xml:space="preserve"> pass), </w:t>
       </w:r>
       <w:r>
         <w:rPr>
@@ -29414,7 +29414,7 @@
         <w:t xml:space="preserve">Reharmonisation</w:t>
       </w:r>
       <w:r>
-        <w:t xml:space="preserve"> (when </w:t>
+        <w:t xml:space="preserve"> (</w:t>
       </w:r>
       <w:r>
         <w:rPr>
@@ -29424,14 +29424,24 @@
         <w:t xml:space="preserve">Build D</w:t>
       </w:r>
       <w:r>
-        <w:t xml:space="preserve"> lands) is designed to </w:t>
-      </w:r>
-      <w:r>
-        <w:rPr>
-          <w:b/>
-          <w:bCs/>
-        </w:rPr>
-        <w:t xml:space="preserve">preserve melodic-triad identity</w:t>
+        <w:t xml:space="preserve">, </w:t>
+      </w:r>
+      <w:r>
+        <w:rPr>
+          <w:b/>
+          <w:bCs/>
+        </w:rPr>
+        <w:t xml:space="preserve">`reharmCandidateEngine`</w:t>
+      </w:r>
+      <w:r>
+        <w:t xml:space="preserve">) </w:t>
+      </w:r>
+      <w:r>
+        <w:rPr>
+          <w:b/>
+          <w:bCs/>
+        </w:rPr>
+        <w:t xml:space="preserve">preserves or reinterprets melodic-triad identity</w:t>
       </w:r>
       <w:r>
         <w:t xml:space="preserve"> while modernising </w:t>
@@ -29444,7 +29454,17 @@
         <w:t xml:space="preserve">shells</w:t>
       </w:r>
       <w:r>
-        <w:t xml:space="preserve"> and colour.</w:t>
+        <w:t xml:space="preserve"> and colour — see </w:t>
+      </w:r>
+      <w:r>
+        <w:rPr>
+          <w:b/>
+          <w:bCs/>
+        </w:rPr>
+        <w:t xml:space="preserve">Revolutionary Reharmonisation Engine</w:t>
+      </w:r>
+      <w:r>
+        <w:t xml:space="preserve">.</w:t>
       </w:r>
     </w:p>
     <w:p>
@@ -29838,6 +29858,16 @@
         <w:t xml:space="preserve">B</w:t>
       </w:r>
       <w:r>
+        <w:t xml:space="preserve">, </w:t>
+      </w:r>
+      <w:r>
+        <w:rPr>
+          <w:b/>
+          <w:bCs/>
+        </w:rPr>
+        <w:t xml:space="preserve">C</w:t>
+      </w:r>
+      <w:r>
         <w:t xml:space="preserve">, and </w:t>
       </w:r>
       <w:r>
@@ -29845,7 +29875,7 @@
           <w:b/>
           <w:bCs/>
         </w:rPr>
-        <w:t xml:space="preserve">C</w:t>
+        <w:t xml:space="preserve">D</w:t>
       </w:r>
       <w:r>
         <w:t xml:space="preserve"> are </w:t>
@@ -29875,10 +29905,10 @@
           <w:b/>
           <w:bCs/>
         </w:rPr>
-        <w:t xml:space="preserve">Build D</w:t>
-      </w:r>
-      <w:r>
-        <w:t xml:space="preserve"> (reharmonisation). Planned sequencing for </w:t>
+        <w:t xml:space="preserve">Build E + F</w:t>
+      </w:r>
+      <w:r>
+        <w:t xml:space="preserve"> (arrangement router + motif transformation). Planned sequencing for </w:t>
       </w:r>
       <w:r>
         <w:rPr>
@@ -29900,7 +29930,7 @@
           <w:b/>
           <w:bCs/>
         </w:rPr>
-        <w:t xml:space="preserve">D → E+F → G → C2 → UI → IMG</w:t>
+        <w:t xml:space="preserve">E+F → G → C2 → UI → IMG</w:t>
       </w:r>
       <w:r>
         <w:t xml:space="preserve"> (</w:t>
@@ -29924,6 +29954,733 @@
       </w:r>
       <w:r>
         <w:t xml:space="preserve"> may ship as one milestone depending on routing vs motif scope.)</w:t>
+      </w:r>
+    </w:p>
+    <w:p>
+      <w:pPr>
+        <w:pStyle w:val="Heading1"/>
+        <w:spacing w:after="120" w:before="200"/>
+      </w:pPr>
+      <w:r>
+        <w:t xml:space="preserve">Revolutionary Reharmonisation Engine</w:t>
+      </w:r>
+    </w:p>
+    <w:p>
+      <w:pPr>
+        <w:spacing w:after="160"/>
+      </w:pPr>
+      <w:r>
+        <w:t xml:space="preserve">This is the </w:t>
+      </w:r>
+      <w:r>
+        <w:rPr>
+          <w:b/>
+          <w:bCs/>
+        </w:rPr>
+        <w:t xml:space="preserve">only</w:t>
+      </w:r>
+      <w:r>
+        <w:t xml:space="preserve"> music generation engine in the product lineup that performs </w:t>
+      </w:r>
+      <w:r>
+        <w:rPr>
+          <w:b/>
+          <w:bCs/>
+        </w:rPr>
+        <w:t xml:space="preserve">reharmonisation at the melodic-triad level</w:t>
+      </w:r>
+      <w:r>
+        <w:t xml:space="preserve"> rather than at the </w:t>
+      </w:r>
+      <w:r>
+        <w:rPr>
+          <w:b/>
+          <w:bCs/>
+        </w:rPr>
+        <w:t xml:space="preserve">chord-symbol</w:t>
+      </w:r>
+      <w:r>
+        <w:t xml:space="preserve"> level. Every substitution </w:t>
+      </w:r>
+      <w:r>
+        <w:rPr>
+          <w:b/>
+          <w:bCs/>
+        </w:rPr>
+        <w:t xml:space="preserve">preserves</w:t>
+      </w:r>
+      <w:r>
+        <w:t xml:space="preserve"> or </w:t>
+      </w:r>
+      <w:r>
+        <w:rPr>
+          <w:b/>
+          <w:bCs/>
+        </w:rPr>
+        <w:t xml:space="preserve">purposefully reinterprets</w:t>
+      </w:r>
+      <w:r>
+        <w:t xml:space="preserve"> the </w:t>
+      </w:r>
+      <w:r>
+        <w:rPr>
+          <w:b/>
+          <w:bCs/>
+        </w:rPr>
+        <w:t xml:space="preserve">upper-structure melodic triad</w:t>
+      </w:r>
+      <w:r>
+        <w:t xml:space="preserve"> that the melody is already expressing — the same object the Tonality Vault uses for quadratonic melody, grips, and tension hierarchy.</w:t>
+      </w:r>
+    </w:p>
+    <w:p>
+      <w:pPr>
+        <w:spacing w:after="160"/>
+      </w:pPr>
+      <w:r>
+        <w:rPr>
+          <w:b/>
+          <w:bCs/>
+        </w:rPr>
+        <w:t xml:space="preserve">No existing general-purpose tool</w:t>
+      </w:r>
+      <w:r>
+        <w:t xml:space="preserve"> in this category — </w:t>
+      </w:r>
+      <w:r>
+        <w:rPr>
+          <w:b/>
+          <w:bCs/>
+        </w:rPr>
+        <w:t xml:space="preserve">Band-in-a-Box</w:t>
+      </w:r>
+      <w:r>
+        <w:t xml:space="preserve">, </w:t>
+      </w:r>
+      <w:r>
+        <w:rPr>
+          <w:b/>
+          <w:bCs/>
+        </w:rPr>
+        <w:t xml:space="preserve">Sibelius</w:t>
+      </w:r>
+      <w:r>
+        <w:t xml:space="preserve">, </w:t>
+      </w:r>
+      <w:r>
+        <w:rPr>
+          <w:b/>
+          <w:bCs/>
+        </w:rPr>
+        <w:t xml:space="preserve">Finale</w:t>
+      </w:r>
+      <w:r>
+        <w:t xml:space="preserve">, </w:t>
+      </w:r>
+      <w:r>
+        <w:rPr>
+          <w:b/>
+          <w:bCs/>
+        </w:rPr>
+        <w:t xml:space="preserve">iReal Pro</w:t>
+      </w:r>
+      <w:r>
+        <w:t xml:space="preserve">, or typical </w:t>
+      </w:r>
+      <w:r>
+        <w:rPr>
+          <w:b/>
+          <w:bCs/>
+        </w:rPr>
+        <w:t xml:space="preserve">DAW</w:t>
+      </w:r>
+      <w:r>
+        <w:t xml:space="preserve"> harmony plugins — implements that contract. </w:t>
+      </w:r>
+      <w:r>
+        <w:rPr>
+          <w:b/>
+          <w:bCs/>
+        </w:rPr>
+        <w:t xml:space="preserve">Band-in-a-Box</w:t>
+      </w:r>
+      <w:r>
+        <w:t xml:space="preserve"> reharmonisation is </w:t>
+      </w:r>
+      <w:r>
+        <w:rPr>
+          <w:b/>
+          <w:bCs/>
+        </w:rPr>
+        <w:t xml:space="preserve">functional harmony</w:t>
+      </w:r>
+      <w:r>
+        <w:t xml:space="preserve"> and style presets over chord roots and scales; it has </w:t>
+      </w:r>
+      <w:r>
+        <w:rPr>
+          <w:b/>
+          <w:bCs/>
+        </w:rPr>
+        <w:t xml:space="preserve">no melodic-triad awareness</w:t>
+      </w:r>
+      <w:r>
+        <w:t xml:space="preserve">. Notation hosts swap chord symbols and extensions on the page without a vault-level triad stack tied to your line.</w:t>
+      </w:r>
+    </w:p>
+    <w:p>
+      <w:pPr>
+        <w:spacing w:after="160"/>
+      </w:pPr>
+      <w:r>
+        <w:t xml:space="preserve">Composer OS uses </w:t>
+      </w:r>
+      <w:r>
+        <w:rPr>
+          <w:b/>
+          <w:bCs/>
+        </w:rPr>
+        <w:t xml:space="preserve">`generateReharmCandidates`</w:t>
+      </w:r>
+      <w:r>
+        <w:t xml:space="preserve"> (</w:t>
+      </w:r>
+      <w:r>
+        <w:rPr>
+          <w:b/>
+          <w:bCs/>
+        </w:rPr>
+        <w:t xml:space="preserve">`reharmCandidateEngine.ts`</w:t>
+      </w:r>
+      <w:r>
+        <w:t xml:space="preserve">) with </w:t>
+      </w:r>
+      <w:r>
+        <w:rPr>
+          <w:b/>
+          <w:bCs/>
+        </w:rPr>
+        <w:t xml:space="preserve">three</w:t>
+      </w:r>
+      <w:r>
+        <w:t xml:space="preserve"> substitution strategies:</w:t>
+      </w:r>
+    </w:p>
+    <w:tbl>
+      <w:tblPr>
+        <w:tblW w:type="pct" w:w="100%"/>
+        <w:tblBorders>
+          <w:top w:val="single" w:color="auto" w:sz="4"/>
+          <w:left w:val="single" w:color="auto" w:sz="4"/>
+          <w:bottom w:val="single" w:color="auto" w:sz="4"/>
+          <w:right w:val="single" w:color="auto" w:sz="4"/>
+          <w:insideH w:val="single" w:color="auto" w:sz="4"/>
+          <w:insideV w:val="single" w:color="auto" w:sz="4"/>
+        </w:tblBorders>
+      </w:tblPr>
+      <w:tblGrid>
+        <w:gridCol w:w="4500"/>
+        <w:gridCol w:w="4500"/>
+      </w:tblGrid>
+      <w:tr>
+        <w:tc>
+          <w:tcPr>
+            <w:tcW w:type="pct" w:w="4500%"/>
+          </w:tcPr>
+          <w:p>
+            <w:pPr>
+              <w:spacing w:after="60"/>
+            </w:pPr>
+            <w:r>
+              <w:t xml:space="preserve">Strategy</w:t>
+            </w:r>
+          </w:p>
+        </w:tc>
+        <w:tc>
+          <w:tcPr>
+            <w:tcW w:type="pct" w:w="4500%"/>
+          </w:tcPr>
+          <w:p>
+            <w:pPr>
+              <w:spacing w:after="60"/>
+            </w:pPr>
+            <w:r>
+              <w:t xml:space="preserve">Role</w:t>
+            </w:r>
+          </w:p>
+        </w:tc>
+      </w:tr>
+      <w:tr>
+        <w:tc>
+          <w:tcPr>
+            <w:tcW w:type="pct" w:w="4500%"/>
+          </w:tcPr>
+          <w:p>
+            <w:pPr>
+              <w:spacing w:after="60"/>
+            </w:pPr>
+            <w:r>
+              <w:rPr>
+                <w:b/>
+                <w:bCs/>
+              </w:rPr>
+              <w:t xml:space="preserve">`shared-melodic-triad`</w:t>
+            </w:r>
+          </w:p>
+        </w:tc>
+        <w:tc>
+          <w:tcPr>
+            <w:tcW w:type="pct" w:w="4500%"/>
+          </w:tcPr>
+          <w:p>
+            <w:pPr>
+              <w:spacing w:after="60"/>
+            </w:pPr>
+            <w:r>
+              <w:t xml:space="preserve">Strongest family — same vault </w:t>
+            </w:r>
+            <w:r>
+              <w:rPr>
+                <w:b/>
+                <w:bCs/>
+              </w:rPr>
+              <w:t xml:space="preserve">melodic triad root</w:t>
+            </w:r>
+            <w:r>
+              <w:t xml:space="preserve"> anchor (`T3` / `T4` / `T7` line); </w:t>
+            </w:r>
+            <w:r>
+              <w:rPr>
+                <w:b/>
+                <w:bCs/>
+              </w:rPr>
+              <w:t xml:space="preserve">`melodicTriadPreserved: true`</w:t>
+            </w:r>
+            <w:r>
+              <w:t xml:space="preserve">.</w:t>
+            </w:r>
+          </w:p>
+        </w:tc>
+      </w:tr>
+      <w:tr>
+        <w:tc>
+          <w:tcPr>
+            <w:tcW w:type="pct" w:w="4500%"/>
+          </w:tcPr>
+          <w:p>
+            <w:pPr>
+              <w:spacing w:after="60"/>
+            </w:pPr>
+            <w:r>
+              <w:rPr>
+                <w:b/>
+                <w:bCs/>
+              </w:rPr>
+              <w:t xml:space="preserve">`tension-layer-swap`</w:t>
+            </w:r>
+          </w:p>
+        </w:tc>
+        <w:tc>
+          <w:tcPr>
+            <w:tcW w:type="pct" w:w="4500%"/>
+          </w:tcPr>
+          <w:p>
+            <w:pPr>
+              <w:spacing w:after="60"/>
+            </w:pPr>
+            <w:r>
+              <w:t xml:space="preserve">Harmonic reinterpretation — substitute type whose </w:t>
+            </w:r>
+            <w:r>
+              <w:rPr>
+                <w:b/>
+                <w:bCs/>
+              </w:rPr>
+              <w:t xml:space="preserve">primary tension degree</w:t>
+            </w:r>
+            <w:r>
+              <w:t xml:space="preserve"> matches the original melodic-triad anchor degree; </w:t>
+            </w:r>
+            <w:r>
+              <w:rPr>
+                <w:b/>
+                <w:bCs/>
+              </w:rPr>
+              <w:t xml:space="preserve">`melodicTriadPreserved: false`</w:t>
+            </w:r>
+            <w:r>
+              <w:t xml:space="preserve"> (expressive tension role shift).</w:t>
+            </w:r>
+          </w:p>
+        </w:tc>
+      </w:tr>
+      <w:tr>
+        <w:tc>
+          <w:tcPr>
+            <w:tcW w:type="pct" w:w="4500%"/>
+          </w:tcPr>
+          <w:p>
+            <w:pPr>
+              <w:spacing w:after="60"/>
+            </w:pPr>
+            <w:r>
+              <w:rPr>
+                <w:b/>
+                <w:bCs/>
+              </w:rPr>
+              <w:t xml:space="preserve">`shell-swap`</w:t>
+            </w:r>
+          </w:p>
+        </w:tc>
+        <w:tc>
+          <w:tcPr>
+            <w:tcW w:type="pct" w:w="4500%"/>
+          </w:tcPr>
+          <w:p>
+            <w:pPr>
+              <w:spacing w:after="60"/>
+            </w:pPr>
+            <w:r>
+              <w:rPr>
+                <w:b/>
+                <w:bCs/>
+              </w:rPr>
+              <w:t xml:space="preserve">Melodic triad degrees fixed</w:t>
+            </w:r>
+            <w:r>
+              <w:t xml:space="preserve">, </w:t>
+            </w:r>
+            <w:r>
+              <w:rPr>
+                <w:b/>
+                <w:bCs/>
+              </w:rPr>
+              <w:t xml:space="preserve">shell / chord quality</w:t>
+            </w:r>
+            <w:r>
+              <w:t xml:space="preserve"> varied beneath (same triad degree triple, different chord type). </w:t>
+            </w:r>
+            <w:r>
+              <w:rPr>
+                <w:b/>
+                <w:bCs/>
+              </w:rPr>
+              <w:t xml:space="preserve">`melodicTriadPreserved: true`</w:t>
+            </w:r>
+            <w:r>
+              <w:t xml:space="preserve">.</w:t>
+            </w:r>
+          </w:p>
+        </w:tc>
+      </w:tr>
+    </w:tbl>
+    <w:p>
+      <w:pPr>
+        <w:spacing w:after="160"/>
+      </w:pPr>
+    </w:p>
+    <w:p>
+      <w:pPr>
+        <w:spacing w:after="160"/>
+      </w:pPr>
+      <w:r>
+        <w:t xml:space="preserve">The </w:t>
+      </w:r>
+      <w:r>
+        <w:rPr>
+          <w:b/>
+          <w:bCs/>
+        </w:rPr>
+        <w:t xml:space="preserve">`EmotionalDrift`</w:t>
+      </w:r>
+      <w:r>
+        <w:t xml:space="preserve"> parameter (</w:t>
+      </w:r>
+      <w:r>
+        <w:rPr>
+          <w:b/>
+          <w:bCs/>
+        </w:rPr>
+        <w:t xml:space="preserve">`darker`</w:t>
+      </w:r>
+      <w:r>
+        <w:t xml:space="preserve">, </w:t>
+      </w:r>
+      <w:r>
+        <w:rPr>
+          <w:b/>
+          <w:bCs/>
+        </w:rPr>
+        <w:t xml:space="preserve">`brighter`</w:t>
+      </w:r>
+      <w:r>
+        <w:t xml:space="preserve">, </w:t>
+      </w:r>
+      <w:r>
+        <w:rPr>
+          <w:b/>
+          <w:bCs/>
+        </w:rPr>
+        <w:t xml:space="preserve">`more-suspended`</w:t>
+      </w:r>
+      <w:r>
+        <w:t xml:space="preserve">, </w:t>
+      </w:r>
+      <w:r>
+        <w:rPr>
+          <w:b/>
+          <w:bCs/>
+        </w:rPr>
+        <w:t xml:space="preserve">`more-unstable`</w:t>
+      </w:r>
+      <w:r>
+        <w:t xml:space="preserve">, </w:t>
+      </w:r>
+      <w:r>
+        <w:rPr>
+          <w:b/>
+          <w:bCs/>
+        </w:rPr>
+        <w:t xml:space="preserve">`more-cinematic`</w:t>
+      </w:r>
+      <w:r>
+        <w:t xml:space="preserve">, </w:t>
+      </w:r>
+      <w:r>
+        <w:rPr>
+          <w:b/>
+          <w:bCs/>
+        </w:rPr>
+        <w:t xml:space="preserve">`neutral`</w:t>
+      </w:r>
+      <w:r>
+        <w:t xml:space="preserve">) biases ranking toward substitutions that match compositional intent — e.g. </w:t>
+      </w:r>
+      <w:r>
+        <w:rPr>
+          <w:b/>
+          <w:bCs/>
+        </w:rPr>
+        <w:t xml:space="preserve">darker</w:t>
+      </w:r>
+      <w:r>
+        <w:t xml:space="preserve"> favours minor / diminished colour, </w:t>
+      </w:r>
+      <w:r>
+        <w:rPr>
+          <w:b/>
+          <w:bCs/>
+        </w:rPr>
+        <w:t xml:space="preserve">brighter</w:t>
+      </w:r>
+      <w:r>
+        <w:t xml:space="preserve"> favours major / Lydian-leaning types, </w:t>
+      </w:r>
+      <w:r>
+        <w:rPr>
+          <w:b/>
+          <w:bCs/>
+        </w:rPr>
+        <w:t xml:space="preserve">more-suspended</w:t>
+      </w:r>
+      <w:r>
+        <w:t xml:space="preserve"> favours </w:t>
+      </w:r>
+      <w:r>
+        <w:rPr>
+          <w:b/>
+          <w:bCs/>
+        </w:rPr>
+        <w:t xml:space="preserve">sus</w:t>
+      </w:r>
+      <w:r>
+        <w:t xml:space="preserve"> families, </w:t>
+      </w:r>
+      <w:r>
+        <w:rPr>
+          <w:b/>
+          <w:bCs/>
+        </w:rPr>
+        <w:t xml:space="preserve">more-unstable</w:t>
+      </w:r>
+      <w:r>
+        <w:t xml:space="preserve"> favours altered / outside harmony, </w:t>
+      </w:r>
+      <w:r>
+        <w:rPr>
+          <w:b/>
+          <w:bCs/>
+        </w:rPr>
+        <w:t xml:space="preserve">more-cinematic</w:t>
+      </w:r>
+      <w:r>
+        <w:t xml:space="preserve"> favours rich </w:t>
+      </w:r>
+      <w:r>
+        <w:rPr>
+          <w:b/>
+          <w:bCs/>
+        </w:rPr>
+        <w:t xml:space="preserve">maj7</w:t>
+      </w:r>
+      <w:r>
+        <w:t xml:space="preserve"> / </w:t>
+      </w:r>
+      <w:r>
+        <w:rPr>
+          <w:b/>
+          <w:bCs/>
+        </w:rPr>
+        <w:t xml:space="preserve">maj9</w:t>
+      </w:r>
+      <w:r>
+        <w:t xml:space="preserve"> colours.</w:t>
+      </w:r>
+    </w:p>
+    <w:p>
+      <w:pPr>
+        <w:spacing w:after="160"/>
+      </w:pPr>
+      <w:r>
+        <w:t xml:space="preserve">The </w:t>
+      </w:r>
+      <w:r>
+        <w:rPr>
+          <w:b/>
+          <w:bCs/>
+        </w:rPr>
+        <w:t xml:space="preserve">`guitarFriendly`</w:t>
+      </w:r>
+      <w:r>
+        <w:t xml:space="preserve"> flag uses </w:t>
+      </w:r>
+      <w:r>
+        <w:rPr>
+          <w:b/>
+          <w:bCs/>
+        </w:rPr>
+        <w:t xml:space="preserve">standard-tuning</w:t>
+      </w:r>
+      <w:r>
+        <w:t xml:space="preserve"> fret reach so suggested bass / root positions stay </w:t>
+      </w:r>
+      <w:r>
+        <w:rPr>
+          <w:b/>
+          <w:bCs/>
+        </w:rPr>
+        <w:t xml:space="preserve">playable in position</w:t>
+      </w:r>
+      <w:r>
+        <w:t xml:space="preserve">. Every substitute chord type already has its own </w:t>
+      </w:r>
+      <w:r>
+        <w:rPr>
+          <w:b/>
+          <w:bCs/>
+        </w:rPr>
+        <w:t xml:space="preserve">quadratonic</w:t>
+      </w:r>
+      <w:r>
+        <w:t xml:space="preserve">, </w:t>
+      </w:r>
+      <w:r>
+        <w:rPr>
+          <w:b/>
+          <w:bCs/>
+        </w:rPr>
+        <w:t xml:space="preserve">grip library</w:t>
+      </w:r>
+      <w:r>
+        <w:t xml:space="preserve">, and </w:t>
+      </w:r>
+      <w:r>
+        <w:rPr>
+          <w:b/>
+          <w:bCs/>
+        </w:rPr>
+        <w:t xml:space="preserve">tension hierarchy</w:t>
+      </w:r>
+      <w:r>
+        <w:t xml:space="preserve"> in the Vault — nothing is a naked symbol swap.</w:t>
+      </w:r>
+    </w:p>
+    <w:p>
+      <w:pPr>
+        <w:spacing w:after="160"/>
+      </w:pPr>
+      <w:r>
+        <w:t xml:space="preserve">Combined with </w:t>
+      </w:r>
+      <w:r>
+        <w:rPr>
+          <w:b/>
+          <w:bCs/>
+        </w:rPr>
+        <w:t xml:space="preserve">Build C</w:t>
+      </w:r>
+      <w:r>
+        <w:t xml:space="preserve"> guitar grip output and </w:t>
+      </w:r>
+      <w:r>
+        <w:rPr>
+          <w:b/>
+          <w:bCs/>
+        </w:rPr>
+        <w:t xml:space="preserve">MusicXML</w:t>
+      </w:r>
+      <w:r>
+        <w:t xml:space="preserve"> export paths, this stack is a </w:t>
+      </w:r>
+      <w:r>
+        <w:rPr>
+          <w:b/>
+          <w:bCs/>
+        </w:rPr>
+        <w:t xml:space="preserve">serious creative tool</w:t>
+      </w:r>
+      <w:r>
+        <w:t xml:space="preserve"> for </w:t>
+      </w:r>
+      <w:r>
+        <w:rPr>
+          <w:b/>
+          <w:bCs/>
+        </w:rPr>
+        <w:t xml:space="preserve">jazz guitarists</w:t>
+      </w:r>
+      <w:r>
+        <w:t xml:space="preserve"> and </w:t>
+      </w:r>
+      <w:r>
+        <w:rPr>
+          <w:b/>
+          <w:bCs/>
+        </w:rPr>
+        <w:t xml:space="preserve">composers</w:t>
+      </w:r>
+      <w:r>
+        <w:t xml:space="preserve"> who work from </w:t>
+      </w:r>
+      <w:r>
+        <w:rPr>
+          <w:b/>
+          <w:bCs/>
+        </w:rPr>
+        <w:t xml:space="preserve">line-first</w:t>
+      </w:r>
+      <w:r>
+        <w:t xml:space="preserve"> and </w:t>
+      </w:r>
+      <w:r>
+        <w:rPr>
+          <w:b/>
+          <w:bCs/>
+        </w:rPr>
+        <w:t xml:space="preserve">teaching-grade</w:t>
+      </w:r>
+      <w:r>
+        <w:t xml:space="preserve"> harmonic logic.</w:t>
       </w:r>
     </w:p>
     <w:p>

</xml_diff>

<commit_message>
docs: Build E+F complete, Build H GCE-targeted generation added to roadmap, build order updated
Co-authored-by: Cursor <cursoragent@cursor.com>
</commit_message>
<xml_diff>
--- a/docs/COMPOSER_OS_PLAYBOOK.docx
+++ b/docs/COMPOSER_OS_PLAYBOOK.docx
@@ -28029,6 +28029,978 @@
         <w:spacing w:after="100" w:before="160"/>
       </w:pPr>
       <w:r>
+        <w:t xml:space="preserve">Build E+F — Arrangement layer router + motif transformation (**complete**)</w:t>
+      </w:r>
+    </w:p>
+    <w:p>
+      <w:pPr>
+        <w:spacing w:after="160"/>
+      </w:pPr>
+      <w:r>
+        <w:rPr>
+          <w:b/>
+          <w:bCs/>
+        </w:rPr>
+        <w:t xml:space="preserve">Shipped</w:t>
+      </w:r>
+      <w:r>
+        <w:t xml:space="preserve"> in `engines/composer-os-v2/core/arrangement/` — </w:t>
+      </w:r>
+      <w:r>
+        <w:rPr>
+          <w:b/>
+          <w:bCs/>
+        </w:rPr>
+        <w:t xml:space="preserve">`arrangementLayerRouter.ts`</w:t>
+      </w:r>
+      <w:r>
+        <w:t xml:space="preserve">, </w:t>
+      </w:r>
+      <w:r>
+        <w:rPr>
+          <w:b/>
+          <w:bCs/>
+        </w:rPr>
+        <w:t xml:space="preserve">`motifTransformer.ts`</w:t>
+      </w:r>
+      <w:r>
+        <w:t xml:space="preserve">, barrel </w:t>
+      </w:r>
+      <w:r>
+        <w:rPr>
+          <w:b/>
+          <w:bCs/>
+        </w:rPr>
+        <w:t xml:space="preserve">`index.ts`</w:t>
+      </w:r>
+      <w:r>
+        <w:t xml:space="preserve">.</w:t>
+      </w:r>
+    </w:p>
+    <w:p>
+      <w:pPr>
+        <w:spacing w:after="160"/>
+      </w:pPr>
+      <w:r>
+        <w:rPr>
+          <w:b/>
+          <w:bCs/>
+        </w:rPr>
+        <w:t xml:space="preserve">`ArrangementLayerRouter`</w:t>
+      </w:r>
+      <w:r>
+        <w:t xml:space="preserve"> — </w:t>
+      </w:r>
+      <w:r>
+        <w:rPr>
+          <w:b/>
+          <w:bCs/>
+        </w:rPr>
+        <w:t xml:space="preserve">`routeStringQuartet(chordTypeId, rootPc)`</w:t>
+      </w:r>
+      <w:r>
+        <w:t xml:space="preserve"> and </w:t>
+      </w:r>
+      <w:r>
+        <w:rPr>
+          <w:b/>
+          <w:bCs/>
+        </w:rPr>
+        <w:t xml:space="preserve">`routeBigBand(chordTypeId, rootPc)`</w:t>
+      </w:r>
+      <w:r>
+        <w:t xml:space="preserve"> return </w:t>
+      </w:r>
+      <w:r>
+        <w:rPr>
+          <w:b/>
+          <w:bCs/>
+        </w:rPr>
+        <w:t xml:space="preserve">`ArrangementLayer[]`</w:t>
+      </w:r>
+      <w:r>
+        <w:t xml:space="preserve">: each row has </w:t>
+      </w:r>
+      <w:r>
+        <w:rPr>
+          <w:b/>
+          <w:bCs/>
+        </w:rPr>
+        <w:t xml:space="preserve">`instrumentFamily`</w:t>
+      </w:r>
+      <w:r>
+        <w:t xml:space="preserve">, </w:t>
+      </w:r>
+      <w:r>
+        <w:rPr>
+          <w:b/>
+          <w:bCs/>
+        </w:rPr>
+        <w:t xml:space="preserve">`assignedTensionLayer`</w:t>
+      </w:r>
+      <w:r>
+        <w:t xml:space="preserve">, </w:t>
+      </w:r>
+      <w:r>
+        <w:rPr>
+          <w:b/>
+          <w:bCs/>
+        </w:rPr>
+        <w:t xml:space="preserve">`allowedRoles`</w:t>
+      </w:r>
+      <w:r>
+        <w:t xml:space="preserve"> (from </w:t>
+      </w:r>
+      <w:r>
+        <w:rPr>
+          <w:b/>
+          <w:bCs/>
+        </w:rPr>
+        <w:t xml:space="preserve">`buildBeatContextLegalityMap`</w:t>
+      </w:r>
+      <w:r>
+        <w:t xml:space="preserve"> + </w:t>
+      </w:r>
+      <w:r>
+        <w:rPr>
+          <w:b/>
+          <w:bCs/>
+        </w:rPr>
+        <w:t xml:space="preserve">`NoteLayer`</w:t>
+      </w:r>
+      <w:r>
+        <w:t xml:space="preserve"> filters), and </w:t>
+      </w:r>
+      <w:r>
+        <w:rPr>
+          <w:b/>
+          <w:bCs/>
+        </w:rPr>
+        <w:t xml:space="preserve">`description`</w:t>
+      </w:r>
+      <w:r>
+        <w:t xml:space="preserve">. </w:t>
+      </w:r>
+      <w:r>
+        <w:rPr>
+          <w:b/>
+          <w:bCs/>
+        </w:rPr>
+        <w:t xml:space="preserve">`TONALITY_VAULT_DATABASE`</w:t>
+      </w:r>
+      <w:r>
+        <w:t xml:space="preserve"> gates unknown </w:t>
+      </w:r>
+      <w:r>
+        <w:rPr>
+          <w:b/>
+          <w:bCs/>
+        </w:rPr>
+        <w:t xml:space="preserve">`chordTypeId`</w:t>
+      </w:r>
+      <w:r>
+        <w:t xml:space="preserve"> (empty list).</w:t>
+      </w:r>
+    </w:p>
+    <w:tbl>
+      <w:tblPr>
+        <w:tblW w:type="pct" w:w="100%"/>
+        <w:tblBorders>
+          <w:top w:val="single" w:color="auto" w:sz="4"/>
+          <w:left w:val="single" w:color="auto" w:sz="4"/>
+          <w:bottom w:val="single" w:color="auto" w:sz="4"/>
+          <w:right w:val="single" w:color="auto" w:sz="4"/>
+          <w:insideH w:val="single" w:color="auto" w:sz="4"/>
+          <w:insideV w:val="single" w:color="auto" w:sz="4"/>
+        </w:tblBorders>
+      </w:tblPr>
+      <w:tblGrid>
+        <w:gridCol w:w="2250"/>
+        <w:gridCol w:w="2250"/>
+        <w:gridCol w:w="2250"/>
+        <w:gridCol w:w="2250"/>
+      </w:tblGrid>
+      <w:tr>
+        <w:tc>
+          <w:tcPr>
+            <w:tcW w:type="pct" w:w="2250%"/>
+          </w:tcPr>
+          <w:p>
+            <w:pPr>
+              <w:spacing w:after="60"/>
+            </w:pPr>
+            <w:r>
+              <w:t xml:space="preserve">Ensemble</w:t>
+            </w:r>
+          </w:p>
+        </w:tc>
+        <w:tc>
+          <w:tcPr>
+            <w:tcW w:type="pct" w:w="2250%"/>
+          </w:tcPr>
+          <w:p>
+            <w:pPr>
+              <w:spacing w:after="60"/>
+            </w:pPr>
+            <w:r>
+              <w:t xml:space="preserve">Part</w:t>
+            </w:r>
+          </w:p>
+        </w:tc>
+        <w:tc>
+          <w:tcPr>
+            <w:tcW w:type="pct" w:w="2250%"/>
+          </w:tcPr>
+          <w:p>
+            <w:pPr>
+              <w:spacing w:after="60"/>
+            </w:pPr>
+            <w:r>
+              <w:t xml:space="preserve">Vault layers</w:t>
+            </w:r>
+          </w:p>
+        </w:tc>
+        <w:tc>
+          <w:tcPr>
+            <w:tcW w:type="pct" w:w="2250%"/>
+          </w:tcPr>
+          <w:p>
+            <w:pPr>
+              <w:spacing w:after="60"/>
+            </w:pPr>
+            <w:r>
+              <w:t xml:space="preserve">Role</w:t>
+            </w:r>
+          </w:p>
+        </w:tc>
+      </w:tr>
+      <w:tr>
+        <w:tc>
+          <w:tcPr>
+            <w:tcW w:type="pct" w:w="2250%"/>
+          </w:tcPr>
+          <w:p>
+            <w:pPr>
+              <w:spacing w:after="60"/>
+            </w:pPr>
+            <w:r>
+              <w:rPr>
+                <w:b/>
+                <w:bCs/>
+              </w:rPr>
+              <w:t xml:space="preserve">String quartet</w:t>
+            </w:r>
+          </w:p>
+        </w:tc>
+        <w:tc>
+          <w:tcPr>
+            <w:tcW w:type="pct" w:w="2250%"/>
+          </w:tcPr>
+          <w:p>
+            <w:pPr>
+              <w:spacing w:after="60"/>
+            </w:pPr>
+            <w:r>
+              <w:t xml:space="preserve">Cello (`bass` family)</w:t>
+            </w:r>
+          </w:p>
+        </w:tc>
+        <w:tc>
+          <w:tcPr>
+            <w:tcW w:type="pct" w:w="2250%"/>
+          </w:tcPr>
+          <w:p>
+            <w:pPr>
+              <w:spacing w:after="60"/>
+            </w:pPr>
+            <w:r>
+              <w:rPr>
+                <w:b/>
+                <w:bCs/>
+              </w:rPr>
+              <w:t xml:space="preserve">0</w:t>
+            </w:r>
+          </w:p>
+        </w:tc>
+        <w:tc>
+          <w:tcPr>
+            <w:tcW w:type="pct" w:w="2250%"/>
+          </w:tcPr>
+          <w:p>
+            <w:pPr>
+              <w:spacing w:after="60"/>
+            </w:pPr>
+            <w:r>
+              <w:t xml:space="preserve">Shell / root motion</w:t>
+            </w:r>
+          </w:p>
+        </w:tc>
+      </w:tr>
+      <w:tr>
+        <w:tc>
+          <w:tcPr>
+            <w:tcW w:type="pct" w:w="2250%"/>
+          </w:tcPr>
+          <w:p>
+            <w:pPr>
+              <w:spacing w:after="60"/>
+            </w:pPr>
+            <w:r>
+              <w:t xml:space="preserve"> </w:t>
+            </w:r>
+          </w:p>
+        </w:tc>
+        <w:tc>
+          <w:tcPr>
+            <w:tcW w:type="pct" w:w="2250%"/>
+          </w:tcPr>
+          <w:p>
+            <w:pPr>
+              <w:spacing w:after="60"/>
+            </w:pPr>
+            <w:r>
+              <w:t xml:space="preserve">Viola (`inner-strings`)</w:t>
+            </w:r>
+          </w:p>
+        </w:tc>
+        <w:tc>
+          <w:tcPr>
+            <w:tcW w:type="pct" w:w="2250%"/>
+          </w:tcPr>
+          <w:p>
+            <w:pPr>
+              <w:spacing w:after="60"/>
+            </w:pPr>
+            <w:r>
+              <w:rPr>
+                <w:b/>
+                <w:bCs/>
+              </w:rPr>
+              <w:t xml:space="preserve">1</w:t>
+            </w:r>
+          </w:p>
+        </w:tc>
+        <w:tc>
+          <w:tcPr>
+            <w:tcW w:type="pct" w:w="2250%"/>
+          </w:tcPr>
+          <w:p>
+            <w:pPr>
+              <w:spacing w:after="60"/>
+            </w:pPr>
+            <w:r>
+              <w:t xml:space="preserve">Quadratonic anchor</w:t>
+            </w:r>
+          </w:p>
+        </w:tc>
+      </w:tr>
+      <w:tr>
+        <w:tc>
+          <w:tcPr>
+            <w:tcW w:type="pct" w:w="2250%"/>
+          </w:tcPr>
+          <w:p>
+            <w:pPr>
+              <w:spacing w:after="60"/>
+            </w:pPr>
+            <w:r>
+              <w:t xml:space="preserve"> </w:t>
+            </w:r>
+          </w:p>
+        </w:tc>
+        <w:tc>
+          <w:tcPr>
+            <w:tcW w:type="pct" w:w="2250%"/>
+          </w:tcPr>
+          <w:p>
+            <w:pPr>
+              <w:spacing w:after="60"/>
+            </w:pPr>
+            <w:r>
+              <w:t xml:space="preserve">Violin 2 (`upper-strings`)</w:t>
+            </w:r>
+          </w:p>
+        </w:tc>
+        <w:tc>
+          <w:tcPr>
+            <w:tcW w:type="pct" w:w="2250%"/>
+          </w:tcPr>
+          <w:p>
+            <w:pPr>
+              <w:spacing w:after="60"/>
+            </w:pPr>
+            <w:r>
+              <w:rPr>
+                <w:b/>
+                <w:bCs/>
+              </w:rPr>
+              <w:t xml:space="preserve">0–1</w:t>
+            </w:r>
+          </w:p>
+        </w:tc>
+        <w:tc>
+          <w:tcPr>
+            <w:tcW w:type="pct" w:w="2250%"/>
+          </w:tcPr>
+          <w:p>
+            <w:pPr>
+              <w:spacing w:after="60"/>
+            </w:pPr>
+            <w:r>
+              <w:t xml:space="preserve">Melodic triad / dyad fragments</w:t>
+            </w:r>
+          </w:p>
+        </w:tc>
+      </w:tr>
+      <w:tr>
+        <w:tc>
+          <w:tcPr>
+            <w:tcW w:type="pct" w:w="2250%"/>
+          </w:tcPr>
+          <w:p>
+            <w:pPr>
+              <w:spacing w:after="60"/>
+            </w:pPr>
+            <w:r>
+              <w:t xml:space="preserve"> </w:t>
+            </w:r>
+          </w:p>
+        </w:tc>
+        <w:tc>
+          <w:tcPr>
+            <w:tcW w:type="pct" w:w="2250%"/>
+          </w:tcPr>
+          <w:p>
+            <w:pPr>
+              <w:spacing w:after="60"/>
+            </w:pPr>
+            <w:r>
+              <w:t xml:space="preserve">Violin 1 (`upper-strings`)</w:t>
+            </w:r>
+          </w:p>
+        </w:tc>
+        <w:tc>
+          <w:tcPr>
+            <w:tcW w:type="pct" w:w="2250%"/>
+          </w:tcPr>
+          <w:p>
+            <w:pPr>
+              <w:spacing w:after="60"/>
+            </w:pPr>
+            <w:r>
+              <w:rPr>
+                <w:b/>
+                <w:bCs/>
+              </w:rPr>
+              <w:t xml:space="preserve">2</w:t>
+            </w:r>
+          </w:p>
+        </w:tc>
+        <w:tc>
+          <w:tcPr>
+            <w:tcW w:type="pct" w:w="2250%"/>
+          </w:tcPr>
+          <w:p>
+            <w:pPr>
+              <w:spacing w:after="60"/>
+            </w:pPr>
+            <w:r>
+              <w:t xml:space="preserve">Tension-layer melody / liquid-harmony colour</w:t>
+            </w:r>
+          </w:p>
+        </w:tc>
+      </w:tr>
+      <w:tr>
+        <w:tc>
+          <w:tcPr>
+            <w:tcW w:type="pct" w:w="2250%"/>
+          </w:tcPr>
+          <w:p>
+            <w:pPr>
+              <w:spacing w:after="60"/>
+            </w:pPr>
+            <w:r>
+              <w:rPr>
+                <w:b/>
+                <w:bCs/>
+              </w:rPr>
+              <w:t xml:space="preserve">Big band</w:t>
+            </w:r>
+          </w:p>
+        </w:tc>
+        <w:tc>
+          <w:tcPr>
+            <w:tcW w:type="pct" w:w="2250%"/>
+          </w:tcPr>
+          <w:p>
+            <w:pPr>
+              <w:spacing w:after="60"/>
+            </w:pPr>
+            <w:r>
+              <w:t xml:space="preserve">Bass</w:t>
+            </w:r>
+          </w:p>
+        </w:tc>
+        <w:tc>
+          <w:tcPr>
+            <w:tcW w:type="pct" w:w="2250%"/>
+          </w:tcPr>
+          <w:p>
+            <w:pPr>
+              <w:spacing w:after="60"/>
+            </w:pPr>
+            <w:r>
+              <w:rPr>
+                <w:b/>
+                <w:bCs/>
+              </w:rPr>
+              <w:t xml:space="preserve">0</w:t>
+            </w:r>
+          </w:p>
+        </w:tc>
+        <w:tc>
+          <w:tcPr>
+            <w:tcW w:type="pct" w:w="2250%"/>
+          </w:tcPr>
+          <w:p>
+            <w:pPr>
+              <w:spacing w:after="60"/>
+            </w:pPr>
+            <w:r>
+              <w:t xml:space="preserve">Shell</w:t>
+            </w:r>
+          </w:p>
+        </w:tc>
+      </w:tr>
+      <w:tr>
+        <w:tc>
+          <w:tcPr>
+            <w:tcW w:type="pct" w:w="2250%"/>
+          </w:tcPr>
+          <w:p>
+            <w:pPr>
+              <w:spacing w:after="60"/>
+            </w:pPr>
+            <w:r>
+              <w:t xml:space="preserve"> </w:t>
+            </w:r>
+          </w:p>
+        </w:tc>
+        <w:tc>
+          <w:tcPr>
+            <w:tcW w:type="pct" w:w="2250%"/>
+          </w:tcPr>
+          <w:p>
+            <w:pPr>
+              <w:spacing w:after="60"/>
+            </w:pPr>
+            <w:r>
+              <w:t xml:space="preserve">Trombone</w:t>
+            </w:r>
+          </w:p>
+        </w:tc>
+        <w:tc>
+          <w:tcPr>
+            <w:tcW w:type="pct" w:w="2250%"/>
+          </w:tcPr>
+          <w:p>
+            <w:pPr>
+              <w:spacing w:after="60"/>
+            </w:pPr>
+            <w:r>
+              <w:rPr>
+                <w:b/>
+                <w:bCs/>
+              </w:rPr>
+              <w:t xml:space="preserve">0–1</w:t>
+            </w:r>
+          </w:p>
+        </w:tc>
+        <w:tc>
+          <w:tcPr>
+            <w:tcW w:type="pct" w:w="2250%"/>
+          </w:tcPr>
+          <w:p>
+            <w:pPr>
+              <w:spacing w:after="60"/>
+            </w:pPr>
+            <w:r>
+              <w:t xml:space="preserve">Shell + liquid inner movement</w:t>
+            </w:r>
+          </w:p>
+        </w:tc>
+      </w:tr>
+      <w:tr>
+        <w:tc>
+          <w:tcPr>
+            <w:tcW w:type="pct" w:w="2250%"/>
+          </w:tcPr>
+          <w:p>
+            <w:pPr>
+              <w:spacing w:after="60"/>
+            </w:pPr>
+            <w:r>
+              <w:t xml:space="preserve"> </w:t>
+            </w:r>
+          </w:p>
+        </w:tc>
+        <w:tc>
+          <w:tcPr>
+            <w:tcW w:type="pct" w:w="2250%"/>
+          </w:tcPr>
+          <w:p>
+            <w:pPr>
+              <w:spacing w:after="60"/>
+            </w:pPr>
+            <w:r>
+              <w:t xml:space="preserve">Saxophone</w:t>
+            </w:r>
+          </w:p>
+        </w:tc>
+        <w:tc>
+          <w:tcPr>
+            <w:tcW w:type="pct" w:w="2250%"/>
+          </w:tcPr>
+          <w:p>
+            <w:pPr>
+              <w:spacing w:after="60"/>
+            </w:pPr>
+            <w:r>
+              <w:rPr>
+                <w:b/>
+                <w:bCs/>
+              </w:rPr>
+              <w:t xml:space="preserve">1–2</w:t>
+            </w:r>
+          </w:p>
+        </w:tc>
+        <w:tc>
+          <w:tcPr>
+            <w:tcW w:type="pct" w:w="2250%"/>
+          </w:tcPr>
+          <w:p>
+            <w:pPr>
+              <w:spacing w:after="60"/>
+            </w:pPr>
+            <w:r>
+              <w:t xml:space="preserve">Triad-pair runs / quadratonic counterlines</w:t>
+            </w:r>
+          </w:p>
+        </w:tc>
+      </w:tr>
+      <w:tr>
+        <w:tc>
+          <w:tcPr>
+            <w:tcW w:type="pct" w:w="2250%"/>
+          </w:tcPr>
+          <w:p>
+            <w:pPr>
+              <w:spacing w:after="60"/>
+            </w:pPr>
+            <w:r>
+              <w:t xml:space="preserve"> </w:t>
+            </w:r>
+          </w:p>
+        </w:tc>
+        <w:tc>
+          <w:tcPr>
+            <w:tcW w:type="pct" w:w="2250%"/>
+          </w:tcPr>
+          <w:p>
+            <w:pPr>
+              <w:spacing w:after="60"/>
+            </w:pPr>
+            <w:r>
+              <w:t xml:space="preserve">Trumpet</w:t>
+            </w:r>
+          </w:p>
+        </w:tc>
+        <w:tc>
+          <w:tcPr>
+            <w:tcW w:type="pct" w:w="2250%"/>
+          </w:tcPr>
+          <w:p>
+            <w:pPr>
+              <w:spacing w:after="60"/>
+            </w:pPr>
+            <w:r>
+              <w:rPr>
+                <w:b/>
+                <w:bCs/>
+              </w:rPr>
+              <w:t xml:space="preserve">2</w:t>
+            </w:r>
+          </w:p>
+        </w:tc>
+        <w:tc>
+          <w:tcPr>
+            <w:tcW w:type="pct" w:w="2250%"/>
+          </w:tcPr>
+          <w:p>
+            <w:pPr>
+              <w:spacing w:after="60"/>
+            </w:pPr>
+            <w:r>
+              <w:t xml:space="preserve">Tension-quadratonic punctures (strong-beat weight)</w:t>
+            </w:r>
+          </w:p>
+        </w:tc>
+      </w:tr>
+      <w:tr>
+        <w:tc>
+          <w:tcPr>
+            <w:tcW w:type="pct" w:w="2250%"/>
+          </w:tcPr>
+          <w:p>
+            <w:pPr>
+              <w:spacing w:after="60"/>
+            </w:pPr>
+            <w:r>
+              <w:t xml:space="preserve"> </w:t>
+            </w:r>
+          </w:p>
+        </w:tc>
+        <w:tc>
+          <w:tcPr>
+            <w:tcW w:type="pct" w:w="2250%"/>
+          </w:tcPr>
+          <w:p>
+            <w:pPr>
+              <w:spacing w:after="60"/>
+            </w:pPr>
+            <w:r>
+              <w:t xml:space="preserve">Guitar / Piano</w:t>
+            </w:r>
+          </w:p>
+        </w:tc>
+        <w:tc>
+          <w:tcPr>
+            <w:tcW w:type="pct" w:w="2250%"/>
+          </w:tcPr>
+          <w:p>
+            <w:pPr>
+              <w:spacing w:after="60"/>
+            </w:pPr>
+            <w:r>
+              <w:rPr>
+                <w:b/>
+                <w:bCs/>
+              </w:rPr>
+              <w:t xml:space="preserve">1</w:t>
+            </w:r>
+          </w:p>
+        </w:tc>
+        <w:tc>
+          <w:tcPr>
+            <w:tcW w:type="pct" w:w="2250%"/>
+          </w:tcPr>
+          <w:p>
+            <w:pPr>
+              <w:spacing w:after="60"/>
+            </w:pPr>
+            <w:r>
+              <w:t xml:space="preserve">Three-note quadratonic voicings / comp cells</w:t>
+            </w:r>
+          </w:p>
+        </w:tc>
+      </w:tr>
+    </w:tbl>
+    <w:p>
+      <w:pPr>
+        <w:spacing w:after="160"/>
+      </w:pPr>
+    </w:p>
+    <w:p>
+      <w:pPr>
+        <w:spacing w:after="160"/>
+      </w:pPr>
+      <w:r>
+        <w:rPr>
+          <w:b/>
+          <w:bCs/>
+        </w:rPr>
+        <w:t xml:space="preserve">`MotifTransformer`</w:t>
+      </w:r>
+      <w:r>
+        <w:t xml:space="preserve"> — </w:t>
+      </w:r>
+      <w:r>
+        <w:rPr>
+          <w:b/>
+          <w:bCs/>
+        </w:rPr>
+        <w:t xml:space="preserve">`transformMotifThroughLayers(motif, chordTypeId, rootPc)`</w:t>
+      </w:r>
+      <w:r>
+        <w:t xml:space="preserve"> returns </w:t>
+      </w:r>
+      <w:r>
+        <w:rPr>
+          <w:b/>
+          <w:bCs/>
+        </w:rPr>
+        <w:t xml:space="preserve">`Record&lt;TensionState, MotifNote[]&gt;`</w:t>
+      </w:r>
+      <w:r>
+        <w:t xml:space="preserve"> (`TensionState` from </w:t>
+      </w:r>
+      <w:r>
+        <w:rPr>
+          <w:b/>
+          <w:bCs/>
+        </w:rPr>
+        <w:t xml:space="preserve">`layerStateMachine`</w:t>
+      </w:r>
+      <w:r>
+        <w:t xml:space="preserve">). </w:t>
+      </w:r>
+      <w:r>
+        <w:rPr>
+          <w:b/>
+          <w:bCs/>
+        </w:rPr>
+        <w:t xml:space="preserve">Rhythm preserved</w:t>
+      </w:r>
+      <w:r>
+        <w:t xml:space="preserve"> (`beatPosition`, </w:t>
+      </w:r>
+      <w:r>
+        <w:rPr>
+          <w:b/>
+          <w:bCs/>
+        </w:rPr>
+        <w:t xml:space="preserve">`duration`</w:t>
+      </w:r>
+      <w:r>
+        <w:t xml:space="preserve">) for every state; only </w:t>
+      </w:r>
+      <w:r>
+        <w:rPr>
+          <w:b/>
+          <w:bCs/>
+        </w:rPr>
+        <w:t xml:space="preserve">pitch classes</w:t>
+      </w:r>
+      <w:r>
+        <w:t xml:space="preserve"> re-quantise: </w:t>
+      </w:r>
+      <w:r>
+        <w:rPr>
+          <w:b/>
+          <w:bCs/>
+        </w:rPr>
+        <w:t xml:space="preserve">`resolve`</w:t>
+      </w:r>
+      <w:r>
+        <w:t xml:space="preserve"> → </w:t>
+      </w:r>
+      <w:r>
+        <w:rPr>
+          <w:b/>
+          <w:bCs/>
+        </w:rPr>
+        <w:t xml:space="preserve">melodic triad</w:t>
+      </w:r>
+      <w:r>
+        <w:t xml:space="preserve"> PCs · </w:t>
+      </w:r>
+      <w:r>
+        <w:rPr>
+          <w:b/>
+          <w:bCs/>
+        </w:rPr>
+        <w:t xml:space="preserve">`primary`</w:t>
+      </w:r>
+      <w:r>
+        <w:t xml:space="preserve"> → </w:t>
+      </w:r>
+      <w:r>
+        <w:rPr>
+          <w:b/>
+          <w:bCs/>
+        </w:rPr>
+        <w:t xml:space="preserve">quadratonic</w:t>
+      </w:r>
+      <w:r>
+        <w:t xml:space="preserve"> set · </w:t>
+      </w:r>
+      <w:r>
+        <w:rPr>
+          <w:b/>
+          <w:bCs/>
+        </w:rPr>
+        <w:t xml:space="preserve">`tension`</w:t>
+      </w:r>
+      <w:r>
+        <w:t xml:space="preserve"> → </w:t>
+      </w:r>
+      <w:r>
+        <w:rPr>
+          <w:b/>
+          <w:bCs/>
+        </w:rPr>
+        <w:t xml:space="preserve">secondary tension</w:t>
+      </w:r>
+      <w:r>
+        <w:t xml:space="preserve"> PCs (fallback: quadratonic) · </w:t>
+      </w:r>
+      <w:r>
+        <w:rPr>
+          <w:b/>
+          <w:bCs/>
+        </w:rPr>
+        <w:t xml:space="preserve">`chaos`</w:t>
+      </w:r>
+      <w:r>
+        <w:t xml:space="preserve"> → </w:t>
+      </w:r>
+      <w:r>
+        <w:rPr>
+          <w:b/>
+          <w:bCs/>
+        </w:rPr>
+        <w:t xml:space="preserve">triad-pair / quadratonic</w:t>
+      </w:r>
+      <w:r>
+        <w:t xml:space="preserve"> pool · </w:t>
+      </w:r>
+      <w:r>
+        <w:rPr>
+          <w:b/>
+          <w:bCs/>
+        </w:rPr>
+        <w:t xml:space="preserve">`recover`</w:t>
+      </w:r>
+      <w:r>
+        <w:t xml:space="preserve"> → </w:t>
+      </w:r>
+      <w:r>
+        <w:rPr>
+          <w:b/>
+          <w:bCs/>
+        </w:rPr>
+        <w:t xml:space="preserve">melodic triad</w:t>
+      </w:r>
+      <w:r>
+        <w:t xml:space="preserve"> with </w:t>
+      </w:r>
+      <w:r>
+        <w:rPr>
+          <w:b/>
+          <w:bCs/>
+        </w:rPr>
+        <w:t xml:space="preserve">chromatic lead-in</w:t>
+      </w:r>
+      <w:r>
+        <w:t xml:space="preserve"> on alternating indices (`triad` vs `triad − 1` semitone).</w:t>
+      </w:r>
+    </w:p>
+    <w:p>
+      <w:pPr>
+        <w:pStyle w:val="Heading2"/>
+        <w:spacing w:after="100" w:before="160"/>
+      </w:pPr>
+      <w:r>
         <w:t xml:space="preserve">Planned builds (engine)</w:t>
       </w:r>
     </w:p>
@@ -28251,7 +29223,7 @@
           <w:b/>
           <w:bCs/>
         </w:rPr>
-        <w:t xml:space="preserve">Build E — Arrangement layer router:</w:t>
+        <w:t xml:space="preserve">Build E + F — Arrangement layer router + motif transformation:</w:t>
       </w:r>
       <w:r>
         <w:t xml:space="preserve"> </w:t>
@@ -28261,180 +29233,20 @@
           <w:b/>
           <w:bCs/>
         </w:rPr>
-        <w:t xml:space="preserve">`ArrangementLayerRouter`</w:t>
-      </w:r>
-      <w:r>
-        <w:t xml:space="preserve"> maps vault roles to ensemble parts. </w:t>
-      </w:r>
-      <w:r>
-        <w:rPr>
-          <w:b/>
-          <w:bCs/>
-        </w:rPr>
-        <w:t xml:space="preserve">String quartet:</w:t>
-      </w:r>
-      <w:r>
-        <w:t xml:space="preserve"> </w:t>
-      </w:r>
-      <w:r>
-        <w:rPr>
-          <w:b/>
-          <w:bCs/>
-        </w:rPr>
-        <w:t xml:space="preserve">cello</w:t>
-      </w:r>
-      <w:r>
-        <w:t xml:space="preserve"> = shell / foundation; </w:t>
-      </w:r>
-      <w:r>
-        <w:rPr>
-          <w:b/>
-          <w:bCs/>
-        </w:rPr>
-        <w:t xml:space="preserve">viola</w:t>
-      </w:r>
-      <w:r>
-        <w:t xml:space="preserve"> = </w:t>
-      </w:r>
-      <w:r>
-        <w:rPr>
-          <w:b/>
-          <w:bCs/>
-        </w:rPr>
-        <w:t xml:space="preserve">quadratonic anchor</w:t>
-      </w:r>
-      <w:r>
-        <w:t xml:space="preserve">; </w:t>
-      </w:r>
-      <w:r>
-        <w:rPr>
-          <w:b/>
-          <w:bCs/>
-        </w:rPr>
-        <w:t xml:space="preserve">violin 2</w:t>
-      </w:r>
-      <w:r>
-        <w:t xml:space="preserve"> = </w:t>
-      </w:r>
-      <w:r>
-        <w:rPr>
-          <w:b/>
-          <w:bCs/>
-        </w:rPr>
-        <w:t xml:space="preserve">melodic triad</w:t>
-      </w:r>
-      <w:r>
-        <w:t xml:space="preserve"> line; </w:t>
-      </w:r>
-      <w:r>
-        <w:rPr>
-          <w:b/>
-          <w:bCs/>
-        </w:rPr>
-        <w:t xml:space="preserve">violin 1</w:t>
-      </w:r>
-      <w:r>
-        <w:t xml:space="preserve"> = </w:t>
-      </w:r>
-      <w:r>
-        <w:rPr>
-          <w:b/>
-          <w:bCs/>
-        </w:rPr>
-        <w:t xml:space="preserve">tension</w:t>
-      </w:r>
-      <w:r>
-        <w:t xml:space="preserve"> melody. </w:t>
-      </w:r>
-      <w:r>
-        <w:rPr>
-          <w:b/>
-          <w:bCs/>
-        </w:rPr>
-        <w:t xml:space="preserve">Big band:</w:t>
-      </w:r>
-      <w:r>
-        <w:t xml:space="preserve"> </w:t>
-      </w:r>
-      <w:r>
-        <w:rPr>
-          <w:b/>
-          <w:bCs/>
-        </w:rPr>
-        <w:t xml:space="preserve">saxes</w:t>
-      </w:r>
-      <w:r>
-        <w:t xml:space="preserve"> = </w:t>
-      </w:r>
-      <w:r>
-        <w:rPr>
-          <w:b/>
-          <w:bCs/>
-        </w:rPr>
-        <w:t xml:space="preserve">triad-pair</w:t>
-      </w:r>
-      <w:r>
-        <w:t xml:space="preserve"> runs; </w:t>
-      </w:r>
-      <w:r>
-        <w:rPr>
-          <w:b/>
-          <w:bCs/>
-        </w:rPr>
-        <w:t xml:space="preserve">trombones</w:t>
-      </w:r>
-      <w:r>
-        <w:t xml:space="preserve"> = </w:t>
-      </w:r>
-      <w:r>
-        <w:rPr>
-          <w:b/>
-          <w:bCs/>
-        </w:rPr>
-        <w:t xml:space="preserve">shell + liquid</w:t>
-      </w:r>
-      <w:r>
-        <w:t xml:space="preserve"> inner motion; </w:t>
-      </w:r>
-      <w:r>
-        <w:rPr>
-          <w:b/>
-          <w:bCs/>
-        </w:rPr>
-        <w:t xml:space="preserve">trumpets</w:t>
-      </w:r>
-      <w:r>
-        <w:t xml:space="preserve"> = </w:t>
-      </w:r>
-      <w:r>
-        <w:rPr>
-          <w:b/>
-          <w:bCs/>
-        </w:rPr>
-        <w:t xml:space="preserve">tension punctures</w:t>
-      </w:r>
-      <w:r>
-        <w:t xml:space="preserve">; </w:t>
-      </w:r>
-      <w:r>
-        <w:rPr>
-          <w:b/>
-          <w:bCs/>
-        </w:rPr>
-        <w:t xml:space="preserve">guitar / piano</w:t>
-      </w:r>
-      <w:r>
-        <w:t xml:space="preserve"> = compact </w:t>
-      </w:r>
-      <w:r>
-        <w:rPr>
-          <w:b/>
-          <w:bCs/>
-        </w:rPr>
-        <w:t xml:space="preserve">3-note quadratonic</w:t>
-      </w:r>
-      <w:r>
-        <w:t xml:space="preserve"> voicings (guitar-friendly).</w:t>
+        <w:t xml:space="preserve">Complete</w:t>
+      </w:r>
+      <w:r>
+        <w:t xml:space="preserve"> (see </w:t>
+      </w:r>
+      <w:r>
+        <w:rPr>
+          <w:b/>
+          <w:bCs/>
+        </w:rPr>
+        <w:t xml:space="preserve">Build E+F</w:t>
+      </w:r>
+      <w:r>
+        <w:t xml:space="preserve"> subsection above).</w:t>
       </w:r>
     </w:p>
     <w:p>
@@ -28450,30 +29262,70 @@
           <w:b/>
           <w:bCs/>
         </w:rPr>
-        <w:t xml:space="preserve">Build F — Motif transformation:</w:t>
-      </w:r>
-      <w:r>
-        <w:t xml:space="preserve"> Restate motifs through </w:t>
-      </w:r>
-      <w:r>
-        <w:rPr>
-          <w:b/>
-          <w:bCs/>
-        </w:rPr>
-        <w:t xml:space="preserve">successive layers</w:t>
-      </w:r>
-      <w:r>
-        <w:t xml:space="preserve"> — </w:t>
-      </w:r>
-      <w:r>
-        <w:rPr>
-          <w:b/>
-          <w:bCs/>
-        </w:rPr>
-        <w:t xml:space="preserve">triad → quadratonic → triad pair → liquid voicings → resolve</w:t>
-      </w:r>
-      <w:r>
-        <w:t xml:space="preserve"> — with deterministic transforms for teaching and recall.</w:t>
+        <w:t xml:space="preserve">Build G — Full 16-tonality per-chord rulesets:</w:t>
+      </w:r>
+      <w:r>
+        <w:t xml:space="preserve"> One complete behaviour pack per Tonality Vault chord type: </w:t>
+      </w:r>
+      <w:r>
+        <w:rPr>
+          <w:b/>
+          <w:bCs/>
+        </w:rPr>
+        <w:t xml:space="preserve">melodic triad</w:t>
+      </w:r>
+      <w:r>
+        <w:t xml:space="preserve">, </w:t>
+      </w:r>
+      <w:r>
+        <w:rPr>
+          <w:b/>
+          <w:bCs/>
+        </w:rPr>
+        <w:t xml:space="preserve">quadratonic</w:t>
+      </w:r>
+      <w:r>
+        <w:t xml:space="preserve">, </w:t>
+      </w:r>
+      <w:r>
+        <w:rPr>
+          <w:b/>
+          <w:bCs/>
+        </w:rPr>
+        <w:t xml:space="preserve">tension hierarchy</w:t>
+      </w:r>
+      <w:r>
+        <w:t xml:space="preserve">, phrase templates, </w:t>
+      </w:r>
+      <w:r>
+        <w:rPr>
+          <w:b/>
+          <w:bCs/>
+        </w:rPr>
+        <w:t xml:space="preserve">beat affinity</w:t>
+      </w:r>
+      <w:r>
+        <w:t xml:space="preserve">, </w:t>
+      </w:r>
+      <w:r>
+        <w:rPr>
+          <w:b/>
+          <w:bCs/>
+        </w:rPr>
+        <w:t xml:space="preserve">guitar grips</w:t>
+      </w:r>
+      <w:r>
+        <w:t xml:space="preserve">, </w:t>
+      </w:r>
+      <w:r>
+        <w:rPr>
+          <w:b/>
+          <w:bCs/>
+        </w:rPr>
+        <w:t xml:space="preserve">reharm</w:t>
+      </w:r>
+      <w:r>
+        <w:t xml:space="preserve"> candidates.</w:t>
       </w:r>
     </w:p>
     <w:p>
@@ -28489,70 +29341,80 @@
           <w:b/>
           <w:bCs/>
         </w:rPr>
-        <w:t xml:space="preserve">Build G — Full 16-tonality per-chord rulesets:</w:t>
-      </w:r>
-      <w:r>
-        <w:t xml:space="preserve"> One complete behaviour pack per Tonality Vault chord type: </w:t>
-      </w:r>
-      <w:r>
-        <w:rPr>
-          <w:b/>
-          <w:bCs/>
-        </w:rPr>
-        <w:t xml:space="preserve">melodic triad</w:t>
-      </w:r>
-      <w:r>
-        <w:t xml:space="preserve">, </w:t>
-      </w:r>
-      <w:r>
-        <w:rPr>
-          <w:b/>
-          <w:bCs/>
-        </w:rPr>
-        <w:t xml:space="preserve">quadratonic</w:t>
-      </w:r>
-      <w:r>
-        <w:t xml:space="preserve">, </w:t>
-      </w:r>
-      <w:r>
-        <w:rPr>
-          <w:b/>
-          <w:bCs/>
-        </w:rPr>
-        <w:t xml:space="preserve">tension hierarchy</w:t>
-      </w:r>
-      <w:r>
-        <w:t xml:space="preserve">, phrase templates, </w:t>
-      </w:r>
-      <w:r>
-        <w:rPr>
-          <w:b/>
-          <w:bCs/>
-        </w:rPr>
-        <w:t xml:space="preserve">beat affinity</w:t>
-      </w:r>
-      <w:r>
-        <w:t xml:space="preserve">, </w:t>
-      </w:r>
-      <w:r>
-        <w:rPr>
-          <w:b/>
-          <w:bCs/>
-        </w:rPr>
-        <w:t xml:space="preserve">guitar grips</w:t>
-      </w:r>
-      <w:r>
-        <w:t xml:space="preserve">, </w:t>
-      </w:r>
-      <w:r>
-        <w:rPr>
-          <w:b/>
-          <w:bCs/>
-        </w:rPr>
-        <w:t xml:space="preserve">reharm</w:t>
-      </w:r>
-      <w:r>
-        <w:t xml:space="preserve"> candidates.</w:t>
+        <w:t xml:space="preserve">Build C2 — Alt tuning extension:</w:t>
+      </w:r>
+      <w:r>
+        <w:t xml:space="preserve"> </w:t>
+      </w:r>
+      <w:r>
+        <w:rPr>
+          <w:b/>
+          <w:bCs/>
+        </w:rPr>
+        <w:t xml:space="preserve">Sonic Youth</w:t>
+      </w:r>
+      <w:r>
+        <w:t xml:space="preserve"> and </w:t>
+      </w:r>
+      <w:r>
+        <w:rPr>
+          <w:b/>
+          <w:bCs/>
+        </w:rPr>
+        <w:t xml:space="preserve">Joni Mitchell</w:t>
+      </w:r>
+      <w:r>
+        <w:t xml:space="preserve"> (and related) </w:t>
+      </w:r>
+      <w:r>
+        <w:rPr>
+          <w:b/>
+          <w:bCs/>
+        </w:rPr>
+        <w:t xml:space="preserve">altered-tuning presets</w:t>
+      </w:r>
+      <w:r>
+        <w:t xml:space="preserve"> already live in </w:t>
+      </w:r>
+      <w:r>
+        <w:rPr>
+          <w:b/>
+          <w:bCs/>
+        </w:rPr>
+        <w:t xml:space="preserve">`alternateGuitarTunings.ts`</w:t>
+      </w:r>
+      <w:r>
+        <w:t xml:space="preserve">; this build </w:t>
+      </w:r>
+      <w:r>
+        <w:rPr>
+          <w:b/>
+          <w:bCs/>
+        </w:rPr>
+        <w:t xml:space="preserve">recomputes fret positions</w:t>
+      </w:r>
+      <w:r>
+        <w:t xml:space="preserve"> from each preset’s </w:t>
+      </w:r>
+      <w:r>
+        <w:rPr>
+          <w:b/>
+          <w:bCs/>
+        </w:rPr>
+        <w:t xml:space="preserve">six string pitches</w:t>
+      </w:r>
+      <w:r>
+        <w:t xml:space="preserve"> so </w:t>
+      </w:r>
+      <w:r>
+        <w:rPr>
+          <w:b/>
+          <w:bCs/>
+        </w:rPr>
+        <w:t xml:space="preserve">`buildGuitarGripLibrary` / `generateVaultRiff`</w:t>
+      </w:r>
+      <w:r>
+        <w:t xml:space="preserve"> match the user’s tuning in the field, not E-standard only.</w:t>
       </w:r>
     </w:p>
     <w:p>
@@ -28568,7 +29430,7 @@
           <w:b/>
           <w:bCs/>
         </w:rPr>
-        <w:t xml:space="preserve">Build C2 — Alt tuning extension:</w:t>
+        <w:t xml:space="preserve">Build UI — Visual fretboard (deferred):</w:t>
       </w:r>
       <w:r>
         <w:t xml:space="preserve"> </w:t>
@@ -28578,70 +29440,50 @@
           <w:b/>
           <w:bCs/>
         </w:rPr>
-        <w:t xml:space="preserve">Sonic Youth</w:t>
-      </w:r>
-      <w:r>
-        <w:t xml:space="preserve"> and </w:t>
-      </w:r>
-      <w:r>
-        <w:rPr>
-          <w:b/>
-          <w:bCs/>
-        </w:rPr>
-        <w:t xml:space="preserve">Joni Mitchell</w:t>
-      </w:r>
-      <w:r>
-        <w:t xml:space="preserve"> (and related) </w:t>
-      </w:r>
-      <w:r>
-        <w:rPr>
-          <w:b/>
-          <w:bCs/>
-        </w:rPr>
-        <w:t xml:space="preserve">altered-tuning presets</w:t>
-      </w:r>
-      <w:r>
-        <w:t xml:space="preserve"> already live in </w:t>
-      </w:r>
-      <w:r>
-        <w:rPr>
-          <w:b/>
-          <w:bCs/>
-        </w:rPr>
-        <w:t xml:space="preserve">`alternateGuitarTunings.ts`</w:t>
-      </w:r>
-      <w:r>
-        <w:t xml:space="preserve">; this build </w:t>
-      </w:r>
-      <w:r>
-        <w:rPr>
-          <w:b/>
-          <w:bCs/>
-        </w:rPr>
-        <w:t xml:space="preserve">recomputes fret positions</w:t>
-      </w:r>
-      <w:r>
-        <w:t xml:space="preserve"> from each preset’s </w:t>
-      </w:r>
-      <w:r>
-        <w:rPr>
-          <w:b/>
-          <w:bCs/>
-        </w:rPr>
-        <w:t xml:space="preserve">six string pitches</w:t>
-      </w:r>
-      <w:r>
-        <w:t xml:space="preserve"> so </w:t>
-      </w:r>
-      <w:r>
-        <w:rPr>
-          <w:b/>
-          <w:bCs/>
-        </w:rPr>
-        <w:t xml:space="preserve">`buildGuitarGripLibrary` / `generateVaultRiff`</w:t>
-      </w:r>
-      <w:r>
-        <w:t xml:space="preserve"> match the user’s tuning in the field, not E-standard only.</w:t>
+        <w:t xml:space="preserve">fretboard.js</w:t>
+      </w:r>
+      <w:r>
+        <w:t xml:space="preserve"> + </w:t>
+      </w:r>
+      <w:r>
+        <w:rPr>
+          <w:b/>
+          <w:bCs/>
+        </w:rPr>
+        <w:t xml:space="preserve">VexFlow</w:t>
+      </w:r>
+      <w:r>
+        <w:t xml:space="preserve">, </w:t>
+      </w:r>
+      <w:r>
+        <w:rPr>
+          <w:b/>
+          <w:bCs/>
+        </w:rPr>
+        <w:t xml:space="preserve">three SVG layers</w:t>
+      </w:r>
+      <w:r>
+        <w:t xml:space="preserve"> (grid, active grip, legality heat). </w:t>
+      </w:r>
+      <w:r>
+        <w:rPr>
+          <w:b/>
+          <w:bCs/>
+        </w:rPr>
+        <w:t xml:space="preserve">Deferred</w:t>
+      </w:r>
+      <w:r>
+        <w:t xml:space="preserve"> until the </w:t>
+      </w:r>
+      <w:r>
+        <w:rPr>
+          <w:b/>
+          <w:bCs/>
+        </w:rPr>
+        <w:t xml:space="preserve">engine</w:t>
+      </w:r>
+      <w:r>
+        <w:t xml:space="preserve"> paths above are stable in production.</w:t>
       </w:r>
     </w:p>
     <w:p>
@@ -28657,60 +29499,20 @@
           <w:b/>
           <w:bCs/>
         </w:rPr>
-        <w:t xml:space="preserve">Build UI — Visual fretboard (deferred):</w:t>
-      </w:r>
-      <w:r>
-        <w:t xml:space="preserve"> </w:t>
-      </w:r>
-      <w:r>
-        <w:rPr>
-          <w:b/>
-          <w:bCs/>
-        </w:rPr>
-        <w:t xml:space="preserve">fretboard.js</w:t>
-      </w:r>
-      <w:r>
-        <w:t xml:space="preserve"> + </w:t>
-      </w:r>
-      <w:r>
-        <w:rPr>
-          <w:b/>
-          <w:bCs/>
-        </w:rPr>
-        <w:t xml:space="preserve">VexFlow</w:t>
-      </w:r>
-      <w:r>
-        <w:t xml:space="preserve">, </w:t>
-      </w:r>
-      <w:r>
-        <w:rPr>
-          <w:b/>
-          <w:bCs/>
-        </w:rPr>
-        <w:t xml:space="preserve">three SVG layers</w:t>
-      </w:r>
-      <w:r>
-        <w:t xml:space="preserve"> (grid, active grip, legality heat). </w:t>
-      </w:r>
-      <w:r>
-        <w:rPr>
-          <w:b/>
-          <w:bCs/>
-        </w:rPr>
-        <w:t xml:space="preserve">Deferred</w:t>
-      </w:r>
-      <w:r>
-        <w:t xml:space="preserve"> until the </w:t>
-      </w:r>
-      <w:r>
-        <w:rPr>
-          <w:b/>
-          <w:bCs/>
-        </w:rPr>
-        <w:t xml:space="preserve">engine</w:t>
-      </w:r>
-      <w:r>
-        <w:t xml:space="preserve"> paths above are stable in production.</w:t>
+        <w:t xml:space="preserve">Build IMG — iReal Pro import + optional vision:</w:t>
+      </w:r>
+      <w:r>
+        <w:t xml:space="preserve"> See </w:t>
+      </w:r>
+      <w:r>
+        <w:rPr>
+          <w:b/>
+          <w:bCs/>
+        </w:rPr>
+        <w:t xml:space="preserve">Build IMG — iReal Pro import</w:t>
+      </w:r>
+      <w:r>
+        <w:t xml:space="preserve"> below (data pipeline + optional screenshot path).</w:t>
       </w:r>
     </w:p>
     <w:p>
@@ -28726,20 +29528,130 @@
           <w:b/>
           <w:bCs/>
         </w:rPr>
-        <w:t xml:space="preserve">Build IMG — iReal Pro import + optional vision:</w:t>
-      </w:r>
-      <w:r>
-        <w:t xml:space="preserve"> See </w:t>
-      </w:r>
-      <w:r>
-        <w:rPr>
-          <w:b/>
-          <w:bCs/>
-        </w:rPr>
-        <w:t xml:space="preserve">Build IMG — iReal Pro import</w:t>
-      </w:r>
-      <w:r>
-        <w:t xml:space="preserve"> below (data pipeline + optional screenshot path).</w:t>
+        <w:t xml:space="preserve">Build H — GCE-targeted generation (planned):</w:t>
+      </w:r>
+      <w:r>
+        <w:t xml:space="preserve"> After generation, evaluate against </w:t>
+      </w:r>
+      <w:r>
+        <w:rPr>
+          <w:b/>
+          <w:bCs/>
+        </w:rPr>
+        <w:t xml:space="preserve">GCE</w:t>
+      </w:r>
+      <w:r>
+        <w:t xml:space="preserve"> + </w:t>
+      </w:r>
+      <w:r>
+        <w:rPr>
+          <w:b/>
+          <w:bCs/>
+        </w:rPr>
+        <w:t xml:space="preserve">LOCK</w:t>
+      </w:r>
+      <w:r>
+        <w:t xml:space="preserve"> + </w:t>
+      </w:r>
+      <w:r>
+        <w:rPr>
+          <w:b/>
+          <w:bCs/>
+        </w:rPr>
+        <w:t xml:space="preserve">Style Profile</w:t>
+      </w:r>
+      <w:r>
+        <w:t xml:space="preserve"> + </w:t>
+      </w:r>
+      <w:r>
+        <w:rPr>
+          <w:b/>
+          <w:bCs/>
+        </w:rPr>
+        <w:t xml:space="preserve">Quadratonic Alignment</w:t>
+      </w:r>
+      <w:r>
+        <w:t xml:space="preserve">. If below </w:t>
+      </w:r>
+      <w:r>
+        <w:rPr>
+          <w:b/>
+          <w:bCs/>
+        </w:rPr>
+        <w:t xml:space="preserve">`minScore`</w:t>
+      </w:r>
+      <w:r>
+        <w:t xml:space="preserve"> (default </w:t>
+      </w:r>
+      <w:r>
+        <w:rPr>
+          <w:b/>
+          <w:bCs/>
+        </w:rPr>
+        <w:t xml:space="preserve">8.5</w:t>
+      </w:r>
+      <w:r>
+        <w:t xml:space="preserve">), run </w:t>
+      </w:r>
+      <w:r>
+        <w:rPr>
+          <w:b/>
+          <w:bCs/>
+        </w:rPr>
+        <w:t xml:space="preserve">one</w:t>
+      </w:r>
+      <w:r>
+        <w:t xml:space="preserve"> refinement pass and re-evaluate. </w:t>
+      </w:r>
+      <w:r>
+        <w:rPr>
+          <w:b/>
+          <w:bCs/>
+        </w:rPr>
+        <w:t xml:space="preserve">Maximum one</w:t>
+      </w:r>
+      <w:r>
+        <w:t xml:space="preserve"> refinement loop per </w:t>
+      </w:r>
+      <w:r>
+        <w:rPr>
+          <w:b/>
+          <w:bCs/>
+        </w:rPr>
+        <w:t xml:space="preserve">DCR</w:t>
+      </w:r>
+      <w:r>
+        <w:t xml:space="preserve"> protocol — output is </w:t>
+      </w:r>
+      <w:r>
+        <w:rPr>
+          <w:b/>
+          <w:bCs/>
+        </w:rPr>
+        <w:t xml:space="preserve">quality-gated</w:t>
+      </w:r>
+      <w:r>
+        <w:t xml:space="preserve">, not infinitely regenerated. Aim: </w:t>
+      </w:r>
+      <w:r>
+        <w:rPr>
+          <w:b/>
+          <w:bCs/>
+        </w:rPr>
+        <w:t xml:space="preserve">GCE 9+</w:t>
+      </w:r>
+      <w:r>
+        <w:t xml:space="preserve">-grade material by </w:t>
+      </w:r>
+      <w:r>
+        <w:rPr>
+          <w:b/>
+          <w:bCs/>
+        </w:rPr>
+        <w:t xml:space="preserve">examining before shipping</w:t>
+      </w:r>
+      <w:r>
+        <w:t xml:space="preserve">.</w:t>
       </w:r>
     </w:p>
     <w:p>
@@ -29848,34 +30760,14 @@
         <w:t xml:space="preserve">A</w:t>
       </w:r>
       <w:r>
-        <w:t xml:space="preserve">, </w:t>
-      </w:r>
-      <w:r>
-        <w:rPr>
-          <w:b/>
-          <w:bCs/>
-        </w:rPr>
-        <w:t xml:space="preserve">B</w:t>
-      </w:r>
-      <w:r>
-        <w:t xml:space="preserve">, </w:t>
-      </w:r>
-      <w:r>
-        <w:rPr>
-          <w:b/>
-          <w:bCs/>
-        </w:rPr>
-        <w:t xml:space="preserve">C</w:t>
-      </w:r>
-      <w:r>
-        <w:t xml:space="preserve">, and </w:t>
-      </w:r>
-      <w:r>
-        <w:rPr>
-          <w:b/>
-          <w:bCs/>
-        </w:rPr>
-        <w:t xml:space="preserve">D</w:t>
+        <w:t xml:space="preserve"> through </w:t>
+      </w:r>
+      <w:r>
+        <w:rPr>
+          <w:b/>
+          <w:bCs/>
+        </w:rPr>
+        <w:t xml:space="preserve">F</w:t>
       </w:r>
       <w:r>
         <w:t xml:space="preserve"> are </w:t>
@@ -29888,7 +30780,17 @@
         <w:t xml:space="preserve">complete</w:t>
       </w:r>
       <w:r>
-        <w:t xml:space="preserve">. </w:t>
+        <w:t xml:space="preserve"> (including </w:t>
+      </w:r>
+      <w:r>
+        <w:rPr>
+          <w:b/>
+          <w:bCs/>
+        </w:rPr>
+        <w:t xml:space="preserve">E+F</w:t>
+      </w:r>
+      <w:r>
+        <w:t xml:space="preserve">). </w:t>
       </w:r>
       <w:r>
         <w:rPr>
@@ -29905,10 +30807,10 @@
           <w:b/>
           <w:bCs/>
         </w:rPr>
-        <w:t xml:space="preserve">Build E + F</w:t>
-      </w:r>
-      <w:r>
-        <w:t xml:space="preserve"> (arrangement router + motif transformation). Planned sequencing for </w:t>
+        <w:t xml:space="preserve">Build G</w:t>
+      </w:r>
+      <w:r>
+        <w:t xml:space="preserve"> (full 16-tonality rulesets). Planned sequencing for </w:t>
       </w:r>
       <w:r>
         <w:rPr>
@@ -29930,30 +30832,7 @@
           <w:b/>
           <w:bCs/>
         </w:rPr>
-        <w:t xml:space="preserve">E+F → G → C2 → UI → IMG</w:t>
-      </w:r>
-      <w:r>
-        <w:t xml:space="preserve"> (</w:t>
-      </w:r>
-      <w:r>
-        <w:rPr>
-          <w:b/>
-          <w:bCs/>
-        </w:rPr>
-        <w:t xml:space="preserve">E</w:t>
-      </w:r>
-      <w:r>
-        <w:t xml:space="preserve"> and </w:t>
-      </w:r>
-      <w:r>
-        <w:rPr>
-          <w:b/>
-          <w:bCs/>
-        </w:rPr>
-        <w:t xml:space="preserve">F</w:t>
-      </w:r>
-      <w:r>
-        <w:t xml:space="preserve"> may ship as one milestone depending on routing vs motif scope.)</w:t>
+        <w:t xml:space="preserve">G → C2 → H → UI → IMG</w:t>
       </w:r>
     </w:p>
     <w:p>

</xml_diff>

<commit_message>
docs: Build G complete — VaultChordRuleSet full 16-tonality behavior packs, roadmap updated
Co-authored-by: Cursor <cursoragent@cursor.com>
</commit_message>
<xml_diff>
--- a/docs/COMPOSER_OS_PLAYBOOK.docx
+++ b/docs/COMPOSER_OS_PLAYBOOK.docx
@@ -29001,6 +29001,906 @@
         <w:spacing w:after="100" w:before="160"/>
       </w:pPr>
       <w:r>
+        <w:t xml:space="preserve">Build G — Full 16-tonality per-chord rulesets (**complete**)</w:t>
+      </w:r>
+    </w:p>
+    <w:p>
+      <w:pPr>
+        <w:spacing w:after="160"/>
+      </w:pPr>
+      <w:r>
+        <w:rPr>
+          <w:b/>
+          <w:bCs/>
+        </w:rPr>
+        <w:t xml:space="preserve">Shipped</w:t>
+      </w:r>
+      <w:r>
+        <w:t xml:space="preserve"> in `engines/composer-os-v2/core/harmony/` — </w:t>
+      </w:r>
+      <w:r>
+        <w:rPr>
+          <w:b/>
+          <w:bCs/>
+        </w:rPr>
+        <w:t xml:space="preserve">`vaultChordRuleSet.ts`</w:t>
+      </w:r>
+      <w:r>
+        <w:t xml:space="preserve"> (re-exported from </w:t>
+      </w:r>
+      <w:r>
+        <w:rPr>
+          <w:b/>
+          <w:bCs/>
+        </w:rPr>
+        <w:t xml:space="preserve">`harmony/index.ts`</w:t>
+      </w:r>
+      <w:r>
+        <w:t xml:space="preserve">).</w:t>
+      </w:r>
+    </w:p>
+    <w:p>
+      <w:pPr>
+        <w:spacing w:after="160"/>
+      </w:pPr>
+      <w:r>
+        <w:t xml:space="preserve">This is the </w:t>
+      </w:r>
+      <w:r>
+        <w:rPr>
+          <w:b/>
+          <w:bCs/>
+        </w:rPr>
+        <w:t xml:space="preserve">unified per-chord ruleset</w:t>
+      </w:r>
+      <w:r>
+        <w:t xml:space="preserve"> that Vault subsystems can query: one typed snapshot per </w:t>
+      </w:r>
+      <w:r>
+        <w:rPr>
+          <w:b/>
+          <w:bCs/>
+        </w:rPr>
+        <w:t xml:space="preserve">`TONALITY_VAULT_DATABASE`</w:t>
+      </w:r>
+      <w:r>
+        <w:t xml:space="preserve"> chord type (</w:t>
+      </w:r>
+      <w:r>
+        <w:rPr>
+          <w:b/>
+          <w:bCs/>
+        </w:rPr>
+        <w:t xml:space="preserve">16</w:t>
+      </w:r>
+      <w:r>
+        <w:t xml:space="preserve"> rows).</w:t>
+      </w:r>
+    </w:p>
+    <w:p>
+      <w:pPr>
+        <w:spacing w:after="160"/>
+      </w:pPr>
+      <w:r>
+        <w:rPr>
+          <w:b/>
+          <w:bCs/>
+        </w:rPr>
+        <w:t xml:space="preserve">`VaultChordRuleSet`</w:t>
+      </w:r>
+    </w:p>
+    <w:tbl>
+      <w:tblPr>
+        <w:tblW w:type="pct" w:w="100%"/>
+        <w:tblBorders>
+          <w:top w:val="single" w:color="auto" w:sz="4"/>
+          <w:left w:val="single" w:color="auto" w:sz="4"/>
+          <w:bottom w:val="single" w:color="auto" w:sz="4"/>
+          <w:right w:val="single" w:color="auto" w:sz="4"/>
+          <w:insideH w:val="single" w:color="auto" w:sz="4"/>
+          <w:insideV w:val="single" w:color="auto" w:sz="4"/>
+        </w:tblBorders>
+      </w:tblPr>
+      <w:tblGrid>
+        <w:gridCol w:w="4500"/>
+        <w:gridCol w:w="4500"/>
+      </w:tblGrid>
+      <w:tr>
+        <w:tc>
+          <w:tcPr>
+            <w:tcW w:type="pct" w:w="4500%"/>
+          </w:tcPr>
+          <w:p>
+            <w:pPr>
+              <w:spacing w:after="60"/>
+            </w:pPr>
+            <w:r>
+              <w:t xml:space="preserve">Field</w:t>
+            </w:r>
+          </w:p>
+        </w:tc>
+        <w:tc>
+          <w:tcPr>
+            <w:tcW w:type="pct" w:w="4500%"/>
+          </w:tcPr>
+          <w:p>
+            <w:pPr>
+              <w:spacing w:after="60"/>
+            </w:pPr>
+            <w:r>
+              <w:t xml:space="preserve">Purpose</w:t>
+            </w:r>
+          </w:p>
+        </w:tc>
+      </w:tr>
+      <w:tr>
+        <w:tc>
+          <w:tcPr>
+            <w:tcW w:type="pct" w:w="4500%"/>
+          </w:tcPr>
+          <w:p>
+            <w:pPr>
+              <w:spacing w:after="60"/>
+            </w:pPr>
+            <w:r>
+              <w:rPr>
+                <w:b/>
+                <w:bCs/>
+              </w:rPr>
+              <w:t xml:space="preserve">`chordTypeId`</w:t>
+            </w:r>
+          </w:p>
+        </w:tc>
+        <w:tc>
+          <w:tcPr>
+            <w:tcW w:type="pct" w:w="4500%"/>
+          </w:tcPr>
+          <w:p>
+            <w:pPr>
+              <w:spacing w:after="60"/>
+            </w:pPr>
+            <w:r>
+              <w:t xml:space="preserve">Vault </w:t>
+            </w:r>
+            <w:r>
+              <w:rPr>
+                <w:b/>
+                <w:bCs/>
+              </w:rPr>
+              <w:t xml:space="preserve">`chordType`</w:t>
+            </w:r>
+            <w:r>
+              <w:t xml:space="preserve"> string</w:t>
+            </w:r>
+          </w:p>
+        </w:tc>
+      </w:tr>
+      <w:tr>
+        <w:tc>
+          <w:tcPr>
+            <w:tcW w:type="pct" w:w="4500%"/>
+          </w:tcPr>
+          <w:p>
+            <w:pPr>
+              <w:spacing w:after="60"/>
+            </w:pPr>
+            <w:r>
+              <w:rPr>
+                <w:b/>
+                <w:bCs/>
+              </w:rPr>
+              <w:t xml:space="preserve">`displayName`</w:t>
+            </w:r>
+          </w:p>
+        </w:tc>
+        <w:tc>
+          <w:tcPr>
+            <w:tcW w:type="pct" w:w="4500%"/>
+          </w:tcPr>
+          <w:p>
+            <w:pPr>
+              <w:spacing w:after="60"/>
+            </w:pPr>
+            <w:r>
+              <w:t xml:space="preserve">Human-readable row title</w:t>
+            </w:r>
+          </w:p>
+        </w:tc>
+      </w:tr>
+      <w:tr>
+        <w:tc>
+          <w:tcPr>
+            <w:tcW w:type="pct" w:w="4500%"/>
+          </w:tcPr>
+          <w:p>
+            <w:pPr>
+              <w:spacing w:after="60"/>
+            </w:pPr>
+            <w:r>
+              <w:rPr>
+                <w:b/>
+                <w:bCs/>
+              </w:rPr>
+              <w:t xml:space="preserve">`melodicTriadDegrees`</w:t>
+            </w:r>
+          </w:p>
+        </w:tc>
+        <w:tc>
+          <w:tcPr>
+            <w:tcW w:type="pct" w:w="4500%"/>
+          </w:tcPr>
+          <w:p>
+            <w:pPr>
+              <w:spacing w:after="60"/>
+            </w:pPr>
+            <w:r>
+              <w:t xml:space="preserve">Three melodic triad </w:t>
+            </w:r>
+            <w:r>
+              <w:rPr>
+                <w:b/>
+                <w:bCs/>
+              </w:rPr>
+              <w:t xml:space="preserve">degrees</w:t>
+            </w:r>
+            <w:r>
+              <w:t xml:space="preserve"> (`1`–`13`)</w:t>
+            </w:r>
+          </w:p>
+        </w:tc>
+      </w:tr>
+      <w:tr>
+        <w:tc>
+          <w:tcPr>
+            <w:tcW w:type="pct" w:w="4500%"/>
+          </w:tcPr>
+          <w:p>
+            <w:pPr>
+              <w:spacing w:after="60"/>
+            </w:pPr>
+            <w:r>
+              <w:rPr>
+                <w:b/>
+                <w:bCs/>
+              </w:rPr>
+              <w:t xml:space="preserve">`primaryQuadratonic`</w:t>
+            </w:r>
+          </w:p>
+        </w:tc>
+        <w:tc>
+          <w:tcPr>
+            <w:tcW w:type="pct" w:w="4500%"/>
+          </w:tcPr>
+          <w:p>
+            <w:pPr>
+              <w:spacing w:after="60"/>
+            </w:pPr>
+            <w:r>
+              <w:t xml:space="preserve">Quadratonic degree set (</w:t>
+            </w:r>
+            <w:r>
+              <w:rPr>
+                <w:b/>
+                <w:bCs/>
+              </w:rPr>
+              <w:t xml:space="preserve">triad ∪ primary tension</w:t>
+            </w:r>
+            <w:r>
+              <w:t xml:space="preserve">)</w:t>
+            </w:r>
+          </w:p>
+        </w:tc>
+      </w:tr>
+      <w:tr>
+        <w:tc>
+          <w:tcPr>
+            <w:tcW w:type="pct" w:w="4500%"/>
+          </w:tcPr>
+          <w:p>
+            <w:pPr>
+              <w:spacing w:after="60"/>
+            </w:pPr>
+            <w:r>
+              <w:rPr>
+                <w:b/>
+                <w:bCs/>
+              </w:rPr>
+              <w:t xml:space="preserve">`tensionHierarchy`</w:t>
+            </w:r>
+          </w:p>
+        </w:tc>
+        <w:tc>
+          <w:tcPr>
+            <w:tcW w:type="pct" w:w="4500%"/>
+          </w:tcPr>
+          <w:p>
+            <w:pPr>
+              <w:spacing w:after="60"/>
+            </w:pPr>
+            <w:r>
+              <w:t xml:space="preserve">Ordered tension preference list from the DB row</w:t>
+            </w:r>
+          </w:p>
+        </w:tc>
+      </w:tr>
+      <w:tr>
+        <w:tc>
+          <w:tcPr>
+            <w:tcW w:type="pct" w:w="4500%"/>
+          </w:tcPr>
+          <w:p>
+            <w:pPr>
+              <w:spacing w:after="60"/>
+            </w:pPr>
+            <w:r>
+              <w:rPr>
+                <w:b/>
+                <w:bCs/>
+              </w:rPr>
+              <w:t xml:space="preserve">`phraseTemplates`</w:t>
+            </w:r>
+          </w:p>
+        </w:tc>
+        <w:tc>
+          <w:tcPr>
+            <w:tcW w:type="pct" w:w="4500%"/>
+          </w:tcPr>
+          <w:p>
+            <w:pPr>
+              <w:spacing w:after="60"/>
+            </w:pPr>
+            <w:r>
+              <w:t xml:space="preserve">Allowed phrase archetypes: </w:t>
+            </w:r>
+            <w:r>
+              <w:rPr>
+                <w:b/>
+                <w:bCs/>
+              </w:rPr>
+              <w:t xml:space="preserve">`triad-sweep`</w:t>
+            </w:r>
+            <w:r>
+              <w:t xml:space="preserve">, </w:t>
+            </w:r>
+            <w:r>
+              <w:rPr>
+                <w:b/>
+                <w:bCs/>
+              </w:rPr>
+              <w:t xml:space="preserve">`quadratonic-enclosure`</w:t>
+            </w:r>
+            <w:r>
+              <w:t xml:space="preserve">, </w:t>
+            </w:r>
+            <w:r>
+              <w:rPr>
+                <w:b/>
+                <w:bCs/>
+              </w:rPr>
+              <w:t xml:space="preserve">`dyad-bounce`</w:t>
+            </w:r>
+            <w:r>
+              <w:t xml:space="preserve">, </w:t>
+            </w:r>
+            <w:r>
+              <w:rPr>
+                <w:b/>
+                <w:bCs/>
+              </w:rPr>
+              <w:t xml:space="preserve">`bebop-insertion`</w:t>
+            </w:r>
+            <w:r>
+              <w:t xml:space="preserve">, </w:t>
+            </w:r>
+            <w:r>
+              <w:rPr>
+                <w:b/>
+                <w:bCs/>
+              </w:rPr>
+              <w:t xml:space="preserve">`tension-climb`</w:t>
+            </w:r>
+            <w:r>
+              <w:t xml:space="preserve">, </w:t>
+            </w:r>
+            <w:r>
+              <w:rPr>
+                <w:b/>
+                <w:bCs/>
+              </w:rPr>
+              <w:t xml:space="preserve">`liquid-resolution`</w:t>
+            </w:r>
+          </w:p>
+        </w:tc>
+      </w:tr>
+      <w:tr>
+        <w:tc>
+          <w:tcPr>
+            <w:tcW w:type="pct" w:w="4500%"/>
+          </w:tcPr>
+          <w:p>
+            <w:pPr>
+              <w:spacing w:after="60"/>
+            </w:pPr>
+            <w:r>
+              <w:rPr>
+                <w:b/>
+                <w:bCs/>
+              </w:rPr>
+              <w:t xml:space="preserve">`beatAffinityProfile`</w:t>
+            </w:r>
+          </w:p>
+        </w:tc>
+        <w:tc>
+          <w:tcPr>
+            <w:tcW w:type="pct" w:w="4500%"/>
+          </w:tcPr>
+          <w:p>
+            <w:pPr>
+              <w:spacing w:after="60"/>
+            </w:pPr>
+            <w:r>
+              <w:rPr>
+                <w:b/>
+                <w:bCs/>
+              </w:rPr>
+              <w:t xml:space="preserve">`strong`</w:t>
+            </w:r>
+            <w:r>
+              <w:t xml:space="preserve"> / </w:t>
+            </w:r>
+            <w:r>
+              <w:rPr>
+                <w:b/>
+                <w:bCs/>
+              </w:rPr>
+              <w:t xml:space="preserve">`weak`</w:t>
+            </w:r>
+            <w:r>
+              <w:t xml:space="preserve"> / </w:t>
+            </w:r>
+            <w:r>
+              <w:rPr>
+                <w:b/>
+                <w:bCs/>
+              </w:rPr>
+              <w:t xml:space="preserve">`offbeat`</w:t>
+            </w:r>
+            <w:r>
+              <w:t xml:space="preserve"> → pitch classes (reference </w:t>
+            </w:r>
+            <w:r>
+              <w:rPr>
+                <w:b/>
+                <w:bCs/>
+              </w:rPr>
+              <w:t xml:space="preserve">`rootPc = 0`</w:t>
+            </w:r>
+            <w:r>
+              <w:t xml:space="preserve">) grouped by </w:t>
+            </w:r>
+            <w:r>
+              <w:rPr>
+                <w:b/>
+                <w:bCs/>
+              </w:rPr>
+              <w:t xml:space="preserve">`NoteLayer`</w:t>
+            </w:r>
+            <w:r>
+              <w:t xml:space="preserve"> from </w:t>
+            </w:r>
+            <w:r>
+              <w:rPr>
+                <w:b/>
+                <w:bCs/>
+              </w:rPr>
+              <w:t xml:space="preserve">`buildBeatContextLegalityMap`</w:t>
+            </w:r>
+          </w:p>
+        </w:tc>
+      </w:tr>
+      <w:tr>
+        <w:tc>
+          <w:tcPr>
+            <w:tcW w:type="pct" w:w="4500%"/>
+          </w:tcPr>
+          <w:p>
+            <w:pPr>
+              <w:spacing w:after="60"/>
+            </w:pPr>
+            <w:r>
+              <w:rPr>
+                <w:b/>
+                <w:bCs/>
+              </w:rPr>
+              <w:t xml:space="preserve">`guitarGripCount`</w:t>
+            </w:r>
+          </w:p>
+        </w:tc>
+        <w:tc>
+          <w:tcPr>
+            <w:tcW w:type="pct" w:w="4500%"/>
+          </w:tcPr>
+          <w:p>
+            <w:pPr>
+              <w:spacing w:after="60"/>
+            </w:pPr>
+            <w:r>
+              <w:t xml:space="preserve">Count from </w:t>
+            </w:r>
+            <w:r>
+              <w:rPr>
+                <w:b/>
+                <w:bCs/>
+              </w:rPr>
+              <w:t xml:space="preserve">`buildGuitarGripLibrary`</w:t>
+            </w:r>
+            <w:r>
+              <w:t xml:space="preserve"> (standard tuning lookup)</w:t>
+            </w:r>
+          </w:p>
+        </w:tc>
+      </w:tr>
+      <w:tr>
+        <w:tc>
+          <w:tcPr>
+            <w:tcW w:type="pct" w:w="4500%"/>
+          </w:tcPr>
+          <w:p>
+            <w:pPr>
+              <w:spacing w:after="60"/>
+            </w:pPr>
+            <w:r>
+              <w:rPr>
+                <w:b/>
+                <w:bCs/>
+              </w:rPr>
+              <w:t xml:space="preserve">`reharmStrategies`</w:t>
+            </w:r>
+          </w:p>
+        </w:tc>
+        <w:tc>
+          <w:tcPr>
+            <w:tcW w:type="pct" w:w="4500%"/>
+          </w:tcPr>
+          <w:p>
+            <w:pPr>
+              <w:spacing w:after="60"/>
+            </w:pPr>
+            <w:r>
+              <w:t xml:space="preserve">Top </w:t>
+            </w:r>
+            <w:r>
+              <w:rPr>
+                <w:b/>
+                <w:bCs/>
+              </w:rPr>
+              <w:t xml:space="preserve">three</w:t>
+            </w:r>
+            <w:r>
+              <w:t xml:space="preserve"> </w:t>
+            </w:r>
+            <w:r>
+              <w:rPr>
+                <w:b/>
+                <w:bCs/>
+              </w:rPr>
+              <w:t xml:space="preserve">`ReharmStrategy`</w:t>
+            </w:r>
+            <w:r>
+              <w:t xml:space="preserve"> frequencies from </w:t>
+            </w:r>
+            <w:r>
+              <w:rPr>
+                <w:b/>
+                <w:bCs/>
+              </w:rPr>
+              <w:t xml:space="preserve">`generateReharmCandidates`</w:t>
+            </w:r>
+            <w:r>
+              <w:t xml:space="preserve"> (</w:t>
+            </w:r>
+            <w:r>
+              <w:rPr>
+                <w:b/>
+                <w:bCs/>
+              </w:rPr>
+              <w:t xml:space="preserve">neutral</w:t>
+            </w:r>
+            <w:r>
+              <w:t xml:space="preserve"> drift)</w:t>
+            </w:r>
+          </w:p>
+        </w:tc>
+      </w:tr>
+      <w:tr>
+        <w:tc>
+          <w:tcPr>
+            <w:tcW w:type="pct" w:w="4500%"/>
+          </w:tcPr>
+          <w:p>
+            <w:pPr>
+              <w:spacing w:after="60"/>
+            </w:pPr>
+            <w:r>
+              <w:rPr>
+                <w:b/>
+                <w:bCs/>
+              </w:rPr>
+              <w:t xml:space="preserve">`recommendedTensionStates`</w:t>
+            </w:r>
+          </w:p>
+        </w:tc>
+        <w:tc>
+          <w:tcPr>
+            <w:tcW w:type="pct" w:w="4500%"/>
+          </w:tcPr>
+          <w:p>
+            <w:pPr>
+              <w:spacing w:after="60"/>
+            </w:pPr>
+            <w:r>
+              <w:t xml:space="preserve">Suggested </w:t>
+            </w:r>
+            <w:r>
+              <w:rPr>
+                <w:b/>
+                <w:bCs/>
+              </w:rPr>
+              <w:t xml:space="preserve">`TensionState`</w:t>
+            </w:r>
+            <w:r>
+              <w:t xml:space="preserve"> arc from chord stability heuristics</w:t>
+            </w:r>
+          </w:p>
+        </w:tc>
+      </w:tr>
+    </w:tbl>
+    <w:p>
+      <w:pPr>
+        <w:spacing w:after="160"/>
+      </w:pPr>
+    </w:p>
+    <w:p>
+      <w:pPr>
+        <w:spacing w:after="160"/>
+      </w:pPr>
+      <w:r>
+        <w:rPr>
+          <w:b/>
+          <w:bCs/>
+        </w:rPr>
+        <w:t xml:space="preserve">`buildAllVaultChordRuleSets()`</w:t>
+      </w:r>
+      <w:r>
+        <w:t xml:space="preserve"> — walks </w:t>
+      </w:r>
+      <w:r>
+        <w:rPr>
+          <w:b/>
+          <w:bCs/>
+        </w:rPr>
+        <w:t xml:space="preserve">`TONALITY_VAULT_DATABASE`</w:t>
+      </w:r>
+      <w:r>
+        <w:t xml:space="preserve">, builds </w:t>
+      </w:r>
+      <w:r>
+        <w:rPr>
+          <w:b/>
+          <w:bCs/>
+        </w:rPr>
+        <w:t xml:space="preserve">`VaultChordRuleSet[]`</w:t>
+      </w:r>
+      <w:r>
+        <w:t xml:space="preserve">. </w:t>
+      </w:r>
+      <w:r>
+        <w:rPr>
+          <w:b/>
+          <w:bCs/>
+        </w:rPr>
+        <w:t xml:space="preserve">Mechanics:</w:t>
+      </w:r>
+      <w:r>
+        <w:t xml:space="preserve"> </w:t>
+      </w:r>
+      <w:r>
+        <w:rPr>
+          <w:b/>
+          <w:bCs/>
+        </w:rPr>
+        <w:t xml:space="preserve">`melodicTriadDegrees`</w:t>
+      </w:r>
+      <w:r>
+        <w:t xml:space="preserve"> / </w:t>
+      </w:r>
+      <w:r>
+        <w:rPr>
+          <w:b/>
+          <w:bCs/>
+        </w:rPr>
+        <w:t xml:space="preserve">`tensionHierarchy`</w:t>
+      </w:r>
+      <w:r>
+        <w:t xml:space="preserve"> from the DB; </w:t>
+      </w:r>
+      <w:r>
+        <w:rPr>
+          <w:b/>
+          <w:bCs/>
+        </w:rPr>
+        <w:t xml:space="preserve">`primaryQuadratonic`</w:t>
+      </w:r>
+      <w:r>
+        <w:t xml:space="preserve"> from </w:t>
+      </w:r>
+      <w:r>
+        <w:rPr>
+          <w:b/>
+          <w:bCs/>
+        </w:rPr>
+        <w:t xml:space="preserve">`selectQuadratonicMelodySpec`</w:t>
+      </w:r>
+      <w:r>
+        <w:t xml:space="preserve">; </w:t>
+      </w:r>
+      <w:r>
+        <w:rPr>
+          <w:b/>
+          <w:bCs/>
+        </w:rPr>
+        <w:t xml:space="preserve">phrase templates</w:t>
+      </w:r>
+      <w:r>
+        <w:t xml:space="preserve"> by chord character (</w:t>
+      </w:r>
+      <w:r>
+        <w:rPr>
+          <w:b/>
+          <w:bCs/>
+        </w:rPr>
+        <w:t xml:space="preserve">sus</w:t>
+      </w:r>
+      <w:r>
+        <w:t xml:space="preserve"> vs </w:t>
+      </w:r>
+      <w:r>
+        <w:rPr>
+          <w:b/>
+          <w:bCs/>
+        </w:rPr>
+        <w:t xml:space="preserve">altered/tense</w:t>
+      </w:r>
+      <w:r>
+        <w:t xml:space="preserve"> vs </w:t>
+      </w:r>
+      <w:r>
+        <w:rPr>
+          <w:b/>
+          <w:bCs/>
+        </w:rPr>
+        <w:t xml:space="preserve">stable</w:t>
+      </w:r>
+      <w:r>
+        <w:t xml:space="preserve"> defaults); </w:t>
+      </w:r>
+      <w:r>
+        <w:rPr>
+          <w:b/>
+          <w:bCs/>
+        </w:rPr>
+        <w:t xml:space="preserve">beat affinity</w:t>
+      </w:r>
+      <w:r>
+        <w:t xml:space="preserve"> from </w:t>
+      </w:r>
+      <w:r>
+        <w:rPr>
+          <w:b/>
+          <w:bCs/>
+        </w:rPr>
+        <w:t xml:space="preserve">`buildBeatContextLegalityMap`</w:t>
+      </w:r>
+      <w:r>
+        <w:t xml:space="preserve"> layer buckets; </w:t>
+      </w:r>
+      <w:r>
+        <w:rPr>
+          <w:b/>
+          <w:bCs/>
+        </w:rPr>
+        <w:t xml:space="preserve">grip count</w:t>
+      </w:r>
+      <w:r>
+        <w:t xml:space="preserve"> via </w:t>
+      </w:r>
+      <w:r>
+        <w:rPr>
+          <w:b/>
+          <w:bCs/>
+        </w:rPr>
+        <w:t xml:space="preserve">`buildGuitarGripLibrary`</w:t>
+      </w:r>
+      <w:r>
+        <w:t xml:space="preserve">; </w:t>
+      </w:r>
+      <w:r>
+        <w:rPr>
+          <w:b/>
+          <w:bCs/>
+        </w:rPr>
+        <w:t xml:space="preserve">reharm</w:t>
+      </w:r>
+      <w:r>
+        <w:t xml:space="preserve"> strategies from </w:t>
+      </w:r>
+      <w:r>
+        <w:rPr>
+          <w:b/>
+          <w:bCs/>
+        </w:rPr>
+        <w:t xml:space="preserve">`generateReharmCandidates`</w:t>
+      </w:r>
+      <w:r>
+        <w:t xml:space="preserve">; </w:t>
+      </w:r>
+      <w:r>
+        <w:rPr>
+          <w:b/>
+          <w:bCs/>
+        </w:rPr>
+        <w:t xml:space="preserve">`recommendedTensionStates`</w:t>
+      </w:r>
+      <w:r>
+        <w:t xml:space="preserve"> from stability heuristics (</w:t>
+      </w:r>
+      <w:r>
+        <w:rPr>
+          <w:b/>
+          <w:bCs/>
+        </w:rPr>
+        <w:t xml:space="preserve">stable</w:t>
+      </w:r>
+      <w:r>
+        <w:t xml:space="preserve"> → </w:t>
+      </w:r>
+      <w:r>
+        <w:rPr>
+          <w:b/>
+          <w:bCs/>
+        </w:rPr>
+        <w:t xml:space="preserve">`resolve` / `primary`</w:t>
+      </w:r>
+      <w:r>
+        <w:t xml:space="preserve"> bias; </w:t>
+      </w:r>
+      <w:r>
+        <w:rPr>
+          <w:b/>
+          <w:bCs/>
+        </w:rPr>
+        <w:t xml:space="preserve">altered</w:t>
+      </w:r>
+      <w:r>
+        <w:t xml:space="preserve"> → </w:t>
+      </w:r>
+      <w:r>
+        <w:rPr>
+          <w:b/>
+          <w:bCs/>
+        </w:rPr>
+        <w:t xml:space="preserve">`tension` / `chaos`</w:t>
+      </w:r>
+      <w:r>
+        <w:t xml:space="preserve"> bias; etc.).</w:t>
+      </w:r>
+    </w:p>
+    <w:p>
+      <w:pPr>
+        <w:pStyle w:val="Heading2"/>
+        <w:spacing w:after="100" w:before="160"/>
+      </w:pPr>
+      <w:r>
         <w:t xml:space="preserve">Planned builds (engine)</w:t>
       </w:r>
     </w:p>
@@ -29265,67 +30165,47 @@
         <w:t xml:space="preserve">Build G — Full 16-tonality per-chord rulesets:</w:t>
       </w:r>
       <w:r>
-        <w:t xml:space="preserve"> One complete behaviour pack per Tonality Vault chord type: </w:t>
-      </w:r>
-      <w:r>
-        <w:rPr>
-          <w:b/>
-          <w:bCs/>
-        </w:rPr>
-        <w:t xml:space="preserve">melodic triad</w:t>
-      </w:r>
-      <w:r>
-        <w:t xml:space="preserve">, </w:t>
-      </w:r>
-      <w:r>
-        <w:rPr>
-          <w:b/>
-          <w:bCs/>
-        </w:rPr>
-        <w:t xml:space="preserve">quadratonic</w:t>
-      </w:r>
-      <w:r>
-        <w:t xml:space="preserve">, </w:t>
-      </w:r>
-      <w:r>
-        <w:rPr>
-          <w:b/>
-          <w:bCs/>
-        </w:rPr>
-        <w:t xml:space="preserve">tension hierarchy</w:t>
-      </w:r>
-      <w:r>
-        <w:t xml:space="preserve">, phrase templates, </w:t>
-      </w:r>
-      <w:r>
-        <w:rPr>
-          <w:b/>
-          <w:bCs/>
-        </w:rPr>
-        <w:t xml:space="preserve">beat affinity</w:t>
-      </w:r>
-      <w:r>
-        <w:t xml:space="preserve">, </w:t>
-      </w:r>
-      <w:r>
-        <w:rPr>
-          <w:b/>
-          <w:bCs/>
-        </w:rPr>
-        <w:t xml:space="preserve">guitar grips</w:t>
-      </w:r>
-      <w:r>
-        <w:t xml:space="preserve">, </w:t>
-      </w:r>
-      <w:r>
-        <w:rPr>
-          <w:b/>
-          <w:bCs/>
-        </w:rPr>
-        <w:t xml:space="preserve">reharm</w:t>
-      </w:r>
-      <w:r>
-        <w:t xml:space="preserve"> candidates.</w:t>
+        <w:t xml:space="preserve"> </w:t>
+      </w:r>
+      <w:r>
+        <w:rPr>
+          <w:b/>
+          <w:bCs/>
+        </w:rPr>
+        <w:t xml:space="preserve">Complete</w:t>
+      </w:r>
+      <w:r>
+        <w:t xml:space="preserve"> — see </w:t>
+      </w:r>
+      <w:r>
+        <w:rPr>
+          <w:b/>
+          <w:bCs/>
+        </w:rPr>
+        <w:t xml:space="preserve">Build G</w:t>
+      </w:r>
+      <w:r>
+        <w:t xml:space="preserve"> subsection above; </w:t>
+      </w:r>
+      <w:r>
+        <w:rPr>
+          <w:b/>
+          <w:bCs/>
+        </w:rPr>
+        <w:t xml:space="preserve">`VaultChordRuleSet`</w:t>
+      </w:r>
+      <w:r>
+        <w:t xml:space="preserve"> + </w:t>
+      </w:r>
+      <w:r>
+        <w:rPr>
+          <w:b/>
+          <w:bCs/>
+        </w:rPr>
+        <w:t xml:space="preserve">`buildAllVaultChordRuleSets()`</w:t>
+      </w:r>
+      <w:r>
+        <w:t xml:space="preserve">.</w:t>
       </w:r>
     </w:p>
     <w:p>
@@ -30307,7 +31187,37 @@
         <w:t xml:space="preserve">scale</w:t>
       </w:r>
       <w:r>
-        <w:t xml:space="preserve"> runs.</w:t>
+        <w:t xml:space="preserve"> runs. </w:t>
+      </w:r>
+      <w:r>
+        <w:rPr>
+          <w:b/>
+          <w:bCs/>
+        </w:rPr>
+        <w:t xml:space="preserve">Build G</w:t>
+      </w:r>
+      <w:r>
+        <w:t xml:space="preserve"> exposes a single </w:t>
+      </w:r>
+      <w:r>
+        <w:rPr>
+          <w:b/>
+          <w:bCs/>
+        </w:rPr>
+        <w:t xml:space="preserve">`VaultChordRuleSet`</w:t>
+      </w:r>
+      <w:r>
+        <w:t xml:space="preserve"> per type so riffs, reharms, beat maps, and phrase templates stay </w:t>
+      </w:r>
+      <w:r>
+        <w:rPr>
+          <w:b/>
+          <w:bCs/>
+        </w:rPr>
+        <w:t xml:space="preserve">consistent</w:t>
+      </w:r>
+      <w:r>
+        <w:t xml:space="preserve"> across the stack.</w:t>
       </w:r>
     </w:p>
     <w:p>
@@ -30767,7 +31677,7 @@
           <w:b/>
           <w:bCs/>
         </w:rPr>
-        <w:t xml:space="preserve">F</w:t>
+        <w:t xml:space="preserve">G</w:t>
       </w:r>
       <w:r>
         <w:t xml:space="preserve"> are </w:t>
@@ -30780,17 +31690,7 @@
         <w:t xml:space="preserve">complete</w:t>
       </w:r>
       <w:r>
-        <w:t xml:space="preserve"> (including </w:t>
-      </w:r>
-      <w:r>
-        <w:rPr>
-          <w:b/>
-          <w:bCs/>
-        </w:rPr>
-        <w:t xml:space="preserve">E+F</w:t>
-      </w:r>
-      <w:r>
-        <w:t xml:space="preserve">). </w:t>
+        <w:t xml:space="preserve">. </w:t>
       </w:r>
       <w:r>
         <w:rPr>
@@ -30807,10 +31707,10 @@
           <w:b/>
           <w:bCs/>
         </w:rPr>
-        <w:t xml:space="preserve">Build G</w:t>
-      </w:r>
-      <w:r>
-        <w:t xml:space="preserve"> (full 16-tonality rulesets). Planned sequencing for </w:t>
+        <w:t xml:space="preserve">Build C2</w:t>
+      </w:r>
+      <w:r>
+        <w:t xml:space="preserve"> (alt tuning extension). Planned sequencing for </w:t>
       </w:r>
       <w:r>
         <w:rPr>
@@ -30832,7 +31732,7 @@
           <w:b/>
           <w:bCs/>
         </w:rPr>
-        <w:t xml:space="preserve">G → C2 → H → UI → IMG</w:t>
+        <w:t xml:space="preserve">C2 → H → UI → IMG</w:t>
       </w:r>
     </w:p>
     <w:p>

</xml_diff>

<commit_message>
docs: Build C2 complete, Future Tunings guide added to playbook, roadmap updated
Co-authored-by: Cursor <cursoragent@cursor.com>
</commit_message>
<xml_diff>
--- a/docs/COMPOSER_OS_PLAYBOOK.docx
+++ b/docs/COMPOSER_OS_PLAYBOOK.docx
@@ -28025,6 +28025,376 @@
     </w:p>
     <w:p>
       <w:pPr>
+        <w:pStyle w:val="Heading3"/>
+        <w:spacing w:after="80" w:before="120"/>
+      </w:pPr>
+      <w:r>
+        <w:t xml:space="preserve">Future Tunings (guitar)</w:t>
+      </w:r>
+    </w:p>
+    <w:p>
+      <w:pPr>
+        <w:spacing w:after="160"/>
+      </w:pPr>
+      <w:r>
+        <w:t xml:space="preserve">To register a new tuning for Vault </w:t>
+      </w:r>
+      <w:r>
+        <w:rPr>
+          <w:b/>
+          <w:bCs/>
+        </w:rPr>
+        <w:t xml:space="preserve">grip</w:t>
+      </w:r>
+      <w:r>
+        <w:t xml:space="preserve"> math (and any caller that passes the same </w:t>
+      </w:r>
+      <w:r>
+        <w:rPr>
+          <w:b/>
+          <w:bCs/>
+        </w:rPr>
+        <w:t xml:space="preserve">`tuningId`</w:t>
+      </w:r>
+      <w:r>
+        <w:t xml:space="preserve">):</w:t>
+      </w:r>
+    </w:p>
+    <w:p>
+      <w:pPr>
+        <w:spacing w:after="160"/>
+      </w:pPr>
+      <w:r>
+        <w:t xml:space="preserve">1. Add a preset row to </w:t>
+      </w:r>
+      <w:r>
+        <w:rPr>
+          <w:b/>
+          <w:bCs/>
+        </w:rPr>
+        <w:t xml:space="preserve">`alternateGuitarTunings.ts`</w:t>
+      </w:r>
+      <w:r>
+        <w:t xml:space="preserve">: stable </w:t>
+      </w:r>
+      <w:r>
+        <w:rPr>
+          <w:b/>
+          <w:bCs/>
+        </w:rPr>
+        <w:t xml:space="preserve">`id`</w:t>
+      </w:r>
+      <w:r>
+        <w:t xml:space="preserve">, </w:t>
+      </w:r>
+      <w:r>
+        <w:rPr>
+          <w:b/>
+          <w:bCs/>
+        </w:rPr>
+        <w:t xml:space="preserve">`label`</w:t>
+      </w:r>
+      <w:r>
+        <w:t xml:space="preserve">, </w:t>
+      </w:r>
+      <w:r>
+        <w:rPr>
+          <w:b/>
+          <w:bCs/>
+        </w:rPr>
+        <w:t xml:space="preserve">`audibleDescription`</w:t>
+      </w:r>
+      <w:r>
+        <w:t xml:space="preserve">, </w:t>
+      </w:r>
+      <w:r>
+        <w:rPr>
+          <w:b/>
+          <w:bCs/>
+        </w:rPr>
+        <w:t xml:space="preserve">`zone`</w:t>
+      </w:r>
+      <w:r>
+        <w:t xml:space="preserve"> (if applicable), and </w:t>
+      </w:r>
+      <w:r>
+        <w:rPr>
+          <w:b/>
+          <w:bCs/>
+        </w:rPr>
+        <w:t xml:space="preserve">`strings`</w:t>
+      </w:r>
+      <w:r>
+        <w:t xml:space="preserve">: six </w:t>
+      </w:r>
+      <w:r>
+        <w:rPr>
+          <w:b/>
+          <w:bCs/>
+        </w:rPr>
+        <w:t xml:space="preserve">scientific-pitch</w:t>
+      </w:r>
+      <w:r>
+        <w:t xml:space="preserve"> open strings </w:t>
+      </w:r>
+      <w:r>
+        <w:rPr>
+          <w:b/>
+          <w:bCs/>
+        </w:rPr>
+        <w:t xml:space="preserve">low → high</w:t>
+      </w:r>
+      <w:r>
+        <w:t xml:space="preserve"> (repo convention, e.g. </w:t>
+      </w:r>
+      <w:r>
+        <w:rPr>
+          <w:b/>
+          <w:bCs/>
+        </w:rPr>
+        <w:t xml:space="preserve">`E2`</w:t>
+      </w:r>
+      <w:r>
+        <w:t xml:space="preserve">…</w:t>
+      </w:r>
+      <w:r>
+        <w:rPr>
+          <w:b/>
+          <w:bCs/>
+        </w:rPr>
+        <w:t xml:space="preserve">`E4`</w:t>
+      </w:r>
+      <w:r>
+        <w:t xml:space="preserve">). </w:t>
+      </w:r>
+      <w:r>
+        <w:rPr>
+          <w:b/>
+          <w:bCs/>
+        </w:rPr>
+        <w:t xml:space="preserve">`openStringMidisForTuning`</w:t>
+      </w:r>
+      <w:r>
+        <w:t xml:space="preserve"> converts those to MIDI for fret candidates. 2. </w:t>
+      </w:r>
+      <w:r>
+        <w:rPr>
+          <w:b/>
+          <w:bCs/>
+        </w:rPr>
+        <w:t xml:space="preserve">Optional / UI:</w:t>
+      </w:r>
+      <w:r>
+        <w:t xml:space="preserve"> add the </w:t>
+      </w:r>
+      <w:r>
+        <w:rPr>
+          <w:b/>
+          <w:bCs/>
+        </w:rPr>
+        <w:t xml:space="preserve">`id`</w:t>
+      </w:r>
+      <w:r>
+        <w:t xml:space="preserve"> to the relevant zone list (e.g. </w:t>
+      </w:r>
+      <w:r>
+        <w:rPr>
+          <w:b/>
+          <w:bCs/>
+        </w:rPr>
+        <w:t xml:space="preserve">`ROADMAP_ZONE_TUNING_PRESET_IDS`</w:t>
+      </w:r>
+      <w:r>
+        <w:t xml:space="preserve"> or zone-specific arrays) if the preset should appear in grouped Generate UI. 3. Pass that </w:t>
+      </w:r>
+      <w:r>
+        <w:rPr>
+          <w:b/>
+          <w:bCs/>
+        </w:rPr>
+        <w:t xml:space="preserve">`tuningId`</w:t>
+      </w:r>
+      <w:r>
+        <w:t xml:space="preserve"> into </w:t>
+      </w:r>
+      <w:r>
+        <w:rPr>
+          <w:b/>
+          <w:bCs/>
+        </w:rPr>
+        <w:t xml:space="preserve">`buildGuitarGripLibrary(chordTypeId, rootPc, tuningId)`</w:t>
+      </w:r>
+      <w:r>
+        <w:t xml:space="preserve"> — grips </w:t>
+      </w:r>
+      <w:r>
+        <w:rPr>
+          <w:b/>
+          <w:bCs/>
+        </w:rPr>
+        <w:t xml:space="preserve">recompute</w:t>
+      </w:r>
+      <w:r>
+        <w:t xml:space="preserve"> from the six open-string midis; </w:t>
+      </w:r>
+      <w:r>
+        <w:rPr>
+          <w:b/>
+          <w:bCs/>
+        </w:rPr>
+        <w:t xml:space="preserve">no edits</w:t>
+      </w:r>
+      <w:r>
+        <w:t xml:space="preserve"> to </w:t>
+      </w:r>
+      <w:r>
+        <w:rPr>
+          <w:b/>
+          <w:bCs/>
+        </w:rPr>
+        <w:t xml:space="preserve">`guitarGripLibrary.ts`</w:t>
+      </w:r>
+      <w:r>
+        <w:t xml:space="preserve">, </w:t>
+      </w:r>
+      <w:r>
+        <w:rPr>
+          <w:b/>
+          <w:bCs/>
+        </w:rPr>
+        <w:t xml:space="preserve">`vaultRiffGenerator.ts`</w:t>
+      </w:r>
+      <w:r>
+        <w:t xml:space="preserve">, or the core Vault engine are required for a new preset </w:t>
+      </w:r>
+      <w:r>
+        <w:rPr>
+          <w:b/>
+          <w:bCs/>
+        </w:rPr>
+        <w:t xml:space="preserve">id</w:t>
+      </w:r>
+      <w:r>
+        <w:t xml:space="preserve">.</w:t>
+      </w:r>
+    </w:p>
+    <w:p>
+      <w:pPr>
+        <w:spacing w:after="160"/>
+      </w:pPr>
+      <w:r>
+        <w:rPr>
+          <w:b/>
+          <w:bCs/>
+        </w:rPr>
+        <w:t xml:space="preserve">Ideas backlog (not yet shipped as presets):</w:t>
+      </w:r>
+      <w:r>
+        <w:t xml:space="preserve"> </w:t>
+      </w:r>
+      <w:r>
+        <w:rPr>
+          <w:b/>
+          <w:bCs/>
+        </w:rPr>
+        <w:t xml:space="preserve">Drop D</w:t>
+      </w:r>
+      <w:r>
+        <w:t xml:space="preserve"> open midis </w:t>
+      </w:r>
+      <w:r>
+        <w:rPr>
+          <w:b/>
+          <w:bCs/>
+        </w:rPr>
+        <w:t xml:space="preserve">[38, 45, 50, 55, 59, 64]</w:t>
+      </w:r>
+      <w:r>
+        <w:t xml:space="preserve"> (see existing </w:t>
+      </w:r>
+      <w:r>
+        <w:rPr>
+          <w:b/>
+          <w:bCs/>
+        </w:rPr>
+        <w:t xml:space="preserve">`drop_d`</w:t>
+      </w:r>
+      <w:r>
+        <w:t xml:space="preserve"> preset), </w:t>
+      </w:r>
+      <w:r>
+        <w:rPr>
+          <w:b/>
+          <w:bCs/>
+        </w:rPr>
+        <w:t xml:space="preserve">Open E</w:t>
+      </w:r>
+      <w:r>
+        <w:t xml:space="preserve">, </w:t>
+      </w:r>
+      <w:r>
+        <w:rPr>
+          <w:b/>
+          <w:bCs/>
+        </w:rPr>
+        <w:t xml:space="preserve">DADGAD</w:t>
+      </w:r>
+      <w:r>
+        <w:t xml:space="preserve"> variants beyond </w:t>
+      </w:r>
+      <w:r>
+        <w:rPr>
+          <w:b/>
+          <w:bCs/>
+        </w:rPr>
+        <w:t xml:space="preserve">`dadgad`</w:t>
+      </w:r>
+      <w:r>
+        <w:t xml:space="preserve">, </w:t>
+      </w:r>
+      <w:r>
+        <w:rPr>
+          <w:b/>
+          <w:bCs/>
+        </w:rPr>
+        <w:t xml:space="preserve">Nashville</w:t>
+      </w:r>
+      <w:r>
+        <w:t xml:space="preserve"> high-stringing, </w:t>
+      </w:r>
+      <w:r>
+        <w:rPr>
+          <w:b/>
+          <w:bCs/>
+        </w:rPr>
+        <w:t xml:space="preserve">baritone</w:t>
+      </w:r>
+      <w:r>
+        <w:t xml:space="preserve"> standard </w:t>
+      </w:r>
+      <w:r>
+        <w:rPr>
+          <w:b/>
+          <w:bCs/>
+        </w:rPr>
+        <w:t xml:space="preserve">[23, 28, 33, 38, 42, 47]</w:t>
+      </w:r>
+      <w:r>
+        <w:t xml:space="preserve">, </w:t>
+      </w:r>
+      <w:r>
+        <w:rPr>
+          <w:b/>
+          <w:bCs/>
+        </w:rPr>
+        <w:t xml:space="preserve">7-string</w:t>
+      </w:r>
+      <w:r>
+        <w:t xml:space="preserve"> standard.</w:t>
+      </w:r>
+    </w:p>
+    <w:p>
+      <w:pPr>
         <w:pStyle w:val="Heading2"/>
         <w:spacing w:after="100" w:before="160"/>
       </w:pPr>
@@ -30231,10 +30601,180 @@
           <w:b/>
           <w:bCs/>
         </w:rPr>
+        <w:t xml:space="preserve">Complete.</w:t>
+      </w:r>
+      <w:r>
+        <w:t xml:space="preserve"> </w:t>
+      </w:r>
+      <w:r>
+        <w:rPr>
+          <w:b/>
+          <w:bCs/>
+        </w:rPr>
+        <w:t xml:space="preserve">`guitarGripLibrary.ts`</w:t>
+      </w:r>
+      <w:r>
+        <w:t xml:space="preserve"> resolves open-string MIDI via </w:t>
+      </w:r>
+      <w:r>
+        <w:rPr>
+          <w:b/>
+          <w:bCs/>
+        </w:rPr>
+        <w:t xml:space="preserve">`openStringMidisForTuning`</w:t>
+      </w:r>
+      <w:r>
+        <w:t xml:space="preserve">: </w:t>
+      </w:r>
+      <w:r>
+        <w:rPr>
+          <w:b/>
+          <w:bCs/>
+        </w:rPr>
+        <w:t xml:space="preserve">`standard`</w:t>
+      </w:r>
+      <w:r>
+        <w:t xml:space="preserve"> → fixed E-standard </w:t>
+      </w:r>
+      <w:r>
+        <w:rPr>
+          <w:b/>
+          <w:bCs/>
+        </w:rPr>
+        <w:t xml:space="preserve">[40, 45, 50, 55, 59, 64]</w:t>
+      </w:r>
+      <w:r>
+        <w:t xml:space="preserve">; otherwise </w:t>
+      </w:r>
+      <w:r>
+        <w:rPr>
+          <w:b/>
+          <w:bCs/>
+        </w:rPr>
+        <w:t xml:space="preserve">`getAlternateGuitarTuningPreset(tuningId)`</w:t>
+      </w:r>
+      <w:r>
+        <w:t xml:space="preserve"> supplies six </w:t>
+      </w:r>
+      <w:r>
+        <w:rPr>
+          <w:b/>
+          <w:bCs/>
+        </w:rPr>
+        <w:t xml:space="preserve">scientific-pitch</w:t>
+      </w:r>
+      <w:r>
+        <w:t xml:space="preserve"> strings → MIDI for all fret math. </w:t>
+      </w:r>
+      <w:r>
+        <w:rPr>
+          <w:b/>
+          <w:bCs/>
+        </w:rPr>
+        <w:t xml:space="preserve">Preset groups (ids):</w:t>
+      </w:r>
+      <w:r>
+        <w:t xml:space="preserve"> </w:t>
+      </w:r>
+      <w:r>
+        <w:rPr>
+          <w:b/>
+          <w:bCs/>
+        </w:rPr>
         <w:t xml:space="preserve">Sonic Youth</w:t>
       </w:r>
       <w:r>
-        <w:t xml:space="preserve"> and </w:t>
+        <w:t xml:space="preserve"> — </w:t>
+      </w:r>
+      <w:r>
+        <w:rPr>
+          <w:b/>
+          <w:bCs/>
+        </w:rPr>
+        <w:t xml:space="preserve">`sy_cgdgcd`</w:t>
+      </w:r>
+      <w:r>
+        <w:t xml:space="preserve">, </w:t>
+      </w:r>
+      <w:r>
+        <w:rPr>
+          <w:b/>
+          <w:bCs/>
+        </w:rPr>
+        <w:t xml:space="preserve">`sy_cgdgbd`</w:t>
+      </w:r>
+      <w:r>
+        <w:t xml:space="preserve">, </w:t>
+      </w:r>
+      <w:r>
+        <w:rPr>
+          <w:b/>
+          <w:bCs/>
+        </w:rPr>
+        <w:t xml:space="preserve">`sy_ebebeb`</w:t>
+      </w:r>
+      <w:r>
+        <w:t xml:space="preserve">, </w:t>
+      </w:r>
+      <w:r>
+        <w:rPr>
+          <w:b/>
+          <w:bCs/>
+        </w:rPr>
+        <w:t xml:space="preserve">`sy_facgce`</w:t>
+      </w:r>
+      <w:r>
+        <w:t xml:space="preserve">, </w:t>
+      </w:r>
+      <w:r>
+        <w:rPr>
+          <w:b/>
+          <w:bCs/>
+        </w:rPr>
+        <w:t xml:space="preserve">`sy_cgcgce`</w:t>
+      </w:r>
+      <w:r>
+        <w:t xml:space="preserve">, </w:t>
+      </w:r>
+      <w:r>
+        <w:rPr>
+          <w:b/>
+          <w:bCs/>
+        </w:rPr>
+        <w:t xml:space="preserve">`sy_dgdgbd`</w:t>
+      </w:r>
+      <w:r>
+        <w:t xml:space="preserve">, </w:t>
+      </w:r>
+      <w:r>
+        <w:rPr>
+          <w:b/>
+          <w:bCs/>
+        </w:rPr>
+        <w:t xml:space="preserve">`open_g`</w:t>
+      </w:r>
+      <w:r>
+        <w:t xml:space="preserve">, </w:t>
+      </w:r>
+      <w:r>
+        <w:rPr>
+          <w:b/>
+          <w:bCs/>
+        </w:rPr>
+        <w:t xml:space="preserve">`drone_cluster_1`</w:t>
+      </w:r>
+      <w:r>
+        <w:t xml:space="preserve">, </w:t>
+      </w:r>
+      <w:r>
+        <w:rPr>
+          <w:b/>
+          <w:bCs/>
+        </w:rPr>
+        <w:t xml:space="preserve">`drone_cluster_2`</w:t>
+      </w:r>
+      <w:r>
+        <w:t xml:space="preserve">; </w:t>
       </w:r>
       <w:r>
         <w:rPr>
@@ -30244,17 +30784,117 @@
         <w:t xml:space="preserve">Joni Mitchell</w:t>
       </w:r>
       <w:r>
-        <w:t xml:space="preserve"> (and related) </w:t>
-      </w:r>
-      <w:r>
-        <w:rPr>
-          <w:b/>
-          <w:bCs/>
-        </w:rPr>
-        <w:t xml:space="preserve">altered-tuning presets</w:t>
-      </w:r>
-      <w:r>
-        <w:t xml:space="preserve"> already live in </w:t>
+        <w:t xml:space="preserve"> — </w:t>
+      </w:r>
+      <w:r>
+        <w:rPr>
+          <w:b/>
+          <w:bCs/>
+        </w:rPr>
+        <w:t xml:space="preserve">`dadgad`</w:t>
+      </w:r>
+      <w:r>
+        <w:t xml:space="preserve">, </w:t>
+      </w:r>
+      <w:r>
+        <w:rPr>
+          <w:b/>
+          <w:bCs/>
+        </w:rPr>
+        <w:t xml:space="preserve">`open_d`</w:t>
+      </w:r>
+      <w:r>
+        <w:t xml:space="preserve">, </w:t>
+      </w:r>
+      <w:r>
+        <w:rPr>
+          <w:b/>
+          <w:bCs/>
+        </w:rPr>
+        <w:t xml:space="preserve">`joni_style_open_color`</w:t>
+      </w:r>
+      <w:r>
+        <w:t xml:space="preserve">, </w:t>
+      </w:r>
+      <w:r>
+        <w:rPr>
+          <w:b/>
+          <w:bCs/>
+        </w:rPr>
+        <w:t xml:space="preserve">`joni_style_hybrid_resonance`</w:t>
+      </w:r>
+      <w:r>
+        <w:t xml:space="preserve">, </w:t>
+      </w:r>
+      <w:r>
+        <w:rPr>
+          <w:b/>
+          <w:bCs/>
+        </w:rPr>
+        <w:t xml:space="preserve">`joni_dgdfce`</w:t>
+      </w:r>
+      <w:r>
+        <w:t xml:space="preserve">, </w:t>
+      </w:r>
+      <w:r>
+        <w:rPr>
+          <w:b/>
+          <w:bCs/>
+        </w:rPr>
+        <w:t xml:space="preserve">`joni_cgefge`</w:t>
+      </w:r>
+      <w:r>
+        <w:t xml:space="preserve">, </w:t>
+      </w:r>
+      <w:r>
+        <w:rPr>
+          <w:b/>
+          <w:bCs/>
+        </w:rPr>
+        <w:t xml:space="preserve">`joni_cgdgbe`</w:t>
+      </w:r>
+      <w:r>
+        <w:t xml:space="preserve">, </w:t>
+      </w:r>
+      <w:r>
+        <w:rPr>
+          <w:b/>
+          <w:bCs/>
+        </w:rPr>
+        <w:t xml:space="preserve">`joni_dadgbe`</w:t>
+      </w:r>
+      <w:r>
+        <w:t xml:space="preserve">, </w:t>
+      </w:r>
+      <w:r>
+        <w:rPr>
+          <w:b/>
+          <w:bCs/>
+        </w:rPr>
+        <w:t xml:space="preserve">`joni_dadfad`</w:t>
+      </w:r>
+      <w:r>
+        <w:t xml:space="preserve">, </w:t>
+      </w:r>
+      <w:r>
+        <w:rPr>
+          <w:b/>
+          <w:bCs/>
+        </w:rPr>
+        <w:t xml:space="preserve">`joni_eeeebe`</w:t>
+      </w:r>
+      <w:r>
+        <w:t xml:space="preserve">. Unrecognised </w:t>
+      </w:r>
+      <w:r>
+        <w:rPr>
+          <w:b/>
+          <w:bCs/>
+        </w:rPr>
+        <w:t xml:space="preserve">`tuningId`</w:t>
+      </w:r>
+      <w:r>
+        <w:t xml:space="preserve"> falls back to standard E. New tunings: add </w:t>
       </w:r>
       <w:r>
         <w:rPr>
@@ -30264,37 +30904,37 @@
         <w:t xml:space="preserve">`alternateGuitarTunings.ts`</w:t>
       </w:r>
       <w:r>
-        <w:t xml:space="preserve">; this build </w:t>
-      </w:r>
-      <w:r>
-        <w:rPr>
-          <w:b/>
-          <w:bCs/>
-        </w:rPr>
-        <w:t xml:space="preserve">recomputes fret positions</w:t>
-      </w:r>
-      <w:r>
-        <w:t xml:space="preserve"> from each preset’s </w:t>
-      </w:r>
-      <w:r>
-        <w:rPr>
-          <w:b/>
-          <w:bCs/>
-        </w:rPr>
-        <w:t xml:space="preserve">six string pitches</w:t>
-      </w:r>
-      <w:r>
-        <w:t xml:space="preserve"> so </w:t>
-      </w:r>
-      <w:r>
-        <w:rPr>
-          <w:b/>
-          <w:bCs/>
-        </w:rPr>
-        <w:t xml:space="preserve">`buildGuitarGripLibrary` / `generateVaultRiff`</w:t>
-      </w:r>
-      <w:r>
-        <w:t xml:space="preserve"> match the user’s tuning in the field, not E-standard only.</w:t>
+        <w:t xml:space="preserve"> row only — </w:t>
+      </w:r>
+      <w:r>
+        <w:rPr>
+          <w:b/>
+          <w:bCs/>
+        </w:rPr>
+        <w:t xml:space="preserve">no</w:t>
+      </w:r>
+      <w:r>
+        <w:t xml:space="preserve"> grip-library / riff-generator / Vault-engine changes (see </w:t>
+      </w:r>
+      <w:r>
+        <w:rPr>
+          <w:b/>
+          <w:bCs/>
+        </w:rPr>
+        <w:t xml:space="preserve">Future Tunings (guitar)</w:t>
+      </w:r>
+      <w:r>
+        <w:t xml:space="preserve"> under </w:t>
+      </w:r>
+      <w:r>
+        <w:rPr>
+          <w:b/>
+          <w:bCs/>
+        </w:rPr>
+        <w:t xml:space="preserve">Build C</w:t>
+      </w:r>
+      <w:r>
+        <w:t xml:space="preserve">).</w:t>
       </w:r>
     </w:p>
     <w:p>
@@ -31680,6 +32320,16 @@
         <w:t xml:space="preserve">G</w:t>
       </w:r>
       <w:r>
+        <w:t xml:space="preserve"> and </w:t>
+      </w:r>
+      <w:r>
+        <w:rPr>
+          <w:b/>
+          <w:bCs/>
+        </w:rPr>
+        <w:t xml:space="preserve">C2</w:t>
+      </w:r>
+      <w:r>
         <w:t xml:space="preserve"> are </w:t>
       </w:r>
       <w:r>
@@ -31707,10 +32357,10 @@
           <w:b/>
           <w:bCs/>
         </w:rPr>
-        <w:t xml:space="preserve">Build C2</w:t>
-      </w:r>
-      <w:r>
-        <w:t xml:space="preserve"> (alt tuning extension). Planned sequencing for </w:t>
+        <w:t xml:space="preserve">Build H</w:t>
+      </w:r>
+      <w:r>
+        <w:t xml:space="preserve"> (GCE-targeted generation). Planned sequencing for </w:t>
       </w:r>
       <w:r>
         <w:rPr>
@@ -31732,7 +32382,7 @@
           <w:b/>
           <w:bCs/>
         </w:rPr>
-        <w:t xml:space="preserve">C2 → H → UI → IMG</w:t>
+        <w:t xml:space="preserve">H → UI → IMG</w:t>
       </w:r>
     </w:p>
     <w:p>

</xml_diff>

<commit_message>
docs: Build H complete — GCE-targeted generation quality gate documented, roadmap updated
Co-authored-by: Cursor <cursoragent@cursor.com>
</commit_message>
<xml_diff>
--- a/docs/COMPOSER_OS_PLAYBOOK.docx
+++ b/docs/COMPOSER_OS_PLAYBOOK.docx
@@ -30271,6 +30271,663 @@
         <w:spacing w:after="100" w:before="160"/>
       </w:pPr>
       <w:r>
+        <w:t xml:space="preserve">Build H — GCE-targeted generation (**complete**)</w:t>
+      </w:r>
+    </w:p>
+    <w:p>
+      <w:pPr>
+        <w:spacing w:after="160"/>
+      </w:pPr>
+      <w:r>
+        <w:rPr>
+          <w:b/>
+          <w:bCs/>
+        </w:rPr>
+        <w:t xml:space="preserve">Shipped</w:t>
+      </w:r>
+      <w:r>
+        <w:t xml:space="preserve"> in `engines/composer-os-v2/core/evaluation/` — </w:t>
+      </w:r>
+      <w:r>
+        <w:rPr>
+          <w:b/>
+          <w:bCs/>
+        </w:rPr>
+        <w:t xml:space="preserve">`gceTargetedGenerator.ts`</w:t>
+      </w:r>
+      <w:r>
+        <w:t xml:space="preserve"> (re-exported from </w:t>
+      </w:r>
+      <w:r>
+        <w:rPr>
+          <w:b/>
+          <w:bCs/>
+        </w:rPr>
+        <w:t xml:space="preserve">`evaluation/index.ts`</w:t>
+      </w:r>
+      <w:r>
+        <w:t xml:space="preserve">).</w:t>
+      </w:r>
+    </w:p>
+    <w:p>
+      <w:pPr>
+        <w:spacing w:after="160"/>
+      </w:pPr>
+      <w:r>
+        <w:t xml:space="preserve">This is the </w:t>
+      </w:r>
+      <w:r>
+        <w:rPr>
+          <w:b/>
+          <w:bCs/>
+        </w:rPr>
+        <w:t xml:space="preserve">quality gate</w:t>
+      </w:r>
+      <w:r>
+        <w:t xml:space="preserve"> for aiming at </w:t>
+      </w:r>
+      <w:r>
+        <w:rPr>
+          <w:b/>
+          <w:bCs/>
+        </w:rPr>
+        <w:t xml:space="preserve">GCE 9+</w:t>
+      </w:r>
+      <w:r>
+        <w:t xml:space="preserve">-grade output: </w:t>
+      </w:r>
+      <w:r>
+        <w:rPr>
+          <w:b/>
+          <w:bCs/>
+        </w:rPr>
+        <w:t xml:space="preserve">evaluate before you ship</w:t>
+      </w:r>
+      <w:r>
+        <w:t xml:space="preserve"> — not infinite regeneration. Wire </w:t>
+      </w:r>
+      <w:r>
+        <w:rPr>
+          <w:b/>
+          <w:bCs/>
+        </w:rPr>
+        <w:t xml:space="preserve">`evaluate`</w:t>
+      </w:r>
+      <w:r>
+        <w:t xml:space="preserve"> to your </w:t>
+      </w:r>
+      <w:r>
+        <w:rPr>
+          <w:b/>
+          <w:bCs/>
+        </w:rPr>
+        <w:t xml:space="preserve">GCE</w:t>
+      </w:r>
+      <w:r>
+        <w:t xml:space="preserve"> / </w:t>
+      </w:r>
+      <w:r>
+        <w:rPr>
+          <w:b/>
+          <w:bCs/>
+        </w:rPr>
+        <w:t xml:space="preserve">LOCK</w:t>
+      </w:r>
+      <w:r>
+        <w:t xml:space="preserve"> / </w:t>
+      </w:r>
+      <w:r>
+        <w:rPr>
+          <w:b/>
+          <w:bCs/>
+        </w:rPr>
+        <w:t xml:space="preserve">Style Profile</w:t>
+      </w:r>
+      <w:r>
+        <w:t xml:space="preserve"> / </w:t>
+      </w:r>
+      <w:r>
+        <w:rPr>
+          <w:b/>
+          <w:bCs/>
+        </w:rPr>
+        <w:t xml:space="preserve">quadratonic alignment</w:t>
+      </w:r>
+      <w:r>
+        <w:t xml:space="preserve"> scores (three numeric inputs below).</w:t>
+      </w:r>
+    </w:p>
+    <w:p>
+      <w:pPr>
+        <w:spacing w:after="160"/>
+      </w:pPr>
+      <w:r>
+        <w:rPr>
+          <w:b/>
+          <w:bCs/>
+        </w:rPr>
+        <w:t xml:space="preserve">`GCEGenerationTarget`</w:t>
+      </w:r>
+    </w:p>
+    <w:tbl>
+      <w:tblPr>
+        <w:tblW w:type="pct" w:w="100%"/>
+        <w:tblBorders>
+          <w:top w:val="single" w:color="auto" w:sz="4"/>
+          <w:left w:val="single" w:color="auto" w:sz="4"/>
+          <w:bottom w:val="single" w:color="auto" w:sz="4"/>
+          <w:right w:val="single" w:color="auto" w:sz="4"/>
+          <w:insideH w:val="single" w:color="auto" w:sz="4"/>
+          <w:insideV w:val="single" w:color="auto" w:sz="4"/>
+        </w:tblBorders>
+      </w:tblPr>
+      <w:tblGrid>
+        <w:gridCol w:w="4500"/>
+        <w:gridCol w:w="4500"/>
+      </w:tblGrid>
+      <w:tr>
+        <w:tc>
+          <w:tcPr>
+            <w:tcW w:type="pct" w:w="4500%"/>
+          </w:tcPr>
+          <w:p>
+            <w:pPr>
+              <w:spacing w:after="60"/>
+            </w:pPr>
+            <w:r>
+              <w:t xml:space="preserve">Field</w:t>
+            </w:r>
+          </w:p>
+        </w:tc>
+        <w:tc>
+          <w:tcPr>
+            <w:tcW w:type="pct" w:w="4500%"/>
+          </w:tcPr>
+          <w:p>
+            <w:pPr>
+              <w:spacing w:after="60"/>
+            </w:pPr>
+            <w:r>
+              <w:t xml:space="preserve">Purpose</w:t>
+            </w:r>
+          </w:p>
+        </w:tc>
+      </w:tr>
+      <w:tr>
+        <w:tc>
+          <w:tcPr>
+            <w:tcW w:type="pct" w:w="4500%"/>
+          </w:tcPr>
+          <w:p>
+            <w:pPr>
+              <w:spacing w:after="60"/>
+            </w:pPr>
+            <w:r>
+              <w:rPr>
+                <w:b/>
+                <w:bCs/>
+              </w:rPr>
+              <w:t xml:space="preserve">`minScore`</w:t>
+            </w:r>
+          </w:p>
+        </w:tc>
+        <w:tc>
+          <w:tcPr>
+            <w:tcW w:type="pct" w:w="4500%"/>
+          </w:tcPr>
+          <w:p>
+            <w:pPr>
+              <w:spacing w:after="60"/>
+            </w:pPr>
+            <w:r>
+              <w:t xml:space="preserve">Weighted score threshold (default </w:t>
+            </w:r>
+            <w:r>
+              <w:rPr>
+                <w:b/>
+                <w:bCs/>
+              </w:rPr>
+              <w:t xml:space="preserve">8.5</w:t>
+            </w:r>
+            <w:r>
+              <w:t xml:space="preserve">).</w:t>
+            </w:r>
+          </w:p>
+        </w:tc>
+      </w:tr>
+      <w:tr>
+        <w:tc>
+          <w:tcPr>
+            <w:tcW w:type="pct" w:w="4500%"/>
+          </w:tcPr>
+          <w:p>
+            <w:pPr>
+              <w:spacing w:after="60"/>
+            </w:pPr>
+            <w:r>
+              <w:rPr>
+                <w:b/>
+                <w:bCs/>
+              </w:rPr>
+              <w:t xml:space="preserve">`maxRefinementPasses`</w:t>
+            </w:r>
+          </w:p>
+        </w:tc>
+        <w:tc>
+          <w:tcPr>
+            <w:tcW w:type="pct" w:w="4500%"/>
+          </w:tcPr>
+          <w:p>
+            <w:pPr>
+              <w:spacing w:after="60"/>
+            </w:pPr>
+            <w:r>
+              <w:t xml:space="preserve">Hard cap on refinement iterations (</w:t>
+            </w:r>
+            <w:r>
+              <w:rPr>
+                <w:b/>
+                <w:bCs/>
+              </w:rPr>
+              <w:t xml:space="preserve">DCR:</w:t>
+            </w:r>
+            <w:r>
+              <w:t xml:space="preserve"> default </w:t>
+            </w:r>
+            <w:r>
+              <w:rPr>
+                <w:b/>
+                <w:bCs/>
+              </w:rPr>
+              <w:t xml:space="preserve">1</w:t>
+            </w:r>
+            <w:r>
+              <w:t xml:space="preserve"> — at most </w:t>
+            </w:r>
+            <w:r>
+              <w:rPr>
+                <w:b/>
+                <w:bCs/>
+              </w:rPr>
+              <w:t xml:space="preserve">one</w:t>
+            </w:r>
+            <w:r>
+              <w:t xml:space="preserve"> pass).</w:t>
+            </w:r>
+          </w:p>
+        </w:tc>
+      </w:tr>
+      <w:tr>
+        <w:tc>
+          <w:tcPr>
+            <w:tcW w:type="pct" w:w="4500%"/>
+          </w:tcPr>
+          <w:p>
+            <w:pPr>
+              <w:spacing w:after="60"/>
+            </w:pPr>
+            <w:r>
+              <w:rPr>
+                <w:b/>
+                <w:bCs/>
+              </w:rPr>
+              <w:t xml:space="preserve">`weights`</w:t>
+            </w:r>
+          </w:p>
+        </w:tc>
+        <w:tc>
+          <w:tcPr>
+            <w:tcW w:type="pct" w:w="4500%"/>
+          </w:tcPr>
+          <w:p>
+            <w:pPr>
+              <w:spacing w:after="60"/>
+            </w:pPr>
+            <w:r>
+              <w:rPr>
+                <w:b/>
+                <w:bCs/>
+              </w:rPr>
+              <w:t xml:space="preserve">`gce`</w:t>
+            </w:r>
+            <w:r>
+              <w:t xml:space="preserve">, </w:t>
+            </w:r>
+            <w:r>
+              <w:rPr>
+                <w:b/>
+                <w:bCs/>
+              </w:rPr>
+              <w:t xml:space="preserve">`style`</w:t>
+            </w:r>
+            <w:r>
+              <w:t xml:space="preserve">, </w:t>
+            </w:r>
+            <w:r>
+              <w:rPr>
+                <w:b/>
+                <w:bCs/>
+              </w:rPr>
+              <w:t xml:space="preserve">`quadratonicAlignment`</w:t>
+            </w:r>
+            <w:r>
+              <w:t xml:space="preserve"> — blend the three sub-scores into </w:t>
+            </w:r>
+            <w:r>
+              <w:rPr>
+                <w:b/>
+                <w:bCs/>
+              </w:rPr>
+              <w:t xml:space="preserve">`finalScore`</w:t>
+            </w:r>
+            <w:r>
+              <w:t xml:space="preserve">.</w:t>
+            </w:r>
+          </w:p>
+        </w:tc>
+      </w:tr>
+    </w:tbl>
+    <w:p>
+      <w:pPr>
+        <w:spacing w:after="160"/>
+      </w:pPr>
+    </w:p>
+    <w:p>
+      <w:pPr>
+        <w:spacing w:after="160"/>
+      </w:pPr>
+      <w:r>
+        <w:rPr>
+          <w:b/>
+          <w:bCs/>
+        </w:rPr>
+        <w:t xml:space="preserve">`DEFAULT_GCE_TARGET`</w:t>
+      </w:r>
+      <w:r>
+        <w:t xml:space="preserve"> — </w:t>
+      </w:r>
+      <w:r>
+        <w:rPr>
+          <w:b/>
+          <w:bCs/>
+        </w:rPr>
+        <w:t xml:space="preserve">`minScore` 8.5</w:t>
+      </w:r>
+      <w:r>
+        <w:t xml:space="preserve">, </w:t>
+      </w:r>
+      <w:r>
+        <w:rPr>
+          <w:b/>
+          <w:bCs/>
+        </w:rPr>
+        <w:t xml:space="preserve">`maxRefinementPasses` 1</w:t>
+      </w:r>
+      <w:r>
+        <w:t xml:space="preserve">, </w:t>
+      </w:r>
+      <w:r>
+        <w:rPr>
+          <w:b/>
+          <w:bCs/>
+        </w:rPr>
+        <w:t xml:space="preserve">`weights`:</w:t>
+      </w:r>
+      <w:r>
+        <w:t xml:space="preserve"> </w:t>
+      </w:r>
+      <w:r>
+        <w:rPr>
+          <w:b/>
+          <w:bCs/>
+        </w:rPr>
+        <w:t xml:space="preserve">`gce` 0.5</w:t>
+      </w:r>
+      <w:r>
+        <w:t xml:space="preserve">, </w:t>
+      </w:r>
+      <w:r>
+        <w:rPr>
+          <w:b/>
+          <w:bCs/>
+        </w:rPr>
+        <w:t xml:space="preserve">`style` 0.3</w:t>
+      </w:r>
+      <w:r>
+        <w:t xml:space="preserve">, </w:t>
+      </w:r>
+      <w:r>
+        <w:rPr>
+          <w:b/>
+          <w:bCs/>
+        </w:rPr>
+        <w:t xml:space="preserve">`quadratonicAlignment` 0.2</w:t>
+      </w:r>
+      <w:r>
+        <w:t xml:space="preserve">.</w:t>
+      </w:r>
+    </w:p>
+    <w:p>
+      <w:pPr>
+        <w:spacing w:after="160"/>
+      </w:pPr>
+      <w:r>
+        <w:rPr>
+          <w:b/>
+          <w:bCs/>
+        </w:rPr>
+        <w:t xml:space="preserve">`runWithGCETarget&lt;T&gt;(generate, evaluate, refine, target)`</w:t>
+      </w:r>
+      <w:r>
+        <w:t xml:space="preserve"> — calls </w:t>
+      </w:r>
+      <w:r>
+        <w:rPr>
+          <w:b/>
+          <w:bCs/>
+        </w:rPr>
+        <w:t xml:space="preserve">`generate()`</w:t>
+      </w:r>
+      <w:r>
+        <w:t xml:space="preserve"> once for the initial candidate; </w:t>
+      </w:r>
+      <w:r>
+        <w:rPr>
+          <w:b/>
+          <w:bCs/>
+        </w:rPr>
+        <w:t xml:space="preserve">`evaluate(output)`</w:t>
+      </w:r>
+      <w:r>
+        <w:t xml:space="preserve"> returns </w:t>
+      </w:r>
+      <w:r>
+        <w:rPr>
+          <w:b/>
+          <w:bCs/>
+        </w:rPr>
+        <w:t xml:space="preserve">`{ gce, style, quadratonicAlignment }`</w:t>
+      </w:r>
+      <w:r>
+        <w:t xml:space="preserve">; </w:t>
+      </w:r>
+      <w:r>
+        <w:rPr>
+          <w:b/>
+          <w:bCs/>
+        </w:rPr>
+        <w:t xml:space="preserve">`finalScore`</w:t>
+      </w:r>
+      <w:r>
+        <w:t xml:space="preserve"> = weighted sum using </w:t>
+      </w:r>
+      <w:r>
+        <w:rPr>
+          <w:b/>
+          <w:bCs/>
+        </w:rPr>
+        <w:t xml:space="preserve">`target.weights`</w:t>
+      </w:r>
+      <w:r>
+        <w:t xml:space="preserve">. If </w:t>
+      </w:r>
+      <w:r>
+        <w:rPr>
+          <w:b/>
+          <w:bCs/>
+        </w:rPr>
+        <w:t xml:space="preserve">`finalScore &lt; minScore`</w:t>
+      </w:r>
+      <w:r>
+        <w:t xml:space="preserve"> and </w:t>
+      </w:r>
+      <w:r>
+        <w:rPr>
+          <w:b/>
+          <w:bCs/>
+        </w:rPr>
+        <w:t xml:space="preserve">`refinementPasses &lt; maxRefinementPasses`</w:t>
+      </w:r>
+      <w:r>
+        <w:t xml:space="preserve">, calls </w:t>
+      </w:r>
+      <w:r>
+        <w:rPr>
+          <w:b/>
+          <w:bCs/>
+        </w:rPr>
+        <w:t xml:space="preserve">`refine(output, breakdown)`</w:t>
+      </w:r>
+      <w:r>
+        <w:t xml:space="preserve"> once (per pass), re-runs </w:t>
+      </w:r>
+      <w:r>
+        <w:rPr>
+          <w:b/>
+          <w:bCs/>
+        </w:rPr>
+        <w:t xml:space="preserve">`evaluate`</w:t>
+      </w:r>
+      <w:r>
+        <w:t xml:space="preserve">, recomputes </w:t>
+      </w:r>
+      <w:r>
+        <w:rPr>
+          <w:b/>
+          <w:bCs/>
+        </w:rPr>
+        <w:t xml:space="preserve">`finalScore`</w:t>
+      </w:r>
+      <w:r>
+        <w:t xml:space="preserve">. </w:t>
+      </w:r>
+      <w:r>
+        <w:rPr>
+          <w:b/>
+          <w:bCs/>
+        </w:rPr>
+        <w:t xml:space="preserve">Never</w:t>
+      </w:r>
+      <w:r>
+        <w:t xml:space="preserve"> loops more than </w:t>
+      </w:r>
+      <w:r>
+        <w:rPr>
+          <w:b/>
+          <w:bCs/>
+        </w:rPr>
+        <w:t xml:space="preserve">`maxRefinementPasses`</w:t>
+      </w:r>
+      <w:r>
+        <w:t xml:space="preserve"> times. Returns </w:t>
+      </w:r>
+      <w:r>
+        <w:rPr>
+          <w:b/>
+          <w:bCs/>
+        </w:rPr>
+        <w:t xml:space="preserve">`GCEGenerationResult`</w:t>
+      </w:r>
+      <w:r>
+        <w:t xml:space="preserve">: </w:t>
+      </w:r>
+      <w:r>
+        <w:rPr>
+          <w:b/>
+          <w:bCs/>
+        </w:rPr>
+        <w:t xml:space="preserve">`output`</w:t>
+      </w:r>
+      <w:r>
+        <w:t xml:space="preserve">, </w:t>
+      </w:r>
+      <w:r>
+        <w:rPr>
+          <w:b/>
+          <w:bCs/>
+        </w:rPr>
+        <w:t xml:space="preserve">`finalScore`</w:t>
+      </w:r>
+      <w:r>
+        <w:t xml:space="preserve">, </w:t>
+      </w:r>
+      <w:r>
+        <w:rPr>
+          <w:b/>
+          <w:bCs/>
+        </w:rPr>
+        <w:t xml:space="preserve">`passedTarget`</w:t>
+      </w:r>
+      <w:r>
+        <w:t xml:space="preserve"> (</w:t>
+      </w:r>
+      <w:r>
+        <w:rPr>
+          <w:b/>
+          <w:bCs/>
+        </w:rPr>
+        <w:t xml:space="preserve">`finalScore &gt;= minScore`</w:t>
+      </w:r>
+      <w:r>
+        <w:t xml:space="preserve">), </w:t>
+      </w:r>
+      <w:r>
+        <w:rPr>
+          <w:b/>
+          <w:bCs/>
+        </w:rPr>
+        <w:t xml:space="preserve">`refinementPasses`</w:t>
+      </w:r>
+      <w:r>
+        <w:t xml:space="preserve">, </w:t>
+      </w:r>
+      <w:r>
+        <w:rPr>
+          <w:b/>
+          <w:bCs/>
+        </w:rPr>
+        <w:t xml:space="preserve">`evaluationBreakdown`</w:t>
+      </w:r>
+      <w:r>
+        <w:t xml:space="preserve"> (final </w:t>
+      </w:r>
+      <w:r>
+        <w:rPr>
+          <w:b/>
+          <w:bCs/>
+        </w:rPr>
+        <w:t xml:space="preserve">gce / style / quadratonicAlignment</w:t>
+      </w:r>
+      <w:r>
+        <w:t xml:space="preserve">).</w:t>
+      </w:r>
+    </w:p>
+    <w:p>
+      <w:pPr>
+        <w:pStyle w:val="Heading2"/>
+        <w:spacing w:after="100" w:before="160"/>
+      </w:pPr>
+      <w:r>
         <w:t xml:space="preserve">Planned builds (engine)</w:t>
       </w:r>
     </w:p>
@@ -30950,7 +31607,7 @@
           <w:b/>
           <w:bCs/>
         </w:rPr>
-        <w:t xml:space="preserve">Build UI — Visual fretboard (deferred):</w:t>
+        <w:t xml:space="preserve">Build H — GCE-targeted generation:</w:t>
       </w:r>
       <w:r>
         <w:t xml:space="preserve"> </w:t>
@@ -30960,17 +31617,37 @@
           <w:b/>
           <w:bCs/>
         </w:rPr>
-        <w:t xml:space="preserve">fretboard.js</w:t>
-      </w:r>
-      <w:r>
-        <w:t xml:space="preserve"> + </w:t>
-      </w:r>
-      <w:r>
-        <w:rPr>
-          <w:b/>
-          <w:bCs/>
-        </w:rPr>
-        <w:t xml:space="preserve">VexFlow</w:t>
+        <w:t xml:space="preserve">Complete</w:t>
+      </w:r>
+      <w:r>
+        <w:t xml:space="preserve"> — see </w:t>
+      </w:r>
+      <w:r>
+        <w:rPr>
+          <w:b/>
+          <w:bCs/>
+        </w:rPr>
+        <w:t xml:space="preserve">Build H</w:t>
+      </w:r>
+      <w:r>
+        <w:t xml:space="preserve"> subsection above; </w:t>
+      </w:r>
+      <w:r>
+        <w:rPr>
+          <w:b/>
+          <w:bCs/>
+        </w:rPr>
+        <w:t xml:space="preserve">`gceTargetedGenerator.ts`</w:t>
+      </w:r>
+      <w:r>
+        <w:t xml:space="preserve"> (</w:t>
+      </w:r>
+      <w:r>
+        <w:rPr>
+          <w:b/>
+          <w:bCs/>
+        </w:rPr>
+        <w:t xml:space="preserve">`runWithGCETarget`</w:t>
       </w:r>
       <w:r>
         <w:t xml:space="preserve">, </w:t>
@@ -30980,30 +31657,20 @@
           <w:b/>
           <w:bCs/>
         </w:rPr>
-        <w:t xml:space="preserve">three SVG layers</w:t>
-      </w:r>
-      <w:r>
-        <w:t xml:space="preserve"> (grid, active grip, legality heat). </w:t>
-      </w:r>
-      <w:r>
-        <w:rPr>
-          <w:b/>
-          <w:bCs/>
-        </w:rPr>
-        <w:t xml:space="preserve">Deferred</w:t>
-      </w:r>
-      <w:r>
-        <w:t xml:space="preserve"> until the </w:t>
-      </w:r>
-      <w:r>
-        <w:rPr>
-          <w:b/>
-          <w:bCs/>
-        </w:rPr>
-        <w:t xml:space="preserve">engine</w:t>
-      </w:r>
-      <w:r>
-        <w:t xml:space="preserve"> paths above are stable in production.</w:t>
+        <w:t xml:space="preserve">`GCEGenerationTarget`</w:t>
+      </w:r>
+      <w:r>
+        <w:t xml:space="preserve">, </w:t>
+      </w:r>
+      <w:r>
+        <w:rPr>
+          <w:b/>
+          <w:bCs/>
+        </w:rPr>
+        <w:t xml:space="preserve">`DEFAULT_GCE_TARGET`</w:t>
+      </w:r>
+      <w:r>
+        <w:t xml:space="preserve">).</w:t>
       </w:r>
     </w:p>
     <w:p>
@@ -31019,20 +31686,60 @@
           <w:b/>
           <w:bCs/>
         </w:rPr>
-        <w:t xml:space="preserve">Build IMG — iReal Pro import + optional vision:</w:t>
-      </w:r>
-      <w:r>
-        <w:t xml:space="preserve"> See </w:t>
-      </w:r>
-      <w:r>
-        <w:rPr>
-          <w:b/>
-          <w:bCs/>
-        </w:rPr>
-        <w:t xml:space="preserve">Build IMG — iReal Pro import</w:t>
-      </w:r>
-      <w:r>
-        <w:t xml:space="preserve"> below (data pipeline + optional screenshot path).</w:t>
+        <w:t xml:space="preserve">Build UI — Visual fretboard (deferred):</w:t>
+      </w:r>
+      <w:r>
+        <w:t xml:space="preserve"> </w:t>
+      </w:r>
+      <w:r>
+        <w:rPr>
+          <w:b/>
+          <w:bCs/>
+        </w:rPr>
+        <w:t xml:space="preserve">fretboard.js</w:t>
+      </w:r>
+      <w:r>
+        <w:t xml:space="preserve"> + </w:t>
+      </w:r>
+      <w:r>
+        <w:rPr>
+          <w:b/>
+          <w:bCs/>
+        </w:rPr>
+        <w:t xml:space="preserve">VexFlow</w:t>
+      </w:r>
+      <w:r>
+        <w:t xml:space="preserve">, </w:t>
+      </w:r>
+      <w:r>
+        <w:rPr>
+          <w:b/>
+          <w:bCs/>
+        </w:rPr>
+        <w:t xml:space="preserve">three SVG layers</w:t>
+      </w:r>
+      <w:r>
+        <w:t xml:space="preserve"> (grid, active grip, legality heat). </w:t>
+      </w:r>
+      <w:r>
+        <w:rPr>
+          <w:b/>
+          <w:bCs/>
+        </w:rPr>
+        <w:t xml:space="preserve">Deferred</w:t>
+      </w:r>
+      <w:r>
+        <w:t xml:space="preserve"> until the </w:t>
+      </w:r>
+      <w:r>
+        <w:rPr>
+          <w:b/>
+          <w:bCs/>
+        </w:rPr>
+        <w:t xml:space="preserve">engine</w:t>
+      </w:r>
+      <w:r>
+        <w:t xml:space="preserve"> paths above are stable in production.</w:t>
       </w:r>
     </w:p>
     <w:p>
@@ -31048,130 +31755,20 @@
           <w:b/>
           <w:bCs/>
         </w:rPr>
-        <w:t xml:space="preserve">Build H — GCE-targeted generation (planned):</w:t>
-      </w:r>
-      <w:r>
-        <w:t xml:space="preserve"> After generation, evaluate against </w:t>
-      </w:r>
-      <w:r>
-        <w:rPr>
-          <w:b/>
-          <w:bCs/>
-        </w:rPr>
-        <w:t xml:space="preserve">GCE</w:t>
-      </w:r>
-      <w:r>
-        <w:t xml:space="preserve"> + </w:t>
-      </w:r>
-      <w:r>
-        <w:rPr>
-          <w:b/>
-          <w:bCs/>
-        </w:rPr>
-        <w:t xml:space="preserve">LOCK</w:t>
-      </w:r>
-      <w:r>
-        <w:t xml:space="preserve"> + </w:t>
-      </w:r>
-      <w:r>
-        <w:rPr>
-          <w:b/>
-          <w:bCs/>
-        </w:rPr>
-        <w:t xml:space="preserve">Style Profile</w:t>
-      </w:r>
-      <w:r>
-        <w:t xml:space="preserve"> + </w:t>
-      </w:r>
-      <w:r>
-        <w:rPr>
-          <w:b/>
-          <w:bCs/>
-        </w:rPr>
-        <w:t xml:space="preserve">Quadratonic Alignment</w:t>
-      </w:r>
-      <w:r>
-        <w:t xml:space="preserve">. If below </w:t>
-      </w:r>
-      <w:r>
-        <w:rPr>
-          <w:b/>
-          <w:bCs/>
-        </w:rPr>
-        <w:t xml:space="preserve">`minScore`</w:t>
-      </w:r>
-      <w:r>
-        <w:t xml:space="preserve"> (default </w:t>
-      </w:r>
-      <w:r>
-        <w:rPr>
-          <w:b/>
-          <w:bCs/>
-        </w:rPr>
-        <w:t xml:space="preserve">8.5</w:t>
-      </w:r>
-      <w:r>
-        <w:t xml:space="preserve">), run </w:t>
-      </w:r>
-      <w:r>
-        <w:rPr>
-          <w:b/>
-          <w:bCs/>
-        </w:rPr>
-        <w:t xml:space="preserve">one</w:t>
-      </w:r>
-      <w:r>
-        <w:t xml:space="preserve"> refinement pass and re-evaluate. </w:t>
-      </w:r>
-      <w:r>
-        <w:rPr>
-          <w:b/>
-          <w:bCs/>
-        </w:rPr>
-        <w:t xml:space="preserve">Maximum one</w:t>
-      </w:r>
-      <w:r>
-        <w:t xml:space="preserve"> refinement loop per </w:t>
-      </w:r>
-      <w:r>
-        <w:rPr>
-          <w:b/>
-          <w:bCs/>
-        </w:rPr>
-        <w:t xml:space="preserve">DCR</w:t>
-      </w:r>
-      <w:r>
-        <w:t xml:space="preserve"> protocol — output is </w:t>
-      </w:r>
-      <w:r>
-        <w:rPr>
-          <w:b/>
-          <w:bCs/>
-        </w:rPr>
-        <w:t xml:space="preserve">quality-gated</w:t>
-      </w:r>
-      <w:r>
-        <w:t xml:space="preserve">, not infinitely regenerated. Aim: </w:t>
-      </w:r>
-      <w:r>
-        <w:rPr>
-          <w:b/>
-          <w:bCs/>
-        </w:rPr>
-        <w:t xml:space="preserve">GCE 9+</w:t>
-      </w:r>
-      <w:r>
-        <w:t xml:space="preserve">-grade material by </w:t>
-      </w:r>
-      <w:r>
-        <w:rPr>
-          <w:b/>
-          <w:bCs/>
-        </w:rPr>
-        <w:t xml:space="preserve">examining before shipping</w:t>
-      </w:r>
-      <w:r>
-        <w:t xml:space="preserve">.</w:t>
+        <w:t xml:space="preserve">Build IMG — iReal Pro import + optional vision:</w:t>
+      </w:r>
+      <w:r>
+        <w:t xml:space="preserve"> See </w:t>
+      </w:r>
+      <w:r>
+        <w:rPr>
+          <w:b/>
+          <w:bCs/>
+        </w:rPr>
+        <w:t xml:space="preserve">Build IMG — iReal Pro import</w:t>
+      </w:r>
+      <w:r>
+        <w:t xml:space="preserve"> below (data pipeline + optional screenshot path).</w:t>
       </w:r>
     </w:p>
     <w:p>
@@ -31873,7 +32470,7 @@
           <w:b/>
           <w:bCs/>
         </w:rPr>
-        <w:t xml:space="preserve">Reharmonisation</w:t>
+        <w:t xml:space="preserve">Build H</w:t>
       </w:r>
       <w:r>
         <w:t xml:space="preserve"> (</w:t>
@@ -31883,47 +32480,57 @@
           <w:b/>
           <w:bCs/>
         </w:rPr>
-        <w:t xml:space="preserve">Build D</w:t>
-      </w:r>
-      <w:r>
-        <w:t xml:space="preserve">, </w:t>
-      </w:r>
-      <w:r>
-        <w:rPr>
-          <w:b/>
-          <w:bCs/>
-        </w:rPr>
-        <w:t xml:space="preserve">`reharmCandidateEngine`</w:t>
-      </w:r>
-      <w:r>
-        <w:t xml:space="preserve">) </w:t>
-      </w:r>
-      <w:r>
-        <w:rPr>
-          <w:b/>
-          <w:bCs/>
-        </w:rPr>
-        <w:t xml:space="preserve">preserves or reinterprets melodic-triad identity</w:t>
-      </w:r>
-      <w:r>
-        <w:t xml:space="preserve"> while modernising </w:t>
-      </w:r>
-      <w:r>
-        <w:rPr>
-          <w:b/>
-          <w:bCs/>
-        </w:rPr>
-        <w:t xml:space="preserve">shells</w:t>
-      </w:r>
-      <w:r>
-        <w:t xml:space="preserve"> and colour — see </w:t>
-      </w:r>
-      <w:r>
-        <w:rPr>
-          <w:b/>
-          <w:bCs/>
-        </w:rPr>
-        <w:t xml:space="preserve">Revolutionary Reharmonisation Engine</w:t>
+        <w:t xml:space="preserve">`runWithGCETarget`</w:t>
+      </w:r>
+      <w:r>
+        <w:t xml:space="preserve">) is the </w:t>
+      </w:r>
+      <w:r>
+        <w:rPr>
+          <w:b/>
+          <w:bCs/>
+        </w:rPr>
+        <w:t xml:space="preserve">weighted quality gate</w:t>
+      </w:r>
+      <w:r>
+        <w:t xml:space="preserve"> (</w:t>
+      </w:r>
+      <w:r>
+        <w:rPr>
+          <w:b/>
+          <w:bCs/>
+        </w:rPr>
+        <w:t xml:space="preserve">GCE + style + quadratonic alignment</w:t>
+      </w:r>
+      <w:r>
+        <w:t xml:space="preserve">) with </w:t>
+      </w:r>
+      <w:r>
+        <w:rPr>
+          <w:b/>
+          <w:bCs/>
+        </w:rPr>
+        <w:t xml:space="preserve">at most one</w:t>
+      </w:r>
+      <w:r>
+        <w:t xml:space="preserve"> refinement pass — aim </w:t>
+      </w:r>
+      <w:r>
+        <w:rPr>
+          <w:b/>
+          <w:bCs/>
+        </w:rPr>
+        <w:t xml:space="preserve">GCE 9+</w:t>
+      </w:r>
+      <w:r>
+        <w:t xml:space="preserve"> by </w:t>
+      </w:r>
+      <w:r>
+        <w:rPr>
+          <w:b/>
+          <w:bCs/>
+        </w:rPr>
+        <w:t xml:space="preserve">scoring before release</w:t>
       </w:r>
       <w:r>
         <w:t xml:space="preserve">.</w:t>
@@ -31942,40 +32549,60 @@
           <w:b/>
           <w:bCs/>
         </w:rPr>
-        <w:t xml:space="preserve">String quartet</w:t>
-      </w:r>
-      <w:r>
-        <w:t xml:space="preserve"> sketches: each </w:t>
-      </w:r>
-      <w:r>
-        <w:rPr>
-          <w:b/>
-          <w:bCs/>
-        </w:rPr>
-        <w:t xml:space="preserve">voice</w:t>
-      </w:r>
-      <w:r>
-        <w:t xml:space="preserve"> can be assigned a different </w:t>
-      </w:r>
-      <w:r>
-        <w:rPr>
-          <w:b/>
-          <w:bCs/>
-        </w:rPr>
-        <w:t xml:space="preserve">tension layer</w:t>
-      </w:r>
-      <w:r>
-        <w:t xml:space="preserve"> so the ensemble moves as a </w:t>
-      </w:r>
-      <w:r>
-        <w:rPr>
-          <w:b/>
-          <w:bCs/>
-        </w:rPr>
-        <w:t xml:space="preserve">coherent</w:t>
-      </w:r>
-      <w:r>
-        <w:t xml:space="preserve"> harmonic unit.</w:t>
+        <w:t xml:space="preserve">Reharmonisation</w:t>
+      </w:r>
+      <w:r>
+        <w:t xml:space="preserve"> (</w:t>
+      </w:r>
+      <w:r>
+        <w:rPr>
+          <w:b/>
+          <w:bCs/>
+        </w:rPr>
+        <w:t xml:space="preserve">Build D</w:t>
+      </w:r>
+      <w:r>
+        <w:t xml:space="preserve">, </w:t>
+      </w:r>
+      <w:r>
+        <w:rPr>
+          <w:b/>
+          <w:bCs/>
+        </w:rPr>
+        <w:t xml:space="preserve">`reharmCandidateEngine`</w:t>
+      </w:r>
+      <w:r>
+        <w:t xml:space="preserve">) </w:t>
+      </w:r>
+      <w:r>
+        <w:rPr>
+          <w:b/>
+          <w:bCs/>
+        </w:rPr>
+        <w:t xml:space="preserve">preserves or reinterprets melodic-triad identity</w:t>
+      </w:r>
+      <w:r>
+        <w:t xml:space="preserve"> while modernising </w:t>
+      </w:r>
+      <w:r>
+        <w:rPr>
+          <w:b/>
+          <w:bCs/>
+        </w:rPr>
+        <w:t xml:space="preserve">shells</w:t>
+      </w:r>
+      <w:r>
+        <w:t xml:space="preserve"> and colour — see </w:t>
+      </w:r>
+      <w:r>
+        <w:rPr>
+          <w:b/>
+          <w:bCs/>
+        </w:rPr>
+        <w:t xml:space="preserve">Revolutionary Reharmonisation Engine</w:t>
+      </w:r>
+      <w:r>
+        <w:t xml:space="preserve">.</w:t>
       </w:r>
     </w:p>
     <w:p>
@@ -31991,50 +32618,40 @@
           <w:b/>
           <w:bCs/>
         </w:rPr>
-        <w:t xml:space="preserve">Big band:</w:t>
-      </w:r>
-      <w:r>
-        <w:t xml:space="preserve"> </w:t>
-      </w:r>
-      <w:r>
-        <w:rPr>
-          <w:b/>
-          <w:bCs/>
-        </w:rPr>
-        <w:t xml:space="preserve">arranger style profiles</w:t>
-      </w:r>
-      <w:r>
-        <w:t xml:space="preserve"> + </w:t>
-      </w:r>
-      <w:r>
-        <w:rPr>
-          <w:b/>
-          <w:bCs/>
-        </w:rPr>
-        <w:t xml:space="preserve">Vault layer routing</w:t>
-      </w:r>
-      <w:r>
-        <w:t xml:space="preserve"> together are a </w:t>
-      </w:r>
-      <w:r>
-        <w:rPr>
-          <w:b/>
-          <w:bCs/>
-        </w:rPr>
-        <w:t xml:space="preserve">differentiated</w:t>
-      </w:r>
-      <w:r>
-        <w:t xml:space="preserve"> capability—style governs phrasing and weight; vault governs </w:t>
-      </w:r>
-      <w:r>
-        <w:rPr>
-          <w:b/>
-          <w:bCs/>
-        </w:rPr>
-        <w:t xml:space="preserve">who plays which harmonic role</w:t>
-      </w:r>
-      <w:r>
-        <w:t xml:space="preserve">.</w:t>
+        <w:t xml:space="preserve">String quartet</w:t>
+      </w:r>
+      <w:r>
+        <w:t xml:space="preserve"> sketches: each </w:t>
+      </w:r>
+      <w:r>
+        <w:rPr>
+          <w:b/>
+          <w:bCs/>
+        </w:rPr>
+        <w:t xml:space="preserve">voice</w:t>
+      </w:r>
+      <w:r>
+        <w:t xml:space="preserve"> can be assigned a different </w:t>
+      </w:r>
+      <w:r>
+        <w:rPr>
+          <w:b/>
+          <w:bCs/>
+        </w:rPr>
+        <w:t xml:space="preserve">tension layer</w:t>
+      </w:r>
+      <w:r>
+        <w:t xml:space="preserve"> so the ensemble moves as a </w:t>
+      </w:r>
+      <w:r>
+        <w:rPr>
+          <w:b/>
+          <w:bCs/>
+        </w:rPr>
+        <w:t xml:space="preserve">coherent</w:t>
+      </w:r>
+      <w:r>
+        <w:t xml:space="preserve"> harmonic unit.</w:t>
       </w:r>
     </w:p>
     <w:p>
@@ -32050,7 +32667,7 @@
           <w:b/>
           <w:bCs/>
         </w:rPr>
-        <w:t xml:space="preserve">Guitar:</w:t>
+        <w:t xml:space="preserve">Big band:</w:t>
       </w:r>
       <w:r>
         <w:t xml:space="preserve"> </w:t>
@@ -32060,50 +32677,40 @@
           <w:b/>
           <w:bCs/>
         </w:rPr>
-        <w:t xml:space="preserve">position-aware</w:t>
-      </w:r>
-      <w:r>
-        <w:t xml:space="preserve">, </w:t>
-      </w:r>
-      <w:r>
-        <w:rPr>
-          <w:b/>
-          <w:bCs/>
-        </w:rPr>
-        <w:t xml:space="preserve">idiomatic</w:t>
-      </w:r>
-      <w:r>
-        <w:t xml:space="preserve"> riffs from </w:t>
-      </w:r>
-      <w:r>
-        <w:rPr>
-          <w:b/>
-          <w:bCs/>
-        </w:rPr>
-        <w:t xml:space="preserve">Build C</w:t>
-      </w:r>
-      <w:r>
-        <w:t xml:space="preserve">; </w:t>
-      </w:r>
-      <w:r>
-        <w:rPr>
-          <w:b/>
-          <w:bCs/>
-        </w:rPr>
-        <w:t xml:space="preserve">MusicXML → GP8</w:t>
-      </w:r>
-      <w:r>
-        <w:t xml:space="preserve"> import path yields </w:t>
-      </w:r>
-      <w:r>
-        <w:rPr>
-          <w:b/>
-          <w:bCs/>
-        </w:rPr>
-        <w:t xml:space="preserve">tab</w:t>
-      </w:r>
-      <w:r>
-        <w:t xml:space="preserve"> in Guitar Pro the same way other exported guitar scores do once the line is on the score.</w:t>
+        <w:t xml:space="preserve">arranger style profiles</w:t>
+      </w:r>
+      <w:r>
+        <w:t xml:space="preserve"> + </w:t>
+      </w:r>
+      <w:r>
+        <w:rPr>
+          <w:b/>
+          <w:bCs/>
+        </w:rPr>
+        <w:t xml:space="preserve">Vault layer routing</w:t>
+      </w:r>
+      <w:r>
+        <w:t xml:space="preserve"> together are a </w:t>
+      </w:r>
+      <w:r>
+        <w:rPr>
+          <w:b/>
+          <w:bCs/>
+        </w:rPr>
+        <w:t xml:space="preserve">differentiated</w:t>
+      </w:r>
+      <w:r>
+        <w:t xml:space="preserve"> capability—style governs phrasing and weight; vault governs </w:t>
+      </w:r>
+      <w:r>
+        <w:rPr>
+          <w:b/>
+          <w:bCs/>
+        </w:rPr>
+        <w:t xml:space="preserve">who plays which harmonic role</w:t>
+      </w:r>
+      <w:r>
+        <w:t xml:space="preserve">.</w:t>
       </w:r>
     </w:p>
     <w:p>
@@ -32119,6 +32726,75 @@
           <w:b/>
           <w:bCs/>
         </w:rPr>
+        <w:t xml:space="preserve">Guitar:</w:t>
+      </w:r>
+      <w:r>
+        <w:t xml:space="preserve"> </w:t>
+      </w:r>
+      <w:r>
+        <w:rPr>
+          <w:b/>
+          <w:bCs/>
+        </w:rPr>
+        <w:t xml:space="preserve">position-aware</w:t>
+      </w:r>
+      <w:r>
+        <w:t xml:space="preserve">, </w:t>
+      </w:r>
+      <w:r>
+        <w:rPr>
+          <w:b/>
+          <w:bCs/>
+        </w:rPr>
+        <w:t xml:space="preserve">idiomatic</w:t>
+      </w:r>
+      <w:r>
+        <w:t xml:space="preserve"> riffs from </w:t>
+      </w:r>
+      <w:r>
+        <w:rPr>
+          <w:b/>
+          <w:bCs/>
+        </w:rPr>
+        <w:t xml:space="preserve">Build C</w:t>
+      </w:r>
+      <w:r>
+        <w:t xml:space="preserve">; </w:t>
+      </w:r>
+      <w:r>
+        <w:rPr>
+          <w:b/>
+          <w:bCs/>
+        </w:rPr>
+        <w:t xml:space="preserve">MusicXML → GP8</w:t>
+      </w:r>
+      <w:r>
+        <w:t xml:space="preserve"> import path yields </w:t>
+      </w:r>
+      <w:r>
+        <w:rPr>
+          <w:b/>
+          <w:bCs/>
+        </w:rPr>
+        <w:t xml:space="preserve">tab</w:t>
+      </w:r>
+      <w:r>
+        <w:t xml:space="preserve"> in Guitar Pro the same way other exported guitar scores do once the line is on the score.</w:t>
+      </w:r>
+    </w:p>
+    <w:p>
+      <w:pPr>
+        <w:spacing w:after="80"/>
+        <w:ind w:left="360" w:hanging="260"/>
+      </w:pPr>
+      <w:r>
+        <w:t xml:space="preserve">• </w:t>
+      </w:r>
+      <w:r>
+        <w:rPr>
+          <w:b/>
+          <w:bCs/>
+        </w:rPr>
         <w:t xml:space="preserve">Vault microscope UI</w:t>
       </w:r>
       <w:r>
@@ -32320,7 +32996,7 @@
         <w:t xml:space="preserve">G</w:t>
       </w:r>
       <w:r>
-        <w:t xml:space="preserve"> and </w:t>
+        <w:t xml:space="preserve">, </w:t>
       </w:r>
       <w:r>
         <w:rPr>
@@ -32330,6 +33006,16 @@
         <w:t xml:space="preserve">C2</w:t>
       </w:r>
       <w:r>
+        <w:t xml:space="preserve">, and </w:t>
+      </w:r>
+      <w:r>
+        <w:rPr>
+          <w:b/>
+          <w:bCs/>
+        </w:rPr>
+        <w:t xml:space="preserve">H</w:t>
+      </w:r>
+      <w:r>
         <w:t xml:space="preserve"> are </w:t>
       </w:r>
       <w:r>
@@ -32357,10 +33043,10 @@
           <w:b/>
           <w:bCs/>
         </w:rPr>
-        <w:t xml:space="preserve">Build H</w:t>
-      </w:r>
-      <w:r>
-        <w:t xml:space="preserve"> (GCE-targeted generation). Planned sequencing for </w:t>
+        <w:t xml:space="preserve">Build UI</w:t>
+      </w:r>
+      <w:r>
+        <w:t xml:space="preserve"> (visual fretboard). Planned sequencing for </w:t>
       </w:r>
       <w:r>
         <w:rPr>
@@ -32382,7 +33068,7 @@
           <w:b/>
           <w:bCs/>
         </w:rPr>
-        <w:t xml:space="preserve">H → UI → IMG</w:t>
+        <w:t xml:space="preserve">UI → IMG</w:t>
       </w:r>
     </w:p>
     <w:p>

</xml_diff>

<commit_message>
docs: build order updated IMG before UI, iteration estimates added to roadmap
Co-authored-by: Cursor <cursoragent@cursor.com>
</commit_message>
<xml_diff>
--- a/docs/COMPOSER_OS_PLAYBOOK.docx
+++ b/docs/COMPOSER_OS_PLAYBOOK.docx
@@ -31686,60 +31686,90 @@
           <w:b/>
           <w:bCs/>
         </w:rPr>
-        <w:t xml:space="preserve">Build UI — Visual fretboard (deferred):</w:t>
-      </w:r>
-      <w:r>
-        <w:t xml:space="preserve"> </w:t>
-      </w:r>
-      <w:r>
-        <w:rPr>
-          <w:b/>
-          <w:bCs/>
-        </w:rPr>
-        <w:t xml:space="preserve">fretboard.js</w:t>
-      </w:r>
-      <w:r>
-        <w:t xml:space="preserve"> + </w:t>
-      </w:r>
-      <w:r>
-        <w:rPr>
-          <w:b/>
-          <w:bCs/>
-        </w:rPr>
-        <w:t xml:space="preserve">VexFlow</w:t>
-      </w:r>
-      <w:r>
-        <w:t xml:space="preserve">, </w:t>
-      </w:r>
-      <w:r>
-        <w:rPr>
-          <w:b/>
-          <w:bCs/>
-        </w:rPr>
-        <w:t xml:space="preserve">three SVG layers</w:t>
-      </w:r>
-      <w:r>
-        <w:t xml:space="preserve"> (grid, active grip, legality heat). </w:t>
-      </w:r>
-      <w:r>
-        <w:rPr>
-          <w:b/>
-          <w:bCs/>
-        </w:rPr>
-        <w:t xml:space="preserve">Deferred</w:t>
-      </w:r>
-      <w:r>
-        <w:t xml:space="preserve"> until the </w:t>
-      </w:r>
-      <w:r>
-        <w:rPr>
-          <w:b/>
-          <w:bCs/>
-        </w:rPr>
-        <w:t xml:space="preserve">engine</w:t>
-      </w:r>
-      <w:r>
-        <w:t xml:space="preserve"> paths above are stable in production.</w:t>
+        <w:t xml:space="preserve">Build IMG — iReal Pro import + optional vision:</w:t>
+      </w:r>
+      <w:r>
+        <w:t xml:space="preserve"> See </w:t>
+      </w:r>
+      <w:r>
+        <w:rPr>
+          <w:b/>
+          <w:bCs/>
+        </w:rPr>
+        <w:t xml:space="preserve">Build IMG — iReal Pro import</w:t>
+      </w:r>
+      <w:r>
+        <w:t xml:space="preserve"> below (data pipeline + optional screenshot path). </w:t>
+      </w:r>
+      <w:r>
+        <w:rPr>
+          <w:b/>
+          <w:bCs/>
+        </w:rPr>
+        <w:t xml:space="preserve">Estimated effort: 3–4 iterations</w:t>
+      </w:r>
+      <w:r>
+        <w:t xml:space="preserve"> — install </w:t>
+      </w:r>
+      <w:r>
+        <w:rPr>
+          <w:b/>
+          <w:bCs/>
+        </w:rPr>
+        <w:t xml:space="preserve">[pianosnake/ireal-reader](https://github.com/pianosnake/ireal-reader)</w:t>
+      </w:r>
+      <w:r>
+        <w:t xml:space="preserve">; </w:t>
+      </w:r>
+      <w:r>
+        <w:rPr>
+          <w:b/>
+          <w:bCs/>
+        </w:rPr>
+        <w:t xml:space="preserve">`ParsedChart`</w:t>
+      </w:r>
+      <w:r>
+        <w:t xml:space="preserve"> TypeScript adapter; chord symbol → </w:t>
+      </w:r>
+      <w:r>
+        <w:rPr>
+          <w:b/>
+          <w:bCs/>
+        </w:rPr>
+        <w:t xml:space="preserve">`tonalityVaultDatabase`</w:t>
+      </w:r>
+      <w:r>
+        <w:t xml:space="preserve"> mapping; </w:t>
+      </w:r>
+      <w:r>
+        <w:rPr>
+          <w:b/>
+          <w:bCs/>
+        </w:rPr>
+        <w:t xml:space="preserve">`generateVaultRiff`</w:t>
+      </w:r>
+      <w:r>
+        <w:t xml:space="preserve"> per bar → </w:t>
+      </w:r>
+      <w:r>
+        <w:rPr>
+          <w:b/>
+          <w:bCs/>
+        </w:rPr>
+        <w:t xml:space="preserve">MusicXML</w:t>
+      </w:r>
+      <w:r>
+        <w:t xml:space="preserve"> output; UI input for </w:t>
+      </w:r>
+      <w:r>
+        <w:rPr>
+          <w:b/>
+          <w:bCs/>
+        </w:rPr>
+        <w:t xml:space="preserve">`ireal://`</w:t>
+      </w:r>
+      <w:r>
+        <w:t xml:space="preserve"> URL.</w:t>
       </w:r>
     </w:p>
     <w:p>
@@ -31755,20 +31785,160 @@
           <w:b/>
           <w:bCs/>
         </w:rPr>
-        <w:t xml:space="preserve">Build IMG — iReal Pro import + optional vision:</w:t>
-      </w:r>
-      <w:r>
-        <w:t xml:space="preserve"> See </w:t>
-      </w:r>
-      <w:r>
-        <w:rPr>
-          <w:b/>
-          <w:bCs/>
-        </w:rPr>
-        <w:t xml:space="preserve">Build IMG — iReal Pro import</w:t>
-      </w:r>
-      <w:r>
-        <w:t xml:space="preserve"> below (data pipeline + optional screenshot path).</w:t>
+        <w:t xml:space="preserve">Build UI — Visual fretboard (deferred):</w:t>
+      </w:r>
+      <w:r>
+        <w:t xml:space="preserve"> </w:t>
+      </w:r>
+      <w:r>
+        <w:rPr>
+          <w:b/>
+          <w:bCs/>
+        </w:rPr>
+        <w:t xml:space="preserve">fretboard.js</w:t>
+      </w:r>
+      <w:r>
+        <w:t xml:space="preserve"> + </w:t>
+      </w:r>
+      <w:r>
+        <w:rPr>
+          <w:b/>
+          <w:bCs/>
+        </w:rPr>
+        <w:t xml:space="preserve">VexFlow</w:t>
+      </w:r>
+      <w:r>
+        <w:t xml:space="preserve">, </w:t>
+      </w:r>
+      <w:r>
+        <w:rPr>
+          <w:b/>
+          <w:bCs/>
+        </w:rPr>
+        <w:t xml:space="preserve">three SVG layers</w:t>
+      </w:r>
+      <w:r>
+        <w:t xml:space="preserve"> (grid, active grip, legality heat). </w:t>
+      </w:r>
+      <w:r>
+        <w:rPr>
+          <w:b/>
+          <w:bCs/>
+        </w:rPr>
+        <w:t xml:space="preserve">Estimated effort: 6–8 iterations</w:t>
+      </w:r>
+      <w:r>
+        <w:t xml:space="preserve"> — </w:t>
+      </w:r>
+      <w:r>
+        <w:rPr>
+          <w:b/>
+          <w:bCs/>
+        </w:rPr>
+        <w:t xml:space="preserve">FretboardPanel</w:t>
+      </w:r>
+      <w:r>
+        <w:t xml:space="preserve"> (</w:t>
+      </w:r>
+      <w:r>
+        <w:rPr>
+          <w:b/>
+          <w:bCs/>
+        </w:rPr>
+        <w:t xml:space="preserve">fretboard.js</w:t>
+      </w:r>
+      <w:r>
+        <w:t xml:space="preserve">); note </w:t>
+      </w:r>
+      <w:r>
+        <w:rPr>
+          <w:b/>
+          <w:bCs/>
+        </w:rPr>
+        <w:t xml:space="preserve">role</w:t>
+      </w:r>
+      <w:r>
+        <w:t xml:space="preserve"> colours; </w:t>
+      </w:r>
+      <w:r>
+        <w:rPr>
+          <w:b/>
+          <w:bCs/>
+        </w:rPr>
+        <w:t xml:space="preserve">layer</w:t>
+      </w:r>
+      <w:r>
+        <w:t xml:space="preserve"> toggles; </w:t>
+      </w:r>
+      <w:r>
+        <w:rPr>
+          <w:b/>
+          <w:bCs/>
+        </w:rPr>
+        <w:t xml:space="preserve">TabPanel</w:t>
+      </w:r>
+      <w:r>
+        <w:t xml:space="preserve"> (</w:t>
+      </w:r>
+      <w:r>
+        <w:rPr>
+          <w:b/>
+          <w:bCs/>
+        </w:rPr>
+        <w:t xml:space="preserve">VexFlow</w:t>
+      </w:r>
+      <w:r>
+        <w:t xml:space="preserve">); </w:t>
+      </w:r>
+      <w:r>
+        <w:rPr>
+          <w:b/>
+          <w:bCs/>
+        </w:rPr>
+        <w:t xml:space="preserve">playback</w:t>
+      </w:r>
+      <w:r>
+        <w:t xml:space="preserve"> trail; </w:t>
+      </w:r>
+      <w:r>
+        <w:rPr>
+          <w:b/>
+          <w:bCs/>
+        </w:rPr>
+        <w:t xml:space="preserve">`svgToPng`</w:t>
+      </w:r>
+      <w:r>
+        <w:t xml:space="preserve"> export; responsive layout / </w:t>
+      </w:r>
+      <w:r>
+        <w:rPr>
+          <w:b/>
+          <w:bCs/>
+        </w:rPr>
+        <w:t xml:space="preserve">dark mode</w:t>
+      </w:r>
+      <w:r>
+        <w:t xml:space="preserve">; </w:t>
+      </w:r>
+      <w:r>
+        <w:rPr>
+          <w:b/>
+          <w:bCs/>
+        </w:rPr>
+        <w:t xml:space="preserve">Vault microscope</w:t>
+      </w:r>
+      <w:r>
+        <w:t xml:space="preserve"> scrubber. Schedule as a </w:t>
+      </w:r>
+      <w:r>
+        <w:rPr>
+          <w:b/>
+          <w:bCs/>
+        </w:rPr>
+        <w:t xml:space="preserve">dedicated focused session</w:t>
+      </w:r>
+      <w:r>
+        <w:t xml:space="preserve"> — largest remaining surface area.</w:t>
       </w:r>
     </w:p>
     <w:p>
@@ -33033,6 +33203,163 @@
           <w:b/>
           <w:bCs/>
         </w:rPr>
+        <w:t xml:space="preserve">Remaining sequencing: IMG → UI.</w:t>
+      </w:r>
+    </w:p>
+    <w:p>
+      <w:pPr>
+        <w:spacing w:after="160"/>
+      </w:pPr>
+      <w:r>
+        <w:rPr>
+          <w:b/>
+          <w:bCs/>
+        </w:rPr>
+        <w:t xml:space="preserve">Why IMG before UI:</w:t>
+      </w:r>
+      <w:r>
+        <w:t xml:space="preserve"> </w:t>
+      </w:r>
+      <w:r>
+        <w:rPr>
+          <w:b/>
+          <w:bCs/>
+        </w:rPr>
+        <w:t xml:space="preserve">Build IMG</w:t>
+      </w:r>
+      <w:r>
+        <w:t xml:space="preserve"> is </w:t>
+      </w:r>
+      <w:r>
+        <w:rPr>
+          <w:b/>
+          <w:bCs/>
+        </w:rPr>
+        <w:t xml:space="preserve">lower risk</w:t>
+      </w:r>
+      <w:r>
+        <w:t xml:space="preserve">, needs </w:t>
+      </w:r>
+      <w:r>
+        <w:rPr>
+          <w:b/>
+          <w:bCs/>
+        </w:rPr>
+        <w:t xml:space="preserve">fewer iterations</w:t>
+      </w:r>
+      <w:r>
+        <w:t xml:space="preserve"> (</w:t>
+      </w:r>
+      <w:r>
+        <w:rPr>
+          <w:b/>
+          <w:bCs/>
+        </w:rPr>
+        <w:t xml:space="preserve">3–4</w:t>
+      </w:r>
+      <w:r>
+        <w:t xml:space="preserve"> vs </w:t>
+      </w:r>
+      <w:r>
+        <w:rPr>
+          <w:b/>
+          <w:bCs/>
+        </w:rPr>
+        <w:t xml:space="preserve">6–8</w:t>
+      </w:r>
+      <w:r>
+        <w:t xml:space="preserve">), and ships </w:t>
+      </w:r>
+      <w:r>
+        <w:rPr>
+          <w:b/>
+          <w:bCs/>
+        </w:rPr>
+        <w:t xml:space="preserve">immediately useful</w:t>
+      </w:r>
+      <w:r>
+        <w:t xml:space="preserve"> output — paste an </w:t>
+      </w:r>
+      <w:r>
+        <w:rPr>
+          <w:b/>
+          <w:bCs/>
+        </w:rPr>
+        <w:t xml:space="preserve">`ireal://`</w:t>
+      </w:r>
+      <w:r>
+        <w:t xml:space="preserve"> URL → chord timeline → </w:t>
+      </w:r>
+      <w:r>
+        <w:rPr>
+          <w:b/>
+          <w:bCs/>
+        </w:rPr>
+        <w:t xml:space="preserve">Vault</w:t>
+      </w:r>
+      <w:r>
+        <w:t xml:space="preserve"> </w:t>
+      </w:r>
+      <w:r>
+        <w:rPr>
+          <w:b/>
+          <w:bCs/>
+        </w:rPr>
+        <w:t xml:space="preserve">`generateVaultRiff`</w:t>
+      </w:r>
+      <w:r>
+        <w:t xml:space="preserve"> → </w:t>
+      </w:r>
+      <w:r>
+        <w:rPr>
+          <w:b/>
+          <w:bCs/>
+        </w:rPr>
+        <w:t xml:space="preserve">MusicXML</w:t>
+      </w:r>
+      <w:r>
+        <w:t xml:space="preserve">. </w:t>
+      </w:r>
+      <w:r>
+        <w:rPr>
+          <w:b/>
+          <w:bCs/>
+        </w:rPr>
+        <w:t xml:space="preserve">Build UI</w:t>
+      </w:r>
+      <w:r>
+        <w:t xml:space="preserve"> is the </w:t>
+      </w:r>
+      <w:r>
+        <w:rPr>
+          <w:b/>
+          <w:bCs/>
+        </w:rPr>
+        <w:t xml:space="preserve">largest</w:t>
+      </w:r>
+      <w:r>
+        <w:t xml:space="preserve"> remaining build (fretboard + tab + microscope + layout); treat it as a </w:t>
+      </w:r>
+      <w:r>
+        <w:rPr>
+          <w:b/>
+          <w:bCs/>
+        </w:rPr>
+        <w:t xml:space="preserve">dedicated focused session</w:t>
+      </w:r>
+      <w:r>
+        <w:t xml:space="preserve"> after IMG lands.</w:t>
+      </w:r>
+    </w:p>
+    <w:p>
+      <w:pPr>
+        <w:spacing w:after="160"/>
+      </w:pPr>
+      <w:r>
+        <w:rPr>
+          <w:b/>
+          <w:bCs/>
+        </w:rPr>
         <w:t xml:space="preserve">Next:</w:t>
       </w:r>
       <w:r>
@@ -33043,20 +33370,20 @@
           <w:b/>
           <w:bCs/>
         </w:rPr>
+        <w:t xml:space="preserve">Build IMG</w:t>
+      </w:r>
+      <w:r>
+        <w:t xml:space="preserve"> (iReal pipeline). Then </w:t>
+      </w:r>
+      <w:r>
+        <w:rPr>
+          <w:b/>
+          <w:bCs/>
+        </w:rPr>
         <w:t xml:space="preserve">Build UI</w:t>
       </w:r>
       <w:r>
-        <w:t xml:space="preserve"> (visual fretboard). Planned sequencing for </w:t>
-      </w:r>
-      <w:r>
-        <w:rPr>
-          <w:b/>
-          <w:bCs/>
-        </w:rPr>
-        <w:t xml:space="preserve">remaining</w:t>
-      </w:r>
-      <w:r>
-        <w:t xml:space="preserve"> work:</w:t>
+        <w:t xml:space="preserve"> (visual fretboard).</w:t>
       </w:r>
     </w:p>
     <w:p>
@@ -33068,7 +33395,7 @@
           <w:b/>
           <w:bCs/>
         </w:rPr>
-        <w:t xml:space="preserve">UI → IMG</w:t>
+        <w:t xml:space="preserve">IMG → UI</w:t>
       </w:r>
     </w:p>
     <w:p>

</xml_diff>

<commit_message>
docs: Build IMG complete — iReal Pro import all 4 iterations documented, session handover, UI next
Co-authored-by: Cursor <cursoragent@cursor.com>
</commit_message>
<xml_diff>
--- a/docs/COMPOSER_OS_PLAYBOOK.docx
+++ b/docs/COMPOSER_OS_PLAYBOOK.docx
@@ -31686,10 +31686,20 @@
           <w:b/>
           <w:bCs/>
         </w:rPr>
-        <w:t xml:space="preserve">Build IMG — iReal Pro import + optional vision:</w:t>
-      </w:r>
-      <w:r>
-        <w:t xml:space="preserve"> See </w:t>
+        <w:t xml:space="preserve">Build IMG — iReal Pro import:</w:t>
+      </w:r>
+      <w:r>
+        <w:t xml:space="preserve"> </w:t>
+      </w:r>
+      <w:r>
+        <w:rPr>
+          <w:b/>
+          <w:bCs/>
+        </w:rPr>
+        <w:t xml:space="preserve">Complete</w:t>
+      </w:r>
+      <w:r>
+        <w:t xml:space="preserve"> — see </w:t>
       </w:r>
       <w:r>
         <w:rPr>
@@ -31699,77 +31709,17 @@
         <w:t xml:space="preserve">Build IMG — iReal Pro import</w:t>
       </w:r>
       <w:r>
-        <w:t xml:space="preserve"> below (data pipeline + optional screenshot path). </w:t>
-      </w:r>
-      <w:r>
-        <w:rPr>
-          <w:b/>
-          <w:bCs/>
-        </w:rPr>
-        <w:t xml:space="preserve">Estimated effort: 3–4 iterations</w:t>
-      </w:r>
-      <w:r>
-        <w:t xml:space="preserve"> — install </w:t>
-      </w:r>
-      <w:r>
-        <w:rPr>
-          <w:b/>
-          <w:bCs/>
-        </w:rPr>
-        <w:t xml:space="preserve">[pianosnake/ireal-reader](https://github.com/pianosnake/ireal-reader)</w:t>
-      </w:r>
-      <w:r>
-        <w:t xml:space="preserve">; </w:t>
-      </w:r>
-      <w:r>
-        <w:rPr>
-          <w:b/>
-          <w:bCs/>
-        </w:rPr>
-        <w:t xml:space="preserve">`ParsedChart`</w:t>
-      </w:r>
-      <w:r>
-        <w:t xml:space="preserve"> TypeScript adapter; chord symbol → </w:t>
-      </w:r>
-      <w:r>
-        <w:rPr>
-          <w:b/>
-          <w:bCs/>
-        </w:rPr>
-        <w:t xml:space="preserve">`tonalityVaultDatabase`</w:t>
-      </w:r>
-      <w:r>
-        <w:t xml:space="preserve"> mapping; </w:t>
-      </w:r>
-      <w:r>
-        <w:rPr>
-          <w:b/>
-          <w:bCs/>
-        </w:rPr>
-        <w:t xml:space="preserve">`generateVaultRiff`</w:t>
-      </w:r>
-      <w:r>
-        <w:t xml:space="preserve"> per bar → </w:t>
-      </w:r>
-      <w:r>
-        <w:rPr>
-          <w:b/>
-          <w:bCs/>
-        </w:rPr>
-        <w:t xml:space="preserve">MusicXML</w:t>
-      </w:r>
-      <w:r>
-        <w:t xml:space="preserve"> output; UI input for </w:t>
-      </w:r>
-      <w:r>
-        <w:rPr>
-          <w:b/>
-          <w:bCs/>
-        </w:rPr>
-        <w:t xml:space="preserve">`ireal://`</w:t>
-      </w:r>
-      <w:r>
-        <w:t xml:space="preserve"> URL.</w:t>
+        <w:t xml:space="preserve"> below (</w:t>
+      </w:r>
+      <w:r>
+        <w:rPr>
+          <w:b/>
+          <w:bCs/>
+        </w:rPr>
+        <w:t xml:space="preserve">four iterations</w:t>
+      </w:r>
+      <w:r>
+        <w:t xml:space="preserve">).</w:t>
       </w:r>
     </w:p>
     <w:p>
@@ -31785,7 +31735,7 @@
           <w:b/>
           <w:bCs/>
         </w:rPr>
-        <w:t xml:space="preserve">Build UI — Visual fretboard (deferred):</w:t>
+        <w:t xml:space="preserve">Build UI — Visual fretboard (remaining):</w:t>
       </w:r>
       <w:r>
         <w:t xml:space="preserve"> </w:t>
@@ -31795,6 +31745,16 @@
           <w:b/>
           <w:bCs/>
         </w:rPr>
+        <w:t xml:space="preserve">Only</w:t>
+      </w:r>
+      <w:r>
+        <w:t xml:space="preserve"> remaining Tonality Vault roadmap build. </w:t>
+      </w:r>
+      <w:r>
+        <w:rPr>
+          <w:b/>
+          <w:bCs/>
+        </w:rPr>
         <w:t xml:space="preserve">fretboard.js</w:t>
       </w:r>
       <w:r>
@@ -31835,6 +31795,16 @@
           <w:b/>
           <w:bCs/>
         </w:rPr>
+        <w:t xml:space="preserve">dedicated focused session</w:t>
+      </w:r>
+      <w:r>
+        <w:t xml:space="preserve"> — </w:t>
+      </w:r>
+      <w:r>
+        <w:rPr>
+          <w:b/>
+          <w:bCs/>
+        </w:rPr>
         <w:t xml:space="preserve">FretboardPanel</w:t>
       </w:r>
       <w:r>
@@ -31928,17 +31898,7 @@
         <w:t xml:space="preserve">Vault microscope</w:t>
       </w:r>
       <w:r>
-        <w:t xml:space="preserve"> scrubber. Schedule as a </w:t>
-      </w:r>
-      <w:r>
-        <w:rPr>
-          <w:b/>
-          <w:bCs/>
-        </w:rPr>
-        <w:t xml:space="preserve">dedicated focused session</w:t>
-      </w:r>
-      <w:r>
-        <w:t xml:space="preserve"> — largest remaining surface area.</w:t>
+        <w:t xml:space="preserve"> scrubber.</w:t>
       </w:r>
     </w:p>
     <w:p>
@@ -31947,7 +31907,7 @@
         <w:spacing w:after="100" w:before="160"/>
       </w:pPr>
       <w:r>
-        <w:t xml:space="preserve">Build IMG — iReal Pro import (planned)</w:t>
+        <w:t xml:space="preserve">Build IMG — iReal Pro import (**complete**)</w:t>
       </w:r>
     </w:p>
     <w:p>
@@ -31959,20 +31919,50 @@
           <w:b/>
           <w:bCs/>
         </w:rPr>
-        <w:t xml:space="preserve">Not shipped.</w:t>
-      </w:r>
-      <w:r>
-        <w:t xml:space="preserve"> Primary path is </w:t>
-      </w:r>
-      <w:r>
-        <w:rPr>
-          <w:b/>
-          <w:bCs/>
-        </w:rPr>
-        <w:t xml:space="preserve">structured data</w:t>
-      </w:r>
-      <w:r>
-        <w:t xml:space="preserve">, not raw </w:t>
+        <w:t xml:space="preserve">Shipped</w:t>
+      </w:r>
+      <w:r>
+        <w:t xml:space="preserve"> in `engines/composer-os-v2/core/irealpro/` (barrel </w:t>
+      </w:r>
+      <w:r>
+        <w:rPr>
+          <w:b/>
+          <w:bCs/>
+        </w:rPr>
+        <w:t xml:space="preserve">`irealpro/index.ts`</w:t>
+      </w:r>
+      <w:r>
+        <w:t xml:space="preserve">) and </w:t>
+      </w:r>
+      <w:r>
+        <w:rPr>
+          <w:b/>
+          <w:bCs/>
+        </w:rPr>
+        <w:t xml:space="preserve">`apps/composer-os-app/src/pages/HomeGenerate.tsx`</w:t>
+      </w:r>
+      <w:r>
+        <w:t xml:space="preserve"> (beta UI). Primary path is </w:t>
+      </w:r>
+      <w:r>
+        <w:rPr>
+          <w:b/>
+          <w:bCs/>
+        </w:rPr>
+        <w:t xml:space="preserve">structured</w:t>
+      </w:r>
+      <w:r>
+        <w:t xml:space="preserve"> parsing via npm </w:t>
+      </w:r>
+      <w:r>
+        <w:rPr>
+          <w:b/>
+          <w:bCs/>
+        </w:rPr>
+        <w:t xml:space="preserve">`ireal-reader`</w:t>
+      </w:r>
+      <w:r>
+        <w:t xml:space="preserve"> ([pianosnake/ireal-reader](https://github.com/pianosnake/ireal-reader)), not raw </w:t>
       </w:r>
       <w:r>
         <w:rPr>
@@ -31982,19 +31972,37 @@
         <w:t xml:space="preserve">`.irealb` binary</w:t>
       </w:r>
       <w:r>
-        <w:t xml:space="preserve">.</w:t>
-      </w:r>
-    </w:p>
-    <w:p>
-      <w:pPr>
-        <w:spacing w:after="160"/>
-      </w:pPr>
-      <w:r>
-        <w:rPr>
-          <w:b/>
-          <w:bCs/>
-        </w:rPr>
-        <w:t xml:space="preserve">Recommended JS libraries (wrap in TypeScript adapters):</w:t>
+        <w:t xml:space="preserve"> as the ingest surface. </w:t>
+      </w:r>
+      <w:r>
+        <w:rPr>
+          <w:b/>
+          <w:bCs/>
+        </w:rPr>
+        <w:t xml:space="preserve">Optional later:</w:t>
+      </w:r>
+      <w:r>
+        <w:t xml:space="preserve"> </w:t>
+      </w:r>
+      <w:r>
+        <w:rPr>
+          <w:b/>
+          <w:bCs/>
+        </w:rPr>
+        <w:t xml:space="preserve">JPEG / screenshot</w:t>
+      </w:r>
+      <w:r>
+        <w:t xml:space="preserve"> OCR for users without HTML export (same </w:t>
+      </w:r>
+      <w:r>
+        <w:rPr>
+          <w:b/>
+          <w:bCs/>
+        </w:rPr>
+        <w:t xml:space="preserve">`ParsedChart`</w:t>
+      </w:r>
+      <w:r>
+        <w:t xml:space="preserve"> target) — not in v1.</w:t>
       </w:r>
     </w:p>
     <w:tbl>
@@ -32010,47 +32018,33 @@
         </w:tblBorders>
       </w:tblPr>
       <w:tblGrid>
-        <w:gridCol w:w="3000"/>
-        <w:gridCol w:w="3000"/>
-        <w:gridCol w:w="3000"/>
+        <w:gridCol w:w="4500"/>
+        <w:gridCol w:w="4500"/>
       </w:tblGrid>
       <w:tr>
         <w:tc>
           <w:tcPr>
-            <w:tcW w:type="pct" w:w="3000%"/>
-          </w:tcPr>
-          <w:p>
-            <w:pPr>
-              <w:spacing w:after="60"/>
-            </w:pPr>
-            <w:r>
-              <w:t xml:space="preserve">Role</w:t>
-            </w:r>
-          </w:p>
-        </w:tc>
-        <w:tc>
-          <w:tcPr>
-            <w:tcW w:type="pct" w:w="3000%"/>
-          </w:tcPr>
-          <w:p>
-            <w:pPr>
-              <w:spacing w:after="60"/>
-            </w:pPr>
-            <w:r>
-              <w:t xml:space="preserve">Library</w:t>
-            </w:r>
-          </w:p>
-        </w:tc>
-        <w:tc>
-          <w:tcPr>
-            <w:tcW w:type="pct" w:w="3000%"/>
-          </w:tcPr>
-          <w:p>
-            <w:pPr>
-              <w:spacing w:after="60"/>
-            </w:pPr>
-            <w:r>
-              <w:t xml:space="preserve">Notes</w:t>
+            <w:tcW w:type="pct" w:w="4500%"/>
+          </w:tcPr>
+          <w:p>
+            <w:pPr>
+              <w:spacing w:after="60"/>
+            </w:pPr>
+            <w:r>
+              <w:t xml:space="preserve">Iteration</w:t>
+            </w:r>
+          </w:p>
+        </w:tc>
+        <w:tc>
+          <w:tcPr>
+            <w:tcW w:type="pct" w:w="4500%"/>
+          </w:tcPr>
+          <w:p>
+            <w:pPr>
+              <w:spacing w:after="60"/>
+            </w:pPr>
+            <w:r>
+              <w:t xml:space="preserve">What shipped</w:t>
             </w:r>
           </w:p>
         </w:tc>
@@ -32058,55 +32052,45 @@
       <w:tr>
         <w:tc>
           <w:tcPr>
-            <w:tcW w:type="pct" w:w="3000%"/>
-          </w:tcPr>
-          <w:p>
-            <w:pPr>
-              <w:spacing w:after="60"/>
-            </w:pPr>
-            <w:r>
-              <w:rPr>
-                <w:b/>
-                <w:bCs/>
-              </w:rPr>
-              <w:t xml:space="preserve">Primary parser</w:t>
-            </w:r>
-          </w:p>
-        </w:tc>
-        <w:tc>
-          <w:tcPr>
-            <w:tcW w:type="pct" w:w="3000%"/>
-          </w:tcPr>
-          <w:p>
-            <w:pPr>
-              <w:spacing w:after="60"/>
-            </w:pPr>
-            <w:r>
-              <w:rPr>
-                <w:b/>
-                <w:bCs/>
-              </w:rPr>
-              <w:t xml:space="preserve">[pianosnake/ireal-reader](https://github.com/pianosnake/ireal-reader)</w:t>
-            </w:r>
-          </w:p>
-        </w:tc>
-        <w:tc>
-          <w:tcPr>
-            <w:tcW w:type="pct" w:w="3000%"/>
-          </w:tcPr>
-          <w:p>
-            <w:pPr>
-              <w:spacing w:after="60"/>
-            </w:pPr>
-            <w:r>
-              <w:t xml:space="preserve">Expanded measures, </w:t>
-            </w:r>
-            <w:r>
-              <w:rPr>
-                <w:b/>
-                <w:bCs/>
-              </w:rPr>
-              <w:t xml:space="preserve">repeats</w:t>
+            <w:tcW w:type="pct" w:w="4500%"/>
+          </w:tcPr>
+          <w:p>
+            <w:pPr>
+              <w:spacing w:after="60"/>
+            </w:pPr>
+            <w:r>
+              <w:rPr>
+                <w:b/>
+                <w:bCs/>
+              </w:rPr>
+              <w:t xml:space="preserve">1</w:t>
+            </w:r>
+          </w:p>
+        </w:tc>
+        <w:tc>
+          <w:tcPr>
+            <w:tcW w:type="pct" w:w="4500%"/>
+          </w:tcPr>
+          <w:p>
+            <w:pPr>
+              <w:spacing w:after="60"/>
+            </w:pPr>
+            <w:r>
+              <w:rPr>
+                <w:b/>
+                <w:bCs/>
+              </w:rPr>
+              <w:t xml:space="preserve">`parsedChart.ts`</w:t>
+            </w:r>
+            <w:r>
+              <w:t xml:space="preserve"> — </w:t>
+            </w:r>
+            <w:r>
+              <w:rPr>
+                <w:b/>
+                <w:bCs/>
+              </w:rPr>
+              <w:t xml:space="preserve">`ParsedChord`</w:t>
             </w:r>
             <w:r>
               <w:t xml:space="preserve">, </w:t>
@@ -32116,7 +32100,7 @@
                 <w:b/>
                 <w:bCs/>
               </w:rPr>
-              <w:t xml:space="preserve">codas</w:t>
+              <w:t xml:space="preserve">`ParsedSection`</w:t>
             </w:r>
             <w:r>
               <w:t xml:space="preserve">, </w:t>
@@ -32126,10 +32110,90 @@
                 <w:b/>
                 <w:bCs/>
               </w:rPr>
-              <w:t xml:space="preserve">segnos</w:t>
-            </w:r>
-            <w:r>
-              <w:t xml:space="preserve"> — good match for roadmaps that need visit-expanded charts.</w:t>
+              <w:t xml:space="preserve">`ParsedChart`</w:t>
+            </w:r>
+            <w:r>
+              <w:t xml:space="preserve"> (`title`, `composer`, `key`, `timeSignature`, `tempo`, `style`, `sections`, `measures`, `repeats`). </w:t>
+            </w:r>
+            <w:r>
+              <w:rPr>
+                <w:b/>
+                <w:bCs/>
+              </w:rPr>
+              <w:t xml:space="preserve">`irealProAdapter.ts`</w:t>
+            </w:r>
+            <w:r>
+              <w:t xml:space="preserve"> — </w:t>
+            </w:r>
+            <w:r>
+              <w:rPr>
+                <w:b/>
+                <w:bCs/>
+              </w:rPr>
+              <w:t xml:space="preserve">`parseIRealProInput(input)`</w:t>
+            </w:r>
+            <w:r>
+              <w:t xml:space="preserve"> uses </w:t>
+            </w:r>
+            <w:r>
+              <w:rPr>
+                <w:b/>
+                <w:bCs/>
+              </w:rPr>
+              <w:t xml:space="preserve">`ireal-reader`</w:t>
+            </w:r>
+            <w:r>
+              <w:t xml:space="preserve"> on </w:t>
+            </w:r>
+            <w:r>
+              <w:rPr>
+                <w:b/>
+                <w:bCs/>
+              </w:rPr>
+              <w:t xml:space="preserve">`ireal://`</w:t>
+            </w:r>
+            <w:r>
+              <w:t xml:space="preserve"> / </w:t>
+            </w:r>
+            <w:r>
+              <w:rPr>
+                <w:b/>
+                <w:bCs/>
+              </w:rPr>
+              <w:t xml:space="preserve">`irealb://`</w:t>
+            </w:r>
+            <w:r>
+              <w:t xml:space="preserve"> URL or </w:t>
+            </w:r>
+            <w:r>
+              <w:rPr>
+                <w:b/>
+                <w:bCs/>
+              </w:rPr>
+              <w:t xml:space="preserve">HTML</w:t>
+            </w:r>
+            <w:r>
+              <w:t xml:space="preserve"> export; </w:t>
+            </w:r>
+            <w:r>
+              <w:rPr>
+                <w:b/>
+                <w:bCs/>
+              </w:rPr>
+              <w:t xml:space="preserve">`ireal://`</w:t>
+            </w:r>
+            <w:r>
+              <w:t xml:space="preserve"> normalised for the library; first playlist song → </w:t>
+            </w:r>
+            <w:r>
+              <w:rPr>
+                <w:b/>
+                <w:bCs/>
+              </w:rPr>
+              <w:t xml:space="preserve">`ParsedChart`</w:t>
+            </w:r>
+            <w:r>
+              <w:t xml:space="preserve">.</w:t>
             </w:r>
           </w:p>
         </w:tc>
@@ -32137,68 +32201,566 @@
       <w:tr>
         <w:tc>
           <w:tcPr>
-            <w:tcW w:type="pct" w:w="3000%"/>
-          </w:tcPr>
-          <w:p>
-            <w:pPr>
-              <w:spacing w:after="60"/>
-            </w:pPr>
-            <w:r>
-              <w:rPr>
-                <w:b/>
-                <w:bCs/>
-              </w:rPr>
-              <w:t xml:space="preserve">Secondary / cross-check</w:t>
-            </w:r>
-          </w:p>
-        </w:tc>
-        <w:tc>
-          <w:tcPr>
-            <w:tcW w:type="pct" w:w="3000%"/>
-          </w:tcPr>
-          <w:p>
-            <w:pPr>
-              <w:spacing w:after="60"/>
-            </w:pPr>
-            <w:r>
-              <w:rPr>
-                <w:b/>
-                <w:bCs/>
-              </w:rPr>
-              <w:t xml:space="preserve">[daumling/ireal-renderer](https://github.com/daumling/ireal-renderer)</w:t>
-            </w:r>
-          </w:p>
-        </w:tc>
-        <w:tc>
-          <w:tcPr>
-            <w:tcW w:type="pct" w:w="3000%"/>
-          </w:tcPr>
-          <w:p>
-            <w:pPr>
-              <w:spacing w:after="60"/>
-            </w:pPr>
-            <w:r>
-              <w:t xml:space="preserve">Preserves </w:t>
-            </w:r>
-            <w:r>
-              <w:rPr>
-                <w:b/>
-                <w:bCs/>
-              </w:rPr>
-              <w:t xml:space="preserve">section markers</w:t>
-            </w:r>
-            <w:r>
-              <w:t xml:space="preserve"> and </w:t>
-            </w:r>
-            <w:r>
-              <w:rPr>
-                <w:b/>
-                <w:bCs/>
-              </w:rPr>
-              <w:t xml:space="preserve">form structure</w:t>
-            </w:r>
-            <w:r>
-              <w:t xml:space="preserve"> — useful for pedagogy and arrangement lanes.</w:t>
+            <w:tcW w:type="pct" w:w="4500%"/>
+          </w:tcPr>
+          <w:p>
+            <w:pPr>
+              <w:spacing w:after="60"/>
+            </w:pPr>
+            <w:r>
+              <w:rPr>
+                <w:b/>
+                <w:bCs/>
+              </w:rPr>
+              <w:t xml:space="preserve">2</w:t>
+            </w:r>
+          </w:p>
+        </w:tc>
+        <w:tc>
+          <w:tcPr>
+            <w:tcW w:type="pct" w:w="4500%"/>
+          </w:tcPr>
+          <w:p>
+            <w:pPr>
+              <w:spacing w:after="60"/>
+            </w:pPr>
+            <w:r>
+              <w:rPr>
+                <w:b/>
+                <w:bCs/>
+              </w:rPr>
+              <w:t xml:space="preserve">`chordSymbolMapper.ts`</w:t>
+            </w:r>
+            <w:r>
+              <w:t xml:space="preserve"> — </w:t>
+            </w:r>
+            <w:r>
+              <w:rPr>
+                <w:b/>
+                <w:bCs/>
+              </w:rPr>
+              <w:t xml:space="preserve">`mapChordToVaultType(ParsedChord)`</w:t>
+            </w:r>
+            <w:r>
+              <w:t xml:space="preserve"> maps </w:t>
+            </w:r>
+            <w:r>
+              <w:rPr>
+                <w:b/>
+                <w:bCs/>
+              </w:rPr>
+              <w:t xml:space="preserve">`rootNote`</w:t>
+            </w:r>
+            <w:r>
+              <w:t xml:space="preserve"> → </w:t>
+            </w:r>
+            <w:r>
+              <w:rPr>
+                <w:b/>
+                <w:bCs/>
+              </w:rPr>
+              <w:t xml:space="preserve">`rootPc`</w:t>
+            </w:r>
+            <w:r>
+              <w:t xml:space="preserve"> (</w:t>
+            </w:r>
+            <w:r>
+              <w:rPr>
+                <w:b/>
+                <w:bCs/>
+              </w:rPr>
+              <w:t xml:space="preserve">C = 0 … B = 11</w:t>
+            </w:r>
+            <w:r>
+              <w:t xml:space="preserve">) and </w:t>
+            </w:r>
+            <w:r>
+              <w:rPr>
+                <w:b/>
+                <w:bCs/>
+              </w:rPr>
+              <w:t xml:space="preserve">`chordQuality`</w:t>
+            </w:r>
+            <w:r>
+              <w:t xml:space="preserve"> → </w:t>
+            </w:r>
+            <w:r>
+              <w:rPr>
+                <w:b/>
+                <w:bCs/>
+              </w:rPr>
+              <w:t xml:space="preserve">`vaultChordTypeId`</w:t>
+            </w:r>
+            <w:r>
+              <w:t xml:space="preserve"> for all </w:t>
+            </w:r>
+            <w:r>
+              <w:rPr>
+                <w:b/>
+                <w:bCs/>
+              </w:rPr>
+              <w:t xml:space="preserve">16</w:t>
+            </w:r>
+            <w:r>
+              <w:t xml:space="preserve"> </w:t>
+            </w:r>
+            <w:r>
+              <w:rPr>
+                <w:b/>
+                <w:bCs/>
+              </w:rPr>
+              <w:t xml:space="preserve">`TONALITY_VAULT_DATABASE`</w:t>
+            </w:r>
+            <w:r>
+              <w:t xml:space="preserve"> types (synonyms: maj/</w:t>
+            </w:r>
+            <w:r>
+              <w:rPr>
+                <w:b/>
+                <w:bCs/>
+              </w:rPr>
+              <w:t xml:space="preserve">^</w:t>
+            </w:r>
+            <w:r>
+              <w:t xml:space="preserve">/Δ, minor, dom, sus, altered, etc.); unrecognised quality → </w:t>
+            </w:r>
+            <w:r>
+              <w:rPr>
+                <w:b/>
+                <w:bCs/>
+              </w:rPr>
+              <w:t xml:space="preserve">`null`</w:t>
+            </w:r>
+            <w:r>
+              <w:t xml:space="preserve">.</w:t>
+            </w:r>
+          </w:p>
+        </w:tc>
+      </w:tr>
+      <w:tr>
+        <w:tc>
+          <w:tcPr>
+            <w:tcW w:type="pct" w:w="4500%"/>
+          </w:tcPr>
+          <w:p>
+            <w:pPr>
+              <w:spacing w:after="60"/>
+            </w:pPr>
+            <w:r>
+              <w:rPr>
+                <w:b/>
+                <w:bCs/>
+              </w:rPr>
+              <w:t xml:space="preserve">3</w:t>
+            </w:r>
+          </w:p>
+        </w:tc>
+        <w:tc>
+          <w:tcPr>
+            <w:tcW w:type="pct" w:w="4500%"/>
+          </w:tcPr>
+          <w:p>
+            <w:pPr>
+              <w:spacing w:after="60"/>
+            </w:pPr>
+            <w:r>
+              <w:rPr>
+                <w:b/>
+                <w:bCs/>
+              </w:rPr>
+              <w:t xml:space="preserve">`irealVaultPipeline.ts`</w:t>
+            </w:r>
+            <w:r>
+              <w:t xml:space="preserve"> — </w:t>
+            </w:r>
+            <w:r>
+              <w:rPr>
+                <w:b/>
+                <w:bCs/>
+              </w:rPr>
+              <w:t xml:space="preserve">`generateFromIReal(input, options?)`</w:t>
+            </w:r>
+            <w:r>
+              <w:t xml:space="preserve"> walks </w:t>
+            </w:r>
+            <w:r>
+              <w:rPr>
+                <w:b/>
+                <w:bCs/>
+              </w:rPr>
+              <w:t xml:space="preserve">`ParsedChart.measures`</w:t>
+            </w:r>
+            <w:r>
+              <w:t xml:space="preserve"> (first chord per bar), </w:t>
+            </w:r>
+            <w:r>
+              <w:rPr>
+                <w:b/>
+                <w:bCs/>
+              </w:rPr>
+              <w:t xml:space="preserve">`mapChordToVaultType`</w:t>
+            </w:r>
+            <w:r>
+              <w:t xml:space="preserve">, </w:t>
+            </w:r>
+            <w:r>
+              <w:rPr>
+                <w:b/>
+                <w:bCs/>
+              </w:rPr>
+              <w:t xml:space="preserve">`generateVaultRiff`</w:t>
+            </w:r>
+            <w:r>
+              <w:t xml:space="preserve"> per bar (</w:t>
+            </w:r>
+            <w:r>
+              <w:rPr>
+                <w:b/>
+                <w:bCs/>
+              </w:rPr>
+              <w:t xml:space="preserve">`bars: 1`</w:t>
+            </w:r>
+            <w:r>
+              <w:t xml:space="preserve">), offsets </w:t>
+            </w:r>
+            <w:r>
+              <w:rPr>
+                <w:b/>
+                <w:bCs/>
+              </w:rPr>
+              <w:t xml:space="preserve">`ScoreNote.startBeat`</w:t>
+            </w:r>
+            <w:r>
+              <w:t xml:space="preserve"> by </w:t>
+            </w:r>
+            <w:r>
+              <w:rPr>
+                <w:b/>
+                <w:bCs/>
+              </w:rPr>
+              <w:t xml:space="preserve">`barIndex * 4`</w:t>
+            </w:r>
+            <w:r>
+              <w:t xml:space="preserve"> (4/4 quarters); returns </w:t>
+            </w:r>
+            <w:r>
+              <w:rPr>
+                <w:b/>
+                <w:bCs/>
+              </w:rPr>
+              <w:t xml:space="preserve">`IRealVaultOutput`</w:t>
+            </w:r>
+            <w:r>
+              <w:t xml:space="preserve"> — </w:t>
+            </w:r>
+            <w:r>
+              <w:rPr>
+                <w:b/>
+                <w:bCs/>
+              </w:rPr>
+              <w:t xml:space="preserve">`generatedNotes`</w:t>
+            </w:r>
+            <w:r>
+              <w:t xml:space="preserve">, </w:t>
+            </w:r>
+            <w:r>
+              <w:rPr>
+                <w:b/>
+                <w:bCs/>
+              </w:rPr>
+              <w:t xml:space="preserve">`chordMappings`</w:t>
+            </w:r>
+            <w:r>
+              <w:t xml:space="preserve">, </w:t>
+            </w:r>
+            <w:r>
+              <w:rPr>
+                <w:b/>
+                <w:bCs/>
+              </w:rPr>
+              <w:t xml:space="preserve">`unmappedChords`</w:t>
+            </w:r>
+            <w:r>
+              <w:t xml:space="preserve">. MusicXML export from this pipeline remains a </w:t>
+            </w:r>
+            <w:r>
+              <w:rPr>
+                <w:b/>
+                <w:bCs/>
+              </w:rPr>
+              <w:t xml:space="preserve">follow-up</w:t>
+            </w:r>
+            <w:r>
+              <w:t xml:space="preserve"> wire to the main exporter.</w:t>
+            </w:r>
+          </w:p>
+        </w:tc>
+      </w:tr>
+      <w:tr>
+        <w:tc>
+          <w:tcPr>
+            <w:tcW w:type="pct" w:w="4500%"/>
+          </w:tcPr>
+          <w:p>
+            <w:pPr>
+              <w:spacing w:after="60"/>
+            </w:pPr>
+            <w:r>
+              <w:rPr>
+                <w:b/>
+                <w:bCs/>
+              </w:rPr>
+              <w:t xml:space="preserve">4</w:t>
+            </w:r>
+          </w:p>
+        </w:tc>
+        <w:tc>
+          <w:tcPr>
+            <w:tcW w:type="pct" w:w="4500%"/>
+          </w:tcPr>
+          <w:p>
+            <w:pPr>
+              <w:spacing w:after="60"/>
+            </w:pPr>
+            <w:r>
+              <w:rPr>
+                <w:b/>
+                <w:bCs/>
+              </w:rPr>
+              <w:t xml:space="preserve">iReal Pro Import (Beta)</w:t>
+            </w:r>
+            <w:r>
+              <w:t xml:space="preserve"> in </w:t>
+            </w:r>
+            <w:r>
+              <w:rPr>
+                <w:b/>
+                <w:bCs/>
+              </w:rPr>
+              <w:t xml:space="preserve">`HomeGenerate.tsx`</w:t>
+            </w:r>
+            <w:r>
+              <w:t xml:space="preserve"> — collapsible </w:t>
+            </w:r>
+            <w:r>
+              <w:rPr>
+                <w:b/>
+                <w:bCs/>
+              </w:rPr>
+              <w:t xml:space="preserve">`details`</w:t>
+            </w:r>
+            <w:r>
+              <w:t xml:space="preserve">; </w:t>
+            </w:r>
+            <w:r>
+              <w:rPr>
+                <w:b/>
+                <w:bCs/>
+              </w:rPr>
+              <w:t xml:space="preserve">textarea</w:t>
+            </w:r>
+            <w:r>
+              <w:t xml:space="preserve"> for </w:t>
+            </w:r>
+            <w:r>
+              <w:rPr>
+                <w:b/>
+                <w:bCs/>
+              </w:rPr>
+              <w:t xml:space="preserve">`ireal://`</w:t>
+            </w:r>
+            <w:r>
+              <w:t xml:space="preserve"> / HTML paste; </w:t>
+            </w:r>
+            <w:r>
+              <w:rPr>
+                <w:b/>
+                <w:bCs/>
+              </w:rPr>
+              <w:t xml:space="preserve">riff style</w:t>
+            </w:r>
+            <w:r>
+              <w:t xml:space="preserve"> dropdown (</w:t>
+            </w:r>
+            <w:r>
+              <w:rPr>
+                <w:b/>
+                <w:bCs/>
+              </w:rPr>
+              <w:t xml:space="preserve">bebop-placement</w:t>
+            </w:r>
+            <w:r>
+              <w:t xml:space="preserve">, </w:t>
+            </w:r>
+            <w:r>
+              <w:rPr>
+                <w:b/>
+                <w:bCs/>
+              </w:rPr>
+              <w:t xml:space="preserve">quadratonic</w:t>
+            </w:r>
+            <w:r>
+              <w:t xml:space="preserve">, </w:t>
+            </w:r>
+            <w:r>
+              <w:rPr>
+                <w:b/>
+                <w:bCs/>
+              </w:rPr>
+              <w:t xml:space="preserve">dyad-seesaw</w:t>
+            </w:r>
+            <w:r>
+              <w:t xml:space="preserve">, </w:t>
+            </w:r>
+            <w:r>
+              <w:rPr>
+                <w:b/>
+                <w:bCs/>
+              </w:rPr>
+              <w:t xml:space="preserve">triad-pair-pendulum</w:t>
+            </w:r>
+            <w:r>
+              <w:t xml:space="preserve">, </w:t>
+            </w:r>
+            <w:r>
+              <w:rPr>
+                <w:b/>
+                <w:bCs/>
+              </w:rPr>
+              <w:t xml:space="preserve">pedal-string</w:t>
+            </w:r>
+            <w:r>
+              <w:t xml:space="preserve">); </w:t>
+            </w:r>
+            <w:r>
+              <w:rPr>
+                <w:b/>
+                <w:bCs/>
+              </w:rPr>
+              <w:t xml:space="preserve">tuning</w:t>
+            </w:r>
+            <w:r>
+              <w:t xml:space="preserve"> dropdown (</w:t>
+            </w:r>
+            <w:r>
+              <w:rPr>
+                <w:b/>
+                <w:bCs/>
+              </w:rPr>
+              <w:t xml:space="preserve">standard</w:t>
+            </w:r>
+            <w:r>
+              <w:t xml:space="preserve">, </w:t>
+            </w:r>
+            <w:r>
+              <w:rPr>
+                <w:b/>
+                <w:bCs/>
+              </w:rPr>
+              <w:t xml:space="preserve">dadgad</w:t>
+            </w:r>
+            <w:r>
+              <w:t xml:space="preserve">, </w:t>
+            </w:r>
+            <w:r>
+              <w:rPr>
+                <w:b/>
+                <w:bCs/>
+              </w:rPr>
+              <w:t xml:space="preserve">open_d</w:t>
+            </w:r>
+            <w:r>
+              <w:t xml:space="preserve">, </w:t>
+            </w:r>
+            <w:r>
+              <w:rPr>
+                <w:b/>
+                <w:bCs/>
+              </w:rPr>
+              <w:t xml:space="preserve">open_g</w:t>
+            </w:r>
+            <w:r>
+              <w:t xml:space="preserve">, </w:t>
+            </w:r>
+            <w:r>
+              <w:rPr>
+                <w:b/>
+                <w:bCs/>
+              </w:rPr>
+              <w:t xml:space="preserve">sy_cgdgcd</w:t>
+            </w:r>
+            <w:r>
+              <w:t xml:space="preserve">); </w:t>
+            </w:r>
+            <w:r>
+              <w:rPr>
+                <w:b/>
+                <w:bCs/>
+              </w:rPr>
+              <w:t xml:space="preserve">Generate from iReal</w:t>
+            </w:r>
+            <w:r>
+              <w:t xml:space="preserve"> calls </w:t>
+            </w:r>
+            <w:r>
+              <w:rPr>
+                <w:b/>
+                <w:bCs/>
+              </w:rPr>
+              <w:t xml:space="preserve">`generateFromIReal`</w:t>
+            </w:r>
+            <w:r>
+              <w:t xml:space="preserve">; results show </w:t>
+            </w:r>
+            <w:r>
+              <w:rPr>
+                <w:b/>
+                <w:bCs/>
+              </w:rPr>
+              <w:t xml:space="preserve">title</w:t>
+            </w:r>
+            <w:r>
+              <w:t xml:space="preserve">, </w:t>
+            </w:r>
+            <w:r>
+              <w:rPr>
+                <w:b/>
+                <w:bCs/>
+              </w:rPr>
+              <w:t xml:space="preserve">key</w:t>
+            </w:r>
+            <w:r>
+              <w:t xml:space="preserve">, </w:t>
+            </w:r>
+            <w:r>
+              <w:rPr>
+                <w:b/>
+                <w:bCs/>
+              </w:rPr>
+              <w:t xml:space="preserve">bars</w:t>
+            </w:r>
+            <w:r>
+              <w:t xml:space="preserve">, </w:t>
+            </w:r>
+            <w:r>
+              <w:rPr>
+                <w:b/>
+                <w:bCs/>
+              </w:rPr>
+              <w:t xml:space="preserve">mapped vs unmapped</w:t>
+            </w:r>
+            <w:r>
+              <w:t xml:space="preserve"> counts; </w:t>
+            </w:r>
+            <w:r>
+              <w:rPr>
+                <w:b/>
+                <w:bCs/>
+              </w:rPr>
+              <w:t xml:space="preserve">amber</w:t>
+            </w:r>
+            <w:r>
+              <w:t xml:space="preserve"> list for unmapped chords.</w:t>
             </w:r>
           </w:p>
         </w:tc>
@@ -32218,7 +32780,7 @@
           <w:b/>
           <w:bCs/>
         </w:rPr>
-        <w:t xml:space="preserve">Input contract:</w:t>
+        <w:t xml:space="preserve">Cross-check library (not bundled):</w:t>
       </w:r>
       <w:r>
         <w:t xml:space="preserve"> </w:t>
@@ -32228,315 +32790,10 @@
           <w:b/>
           <w:bCs/>
         </w:rPr>
-        <w:t xml:space="preserve">iReal Pro HTML export</w:t>
-      </w:r>
-      <w:r>
-        <w:t xml:space="preserve"> or </w:t>
-      </w:r>
-      <w:r>
-        <w:rPr>
-          <w:b/>
-          <w:bCs/>
-        </w:rPr>
-        <w:t xml:space="preserve">`ireal://` URL</w:t>
-      </w:r>
-      <w:r>
-        <w:t xml:space="preserve"> — </w:t>
-      </w:r>
-      <w:r>
-        <w:rPr>
-          <w:b/>
-          <w:bCs/>
-        </w:rPr>
-        <w:t xml:space="preserve">not</w:t>
-      </w:r>
-      <w:r>
-        <w:t xml:space="preserve"> the opaque </w:t>
-      </w:r>
-      <w:r>
-        <w:rPr>
-          <w:b/>
-          <w:bCs/>
-        </w:rPr>
-        <w:t xml:space="preserve">`.irealb`</w:t>
-      </w:r>
-      <w:r>
-        <w:t xml:space="preserve"> file alone (binary format is not the ingestion surface for this roadmap).</w:t>
-      </w:r>
-    </w:p>
-    <w:p>
-      <w:pPr>
-        <w:spacing w:after="160"/>
-      </w:pPr>
-      <w:r>
-        <w:rPr>
-          <w:b/>
-          <w:bCs/>
-        </w:rPr>
-        <w:t xml:space="preserve">Target schema:</w:t>
-      </w:r>
-      <w:r>
-        <w:t xml:space="preserve"> normalise both parsers toward a shared </w:t>
-      </w:r>
-      <w:r>
-        <w:rPr>
-          <w:b/>
-          <w:bCs/>
-        </w:rPr>
-        <w:t xml:space="preserve">`ParsedChart`</w:t>
-      </w:r>
-      <w:r>
-        <w:t xml:space="preserve"> contract (</w:t>
-      </w:r>
-      <w:r>
-        <w:rPr>
-          <w:b/>
-          <w:bCs/>
-        </w:rPr>
-        <w:t xml:space="preserve">title</w:t>
-      </w:r>
-      <w:r>
-        <w:t xml:space="preserve">, </w:t>
-      </w:r>
-      <w:r>
-        <w:rPr>
-          <w:b/>
-          <w:bCs/>
-        </w:rPr>
-        <w:t xml:space="preserve">key</w:t>
-      </w:r>
-      <w:r>
-        <w:t xml:space="preserve">, </w:t>
-      </w:r>
-      <w:r>
-        <w:rPr>
-          <w:b/>
-          <w:bCs/>
-        </w:rPr>
-        <w:t xml:space="preserve">timeSignature</w:t>
-      </w:r>
-      <w:r>
-        <w:t xml:space="preserve">, </w:t>
-      </w:r>
-      <w:r>
-        <w:rPr>
-          <w:b/>
-          <w:bCs/>
-        </w:rPr>
-        <w:t xml:space="preserve">tempo</w:t>
-      </w:r>
-      <w:r>
-        <w:t xml:space="preserve">, </w:t>
-      </w:r>
-      <w:r>
-        <w:rPr>
-          <w:b/>
-          <w:bCs/>
-        </w:rPr>
-        <w:t xml:space="preserve">sections</w:t>
-      </w:r>
-      <w:r>
-        <w:t xml:space="preserve">, </w:t>
-      </w:r>
-      <w:r>
-        <w:rPr>
-          <w:b/>
-          <w:bCs/>
-        </w:rPr>
-        <w:t xml:space="preserve">measures</w:t>
-      </w:r>
-      <w:r>
-        <w:t xml:space="preserve">, </w:t>
-      </w:r>
-      <w:r>
-        <w:rPr>
-          <w:b/>
-          <w:bCs/>
-        </w:rPr>
-        <w:t xml:space="preserve">repeats</w:t>
-      </w:r>
-      <w:r>
-        <w:t xml:space="preserve">, </w:t>
-      </w:r>
-      <w:r>
-        <w:rPr>
-          <w:b/>
-          <w:bCs/>
-        </w:rPr>
-        <w:t xml:space="preserve">jumps</w:t>
-      </w:r>
-      <w:r>
-        <w:t xml:space="preserve">). Both libraries are </w:t>
-      </w:r>
-      <w:r>
-        <w:rPr>
-          <w:b/>
-          <w:bCs/>
-        </w:rPr>
-        <w:t xml:space="preserve">JavaScript</w:t>
-      </w:r>
-      <w:r>
-        <w:t xml:space="preserve"> — ship thin </w:t>
-      </w:r>
-      <w:r>
-        <w:rPr>
-          <w:b/>
-          <w:bCs/>
-        </w:rPr>
-        <w:t xml:space="preserve">TypeScript</w:t>
-      </w:r>
-      <w:r>
-        <w:t xml:space="preserve"> facades + typed </w:t>
-      </w:r>
-      <w:r>
-        <w:rPr>
-          <w:b/>
-          <w:bCs/>
-        </w:rPr>
-        <w:t xml:space="preserve">`ParsedChart`</w:t>
-      </w:r>
-      <w:r>
-        <w:t xml:space="preserve"> in-repo.</w:t>
-      </w:r>
-    </w:p>
-    <w:p>
-      <w:pPr>
-        <w:spacing w:after="160"/>
-      </w:pPr>
-      <w:r>
-        <w:rPr>
-          <w:b/>
-          <w:bCs/>
-        </w:rPr>
-        <w:t xml:space="preserve">Downstream:</w:t>
-      </w:r>
-      <w:r>
-        <w:t xml:space="preserve"> map chord symbols to </w:t>
-      </w:r>
-      <w:r>
-        <w:rPr>
-          <w:b/>
-          <w:bCs/>
-        </w:rPr>
-        <w:t xml:space="preserve">`tonalityVaultDatabase`</w:t>
-      </w:r>
-      <w:r>
-        <w:t xml:space="preserve"> chord types, then </w:t>
-      </w:r>
-      <w:r>
-        <w:rPr>
-          <w:b/>
-          <w:bCs/>
-        </w:rPr>
-        <w:t xml:space="preserve">`generateVaultRiff`</w:t>
-      </w:r>
-      <w:r>
-        <w:t xml:space="preserve"> (and quadratonic planners) </w:t>
-      </w:r>
-      <w:r>
-        <w:rPr>
-          <w:b/>
-          <w:bCs/>
-        </w:rPr>
-        <w:t xml:space="preserve">per chord / bar</w:t>
-      </w:r>
-      <w:r>
-        <w:t xml:space="preserve"> for guitar lines.</w:t>
-      </w:r>
-    </w:p>
-    <w:p>
-      <w:pPr>
-        <w:spacing w:after="160"/>
-      </w:pPr>
-      <w:r>
-        <w:rPr>
-          <w:b/>
-          <w:bCs/>
-        </w:rPr>
-        <w:t xml:space="preserve">Optional later:</w:t>
-      </w:r>
-      <w:r>
-        <w:t xml:space="preserve"> </w:t>
-      </w:r>
-      <w:r>
-        <w:rPr>
-          <w:b/>
-          <w:bCs/>
-        </w:rPr>
-        <w:t xml:space="preserve">JPEG / screenshot</w:t>
-      </w:r>
-      <w:r>
-        <w:t xml:space="preserve"> of an iReal-style chart via </w:t>
-      </w:r>
-      <w:r>
-        <w:rPr>
-          <w:b/>
-          <w:bCs/>
-        </w:rPr>
-        <w:t xml:space="preserve">Claude vision API</w:t>
-      </w:r>
-      <w:r>
-        <w:t xml:space="preserve"> for users without HTML export — same </w:t>
-      </w:r>
-      <w:r>
-        <w:rPr>
-          <w:b/>
-          <w:bCs/>
-        </w:rPr>
-        <w:t xml:space="preserve">`ParsedChart`</w:t>
-      </w:r>
-      <w:r>
-        <w:t xml:space="preserve"> target after OCR normalisation. </w:t>
-      </w:r>
-      <w:r>
-        <w:rPr>
-          <w:b/>
-          <w:bCs/>
-        </w:rPr>
-        <w:t xml:space="preserve">Dependencies:</w:t>
-      </w:r>
-      <w:r>
-        <w:t xml:space="preserve"> </w:t>
-      </w:r>
-      <w:r>
-        <w:rPr>
-          <w:b/>
-          <w:bCs/>
-        </w:rPr>
-        <w:t xml:space="preserve">Build C</w:t>
-      </w:r>
-      <w:r>
-        <w:t xml:space="preserve"> (riffs), </w:t>
-      </w:r>
-      <w:r>
-        <w:rPr>
-          <w:b/>
-          <w:bCs/>
-        </w:rPr>
-        <w:t xml:space="preserve">Build D</w:t>
-      </w:r>
-      <w:r>
-        <w:t xml:space="preserve"> (optional </w:t>
-      </w:r>
-      <w:r>
-        <w:rPr>
-          <w:b/>
-          <w:bCs/>
-        </w:rPr>
-        <w:t xml:space="preserve">`generateReharmCandidates`</w:t>
-      </w:r>
-      <w:r>
-        <w:t xml:space="preserve"> pass), </w:t>
-      </w:r>
-      <w:r>
-        <w:rPr>
-          <w:b/>
-          <w:bCs/>
-        </w:rPr>
-        <w:t xml:space="preserve">`ParsedChart`</w:t>
-      </w:r>
-      <w:r>
-        <w:t xml:space="preserve"> adapter layer.</w:t>
+        <w:t xml:space="preserve">[daumling/ireal-renderer](https://github.com/daumling/ireal-renderer)</w:t>
+      </w:r>
+      <w:r>
+        <w:t xml:space="preserve"> — optional future cross-check for section markers / form structure.</w:t>
       </w:r>
     </w:p>
     <w:p>
@@ -33112,14 +33369,24 @@
         <w:t xml:space="preserve">guitar riff mode</w:t>
       </w:r>
       <w:r>
-        <w:t xml:space="preserve">, </w:t>
-      </w:r>
-      <w:r>
-        <w:rPr>
-          <w:b/>
-          <w:bCs/>
-        </w:rPr>
-        <w:t xml:space="preserve">iReal Pro import UI</w:t>
+        <w:t xml:space="preserve"> — plus </w:t>
+      </w:r>
+      <w:r>
+        <w:rPr>
+          <w:b/>
+          <w:bCs/>
+        </w:rPr>
+        <w:t xml:space="preserve">iReal Pro Import (Beta)</w:t>
+      </w:r>
+      <w:r>
+        <w:t xml:space="preserve"> on </w:t>
+      </w:r>
+      <w:r>
+        <w:rPr>
+          <w:b/>
+          <w:bCs/>
+        </w:rPr>
+        <w:t xml:space="preserve">Generate</w:t>
       </w:r>
       <w:r>
         <w:t xml:space="preserve"> (</w:t>
@@ -33129,10 +33396,30 @@
           <w:b/>
           <w:bCs/>
         </w:rPr>
+        <w:t xml:space="preserve">`ireal://`</w:t>
+      </w:r>
+      <w:r>
+        <w:t xml:space="preserve"> / HTML paste → Vault riffs; shipped </w:t>
+      </w:r>
+      <w:r>
+        <w:rPr>
+          <w:b/>
+          <w:bCs/>
+        </w:rPr>
         <w:t xml:space="preserve">Build IMG</w:t>
       </w:r>
       <w:r>
-        <w:t xml:space="preserve"> — HTML / `ireal://`, optional screenshot OCR).</w:t>
+        <w:t xml:space="preserve"> iter </w:t>
+      </w:r>
+      <w:r>
+        <w:rPr>
+          <w:b/>
+          <w:bCs/>
+        </w:rPr>
+        <w:t xml:space="preserve">4</w:t>
+      </w:r>
+      <w:r>
+        <w:t xml:space="preserve">).</w:t>
       </w:r>
     </w:p>
     <w:p>
@@ -33176,6 +33463,16 @@
         <w:t xml:space="preserve">C2</w:t>
       </w:r>
       <w:r>
+        <w:t xml:space="preserve">, </w:t>
+      </w:r>
+      <w:r>
+        <w:rPr>
+          <w:b/>
+          <w:bCs/>
+        </w:rPr>
+        <w:t xml:space="preserve">H</w:t>
+      </w:r>
+      <w:r>
         <w:t xml:space="preserve">, and </w:t>
       </w:r>
       <w:r>
@@ -33183,7 +33480,7 @@
           <w:b/>
           <w:bCs/>
         </w:rPr>
-        <w:t xml:space="preserve">H</w:t>
+        <w:t xml:space="preserve">IMG</w:t>
       </w:r>
       <w:r>
         <w:t xml:space="preserve"> are </w:t>
@@ -33203,7 +33500,20 @@
           <w:b/>
           <w:bCs/>
         </w:rPr>
-        <w:t xml:space="preserve">Remaining sequencing: IMG → UI.</w:t>
+        <w:t xml:space="preserve">Only</w:t>
+      </w:r>
+      <w:r>
+        <w:t xml:space="preserve"> remaining Tonality Vault build: </w:t>
+      </w:r>
+      <w:r>
+        <w:rPr>
+          <w:b/>
+          <w:bCs/>
+        </w:rPr>
+        <w:t xml:space="preserve">Build UI</w:t>
+      </w:r>
+      <w:r>
+        <w:t xml:space="preserve"> (visual fretboard).</w:t>
       </w:r>
     </w:p>
     <w:p>
@@ -33215,7 +33525,7 @@
           <w:b/>
           <w:bCs/>
         </w:rPr>
-        <w:t xml:space="preserve">Why IMG before UI:</w:t>
+        <w:t xml:space="preserve">Next:</w:t>
       </w:r>
       <w:r>
         <w:t xml:space="preserve"> </w:t>
@@ -33225,27 +33535,27 @@
           <w:b/>
           <w:bCs/>
         </w:rPr>
-        <w:t xml:space="preserve">Build IMG</w:t>
-      </w:r>
-      <w:r>
-        <w:t xml:space="preserve"> is </w:t>
-      </w:r>
-      <w:r>
-        <w:rPr>
-          <w:b/>
-          <w:bCs/>
-        </w:rPr>
-        <w:t xml:space="preserve">lower risk</w:t>
-      </w:r>
-      <w:r>
-        <w:t xml:space="preserve">, needs </w:t>
-      </w:r>
-      <w:r>
-        <w:rPr>
-          <w:b/>
-          <w:bCs/>
-        </w:rPr>
-        <w:t xml:space="preserve">fewer iterations</w:t>
+        <w:t xml:space="preserve">Build UI</w:t>
+      </w:r>
+      <w:r>
+        <w:t xml:space="preserve"> — </w:t>
+      </w:r>
+      <w:r>
+        <w:rPr>
+          <w:b/>
+          <w:bCs/>
+        </w:rPr>
+        <w:t xml:space="preserve">6–8</w:t>
+      </w:r>
+      <w:r>
+        <w:t xml:space="preserve"> iteration </w:t>
+      </w:r>
+      <w:r>
+        <w:rPr>
+          <w:b/>
+          <w:bCs/>
+        </w:rPr>
+        <w:t xml:space="preserve">dedicated session</w:t>
       </w:r>
       <w:r>
         <w:t xml:space="preserve"> (</w:t>
@@ -33255,147 +33565,50 @@
           <w:b/>
           <w:bCs/>
         </w:rPr>
-        <w:t xml:space="preserve">3–4</w:t>
-      </w:r>
-      <w:r>
-        <w:t xml:space="preserve"> vs </w:t>
-      </w:r>
-      <w:r>
-        <w:rPr>
-          <w:b/>
-          <w:bCs/>
-        </w:rPr>
-        <w:t xml:space="preserve">6–8</w:t>
-      </w:r>
-      <w:r>
-        <w:t xml:space="preserve">), and ships </w:t>
-      </w:r>
-      <w:r>
-        <w:rPr>
-          <w:b/>
-          <w:bCs/>
-        </w:rPr>
-        <w:t xml:space="preserve">immediately useful</w:t>
-      </w:r>
-      <w:r>
-        <w:t xml:space="preserve"> output — paste an </w:t>
-      </w:r>
-      <w:r>
-        <w:rPr>
-          <w:b/>
-          <w:bCs/>
-        </w:rPr>
-        <w:t xml:space="preserve">`ireal://`</w:t>
-      </w:r>
-      <w:r>
-        <w:t xml:space="preserve"> URL → chord timeline → </w:t>
-      </w:r>
-      <w:r>
-        <w:rPr>
-          <w:b/>
-          <w:bCs/>
-        </w:rPr>
-        <w:t xml:space="preserve">Vault</w:t>
-      </w:r>
-      <w:r>
-        <w:t xml:space="preserve"> </w:t>
-      </w:r>
-      <w:r>
-        <w:rPr>
-          <w:b/>
-          <w:bCs/>
-        </w:rPr>
-        <w:t xml:space="preserve">`generateVaultRiff`</w:t>
-      </w:r>
-      <w:r>
-        <w:t xml:space="preserve"> → </w:t>
-      </w:r>
-      <w:r>
-        <w:rPr>
-          <w:b/>
-          <w:bCs/>
-        </w:rPr>
-        <w:t xml:space="preserve">MusicXML</w:t>
-      </w:r>
-      <w:r>
-        <w:t xml:space="preserve">. </w:t>
-      </w:r>
-      <w:r>
-        <w:rPr>
-          <w:b/>
-          <w:bCs/>
-        </w:rPr>
-        <w:t xml:space="preserve">Build UI</w:t>
-      </w:r>
-      <w:r>
-        <w:t xml:space="preserve"> is the </w:t>
-      </w:r>
-      <w:r>
-        <w:rPr>
-          <w:b/>
-          <w:bCs/>
-        </w:rPr>
-        <w:t xml:space="preserve">largest</w:t>
-      </w:r>
-      <w:r>
-        <w:t xml:space="preserve"> remaining build (fretboard + tab + microscope + layout); treat it as a </w:t>
-      </w:r>
-      <w:r>
-        <w:rPr>
-          <w:b/>
-          <w:bCs/>
-        </w:rPr>
-        <w:t xml:space="preserve">dedicated focused session</w:t>
-      </w:r>
-      <w:r>
-        <w:t xml:space="preserve"> after IMG lands.</w:t>
-      </w:r>
-    </w:p>
-    <w:p>
-      <w:pPr>
-        <w:spacing w:after="160"/>
-      </w:pPr>
-      <w:r>
-        <w:rPr>
-          <w:b/>
-          <w:bCs/>
-        </w:rPr>
-        <w:t xml:space="preserve">Next:</w:t>
-      </w:r>
-      <w:r>
-        <w:t xml:space="preserve"> </w:t>
-      </w:r>
-      <w:r>
-        <w:rPr>
-          <w:b/>
-          <w:bCs/>
-        </w:rPr>
-        <w:t xml:space="preserve">Build IMG</w:t>
-      </w:r>
-      <w:r>
-        <w:t xml:space="preserve"> (iReal pipeline). Then </w:t>
-      </w:r>
-      <w:r>
-        <w:rPr>
-          <w:b/>
-          <w:bCs/>
-        </w:rPr>
-        <w:t xml:space="preserve">Build UI</w:t>
-      </w:r>
-      <w:r>
-        <w:t xml:space="preserve"> (visual fretboard).</w:t>
-      </w:r>
-    </w:p>
-    <w:p>
-      <w:pPr>
-        <w:spacing w:after="160"/>
-      </w:pPr>
-      <w:r>
-        <w:rPr>
-          <w:b/>
-          <w:bCs/>
-        </w:rPr>
-        <w:t xml:space="preserve">IMG → UI</w:t>
+        <w:t xml:space="preserve">fretboard.js</w:t>
+      </w:r>
+      <w:r>
+        <w:t xml:space="preserve"> + </w:t>
+      </w:r>
+      <w:r>
+        <w:rPr>
+          <w:b/>
+          <w:bCs/>
+        </w:rPr>
+        <w:t xml:space="preserve">VexFlow</w:t>
+      </w:r>
+      <w:r>
+        <w:t xml:space="preserve">; </w:t>
+      </w:r>
+      <w:r>
+        <w:rPr>
+          <w:b/>
+          <w:bCs/>
+        </w:rPr>
+        <w:t xml:space="preserve">FretboardPanel</w:t>
+      </w:r>
+      <w:r>
+        <w:t xml:space="preserve">, </w:t>
+      </w:r>
+      <w:r>
+        <w:rPr>
+          <w:b/>
+          <w:bCs/>
+        </w:rPr>
+        <w:t xml:space="preserve">TabPanel</w:t>
+      </w:r>
+      <w:r>
+        <w:t xml:space="preserve">, </w:t>
+      </w:r>
+      <w:r>
+        <w:rPr>
+          <w:b/>
+          <w:bCs/>
+        </w:rPr>
+        <w:t xml:space="preserve">Vault microscope</w:t>
+      </w:r>
+      <w:r>
+        <w:t xml:space="preserve">, layout / dark mode). No other Vault roadmap builds ahead of it.</w:t>
       </w:r>
     </w:p>
     <w:p>

</xml_diff>

<commit_message>
docs: Build I Generation Mode Profiles added to roadmap — solo vs melody differentiation
Co-authored-by: Cursor <cursoragent@cursor.com>
</commit_message>
<xml_diff>
--- a/docs/COMPOSER_OS_PLAYBOOK.docx
+++ b/docs/COMPOSER_OS_PLAYBOOK.docx
@@ -31735,6 +31735,65 @@
           <w:b/>
           <w:bCs/>
         </w:rPr>
+        <w:t xml:space="preserve">Build I — Generation Mode Profiles (Solo vs Melody):</w:t>
+      </w:r>
+      <w:r>
+        <w:t xml:space="preserve"> </w:t>
+      </w:r>
+      <w:r>
+        <w:rPr>
+          <w:b/>
+          <w:bCs/>
+        </w:rPr>
+        <w:t xml:space="preserve">Roadmap / not shipped</w:t>
+      </w:r>
+      <w:r>
+        <w:t xml:space="preserve"> — expression-level differentiation between </w:t>
+      </w:r>
+      <w:r>
+        <w:rPr>
+          <w:b/>
+          <w:bCs/>
+        </w:rPr>
+        <w:t xml:space="preserve">solo</w:t>
+      </w:r>
+      <w:r>
+        <w:t xml:space="preserve"> (dense, bar-reactive, bebop-weighted) and </w:t>
+      </w:r>
+      <w:r>
+        <w:rPr>
+          <w:b/>
+          <w:bCs/>
+        </w:rPr>
+        <w:t xml:space="preserve">melody</w:t>
+      </w:r>
+      <w:r>
+        <w:t xml:space="preserve"> (sparse, motif-driven, phrase-reactive). See </w:t>
+      </w:r>
+      <w:r>
+        <w:rPr>
+          <w:b/>
+          <w:bCs/>
+        </w:rPr>
+        <w:t xml:space="preserve">Build I — Generation Mode Profiles</w:t>
+      </w:r>
+      <w:r>
+        <w:t xml:space="preserve"> below.</w:t>
+      </w:r>
+    </w:p>
+    <w:p>
+      <w:pPr>
+        <w:spacing w:after="80"/>
+        <w:ind w:left="360" w:hanging="260"/>
+      </w:pPr>
+      <w:r>
+        <w:t xml:space="preserve">• </w:t>
+      </w:r>
+      <w:r>
+        <w:rPr>
+          <w:b/>
+          <w:bCs/>
+        </w:rPr>
         <w:t xml:space="preserve">Build UI — Visual fretboard (remaining):</w:t>
       </w:r>
       <w:r>
@@ -31745,10 +31804,20 @@
           <w:b/>
           <w:bCs/>
         </w:rPr>
-        <w:t xml:space="preserve">Only</w:t>
-      </w:r>
-      <w:r>
-        <w:t xml:space="preserve"> remaining Tonality Vault roadmap build. </w:t>
+        <w:t xml:space="preserve">Next</w:t>
+      </w:r>
+      <w:r>
+        <w:t xml:space="preserve"> after </w:t>
+      </w:r>
+      <w:r>
+        <w:rPr>
+          <w:b/>
+          <w:bCs/>
+        </w:rPr>
+        <w:t xml:space="preserve">Build I</w:t>
+      </w:r>
+      <w:r>
+        <w:t xml:space="preserve">. </w:t>
       </w:r>
       <w:r>
         <w:rPr>
@@ -31907,7 +31976,7 @@
         <w:spacing w:after="100" w:before="160"/>
       </w:pPr>
       <w:r>
-        <w:t xml:space="preserve">Build IMG — iReal Pro import (**complete**)</w:t>
+        <w:t xml:space="preserve">Build I — Generation Mode Profiles (Solo vs Melody) (roadmap)</w:t>
       </w:r>
     </w:p>
     <w:p>
@@ -31919,90 +31988,55 @@
           <w:b/>
           <w:bCs/>
         </w:rPr>
-        <w:t xml:space="preserve">Shipped</w:t>
-      </w:r>
-      <w:r>
-        <w:t xml:space="preserve"> in `engines/composer-os-v2/core/irealpro/` (barrel </w:t>
-      </w:r>
-      <w:r>
-        <w:rPr>
-          <w:b/>
-          <w:bCs/>
-        </w:rPr>
-        <w:t xml:space="preserve">`irealpro/index.ts`</w:t>
-      </w:r>
-      <w:r>
-        <w:t xml:space="preserve">) and </w:t>
-      </w:r>
-      <w:r>
-        <w:rPr>
-          <w:b/>
-          <w:bCs/>
-        </w:rPr>
-        <w:t xml:space="preserve">`apps/composer-os-app/src/pages/HomeGenerate.tsx`</w:t>
-      </w:r>
-      <w:r>
-        <w:t xml:space="preserve"> (beta UI). Primary path is </w:t>
-      </w:r>
-      <w:r>
-        <w:rPr>
-          <w:b/>
-          <w:bCs/>
-        </w:rPr>
-        <w:t xml:space="preserve">structured</w:t>
-      </w:r>
-      <w:r>
-        <w:t xml:space="preserve"> parsing via npm </w:t>
-      </w:r>
-      <w:r>
-        <w:rPr>
-          <w:b/>
-          <w:bCs/>
-        </w:rPr>
-        <w:t xml:space="preserve">`ireal-reader`</w:t>
-      </w:r>
-      <w:r>
-        <w:t xml:space="preserve"> ([pianosnake/ireal-reader](https://github.com/pianosnake/ireal-reader)), not raw </w:t>
-      </w:r>
-      <w:r>
-        <w:rPr>
-          <w:b/>
-          <w:bCs/>
-        </w:rPr>
-        <w:t xml:space="preserve">`.irealb` binary</w:t>
-      </w:r>
-      <w:r>
-        <w:t xml:space="preserve"> as the ingest surface. </w:t>
-      </w:r>
-      <w:r>
-        <w:rPr>
-          <w:b/>
-          <w:bCs/>
-        </w:rPr>
-        <w:t xml:space="preserve">Optional later:</w:t>
-      </w:r>
-      <w:r>
-        <w:t xml:space="preserve"> </w:t>
-      </w:r>
-      <w:r>
-        <w:rPr>
-          <w:b/>
-          <w:bCs/>
-        </w:rPr>
-        <w:t xml:space="preserve">JPEG / screenshot</w:t>
-      </w:r>
-      <w:r>
-        <w:t xml:space="preserve"> OCR for users without HTML export (same </w:t>
-      </w:r>
-      <w:r>
-        <w:rPr>
-          <w:b/>
-          <w:bCs/>
-        </w:rPr>
-        <w:t xml:space="preserve">`ParsedChart`</w:t>
-      </w:r>
-      <w:r>
-        <w:t xml:space="preserve"> target) — not in v1.</w:t>
+        <w:t xml:space="preserve">Goal:</w:t>
+      </w:r>
+      <w:r>
+        <w:t xml:space="preserve"> Two generation </w:t>
+      </w:r>
+      <w:r>
+        <w:rPr>
+          <w:b/>
+          <w:bCs/>
+        </w:rPr>
+        <w:t xml:space="preserve">modes</w:t>
+      </w:r>
+      <w:r>
+        <w:t xml:space="preserve">—</w:t>
+      </w:r>
+      <w:r>
+        <w:rPr>
+          <w:b/>
+          <w:bCs/>
+        </w:rPr>
+        <w:t xml:space="preserve">solo</w:t>
+      </w:r>
+      <w:r>
+        <w:t xml:space="preserve"> vs </w:t>
+      </w:r>
+      <w:r>
+        <w:rPr>
+          <w:b/>
+          <w:bCs/>
+        </w:rPr>
+        <w:t xml:space="preserve">song melody</w:t>
+      </w:r>
+      <w:r>
+        <w:t xml:space="preserve">—with explicit tunable profiles so Vault melody output does not default to one density.</w:t>
+      </w:r>
+    </w:p>
+    <w:p>
+      <w:pPr>
+        <w:spacing w:after="160"/>
+      </w:pPr>
+      <w:r>
+        <w:rPr>
+          <w:b/>
+          <w:bCs/>
+        </w:rPr>
+        <w:t xml:space="preserve">`GenerationModeProfile`</w:t>
+      </w:r>
+      <w:r>
+        <w:t xml:space="preserve"> (planned type — fields drive phrase + bar fill):</w:t>
       </w:r>
     </w:p>
     <w:tbl>
@@ -32031,7 +32065,7 @@
               <w:spacing w:after="60"/>
             </w:pPr>
             <w:r>
-              <w:t xml:space="preserve">Iteration</w:t>
+              <w:t xml:space="preserve">Field</w:t>
             </w:r>
           </w:p>
         </w:tc>
@@ -32044,7 +32078,7 @@
               <w:spacing w:after="60"/>
             </w:pPr>
             <w:r>
-              <w:t xml:space="preserve">What shipped</w:t>
+              <w:t xml:space="preserve">Role</w:t>
             </w:r>
           </w:p>
         </w:tc>
@@ -32063,7 +32097,7 @@
                 <w:b/>
                 <w:bCs/>
               </w:rPr>
-              <w:t xml:space="preserve">1</w:t>
+              <w:t xml:space="preserve">`notesPerBarRange`</w:t>
             </w:r>
           </w:p>
         </w:tc>
@@ -32076,124 +32110,17 @@
               <w:spacing w:after="60"/>
             </w:pPr>
             <w:r>
-              <w:rPr>
-                <w:b/>
-                <w:bCs/>
-              </w:rPr>
-              <w:t xml:space="preserve">`parsedChart.ts`</w:t>
-            </w:r>
-            <w:r>
-              <w:t xml:space="preserve"> — </w:t>
-            </w:r>
-            <w:r>
-              <w:rPr>
-                <w:b/>
-                <w:bCs/>
-              </w:rPr>
-              <w:t xml:space="preserve">`ParsedChord`</w:t>
-            </w:r>
-            <w:r>
-              <w:t xml:space="preserve">, </w:t>
-            </w:r>
-            <w:r>
-              <w:rPr>
-                <w:b/>
-                <w:bCs/>
-              </w:rPr>
-              <w:t xml:space="preserve">`ParsedSection`</w:t>
-            </w:r>
-            <w:r>
-              <w:t xml:space="preserve">, </w:t>
-            </w:r>
-            <w:r>
-              <w:rPr>
-                <w:b/>
-                <w:bCs/>
-              </w:rPr>
-              <w:t xml:space="preserve">`ParsedChart`</w:t>
-            </w:r>
-            <w:r>
-              <w:t xml:space="preserve"> (`title`, `composer`, `key`, `timeSignature`, `tempo`, `style`, `sections`, `measures`, `repeats`). </w:t>
-            </w:r>
-            <w:r>
-              <w:rPr>
-                <w:b/>
-                <w:bCs/>
-              </w:rPr>
-              <w:t xml:space="preserve">`irealProAdapter.ts`</w:t>
-            </w:r>
-            <w:r>
-              <w:t xml:space="preserve"> — </w:t>
-            </w:r>
-            <w:r>
-              <w:rPr>
-                <w:b/>
-                <w:bCs/>
-              </w:rPr>
-              <w:t xml:space="preserve">`parseIRealProInput(input)`</w:t>
-            </w:r>
-            <w:r>
-              <w:t xml:space="preserve"> uses </w:t>
-            </w:r>
-            <w:r>
-              <w:rPr>
-                <w:b/>
-                <w:bCs/>
-              </w:rPr>
-              <w:t xml:space="preserve">`ireal-reader`</w:t>
-            </w:r>
-            <w:r>
-              <w:t xml:space="preserve"> on </w:t>
-            </w:r>
-            <w:r>
-              <w:rPr>
-                <w:b/>
-                <w:bCs/>
-              </w:rPr>
-              <w:t xml:space="preserve">`ireal://`</w:t>
-            </w:r>
-            <w:r>
-              <w:t xml:space="preserve"> / </w:t>
-            </w:r>
-            <w:r>
-              <w:rPr>
-                <w:b/>
-                <w:bCs/>
-              </w:rPr>
-              <w:t xml:space="preserve">`irealb://`</w:t>
-            </w:r>
-            <w:r>
-              <w:t xml:space="preserve"> URL or </w:t>
-            </w:r>
-            <w:r>
-              <w:rPr>
-                <w:b/>
-                <w:bCs/>
-              </w:rPr>
-              <w:t xml:space="preserve">HTML</w:t>
-            </w:r>
-            <w:r>
-              <w:t xml:space="preserve"> export; </w:t>
-            </w:r>
-            <w:r>
-              <w:rPr>
-                <w:b/>
-                <w:bCs/>
-              </w:rPr>
-              <w:t xml:space="preserve">`ireal://`</w:t>
-            </w:r>
-            <w:r>
-              <w:t xml:space="preserve"> normalised for the library; first playlist song → </w:t>
-            </w:r>
-            <w:r>
-              <w:rPr>
-                <w:b/>
-                <w:bCs/>
-              </w:rPr>
-              <w:t xml:space="preserve">`ParsedChart`</w:t>
-            </w:r>
-            <w:r>
-              <w:t xml:space="preserve">.</w:t>
+              <w:t xml:space="preserve">Allowed </w:t>
+            </w:r>
+            <w:r>
+              <w:rPr>
+                <w:b/>
+                <w:bCs/>
+              </w:rPr>
+              <w:t xml:space="preserve">min/max</w:t>
+            </w:r>
+            <w:r>
+              <w:t xml:space="preserve"> notes per bar for the mode.</w:t>
             </w:r>
           </w:p>
         </w:tc>
@@ -32212,7 +32139,7 @@
                 <w:b/>
                 <w:bCs/>
               </w:rPr>
-              <w:t xml:space="preserve">2</w:t>
+              <w:t xml:space="preserve">`longNoteRatio`</w:t>
             </w:r>
           </w:p>
         </w:tc>
@@ -32225,114 +32152,17 @@
               <w:spacing w:after="60"/>
             </w:pPr>
             <w:r>
-              <w:rPr>
-                <w:b/>
-                <w:bCs/>
-              </w:rPr>
-              <w:t xml:space="preserve">`chordSymbolMapper.ts`</w:t>
-            </w:r>
-            <w:r>
-              <w:t xml:space="preserve"> — </w:t>
-            </w:r>
-            <w:r>
-              <w:rPr>
-                <w:b/>
-                <w:bCs/>
-              </w:rPr>
-              <w:t xml:space="preserve">`mapChordToVaultType(ParsedChord)`</w:t>
-            </w:r>
-            <w:r>
-              <w:t xml:space="preserve"> maps </w:t>
-            </w:r>
-            <w:r>
-              <w:rPr>
-                <w:b/>
-                <w:bCs/>
-              </w:rPr>
-              <w:t xml:space="preserve">`rootNote`</w:t>
-            </w:r>
-            <w:r>
-              <w:t xml:space="preserve"> → </w:t>
-            </w:r>
-            <w:r>
-              <w:rPr>
-                <w:b/>
-                <w:bCs/>
-              </w:rPr>
-              <w:t xml:space="preserve">`rootPc`</w:t>
-            </w:r>
-            <w:r>
-              <w:t xml:space="preserve"> (</w:t>
-            </w:r>
-            <w:r>
-              <w:rPr>
-                <w:b/>
-                <w:bCs/>
-              </w:rPr>
-              <w:t xml:space="preserve">C = 0 … B = 11</w:t>
-            </w:r>
-            <w:r>
-              <w:t xml:space="preserve">) and </w:t>
-            </w:r>
-            <w:r>
-              <w:rPr>
-                <w:b/>
-                <w:bCs/>
-              </w:rPr>
-              <w:t xml:space="preserve">`chordQuality`</w:t>
-            </w:r>
-            <w:r>
-              <w:t xml:space="preserve"> → </w:t>
-            </w:r>
-            <w:r>
-              <w:rPr>
-                <w:b/>
-                <w:bCs/>
-              </w:rPr>
-              <w:t xml:space="preserve">`vaultChordTypeId`</w:t>
-            </w:r>
-            <w:r>
-              <w:t xml:space="preserve"> for all </w:t>
-            </w:r>
-            <w:r>
-              <w:rPr>
-                <w:b/>
-                <w:bCs/>
-              </w:rPr>
-              <w:t xml:space="preserve">16</w:t>
-            </w:r>
-            <w:r>
-              <w:t xml:space="preserve"> </w:t>
-            </w:r>
-            <w:r>
-              <w:rPr>
-                <w:b/>
-                <w:bCs/>
-              </w:rPr>
-              <w:t xml:space="preserve">`TONALITY_VAULT_DATABASE`</w:t>
-            </w:r>
-            <w:r>
-              <w:t xml:space="preserve"> types (synonyms: maj/</w:t>
-            </w:r>
-            <w:r>
-              <w:rPr>
-                <w:b/>
-                <w:bCs/>
-              </w:rPr>
-              <w:t xml:space="preserve">^</w:t>
-            </w:r>
-            <w:r>
-              <w:t xml:space="preserve">/Δ, minor, dom, sus, altered, etc.); unrecognised quality → </w:t>
-            </w:r>
-            <w:r>
-              <w:rPr>
-                <w:b/>
-                <w:bCs/>
-              </w:rPr>
-              <w:t xml:space="preserve">`null`</w:t>
-            </w:r>
-            <w:r>
-              <w:t xml:space="preserve">.</w:t>
+              <w:t xml:space="preserve">Target fraction of </w:t>
+            </w:r>
+            <w:r>
+              <w:rPr>
+                <w:b/>
+                <w:bCs/>
+              </w:rPr>
+              <w:t xml:space="preserve">longer</w:t>
+            </w:r>
+            <w:r>
+              <w:t xml:space="preserve"> durations (half / dotted / tied feel).</w:t>
             </w:r>
           </w:p>
         </w:tc>
@@ -32351,7 +32181,7 @@
                 <w:b/>
                 <w:bCs/>
               </w:rPr>
-              <w:t xml:space="preserve">3</w:t>
+              <w:t xml:space="preserve">`restRatio`</w:t>
             </w:r>
           </w:p>
         </w:tc>
@@ -32364,134 +32194,27 @@
               <w:spacing w:after="60"/>
             </w:pPr>
             <w:r>
-              <w:rPr>
-                <w:b/>
-                <w:bCs/>
-              </w:rPr>
-              <w:t xml:space="preserve">`irealVaultPipeline.ts`</w:t>
-            </w:r>
-            <w:r>
-              <w:t xml:space="preserve"> — </w:t>
-            </w:r>
-            <w:r>
-              <w:rPr>
-                <w:b/>
-                <w:bCs/>
-              </w:rPr>
-              <w:t xml:space="preserve">`generateFromIReal(input, options?)`</w:t>
-            </w:r>
-            <w:r>
-              <w:t xml:space="preserve"> walks </w:t>
-            </w:r>
-            <w:r>
-              <w:rPr>
-                <w:b/>
-                <w:bCs/>
-              </w:rPr>
-              <w:t xml:space="preserve">`ParsedChart.measures`</w:t>
-            </w:r>
-            <w:r>
-              <w:t xml:space="preserve"> (first chord per bar), </w:t>
-            </w:r>
-            <w:r>
-              <w:rPr>
-                <w:b/>
-                <w:bCs/>
-              </w:rPr>
-              <w:t xml:space="preserve">`mapChordToVaultType`</w:t>
-            </w:r>
-            <w:r>
-              <w:t xml:space="preserve">, </w:t>
-            </w:r>
-            <w:r>
-              <w:rPr>
-                <w:b/>
-                <w:bCs/>
-              </w:rPr>
-              <w:t xml:space="preserve">`generateVaultRiff`</w:t>
-            </w:r>
-            <w:r>
-              <w:t xml:space="preserve"> per bar (</w:t>
-            </w:r>
-            <w:r>
-              <w:rPr>
-                <w:b/>
-                <w:bCs/>
-              </w:rPr>
-              <w:t xml:space="preserve">`bars: 1`</w:t>
-            </w:r>
-            <w:r>
-              <w:t xml:space="preserve">), offsets </w:t>
-            </w:r>
-            <w:r>
-              <w:rPr>
-                <w:b/>
-                <w:bCs/>
-              </w:rPr>
-              <w:t xml:space="preserve">`ScoreNote.startBeat`</w:t>
-            </w:r>
-            <w:r>
-              <w:t xml:space="preserve"> by </w:t>
-            </w:r>
-            <w:r>
-              <w:rPr>
-                <w:b/>
-                <w:bCs/>
-              </w:rPr>
-              <w:t xml:space="preserve">`barIndex * 4`</w:t>
-            </w:r>
-            <w:r>
-              <w:t xml:space="preserve"> (4/4 quarters); returns </w:t>
-            </w:r>
-            <w:r>
-              <w:rPr>
-                <w:b/>
-                <w:bCs/>
-              </w:rPr>
-              <w:t xml:space="preserve">`IRealVaultOutput`</w:t>
-            </w:r>
-            <w:r>
-              <w:t xml:space="preserve"> — </w:t>
-            </w:r>
-            <w:r>
-              <w:rPr>
-                <w:b/>
-                <w:bCs/>
-              </w:rPr>
-              <w:t xml:space="preserve">`generatedNotes`</w:t>
-            </w:r>
-            <w:r>
-              <w:t xml:space="preserve">, </w:t>
-            </w:r>
-            <w:r>
-              <w:rPr>
-                <w:b/>
-                <w:bCs/>
-              </w:rPr>
-              <w:t xml:space="preserve">`chordMappings`</w:t>
-            </w:r>
-            <w:r>
-              <w:t xml:space="preserve">, </w:t>
-            </w:r>
-            <w:r>
-              <w:rPr>
-                <w:b/>
-                <w:bCs/>
-              </w:rPr>
-              <w:t xml:space="preserve">`unmappedChords`</w:t>
-            </w:r>
-            <w:r>
-              <w:t xml:space="preserve">. MusicXML export from this pipeline remains a </w:t>
-            </w:r>
-            <w:r>
-              <w:rPr>
-                <w:b/>
-                <w:bCs/>
-              </w:rPr>
-              <w:t xml:space="preserve">follow-up</w:t>
-            </w:r>
-            <w:r>
-              <w:t xml:space="preserve"> wire to the main exporter.</w:t>
+              <w:t xml:space="preserve">Target fraction of </w:t>
+            </w:r>
+            <w:r>
+              <w:rPr>
+                <w:b/>
+                <w:bCs/>
+              </w:rPr>
+              <w:t xml:space="preserve">rest</w:t>
+            </w:r>
+            <w:r>
+              <w:t xml:space="preserve"> or </w:t>
+            </w:r>
+            <w:r>
+              <w:rPr>
+                <w:b/>
+                <w:bCs/>
+              </w:rPr>
+              <w:t xml:space="preserve">breath</w:t>
+            </w:r>
+            <w:r>
+              <w:t xml:space="preserve"> vs sounded notes.</w:t>
             </w:r>
           </w:p>
         </w:tc>
@@ -32510,7 +32233,7 @@
                 <w:b/>
                 <w:bCs/>
               </w:rPr>
-              <w:t xml:space="preserve">4</w:t>
+              <w:t xml:space="preserve">`motifReuseProbability`</w:t>
             </w:r>
           </w:p>
         </w:tc>
@@ -32523,244 +32246,552 @@
               <w:spacing w:after="60"/>
             </w:pPr>
             <w:r>
-              <w:rPr>
-                <w:b/>
-                <w:bCs/>
-              </w:rPr>
-              <w:t xml:space="preserve">iReal Pro Import (Beta)</w:t>
-            </w:r>
-            <w:r>
-              <w:t xml:space="preserve"> in </w:t>
-            </w:r>
-            <w:r>
-              <w:rPr>
-                <w:b/>
-                <w:bCs/>
-              </w:rPr>
-              <w:t xml:space="preserve">`HomeGenerate.tsx`</w:t>
-            </w:r>
-            <w:r>
-              <w:t xml:space="preserve"> — collapsible </w:t>
-            </w:r>
-            <w:r>
-              <w:rPr>
-                <w:b/>
-                <w:bCs/>
-              </w:rPr>
-              <w:t xml:space="preserve">`details`</w:t>
-            </w:r>
-            <w:r>
-              <w:t xml:space="preserve">; </w:t>
-            </w:r>
-            <w:r>
-              <w:rPr>
-                <w:b/>
-                <w:bCs/>
-              </w:rPr>
-              <w:t xml:space="preserve">textarea</w:t>
-            </w:r>
-            <w:r>
-              <w:t xml:space="preserve"> for </w:t>
-            </w:r>
-            <w:r>
-              <w:rPr>
-                <w:b/>
-                <w:bCs/>
-              </w:rPr>
-              <w:t xml:space="preserve">`ireal://`</w:t>
-            </w:r>
-            <w:r>
-              <w:t xml:space="preserve"> / HTML paste; </w:t>
-            </w:r>
-            <w:r>
-              <w:rPr>
-                <w:b/>
-                <w:bCs/>
-              </w:rPr>
-              <w:t xml:space="preserve">riff style</w:t>
-            </w:r>
-            <w:r>
-              <w:t xml:space="preserve"> dropdown (</w:t>
-            </w:r>
-            <w:r>
-              <w:rPr>
-                <w:b/>
-                <w:bCs/>
-              </w:rPr>
-              <w:t xml:space="preserve">bebop-placement</w:t>
-            </w:r>
-            <w:r>
-              <w:t xml:space="preserve">, </w:t>
-            </w:r>
-            <w:r>
-              <w:rPr>
-                <w:b/>
-                <w:bCs/>
-              </w:rPr>
-              <w:t xml:space="preserve">quadratonic</w:t>
-            </w:r>
-            <w:r>
-              <w:t xml:space="preserve">, </w:t>
-            </w:r>
-            <w:r>
-              <w:rPr>
-                <w:b/>
-                <w:bCs/>
-              </w:rPr>
-              <w:t xml:space="preserve">dyad-seesaw</w:t>
-            </w:r>
-            <w:r>
-              <w:t xml:space="preserve">, </w:t>
-            </w:r>
-            <w:r>
-              <w:rPr>
-                <w:b/>
-                <w:bCs/>
-              </w:rPr>
-              <w:t xml:space="preserve">triad-pair-pendulum</w:t>
-            </w:r>
-            <w:r>
-              <w:t xml:space="preserve">, </w:t>
-            </w:r>
-            <w:r>
-              <w:rPr>
-                <w:b/>
-                <w:bCs/>
-              </w:rPr>
-              <w:t xml:space="preserve">pedal-string</w:t>
-            </w:r>
-            <w:r>
-              <w:t xml:space="preserve">); </w:t>
-            </w:r>
-            <w:r>
-              <w:rPr>
-                <w:b/>
-                <w:bCs/>
-              </w:rPr>
-              <w:t xml:space="preserve">tuning</w:t>
-            </w:r>
-            <w:r>
-              <w:t xml:space="preserve"> dropdown (</w:t>
-            </w:r>
-            <w:r>
-              <w:rPr>
-                <w:b/>
-                <w:bCs/>
-              </w:rPr>
-              <w:t xml:space="preserve">standard</w:t>
-            </w:r>
-            <w:r>
-              <w:t xml:space="preserve">, </w:t>
-            </w:r>
-            <w:r>
-              <w:rPr>
-                <w:b/>
-                <w:bCs/>
-              </w:rPr>
-              <w:t xml:space="preserve">dadgad</w:t>
-            </w:r>
-            <w:r>
-              <w:t xml:space="preserve">, </w:t>
-            </w:r>
-            <w:r>
-              <w:rPr>
-                <w:b/>
-                <w:bCs/>
-              </w:rPr>
-              <w:t xml:space="preserve">open_d</w:t>
-            </w:r>
-            <w:r>
-              <w:t xml:space="preserve">, </w:t>
-            </w:r>
-            <w:r>
-              <w:rPr>
-                <w:b/>
-                <w:bCs/>
-              </w:rPr>
-              <w:t xml:space="preserve">open_g</w:t>
-            </w:r>
-            <w:r>
-              <w:t xml:space="preserve">, </w:t>
-            </w:r>
-            <w:r>
-              <w:rPr>
-                <w:b/>
-                <w:bCs/>
-              </w:rPr>
-              <w:t xml:space="preserve">sy_cgdgcd</w:t>
-            </w:r>
-            <w:r>
-              <w:t xml:space="preserve">); </w:t>
-            </w:r>
-            <w:r>
-              <w:rPr>
-                <w:b/>
-                <w:bCs/>
-              </w:rPr>
-              <w:t xml:space="preserve">Generate from iReal</w:t>
-            </w:r>
-            <w:r>
-              <w:t xml:space="preserve"> calls </w:t>
-            </w:r>
-            <w:r>
-              <w:rPr>
-                <w:b/>
-                <w:bCs/>
-              </w:rPr>
-              <w:t xml:space="preserve">`generateFromIReal`</w:t>
-            </w:r>
-            <w:r>
-              <w:t xml:space="preserve">; results show </w:t>
-            </w:r>
-            <w:r>
-              <w:rPr>
-                <w:b/>
-                <w:bCs/>
-              </w:rPr>
-              <w:t xml:space="preserve">title</w:t>
-            </w:r>
-            <w:r>
-              <w:t xml:space="preserve">, </w:t>
-            </w:r>
-            <w:r>
-              <w:rPr>
-                <w:b/>
-                <w:bCs/>
-              </w:rPr>
-              <w:t xml:space="preserve">key</w:t>
-            </w:r>
-            <w:r>
-              <w:t xml:space="preserve">, </w:t>
-            </w:r>
-            <w:r>
-              <w:rPr>
-                <w:b/>
-                <w:bCs/>
-              </w:rPr>
-              <w:t xml:space="preserve">bars</w:t>
-            </w:r>
-            <w:r>
-              <w:t xml:space="preserve">, </w:t>
-            </w:r>
-            <w:r>
-              <w:rPr>
-                <w:b/>
-                <w:bCs/>
-              </w:rPr>
-              <w:t xml:space="preserve">mapped vs unmapped</w:t>
-            </w:r>
-            <w:r>
-              <w:t xml:space="preserve"> counts; </w:t>
-            </w:r>
-            <w:r>
-              <w:rPr>
-                <w:b/>
-                <w:bCs/>
-              </w:rPr>
-              <w:t xml:space="preserve">amber</w:t>
-            </w:r>
-            <w:r>
-              <w:t xml:space="preserve"> list for unmapped chords.</w:t>
+              <w:t xml:space="preserve">Chance to </w:t>
+            </w:r>
+            <w:r>
+              <w:rPr>
+                <w:b/>
+                <w:bCs/>
+              </w:rPr>
+              <w:t xml:space="preserve">reuse</w:t>
+            </w:r>
+            <w:r>
+              <w:t xml:space="preserve"> or </w:t>
+            </w:r>
+            <w:r>
+              <w:rPr>
+                <w:b/>
+                <w:bCs/>
+              </w:rPr>
+              <w:t xml:space="preserve">call back</w:t>
+            </w:r>
+            <w:r>
+              <w:t xml:space="preserve"> material vs fresh cells.</w:t>
+            </w:r>
+          </w:p>
+        </w:tc>
+      </w:tr>
+      <w:tr>
+        <w:tc>
+          <w:tcPr>
+            <w:tcW w:type="pct" w:w="4500%"/>
+          </w:tcPr>
+          <w:p>
+            <w:pPr>
+              <w:spacing w:after="60"/>
+            </w:pPr>
+            <w:r>
+              <w:rPr>
+                <w:b/>
+                <w:bCs/>
+              </w:rPr>
+              <w:t xml:space="preserve">`exactMotifRepeatProbability`</w:t>
+            </w:r>
+          </w:p>
+        </w:tc>
+        <w:tc>
+          <w:tcPr>
+            <w:tcW w:type="pct" w:w="4500%"/>
+          </w:tcPr>
+          <w:p>
+            <w:pPr>
+              <w:spacing w:after="60"/>
+            </w:pPr>
+            <w:r>
+              <w:t xml:space="preserve">Chance of </w:t>
+            </w:r>
+            <w:r>
+              <w:rPr>
+                <w:b/>
+                <w:bCs/>
+              </w:rPr>
+              <w:t xml:space="preserve">literal</w:t>
+            </w:r>
+            <w:r>
+              <w:t xml:space="preserve"> repeat vs varied sequence.</w:t>
+            </w:r>
+          </w:p>
+        </w:tc>
+      </w:tr>
+      <w:tr>
+        <w:tc>
+          <w:tcPr>
+            <w:tcW w:type="pct" w:w="4500%"/>
+          </w:tcPr>
+          <w:p>
+            <w:pPr>
+              <w:spacing w:after="60"/>
+            </w:pPr>
+            <w:r>
+              <w:rPr>
+                <w:b/>
+                <w:bCs/>
+              </w:rPr>
+              <w:t xml:space="preserve">`contourPlanningStrength`</w:t>
+            </w:r>
+          </w:p>
+        </w:tc>
+        <w:tc>
+          <w:tcPr>
+            <w:tcW w:type="pct" w:w="4500%"/>
+          </w:tcPr>
+          <w:p>
+            <w:pPr>
+              <w:spacing w:after="60"/>
+            </w:pPr>
+            <w:r>
+              <w:t xml:space="preserve">How strongly phrase </w:t>
+            </w:r>
+            <w:r>
+              <w:rPr>
+                <w:b/>
+                <w:bCs/>
+              </w:rPr>
+              <w:t xml:space="preserve">shape</w:t>
+            </w:r>
+            <w:r>
+              <w:t xml:space="preserve"> (ascend / descend / apex) constrains pitches.</w:t>
+            </w:r>
+          </w:p>
+        </w:tc>
+      </w:tr>
+      <w:tr>
+        <w:tc>
+          <w:tcPr>
+            <w:tcW w:type="pct" w:w="4500%"/>
+          </w:tcPr>
+          <w:p>
+            <w:pPr>
+              <w:spacing w:after="60"/>
+            </w:pPr>
+            <w:r>
+              <w:rPr>
+                <w:b/>
+                <w:bCs/>
+              </w:rPr>
+              <w:t xml:space="preserve">`harmonyProofPerBar`</w:t>
+            </w:r>
+          </w:p>
+        </w:tc>
+        <w:tc>
+          <w:tcPr>
+            <w:tcW w:type="pct" w:w="4500%"/>
+          </w:tcPr>
+          <w:p>
+            <w:pPr>
+              <w:spacing w:after="60"/>
+            </w:pPr>
+            <w:r>
+              <w:t xml:space="preserve">Whether </w:t>
+            </w:r>
+            <w:r>
+              <w:rPr>
+                <w:b/>
+                <w:bCs/>
+              </w:rPr>
+              <w:t xml:space="preserve">harmonic proof</w:t>
+            </w:r>
+            <w:r>
+              <w:t xml:space="preserve"> (chord-tone / vault legality check) runs </w:t>
+            </w:r>
+            <w:r>
+              <w:rPr>
+                <w:b/>
+                <w:bCs/>
+              </w:rPr>
+              <w:t xml:space="preserve">every bar</w:t>
+            </w:r>
+            <w:r>
+              <w:t xml:space="preserve">.</w:t>
+            </w:r>
+          </w:p>
+        </w:tc>
+      </w:tr>
+      <w:tr>
+        <w:tc>
+          <w:tcPr>
+            <w:tcW w:type="pct" w:w="4500%"/>
+          </w:tcPr>
+          <w:p>
+            <w:pPr>
+              <w:spacing w:after="60"/>
+            </w:pPr>
+            <w:r>
+              <w:rPr>
+                <w:b/>
+                <w:bCs/>
+              </w:rPr>
+              <w:t xml:space="preserve">`harmonyProofPerPhrase`</w:t>
+            </w:r>
+          </w:p>
+        </w:tc>
+        <w:tc>
+          <w:tcPr>
+            <w:tcW w:type="pct" w:w="4500%"/>
+          </w:tcPr>
+          <w:p>
+            <w:pPr>
+              <w:spacing w:after="60"/>
+            </w:pPr>
+            <w:r>
+              <w:t xml:space="preserve">Whether proof applies at </w:t>
+            </w:r>
+            <w:r>
+              <w:rPr>
+                <w:b/>
+                <w:bCs/>
+              </w:rPr>
+              <w:t xml:space="preserve">phrase</w:t>
+            </w:r>
+            <w:r>
+              <w:t xml:space="preserve"> anchors instead of or in addition to per-bar.</w:t>
+            </w:r>
+          </w:p>
+        </w:tc>
+      </w:tr>
+      <w:tr>
+        <w:tc>
+          <w:tcPr>
+            <w:tcW w:type="pct" w:w="4500%"/>
+          </w:tcPr>
+          <w:p>
+            <w:pPr>
+              <w:spacing w:after="60"/>
+            </w:pPr>
+            <w:r>
+              <w:rPr>
+                <w:b/>
+                <w:bCs/>
+              </w:rPr>
+              <w:t xml:space="preserve">`maxPhraseSpanSemitones`</w:t>
+            </w:r>
+          </w:p>
+        </w:tc>
+        <w:tc>
+          <w:tcPr>
+            <w:tcW w:type="pct" w:w="4500%"/>
+          </w:tcPr>
+          <w:p>
+            <w:pPr>
+              <w:spacing w:after="60"/>
+            </w:pPr>
+            <w:r>
+              <w:rPr>
+                <w:b/>
+                <w:bCs/>
+              </w:rPr>
+              <w:t xml:space="preserve">Register span</w:t>
+            </w:r>
+            <w:r>
+              <w:t xml:space="preserve"> cap within a phrase window.</w:t>
+            </w:r>
+          </w:p>
+        </w:tc>
+      </w:tr>
+      <w:tr>
+        <w:tc>
+          <w:tcPr>
+            <w:tcW w:type="pct" w:w="4500%"/>
+          </w:tcPr>
+          <w:p>
+            <w:pPr>
+              <w:spacing w:after="60"/>
+            </w:pPr>
+            <w:r>
+              <w:rPr>
+                <w:b/>
+                <w:bCs/>
+              </w:rPr>
+              <w:t xml:space="preserve">`stepwiseMotionRatio`</w:t>
+            </w:r>
+          </w:p>
+        </w:tc>
+        <w:tc>
+          <w:tcPr>
+            <w:tcW w:type="pct" w:w="4500%"/>
+          </w:tcPr>
+          <w:p>
+            <w:pPr>
+              <w:spacing w:after="60"/>
+            </w:pPr>
+            <w:r>
+              <w:t xml:space="preserve">Target </w:t>
+            </w:r>
+            <w:r>
+              <w:rPr>
+                <w:b/>
+                <w:bCs/>
+              </w:rPr>
+              <w:t xml:space="preserve">step</w:t>
+            </w:r>
+            <w:r>
+              <w:t xml:space="preserve"> vs </w:t>
+            </w:r>
+            <w:r>
+              <w:rPr>
+                <w:b/>
+                <w:bCs/>
+              </w:rPr>
+              <w:t xml:space="preserve">leap</w:t>
+            </w:r>
+            <w:r>
+              <w:t xml:space="preserve"> balance.</w:t>
+            </w:r>
+          </w:p>
+        </w:tc>
+      </w:tr>
+      <w:tr>
+        <w:tc>
+          <w:tcPr>
+            <w:tcW w:type="pct" w:w="4500%"/>
+          </w:tcPr>
+          <w:p>
+            <w:pPr>
+              <w:spacing w:after="60"/>
+            </w:pPr>
+            <w:r>
+              <w:rPr>
+                <w:b/>
+                <w:bCs/>
+              </w:rPr>
+              <w:t xml:space="preserve">`leapProbability`</w:t>
+            </w:r>
+          </w:p>
+        </w:tc>
+        <w:tc>
+          <w:tcPr>
+            <w:tcW w:type="pct" w:w="4500%"/>
+          </w:tcPr>
+          <w:p>
+            <w:pPr>
+              <w:spacing w:after="60"/>
+            </w:pPr>
+            <w:r>
+              <w:t xml:space="preserve">Probability of </w:t>
+            </w:r>
+            <w:r>
+              <w:rPr>
+                <w:b/>
+                <w:bCs/>
+              </w:rPr>
+              <w:t xml:space="preserve">allowed leaps</w:t>
+            </w:r>
+            <w:r>
+              <w:t xml:space="preserve"> (bounded by vault / voice-leading elsewhere).</w:t>
+            </w:r>
+          </w:p>
+        </w:tc>
+      </w:tr>
+      <w:tr>
+        <w:tc>
+          <w:tcPr>
+            <w:tcW w:type="pct" w:w="4500%"/>
+          </w:tcPr>
+          <w:p>
+            <w:pPr>
+              <w:spacing w:after="60"/>
+            </w:pPr>
+            <w:r>
+              <w:rPr>
+                <w:b/>
+                <w:bCs/>
+              </w:rPr>
+              <w:t xml:space="preserve">`maxTensionLayerDefault`</w:t>
+            </w:r>
+          </w:p>
+        </w:tc>
+        <w:tc>
+          <w:tcPr>
+            <w:tcW w:type="pct" w:w="4500%"/>
+          </w:tcPr>
+          <w:p>
+            <w:pPr>
+              <w:spacing w:after="60"/>
+            </w:pPr>
+            <w:r>
+              <w:t xml:space="preserve">Default </w:t>
+            </w:r>
+            <w:r>
+              <w:rPr>
+                <w:b/>
+                <w:bCs/>
+              </w:rPr>
+              <w:t xml:space="preserve">tension layer</w:t>
+            </w:r>
+            <w:r>
+              <w:t xml:space="preserve"> ceiling unless phrase overrides.</w:t>
+            </w:r>
+          </w:p>
+        </w:tc>
+      </w:tr>
+      <w:tr>
+        <w:tc>
+          <w:tcPr>
+            <w:tcW w:type="pct" w:w="4500%"/>
+          </w:tcPr>
+          <w:p>
+            <w:pPr>
+              <w:spacing w:after="60"/>
+            </w:pPr>
+            <w:r>
+              <w:rPr>
+                <w:b/>
+                <w:bCs/>
+              </w:rPr>
+              <w:t xml:space="preserve">`postCadenceRestProbability`</w:t>
+            </w:r>
+          </w:p>
+        </w:tc>
+        <w:tc>
+          <w:tcPr>
+            <w:tcW w:type="pct" w:w="4500%"/>
+          </w:tcPr>
+          <w:p>
+            <w:pPr>
+              <w:spacing w:after="60"/>
+            </w:pPr>
+            <w:r>
+              <w:rPr>
+                <w:b/>
+                <w:bCs/>
+              </w:rPr>
+              <w:t xml:space="preserve">Space after cadences</w:t>
+            </w:r>
+            <w:r>
+              <w:t xml:space="preserve"> — rest/breath after resolution.</w:t>
+            </w:r>
+          </w:p>
+        </w:tc>
+      </w:tr>
+      <w:tr>
+        <w:tc>
+          <w:tcPr>
+            <w:tcW w:type="pct" w:w="4500%"/>
+          </w:tcPr>
+          <w:p>
+            <w:pPr>
+              <w:spacing w:after="60"/>
+            </w:pPr>
+            <w:r>
+              <w:rPr>
+                <w:b/>
+                <w:bCs/>
+              </w:rPr>
+              <w:t xml:space="preserve">`barCrossingContinuationProbability`</w:t>
+            </w:r>
+          </w:p>
+        </w:tc>
+        <w:tc>
+          <w:tcPr>
+            <w:tcW w:type="pct" w:w="4500%"/>
+          </w:tcPr>
+          <w:p>
+            <w:pPr>
+              <w:spacing w:after="60"/>
+            </w:pPr>
+            <w:r>
+              <w:rPr>
+                <w:b/>
+                <w:bCs/>
+              </w:rPr>
+              <w:t xml:space="preserve">Carry</w:t>
+            </w:r>
+            <w:r>
+              <w:t xml:space="preserve"> melodic figure across barline vs respell on downbeat.</w:t>
+            </w:r>
+          </w:p>
+        </w:tc>
+      </w:tr>
+      <w:tr>
+        <w:tc>
+          <w:tcPr>
+            <w:tcW w:type="pct" w:w="4500%"/>
+          </w:tcPr>
+          <w:p>
+            <w:pPr>
+              <w:spacing w:after="60"/>
+            </w:pPr>
+            <w:r>
+              <w:rPr>
+                <w:b/>
+                <w:bCs/>
+              </w:rPr>
+              <w:t xml:space="preserve">`rhythmicCellReuseProbability`</w:t>
+            </w:r>
+          </w:p>
+        </w:tc>
+        <w:tc>
+          <w:tcPr>
+            <w:tcW w:type="pct" w:w="4500%"/>
+          </w:tcPr>
+          <w:p>
+            <w:pPr>
+              <w:spacing w:after="60"/>
+            </w:pPr>
+            <w:r>
+              <w:t xml:space="preserve">Reuse </w:t>
+            </w:r>
+            <w:r>
+              <w:rPr>
+                <w:b/>
+                <w:bCs/>
+              </w:rPr>
+              <w:t xml:space="preserve">rhythmic cell family</w:t>
+            </w:r>
+            <w:r>
+              <w:t xml:space="preserve"> vs new subdivision pattern.</w:t>
+            </w:r>
+          </w:p>
+        </w:tc>
+      </w:tr>
+      <w:tr>
+        <w:tc>
+          <w:tcPr>
+            <w:tcW w:type="pct" w:w="4500%"/>
+          </w:tcPr>
+          <w:p>
+            <w:pPr>
+              <w:spacing w:after="60"/>
+            </w:pPr>
+            <w:r>
+              <w:rPr>
+                <w:b/>
+                <w:bCs/>
+              </w:rPr>
+              <w:t xml:space="preserve">`melodicOverrideVsLocalHarmony`</w:t>
+            </w:r>
+          </w:p>
+        </w:tc>
+        <w:tc>
+          <w:tcPr>
+            <w:tcW w:type="pct" w:w="4500%"/>
+          </w:tcPr>
+          <w:p>
+            <w:pPr>
+              <w:spacing w:after="60"/>
+            </w:pPr>
+            <w:r>
+              <w:t xml:space="preserve">How much </w:t>
+            </w:r>
+            <w:r>
+              <w:rPr>
+                <w:b/>
+                <w:bCs/>
+              </w:rPr>
+              <w:t xml:space="preserve">contour/motif</w:t>
+            </w:r>
+            <w:r>
+              <w:t xml:space="preserve"> may override </w:t>
+            </w:r>
+            <w:r>
+              <w:rPr>
+                <w:b/>
+                <w:bCs/>
+              </w:rPr>
+              <w:t xml:space="preserve">local</w:t>
+            </w:r>
+            <w:r>
+              <w:t xml:space="preserve"> grip harmony hints.</w:t>
             </w:r>
           </w:p>
         </w:tc>
@@ -32780,7 +32811,33 @@
           <w:b/>
           <w:bCs/>
         </w:rPr>
-        <w:t xml:space="preserve">Cross-check library (not bundled):</w:t>
+        <w:t xml:space="preserve">Presets (planned):</w:t>
+      </w:r>
+    </w:p>
+    <w:p>
+      <w:pPr>
+        <w:spacing w:after="80"/>
+        <w:ind w:left="360" w:hanging="260"/>
+      </w:pPr>
+      <w:r>
+        <w:t xml:space="preserve">• </w:t>
+      </w:r>
+      <w:r>
+        <w:rPr>
+          <w:b/>
+          <w:bCs/>
+        </w:rPr>
+        <w:t xml:space="preserve">`SOLO_PROFILE`</w:t>
+      </w:r>
+      <w:r>
+        <w:t xml:space="preserve"> — </w:t>
+      </w:r>
+      <w:r>
+        <w:rPr>
+          <w:b/>
+          <w:bCs/>
+        </w:rPr>
+        <w:t xml:space="preserve">`notesPerBarRange`</w:t>
       </w:r>
       <w:r>
         <w:t xml:space="preserve"> </w:t>
@@ -32790,10 +32847,529 @@
           <w:b/>
           <w:bCs/>
         </w:rPr>
-        <w:t xml:space="preserve">[daumling/ireal-renderer](https://github.com/daumling/ireal-renderer)</w:t>
-      </w:r>
-      <w:r>
-        <w:t xml:space="preserve"> — optional future cross-check for section markers / form structure.</w:t>
+        <w:t xml:space="preserve">5–10</w:t>
+      </w:r>
+      <w:r>
+        <w:t xml:space="preserve">; </w:t>
+      </w:r>
+      <w:r>
+        <w:rPr>
+          <w:b/>
+          <w:bCs/>
+        </w:rPr>
+        <w:t xml:space="preserve">dense</w:t>
+      </w:r>
+      <w:r>
+        <w:t xml:space="preserve"> activity; </w:t>
+      </w:r>
+      <w:r>
+        <w:rPr>
+          <w:b/>
+          <w:bCs/>
+        </w:rPr>
+        <w:t xml:space="preserve">bebop</w:t>
+      </w:r>
+      <w:r>
+        <w:t xml:space="preserve">-leaning placement; </w:t>
+      </w:r>
+      <w:r>
+        <w:rPr>
+          <w:b/>
+          <w:bCs/>
+        </w:rPr>
+        <w:t xml:space="preserve">bar-reactive</w:t>
+      </w:r>
+      <w:r>
+        <w:t xml:space="preserve"> (harmony proof and density respond </w:t>
+      </w:r>
+      <w:r>
+        <w:rPr>
+          <w:b/>
+          <w:bCs/>
+        </w:rPr>
+        <w:t xml:space="preserve">per bar</w:t>
+      </w:r>
+      <w:r>
+        <w:t xml:space="preserve">).</w:t>
+      </w:r>
+    </w:p>
+    <w:p>
+      <w:pPr>
+        <w:spacing w:after="80"/>
+        <w:ind w:left="360" w:hanging="260"/>
+      </w:pPr>
+      <w:r>
+        <w:t xml:space="preserve">• </w:t>
+      </w:r>
+      <w:r>
+        <w:rPr>
+          <w:b/>
+          <w:bCs/>
+        </w:rPr>
+        <w:t xml:space="preserve">`MELODY_PROFILE`</w:t>
+      </w:r>
+      <w:r>
+        <w:t xml:space="preserve"> — </w:t>
+      </w:r>
+      <w:r>
+        <w:rPr>
+          <w:b/>
+          <w:bCs/>
+        </w:rPr>
+        <w:t xml:space="preserve">`notesPerBarRange`</w:t>
+      </w:r>
+      <w:r>
+        <w:t xml:space="preserve"> </w:t>
+      </w:r>
+      <w:r>
+        <w:rPr>
+          <w:b/>
+          <w:bCs/>
+        </w:rPr>
+        <w:t xml:space="preserve">2–6</w:t>
+      </w:r>
+      <w:r>
+        <w:t xml:space="preserve">; </w:t>
+      </w:r>
+      <w:r>
+        <w:rPr>
+          <w:b/>
+          <w:bCs/>
+        </w:rPr>
+        <w:t xml:space="preserve">sparse</w:t>
+      </w:r>
+      <w:r>
+        <w:t xml:space="preserve">; </w:t>
+      </w:r>
+      <w:r>
+        <w:rPr>
+          <w:b/>
+          <w:bCs/>
+        </w:rPr>
+        <w:t xml:space="preserve">motif-driven</w:t>
+      </w:r>
+      <w:r>
+        <w:t xml:space="preserve">; </w:t>
+      </w:r>
+      <w:r>
+        <w:rPr>
+          <w:b/>
+          <w:bCs/>
+        </w:rPr>
+        <w:t xml:space="preserve">phrase-reactive</w:t>
+      </w:r>
+      <w:r>
+        <w:t xml:space="preserve"> (phrase planner leads; fewer notes per bar).</w:t>
+      </w:r>
+    </w:p>
+    <w:p>
+      <w:pPr>
+        <w:spacing w:after="160"/>
+      </w:pPr>
+      <w:r>
+        <w:rPr>
+          <w:b/>
+          <w:bCs/>
+        </w:rPr>
+        <w:t xml:space="preserve">`MelodyModePlanner`</w:t>
+      </w:r>
+      <w:r>
+        <w:t xml:space="preserve"> (planned) </w:t>
+      </w:r>
+      <w:r>
+        <w:rPr>
+          <w:b/>
+          <w:bCs/>
+        </w:rPr>
+        <w:t xml:space="preserve">wraps</w:t>
+      </w:r>
+      <w:r>
+        <w:t xml:space="preserve"> the existing </w:t>
+      </w:r>
+      <w:r>
+        <w:rPr>
+          <w:b/>
+          <w:bCs/>
+        </w:rPr>
+        <w:t xml:space="preserve">quadratonic</w:t>
+      </w:r>
+      <w:r>
+        <w:t xml:space="preserve"> / Vault melody path — it </w:t>
+      </w:r>
+      <w:r>
+        <w:rPr>
+          <w:b/>
+          <w:bCs/>
+        </w:rPr>
+        <w:t xml:space="preserve">does not replace</w:t>
+      </w:r>
+      <w:r>
+        <w:t xml:space="preserve"> the quadratonic engine. It sits </w:t>
+      </w:r>
+      <w:r>
+        <w:rPr>
+          <w:b/>
+          <w:bCs/>
+        </w:rPr>
+        <w:t xml:space="preserve">above</w:t>
+      </w:r>
+      <w:r>
+        <w:t xml:space="preserve"> fill: selects phrase-level </w:t>
+      </w:r>
+      <w:r>
+        <w:rPr>
+          <w:b/>
+          <w:bCs/>
+        </w:rPr>
+        <w:t xml:space="preserve">contour</w:t>
+      </w:r>
+      <w:r>
+        <w:t xml:space="preserve">, </w:t>
+      </w:r>
+      <w:r>
+        <w:rPr>
+          <w:b/>
+          <w:bCs/>
+        </w:rPr>
+        <w:t xml:space="preserve">rhythmic cell family</w:t>
+      </w:r>
+      <w:r>
+        <w:t xml:space="preserve">, </w:t>
+      </w:r>
+      <w:r>
+        <w:rPr>
+          <w:b/>
+          <w:bCs/>
+        </w:rPr>
+        <w:t xml:space="preserve">motif</w:t>
+      </w:r>
+      <w:r>
+        <w:t xml:space="preserve">, </w:t>
+      </w:r>
+      <w:r>
+        <w:rPr>
+          <w:b/>
+          <w:bCs/>
+        </w:rPr>
+        <w:t xml:space="preserve">cadence target</w:t>
+      </w:r>
+      <w:r>
+        <w:t xml:space="preserve">, and </w:t>
+      </w:r>
+      <w:r>
+        <w:rPr>
+          <w:b/>
+          <w:bCs/>
+        </w:rPr>
+        <w:t xml:space="preserve">max tension layer</w:t>
+      </w:r>
+      <w:r>
+        <w:t xml:space="preserve"> </w:t>
+      </w:r>
+      <w:r>
+        <w:rPr>
+          <w:b/>
+          <w:bCs/>
+        </w:rPr>
+        <w:t xml:space="preserve">before</w:t>
+      </w:r>
+      <w:r>
+        <w:t xml:space="preserve"> bar-level note placement.</w:t>
+      </w:r>
+    </w:p>
+    <w:p>
+      <w:pPr>
+        <w:spacing w:after="160"/>
+      </w:pPr>
+      <w:r>
+        <w:rPr>
+          <w:b/>
+          <w:bCs/>
+        </w:rPr>
+        <w:t xml:space="preserve">Phrase planner responsibilities (planned):</w:t>
+      </w:r>
+      <w:r>
+        <w:t xml:space="preserve"> choose </w:t>
+      </w:r>
+      <w:r>
+        <w:rPr>
+          <w:b/>
+          <w:bCs/>
+        </w:rPr>
+        <w:t xml:space="preserve">contour</w:t>
+      </w:r>
+      <w:r>
+        <w:t xml:space="preserve">, </w:t>
+      </w:r>
+      <w:r>
+        <w:rPr>
+          <w:b/>
+          <w:bCs/>
+        </w:rPr>
+        <w:t xml:space="preserve">rhythmic cell family</w:t>
+      </w:r>
+      <w:r>
+        <w:t xml:space="preserve">, </w:t>
+      </w:r>
+      <w:r>
+        <w:rPr>
+          <w:b/>
+          <w:bCs/>
+        </w:rPr>
+        <w:t xml:space="preserve">motif</w:t>
+      </w:r>
+      <w:r>
+        <w:t xml:space="preserve">, </w:t>
+      </w:r>
+      <w:r>
+        <w:rPr>
+          <w:b/>
+          <w:bCs/>
+        </w:rPr>
+        <w:t xml:space="preserve">cadence target</w:t>
+      </w:r>
+      <w:r>
+        <w:t xml:space="preserve">, </w:t>
+      </w:r>
+      <w:r>
+        <w:rPr>
+          <w:b/>
+          <w:bCs/>
+        </w:rPr>
+        <w:t xml:space="preserve">`maxTensionLayer`</w:t>
+      </w:r>
+      <w:r>
+        <w:t xml:space="preserve"> </w:t>
+      </w:r>
+      <w:r>
+        <w:rPr>
+          <w:b/>
+          <w:bCs/>
+        </w:rPr>
+        <w:t xml:space="preserve">before</w:t>
+      </w:r>
+      <w:r>
+        <w:t xml:space="preserve"> filling individual notes.</w:t>
+      </w:r>
+    </w:p>
+    <w:p>
+      <w:pPr>
+        <w:spacing w:after="160"/>
+      </w:pPr>
+      <w:r>
+        <w:rPr>
+          <w:b/>
+          <w:bCs/>
+        </w:rPr>
+        <w:t xml:space="preserve">Fastest wins (five):</w:t>
+      </w:r>
+    </w:p>
+    <w:p>
+      <w:pPr>
+        <w:spacing w:after="160"/>
+      </w:pPr>
+      <w:r>
+        <w:t xml:space="preserve">1. </w:t>
+      </w:r>
+      <w:r>
+        <w:rPr>
+          <w:b/>
+          <w:bCs/>
+        </w:rPr>
+        <w:t xml:space="preserve">Reduce</w:t>
+      </w:r>
+      <w:r>
+        <w:t xml:space="preserve"> melody </w:t>
+      </w:r>
+      <w:r>
+        <w:rPr>
+          <w:b/>
+          <w:bCs/>
+        </w:rPr>
+        <w:t xml:space="preserve">notes per bar</w:t>
+      </w:r>
+      <w:r>
+        <w:t xml:space="preserve"> in melody mode (enforce </w:t>
+      </w:r>
+      <w:r>
+        <w:rPr>
+          <w:b/>
+          <w:bCs/>
+        </w:rPr>
+        <w:t xml:space="preserve">`notesPerBarRange`</w:t>
+      </w:r>
+      <w:r>
+        <w:t xml:space="preserve"> / breath). 2. </w:t>
+      </w:r>
+      <w:r>
+        <w:rPr>
+          <w:b/>
+          <w:bCs/>
+        </w:rPr>
+        <w:t xml:space="preserve">Add</w:t>
+      </w:r>
+      <w:r>
+        <w:t xml:space="preserve"> phrase </w:t>
+      </w:r>
+      <w:r>
+        <w:rPr>
+          <w:b/>
+          <w:bCs/>
+        </w:rPr>
+        <w:t xml:space="preserve">contours</w:t>
+      </w:r>
+      <w:r>
+        <w:t xml:space="preserve"> and </w:t>
+      </w:r>
+      <w:r>
+        <w:rPr>
+          <w:b/>
+          <w:bCs/>
+        </w:rPr>
+        <w:t xml:space="preserve">apex</w:t>
+      </w:r>
+      <w:r>
+        <w:t xml:space="preserve"> targets so lines arc instead of filling evenly. 3. </w:t>
+      </w:r>
+      <w:r>
+        <w:rPr>
+          <w:b/>
+          <w:bCs/>
+        </w:rPr>
+        <w:t xml:space="preserve">Add</w:t>
+      </w:r>
+      <w:r>
+        <w:t xml:space="preserve"> </w:t>
+      </w:r>
+      <w:r>
+        <w:rPr>
+          <w:b/>
+          <w:bCs/>
+        </w:rPr>
+        <w:t xml:space="preserve">motif reuse</w:t>
+      </w:r>
+      <w:r>
+        <w:t xml:space="preserve"> across </w:t>
+      </w:r>
+      <w:r>
+        <w:rPr>
+          <w:b/>
+          <w:bCs/>
+        </w:rPr>
+        <w:t xml:space="preserve">2–4</w:t>
+      </w:r>
+      <w:r>
+        <w:t xml:space="preserve"> bars (development windows). 4. </w:t>
+      </w:r>
+      <w:r>
+        <w:rPr>
+          <w:b/>
+          <w:bCs/>
+        </w:rPr>
+        <w:t xml:space="preserve">Require</w:t>
+      </w:r>
+      <w:r>
+        <w:t xml:space="preserve"> </w:t>
+      </w:r>
+      <w:r>
+        <w:rPr>
+          <w:b/>
+          <w:bCs/>
+        </w:rPr>
+        <w:t xml:space="preserve">rests</w:t>
+      </w:r>
+      <w:r>
+        <w:t xml:space="preserve"> and </w:t>
+      </w:r>
+      <w:r>
+        <w:rPr>
+          <w:b/>
+          <w:bCs/>
+        </w:rPr>
+        <w:t xml:space="preserve">post-cadence</w:t>
+      </w:r>
+      <w:r>
+        <w:t xml:space="preserve"> space (</w:t>
+      </w:r>
+      <w:r>
+        <w:rPr>
+          <w:b/>
+          <w:bCs/>
+        </w:rPr>
+        <w:t xml:space="preserve">`restRatio`</w:t>
+      </w:r>
+      <w:r>
+        <w:t xml:space="preserve">, </w:t>
+      </w:r>
+      <w:r>
+        <w:rPr>
+          <w:b/>
+          <w:bCs/>
+        </w:rPr>
+        <w:t xml:space="preserve">`postCadenceRestProbability`</w:t>
+      </w:r>
+      <w:r>
+        <w:t xml:space="preserve">). 5. </w:t>
+      </w:r>
+      <w:r>
+        <w:rPr>
+          <w:b/>
+          <w:bCs/>
+        </w:rPr>
+        <w:t xml:space="preserve">Shift</w:t>
+      </w:r>
+      <w:r>
+        <w:t xml:space="preserve"> harmonic </w:t>
+      </w:r>
+      <w:r>
+        <w:rPr>
+          <w:b/>
+          <w:bCs/>
+        </w:rPr>
+        <w:t xml:space="preserve">proof</w:t>
+      </w:r>
+      <w:r>
+        <w:t xml:space="preserve"> from </w:t>
+      </w:r>
+      <w:r>
+        <w:rPr>
+          <w:b/>
+          <w:bCs/>
+        </w:rPr>
+        <w:t xml:space="preserve">every bar</w:t>
+      </w:r>
+      <w:r>
+        <w:t xml:space="preserve"> to </w:t>
+      </w:r>
+      <w:r>
+        <w:rPr>
+          <w:b/>
+          <w:bCs/>
+        </w:rPr>
+        <w:t xml:space="preserve">phrase start / climax / cadence</w:t>
+      </w:r>
+      <w:r>
+        <w:t xml:space="preserve"> only (</w:t>
+      </w:r>
+      <w:r>
+        <w:rPr>
+          <w:b/>
+          <w:bCs/>
+        </w:rPr>
+        <w:t xml:space="preserve">`harmonyProofPerBar`</w:t>
+      </w:r>
+      <w:r>
+        <w:t xml:space="preserve"> vs </w:t>
+      </w:r>
+      <w:r>
+        <w:rPr>
+          <w:b/>
+          <w:bCs/>
+        </w:rPr>
+        <w:t xml:space="preserve">`harmonyProofPerPhrase`</w:t>
+      </w:r>
+      <w:r>
+        <w:t xml:space="preserve">).</w:t>
       </w:r>
     </w:p>
     <w:p>
@@ -32802,6 +33378,901 @@
         <w:spacing w:after="100" w:before="160"/>
       </w:pPr>
       <w:r>
+        <w:t xml:space="preserve">Build IMG — iReal Pro import (**complete**)</w:t>
+      </w:r>
+    </w:p>
+    <w:p>
+      <w:pPr>
+        <w:spacing w:after="160"/>
+      </w:pPr>
+      <w:r>
+        <w:rPr>
+          <w:b/>
+          <w:bCs/>
+        </w:rPr>
+        <w:t xml:space="preserve">Shipped</w:t>
+      </w:r>
+      <w:r>
+        <w:t xml:space="preserve"> in `engines/composer-os-v2/core/irealpro/` (barrel </w:t>
+      </w:r>
+      <w:r>
+        <w:rPr>
+          <w:b/>
+          <w:bCs/>
+        </w:rPr>
+        <w:t xml:space="preserve">`irealpro/index.ts`</w:t>
+      </w:r>
+      <w:r>
+        <w:t xml:space="preserve">) and </w:t>
+      </w:r>
+      <w:r>
+        <w:rPr>
+          <w:b/>
+          <w:bCs/>
+        </w:rPr>
+        <w:t xml:space="preserve">`apps/composer-os-app/src/pages/HomeGenerate.tsx`</w:t>
+      </w:r>
+      <w:r>
+        <w:t xml:space="preserve"> (beta UI). Primary path is </w:t>
+      </w:r>
+      <w:r>
+        <w:rPr>
+          <w:b/>
+          <w:bCs/>
+        </w:rPr>
+        <w:t xml:space="preserve">structured</w:t>
+      </w:r>
+      <w:r>
+        <w:t xml:space="preserve"> parsing via npm </w:t>
+      </w:r>
+      <w:r>
+        <w:rPr>
+          <w:b/>
+          <w:bCs/>
+        </w:rPr>
+        <w:t xml:space="preserve">`ireal-reader`</w:t>
+      </w:r>
+      <w:r>
+        <w:t xml:space="preserve"> ([pianosnake/ireal-reader](https://github.com/pianosnake/ireal-reader)), not raw </w:t>
+      </w:r>
+      <w:r>
+        <w:rPr>
+          <w:b/>
+          <w:bCs/>
+        </w:rPr>
+        <w:t xml:space="preserve">`.irealb` binary</w:t>
+      </w:r>
+      <w:r>
+        <w:t xml:space="preserve"> as the ingest surface. </w:t>
+      </w:r>
+      <w:r>
+        <w:rPr>
+          <w:b/>
+          <w:bCs/>
+        </w:rPr>
+        <w:t xml:space="preserve">Optional later:</w:t>
+      </w:r>
+      <w:r>
+        <w:t xml:space="preserve"> </w:t>
+      </w:r>
+      <w:r>
+        <w:rPr>
+          <w:b/>
+          <w:bCs/>
+        </w:rPr>
+        <w:t xml:space="preserve">JPEG / screenshot</w:t>
+      </w:r>
+      <w:r>
+        <w:t xml:space="preserve"> OCR for users without HTML export (same </w:t>
+      </w:r>
+      <w:r>
+        <w:rPr>
+          <w:b/>
+          <w:bCs/>
+        </w:rPr>
+        <w:t xml:space="preserve">`ParsedChart`</w:t>
+      </w:r>
+      <w:r>
+        <w:t xml:space="preserve"> target) — not in v1.</w:t>
+      </w:r>
+    </w:p>
+    <w:tbl>
+      <w:tblPr>
+        <w:tblW w:type="pct" w:w="100%"/>
+        <w:tblBorders>
+          <w:top w:val="single" w:color="auto" w:sz="4"/>
+          <w:left w:val="single" w:color="auto" w:sz="4"/>
+          <w:bottom w:val="single" w:color="auto" w:sz="4"/>
+          <w:right w:val="single" w:color="auto" w:sz="4"/>
+          <w:insideH w:val="single" w:color="auto" w:sz="4"/>
+          <w:insideV w:val="single" w:color="auto" w:sz="4"/>
+        </w:tblBorders>
+      </w:tblPr>
+      <w:tblGrid>
+        <w:gridCol w:w="4500"/>
+        <w:gridCol w:w="4500"/>
+      </w:tblGrid>
+      <w:tr>
+        <w:tc>
+          <w:tcPr>
+            <w:tcW w:type="pct" w:w="4500%"/>
+          </w:tcPr>
+          <w:p>
+            <w:pPr>
+              <w:spacing w:after="60"/>
+            </w:pPr>
+            <w:r>
+              <w:t xml:space="preserve">Iteration</w:t>
+            </w:r>
+          </w:p>
+        </w:tc>
+        <w:tc>
+          <w:tcPr>
+            <w:tcW w:type="pct" w:w="4500%"/>
+          </w:tcPr>
+          <w:p>
+            <w:pPr>
+              <w:spacing w:after="60"/>
+            </w:pPr>
+            <w:r>
+              <w:t xml:space="preserve">What shipped</w:t>
+            </w:r>
+          </w:p>
+        </w:tc>
+      </w:tr>
+      <w:tr>
+        <w:tc>
+          <w:tcPr>
+            <w:tcW w:type="pct" w:w="4500%"/>
+          </w:tcPr>
+          <w:p>
+            <w:pPr>
+              <w:spacing w:after="60"/>
+            </w:pPr>
+            <w:r>
+              <w:rPr>
+                <w:b/>
+                <w:bCs/>
+              </w:rPr>
+              <w:t xml:space="preserve">1</w:t>
+            </w:r>
+          </w:p>
+        </w:tc>
+        <w:tc>
+          <w:tcPr>
+            <w:tcW w:type="pct" w:w="4500%"/>
+          </w:tcPr>
+          <w:p>
+            <w:pPr>
+              <w:spacing w:after="60"/>
+            </w:pPr>
+            <w:r>
+              <w:rPr>
+                <w:b/>
+                <w:bCs/>
+              </w:rPr>
+              <w:t xml:space="preserve">`parsedChart.ts`</w:t>
+            </w:r>
+            <w:r>
+              <w:t xml:space="preserve"> — </w:t>
+            </w:r>
+            <w:r>
+              <w:rPr>
+                <w:b/>
+                <w:bCs/>
+              </w:rPr>
+              <w:t xml:space="preserve">`ParsedChord`</w:t>
+            </w:r>
+            <w:r>
+              <w:t xml:space="preserve">, </w:t>
+            </w:r>
+            <w:r>
+              <w:rPr>
+                <w:b/>
+                <w:bCs/>
+              </w:rPr>
+              <w:t xml:space="preserve">`ParsedSection`</w:t>
+            </w:r>
+            <w:r>
+              <w:t xml:space="preserve">, </w:t>
+            </w:r>
+            <w:r>
+              <w:rPr>
+                <w:b/>
+                <w:bCs/>
+              </w:rPr>
+              <w:t xml:space="preserve">`ParsedChart`</w:t>
+            </w:r>
+            <w:r>
+              <w:t xml:space="preserve"> (`title`, `composer`, `key`, `timeSignature`, `tempo`, `style`, `sections`, `measures`, `repeats`). </w:t>
+            </w:r>
+            <w:r>
+              <w:rPr>
+                <w:b/>
+                <w:bCs/>
+              </w:rPr>
+              <w:t xml:space="preserve">`irealProAdapter.ts`</w:t>
+            </w:r>
+            <w:r>
+              <w:t xml:space="preserve"> — </w:t>
+            </w:r>
+            <w:r>
+              <w:rPr>
+                <w:b/>
+                <w:bCs/>
+              </w:rPr>
+              <w:t xml:space="preserve">`parseIRealProInput(input)`</w:t>
+            </w:r>
+            <w:r>
+              <w:t xml:space="preserve"> uses </w:t>
+            </w:r>
+            <w:r>
+              <w:rPr>
+                <w:b/>
+                <w:bCs/>
+              </w:rPr>
+              <w:t xml:space="preserve">`ireal-reader`</w:t>
+            </w:r>
+            <w:r>
+              <w:t xml:space="preserve"> on </w:t>
+            </w:r>
+            <w:r>
+              <w:rPr>
+                <w:b/>
+                <w:bCs/>
+              </w:rPr>
+              <w:t xml:space="preserve">`ireal://`</w:t>
+            </w:r>
+            <w:r>
+              <w:t xml:space="preserve"> / </w:t>
+            </w:r>
+            <w:r>
+              <w:rPr>
+                <w:b/>
+                <w:bCs/>
+              </w:rPr>
+              <w:t xml:space="preserve">`irealb://`</w:t>
+            </w:r>
+            <w:r>
+              <w:t xml:space="preserve"> URL or </w:t>
+            </w:r>
+            <w:r>
+              <w:rPr>
+                <w:b/>
+                <w:bCs/>
+              </w:rPr>
+              <w:t xml:space="preserve">HTML</w:t>
+            </w:r>
+            <w:r>
+              <w:t xml:space="preserve"> export; </w:t>
+            </w:r>
+            <w:r>
+              <w:rPr>
+                <w:b/>
+                <w:bCs/>
+              </w:rPr>
+              <w:t xml:space="preserve">`ireal://`</w:t>
+            </w:r>
+            <w:r>
+              <w:t xml:space="preserve"> normalised for the library; first playlist song → </w:t>
+            </w:r>
+            <w:r>
+              <w:rPr>
+                <w:b/>
+                <w:bCs/>
+              </w:rPr>
+              <w:t xml:space="preserve">`ParsedChart`</w:t>
+            </w:r>
+            <w:r>
+              <w:t xml:space="preserve">.</w:t>
+            </w:r>
+          </w:p>
+        </w:tc>
+      </w:tr>
+      <w:tr>
+        <w:tc>
+          <w:tcPr>
+            <w:tcW w:type="pct" w:w="4500%"/>
+          </w:tcPr>
+          <w:p>
+            <w:pPr>
+              <w:spacing w:after="60"/>
+            </w:pPr>
+            <w:r>
+              <w:rPr>
+                <w:b/>
+                <w:bCs/>
+              </w:rPr>
+              <w:t xml:space="preserve">2</w:t>
+            </w:r>
+          </w:p>
+        </w:tc>
+        <w:tc>
+          <w:tcPr>
+            <w:tcW w:type="pct" w:w="4500%"/>
+          </w:tcPr>
+          <w:p>
+            <w:pPr>
+              <w:spacing w:after="60"/>
+            </w:pPr>
+            <w:r>
+              <w:rPr>
+                <w:b/>
+                <w:bCs/>
+              </w:rPr>
+              <w:t xml:space="preserve">`chordSymbolMapper.ts`</w:t>
+            </w:r>
+            <w:r>
+              <w:t xml:space="preserve"> — </w:t>
+            </w:r>
+            <w:r>
+              <w:rPr>
+                <w:b/>
+                <w:bCs/>
+              </w:rPr>
+              <w:t xml:space="preserve">`mapChordToVaultType(ParsedChord)`</w:t>
+            </w:r>
+            <w:r>
+              <w:t xml:space="preserve"> maps </w:t>
+            </w:r>
+            <w:r>
+              <w:rPr>
+                <w:b/>
+                <w:bCs/>
+              </w:rPr>
+              <w:t xml:space="preserve">`rootNote`</w:t>
+            </w:r>
+            <w:r>
+              <w:t xml:space="preserve"> → </w:t>
+            </w:r>
+            <w:r>
+              <w:rPr>
+                <w:b/>
+                <w:bCs/>
+              </w:rPr>
+              <w:t xml:space="preserve">`rootPc`</w:t>
+            </w:r>
+            <w:r>
+              <w:t xml:space="preserve"> (</w:t>
+            </w:r>
+            <w:r>
+              <w:rPr>
+                <w:b/>
+                <w:bCs/>
+              </w:rPr>
+              <w:t xml:space="preserve">C = 0 … B = 11</w:t>
+            </w:r>
+            <w:r>
+              <w:t xml:space="preserve">) and </w:t>
+            </w:r>
+            <w:r>
+              <w:rPr>
+                <w:b/>
+                <w:bCs/>
+              </w:rPr>
+              <w:t xml:space="preserve">`chordQuality`</w:t>
+            </w:r>
+            <w:r>
+              <w:t xml:space="preserve"> → </w:t>
+            </w:r>
+            <w:r>
+              <w:rPr>
+                <w:b/>
+                <w:bCs/>
+              </w:rPr>
+              <w:t xml:space="preserve">`vaultChordTypeId`</w:t>
+            </w:r>
+            <w:r>
+              <w:t xml:space="preserve"> for all </w:t>
+            </w:r>
+            <w:r>
+              <w:rPr>
+                <w:b/>
+                <w:bCs/>
+              </w:rPr>
+              <w:t xml:space="preserve">16</w:t>
+            </w:r>
+            <w:r>
+              <w:t xml:space="preserve"> </w:t>
+            </w:r>
+            <w:r>
+              <w:rPr>
+                <w:b/>
+                <w:bCs/>
+              </w:rPr>
+              <w:t xml:space="preserve">`TONALITY_VAULT_DATABASE`</w:t>
+            </w:r>
+            <w:r>
+              <w:t xml:space="preserve"> types (synonyms: maj/</w:t>
+            </w:r>
+            <w:r>
+              <w:rPr>
+                <w:b/>
+                <w:bCs/>
+              </w:rPr>
+              <w:t xml:space="preserve">^</w:t>
+            </w:r>
+            <w:r>
+              <w:t xml:space="preserve">/Δ, minor, dom, sus, altered, etc.); unrecognised quality → </w:t>
+            </w:r>
+            <w:r>
+              <w:rPr>
+                <w:b/>
+                <w:bCs/>
+              </w:rPr>
+              <w:t xml:space="preserve">`null`</w:t>
+            </w:r>
+            <w:r>
+              <w:t xml:space="preserve">.</w:t>
+            </w:r>
+          </w:p>
+        </w:tc>
+      </w:tr>
+      <w:tr>
+        <w:tc>
+          <w:tcPr>
+            <w:tcW w:type="pct" w:w="4500%"/>
+          </w:tcPr>
+          <w:p>
+            <w:pPr>
+              <w:spacing w:after="60"/>
+            </w:pPr>
+            <w:r>
+              <w:rPr>
+                <w:b/>
+                <w:bCs/>
+              </w:rPr>
+              <w:t xml:space="preserve">3</w:t>
+            </w:r>
+          </w:p>
+        </w:tc>
+        <w:tc>
+          <w:tcPr>
+            <w:tcW w:type="pct" w:w="4500%"/>
+          </w:tcPr>
+          <w:p>
+            <w:pPr>
+              <w:spacing w:after="60"/>
+            </w:pPr>
+            <w:r>
+              <w:rPr>
+                <w:b/>
+                <w:bCs/>
+              </w:rPr>
+              <w:t xml:space="preserve">`irealVaultPipeline.ts`</w:t>
+            </w:r>
+            <w:r>
+              <w:t xml:space="preserve"> — </w:t>
+            </w:r>
+            <w:r>
+              <w:rPr>
+                <w:b/>
+                <w:bCs/>
+              </w:rPr>
+              <w:t xml:space="preserve">`generateFromIReal(input, options?)`</w:t>
+            </w:r>
+            <w:r>
+              <w:t xml:space="preserve"> walks </w:t>
+            </w:r>
+            <w:r>
+              <w:rPr>
+                <w:b/>
+                <w:bCs/>
+              </w:rPr>
+              <w:t xml:space="preserve">`ParsedChart.measures`</w:t>
+            </w:r>
+            <w:r>
+              <w:t xml:space="preserve"> (first chord per bar), </w:t>
+            </w:r>
+            <w:r>
+              <w:rPr>
+                <w:b/>
+                <w:bCs/>
+              </w:rPr>
+              <w:t xml:space="preserve">`mapChordToVaultType`</w:t>
+            </w:r>
+            <w:r>
+              <w:t xml:space="preserve">, </w:t>
+            </w:r>
+            <w:r>
+              <w:rPr>
+                <w:b/>
+                <w:bCs/>
+              </w:rPr>
+              <w:t xml:space="preserve">`generateVaultRiff`</w:t>
+            </w:r>
+            <w:r>
+              <w:t xml:space="preserve"> per bar (</w:t>
+            </w:r>
+            <w:r>
+              <w:rPr>
+                <w:b/>
+                <w:bCs/>
+              </w:rPr>
+              <w:t xml:space="preserve">`bars: 1`</w:t>
+            </w:r>
+            <w:r>
+              <w:t xml:space="preserve">), offsets </w:t>
+            </w:r>
+            <w:r>
+              <w:rPr>
+                <w:b/>
+                <w:bCs/>
+              </w:rPr>
+              <w:t xml:space="preserve">`ScoreNote.startBeat`</w:t>
+            </w:r>
+            <w:r>
+              <w:t xml:space="preserve"> by </w:t>
+            </w:r>
+            <w:r>
+              <w:rPr>
+                <w:b/>
+                <w:bCs/>
+              </w:rPr>
+              <w:t xml:space="preserve">`barIndex * 4`</w:t>
+            </w:r>
+            <w:r>
+              <w:t xml:space="preserve"> (4/4 quarters); returns </w:t>
+            </w:r>
+            <w:r>
+              <w:rPr>
+                <w:b/>
+                <w:bCs/>
+              </w:rPr>
+              <w:t xml:space="preserve">`IRealVaultOutput`</w:t>
+            </w:r>
+            <w:r>
+              <w:t xml:space="preserve"> — </w:t>
+            </w:r>
+            <w:r>
+              <w:rPr>
+                <w:b/>
+                <w:bCs/>
+              </w:rPr>
+              <w:t xml:space="preserve">`generatedNotes`</w:t>
+            </w:r>
+            <w:r>
+              <w:t xml:space="preserve">, </w:t>
+            </w:r>
+            <w:r>
+              <w:rPr>
+                <w:b/>
+                <w:bCs/>
+              </w:rPr>
+              <w:t xml:space="preserve">`chordMappings`</w:t>
+            </w:r>
+            <w:r>
+              <w:t xml:space="preserve">, </w:t>
+            </w:r>
+            <w:r>
+              <w:rPr>
+                <w:b/>
+                <w:bCs/>
+              </w:rPr>
+              <w:t xml:space="preserve">`unmappedChords`</w:t>
+            </w:r>
+            <w:r>
+              <w:t xml:space="preserve">. MusicXML export from this pipeline remains a </w:t>
+            </w:r>
+            <w:r>
+              <w:rPr>
+                <w:b/>
+                <w:bCs/>
+              </w:rPr>
+              <w:t xml:space="preserve">follow-up</w:t>
+            </w:r>
+            <w:r>
+              <w:t xml:space="preserve"> wire to the main exporter.</w:t>
+            </w:r>
+          </w:p>
+        </w:tc>
+      </w:tr>
+      <w:tr>
+        <w:tc>
+          <w:tcPr>
+            <w:tcW w:type="pct" w:w="4500%"/>
+          </w:tcPr>
+          <w:p>
+            <w:pPr>
+              <w:spacing w:after="60"/>
+            </w:pPr>
+            <w:r>
+              <w:rPr>
+                <w:b/>
+                <w:bCs/>
+              </w:rPr>
+              <w:t xml:space="preserve">4</w:t>
+            </w:r>
+          </w:p>
+        </w:tc>
+        <w:tc>
+          <w:tcPr>
+            <w:tcW w:type="pct" w:w="4500%"/>
+          </w:tcPr>
+          <w:p>
+            <w:pPr>
+              <w:spacing w:after="60"/>
+            </w:pPr>
+            <w:r>
+              <w:rPr>
+                <w:b/>
+                <w:bCs/>
+              </w:rPr>
+              <w:t xml:space="preserve">iReal Pro Import (Beta)</w:t>
+            </w:r>
+            <w:r>
+              <w:t xml:space="preserve"> in </w:t>
+            </w:r>
+            <w:r>
+              <w:rPr>
+                <w:b/>
+                <w:bCs/>
+              </w:rPr>
+              <w:t xml:space="preserve">`HomeGenerate.tsx`</w:t>
+            </w:r>
+            <w:r>
+              <w:t xml:space="preserve"> — collapsible </w:t>
+            </w:r>
+            <w:r>
+              <w:rPr>
+                <w:b/>
+                <w:bCs/>
+              </w:rPr>
+              <w:t xml:space="preserve">`details`</w:t>
+            </w:r>
+            <w:r>
+              <w:t xml:space="preserve">; </w:t>
+            </w:r>
+            <w:r>
+              <w:rPr>
+                <w:b/>
+                <w:bCs/>
+              </w:rPr>
+              <w:t xml:space="preserve">textarea</w:t>
+            </w:r>
+            <w:r>
+              <w:t xml:space="preserve"> for </w:t>
+            </w:r>
+            <w:r>
+              <w:rPr>
+                <w:b/>
+                <w:bCs/>
+              </w:rPr>
+              <w:t xml:space="preserve">`ireal://`</w:t>
+            </w:r>
+            <w:r>
+              <w:t xml:space="preserve"> / HTML paste; </w:t>
+            </w:r>
+            <w:r>
+              <w:rPr>
+                <w:b/>
+                <w:bCs/>
+              </w:rPr>
+              <w:t xml:space="preserve">riff style</w:t>
+            </w:r>
+            <w:r>
+              <w:t xml:space="preserve"> dropdown (</w:t>
+            </w:r>
+            <w:r>
+              <w:rPr>
+                <w:b/>
+                <w:bCs/>
+              </w:rPr>
+              <w:t xml:space="preserve">bebop-placement</w:t>
+            </w:r>
+            <w:r>
+              <w:t xml:space="preserve">, </w:t>
+            </w:r>
+            <w:r>
+              <w:rPr>
+                <w:b/>
+                <w:bCs/>
+              </w:rPr>
+              <w:t xml:space="preserve">quadratonic</w:t>
+            </w:r>
+            <w:r>
+              <w:t xml:space="preserve">, </w:t>
+            </w:r>
+            <w:r>
+              <w:rPr>
+                <w:b/>
+                <w:bCs/>
+              </w:rPr>
+              <w:t xml:space="preserve">dyad-seesaw</w:t>
+            </w:r>
+            <w:r>
+              <w:t xml:space="preserve">, </w:t>
+            </w:r>
+            <w:r>
+              <w:rPr>
+                <w:b/>
+                <w:bCs/>
+              </w:rPr>
+              <w:t xml:space="preserve">triad-pair-pendulum</w:t>
+            </w:r>
+            <w:r>
+              <w:t xml:space="preserve">, </w:t>
+            </w:r>
+            <w:r>
+              <w:rPr>
+                <w:b/>
+                <w:bCs/>
+              </w:rPr>
+              <w:t xml:space="preserve">pedal-string</w:t>
+            </w:r>
+            <w:r>
+              <w:t xml:space="preserve">); </w:t>
+            </w:r>
+            <w:r>
+              <w:rPr>
+                <w:b/>
+                <w:bCs/>
+              </w:rPr>
+              <w:t xml:space="preserve">tuning</w:t>
+            </w:r>
+            <w:r>
+              <w:t xml:space="preserve"> dropdown (</w:t>
+            </w:r>
+            <w:r>
+              <w:rPr>
+                <w:b/>
+                <w:bCs/>
+              </w:rPr>
+              <w:t xml:space="preserve">standard</w:t>
+            </w:r>
+            <w:r>
+              <w:t xml:space="preserve">, </w:t>
+            </w:r>
+            <w:r>
+              <w:rPr>
+                <w:b/>
+                <w:bCs/>
+              </w:rPr>
+              <w:t xml:space="preserve">dadgad</w:t>
+            </w:r>
+            <w:r>
+              <w:t xml:space="preserve">, </w:t>
+            </w:r>
+            <w:r>
+              <w:rPr>
+                <w:b/>
+                <w:bCs/>
+              </w:rPr>
+              <w:t xml:space="preserve">open_d</w:t>
+            </w:r>
+            <w:r>
+              <w:t xml:space="preserve">, </w:t>
+            </w:r>
+            <w:r>
+              <w:rPr>
+                <w:b/>
+                <w:bCs/>
+              </w:rPr>
+              <w:t xml:space="preserve">open_g</w:t>
+            </w:r>
+            <w:r>
+              <w:t xml:space="preserve">, </w:t>
+            </w:r>
+            <w:r>
+              <w:rPr>
+                <w:b/>
+                <w:bCs/>
+              </w:rPr>
+              <w:t xml:space="preserve">sy_cgdgcd</w:t>
+            </w:r>
+            <w:r>
+              <w:t xml:space="preserve">); </w:t>
+            </w:r>
+            <w:r>
+              <w:rPr>
+                <w:b/>
+                <w:bCs/>
+              </w:rPr>
+              <w:t xml:space="preserve">Generate from iReal</w:t>
+            </w:r>
+            <w:r>
+              <w:t xml:space="preserve"> calls </w:t>
+            </w:r>
+            <w:r>
+              <w:rPr>
+                <w:b/>
+                <w:bCs/>
+              </w:rPr>
+              <w:t xml:space="preserve">`generateFromIReal`</w:t>
+            </w:r>
+            <w:r>
+              <w:t xml:space="preserve">; results show </w:t>
+            </w:r>
+            <w:r>
+              <w:rPr>
+                <w:b/>
+                <w:bCs/>
+              </w:rPr>
+              <w:t xml:space="preserve">title</w:t>
+            </w:r>
+            <w:r>
+              <w:t xml:space="preserve">, </w:t>
+            </w:r>
+            <w:r>
+              <w:rPr>
+                <w:b/>
+                <w:bCs/>
+              </w:rPr>
+              <w:t xml:space="preserve">key</w:t>
+            </w:r>
+            <w:r>
+              <w:t xml:space="preserve">, </w:t>
+            </w:r>
+            <w:r>
+              <w:rPr>
+                <w:b/>
+                <w:bCs/>
+              </w:rPr>
+              <w:t xml:space="preserve">bars</w:t>
+            </w:r>
+            <w:r>
+              <w:t xml:space="preserve">, </w:t>
+            </w:r>
+            <w:r>
+              <w:rPr>
+                <w:b/>
+                <w:bCs/>
+              </w:rPr>
+              <w:t xml:space="preserve">mapped vs unmapped</w:t>
+            </w:r>
+            <w:r>
+              <w:t xml:space="preserve"> counts; </w:t>
+            </w:r>
+            <w:r>
+              <w:rPr>
+                <w:b/>
+                <w:bCs/>
+              </w:rPr>
+              <w:t xml:space="preserve">amber</w:t>
+            </w:r>
+            <w:r>
+              <w:t xml:space="preserve"> list for unmapped chords.</w:t>
+            </w:r>
+          </w:p>
+        </w:tc>
+      </w:tr>
+    </w:tbl>
+    <w:p>
+      <w:pPr>
+        <w:spacing w:after="160"/>
+      </w:pPr>
+    </w:p>
+    <w:p>
+      <w:pPr>
+        <w:spacing w:after="160"/>
+      </w:pPr>
+      <w:r>
+        <w:rPr>
+          <w:b/>
+          <w:bCs/>
+        </w:rPr>
+        <w:t xml:space="preserve">Cross-check library (not bundled):</w:t>
+      </w:r>
+      <w:r>
+        <w:t xml:space="preserve"> </w:t>
+      </w:r>
+      <w:r>
+        <w:rPr>
+          <w:b/>
+          <w:bCs/>
+        </w:rPr>
+        <w:t xml:space="preserve">[daumling/ireal-renderer](https://github.com/daumling/ireal-renderer)</w:t>
+      </w:r>
+      <w:r>
+        <w:t xml:space="preserve"> — optional future cross-check for section markers / form structure.</w:t>
+      </w:r>
+    </w:p>
+    <w:p>
+      <w:pPr>
+        <w:pStyle w:val="Heading2"/>
+        <w:spacing w:after="100" w:before="160"/>
+      </w:pPr>
+      <w:r>
         <w:t xml:space="preserve">How Composer OS helps composition</w:t>
       </w:r>
     </w:p>
@@ -33493,17 +34964,122 @@
         <w:t xml:space="preserve">complete</w:t>
       </w:r>
       <w:r>
-        <w:t xml:space="preserve">. </w:t>
-      </w:r>
-      <w:r>
-        <w:rPr>
-          <w:b/>
-          <w:bCs/>
-        </w:rPr>
-        <w:t xml:space="preserve">Only</w:t>
-      </w:r>
-      <w:r>
-        <w:t xml:space="preserve"> remaining Tonality Vault build: </w:t>
+        <w:t xml:space="preserve">. Remaining Tonality Vault build order: </w:t>
+      </w:r>
+      <w:r>
+        <w:rPr>
+          <w:b/>
+          <w:bCs/>
+        </w:rPr>
+        <w:t xml:space="preserve">I → UI</w:t>
+      </w:r>
+      <w:r>
+        <w:t xml:space="preserve"> only (</w:t>
+      </w:r>
+      <w:r>
+        <w:rPr>
+          <w:b/>
+          <w:bCs/>
+        </w:rPr>
+        <w:t xml:space="preserve">IMG</w:t>
+      </w:r>
+      <w:r>
+        <w:t xml:space="preserve"> is done — do not sequence </w:t>
+      </w:r>
+      <w:r>
+        <w:rPr>
+          <w:b/>
+          <w:bCs/>
+        </w:rPr>
+        <w:t xml:space="preserve">IMG</w:t>
+      </w:r>
+      <w:r>
+        <w:t xml:space="preserve"> ahead of </w:t>
+      </w:r>
+      <w:r>
+        <w:rPr>
+          <w:b/>
+          <w:bCs/>
+        </w:rPr>
+        <w:t xml:space="preserve">I</w:t>
+      </w:r>
+      <w:r>
+        <w:t xml:space="preserve"> or </w:t>
+      </w:r>
+      <w:r>
+        <w:rPr>
+          <w:b/>
+          <w:bCs/>
+        </w:rPr>
+        <w:t xml:space="preserve">UI</w:t>
+      </w:r>
+      <w:r>
+        <w:t xml:space="preserve">).</w:t>
+      </w:r>
+    </w:p>
+    <w:p>
+      <w:pPr>
+        <w:spacing w:after="160"/>
+      </w:pPr>
+      <w:r>
+        <w:rPr>
+          <w:b/>
+          <w:bCs/>
+        </w:rPr>
+        <w:t xml:space="preserve">Next:</w:t>
+      </w:r>
+      <w:r>
+        <w:t xml:space="preserve"> </w:t>
+      </w:r>
+      <w:r>
+        <w:rPr>
+          <w:b/>
+          <w:bCs/>
+        </w:rPr>
+        <w:t xml:space="preserve">Build I</w:t>
+      </w:r>
+      <w:r>
+        <w:t xml:space="preserve"> — </w:t>
+      </w:r>
+      <w:r>
+        <w:rPr>
+          <w:b/>
+          <w:bCs/>
+        </w:rPr>
+        <w:t xml:space="preserve">Generation Mode Profiles</w:t>
+      </w:r>
+      <w:r>
+        <w:t xml:space="preserve"> (</w:t>
+      </w:r>
+      <w:r>
+        <w:rPr>
+          <w:b/>
+          <w:bCs/>
+        </w:rPr>
+        <w:t xml:space="preserve">Solo</w:t>
+      </w:r>
+      <w:r>
+        <w:t xml:space="preserve"> vs </w:t>
+      </w:r>
+      <w:r>
+        <w:rPr>
+          <w:b/>
+          <w:bCs/>
+        </w:rPr>
+        <w:t xml:space="preserve">Melody</w:t>
+      </w:r>
+      <w:r>
+        <w:t xml:space="preserve">). </w:t>
+      </w:r>
+      <w:r>
+        <w:rPr>
+          <w:b/>
+          <w:bCs/>
+        </w:rPr>
+        <w:t xml:space="preserve">Then:</w:t>
+      </w:r>
+      <w:r>
+        <w:t xml:space="preserve"> </w:t>
       </w:r>
       <w:r>
         <w:rPr>
@@ -33513,31 +35089,6 @@
         <w:t xml:space="preserve">Build UI</w:t>
       </w:r>
       <w:r>
-        <w:t xml:space="preserve"> (visual fretboard).</w:t>
-      </w:r>
-    </w:p>
-    <w:p>
-      <w:pPr>
-        <w:spacing w:after="160"/>
-      </w:pPr>
-      <w:r>
-        <w:rPr>
-          <w:b/>
-          <w:bCs/>
-        </w:rPr>
-        <w:t xml:space="preserve">Next:</w:t>
-      </w:r>
-      <w:r>
-        <w:t xml:space="preserve"> </w:t>
-      </w:r>
-      <w:r>
-        <w:rPr>
-          <w:b/>
-          <w:bCs/>
-        </w:rPr>
-        <w:t xml:space="preserve">Build UI</w:t>
-      </w:r>
-      <w:r>
         <w:t xml:space="preserve"> — </w:t>
       </w:r>
       <w:r>
@@ -33608,7 +35159,7 @@
         <w:t xml:space="preserve">Vault microscope</w:t>
       </w:r>
       <w:r>
-        <w:t xml:space="preserve">, layout / dark mode). No other Vault roadmap builds ahead of it.</w:t>
+        <w:t xml:space="preserve">, layout / dark mode).</w:t>
       </w:r>
     </w:p>
     <w:p>

</xml_diff>

<commit_message>
docs: Build I complete — GenerationModeProfile solo vs melody, wired into iReal pipeline, roadmap updated
Co-authored-by: Cursor <cursoragent@cursor.com>
</commit_message>
<xml_diff>
--- a/docs/COMPOSER_OS_PLAYBOOK.docx
+++ b/docs/COMPOSER_OS_PLAYBOOK.docx
@@ -31745,30 +31745,10 @@
           <w:b/>
           <w:bCs/>
         </w:rPr>
-        <w:t xml:space="preserve">Roadmap / not shipped</w:t>
-      </w:r>
-      <w:r>
-        <w:t xml:space="preserve"> — expression-level differentiation between </w:t>
-      </w:r>
-      <w:r>
-        <w:rPr>
-          <w:b/>
-          <w:bCs/>
-        </w:rPr>
-        <w:t xml:space="preserve">solo</w:t>
-      </w:r>
-      <w:r>
-        <w:t xml:space="preserve"> (dense, bar-reactive, bebop-weighted) and </w:t>
-      </w:r>
-      <w:r>
-        <w:rPr>
-          <w:b/>
-          <w:bCs/>
-        </w:rPr>
-        <w:t xml:space="preserve">melody</w:t>
-      </w:r>
-      <w:r>
-        <w:t xml:space="preserve"> (sparse, motif-driven, phrase-reactive). See </w:t>
+        <w:t xml:space="preserve">Complete</w:t>
+      </w:r>
+      <w:r>
+        <w:t xml:space="preserve"> — see </w:t>
       </w:r>
       <w:r>
         <w:rPr>
@@ -31778,7 +31758,47 @@
         <w:t xml:space="preserve">Build I — Generation Mode Profiles</w:t>
       </w:r>
       <w:r>
-        <w:t xml:space="preserve"> below.</w:t>
+        <w:t xml:space="preserve"> below; shipped </w:t>
+      </w:r>
+      <w:r>
+        <w:rPr>
+          <w:b/>
+          <w:bCs/>
+        </w:rPr>
+        <w:t xml:space="preserve">`core/generation/generationModeProfile.ts`</w:t>
+      </w:r>
+      <w:r>
+        <w:t xml:space="preserve">, </w:t>
+      </w:r>
+      <w:r>
+        <w:rPr>
+          <w:b/>
+          <w:bCs/>
+        </w:rPr>
+        <w:t xml:space="preserve">`core/generation/index.ts`</w:t>
+      </w:r>
+      <w:r>
+        <w:t xml:space="preserve">, and </w:t>
+      </w:r>
+      <w:r>
+        <w:rPr>
+          <w:b/>
+          <w:bCs/>
+        </w:rPr>
+        <w:t xml:space="preserve">iReal</w:t>
+      </w:r>
+      <w:r>
+        <w:t xml:space="preserve"> wire-up in </w:t>
+      </w:r>
+      <w:r>
+        <w:rPr>
+          <w:b/>
+          <w:bCs/>
+        </w:rPr>
+        <w:t xml:space="preserve">`irealVaultPipeline.ts`</w:t>
+      </w:r>
+      <w:r>
+        <w:t xml:space="preserve">.</w:t>
       </w:r>
     </w:p>
     <w:p>
@@ -31794,7 +31814,7 @@
           <w:b/>
           <w:bCs/>
         </w:rPr>
-        <w:t xml:space="preserve">Build UI — Visual fretboard (remaining):</w:t>
+        <w:t xml:space="preserve">Build UI — Visual fretboard (only remaining):</w:t>
       </w:r>
       <w:r>
         <w:t xml:space="preserve"> </w:t>
@@ -31804,26 +31824,6 @@
           <w:b/>
           <w:bCs/>
         </w:rPr>
-        <w:t xml:space="preserve">Next</w:t>
-      </w:r>
-      <w:r>
-        <w:t xml:space="preserve"> after </w:t>
-      </w:r>
-      <w:r>
-        <w:rPr>
-          <w:b/>
-          <w:bCs/>
-        </w:rPr>
-        <w:t xml:space="preserve">Build I</w:t>
-      </w:r>
-      <w:r>
-        <w:t xml:space="preserve">. </w:t>
-      </w:r>
-      <w:r>
-        <w:rPr>
-          <w:b/>
-          <w:bCs/>
-        </w:rPr>
         <w:t xml:space="preserve">fretboard.js</w:t>
       </w:r>
       <w:r>
@@ -31854,20 +31854,120 @@
           <w:b/>
           <w:bCs/>
         </w:rPr>
-        <w:t xml:space="preserve">Estimated effort: 6–8 iterations</w:t>
-      </w:r>
-      <w:r>
-        <w:t xml:space="preserve"> — </w:t>
-      </w:r>
-      <w:r>
-        <w:rPr>
-          <w:b/>
-          <w:bCs/>
-        </w:rPr>
-        <w:t xml:space="preserve">dedicated focused session</w:t>
-      </w:r>
-      <w:r>
-        <w:t xml:space="preserve"> — </w:t>
+        <w:t xml:space="preserve">Five iterations</w:t>
+      </w:r>
+      <w:r>
+        <w:t xml:space="preserve"> (roadmap): </w:t>
+      </w:r>
+      <w:r>
+        <w:rPr>
+          <w:b/>
+          <w:bCs/>
+        </w:rPr>
+        <w:t xml:space="preserve">(1)</w:t>
+      </w:r>
+      <w:r>
+        <w:t xml:space="preserve"> </w:t>
+      </w:r>
+      <w:r>
+        <w:rPr>
+          <w:b/>
+          <w:bCs/>
+        </w:rPr>
+        <w:t xml:space="preserve">layer</w:t>
+      </w:r>
+      <w:r>
+        <w:t xml:space="preserve"> toggles; </w:t>
+      </w:r>
+      <w:r>
+        <w:rPr>
+          <w:b/>
+          <w:bCs/>
+        </w:rPr>
+        <w:t xml:space="preserve">(2)</w:t>
+      </w:r>
+      <w:r>
+        <w:t xml:space="preserve"> </w:t>
+      </w:r>
+      <w:r>
+        <w:rPr>
+          <w:b/>
+          <w:bCs/>
+        </w:rPr>
+        <w:t xml:space="preserve">playback</w:t>
+      </w:r>
+      <w:r>
+        <w:t xml:space="preserve"> trail; </w:t>
+      </w:r>
+      <w:r>
+        <w:rPr>
+          <w:b/>
+          <w:bCs/>
+        </w:rPr>
+        <w:t xml:space="preserve">(3)</w:t>
+      </w:r>
+      <w:r>
+        <w:t xml:space="preserve"> </w:t>
+      </w:r>
+      <w:r>
+        <w:rPr>
+          <w:b/>
+          <w:bCs/>
+        </w:rPr>
+        <w:t xml:space="preserve">export</w:t>
+      </w:r>
+      <w:r>
+        <w:t xml:space="preserve"> pipeline (</w:t>
+      </w:r>
+      <w:r>
+        <w:rPr>
+          <w:b/>
+          <w:bCs/>
+        </w:rPr>
+        <w:t xml:space="preserve">`svgToPng`</w:t>
+      </w:r>
+      <w:r>
+        <w:t xml:space="preserve">); </w:t>
+      </w:r>
+      <w:r>
+        <w:rPr>
+          <w:b/>
+          <w:bCs/>
+        </w:rPr>
+        <w:t xml:space="preserve">(4)</w:t>
+      </w:r>
+      <w:r>
+        <w:t xml:space="preserve"> responsive layout / </w:t>
+      </w:r>
+      <w:r>
+        <w:rPr>
+          <w:b/>
+          <w:bCs/>
+        </w:rPr>
+        <w:t xml:space="preserve">dark</w:t>
+      </w:r>
+      <w:r>
+        <w:t xml:space="preserve"> mode; </w:t>
+      </w:r>
+      <w:r>
+        <w:rPr>
+          <w:b/>
+          <w:bCs/>
+        </w:rPr>
+        <w:t xml:space="preserve">(5)</w:t>
+      </w:r>
+      <w:r>
+        <w:t xml:space="preserve"> </w:t>
+      </w:r>
+      <w:r>
+        <w:rPr>
+          <w:b/>
+          <w:bCs/>
+        </w:rPr>
+        <w:t xml:space="preserve">Vault microscope</w:t>
+      </w:r>
+      <w:r>
+        <w:t xml:space="preserve"> scrubber. </w:t>
       </w:r>
       <w:r>
         <w:rPr>
@@ -31877,37 +31977,7 @@
         <w:t xml:space="preserve">FretboardPanel</w:t>
       </w:r>
       <w:r>
-        <w:t xml:space="preserve"> (</w:t>
-      </w:r>
-      <w:r>
-        <w:rPr>
-          <w:b/>
-          <w:bCs/>
-        </w:rPr>
-        <w:t xml:space="preserve">fretboard.js</w:t>
-      </w:r>
-      <w:r>
-        <w:t xml:space="preserve">); note </w:t>
-      </w:r>
-      <w:r>
-        <w:rPr>
-          <w:b/>
-          <w:bCs/>
-        </w:rPr>
-        <w:t xml:space="preserve">role</w:t>
-      </w:r>
-      <w:r>
-        <w:t xml:space="preserve"> colours; </w:t>
-      </w:r>
-      <w:r>
-        <w:rPr>
-          <w:b/>
-          <w:bCs/>
-        </w:rPr>
-        <w:t xml:space="preserve">layer</w:t>
-      </w:r>
-      <w:r>
-        <w:t xml:space="preserve"> toggles; </w:t>
+        <w:t xml:space="preserve"> / </w:t>
       </w:r>
       <w:r>
         <w:rPr>
@@ -31917,57 +31987,17 @@
         <w:t xml:space="preserve">TabPanel</w:t>
       </w:r>
       <w:r>
-        <w:t xml:space="preserve"> (</w:t>
-      </w:r>
-      <w:r>
-        <w:rPr>
-          <w:b/>
-          <w:bCs/>
-        </w:rPr>
-        <w:t xml:space="preserve">VexFlow</w:t>
-      </w:r>
-      <w:r>
-        <w:t xml:space="preserve">); </w:t>
-      </w:r>
-      <w:r>
-        <w:rPr>
-          <w:b/>
-          <w:bCs/>
-        </w:rPr>
-        <w:t xml:space="preserve">playback</w:t>
-      </w:r>
-      <w:r>
-        <w:t xml:space="preserve"> trail; </w:t>
-      </w:r>
-      <w:r>
-        <w:rPr>
-          <w:b/>
-          <w:bCs/>
-        </w:rPr>
-        <w:t xml:space="preserve">`svgToPng`</w:t>
-      </w:r>
-      <w:r>
-        <w:t xml:space="preserve"> export; responsive layout / </w:t>
-      </w:r>
-      <w:r>
-        <w:rPr>
-          <w:b/>
-          <w:bCs/>
-        </w:rPr>
-        <w:t xml:space="preserve">dark mode</w:t>
-      </w:r>
-      <w:r>
-        <w:t xml:space="preserve">; </w:t>
-      </w:r>
-      <w:r>
-        <w:rPr>
-          <w:b/>
-          <w:bCs/>
-        </w:rPr>
-        <w:t xml:space="preserve">Vault microscope</w:t>
-      </w:r>
-      <w:r>
-        <w:t xml:space="preserve"> scrubber.</w:t>
+        <w:t xml:space="preserve"> scaffold exists in </w:t>
+      </w:r>
+      <w:r>
+        <w:rPr>
+          <w:b/>
+          <w:bCs/>
+        </w:rPr>
+        <w:t xml:space="preserve">`apps/composer-os-app`</w:t>
+      </w:r>
+      <w:r>
+        <w:t xml:space="preserve"> — extend through these five passes.</w:t>
       </w:r>
     </w:p>
     <w:p>
@@ -31976,7 +32006,7 @@
         <w:spacing w:after="100" w:before="160"/>
       </w:pPr>
       <w:r>
-        <w:t xml:space="preserve">Build I — Generation Mode Profiles (Solo vs Melody) (roadmap)</w:t>
+        <w:t xml:space="preserve">Build I — Generation Mode Profiles (Solo vs Melody) (**complete**)</w:t>
       </w:r>
     </w:p>
     <w:p>
@@ -32033,10 +32063,243 @@
           <w:b/>
           <w:bCs/>
         </w:rPr>
+        <w:t xml:space="preserve">Shipped types</w:t>
+      </w:r>
+      <w:r>
+        <w:t xml:space="preserve"> (`engines/composer-os-v2/core/generation/generationModeProfile.ts`):</w:t>
+      </w:r>
+    </w:p>
+    <w:p>
+      <w:pPr>
+        <w:spacing w:after="80"/>
+        <w:ind w:left="360" w:hanging="260"/>
+      </w:pPr>
+      <w:r>
+        <w:t xml:space="preserve">• </w:t>
+      </w:r>
+      <w:r>
+        <w:rPr>
+          <w:b/>
+          <w:bCs/>
+        </w:rPr>
+        <w:t xml:space="preserve">`getProfileForMode(mode)`</w:t>
+      </w:r>
+      <w:r>
+        <w:t xml:space="preserve"> — returns </w:t>
+      </w:r>
+      <w:r>
+        <w:rPr>
+          <w:b/>
+          <w:bCs/>
+        </w:rPr>
+        <w:t xml:space="preserve">`SOLO_PROFILE`</w:t>
+      </w:r>
+      <w:r>
+        <w:t xml:space="preserve"> or </w:t>
+      </w:r>
+      <w:r>
+        <w:rPr>
+          <w:b/>
+          <w:bCs/>
+        </w:rPr>
+        <w:t xml:space="preserve">`MELODY_PROFILE`</w:t>
+      </w:r>
+      <w:r>
+        <w:t xml:space="preserve"> for </w:t>
+      </w:r>
+      <w:r>
+        <w:rPr>
+          <w:b/>
+          <w:bCs/>
+        </w:rPr>
+        <w:t xml:space="preserve">`GenerationMode`</w:t>
+      </w:r>
+      <w:r>
+        <w:t xml:space="preserve"> </w:t>
+      </w:r>
+      <w:r>
+        <w:rPr>
+          <w:b/>
+          <w:bCs/>
+        </w:rPr>
+        <w:t xml:space="preserve">`'solo'`</w:t>
+      </w:r>
+      <w:r>
+        <w:t xml:space="preserve"> | </w:t>
+      </w:r>
+      <w:r>
+        <w:rPr>
+          <w:b/>
+          <w:bCs/>
+        </w:rPr>
+        <w:t xml:space="preserve">`'melody'`</w:t>
+      </w:r>
+      <w:r>
+        <w:t xml:space="preserve">.</w:t>
+      </w:r>
+    </w:p>
+    <w:p>
+      <w:pPr>
+        <w:spacing w:after="80"/>
+        <w:ind w:left="360" w:hanging="260"/>
+      </w:pPr>
+      <w:r>
+        <w:t xml:space="preserve">• </w:t>
+      </w:r>
+      <w:r>
+        <w:rPr>
+          <w:b/>
+          <w:bCs/>
+        </w:rPr>
+        <w:t xml:space="preserve">`planPhrase(bars, mode)`</w:t>
+      </w:r>
+      <w:r>
+        <w:t xml:space="preserve"> — </w:t>
+      </w:r>
+      <w:r>
+        <w:rPr>
+          <w:b/>
+          <w:bCs/>
+        </w:rPr>
+        <w:t xml:space="preserve">seeded deterministic</w:t>
+      </w:r>
+      <w:r>
+        <w:t xml:space="preserve"> RNG (</w:t>
+      </w:r>
+      <w:r>
+        <w:rPr>
+          <w:b/>
+          <w:bCs/>
+        </w:rPr>
+        <w:t xml:space="preserve">mulberry32</w:t>
+      </w:r>
+      <w:r>
+        <w:t xml:space="preserve">, seed from </w:t>
+      </w:r>
+      <w:r>
+        <w:rPr>
+          <w:b/>
+          <w:bCs/>
+        </w:rPr>
+        <w:t xml:space="preserve">`bars` + `mode`</w:t>
+      </w:r>
+      <w:r>
+        <w:t xml:space="preserve">). Returns </w:t>
+      </w:r>
+      <w:r>
+        <w:rPr>
+          <w:b/>
+          <w:bCs/>
+        </w:rPr>
+        <w:t xml:space="preserve">`PhrasePlan`</w:t>
+      </w:r>
+      <w:r>
+        <w:t xml:space="preserve">: </w:t>
+      </w:r>
+      <w:r>
+        <w:rPr>
+          <w:b/>
+          <w:bCs/>
+        </w:rPr>
+        <w:t xml:space="preserve">`bars`</w:t>
+      </w:r>
+      <w:r>
+        <w:t xml:space="preserve">, </w:t>
+      </w:r>
+      <w:r>
+        <w:rPr>
+          <w:b/>
+          <w:bCs/>
+        </w:rPr>
+        <w:t xml:space="preserve">`contour`</w:t>
+      </w:r>
+      <w:r>
+        <w:t xml:space="preserve"> (</w:t>
+      </w:r>
+      <w:r>
+        <w:rPr>
+          <w:b/>
+          <w:bCs/>
+        </w:rPr>
+        <w:t xml:space="preserve">`PhraseContour`</w:t>
+      </w:r>
+      <w:r>
+        <w:t xml:space="preserve">), </w:t>
+      </w:r>
+      <w:r>
+        <w:rPr>
+          <w:b/>
+          <w:bCs/>
+        </w:rPr>
+        <w:t xml:space="preserve">`apexBar`</w:t>
+      </w:r>
+      <w:r>
+        <w:t xml:space="preserve"> / </w:t>
+      </w:r>
+      <w:r>
+        <w:rPr>
+          <w:b/>
+          <w:bCs/>
+        </w:rPr>
+        <w:t xml:space="preserve">`apexBeat`</w:t>
+      </w:r>
+      <w:r>
+        <w:t xml:space="preserve">, </w:t>
+      </w:r>
+      <w:r>
+        <w:rPr>
+          <w:b/>
+          <w:bCs/>
+        </w:rPr>
+        <w:t xml:space="preserve">`cadencePitchClassRole`</w:t>
+      </w:r>
+      <w:r>
+        <w:t xml:space="preserve">, </w:t>
+      </w:r>
+      <w:r>
+        <w:rPr>
+          <w:b/>
+          <w:bCs/>
+        </w:rPr>
+        <w:t xml:space="preserve">`rhythmCells`</w:t>
+      </w:r>
+      <w:r>
+        <w:t xml:space="preserve"> (</w:t>
+      </w:r>
+      <w:r>
+        <w:rPr>
+          <w:b/>
+          <w:bCs/>
+        </w:rPr>
+        <w:t xml:space="preserve">`RhythmCell[]`</w:t>
+      </w:r>
+      <w:r>
+        <w:t xml:space="preserve">), optional </w:t>
+      </w:r>
+      <w:r>
+        <w:rPr>
+          <w:b/>
+          <w:bCs/>
+        </w:rPr>
+        <w:t xml:space="preserve">`motifId`</w:t>
+      </w:r>
+      <w:r>
+        <w:t xml:space="preserve">.</w:t>
+      </w:r>
+    </w:p>
+    <w:p>
+      <w:pPr>
+        <w:spacing w:after="160"/>
+      </w:pPr>
+      <w:r>
+        <w:rPr>
+          <w:b/>
+          <w:bCs/>
+        </w:rPr>
         <w:t xml:space="preserve">`GenerationModeProfile`</w:t>
       </w:r>
       <w:r>
-        <w:t xml:space="preserve"> (planned type — fields drive phrase + bar fill):</w:t>
+        <w:t xml:space="preserve"> — fields drive phrase + bar fill:</w:t>
       </w:r>
     </w:p>
     <w:tbl>
@@ -32110,14 +32373,11 @@
               <w:spacing w:after="60"/>
             </w:pPr>
             <w:r>
-              <w:t xml:space="preserve">Allowed </w:t>
-            </w:r>
-            <w:r>
-              <w:rPr>
-                <w:b/>
-                <w:bCs/>
-              </w:rPr>
-              <w:t xml:space="preserve">min/max</w:t>
+              <w:rPr>
+                <w:b/>
+                <w:bCs/>
+              </w:rPr>
+              <w:t xml:space="preserve">`[min, max]`</w:t>
             </w:r>
             <w:r>
               <w:t xml:space="preserve"> notes per bar for the mode.</w:t>
@@ -32350,7 +32610,7 @@
               <w:t xml:space="preserve">shape</w:t>
             </w:r>
             <w:r>
-              <w:t xml:space="preserve"> (ascend / descend / apex) constrains pitches.</w:t>
+              <w:t xml:space="preserve"> constrains pitch choices.</w:t>
             </w:r>
           </w:p>
         </w:tc>
@@ -32382,27 +32642,17 @@
               <w:spacing w:after="60"/>
             </w:pPr>
             <w:r>
-              <w:t xml:space="preserve">Whether </w:t>
-            </w:r>
-            <w:r>
-              <w:rPr>
-                <w:b/>
-                <w:bCs/>
-              </w:rPr>
-              <w:t xml:space="preserve">harmonic proof</w:t>
-            </w:r>
-            <w:r>
-              <w:t xml:space="preserve"> (chord-tone / vault legality check) runs </w:t>
-            </w:r>
-            <w:r>
-              <w:rPr>
-                <w:b/>
-                <w:bCs/>
-              </w:rPr>
-              <w:t xml:space="preserve">every bar</w:t>
-            </w:r>
-            <w:r>
-              <w:t xml:space="preserve">.</w:t>
+              <w:t xml:space="preserve">Scalar weight for </w:t>
+            </w:r>
+            <w:r>
+              <w:rPr>
+                <w:b/>
+                <w:bCs/>
+              </w:rPr>
+              <w:t xml:space="preserve">per-bar</w:t>
+            </w:r>
+            <w:r>
+              <w:t xml:space="preserve"> harmonic proof density (solo defaults higher).</w:t>
             </w:r>
           </w:p>
         </w:tc>
@@ -32434,17 +32684,17 @@
               <w:spacing w:after="60"/>
             </w:pPr>
             <w:r>
-              <w:t xml:space="preserve">Whether proof applies at </w:t>
-            </w:r>
-            <w:r>
-              <w:rPr>
-                <w:b/>
-                <w:bCs/>
-              </w:rPr>
-              <w:t xml:space="preserve">phrase</w:t>
-            </w:r>
-            <w:r>
-              <w:t xml:space="preserve"> anchors instead of or in addition to per-bar.</w:t>
+              <w:t xml:space="preserve">Scalar weight for </w:t>
+            </w:r>
+            <w:r>
+              <w:rPr>
+                <w:b/>
+                <w:bCs/>
+              </w:rPr>
+              <w:t xml:space="preserve">phrase-anchor</w:t>
+            </w:r>
+            <w:r>
+              <w:t xml:space="preserve"> proof (melody defaults higher).</w:t>
             </w:r>
           </w:p>
         </w:tc>
@@ -32619,7 +32869,17 @@
               <w:t xml:space="preserve">tension layer</w:t>
             </w:r>
             <w:r>
-              <w:t xml:space="preserve"> ceiling unless phrase overrides.</w:t>
+              <w:t xml:space="preserve"> ceiling </w:t>
+            </w:r>
+            <w:r>
+              <w:rPr>
+                <w:b/>
+                <w:bCs/>
+              </w:rPr>
+              <w:t xml:space="preserve">`0`–`3`</w:t>
+            </w:r>
+            <w:r>
+              <w:t xml:space="preserve"> unless phrase overrides.</w:t>
             </w:r>
           </w:p>
         </w:tc>
@@ -32658,7 +32918,27 @@
               <w:t xml:space="preserve">Space after cadences</w:t>
             </w:r>
             <w:r>
-              <w:t xml:space="preserve"> — rest/breath after resolution.</w:t>
+              <w:t xml:space="preserve"> — drives optional </w:t>
+            </w:r>
+            <w:r>
+              <w:rPr>
+                <w:b/>
+                <w:bCs/>
+              </w:rPr>
+              <w:t xml:space="preserve">rest</w:t>
+            </w:r>
+            <w:r>
+              <w:t xml:space="preserve"> inserts in </w:t>
+            </w:r>
+            <w:r>
+              <w:rPr>
+                <w:b/>
+                <w:bCs/>
+              </w:rPr>
+              <w:t xml:space="preserve">melody</w:t>
+            </w:r>
+            <w:r>
+              <w:t xml:space="preserve"> iReal path.</w:t>
             </w:r>
           </w:p>
         </w:tc>
@@ -32811,7 +33091,7 @@
           <w:b/>
           <w:bCs/>
         </w:rPr>
-        <w:t xml:space="preserve">Presets (planned):</w:t>
+        <w:t xml:space="preserve">Presets:</w:t>
       </w:r>
     </w:p>
     <w:p>
@@ -32860,7 +33140,7 @@
         <w:t xml:space="preserve">dense</w:t>
       </w:r>
       <w:r>
-        <w:t xml:space="preserve"> activity; </w:t>
+        <w:t xml:space="preserve">; </w:t>
       </w:r>
       <w:r>
         <w:rPr>
@@ -32870,7 +33150,7 @@
         <w:t xml:space="preserve">bebop</w:t>
       </w:r>
       <w:r>
-        <w:t xml:space="preserve">-leaning placement; </w:t>
+        <w:t xml:space="preserve">-leaning; </w:t>
       </w:r>
       <w:r>
         <w:rPr>
@@ -32880,17 +33160,17 @@
         <w:t xml:space="preserve">bar-reactive</w:t>
       </w:r>
       <w:r>
-        <w:t xml:space="preserve"> (harmony proof and density respond </w:t>
-      </w:r>
-      <w:r>
-        <w:rPr>
-          <w:b/>
-          <w:bCs/>
-        </w:rPr>
-        <w:t xml:space="preserve">per bar</w:t>
-      </w:r>
-      <w:r>
-        <w:t xml:space="preserve">).</w:t>
+        <w:t xml:space="preserve">; </w:t>
+      </w:r>
+      <w:r>
+        <w:rPr>
+          <w:b/>
+          <w:bCs/>
+        </w:rPr>
+        <w:t xml:space="preserve">`maxTensionLayerDefault` `2`</w:t>
+      </w:r>
+      <w:r>
+        <w:t xml:space="preserve">.</w:t>
       </w:r>
     </w:p>
     <w:p>
@@ -32959,7 +33239,307 @@
         <w:t xml:space="preserve">phrase-reactive</w:t>
       </w:r>
       <w:r>
-        <w:t xml:space="preserve"> (phrase planner leads; fewer notes per bar).</w:t>
+        <w:t xml:space="preserve">; </w:t>
+      </w:r>
+      <w:r>
+        <w:rPr>
+          <w:b/>
+          <w:bCs/>
+        </w:rPr>
+        <w:t xml:space="preserve">`maxTensionLayerDefault` `1`</w:t>
+      </w:r>
+      <w:r>
+        <w:t xml:space="preserve">.</w:t>
+      </w:r>
+    </w:p>
+    <w:p>
+      <w:pPr>
+        <w:spacing w:after="160"/>
+      </w:pPr>
+      <w:r>
+        <w:rPr>
+          <w:b/>
+          <w:bCs/>
+        </w:rPr>
+        <w:t xml:space="preserve">iReal pipeline wire-up</w:t>
+      </w:r>
+      <w:r>
+        <w:t xml:space="preserve"> (`engines/composer-os-v2/core/irealpro/irealVaultPipeline.ts`): </w:t>
+      </w:r>
+      <w:r>
+        <w:rPr>
+          <w:b/>
+          <w:bCs/>
+        </w:rPr>
+        <w:t xml:space="preserve">`GenerateFromIRealOptions`</w:t>
+      </w:r>
+      <w:r>
+        <w:t xml:space="preserve"> includes optional </w:t>
+      </w:r>
+      <w:r>
+        <w:rPr>
+          <w:b/>
+          <w:bCs/>
+        </w:rPr>
+        <w:t xml:space="preserve">`mode?: GenerationMode`</w:t>
+      </w:r>
+      <w:r>
+        <w:t xml:space="preserve"> (default </w:t>
+      </w:r>
+      <w:r>
+        <w:rPr>
+          <w:b/>
+          <w:bCs/>
+        </w:rPr>
+        <w:t xml:space="preserve">`'solo'`</w:t>
+      </w:r>
+      <w:r>
+        <w:t xml:space="preserve">). Each measure runs </w:t>
+      </w:r>
+      <w:r>
+        <w:rPr>
+          <w:b/>
+          <w:bCs/>
+        </w:rPr>
+        <w:t xml:space="preserve">`planPhrase(1, mode)`</w:t>
+      </w:r>
+      <w:r>
+        <w:t xml:space="preserve">; </w:t>
+      </w:r>
+      <w:r>
+        <w:rPr>
+          <w:b/>
+          <w:bCs/>
+        </w:rPr>
+        <w:t xml:space="preserve">`generateVaultRiff`</w:t>
+      </w:r>
+      <w:r>
+        <w:t xml:space="preserve"> uses </w:t>
+      </w:r>
+      <w:r>
+        <w:rPr>
+          <w:b/>
+          <w:bCs/>
+        </w:rPr>
+        <w:t xml:space="preserve">`phrasePlan.bars`</w:t>
+      </w:r>
+      <w:r>
+        <w:t xml:space="preserve"> and </w:t>
+      </w:r>
+      <w:r>
+        <w:rPr>
+          <w:b/>
+          <w:bCs/>
+        </w:rPr>
+        <w:t xml:space="preserve">`effectiveRiffStyle`</w:t>
+      </w:r>
+      <w:r>
+        <w:t xml:space="preserve"> (</w:t>
+      </w:r>
+      <w:r>
+        <w:rPr>
+          <w:b/>
+          <w:bCs/>
+        </w:rPr>
+        <w:t xml:space="preserve">melody</w:t>
+      </w:r>
+      <w:r>
+        <w:t xml:space="preserve"> forces </w:t>
+      </w:r>
+      <w:r>
+        <w:rPr>
+          <w:b/>
+          <w:bCs/>
+        </w:rPr>
+        <w:t xml:space="preserve">`quadratonic`</w:t>
+      </w:r>
+      <w:r>
+        <w:t xml:space="preserve"> for space / triad focus; </w:t>
+      </w:r>
+      <w:r>
+        <w:rPr>
+          <w:b/>
+          <w:bCs/>
+        </w:rPr>
+        <w:t xml:space="preserve">solo</w:t>
+      </w:r>
+      <w:r>
+        <w:t xml:space="preserve"> uses </w:t>
+      </w:r>
+      <w:r>
+        <w:rPr>
+          <w:b/>
+          <w:bCs/>
+        </w:rPr>
+        <w:t xml:space="preserve">`riffStyle`</w:t>
+      </w:r>
+      <w:r>
+        <w:t xml:space="preserve"> as before). </w:t>
+      </w:r>
+      <w:r>
+        <w:rPr>
+          <w:b/>
+          <w:bCs/>
+        </w:rPr>
+        <w:t xml:space="preserve">`postCadenceRestProbability`</w:t>
+      </w:r>
+      <w:r>
+        <w:t xml:space="preserve"> (profile): in </w:t>
+      </w:r>
+      <w:r>
+        <w:rPr>
+          <w:b/>
+          <w:bCs/>
+        </w:rPr>
+        <w:t xml:space="preserve">melody</w:t>
+      </w:r>
+      <w:r>
+        <w:t xml:space="preserve"> mode, after </w:t>
+      </w:r>
+      <w:r>
+        <w:rPr>
+          <w:b/>
+          <w:bCs/>
+        </w:rPr>
+        <w:t xml:space="preserve">odd</w:t>
+      </w:r>
+      <w:r>
+        <w:t xml:space="preserve"> bar indices (</w:t>
+      </w:r>
+      <w:r>
+        <w:rPr>
+          <w:b/>
+          <w:bCs/>
+        </w:rPr>
+        <w:t xml:space="preserve">1, 3, 5…</w:t>
+      </w:r>
+      <w:r>
+        <w:t xml:space="preserve">), </w:t>
+      </w:r>
+      <w:r>
+        <w:rPr>
+          <w:b/>
+          <w:bCs/>
+        </w:rPr>
+        <w:t xml:space="preserve">`Math.random() &lt; postCadenceRestProbability`</w:t>
+      </w:r>
+      <w:r>
+        <w:t xml:space="preserve"> appends a </w:t>
+      </w:r>
+      <w:r>
+        <w:rPr>
+          <w:b/>
+          <w:bCs/>
+        </w:rPr>
+        <w:t xml:space="preserve">rest</w:t>
+      </w:r>
+      <w:r>
+        <w:t xml:space="preserve"> </w:t>
+      </w:r>
+      <w:r>
+        <w:rPr>
+          <w:b/>
+          <w:bCs/>
+        </w:rPr>
+        <w:t xml:space="preserve">`ScoreNote`</w:t>
+      </w:r>
+      <w:r>
+        <w:t xml:space="preserve"> (</w:t>
+      </w:r>
+      <w:r>
+        <w:rPr>
+          <w:b/>
+          <w:bCs/>
+        </w:rPr>
+        <w:t xml:space="preserve">`pitch` 0</w:t>
+      </w:r>
+      <w:r>
+        <w:t xml:space="preserve">, </w:t>
+      </w:r>
+      <w:r>
+        <w:rPr>
+          <w:b/>
+          <w:bCs/>
+        </w:rPr>
+        <w:t xml:space="preserve">`duration` 0.5</w:t>
+      </w:r>
+      <w:r>
+        <w:t xml:space="preserve"> quarters). </w:t>
+      </w:r>
+      <w:r>
+        <w:rPr>
+          <w:b/>
+          <w:bCs/>
+        </w:rPr>
+        <w:t xml:space="preserve">`IRealVaultOutput`</w:t>
+      </w:r>
+      <w:r>
+        <w:t xml:space="preserve"> includes </w:t>
+      </w:r>
+      <w:r>
+        <w:rPr>
+          <w:b/>
+          <w:bCs/>
+        </w:rPr>
+        <w:t xml:space="preserve">`mode: GenerationMode`</w:t>
+      </w:r>
+      <w:r>
+        <w:t xml:space="preserve">.</w:t>
+      </w:r>
+    </w:p>
+    <w:p>
+      <w:pPr>
+        <w:spacing w:after="160"/>
+      </w:pPr>
+      <w:r>
+        <w:rPr>
+          <w:b/>
+          <w:bCs/>
+        </w:rPr>
+        <w:t xml:space="preserve">`MelodyModePlanner`</w:t>
+      </w:r>
+      <w:r>
+        <w:t xml:space="preserve"> (full orchestration above quadratonic fill) remains </w:t>
+      </w:r>
+      <w:r>
+        <w:rPr>
+          <w:b/>
+          <w:bCs/>
+        </w:rPr>
+        <w:t xml:space="preserve">future</w:t>
+      </w:r>
+      <w:r>
+        <w:t xml:space="preserve">; </w:t>
+      </w:r>
+      <w:r>
+        <w:rPr>
+          <w:b/>
+          <w:bCs/>
+        </w:rPr>
+        <w:t xml:space="preserve">`planPhrase`</w:t>
+      </w:r>
+      <w:r>
+        <w:t xml:space="preserve"> + profiles </w:t>
+      </w:r>
+      <w:r>
+        <w:rPr>
+          <w:b/>
+          <w:bCs/>
+        </w:rPr>
+        <w:t xml:space="preserve">do not replace</w:t>
+      </w:r>
+      <w:r>
+        <w:t xml:space="preserve"> the quadratonic engine — they </w:t>
+      </w:r>
+      <w:r>
+        <w:rPr>
+          <w:b/>
+          <w:bCs/>
+        </w:rPr>
+        <w:t xml:space="preserve">layer</w:t>
+      </w:r>
+      <w:r>
+        <w:t xml:space="preserve"> phrase intent and mode gates ahead of note fill where wired.</w:t>
       </w:r>
     </w:p>
     <w:p>
@@ -34944,6 +35524,16 @@
         <w:t xml:space="preserve">H</w:t>
       </w:r>
       <w:r>
+        <w:t xml:space="preserve">, </w:t>
+      </w:r>
+      <w:r>
+        <w:rPr>
+          <w:b/>
+          <w:bCs/>
+        </w:rPr>
+        <w:t xml:space="preserve">IMG</w:t>
+      </w:r>
+      <w:r>
         <w:t xml:space="preserve">, and </w:t>
       </w:r>
       <w:r>
@@ -34951,7 +35541,7 @@
           <w:b/>
           <w:bCs/>
         </w:rPr>
-        <w:t xml:space="preserve">IMG</w:t>
+        <w:t xml:space="preserve">I</w:t>
       </w:r>
       <w:r>
         <w:t xml:space="preserve"> are </w:t>
@@ -34964,202 +35554,162 @@
         <w:t xml:space="preserve">complete</w:t>
       </w:r>
       <w:r>
-        <w:t xml:space="preserve">. Remaining Tonality Vault build order: </w:t>
-      </w:r>
-      <w:r>
-        <w:rPr>
-          <w:b/>
-          <w:bCs/>
-        </w:rPr>
-        <w:t xml:space="preserve">I → UI</w:t>
-      </w:r>
-      <w:r>
-        <w:t xml:space="preserve"> only (</w:t>
-      </w:r>
-      <w:r>
-        <w:rPr>
-          <w:b/>
-          <w:bCs/>
-        </w:rPr>
-        <w:t xml:space="preserve">IMG</w:t>
-      </w:r>
-      <w:r>
-        <w:t xml:space="preserve"> is done — do not sequence </w:t>
-      </w:r>
-      <w:r>
-        <w:rPr>
-          <w:b/>
-          <w:bCs/>
-        </w:rPr>
-        <w:t xml:space="preserve">IMG</w:t>
-      </w:r>
-      <w:r>
-        <w:t xml:space="preserve"> ahead of </w:t>
-      </w:r>
-      <w:r>
-        <w:rPr>
-          <w:b/>
-          <w:bCs/>
-        </w:rPr>
-        <w:t xml:space="preserve">I</w:t>
-      </w:r>
-      <w:r>
-        <w:t xml:space="preserve"> or </w:t>
-      </w:r>
-      <w:r>
-        <w:rPr>
-          <w:b/>
-          <w:bCs/>
-        </w:rPr>
-        <w:t xml:space="preserve">UI</w:t>
+        <w:t xml:space="preserve">. </w:t>
+      </w:r>
+      <w:r>
+        <w:rPr>
+          <w:b/>
+          <w:bCs/>
+        </w:rPr>
+        <w:t xml:space="preserve">Only</w:t>
+      </w:r>
+      <w:r>
+        <w:t xml:space="preserve"> remaining Tonality Vault build: </w:t>
+      </w:r>
+      <w:r>
+        <w:rPr>
+          <w:b/>
+          <w:bCs/>
+        </w:rPr>
+        <w:t xml:space="preserve">Build UI</w:t>
+      </w:r>
+      <w:r>
+        <w:t xml:space="preserve"> (visual fretboard / microscope stack).</w:t>
+      </w:r>
+    </w:p>
+    <w:p>
+      <w:pPr>
+        <w:spacing w:after="160"/>
+      </w:pPr>
+      <w:r>
+        <w:rPr>
+          <w:b/>
+          <w:bCs/>
+        </w:rPr>
+        <w:t xml:space="preserve">Next:</w:t>
+      </w:r>
+      <w:r>
+        <w:t xml:space="preserve"> </w:t>
+      </w:r>
+      <w:r>
+        <w:rPr>
+          <w:b/>
+          <w:bCs/>
+        </w:rPr>
+        <w:t xml:space="preserve">Build UI</w:t>
+      </w:r>
+      <w:r>
+        <w:t xml:space="preserve"> — </w:t>
+      </w:r>
+      <w:r>
+        <w:rPr>
+          <w:b/>
+          <w:bCs/>
+        </w:rPr>
+        <w:t xml:space="preserve">five</w:t>
+      </w:r>
+      <w:r>
+        <w:t xml:space="preserve"> roadmap iterations: </w:t>
+      </w:r>
+      <w:r>
+        <w:rPr>
+          <w:b/>
+          <w:bCs/>
+        </w:rPr>
+        <w:t xml:space="preserve">layer toggles</w:t>
+      </w:r>
+      <w:r>
+        <w:t xml:space="preserve"> → </w:t>
+      </w:r>
+      <w:r>
+        <w:rPr>
+          <w:b/>
+          <w:bCs/>
+        </w:rPr>
+        <w:t xml:space="preserve">playback trail</w:t>
+      </w:r>
+      <w:r>
+        <w:t xml:space="preserve"> → </w:t>
+      </w:r>
+      <w:r>
+        <w:rPr>
+          <w:b/>
+          <w:bCs/>
+        </w:rPr>
+        <w:t xml:space="preserve">export pipeline</w:t>
+      </w:r>
+      <w:r>
+        <w:t xml:space="preserve"> (</w:t>
+      </w:r>
+      <w:r>
+        <w:rPr>
+          <w:b/>
+          <w:bCs/>
+        </w:rPr>
+        <w:t xml:space="preserve">`svgToPng`</w:t>
+      </w:r>
+      <w:r>
+        <w:t xml:space="preserve">) → </w:t>
+      </w:r>
+      <w:r>
+        <w:rPr>
+          <w:b/>
+          <w:bCs/>
+        </w:rPr>
+        <w:t xml:space="preserve">responsive / dark mode</w:t>
+      </w:r>
+      <w:r>
+        <w:t xml:space="preserve"> → </w:t>
+      </w:r>
+      <w:r>
+        <w:rPr>
+          <w:b/>
+          <w:bCs/>
+        </w:rPr>
+        <w:t xml:space="preserve">Vault microscope</w:t>
+      </w:r>
+      <w:r>
+        <w:t xml:space="preserve"> scrubber (</w:t>
+      </w:r>
+      <w:r>
+        <w:rPr>
+          <w:b/>
+          <w:bCs/>
+        </w:rPr>
+        <w:t xml:space="preserve">fretboard.js</w:t>
+      </w:r>
+      <w:r>
+        <w:t xml:space="preserve"> + </w:t>
+      </w:r>
+      <w:r>
+        <w:rPr>
+          <w:b/>
+          <w:bCs/>
+        </w:rPr>
+        <w:t xml:space="preserve">VexFlow</w:t>
+      </w:r>
+      <w:r>
+        <w:t xml:space="preserve">; extend </w:t>
+      </w:r>
+      <w:r>
+        <w:rPr>
+          <w:b/>
+          <w:bCs/>
+        </w:rPr>
+        <w:t xml:space="preserve">FretboardPanel</w:t>
+      </w:r>
+      <w:r>
+        <w:t xml:space="preserve">, </w:t>
+      </w:r>
+      <w:r>
+        <w:rPr>
+          <w:b/>
+          <w:bCs/>
+        </w:rPr>
+        <w:t xml:space="preserve">TabPanel</w:t>
       </w:r>
       <w:r>
         <w:t xml:space="preserve">).</w:t>
-      </w:r>
-    </w:p>
-    <w:p>
-      <w:pPr>
-        <w:spacing w:after="160"/>
-      </w:pPr>
-      <w:r>
-        <w:rPr>
-          <w:b/>
-          <w:bCs/>
-        </w:rPr>
-        <w:t xml:space="preserve">Next:</w:t>
-      </w:r>
-      <w:r>
-        <w:t xml:space="preserve"> </w:t>
-      </w:r>
-      <w:r>
-        <w:rPr>
-          <w:b/>
-          <w:bCs/>
-        </w:rPr>
-        <w:t xml:space="preserve">Build I</w:t>
-      </w:r>
-      <w:r>
-        <w:t xml:space="preserve"> — </w:t>
-      </w:r>
-      <w:r>
-        <w:rPr>
-          <w:b/>
-          <w:bCs/>
-        </w:rPr>
-        <w:t xml:space="preserve">Generation Mode Profiles</w:t>
-      </w:r>
-      <w:r>
-        <w:t xml:space="preserve"> (</w:t>
-      </w:r>
-      <w:r>
-        <w:rPr>
-          <w:b/>
-          <w:bCs/>
-        </w:rPr>
-        <w:t xml:space="preserve">Solo</w:t>
-      </w:r>
-      <w:r>
-        <w:t xml:space="preserve"> vs </w:t>
-      </w:r>
-      <w:r>
-        <w:rPr>
-          <w:b/>
-          <w:bCs/>
-        </w:rPr>
-        <w:t xml:space="preserve">Melody</w:t>
-      </w:r>
-      <w:r>
-        <w:t xml:space="preserve">). </w:t>
-      </w:r>
-      <w:r>
-        <w:rPr>
-          <w:b/>
-          <w:bCs/>
-        </w:rPr>
-        <w:t xml:space="preserve">Then:</w:t>
-      </w:r>
-      <w:r>
-        <w:t xml:space="preserve"> </w:t>
-      </w:r>
-      <w:r>
-        <w:rPr>
-          <w:b/>
-          <w:bCs/>
-        </w:rPr>
-        <w:t xml:space="preserve">Build UI</w:t>
-      </w:r>
-      <w:r>
-        <w:t xml:space="preserve"> — </w:t>
-      </w:r>
-      <w:r>
-        <w:rPr>
-          <w:b/>
-          <w:bCs/>
-        </w:rPr>
-        <w:t xml:space="preserve">6–8</w:t>
-      </w:r>
-      <w:r>
-        <w:t xml:space="preserve"> iteration </w:t>
-      </w:r>
-      <w:r>
-        <w:rPr>
-          <w:b/>
-          <w:bCs/>
-        </w:rPr>
-        <w:t xml:space="preserve">dedicated session</w:t>
-      </w:r>
-      <w:r>
-        <w:t xml:space="preserve"> (</w:t>
-      </w:r>
-      <w:r>
-        <w:rPr>
-          <w:b/>
-          <w:bCs/>
-        </w:rPr>
-        <w:t xml:space="preserve">fretboard.js</w:t>
-      </w:r>
-      <w:r>
-        <w:t xml:space="preserve"> + </w:t>
-      </w:r>
-      <w:r>
-        <w:rPr>
-          <w:b/>
-          <w:bCs/>
-        </w:rPr>
-        <w:t xml:space="preserve">VexFlow</w:t>
-      </w:r>
-      <w:r>
-        <w:t xml:space="preserve">; </w:t>
-      </w:r>
-      <w:r>
-        <w:rPr>
-          <w:b/>
-          <w:bCs/>
-        </w:rPr>
-        <w:t xml:space="preserve">FretboardPanel</w:t>
-      </w:r>
-      <w:r>
-        <w:t xml:space="preserve">, </w:t>
-      </w:r>
-      <w:r>
-        <w:rPr>
-          <w:b/>
-          <w:bCs/>
-        </w:rPr>
-        <w:t xml:space="preserve">TabPanel</w:t>
-      </w:r>
-      <w:r>
-        <w:t xml:space="preserve">, </w:t>
-      </w:r>
-      <w:r>
-        <w:rPr>
-          <w:b/>
-          <w:bCs/>
-        </w:rPr>
-        <w:t xml:space="preserve">Vault microscope</w:t>
-      </w:r>
-      <w:r>
-        <w:t xml:space="preserve">, layout / dark mode).</w:t>
       </w:r>
     </w:p>
     <w:p>

</xml_diff>

<commit_message>
docs: Chord Inspector documented — inspect any chord symbol, MusicXML export, UI wired
Co-authored-by: Cursor <cursoragent@cursor.com>
</commit_message>
<xml_diff>
--- a/docs/COMPOSER_OS_PLAYBOOK.docx
+++ b/docs/COMPOSER_OS_PLAYBOOK.docx
@@ -6737,6 +6737,363 @@
       </w:r>
       <w:r>
         <w:t xml:space="preserve">.</w:t>
+      </w:r>
+    </w:p>
+    <w:p>
+      <w:pPr>
+        <w:pStyle w:val="Heading1"/>
+        <w:spacing w:after="120" w:before="200"/>
+      </w:pPr>
+      <w:r>
+        <w:t xml:space="preserve">Chord Inspector</w:t>
+      </w:r>
+    </w:p>
+    <w:p>
+      <w:pPr>
+        <w:spacing w:after="160"/>
+      </w:pPr>
+      <w:r>
+        <w:rPr>
+          <w:b/>
+          <w:bCs/>
+        </w:rPr>
+        <w:t xml:space="preserve">API</w:t>
+      </w:r>
+      <w:r>
+        <w:t xml:space="preserve"> (`engines/composer-os-v2/core/irealpro/`):</w:t>
+      </w:r>
+    </w:p>
+    <w:p>
+      <w:pPr>
+        <w:spacing w:after="80"/>
+        <w:ind w:left="360" w:hanging="260"/>
+      </w:pPr>
+      <w:r>
+        <w:t xml:space="preserve">• </w:t>
+      </w:r>
+      <w:r>
+        <w:rPr>
+          <w:b/>
+          <w:bCs/>
+        </w:rPr>
+        <w:t xml:space="preserve">`inspectChordSymbol(input, tuningId?)`</w:t>
+      </w:r>
+      <w:r>
+        <w:t xml:space="preserve"> — Parses any chord symbol string (e.g. </w:t>
+      </w:r>
+      <w:r>
+        <w:rPr>
+          <w:b/>
+          <w:bCs/>
+        </w:rPr>
+        <w:t xml:space="preserve">Cmaj7</w:t>
+      </w:r>
+      <w:r>
+        <w:t xml:space="preserve">, </w:t>
+      </w:r>
+      <w:r>
+        <w:rPr>
+          <w:b/>
+          <w:bCs/>
+        </w:rPr>
+        <w:t xml:space="preserve">F#min9</w:t>
+      </w:r>
+      <w:r>
+        <w:t xml:space="preserve">, </w:t>
+      </w:r>
+      <w:r>
+        <w:rPr>
+          <w:b/>
+          <w:bCs/>
+        </w:rPr>
+        <w:t xml:space="preserve">Bb7#11</w:t>
+      </w:r>
+      <w:r>
+        <w:t xml:space="preserve">), maps it to the Tonality Vault, and returns a </w:t>
+      </w:r>
+      <w:r>
+        <w:rPr>
+          <w:b/>
+          <w:bCs/>
+        </w:rPr>
+        <w:t xml:space="preserve">`ChordInspectorResult`</w:t>
+      </w:r>
+      <w:r>
+        <w:t xml:space="preserve">: vault chord type id, </w:t>
+      </w:r>
+      <w:r>
+        <w:rPr>
+          <w:b/>
+          <w:bCs/>
+        </w:rPr>
+        <w:t xml:space="preserve">melodic triad</w:t>
+      </w:r>
+      <w:r>
+        <w:t xml:space="preserve"> pitch classes, </w:t>
+      </w:r>
+      <w:r>
+        <w:rPr>
+          <w:b/>
+          <w:bCs/>
+        </w:rPr>
+        <w:t xml:space="preserve">primary tension</w:t>
+      </w:r>
+      <w:r>
+        <w:t xml:space="preserve"> note (pitch class), </w:t>
+      </w:r>
+      <w:r>
+        <w:rPr>
+          <w:b/>
+          <w:bCs/>
+        </w:rPr>
+        <w:t xml:space="preserve">quadratonic</w:t>
+      </w:r>
+      <w:r>
+        <w:t xml:space="preserve"> pitch classes, and </w:t>
+      </w:r>
+      <w:r>
+        <w:rPr>
+          <w:b/>
+          <w:bCs/>
+        </w:rPr>
+        <w:t xml:space="preserve">guitar grips</w:t>
+      </w:r>
+      <w:r>
+        <w:t xml:space="preserve"> (`FretboardRealization[]`) for the chosen tuning (`tuningId` optional; default </w:t>
+      </w:r>
+      <w:r>
+        <w:rPr>
+          <w:b/>
+          <w:bCs/>
+        </w:rPr>
+        <w:t xml:space="preserve">standard</w:t>
+      </w:r>
+      <w:r>
+        <w:t xml:space="preserve">).</w:t>
+      </w:r>
+    </w:p>
+    <w:p>
+      <w:pPr>
+        <w:spacing w:after="80"/>
+        <w:ind w:left="360" w:hanging="260"/>
+      </w:pPr>
+      <w:r>
+        <w:t xml:space="preserve">• </w:t>
+      </w:r>
+      <w:r>
+        <w:rPr>
+          <w:b/>
+          <w:bCs/>
+        </w:rPr>
+        <w:t xml:space="preserve">`inspectChordToMusicXml(input, options?)`</w:t>
+      </w:r>
+      <w:r>
+        <w:t xml:space="preserve"> — Chains the inspector to </w:t>
+      </w:r>
+      <w:r>
+        <w:rPr>
+          <w:b/>
+          <w:bCs/>
+        </w:rPr>
+        <w:t xml:space="preserve">`generateVaultRiff`</w:t>
+      </w:r>
+      <w:r>
+        <w:t xml:space="preserve"> (`vaultRiffGenerator.ts`) and emits a minimal valid </w:t>
+      </w:r>
+      <w:r>
+        <w:rPr>
+          <w:b/>
+          <w:bCs/>
+        </w:rPr>
+        <w:t xml:space="preserve">MusicXML</w:t>
+      </w:r>
+      <w:r>
+        <w:t xml:space="preserve"> string (4/4, treble clef): </w:t>
+      </w:r>
+      <w:r>
+        <w:rPr>
+          <w:b/>
+          <w:bCs/>
+        </w:rPr>
+        <w:t xml:space="preserve">`ScoreNote`</w:t>
+      </w:r>
+      <w:r>
+        <w:t xml:space="preserve"> rows become written pitches with </w:t>
+      </w:r>
+      <w:r>
+        <w:rPr>
+          <w:b/>
+          <w:bCs/>
+        </w:rPr>
+        <w:t xml:space="preserve">`&lt;notations&gt;&lt;technical&gt;&lt;string/&gt;&lt;fret/&gt;&lt;/technical&gt;&lt;/notations&gt;`</w:t>
+      </w:r>
+      <w:r>
+        <w:t xml:space="preserve"> where string/fret are present. Options include </w:t>
+      </w:r>
+      <w:r>
+        <w:rPr>
+          <w:b/>
+          <w:bCs/>
+        </w:rPr>
+        <w:t xml:space="preserve">`bars`</w:t>
+      </w:r>
+      <w:r>
+        <w:t xml:space="preserve"> (1, 2, or 4), </w:t>
+      </w:r>
+      <w:r>
+        <w:rPr>
+          <w:b/>
+          <w:bCs/>
+        </w:rPr>
+        <w:t xml:space="preserve">`mode`</w:t>
+      </w:r>
+      <w:r>
+        <w:t xml:space="preserve"> (solo / melody; steers default riff style), </w:t>
+      </w:r>
+      <w:r>
+        <w:rPr>
+          <w:b/>
+          <w:bCs/>
+        </w:rPr>
+        <w:t xml:space="preserve">`tuningId`</w:t>
+      </w:r>
+      <w:r>
+        <w:t xml:space="preserve">, and </w:t>
+      </w:r>
+      <w:r>
+        <w:rPr>
+          <w:b/>
+          <w:bCs/>
+        </w:rPr>
+        <w:t xml:space="preserve">`riffStyle`</w:t>
+      </w:r>
+      <w:r>
+        <w:t xml:space="preserve">.</w:t>
+      </w:r>
+    </w:p>
+    <w:p>
+      <w:pPr>
+        <w:spacing w:after="160"/>
+      </w:pPr>
+      <w:r>
+        <w:rPr>
+          <w:b/>
+          <w:bCs/>
+        </w:rPr>
+        <w:t xml:space="preserve">UI</w:t>
+      </w:r>
+      <w:r>
+        <w:t xml:space="preserve"> (`apps/composer-os-app/src/pages/HomeGenerate.tsx`): Collapsible </w:t>
+      </w:r>
+      <w:r>
+        <w:rPr>
+          <w:b/>
+          <w:bCs/>
+        </w:rPr>
+        <w:t xml:space="preserve">Chord Inspector</w:t>
+      </w:r>
+      <w:r>
+        <w:t xml:space="preserve"> block — chord symbol text input, </w:t>
+      </w:r>
+      <w:r>
+        <w:rPr>
+          <w:b/>
+          <w:bCs/>
+        </w:rPr>
+        <w:t xml:space="preserve">Solo</w:t>
+      </w:r>
+      <w:r>
+        <w:t xml:space="preserve"> / </w:t>
+      </w:r>
+      <w:r>
+        <w:rPr>
+          <w:b/>
+          <w:bCs/>
+        </w:rPr>
+        <w:t xml:space="preserve">Melody</w:t>
+      </w:r>
+      <w:r>
+        <w:t xml:space="preserve"> mode toggle, </w:t>
+      </w:r>
+      <w:r>
+        <w:rPr>
+          <w:b/>
+          <w:bCs/>
+        </w:rPr>
+        <w:t xml:space="preserve">bars</w:t>
+      </w:r>
+      <w:r>
+        <w:t xml:space="preserve"> selector (1 / 2 / 4), </w:t>
+      </w:r>
+      <w:r>
+        <w:rPr>
+          <w:b/>
+          <w:bCs/>
+        </w:rPr>
+        <w:t xml:space="preserve">riff style</w:t>
+      </w:r>
+      <w:r>
+        <w:t xml:space="preserve"> dropdown, </w:t>
+      </w:r>
+      <w:r>
+        <w:rPr>
+          <w:b/>
+          <w:bCs/>
+        </w:rPr>
+        <w:t xml:space="preserve">tuning</w:t>
+      </w:r>
+      <w:r>
+        <w:t xml:space="preserve"> dropdown. </w:t>
+      </w:r>
+      <w:r>
+        <w:rPr>
+          <w:b/>
+          <w:bCs/>
+        </w:rPr>
+        <w:t xml:space="preserve">Inspect Chord</w:t>
+      </w:r>
+      <w:r>
+        <w:t xml:space="preserve"> shows the Vault breakdown. </w:t>
+      </w:r>
+      <w:r>
+        <w:rPr>
+          <w:b/>
+          <w:bCs/>
+        </w:rPr>
+        <w:t xml:space="preserve">Generate + Export MusicXML</w:t>
+      </w:r>
+      <w:r>
+        <w:t xml:space="preserve"> triggers a browser download of a </w:t>
+      </w:r>
+      <w:r>
+        <w:rPr>
+          <w:b/>
+          <w:bCs/>
+        </w:rPr>
+        <w:t xml:space="preserve">`.xml`</w:t>
+      </w:r>
+      <w:r>
+        <w:t xml:space="preserve"> file ready for </w:t>
+      </w:r>
+      <w:r>
+        <w:rPr>
+          <w:b/>
+          <w:bCs/>
+        </w:rPr>
+        <w:t xml:space="preserve">Sibelius</w:t>
+      </w:r>
+      <w:r>
+        <w:t xml:space="preserve"> and </w:t>
+      </w:r>
+      <w:r>
+        <w:rPr>
+          <w:b/>
+          <w:bCs/>
+        </w:rPr>
+        <w:t xml:space="preserve">Guitar Pro 8</w:t>
+      </w:r>
+      <w:r>
+        <w:t xml:space="preserve"> (GP8).</w:t>
       </w:r>
     </w:p>
     <w:p>

</xml_diff>

<commit_message>
docs: Build UI complete — VaultMicroscope, FretboardPanel full feature set, entire Tonality Vault roadmap shipped
Co-authored-by: Cursor <cursoragent@cursor.com>
</commit_message>
<xml_diff>
--- a/docs/COMPOSER_OS_PLAYBOOK.docx
+++ b/docs/COMPOSER_OS_PLAYBOOK.docx
@@ -7094,6 +7094,597 @@
       </w:r>
       <w:r>
         <w:t xml:space="preserve"> (GP8).</w:t>
+      </w:r>
+    </w:p>
+    <w:p>
+      <w:pPr>
+        <w:pStyle w:val="Heading1"/>
+        <w:spacing w:after="120" w:before="200"/>
+      </w:pPr>
+      <w:r>
+        <w:t xml:space="preserve">Tonality Vault — Build UI (complete)</w:t>
+      </w:r>
+    </w:p>
+    <w:p>
+      <w:pPr>
+        <w:spacing w:after="160"/>
+      </w:pPr>
+      <w:r>
+        <w:rPr>
+          <w:b/>
+          <w:bCs/>
+        </w:rPr>
+        <w:t xml:space="preserve">Summary:</w:t>
+      </w:r>
+      <w:r>
+        <w:t xml:space="preserve"> All Tonality Vault builds </w:t>
+      </w:r>
+      <w:r>
+        <w:rPr>
+          <w:b/>
+          <w:bCs/>
+        </w:rPr>
+        <w:t xml:space="preserve">A</w:t>
+      </w:r>
+      <w:r>
+        <w:t xml:space="preserve"> through </w:t>
+      </w:r>
+      <w:r>
+        <w:rPr>
+          <w:b/>
+          <w:bCs/>
+        </w:rPr>
+        <w:t xml:space="preserve">I</w:t>
+      </w:r>
+      <w:r>
+        <w:t xml:space="preserve"> plus </w:t>
+      </w:r>
+      <w:r>
+        <w:rPr>
+          <w:b/>
+          <w:bCs/>
+        </w:rPr>
+        <w:t xml:space="preserve">C2</w:t>
+      </w:r>
+      <w:r>
+        <w:t xml:space="preserve">, </w:t>
+      </w:r>
+      <w:r>
+        <w:rPr>
+          <w:b/>
+          <w:bCs/>
+        </w:rPr>
+        <w:t xml:space="preserve">IMG</w:t>
+      </w:r>
+      <w:r>
+        <w:t xml:space="preserve">, and </w:t>
+      </w:r>
+      <w:r>
+        <w:rPr>
+          <w:b/>
+          <w:bCs/>
+        </w:rPr>
+        <w:t xml:space="preserve">UI</w:t>
+      </w:r>
+      <w:r>
+        <w:t xml:space="preserve"> are now complete. The full Tonality Vault roadmap is shipped.</w:t>
+      </w:r>
+    </w:p>
+    <w:p>
+      <w:pPr>
+        <w:pStyle w:val="Heading2"/>
+        <w:spacing w:after="100" w:before="160"/>
+      </w:pPr>
+      <w:r>
+        <w:t xml:space="preserve">UI iterations (1–5)</w:t>
+      </w:r>
+    </w:p>
+    <w:p>
+      <w:pPr>
+        <w:spacing w:after="160"/>
+      </w:pPr>
+      <w:r>
+        <w:t xml:space="preserve">1. </w:t>
+      </w:r>
+      <w:r>
+        <w:rPr>
+          <w:b/>
+          <w:bCs/>
+        </w:rPr>
+        <w:t xml:space="preserve">Iteration 1 — Fretboard + tab scaffold:</w:t>
+      </w:r>
+      <w:r>
+        <w:t xml:space="preserve"> </w:t>
+      </w:r>
+      <w:r>
+        <w:rPr>
+          <w:b/>
+          <w:bCs/>
+        </w:rPr>
+        <w:t xml:space="preserve">`FretboardPanel`</w:t>
+      </w:r>
+      <w:r>
+        <w:t xml:space="preserve"> (fretboard.js) and </w:t>
+      </w:r>
+      <w:r>
+        <w:rPr>
+          <w:b/>
+          <w:bCs/>
+        </w:rPr>
+        <w:t xml:space="preserve">`TabPanel`</w:t>
+      </w:r>
+      <w:r>
+        <w:t xml:space="preserve"> (VexFlow) with </w:t>
+      </w:r>
+      <w:r>
+        <w:rPr>
+          <w:b/>
+          <w:bCs/>
+        </w:rPr>
+        <w:t xml:space="preserve">role colour encoding</w:t>
+      </w:r>
+      <w:r>
+        <w:t xml:space="preserve"> — </w:t>
+      </w:r>
+      <w:r>
+        <w:rPr>
+          <w:b/>
+          <w:bCs/>
+        </w:rPr>
+        <w:t xml:space="preserve">`triadRoot`</w:t>
+      </w:r>
+      <w:r>
+        <w:t xml:space="preserve"> green, </w:t>
+      </w:r>
+      <w:r>
+        <w:rPr>
+          <w:b/>
+          <w:bCs/>
+        </w:rPr>
+        <w:t xml:space="preserve">`primaryTension`</w:t>
+      </w:r>
+      <w:r>
+        <w:t xml:space="preserve"> amber, </w:t>
+      </w:r>
+      <w:r>
+        <w:rPr>
+          <w:b/>
+          <w:bCs/>
+        </w:rPr>
+        <w:t xml:space="preserve">`secondaryTension`</w:t>
+      </w:r>
+      <w:r>
+        <w:t xml:space="preserve"> orange, </w:t>
+      </w:r>
+      <w:r>
+        <w:rPr>
+          <w:b/>
+          <w:bCs/>
+        </w:rPr>
+        <w:t xml:space="preserve">`triadPairTension`</w:t>
+      </w:r>
+      <w:r>
+        <w:t xml:space="preserve"> red, </w:t>
+      </w:r>
+      <w:r>
+        <w:rPr>
+          <w:b/>
+          <w:bCs/>
+        </w:rPr>
+        <w:t xml:space="preserve">`bebopPassing`</w:t>
+      </w:r>
+      <w:r>
+        <w:t xml:space="preserve"> purple, </w:t>
+      </w:r>
+      <w:r>
+        <w:rPr>
+          <w:b/>
+          <w:bCs/>
+        </w:rPr>
+        <w:t xml:space="preserve">`chaos`</w:t>
+      </w:r>
+      <w:r>
+        <w:t xml:space="preserve"> pink. 2. </w:t>
+      </w:r>
+      <w:r>
+        <w:rPr>
+          <w:b/>
+          <w:bCs/>
+        </w:rPr>
+        <w:t xml:space="preserve">Iteration 2 — Layers + legality chrome:</w:t>
+      </w:r>
+      <w:r>
+        <w:t xml:space="preserve"> </w:t>
+      </w:r>
+      <w:r>
+        <w:rPr>
+          <w:b/>
+          <w:bCs/>
+        </w:rPr>
+        <w:t xml:space="preserve">`LayerToggleBar`</w:t>
+      </w:r>
+      <w:r>
+        <w:t xml:space="preserve"> — four buttons </w:t>
+      </w:r>
+      <w:r>
+        <w:rPr>
+          <w:b/>
+          <w:bCs/>
+        </w:rPr>
+        <w:t xml:space="preserve">L0–L3</w:t>
+      </w:r>
+      <w:r>
+        <w:t xml:space="preserve">; </w:t>
+      </w:r>
+      <w:r>
+        <w:rPr>
+          <w:b/>
+          <w:bCs/>
+        </w:rPr>
+        <w:t xml:space="preserve">beat legality</w:t>
+      </w:r>
+      <w:r>
+        <w:t xml:space="preserve"> visual indicators (</w:t>
+      </w:r>
+      <w:r>
+        <w:rPr>
+          <w:b/>
+          <w:bCs/>
+        </w:rPr>
+        <w:t xml:space="preserve">strong</w:t>
+      </w:r>
+      <w:r>
+        <w:t xml:space="preserve"> = solid, </w:t>
+      </w:r>
+      <w:r>
+        <w:rPr>
+          <w:b/>
+          <w:bCs/>
+        </w:rPr>
+        <w:t xml:space="preserve">weak</w:t>
+      </w:r>
+      <w:r>
+        <w:t xml:space="preserve"> = half opacity, </w:t>
+      </w:r>
+      <w:r>
+        <w:rPr>
+          <w:b/>
+          <w:bCs/>
+        </w:rPr>
+        <w:t xml:space="preserve">syncopated</w:t>
+      </w:r>
+      <w:r>
+        <w:t xml:space="preserve"> = dashed, </w:t>
+      </w:r>
+      <w:r>
+        <w:rPr>
+          <w:b/>
+          <w:bCs/>
+        </w:rPr>
+        <w:t xml:space="preserve">approachOnly</w:t>
+      </w:r>
+      <w:r>
+        <w:t xml:space="preserve"> = hollow); </w:t>
+      </w:r>
+      <w:r>
+        <w:rPr>
+          <w:b/>
+          <w:bCs/>
+        </w:rPr>
+        <w:t xml:space="preserve">note click</w:t>
+      </w:r>
+      <w:r>
+        <w:t xml:space="preserve"> handler. 3. </w:t>
+      </w:r>
+      <w:r>
+        <w:rPr>
+          <w:b/>
+          <w:bCs/>
+        </w:rPr>
+        <w:t xml:space="preserve">Iteration 3 — Playback trail:</w:t>
+      </w:r>
+      <w:r>
+        <w:t xml:space="preserve"> </w:t>
+      </w:r>
+      <w:r>
+        <w:rPr>
+          <w:b/>
+          <w:bCs/>
+        </w:rPr>
+        <w:t xml:space="preserve">`playbackNotes`</w:t>
+      </w:r>
+      <w:r>
+        <w:t xml:space="preserve"> with glow, </w:t>
+      </w:r>
+      <w:r>
+        <w:rPr>
+          <w:b/>
+          <w:bCs/>
+        </w:rPr>
+        <w:t xml:space="preserve">`trailNotes`</w:t>
+      </w:r>
+      <w:r>
+        <w:t xml:space="preserve"> at </w:t>
+      </w:r>
+      <w:r>
+        <w:rPr>
+          <w:b/>
+          <w:bCs/>
+        </w:rPr>
+        <w:t xml:space="preserve">30%</w:t>
+      </w:r>
+      <w:r>
+        <w:t xml:space="preserve"> opacity, </w:t>
+      </w:r>
+      <w:r>
+        <w:rPr>
+          <w:b/>
+          <w:bCs/>
+        </w:rPr>
+        <w:t xml:space="preserve">position band</w:t>
+      </w:r>
+      <w:r>
+        <w:t xml:space="preserve"> overlay with CSS transition, </w:t>
+      </w:r>
+      <w:r>
+        <w:rPr>
+          <w:b/>
+          <w:bCs/>
+        </w:rPr>
+        <w:t xml:space="preserve">`positionLock`</w:t>
+      </w:r>
+      <w:r>
+        <w:t xml:space="preserve"> indicator. 4. </w:t>
+      </w:r>
+      <w:r>
+        <w:rPr>
+          <w:b/>
+          <w:bCs/>
+        </w:rPr>
+        <w:t xml:space="preserve">Iteration 4 — Export + layout:</w:t>
+      </w:r>
+      <w:r>
+        <w:t xml:space="preserve"> </w:t>
+      </w:r>
+      <w:r>
+        <w:rPr>
+          <w:b/>
+          <w:bCs/>
+        </w:rPr>
+        <w:t xml:space="preserve">`FretboardExporter`</w:t>
+      </w:r>
+      <w:r>
+        <w:t xml:space="preserve"> PNG (</w:t>
+      </w:r>
+      <w:r>
+        <w:rPr>
+          <w:b/>
+          <w:bCs/>
+        </w:rPr>
+        <w:t xml:space="preserve">SVG → Canvas → PNG</w:t>
+      </w:r>
+      <w:r>
+        <w:t xml:space="preserve"> download), </w:t>
+      </w:r>
+      <w:r>
+        <w:rPr>
+          <w:b/>
+          <w:bCs/>
+        </w:rPr>
+        <w:t xml:space="preserve">dark mode</w:t>
+      </w:r>
+      <w:r>
+        <w:t xml:space="preserve"> (</w:t>
+      </w:r>
+      <w:r>
+        <w:rPr>
+          <w:b/>
+          <w:bCs/>
+        </w:rPr>
+        <w:t xml:space="preserve">#1a1a2e</w:t>
+      </w:r>
+      <w:r>
+        <w:t xml:space="preserve"> background), responsive </w:t>
+      </w:r>
+      <w:r>
+        <w:rPr>
+          <w:b/>
+          <w:bCs/>
+        </w:rPr>
+        <w:t xml:space="preserve">16:9</w:t>
+      </w:r>
+      <w:r>
+        <w:t xml:space="preserve"> layout. 5. </w:t>
+      </w:r>
+      <w:r>
+        <w:rPr>
+          <w:b/>
+          <w:bCs/>
+        </w:rPr>
+        <w:t xml:space="preserve">Iteration 5 — Vault Microscope:</w:t>
+      </w:r>
+      <w:r>
+        <w:t xml:space="preserve"> </w:t>
+      </w:r>
+      <w:r>
+        <w:rPr>
+          <w:b/>
+          <w:bCs/>
+        </w:rPr>
+        <w:t xml:space="preserve">`VaultMicroscope`</w:t>
+      </w:r>
+      <w:r>
+        <w:t xml:space="preserve"> — scrubber </w:t>
+      </w:r>
+      <w:r>
+        <w:rPr>
+          <w:b/>
+          <w:bCs/>
+        </w:rPr>
+        <w:t xml:space="preserve">0 … totalBars×4</w:t>
+      </w:r>
+      <w:r>
+        <w:t xml:space="preserve"> (beats), </w:t>
+      </w:r>
+      <w:r>
+        <w:rPr>
+          <w:b/>
+          <w:bCs/>
+        </w:rPr>
+        <w:t xml:space="preserve">Play / Pause / Stop</w:t>
+      </w:r>
+      <w:r>
+        <w:t xml:space="preserve"> (advance </w:t>
+      </w:r>
+      <w:r>
+        <w:rPr>
+          <w:b/>
+          <w:bCs/>
+        </w:rPr>
+        <w:t xml:space="preserve">0.5</w:t>
+      </w:r>
+      <w:r>
+        <w:t xml:space="preserve"> beat / </w:t>
+      </w:r>
+      <w:r>
+        <w:rPr>
+          <w:b/>
+          <w:bCs/>
+        </w:rPr>
+        <w:t xml:space="preserve">500ms</w:t>
+      </w:r>
+      <w:r>
+        <w:t xml:space="preserve">); </w:t>
+      </w:r>
+      <w:r>
+        <w:rPr>
+          <w:b/>
+          <w:bCs/>
+        </w:rPr>
+        <w:t xml:space="preserve">`TensionState`</w:t>
+      </w:r>
+      <w:r>
+        <w:t xml:space="preserve"> badge (</w:t>
+      </w:r>
+      <w:r>
+        <w:rPr>
+          <w:b/>
+          <w:bCs/>
+        </w:rPr>
+        <w:t xml:space="preserve">resolve</w:t>
+      </w:r>
+      <w:r>
+        <w:t xml:space="preserve"> green, </w:t>
+      </w:r>
+      <w:r>
+        <w:rPr>
+          <w:b/>
+          <w:bCs/>
+        </w:rPr>
+        <w:t xml:space="preserve">primary</w:t>
+      </w:r>
+      <w:r>
+        <w:t xml:space="preserve"> blue, </w:t>
+      </w:r>
+      <w:r>
+        <w:rPr>
+          <w:b/>
+          <w:bCs/>
+        </w:rPr>
+        <w:t xml:space="preserve">tension</w:t>
+      </w:r>
+      <w:r>
+        <w:t xml:space="preserve"> amber, </w:t>
+      </w:r>
+      <w:r>
+        <w:rPr>
+          <w:b/>
+          <w:bCs/>
+        </w:rPr>
+        <w:t xml:space="preserve">chaos</w:t>
+      </w:r>
+      <w:r>
+        <w:t xml:space="preserve"> red, </w:t>
+      </w:r>
+      <w:r>
+        <w:rPr>
+          <w:b/>
+          <w:bCs/>
+        </w:rPr>
+        <w:t xml:space="preserve">recover</w:t>
+      </w:r>
+      <w:r>
+        <w:t xml:space="preserve"> purple); active note highlighting per beat via </w:t>
+      </w:r>
+      <w:r>
+        <w:rPr>
+          <w:b/>
+          <w:bCs/>
+        </w:rPr>
+        <w:t xml:space="preserve">`LayerStateMachine`</w:t>
+      </w:r>
+      <w:r>
+        <w:t xml:space="preserve">; </w:t>
+      </w:r>
+      <w:r>
+        <w:rPr>
+          <w:b/>
+          <w:bCs/>
+        </w:rPr>
+        <w:t xml:space="preserve">layer</w:t>
+      </w:r>
+      <w:r>
+        <w:t xml:space="preserve"> row from </w:t>
+      </w:r>
+      <w:r>
+        <w:rPr>
+          <w:b/>
+          <w:bCs/>
+        </w:rPr>
+        <w:t xml:space="preserve">`getAllowedLayers()`</w:t>
+      </w:r>
+      <w:r>
+        <w:t xml:space="preserve">; </w:t>
+      </w:r>
+      <w:r>
+        <w:rPr>
+          <w:b/>
+          <w:bCs/>
+        </w:rPr>
+        <w:t xml:space="preserve">beat legality</w:t>
+      </w:r>
+      <w:r>
+        <w:t xml:space="preserve"> table from </w:t>
+      </w:r>
+      <w:r>
+        <w:rPr>
+          <w:b/>
+          <w:bCs/>
+        </w:rPr>
+        <w:t xml:space="preserve">`buildBeatContextLegalityMap`</w:t>
+      </w:r>
+      <w:r>
+        <w:t xml:space="preserve">; embedded </w:t>
+      </w:r>
+      <w:r>
+        <w:rPr>
+          <w:b/>
+          <w:bCs/>
+        </w:rPr>
+        <w:t xml:space="preserve">`FretboardPanel`</w:t>
+      </w:r>
+      <w:r>
+        <w:t xml:space="preserve"> (</w:t>
+      </w:r>
+      <w:r>
+        <w:rPr>
+          <w:b/>
+          <w:bCs/>
+        </w:rPr>
+        <w:t xml:space="preserve">`darkMode={true}`</w:t>
+      </w:r>
+      <w:r>
+        <w:t xml:space="preserve">).</w:t>
       </w:r>
     </w:p>
     <w:p>

</xml_diff>

<commit_message>
feat: multi-chorus variation, triad pair rotation, motif wiring, SY zigzag bypass, docs updated
Co-authored-by: Cursor <cursoragent@cursor.com>
</commit_message>
<xml_diff>
--- a/docs/COMPOSER_OS_PLAYBOOK.docx
+++ b/docs/COMPOSER_OS_PLAYBOOK.docx
@@ -34219,10 +34219,20 @@
           <w:b/>
           <w:bCs/>
         </w:rPr>
+        <w:t xml:space="preserve">`VaultGenerationOptions`</w:t>
+      </w:r>
+      <w:r>
+        <w:t xml:space="preserve"> (alias </w:t>
+      </w:r>
+      <w:r>
+        <w:rPr>
+          <w:b/>
+          <w:bCs/>
+        </w:rPr>
         <w:t xml:space="preserve">`GenerateFromIRealOptions`</w:t>
       </w:r>
       <w:r>
-        <w:t xml:space="preserve"> includes optional </w:t>
+        <w:t xml:space="preserve">) includes optional </w:t>
       </w:r>
       <w:r>
         <w:rPr>
@@ -34433,6 +34443,470 @@
       </w:r>
       <w:r>
         <w:t xml:space="preserve">.</w:t>
+      </w:r>
+    </w:p>
+    <w:p>
+      <w:pPr>
+        <w:pStyle w:val="Heading2"/>
+        <w:spacing w:after="100" w:before="160"/>
+      </w:pPr>
+      <w:r>
+        <w:t xml:space="preserve">Multi-Chorus Variation (iReal / paste / PDF vault pipeline)</w:t>
+      </w:r>
+    </w:p>
+    <w:p>
+      <w:pPr>
+        <w:spacing w:after="160"/>
+      </w:pPr>
+      <w:r>
+        <w:t xml:space="preserve">Repeat the same </w:t>
+      </w:r>
+      <w:r>
+        <w:rPr>
+          <w:b/>
+          <w:bCs/>
+        </w:rPr>
+        <w:t xml:space="preserve">`ParsedChart`</w:t>
+      </w:r>
+      <w:r>
+        <w:t xml:space="preserve"> multiple times in one </w:t>
+      </w:r>
+      <w:r>
+        <w:rPr>
+          <w:b/>
+          <w:bCs/>
+        </w:rPr>
+        <w:t xml:space="preserve">`IRealVaultOutput`</w:t>
+      </w:r>
+      <w:r>
+        <w:t xml:space="preserve"> without duplicating cells in the UI:</w:t>
+      </w:r>
+    </w:p>
+    <w:p>
+      <w:pPr>
+        <w:spacing w:after="80"/>
+        <w:ind w:left="360" w:hanging="260"/>
+      </w:pPr>
+      <w:r>
+        <w:t xml:space="preserve">• </w:t>
+      </w:r>
+      <w:r>
+        <w:rPr>
+          <w:b/>
+          <w:bCs/>
+        </w:rPr>
+        <w:t xml:space="preserve">`chorusCount`</w:t>
+      </w:r>
+      <w:r>
+        <w:t xml:space="preserve"> on </w:t>
+      </w:r>
+      <w:r>
+        <w:rPr>
+          <w:b/>
+          <w:bCs/>
+        </w:rPr>
+        <w:t xml:space="preserve">`VaultGenerationOptions`</w:t>
+      </w:r>
+      <w:r>
+        <w:t xml:space="preserve"> — integer </w:t>
+      </w:r>
+      <w:r>
+        <w:rPr>
+          <w:b/>
+          <w:bCs/>
+        </w:rPr>
+        <w:t xml:space="preserve">`≥ 1`</w:t>
+      </w:r>
+      <w:r>
+        <w:t xml:space="preserve">, default </w:t>
+      </w:r>
+      <w:r>
+        <w:rPr>
+          <w:b/>
+          <w:bCs/>
+        </w:rPr>
+        <w:t xml:space="preserve">`1`</w:t>
+      </w:r>
+      <w:r>
+        <w:t xml:space="preserve">, capped at </w:t>
+      </w:r>
+      <w:r>
+        <w:rPr>
+          <w:b/>
+          <w:bCs/>
+        </w:rPr>
+        <w:t xml:space="preserve">`64`</w:t>
+      </w:r>
+      <w:r>
+        <w:t xml:space="preserve">. Each chorus runs the </w:t>
+      </w:r>
+      <w:r>
+        <w:rPr>
+          <w:b/>
+          <w:bCs/>
+        </w:rPr>
+        <w:t xml:space="preserve">full</w:t>
+      </w:r>
+      <w:r>
+        <w:t xml:space="preserve"> per-bar </w:t>
+      </w:r>
+      <w:r>
+        <w:rPr>
+          <w:b/>
+          <w:bCs/>
+        </w:rPr>
+        <w:t xml:space="preserve">`generateVaultRiff`</w:t>
+      </w:r>
+      <w:r>
+        <w:t xml:space="preserve"> loop; </w:t>
+      </w:r>
+      <w:r>
+        <w:rPr>
+          <w:b/>
+          <w:bCs/>
+        </w:rPr>
+        <w:t xml:space="preserve">`generatedNotes`</w:t>
+      </w:r>
+      <w:r>
+        <w:t xml:space="preserve"> use </w:t>
+      </w:r>
+      <w:r>
+        <w:rPr>
+          <w:b/>
+          <w:bCs/>
+        </w:rPr>
+        <w:t xml:space="preserve">global</w:t>
+      </w:r>
+      <w:r>
+        <w:t xml:space="preserve"> sequential </w:t>
+      </w:r>
+      <w:r>
+        <w:rPr>
+          <w:b/>
+          <w:bCs/>
+        </w:rPr>
+        <w:t xml:space="preserve">`barIndex`</w:t>
+      </w:r>
+      <w:r>
+        <w:t xml:space="preserve"> (</w:t>
+      </w:r>
+      <w:r>
+        <w:rPr>
+          <w:b/>
+          <w:bCs/>
+        </w:rPr>
+        <w:t xml:space="preserve">0 … N×`chorusCount`−1</w:t>
+      </w:r>
+      <w:r>
+        <w:t xml:space="preserve">) and </w:t>
+      </w:r>
+      <w:r>
+        <w:rPr>
+          <w:b/>
+          <w:bCs/>
+        </w:rPr>
+        <w:t xml:space="preserve">`startBeat`</w:t>
+      </w:r>
+      <w:r>
+        <w:t xml:space="preserve"> continues in </w:t>
+      </w:r>
+      <w:r>
+        <w:rPr>
+          <w:b/>
+          <w:bCs/>
+        </w:rPr>
+        <w:t xml:space="preserve">quarter-note</w:t>
+      </w:r>
+      <w:r>
+        <w:t xml:space="preserve"> units across choruses (</w:t>
+      </w:r>
+      <w:r>
+        <w:rPr>
+          <w:b/>
+          <w:bCs/>
+        </w:rPr>
+        <w:t xml:space="preserve">meter</w:t>
+      </w:r>
+      <w:r>
+        <w:t xml:space="preserve"> from </w:t>
+      </w:r>
+      <w:r>
+        <w:rPr>
+          <w:b/>
+          <w:bCs/>
+        </w:rPr>
+        <w:t xml:space="preserve">`ParsedChart.timeSignature`</w:t>
+      </w:r>
+      <w:r>
+        <w:t xml:space="preserve">).</w:t>
+      </w:r>
+    </w:p>
+    <w:p>
+      <w:pPr>
+        <w:spacing w:after="80"/>
+        <w:ind w:left="360" w:hanging="260"/>
+      </w:pPr>
+      <w:r>
+        <w:t xml:space="preserve">• </w:t>
+      </w:r>
+      <w:r>
+        <w:rPr>
+          <w:b/>
+          <w:bCs/>
+        </w:rPr>
+        <w:t xml:space="preserve">Melody</w:t>
+      </w:r>
+      <w:r>
+        <w:t xml:space="preserve"> mode — after each chorus’s raw fill, </w:t>
+      </w:r>
+      <w:r>
+        <w:rPr>
+          <w:b/>
+          <w:bCs/>
+        </w:rPr>
+        <w:t xml:space="preserve">Build F</w:t>
+      </w:r>
+      <w:r>
+        <w:t xml:space="preserve"> </w:t>
+      </w:r>
+      <w:r>
+        <w:rPr>
+          <w:b/>
+          <w:bCs/>
+        </w:rPr>
+        <w:t xml:space="preserve">`transformMotifThroughLayers`</w:t>
+      </w:r>
+      <w:r>
+        <w:t xml:space="preserve"> restates the seed motif on later bars. </w:t>
+      </w:r>
+      <w:r>
+        <w:rPr>
+          <w:b/>
+          <w:bCs/>
+        </w:rPr>
+        <w:t xml:space="preserve">Tension arc per chorus:</w:t>
+      </w:r>
+      <w:r>
+        <w:t xml:space="preserve"> the layer pick cycles </w:t>
+      </w:r>
+      <w:r>
+        <w:rPr>
+          <w:b/>
+          <w:bCs/>
+        </w:rPr>
+        <w:t xml:space="preserve">primary → tension → chaos → recover → resolve</w:t>
+      </w:r>
+      <w:r>
+        <w:t xml:space="preserve">; each new chorus </w:t>
+      </w:r>
+      <w:r>
+        <w:rPr>
+          <w:b/>
+          <w:bCs/>
+        </w:rPr>
+        <w:t xml:space="preserve">offsets</w:t>
+      </w:r>
+      <w:r>
+        <w:t xml:space="preserve"> that cycle by one step (</w:t>
+      </w:r>
+      <w:r>
+        <w:rPr>
+          <w:b/>
+          <w:bCs/>
+        </w:rPr>
+        <w:t xml:space="preserve">`tensionCycleRotation`</w:t>
+      </w:r>
+      <w:r>
+        <w:t xml:space="preserve"> = chorus index, modulo </w:t>
+      </w:r>
+      <w:r>
+        <w:rPr>
+          <w:b/>
+          <w:bCs/>
+        </w:rPr>
+        <w:t xml:space="preserve">5</w:t>
+      </w:r>
+      <w:r>
+        <w:t xml:space="preserve">) so successive choruses do not all begin on </w:t>
+      </w:r>
+      <w:r>
+        <w:rPr>
+          <w:b/>
+          <w:bCs/>
+        </w:rPr>
+        <w:t xml:space="preserve">primary</w:t>
+      </w:r>
+      <w:r>
+        <w:t xml:space="preserve">. </w:t>
+      </w:r>
+      <w:r>
+        <w:rPr>
+          <w:b/>
+          <w:bCs/>
+        </w:rPr>
+        <w:t xml:space="preserve">`songwriterStyleId === 'sonic_youth'`</w:t>
+      </w:r>
+      <w:r>
+        <w:t xml:space="preserve"> disables this offset (</w:t>
+      </w:r>
+      <w:r>
+        <w:rPr>
+          <w:b/>
+          <w:bCs/>
+        </w:rPr>
+        <w:t xml:space="preserve">rotation stays 0</w:t>
+      </w:r>
+      <w:r>
+        <w:t xml:space="preserve">) so Sonic Youth texture logic elsewhere is not fighting the vault phrase engine.</w:t>
+      </w:r>
+    </w:p>
+    <w:p>
+      <w:pPr>
+        <w:spacing w:after="80"/>
+        <w:ind w:left="360" w:hanging="260"/>
+      </w:pPr>
+      <w:r>
+        <w:t xml:space="preserve">• </w:t>
+      </w:r>
+      <w:r>
+        <w:rPr>
+          <w:b/>
+          <w:bCs/>
+        </w:rPr>
+        <w:t xml:space="preserve">Solo</w:t>
+      </w:r>
+      <w:r>
+        <w:t xml:space="preserve"> mode — there is </w:t>
+      </w:r>
+      <w:r>
+        <w:rPr>
+          <w:b/>
+          <w:bCs/>
+        </w:rPr>
+        <w:t xml:space="preserve">no</w:t>
+      </w:r>
+      <w:r>
+        <w:t xml:space="preserve"> motif pass; choruses are independent bar-generation passes only. If </w:t>
+      </w:r>
+      <w:r>
+        <w:rPr>
+          <w:b/>
+          <w:bCs/>
+        </w:rPr>
+        <w:t xml:space="preserve">`riffStyle`</w:t>
+      </w:r>
+      <w:r>
+        <w:t xml:space="preserve"> is </w:t>
+      </w:r>
+      <w:r>
+        <w:rPr>
+          <w:b/>
+          <w:bCs/>
+        </w:rPr>
+        <w:t xml:space="preserve">omitted</w:t>
+      </w:r>
+      <w:r>
+        <w:t xml:space="preserve"> or set to </w:t>
+      </w:r>
+      <w:r>
+        <w:rPr>
+          <w:b/>
+          <w:bCs/>
+        </w:rPr>
+        <w:t xml:space="preserve">`triad-pair-pendulum`</w:t>
+      </w:r>
+      <w:r>
+        <w:t xml:space="preserve">, effective vault style follows </w:t>
+      </w:r>
+      <w:r>
+        <w:rPr>
+          <w:b/>
+          <w:bCs/>
+        </w:rPr>
+        <w:t xml:space="preserve">`TRIAD_PAIR_CHORUS_ROTATION`</w:t>
+      </w:r>
+      <w:r>
+        <w:t xml:space="preserve">: </w:t>
+      </w:r>
+      <w:r>
+        <w:rPr>
+          <w:b/>
+          <w:bCs/>
+        </w:rPr>
+        <w:t xml:space="preserve">`['triad-pair-pendulum','bebop-placement','triad-pair-pendulum','quadratonic','triad-pair-pendulum']`</w:t>
+      </w:r>
+      <w:r>
+        <w:t xml:space="preserve"> by </w:t>
+      </w:r>
+      <w:r>
+        <w:rPr>
+          <w:b/>
+          <w:bCs/>
+        </w:rPr>
+        <w:t xml:space="preserve">`chorusIndex % 5`</w:t>
+      </w:r>
+      <w:r>
+        <w:t xml:space="preserve">. Same </w:t>
+      </w:r>
+      <w:r>
+        <w:rPr>
+          <w:b/>
+          <w:bCs/>
+        </w:rPr>
+        <w:t xml:space="preserve">SY</w:t>
+      </w:r>
+      <w:r>
+        <w:t xml:space="preserve"> </w:t>
+      </w:r>
+      <w:r>
+        <w:rPr>
+          <w:b/>
+          <w:bCs/>
+        </w:rPr>
+        <w:t xml:space="preserve">`songwriterStyleId`</w:t>
+      </w:r>
+      <w:r>
+        <w:t xml:space="preserve"> flag </w:t>
+      </w:r>
+      <w:r>
+        <w:rPr>
+          <w:b/>
+          <w:bCs/>
+        </w:rPr>
+        <w:t xml:space="preserve">skips</w:t>
+      </w:r>
+      <w:r>
+        <w:t xml:space="preserve"> this style rotation (every chorus uses the resolved base </w:t>
+      </w:r>
+      <w:r>
+        <w:rPr>
+          <w:b/>
+          <w:bCs/>
+        </w:rPr>
+        <w:t xml:space="preserve">`riffStyle`</w:t>
+      </w:r>
+      <w:r>
+        <w:t xml:space="preserve"> / default). Any </w:t>
+      </w:r>
+      <w:r>
+        <w:rPr>
+          <w:b/>
+          <w:bCs/>
+        </w:rPr>
+        <w:t xml:space="preserve">other</w:t>
+      </w:r>
+      <w:r>
+        <w:t xml:space="preserve"> explicit </w:t>
+      </w:r>
+      <w:r>
+        <w:rPr>
+          <w:b/>
+          <w:bCs/>
+        </w:rPr>
+        <w:t xml:space="preserve">`riffStyle`</w:t>
+      </w:r>
+      <w:r>
+        <w:t xml:space="preserve"> keeps one style for all choruses.</w:t>
       </w:r>
     </w:p>
     <w:p>

</xml_diff>

<commit_message>
docs: ECM Chamber handbook section — style vs songwriter distinction, presets, six example applications
Co-authored-by: Cursor <cursoragent@cursor.com>
</commit_message>
<xml_diff>
--- a/docs/COMPOSER_OS_PLAYBOOK.docx
+++ b/docs/COMPOSER_OS_PLAYBOOK.docx
@@ -8844,6 +8844,26 @@
         <w:t xml:space="preserve">Groove / Soul</w:t>
       </w:r>
       <w:r>
+        <w:t xml:space="preserve">, </w:t>
+      </w:r>
+      <w:r>
+        <w:rPr>
+          <w:b/>
+          <w:bCs/>
+        </w:rPr>
+        <w:t xml:space="preserve">`STYLE_ECM`</w:t>
+      </w:r>
+      <w:r>
+        <w:t xml:space="preserve">, </w:t>
+      </w:r>
+      <w:r>
+        <w:rPr>
+          <w:b/>
+          <w:bCs/>
+        </w:rPr>
+        <w:t xml:space="preserve">`STYLE_ECM_CHAMBER`</w:t>
+      </w:r>
+      <w:r>
         <w:t xml:space="preserve">, and — as of the style-to-slice wiring — </w:t>
       </w:r>
       <w:r>
@@ -16399,6 +16419,1472 @@
       </w:r>
       <w:r>
         <w:t xml:space="preserve">.</w:t>
+      </w:r>
+    </w:p>
+    <w:p>
+      <w:pPr>
+        <w:pStyle w:val="Heading2"/>
+        <w:spacing w:after="100" w:before="160"/>
+      </w:pPr>
+      <w:r>
+        <w:t xml:space="preserve">ECM Style vs ECM Chamber songwriter — how the controls differ</w:t>
+      </w:r>
+    </w:p>
+    <w:p>
+      <w:pPr>
+        <w:spacing w:after="160"/>
+      </w:pPr>
+      <w:r>
+        <w:t xml:space="preserve">Composer OS splits </w:t>
+      </w:r>
+      <w:r>
+        <w:rPr>
+          <w:b/>
+          <w:bCs/>
+        </w:rPr>
+        <w:t xml:space="preserve">ECM-flavoured harmony</w:t>
+      </w:r>
+      <w:r>
+        <w:t xml:space="preserve"> (what chords are chosen and how they move) from </w:t>
+      </w:r>
+      <w:r>
+        <w:rPr>
+          <w:b/>
+          <w:bCs/>
+        </w:rPr>
+        <w:t xml:space="preserve">ECM-flavoured surface behaviour</w:t>
+      </w:r>
+      <w:r>
+        <w:t xml:space="preserve"> (how sparse the guitar comp feels, where phrases attack, how soft cadences land, how independent the bass rhythm is). You can use either alone or both together.</w:t>
+      </w:r>
+    </w:p>
+    <w:tbl>
+      <w:tblPr>
+        <w:tblW w:type="pct" w:w="100%"/>
+        <w:tblBorders>
+          <w:top w:val="single" w:color="auto" w:sz="4"/>
+          <w:left w:val="single" w:color="auto" w:sz="4"/>
+          <w:bottom w:val="single" w:color="auto" w:sz="4"/>
+          <w:right w:val="single" w:color="auto" w:sz="4"/>
+          <w:insideH w:val="single" w:color="auto" w:sz="4"/>
+          <w:insideV w:val="single" w:color="auto" w:sz="4"/>
+        </w:tblBorders>
+      </w:tblPr>
+      <w:tblGrid>
+        <w:gridCol w:w="3000"/>
+        <w:gridCol w:w="3000"/>
+        <w:gridCol w:w="3000"/>
+      </w:tblGrid>
+      <w:tr>
+        <w:tc>
+          <w:tcPr>
+            <w:tcW w:type="pct" w:w="3000%"/>
+          </w:tcPr>
+          <w:p>
+            <w:pPr>
+              <w:spacing w:after="60"/>
+            </w:pPr>
+            <w:r>
+              <w:t xml:space="preserve">Control</w:t>
+            </w:r>
+          </w:p>
+        </w:tc>
+        <w:tc>
+          <w:tcPr>
+            <w:tcW w:type="pct" w:w="3000%"/>
+          </w:tcPr>
+          <w:p>
+            <w:pPr>
+              <w:spacing w:after="60"/>
+            </w:pPr>
+            <w:r>
+              <w:t xml:space="preserve">What it is</w:t>
+            </w:r>
+          </w:p>
+        </w:tc>
+        <w:tc>
+          <w:tcPr>
+            <w:tcW w:type="pct" w:w="3000%"/>
+          </w:tcPr>
+          <w:p>
+            <w:pPr>
+              <w:spacing w:after="60"/>
+            </w:pPr>
+            <w:r>
+              <w:t xml:space="preserve">What it drives</w:t>
+            </w:r>
+          </w:p>
+        </w:tc>
+      </w:tr>
+      <w:tr>
+        <w:tc>
+          <w:tcPr>
+            <w:tcW w:type="pct" w:w="3000%"/>
+          </w:tcPr>
+          <w:p>
+            <w:pPr>
+              <w:spacing w:after="60"/>
+            </w:pPr>
+            <w:r>
+              <w:rPr>
+                <w:b/>
+                <w:bCs/>
+              </w:rPr>
+              <w:t xml:space="preserve">ECM Style</w:t>
+            </w:r>
+          </w:p>
+        </w:tc>
+        <w:tc>
+          <w:tcPr>
+            <w:tcW w:type="pct" w:w="3000%"/>
+          </w:tcPr>
+          <w:p>
+            <w:pPr>
+              <w:spacing w:after="60"/>
+            </w:pPr>
+            <w:r>
+              <w:rPr>
+                <w:b/>
+                <w:bCs/>
+              </w:rPr>
+              <w:t xml:space="preserve">Style Engine</w:t>
+            </w:r>
+            <w:r>
+              <w:t xml:space="preserve"> dropdown: </w:t>
+            </w:r>
+            <w:r>
+              <w:rPr>
+                <w:b/>
+                <w:bCs/>
+              </w:rPr>
+              <w:t xml:space="preserve">`STYLE_ECM`</w:t>
+            </w:r>
+            <w:r>
+              <w:t xml:space="preserve"> or </w:t>
+            </w:r>
+            <w:r>
+              <w:rPr>
+                <w:b/>
+                <w:bCs/>
+              </w:rPr>
+              <w:t xml:space="preserve">`STYLE_ECM_CHAMBER`</w:t>
+            </w:r>
+          </w:p>
+        </w:tc>
+        <w:tc>
+          <w:tcPr>
+            <w:tcW w:type="pct" w:w="3000%"/>
+          </w:tcPr>
+          <w:p>
+            <w:pPr>
+              <w:spacing w:after="60"/>
+            </w:pPr>
+            <w:r>
+              <w:rPr>
+                <w:b/>
+                <w:bCs/>
+              </w:rPr>
+              <w:t xml:space="preserve">Surface metadata</w:t>
+            </w:r>
+            <w:r>
+              <w:t xml:space="preserve"> consumed by Song Mode passes: </w:t>
+            </w:r>
+            <w:r>
+              <w:rPr>
+                <w:b/>
+                <w:bCs/>
+              </w:rPr>
+              <w:t xml:space="preserve">density</w:t>
+            </w:r>
+            <w:r>
+              <w:t xml:space="preserve">, </w:t>
+            </w:r>
+            <w:r>
+              <w:rPr>
+                <w:b/>
+                <w:bCs/>
+              </w:rPr>
+              <w:t xml:space="preserve">space</w:t>
+            </w:r>
+            <w:r>
+              <w:t xml:space="preserve">, </w:t>
+            </w:r>
+            <w:r>
+              <w:rPr>
+                <w:b/>
+                <w:bCs/>
+              </w:rPr>
+              <w:t xml:space="preserve">syncopation</w:t>
+            </w:r>
+            <w:r>
+              <w:t xml:space="preserve">, </w:t>
+            </w:r>
+            <w:r>
+              <w:rPr>
+                <w:b/>
+                <w:bCs/>
+              </w:rPr>
+              <w:t xml:space="preserve">phrase-start looseness</w:t>
+            </w:r>
+            <w:r>
+              <w:t xml:space="preserve">, </w:t>
+            </w:r>
+            <w:r>
+              <w:rPr>
+                <w:b/>
+                <w:bCs/>
+              </w:rPr>
+              <w:t xml:space="preserve">bass independence</w:t>
+            </w:r>
+            <w:r>
+              <w:t xml:space="preserve">, </w:t>
+            </w:r>
+            <w:r>
+              <w:rPr>
+                <w:b/>
+                <w:bCs/>
+              </w:rPr>
+              <w:t xml:space="preserve">cadence softness</w:t>
+            </w:r>
+            <w:r>
+              <w:t xml:space="preserve">, plus </w:t>
+            </w:r>
+            <w:r>
+              <w:rPr>
+                <w:b/>
+                <w:bCs/>
+              </w:rPr>
+              <w:t xml:space="preserve">Style Engine</w:t>
+            </w:r>
+            <w:r>
+              <w:t xml:space="preserve"> velocity contouring. </w:t>
+            </w:r>
+            <w:r>
+              <w:rPr>
+                <w:b/>
+                <w:bCs/>
+              </w:rPr>
+              <w:t xml:space="preserve">`STYLE_ECM_CHAMBER`</w:t>
+            </w:r>
+            <w:r>
+              <w:t xml:space="preserve"> also participates in the </w:t>
+            </w:r>
+            <w:r>
+              <w:rPr>
+                <w:b/>
+                <w:bCs/>
+              </w:rPr>
+              <w:t xml:space="preserve">alternate tuning</w:t>
+            </w:r>
+            <w:r>
+              <w:t xml:space="preserve"> gate like other “alt tuning” styles. Implementation: </w:t>
+            </w:r>
+            <w:r>
+              <w:rPr>
+                <w:b/>
+                <w:bCs/>
+              </w:rPr>
+              <w:t xml:space="preserve">`applyEcmChamberStyleSurface`</w:t>
+            </w:r>
+            <w:r>
+              <w:t xml:space="preserve"> (`songModeStyleSurface.ts`) nudges </w:t>
+            </w:r>
+            <w:r>
+              <w:rPr>
+                <w:b/>
+                <w:bCs/>
+              </w:rPr>
+              <w:t xml:space="preserve">`GenerationMetadata`</w:t>
+            </w:r>
+            <w:r>
+              <w:t xml:space="preserve"> before </w:t>
+            </w:r>
+            <w:r>
+              <w:rPr>
+                <w:b/>
+                <w:bCs/>
+              </w:rPr>
+              <w:t xml:space="preserve">C1/C7</w:t>
+            </w:r>
+            <w:r>
+              <w:t xml:space="preserve"> rhythm overlays and harmony policies.</w:t>
+            </w:r>
+          </w:p>
+        </w:tc>
+      </w:tr>
+      <w:tr>
+        <w:tc>
+          <w:tcPr>
+            <w:tcW w:type="pct" w:w="3000%"/>
+          </w:tcPr>
+          <w:p>
+            <w:pPr>
+              <w:spacing w:after="60"/>
+            </w:pPr>
+            <w:r>
+              <w:rPr>
+                <w:b/>
+                <w:bCs/>
+              </w:rPr>
+              <w:t xml:space="preserve">ECM Chamber</w:t>
+            </w:r>
+          </w:p>
+        </w:tc>
+        <w:tc>
+          <w:tcPr>
+            <w:tcW w:type="pct" w:w="3000%"/>
+          </w:tcPr>
+          <w:p>
+            <w:pPr>
+              <w:spacing w:after="60"/>
+            </w:pPr>
+            <w:r>
+              <w:rPr>
+                <w:b/>
+                <w:bCs/>
+              </w:rPr>
+              <w:t xml:space="preserve">Primary songwriter</w:t>
+            </w:r>
+            <w:r>
+              <w:t xml:space="preserve"> </w:t>
+            </w:r>
+            <w:r>
+              <w:rPr>
+                <w:b/>
+                <w:bCs/>
+              </w:rPr>
+              <w:t xml:space="preserve">`ecm_chamber`</w:t>
+            </w:r>
+            <w:r>
+              <w:t xml:space="preserve"> (`SongwriterRuleId`)</w:t>
+            </w:r>
+          </w:p>
+        </w:tc>
+        <w:tc>
+          <w:tcPr>
+            <w:tcW w:type="pct" w:w="3000%"/>
+          </w:tcPr>
+          <w:p>
+            <w:pPr>
+              <w:spacing w:after="60"/>
+            </w:pPr>
+            <w:r>
+              <w:rPr>
+                <w:b/>
+                <w:bCs/>
+              </w:rPr>
+              <w:t xml:space="preserve">Harmonic slice</w:t>
+            </w:r>
+            <w:r>
+              <w:t xml:space="preserve"> — precomputed chord symbols and devices (</w:t>
+            </w:r>
+            <w:r>
+              <w:rPr>
+                <w:b/>
+                <w:bCs/>
+              </w:rPr>
+              <w:t xml:space="preserve">Lydian</w:t>
+            </w:r>
+            <w:r>
+              <w:t xml:space="preserve"> lean on primaries, </w:t>
+            </w:r>
+            <w:r>
+              <w:rPr>
+                <w:b/>
+                <w:bCs/>
+              </w:rPr>
+              <w:t xml:space="preserve">m11no3</w:t>
+            </w:r>
+            <w:r>
+              <w:t xml:space="preserve">-style colours, </w:t>
+            </w:r>
+            <w:r>
+              <w:rPr>
+                <w:b/>
+                <w:bCs/>
+              </w:rPr>
+              <w:t xml:space="preserve">m7b5</w:t>
+            </w:r>
+            <w:r>
+              <w:t xml:space="preserve"> destinations, asymmetric phrase grid, wide leap peaks in melody planning). Implementation: </w:t>
+            </w:r>
+            <w:r>
+              <w:rPr>
+                <w:b/>
+                <w:bCs/>
+              </w:rPr>
+              <w:t xml:space="preserve">`ecmChamberSlice.ts`</w:t>
+            </w:r>
+            <w:r>
+              <w:t xml:space="preserve"> / </w:t>
+            </w:r>
+            <w:r>
+              <w:rPr>
+                <w:b/>
+                <w:bCs/>
+              </w:rPr>
+              <w:t xml:space="preserve">`precomputeEcmChamberEffectiveHarmonyBars`</w:t>
+            </w:r>
+            <w:r>
+              <w:t xml:space="preserve">, same locked-export pattern as other writers.</w:t>
+            </w:r>
+          </w:p>
+        </w:tc>
+      </w:tr>
+    </w:tbl>
+    <w:p>
+      <w:pPr>
+        <w:spacing w:after="160"/>
+      </w:pPr>
+    </w:p>
+    <w:p>
+      <w:pPr>
+        <w:spacing w:after="160"/>
+      </w:pPr>
+      <w:r>
+        <w:rPr>
+          <w:b/>
+          <w:bCs/>
+        </w:rPr>
+        <w:t xml:space="preserve">Stacking:</w:t>
+      </w:r>
+      <w:r>
+        <w:t xml:space="preserve"> If you pick </w:t>
+      </w:r>
+      <w:r>
+        <w:rPr>
+          <w:b/>
+          <w:bCs/>
+        </w:rPr>
+        <w:t xml:space="preserve">ECM Chamber</w:t>
+      </w:r>
+      <w:r>
+        <w:t xml:space="preserve"> as songwriter </w:t>
+      </w:r>
+      <w:r>
+        <w:rPr>
+          <w:b/>
+          <w:bCs/>
+        </w:rPr>
+        <w:t xml:space="preserve">and</w:t>
+      </w:r>
+      <w:r>
+        <w:t xml:space="preserve"> </w:t>
+      </w:r>
+      <w:r>
+        <w:rPr>
+          <w:b/>
+          <w:bCs/>
+        </w:rPr>
+        <w:t xml:space="preserve">ECM</w:t>
+      </w:r>
+      <w:r>
+        <w:t xml:space="preserve"> or </w:t>
+      </w:r>
+      <w:r>
+        <w:rPr>
+          <w:b/>
+          <w:bCs/>
+        </w:rPr>
+        <w:t xml:space="preserve">ECM Chamber</w:t>
+      </w:r>
+      <w:r>
+        <w:t xml:space="preserve"> as Style Engine, both layers apply — you get ECM harmony vocabulary </w:t>
+      </w:r>
+      <w:r>
+        <w:rPr>
+          <w:b/>
+          <w:bCs/>
+        </w:rPr>
+        <w:t xml:space="preserve">and</w:t>
+      </w:r>
+      <w:r>
+        <w:t xml:space="preserve"> ECM surface spacing/cadence behaviour (full-stack ECM).</w:t>
+      </w:r>
+    </w:p>
+    <w:p>
+      <w:pPr>
+        <w:spacing w:after="160"/>
+      </w:pPr>
+      <w:r>
+        <w:rPr>
+          <w:b/>
+          <w:bCs/>
+        </w:rPr>
+        <w:t xml:space="preserve">Independence:</w:t>
+      </w:r>
+      <w:r>
+        <w:t xml:space="preserve"> You can choose </w:t>
+      </w:r>
+      <w:r>
+        <w:rPr>
+          <w:b/>
+          <w:bCs/>
+        </w:rPr>
+        <w:t xml:space="preserve">ECM Chamber</w:t>
+      </w:r>
+      <w:r>
+        <w:t xml:space="preserve"> with a </w:t>
+      </w:r>
+      <w:r>
+        <w:rPr>
+          <w:b/>
+          <w:bCs/>
+        </w:rPr>
+        <w:t xml:space="preserve">non-ECM</w:t>
+      </w:r>
+      <w:r>
+        <w:t xml:space="preserve"> style to get the harmonic language without the ECM surface recipe, or </w:t>
+      </w:r>
+      <w:r>
+        <w:rPr>
+          <w:b/>
+          <w:bCs/>
+        </w:rPr>
+        <w:t xml:space="preserve">ECM Style</w:t>
+      </w:r>
+      <w:r>
+        <w:t xml:space="preserve"> with a </w:t>
+      </w:r>
+      <w:r>
+        <w:rPr>
+          <w:b/>
+          <w:bCs/>
+        </w:rPr>
+        <w:t xml:space="preserve">different</w:t>
+      </w:r>
+      <w:r>
+        <w:t xml:space="preserve"> primary songwriter to get ECM spacing and cadence behaviour without the ECM Chamber chord slice.</w:t>
+      </w:r>
+    </w:p>
+    <w:p>
+      <w:pPr>
+        <w:pStyle w:val="Heading2"/>
+        <w:spacing w:after="100" w:before="160"/>
+      </w:pPr>
+      <w:r>
+        <w:t xml:space="preserve">ECM Chamber surface — three presets (Chamber ↔ Flow)</w:t>
+      </w:r>
+    </w:p>
+    <w:p>
+      <w:pPr>
+        <w:spacing w:after="160"/>
+      </w:pPr>
+      <w:r>
+        <w:t xml:space="preserve">When </w:t>
+      </w:r>
+      <w:r>
+        <w:rPr>
+          <w:b/>
+          <w:bCs/>
+        </w:rPr>
+        <w:t xml:space="preserve">Style Engine</w:t>
+      </w:r>
+      <w:r>
+        <w:t xml:space="preserve"> is </w:t>
+      </w:r>
+      <w:r>
+        <w:rPr>
+          <w:b/>
+          <w:bCs/>
+        </w:rPr>
+        <w:t xml:space="preserve">`STYLE_ECM`</w:t>
+      </w:r>
+      <w:r>
+        <w:t xml:space="preserve"> or </w:t>
+      </w:r>
+      <w:r>
+        <w:rPr>
+          <w:b/>
+          <w:bCs/>
+        </w:rPr>
+        <w:t xml:space="preserve">`STYLE_ECM_CHAMBER`</w:t>
+      </w:r>
+      <w:r>
+        <w:t xml:space="preserve">, Generate maps the </w:t>
+      </w:r>
+      <w:r>
+        <w:rPr>
+          <w:b/>
+          <w:bCs/>
+        </w:rPr>
+        <w:t xml:space="preserve">Chamber ↔ Flow</w:t>
+      </w:r>
+      <w:r>
+        <w:t xml:space="preserve"> slider (0–1) to a discrete </w:t>
+      </w:r>
+      <w:r>
+        <w:rPr>
+          <w:b/>
+          <w:bCs/>
+        </w:rPr>
+        <w:t xml:space="preserve">`ecmChamberMode`</w:t>
+      </w:r>
+      <w:r>
+        <w:t xml:space="preserve"> sent on the request (`GenerateRequest.ecmChamberMode`): </w:t>
+      </w:r>
+      <w:r>
+        <w:rPr>
+          <w:b/>
+          <w:bCs/>
+        </w:rPr>
+        <w:t xml:space="preserve">`angel_song`</w:t>
+      </w:r>
+      <w:r>
+        <w:t xml:space="preserve">, </w:t>
+      </w:r>
+      <w:r>
+        <w:rPr>
+          <w:b/>
+          <w:bCs/>
+        </w:rPr>
+        <w:t xml:space="preserve">`balanced`</w:t>
+      </w:r>
+      <w:r>
+        <w:t xml:space="preserve">, or </w:t>
+      </w:r>
+      <w:r>
+        <w:rPr>
+          <w:b/>
+          <w:bCs/>
+        </w:rPr>
+        <w:t xml:space="preserve">`metheny_scofield`</w:t>
+      </w:r>
+      <w:r>
+        <w:t xml:space="preserve">. Each mode applies additive nudges (clamped 0–1) to </w:t>
+      </w:r>
+      <w:r>
+        <w:rPr>
+          <w:b/>
+          <w:bCs/>
+        </w:rPr>
+        <w:t xml:space="preserve">density</w:t>
+      </w:r>
+      <w:r>
+        <w:t xml:space="preserve">, </w:t>
+      </w:r>
+      <w:r>
+        <w:rPr>
+          <w:b/>
+          <w:bCs/>
+        </w:rPr>
+        <w:t xml:space="preserve">syncopation</w:t>
+      </w:r>
+      <w:r>
+        <w:t xml:space="preserve">, </w:t>
+      </w:r>
+      <w:r>
+        <w:rPr>
+          <w:b/>
+          <w:bCs/>
+        </w:rPr>
+        <w:t xml:space="preserve">space</w:t>
+      </w:r>
+      <w:r>
+        <w:t xml:space="preserve">, </w:t>
+      </w:r>
+      <w:r>
+        <w:rPr>
+          <w:b/>
+          <w:bCs/>
+        </w:rPr>
+        <w:t xml:space="preserve">phrase-start looseness</w:t>
+      </w:r>
+      <w:r>
+        <w:t xml:space="preserve">, </w:t>
+      </w:r>
+      <w:r>
+        <w:rPr>
+          <w:b/>
+          <w:bCs/>
+        </w:rPr>
+        <w:t xml:space="preserve">bass independence</w:t>
+      </w:r>
+      <w:r>
+        <w:t xml:space="preserve">, and </w:t>
+      </w:r>
+      <w:r>
+        <w:rPr>
+          <w:b/>
+          <w:bCs/>
+        </w:rPr>
+        <w:t xml:space="preserve">cadence softness</w:t>
+      </w:r>
+      <w:r>
+        <w:t xml:space="preserve"> — see </w:t>
+      </w:r>
+      <w:r>
+        <w:rPr>
+          <w:b/>
+          <w:bCs/>
+        </w:rPr>
+        <w:t xml:space="preserve">`applyEcmChamberStyleSurface`</w:t>
+      </w:r>
+      <w:r>
+        <w:t xml:space="preserve">.</w:t>
+      </w:r>
+    </w:p>
+    <w:tbl>
+      <w:tblPr>
+        <w:tblW w:type="pct" w:w="100%"/>
+        <w:tblBorders>
+          <w:top w:val="single" w:color="auto" w:sz="4"/>
+          <w:left w:val="single" w:color="auto" w:sz="4"/>
+          <w:bottom w:val="single" w:color="auto" w:sz="4"/>
+          <w:right w:val="single" w:color="auto" w:sz="4"/>
+          <w:insideH w:val="single" w:color="auto" w:sz="4"/>
+          <w:insideV w:val="single" w:color="auto" w:sz="4"/>
+        </w:tblBorders>
+      </w:tblPr>
+      <w:tblGrid>
+        <w:gridCol w:w="3000"/>
+        <w:gridCol w:w="3000"/>
+        <w:gridCol w:w="3000"/>
+      </w:tblGrid>
+      <w:tr>
+        <w:tc>
+          <w:tcPr>
+            <w:tcW w:type="pct" w:w="3000%"/>
+          </w:tcPr>
+          <w:p>
+            <w:pPr>
+              <w:spacing w:after="60"/>
+            </w:pPr>
+            <w:r>
+              <w:t xml:space="preserve">Resolved mode</w:t>
+            </w:r>
+          </w:p>
+        </w:tc>
+        <w:tc>
+          <w:tcPr>
+            <w:tcW w:type="pct" w:w="3000%"/>
+          </w:tcPr>
+          <w:p>
+            <w:pPr>
+              <w:spacing w:after="60"/>
+            </w:pPr>
+            <w:r>
+              <w:t xml:space="preserve">Musical intent (product framing)</w:t>
+            </w:r>
+          </w:p>
+        </w:tc>
+        <w:tc>
+          <w:tcPr>
+            <w:tcW w:type="pct" w:w="3000%"/>
+          </w:tcPr>
+          <w:p>
+            <w:pPr>
+              <w:spacing w:after="60"/>
+            </w:pPr>
+            <w:r>
+              <w:t xml:space="preserve">Reference listening (orientation, not imitation)</w:t>
+            </w:r>
+          </w:p>
+        </w:tc>
+      </w:tr>
+      <w:tr>
+        <w:tc>
+          <w:tcPr>
+            <w:tcW w:type="pct" w:w="3000%"/>
+          </w:tcPr>
+          <w:p>
+            <w:pPr>
+              <w:spacing w:after="60"/>
+            </w:pPr>
+            <w:r>
+              <w:rPr>
+                <w:b/>
+                <w:bCs/>
+              </w:rPr>
+              <w:t xml:space="preserve">Angel Song</w:t>
+            </w:r>
+          </w:p>
+        </w:tc>
+        <w:tc>
+          <w:tcPr>
+            <w:tcW w:type="pct" w:w="3000%"/>
+          </w:tcPr>
+          <w:p>
+            <w:pPr>
+              <w:spacing w:after="60"/>
+            </w:pPr>
+            <w:r>
+              <w:rPr>
+                <w:b/>
+                <w:bCs/>
+              </w:rPr>
+              <w:t xml:space="preserve">Maximum space</w:t>
+            </w:r>
+            <w:r>
+              <w:t xml:space="preserve"> — floating phrases, softer cadential landing preference, more off-beat phrase entries, bass leaning </w:t>
+            </w:r>
+            <w:r>
+              <w:rPr>
+                <w:b/>
+                <w:bCs/>
+              </w:rPr>
+              <w:t xml:space="preserve">independent / co-melodic</w:t>
+            </w:r>
+            <w:r>
+              <w:t xml:space="preserve"> vs doubling guitar rhythm.</w:t>
+            </w:r>
+          </w:p>
+        </w:tc>
+        <w:tc>
+          <w:tcPr>
+            <w:tcW w:type="pct" w:w="3000%"/>
+          </w:tcPr>
+          <w:p>
+            <w:pPr>
+              <w:spacing w:after="60"/>
+            </w:pPr>
+            <w:r>
+              <w:t xml:space="preserve">*Angel Song* — Kenny Wheeler</w:t>
+            </w:r>
+          </w:p>
+        </w:tc>
+      </w:tr>
+      <w:tr>
+        <w:tc>
+          <w:tcPr>
+            <w:tcW w:type="pct" w:w="3000%"/>
+          </w:tcPr>
+          <w:p>
+            <w:pPr>
+              <w:spacing w:after="60"/>
+            </w:pPr>
+            <w:r>
+              <w:rPr>
+                <w:b/>
+                <w:bCs/>
+              </w:rPr>
+              <w:t xml:space="preserve">Balanced ECM Duo</w:t>
+            </w:r>
+          </w:p>
+        </w:tc>
+        <w:tc>
+          <w:tcPr>
+            <w:tcW w:type="pct" w:w="3000%"/>
+          </w:tcPr>
+          <w:p>
+            <w:pPr>
+              <w:spacing w:after="60"/>
+            </w:pPr>
+            <w:r>
+              <w:rPr>
+                <w:b/>
+                <w:bCs/>
+              </w:rPr>
+              <w:t xml:space="preserve">Default blend</w:t>
+            </w:r>
+            <w:r>
+              <w:t xml:space="preserve"> — lyrical and spacious, still grounded; good first stop for ECM-influenced duo writing.</w:t>
+            </w:r>
+          </w:p>
+        </w:tc>
+        <w:tc>
+          <w:tcPr>
+            <w:tcW w:type="pct" w:w="3000%"/>
+          </w:tcPr>
+          <w:p>
+            <w:pPr>
+              <w:spacing w:after="60"/>
+            </w:pPr>
+            <w:r>
+              <w:t xml:space="preserve">General ECM chamber-jazz orientation</w:t>
+            </w:r>
+          </w:p>
+        </w:tc>
+      </w:tr>
+      <w:tr>
+        <w:tc>
+          <w:tcPr>
+            <w:tcW w:type="pct" w:w="3000%"/>
+          </w:tcPr>
+          <w:p>
+            <w:pPr>
+              <w:spacing w:after="60"/>
+            </w:pPr>
+            <w:r>
+              <w:rPr>
+                <w:b/>
+                <w:bCs/>
+              </w:rPr>
+              <w:t xml:space="preserve">Metheny·Scofield</w:t>
+            </w:r>
+          </w:p>
+        </w:tc>
+        <w:tc>
+          <w:tcPr>
+            <w:tcW w:type="pct" w:w="3000%"/>
+          </w:tcPr>
+          <w:p>
+            <w:pPr>
+              <w:spacing w:after="60"/>
+            </w:pPr>
+            <w:r>
+              <w:rPr>
+                <w:b/>
+                <w:bCs/>
+              </w:rPr>
+              <w:t xml:space="preserve">Clearer pulse</w:t>
+            </w:r>
+            <w:r>
+              <w:t xml:space="preserve">, stronger sense of </w:t>
+            </w:r>
+            <w:r>
+              <w:rPr>
+                <w:b/>
+                <w:bCs/>
+              </w:rPr>
+              <w:t xml:space="preserve">key centre</w:t>
+            </w:r>
+            <w:r>
+              <w:t xml:space="preserve">, more continuous motion, light </w:t>
+            </w:r>
+            <w:r>
+              <w:rPr>
+                <w:b/>
+                <w:bCs/>
+              </w:rPr>
+              <w:t xml:space="preserve">folk/blues</w:t>
+            </w:r>
+            <w:r>
+              <w:t xml:space="preserve"> inflection in the surface recipe.</w:t>
+            </w:r>
+          </w:p>
+        </w:tc>
+        <w:tc>
+          <w:tcPr>
+            <w:tcW w:type="pct" w:w="3000%"/>
+          </w:tcPr>
+          <w:p>
+            <w:pPr>
+              <w:spacing w:after="60"/>
+            </w:pPr>
+            <w:r>
+              <w:t xml:space="preserve">*Memories of Home*, *Bright Size Life*</w:t>
+            </w:r>
+          </w:p>
+        </w:tc>
+      </w:tr>
+    </w:tbl>
+    <w:p>
+      <w:pPr>
+        <w:spacing w:after="160"/>
+      </w:pPr>
+    </w:p>
+    <w:p>
+      <w:pPr>
+        <w:pStyle w:val="Heading2"/>
+        <w:spacing w:after="100" w:before="160"/>
+      </w:pPr>
+      <w:r>
+        <w:t xml:space="preserve">Chamber ↔ Flow slider — plain English</w:t>
+      </w:r>
+    </w:p>
+    <w:p>
+      <w:pPr>
+        <w:spacing w:after="160"/>
+      </w:pPr>
+      <w:r>
+        <w:t xml:space="preserve">The slider does </w:t>
+      </w:r>
+      <w:r>
+        <w:rPr>
+          <w:b/>
+          <w:bCs/>
+        </w:rPr>
+        <w:t xml:space="preserve">not</w:t>
+      </w:r>
+      <w:r>
+        <w:t xml:space="preserve"> blend infinitely between styles. It picks </w:t>
+      </w:r>
+      <w:r>
+        <w:rPr>
+          <w:b/>
+          <w:bCs/>
+        </w:rPr>
+        <w:t xml:space="preserve">one of three</w:t>
+      </w:r>
+      <w:r>
+        <w:t xml:space="preserve"> ECM surface recipes:</w:t>
+      </w:r>
+    </w:p>
+    <w:p>
+      <w:pPr>
+        <w:spacing w:after="80"/>
+        <w:ind w:left="360" w:hanging="260"/>
+      </w:pPr>
+      <w:r>
+        <w:t xml:space="preserve">• </w:t>
+      </w:r>
+      <w:r>
+        <w:rPr>
+          <w:b/>
+          <w:bCs/>
+        </w:rPr>
+        <w:t xml:space="preserve">Toward Chamber (left):</w:t>
+      </w:r>
+      <w:r>
+        <w:t xml:space="preserve"> Values in the </w:t>
+      </w:r>
+      <w:r>
+        <w:rPr>
+          <w:b/>
+          <w:bCs/>
+        </w:rPr>
+        <w:t xml:space="preserve">lower third</w:t>
+      </w:r>
+      <w:r>
+        <w:t xml:space="preserve"> select </w:t>
+      </w:r>
+      <w:r>
+        <w:rPr>
+          <w:b/>
+          <w:bCs/>
+        </w:rPr>
+        <w:t xml:space="preserve">Angel Song</w:t>
+      </w:r>
+      <w:r>
+        <w:t xml:space="preserve"> — sparser, floatier, softer cadences, more deferred phrase onsets, bass more its own voice.</w:t>
+      </w:r>
+    </w:p>
+    <w:p>
+      <w:pPr>
+        <w:spacing w:after="80"/>
+        <w:ind w:left="360" w:hanging="260"/>
+      </w:pPr>
+      <w:r>
+        <w:t xml:space="preserve">• </w:t>
+      </w:r>
+      <w:r>
+        <w:rPr>
+          <w:b/>
+          <w:bCs/>
+        </w:rPr>
+        <w:t xml:space="preserve">Middle third:</w:t>
+      </w:r>
+      <w:r>
+        <w:t xml:space="preserve"> </w:t>
+      </w:r>
+      <w:r>
+        <w:rPr>
+          <w:b/>
+          <w:bCs/>
+        </w:rPr>
+        <w:t xml:space="preserve">Balanced ECM Duo</w:t>
+      </w:r>
+      <w:r>
+        <w:t xml:space="preserve">.</w:t>
+      </w:r>
+    </w:p>
+    <w:p>
+      <w:pPr>
+        <w:spacing w:after="80"/>
+        <w:ind w:left="360" w:hanging="260"/>
+      </w:pPr>
+      <w:r>
+        <w:t xml:space="preserve">• </w:t>
+      </w:r>
+      <w:r>
+        <w:rPr>
+          <w:b/>
+          <w:bCs/>
+        </w:rPr>
+        <w:t xml:space="preserve">Toward Flow (right):</w:t>
+      </w:r>
+      <w:r>
+        <w:t xml:space="preserve"> </w:t>
+      </w:r>
+      <w:r>
+        <w:rPr>
+          <w:b/>
+          <w:bCs/>
+        </w:rPr>
+        <w:t xml:space="preserve">Upper third</w:t>
+      </w:r>
+      <w:r>
+        <w:t xml:space="preserve"> selects </w:t>
+      </w:r>
+      <w:r>
+        <w:rPr>
+          <w:b/>
+          <w:bCs/>
+        </w:rPr>
+        <w:t xml:space="preserve">Metheny·Scofield</w:t>
+      </w:r>
+      <w:r>
+        <w:t xml:space="preserve"> — relatively denser motion, a steadier pocket, less extreme space and cadence softening than Angel Song.</w:t>
+      </w:r>
+    </w:p>
+    <w:p>
+      <w:pPr>
+        <w:spacing w:after="160"/>
+      </w:pPr>
+      <w:r>
+        <w:t xml:space="preserve">Internally: `t &lt; 1/3` → </w:t>
+      </w:r>
+      <w:r>
+        <w:rPr>
+          <w:b/>
+          <w:bCs/>
+        </w:rPr>
+        <w:t xml:space="preserve">`angel_song`</w:t>
+      </w:r>
+      <w:r>
+        <w:t xml:space="preserve">; `1/3 ≤ t &lt; 2/3` → </w:t>
+      </w:r>
+      <w:r>
+        <w:rPr>
+          <w:b/>
+          <w:bCs/>
+        </w:rPr>
+        <w:t xml:space="preserve">`balanced`</w:t>
+      </w:r>
+      <w:r>
+        <w:t xml:space="preserve">; `t ≥ 2/3` → </w:t>
+      </w:r>
+      <w:r>
+        <w:rPr>
+          <w:b/>
+          <w:bCs/>
+        </w:rPr>
+        <w:t xml:space="preserve">`metheny_scofield`</w:t>
+      </w:r>
+      <w:r>
+        <w:t xml:space="preserve"> (`HomeGenerate.tsx`: </w:t>
+      </w:r>
+      <w:r>
+        <w:rPr>
+          <w:b/>
+          <w:bCs/>
+        </w:rPr>
+        <w:t xml:space="preserve">`ecmChamberFlow01ToMode`</w:t>
+      </w:r>
+      <w:r>
+        <w:t xml:space="preserve">).</w:t>
+      </w:r>
+    </w:p>
+    <w:p>
+      <w:pPr>
+        <w:pStyle w:val="Heading2"/>
+        <w:spacing w:after="100" w:before="160"/>
+      </w:pPr>
+      <w:r>
+        <w:t xml:space="preserve">Six example applications</w:t>
+      </w:r>
+    </w:p>
+    <w:p>
+      <w:pPr>
+        <w:spacing w:after="160"/>
+      </w:pPr>
+      <w:r>
+        <w:t xml:space="preserve">1. </w:t>
+      </w:r>
+      <w:r>
+        <w:rPr>
+          <w:b/>
+          <w:bCs/>
+        </w:rPr>
+        <w:t xml:space="preserve">Guitar + upright bass duo, Angel Song</w:t>
+      </w:r>
+      <w:r>
+        <w:t xml:space="preserve"> — Sparse, floating, bittersweet chamber mood; orientation toward Wheeler / Frisell / Holland-style </w:t>
+      </w:r>
+      <w:r>
+        <w:rPr>
+          <w:b/>
+          <w:bCs/>
+        </w:rPr>
+        <w:t xml:space="preserve">space and countermelody</w:t>
+      </w:r>
+      <w:r>
+        <w:t xml:space="preserve">, not a transcription. 2. </w:t>
+      </w:r>
+      <w:r>
+        <w:rPr>
+          <w:b/>
+          <w:bCs/>
+        </w:rPr>
+        <w:t xml:space="preserve">Guitar + upright bass duo, Metheny·Scofield</w:t>
+      </w:r>
+      <w:r>
+        <w:t xml:space="preserve"> — Conversational </w:t>
+      </w:r>
+      <w:r>
+        <w:rPr>
+          <w:b/>
+          <w:bCs/>
+        </w:rPr>
+        <w:t xml:space="preserve">folk-jazz</w:t>
+      </w:r>
+      <w:r>
+        <w:t xml:space="preserve">, clearer time feel, stronger tonal centre; orientation toward *Memories of Home*-style clarity. 3. </w:t>
+      </w:r>
+      <w:r>
+        <w:rPr>
+          <w:b/>
+          <w:bCs/>
+        </w:rPr>
+        <w:t xml:space="preserve">Guitar + upright bass duo, Balanced</w:t>
+      </w:r>
+      <w:r>
+        <w:t xml:space="preserve"> — General </w:t>
+      </w:r>
+      <w:r>
+        <w:rPr>
+          <w:b/>
+          <w:bCs/>
+        </w:rPr>
+        <w:t xml:space="preserve">ECM-influenced</w:t>
+      </w:r>
+      <w:r>
+        <w:t xml:space="preserve"> duo writing when you want neither extreme. 4. </w:t>
+      </w:r>
+      <w:r>
+        <w:rPr>
+          <w:b/>
+          <w:bCs/>
+        </w:rPr>
+        <w:t xml:space="preserve">ECM Chamber songwriter only</w:t>
+      </w:r>
+      <w:r>
+        <w:t xml:space="preserve"> (no </w:t>
+      </w:r>
+      <w:r>
+        <w:rPr>
+          <w:b/>
+          <w:bCs/>
+        </w:rPr>
+        <w:t xml:space="preserve">ECM</w:t>
+      </w:r>
+      <w:r>
+        <w:t xml:space="preserve"> / </w:t>
+      </w:r>
+      <w:r>
+        <w:rPr>
+          <w:b/>
+          <w:bCs/>
+        </w:rPr>
+        <w:t xml:space="preserve">ECM Chamber</w:t>
+      </w:r>
+      <w:r>
+        <w:t xml:space="preserve"> style) — </w:t>
+      </w:r>
+      <w:r>
+        <w:rPr>
+          <w:b/>
+          <w:bCs/>
+        </w:rPr>
+        <w:t xml:space="preserve">Harmonic colour</w:t>
+      </w:r>
+      <w:r>
+        <w:t xml:space="preserve"> (Lydian primary, m11 colours, m7b5 targets, phrase grid, leap peaks) </w:t>
+      </w:r>
+      <w:r>
+        <w:rPr>
+          <w:b/>
+          <w:bCs/>
+        </w:rPr>
+        <w:t xml:space="preserve">without</w:t>
+      </w:r>
+      <w:r>
+        <w:t xml:space="preserve"> the ECM style surface nudges. Use when you want ECM harmony language under a different Style Engine profile. 5. </w:t>
+      </w:r>
+      <w:r>
+        <w:rPr>
+          <w:b/>
+          <w:bCs/>
+        </w:rPr>
+        <w:t xml:space="preserve">ECM Style only</w:t>
+      </w:r>
+      <w:r>
+        <w:t xml:space="preserve"> (e.g. </w:t>
+      </w:r>
+      <w:r>
+        <w:rPr>
+          <w:b/>
+          <w:bCs/>
+        </w:rPr>
+        <w:t xml:space="preserve">STYLE_ECM</w:t>
+      </w:r>
+      <w:r>
+        <w:t xml:space="preserve"> + </w:t>
+      </w:r>
+      <w:r>
+        <w:rPr>
+          <w:b/>
+          <w:bCs/>
+        </w:rPr>
+        <w:t xml:space="preserve">James Brown</w:t>
+      </w:r>
+      <w:r>
+        <w:t xml:space="preserve"> or another writer) — </w:t>
+      </w:r>
+      <w:r>
+        <w:rPr>
+          <w:b/>
+          <w:bCs/>
+        </w:rPr>
+        <w:t xml:space="preserve">Surface spacing, phrase looseness, bass independence, cadence softness</w:t>
+      </w:r>
+      <w:r>
+        <w:t xml:space="preserve"> without </w:t>
+      </w:r>
+      <w:r>
+        <w:rPr>
+          <w:b/>
+          <w:bCs/>
+        </w:rPr>
+        <w:t xml:space="preserve">ECM Chamber</w:t>
+      </w:r>
+      <w:r>
+        <w:t xml:space="preserve"> chord-symbol machinery. Use when you want ECM </w:t>
+      </w:r>
+      <w:r>
+        <w:rPr>
+          <w:b/>
+          <w:bCs/>
+        </w:rPr>
+        <w:t xml:space="preserve">feel</w:t>
+      </w:r>
+      <w:r>
+        <w:t xml:space="preserve"> on non-ECM harmony. 6. </w:t>
+      </w:r>
+      <w:r>
+        <w:rPr>
+          <w:b/>
+          <w:bCs/>
+        </w:rPr>
+        <w:t xml:space="preserve">Full stack</w:t>
+      </w:r>
+      <w:r>
+        <w:t xml:space="preserve"> — Primary </w:t>
+      </w:r>
+      <w:r>
+        <w:rPr>
+          <w:b/>
+          <w:bCs/>
+        </w:rPr>
+        <w:t xml:space="preserve">`ecm_chamber`</w:t>
+      </w:r>
+      <w:r>
+        <w:t xml:space="preserve"> + </w:t>
+      </w:r>
+      <w:r>
+        <w:rPr>
+          <w:b/>
+          <w:bCs/>
+        </w:rPr>
+        <w:t xml:space="preserve">`STYLE_ECM_CHAMBER`</w:t>
+      </w:r>
+      <w:r>
+        <w:t xml:space="preserve"> + </w:t>
+      </w:r>
+      <w:r>
+        <w:rPr>
+          <w:b/>
+          <w:bCs/>
+        </w:rPr>
+        <w:t xml:space="preserve">Angel Song</w:t>
+      </w:r>
+      <w:r>
+        <w:t xml:space="preserve"> mode — </w:t>
+      </w:r>
+      <w:r>
+        <w:rPr>
+          <w:b/>
+          <w:bCs/>
+        </w:rPr>
+        <w:t xml:space="preserve">Maximum</w:t>
+      </w:r>
+      <w:r>
+        <w:t xml:space="preserve"> alignment of ECM Chamber harmony slice + ECM Chamber style surface + sparsest preset; suited to </w:t>
+      </w:r>
+      <w:r>
+        <w:rPr>
+          <w:b/>
+          <w:bCs/>
+        </w:rPr>
+        <w:t xml:space="preserve">chamber</w:t>
+      </w:r>
+      <w:r>
+        <w:t xml:space="preserve"> textures (e.g. flugelhorn–guitar–bass orientation in lesson framing).</w:t>
+      </w:r>
+    </w:p>
+    <w:p>
+      <w:pPr>
+        <w:pStyle w:val="Heading2"/>
+        <w:spacing w:after="100" w:before="160"/>
+      </w:pPr>
+      <w:r>
+        <w:t xml:space="preserve">GCE note — ECM Chamber melodic identity</w:t>
+      </w:r>
+    </w:p>
+    <w:p>
+      <w:pPr>
+        <w:spacing w:after="160"/>
+      </w:pPr>
+      <w:r>
+        <w:rPr>
+          <w:b/>
+          <w:bCs/>
+        </w:rPr>
+        <w:t xml:space="preserve">ECM Chamber</w:t>
+      </w:r>
+      <w:r>
+        <w:t xml:space="preserve"> shipped around </w:t>
+      </w:r>
+      <w:r>
+        <w:rPr>
+          <w:b/>
+          <w:bCs/>
+        </w:rPr>
+        <w:t xml:space="preserve">7.8/10</w:t>
+      </w:r>
+      <w:r>
+        <w:t xml:space="preserve"> overall on the </w:t>
+      </w:r>
+      <w:r>
+        <w:rPr>
+          <w:b/>
+          <w:bCs/>
+        </w:rPr>
+        <w:t xml:space="preserve">GCE</w:t>
+      </w:r>
+      <w:r>
+        <w:t xml:space="preserve"> rubric; the recurring weakness was </w:t>
+      </w:r>
+      <w:r>
+        <w:rPr>
+          <w:b/>
+          <w:bCs/>
+        </w:rPr>
+        <w:t xml:space="preserve">Melodic Identity</w:t>
+      </w:r>
+      <w:r>
+        <w:t xml:space="preserve">. Recent slice work targeted that lane (</w:t>
+      </w:r>
+      <w:r>
+        <w:rPr>
+          <w:b/>
+          <w:bCs/>
+        </w:rPr>
+        <w:t xml:space="preserve">wide leap peaks</w:t>
+      </w:r>
+      <w:r>
+        <w:t xml:space="preserve">, </w:t>
+      </w:r>
+      <w:r>
+        <w:rPr>
+          <w:b/>
+          <w:bCs/>
+        </w:rPr>
+        <w:t xml:space="preserve">asymmetric phrase grid</w:t>
+      </w:r>
+      <w:r>
+        <w:t xml:space="preserve">) so melodic character reads more intentional in sparse textures — re-score exports after major engine updates if you rely on GCE numbers for teaching.</w:t>
       </w:r>
     </w:p>
     <w:p>

</xml_diff>

<commit_message>
docs: Bill Evans handbook section + roadmap complete
Co-authored-by: Cursor <cursoragent@cursor.com>
</commit_message>
<xml_diff>
--- a/docs/COMPOSER_OS_PLAYBOOK.docx
+++ b/docs/COMPOSER_OS_PLAYBOOK.docx
@@ -16419,6 +16419,1466 @@
       </w:r>
       <w:r>
         <w:t xml:space="preserve">.</w:t>
+      </w:r>
+    </w:p>
+    <w:p>
+      <w:pPr>
+        <w:pStyle w:val="Heading2"/>
+        <w:spacing w:after="100" w:before="160"/>
+      </w:pPr>
+      <w:r>
+        <w:t xml:space="preserve">Bill Evans (Song Mode — impressionist / rootless-symbol slice)</w:t>
+      </w:r>
+    </w:p>
+    <w:p>
+      <w:pPr>
+        <w:spacing w:after="160"/>
+      </w:pPr>
+      <w:r>
+        <w:rPr>
+          <w:b/>
+          <w:bCs/>
+        </w:rPr>
+        <w:t xml:space="preserve">Still current:</w:t>
+      </w:r>
+      <w:r>
+        <w:t xml:space="preserve"> </w:t>
+      </w:r>
+      <w:r>
+        <w:rPr>
+          <w:b/>
+          <w:bCs/>
+        </w:rPr>
+        <w:t xml:space="preserve">`billEvansSlice.ts`</w:t>
+      </w:r>
+      <w:r>
+        <w:t xml:space="preserve">, </w:t>
+      </w:r>
+      <w:r>
+        <w:rPr>
+          <w:b/>
+          <w:bCs/>
+        </w:rPr>
+        <w:t xml:space="preserve">`precomputeBillEvansEffectiveHarmonyBars`</w:t>
+      </w:r>
+      <w:r>
+        <w:t xml:space="preserve">, </w:t>
+      </w:r>
+      <w:r>
+        <w:rPr>
+          <w:b/>
+          <w:bCs/>
+        </w:rPr>
+        <w:t xml:space="preserve">`billEvansEffectiveHarmonyBars`</w:t>
+      </w:r>
+      <w:r>
+        <w:t xml:space="preserve"> feeding </w:t>
+      </w:r>
+      <w:r>
+        <w:rPr>
+          <w:b/>
+          <w:bCs/>
+        </w:rPr>
+        <w:t xml:space="preserve">`getChordForBar`</w:t>
+      </w:r>
+      <w:r>
+        <w:t xml:space="preserve"> and locked MusicXML truth, smoke </w:t>
+      </w:r>
+      <w:r>
+        <w:rPr>
+          <w:b/>
+          <w:bCs/>
+        </w:rPr>
+        <w:t xml:space="preserve">`billEvansSliceSmoke.test.ts`</w:t>
+      </w:r>
+      <w:r>
+        <w:t xml:space="preserve">.</w:t>
+      </w:r>
+    </w:p>
+    <w:p>
+      <w:pPr>
+        <w:spacing w:after="160"/>
+      </w:pPr>
+      <w:r>
+        <w:t xml:space="preserve">The slice </w:t>
+      </w:r>
+      <w:r>
+        <w:rPr>
+          <w:b/>
+          <w:bCs/>
+        </w:rPr>
+        <w:t xml:space="preserve">only rewrites chord symbols</w:t>
+      </w:r>
+      <w:r>
+        <w:t xml:space="preserve"> on the duo golden path (Bill Evans–flavoured tertian richness, sus/quartal hints, delayed tonic landings); there is no separate </w:t>
+      </w:r>
+      <w:r>
+        <w:rPr>
+          <w:b/>
+          <w:bCs/>
+        </w:rPr>
+        <w:t xml:space="preserve">`ChordEvent`</w:t>
+      </w:r>
+      <w:r>
+        <w:t xml:space="preserve"> extension layer.</w:t>
+      </w:r>
+    </w:p>
+    <w:p>
+      <w:pPr>
+        <w:pStyle w:val="Heading3"/>
+        <w:spacing w:after="80" w:before="120"/>
+      </w:pPr>
+      <w:r>
+        <w:t xml:space="preserve">Asymmetric phrase grid</w:t>
+      </w:r>
+    </w:p>
+    <w:p>
+      <w:pPr>
+        <w:spacing w:after="160"/>
+      </w:pPr>
+      <w:r>
+        <w:rPr>
+          <w:b/>
+          <w:bCs/>
+        </w:rPr>
+        <w:t xml:space="preserve">`computeBillEvansPhrasePositions(totalBars, seed)`</w:t>
+      </w:r>
+      <w:r>
+        <w:t xml:space="preserve"> assigns </w:t>
+      </w:r>
+      <w:r>
+        <w:rPr>
+          <w:b/>
+          <w:bCs/>
+        </w:rPr>
+        <w:t xml:space="preserve">phraseStart</w:t>
+      </w:r>
+      <w:r>
+        <w:t xml:space="preserve"> / </w:t>
+      </w:r>
+      <w:r>
+        <w:rPr>
+          <w:b/>
+          <w:bCs/>
+        </w:rPr>
+        <w:t xml:space="preserve">phraseMiddle</w:t>
+      </w:r>
+      <w:r>
+        <w:t xml:space="preserve"> / </w:t>
+      </w:r>
+      <w:r>
+        <w:rPr>
+          <w:b/>
+          <w:bCs/>
+        </w:rPr>
+        <w:t xml:space="preserve">phraseFinal</w:t>
+      </w:r>
+      <w:r>
+        <w:t xml:space="preserve"> using variable phrase lengths </w:t>
+      </w:r>
+      <w:r>
+        <w:rPr>
+          <w:b/>
+          <w:bCs/>
+        </w:rPr>
+        <w:t xml:space="preserve">3, 4, or 5 bars</w:t>
+      </w:r>
+      <w:r>
+        <w:t xml:space="preserve"> weighted </w:t>
+      </w:r>
+      <w:r>
+        <w:rPr>
+          <w:b/>
+          <w:bCs/>
+        </w:rPr>
+        <w:t xml:space="preserve">22% / 56% / 22%</w:t>
+      </w:r>
+      <w:r>
+        <w:t xml:space="preserve"> (same rolling-bar layout pattern as ECM Chamber / variable-grid Bacharach). Each </w:t>
+      </w:r>
+      <w:r>
+        <w:rPr>
+          <w:b/>
+          <w:bCs/>
+        </w:rPr>
+        <w:t xml:space="preserve">phraseStart</w:t>
+      </w:r>
+      <w:r>
+        <w:t xml:space="preserve"> emits </w:t>
+      </w:r>
+      <w:r>
+        <w:rPr>
+          <w:b/>
+          <w:bCs/>
+        </w:rPr>
+        <w:t xml:space="preserve">`be:asym_phrase@bar{N}`</w:t>
+      </w:r>
+      <w:r>
+        <w:t xml:space="preserve">.</w:t>
+      </w:r>
+    </w:p>
+    <w:p>
+      <w:pPr>
+        <w:pStyle w:val="Heading3"/>
+        <w:spacing w:after="80" w:before="120"/>
+      </w:pPr>
+      <w:r>
+        <w:t xml:space="preserve">Retuned base pass rates (seeded probability)</w:t>
+      </w:r>
+    </w:p>
+    <w:tbl>
+      <w:tblPr>
+        <w:tblW w:type="pct" w:w="100%"/>
+        <w:tblBorders>
+          <w:top w:val="single" w:color="auto" w:sz="4"/>
+          <w:left w:val="single" w:color="auto" w:sz="4"/>
+          <w:bottom w:val="single" w:color="auto" w:sz="4"/>
+          <w:right w:val="single" w:color="auto" w:sz="4"/>
+          <w:insideH w:val="single" w:color="auto" w:sz="4"/>
+          <w:insideV w:val="single" w:color="auto" w:sz="4"/>
+        </w:tblBorders>
+      </w:tblPr>
+      <w:tblGrid>
+        <w:gridCol w:w="3000"/>
+        <w:gridCol w:w="3000"/>
+        <w:gridCol w:w="3000"/>
+      </w:tblGrid>
+      <w:tr>
+        <w:tc>
+          <w:tcPr>
+            <w:tcW w:type="pct" w:w="3000%"/>
+          </w:tcPr>
+          <w:p>
+            <w:pPr>
+              <w:spacing w:after="60"/>
+            </w:pPr>
+            <w:r>
+              <w:t xml:space="preserve">Device</w:t>
+            </w:r>
+          </w:p>
+        </w:tc>
+        <w:tc>
+          <w:tcPr>
+            <w:tcW w:type="pct" w:w="3000%"/>
+          </w:tcPr>
+          <w:p>
+            <w:pPr>
+              <w:spacing w:after="60"/>
+            </w:pPr>
+            <w:r>
+              <w:t xml:space="preserve">Receipt</w:t>
+            </w:r>
+          </w:p>
+        </w:tc>
+        <w:tc>
+          <w:tcPr>
+            <w:tcW w:type="pct" w:w="3000%"/>
+          </w:tcPr>
+          <w:p>
+            <w:pPr>
+              <w:spacing w:after="60"/>
+            </w:pPr>
+            <w:r>
+              <w:t xml:space="preserve">Target rate</w:t>
+            </w:r>
+          </w:p>
+        </w:tc>
+      </w:tr>
+      <w:tr>
+        <w:tc>
+          <w:tcPr>
+            <w:tcW w:type="pct" w:w="3000%"/>
+          </w:tcPr>
+          <w:p>
+            <w:pPr>
+              <w:spacing w:after="60"/>
+            </w:pPr>
+            <w:r>
+              <w:t xml:space="preserve">Dominant → 13 colour</w:t>
+            </w:r>
+          </w:p>
+        </w:tc>
+        <w:tc>
+          <w:tcPr>
+            <w:tcW w:type="pct" w:w="3000%"/>
+          </w:tcPr>
+          <w:p>
+            <w:pPr>
+              <w:spacing w:after="60"/>
+            </w:pPr>
+            <w:r>
+              <w:t xml:space="preserve">`be:dom_extension@bar{N}`</w:t>
+            </w:r>
+          </w:p>
+        </w:tc>
+        <w:tc>
+          <w:tcPr>
+            <w:tcW w:type="pct" w:w="3000%"/>
+          </w:tcPr>
+          <w:p>
+            <w:pPr>
+              <w:spacing w:after="60"/>
+            </w:pPr>
+            <w:r>
+              <w:rPr>
+                <w:b/>
+                <w:bCs/>
+              </w:rPr>
+              <w:t xml:space="preserve">34%</w:t>
+            </w:r>
+          </w:p>
+        </w:tc>
+      </w:tr>
+      <w:tr>
+        <w:tc>
+          <w:tcPr>
+            <w:tcW w:type="pct" w:w="3000%"/>
+          </w:tcPr>
+          <w:p>
+            <w:pPr>
+              <w:spacing w:after="60"/>
+            </w:pPr>
+            <w:r>
+              <w:t xml:space="preserve">Maj7 family → maj9</w:t>
+            </w:r>
+          </w:p>
+        </w:tc>
+        <w:tc>
+          <w:tcPr>
+            <w:tcW w:type="pct" w:w="3000%"/>
+          </w:tcPr>
+          <w:p>
+            <w:pPr>
+              <w:spacing w:after="60"/>
+            </w:pPr>
+            <w:r>
+              <w:t xml:space="preserve">`be:maj_colour@bar{N}`</w:t>
+            </w:r>
+          </w:p>
+        </w:tc>
+        <w:tc>
+          <w:tcPr>
+            <w:tcW w:type="pct" w:w="3000%"/>
+          </w:tcPr>
+          <w:p>
+            <w:pPr>
+              <w:spacing w:after="60"/>
+            </w:pPr>
+            <w:r>
+              <w:rPr>
+                <w:b/>
+                <w:bCs/>
+              </w:rPr>
+              <w:t xml:space="preserve">42%</w:t>
+            </w:r>
+          </w:p>
+        </w:tc>
+      </w:tr>
+      <w:tr>
+        <w:tc>
+          <w:tcPr>
+            <w:tcW w:type="pct" w:w="3000%"/>
+          </w:tcPr>
+          <w:p>
+            <w:pPr>
+              <w:spacing w:after="60"/>
+            </w:pPr>
+            <w:r>
+              <w:t xml:space="preserve">m7 → m11 quartal hint</w:t>
+            </w:r>
+          </w:p>
+        </w:tc>
+        <w:tc>
+          <w:tcPr>
+            <w:tcW w:type="pct" w:w="3000%"/>
+          </w:tcPr>
+          <w:p>
+            <w:pPr>
+              <w:spacing w:after="60"/>
+            </w:pPr>
+            <w:r>
+              <w:t xml:space="preserve">`be:quartal_m11@bar{N}`</w:t>
+            </w:r>
+          </w:p>
+        </w:tc>
+        <w:tc>
+          <w:tcPr>
+            <w:tcW w:type="pct" w:w="3000%"/>
+          </w:tcPr>
+          <w:p>
+            <w:pPr>
+              <w:spacing w:after="60"/>
+            </w:pPr>
+            <w:r>
+              <w:rPr>
+                <w:b/>
+                <w:bCs/>
+              </w:rPr>
+              <w:t xml:space="preserve">24%</w:t>
+            </w:r>
+          </w:p>
+        </w:tc>
+      </w:tr>
+      <w:tr>
+        <w:tc>
+          <w:tcPr>
+            <w:tcW w:type="pct" w:w="3000%"/>
+          </w:tcPr>
+          <w:p>
+            <w:pPr>
+              <w:spacing w:after="60"/>
+            </w:pPr>
+            <w:r>
+              <w:t xml:space="preserve">Dominant → 7sus4</w:t>
+            </w:r>
+          </w:p>
+        </w:tc>
+        <w:tc>
+          <w:tcPr>
+            <w:tcW w:type="pct" w:w="3000%"/>
+          </w:tcPr>
+          <w:p>
+            <w:pPr>
+              <w:spacing w:after="60"/>
+            </w:pPr>
+            <w:r>
+              <w:t xml:space="preserve">`be:sus_dom@bar{N}`</w:t>
+            </w:r>
+          </w:p>
+        </w:tc>
+        <w:tc>
+          <w:tcPr>
+            <w:tcW w:type="pct" w:w="3000%"/>
+          </w:tcPr>
+          <w:p>
+            <w:pPr>
+              <w:spacing w:after="60"/>
+            </w:pPr>
+            <w:r>
+              <w:rPr>
+                <w:b/>
+                <w:bCs/>
+              </w:rPr>
+              <w:t xml:space="preserve">18%</w:t>
+            </w:r>
+          </w:p>
+        </w:tc>
+      </w:tr>
+      <w:tr>
+        <w:tc>
+          <w:tcPr>
+            <w:tcW w:type="pct" w:w="3000%"/>
+          </w:tcPr>
+          <w:p>
+            <w:pPr>
+              <w:spacing w:after="60"/>
+            </w:pPr>
+            <w:r>
+              <w:t xml:space="preserve">Phrase-final tonic → maj9 / 6/9</w:t>
+            </w:r>
+          </w:p>
+        </w:tc>
+        <w:tc>
+          <w:tcPr>
+            <w:tcW w:type="pct" w:w="3000%"/>
+          </w:tcPr>
+          <w:p>
+            <w:pPr>
+              <w:spacing w:after="60"/>
+            </w:pPr>
+            <w:r>
+              <w:t xml:space="preserve">`be:delayed_tonic@bar{N}`</w:t>
+            </w:r>
+          </w:p>
+        </w:tc>
+        <w:tc>
+          <w:tcPr>
+            <w:tcW w:type="pct" w:w="3000%"/>
+          </w:tcPr>
+          <w:p>
+            <w:pPr>
+              <w:spacing w:after="60"/>
+            </w:pPr>
+            <w:r>
+              <w:rPr>
+                <w:b/>
+                <w:bCs/>
+              </w:rPr>
+              <w:t xml:space="preserve">44%</w:t>
+            </w:r>
+          </w:p>
+        </w:tc>
+      </w:tr>
+      <w:tr>
+        <w:tc>
+          <w:tcPr>
+            <w:tcW w:type="pct" w:w="3000%"/>
+          </w:tcPr>
+          <w:p>
+            <w:pPr>
+              <w:spacing w:after="60"/>
+            </w:pPr>
+            <w:r>
+              <w:t xml:space="preserve">Gentle ii–V prep</w:t>
+            </w:r>
+          </w:p>
+        </w:tc>
+        <w:tc>
+          <w:tcPr>
+            <w:tcW w:type="pct" w:w="3000%"/>
+          </w:tcPr>
+          <w:p>
+            <w:pPr>
+              <w:spacing w:after="60"/>
+            </w:pPr>
+            <w:r>
+              <w:t xml:space="preserve">`be:gentle_ii_V@bar{N}`</w:t>
+            </w:r>
+          </w:p>
+        </w:tc>
+        <w:tc>
+          <w:tcPr>
+            <w:tcW w:type="pct" w:w="3000%"/>
+          </w:tcPr>
+          <w:p>
+            <w:pPr>
+              <w:spacing w:after="60"/>
+            </w:pPr>
+            <w:r>
+              <w:rPr>
+                <w:b/>
+                <w:bCs/>
+              </w:rPr>
+              <w:t xml:space="preserve">31%</w:t>
+            </w:r>
+          </w:p>
+        </w:tc>
+      </w:tr>
+    </w:tbl>
+    <w:p>
+      <w:pPr>
+        <w:spacing w:after="160"/>
+      </w:pPr>
+    </w:p>
+    <w:p>
+      <w:pPr>
+        <w:pStyle w:val="Heading3"/>
+        <w:spacing w:after="80" w:before="120"/>
+      </w:pPr>
+      <w:r>
+        <w:t xml:space="preserve">Six newer passes (five harmony passes + phrase grid)</w:t>
+      </w:r>
+    </w:p>
+    <w:tbl>
+      <w:tblPr>
+        <w:tblW w:type="pct" w:w="100%"/>
+        <w:tblBorders>
+          <w:top w:val="single" w:color="auto" w:sz="4"/>
+          <w:left w:val="single" w:color="auto" w:sz="4"/>
+          <w:bottom w:val="single" w:color="auto" w:sz="4"/>
+          <w:right w:val="single" w:color="auto" w:sz="4"/>
+          <w:insideH w:val="single" w:color="auto" w:sz="4"/>
+          <w:insideV w:val="single" w:color="auto" w:sz="4"/>
+        </w:tblBorders>
+      </w:tblPr>
+      <w:tblGrid>
+        <w:gridCol w:w="3000"/>
+        <w:gridCol w:w="3000"/>
+        <w:gridCol w:w="3000"/>
+      </w:tblGrid>
+      <w:tr>
+        <w:tc>
+          <w:tcPr>
+            <w:tcW w:type="pct" w:w="3000%"/>
+          </w:tcPr>
+          <w:p>
+            <w:pPr>
+              <w:spacing w:after="60"/>
+            </w:pPr>
+            <w:r>
+              <w:t xml:space="preserve">Pass</w:t>
+            </w:r>
+          </w:p>
+        </w:tc>
+        <w:tc>
+          <w:tcPr>
+            <w:tcW w:type="pct" w:w="3000%"/>
+          </w:tcPr>
+          <w:p>
+            <w:pPr>
+              <w:spacing w:after="60"/>
+            </w:pPr>
+            <w:r>
+              <w:t xml:space="preserve">Role</w:t>
+            </w:r>
+          </w:p>
+        </w:tc>
+        <w:tc>
+          <w:tcPr>
+            <w:tcW w:type="pct" w:w="3000%"/>
+          </w:tcPr>
+          <w:p>
+            <w:pPr>
+              <w:spacing w:after="60"/>
+            </w:pPr>
+            <w:r>
+              <w:t xml:space="preserve">Receipt</w:t>
+            </w:r>
+          </w:p>
+        </w:tc>
+      </w:tr>
+      <w:tr>
+        <w:tc>
+          <w:tcPr>
+            <w:tcW w:type="pct" w:w="3000%"/>
+          </w:tcPr>
+          <w:p>
+            <w:pPr>
+              <w:spacing w:after="60"/>
+            </w:pPr>
+            <w:r>
+              <w:rPr>
+                <w:b/>
+                <w:bCs/>
+              </w:rPr>
+              <w:t xml:space="preserve">Asymmetric phrase grid</w:t>
+            </w:r>
+          </w:p>
+        </w:tc>
+        <w:tc>
+          <w:tcPr>
+            <w:tcW w:type="pct" w:w="3000%"/>
+          </w:tcPr>
+          <w:p>
+            <w:pPr>
+              <w:spacing w:after="60"/>
+            </w:pPr>
+            <w:r>
+              <w:t xml:space="preserve">Replaces fixed 4-bar cycle; </w:t>
+            </w:r>
+            <w:r>
+              <w:rPr>
+                <w:b/>
+                <w:bCs/>
+              </w:rPr>
+              <w:t xml:space="preserve">phraseStart</w:t>
+            </w:r>
+            <w:r>
+              <w:t xml:space="preserve"> marks each new phrase</w:t>
+            </w:r>
+          </w:p>
+        </w:tc>
+        <w:tc>
+          <w:tcPr>
+            <w:tcW w:type="pct" w:w="3000%"/>
+          </w:tcPr>
+          <w:p>
+            <w:pPr>
+              <w:spacing w:after="60"/>
+            </w:pPr>
+            <w:r>
+              <w:t xml:space="preserve">`be:asym_phrase@bar{N}`</w:t>
+            </w:r>
+          </w:p>
+        </w:tc>
+      </w:tr>
+      <w:tr>
+        <w:tc>
+          <w:tcPr>
+            <w:tcW w:type="pct" w:w="3000%"/>
+          </w:tcPr>
+          <w:p>
+            <w:pPr>
+              <w:spacing w:after="60"/>
+            </w:pPr>
+            <w:r>
+              <w:rPr>
+                <w:b/>
+                <w:bCs/>
+              </w:rPr>
+              <w:t xml:space="preserve">Diminished delayed resolution</w:t>
+            </w:r>
+          </w:p>
+        </w:tc>
+        <w:tc>
+          <w:tcPr>
+            <w:tcW w:type="pct" w:w="3000%"/>
+          </w:tcPr>
+          <w:p>
+            <w:pPr>
+              <w:spacing w:after="60"/>
+            </w:pPr>
+            <w:r>
+              <w:t xml:space="preserve">Phrase-final </w:t>
+            </w:r>
+            <w:r>
+              <w:rPr>
+                <w:b/>
+                <w:bCs/>
+              </w:rPr>
+              <w:t xml:space="preserve">major</w:t>
+            </w:r>
+            <w:r>
+              <w:t xml:space="preserve"> cadence: preceding </w:t>
+            </w:r>
+            <w:r>
+              <w:rPr>
+                <w:b/>
+                <w:bCs/>
+              </w:rPr>
+              <w:t xml:space="preserve">dominant</w:t>
+            </w:r>
+            <w:r>
+              <w:t xml:space="preserve"> bar may become </w:t>
+            </w:r>
+            <w:r>
+              <w:rPr>
+                <w:b/>
+                <w:bCs/>
+              </w:rPr>
+              <w:t xml:space="preserve">#ii°7</w:t>
+            </w:r>
+            <w:r>
+              <w:t xml:space="preserve"> or </w:t>
+            </w:r>
+            <w:r>
+              <w:rPr>
+                <w:b/>
+                <w:bCs/>
+              </w:rPr>
+              <w:t xml:space="preserve">vii°7</w:t>
+            </w:r>
+            <w:r>
+              <w:t xml:space="preserve"> (`dim7` spelling); </w:t>
+            </w:r>
+            <w:r>
+              <w:rPr>
+                <w:b/>
+                <w:bCs/>
+              </w:rPr>
+              <w:t xml:space="preserve">skips</w:t>
+            </w:r>
+            <w:r>
+              <w:t xml:space="preserve"> dominants already coloured </w:t>
+            </w:r>
+            <w:r>
+              <w:rPr>
+                <w:b/>
+                <w:bCs/>
+              </w:rPr>
+              <w:t xml:space="preserve">sus</w:t>
+            </w:r>
+          </w:p>
+        </w:tc>
+        <w:tc>
+          <w:tcPr>
+            <w:tcW w:type="pct" w:w="3000%"/>
+          </w:tcPr>
+          <w:p>
+            <w:pPr>
+              <w:spacing w:after="60"/>
+            </w:pPr>
+            <w:r>
+              <w:t xml:space="preserve">`be:dim_delayed_res@bar{N}`</w:t>
+            </w:r>
+          </w:p>
+        </w:tc>
+      </w:tr>
+      <w:tr>
+        <w:tc>
+          <w:tcPr>
+            <w:tcW w:type="pct" w:w="3000%"/>
+          </w:tcPr>
+          <w:p>
+            <w:pPr>
+              <w:spacing w:after="60"/>
+            </w:pPr>
+            <w:r>
+              <w:rPr>
+                <w:b/>
+                <w:bCs/>
+              </w:rPr>
+              <w:t xml:space="preserve">IV minor borrow</w:t>
+            </w:r>
+          </w:p>
+        </w:tc>
+        <w:tc>
+          <w:tcPr>
+            <w:tcW w:type="pct" w:w="3000%"/>
+          </w:tcPr>
+          <w:p>
+            <w:pPr>
+              <w:spacing w:after="60"/>
+            </w:pPr>
+            <w:r>
+              <w:t xml:space="preserve">Phrase-middle, </w:t>
+            </w:r>
+            <w:r>
+              <w:rPr>
+                <w:b/>
+                <w:bCs/>
+              </w:rPr>
+              <w:t xml:space="preserve">major-key</w:t>
+            </w:r>
+            <w:r>
+              <w:t xml:space="preserve"> context: </w:t>
+            </w:r>
+            <w:r>
+              <w:rPr>
+                <w:b/>
+                <w:bCs/>
+              </w:rPr>
+              <w:t xml:space="preserve">IV → ivm9</w:t>
+            </w:r>
+          </w:p>
+        </w:tc>
+        <w:tc>
+          <w:tcPr>
+            <w:tcW w:type="pct" w:w="3000%"/>
+          </w:tcPr>
+          <w:p>
+            <w:pPr>
+              <w:spacing w:after="60"/>
+            </w:pPr>
+            <w:r>
+              <w:t xml:space="preserve">`be:iv_minor_borrow@bar{N}`</w:t>
+            </w:r>
+          </w:p>
+        </w:tc>
+      </w:tr>
+      <w:tr>
+        <w:tc>
+          <w:tcPr>
+            <w:tcW w:type="pct" w:w="3000%"/>
+          </w:tcPr>
+          <w:p>
+            <w:pPr>
+              <w:spacing w:after="60"/>
+            </w:pPr>
+            <w:r>
+              <w:rPr>
+                <w:b/>
+                <w:bCs/>
+              </w:rPr>
+              <w:t xml:space="preserve">Minor detour</w:t>
+            </w:r>
+          </w:p>
+        </w:tc>
+        <w:tc>
+          <w:tcPr>
+            <w:tcW w:type="pct" w:w="3000%"/>
+          </w:tcPr>
+          <w:p>
+            <w:pPr>
+              <w:spacing w:after="60"/>
+            </w:pPr>
+            <w:r>
+              <w:t xml:space="preserve">Phrase-middle three-bar </w:t>
+            </w:r>
+            <w:r>
+              <w:rPr>
+                <w:b/>
+                <w:bCs/>
+              </w:rPr>
+              <w:t xml:space="preserve">iiø–V–minor i</w:t>
+            </w:r>
+            <w:r>
+              <w:t xml:space="preserve"> (major key); skips cadence targets already tied to </w:t>
+            </w:r>
+            <w:r>
+              <w:rPr>
+                <w:b/>
+                <w:bCs/>
+              </w:rPr>
+              <w:t xml:space="preserve">dim delayed</w:t>
+            </w:r>
+            <w:r>
+              <w:t xml:space="preserve"> resolution</w:t>
+            </w:r>
+          </w:p>
+        </w:tc>
+        <w:tc>
+          <w:tcPr>
+            <w:tcW w:type="pct" w:w="3000%"/>
+          </w:tcPr>
+          <w:p>
+            <w:pPr>
+              <w:spacing w:after="60"/>
+            </w:pPr>
+            <w:r>
+              <w:t xml:space="preserve">`be:minor_detour@bar{N}`</w:t>
+            </w:r>
+          </w:p>
+        </w:tc>
+      </w:tr>
+      <w:tr>
+        <w:tc>
+          <w:tcPr>
+            <w:tcW w:type="pct" w:w="3000%"/>
+          </w:tcPr>
+          <w:p>
+            <w:pPr>
+              <w:spacing w:after="60"/>
+            </w:pPr>
+            <w:r>
+              <w:rPr>
+                <w:b/>
+                <w:bCs/>
+              </w:rPr>
+              <w:t xml:space="preserve">Inner voice melody</w:t>
+            </w:r>
+            <w:r>
+              <w:t xml:space="preserve"> (lead-sheet proxy)</w:t>
+            </w:r>
+          </w:p>
+        </w:tc>
+        <w:tc>
+          <w:tcPr>
+            <w:tcW w:type="pct" w:w="3000%"/>
+          </w:tcPr>
+          <w:p>
+            <w:pPr>
+              <w:spacing w:after="60"/>
+            </w:pPr>
+            <w:r>
+              <w:t xml:space="preserve">Phrase-middle, </w:t>
+            </w:r>
+            <w:r>
+              <w:rPr>
+                <w:b/>
+                <w:bCs/>
+              </w:rPr>
+              <w:t xml:space="preserve">rich</w:t>
+            </w:r>
+            <w:r>
+              <w:t xml:space="preserve"> tertian symbol: adds </w:t>
+            </w:r>
+            <w:r>
+              <w:rPr>
+                <w:b/>
+                <w:bCs/>
+              </w:rPr>
+              <w:t xml:space="preserve">slash bass</w:t>
+            </w:r>
+            <w:r>
+              <w:t xml:space="preserve"> a semitone either side of the </w:t>
+            </w:r>
+            <w:r>
+              <w:rPr>
+                <w:b/>
+                <w:bCs/>
+              </w:rPr>
+              <w:t xml:space="preserve">3rd</w:t>
+            </w:r>
+            <w:r>
+              <w:t xml:space="preserve"> (inner-line hint)</w:t>
+            </w:r>
+          </w:p>
+        </w:tc>
+        <w:tc>
+          <w:tcPr>
+            <w:tcW w:type="pct" w:w="3000%"/>
+          </w:tcPr>
+          <w:p>
+            <w:pPr>
+              <w:spacing w:after="60"/>
+            </w:pPr>
+            <w:r>
+              <w:t xml:space="preserve">`be:inner_voice@bar{N}`</w:t>
+            </w:r>
+          </w:p>
+        </w:tc>
+      </w:tr>
+      <w:tr>
+        <w:tc>
+          <w:tcPr>
+            <w:tcW w:type="pct" w:w="3000%"/>
+          </w:tcPr>
+          <w:p>
+            <w:pPr>
+              <w:spacing w:after="60"/>
+            </w:pPr>
+            <w:r>
+              <w:rPr>
+                <w:b/>
+                <w:bCs/>
+              </w:rPr>
+              <w:t xml:space="preserve">Locked hands approximation</w:t>
+            </w:r>
+          </w:p>
+        </w:tc>
+        <w:tc>
+          <w:tcPr>
+            <w:tcW w:type="pct" w:w="3000%"/>
+          </w:tcPr>
+          <w:p>
+            <w:pPr>
+              <w:spacing w:after="60"/>
+            </w:pPr>
+            <w:r>
+              <w:t xml:space="preserve">Phrase-start: </w:t>
+            </w:r>
+            <w:r>
+              <w:rPr>
+                <w:b/>
+                <w:bCs/>
+              </w:rPr>
+              <w:t xml:space="preserve">slash bass</w:t>
+            </w:r>
+            <w:r>
+              <w:t xml:space="preserve"> under lighter textures (3rd / m6 / M6 colour rotation); skips dense </w:t>
+            </w:r>
+            <w:r>
+              <w:rPr>
+                <w:b/>
+                <w:bCs/>
+              </w:rPr>
+              <w:t xml:space="preserve">alt</w:t>
+            </w:r>
+            <w:r>
+              <w:t xml:space="preserve"> / </w:t>
+            </w:r>
+            <w:r>
+              <w:rPr>
+                <w:b/>
+                <w:bCs/>
+              </w:rPr>
+              <w:t xml:space="preserve">dim</w:t>
+            </w:r>
+            <w:r>
+              <w:t xml:space="preserve"> symbols</w:t>
+            </w:r>
+          </w:p>
+        </w:tc>
+        <w:tc>
+          <w:tcPr>
+            <w:tcW w:type="pct" w:w="3000%"/>
+          </w:tcPr>
+          <w:p>
+            <w:pPr>
+              <w:spacing w:after="60"/>
+            </w:pPr>
+            <w:r>
+              <w:t xml:space="preserve">`be:locked_hands_approx@bar{N}`</w:t>
+            </w:r>
+          </w:p>
+        </w:tc>
+      </w:tr>
+    </w:tbl>
+    <w:p>
+      <w:pPr>
+        <w:spacing w:after="160"/>
+      </w:pPr>
+    </w:p>
+    <w:p>
+      <w:pPr>
+        <w:pStyle w:val="Heading3"/>
+        <w:spacing w:after="80" w:before="120"/>
+      </w:pPr>
+      <w:r>
+        <w:t xml:space="preserve">Modern Jazz style surface</w:t>
+      </w:r>
+    </w:p>
+    <w:p>
+      <w:pPr>
+        <w:spacing w:after="160"/>
+      </w:pPr>
+      <w:r>
+        <w:rPr>
+          <w:b/>
+          <w:bCs/>
+        </w:rPr>
+        <w:t xml:space="preserve">`STYLE_MODERN_JAZZ`</w:t>
+      </w:r>
+      <w:r>
+        <w:t xml:space="preserve"> triggers </w:t>
+      </w:r>
+      <w:r>
+        <w:rPr>
+          <w:b/>
+          <w:bCs/>
+        </w:rPr>
+        <w:t xml:space="preserve">`applyBillEvansStyleSurface`</w:t>
+      </w:r>
+      <w:r>
+        <w:t xml:space="preserve"> (`songModeStyleSurface.ts`): </w:t>
+      </w:r>
+      <w:r>
+        <w:rPr>
+          <w:b/>
+          <w:bCs/>
+        </w:rPr>
+        <w:t xml:space="preserve">`songwriterDensityBias`</w:t>
+      </w:r>
+      <w:r>
+        <w:t xml:space="preserve"> </w:t>
+      </w:r>
+      <w:r>
+        <w:rPr>
+          <w:b/>
+          <w:bCs/>
+        </w:rPr>
+        <w:t xml:space="preserve">−0.05</w:t>
+      </w:r>
+      <w:r>
+        <w:t xml:space="preserve">, </w:t>
+      </w:r>
+      <w:r>
+        <w:rPr>
+          <w:b/>
+          <w:bCs/>
+        </w:rPr>
+        <w:t xml:space="preserve">`songwriterCadenceSoftness`</w:t>
+      </w:r>
+      <w:r>
+        <w:t xml:space="preserve"> </w:t>
+      </w:r>
+      <w:r>
+        <w:rPr>
+          <w:b/>
+          <w:bCs/>
+        </w:rPr>
+        <w:t xml:space="preserve">+0.22</w:t>
+      </w:r>
+      <w:r>
+        <w:t xml:space="preserve">, </w:t>
+      </w:r>
+      <w:r>
+        <w:rPr>
+          <w:b/>
+          <w:bCs/>
+        </w:rPr>
+        <w:t xml:space="preserve">`songwriterSpaceBias`</w:t>
+      </w:r>
+      <w:r>
+        <w:t xml:space="preserve"> </w:t>
+      </w:r>
+      <w:r>
+        <w:rPr>
+          <w:b/>
+          <w:bCs/>
+        </w:rPr>
+        <w:t xml:space="preserve">+0.12</w:t>
+      </w:r>
+      <w:r>
+        <w:t xml:space="preserve"> (clamped </w:t>
+      </w:r>
+      <w:r>
+        <w:rPr>
+          <w:b/>
+          <w:bCs/>
+        </w:rPr>
+        <w:t xml:space="preserve">0–1</w:t>
+      </w:r>
+      <w:r>
+        <w:t xml:space="preserve">). Wired in </w:t>
+      </w:r>
+      <w:r>
+        <w:rPr>
+          <w:b/>
+          <w:bCs/>
+        </w:rPr>
+        <w:t xml:space="preserve">`runGoldenPath.ts`</w:t>
+      </w:r>
+      <w:r>
+        <w:t xml:space="preserve"> </w:t>
+      </w:r>
+      <w:r>
+        <w:rPr>
+          <w:b/>
+          <w:bCs/>
+        </w:rPr>
+        <w:t xml:space="preserve">after</w:t>
+      </w:r>
+      <w:r>
+        <w:t xml:space="preserve"> </w:t>
+      </w:r>
+      <w:r>
+        <w:rPr>
+          <w:b/>
+          <w:bCs/>
+        </w:rPr>
+        <w:t xml:space="preserve">`applyBacharachStyleSurface`</w:t>
+      </w:r>
+      <w:r>
+        <w:t xml:space="preserve"> and </w:t>
+      </w:r>
+      <w:r>
+        <w:rPr>
+          <w:b/>
+          <w:bCs/>
+        </w:rPr>
+        <w:t xml:space="preserve">before</w:t>
+      </w:r>
+      <w:r>
+        <w:t xml:space="preserve"> </w:t>
+      </w:r>
+      <w:r>
+        <w:rPr>
+          <w:b/>
+          <w:bCs/>
+        </w:rPr>
+        <w:t xml:space="preserve">`applySophisticatedPopStyleSurface`</w:t>
+      </w:r>
+      <w:r>
+        <w:t xml:space="preserve"> — stacks with other style surfaces when multiple profiles apply.</w:t>
+      </w:r>
+    </w:p>
+    <w:p>
+      <w:pPr>
+        <w:pStyle w:val="Heading3"/>
+        <w:spacing w:after="80" w:before="120"/>
+      </w:pPr>
+      <w:r>
+        <w:t xml:space="preserve">Example applications</w:t>
+      </w:r>
+    </w:p>
+    <w:p>
+      <w:pPr>
+        <w:spacing w:after="160"/>
+      </w:pPr>
+      <w:r>
+        <w:t xml:space="preserve">1. </w:t>
+      </w:r>
+      <w:r>
+        <w:rPr>
+          <w:b/>
+          <w:bCs/>
+        </w:rPr>
+        <w:t xml:space="preserve">Primary `bill_evans` + Modern Jazz</w:t>
+      </w:r>
+      <w:r>
+        <w:t xml:space="preserve"> — Full Evans harmony slice </w:t>
+      </w:r>
+      <w:r>
+        <w:rPr>
+          <w:b/>
+          <w:bCs/>
+        </w:rPr>
+        <w:t xml:space="preserve">plus</w:t>
+      </w:r>
+      <w:r>
+        <w:t xml:space="preserve"> softer density / softer cadence / more space metadata; default </w:t>
+      </w:r>
+      <w:r>
+        <w:rPr>
+          <w:b/>
+          <w:bCs/>
+        </w:rPr>
+        <w:t xml:space="preserve">lesson</w:t>
+      </w:r>
+      <w:r>
+        <w:t xml:space="preserve"> preset when teaching impressionist </w:t>
+      </w:r>
+      <w:r>
+        <w:rPr>
+          <w:b/>
+          <w:bCs/>
+        </w:rPr>
+        <w:t xml:space="preserve">lead-sheet</w:t>
+      </w:r>
+      <w:r>
+        <w:t xml:space="preserve"> colour. 2. </w:t>
+      </w:r>
+      <w:r>
+        <w:rPr>
+          <w:b/>
+          <w:bCs/>
+        </w:rPr>
+        <w:t xml:space="preserve">Evans harmony only</w:t>
+      </w:r>
+      <w:r>
+        <w:t xml:space="preserve"> — Pick Evans as songwriter but another </w:t>
+      </w:r>
+      <w:r>
+        <w:rPr>
+          <w:b/>
+          <w:bCs/>
+        </w:rPr>
+        <w:t xml:space="preserve">Style Engine</w:t>
+      </w:r>
+      <w:r>
+        <w:t xml:space="preserve"> profile if you want </w:t>
+      </w:r>
+      <w:r>
+        <w:rPr>
+          <w:b/>
+          <w:bCs/>
+        </w:rPr>
+        <w:t xml:space="preserve">symbol</w:t>
+      </w:r>
+      <w:r>
+        <w:t xml:space="preserve"> devices without Modern Jazz surface nudges. 3. </w:t>
+      </w:r>
+      <w:r>
+        <w:rPr>
+          <w:b/>
+          <w:bCs/>
+        </w:rPr>
+        <w:t xml:space="preserve">Custom_locked chart + Evans</w:t>
+      </w:r>
+      <w:r>
+        <w:t xml:space="preserve"> — Stress </w:t>
+      </w:r>
+      <w:r>
+        <w:rPr>
+          <w:b/>
+          <w:bCs/>
+        </w:rPr>
+        <w:t xml:space="preserve">`be:*`</w:t>
+      </w:r>
+      <w:r>
+        <w:t xml:space="preserve"> receipts against a </w:t>
+      </w:r>
+      <w:r>
+        <w:rPr>
+          <w:b/>
+          <w:bCs/>
+        </w:rPr>
+        <w:t xml:space="preserve">fixed</w:t>
+      </w:r>
+      <w:r>
+        <w:t xml:space="preserve"> progression; phrase grid still reshapes </w:t>
+      </w:r>
+      <w:r>
+        <w:rPr>
+          <w:b/>
+          <w:bCs/>
+        </w:rPr>
+        <w:t xml:space="preserve">roles</w:t>
+      </w:r>
+      <w:r>
+        <w:t xml:space="preserve"> bar-to-bar. 4. </w:t>
+      </w:r>
+      <w:r>
+        <w:rPr>
+          <w:b/>
+          <w:bCs/>
+        </w:rPr>
+        <w:t xml:space="preserve">Evans + Evans odd-meter preset</w:t>
+      </w:r>
+      <w:r>
+        <w:t xml:space="preserve"> — Combine </w:t>
+      </w:r>
+      <w:r>
+        <w:rPr>
+          <w:b/>
+          <w:bCs/>
+        </w:rPr>
+        <w:t xml:space="preserve">variable phrase grid</w:t>
+      </w:r>
+      <w:r>
+        <w:t xml:space="preserve"> with </w:t>
+      </w:r>
+      <w:r>
+        <w:rPr>
+          <w:b/>
+          <w:bCs/>
+        </w:rPr>
+        <w:t xml:space="preserve">`barMeterMap`</w:t>
+      </w:r>
+      <w:r>
+        <w:t xml:space="preserve"> (`evans_five_three`, </w:t>
+      </w:r>
+      <w:r>
+        <w:rPr>
+          <w:b/>
+          <w:bCs/>
+        </w:rPr>
+        <w:t xml:space="preserve">Peace Piece</w:t>
+      </w:r>
+      <w:r>
+        <w:t xml:space="preserve">, etc.); verify </w:t>
+      </w:r>
+      <w:r>
+        <w:rPr>
+          <w:b/>
+          <w:bCs/>
+        </w:rPr>
+        <w:t xml:space="preserve">MusicXML</w:t>
+      </w:r>
+      <w:r>
+        <w:t xml:space="preserve"> meter lines vs phrase receipts. 5. </w:t>
+      </w:r>
+      <w:r>
+        <w:rPr>
+          <w:b/>
+          <w:bCs/>
+        </w:rPr>
+        <w:t xml:space="preserve">Seed A/B</w:t>
+      </w:r>
+      <w:r>
+        <w:t xml:space="preserve"> — Asymmetric phrase boundaries change which passes fire; </w:t>
+      </w:r>
+      <w:r>
+        <w:rPr>
+          <w:b/>
+          <w:bCs/>
+        </w:rPr>
+        <w:t xml:space="preserve">lock seed</w:t>
+      </w:r>
+      <w:r>
+        <w:t xml:space="preserve"> when demoing a specific </w:t>
+      </w:r>
+      <w:r>
+        <w:rPr>
+          <w:b/>
+          <w:bCs/>
+        </w:rPr>
+        <w:t xml:space="preserve">`be:dim_delayed_res`</w:t>
+      </w:r>
+      <w:r>
+        <w:t xml:space="preserve"> or </w:t>
+      </w:r>
+      <w:r>
+        <w:rPr>
+          <w:b/>
+          <w:bCs/>
+        </w:rPr>
+        <w:t xml:space="preserve">`be:minor_detour`</w:t>
+      </w:r>
+      <w:r>
+        <w:t xml:space="preserve"> outcome. 6. </w:t>
+      </w:r>
+      <w:r>
+        <w:rPr>
+          <w:b/>
+          <w:bCs/>
+        </w:rPr>
+        <w:t xml:space="preserve">Duo guitar–bass + arranger Gil Evans</w:t>
+      </w:r>
+      <w:r>
+        <w:t xml:space="preserve"> — Use Evans </w:t>
+      </w:r>
+      <w:r>
+        <w:rPr>
+          <w:b/>
+          <w:bCs/>
+        </w:rPr>
+        <w:t xml:space="preserve">slice</w:t>
+      </w:r>
+      <w:r>
+        <w:t xml:space="preserve"> for </w:t>
+      </w:r>
+      <w:r>
+        <w:rPr>
+          <w:b/>
+          <w:bCs/>
+        </w:rPr>
+        <w:t xml:space="preserve">symbols</w:t>
+      </w:r>
+      <w:r>
+        <w:t xml:space="preserve"> on the lead-sheet path while ensemble pairing handles </w:t>
+      </w:r>
+      <w:r>
+        <w:rPr>
+          <w:b/>
+          <w:bCs/>
+        </w:rPr>
+        <w:t xml:space="preserve">orchestration</w:t>
+      </w:r>
+      <w:r>
+        <w:t xml:space="preserve"> receipts separately.</w:t>
       </w:r>
     </w:p>
     <w:p>

</xml_diff>

<commit_message>
feat: Jobim slice — Lydian dominant, bVIm6 alt dominant, bossa anticipation bias, asymmetric phrase grid 4/8/2, Jobim style surface with bossa sync nudge
Co-authored-by: Cursor <cursoragent@cursor.com>
</commit_message>
<xml_diff>
--- a/docs/COMPOSER_OS_PLAYBOOK.docx
+++ b/docs/COMPOSER_OS_PLAYBOOK.docx
@@ -17879,6 +17879,1165 @@
       </w:r>
       <w:r>
         <w:t xml:space="preserve"> receipts separately.</w:t>
+      </w:r>
+    </w:p>
+    <w:p>
+      <w:pPr>
+        <w:pStyle w:val="Heading2"/>
+        <w:spacing w:after="100" w:before="160"/>
+      </w:pPr>
+      <w:r>
+        <w:t xml:space="preserve">Antônio Carlos Jobim (Song Mode — Brazilian jazz / bossa harmony slice)</w:t>
+      </w:r>
+    </w:p>
+    <w:p>
+      <w:pPr>
+        <w:spacing w:after="160"/>
+      </w:pPr>
+      <w:r>
+        <w:rPr>
+          <w:b/>
+          <w:bCs/>
+        </w:rPr>
+        <w:t xml:space="preserve">Still current:</w:t>
+      </w:r>
+      <w:r>
+        <w:t xml:space="preserve"> </w:t>
+      </w:r>
+      <w:r>
+        <w:rPr>
+          <w:b/>
+          <w:bCs/>
+        </w:rPr>
+        <w:t xml:space="preserve">`jobimSlice.ts`</w:t>
+      </w:r>
+      <w:r>
+        <w:t xml:space="preserve">, </w:t>
+      </w:r>
+      <w:r>
+        <w:rPr>
+          <w:b/>
+          <w:bCs/>
+        </w:rPr>
+        <w:t xml:space="preserve">`precomputeJobimEffectiveHarmonyBars`</w:t>
+      </w:r>
+      <w:r>
+        <w:t xml:space="preserve">, </w:t>
+      </w:r>
+      <w:r>
+        <w:rPr>
+          <w:b/>
+          <w:bCs/>
+        </w:rPr>
+        <w:t xml:space="preserve">`jobimEffectiveHarmonyBars`</w:t>
+      </w:r>
+      <w:r>
+        <w:t xml:space="preserve"> feeding </w:t>
+      </w:r>
+      <w:r>
+        <w:rPr>
+          <w:b/>
+          <w:bCs/>
+        </w:rPr>
+        <w:t xml:space="preserve">`getChordForBar`</w:t>
+      </w:r>
+      <w:r>
+        <w:t xml:space="preserve"> and locked MusicXML truth, smoke </w:t>
+      </w:r>
+      <w:r>
+        <w:rPr>
+          <w:b/>
+          <w:bCs/>
+        </w:rPr>
+        <w:t xml:space="preserve">`jobimSliceSmoke.test.ts`</w:t>
+      </w:r>
+      <w:r>
+        <w:t xml:space="preserve">. Harmony receipts use </w:t>
+      </w:r>
+      <w:r>
+        <w:rPr>
+          <w:b/>
+          <w:bCs/>
+        </w:rPr>
+        <w:t xml:space="preserve">`aj:*`</w:t>
+      </w:r>
+      <w:r>
+        <w:t xml:space="preserve"> (</w:t>
+      </w:r>
+      <w:r>
+        <w:rPr>
+          <w:b/>
+          <w:bCs/>
+        </w:rPr>
+        <w:t xml:space="preserve">Antônio Jobim</w:t>
+      </w:r>
+      <w:r>
+        <w:t xml:space="preserve">) — </w:t>
+      </w:r>
+      <w:r>
+        <w:rPr>
+          <w:b/>
+          <w:bCs/>
+        </w:rPr>
+        <w:t xml:space="preserve">not</w:t>
+      </w:r>
+      <w:r>
+        <w:t xml:space="preserve"> </w:t>
+      </w:r>
+      <w:r>
+        <w:rPr>
+          <w:b/>
+          <w:bCs/>
+        </w:rPr>
+        <w:t xml:space="preserve">`jb:*`</w:t>
+      </w:r>
+      <w:r>
+        <w:t xml:space="preserve"> (James Brown).</w:t>
+      </w:r>
+    </w:p>
+    <w:p>
+      <w:pPr>
+        <w:spacing w:after="160"/>
+      </w:pPr>
+      <w:r>
+        <w:t xml:space="preserve">The slice </w:t>
+      </w:r>
+      <w:r>
+        <w:rPr>
+          <w:b/>
+          <w:bCs/>
+        </w:rPr>
+        <w:t xml:space="preserve">rewrites chord symbols</w:t>
+      </w:r>
+      <w:r>
+        <w:t xml:space="preserve"> on the duo golden path (bossa tonic colours, altered dominants, tritone subs, backdoor, passing diminished, etc.) and writes </w:t>
+      </w:r>
+      <w:r>
+        <w:rPr>
+          <w:b/>
+          <w:bCs/>
+        </w:rPr>
+        <w:t xml:space="preserve">rhythm-hint metadata</w:t>
+      </w:r>
+      <w:r>
+        <w:t xml:space="preserve"> for anticipation bars only — no parallel </w:t>
+      </w:r>
+      <w:r>
+        <w:rPr>
+          <w:b/>
+          <w:bCs/>
+        </w:rPr>
+        <w:t xml:space="preserve">`ChordEvent`</w:t>
+      </w:r>
+      <w:r>
+        <w:t xml:space="preserve"> extension layer beyond standard export.</w:t>
+      </w:r>
+    </w:p>
+    <w:p>
+      <w:pPr>
+        <w:pStyle w:val="Heading3"/>
+        <w:spacing w:after="80" w:before="120"/>
+      </w:pPr>
+      <w:r>
+        <w:t xml:space="preserve">Asymmetric phrase grid</w:t>
+      </w:r>
+    </w:p>
+    <w:p>
+      <w:pPr>
+        <w:spacing w:after="160"/>
+      </w:pPr>
+      <w:r>
+        <w:rPr>
+          <w:b/>
+          <w:bCs/>
+        </w:rPr>
+        <w:t xml:space="preserve">`computeJobimPhrasePositions(totalBars, seed)`</w:t>
+      </w:r>
+      <w:r>
+        <w:t xml:space="preserve"> assigns </w:t>
+      </w:r>
+      <w:r>
+        <w:rPr>
+          <w:b/>
+          <w:bCs/>
+        </w:rPr>
+        <w:t xml:space="preserve">phraseStart</w:t>
+      </w:r>
+      <w:r>
+        <w:t xml:space="preserve"> / </w:t>
+      </w:r>
+      <w:r>
+        <w:rPr>
+          <w:b/>
+          <w:bCs/>
+        </w:rPr>
+        <w:t xml:space="preserve">phraseMiddle</w:t>
+      </w:r>
+      <w:r>
+        <w:t xml:space="preserve"> / </w:t>
+      </w:r>
+      <w:r>
+        <w:rPr>
+          <w:b/>
+          <w:bCs/>
+        </w:rPr>
+        <w:t xml:space="preserve">phraseFinal</w:t>
+      </w:r>
+      <w:r>
+        <w:t xml:space="preserve"> using variable phrase lengths </w:t>
+      </w:r>
+      <w:r>
+        <w:rPr>
+          <w:b/>
+          <w:bCs/>
+        </w:rPr>
+        <w:t xml:space="preserve">4, 8, or 2 bars</w:t>
+      </w:r>
+      <w:r>
+        <w:t xml:space="preserve"> weighted </w:t>
+      </w:r>
+      <w:r>
+        <w:rPr>
+          <w:b/>
+          <w:bCs/>
+        </w:rPr>
+        <w:t xml:space="preserve">65% / 20% / 15%</w:t>
+      </w:r>
+      <w:r>
+        <w:t xml:space="preserve"> (mostly regular four-bar organisation with occasional eight-bar spans or two-bar turns). Same rolling-bar layout pattern as Bill Evans / ECM Chamber / Bacharach variable grids.</w:t>
+      </w:r>
+    </w:p>
+    <w:p>
+      <w:pPr>
+        <w:pStyle w:val="Heading3"/>
+        <w:spacing w:after="80" w:before="120"/>
+      </w:pPr>
+      <w:r>
+        <w:t xml:space="preserve">Additive passes (2026 refresh)</w:t>
+      </w:r>
+    </w:p>
+    <w:tbl>
+      <w:tblPr>
+        <w:tblW w:type="pct" w:w="100%"/>
+        <w:tblBorders>
+          <w:top w:val="single" w:color="auto" w:sz="4"/>
+          <w:left w:val="single" w:color="auto" w:sz="4"/>
+          <w:bottom w:val="single" w:color="auto" w:sz="4"/>
+          <w:right w:val="single" w:color="auto" w:sz="4"/>
+          <w:insideH w:val="single" w:color="auto" w:sz="4"/>
+          <w:insideV w:val="single" w:color="auto" w:sz="4"/>
+        </w:tblBorders>
+      </w:tblPr>
+      <w:tblGrid>
+        <w:gridCol w:w="2250"/>
+        <w:gridCol w:w="2250"/>
+        <w:gridCol w:w="2250"/>
+        <w:gridCol w:w="2250"/>
+      </w:tblGrid>
+      <w:tr>
+        <w:tc>
+          <w:tcPr>
+            <w:tcW w:type="pct" w:w="2250%"/>
+          </w:tcPr>
+          <w:p>
+            <w:pPr>
+              <w:spacing w:after="60"/>
+            </w:pPr>
+            <w:r>
+              <w:t xml:space="preserve">Pass</w:t>
+            </w:r>
+          </w:p>
+        </w:tc>
+        <w:tc>
+          <w:tcPr>
+            <w:tcW w:type="pct" w:w="2250%"/>
+          </w:tcPr>
+          <w:p>
+            <w:pPr>
+              <w:spacing w:after="60"/>
+            </w:pPr>
+            <w:r>
+              <w:t xml:space="preserve">Phrase roles</w:t>
+            </w:r>
+          </w:p>
+        </w:tc>
+        <w:tc>
+          <w:tcPr>
+            <w:tcW w:type="pct" w:w="2250%"/>
+          </w:tcPr>
+          <w:p>
+            <w:pPr>
+              <w:spacing w:after="60"/>
+            </w:pPr>
+            <w:r>
+              <w:t xml:space="preserve">Target rate</w:t>
+            </w:r>
+          </w:p>
+        </w:tc>
+        <w:tc>
+          <w:tcPr>
+            <w:tcW w:type="pct" w:w="2250%"/>
+          </w:tcPr>
+          <w:p>
+            <w:pPr>
+              <w:spacing w:after="60"/>
+            </w:pPr>
+            <w:r>
+              <w:t xml:space="preserve">Receipt / metadata</w:t>
+            </w:r>
+          </w:p>
+        </w:tc>
+      </w:tr>
+      <w:tr>
+        <w:tc>
+          <w:tcPr>
+            <w:tcW w:type="pct" w:w="2250%"/>
+          </w:tcPr>
+          <w:p>
+            <w:pPr>
+              <w:spacing w:after="60"/>
+            </w:pPr>
+            <w:r>
+              <w:rPr>
+                <w:b/>
+                <w:bCs/>
+              </w:rPr>
+              <w:t xml:space="preserve">Lydian dominant colour</w:t>
+            </w:r>
+          </w:p>
+        </w:tc>
+        <w:tc>
+          <w:tcPr>
+            <w:tcW w:type="pct" w:w="2250%"/>
+          </w:tcPr>
+          <w:p>
+            <w:pPr>
+              <w:spacing w:after="60"/>
+            </w:pPr>
+            <w:r>
+              <w:rPr>
+                <w:b/>
+                <w:bCs/>
+              </w:rPr>
+              <w:t xml:space="preserve">phraseMiddle</w:t>
+            </w:r>
+            <w:r>
+              <w:t xml:space="preserve"> only</w:t>
+            </w:r>
+          </w:p>
+        </w:tc>
+        <w:tc>
+          <w:tcPr>
+            <w:tcW w:type="pct" w:w="2250%"/>
+          </w:tcPr>
+          <w:p>
+            <w:pPr>
+              <w:spacing w:after="60"/>
+            </w:pPr>
+            <w:r>
+              <w:rPr>
+                <w:b/>
+                <w:bCs/>
+              </w:rPr>
+              <w:t xml:space="preserve">26%</w:t>
+            </w:r>
+            <w:r>
+              <w:t xml:space="preserve"> of eligible dominant bars</w:t>
+            </w:r>
+          </w:p>
+        </w:tc>
+        <w:tc>
+          <w:tcPr>
+            <w:tcW w:type="pct" w:w="2250%"/>
+          </w:tcPr>
+          <w:p>
+            <w:pPr>
+              <w:spacing w:after="60"/>
+            </w:pPr>
+            <w:r>
+              <w:rPr>
+                <w:b/>
+                <w:bCs/>
+              </w:rPr>
+              <w:t xml:space="preserve">`aj:lyd_dom@bar{N}`</w:t>
+            </w:r>
+            <w:r>
+              <w:t xml:space="preserve"> — dominant gains </w:t>
+            </w:r>
+            <w:r>
+              <w:rPr>
+                <w:b/>
+                <w:bCs/>
+              </w:rPr>
+              <w:t xml:space="preserve">`(#11)`</w:t>
+            </w:r>
+            <w:r>
+              <w:t xml:space="preserve"> (e.g. `G7` → `G7(#11)`) when not already present</w:t>
+            </w:r>
+          </w:p>
+        </w:tc>
+      </w:tr>
+      <w:tr>
+        <w:tc>
+          <w:tcPr>
+            <w:tcW w:type="pct" w:w="2250%"/>
+          </w:tcPr>
+          <w:p>
+            <w:pPr>
+              <w:spacing w:after="60"/>
+            </w:pPr>
+            <w:r>
+              <w:rPr>
+                <w:b/>
+                <w:bCs/>
+              </w:rPr>
+              <w:t xml:space="preserve">bVI minor-six alternate</w:t>
+            </w:r>
+          </w:p>
+        </w:tc>
+        <w:tc>
+          <w:tcPr>
+            <w:tcW w:type="pct" w:w="2250%"/>
+          </w:tcPr>
+          <w:p>
+            <w:pPr>
+              <w:spacing w:after="60"/>
+            </w:pPr>
+            <w:r>
+              <w:rPr>
+                <w:b/>
+                <w:bCs/>
+              </w:rPr>
+              <w:t xml:space="preserve">phraseFinal</w:t>
+            </w:r>
+            <w:r>
+              <w:t xml:space="preserve"> only</w:t>
+            </w:r>
+          </w:p>
+        </w:tc>
+        <w:tc>
+          <w:tcPr>
+            <w:tcW w:type="pct" w:w="2250%"/>
+          </w:tcPr>
+          <w:p>
+            <w:pPr>
+              <w:spacing w:after="60"/>
+            </w:pPr>
+            <w:r>
+              <w:rPr>
+                <w:b/>
+                <w:bCs/>
+              </w:rPr>
+              <w:t xml:space="preserve">18%</w:t>
+            </w:r>
+            <w:r>
+              <w:t xml:space="preserve"> when </w:t>
+            </w:r>
+            <w:r>
+              <w:rPr>
+                <w:b/>
+                <w:bCs/>
+              </w:rPr>
+              <w:t xml:space="preserve">dominant → tonic</w:t>
+            </w:r>
+          </w:p>
+        </w:tc>
+        <w:tc>
+          <w:tcPr>
+            <w:tcW w:type="pct" w:w="2250%"/>
+          </w:tcPr>
+          <w:p>
+            <w:pPr>
+              <w:spacing w:after="60"/>
+            </w:pPr>
+            <w:r>
+              <w:rPr>
+                <w:b/>
+                <w:bCs/>
+              </w:rPr>
+              <w:t xml:space="preserve">`aj:bvi_m6@bar{N}`</w:t>
+            </w:r>
+            <w:r>
+              <w:t xml:space="preserve"> — dominant bar may become </w:t>
+            </w:r>
+            <w:r>
+              <w:rPr>
+                <w:b/>
+                <w:bCs/>
+              </w:rPr>
+              <w:t xml:space="preserve">bVI m6</w:t>
+            </w:r>
+            <w:r>
+              <w:t xml:space="preserve"> (flattened-sixth minor-six colour toward tonic, e.g. </w:t>
+            </w:r>
+            <w:r>
+              <w:rPr>
+                <w:b/>
+                <w:bCs/>
+              </w:rPr>
+              <w:t xml:space="preserve">Cm6</w:t>
+            </w:r>
+            <w:r>
+              <w:t xml:space="preserve"> in </w:t>
+            </w:r>
+            <w:r>
+              <w:rPr>
+                <w:b/>
+                <w:bCs/>
+              </w:rPr>
+              <w:t xml:space="preserve">Eb</w:t>
+            </w:r>
+            <w:r>
+              <w:t xml:space="preserve"> major context)</w:t>
+            </w:r>
+          </w:p>
+        </w:tc>
+      </w:tr>
+      <w:tr>
+        <w:tc>
+          <w:tcPr>
+            <w:tcW w:type="pct" w:w="2250%"/>
+          </w:tcPr>
+          <w:p>
+            <w:pPr>
+              <w:spacing w:after="60"/>
+            </w:pPr>
+            <w:r>
+              <w:rPr>
+                <w:b/>
+                <w:bCs/>
+              </w:rPr>
+              <w:t xml:space="preserve">Bossa anticipation bias</w:t>
+            </w:r>
+          </w:p>
+        </w:tc>
+        <w:tc>
+          <w:tcPr>
+            <w:tcW w:type="pct" w:w="2250%"/>
+          </w:tcPr>
+          <w:p>
+            <w:pPr>
+              <w:spacing w:after="60"/>
+            </w:pPr>
+            <w:r>
+              <w:rPr>
+                <w:b/>
+                <w:bCs/>
+              </w:rPr>
+              <w:t xml:space="preserve">all</w:t>
+            </w:r>
+            <w:r>
+              <w:t xml:space="preserve"> roles</w:t>
+            </w:r>
+          </w:p>
+        </w:tc>
+        <w:tc>
+          <w:tcPr>
+            <w:tcW w:type="pct" w:w="2250%"/>
+          </w:tcPr>
+          <w:p>
+            <w:pPr>
+              <w:spacing w:after="60"/>
+            </w:pPr>
+            <w:r>
+              <w:rPr>
+                <w:b/>
+                <w:bCs/>
+              </w:rPr>
+              <w:t xml:space="preserve">55%</w:t>
+            </w:r>
+            <w:r>
+              <w:t xml:space="preserve"> per eligible bar</w:t>
+            </w:r>
+          </w:p>
+        </w:tc>
+        <w:tc>
+          <w:tcPr>
+            <w:tcW w:type="pct" w:w="2250%"/>
+          </w:tcPr>
+          <w:p>
+            <w:pPr>
+              <w:spacing w:after="60"/>
+            </w:pPr>
+            <w:r>
+              <w:rPr>
+                <w:b/>
+                <w:bCs/>
+              </w:rPr>
+              <w:t xml:space="preserve">`aj:bossa_anticipation@bar{N}`</w:t>
+            </w:r>
+            <w:r>
+              <w:t xml:space="preserve"> — appends bar index to </w:t>
+            </w:r>
+            <w:r>
+              <w:rPr>
+                <w:b/>
+                <w:bCs/>
+              </w:rPr>
+              <w:t xml:space="preserve">`jobimBossaAnticipationBars`</w:t>
+            </w:r>
+            <w:r>
+              <w:t xml:space="preserve"> (1-based): accompaniment should </w:t>
+            </w:r>
+            <w:r>
+              <w:rPr>
+                <w:b/>
+                <w:bCs/>
+              </w:rPr>
+              <w:t xml:space="preserve">anticipate</w:t>
+            </w:r>
+            <w:r>
+              <w:t xml:space="preserve"> the next harmony at </w:t>
+            </w:r>
+            <w:r>
+              <w:rPr>
+                <w:b/>
+                <w:bCs/>
+              </w:rPr>
+              <w:t xml:space="preserve">&amp; of 4</w:t>
+            </w:r>
+            <w:r>
+              <w:t xml:space="preserve"> in the </w:t>
+            </w:r>
+            <w:r>
+              <w:rPr>
+                <w:b/>
+                <w:bCs/>
+              </w:rPr>
+              <w:t xml:space="preserve">previous</w:t>
+            </w:r>
+            <w:r>
+              <w:t xml:space="preserve"> bar for downstream </w:t>
+            </w:r>
+            <w:r>
+              <w:rPr>
+                <w:b/>
+                <w:bCs/>
+              </w:rPr>
+              <w:t xml:space="preserve">C1</w:t>
+            </w:r>
+            <w:r>
+              <w:t xml:space="preserve"> rhythm overlay consumption</w:t>
+            </w:r>
+          </w:p>
+        </w:tc>
+      </w:tr>
+    </w:tbl>
+    <w:p>
+      <w:pPr>
+        <w:spacing w:after="160"/>
+      </w:pPr>
+    </w:p>
+    <w:p>
+      <w:pPr>
+        <w:spacing w:after="160"/>
+      </w:pPr>
+      <w:r>
+        <w:t xml:space="preserve">Existing Jobim devices (tritone sub, backdoor, phrase-final 6/9, bright </w:t>
+      </w:r>
+      <w:r>
+        <w:rPr>
+          <w:b/>
+          <w:bCs/>
+        </w:rPr>
+        <w:t xml:space="preserve">II7</w:t>
+      </w:r>
+      <w:r>
+        <w:t xml:space="preserve">, passing diminished, anti-elaboration guards) continue to apply as before; new passes run in the </w:t>
+      </w:r>
+      <w:r>
+        <w:rPr>
+          <w:b/>
+          <w:bCs/>
+        </w:rPr>
+        <w:t xml:space="preserve">symbol post-pass</w:t>
+      </w:r>
+      <w:r>
+        <w:t xml:space="preserve"> chain after the base per-bar enrich pass.</w:t>
+      </w:r>
+    </w:p>
+    <w:p>
+      <w:pPr>
+        <w:pStyle w:val="Heading3"/>
+        <w:spacing w:after="80" w:before="120"/>
+      </w:pPr>
+      <w:r>
+        <w:t xml:space="preserve">STYLE_MODERN_JAZZ — Jobim surface vs Bill Evans surface</w:t>
+      </w:r>
+    </w:p>
+    <w:p>
+      <w:pPr>
+        <w:spacing w:after="160"/>
+      </w:pPr>
+      <w:r>
+        <w:t xml:space="preserve">When the resolved primary songwriter is </w:t>
+      </w:r>
+      <w:r>
+        <w:rPr>
+          <w:b/>
+          <w:bCs/>
+        </w:rPr>
+        <w:t xml:space="preserve">`antonio_carlos_jobim`</w:t>
+      </w:r>
+      <w:r>
+        <w:t xml:space="preserve">, </w:t>
+      </w:r>
+      <w:r>
+        <w:rPr>
+          <w:b/>
+          <w:bCs/>
+        </w:rPr>
+        <w:t xml:space="preserve">`runGoldenPath`</w:t>
+      </w:r>
+      <w:r>
+        <w:t xml:space="preserve"> sets </w:t>
+      </w:r>
+      <w:r>
+        <w:rPr>
+          <w:b/>
+          <w:bCs/>
+        </w:rPr>
+        <w:t xml:space="preserve">`jobimMode: true`</w:t>
+      </w:r>
+      <w:r>
+        <w:t xml:space="preserve"> on </w:t>
+      </w:r>
+      <w:r>
+        <w:rPr>
+          <w:b/>
+          <w:bCs/>
+        </w:rPr>
+        <w:t xml:space="preserve">`GenerationMetadata`</w:t>
+      </w:r>
+      <w:r>
+        <w:t xml:space="preserve">. </w:t>
+      </w:r>
+      <w:r>
+        <w:rPr>
+          <w:b/>
+          <w:bCs/>
+        </w:rPr>
+        <w:t xml:space="preserve">`applyBillEvansStyleSurface`</w:t>
+      </w:r>
+      <w:r>
+        <w:t xml:space="preserve"> </w:t>
+      </w:r>
+      <w:r>
+        <w:rPr>
+          <w:b/>
+          <w:bCs/>
+        </w:rPr>
+        <w:t xml:space="preserve">returns early</w:t>
+      </w:r>
+      <w:r>
+        <w:t xml:space="preserve"> (no Evans density/cadence/space nudges). </w:t>
+      </w:r>
+      <w:r>
+        <w:rPr>
+          <w:b/>
+          <w:bCs/>
+        </w:rPr>
+        <w:t xml:space="preserve">`applyJobimStyleSurface`</w:t>
+      </w:r>
+      <w:r>
+        <w:t xml:space="preserve"> runs </w:t>
+      </w:r>
+      <w:r>
+        <w:rPr>
+          <w:b/>
+          <w:bCs/>
+        </w:rPr>
+        <w:t xml:space="preserve">immediately after</w:t>
+      </w:r>
+      <w:r>
+        <w:t xml:space="preserve"> (wired after </w:t>
+      </w:r>
+      <w:r>
+        <w:rPr>
+          <w:b/>
+          <w:bCs/>
+        </w:rPr>
+        <w:t xml:space="preserve">`applyBillEvansStyleSurface`</w:t>
+      </w:r>
+      <w:r>
+        <w:t xml:space="preserve">): </w:t>
+      </w:r>
+      <w:r>
+        <w:rPr>
+          <w:b/>
+          <w:bCs/>
+        </w:rPr>
+        <w:t xml:space="preserve">`songwriterDensityBias`</w:t>
+      </w:r>
+      <w:r>
+        <w:t xml:space="preserve"> </w:t>
+      </w:r>
+      <w:r>
+        <w:rPr>
+          <w:b/>
+          <w:bCs/>
+        </w:rPr>
+        <w:t xml:space="preserve">−0.08</w:t>
+      </w:r>
+      <w:r>
+        <w:t xml:space="preserve">, </w:t>
+      </w:r>
+      <w:r>
+        <w:rPr>
+          <w:b/>
+          <w:bCs/>
+        </w:rPr>
+        <w:t xml:space="preserve">`songwriterSyncopationBias`</w:t>
+      </w:r>
+      <w:r>
+        <w:t xml:space="preserve"> </w:t>
+      </w:r>
+      <w:r>
+        <w:rPr>
+          <w:b/>
+          <w:bCs/>
+        </w:rPr>
+        <w:t xml:space="preserve">+0.18</w:t>
+      </w:r>
+      <w:r>
+        <w:t xml:space="preserve">, </w:t>
+      </w:r>
+      <w:r>
+        <w:rPr>
+          <w:b/>
+          <w:bCs/>
+        </w:rPr>
+        <w:t xml:space="preserve">`songwriterCadenceSoftness`</w:t>
+      </w:r>
+      <w:r>
+        <w:t xml:space="preserve"> </w:t>
+      </w:r>
+      <w:r>
+        <w:rPr>
+          <w:b/>
+          <w:bCs/>
+        </w:rPr>
+        <w:t xml:space="preserve">+0.15</w:t>
+      </w:r>
+      <w:r>
+        <w:t xml:space="preserve"> (clamped </w:t>
+      </w:r>
+      <w:r>
+        <w:rPr>
+          <w:b/>
+          <w:bCs/>
+        </w:rPr>
+        <w:t xml:space="preserve">0–1</w:t>
+      </w:r>
+      <w:r>
+        <w:t xml:space="preserve">) — bossa-weighted sync and softer cadence metadata, honest generative bias only.</w:t>
+      </w:r>
+    </w:p>
+    <w:p>
+      <w:pPr>
+        <w:pStyle w:val="Heading3"/>
+        <w:spacing w:after="80" w:before="120"/>
+      </w:pPr>
+      <w:r>
+        <w:t xml:space="preserve">Example applications</w:t>
+      </w:r>
+    </w:p>
+    <w:p>
+      <w:pPr>
+        <w:spacing w:after="160"/>
+      </w:pPr>
+      <w:r>
+        <w:t xml:space="preserve">1. </w:t>
+      </w:r>
+      <w:r>
+        <w:rPr>
+          <w:b/>
+          <w:bCs/>
+        </w:rPr>
+        <w:t xml:space="preserve">Primary Jobim + Modern Jazz</w:t>
+      </w:r>
+      <w:r>
+        <w:t xml:space="preserve"> — Full </w:t>
+      </w:r>
+      <w:r>
+        <w:rPr>
+          <w:b/>
+          <w:bCs/>
+        </w:rPr>
+        <w:t xml:space="preserve">`aj:*`</w:t>
+      </w:r>
+      <w:r>
+        <w:t xml:space="preserve"> harmony slice </w:t>
+      </w:r>
+      <w:r>
+        <w:rPr>
+          <w:b/>
+          <w:bCs/>
+        </w:rPr>
+        <w:t xml:space="preserve">plus</w:t>
+      </w:r>
+      <w:r>
+        <w:t xml:space="preserve"> Jobim </w:t>
+      </w:r>
+      <w:r>
+        <w:rPr>
+          <w:b/>
+          <w:bCs/>
+        </w:rPr>
+        <w:t xml:space="preserve">`STYLE_MODERN_JAZZ`</w:t>
+      </w:r>
+      <w:r>
+        <w:t xml:space="preserve"> surface (lower density, higher syncopation bias, softer cadences) for </w:t>
+      </w:r>
+      <w:r>
+        <w:rPr>
+          <w:b/>
+          <w:bCs/>
+        </w:rPr>
+        <w:t xml:space="preserve">lead-sheet bossa</w:t>
+      </w:r>
+      <w:r>
+        <w:t xml:space="preserve"> lessons. 2. </w:t>
+      </w:r>
+      <w:r>
+        <w:rPr>
+          <w:b/>
+          <w:bCs/>
+        </w:rPr>
+        <w:t xml:space="preserve">Jobim harmony without Modern Jazz</w:t>
+      </w:r>
+      <w:r>
+        <w:t xml:space="preserve"> — Pick </w:t>
+      </w:r>
+      <w:r>
+        <w:rPr>
+          <w:b/>
+          <w:bCs/>
+        </w:rPr>
+        <w:t xml:space="preserve">Jobim</w:t>
+      </w:r>
+      <w:r>
+        <w:t xml:space="preserve"> as primary and a </w:t>
+      </w:r>
+      <w:r>
+        <w:rPr>
+          <w:b/>
+          <w:bCs/>
+        </w:rPr>
+        <w:t xml:space="preserve">different</w:t>
+      </w:r>
+      <w:r>
+        <w:t xml:space="preserve"> Style Engine profile to study </w:t>
+      </w:r>
+      <w:r>
+        <w:rPr>
+          <w:b/>
+          <w:bCs/>
+        </w:rPr>
+        <w:t xml:space="preserve">symbol</w:t>
+      </w:r>
+      <w:r>
+        <w:t xml:space="preserve"> devices (</w:t>
+      </w:r>
+      <w:r>
+        <w:rPr>
+          <w:b/>
+          <w:bCs/>
+        </w:rPr>
+        <w:t xml:space="preserve">`aj:lyd_dom`</w:t>
+      </w:r>
+      <w:r>
+        <w:t xml:space="preserve">, </w:t>
+      </w:r>
+      <w:r>
+        <w:rPr>
+          <w:b/>
+          <w:bCs/>
+        </w:rPr>
+        <w:t xml:space="preserve">`aj:bvi_m6`</w:t>
+      </w:r>
+      <w:r>
+        <w:t xml:space="preserve">) without the Jobim surface nudges. 3. </w:t>
+      </w:r>
+      <w:r>
+        <w:rPr>
+          <w:b/>
+          <w:bCs/>
+        </w:rPr>
+        <w:t xml:space="preserve">Locked custom chart + Jobim</w:t>
+      </w:r>
+      <w:r>
+        <w:t xml:space="preserve"> — Paste or lock a progression; phrase grid still drives </w:t>
+      </w:r>
+      <w:r>
+        <w:rPr>
+          <w:b/>
+          <w:bCs/>
+        </w:rPr>
+        <w:t xml:space="preserve">phraseMiddle</w:t>
+      </w:r>
+      <w:r>
+        <w:t xml:space="preserve"> vs </w:t>
+      </w:r>
+      <w:r>
+        <w:rPr>
+          <w:b/>
+          <w:bCs/>
+        </w:rPr>
+        <w:t xml:space="preserve">phraseFinal</w:t>
+      </w:r>
+      <w:r>
+        <w:t xml:space="preserve"> gates so </w:t>
+      </w:r>
+      <w:r>
+        <w:rPr>
+          <w:b/>
+          <w:bCs/>
+        </w:rPr>
+        <w:t xml:space="preserve">Lydian dominant</w:t>
+      </w:r>
+      <w:r>
+        <w:t xml:space="preserve"> vs </w:t>
+      </w:r>
+      <w:r>
+        <w:rPr>
+          <w:b/>
+          <w:bCs/>
+        </w:rPr>
+        <w:t xml:space="preserve">bVI m6</w:t>
+      </w:r>
+      <w:r>
+        <w:t xml:space="preserve"> fire on different seeds. 4. </w:t>
+      </w:r>
+      <w:r>
+        <w:rPr>
+          <w:b/>
+          <w:bCs/>
+        </w:rPr>
+        <w:t xml:space="preserve">`jobimBossaAnticipationBars` teaching</w:t>
+      </w:r>
+      <w:r>
+        <w:t xml:space="preserve"> — Read </w:t>
+      </w:r>
+      <w:r>
+        <w:rPr>
+          <w:b/>
+          <w:bCs/>
+        </w:rPr>
+        <w:t xml:space="preserve">`GenerationMetadata.jobimBossaAnticipationBars`</w:t>
+      </w:r>
+      <w:r>
+        <w:t xml:space="preserve"> after Generate to show which bars expect </w:t>
+      </w:r>
+      <w:r>
+        <w:rPr>
+          <w:b/>
+          <w:bCs/>
+        </w:rPr>
+        <w:t xml:space="preserve">anticipatory</w:t>
+      </w:r>
+      <w:r>
+        <w:t xml:space="preserve"> comp rhythm (pair with </w:t>
+      </w:r>
+      <w:r>
+        <w:rPr>
+          <w:b/>
+          <w:bCs/>
+        </w:rPr>
+        <w:t xml:space="preserve">Phase C1</w:t>
+      </w:r>
+      <w:r>
+        <w:t xml:space="preserve"> overlays when consuming metadata). 5. </w:t>
+      </w:r>
+      <w:r>
+        <w:rPr>
+          <w:b/>
+          <w:bCs/>
+        </w:rPr>
+        <w:t xml:space="preserve">Seed A/B</w:t>
+      </w:r>
+      <w:r>
+        <w:t xml:space="preserve"> — </w:t>
+      </w:r>
+      <w:r>
+        <w:rPr>
+          <w:b/>
+          <w:bCs/>
+        </w:rPr>
+        <w:t xml:space="preserve">4/8/2</w:t>
+      </w:r>
+      <w:r>
+        <w:t xml:space="preserve"> phrase lengths change boundary positions; </w:t>
+      </w:r>
+      <w:r>
+        <w:rPr>
+          <w:b/>
+          <w:bCs/>
+        </w:rPr>
+        <w:t xml:space="preserve">lock seed</w:t>
+      </w:r>
+      <w:r>
+        <w:t xml:space="preserve"> to demo a stable </w:t>
+      </w:r>
+      <w:r>
+        <w:rPr>
+          <w:b/>
+          <w:bCs/>
+        </w:rPr>
+        <w:t xml:space="preserve">`aj:lyd_dom`</w:t>
+      </w:r>
+      <w:r>
+        <w:t xml:space="preserve"> or </w:t>
+      </w:r>
+      <w:r>
+        <w:rPr>
+          <w:b/>
+          <w:bCs/>
+        </w:rPr>
+        <w:t xml:space="preserve">`aj:bvi_m6`</w:t>
+      </w:r>
+      <w:r>
+        <w:t xml:space="preserve"> outcome for scoring examples. 6. </w:t>
+      </w:r>
+      <w:r>
+        <w:rPr>
+          <w:b/>
+          <w:bCs/>
+        </w:rPr>
+        <w:t xml:space="preserve">Pair with Latin / sophisticated-pop era</w:t>
+      </w:r>
+      <w:r>
+        <w:t xml:space="preserve"> — Use </w:t>
+      </w:r>
+      <w:r>
+        <w:rPr>
+          <w:b/>
+          <w:bCs/>
+        </w:rPr>
+        <w:t xml:space="preserve">Song Mode</w:t>
+      </w:r>
+      <w:r>
+        <w:t xml:space="preserve"> era pairing copy as usual; Jobim </w:t>
+      </w:r>
+      <w:r>
+        <w:rPr>
+          <w:b/>
+          <w:bCs/>
+        </w:rPr>
+        <w:t xml:space="preserve">slice</w:t>
+      </w:r>
+      <w:r>
+        <w:t xml:space="preserve"> stays harmony-first — arrangement pairing does not replace </w:t>
+      </w:r>
+      <w:r>
+        <w:rPr>
+          <w:b/>
+          <w:bCs/>
+        </w:rPr>
+        <w:t xml:space="preserve">`aj:*`</w:t>
+      </w:r>
+      <w:r>
+        <w:t xml:space="preserve"> symbol logic.</w:t>
       </w:r>
     </w:p>
     <w:p>

</xml_diff>

<commit_message>
docs: Frank Zappa handbook section + roadmap complete
Co-authored-by: Cursor <cursoragent@cursor.com>
</commit_message>
<xml_diff>
--- a/docs/COMPOSER_OS_PLAYBOOK.docx
+++ b/docs/COMPOSER_OS_PLAYBOOK.docx
@@ -17879,6 +17879,1939 @@
       </w:r>
       <w:r>
         <w:t xml:space="preserve"> receipts separately.</w:t>
+      </w:r>
+    </w:p>
+    <w:p>
+      <w:pPr>
+        <w:pStyle w:val="Heading2"/>
+        <w:spacing w:after="100" w:before="160"/>
+      </w:pPr>
+      <w:r>
+        <w:t xml:space="preserve">Frank Zappa (Song Mode — polytonal clash / sectional harmonic slice)</w:t>
+      </w:r>
+    </w:p>
+    <w:p>
+      <w:pPr>
+        <w:spacing w:after="160"/>
+      </w:pPr>
+      <w:r>
+        <w:rPr>
+          <w:b/>
+          <w:bCs/>
+        </w:rPr>
+        <w:t xml:space="preserve">Still current:</w:t>
+      </w:r>
+      <w:r>
+        <w:t xml:space="preserve"> </w:t>
+      </w:r>
+      <w:r>
+        <w:rPr>
+          <w:b/>
+          <w:bCs/>
+        </w:rPr>
+        <w:t xml:space="preserve">`frankZappaSlice.ts`</w:t>
+      </w:r>
+      <w:r>
+        <w:t xml:space="preserve">, </w:t>
+      </w:r>
+      <w:r>
+        <w:rPr>
+          <w:b/>
+          <w:bCs/>
+        </w:rPr>
+        <w:t xml:space="preserve">`precomputeFrankZappaEffectiveHarmonyBars`</w:t>
+      </w:r>
+      <w:r>
+        <w:t xml:space="preserve">, </w:t>
+      </w:r>
+      <w:r>
+        <w:rPr>
+          <w:b/>
+          <w:bCs/>
+        </w:rPr>
+        <w:t xml:space="preserve">`frankZappaEffectiveHarmonyBars`</w:t>
+      </w:r>
+      <w:r>
+        <w:t xml:space="preserve"> → </w:t>
+      </w:r>
+      <w:r>
+        <w:rPr>
+          <w:b/>
+          <w:bCs/>
+        </w:rPr>
+        <w:t xml:space="preserve">`getChordForBar`</w:t>
+      </w:r>
+      <w:r>
+        <w:t xml:space="preserve"> / </w:t>
+      </w:r>
+      <w:r>
+        <w:rPr>
+          <w:b/>
+          <w:bCs/>
+        </w:rPr>
+        <w:t xml:space="preserve">`attachFrankZappaHarmonyContext`</w:t>
+      </w:r>
+      <w:r>
+        <w:t xml:space="preserve"> / locked export truth; receipts </w:t>
+      </w:r>
+      <w:r>
+        <w:rPr>
+          <w:b/>
+          <w:bCs/>
+        </w:rPr>
+        <w:t xml:space="preserve">`fz:d1–d5:…@bar{N}#v1`</w:t>
+      </w:r>
+      <w:r>
+        <w:t xml:space="preserve"> plus additive </w:t>
+      </w:r>
+      <w:r>
+        <w:rPr>
+          <w:b/>
+          <w:bCs/>
+        </w:rPr>
+        <w:t xml:space="preserve">`fz:lyd_dominant`</w:t>
+      </w:r>
+      <w:r>
+        <w:t xml:space="preserve">, </w:t>
+      </w:r>
+      <w:r>
+        <w:rPr>
+          <w:b/>
+          <w:bCs/>
+        </w:rPr>
+        <w:t xml:space="preserve">`fz:bitonal_triad`</w:t>
+      </w:r>
+      <w:r>
+        <w:t xml:space="preserve">, </w:t>
+      </w:r>
+      <w:r>
+        <w:rPr>
+          <w:b/>
+          <w:bCs/>
+        </w:rPr>
+        <w:t xml:space="preserve">`fz:motif_recycle_*`</w:t>
+      </w:r>
+      <w:r>
+        <w:t xml:space="preserve">, </w:t>
+      </w:r>
+      <w:r>
+        <w:rPr>
+          <w:b/>
+          <w:bCs/>
+        </w:rPr>
+        <w:t xml:space="preserve">`fz:hard_cut_trigger`</w:t>
+      </w:r>
+      <w:r>
+        <w:t xml:space="preserve">.</w:t>
+      </w:r>
+    </w:p>
+    <w:p>
+      <w:pPr>
+        <w:spacing w:after="160"/>
+      </w:pPr>
+      <w:r>
+        <w:t xml:space="preserve">The slice </w:t>
+      </w:r>
+      <w:r>
+        <w:rPr>
+          <w:b/>
+          <w:bCs/>
+        </w:rPr>
+        <w:t xml:space="preserve">rewrites chord symbols</w:t>
+      </w:r>
+      <w:r>
+        <w:t xml:space="preserve"> on the duo golden path (devices </w:t>
+      </w:r>
+      <w:r>
+        <w:rPr>
+          <w:b/>
+          <w:bCs/>
+        </w:rPr>
+        <w:t xml:space="preserve">d1–d5</w:t>
+      </w:r>
+      <w:r>
+        <w:t xml:space="preserve">: polytonal slash, metric displacement, xenochrony offset, style juxtaposition, through-composed cut). Additive passes stack </w:t>
+      </w:r>
+      <w:r>
+        <w:rPr>
+          <w:b/>
+          <w:bCs/>
+        </w:rPr>
+        <w:t xml:space="preserve">after</w:t>
+      </w:r>
+      <w:r>
+        <w:t xml:space="preserve"> the primary device loop; </w:t>
+      </w:r>
+      <w:r>
+        <w:rPr>
+          <w:b/>
+          <w:bCs/>
+        </w:rPr>
+        <w:t xml:space="preserve">slash-bass symbols are left untouched</w:t>
+      </w:r>
+      <w:r>
+        <w:t xml:space="preserve"> on those passes so slash spelling stays aligned with locked harmony assertions.</w:t>
+      </w:r>
+    </w:p>
+    <w:p>
+      <w:pPr>
+        <w:pStyle w:val="Heading3"/>
+        <w:spacing w:after="80" w:before="120"/>
+      </w:pPr>
+      <w:r>
+        <w:t xml:space="preserve">Three context modes (`frankZappaContext`)</w:t>
+      </w:r>
+    </w:p>
+    <w:p>
+      <w:pPr>
+        <w:spacing w:after="160"/>
+      </w:pPr>
+      <w:r>
+        <w:t xml:space="preserve">API / </w:t>
+      </w:r>
+      <w:r>
+        <w:rPr>
+          <w:b/>
+          <w:bCs/>
+        </w:rPr>
+        <w:t xml:space="preserve">`GenerateRequest`</w:t>
+      </w:r>
+      <w:r>
+        <w:t xml:space="preserve"> / </w:t>
+      </w:r>
+      <w:r>
+        <w:rPr>
+          <w:b/>
+          <w:bCs/>
+        </w:rPr>
+        <w:t xml:space="preserve">`RunGoldenPathOptions`</w:t>
+      </w:r>
+      <w:r>
+        <w:t xml:space="preserve"> → </w:t>
+      </w:r>
+      <w:r>
+        <w:rPr>
+          <w:b/>
+          <w:bCs/>
+        </w:rPr>
+        <w:t xml:space="preserve">`GenerationMetadata.frankZappaContext`</w:t>
+      </w:r>
+      <w:r>
+        <w:t xml:space="preserve">. Default when omitted: </w:t>
+      </w:r>
+      <w:r>
+        <w:rPr>
+          <w:b/>
+          <w:bCs/>
+        </w:rPr>
+        <w:t xml:space="preserve">`avant_rock`</w:t>
+      </w:r>
+      <w:r>
+        <w:t xml:space="preserve">.</w:t>
+      </w:r>
+    </w:p>
+    <w:tbl>
+      <w:tblPr>
+        <w:tblW w:type="pct" w:w="100%"/>
+        <w:tblBorders>
+          <w:top w:val="single" w:color="auto" w:sz="4"/>
+          <w:left w:val="single" w:color="auto" w:sz="4"/>
+          <w:bottom w:val="single" w:color="auto" w:sz="4"/>
+          <w:right w:val="single" w:color="auto" w:sz="4"/>
+          <w:insideH w:val="single" w:color="auto" w:sz="4"/>
+          <w:insideV w:val="single" w:color="auto" w:sz="4"/>
+        </w:tblBorders>
+      </w:tblPr>
+      <w:tblGrid>
+        <w:gridCol w:w="4500"/>
+        <w:gridCol w:w="4500"/>
+      </w:tblGrid>
+      <w:tr>
+        <w:tc>
+          <w:tcPr>
+            <w:tcW w:type="pct" w:w="4500%"/>
+          </w:tcPr>
+          <w:p>
+            <w:pPr>
+              <w:spacing w:after="60"/>
+            </w:pPr>
+            <w:r>
+              <w:t xml:space="preserve">Mode</w:t>
+            </w:r>
+          </w:p>
+        </w:tc>
+        <w:tc>
+          <w:tcPr>
+            <w:tcW w:type="pct" w:w="4500%"/>
+          </w:tcPr>
+          <w:p>
+            <w:pPr>
+              <w:spacing w:after="60"/>
+            </w:pPr>
+            <w:r>
+              <w:t xml:space="preserve">Role</w:t>
+            </w:r>
+          </w:p>
+        </w:tc>
+      </w:tr>
+      <w:tr>
+        <w:tc>
+          <w:tcPr>
+            <w:tcW w:type="pct" w:w="4500%"/>
+          </w:tcPr>
+          <w:p>
+            <w:pPr>
+              <w:spacing w:after="60"/>
+            </w:pPr>
+            <w:r>
+              <w:rPr>
+                <w:b/>
+                <w:bCs/>
+              </w:rPr>
+              <w:t xml:space="preserve">`avant_rock`</w:t>
+            </w:r>
+          </w:p>
+        </w:tc>
+        <w:tc>
+          <w:tcPr>
+            <w:tcW w:type="pct" w:w="4500%"/>
+          </w:tcPr>
+          <w:p>
+            <w:pPr>
+              <w:spacing w:after="60"/>
+            </w:pPr>
+            <w:r>
+              <w:t xml:space="preserve">Default </w:t>
+            </w:r>
+            <w:r>
+              <w:rPr>
+                <w:b/>
+                <w:bCs/>
+              </w:rPr>
+              <w:t xml:space="preserve">studio-rock / collage</w:t>
+            </w:r>
+            <w:r>
+              <w:t xml:space="preserve"> bias — synthetic bucket includes </w:t>
+            </w:r>
+            <w:r>
+              <w:rPr>
+                <w:b/>
+                <w:bCs/>
+              </w:rPr>
+              <w:t xml:space="preserve">`synthetic`</w:t>
+            </w:r>
+            <w:r>
+              <w:t xml:space="preserve"> weight in scale-bias metadata.</w:t>
+            </w:r>
+          </w:p>
+        </w:tc>
+      </w:tr>
+      <w:tr>
+        <w:tc>
+          <w:tcPr>
+            <w:tcW w:type="pct" w:w="4500%"/>
+          </w:tcPr>
+          <w:p>
+            <w:pPr>
+              <w:spacing w:after="60"/>
+            </w:pPr>
+            <w:r>
+              <w:rPr>
+                <w:b/>
+                <w:bCs/>
+              </w:rPr>
+              <w:t xml:space="preserve">`big_band`</w:t>
+            </w:r>
+          </w:p>
+        </w:tc>
+        <w:tc>
+          <w:tcPr>
+            <w:tcW w:type="pct" w:w="4500%"/>
+          </w:tcPr>
+          <w:p>
+            <w:pPr>
+              <w:spacing w:after="60"/>
+            </w:pPr>
+            <w:r>
+              <w:rPr>
+                <w:b/>
+                <w:bCs/>
+              </w:rPr>
+              <w:t xml:space="preserve">Lydian / Mixolydian / Dorian</w:t>
+            </w:r>
+            <w:r>
+              <w:t xml:space="preserve"> only (three-way split in </w:t>
+            </w:r>
+            <w:r>
+              <w:rPr>
+                <w:b/>
+                <w:bCs/>
+              </w:rPr>
+              <w:t xml:space="preserve">`frankZappaSyntheticScaleBias`</w:t>
+            </w:r>
+            <w:r>
+              <w:t xml:space="preserve">).</w:t>
+            </w:r>
+          </w:p>
+        </w:tc>
+      </w:tr>
+      <w:tr>
+        <w:tc>
+          <w:tcPr>
+            <w:tcW w:type="pct" w:w="4500%"/>
+          </w:tcPr>
+          <w:p>
+            <w:pPr>
+              <w:spacing w:after="60"/>
+            </w:pPr>
+            <w:r>
+              <w:rPr>
+                <w:b/>
+                <w:bCs/>
+              </w:rPr>
+              <w:t xml:space="preserve">`futuristic_jazz`</w:t>
+            </w:r>
+          </w:p>
+        </w:tc>
+        <w:tc>
+          <w:tcPr>
+            <w:tcW w:type="pct" w:w="4500%"/>
+          </w:tcPr>
+          <w:p>
+            <w:pPr>
+              <w:spacing w:after="60"/>
+            </w:pPr>
+            <w:r>
+              <w:t xml:space="preserve">Adds </w:t>
+            </w:r>
+            <w:r>
+              <w:rPr>
+                <w:b/>
+                <w:bCs/>
+              </w:rPr>
+              <w:t xml:space="preserve">Lydian dominant</w:t>
+            </w:r>
+            <w:r>
+              <w:t xml:space="preserve">, </w:t>
+            </w:r>
+            <w:r>
+              <w:rPr>
+                <w:b/>
+                <w:bCs/>
+              </w:rPr>
+              <w:t xml:space="preserve">diminished</w:t>
+            </w:r>
+            <w:r>
+              <w:t xml:space="preserve">, </w:t>
+            </w:r>
+            <w:r>
+              <w:rPr>
+                <w:b/>
+                <w:bCs/>
+              </w:rPr>
+              <w:t xml:space="preserve">whole-tone</w:t>
+            </w:r>
+            <w:r>
+              <w:t xml:space="preserve">, </w:t>
+            </w:r>
+            <w:r>
+              <w:rPr>
+                <w:b/>
+                <w:bCs/>
+              </w:rPr>
+              <w:t xml:space="preserve">`custom`</w:t>
+            </w:r>
+            <w:r>
+              <w:t xml:space="preserve"> alongside core </w:t>
+            </w:r>
+            <w:r>
+              <w:rPr>
+                <w:b/>
+                <w:bCs/>
+              </w:rPr>
+              <w:t xml:space="preserve">Lydian</w:t>
+            </w:r>
+            <w:r>
+              <w:t xml:space="preserve"> weights.</w:t>
+            </w:r>
+          </w:p>
+        </w:tc>
+      </w:tr>
+    </w:tbl>
+    <w:p>
+      <w:pPr>
+        <w:spacing w:after="160"/>
+      </w:pPr>
+    </w:p>
+    <w:p>
+      <w:pPr>
+        <w:pStyle w:val="Heading3"/>
+        <w:spacing w:after="80" w:before="120"/>
+      </w:pPr>
+      <w:r>
+        <w:t xml:space="preserve">Density arc — six zones</w:t>
+      </w:r>
+    </w:p>
+    <w:p>
+      <w:pPr>
+        <w:spacing w:after="160"/>
+      </w:pPr>
+      <w:r>
+        <w:rPr>
+          <w:b/>
+          <w:bCs/>
+        </w:rPr>
+        <w:t xml:space="preserve">`computeZappaDensityArc(totalBars)`</w:t>
+      </w:r>
+      <w:r>
+        <w:t xml:space="preserve"> maps each bar to </w:t>
+      </w:r>
+      <w:r>
+        <w:rPr>
+          <w:b/>
+          <w:bCs/>
+        </w:rPr>
+        <w:t xml:space="preserve">`songwriterDensityBias`-lane values</w:t>
+      </w:r>
+      <w:r>
+        <w:t xml:space="preserve"> along </w:t>
+      </w:r>
+      <w:r>
+        <w:rPr>
+          <w:b/>
+          <w:bCs/>
+        </w:rPr>
+        <w:t xml:space="preserve">intro → build1 → peak1 → drop → peak2 → outro</w:t>
+      </w:r>
+      <w:r>
+        <w:t xml:space="preserve"> with time shares </w:t>
+      </w:r>
+      <w:r>
+        <w:rPr>
+          <w:b/>
+          <w:bCs/>
+        </w:rPr>
+        <w:t xml:space="preserve">12% / 22% / 12% / 18% / 28% / 8%</w:t>
+      </w:r>
+      <w:r>
+        <w:t xml:space="preserve"> and zone densities </w:t>
+      </w:r>
+      <w:r>
+        <w:rPr>
+          <w:b/>
+          <w:bCs/>
+        </w:rPr>
+        <w:t xml:space="preserve">0.30 / 0.55 / 0.85 / 0.25 / 0.95 / 0.35</w:t>
+      </w:r>
+      <w:r>
+        <w:t xml:space="preserve">. </w:t>
+      </w:r>
+      <w:r>
+        <w:rPr>
+          <w:b/>
+          <w:bCs/>
+        </w:rPr>
+        <w:t xml:space="preserve">`precomputeFrankZappaEffectiveHarmonyBars`</w:t>
+      </w:r>
+      <w:r>
+        <w:t xml:space="preserve"> stores </w:t>
+      </w:r>
+      <w:r>
+        <w:rPr>
+          <w:b/>
+          <w:bCs/>
+        </w:rPr>
+        <w:t xml:space="preserve">`frankZappaDensityBiasByBar`</w:t>
+      </w:r>
+      <w:r>
+        <w:t xml:space="preserve"> and refreshes it after </w:t>
+      </w:r>
+      <w:r>
+        <w:rPr>
+          <w:b/>
+          <w:bCs/>
+        </w:rPr>
+        <w:t xml:space="preserve">hard-cut</w:t>
+      </w:r>
+      <w:r>
+        <w:t xml:space="preserve"> triggers (tail segment </w:t>
+      </w:r>
+      <w:r>
+        <w:rPr>
+          <w:b/>
+          <w:bCs/>
+        </w:rPr>
+        <w:t xml:space="preserve">re-zoned</w:t>
+      </w:r>
+      <w:r>
+        <w:t xml:space="preserve"> from the cut bar).</w:t>
+      </w:r>
+    </w:p>
+    <w:p>
+      <w:pPr>
+        <w:pStyle w:val="Heading3"/>
+        <w:spacing w:after="80" w:before="120"/>
+      </w:pPr>
+      <w:r>
+        <w:t xml:space="preserve">Synthetic scale bias (metadata)</w:t>
+      </w:r>
+    </w:p>
+    <w:p>
+      <w:pPr>
+        <w:spacing w:after="160"/>
+      </w:pPr>
+      <w:r>
+        <w:rPr>
+          <w:b/>
+          <w:bCs/>
+        </w:rPr>
+        <w:t xml:space="preserve">`resolveFrankZappaSyntheticScaleBias(mode)`</w:t>
+      </w:r>
+      <w:r>
+        <w:t xml:space="preserve"> fills </w:t>
+      </w:r>
+      <w:r>
+        <w:rPr>
+          <w:b/>
+          <w:bCs/>
+        </w:rPr>
+        <w:t xml:space="preserve">`frankZappaSyntheticScaleBias`</w:t>
+      </w:r>
+      <w:r>
+        <w:t xml:space="preserve"> on </w:t>
+      </w:r>
+      <w:r>
+        <w:rPr>
+          <w:b/>
+          <w:bCs/>
+        </w:rPr>
+        <w:t xml:space="preserve">`GenerationMetadata`</w:t>
+      </w:r>
+      <w:r>
+        <w:t xml:space="preserve"> — manifest/teaching weights only, not a separate scale engine:</w:t>
+      </w:r>
+    </w:p>
+    <w:p>
+      <w:pPr>
+        <w:spacing w:after="80"/>
+        <w:ind w:left="360" w:hanging="260"/>
+      </w:pPr>
+      <w:r>
+        <w:t xml:space="preserve">• </w:t>
+      </w:r>
+      <w:r>
+        <w:rPr>
+          <w:b/>
+          <w:bCs/>
+        </w:rPr>
+        <w:t xml:space="preserve">avant_rock:</w:t>
+      </w:r>
+      <w:r>
+        <w:t xml:space="preserve"> Lydian </w:t>
+      </w:r>
+      <w:r>
+        <w:rPr>
+          <w:b/>
+          <w:bCs/>
+        </w:rPr>
+        <w:t xml:space="preserve">40%</w:t>
+      </w:r>
+      <w:r>
+        <w:t xml:space="preserve"> · Dorian </w:t>
+      </w:r>
+      <w:r>
+        <w:rPr>
+          <w:b/>
+          <w:bCs/>
+        </w:rPr>
+        <w:t xml:space="preserve">30%</w:t>
+      </w:r>
+      <w:r>
+        <w:t xml:space="preserve"> · Mixolydian </w:t>
+      </w:r>
+      <w:r>
+        <w:rPr>
+          <w:b/>
+          <w:bCs/>
+        </w:rPr>
+        <w:t xml:space="preserve">20%</w:t>
+      </w:r>
+      <w:r>
+        <w:t xml:space="preserve"> · synthetic </w:t>
+      </w:r>
+      <w:r>
+        <w:rPr>
+          <w:b/>
+          <w:bCs/>
+        </w:rPr>
+        <w:t xml:space="preserve">10%</w:t>
+      </w:r>
+    </w:p>
+    <w:p>
+      <w:pPr>
+        <w:spacing w:after="80"/>
+        <w:ind w:left="360" w:hanging="260"/>
+      </w:pPr>
+      <w:r>
+        <w:t xml:space="preserve">• </w:t>
+      </w:r>
+      <w:r>
+        <w:rPr>
+          <w:b/>
+          <w:bCs/>
+        </w:rPr>
+        <w:t xml:space="preserve">big_band:</w:t>
+      </w:r>
+      <w:r>
+        <w:t xml:space="preserve"> Lydian </w:t>
+      </w:r>
+      <w:r>
+        <w:rPr>
+          <w:b/>
+          <w:bCs/>
+        </w:rPr>
+        <w:t xml:space="preserve">50%</w:t>
+      </w:r>
+      <w:r>
+        <w:t xml:space="preserve"> · Mixolydian </w:t>
+      </w:r>
+      <w:r>
+        <w:rPr>
+          <w:b/>
+          <w:bCs/>
+        </w:rPr>
+        <w:t xml:space="preserve">25%</w:t>
+      </w:r>
+      <w:r>
+        <w:t xml:space="preserve"> · Dorian </w:t>
+      </w:r>
+      <w:r>
+        <w:rPr>
+          <w:b/>
+          <w:bCs/>
+        </w:rPr>
+        <w:t xml:space="preserve">25%</w:t>
+      </w:r>
+    </w:p>
+    <w:p>
+      <w:pPr>
+        <w:spacing w:after="80"/>
+        <w:ind w:left="360" w:hanging="260"/>
+      </w:pPr>
+      <w:r>
+        <w:t xml:space="preserve">• </w:t>
+      </w:r>
+      <w:r>
+        <w:rPr>
+          <w:b/>
+          <w:bCs/>
+        </w:rPr>
+        <w:t xml:space="preserve">futuristic_jazz:</w:t>
+      </w:r>
+      <w:r>
+        <w:t xml:space="preserve"> Lydian </w:t>
+      </w:r>
+      <w:r>
+        <w:rPr>
+          <w:b/>
+          <w:bCs/>
+        </w:rPr>
+        <w:t xml:space="preserve">35%</w:t>
+      </w:r>
+      <w:r>
+        <w:t xml:space="preserve"> · Lydian dominant </w:t>
+      </w:r>
+      <w:r>
+        <w:rPr>
+          <w:b/>
+          <w:bCs/>
+        </w:rPr>
+        <w:t xml:space="preserve">20%</w:t>
+      </w:r>
+      <w:r>
+        <w:t xml:space="preserve"> · diminished </w:t>
+      </w:r>
+      <w:r>
+        <w:rPr>
+          <w:b/>
+          <w:bCs/>
+        </w:rPr>
+        <w:t xml:space="preserve">15%</w:t>
+      </w:r>
+      <w:r>
+        <w:t xml:space="preserve"> · whole-tone </w:t>
+      </w:r>
+      <w:r>
+        <w:rPr>
+          <w:b/>
+          <w:bCs/>
+        </w:rPr>
+        <w:t xml:space="preserve">10%</w:t>
+      </w:r>
+      <w:r>
+        <w:t xml:space="preserve"> · custom </w:t>
+      </w:r>
+      <w:r>
+        <w:rPr>
+          <w:b/>
+          <w:bCs/>
+        </w:rPr>
+        <w:t xml:space="preserve">20%</w:t>
+      </w:r>
+    </w:p>
+    <w:p>
+      <w:pPr>
+        <w:pStyle w:val="Heading3"/>
+        <w:spacing w:after="80" w:before="120"/>
+      </w:pPr>
+      <w:r>
+        <w:t xml:space="preserve">Additive harmony passes (post–d1–d5 loop)</w:t>
+      </w:r>
+    </w:p>
+    <w:tbl>
+      <w:tblPr>
+        <w:tblW w:type="pct" w:w="100%"/>
+        <w:tblBorders>
+          <w:top w:val="single" w:color="auto" w:sz="4"/>
+          <w:left w:val="single" w:color="auto" w:sz="4"/>
+          <w:bottom w:val="single" w:color="auto" w:sz="4"/>
+          <w:right w:val="single" w:color="auto" w:sz="4"/>
+          <w:insideH w:val="single" w:color="auto" w:sz="4"/>
+          <w:insideV w:val="single" w:color="auto" w:sz="4"/>
+        </w:tblBorders>
+      </w:tblPr>
+      <w:tblGrid>
+        <w:gridCol w:w="3000"/>
+        <w:gridCol w:w="3000"/>
+        <w:gridCol w:w="3000"/>
+      </w:tblGrid>
+      <w:tr>
+        <w:tc>
+          <w:tcPr>
+            <w:tcW w:type="pct" w:w="3000%"/>
+          </w:tcPr>
+          <w:p>
+            <w:pPr>
+              <w:spacing w:after="60"/>
+            </w:pPr>
+            <w:r>
+              <w:t xml:space="preserve">Pass</w:t>
+            </w:r>
+          </w:p>
+        </w:tc>
+        <w:tc>
+          <w:tcPr>
+            <w:tcW w:type="pct" w:w="3000%"/>
+          </w:tcPr>
+          <w:p>
+            <w:pPr>
+              <w:spacing w:after="60"/>
+            </w:pPr>
+            <w:r>
+              <w:t xml:space="preserve">Receipt</w:t>
+            </w:r>
+          </w:p>
+        </w:tc>
+        <w:tc>
+          <w:tcPr>
+            <w:tcW w:type="pct" w:w="3000%"/>
+          </w:tcPr>
+          <w:p>
+            <w:pPr>
+              <w:spacing w:after="60"/>
+            </w:pPr>
+            <w:r>
+              <w:t xml:space="preserve">Notes</w:t>
+            </w:r>
+          </w:p>
+        </w:tc>
+      </w:tr>
+      <w:tr>
+        <w:tc>
+          <w:tcPr>
+            <w:tcW w:type="pct" w:w="3000%"/>
+          </w:tcPr>
+          <w:p>
+            <w:pPr>
+              <w:spacing w:after="60"/>
+            </w:pPr>
+            <w:r>
+              <w:rPr>
+                <w:b/>
+                <w:bCs/>
+              </w:rPr>
+              <w:t xml:space="preserve">Lydian dominant field</w:t>
+            </w:r>
+          </w:p>
+        </w:tc>
+        <w:tc>
+          <w:tcPr>
+            <w:tcW w:type="pct" w:w="3000%"/>
+          </w:tcPr>
+          <w:p>
+            <w:pPr>
+              <w:spacing w:after="60"/>
+            </w:pPr>
+            <w:r>
+              <w:rPr>
+                <w:b/>
+                <w:bCs/>
+              </w:rPr>
+              <w:t xml:space="preserve">`fz:lyd_dominant@bar{N}#v1`</w:t>
+            </w:r>
+          </w:p>
+        </w:tc>
+        <w:tc>
+          <w:tcPr>
+            <w:tcW w:type="pct" w:w="3000%"/>
+          </w:tcPr>
+          <w:p>
+            <w:pPr>
+              <w:spacing w:after="60"/>
+            </w:pPr>
+            <w:r>
+              <w:rPr>
+                <w:b/>
+                <w:bCs/>
+              </w:rPr>
+              <w:t xml:space="preserve">Non-hook</w:t>
+            </w:r>
+            <w:r>
+              <w:t xml:space="preserve"> bars, seeded rate </w:t>
+            </w:r>
+            <w:r>
+              <w:rPr>
+                <w:b/>
+                <w:bCs/>
+              </w:rPr>
+              <w:t xml:space="preserve">32%</w:t>
+            </w:r>
+            <w:r>
+              <w:t xml:space="preserve"> when the bar reads as </w:t>
+            </w:r>
+            <w:r>
+              <w:rPr>
+                <w:b/>
+                <w:bCs/>
+              </w:rPr>
+              <w:t xml:space="preserve">Lydian-field</w:t>
+            </w:r>
+            <w:r>
+              <w:t xml:space="preserve"> (symbol hints + context odds); appends </w:t>
+            </w:r>
+            <w:r>
+              <w:rPr>
+                <w:b/>
+                <w:bCs/>
+              </w:rPr>
+              <w:t xml:space="preserve">`(#11)`</w:t>
+            </w:r>
+            <w:r>
+              <w:t xml:space="preserve"> to eligible </w:t>
+            </w:r>
+            <w:r>
+              <w:rPr>
+                <w:b/>
+                <w:bCs/>
+              </w:rPr>
+              <w:t xml:space="preserve">dominant / major</w:t>
+            </w:r>
+            <w:r>
+              <w:t xml:space="preserve"> spellings. </w:t>
+            </w:r>
+            <w:r>
+              <w:rPr>
+                <w:b/>
+                <w:bCs/>
+              </w:rPr>
+              <w:t xml:space="preserve">Skips</w:t>
+            </w:r>
+            <w:r>
+              <w:t xml:space="preserve"> symbols with </w:t>
+            </w:r>
+            <w:r>
+              <w:rPr>
+                <w:b/>
+                <w:bCs/>
+              </w:rPr>
+              <w:t xml:space="preserve">`/`</w:t>
+            </w:r>
+            <w:r>
+              <w:t xml:space="preserve"> (slash bass unchanged).</w:t>
+            </w:r>
+          </w:p>
+        </w:tc>
+      </w:tr>
+      <w:tr>
+        <w:tc>
+          <w:tcPr>
+            <w:tcW w:type="pct" w:w="3000%"/>
+          </w:tcPr>
+          <w:p>
+            <w:pPr>
+              <w:spacing w:after="60"/>
+            </w:pPr>
+            <w:r>
+              <w:rPr>
+                <w:b/>
+                <w:bCs/>
+              </w:rPr>
+              <w:t xml:space="preserve">Bitonal triads</w:t>
+            </w:r>
+          </w:p>
+        </w:tc>
+        <w:tc>
+          <w:tcPr>
+            <w:tcW w:type="pct" w:w="3000%"/>
+          </w:tcPr>
+          <w:p>
+            <w:pPr>
+              <w:spacing w:after="60"/>
+            </w:pPr>
+            <w:r>
+              <w:rPr>
+                <w:b/>
+                <w:bCs/>
+              </w:rPr>
+              <w:t xml:space="preserve">`fz:bitonal_triad@bar{N}#v1`</w:t>
+            </w:r>
+          </w:p>
+        </w:tc>
+        <w:tc>
+          <w:tcPr>
+            <w:tcW w:type="pct" w:w="3000%"/>
+          </w:tcPr>
+          <w:p>
+            <w:pPr>
+              <w:spacing w:after="60"/>
+            </w:pPr>
+            <w:r>
+              <w:rPr>
+                <w:b/>
+                <w:bCs/>
+              </w:rPr>
+              <w:t xml:space="preserve">Non-hook</w:t>
+            </w:r>
+            <w:r>
+              <w:t xml:space="preserve">, rate </w:t>
+            </w:r>
+            <w:r>
+              <w:rPr>
+                <w:b/>
+                <w:bCs/>
+              </w:rPr>
+              <w:t xml:space="preserve">24%</w:t>
+            </w:r>
+            <w:r>
+              <w:t xml:space="preserve"> — two </w:t>
+            </w:r>
+            <w:r>
+              <w:rPr>
+                <w:b/>
+                <w:bCs/>
+              </w:rPr>
+              <w:t xml:space="preserve">major triad</w:t>
+            </w:r>
+            <w:r>
+              <w:t xml:space="preserve"> roots </w:t>
+            </w:r>
+            <w:r>
+              <w:rPr>
+                <w:b/>
+                <w:bCs/>
+              </w:rPr>
+              <w:t xml:space="preserve">+4 or +6</w:t>
+            </w:r>
+            <w:r>
+              <w:t xml:space="preserve"> semitones apart, spelled </w:t>
+            </w:r>
+            <w:r>
+              <w:rPr>
+                <w:b/>
+                <w:bCs/>
+              </w:rPr>
+              <w:t xml:space="preserve">`Rootmaj+Root2maj`</w:t>
+            </w:r>
+            <w:r>
+              <w:t xml:space="preserve"> (not tritone </w:t>
+            </w:r>
+            <w:r>
+              <w:rPr>
+                <w:b/>
+                <w:bCs/>
+              </w:rPr>
+              <w:t xml:space="preserve">slash</w:t>
+            </w:r>
+            <w:r>
+              <w:t xml:space="preserve"> polytonality). </w:t>
+            </w:r>
+            <w:r>
+              <w:rPr>
+                <w:b/>
+                <w:bCs/>
+              </w:rPr>
+              <w:t xml:space="preserve">Skips</w:t>
+            </w:r>
+            <w:r>
+              <w:t xml:space="preserve"> slash chords.</w:t>
+            </w:r>
+          </w:p>
+        </w:tc>
+      </w:tr>
+      <w:tr>
+        <w:tc>
+          <w:tcPr>
+            <w:tcW w:type="pct" w:w="3000%"/>
+          </w:tcPr>
+          <w:p>
+            <w:pPr>
+              <w:spacing w:after="60"/>
+            </w:pPr>
+            <w:r>
+              <w:rPr>
+                <w:b/>
+                <w:bCs/>
+              </w:rPr>
+              <w:t xml:space="preserve">Motif recycling</w:t>
+            </w:r>
+          </w:p>
+        </w:tc>
+        <w:tc>
+          <w:tcPr>
+            <w:tcW w:type="pct" w:w="3000%"/>
+          </w:tcPr>
+          <w:p>
+            <w:pPr>
+              <w:spacing w:after="60"/>
+            </w:pPr>
+            <w:r>
+              <w:rPr>
+                <w:b/>
+                <w:bCs/>
+              </w:rPr>
+              <w:t xml:space="preserve">`fz:motif_recycle_{transform}@bar{N}#v1`</w:t>
+            </w:r>
+          </w:p>
+        </w:tc>
+        <w:tc>
+          <w:tcPr>
+            <w:tcW w:type="pct" w:w="3000%"/>
+          </w:tcPr>
+          <w:p>
+            <w:pPr>
+              <w:spacing w:after="60"/>
+            </w:pPr>
+            <w:r>
+              <w:t xml:space="preserve">Per </w:t>
+            </w:r>
+            <w:r>
+              <w:rPr>
+                <w:b/>
+                <w:bCs/>
+              </w:rPr>
+              <w:t xml:space="preserve">form section</w:t>
+            </w:r>
+            <w:r>
+              <w:t xml:space="preserve">, detects a repeating </w:t>
+            </w:r>
+            <w:r>
+              <w:rPr>
+                <w:b/>
+                <w:bCs/>
+              </w:rPr>
+              <w:t xml:space="preserve">4-bar</w:t>
+            </w:r>
+            <w:r>
+              <w:t xml:space="preserve"> harmonic cell; one weighted transform on the repeat (</w:t>
+            </w:r>
+            <w:r>
+              <w:rPr>
+                <w:b/>
+                <w:bCs/>
+              </w:rPr>
+              <w:t xml:space="preserve">transposition</w:t>
+            </w:r>
+            <w:r>
+              <w:t xml:space="preserve">, </w:t>
+            </w:r>
+            <w:r>
+              <w:rPr>
+                <w:b/>
+                <w:bCs/>
+              </w:rPr>
+              <w:t xml:space="preserve">rhythmic_displacement</w:t>
+            </w:r>
+            <w:r>
+              <w:t xml:space="preserve">, </w:t>
+            </w:r>
+            <w:r>
+              <w:rPr>
+                <w:b/>
+                <w:bCs/>
+              </w:rPr>
+              <w:t xml:space="preserve">exact_repeat</w:t>
+            </w:r>
+            <w:r>
+              <w:t xml:space="preserve">, </w:t>
+            </w:r>
+            <w:r>
+              <w:rPr>
+                <w:b/>
+                <w:bCs/>
+              </w:rPr>
+              <w:t xml:space="preserve">augmentation_diminution</w:t>
+            </w:r>
+            <w:r>
+              <w:t xml:space="preserve">, </w:t>
+            </w:r>
+            <w:r>
+              <w:rPr>
+                <w:b/>
+                <w:bCs/>
+              </w:rPr>
+              <w:t xml:space="preserve">inversion</w:t>
+            </w:r>
+            <w:r>
+              <w:t xml:space="preserve">, </w:t>
+            </w:r>
+            <w:r>
+              <w:rPr>
+                <w:b/>
+                <w:bCs/>
+              </w:rPr>
+              <w:t xml:space="preserve">combined</w:t>
+            </w:r>
+            <w:r>
+              <w:t xml:space="preserve">, </w:t>
+            </w:r>
+            <w:r>
+              <w:rPr>
+                <w:b/>
+                <w:bCs/>
+              </w:rPr>
+              <w:t xml:space="preserve">retrograde</w:t>
+            </w:r>
+            <w:r>
+              <w:t xml:space="preserve">). </w:t>
+            </w:r>
+            <w:r>
+              <w:rPr>
+                <w:b/>
+                <w:bCs/>
+              </w:rPr>
+              <w:t xml:space="preserve">Skips</w:t>
+            </w:r>
+            <w:r>
+              <w:t xml:space="preserve"> slash chords at the edit bar.</w:t>
+            </w:r>
+          </w:p>
+        </w:tc>
+      </w:tr>
+      <w:tr>
+        <w:tc>
+          <w:tcPr>
+            <w:tcW w:type="pct" w:w="3000%"/>
+          </w:tcPr>
+          <w:p>
+            <w:pPr>
+              <w:spacing w:after="60"/>
+            </w:pPr>
+            <w:r>
+              <w:rPr>
+                <w:b/>
+                <w:bCs/>
+              </w:rPr>
+              <w:t xml:space="preserve">Hard-cut trigger system</w:t>
+            </w:r>
+          </w:p>
+        </w:tc>
+        <w:tc>
+          <w:tcPr>
+            <w:tcW w:type="pct" w:w="3000%"/>
+          </w:tcPr>
+          <w:p>
+            <w:pPr>
+              <w:spacing w:after="60"/>
+            </w:pPr>
+            <w:r>
+              <w:rPr>
+                <w:b/>
+                <w:bCs/>
+              </w:rPr>
+              <w:t xml:space="preserve">`fz:hard_cut_trigger@bar{N}#v1`</w:t>
+            </w:r>
+            <w:r>
+              <w:t xml:space="preserve"> + </w:t>
+            </w:r>
+            <w:r>
+              <w:rPr>
+                <w:b/>
+                <w:bCs/>
+              </w:rPr>
+              <w:t xml:space="preserve">`fz:d5:through_composed_cut@bar{N}#v1`</w:t>
+            </w:r>
+          </w:p>
+        </w:tc>
+        <w:tc>
+          <w:tcPr>
+            <w:tcW w:type="pct" w:w="3000%"/>
+          </w:tcPr>
+          <w:p>
+            <w:pPr>
+              <w:spacing w:after="60"/>
+            </w:pPr>
+            <w:r>
+              <w:t xml:space="preserve">Monitors </w:t>
+            </w:r>
+            <w:r>
+              <w:rPr>
+                <w:b/>
+                <w:bCs/>
+              </w:rPr>
+              <w:t xml:space="preserve">long sections</w:t>
+            </w:r>
+            <w:r>
+              <w:t xml:space="preserve">, </w:t>
+            </w:r>
+            <w:r>
+              <w:rPr>
+                <w:b/>
+                <w:bCs/>
+              </w:rPr>
+              <w:t xml:space="preserve">long ostinato-like chord runs</w:t>
+            </w:r>
+            <w:r>
+              <w:t xml:space="preserve">, and </w:t>
+            </w:r>
+            <w:r>
+              <w:rPr>
+                <w:b/>
+                <w:bCs/>
+              </w:rPr>
+              <w:t xml:space="preserve">peak-density streaks</w:t>
+            </w:r>
+            <w:r>
+              <w:t xml:space="preserve">; fires </w:t>
+            </w:r>
+            <w:r>
+              <w:rPr>
+                <w:b/>
+                <w:bCs/>
+              </w:rPr>
+              <w:t xml:space="preserve">through-composed cut</w:t>
+            </w:r>
+            <w:r>
+              <w:t xml:space="preserve"> (same transform family as </w:t>
+            </w:r>
+            <w:r>
+              <w:rPr>
+                <w:b/>
+                <w:bCs/>
+              </w:rPr>
+              <w:t xml:space="preserve">d5</w:t>
+            </w:r>
+            <w:r>
+              <w:t xml:space="preserve">) and </w:t>
+            </w:r>
+            <w:r>
+              <w:rPr>
+                <w:b/>
+                <w:bCs/>
+              </w:rPr>
+              <w:t xml:space="preserve">resets</w:t>
+            </w:r>
+            <w:r>
+              <w:t xml:space="preserve"> the density arc tail from that bar. </w:t>
+            </w:r>
+            <w:r>
+              <w:rPr>
+                <w:b/>
+                <w:bCs/>
+              </w:rPr>
+              <w:t xml:space="preserve">Skips</w:t>
+            </w:r>
+            <w:r>
+              <w:t xml:space="preserve"> slash chords for the cut.</w:t>
+            </w:r>
+          </w:p>
+        </w:tc>
+      </w:tr>
+    </w:tbl>
+    <w:p>
+      <w:pPr>
+        <w:spacing w:after="160"/>
+      </w:pPr>
+    </w:p>
+    <w:p>
+      <w:pPr>
+        <w:pStyle w:val="Heading3"/>
+        <w:spacing w:after="80" w:before="120"/>
+      </w:pPr>
+      <w:r>
+        <w:t xml:space="preserve">Zappa style surface (primary songwriter)</w:t>
+      </w:r>
+    </w:p>
+    <w:p>
+      <w:pPr>
+        <w:spacing w:after="160"/>
+      </w:pPr>
+      <w:r>
+        <w:t xml:space="preserve">When </w:t>
+      </w:r>
+      <w:r>
+        <w:rPr>
+          <w:b/>
+          <w:bCs/>
+        </w:rPr>
+        <w:t xml:space="preserve">`normalizeSongwriterStyleKey(primary) === 'frank_zappa'`</w:t>
+      </w:r>
+      <w:r>
+        <w:t xml:space="preserve">, </w:t>
+      </w:r>
+      <w:r>
+        <w:rPr>
+          <w:b/>
+          <w:bCs/>
+        </w:rPr>
+        <w:t xml:space="preserve">`applyFrankZappaStyleSurface`</w:t>
+      </w:r>
+      <w:r>
+        <w:t xml:space="preserve"> (`songModeStyleSurface.ts`) runs from </w:t>
+      </w:r>
+      <w:r>
+        <w:rPr>
+          <w:b/>
+          <w:bCs/>
+        </w:rPr>
+        <w:t xml:space="preserve">`runGoldenPath`</w:t>
+      </w:r>
+      <w:r>
+        <w:t xml:space="preserve"> (no Style Engine profile gate): sets </w:t>
+      </w:r>
+      <w:r>
+        <w:rPr>
+          <w:b/>
+          <w:bCs/>
+        </w:rPr>
+        <w:t xml:space="preserve">`frankZappaSyntheticScaleBias`</w:t>
+      </w:r>
+      <w:r>
+        <w:t xml:space="preserve">, </w:t>
+      </w:r>
+      <w:r>
+        <w:rPr>
+          <w:b/>
+          <w:bCs/>
+        </w:rPr>
+        <w:t xml:space="preserve">`frankZappaDensityBiasByBar`</w:t>
+      </w:r>
+      <w:r>
+        <w:t xml:space="preserve"> from </w:t>
+      </w:r>
+      <w:r>
+        <w:rPr>
+          <w:b/>
+          <w:bCs/>
+        </w:rPr>
+        <w:t xml:space="preserve">`computeZappaDensityArc`</w:t>
+      </w:r>
+      <w:r>
+        <w:t xml:space="preserve">, mean </w:t>
+      </w:r>
+      <w:r>
+        <w:rPr>
+          <w:b/>
+          <w:bCs/>
+        </w:rPr>
+        <w:t xml:space="preserve">`songwriterDensityBias`</w:t>
+      </w:r>
+      <w:r>
+        <w:t xml:space="preserve">, </w:t>
+      </w:r>
+      <w:r>
+        <w:rPr>
+          <w:b/>
+          <w:bCs/>
+        </w:rPr>
+        <w:t xml:space="preserve">`songwriterSyncopationBias +0.22`</w:t>
+      </w:r>
+      <w:r>
+        <w:t xml:space="preserve">, </w:t>
+      </w:r>
+      <w:r>
+        <w:rPr>
+          <w:b/>
+          <w:bCs/>
+        </w:rPr>
+        <w:t xml:space="preserve">`songwriterSpaceBias −0.15`</w:t>
+      </w:r>
+      <w:r>
+        <w:t xml:space="preserve"> (Zappa pocket = </w:t>
+      </w:r>
+      <w:r>
+        <w:rPr>
+          <w:b/>
+          <w:bCs/>
+        </w:rPr>
+        <w:t xml:space="preserve">dense</w:t>
+      </w:r>
+      <w:r>
+        <w:t xml:space="preserve">, not ECM-sparse).</w:t>
+      </w:r>
+    </w:p>
+    <w:p>
+      <w:pPr>
+        <w:spacing w:after="160"/>
+      </w:pPr>
+      <w:r>
+        <w:t xml:space="preserve">Optional </w:t>
+      </w:r>
+      <w:r>
+        <w:rPr>
+          <w:b/>
+          <w:bCs/>
+        </w:rPr>
+        <w:t xml:space="preserve">`frankZappaContext`</w:t>
+      </w:r>
+      <w:r>
+        <w:t xml:space="preserve"> on the generate request selects the three modes above; defaults </w:t>
+      </w:r>
+      <w:r>
+        <w:rPr>
+          <w:b/>
+          <w:bCs/>
+        </w:rPr>
+        <w:t xml:space="preserve">`avant_rock`</w:t>
+      </w:r>
+      <w:r>
+        <w:t xml:space="preserve">.</w:t>
+      </w:r>
+    </w:p>
+    <w:p>
+      <w:pPr>
+        <w:pStyle w:val="Heading3"/>
+        <w:spacing w:after="80" w:before="120"/>
+      </w:pPr>
+      <w:r>
+        <w:t xml:space="preserve">Example applications (by context)</w:t>
+      </w:r>
+    </w:p>
+    <w:p>
+      <w:pPr>
+        <w:spacing w:after="160"/>
+      </w:pPr>
+      <w:r>
+        <w:t xml:space="preserve">1. </w:t>
+      </w:r>
+      <w:r>
+        <w:rPr>
+          <w:b/>
+          <w:bCs/>
+        </w:rPr>
+        <w:t xml:space="preserve">`avant_rock`</w:t>
+      </w:r>
+      <w:r>
+        <w:t xml:space="preserve"> — </w:t>
+      </w:r>
+      <w:r>
+        <w:rPr>
+          <w:b/>
+          <w:bCs/>
+        </w:rPr>
+        <w:t xml:space="preserve">Studio collage / rock orchestra</w:t>
+      </w:r>
+      <w:r>
+        <w:t xml:space="preserve"> lesson planning: default </w:t>
+      </w:r>
+      <w:r>
+        <w:rPr>
+          <w:b/>
+          <w:bCs/>
+        </w:rPr>
+        <w:t xml:space="preserve">`frankZappaContext`</w:t>
+      </w:r>
+      <w:r>
+        <w:t xml:space="preserve">, density arc + </w:t>
+      </w:r>
+      <w:r>
+        <w:rPr>
+          <w:b/>
+          <w:bCs/>
+        </w:rPr>
+        <w:t xml:space="preserve">synthetic</w:t>
+      </w:r>
+      <w:r>
+        <w:t xml:space="preserve"> weight in metadata; use when demonstrating </w:t>
+      </w:r>
+      <w:r>
+        <w:rPr>
+          <w:b/>
+          <w:bCs/>
+        </w:rPr>
+        <w:t xml:space="preserve">d1–d5</w:t>
+      </w:r>
+      <w:r>
+        <w:t xml:space="preserve"> receipts alongside </w:t>
+      </w:r>
+      <w:r>
+        <w:rPr>
+          <w:b/>
+          <w:bCs/>
+        </w:rPr>
+        <w:t xml:space="preserve">hard-cut</w:t>
+      </w:r>
+      <w:r>
+        <w:t xml:space="preserve"> drama without insisting on big-band spelling habits. 2. </w:t>
+      </w:r>
+      <w:r>
+        <w:rPr>
+          <w:b/>
+          <w:bCs/>
+        </w:rPr>
+        <w:t xml:space="preserve">`big_band`</w:t>
+      </w:r>
+      <w:r>
+        <w:t xml:space="preserve"> — </w:t>
+      </w:r>
+      <w:r>
+        <w:rPr>
+          <w:b/>
+          <w:bCs/>
+        </w:rPr>
+        <w:t xml:space="preserve">Sectional brass–rhythm</w:t>
+      </w:r>
+      <w:r>
+        <w:t xml:space="preserve"> orientation: three-way </w:t>
+      </w:r>
+      <w:r>
+        <w:rPr>
+          <w:b/>
+          <w:bCs/>
+        </w:rPr>
+        <w:t xml:space="preserve">Lydian / Mix / Dorian</w:t>
+      </w:r>
+      <w:r>
+        <w:t xml:space="preserve"> bias table only; pair with </w:t>
+      </w:r>
+      <w:r>
+        <w:rPr>
+          <w:b/>
+          <w:bCs/>
+        </w:rPr>
+        <w:t xml:space="preserve">long-form</w:t>
+      </w:r>
+      <w:r>
+        <w:t xml:space="preserve"> or </w:t>
+      </w:r>
+      <w:r>
+        <w:rPr>
+          <w:b/>
+          <w:bCs/>
+        </w:rPr>
+        <w:t xml:space="preserve">high bar count</w:t>
+      </w:r>
+      <w:r>
+        <w:t xml:space="preserve"> to exercise </w:t>
+      </w:r>
+      <w:r>
+        <w:rPr>
+          <w:b/>
+          <w:bCs/>
+        </w:rPr>
+        <w:t xml:space="preserve">hard-cut</w:t>
+      </w:r>
+      <w:r>
+        <w:t xml:space="preserve"> on </w:t>
+      </w:r>
+      <w:r>
+        <w:rPr>
+          <w:b/>
+          <w:bCs/>
+        </w:rPr>
+        <w:t xml:space="preserve">long sections</w:t>
+      </w:r>
+      <w:r>
+        <w:t xml:space="preserve">. 3. </w:t>
+      </w:r>
+      <w:r>
+        <w:rPr>
+          <w:b/>
+          <w:bCs/>
+        </w:rPr>
+        <w:t xml:space="preserve">`futuristic_jazz`</w:t>
+      </w:r>
+      <w:r>
+        <w:t xml:space="preserve"> — </w:t>
+      </w:r>
+      <w:r>
+        <w:rPr>
+          <w:b/>
+          <w:bCs/>
+        </w:rPr>
+        <w:t xml:space="preserve">Colour-stack / whole-tone / altered-palette</w:t>
+      </w:r>
+      <w:r>
+        <w:t xml:space="preserve"> teaching: metadata stresses </w:t>
+      </w:r>
+      <w:r>
+        <w:rPr>
+          <w:b/>
+          <w:bCs/>
+        </w:rPr>
+        <w:t xml:space="preserve">Lydian dominant</w:t>
+      </w:r>
+      <w:r>
+        <w:t xml:space="preserve">, </w:t>
+      </w:r>
+      <w:r>
+        <w:rPr>
+          <w:b/>
+          <w:bCs/>
+        </w:rPr>
+        <w:t xml:space="preserve">diminished</w:t>
+      </w:r>
+      <w:r>
+        <w:t xml:space="preserve">, </w:t>
+      </w:r>
+      <w:r>
+        <w:rPr>
+          <w:b/>
+          <w:bCs/>
+        </w:rPr>
+        <w:t xml:space="preserve">whole-tone</w:t>
+      </w:r>
+      <w:r>
+        <w:t xml:space="preserve">, </w:t>
+      </w:r>
+      <w:r>
+        <w:rPr>
+          <w:b/>
+          <w:bCs/>
+        </w:rPr>
+        <w:t xml:space="preserve">custom</w:t>
+      </w:r>
+      <w:r>
+        <w:t xml:space="preserve"> bucket; compare </w:t>
+      </w:r>
+      <w:r>
+        <w:rPr>
+          <w:b/>
+          <w:bCs/>
+        </w:rPr>
+        <w:t xml:space="preserve">`fz:lyd_dominant`</w:t>
+      </w:r>
+      <w:r>
+        <w:t xml:space="preserve"> receipts against </w:t>
+      </w:r>
+      <w:r>
+        <w:rPr>
+          <w:b/>
+          <w:bCs/>
+        </w:rPr>
+        <w:t xml:space="preserve">bitonal triad</w:t>
+      </w:r>
+      <w:r>
+        <w:t xml:space="preserve"> </w:t>
+      </w:r>
+      <w:r>
+        <w:rPr>
+          <w:b/>
+          <w:bCs/>
+        </w:rPr>
+        <w:t xml:space="preserve">`maj+maj`</w:t>
+      </w:r>
+      <w:r>
+        <w:t xml:space="preserve"> spellings on </w:t>
+      </w:r>
+      <w:r>
+        <w:rPr>
+          <w:b/>
+          <w:bCs/>
+        </w:rPr>
+        <w:t xml:space="preserve">non-slash</w:t>
+      </w:r>
+      <w:r>
+        <w:t xml:space="preserve"> bars. 4. </w:t>
+      </w:r>
+      <w:r>
+        <w:rPr>
+          <w:b/>
+          <w:bCs/>
+        </w:rPr>
+        <w:t xml:space="preserve">Density arc teaching</w:t>
+      </w:r>
+      <w:r>
+        <w:t xml:space="preserve"> — Read </w:t>
+      </w:r>
+      <w:r>
+        <w:rPr>
+          <w:b/>
+          <w:bCs/>
+        </w:rPr>
+        <w:t xml:space="preserve">`frankZappaDensityBiasByBar`</w:t>
+      </w:r>
+      <w:r>
+        <w:t xml:space="preserve"> after Generate to show </w:t>
+      </w:r>
+      <w:r>
+        <w:rPr>
+          <w:b/>
+          <w:bCs/>
+        </w:rPr>
+        <w:t xml:space="preserve">intro → peaks → drop</w:t>
+      </w:r>
+      <w:r>
+        <w:t xml:space="preserve"> narrative; after a </w:t>
+      </w:r>
+      <w:r>
+        <w:rPr>
+          <w:b/>
+          <w:bCs/>
+        </w:rPr>
+        <w:t xml:space="preserve">hard cut</w:t>
+      </w:r>
+      <w:r>
+        <w:t xml:space="preserve">, tail bars </w:t>
+      </w:r>
+      <w:r>
+        <w:rPr>
+          <w:b/>
+          <w:bCs/>
+        </w:rPr>
+        <w:t xml:space="preserve">recompute</w:t>
+      </w:r>
+      <w:r>
+        <w:t xml:space="preserve"> — demo </w:t>
+      </w:r>
+      <w:r>
+        <w:rPr>
+          <w:b/>
+          <w:bCs/>
+        </w:rPr>
+        <w:t xml:space="preserve">reset</w:t>
+      </w:r>
+      <w:r>
+        <w:t xml:space="preserve"> with seeds that fire </w:t>
+      </w:r>
+      <w:r>
+        <w:rPr>
+          <w:b/>
+          <w:bCs/>
+        </w:rPr>
+        <w:t xml:space="preserve">`fz:hard_cut_trigger`</w:t>
+      </w:r>
+      <w:r>
+        <w:t xml:space="preserve">. 5. </w:t>
+      </w:r>
+      <w:r>
+        <w:rPr>
+          <w:b/>
+          <w:bCs/>
+        </w:rPr>
+        <w:t xml:space="preserve">Locked chart + Zappa</w:t>
+      </w:r>
+      <w:r>
+        <w:t xml:space="preserve"> — Custom </w:t>
+      </w:r>
+      <w:r>
+        <w:rPr>
+          <w:b/>
+          <w:bCs/>
+        </w:rPr>
+        <w:t xml:space="preserve">`|`</w:t>
+      </w:r>
+      <w:r>
+        <w:t xml:space="preserve"> progression still runs the slice; </w:t>
+      </w:r>
+      <w:r>
+        <w:rPr>
+          <w:b/>
+          <w:bCs/>
+        </w:rPr>
+        <w:t xml:space="preserve">slash chords</w:t>
+      </w:r>
+      <w:r>
+        <w:t xml:space="preserve"> are preserved through additive passes so </w:t>
+      </w:r>
+      <w:r>
+        <w:rPr>
+          <w:b/>
+          <w:bCs/>
+        </w:rPr>
+        <w:t xml:space="preserve">HarmonyContext</w:t>
+      </w:r>
+      <w:r>
+        <w:t xml:space="preserve"> / export parity stays stable. 6. </w:t>
+      </w:r>
+      <w:r>
+        <w:rPr>
+          <w:b/>
+          <w:bCs/>
+        </w:rPr>
+        <w:t xml:space="preserve">Seed A/B</w:t>
+      </w:r>
+      <w:r>
+        <w:t xml:space="preserve"> — Same </w:t>
+      </w:r>
+      <w:r>
+        <w:rPr>
+          <w:b/>
+          <w:bCs/>
+        </w:rPr>
+        <w:t xml:space="preserve">`frankZappaContext`</w:t>
+      </w:r>
+      <w:r>
+        <w:t xml:space="preserve"> with different </w:t>
+      </w:r>
+      <w:r>
+        <w:rPr>
+          <w:b/>
+          <w:bCs/>
+        </w:rPr>
+        <w:t xml:space="preserve">seeds</w:t>
+      </w:r>
+      <w:r>
+        <w:t xml:space="preserve"> changes which </w:t>
+      </w:r>
+      <w:r>
+        <w:rPr>
+          <w:b/>
+          <w:bCs/>
+        </w:rPr>
+        <w:t xml:space="preserve">d1–d5</w:t>
+      </w:r>
+      <w:r>
+        <w:t xml:space="preserve"> bar wins vs </w:t>
+      </w:r>
+      <w:r>
+        <w:rPr>
+          <w:b/>
+          <w:bCs/>
+        </w:rPr>
+        <w:t xml:space="preserve">additive</w:t>
+      </w:r>
+      <w:r>
+        <w:t xml:space="preserve"> passes (rates are seeded); lock seed when demoing a specific </w:t>
+      </w:r>
+      <w:r>
+        <w:rPr>
+          <w:b/>
+          <w:bCs/>
+        </w:rPr>
+        <w:t xml:space="preserve">`fz:motif_recycle_transposition`</w:t>
+      </w:r>
+      <w:r>
+        <w:t xml:space="preserve"> or </w:t>
+      </w:r>
+      <w:r>
+        <w:rPr>
+          <w:b/>
+          <w:bCs/>
+        </w:rPr>
+        <w:t xml:space="preserve">`fz:bitonal_triad`</w:t>
+      </w:r>
+      <w:r>
+        <w:t xml:space="preserve"> outcome.</w:t>
       </w:r>
     </w:p>
     <w:p>

</xml_diff>

<commit_message>
docs: Thelonious Monk handbook section + roadmap complete
Co-authored-by: Cursor <cursoragent@cursor.com>
</commit_message>
<xml_diff>
--- a/docs/COMPOSER_OS_PLAYBOOK.docx
+++ b/docs/COMPOSER_OS_PLAYBOOK.docx
@@ -17879,6 +17879,1336 @@
       </w:r>
       <w:r>
         <w:t xml:space="preserve"> receipts separately.</w:t>
+      </w:r>
+    </w:p>
+    <w:p>
+      <w:pPr>
+        <w:pStyle w:val="Heading2"/>
+        <w:spacing w:after="100" w:before="160"/>
+      </w:pPr>
+      <w:r>
+        <w:t xml:space="preserve">Thelonious Monk (Song Mode — angular dominant / whole-tone fragment slice)</w:t>
+      </w:r>
+    </w:p>
+    <w:p>
+      <w:pPr>
+        <w:spacing w:after="160"/>
+      </w:pPr>
+      <w:r>
+        <w:rPr>
+          <w:b/>
+          <w:bCs/>
+        </w:rPr>
+        <w:t xml:space="preserve">Still current:</w:t>
+      </w:r>
+      <w:r>
+        <w:t xml:space="preserve"> </w:t>
+      </w:r>
+      <w:r>
+        <w:rPr>
+          <w:b/>
+          <w:bCs/>
+        </w:rPr>
+        <w:t xml:space="preserve">`theloniousMonkSlice.ts`</w:t>
+      </w:r>
+      <w:r>
+        <w:t xml:space="preserve">, </w:t>
+      </w:r>
+      <w:r>
+        <w:rPr>
+          <w:b/>
+          <w:bCs/>
+        </w:rPr>
+        <w:t xml:space="preserve">`precomputeTheloniousMonkEffectiveHarmonyBars`</w:t>
+      </w:r>
+      <w:r>
+        <w:t xml:space="preserve">, </w:t>
+      </w:r>
+      <w:r>
+        <w:rPr>
+          <w:b/>
+          <w:bCs/>
+        </w:rPr>
+        <w:t xml:space="preserve">`theloniousMonkEffectiveHarmonyBars`</w:t>
+      </w:r>
+      <w:r>
+        <w:t xml:space="preserve"> feeding </w:t>
+      </w:r>
+      <w:r>
+        <w:rPr>
+          <w:b/>
+          <w:bCs/>
+        </w:rPr>
+        <w:t xml:space="preserve">`getChordForBar`</w:t>
+      </w:r>
+      <w:r>
+        <w:t xml:space="preserve"> and locked MusicXML truth, receipts </w:t>
+      </w:r>
+      <w:r>
+        <w:rPr>
+          <w:b/>
+          <w:bCs/>
+        </w:rPr>
+        <w:t xml:space="preserve">`tm:*`</w:t>
+      </w:r>
+      <w:r>
+        <w:t xml:space="preserve"> on </w:t>
+      </w:r>
+      <w:r>
+        <w:rPr>
+          <w:b/>
+          <w:bCs/>
+        </w:rPr>
+        <w:t xml:space="preserve">`theloniousMonkDeviceReceipts`</w:t>
+      </w:r>
+      <w:r>
+        <w:t xml:space="preserve">, smoke </w:t>
+      </w:r>
+      <w:r>
+        <w:rPr>
+          <w:b/>
+          <w:bCs/>
+        </w:rPr>
+        <w:t xml:space="preserve">`theloniousMonkSliceSmoke.test.ts`</w:t>
+      </w:r>
+      <w:r>
+        <w:t xml:space="preserve">.</w:t>
+      </w:r>
+    </w:p>
+    <w:p>
+      <w:pPr>
+        <w:spacing w:after="160"/>
+      </w:pPr>
+      <w:r>
+        <w:t xml:space="preserve">The slice </w:t>
+      </w:r>
+      <w:r>
+        <w:rPr>
+          <w:b/>
+          <w:bCs/>
+        </w:rPr>
+        <w:t xml:space="preserve">rewrites chord symbols</w:t>
+      </w:r>
+      <w:r>
+        <w:t xml:space="preserve"> on the duo golden path (b9 / angular tonic colour / deferred cadence / contrast sus / whole-tone fragments / chromatic-enclosure slash hints) and writes </w:t>
+      </w:r>
+      <w:r>
+        <w:rPr>
+          <w:b/>
+          <w:bCs/>
+        </w:rPr>
+        <w:t xml:space="preserve">silence/rest intent metadata</w:t>
+      </w:r>
+      <w:r>
+        <w:t xml:space="preserve"> for downstream melody timing — no dedicated </w:t>
+      </w:r>
+      <w:r>
+        <w:rPr>
+          <w:b/>
+          <w:bCs/>
+        </w:rPr>
+        <w:t xml:space="preserve">`ChordEvent`</w:t>
+      </w:r>
+      <w:r>
+        <w:t xml:space="preserve"> extension layer beyond standard harmony export.</w:t>
+      </w:r>
+    </w:p>
+    <w:p>
+      <w:pPr>
+        <w:pStyle w:val="Heading3"/>
+        <w:spacing w:after="80" w:before="120"/>
+      </w:pPr>
+      <w:r>
+        <w:t xml:space="preserve">Asymmetric phrase grid</w:t>
+      </w:r>
+    </w:p>
+    <w:p>
+      <w:pPr>
+        <w:spacing w:after="160"/>
+      </w:pPr>
+      <w:r>
+        <w:rPr>
+          <w:b/>
+          <w:bCs/>
+        </w:rPr>
+        <w:t xml:space="preserve">`computeMonkPhrasePositions(totalBars, seed)`</w:t>
+      </w:r>
+      <w:r>
+        <w:t xml:space="preserve"> assigns </w:t>
+      </w:r>
+      <w:r>
+        <w:rPr>
+          <w:b/>
+          <w:bCs/>
+        </w:rPr>
+        <w:t xml:space="preserve">phraseStart</w:t>
+      </w:r>
+      <w:r>
+        <w:t xml:space="preserve"> / </w:t>
+      </w:r>
+      <w:r>
+        <w:rPr>
+          <w:b/>
+          <w:bCs/>
+        </w:rPr>
+        <w:t xml:space="preserve">phraseMiddle</w:t>
+      </w:r>
+      <w:r>
+        <w:t xml:space="preserve"> / </w:t>
+      </w:r>
+      <w:r>
+        <w:rPr>
+          <w:b/>
+          <w:bCs/>
+        </w:rPr>
+        <w:t xml:space="preserve">phraseFinal</w:t>
+      </w:r>
+      <w:r>
+        <w:t xml:space="preserve"> using variable phrase lengths </w:t>
+      </w:r>
+      <w:r>
+        <w:rPr>
+          <w:b/>
+          <w:bCs/>
+        </w:rPr>
+        <w:t xml:space="preserve">4, 5, 7, 9, or 6 bars</w:t>
+      </w:r>
+      <w:r>
+        <w:t xml:space="preserve"> weighted </w:t>
+      </w:r>
+      <w:r>
+        <w:rPr>
+          <w:b/>
+          <w:bCs/>
+        </w:rPr>
+        <w:t xml:space="preserve">58% / 14% / 14% / 11% / 3%</w:t>
+      </w:r>
+      <w:r>
+        <w:t xml:space="preserve">. Each </w:t>
+      </w:r>
+      <w:r>
+        <w:rPr>
+          <w:b/>
+          <w:bCs/>
+        </w:rPr>
+        <w:t xml:space="preserve">phraseStart</w:t>
+      </w:r>
+      <w:r>
+        <w:t xml:space="preserve"> emits </w:t>
+      </w:r>
+      <w:r>
+        <w:rPr>
+          <w:b/>
+          <w:bCs/>
+        </w:rPr>
+        <w:t xml:space="preserve">`tm:asym_phrase@bar{N}`</w:t>
+      </w:r>
+      <w:r>
+        <w:t xml:space="preserve"> (same rolling-bar layout pattern as Bill Evans / Jobim / ECM variable grids). Phrase role drives </w:t>
+      </w:r>
+      <w:r>
+        <w:rPr>
+          <w:b/>
+          <w:bCs/>
+        </w:rPr>
+        <w:t xml:space="preserve">phrase-final tritone sub</w:t>
+      </w:r>
+      <w:r>
+        <w:t xml:space="preserve">, </w:t>
+      </w:r>
+      <w:r>
+        <w:rPr>
+          <w:b/>
+          <w:bCs/>
+        </w:rPr>
+        <w:t xml:space="preserve">chromatic enclosure</w:t>
+      </w:r>
+      <w:r>
+        <w:t xml:space="preserve"> (middle only), and </w:t>
+      </w:r>
+      <w:r>
+        <w:rPr>
+          <w:b/>
+          <w:bCs/>
+        </w:rPr>
+        <w:t xml:space="preserve">deliberate silence</w:t>
+      </w:r>
+      <w:r>
+        <w:t xml:space="preserve"> placement.</w:t>
+      </w:r>
+    </w:p>
+    <w:p>
+      <w:pPr>
+        <w:pStyle w:val="Heading3"/>
+        <w:spacing w:after="80" w:before="120"/>
+      </w:pPr>
+      <w:r>
+        <w:t xml:space="preserve">Harmony passes (rates + receipts)</w:t>
+      </w:r>
+    </w:p>
+    <w:tbl>
+      <w:tblPr>
+        <w:tblW w:type="pct" w:w="100%"/>
+        <w:tblBorders>
+          <w:top w:val="single" w:color="auto" w:sz="4"/>
+          <w:left w:val="single" w:color="auto" w:sz="4"/>
+          <w:bottom w:val="single" w:color="auto" w:sz="4"/>
+          <w:right w:val="single" w:color="auto" w:sz="4"/>
+          <w:insideH w:val="single" w:color="auto" w:sz="4"/>
+          <w:insideV w:val="single" w:color="auto" w:sz="4"/>
+        </w:tblBorders>
+      </w:tblPr>
+      <w:tblGrid>
+        <w:gridCol w:w="3000"/>
+        <w:gridCol w:w="3000"/>
+        <w:gridCol w:w="3000"/>
+      </w:tblGrid>
+      <w:tr>
+        <w:tc>
+          <w:tcPr>
+            <w:tcW w:type="pct" w:w="3000%"/>
+          </w:tcPr>
+          <w:p>
+            <w:pPr>
+              <w:spacing w:after="60"/>
+            </w:pPr>
+            <w:r>
+              <w:t xml:space="preserve">Pass</w:t>
+            </w:r>
+          </w:p>
+        </w:tc>
+        <w:tc>
+          <w:tcPr>
+            <w:tcW w:type="pct" w:w="3000%"/>
+          </w:tcPr>
+          <w:p>
+            <w:pPr>
+              <w:spacing w:after="60"/>
+            </w:pPr>
+            <w:r>
+              <w:t xml:space="preserve">Role</w:t>
+            </w:r>
+          </w:p>
+        </w:tc>
+        <w:tc>
+          <w:tcPr>
+            <w:tcW w:type="pct" w:w="3000%"/>
+          </w:tcPr>
+          <w:p>
+            <w:pPr>
+              <w:spacing w:after="60"/>
+            </w:pPr>
+            <w:r>
+              <w:t xml:space="preserve">Receipt</w:t>
+            </w:r>
+          </w:p>
+        </w:tc>
+      </w:tr>
+      <w:tr>
+        <w:tc>
+          <w:tcPr>
+            <w:tcW w:type="pct" w:w="3000%"/>
+          </w:tcPr>
+          <w:p>
+            <w:pPr>
+              <w:spacing w:after="60"/>
+            </w:pPr>
+            <w:r>
+              <w:rPr>
+                <w:b/>
+                <w:bCs/>
+              </w:rPr>
+              <w:t xml:space="preserve">Whole-tone fragment</w:t>
+            </w:r>
+          </w:p>
+        </w:tc>
+        <w:tc>
+          <w:tcPr>
+            <w:tcW w:type="pct" w:w="3000%"/>
+          </w:tcPr>
+          <w:p>
+            <w:pPr>
+              <w:spacing w:after="60"/>
+            </w:pPr>
+            <w:r>
+              <w:rPr>
+                <w:b/>
+                <w:bCs/>
+              </w:rPr>
+              <w:t xml:space="preserve">20%</w:t>
+            </w:r>
+            <w:r>
+              <w:t xml:space="preserve"> on dominant-function bars (</w:t>
+            </w:r>
+            <w:r>
+              <w:rPr>
+                <w:b/>
+                <w:bCs/>
+              </w:rPr>
+              <w:t xml:space="preserve">7</w:t>
+            </w:r>
+            <w:r>
+              <w:t xml:space="preserve"> / </w:t>
+            </w:r>
+            <w:r>
+              <w:rPr>
+                <w:b/>
+                <w:bCs/>
+              </w:rPr>
+              <w:t xml:space="preserve">7b9</w:t>
+            </w:r>
+            <w:r>
+              <w:t xml:space="preserve"> / </w:t>
+            </w:r>
+            <w:r>
+              <w:rPr>
+                <w:b/>
+                <w:bCs/>
+              </w:rPr>
+              <w:t xml:space="preserve">7alt</w:t>
+            </w:r>
+            <w:r>
+              <w:t xml:space="preserve">), roots only at </w:t>
+            </w:r>
+            <w:r>
+              <w:rPr>
+                <w:b/>
+                <w:bCs/>
+              </w:rPr>
+              <w:t xml:space="preserve">V</w:t>
+            </w:r>
+            <w:r>
+              <w:t xml:space="preserve">, </w:t>
+            </w:r>
+            <w:r>
+              <w:rPr>
+                <w:b/>
+                <w:bCs/>
+              </w:rPr>
+              <w:t xml:space="preserve">bII</w:t>
+            </w:r>
+            <w:r>
+              <w:t xml:space="preserve">, or </w:t>
+            </w:r>
+            <w:r>
+              <w:rPr>
+                <w:b/>
+                <w:bCs/>
+              </w:rPr>
+              <w:t xml:space="preserve">II-of-V</w:t>
+            </w:r>
+            <w:r>
+              <w:t xml:space="preserve"> vs tonic — spells </w:t>
+            </w:r>
+            <w:r>
+              <w:rPr>
+                <w:b/>
+                <w:bCs/>
+              </w:rPr>
+              <w:t xml:space="preserve">`7(b5#5)`</w:t>
+            </w:r>
+            <w:r>
+              <w:t xml:space="preserve"> or </w:t>
+            </w:r>
+            <w:r>
+              <w:rPr>
+                <w:b/>
+                <w:bCs/>
+              </w:rPr>
+              <w:t xml:space="preserve">`aug7`</w:t>
+            </w:r>
+          </w:p>
+        </w:tc>
+        <w:tc>
+          <w:tcPr>
+            <w:tcW w:type="pct" w:w="3000%"/>
+          </w:tcPr>
+          <w:p>
+            <w:pPr>
+              <w:spacing w:after="60"/>
+            </w:pPr>
+            <w:r>
+              <w:rPr>
+                <w:b/>
+                <w:bCs/>
+              </w:rPr>
+              <w:t xml:space="preserve">`tm:whole_tone@bar{N}`</w:t>
+            </w:r>
+          </w:p>
+        </w:tc>
+      </w:tr>
+      <w:tr>
+        <w:tc>
+          <w:tcPr>
+            <w:tcW w:type="pct" w:w="3000%"/>
+          </w:tcPr>
+          <w:p>
+            <w:pPr>
+              <w:spacing w:after="60"/>
+            </w:pPr>
+            <w:r>
+              <w:rPr>
+                <w:b/>
+                <w:bCs/>
+              </w:rPr>
+              <w:t xml:space="preserve">Chromatic enclosure</w:t>
+            </w:r>
+          </w:p>
+        </w:tc>
+        <w:tc>
+          <w:tcPr>
+            <w:tcW w:type="pct" w:w="3000%"/>
+          </w:tcPr>
+          <w:p>
+            <w:pPr>
+              <w:spacing w:after="60"/>
+            </w:pPr>
+            <w:r>
+              <w:rPr>
+                <w:b/>
+                <w:bCs/>
+              </w:rPr>
+              <w:t xml:space="preserve">25%</w:t>
+            </w:r>
+            <w:r>
+              <w:t xml:space="preserve">, </w:t>
+            </w:r>
+            <w:r>
+              <w:rPr>
+                <w:b/>
+                <w:bCs/>
+              </w:rPr>
+              <w:t xml:space="preserve">phraseMiddle</w:t>
+            </w:r>
+            <w:r>
+              <w:t xml:space="preserve"> only: if </w:t>
+            </w:r>
+            <w:r>
+              <w:rPr>
+                <w:b/>
+                <w:bCs/>
+              </w:rPr>
+              <w:t xml:space="preserve">previous</w:t>
+            </w:r>
+            <w:r>
+              <w:t xml:space="preserve"> bar reads as </w:t>
+            </w:r>
+            <w:r>
+              <w:rPr>
+                <w:b/>
+                <w:bCs/>
+              </w:rPr>
+              <w:t xml:space="preserve">high-density</w:t>
+            </w:r>
+            <w:r>
+              <w:t xml:space="preserve"> chord, add </w:t>
+            </w:r>
+            <w:r>
+              <w:rPr>
+                <w:b/>
+                <w:bCs/>
+              </w:rPr>
+              <w:t xml:space="preserve">slash bass</w:t>
+            </w:r>
+            <w:r>
+              <w:t xml:space="preserve"> = chromatic approach (±1 semitone) toward current chord </w:t>
+            </w:r>
+            <w:r>
+              <w:rPr>
+                <w:b/>
+                <w:bCs/>
+              </w:rPr>
+              <w:t xml:space="preserve">3rd or 5th</w:t>
+            </w:r>
+          </w:p>
+        </w:tc>
+        <w:tc>
+          <w:tcPr>
+            <w:tcW w:type="pct" w:w="3000%"/>
+          </w:tcPr>
+          <w:p>
+            <w:pPr>
+              <w:spacing w:after="60"/>
+            </w:pPr>
+            <w:r>
+              <w:rPr>
+                <w:b/>
+                <w:bCs/>
+              </w:rPr>
+              <w:t xml:space="preserve">`tm:chrom_enclosure@bar{N}`</w:t>
+            </w:r>
+          </w:p>
+        </w:tc>
+      </w:tr>
+      <w:tr>
+        <w:tc>
+          <w:tcPr>
+            <w:tcW w:type="pct" w:w="3000%"/>
+          </w:tcPr>
+          <w:p>
+            <w:pPr>
+              <w:spacing w:after="60"/>
+            </w:pPr>
+            <w:r>
+              <w:rPr>
+                <w:b/>
+                <w:bCs/>
+              </w:rPr>
+              <w:t xml:space="preserve">Deliberate silence</w:t>
+            </w:r>
+          </w:p>
+        </w:tc>
+        <w:tc>
+          <w:tcPr>
+            <w:tcW w:type="pct" w:w="3000%"/>
+          </w:tcPr>
+          <w:p>
+            <w:pPr>
+              <w:spacing w:after="60"/>
+            </w:pPr>
+            <w:r>
+              <w:rPr>
+                <w:b/>
+                <w:bCs/>
+              </w:rPr>
+              <w:t xml:space="preserve">14%</w:t>
+            </w:r>
+            <w:r>
+              <w:t xml:space="preserve"> on </w:t>
+            </w:r>
+            <w:r>
+              <w:rPr>
+                <w:b/>
+                <w:bCs/>
+              </w:rPr>
+              <w:t xml:space="preserve">phraseFinal</w:t>
+            </w:r>
+            <w:r>
+              <w:t xml:space="preserve"> bars → </w:t>
+            </w:r>
+            <w:r>
+              <w:rPr>
+                <w:b/>
+                <w:bCs/>
+              </w:rPr>
+              <w:t xml:space="preserve">`monkSilenceBars`</w:t>
+            </w:r>
+            <w:r>
+              <w:t xml:space="preserve"> (full-bar silence intent); </w:t>
+            </w:r>
+            <w:r>
+              <w:rPr>
+                <w:b/>
+                <w:bCs/>
+              </w:rPr>
+              <w:t xml:space="preserve">10%</w:t>
+            </w:r>
+            <w:r>
+              <w:t xml:space="preserve"> of </w:t>
+            </w:r>
+            <w:r>
+              <w:rPr>
+                <w:b/>
+                <w:bCs/>
+              </w:rPr>
+              <w:t xml:space="preserve">phraseMiddle</w:t>
+            </w:r>
+            <w:r>
+              <w:t xml:space="preserve"> → </w:t>
+            </w:r>
+            <w:r>
+              <w:rPr>
+                <w:b/>
+                <w:bCs/>
+              </w:rPr>
+              <w:t xml:space="preserve">`monkPartialRestBars`</w:t>
+            </w:r>
+            <w:r>
+              <w:t xml:space="preserve"> (melody after beat </w:t>
+            </w:r>
+            <w:r>
+              <w:rPr>
+                <w:b/>
+                <w:bCs/>
+              </w:rPr>
+              <w:t xml:space="preserve">3</w:t>
+            </w:r>
+            <w:r>
+              <w:t xml:space="preserve">)</w:t>
+            </w:r>
+          </w:p>
+        </w:tc>
+        <w:tc>
+          <w:tcPr>
+            <w:tcW w:type="pct" w:w="3000%"/>
+          </w:tcPr>
+          <w:p>
+            <w:pPr>
+              <w:spacing w:after="60"/>
+            </w:pPr>
+            <w:r>
+              <w:rPr>
+                <w:b/>
+                <w:bCs/>
+              </w:rPr>
+              <w:t xml:space="preserve">`tm:deliberate_silence@bar{N}`</w:t>
+            </w:r>
+          </w:p>
+        </w:tc>
+      </w:tr>
+    </w:tbl>
+    <w:p>
+      <w:pPr>
+        <w:spacing w:after="160"/>
+      </w:pPr>
+    </w:p>
+    <w:p>
+      <w:pPr>
+        <w:spacing w:after="160"/>
+      </w:pPr>
+      <w:r>
+        <w:t xml:space="preserve">Existing Monk passes (</w:t>
+      </w:r>
+      <w:r>
+        <w:rPr>
+          <w:b/>
+          <w:bCs/>
+        </w:rPr>
+        <w:t xml:space="preserve">lush strip</w:t>
+      </w:r>
+      <w:r>
+        <w:t xml:space="preserve">, </w:t>
+      </w:r>
+      <w:r>
+        <w:rPr>
+          <w:b/>
+          <w:bCs/>
+        </w:rPr>
+        <w:t xml:space="preserve">tonic colour</w:t>
+      </w:r>
+      <w:r>
+        <w:t xml:space="preserve">, </w:t>
+      </w:r>
+      <w:r>
+        <w:rPr>
+          <w:b/>
+          <w:bCs/>
+        </w:rPr>
+        <w:t xml:space="preserve">dominant b9/alt</w:t>
+      </w:r>
+      <w:r>
+        <w:t xml:space="preserve">, </w:t>
+      </w:r>
+      <w:r>
+        <w:rPr>
+          <w:b/>
+          <w:bCs/>
+        </w:rPr>
+        <w:t xml:space="preserve">phrase-final tritone sub</w:t>
+      </w:r>
+      <w:r>
+        <w:t xml:space="preserve">, </w:t>
+      </w:r>
+      <w:r>
+        <w:rPr>
+          <w:b/>
+          <w:bCs/>
+        </w:rPr>
+        <w:t xml:space="preserve">contrast sus</w:t>
+      </w:r>
+      <w:r>
+        <w:t xml:space="preserve">) keep earlier </w:t>
+      </w:r>
+      <w:r>
+        <w:rPr>
+          <w:b/>
+          <w:bCs/>
+        </w:rPr>
+        <w:t xml:space="preserve">`tm:*`</w:t>
+      </w:r>
+      <w:r>
+        <w:t xml:space="preserve"> receipts (e.g. </w:t>
+      </w:r>
+      <w:r>
+        <w:rPr>
+          <w:b/>
+          <w:bCs/>
+        </w:rPr>
+        <w:t xml:space="preserve">`tm:tritone_sub@bar{N}`</w:t>
+      </w:r>
+      <w:r>
+        <w:t xml:space="preserve">, </w:t>
+      </w:r>
+      <w:r>
+        <w:rPr>
+          <w:b/>
+          <w:bCs/>
+        </w:rPr>
+        <w:t xml:space="preserve">`tm:contrast_sus@bar{N}`</w:t>
+      </w:r>
+      <w:r>
+        <w:t xml:space="preserve">).</w:t>
+      </w:r>
+    </w:p>
+    <w:p>
+      <w:pPr>
+        <w:pStyle w:val="Heading3"/>
+        <w:spacing w:after="80" w:before="120"/>
+      </w:pPr>
+      <w:r>
+        <w:t xml:space="preserve">Monk style surface (primary songwriter)</w:t>
+      </w:r>
+    </w:p>
+    <w:p>
+      <w:pPr>
+        <w:spacing w:after="160"/>
+      </w:pPr>
+      <w:r>
+        <w:t xml:space="preserve">When </w:t>
+      </w:r>
+      <w:r>
+        <w:rPr>
+          <w:b/>
+          <w:bCs/>
+        </w:rPr>
+        <w:t xml:space="preserve">`normalizeSongwriterStyleKey(primary) === 'thelonious_monk'`</w:t>
+      </w:r>
+      <w:r>
+        <w:t xml:space="preserve">, </w:t>
+      </w:r>
+      <w:r>
+        <w:rPr>
+          <w:b/>
+          <w:bCs/>
+        </w:rPr>
+        <w:t xml:space="preserve">`applyMonkStyleSurface`</w:t>
+      </w:r>
+      <w:r>
+        <w:t xml:space="preserve"> (`songModeStyleSurface.ts`) runs from </w:t>
+      </w:r>
+      <w:r>
+        <w:rPr>
+          <w:b/>
+          <w:bCs/>
+        </w:rPr>
+        <w:t xml:space="preserve">`runGoldenPath`</w:t>
+      </w:r>
+      <w:r>
+        <w:t xml:space="preserve"> </w:t>
+      </w:r>
+      <w:r>
+        <w:rPr>
+          <w:b/>
+          <w:bCs/>
+        </w:rPr>
+        <w:t xml:space="preserve">immediately after</w:t>
+      </w:r>
+      <w:r>
+        <w:t xml:space="preserve"> </w:t>
+      </w:r>
+      <w:r>
+        <w:rPr>
+          <w:b/>
+          <w:bCs/>
+        </w:rPr>
+        <w:t xml:space="preserve">`applyFrankZappaStyleSurface`</w:t>
+      </w:r>
+      <w:r>
+        <w:t xml:space="preserve">: </w:t>
+      </w:r>
+      <w:r>
+        <w:rPr>
+          <w:b/>
+          <w:bCs/>
+        </w:rPr>
+        <w:t xml:space="preserve">`songwriterDensityBias −0.12`</w:t>
+      </w:r>
+      <w:r>
+        <w:t xml:space="preserve">, </w:t>
+      </w:r>
+      <w:r>
+        <w:rPr>
+          <w:b/>
+          <w:bCs/>
+        </w:rPr>
+        <w:t xml:space="preserve">`songwriterSyncopationBias +0.30`</w:t>
+      </w:r>
+      <w:r>
+        <w:t xml:space="preserve">, </w:t>
+      </w:r>
+      <w:r>
+        <w:rPr>
+          <w:b/>
+          <w:bCs/>
+        </w:rPr>
+        <w:t xml:space="preserve">`songwriterSpaceBias +0.35`</w:t>
+      </w:r>
+      <w:r>
+        <w:t xml:space="preserve">, </w:t>
+      </w:r>
+      <w:r>
+        <w:rPr>
+          <w:b/>
+          <w:bCs/>
+        </w:rPr>
+        <w:t xml:space="preserve">`songwriterCadenceSoftness +0.10`</w:t>
+      </w:r>
+      <w:r>
+        <w:t xml:space="preserve"> (clamped </w:t>
+      </w:r>
+      <w:r>
+        <w:rPr>
+          <w:b/>
+          <w:bCs/>
+        </w:rPr>
+        <w:t xml:space="preserve">0–1</w:t>
+      </w:r>
+      <w:r>
+        <w:t xml:space="preserve">). Stacks with </w:t>
+      </w:r>
+      <w:r>
+        <w:rPr>
+          <w:b/>
+          <w:bCs/>
+        </w:rPr>
+        <w:t xml:space="preserve">STYLE_ECM</w:t>
+      </w:r>
+      <w:r>
+        <w:t xml:space="preserve"> / Chamber surfaces when both apply.</w:t>
+      </w:r>
+    </w:p>
+    <w:p>
+      <w:pPr>
+        <w:pStyle w:val="Heading3"/>
+        <w:spacing w:after="80" w:before="120"/>
+      </w:pPr>
+      <w:r>
+        <w:t xml:space="preserve">Duo LOCK note (bass motion)</w:t>
+      </w:r>
+    </w:p>
+    <w:p>
+      <w:pPr>
+        <w:spacing w:after="160"/>
+      </w:pPr>
+      <w:r>
+        <w:t xml:space="preserve">Angular harmony + slash enclosure can widen </w:t>
+      </w:r>
+      <w:r>
+        <w:rPr>
+          <w:b/>
+          <w:bCs/>
+        </w:rPr>
+        <w:t xml:space="preserve">chromatic bass</w:t>
+      </w:r>
+      <w:r>
+        <w:t xml:space="preserve"> motion; Barry Harris module validation allows </w:t>
+      </w:r>
+      <w:r>
+        <w:rPr>
+          <w:b/>
+          <w:bCs/>
+        </w:rPr>
+        <w:t xml:space="preserve">18 semitone</w:t>
+      </w:r>
+      <w:r>
+        <w:t xml:space="preserve"> max consecutive bass leap for </w:t>
+      </w:r>
+      <w:r>
+        <w:rPr>
+          <w:b/>
+          <w:bCs/>
+        </w:rPr>
+        <w:t xml:space="preserve">`thelonious_monk`</w:t>
+      </w:r>
+      <w:r>
+        <w:t xml:space="preserve"> (same budget as </w:t>
+      </w:r>
+      <w:r>
+        <w:rPr>
+          <w:b/>
+          <w:bCs/>
+        </w:rPr>
+        <w:t xml:space="preserve">`wayne_shorter`</w:t>
+      </w:r>
+      <w:r>
+        <w:t xml:space="preserve">) so golden-path gates stay green without relaxing guitar melody gates.</w:t>
+      </w:r>
+    </w:p>
+    <w:p>
+      <w:pPr>
+        <w:pStyle w:val="Heading3"/>
+        <w:spacing w:after="80" w:before="120"/>
+      </w:pPr>
+      <w:r>
+        <w:t xml:space="preserve">Example applications</w:t>
+      </w:r>
+    </w:p>
+    <w:p>
+      <w:pPr>
+        <w:spacing w:after="160"/>
+      </w:pPr>
+      <w:r>
+        <w:t xml:space="preserve">1. </w:t>
+      </w:r>
+      <w:r>
+        <w:rPr>
+          <w:b/>
+          <w:bCs/>
+        </w:rPr>
+        <w:t xml:space="preserve">Primary `thelonious_monk` + STYLE_ECM</w:t>
+      </w:r>
+      <w:r>
+        <w:t xml:space="preserve"> — Angular </w:t>
+      </w:r>
+      <w:r>
+        <w:rPr>
+          <w:b/>
+          <w:bCs/>
+        </w:rPr>
+        <w:t xml:space="preserve">lead-sheet</w:t>
+      </w:r>
+      <w:r>
+        <w:t xml:space="preserve"> harmony plus sparse </w:t>
+      </w:r>
+      <w:r>
+        <w:rPr>
+          <w:b/>
+          <w:bCs/>
+        </w:rPr>
+        <w:t xml:space="preserve">space/sync</w:t>
+      </w:r>
+      <w:r>
+        <w:t xml:space="preserve"> metadata stack; good for lessons on </w:t>
+      </w:r>
+      <w:r>
+        <w:rPr>
+          <w:b/>
+          <w:bCs/>
+        </w:rPr>
+        <w:t xml:space="preserve">off-centre</w:t>
+      </w:r>
+      <w:r>
+        <w:t xml:space="preserve"> phrasing vs straight </w:t>
+      </w:r>
+      <w:r>
+        <w:rPr>
+          <w:b/>
+          <w:bCs/>
+        </w:rPr>
+        <w:t xml:space="preserve">four-bar</w:t>
+      </w:r>
+      <w:r>
+        <w:t xml:space="preserve"> blues grids. 2. </w:t>
+      </w:r>
+      <w:r>
+        <w:rPr>
+          <w:b/>
+          <w:bCs/>
+        </w:rPr>
+        <w:t xml:space="preserve">Long-form 32 bars + Monk</w:t>
+      </w:r>
+      <w:r>
+        <w:t xml:space="preserve"> — Asymmetric grid changes </w:t>
+      </w:r>
+      <w:r>
+        <w:rPr>
+          <w:b/>
+          <w:bCs/>
+        </w:rPr>
+        <w:t xml:space="preserve">phrase-final</w:t>
+      </w:r>
+      <w:r>
+        <w:t xml:space="preserve"> placement vs fixed </w:t>
+      </w:r>
+      <w:r>
+        <w:rPr>
+          <w:b/>
+          <w:bCs/>
+        </w:rPr>
+        <w:t xml:space="preserve">4-bar</w:t>
+      </w:r>
+      <w:r>
+        <w:t xml:space="preserve"> cycle; compare </w:t>
+      </w:r>
+      <w:r>
+        <w:rPr>
+          <w:b/>
+          <w:bCs/>
+        </w:rPr>
+        <w:t xml:space="preserve">`tm:asym_phrase`</w:t>
+      </w:r>
+      <w:r>
+        <w:t xml:space="preserve"> timeline to </w:t>
+      </w:r>
+      <w:r>
+        <w:rPr>
+          <w:b/>
+          <w:bCs/>
+        </w:rPr>
+        <w:t xml:space="preserve">Bill Evans</w:t>
+      </w:r>
+      <w:r>
+        <w:t xml:space="preserve"> </w:t>
+      </w:r>
+      <w:r>
+        <w:rPr>
+          <w:b/>
+          <w:bCs/>
+        </w:rPr>
+        <w:t xml:space="preserve">`be:asym_phrase`</w:t>
+      </w:r>
+      <w:r>
+        <w:t xml:space="preserve"> on the same </w:t>
+      </w:r>
+      <w:r>
+        <w:rPr>
+          <w:b/>
+          <w:bCs/>
+        </w:rPr>
+        <w:t xml:space="preserve">seed</w:t>
+      </w:r>
+      <w:r>
+        <w:t xml:space="preserve"> family. 3. </w:t>
+      </w:r>
+      <w:r>
+        <w:rPr>
+          <w:b/>
+          <w:bCs/>
+        </w:rPr>
+        <w:t xml:space="preserve">`custom_locked` chart + Monk</w:t>
+      </w:r>
+      <w:r>
+        <w:t xml:space="preserve"> — Fixed progression still runs </w:t>
+      </w:r>
+      <w:r>
+        <w:rPr>
+          <w:b/>
+          <w:bCs/>
+        </w:rPr>
+        <w:t xml:space="preserve">slice</w:t>
+      </w:r>
+      <w:r>
+        <w:t xml:space="preserve"> devices; watch </w:t>
+      </w:r>
+      <w:r>
+        <w:rPr>
+          <w:b/>
+          <w:bCs/>
+        </w:rPr>
+        <w:t xml:space="preserve">`tm:chrom_enclosure`</w:t>
+      </w:r>
+      <w:r>
+        <w:t xml:space="preserve"> slash hints vs export </w:t>
+      </w:r>
+      <w:r>
+        <w:rPr>
+          <w:b/>
+          <w:bCs/>
+        </w:rPr>
+        <w:t xml:space="preserve">MusicXML</w:t>
+      </w:r>
+      <w:r>
+        <w:t xml:space="preserve"> truth (slash bass must round-trip). 4. </w:t>
+      </w:r>
+      <w:r>
+        <w:rPr>
+          <w:b/>
+          <w:bCs/>
+        </w:rPr>
+        <w:t xml:space="preserve">Seed A/B</w:t>
+      </w:r>
+      <w:r>
+        <w:t xml:space="preserve"> — Same </w:t>
+      </w:r>
+      <w:r>
+        <w:rPr>
+          <w:b/>
+          <w:bCs/>
+        </w:rPr>
+        <w:t xml:space="preserve">writer</w:t>
+      </w:r>
+      <w:r>
+        <w:t xml:space="preserve"> + </w:t>
+      </w:r>
+      <w:r>
+        <w:rPr>
+          <w:b/>
+          <w:bCs/>
+        </w:rPr>
+        <w:t xml:space="preserve">preset</w:t>
+      </w:r>
+      <w:r>
+        <w:t xml:space="preserve">, different </w:t>
+      </w:r>
+      <w:r>
+        <w:rPr>
+          <w:b/>
+          <w:bCs/>
+        </w:rPr>
+        <w:t xml:space="preserve">seeds</w:t>
+      </w:r>
+      <w:r>
+        <w:t xml:space="preserve">: </w:t>
+      </w:r>
+      <w:r>
+        <w:rPr>
+          <w:b/>
+          <w:bCs/>
+        </w:rPr>
+        <w:t xml:space="preserve">whole-tone</w:t>
+      </w:r>
+      <w:r>
+        <w:t xml:space="preserve"> and </w:t>
+      </w:r>
+      <w:r>
+        <w:rPr>
+          <w:b/>
+          <w:bCs/>
+        </w:rPr>
+        <w:t xml:space="preserve">enclosure</w:t>
+      </w:r>
+      <w:r>
+        <w:t xml:space="preserve"> rates are seeded bar-local — lock </w:t>
+      </w:r>
+      <w:r>
+        <w:rPr>
+          <w:b/>
+          <w:bCs/>
+        </w:rPr>
+        <w:t xml:space="preserve">seed</w:t>
+      </w:r>
+      <w:r>
+        <w:t xml:space="preserve"> when demoing a specific </w:t>
+      </w:r>
+      <w:r>
+        <w:rPr>
+          <w:b/>
+          <w:bCs/>
+        </w:rPr>
+        <w:t xml:space="preserve">`tm:whole_tone@bar{N}`</w:t>
+      </w:r>
+      <w:r>
+        <w:t xml:space="preserve"> outcome. 5. </w:t>
+      </w:r>
+      <w:r>
+        <w:rPr>
+          <w:b/>
+          <w:bCs/>
+        </w:rPr>
+        <w:t xml:space="preserve">Silence metadata inspection</w:t>
+      </w:r>
+      <w:r>
+        <w:t xml:space="preserve"> — After Generate, read </w:t>
+      </w:r>
+      <w:r>
+        <w:rPr>
+          <w:b/>
+          <w:bCs/>
+        </w:rPr>
+        <w:t xml:space="preserve">`monkSilenceBars`</w:t>
+      </w:r>
+      <w:r>
+        <w:t xml:space="preserve"> / </w:t>
+      </w:r>
+      <w:r>
+        <w:rPr>
+          <w:b/>
+          <w:bCs/>
+        </w:rPr>
+        <w:t xml:space="preserve">`monkPartialRestBars`</w:t>
+      </w:r>
+      <w:r>
+        <w:t xml:space="preserve"> on </w:t>
+      </w:r>
+      <w:r>
+        <w:rPr>
+          <w:b/>
+          <w:bCs/>
+        </w:rPr>
+        <w:t xml:space="preserve">`GenerationMetadata`</w:t>
+      </w:r>
+      <w:r>
+        <w:t xml:space="preserve"> for arranging </w:t>
+      </w:r>
+      <w:r>
+        <w:rPr>
+          <w:b/>
+          <w:bCs/>
+        </w:rPr>
+        <w:t xml:space="preserve">rests</w:t>
+      </w:r>
+      <w:r>
+        <w:t xml:space="preserve"> / late melody entry in a DAW (metadata intent, not forced MIDI deletion). 6. </w:t>
+      </w:r>
+      <w:r>
+        <w:rPr>
+          <w:b/>
+          <w:bCs/>
+        </w:rPr>
+        <w:t xml:space="preserve">Paste / iReal chart + Monk</w:t>
+      </w:r>
+      <w:r>
+        <w:t xml:space="preserve"> — Vault / paste pipelines feed </w:t>
+      </w:r>
+      <w:r>
+        <w:rPr>
+          <w:b/>
+          <w:bCs/>
+        </w:rPr>
+        <w:t xml:space="preserve">harmony</w:t>
+      </w:r>
+      <w:r>
+        <w:t xml:space="preserve"> into the same </w:t>
+      </w:r>
+      <w:r>
+        <w:rPr>
+          <w:b/>
+          <w:bCs/>
+        </w:rPr>
+        <w:t xml:space="preserve">effective-bar</w:t>
+      </w:r>
+      <w:r>
+        <w:t xml:space="preserve"> path; use </w:t>
+      </w:r>
+      <w:r>
+        <w:rPr>
+          <w:b/>
+          <w:bCs/>
+        </w:rPr>
+        <w:t xml:space="preserve">multi-chorus</w:t>
+      </w:r>
+      <w:r>
+        <w:t xml:space="preserve"> options to hear </w:t>
+      </w:r>
+      <w:r>
+        <w:rPr>
+          <w:b/>
+          <w:bCs/>
+        </w:rPr>
+        <w:t xml:space="preserve">phrase-grid</w:t>
+      </w:r>
+      <w:r>
+        <w:t xml:space="preserve"> + </w:t>
+      </w:r>
+      <w:r>
+        <w:rPr>
+          <w:b/>
+          <w:bCs/>
+        </w:rPr>
+        <w:t xml:space="preserve">motif</w:t>
+      </w:r>
+      <w:r>
+        <w:t xml:space="preserve"> tension phase shift chorus-to-chorus while </w:t>
+      </w:r>
+      <w:r>
+        <w:rPr>
+          <w:b/>
+          <w:bCs/>
+        </w:rPr>
+        <w:t xml:space="preserve">`tm:*`</w:t>
+      </w:r>
+      <w:r>
+        <w:t xml:space="preserve"> receipts stay in the manifest.</w:t>
       </w:r>
     </w:p>
     <w:p>

</xml_diff>

<commit_message>
docs: Duke Ellington handbook section + roadmap complete
Co-authored-by: Cursor <cursoragent@cursor.com>
</commit_message>
<xml_diff>
--- a/docs/COMPOSER_OS_PLAYBOOK.docx
+++ b/docs/COMPOSER_OS_PLAYBOOK.docx
@@ -17879,6 +17879,2133 @@
       </w:r>
       <w:r>
         <w:t xml:space="preserve"> receipts separately.</w:t>
+      </w:r>
+    </w:p>
+    <w:p>
+      <w:pPr>
+        <w:pStyle w:val="Heading2"/>
+        <w:spacing w:after="100" w:before="160"/>
+      </w:pPr>
+      <w:r>
+        <w:t xml:space="preserve">Duke Ellington (Song Mode — orchestral / jungle timbre lead-sheet slice)</w:t>
+      </w:r>
+    </w:p>
+    <w:p>
+      <w:pPr>
+        <w:spacing w:after="160"/>
+      </w:pPr>
+      <w:r>
+        <w:rPr>
+          <w:b/>
+          <w:bCs/>
+        </w:rPr>
+        <w:t xml:space="preserve">Still current:</w:t>
+      </w:r>
+      <w:r>
+        <w:t xml:space="preserve"> </w:t>
+      </w:r>
+      <w:r>
+        <w:rPr>
+          <w:b/>
+          <w:bCs/>
+        </w:rPr>
+        <w:t xml:space="preserve">`dukeEllingtonSlice.ts`</w:t>
+      </w:r>
+      <w:r>
+        <w:t xml:space="preserve">, </w:t>
+      </w:r>
+      <w:r>
+        <w:rPr>
+          <w:b/>
+          <w:bCs/>
+        </w:rPr>
+        <w:t xml:space="preserve">`precomputeDukeEllingtonEffectiveHarmonyBars`</w:t>
+      </w:r>
+      <w:r>
+        <w:t xml:space="preserve">, </w:t>
+      </w:r>
+      <w:r>
+        <w:rPr>
+          <w:b/>
+          <w:bCs/>
+        </w:rPr>
+        <w:t xml:space="preserve">`dukeEllingtonEffectiveHarmonyBars`</w:t>
+      </w:r>
+      <w:r>
+        <w:t xml:space="preserve"> feeding </w:t>
+      </w:r>
+      <w:r>
+        <w:rPr>
+          <w:b/>
+          <w:bCs/>
+        </w:rPr>
+        <w:t xml:space="preserve">`getChordForBar`</w:t>
+      </w:r>
+      <w:r>
+        <w:t xml:space="preserve"> and locked MusicXML / export / disk truth, receipts </w:t>
+      </w:r>
+      <w:r>
+        <w:rPr>
+          <w:b/>
+          <w:bCs/>
+        </w:rPr>
+        <w:t xml:space="preserve">`de:*`</w:t>
+      </w:r>
+      <w:r>
+        <w:t xml:space="preserve"> on </w:t>
+      </w:r>
+      <w:r>
+        <w:rPr>
+          <w:b/>
+          <w:bCs/>
+        </w:rPr>
+        <w:t xml:space="preserve">`dukeEllingtonDeviceReceipts`</w:t>
+      </w:r>
+      <w:r>
+        <w:t xml:space="preserve">, re-export </w:t>
+      </w:r>
+      <w:r>
+        <w:rPr>
+          <w:b/>
+          <w:bCs/>
+        </w:rPr>
+        <w:t xml:space="preserve">`goldenPath/dukeEllingtonSlice.ts`</w:t>
+      </w:r>
+      <w:r>
+        <w:t xml:space="preserve">.</w:t>
+      </w:r>
+    </w:p>
+    <w:p>
+      <w:pPr>
+        <w:spacing w:after="160"/>
+      </w:pPr>
+      <w:r>
+        <w:t xml:space="preserve">The slice </w:t>
+      </w:r>
+      <w:r>
+        <w:rPr>
+          <w:b/>
+          <w:bCs/>
+        </w:rPr>
+        <w:t xml:space="preserve">only rewrites chord symbols</w:t>
+      </w:r>
+      <w:r>
+        <w:t xml:space="preserve"> on the duo golden path (extension-rich </w:t>
+      </w:r>
+      <w:r>
+        <w:rPr>
+          <w:b/>
+          <w:bCs/>
+        </w:rPr>
+        <w:t xml:space="preserve">tonic / dominant / minor</w:t>
+      </w:r>
+      <w:r>
+        <w:t xml:space="preserve"> pass, then five </w:t>
+      </w:r>
+      <w:r>
+        <w:rPr>
+          <w:b/>
+          <w:bCs/>
+        </w:rPr>
+        <w:t xml:space="preserve">d1–d5</w:t>
+      </w:r>
+      <w:r>
+        <w:t xml:space="preserve"> devices). </w:t>
+      </w:r>
+      <w:r>
+        <w:rPr>
+          <w:b/>
+          <w:bCs/>
+        </w:rPr>
+        <w:t xml:space="preserve">Metadata</w:t>
+      </w:r>
+      <w:r>
+        <w:t xml:space="preserve"> also carries </w:t>
+      </w:r>
+      <w:r>
+        <w:rPr>
+          <w:b/>
+          <w:bCs/>
+        </w:rPr>
+        <w:t xml:space="preserve">`ellingtonCallResponseMap`</w:t>
+      </w:r>
+      <w:r>
+        <w:t xml:space="preserve"> (per-bar </w:t>
+      </w:r>
+      <w:r>
+        <w:rPr>
+          <w:b/>
+          <w:bCs/>
+        </w:rPr>
+        <w:t xml:space="preserve">call</w:t>
+      </w:r>
+      <w:r>
+        <w:t xml:space="preserve"> / </w:t>
+      </w:r>
+      <w:r>
+        <w:rPr>
+          <w:b/>
+          <w:bCs/>
+        </w:rPr>
+        <w:t xml:space="preserve">response</w:t>
+      </w:r>
+      <w:r>
+        <w:t xml:space="preserve"> roles) and </w:t>
+      </w:r>
+      <w:r>
+        <w:rPr>
+          <w:b/>
+          <w:bCs/>
+        </w:rPr>
+        <w:t xml:space="preserve">`ellingtonShoutBars`</w:t>
+      </w:r>
+      <w:r>
+        <w:t xml:space="preserve"> (1-based bar indices in the shout window).</w:t>
+      </w:r>
+    </w:p>
+    <w:p>
+      <w:pPr>
+        <w:pStyle w:val="Heading3"/>
+        <w:spacing w:after="80" w:before="120"/>
+      </w:pPr>
+      <w:r>
+        <w:t xml:space="preserve">Variable phrase grid</w:t>
+      </w:r>
+    </w:p>
+    <w:p>
+      <w:pPr>
+        <w:spacing w:after="160"/>
+      </w:pPr>
+      <w:r>
+        <w:rPr>
+          <w:b/>
+          <w:bCs/>
+        </w:rPr>
+        <w:t xml:space="preserve">`computeEllingtonPhrasePositions(totalBars, seed)`</w:t>
+      </w:r>
+      <w:r>
+        <w:t xml:space="preserve"> assigns </w:t>
+      </w:r>
+      <w:r>
+        <w:rPr>
+          <w:b/>
+          <w:bCs/>
+        </w:rPr>
+        <w:t xml:space="preserve">phraseStart</w:t>
+      </w:r>
+      <w:r>
+        <w:t xml:space="preserve"> / </w:t>
+      </w:r>
+      <w:r>
+        <w:rPr>
+          <w:b/>
+          <w:bCs/>
+        </w:rPr>
+        <w:t xml:space="preserve">phraseMiddle</w:t>
+      </w:r>
+      <w:r>
+        <w:t xml:space="preserve"> / </w:t>
+      </w:r>
+      <w:r>
+        <w:rPr>
+          <w:b/>
+          <w:bCs/>
+        </w:rPr>
+        <w:t xml:space="preserve">phraseFinal</w:t>
+      </w:r>
+      <w:r>
+        <w:t xml:space="preserve"> using variable phrase lengths </w:t>
+      </w:r>
+      <w:r>
+        <w:rPr>
+          <w:b/>
+          <w:bCs/>
+        </w:rPr>
+        <w:t xml:space="preserve">4, 8, 2, or 6 bars</w:t>
+      </w:r>
+      <w:r>
+        <w:t xml:space="preserve"> weighted </w:t>
+      </w:r>
+      <w:r>
+        <w:rPr>
+          <w:b/>
+          <w:bCs/>
+        </w:rPr>
+        <w:t xml:space="preserve">60% / 22% / 13% / 5%</w:t>
+      </w:r>
+      <w:r>
+        <w:t xml:space="preserve"> (same rolling-bar layout pattern as Bill Evans / Jobim / Monk variable grids). Phrase roles drive </w:t>
+      </w:r>
+      <w:r>
+        <w:rPr>
+          <w:b/>
+          <w:bCs/>
+        </w:rPr>
+        <w:t xml:space="preserve">jungle growl</w:t>
+      </w:r>
+      <w:r>
+        <w:t xml:space="preserve"> (phrase-start only), </w:t>
+      </w:r>
+      <w:r>
+        <w:rPr>
+          <w:b/>
+          <w:bCs/>
+        </w:rPr>
+        <w:t xml:space="preserve">chromatic diminished</w:t>
+      </w:r>
+      <w:r>
+        <w:t xml:space="preserve"> (approach to phrase-final cadence), and contrast with the </w:t>
+      </w:r>
+      <w:r>
+        <w:rPr>
+          <w:b/>
+          <w:bCs/>
+        </w:rPr>
+        <w:t xml:space="preserve">shout</w:t>
+      </w:r>
+      <w:r>
+        <w:t xml:space="preserve"> window (final </w:t>
+      </w:r>
+      <w:r>
+        <w:rPr>
+          <w:b/>
+          <w:bCs/>
+        </w:rPr>
+        <w:t xml:space="preserve">8–16</w:t>
+      </w:r>
+      <w:r>
+        <w:t xml:space="preserve"> bars of the form, span rule in slice).</w:t>
+      </w:r>
+    </w:p>
+    <w:p>
+      <w:pPr>
+        <w:pStyle w:val="Heading3"/>
+        <w:spacing w:after="80" w:before="120"/>
+      </w:pPr>
+      <w:r>
+        <w:t xml:space="preserve">Stage 1 — per-bar enrichment (before d1–d5)</w:t>
+      </w:r>
+    </w:p>
+    <w:tbl>
+      <w:tblPr>
+        <w:tblW w:type="pct" w:w="100%"/>
+        <w:tblBorders>
+          <w:top w:val="single" w:color="auto" w:sz="4"/>
+          <w:left w:val="single" w:color="auto" w:sz="4"/>
+          <w:bottom w:val="single" w:color="auto" w:sz="4"/>
+          <w:right w:val="single" w:color="auto" w:sz="4"/>
+          <w:insideH w:val="single" w:color="auto" w:sz="4"/>
+          <w:insideV w:val="single" w:color="auto" w:sz="4"/>
+        </w:tblBorders>
+      </w:tblPr>
+      <w:tblGrid>
+        <w:gridCol w:w="3000"/>
+        <w:gridCol w:w="3000"/>
+        <w:gridCol w:w="3000"/>
+      </w:tblGrid>
+      <w:tr>
+        <w:tc>
+          <w:tcPr>
+            <w:tcW w:type="pct" w:w="3000%"/>
+          </w:tcPr>
+          <w:p>
+            <w:pPr>
+              <w:spacing w:after="60"/>
+            </w:pPr>
+            <w:r>
+              <w:t xml:space="preserve">Family</w:t>
+            </w:r>
+          </w:p>
+        </w:tc>
+        <w:tc>
+          <w:tcPr>
+            <w:tcW w:type="pct" w:w="3000%"/>
+          </w:tcPr>
+          <w:p>
+            <w:pPr>
+              <w:spacing w:after="60"/>
+            </w:pPr>
+            <w:r>
+              <w:t xml:space="preserve">Input (lead-sheet proxy)</w:t>
+            </w:r>
+          </w:p>
+        </w:tc>
+        <w:tc>
+          <w:tcPr>
+            <w:tcW w:type="pct" w:w="3000%"/>
+          </w:tcPr>
+          <w:p>
+            <w:pPr>
+              <w:spacing w:after="60"/>
+            </w:pPr>
+            <w:r>
+              <w:t xml:space="preserve">Weighted outputs</w:t>
+            </w:r>
+          </w:p>
+        </w:tc>
+      </w:tr>
+      <w:tr>
+        <w:tc>
+          <w:tcPr>
+            <w:tcW w:type="pct" w:w="3000%"/>
+          </w:tcPr>
+          <w:p>
+            <w:pPr>
+              <w:spacing w:after="60"/>
+            </w:pPr>
+            <w:r>
+              <w:rPr>
+                <w:b/>
+                <w:bCs/>
+              </w:rPr>
+              <w:t xml:space="preserve">Tonic major</w:t>
+            </w:r>
+            <w:r>
+              <w:t xml:space="preserve"> (bare / maj / maj7 on tonic)</w:t>
+            </w:r>
+          </w:p>
+        </w:tc>
+        <w:tc>
+          <w:tcPr>
+            <w:tcW w:type="pct" w:w="3000%"/>
+          </w:tcPr>
+          <w:p>
+            <w:pPr>
+              <w:spacing w:after="60"/>
+            </w:pPr>
+            <w:r>
+              <w:rPr>
+                <w:b/>
+                <w:bCs/>
+              </w:rPr>
+              <w:t xml:space="preserve">maj9(#11)</w:t>
+            </w:r>
+            <w:r>
+              <w:t xml:space="preserve"> </w:t>
+            </w:r>
+            <w:r>
+              <w:rPr>
+                <w:b/>
+                <w:bCs/>
+              </w:rPr>
+              <w:t xml:space="preserve">35%</w:t>
+            </w:r>
+            <w:r>
+              <w:t xml:space="preserve">, </w:t>
+            </w:r>
+            <w:r>
+              <w:rPr>
+                <w:b/>
+                <w:bCs/>
+              </w:rPr>
+              <w:t xml:space="preserve">maj13(#11)</w:t>
+            </w:r>
+            <w:r>
+              <w:t xml:space="preserve"> </w:t>
+            </w:r>
+            <w:r>
+              <w:rPr>
+                <w:b/>
+                <w:bCs/>
+              </w:rPr>
+              <w:t xml:space="preserve">25%</w:t>
+            </w:r>
+            <w:r>
+              <w:t xml:space="preserve">, </w:t>
+            </w:r>
+            <w:r>
+              <w:rPr>
+                <w:b/>
+                <w:bCs/>
+              </w:rPr>
+              <w:t xml:space="preserve">maj6</w:t>
+            </w:r>
+            <w:r>
+              <w:t xml:space="preserve"> </w:t>
+            </w:r>
+            <w:r>
+              <w:rPr>
+                <w:b/>
+                <w:bCs/>
+              </w:rPr>
+              <w:t xml:space="preserve">25%</w:t>
+            </w:r>
+            <w:r>
+              <w:t xml:space="preserve">, </w:t>
+            </w:r>
+            <w:r>
+              <w:rPr>
+                <w:b/>
+                <w:bCs/>
+              </w:rPr>
+              <w:t xml:space="preserve">maj9</w:t>
+            </w:r>
+            <w:r>
+              <w:t xml:space="preserve"> </w:t>
+            </w:r>
+            <w:r>
+              <w:rPr>
+                <w:b/>
+                <w:bCs/>
+              </w:rPr>
+              <w:t xml:space="preserve">15%</w:t>
+            </w:r>
+          </w:p>
+        </w:tc>
+      </w:tr>
+      <w:tr>
+        <w:tc>
+          <w:tcPr>
+            <w:tcW w:type="pct" w:w="3000%"/>
+          </w:tcPr>
+          <w:p>
+            <w:pPr>
+              <w:spacing w:after="60"/>
+            </w:pPr>
+            <w:r>
+              <w:rPr>
+                <w:b/>
+                <w:bCs/>
+              </w:rPr>
+              <w:t xml:space="preserve">Dominant</w:t>
+            </w:r>
+            <w:r>
+              <w:t xml:space="preserve"> (plain </w:t>
+            </w:r>
+            <w:r>
+              <w:rPr>
+                <w:b/>
+                <w:bCs/>
+              </w:rPr>
+              <w:t xml:space="preserve">dom7</w:t>
+            </w:r>
+            <w:r>
+              <w:t xml:space="preserve"> family)</w:t>
+            </w:r>
+          </w:p>
+        </w:tc>
+        <w:tc>
+          <w:tcPr>
+            <w:tcW w:type="pct" w:w="3000%"/>
+          </w:tcPr>
+          <w:p>
+            <w:pPr>
+              <w:spacing w:after="60"/>
+            </w:pPr>
+            <w:r>
+              <w:rPr>
+                <w:b/>
+                <w:bCs/>
+              </w:rPr>
+              <w:t xml:space="preserve">dom9</w:t>
+            </w:r>
+            <w:r>
+              <w:t xml:space="preserve"> </w:t>
+            </w:r>
+            <w:r>
+              <w:rPr>
+                <w:b/>
+                <w:bCs/>
+              </w:rPr>
+              <w:t xml:space="preserve">40%</w:t>
+            </w:r>
+            <w:r>
+              <w:t xml:space="preserve">, </w:t>
+            </w:r>
+            <w:r>
+              <w:rPr>
+                <w:b/>
+                <w:bCs/>
+              </w:rPr>
+              <w:t xml:space="preserve">dom13</w:t>
+            </w:r>
+            <w:r>
+              <w:t xml:space="preserve"> </w:t>
+            </w:r>
+            <w:r>
+              <w:rPr>
+                <w:b/>
+                <w:bCs/>
+              </w:rPr>
+              <w:t xml:space="preserve">25%</w:t>
+            </w:r>
+            <w:r>
+              <w:t xml:space="preserve">, </w:t>
+            </w:r>
+            <w:r>
+              <w:rPr>
+                <w:b/>
+                <w:bCs/>
+              </w:rPr>
+              <w:t xml:space="preserve">dom7(b9)</w:t>
+            </w:r>
+            <w:r>
+              <w:t xml:space="preserve"> </w:t>
+            </w:r>
+            <w:r>
+              <w:rPr>
+                <w:b/>
+                <w:bCs/>
+              </w:rPr>
+              <w:t xml:space="preserve">20%</w:t>
+            </w:r>
+            <w:r>
+              <w:t xml:space="preserve">, </w:t>
+            </w:r>
+            <w:r>
+              <w:rPr>
+                <w:b/>
+                <w:bCs/>
+              </w:rPr>
+              <w:t xml:space="preserve">dom7(#9,b13)</w:t>
+            </w:r>
+            <w:r>
+              <w:t xml:space="preserve"> </w:t>
+            </w:r>
+            <w:r>
+              <w:rPr>
+                <w:b/>
+                <w:bCs/>
+              </w:rPr>
+              <w:t xml:space="preserve">15%</w:t>
+            </w:r>
+          </w:p>
+        </w:tc>
+      </w:tr>
+      <w:tr>
+        <w:tc>
+          <w:tcPr>
+            <w:tcW w:type="pct" w:w="3000%"/>
+          </w:tcPr>
+          <w:p>
+            <w:pPr>
+              <w:spacing w:after="60"/>
+            </w:pPr>
+            <w:r>
+              <w:rPr>
+                <w:b/>
+                <w:bCs/>
+              </w:rPr>
+              <w:t xml:space="preserve">Bare minor</w:t>
+            </w:r>
+          </w:p>
+        </w:tc>
+        <w:tc>
+          <w:tcPr>
+            <w:tcW w:type="pct" w:w="3000%"/>
+          </w:tcPr>
+          <w:p>
+            <w:pPr>
+              <w:spacing w:after="60"/>
+            </w:pPr>
+            <w:r>
+              <w:rPr>
+                <w:b/>
+                <w:bCs/>
+              </w:rPr>
+              <w:t xml:space="preserve">m6(9)</w:t>
+            </w:r>
+            <w:r>
+              <w:t xml:space="preserve"> </w:t>
+            </w:r>
+            <w:r>
+              <w:rPr>
+                <w:b/>
+                <w:bCs/>
+              </w:rPr>
+              <w:t xml:space="preserve">35%</w:t>
+            </w:r>
+            <w:r>
+              <w:t xml:space="preserve">, </w:t>
+            </w:r>
+            <w:r>
+              <w:rPr>
+                <w:b/>
+                <w:bCs/>
+              </w:rPr>
+              <w:t xml:space="preserve">m9</w:t>
+            </w:r>
+            <w:r>
+              <w:t xml:space="preserve"> </w:t>
+            </w:r>
+            <w:r>
+              <w:rPr>
+                <w:b/>
+                <w:bCs/>
+              </w:rPr>
+              <w:t xml:space="preserve">30%</w:t>
+            </w:r>
+            <w:r>
+              <w:t xml:space="preserve">, </w:t>
+            </w:r>
+            <w:r>
+              <w:rPr>
+                <w:b/>
+                <w:bCs/>
+              </w:rPr>
+              <w:t xml:space="preserve">m7</w:t>
+            </w:r>
+            <w:r>
+              <w:t xml:space="preserve"> </w:t>
+            </w:r>
+            <w:r>
+              <w:rPr>
+                <w:b/>
+                <w:bCs/>
+              </w:rPr>
+              <w:t xml:space="preserve">25%</w:t>
+            </w:r>
+            <w:r>
+              <w:t xml:space="preserve">, </w:t>
+            </w:r>
+            <w:r>
+              <w:rPr>
+                <w:b/>
+                <w:bCs/>
+              </w:rPr>
+              <w:t xml:space="preserve">m6</w:t>
+            </w:r>
+            <w:r>
+              <w:t xml:space="preserve"> </w:t>
+            </w:r>
+            <w:r>
+              <w:rPr>
+                <w:b/>
+                <w:bCs/>
+              </w:rPr>
+              <w:t xml:space="preserve">10%</w:t>
+            </w:r>
+          </w:p>
+        </w:tc>
+      </w:tr>
+    </w:tbl>
+    <w:p>
+      <w:pPr>
+        <w:spacing w:after="160"/>
+      </w:pPr>
+    </w:p>
+    <w:p>
+      <w:pPr>
+        <w:pStyle w:val="Heading3"/>
+        <w:spacing w:after="80" w:before="120"/>
+      </w:pPr>
+      <w:r>
+        <w:t xml:space="preserve">Stage 2 — passes (receipts **`de:*`**)</w:t>
+      </w:r>
+    </w:p>
+    <w:tbl>
+      <w:tblPr>
+        <w:tblW w:type="pct" w:w="100%"/>
+        <w:tblBorders>
+          <w:top w:val="single" w:color="auto" w:sz="4"/>
+          <w:left w:val="single" w:color="auto" w:sz="4"/>
+          <w:bottom w:val="single" w:color="auto" w:sz="4"/>
+          <w:right w:val="single" w:color="auto" w:sz="4"/>
+          <w:insideH w:val="single" w:color="auto" w:sz="4"/>
+          <w:insideV w:val="single" w:color="auto" w:sz="4"/>
+        </w:tblBorders>
+      </w:tblPr>
+      <w:tblGrid>
+        <w:gridCol w:w="2250"/>
+        <w:gridCol w:w="2250"/>
+        <w:gridCol w:w="2250"/>
+        <w:gridCol w:w="2250"/>
+      </w:tblGrid>
+      <w:tr>
+        <w:tc>
+          <w:tcPr>
+            <w:tcW w:type="pct" w:w="2250%"/>
+          </w:tcPr>
+          <w:p>
+            <w:pPr>
+              <w:spacing w:after="60"/>
+            </w:pPr>
+            <w:r>
+              <w:t xml:space="preserve">Pass</w:t>
+            </w:r>
+          </w:p>
+        </w:tc>
+        <w:tc>
+          <w:tcPr>
+            <w:tcW w:type="pct" w:w="2250%"/>
+          </w:tcPr>
+          <w:p>
+            <w:pPr>
+              <w:spacing w:after="60"/>
+            </w:pPr>
+            <w:r>
+              <w:t xml:space="preserve">Rate / scope</w:t>
+            </w:r>
+          </w:p>
+        </w:tc>
+        <w:tc>
+          <w:tcPr>
+            <w:tcW w:type="pct" w:w="2250%"/>
+          </w:tcPr>
+          <w:p>
+            <w:pPr>
+              <w:spacing w:after="60"/>
+            </w:pPr>
+            <w:r>
+              <w:t xml:space="preserve">Role</w:t>
+            </w:r>
+          </w:p>
+        </w:tc>
+        <w:tc>
+          <w:tcPr>
+            <w:tcW w:type="pct" w:w="2250%"/>
+          </w:tcPr>
+          <w:p>
+            <w:pPr>
+              <w:spacing w:after="60"/>
+            </w:pPr>
+            <w:r>
+              <w:t xml:space="preserve">Receipt</w:t>
+            </w:r>
+          </w:p>
+        </w:tc>
+      </w:tr>
+      <w:tr>
+        <w:tc>
+          <w:tcPr>
+            <w:tcW w:type="pct" w:w="2250%"/>
+          </w:tcPr>
+          <w:p>
+            <w:pPr>
+              <w:spacing w:after="60"/>
+            </w:pPr>
+            <w:r>
+              <w:rPr>
+                <w:b/>
+                <w:bCs/>
+              </w:rPr>
+              <w:t xml:space="preserve">d1 Jungle growl</w:t>
+            </w:r>
+          </w:p>
+        </w:tc>
+        <w:tc>
+          <w:tcPr>
+            <w:tcW w:type="pct" w:w="2250%"/>
+          </w:tcPr>
+          <w:p>
+            <w:pPr>
+              <w:spacing w:after="60"/>
+            </w:pPr>
+            <w:r>
+              <w:rPr>
+                <w:b/>
+                <w:bCs/>
+              </w:rPr>
+              <w:t xml:space="preserve">22%</w:t>
+            </w:r>
+            <w:r>
+              <w:t xml:space="preserve">, </w:t>
+            </w:r>
+            <w:r>
+              <w:rPr>
+                <w:b/>
+                <w:bCs/>
+              </w:rPr>
+              <w:t xml:space="preserve">phraseStart</w:t>
+            </w:r>
+            <w:r>
+              <w:t xml:space="preserve"> only, </w:t>
+            </w:r>
+            <w:r>
+              <w:rPr>
+                <w:b/>
+                <w:bCs/>
+              </w:rPr>
+              <w:t xml:space="preserve">minor or dominant</w:t>
+            </w:r>
+            <w:r>
+              <w:t xml:space="preserve"> context</w:t>
+            </w:r>
+          </w:p>
+        </w:tc>
+        <w:tc>
+          <w:tcPr>
+            <w:tcW w:type="pct" w:w="2250%"/>
+          </w:tcPr>
+          <w:p>
+            <w:pPr>
+              <w:spacing w:after="60"/>
+            </w:pPr>
+            <w:r>
+              <w:t xml:space="preserve">Dark colours: </w:t>
+            </w:r>
+            <w:r>
+              <w:rPr>
+                <w:b/>
+                <w:bCs/>
+              </w:rPr>
+              <w:t xml:space="preserve">dominant</w:t>
+            </w:r>
+            <w:r>
+              <w:t xml:space="preserve"> → </w:t>
+            </w:r>
+            <w:r>
+              <w:rPr>
+                <w:b/>
+                <w:bCs/>
+              </w:rPr>
+              <w:t xml:space="preserve">7(b9#5)</w:t>
+            </w:r>
+            <w:r>
+              <w:t xml:space="preserve"> / </w:t>
+            </w:r>
+            <w:r>
+              <w:rPr>
+                <w:b/>
+                <w:bCs/>
+              </w:rPr>
+              <w:t xml:space="preserve">7(b9b5)</w:t>
+            </w:r>
+            <w:r>
+              <w:t xml:space="preserve">; </w:t>
+            </w:r>
+            <w:r>
+              <w:rPr>
+                <w:b/>
+                <w:bCs/>
+              </w:rPr>
+              <w:t xml:space="preserve">minor phrase-start</w:t>
+            </w:r>
+            <w:r>
+              <w:t xml:space="preserve"> → </w:t>
+            </w:r>
+            <w:r>
+              <w:rPr>
+                <w:b/>
+                <w:bCs/>
+              </w:rPr>
+              <w:t xml:space="preserve">m6(9)</w:t>
+            </w:r>
+          </w:p>
+        </w:tc>
+        <w:tc>
+          <w:tcPr>
+            <w:tcW w:type="pct" w:w="2250%"/>
+          </w:tcPr>
+          <w:p>
+            <w:pPr>
+              <w:spacing w:after="60"/>
+            </w:pPr>
+            <w:r>
+              <w:rPr>
+                <w:b/>
+                <w:bCs/>
+              </w:rPr>
+              <w:t xml:space="preserve">`de:jungle_growl@bar{N}`</w:t>
+            </w:r>
+          </w:p>
+        </w:tc>
+      </w:tr>
+      <w:tr>
+        <w:tc>
+          <w:tcPr>
+            <w:tcW w:type="pct" w:w="2250%"/>
+          </w:tcPr>
+          <w:p>
+            <w:pPr>
+              <w:spacing w:after="60"/>
+            </w:pPr>
+            <w:r>
+              <w:rPr>
+                <w:b/>
+                <w:bCs/>
+              </w:rPr>
+              <w:t xml:space="preserve">d2 Chromatic diminished</w:t>
+            </w:r>
+          </w:p>
+        </w:tc>
+        <w:tc>
+          <w:tcPr>
+            <w:tcW w:type="pct" w:w="2250%"/>
+          </w:tcPr>
+          <w:p>
+            <w:pPr>
+              <w:spacing w:after="60"/>
+            </w:pPr>
+            <w:r>
+              <w:rPr>
+                <w:b/>
+                <w:bCs/>
+              </w:rPr>
+              <w:t xml:space="preserve">25%</w:t>
+            </w:r>
+            <w:r>
+              <w:t xml:space="preserve">, bar </w:t>
+            </w:r>
+            <w:r>
+              <w:rPr>
+                <w:b/>
+                <w:bCs/>
+              </w:rPr>
+              <w:t xml:space="preserve">before</w:t>
+            </w:r>
+            <w:r>
+              <w:t xml:space="preserve"> a </w:t>
+            </w:r>
+            <w:r>
+              <w:rPr>
+                <w:b/>
+                <w:bCs/>
+              </w:rPr>
+              <w:t xml:space="preserve">phraseFinal</w:t>
+            </w:r>
+            <w:r>
+              <w:t xml:space="preserve"> cadence target</w:t>
+            </w:r>
+          </w:p>
+        </w:tc>
+        <w:tc>
+          <w:tcPr>
+            <w:tcW w:type="pct" w:w="2250%"/>
+          </w:tcPr>
+          <w:p>
+            <w:pPr>
+              <w:spacing w:after="60"/>
+            </w:pPr>
+            <w:r>
+              <w:rPr>
+                <w:b/>
+                <w:bCs/>
+              </w:rPr>
+              <w:t xml:space="preserve">CT°7</w:t>
+            </w:r>
+            <w:r>
+              <w:t xml:space="preserve"> spelling </w:t>
+            </w:r>
+            <w:r>
+              <w:rPr>
+                <w:b/>
+                <w:bCs/>
+              </w:rPr>
+              <w:t xml:space="preserve">one semitone above</w:t>
+            </w:r>
+            <w:r>
+              <w:t xml:space="preserve"> the resolution chord root</w:t>
+            </w:r>
+          </w:p>
+        </w:tc>
+        <w:tc>
+          <w:tcPr>
+            <w:tcW w:type="pct" w:w="2250%"/>
+          </w:tcPr>
+          <w:p>
+            <w:pPr>
+              <w:spacing w:after="60"/>
+            </w:pPr>
+            <w:r>
+              <w:rPr>
+                <w:b/>
+                <w:bCs/>
+              </w:rPr>
+              <w:t xml:space="preserve">`de:chrom_dim@bar{N}`</w:t>
+            </w:r>
+          </w:p>
+        </w:tc>
+      </w:tr>
+      <w:tr>
+        <w:tc>
+          <w:tcPr>
+            <w:tcW w:type="pct" w:w="2250%"/>
+          </w:tcPr>
+          <w:p>
+            <w:pPr>
+              <w:spacing w:after="60"/>
+            </w:pPr>
+            <w:r>
+              <w:rPr>
+                <w:b/>
+                <w:bCs/>
+              </w:rPr>
+              <w:t xml:space="preserve">d3 Call / response</w:t>
+            </w:r>
+          </w:p>
+        </w:tc>
+        <w:tc>
+          <w:tcPr>
+            <w:tcW w:type="pct" w:w="2250%"/>
+          </w:tcPr>
+          <w:p>
+            <w:pPr>
+              <w:spacing w:after="60"/>
+            </w:pPr>
+            <w:r>
+              <w:rPr>
+                <w:b/>
+                <w:bCs/>
+              </w:rPr>
+              <w:t xml:space="preserve">60%</w:t>
+            </w:r>
+            <w:r>
+              <w:t xml:space="preserve"> receipt rate, </w:t>
+            </w:r>
+            <w:r>
+              <w:rPr>
+                <w:b/>
+                <w:bCs/>
+              </w:rPr>
+              <w:t xml:space="preserve">all bars</w:t>
+            </w:r>
+          </w:p>
+        </w:tc>
+        <w:tc>
+          <w:tcPr>
+            <w:tcW w:type="pct" w:w="2250%"/>
+          </w:tcPr>
+          <w:p>
+            <w:pPr>
+              <w:spacing w:after="60"/>
+            </w:pPr>
+            <w:r>
+              <w:t xml:space="preserve">Deterministic </w:t>
+            </w:r>
+            <w:r>
+              <w:rPr>
+                <w:b/>
+                <w:bCs/>
+              </w:rPr>
+              <w:t xml:space="preserve">odd bars = call</w:t>
+            </w:r>
+            <w:r>
+              <w:t xml:space="preserve">, </w:t>
+            </w:r>
+            <w:r>
+              <w:rPr>
+                <w:b/>
+                <w:bCs/>
+              </w:rPr>
+              <w:t xml:space="preserve">even bars = response</w:t>
+            </w:r>
+            <w:r>
+              <w:t xml:space="preserve"> on </w:t>
+            </w:r>
+            <w:r>
+              <w:rPr>
+                <w:b/>
+                <w:bCs/>
+              </w:rPr>
+              <w:t xml:space="preserve">`ellingtonCallResponseMap`</w:t>
+            </w:r>
+            <w:r>
+              <w:t xml:space="preserve">; receipt only when the Bernoulli gate fires</w:t>
+            </w:r>
+          </w:p>
+        </w:tc>
+        <w:tc>
+          <w:tcPr>
+            <w:tcW w:type="pct" w:w="2250%"/>
+          </w:tcPr>
+          <w:p>
+            <w:pPr>
+              <w:spacing w:after="60"/>
+            </w:pPr>
+            <w:r>
+              <w:rPr>
+                <w:b/>
+                <w:bCs/>
+              </w:rPr>
+              <w:t xml:space="preserve">`de:call@bar{N}`</w:t>
+            </w:r>
+            <w:r>
+              <w:t xml:space="preserve"> / </w:t>
+            </w:r>
+            <w:r>
+              <w:rPr>
+                <w:b/>
+                <w:bCs/>
+              </w:rPr>
+              <w:t xml:space="preserve">`de:response@bar{N}`</w:t>
+            </w:r>
+          </w:p>
+        </w:tc>
+      </w:tr>
+      <w:tr>
+        <w:tc>
+          <w:tcPr>
+            <w:tcW w:type="pct" w:w="2250%"/>
+          </w:tcPr>
+          <w:p>
+            <w:pPr>
+              <w:spacing w:after="60"/>
+            </w:pPr>
+            <w:r>
+              <w:rPr>
+                <w:b/>
+                <w:bCs/>
+              </w:rPr>
+              <w:t xml:space="preserve">d4 Parallel planing</w:t>
+            </w:r>
+          </w:p>
+        </w:tc>
+        <w:tc>
+          <w:tcPr>
+            <w:tcW w:type="pct" w:w="2250%"/>
+          </w:tcPr>
+          <w:p>
+            <w:pPr>
+              <w:spacing w:after="60"/>
+            </w:pPr>
+            <w:r>
+              <w:rPr>
+                <w:b/>
+                <w:bCs/>
+              </w:rPr>
+              <w:t xml:space="preserve">20%</w:t>
+            </w:r>
+            <w:r>
+              <w:t xml:space="preserve">, </w:t>
+            </w:r>
+            <w:r>
+              <w:rPr>
+                <w:b/>
+                <w:bCs/>
+              </w:rPr>
+              <w:t xml:space="preserve">two consecutive tonic-centre</w:t>
+            </w:r>
+            <w:r>
+              <w:t xml:space="preserve"> bars</w:t>
+            </w:r>
+          </w:p>
+        </w:tc>
+        <w:tc>
+          <w:tcPr>
+            <w:tcW w:type="pct" w:w="2250%"/>
+          </w:tcPr>
+          <w:p>
+            <w:pPr>
+              <w:spacing w:after="60"/>
+            </w:pPr>
+            <w:r>
+              <w:t xml:space="preserve">Upper structure </w:t>
+            </w:r>
+            <w:r>
+              <w:rPr>
+                <w:b/>
+                <w:bCs/>
+              </w:rPr>
+              <w:t xml:space="preserve">±1 semitone</w:t>
+            </w:r>
+            <w:r>
+              <w:t xml:space="preserve"> vs sustained tonic root → </w:t>
+            </w:r>
+            <w:r>
+              <w:rPr>
+                <w:b/>
+                <w:bCs/>
+              </w:rPr>
+              <w:t xml:space="preserve">`upperChord/tonicBass`</w:t>
+            </w:r>
+            <w:r>
+              <w:t xml:space="preserve"> slash</w:t>
+            </w:r>
+          </w:p>
+        </w:tc>
+        <w:tc>
+          <w:tcPr>
+            <w:tcW w:type="pct" w:w="2250%"/>
+          </w:tcPr>
+          <w:p>
+            <w:pPr>
+              <w:spacing w:after="60"/>
+            </w:pPr>
+            <w:r>
+              <w:rPr>
+                <w:b/>
+                <w:bCs/>
+              </w:rPr>
+              <w:t xml:space="preserve">`de:planing@bar{N}`</w:t>
+            </w:r>
+          </w:p>
+        </w:tc>
+      </w:tr>
+      <w:tr>
+        <w:tc>
+          <w:tcPr>
+            <w:tcW w:type="pct" w:w="2250%"/>
+          </w:tcPr>
+          <w:p>
+            <w:pPr>
+              <w:spacing w:after="60"/>
+            </w:pPr>
+            <w:r>
+              <w:rPr>
+                <w:b/>
+                <w:bCs/>
+              </w:rPr>
+              <w:t xml:space="preserve">d5 Shout chorus</w:t>
+            </w:r>
+          </w:p>
+        </w:tc>
+        <w:tc>
+          <w:tcPr>
+            <w:tcW w:type="pct" w:w="2250%"/>
+          </w:tcPr>
+          <w:p>
+            <w:pPr>
+              <w:spacing w:after="60"/>
+            </w:pPr>
+            <w:r>
+              <w:rPr>
+                <w:b/>
+                <w:bCs/>
+              </w:rPr>
+              <w:t xml:space="preserve">100%</w:t>
+            </w:r>
+            <w:r>
+              <w:t xml:space="preserve"> of bars in the </w:t>
+            </w:r>
+            <w:r>
+              <w:rPr>
+                <w:b/>
+                <w:bCs/>
+              </w:rPr>
+              <w:t xml:space="preserve">final section</w:t>
+            </w:r>
+            <w:r>
+              <w:t xml:space="preserve"> (last </w:t>
+            </w:r>
+            <w:r>
+              <w:rPr>
+                <w:b/>
+                <w:bCs/>
+              </w:rPr>
+              <w:t xml:space="preserve">8–16</w:t>
+            </w:r>
+            <w:r>
+              <w:t xml:space="preserve"> bars per form rule)</w:t>
+            </w:r>
+          </w:p>
+        </w:tc>
+        <w:tc>
+          <w:tcPr>
+            <w:tcW w:type="pct" w:w="2250%"/>
+          </w:tcPr>
+          <w:p>
+            <w:pPr>
+              <w:spacing w:after="60"/>
+            </w:pPr>
+            <w:r>
+              <w:t xml:space="preserve">Forces </w:t>
+            </w:r>
+            <w:r>
+              <w:rPr>
+                <w:b/>
+                <w:bCs/>
+              </w:rPr>
+              <w:t xml:space="preserve">maj9(#11)</w:t>
+            </w:r>
+            <w:r>
+              <w:t xml:space="preserve"> or </w:t>
+            </w:r>
+            <w:r>
+              <w:rPr>
+                <w:b/>
+                <w:bCs/>
+              </w:rPr>
+              <w:t xml:space="preserve">dom13</w:t>
+            </w:r>
+            <w:r>
+              <w:t xml:space="preserve"> (tonic minor colour → </w:t>
+            </w:r>
+            <w:r>
+              <w:rPr>
+                <w:b/>
+                <w:bCs/>
+              </w:rPr>
+              <w:t xml:space="preserve">m9</w:t>
+            </w:r>
+            <w:r>
+              <w:t xml:space="preserve">); fills </w:t>
+            </w:r>
+            <w:r>
+              <w:rPr>
+                <w:b/>
+                <w:bCs/>
+              </w:rPr>
+              <w:t xml:space="preserve">`ellingtonShoutBars`</w:t>
+            </w:r>
+          </w:p>
+        </w:tc>
+        <w:tc>
+          <w:tcPr>
+            <w:tcW w:type="pct" w:w="2250%"/>
+          </w:tcPr>
+          <w:p>
+            <w:pPr>
+              <w:spacing w:after="60"/>
+            </w:pPr>
+            <w:r>
+              <w:rPr>
+                <w:b/>
+                <w:bCs/>
+              </w:rPr>
+              <w:t xml:space="preserve">`de:shout@bar{N}`</w:t>
+            </w:r>
+          </w:p>
+        </w:tc>
+      </w:tr>
+    </w:tbl>
+    <w:p>
+      <w:pPr>
+        <w:spacing w:after="160"/>
+      </w:pPr>
+    </w:p>
+    <w:p>
+      <w:pPr>
+        <w:pStyle w:val="Heading3"/>
+        <w:spacing w:after="80" w:before="120"/>
+      </w:pPr>
+      <w:r>
+        <w:t xml:space="preserve">Ellington style surface (primary songwriter)</w:t>
+      </w:r>
+    </w:p>
+    <w:p>
+      <w:pPr>
+        <w:spacing w:after="160"/>
+      </w:pPr>
+      <w:r>
+        <w:t xml:space="preserve">When </w:t>
+      </w:r>
+      <w:r>
+        <w:rPr>
+          <w:b/>
+          <w:bCs/>
+        </w:rPr>
+        <w:t xml:space="preserve">`normalizeSongwriterStyleKey(primary) === 'duke_ellington'`</w:t>
+      </w:r>
+      <w:r>
+        <w:t xml:space="preserve">, </w:t>
+      </w:r>
+      <w:r>
+        <w:rPr>
+          <w:b/>
+          <w:bCs/>
+        </w:rPr>
+        <w:t xml:space="preserve">`applyDukeEllingtonStyleSurface`</w:t>
+      </w:r>
+      <w:r>
+        <w:t xml:space="preserve"> (`songModeStyleSurface.ts`) runs from </w:t>
+      </w:r>
+      <w:r>
+        <w:rPr>
+          <w:b/>
+          <w:bCs/>
+        </w:rPr>
+        <w:t xml:space="preserve">`runGoldenPath`</w:t>
+      </w:r>
+      <w:r>
+        <w:t xml:space="preserve"> </w:t>
+      </w:r>
+      <w:r>
+        <w:rPr>
+          <w:b/>
+          <w:bCs/>
+        </w:rPr>
+        <w:t xml:space="preserve">immediately after</w:t>
+      </w:r>
+      <w:r>
+        <w:t xml:space="preserve"> </w:t>
+      </w:r>
+      <w:r>
+        <w:rPr>
+          <w:b/>
+          <w:bCs/>
+        </w:rPr>
+        <w:t xml:space="preserve">`applyMonkStyleSurface`</w:t>
+      </w:r>
+      <w:r>
+        <w:t xml:space="preserve">: </w:t>
+      </w:r>
+      <w:r>
+        <w:rPr>
+          <w:b/>
+          <w:bCs/>
+        </w:rPr>
+        <w:t xml:space="preserve">`songwriterDensityBias +0.15`</w:t>
+      </w:r>
+      <w:r>
+        <w:t xml:space="preserve">, </w:t>
+      </w:r>
+      <w:r>
+        <w:rPr>
+          <w:b/>
+          <w:bCs/>
+        </w:rPr>
+        <w:t xml:space="preserve">`songwriterSyncopationBias +0.22`</w:t>
+      </w:r>
+      <w:r>
+        <w:t xml:space="preserve">, </w:t>
+      </w:r>
+      <w:r>
+        <w:rPr>
+          <w:b/>
+          <w:bCs/>
+        </w:rPr>
+        <w:t xml:space="preserve">`songwriterSpaceBias −0.10`</w:t>
+      </w:r>
+      <w:r>
+        <w:t xml:space="preserve">, </w:t>
+      </w:r>
+      <w:r>
+        <w:rPr>
+          <w:b/>
+          <w:bCs/>
+        </w:rPr>
+        <w:t xml:space="preserve">`songwriterCadenceSoftness +0.08`</w:t>
+      </w:r>
+      <w:r>
+        <w:t xml:space="preserve"> (clamped </w:t>
+      </w:r>
+      <w:r>
+        <w:rPr>
+          <w:b/>
+          <w:bCs/>
+        </w:rPr>
+        <w:t xml:space="preserve">0–1</w:t>
+      </w:r>
+      <w:r>
+        <w:t xml:space="preserve">). Stacks with groove / ECM / sophisticated-pop surfaces when those profiles also apply.</w:t>
+      </w:r>
+    </w:p>
+    <w:p>
+      <w:pPr>
+        <w:pStyle w:val="Heading3"/>
+        <w:spacing w:after="80" w:before="120"/>
+      </w:pPr>
+      <w:r>
+        <w:t xml:space="preserve">Example applications (jungle vs shout vs call/response)</w:t>
+      </w:r>
+    </w:p>
+    <w:p>
+      <w:pPr>
+        <w:spacing w:after="160"/>
+      </w:pPr>
+      <w:r>
+        <w:t xml:space="preserve">1. </w:t>
+      </w:r>
+      <w:r>
+        <w:rPr>
+          <w:b/>
+          <w:bCs/>
+        </w:rPr>
+        <w:t xml:space="preserve">Jungle growl only</w:t>
+      </w:r>
+      <w:r>
+        <w:t xml:space="preserve"> — Short form (</w:t>
+      </w:r>
+      <w:r>
+        <w:rPr>
+          <w:b/>
+          <w:bCs/>
+        </w:rPr>
+        <w:t xml:space="preserve">8 bars</w:t>
+      </w:r>
+      <w:r>
+        <w:t xml:space="preserve">); lock </w:t>
+      </w:r>
+      <w:r>
+        <w:rPr>
+          <w:b/>
+          <w:bCs/>
+        </w:rPr>
+        <w:t xml:space="preserve">seed</w:t>
+      </w:r>
+      <w:r>
+        <w:t xml:space="preserve"> until </w:t>
+      </w:r>
+      <w:r>
+        <w:rPr>
+          <w:b/>
+          <w:bCs/>
+        </w:rPr>
+        <w:t xml:space="preserve">`de:jungle_growl`</w:t>
+      </w:r>
+      <w:r>
+        <w:t xml:space="preserve"> appears on a </w:t>
+      </w:r>
+      <w:r>
+        <w:rPr>
+          <w:b/>
+          <w:bCs/>
+        </w:rPr>
+        <w:t xml:space="preserve">phraseStart</w:t>
+      </w:r>
+      <w:r>
+        <w:t xml:space="preserve"> bar; contrast with </w:t>
+      </w:r>
+      <w:r>
+        <w:rPr>
+          <w:b/>
+          <w:bCs/>
+        </w:rPr>
+        <w:t xml:space="preserve">adjacent</w:t>
+      </w:r>
+      <w:r>
+        <w:t xml:space="preserve"> phrase-start bars that stay </w:t>
+      </w:r>
+      <w:r>
+        <w:rPr>
+          <w:b/>
+          <w:bCs/>
+        </w:rPr>
+        <w:t xml:space="preserve">ungrowled</w:t>
+      </w:r>
+      <w:r>
+        <w:t xml:space="preserve"> when the </w:t>
+      </w:r>
+      <w:r>
+        <w:rPr>
+          <w:b/>
+          <w:bCs/>
+        </w:rPr>
+        <w:t xml:space="preserve">22%</w:t>
+      </w:r>
+      <w:r>
+        <w:t xml:space="preserve"> gate misses — teaches </w:t>
+      </w:r>
+      <w:r>
+        <w:rPr>
+          <w:b/>
+          <w:bCs/>
+        </w:rPr>
+        <w:t xml:space="preserve">phrase-entry</w:t>
+      </w:r>
+      <w:r>
+        <w:t xml:space="preserve"> colour vs middle-weight </w:t>
+      </w:r>
+      <w:r>
+        <w:rPr>
+          <w:b/>
+          <w:bCs/>
+        </w:rPr>
+        <w:t xml:space="preserve">extensions</w:t>
+      </w:r>
+      <w:r>
+        <w:t xml:space="preserve"> from stage 1 alone. 2. </w:t>
+      </w:r>
+      <w:r>
+        <w:rPr>
+          <w:b/>
+          <w:bCs/>
+        </w:rPr>
+        <w:t xml:space="preserve">Shout chorus only</w:t>
+      </w:r>
+      <w:r>
+        <w:t xml:space="preserve"> — </w:t>
+      </w:r>
+      <w:r>
+        <w:rPr>
+          <w:b/>
+          <w:bCs/>
+        </w:rPr>
+        <w:t xml:space="preserve">32-bar</w:t>
+      </w:r>
+      <w:r>
+        <w:t xml:space="preserve"> custom_locked or built-in long form; inspect </w:t>
+      </w:r>
+      <w:r>
+        <w:rPr>
+          <w:b/>
+          <w:bCs/>
+        </w:rPr>
+        <w:t xml:space="preserve">`ellingtonShoutBars`</w:t>
+      </w:r>
+      <w:r>
+        <w:t xml:space="preserve"> + </w:t>
+      </w:r>
+      <w:r>
+        <w:rPr>
+          <w:b/>
+          <w:bCs/>
+        </w:rPr>
+        <w:t xml:space="preserve">`de:shout@bar{N}`</w:t>
+      </w:r>
+      <w:r>
+        <w:t xml:space="preserve"> on the </w:t>
+      </w:r>
+      <w:r>
+        <w:rPr>
+          <w:b/>
+          <w:bCs/>
+        </w:rPr>
+        <w:t xml:space="preserve">last 8–16</w:t>
+      </w:r>
+      <w:r>
+        <w:t xml:space="preserve"> bars — </w:t>
+      </w:r>
+      <w:r>
+        <w:rPr>
+          <w:b/>
+          <w:bCs/>
+        </w:rPr>
+        <w:t xml:space="preserve">harmonic density</w:t>
+      </w:r>
+      <w:r>
+        <w:t xml:space="preserve"> spikes there (</w:t>
+      </w:r>
+      <w:r>
+        <w:rPr>
+          <w:b/>
+          <w:bCs/>
+        </w:rPr>
+        <w:t xml:space="preserve">maj9(#11)</w:t>
+      </w:r>
+      <w:r>
+        <w:t xml:space="preserve"> / </w:t>
+      </w:r>
+      <w:r>
+        <w:rPr>
+          <w:b/>
+          <w:bCs/>
+        </w:rPr>
+        <w:t xml:space="preserve">dom13</w:t>
+      </w:r>
+      <w:r>
+        <w:t xml:space="preserve"> / tonic-minor </w:t>
+      </w:r>
+      <w:r>
+        <w:rPr>
+          <w:b/>
+          <w:bCs/>
+        </w:rPr>
+        <w:t xml:space="preserve">m9</w:t>
+      </w:r>
+      <w:r>
+        <w:t xml:space="preserve">) while </w:t>
+      </w:r>
+      <w:r>
+        <w:rPr>
+          <w:b/>
+          <w:bCs/>
+        </w:rPr>
+        <w:t xml:space="preserve">earlier</w:t>
+      </w:r>
+      <w:r>
+        <w:t xml:space="preserve"> bars keep normal </w:t>
+      </w:r>
+      <w:r>
+        <w:rPr>
+          <w:b/>
+          <w:bCs/>
+        </w:rPr>
+        <w:t xml:space="preserve">de:</w:t>
+      </w:r>
+      <w:r>
+        <w:t xml:space="preserve"> mix — distinct from </w:t>
+      </w:r>
+      <w:r>
+        <w:rPr>
+          <w:b/>
+          <w:bCs/>
+        </w:rPr>
+        <w:t xml:space="preserve">jungle</w:t>
+      </w:r>
+      <w:r>
+        <w:t xml:space="preserve">, which fires on </w:t>
+      </w:r>
+      <w:r>
+        <w:rPr>
+          <w:b/>
+          <w:bCs/>
+        </w:rPr>
+        <w:t xml:space="preserve">phrase boundaries</w:t>
+      </w:r>
+      <w:r>
+        <w:t xml:space="preserve">, not </w:t>
+      </w:r>
+      <w:r>
+        <w:rPr>
+          <w:b/>
+          <w:bCs/>
+        </w:rPr>
+        <w:t xml:space="preserve">finale span</w:t>
+      </w:r>
+      <w:r>
+        <w:t xml:space="preserve">. 3. </w:t>
+      </w:r>
+      <w:r>
+        <w:rPr>
+          <w:b/>
+          <w:bCs/>
+        </w:rPr>
+        <w:t xml:space="preserve">Call / response narrative</w:t>
+      </w:r>
+      <w:r>
+        <w:t xml:space="preserve"> — Same seed: read </w:t>
+      </w:r>
+      <w:r>
+        <w:rPr>
+          <w:b/>
+          <w:bCs/>
+        </w:rPr>
+        <w:t xml:space="preserve">`ellingtonCallResponseMap`</w:t>
+      </w:r>
+      <w:r>
+        <w:t xml:space="preserve"> + </w:t>
+      </w:r>
+      <w:r>
+        <w:rPr>
+          <w:b/>
+          <w:bCs/>
+        </w:rPr>
+        <w:t xml:space="preserve">`de:call`</w:t>
+      </w:r>
+      <w:r>
+        <w:t xml:space="preserve"> / </w:t>
+      </w:r>
+      <w:r>
+        <w:rPr>
+          <w:b/>
+          <w:bCs/>
+        </w:rPr>
+        <w:t xml:space="preserve">`de:response`</w:t>
+      </w:r>
+      <w:r>
+        <w:t xml:space="preserve"> receipts (</w:t>
+      </w:r>
+      <w:r>
+        <w:rPr>
+          <w:b/>
+          <w:bCs/>
+        </w:rPr>
+        <w:t xml:space="preserve">60%</w:t>
+      </w:r>
+      <w:r>
+        <w:t xml:space="preserve"> of bars tagged in receipts); </w:t>
+      </w:r>
+      <w:r>
+        <w:rPr>
+          <w:b/>
+          <w:bCs/>
+        </w:rPr>
+        <w:t xml:space="preserve">odd/even</w:t>
+      </w:r>
+      <w:r>
+        <w:t xml:space="preserve"> structure is </w:t>
+      </w:r>
+      <w:r>
+        <w:rPr>
+          <w:b/>
+          <w:bCs/>
+        </w:rPr>
+        <w:t xml:space="preserve">always</w:t>
+      </w:r>
+      <w:r>
+        <w:t xml:space="preserve"> in the map even when a bar has </w:t>
+      </w:r>
+      <w:r>
+        <w:rPr>
+          <w:b/>
+          <w:bCs/>
+        </w:rPr>
+        <w:t xml:space="preserve">no</w:t>
+      </w:r>
+      <w:r>
+        <w:t xml:space="preserve"> receipt — use for </w:t>
+      </w:r>
+      <w:r>
+        <w:rPr>
+          <w:b/>
+          <w:bCs/>
+        </w:rPr>
+        <w:t xml:space="preserve">arrangement</w:t>
+      </w:r>
+      <w:r>
+        <w:t xml:space="preserve"> (answer fills, horn kicks) </w:t>
+      </w:r>
+      <w:r>
+        <w:rPr>
+          <w:b/>
+          <w:bCs/>
+        </w:rPr>
+        <w:t xml:space="preserve">without</w:t>
+      </w:r>
+      <w:r>
+        <w:t xml:space="preserve"> implying a different harmony row than </w:t>
+      </w:r>
+      <w:r>
+        <w:rPr>
+          <w:b/>
+          <w:bCs/>
+        </w:rPr>
+        <w:t xml:space="preserve">`dukeEllingtonEffectiveHarmonyBars`</w:t>
+      </w:r>
+      <w:r>
+        <w:t xml:space="preserve">. 4. </w:t>
+      </w:r>
+      <w:r>
+        <w:rPr>
+          <w:b/>
+          <w:bCs/>
+        </w:rPr>
+        <w:t xml:space="preserve">Jungle vs shout on one chart</w:t>
+      </w:r>
+      <w:r>
+        <w:t xml:space="preserve"> — </w:t>
+      </w:r>
+      <w:r>
+        <w:rPr>
+          <w:b/>
+          <w:bCs/>
+        </w:rPr>
+        <w:t xml:space="preserve">Phrase-start</w:t>
+      </w:r>
+      <w:r>
+        <w:t xml:space="preserve"> </w:t>
+      </w:r>
+      <w:r>
+        <w:rPr>
+          <w:b/>
+          <w:bCs/>
+        </w:rPr>
+        <w:t xml:space="preserve">`de:jungle_growl`</w:t>
+      </w:r>
+      <w:r>
+        <w:t xml:space="preserve"> can appear in </w:t>
+      </w:r>
+      <w:r>
+        <w:rPr>
+          <w:b/>
+          <w:bCs/>
+        </w:rPr>
+        <w:t xml:space="preserve">bars 1–24</w:t>
+      </w:r>
+      <w:r>
+        <w:t xml:space="preserve">; </w:t>
+      </w:r>
+      <w:r>
+        <w:rPr>
+          <w:b/>
+          <w:bCs/>
+        </w:rPr>
+        <w:t xml:space="preserve">`de:shout`</w:t>
+      </w:r>
+      <w:r>
+        <w:t xml:space="preserve"> clusters only in </w:t>
+      </w:r>
+      <w:r>
+        <w:rPr>
+          <w:b/>
+          <w:bCs/>
+        </w:rPr>
+        <w:t xml:space="preserve">`ellingtonShoutBars`</w:t>
+      </w:r>
+      <w:r>
+        <w:t xml:space="preserve"> — compare manifest: growl = </w:t>
+      </w:r>
+      <w:r>
+        <w:rPr>
+          <w:b/>
+          <w:bCs/>
+        </w:rPr>
+        <w:t xml:space="preserve">entry colour</w:t>
+      </w:r>
+      <w:r>
+        <w:t xml:space="preserve">; shout = </w:t>
+      </w:r>
+      <w:r>
+        <w:rPr>
+          <w:b/>
+          <w:bCs/>
+        </w:rPr>
+        <w:t xml:space="preserve">terminal orchestration</w:t>
+      </w:r>
+      <w:r>
+        <w:t xml:space="preserve"> lift (different </w:t>
+      </w:r>
+      <w:r>
+        <w:rPr>
+          <w:b/>
+          <w:bCs/>
+        </w:rPr>
+        <w:t xml:space="preserve">musical jobs</w:t>
+      </w:r>
+      <w:r>
+        <w:t xml:space="preserve">). 5. </w:t>
+      </w:r>
+      <w:r>
+        <w:rPr>
+          <w:b/>
+          <w:bCs/>
+        </w:rPr>
+        <w:t xml:space="preserve">Chromatic diminished bridge</w:t>
+      </w:r>
+      <w:r>
+        <w:t xml:space="preserve"> — Watch </w:t>
+      </w:r>
+      <w:r>
+        <w:rPr>
+          <w:b/>
+          <w:bCs/>
+        </w:rPr>
+        <w:t xml:space="preserve">`de:chrom_dim`</w:t>
+      </w:r>
+      <w:r>
+        <w:t xml:space="preserve"> on the bar </w:t>
+      </w:r>
+      <w:r>
+        <w:rPr>
+          <w:b/>
+          <w:bCs/>
+        </w:rPr>
+        <w:t xml:space="preserve">before</w:t>
+      </w:r>
+      <w:r>
+        <w:t xml:space="preserve"> </w:t>
+      </w:r>
+      <w:r>
+        <w:rPr>
+          <w:b/>
+          <w:bCs/>
+        </w:rPr>
+        <w:t xml:space="preserve">`phraseFinal`</w:t>
+      </w:r>
+      <w:r>
+        <w:t xml:space="preserve"> tonic (</w:t>
+      </w:r>
+      <w:r>
+        <w:rPr>
+          <w:b/>
+          <w:bCs/>
+        </w:rPr>
+        <w:t xml:space="preserve">CT°7</w:t>
+      </w:r>
+      <w:r>
+        <w:t xml:space="preserve"> approach); pair with </w:t>
+      </w:r>
+      <w:r>
+        <w:rPr>
+          <w:b/>
+          <w:bCs/>
+        </w:rPr>
+        <w:t xml:space="preserve">custom_locked</w:t>
+      </w:r>
+      <w:r>
+        <w:t xml:space="preserve"> bridge bars to hear </w:t>
+      </w:r>
+      <w:r>
+        <w:rPr>
+          <w:b/>
+          <w:bCs/>
+        </w:rPr>
+        <w:t xml:space="preserve">dim → tonic</w:t>
+      </w:r>
+      <w:r>
+        <w:t xml:space="preserve"> vs </w:t>
+      </w:r>
+      <w:r>
+        <w:rPr>
+          <w:b/>
+          <w:bCs/>
+        </w:rPr>
+        <w:t xml:space="preserve">Evans</w:t>
+      </w:r>
+      <w:r>
+        <w:t xml:space="preserve"> </w:t>
+      </w:r>
+      <w:r>
+        <w:rPr>
+          <w:b/>
+          <w:bCs/>
+        </w:rPr>
+        <w:t xml:space="preserve">`be:dim_delayed_res`</w:t>
+      </w:r>
+      <w:r>
+        <w:t xml:space="preserve"> (different phrase logic). 6. </w:t>
+      </w:r>
+      <w:r>
+        <w:rPr>
+          <w:b/>
+          <w:bCs/>
+        </w:rPr>
+        <w:t xml:space="preserve">Parallel planing sustain</w:t>
+      </w:r>
+      <w:r>
+        <w:t xml:space="preserve"> — Hold </w:t>
+      </w:r>
+      <w:r>
+        <w:rPr>
+          <w:b/>
+          <w:bCs/>
+        </w:rPr>
+        <w:t xml:space="preserve">tonic</w:t>
+      </w:r>
+      <w:r>
+        <w:t xml:space="preserve"> across </w:t>
+      </w:r>
+      <w:r>
+        <w:rPr>
+          <w:b/>
+          <w:bCs/>
+        </w:rPr>
+        <w:t xml:space="preserve">two</w:t>
+      </w:r>
+      <w:r>
+        <w:t xml:space="preserve"> bars, then check </w:t>
+      </w:r>
+      <w:r>
+        <w:rPr>
+          <w:b/>
+          <w:bCs/>
+        </w:rPr>
+        <w:t xml:space="preserve">`de:planing`</w:t>
+      </w:r>
+      <w:r>
+        <w:t xml:space="preserve"> (</w:t>
+      </w:r>
+      <w:r>
+        <w:rPr>
+          <w:b/>
+          <w:bCs/>
+        </w:rPr>
+        <w:t xml:space="preserve">slash</w:t>
+      </w:r>
+      <w:r>
+        <w:t xml:space="preserve"> upper stack vs pedal bass) — teaches </w:t>
+      </w:r>
+      <w:r>
+        <w:rPr>
+          <w:b/>
+          <w:bCs/>
+        </w:rPr>
+        <w:t xml:space="preserve">half-step deck</w:t>
+      </w:r>
+      <w:r>
+        <w:t xml:space="preserve"> colour distinct from </w:t>
+      </w:r>
+      <w:r>
+        <w:rPr>
+          <w:b/>
+          <w:bCs/>
+        </w:rPr>
+        <w:t xml:space="preserve">shout</w:t>
+      </w:r>
+      <w:r>
+        <w:t xml:space="preserve"> (no requirement for </w:t>
+      </w:r>
+      <w:r>
+        <w:rPr>
+          <w:b/>
+          <w:bCs/>
+        </w:rPr>
+        <w:t xml:space="preserve">maj9(#11)</w:t>
+      </w:r>
+      <w:r>
+        <w:t xml:space="preserve">) and from </w:t>
+      </w:r>
+      <w:r>
+        <w:rPr>
+          <w:b/>
+          <w:bCs/>
+        </w:rPr>
+        <w:t xml:space="preserve">call/response</w:t>
+      </w:r>
+      <w:r>
+        <w:t xml:space="preserve"> (purely horizontal register motion).</w:t>
       </w:r>
     </w:p>
     <w:p>

</xml_diff>

<commit_message>
docs: Maria Schneider handbook section + roadmap complete
Co-authored-by: Cursor <cursoragent@cursor.com>
</commit_message>
<xml_diff>
--- a/docs/COMPOSER_OS_PLAYBOOK.docx
+++ b/docs/COMPOSER_OS_PLAYBOOK.docx
@@ -2598,7 +2598,7 @@
         <w:spacing w:after="100" w:before="160"/>
       </w:pPr>
       <w:r>
-        <w:t xml:space="preserve">Per-composer profile table (34 research rows)</w:t>
+        <w:t xml:space="preserve">Per-composer profile table (35 research rows)</w:t>
       </w:r>
     </w:p>
     <w:tbl>
@@ -5422,7 +5422,7 @@
               <w:spacing w:after="60"/>
             </w:pPr>
             <w:r>
-              <w:t xml:space="preserve">`holland_dozier_holland`</w:t>
+              <w:t xml:space="preserve">`maria_schneider`</w:t>
             </w:r>
           </w:p>
         </w:tc>
@@ -5448,7 +5448,7 @@
               <w:spacing w:after="60"/>
             </w:pPr>
             <w:r>
-              <w:t xml:space="preserve">eighth_patterns</w:t>
+              <w:t xml:space="preserve">mixed</w:t>
             </w:r>
           </w:p>
         </w:tc>
@@ -5461,7 +5461,7 @@
               <w:spacing w:after="60"/>
             </w:pPr>
             <w:r>
-              <w:t xml:space="preserve">2</w:t>
+              <w:t xml:space="preserve">7</w:t>
             </w:r>
           </w:p>
         </w:tc>
@@ -5474,7 +5474,7 @@
               <w:spacing w:after="60"/>
             </w:pPr>
             <w:r>
-              <w:t xml:space="preserve">0.7</w:t>
+              <w:t xml:space="preserve">0.85</w:t>
             </w:r>
           </w:p>
         </w:tc>
@@ -5487,7 +5487,7 @@
               <w:spacing w:after="60"/>
             </w:pPr>
             <w:r>
-              <w:t xml:space="preserve">rising</w:t>
+              <w:t xml:space="preserve">arch</w:t>
             </w:r>
           </w:p>
         </w:tc>
@@ -5500,7 +5500,7 @@
               <w:spacing w:after="60"/>
             </w:pPr>
             <w:r>
-              <w:t xml:space="preserve">call_response_hook; repeated_title_phrase; tambourine_anticipation; backing_vocal_echo</w:t>
+              <w:t xml:space="preserve">sparse_phrase; modal_field; breath_space; nature_arc; chamber_texture</w:t>
             </w:r>
           </w:p>
         </w:tc>
@@ -5515,7 +5515,7 @@
               <w:spacing w:after="60"/>
             </w:pPr>
             <w:r>
-              <w:t xml:space="preserve">`jeff_lynne`</w:t>
+              <w:t xml:space="preserve">`holland_dozier_holland`</w:t>
             </w:r>
           </w:p>
         </w:tc>
@@ -5541,7 +5541,7 @@
               <w:spacing w:after="60"/>
             </w:pPr>
             <w:r>
-              <w:t xml:space="preserve">mixed</w:t>
+              <w:t xml:space="preserve">eighth_patterns</w:t>
             </w:r>
           </w:p>
         </w:tc>
@@ -5554,7 +5554,7 @@
               <w:spacing w:after="60"/>
             </w:pPr>
             <w:r>
-              <w:t xml:space="preserve">4</w:t>
+              <w:t xml:space="preserve">2</w:t>
             </w:r>
           </w:p>
         </w:tc>
@@ -5567,7 +5567,7 @@
               <w:spacing w:after="60"/>
             </w:pPr>
             <w:r>
-              <w:t xml:space="preserve">0.6</w:t>
+              <w:t xml:space="preserve">0.7</w:t>
             </w:r>
           </w:p>
         </w:tc>
@@ -5580,7 +5580,7 @@
               <w:spacing w:after="60"/>
             </w:pPr>
             <w:r>
-              <w:t xml:space="preserve">arch</w:t>
+              <w:t xml:space="preserve">rising</w:t>
             </w:r>
           </w:p>
         </w:tc>
@@ -5593,7 +5593,7 @@
               <w:spacing w:after="60"/>
             </w:pPr>
             <w:r>
-              <w:t xml:space="preserve">stacked_harmony_hook; octave_doubled_melody; string_countermelody; descending_bass_hook</w:t>
+              <w:t xml:space="preserve">call_response_hook; repeated_title_phrase; tambourine_anticipation; backing_vocal_echo</w:t>
             </w:r>
           </w:p>
         </w:tc>
@@ -5608,7 +5608,7 @@
               <w:spacing w:after="60"/>
             </w:pPr>
             <w:r>
-              <w:t xml:space="preserve">`jeff_tweedy`</w:t>
+              <w:t xml:space="preserve">`jeff_lynne`</w:t>
             </w:r>
           </w:p>
         </w:tc>
@@ -5660,7 +5660,7 @@
               <w:spacing w:after="60"/>
             </w:pPr>
             <w:r>
-              <w:t xml:space="preserve">0.7</w:t>
+              <w:t xml:space="preserve">0.6</w:t>
             </w:r>
           </w:p>
         </w:tc>
@@ -5673,7 +5673,7 @@
               <w:spacing w:after="60"/>
             </w:pPr>
             <w:r>
-              <w:t xml:space="preserve">flat</w:t>
+              <w:t xml:space="preserve">arch</w:t>
             </w:r>
           </w:p>
         </w:tc>
@@ -5686,7 +5686,7 @@
               <w:spacing w:after="60"/>
             </w:pPr>
             <w:r>
-              <w:t xml:space="preserve">deadpan_repeated_note; modal_bVII; unresolved_suspension; folk_drone; understated_chorus</w:t>
+              <w:t xml:space="preserve">stacked_harmony_hook; octave_doubled_melody; string_countermelody; descending_bass_hook</w:t>
             </w:r>
           </w:p>
         </w:tc>
@@ -5701,7 +5701,7 @@
               <w:spacing w:after="60"/>
             </w:pPr>
             <w:r>
-              <w:t xml:space="preserve">`kendrick_lamar`</w:t>
+              <w:t xml:space="preserve">`jeff_tweedy`</w:t>
             </w:r>
           </w:p>
         </w:tc>
@@ -5727,7 +5727,7 @@
               <w:spacing w:after="60"/>
             </w:pPr>
             <w:r>
-              <w:t xml:space="preserve">eighth_patterns</w:t>
+              <w:t xml:space="preserve">mixed</w:t>
             </w:r>
           </w:p>
         </w:tc>
@@ -5740,7 +5740,7 @@
               <w:spacing w:after="60"/>
             </w:pPr>
             <w:r>
-              <w:t xml:space="preserve">3</w:t>
+              <w:t xml:space="preserve">4</w:t>
             </w:r>
           </w:p>
         </w:tc>
@@ -5753,7 +5753,7 @@
               <w:spacing w:after="60"/>
             </w:pPr>
             <w:r>
-              <w:t xml:space="preserve">0.5</w:t>
+              <w:t xml:space="preserve">0.7</w:t>
             </w:r>
           </w:p>
         </w:tc>
@@ -5766,7 +5766,7 @@
               <w:spacing w:after="60"/>
             </w:pPr>
             <w:r>
-              <w:t xml:space="preserve">speech_contour</w:t>
+              <w:t xml:space="preserve">flat</w:t>
             </w:r>
           </w:p>
         </w:tc>
@@ -5779,7 +5779,7 @@
               <w:spacing w:after="60"/>
             </w:pPr>
             <w:r>
-              <w:t xml:space="preserve">flow_modulation; syllabic_ostinato; pitch_zone_contrast; barline_displacement; triplet_switch</w:t>
+              <w:t xml:space="preserve">deadpan_repeated_note; modal_bVII; unresolved_suspension; folk_drone; understated_chorus</w:t>
             </w:r>
           </w:p>
         </w:tc>
@@ -5794,6 +5794,99 @@
               <w:spacing w:after="60"/>
             </w:pPr>
             <w:r>
+              <w:t xml:space="preserve">`kendrick_lamar`</w:t>
+            </w:r>
+          </w:p>
+        </w:tc>
+        <w:tc>
+          <w:tcPr>
+            <w:tcW w:type="pct" w:w="1285%"/>
+          </w:tcPr>
+          <w:p>
+            <w:pPr>
+              <w:spacing w:after="60"/>
+            </w:pPr>
+            <w:r>
+              <w:t xml:space="preserve">stepwise</w:t>
+            </w:r>
+          </w:p>
+        </w:tc>
+        <w:tc>
+          <w:tcPr>
+            <w:tcW w:type="pct" w:w="1285%"/>
+          </w:tcPr>
+          <w:p>
+            <w:pPr>
+              <w:spacing w:after="60"/>
+            </w:pPr>
+            <w:r>
+              <w:t xml:space="preserve">eighth_patterns</w:t>
+            </w:r>
+          </w:p>
+        </w:tc>
+        <w:tc>
+          <w:tcPr>
+            <w:tcW w:type="pct" w:w="1285%"/>
+          </w:tcPr>
+          <w:p>
+            <w:pPr>
+              <w:spacing w:after="60"/>
+            </w:pPr>
+            <w:r>
+              <w:t xml:space="preserve">3</w:t>
+            </w:r>
+          </w:p>
+        </w:tc>
+        <w:tc>
+          <w:tcPr>
+            <w:tcW w:type="pct" w:w="1285%"/>
+          </w:tcPr>
+          <w:p>
+            <w:pPr>
+              <w:spacing w:after="60"/>
+            </w:pPr>
+            <w:r>
+              <w:t xml:space="preserve">0.5</w:t>
+            </w:r>
+          </w:p>
+        </w:tc>
+        <w:tc>
+          <w:tcPr>
+            <w:tcW w:type="pct" w:w="1285%"/>
+          </w:tcPr>
+          <w:p>
+            <w:pPr>
+              <w:spacing w:after="60"/>
+            </w:pPr>
+            <w:r>
+              <w:t xml:space="preserve">speech_contour</w:t>
+            </w:r>
+          </w:p>
+        </w:tc>
+        <w:tc>
+          <w:tcPr>
+            <w:tcW w:type="pct" w:w="1285%"/>
+          </w:tcPr>
+          <w:p>
+            <w:pPr>
+              <w:spacing w:after="60"/>
+            </w:pPr>
+            <w:r>
+              <w:t xml:space="preserve">flow_modulation; syllabic_ostinato; pitch_zone_contrast; barline_displacement; triplet_switch</w:t>
+            </w:r>
+          </w:p>
+        </w:tc>
+      </w:tr>
+      <w:tr>
+        <w:tc>
+          <w:tcPr>
+            <w:tcW w:type="pct" w:w="1285%"/>
+          </w:tcPr>
+          <w:p>
+            <w:pPr>
+              <w:spacing w:after="60"/>
+            </w:pPr>
+            <w:r>
               <w:t xml:space="preserve">`kurt_weill`</w:t>
             </w:r>
           </w:p>
@@ -5934,7 +6027,7 @@
         <w:t xml:space="preserve">`MELODY_PROFILES`</w:t>
       </w:r>
       <w:r>
-        <w:t xml:space="preserve"> cardinality (≥34 keys), distinct </w:t>
+        <w:t xml:space="preserve"> cardinality (≥35 keys), distinct </w:t>
       </w:r>
       <w:r>
         <w:rPr>
@@ -6734,6 +6827,1822 @@
           <w:bCs/>
         </w:rPr>
         <w:t xml:space="preserve">`songwriterStyleResolver.ts`</w:t>
+      </w:r>
+      <w:r>
+        <w:t xml:space="preserve">.</w:t>
+      </w:r>
+    </w:p>
+    <w:p>
+      <w:pPr>
+        <w:pStyle w:val="Heading1"/>
+        <w:spacing w:after="120" w:before="200"/>
+      </w:pPr>
+      <w:r>
+        <w:t xml:space="preserve">Maria Schneider (`maria_schneider`) — Song Mode harmony slice</w:t>
+      </w:r>
+    </w:p>
+    <w:p>
+      <w:pPr>
+        <w:spacing w:after="160"/>
+      </w:pPr>
+      <w:r>
+        <w:t xml:space="preserve">Primary songwriter </w:t>
+      </w:r>
+      <w:r>
+        <w:rPr>
+          <w:b/>
+          <w:bCs/>
+        </w:rPr>
+        <w:t xml:space="preserve">`maria_schneider`</w:t>
+      </w:r>
+      <w:r>
+        <w:t xml:space="preserve"> runs </w:t>
+      </w:r>
+      <w:r>
+        <w:rPr>
+          <w:b/>
+          <w:bCs/>
+        </w:rPr>
+        <w:t xml:space="preserve">`mariaSchneiderSlice.ts`</w:t>
+      </w:r>
+      <w:r>
+        <w:t xml:space="preserve"> on the golden-path duo harmony timeline (same locked-export authority pattern as other full slices): </w:t>
+      </w:r>
+      <w:r>
+        <w:rPr>
+          <w:b/>
+          <w:bCs/>
+        </w:rPr>
+        <w:t xml:space="preserve">`precomputeMariaSchneiderEffectiveHarmonyBars`</w:t>
+      </w:r>
+      <w:r>
+        <w:t xml:space="preserve"> → </w:t>
+      </w:r>
+      <w:r>
+        <w:rPr>
+          <w:b/>
+          <w:bCs/>
+        </w:rPr>
+        <w:t xml:space="preserve">`mariaSchneiderEffectiveHarmonyBars`</w:t>
+      </w:r>
+      <w:r>
+        <w:t xml:space="preserve"> for </w:t>
+      </w:r>
+      <w:r>
+        <w:rPr>
+          <w:b/>
+          <w:bCs/>
+        </w:rPr>
+        <w:t xml:space="preserve">`getChordForBar`</w:t>
+      </w:r>
+      <w:r>
+        <w:t xml:space="preserve">, </w:t>
+      </w:r>
+      <w:r>
+        <w:rPr>
+          <w:b/>
+          <w:bCs/>
+        </w:rPr>
+        <w:t xml:space="preserve">`customLockedHarmonyRouting`</w:t>
+      </w:r>
+      <w:r>
+        <w:t xml:space="preserve">, </w:t>
+      </w:r>
+      <w:r>
+        <w:rPr>
+          <w:b/>
+          <w:bCs/>
+        </w:rPr>
+        <w:t xml:space="preserve">`runGoldenPath`</w:t>
+      </w:r>
+      <w:r>
+        <w:t xml:space="preserve"> disk/export truth, </w:t>
+      </w:r>
+      <w:r>
+        <w:rPr>
+          <w:b/>
+          <w:bCs/>
+        </w:rPr>
+        <w:t xml:space="preserve">`composerOsAppGeneration`</w:t>
+      </w:r>
+      <w:r>
+        <w:t xml:space="preserve">. Receipts are prefixed </w:t>
+      </w:r>
+      <w:r>
+        <w:rPr>
+          <w:b/>
+          <w:bCs/>
+        </w:rPr>
+        <w:t xml:space="preserve">`ms:`</w:t>
+      </w:r>
+      <w:r>
+        <w:t xml:space="preserve">.</w:t>
+      </w:r>
+    </w:p>
+    <w:p>
+      <w:pPr>
+        <w:pStyle w:val="Heading2"/>
+        <w:spacing w:after="100" w:before="160"/>
+      </w:pPr>
+      <w:r>
+        <w:t xml:space="preserve">Phrase grid</w:t>
+      </w:r>
+    </w:p>
+    <w:p>
+      <w:pPr>
+        <w:spacing w:after="160"/>
+      </w:pPr>
+      <w:r>
+        <w:rPr>
+          <w:b/>
+          <w:bCs/>
+        </w:rPr>
+        <w:t xml:space="preserve">`computeSchneiderPhrasePositions`</w:t>
+      </w:r>
+      <w:r>
+        <w:t xml:space="preserve"> assigns each bar </w:t>
+      </w:r>
+      <w:r>
+        <w:rPr>
+          <w:b/>
+          <w:bCs/>
+        </w:rPr>
+        <w:t xml:space="preserve">`phraseStart` | `phraseMiddle` | `phraseFinal`</w:t>
+      </w:r>
+      <w:r>
+        <w:t xml:space="preserve"> from rolling phrase lengths </w:t>
+      </w:r>
+      <w:r>
+        <w:rPr>
+          <w:b/>
+          <w:bCs/>
+        </w:rPr>
+        <w:t xml:space="preserve">4 / 6 / 8 / 5 / 7 / 9</w:t>
+      </w:r>
+      <w:r>
+        <w:t xml:space="preserve"> bars at weights </w:t>
+      </w:r>
+      <w:r>
+        <w:rPr>
+          <w:b/>
+          <w:bCs/>
+        </w:rPr>
+        <w:t xml:space="preserve">28% / 22% / 22% / 14% / 9% / 5%</w:t>
+      </w:r>
+      <w:r>
+        <w:t xml:space="preserve">. Device </w:t>
+      </w:r>
+      <w:r>
+        <w:rPr>
+          <w:b/>
+          <w:bCs/>
+        </w:rPr>
+        <w:t xml:space="preserve">d5</w:t>
+      </w:r>
+      <w:r>
+        <w:t xml:space="preserve"> (`planing`) keys off </w:t>
+      </w:r>
+      <w:r>
+        <w:rPr>
+          <w:b/>
+          <w:bCs/>
+        </w:rPr>
+        <w:t xml:space="preserve">`phraseMiddle`</w:t>
+      </w:r>
+      <w:r>
+        <w:t xml:space="preserve">; </w:t>
+      </w:r>
+      <w:r>
+        <w:rPr>
+          <w:b/>
+          <w:bCs/>
+        </w:rPr>
+        <w:t xml:space="preserve">d4</w:t>
+      </w:r>
+      <w:r>
+        <w:t xml:space="preserve"> (`color_stack`) keys off </w:t>
+      </w:r>
+      <w:r>
+        <w:rPr>
+          <w:b/>
+          <w:bCs/>
+        </w:rPr>
+        <w:t xml:space="preserve">`phraseFinal`</w:t>
+      </w:r>
+      <w:r>
+        <w:t xml:space="preserve"> (lead-sheet “tutti weight” on phrase cadences, not a literal ensemble flag).</w:t>
+      </w:r>
+    </w:p>
+    <w:p>
+      <w:pPr>
+        <w:pStyle w:val="Heading2"/>
+        <w:spacing w:after="100" w:before="160"/>
+      </w:pPr>
+      <w:r>
+        <w:t xml:space="preserve">Stage 1 — bare-symbol enrichment (no receipts)</w:t>
+      </w:r>
+    </w:p>
+    <w:p>
+      <w:pPr>
+        <w:spacing w:after="160"/>
+      </w:pPr>
+      <w:r>
+        <w:t xml:space="preserve">Applied before the </w:t>
+      </w:r>
+      <w:r>
+        <w:rPr>
+          <w:b/>
+          <w:bCs/>
+        </w:rPr>
+        <w:t xml:space="preserve">`ms:*`</w:t>
+      </w:r>
+      <w:r>
+        <w:t xml:space="preserve"> passes:</w:t>
+      </w:r>
+    </w:p>
+    <w:p>
+      <w:pPr>
+        <w:spacing w:after="80"/>
+        <w:ind w:left="360" w:hanging="260"/>
+      </w:pPr>
+      <w:r>
+        <w:t xml:space="preserve">• </w:t>
+      </w:r>
+      <w:r>
+        <w:rPr>
+          <w:b/>
+          <w:bCs/>
+        </w:rPr>
+        <w:t xml:space="preserve">Tonic (bare major on the inferred tonic PC):</w:t>
+      </w:r>
+      <w:r>
+        <w:t xml:space="preserve"> </w:t>
+      </w:r>
+      <w:r>
+        <w:rPr>
+          <w:b/>
+          <w:bCs/>
+        </w:rPr>
+        <w:t xml:space="preserve">maj9(#11)</w:t>
+      </w:r>
+      <w:r>
+        <w:t xml:space="preserve"> 45%, </w:t>
+      </w:r>
+      <w:r>
+        <w:rPr>
+          <w:b/>
+          <w:bCs/>
+        </w:rPr>
+        <w:t xml:space="preserve">maj13(#11)</w:t>
+      </w:r>
+      <w:r>
+        <w:t xml:space="preserve"> 25%, </w:t>
+      </w:r>
+      <w:r>
+        <w:rPr>
+          <w:b/>
+          <w:bCs/>
+        </w:rPr>
+        <w:t xml:space="preserve">maj7(#11)</w:t>
+      </w:r>
+      <w:r>
+        <w:t xml:space="preserve"> 20%, </w:t>
+      </w:r>
+      <w:r>
+        <w:rPr>
+          <w:b/>
+          <w:bCs/>
+        </w:rPr>
+        <w:t xml:space="preserve">6/9(#11)</w:t>
+      </w:r>
+      <w:r>
+        <w:t xml:space="preserve"> 10%.</w:t>
+      </w:r>
+    </w:p>
+    <w:p>
+      <w:pPr>
+        <w:spacing w:after="80"/>
+        <w:ind w:left="360" w:hanging="260"/>
+      </w:pPr>
+      <w:r>
+        <w:t xml:space="preserve">• </w:t>
+      </w:r>
+      <w:r>
+        <w:rPr>
+          <w:b/>
+          <w:bCs/>
+        </w:rPr>
+        <w:t xml:space="preserve">Dominant (plain dom7 family):</w:t>
+      </w:r>
+      <w:r>
+        <w:t xml:space="preserve"> </w:t>
+      </w:r>
+      <w:r>
+        <w:rPr>
+          <w:b/>
+          <w:bCs/>
+        </w:rPr>
+        <w:t xml:space="preserve">7(b9,#11,13)</w:t>
+      </w:r>
+      <w:r>
+        <w:t xml:space="preserve"> (Lydian dominant colour) 45%, </w:t>
+      </w:r>
+      <w:r>
+        <w:rPr>
+          <w:b/>
+          <w:bCs/>
+        </w:rPr>
+        <w:t xml:space="preserve">7alt</w:t>
+      </w:r>
+      <w:r>
+        <w:t xml:space="preserve"> 30%, </w:t>
+      </w:r>
+      <w:r>
+        <w:rPr>
+          <w:b/>
+          <w:bCs/>
+        </w:rPr>
+        <w:t xml:space="preserve">9(#11)</w:t>
+      </w:r>
+      <w:r>
+        <w:t xml:space="preserve"> 25%.</w:t>
+      </w:r>
+    </w:p>
+    <w:p>
+      <w:pPr>
+        <w:spacing w:after="80"/>
+        <w:ind w:left="360" w:hanging="260"/>
+      </w:pPr>
+      <w:r>
+        <w:t xml:space="preserve">• </w:t>
+      </w:r>
+      <w:r>
+        <w:rPr>
+          <w:b/>
+          <w:bCs/>
+        </w:rPr>
+        <w:t xml:space="preserve">Minor (bare minor triad / bare m7):</w:t>
+      </w:r>
+      <w:r>
+        <w:t xml:space="preserve"> </w:t>
+      </w:r>
+      <w:r>
+        <w:rPr>
+          <w:b/>
+          <w:bCs/>
+        </w:rPr>
+        <w:t xml:space="preserve">m(maj7)</w:t>
+      </w:r>
+      <w:r>
+        <w:t xml:space="preserve"> 30%, </w:t>
+      </w:r>
+      <w:r>
+        <w:rPr>
+          <w:b/>
+          <w:bCs/>
+        </w:rPr>
+        <w:t xml:space="preserve">m7(b6)</w:t>
+      </w:r>
+      <w:r>
+        <w:t xml:space="preserve"> 25%, </w:t>
+      </w:r>
+      <w:r>
+        <w:rPr>
+          <w:b/>
+          <w:bCs/>
+        </w:rPr>
+        <w:t xml:space="preserve">m9</w:t>
+      </w:r>
+      <w:r>
+        <w:t xml:space="preserve"> 25%, </w:t>
+      </w:r>
+      <w:r>
+        <w:rPr>
+          <w:b/>
+          <w:bCs/>
+        </w:rPr>
+        <w:t xml:space="preserve">m11</w:t>
+      </w:r>
+      <w:r>
+        <w:t xml:space="preserve"> 20%.</w:t>
+      </w:r>
+    </w:p>
+    <w:p>
+      <w:pPr>
+        <w:pStyle w:val="Heading2"/>
+        <w:spacing w:after="100" w:before="160"/>
+      </w:pPr>
+      <w:r>
+        <w:t xml:space="preserve">Stage 2 — harmonic devices (receipts)</w:t>
+      </w:r>
+    </w:p>
+    <w:tbl>
+      <w:tblPr>
+        <w:tblW w:type="pct" w:w="100%"/>
+        <w:tblBorders>
+          <w:top w:val="single" w:color="auto" w:sz="4"/>
+          <w:left w:val="single" w:color="auto" w:sz="4"/>
+          <w:bottom w:val="single" w:color="auto" w:sz="4"/>
+          <w:right w:val="single" w:color="auto" w:sz="4"/>
+          <w:insideH w:val="single" w:color="auto" w:sz="4"/>
+          <w:insideV w:val="single" w:color="auto" w:sz="4"/>
+        </w:tblBorders>
+      </w:tblPr>
+      <w:tblGrid>
+        <w:gridCol w:w="1800"/>
+        <w:gridCol w:w="1800"/>
+        <w:gridCol w:w="1800"/>
+        <w:gridCol w:w="1800"/>
+        <w:gridCol w:w="1800"/>
+      </w:tblGrid>
+      <w:tr>
+        <w:tc>
+          <w:tcPr>
+            <w:tcW w:type="pct" w:w="1800%"/>
+          </w:tcPr>
+          <w:p>
+            <w:pPr>
+              <w:spacing w:after="60"/>
+            </w:pPr>
+            <w:r>
+              <w:t xml:space="preserve">Id</w:t>
+            </w:r>
+          </w:p>
+        </w:tc>
+        <w:tc>
+          <w:tcPr>
+            <w:tcW w:type="pct" w:w="1800%"/>
+          </w:tcPr>
+          <w:p>
+            <w:pPr>
+              <w:spacing w:after="60"/>
+            </w:pPr>
+            <w:r>
+              <w:t xml:space="preserve">Pass</w:t>
+            </w:r>
+          </w:p>
+        </w:tc>
+        <w:tc>
+          <w:tcPr>
+            <w:tcW w:type="pct" w:w="1800%"/>
+          </w:tcPr>
+          <w:p>
+            <w:pPr>
+              <w:spacing w:after="60"/>
+            </w:pPr>
+            <w:r>
+              <w:t xml:space="preserve">Rate / gate</w:t>
+            </w:r>
+          </w:p>
+        </w:tc>
+        <w:tc>
+          <w:tcPr>
+            <w:tcW w:type="pct" w:w="1800%"/>
+          </w:tcPr>
+          <w:p>
+            <w:pPr>
+              <w:spacing w:after="60"/>
+            </w:pPr>
+            <w:r>
+              <w:t xml:space="preserve">Receipt</w:t>
+            </w:r>
+          </w:p>
+        </w:tc>
+        <w:tc>
+          <w:tcPr>
+            <w:tcW w:type="pct" w:w="1800%"/>
+          </w:tcPr>
+          <w:p>
+            <w:pPr>
+              <w:spacing w:after="60"/>
+            </w:pPr>
+            <w:r>
+              <w:t xml:space="preserve">Metadata</w:t>
+            </w:r>
+          </w:p>
+        </w:tc>
+      </w:tr>
+      <w:tr>
+        <w:tc>
+          <w:tcPr>
+            <w:tcW w:type="pct" w:w="1800%"/>
+          </w:tcPr>
+          <w:p>
+            <w:pPr>
+              <w:spacing w:after="60"/>
+            </w:pPr>
+            <w:r>
+              <w:rPr>
+                <w:b/>
+                <w:bCs/>
+              </w:rPr>
+              <w:t xml:space="preserve">d1</w:t>
+            </w:r>
+          </w:p>
+        </w:tc>
+        <w:tc>
+          <w:tcPr>
+            <w:tcW w:type="pct" w:w="1800%"/>
+          </w:tcPr>
+          <w:p>
+            <w:pPr>
+              <w:spacing w:after="60"/>
+            </w:pPr>
+            <w:r>
+              <w:rPr>
+                <w:b/>
+                <w:bCs/>
+              </w:rPr>
+              <w:t xml:space="preserve">`applyLydianModalCenterPass`</w:t>
+            </w:r>
+          </w:p>
+        </w:tc>
+        <w:tc>
+          <w:tcPr>
+            <w:tcW w:type="pct" w:w="1800%"/>
+          </w:tcPr>
+          <w:p>
+            <w:pPr>
+              <w:spacing w:after="60"/>
+            </w:pPr>
+            <w:r>
+              <w:rPr>
+                <w:b/>
+                <w:bCs/>
+              </w:rPr>
+              <w:t xml:space="preserve">35%</w:t>
+            </w:r>
+            <w:r>
+              <w:t xml:space="preserve"> of eligible bars (`1 − 0.65`); all bars; maj7/maj9/maj13 tonic colours get </w:t>
+            </w:r>
+            <w:r>
+              <w:rPr>
+                <w:b/>
+                <w:bCs/>
+              </w:rPr>
+              <w:t xml:space="preserve">#11</w:t>
+            </w:r>
+            <w:r>
+              <w:t xml:space="preserve"> if absent</w:t>
+            </w:r>
+          </w:p>
+        </w:tc>
+        <w:tc>
+          <w:tcPr>
+            <w:tcW w:type="pct" w:w="1800%"/>
+          </w:tcPr>
+          <w:p>
+            <w:pPr>
+              <w:spacing w:after="60"/>
+            </w:pPr>
+            <w:r>
+              <w:rPr>
+                <w:b/>
+                <w:bCs/>
+              </w:rPr>
+              <w:t xml:space="preserve">`ms:lyd_center@bar{N}`</w:t>
+            </w:r>
+          </w:p>
+        </w:tc>
+        <w:tc>
+          <w:tcPr>
+            <w:tcW w:type="pct" w:w="1800%"/>
+          </w:tcPr>
+          <w:p>
+            <w:pPr>
+              <w:spacing w:after="60"/>
+            </w:pPr>
+            <w:r>
+              <w:t xml:space="preserve">—</w:t>
+            </w:r>
+          </w:p>
+        </w:tc>
+      </w:tr>
+      <w:tr>
+        <w:tc>
+          <w:tcPr>
+            <w:tcW w:type="pct" w:w="1800%"/>
+          </w:tcPr>
+          <w:p>
+            <w:pPr>
+              <w:spacing w:after="60"/>
+            </w:pPr>
+            <w:r>
+              <w:rPr>
+                <w:b/>
+                <w:bCs/>
+              </w:rPr>
+              <w:t xml:space="preserve">d2</w:t>
+            </w:r>
+          </w:p>
+        </w:tc>
+        <w:tc>
+          <w:tcPr>
+            <w:tcW w:type="pct" w:w="1800%"/>
+          </w:tcPr>
+          <w:p>
+            <w:pPr>
+              <w:spacing w:after="60"/>
+            </w:pPr>
+            <w:r>
+              <w:rPr>
+                <w:b/>
+                <w:bCs/>
+              </w:rPr>
+              <w:t xml:space="preserve">`applyPedalOstinatoPass`</w:t>
+            </w:r>
+          </w:p>
+        </w:tc>
+        <w:tc>
+          <w:tcPr>
+            <w:tcW w:type="pct" w:w="1800%"/>
+          </w:tcPr>
+          <w:p>
+            <w:pPr>
+              <w:spacing w:after="60"/>
+            </w:pPr>
+            <w:r>
+              <w:rPr>
+                <w:b/>
+                <w:bCs/>
+              </w:rPr>
+              <w:t xml:space="preserve">60%</w:t>
+            </w:r>
+            <w:r>
+              <w:t xml:space="preserve"> attempt rate on runs where the </w:t>
+            </w:r>
+            <w:r>
+              <w:rPr>
+                <w:b/>
+                <w:bCs/>
+              </w:rPr>
+              <w:t xml:space="preserve">harmonic root stays fixed ≥4 consecutive bars</w:t>
+            </w:r>
+            <w:r>
+              <w:t xml:space="preserve">; slash bass cycles chord tones</w:t>
+            </w:r>
+          </w:p>
+        </w:tc>
+        <w:tc>
+          <w:tcPr>
+            <w:tcW w:type="pct" w:w="1800%"/>
+          </w:tcPr>
+          <w:p>
+            <w:pPr>
+              <w:spacing w:after="60"/>
+            </w:pPr>
+            <w:r>
+              <w:rPr>
+                <w:b/>
+                <w:bCs/>
+              </w:rPr>
+              <w:t xml:space="preserve">`ms:pedal@bar{N}`</w:t>
+            </w:r>
+          </w:p>
+        </w:tc>
+        <w:tc>
+          <w:tcPr>
+            <w:tcW w:type="pct" w:w="1800%"/>
+          </w:tcPr>
+          <w:p>
+            <w:pPr>
+              <w:spacing w:after="60"/>
+            </w:pPr>
+            <w:r>
+              <w:rPr>
+                <w:b/>
+                <w:bCs/>
+              </w:rPr>
+              <w:t xml:space="preserve">`schneiderPedalBars`</w:t>
+            </w:r>
+          </w:p>
+        </w:tc>
+      </w:tr>
+      <w:tr>
+        <w:tc>
+          <w:tcPr>
+            <w:tcW w:type="pct" w:w="1800%"/>
+          </w:tcPr>
+          <w:p>
+            <w:pPr>
+              <w:spacing w:after="60"/>
+            </w:pPr>
+            <w:r>
+              <w:rPr>
+                <w:b/>
+                <w:bCs/>
+              </w:rPr>
+              <w:t xml:space="preserve">d3</w:t>
+            </w:r>
+          </w:p>
+        </w:tc>
+        <w:tc>
+          <w:tcPr>
+            <w:tcW w:type="pct" w:w="1800%"/>
+          </w:tcPr>
+          <w:p>
+            <w:pPr>
+              <w:spacing w:after="60"/>
+            </w:pPr>
+            <w:r>
+              <w:rPr>
+                <w:b/>
+                <w:bCs/>
+              </w:rPr>
+              <w:t xml:space="preserve">`applyNatureArcTexturePass`</w:t>
+            </w:r>
+          </w:p>
+        </w:tc>
+        <w:tc>
+          <w:tcPr>
+            <w:tcW w:type="pct" w:w="1800%"/>
+          </w:tcPr>
+          <w:p>
+            <w:pPr>
+              <w:spacing w:after="60"/>
+            </w:pPr>
+            <w:r>
+              <w:rPr>
+                <w:b/>
+                <w:bCs/>
+              </w:rPr>
+              <w:t xml:space="preserve">15%</w:t>
+            </w:r>
+            <w:r>
+              <w:t xml:space="preserve"> on </w:t>
+            </w:r>
+            <w:r>
+              <w:rPr>
+                <w:b/>
+                <w:bCs/>
+              </w:rPr>
+              <w:t xml:space="preserve">intro</w:t>
+            </w:r>
+            <w:r>
+              <w:t xml:space="preserve"> (first ≤4 bars) and </w:t>
+            </w:r>
+            <w:r>
+              <w:rPr>
+                <w:b/>
+                <w:bCs/>
+              </w:rPr>
+              <w:t xml:space="preserve">outro</w:t>
+            </w:r>
+            <w:r>
+              <w:t xml:space="preserve"> (last ≤4 bars); sets </w:t>
+            </w:r>
+            <w:r>
+              <w:rPr>
+                <w:b/>
+                <w:bCs/>
+              </w:rPr>
+              <w:t xml:space="preserve">`maj7(add9)`</w:t>
+            </w:r>
+            <w:r>
+              <w:t xml:space="preserve"> as a narrow pastoral colour</w:t>
+            </w:r>
+          </w:p>
+        </w:tc>
+        <w:tc>
+          <w:tcPr>
+            <w:tcW w:type="pct" w:w="1800%"/>
+          </w:tcPr>
+          <w:p>
+            <w:pPr>
+              <w:spacing w:after="60"/>
+            </w:pPr>
+            <w:r>
+              <w:rPr>
+                <w:b/>
+                <w:bCs/>
+              </w:rPr>
+              <w:t xml:space="preserve">`ms:nature_arc@bar{N}`</w:t>
+            </w:r>
+          </w:p>
+        </w:tc>
+        <w:tc>
+          <w:tcPr>
+            <w:tcW w:type="pct" w:w="1800%"/>
+          </w:tcPr>
+          <w:p>
+            <w:pPr>
+              <w:spacing w:after="60"/>
+            </w:pPr>
+            <w:r>
+              <w:t xml:space="preserve">—</w:t>
+            </w:r>
+          </w:p>
+        </w:tc>
+      </w:tr>
+      <w:tr>
+        <w:tc>
+          <w:tcPr>
+            <w:tcW w:type="pct" w:w="1800%"/>
+          </w:tcPr>
+          <w:p>
+            <w:pPr>
+              <w:spacing w:after="60"/>
+            </w:pPr>
+            <w:r>
+              <w:rPr>
+                <w:b/>
+                <w:bCs/>
+              </w:rPr>
+              <w:t xml:space="preserve">d4</w:t>
+            </w:r>
+          </w:p>
+        </w:tc>
+        <w:tc>
+          <w:tcPr>
+            <w:tcW w:type="pct" w:w="1800%"/>
+          </w:tcPr>
+          <w:p>
+            <w:pPr>
+              <w:spacing w:after="60"/>
+            </w:pPr>
+            <w:r>
+              <w:rPr>
+                <w:b/>
+                <w:bCs/>
+              </w:rPr>
+              <w:t xml:space="preserve">`applyColorStackPass`</w:t>
+            </w:r>
+          </w:p>
+        </w:tc>
+        <w:tc>
+          <w:tcPr>
+            <w:tcW w:type="pct" w:w="1800%"/>
+          </w:tcPr>
+          <w:p>
+            <w:pPr>
+              <w:spacing w:after="60"/>
+            </w:pPr>
+            <w:r>
+              <w:rPr>
+                <w:b/>
+                <w:bCs/>
+              </w:rPr>
+              <w:t xml:space="preserve">45%</w:t>
+            </w:r>
+            <w:r>
+              <w:t xml:space="preserve"> on </w:t>
+            </w:r>
+            <w:r>
+              <w:rPr>
+                <w:b/>
+                <w:bCs/>
+              </w:rPr>
+              <w:t xml:space="preserve">`phraseFinal`</w:t>
+            </w:r>
+            <w:r>
+              <w:t xml:space="preserve">; ensures altered/colour extensions (e.g. </w:t>
+            </w:r>
+            <w:r>
+              <w:rPr>
+                <w:b/>
+                <w:bCs/>
+              </w:rPr>
+              <w:t xml:space="preserve">`add9`</w:t>
+            </w:r>
+            <w:r>
+              <w:t xml:space="preserve">) for semitone-adjacent tension in the symbol</w:t>
+            </w:r>
+          </w:p>
+        </w:tc>
+        <w:tc>
+          <w:tcPr>
+            <w:tcW w:type="pct" w:w="1800%"/>
+          </w:tcPr>
+          <w:p>
+            <w:pPr>
+              <w:spacing w:after="60"/>
+            </w:pPr>
+            <w:r>
+              <w:rPr>
+                <w:b/>
+                <w:bCs/>
+              </w:rPr>
+              <w:t xml:space="preserve">`ms:color_stack@bar{N}`</w:t>
+            </w:r>
+          </w:p>
+        </w:tc>
+        <w:tc>
+          <w:tcPr>
+            <w:tcW w:type="pct" w:w="1800%"/>
+          </w:tcPr>
+          <w:p>
+            <w:pPr>
+              <w:spacing w:after="60"/>
+            </w:pPr>
+            <w:r>
+              <w:rPr>
+                <w:b/>
+                <w:bCs/>
+              </w:rPr>
+              <w:t xml:space="preserve">`schneiderColorStackBars`</w:t>
+            </w:r>
+          </w:p>
+        </w:tc>
+      </w:tr>
+      <w:tr>
+        <w:tc>
+          <w:tcPr>
+            <w:tcW w:type="pct" w:w="1800%"/>
+          </w:tcPr>
+          <w:p>
+            <w:pPr>
+              <w:spacing w:after="60"/>
+            </w:pPr>
+            <w:r>
+              <w:rPr>
+                <w:b/>
+                <w:bCs/>
+              </w:rPr>
+              <w:t xml:space="preserve">d5</w:t>
+            </w:r>
+          </w:p>
+        </w:tc>
+        <w:tc>
+          <w:tcPr>
+            <w:tcW w:type="pct" w:w="1800%"/>
+          </w:tcPr>
+          <w:p>
+            <w:pPr>
+              <w:spacing w:after="60"/>
+            </w:pPr>
+            <w:r>
+              <w:rPr>
+                <w:b/>
+                <w:bCs/>
+              </w:rPr>
+              <w:t xml:space="preserve">`applyNonFunctionalPlaningPass`</w:t>
+            </w:r>
+          </w:p>
+        </w:tc>
+        <w:tc>
+          <w:tcPr>
+            <w:tcW w:type="pct" w:w="1800%"/>
+          </w:tcPr>
+          <w:p>
+            <w:pPr>
+              <w:spacing w:after="60"/>
+            </w:pPr>
+            <w:r>
+              <w:rPr>
+                <w:b/>
+                <w:bCs/>
+              </w:rPr>
+              <w:t xml:space="preserve">35%</w:t>
+            </w:r>
+            <w:r>
+              <w:t xml:space="preserve"> on </w:t>
+            </w:r>
+            <w:r>
+              <w:rPr>
+                <w:b/>
+                <w:bCs/>
+              </w:rPr>
+              <w:t xml:space="preserve">`phraseMiddle`</w:t>
+            </w:r>
+            <w:r>
+              <w:t xml:space="preserve"> where a </w:t>
+            </w:r>
+            <w:r>
+              <w:rPr>
+                <w:b/>
+                <w:bCs/>
+              </w:rPr>
+              <w:t xml:space="preserve">major-key ii–V–I</w:t>
+            </w:r>
+            <w:r>
+              <w:t xml:space="preserve"> is detected; roots shift by </w:t>
+            </w:r>
+            <w:r>
+              <w:rPr>
+                <w:b/>
+                <w:bCs/>
+              </w:rPr>
+              <w:t xml:space="preserve">±2 or ±3</w:t>
+            </w:r>
+            <w:r>
+              <w:t xml:space="preserve"> semitones with </w:t>
+            </w:r>
+            <w:r>
+              <w:rPr>
+                <w:b/>
+                <w:bCs/>
+              </w:rPr>
+              <w:t xml:space="preserve">quality preserved</w:t>
+            </w:r>
+          </w:p>
+        </w:tc>
+        <w:tc>
+          <w:tcPr>
+            <w:tcW w:type="pct" w:w="1800%"/>
+          </w:tcPr>
+          <w:p>
+            <w:pPr>
+              <w:spacing w:after="60"/>
+            </w:pPr>
+            <w:r>
+              <w:rPr>
+                <w:b/>
+                <w:bCs/>
+              </w:rPr>
+              <w:t xml:space="preserve">`ms:planing@bar{N}`</w:t>
+            </w:r>
+          </w:p>
+        </w:tc>
+        <w:tc>
+          <w:tcPr>
+            <w:tcW w:type="pct" w:w="1800%"/>
+          </w:tcPr>
+          <w:p>
+            <w:pPr>
+              <w:spacing w:after="60"/>
+            </w:pPr>
+            <w:r>
+              <w:t xml:space="preserve">—</w:t>
+            </w:r>
+          </w:p>
+        </w:tc>
+      </w:tr>
+    </w:tbl>
+    <w:p>
+      <w:pPr>
+        <w:spacing w:after="160"/>
+      </w:pPr>
+    </w:p>
+    <w:p>
+      <w:pPr>
+        <w:pStyle w:val="Heading2"/>
+        <w:spacing w:after="100" w:before="160"/>
+      </w:pPr>
+      <w:r>
+        <w:t xml:space="preserve">Style surface (floating rhythm bias)</w:t>
+      </w:r>
+    </w:p>
+    <w:p>
+      <w:pPr>
+        <w:spacing w:after="160"/>
+      </w:pPr>
+      <w:r>
+        <w:rPr>
+          <w:b/>
+          <w:bCs/>
+        </w:rPr>
+        <w:t xml:space="preserve">`applyMariaSchneiderStyleSurface`</w:t>
+      </w:r>
+      <w:r>
+        <w:t xml:space="preserve"> (primary </w:t>
+      </w:r>
+      <w:r>
+        <w:rPr>
+          <w:b/>
+          <w:bCs/>
+        </w:rPr>
+        <w:t xml:space="preserve">`maria_schneider`</w:t>
+      </w:r>
+      <w:r>
+        <w:t xml:space="preserve">, hook-first Song Mode): </w:t>
+      </w:r>
+      <w:r>
+        <w:rPr>
+          <w:b/>
+          <w:bCs/>
+        </w:rPr>
+        <w:t xml:space="preserve">`songwriterDensityBias` +0.05</w:t>
+      </w:r>
+      <w:r>
+        <w:t xml:space="preserve">, </w:t>
+      </w:r>
+      <w:r>
+        <w:rPr>
+          <w:b/>
+          <w:bCs/>
+        </w:rPr>
+        <w:t xml:space="preserve">`songwriterSyncopationBias` −0.20</w:t>
+      </w:r>
+      <w:r>
+        <w:t xml:space="preserve">, </w:t>
+      </w:r>
+      <w:r>
+        <w:rPr>
+          <w:b/>
+          <w:bCs/>
+        </w:rPr>
+        <w:t xml:space="preserve">`songwriterSpaceBias` +0.25</w:t>
+      </w:r>
+      <w:r>
+        <w:t xml:space="preserve">, </w:t>
+      </w:r>
+      <w:r>
+        <w:rPr>
+          <w:b/>
+          <w:bCs/>
+        </w:rPr>
+        <w:t xml:space="preserve">`songwriterCadenceSoftness` +0.28</w:t>
+      </w:r>
+      <w:r>
+        <w:t xml:space="preserve"> — less swing-era pocket, more air and softened cadences (generative bias only; not an imitation claim).</w:t>
+      </w:r>
+    </w:p>
+    <w:p>
+      <w:pPr>
+        <w:pStyle w:val="Heading2"/>
+        <w:spacing w:after="100" w:before="160"/>
+      </w:pPr>
+      <w:r>
+        <w:t xml:space="preserve">Melody planner row</w:t>
+      </w:r>
+    </w:p>
+    <w:p>
+      <w:pPr>
+        <w:spacing w:after="160"/>
+      </w:pPr>
+      <w:r>
+        <w:rPr>
+          <w:b/>
+          <w:bCs/>
+        </w:rPr>
+        <w:t xml:space="preserve">`MELODY_PROFILES['maria_schneider']`</w:t>
+      </w:r>
+      <w:r>
+        <w:t xml:space="preserve"> — </w:t>
+      </w:r>
+      <w:r>
+        <w:rPr>
+          <w:b/>
+          <w:bCs/>
+        </w:rPr>
+        <w:t xml:space="preserve">`intervalTendency`</w:t>
+      </w:r>
+      <w:r>
+        <w:t xml:space="preserve">: stepwise · </w:t>
+      </w:r>
+      <w:r>
+        <w:rPr>
+          <w:b/>
+          <w:bCs/>
+        </w:rPr>
+        <w:t xml:space="preserve">`rhythmicSubdivision`</w:t>
+      </w:r>
+      <w:r>
+        <w:t xml:space="preserve">: mixed · </w:t>
+      </w:r>
+      <w:r>
+        <w:rPr>
+          <w:b/>
+          <w:bCs/>
+        </w:rPr>
+        <w:t xml:space="preserve">`repetitionVsVariationBias`</w:t>
+      </w:r>
+      <w:r>
+        <w:t xml:space="preserve">: </w:t>
+      </w:r>
+      <w:r>
+        <w:rPr>
+          <w:b/>
+          <w:bCs/>
+        </w:rPr>
+        <w:t xml:space="preserve">0.85</w:t>
+      </w:r>
+      <w:r>
+        <w:t xml:space="preserve"> · </w:t>
+      </w:r>
+      <w:r>
+        <w:rPr>
+          <w:b/>
+          <w:bCs/>
+        </w:rPr>
+        <w:t xml:space="preserve">`phraseLength`</w:t>
+      </w:r>
+      <w:r>
+        <w:t xml:space="preserve">: </w:t>
+      </w:r>
+      <w:r>
+        <w:rPr>
+          <w:b/>
+          <w:bCs/>
+        </w:rPr>
+        <w:t xml:space="preserve">7</w:t>
+      </w:r>
+      <w:r>
+        <w:t xml:space="preserve"> · </w:t>
+      </w:r>
+      <w:r>
+        <w:rPr>
+          <w:b/>
+          <w:bCs/>
+        </w:rPr>
+        <w:t xml:space="preserve">`contourProfile`</w:t>
+      </w:r>
+      <w:r>
+        <w:t xml:space="preserve">: arch · </w:t>
+      </w:r>
+      <w:r>
+        <w:rPr>
+          <w:b/>
+          <w:bCs/>
+        </w:rPr>
+        <w:t xml:space="preserve">`phraseAsymmetryTendency`</w:t>
+      </w:r>
+      <w:r>
+        <w:t xml:space="preserve">: </w:t>
+      </w:r>
+      <w:r>
+        <w:rPr>
+          <w:b/>
+          <w:bCs/>
+        </w:rPr>
+        <w:t xml:space="preserve">0.75</w:t>
+      </w:r>
+      <w:r>
+        <w:t xml:space="preserve"> · </w:t>
+      </w:r>
+      <w:r>
+        <w:rPr>
+          <w:b/>
+          <w:bCs/>
+        </w:rPr>
+        <w:t xml:space="preserve">`cadenceFrequency`</w:t>
+      </w:r>
+      <w:r>
+        <w:t xml:space="preserve">: low · </w:t>
+      </w:r>
+      <w:r>
+        <w:rPr>
+          <w:b/>
+          <w:bCs/>
+        </w:rPr>
+        <w:t xml:space="preserve">`devices`</w:t>
+      </w:r>
+      <w:r>
+        <w:t xml:space="preserve">: </w:t>
+      </w:r>
+      <w:r>
+        <w:rPr>
+          <w:b/>
+          <w:bCs/>
+        </w:rPr>
+        <w:t xml:space="preserve">`sparse_phrase`</w:t>
+      </w:r>
+      <w:r>
+        <w:t xml:space="preserve">, </w:t>
+      </w:r>
+      <w:r>
+        <w:rPr>
+          <w:b/>
+          <w:bCs/>
+        </w:rPr>
+        <w:t xml:space="preserve">`modal_field`</w:t>
+      </w:r>
+      <w:r>
+        <w:t xml:space="preserve">, </w:t>
+      </w:r>
+      <w:r>
+        <w:rPr>
+          <w:b/>
+          <w:bCs/>
+        </w:rPr>
+        <w:t xml:space="preserve">`breath_space`</w:t>
+      </w:r>
+      <w:r>
+        <w:t xml:space="preserve">, </w:t>
+      </w:r>
+      <w:r>
+        <w:rPr>
+          <w:b/>
+          <w:bCs/>
+        </w:rPr>
+        <w:t xml:space="preserve">`nature_arc`</w:t>
+      </w:r>
+      <w:r>
+        <w:t xml:space="preserve">, </w:t>
+      </w:r>
+      <w:r>
+        <w:rPr>
+          <w:b/>
+          <w:bCs/>
+        </w:rPr>
+        <w:t xml:space="preserve">`chamber_texture`</w:t>
+      </w:r>
+      <w:r>
+        <w:t xml:space="preserve">.</w:t>
+      </w:r>
+    </w:p>
+    <w:p>
+      <w:pPr>
+        <w:pStyle w:val="Heading2"/>
+        <w:spacing w:after="100" w:before="160"/>
+      </w:pPr>
+      <w:r>
+        <w:t xml:space="preserve">Six example applications (nature arc vs chamber texture vs long-form arc)</w:t>
+      </w:r>
+    </w:p>
+    <w:p>
+      <w:pPr>
+        <w:spacing w:after="160"/>
+      </w:pPr>
+      <w:r>
+        <w:t xml:space="preserve">1. </w:t>
+      </w:r>
+      <w:r>
+        <w:rPr>
+          <w:b/>
+          <w:bCs/>
+        </w:rPr>
+        <w:t xml:space="preserve">Nature arc only (paint intro/outro)</w:t>
+      </w:r>
+      <w:r>
+        <w:t xml:space="preserve"> — Short chart (</w:t>
+      </w:r>
+      <w:r>
+        <w:rPr>
+          <w:b/>
+          <w:bCs/>
+        </w:rPr>
+        <w:t xml:space="preserve">16 bars</w:t>
+      </w:r>
+      <w:r>
+        <w:t xml:space="preserve">), slow tempo, primary </w:t>
+      </w:r>
+      <w:r>
+        <w:rPr>
+          <w:b/>
+          <w:bCs/>
+        </w:rPr>
+        <w:t xml:space="preserve">Maria Schneider</w:t>
+      </w:r>
+      <w:r>
+        <w:t xml:space="preserve">. Expect </w:t>
+      </w:r>
+      <w:r>
+        <w:rPr>
+          <w:b/>
+          <w:bCs/>
+        </w:rPr>
+        <w:t xml:space="preserve">`ms:nature_arc`</w:t>
+      </w:r>
+      <w:r>
+        <w:t xml:space="preserve"> only at the </w:t>
+      </w:r>
+      <w:r>
+        <w:rPr>
+          <w:b/>
+          <w:bCs/>
+        </w:rPr>
+        <w:t xml:space="preserve">first ≤4</w:t>
+      </w:r>
+      <w:r>
+        <w:t xml:space="preserve"> and </w:t>
+      </w:r>
+      <w:r>
+        <w:rPr>
+          <w:b/>
+          <w:bCs/>
+        </w:rPr>
+        <w:t xml:space="preserve">last ≤4</w:t>
+      </w:r>
+      <w:r>
+        <w:t xml:space="preserve"> bars; middle stays driven by </w:t>
+      </w:r>
+      <w:r>
+        <w:rPr>
+          <w:b/>
+          <w:bCs/>
+        </w:rPr>
+        <w:t xml:space="preserve">d1/d4/d5</w:t>
+      </w:r>
+      <w:r>
+        <w:t xml:space="preserve"> and stage‑1 colours. Use when you want </w:t>
+      </w:r>
+      <w:r>
+        <w:rPr>
+          <w:b/>
+          <w:bCs/>
+        </w:rPr>
+        <w:t xml:space="preserve">bookend wash</w:t>
+      </w:r>
+      <w:r>
+        <w:t xml:space="preserve">, not a middle-register pedalled wedge. 2. </w:t>
+      </w:r>
+      <w:r>
+        <w:rPr>
+          <w:b/>
+          <w:bCs/>
+        </w:rPr>
+        <w:t xml:space="preserve">Chamber texture (devices, not ECM preset)</w:t>
+      </w:r>
+      <w:r>
+        <w:t xml:space="preserve"> — Same primary; pair with </w:t>
+      </w:r>
+      <w:r>
+        <w:rPr>
+          <w:b/>
+          <w:bCs/>
+        </w:rPr>
+        <w:t xml:space="preserve">guitar–bass duo</w:t>
+      </w:r>
+      <w:r>
+        <w:t xml:space="preserve"> and a </w:t>
+      </w:r>
+      <w:r>
+        <w:rPr>
+          <w:b/>
+          <w:bCs/>
+        </w:rPr>
+        <w:t xml:space="preserve">non-shout</w:t>
+      </w:r>
+      <w:r>
+        <w:t xml:space="preserve"> arranger if you want </w:t>
+      </w:r>
+      <w:r>
+        <w:rPr>
+          <w:b/>
+          <w:bCs/>
+        </w:rPr>
+        <w:t xml:space="preserve">breath + sparse phrase</w:t>
+      </w:r>
+      <w:r>
+        <w:t xml:space="preserve"> without invoking </w:t>
+      </w:r>
+      <w:r>
+        <w:rPr>
+          <w:b/>
+          <w:bCs/>
+        </w:rPr>
+        <w:t xml:space="preserve">`STYLE_ECM`</w:t>
+      </w:r>
+      <w:r>
+        <w:t xml:space="preserve"> / </w:t>
+      </w:r>
+      <w:r>
+        <w:rPr>
+          <w:b/>
+          <w:bCs/>
+        </w:rPr>
+        <w:t xml:space="preserve">`ecm_chamber`</w:t>
+      </w:r>
+      <w:r>
+        <w:t xml:space="preserve"> writer. </w:t>
+      </w:r>
+      <w:r>
+        <w:rPr>
+          <w:b/>
+          <w:bCs/>
+        </w:rPr>
+        <w:t xml:space="preserve">Chamber texture</w:t>
+      </w:r>
+      <w:r>
+        <w:t xml:space="preserve"> here is the </w:t>
+      </w:r>
+      <w:r>
+        <w:rPr>
+          <w:b/>
+          <w:bCs/>
+        </w:rPr>
+        <w:t xml:space="preserve">melody device list + high repetition bias</w:t>
+      </w:r>
+      <w:r>
+        <w:t xml:space="preserve">; </w:t>
+      </w:r>
+      <w:r>
+        <w:rPr>
+          <w:b/>
+          <w:bCs/>
+        </w:rPr>
+        <w:t xml:space="preserve">ECM Chamber</w:t>
+      </w:r>
+      <w:r>
+        <w:t xml:space="preserve"> is a </w:t>
+      </w:r>
+      <w:r>
+        <w:rPr>
+          <w:b/>
+          <w:bCs/>
+        </w:rPr>
+        <w:t xml:space="preserve">different writer slice</w:t>
+      </w:r>
+      <w:r>
+        <w:t xml:space="preserve"> with its own harmony pipeline and </w:t>
+      </w:r>
+      <w:r>
+        <w:rPr>
+          <w:b/>
+          <w:bCs/>
+        </w:rPr>
+        <w:t xml:space="preserve">`ecm_chamber`</w:t>
+      </w:r>
+      <w:r>
+        <w:t xml:space="preserve"> profiles. 3. </w:t>
+      </w:r>
+      <w:r>
+        <w:rPr>
+          <w:b/>
+          <w:bCs/>
+        </w:rPr>
+        <w:t xml:space="preserve">Long-form arc (phrase grid + planing)</w:t>
+      </w:r>
+      <w:r>
+        <w:t xml:space="preserve"> — </w:t>
+      </w:r>
+      <w:r>
+        <w:rPr>
+          <w:b/>
+          <w:bCs/>
+        </w:rPr>
+        <w:t xml:space="preserve">48–64 bars</w:t>
+      </w:r>
+      <w:r>
+        <w:t xml:space="preserve">, same primary. Asymmetric phrase lengths (</w:t>
+      </w:r>
+      <w:r>
+        <w:rPr>
+          <w:b/>
+          <w:bCs/>
+        </w:rPr>
+        <w:t xml:space="preserve">4/6/8/5/7/9</w:t>
+      </w:r>
+      <w:r>
+        <w:t xml:space="preserve">) stagger phrase endings; </w:t>
+      </w:r>
+      <w:r>
+        <w:rPr>
+          <w:b/>
+          <w:bCs/>
+        </w:rPr>
+        <w:t xml:space="preserve">`ms:planing`</w:t>
+      </w:r>
+      <w:r>
+        <w:t xml:space="preserve"> hits </w:t>
+      </w:r>
+      <w:r>
+        <w:rPr>
+          <w:b/>
+          <w:bCs/>
+        </w:rPr>
+        <w:t xml:space="preserve">phrase middles</w:t>
+      </w:r>
+      <w:r>
+        <w:t xml:space="preserve"> and removes textbook </w:t>
+      </w:r>
+      <w:r>
+        <w:rPr>
+          <w:b/>
+          <w:bCs/>
+        </w:rPr>
+        <w:t xml:space="preserve">ii–V–I</w:t>
+      </w:r>
+      <w:r>
+        <w:t xml:space="preserve"> loops in favour of </w:t>
+      </w:r>
+      <w:r>
+        <w:rPr>
+          <w:b/>
+          <w:bCs/>
+        </w:rPr>
+        <w:t xml:space="preserve">parallel shifts</w:t>
+      </w:r>
+      <w:r>
+        <w:t xml:space="preserve">. Use when the chart needs </w:t>
+      </w:r>
+      <w:r>
+        <w:rPr>
+          <w:b/>
+          <w:bCs/>
+        </w:rPr>
+        <w:t xml:space="preserve">sectional unevenness</w:t>
+      </w:r>
+      <w:r>
+        <w:t xml:space="preserve"> and </w:t>
+      </w:r>
+      <w:r>
+        <w:rPr>
+          <w:b/>
+          <w:bCs/>
+        </w:rPr>
+        <w:t xml:space="preserve">less functional turnaround</w:t>
+      </w:r>
+      <w:r>
+        <w:t xml:space="preserve">. 4. </w:t>
+      </w:r>
+      <w:r>
+        <w:rPr>
+          <w:b/>
+          <w:bCs/>
+        </w:rPr>
+        <w:t xml:space="preserve">Pedal vs nature arc (orthogonal)</w:t>
+      </w:r>
+      <w:r>
+        <w:t xml:space="preserve"> — </w:t>
+      </w:r>
+      <w:r>
+        <w:rPr>
+          <w:b/>
+          <w:bCs/>
+        </w:rPr>
+        <w:t xml:space="preserve">`ms:pedal`</w:t>
+      </w:r>
+      <w:r>
+        <w:t xml:space="preserve"> needs </w:t>
+      </w:r>
+      <w:r>
+        <w:rPr>
+          <w:b/>
+          <w:bCs/>
+        </w:rPr>
+        <w:t xml:space="preserve">≥4 bars</w:t>
+      </w:r>
+      <w:r>
+        <w:t xml:space="preserve"> of the </w:t>
+      </w:r>
+      <w:r>
+        <w:rPr>
+          <w:b/>
+          <w:bCs/>
+        </w:rPr>
+        <w:t xml:space="preserve">same harmonic root</w:t>
+      </w:r>
+      <w:r>
+        <w:t xml:space="preserve"> anywhere in the form (slash-bass ostinato). </w:t>
+      </w:r>
+      <w:r>
+        <w:rPr>
+          <w:b/>
+          <w:bCs/>
+        </w:rPr>
+        <w:t xml:space="preserve">`ms:nature_arc`</w:t>
+      </w:r>
+      <w:r>
+        <w:t xml:space="preserve"> is </w:t>
+      </w:r>
+      <w:r>
+        <w:rPr>
+          <w:b/>
+          <w:bCs/>
+        </w:rPr>
+        <w:t xml:space="preserve">intro/outro-only</w:t>
+      </w:r>
+      <w:r>
+        <w:t xml:space="preserve">. Mid-piece </w:t>
+      </w:r>
+      <w:r>
+        <w:rPr>
+          <w:b/>
+          <w:bCs/>
+        </w:rPr>
+        <w:t xml:space="preserve">static harmony</w:t>
+      </w:r>
+      <w:r>
+        <w:t xml:space="preserve"> → pedal receipts; </w:t>
+      </w:r>
+      <w:r>
+        <w:rPr>
+          <w:b/>
+          <w:bCs/>
+        </w:rPr>
+        <w:t xml:space="preserve">opening/closing pastoral colour</w:t>
+      </w:r>
+      <w:r>
+        <w:t xml:space="preserve"> → nature arc — they answer different prompts. 5. </w:t>
+      </w:r>
+      <w:r>
+        <w:rPr>
+          <w:b/>
+          <w:bCs/>
+        </w:rPr>
+        <w:t xml:space="preserve">Colour stack phrase endings</w:t>
+      </w:r>
+      <w:r>
+        <w:t xml:space="preserve"> — </w:t>
+      </w:r>
+      <w:r>
+        <w:rPr>
+          <w:b/>
+          <w:bCs/>
+        </w:rPr>
+        <w:t xml:space="preserve">`ms:color_stack`</w:t>
+      </w:r>
+      <w:r>
+        <w:t xml:space="preserve"> on </w:t>
+      </w:r>
+      <w:r>
+        <w:rPr>
+          <w:b/>
+          <w:bCs/>
+        </w:rPr>
+        <w:t xml:space="preserve">`phraseFinal`</w:t>
+      </w:r>
+      <w:r>
+        <w:t xml:space="preserve"> bars: use when you want </w:t>
+      </w:r>
+      <w:r>
+        <w:rPr>
+          <w:b/>
+          <w:bCs/>
+        </w:rPr>
+        <w:t xml:space="preserve">dense altered symbols at phrase borders</w:t>
+      </w:r>
+      <w:r>
+        <w:t xml:space="preserve"> (lead-sheet “full ensemble hit”) while keeping </w:t>
+      </w:r>
+      <w:r>
+        <w:rPr>
+          <w:b/>
+          <w:bCs/>
+        </w:rPr>
+        <w:t xml:space="preserve">middle bars</w:t>
+      </w:r>
+      <w:r>
+        <w:t xml:space="preserve"> lighter via </w:t>
+      </w:r>
+      <w:r>
+        <w:rPr>
+          <w:b/>
+          <w:bCs/>
+        </w:rPr>
+        <w:t xml:space="preserve">space/cadence softness</w:t>
+      </w:r>
+      <w:r>
+        <w:t xml:space="preserve"> surface. 6. </w:t>
+      </w:r>
+      <w:r>
+        <w:rPr>
+          <w:b/>
+          <w:bCs/>
+        </w:rPr>
+        <w:t xml:space="preserve">Lydian modal center hold</w:t>
+      </w:r>
+      <w:r>
+        <w:t xml:space="preserve"> — </w:t>
+      </w:r>
+      <w:r>
+        <w:rPr>
+          <w:b/>
+          <w:bCs/>
+        </w:rPr>
+        <w:t xml:space="preserve">`ms:lyd_center`</w:t>
+      </w:r>
+      <w:r>
+        <w:t xml:space="preserve"> ensures </w:t>
+      </w:r>
+      <w:r>
+        <w:rPr>
+          <w:b/>
+          <w:bCs/>
+        </w:rPr>
+        <w:t xml:space="preserve">#11</w:t>
+      </w:r>
+      <w:r>
+        <w:t xml:space="preserve"> on </w:t>
+      </w:r>
+      <w:r>
+        <w:rPr>
+          <w:b/>
+          <w:bCs/>
+        </w:rPr>
+        <w:t xml:space="preserve">maj7/maj9/maj13</w:t>
+      </w:r>
+      <w:r>
+        <w:t xml:space="preserve"> tonic colours for a </w:t>
+      </w:r>
+      <w:r>
+        <w:rPr>
+          <w:b/>
+          <w:bCs/>
+        </w:rPr>
+        <w:t xml:space="preserve">single modal pole</w:t>
+      </w:r>
+      <w:r>
+        <w:t xml:space="preserve">; combine with </w:t>
+      </w:r>
+      <w:r>
+        <w:rPr>
+          <w:b/>
+          <w:bCs/>
+        </w:rPr>
+        <w:t xml:space="preserve">long-form</w:t>
+      </w:r>
+      <w:r>
+        <w:t xml:space="preserve"> runs so tonic returns </w:t>
+      </w:r>
+      <w:r>
+        <w:rPr>
+          <w:b/>
+          <w:bCs/>
+        </w:rPr>
+        <w:t xml:space="preserve">read as colour</w:t>
+      </w:r>
+      <w:r>
+        <w:t xml:space="preserve">, not </w:t>
+      </w:r>
+      <w:r>
+        <w:rPr>
+          <w:b/>
+          <w:bCs/>
+        </w:rPr>
+        <w:t xml:space="preserve">bebop ii–V setup</w:t>
       </w:r>
       <w:r>
         <w:t xml:space="preserve">.</w:t>

</xml_diff>

<commit_message>
docs: Miles Davis handbook section + roadmap complete
Co-authored-by: Cursor <cursoragent@cursor.com>
</commit_message>
<xml_diff>
--- a/docs/COMPOSER_OS_PLAYBOOK.docx
+++ b/docs/COMPOSER_OS_PLAYBOOK.docx
@@ -2598,7 +2598,7 @@
         <w:spacing w:after="100" w:before="160"/>
       </w:pPr>
       <w:r>
-        <w:t xml:space="preserve">Per-composer profile table (35 research rows)</w:t>
+        <w:t xml:space="preserve">Per-composer profile table (36 research rows)</w:t>
       </w:r>
     </w:p>
     <w:tbl>
@@ -5515,7 +5515,7 @@
               <w:spacing w:after="60"/>
             </w:pPr>
             <w:r>
-              <w:t xml:space="preserve">`holland_dozier_holland`</w:t>
+              <w:t xml:space="preserve">`miles_davis`</w:t>
             </w:r>
           </w:p>
         </w:tc>
@@ -5541,7 +5541,7 @@
               <w:spacing w:after="60"/>
             </w:pPr>
             <w:r>
-              <w:t xml:space="preserve">eighth_patterns</w:t>
+              <w:t xml:space="preserve">mixed</w:t>
             </w:r>
           </w:p>
         </w:tc>
@@ -5554,7 +5554,7 @@
               <w:spacing w:after="60"/>
             </w:pPr>
             <w:r>
-              <w:t xml:space="preserve">2</w:t>
+              <w:t xml:space="preserve">4</w:t>
             </w:r>
           </w:p>
         </w:tc>
@@ -5567,7 +5567,7 @@
               <w:spacing w:after="60"/>
             </w:pPr>
             <w:r>
-              <w:t xml:space="preserve">0.7</w:t>
+              <w:t xml:space="preserve">0.72</w:t>
             </w:r>
           </w:p>
         </w:tc>
@@ -5580,7 +5580,7 @@
               <w:spacing w:after="60"/>
             </w:pPr>
             <w:r>
-              <w:t xml:space="preserve">rising</w:t>
+              <w:t xml:space="preserve">arch</w:t>
             </w:r>
           </w:p>
         </w:tc>
@@ -5593,7 +5593,7 @@
               <w:spacing w:after="60"/>
             </w:pPr>
             <w:r>
-              <w:t xml:space="preserve">call_response_hook; repeated_title_phrase; tambourine_anticipation; backing_vocal_echo</w:t>
+              <w:t xml:space="preserve">modal_field; breath_space; deliberate_silence; cool_phrasing; motivic_cell</w:t>
             </w:r>
           </w:p>
         </w:tc>
@@ -5608,7 +5608,7 @@
               <w:spacing w:after="60"/>
             </w:pPr>
             <w:r>
-              <w:t xml:space="preserve">`jeff_lynne`</w:t>
+              <w:t xml:space="preserve">`holland_dozier_holland`</w:t>
             </w:r>
           </w:p>
         </w:tc>
@@ -5634,7 +5634,7 @@
               <w:spacing w:after="60"/>
             </w:pPr>
             <w:r>
-              <w:t xml:space="preserve">mixed</w:t>
+              <w:t xml:space="preserve">eighth_patterns</w:t>
             </w:r>
           </w:p>
         </w:tc>
@@ -5647,7 +5647,7 @@
               <w:spacing w:after="60"/>
             </w:pPr>
             <w:r>
-              <w:t xml:space="preserve">4</w:t>
+              <w:t xml:space="preserve">2</w:t>
             </w:r>
           </w:p>
         </w:tc>
@@ -5660,7 +5660,7 @@
               <w:spacing w:after="60"/>
             </w:pPr>
             <w:r>
-              <w:t xml:space="preserve">0.6</w:t>
+              <w:t xml:space="preserve">0.7</w:t>
             </w:r>
           </w:p>
         </w:tc>
@@ -5673,7 +5673,7 @@
               <w:spacing w:after="60"/>
             </w:pPr>
             <w:r>
-              <w:t xml:space="preserve">arch</w:t>
+              <w:t xml:space="preserve">rising</w:t>
             </w:r>
           </w:p>
         </w:tc>
@@ -5686,7 +5686,7 @@
               <w:spacing w:after="60"/>
             </w:pPr>
             <w:r>
-              <w:t xml:space="preserve">stacked_harmony_hook; octave_doubled_melody; string_countermelody; descending_bass_hook</w:t>
+              <w:t xml:space="preserve">call_response_hook; repeated_title_phrase; tambourine_anticipation; backing_vocal_echo</w:t>
             </w:r>
           </w:p>
         </w:tc>
@@ -5701,7 +5701,7 @@
               <w:spacing w:after="60"/>
             </w:pPr>
             <w:r>
-              <w:t xml:space="preserve">`jeff_tweedy`</w:t>
+              <w:t xml:space="preserve">`jeff_lynne`</w:t>
             </w:r>
           </w:p>
         </w:tc>
@@ -5753,7 +5753,7 @@
               <w:spacing w:after="60"/>
             </w:pPr>
             <w:r>
-              <w:t xml:space="preserve">0.7</w:t>
+              <w:t xml:space="preserve">0.6</w:t>
             </w:r>
           </w:p>
         </w:tc>
@@ -5766,7 +5766,7 @@
               <w:spacing w:after="60"/>
             </w:pPr>
             <w:r>
-              <w:t xml:space="preserve">flat</w:t>
+              <w:t xml:space="preserve">arch</w:t>
             </w:r>
           </w:p>
         </w:tc>
@@ -5779,7 +5779,7 @@
               <w:spacing w:after="60"/>
             </w:pPr>
             <w:r>
-              <w:t xml:space="preserve">deadpan_repeated_note; modal_bVII; unresolved_suspension; folk_drone; understated_chorus</w:t>
+              <w:t xml:space="preserve">stacked_harmony_hook; octave_doubled_melody; string_countermelody; descending_bass_hook</w:t>
             </w:r>
           </w:p>
         </w:tc>
@@ -5794,7 +5794,7 @@
               <w:spacing w:after="60"/>
             </w:pPr>
             <w:r>
-              <w:t xml:space="preserve">`kendrick_lamar`</w:t>
+              <w:t xml:space="preserve">`jeff_tweedy`</w:t>
             </w:r>
           </w:p>
         </w:tc>
@@ -5820,7 +5820,7 @@
               <w:spacing w:after="60"/>
             </w:pPr>
             <w:r>
-              <w:t xml:space="preserve">eighth_patterns</w:t>
+              <w:t xml:space="preserve">mixed</w:t>
             </w:r>
           </w:p>
         </w:tc>
@@ -5833,7 +5833,7 @@
               <w:spacing w:after="60"/>
             </w:pPr>
             <w:r>
-              <w:t xml:space="preserve">3</w:t>
+              <w:t xml:space="preserve">4</w:t>
             </w:r>
           </w:p>
         </w:tc>
@@ -5846,7 +5846,7 @@
               <w:spacing w:after="60"/>
             </w:pPr>
             <w:r>
-              <w:t xml:space="preserve">0.5</w:t>
+              <w:t xml:space="preserve">0.7</w:t>
             </w:r>
           </w:p>
         </w:tc>
@@ -5859,7 +5859,7 @@
               <w:spacing w:after="60"/>
             </w:pPr>
             <w:r>
-              <w:t xml:space="preserve">speech_contour</w:t>
+              <w:t xml:space="preserve">flat</w:t>
             </w:r>
           </w:p>
         </w:tc>
@@ -5872,7 +5872,7 @@
               <w:spacing w:after="60"/>
             </w:pPr>
             <w:r>
-              <w:t xml:space="preserve">flow_modulation; syllabic_ostinato; pitch_zone_contrast; barline_displacement; triplet_switch</w:t>
+              <w:t xml:space="preserve">deadpan_repeated_note; modal_bVII; unresolved_suspension; folk_drone; understated_chorus</w:t>
             </w:r>
           </w:p>
         </w:tc>
@@ -5887,6 +5887,99 @@
               <w:spacing w:after="60"/>
             </w:pPr>
             <w:r>
+              <w:t xml:space="preserve">`kendrick_lamar`</w:t>
+            </w:r>
+          </w:p>
+        </w:tc>
+        <w:tc>
+          <w:tcPr>
+            <w:tcW w:type="pct" w:w="1285%"/>
+          </w:tcPr>
+          <w:p>
+            <w:pPr>
+              <w:spacing w:after="60"/>
+            </w:pPr>
+            <w:r>
+              <w:t xml:space="preserve">stepwise</w:t>
+            </w:r>
+          </w:p>
+        </w:tc>
+        <w:tc>
+          <w:tcPr>
+            <w:tcW w:type="pct" w:w="1285%"/>
+          </w:tcPr>
+          <w:p>
+            <w:pPr>
+              <w:spacing w:after="60"/>
+            </w:pPr>
+            <w:r>
+              <w:t xml:space="preserve">eighth_patterns</w:t>
+            </w:r>
+          </w:p>
+        </w:tc>
+        <w:tc>
+          <w:tcPr>
+            <w:tcW w:type="pct" w:w="1285%"/>
+          </w:tcPr>
+          <w:p>
+            <w:pPr>
+              <w:spacing w:after="60"/>
+            </w:pPr>
+            <w:r>
+              <w:t xml:space="preserve">3</w:t>
+            </w:r>
+          </w:p>
+        </w:tc>
+        <w:tc>
+          <w:tcPr>
+            <w:tcW w:type="pct" w:w="1285%"/>
+          </w:tcPr>
+          <w:p>
+            <w:pPr>
+              <w:spacing w:after="60"/>
+            </w:pPr>
+            <w:r>
+              <w:t xml:space="preserve">0.5</w:t>
+            </w:r>
+          </w:p>
+        </w:tc>
+        <w:tc>
+          <w:tcPr>
+            <w:tcW w:type="pct" w:w="1285%"/>
+          </w:tcPr>
+          <w:p>
+            <w:pPr>
+              <w:spacing w:after="60"/>
+            </w:pPr>
+            <w:r>
+              <w:t xml:space="preserve">speech_contour</w:t>
+            </w:r>
+          </w:p>
+        </w:tc>
+        <w:tc>
+          <w:tcPr>
+            <w:tcW w:type="pct" w:w="1285%"/>
+          </w:tcPr>
+          <w:p>
+            <w:pPr>
+              <w:spacing w:after="60"/>
+            </w:pPr>
+            <w:r>
+              <w:t xml:space="preserve">flow_modulation; syllabic_ostinato; pitch_zone_contrast; barline_displacement; triplet_switch</w:t>
+            </w:r>
+          </w:p>
+        </w:tc>
+      </w:tr>
+      <w:tr>
+        <w:tc>
+          <w:tcPr>
+            <w:tcW w:type="pct" w:w="1285%"/>
+          </w:tcPr>
+          <w:p>
+            <w:pPr>
+              <w:spacing w:after="60"/>
+            </w:pPr>
+            <w:r>
               <w:t xml:space="preserve">`kurt_weill`</w:t>
             </w:r>
           </w:p>
@@ -6027,7 +6120,7 @@
         <w:t xml:space="preserve">`MELODY_PROFILES`</w:t>
       </w:r>
       <w:r>
-        <w:t xml:space="preserve"> cardinality (≥35 keys), distinct </w:t>
+        <w:t xml:space="preserve"> cardinality (≥36 keys), distinct </w:t>
       </w:r>
       <w:r>
         <w:rPr>
@@ -8643,6 +8736,2203 @@
           <w:bCs/>
         </w:rPr>
         <w:t xml:space="preserve">bebop ii–V setup</w:t>
+      </w:r>
+      <w:r>
+        <w:t xml:space="preserve">.</w:t>
+      </w:r>
+    </w:p>
+    <w:p>
+      <w:pPr>
+        <w:pStyle w:val="Heading1"/>
+        <w:spacing w:after="120" w:before="200"/>
+      </w:pPr>
+      <w:r>
+        <w:t xml:space="preserve">Miles Davis (`miles_davis`) — Song Mode harmony slice (three period contexts)</w:t>
+      </w:r>
+    </w:p>
+    <w:p>
+      <w:pPr>
+        <w:spacing w:after="160"/>
+      </w:pPr>
+      <w:r>
+        <w:t xml:space="preserve">Primary songwriter </w:t>
+      </w:r>
+      <w:r>
+        <w:rPr>
+          <w:b/>
+          <w:bCs/>
+        </w:rPr>
+        <w:t xml:space="preserve">`miles_davis`</w:t>
+      </w:r>
+      <w:r>
+        <w:t xml:space="preserve"> runs </w:t>
+      </w:r>
+      <w:r>
+        <w:rPr>
+          <w:b/>
+          <w:bCs/>
+        </w:rPr>
+        <w:t xml:space="preserve">`milesDavisSlice.ts`</w:t>
+      </w:r>
+      <w:r>
+        <w:t xml:space="preserve"> on the golden-path duo timeline (</w:t>
+      </w:r>
+      <w:r>
+        <w:rPr>
+          <w:b/>
+          <w:bCs/>
+        </w:rPr>
+        <w:t xml:space="preserve">`precomputeMilesDavisEffectiveHarmonyBars`</w:t>
+      </w:r>
+      <w:r>
+        <w:t xml:space="preserve"> → </w:t>
+      </w:r>
+      <w:r>
+        <w:rPr>
+          <w:b/>
+          <w:bCs/>
+        </w:rPr>
+        <w:t xml:space="preserve">`milesDavisEffectiveHarmonyBars`</w:t>
+      </w:r>
+      <w:r>
+        <w:t xml:space="preserve"> for </w:t>
+      </w:r>
+      <w:r>
+        <w:rPr>
+          <w:b/>
+          <w:bCs/>
+        </w:rPr>
+        <w:t xml:space="preserve">`getChordForBar`</w:t>
+      </w:r>
+      <w:r>
+        <w:t xml:space="preserve">, </w:t>
+      </w:r>
+      <w:r>
+        <w:rPr>
+          <w:b/>
+          <w:bCs/>
+        </w:rPr>
+        <w:t xml:space="preserve">`customLockedHarmonyRouting`</w:t>
+      </w:r>
+      <w:r>
+        <w:t xml:space="preserve">, </w:t>
+      </w:r>
+      <w:r>
+        <w:rPr>
+          <w:b/>
+          <w:bCs/>
+        </w:rPr>
+        <w:t xml:space="preserve">`runGoldenPath`</w:t>
+      </w:r>
+      <w:r>
+        <w:t xml:space="preserve"> locked export truth, </w:t>
+      </w:r>
+      <w:r>
+        <w:rPr>
+          <w:b/>
+          <w:bCs/>
+        </w:rPr>
+        <w:t xml:space="preserve">`composerOsAppGeneration`</w:t>
+      </w:r>
+      <w:r>
+        <w:t xml:space="preserve">). </w:t>
+      </w:r>
+      <w:r>
+        <w:rPr>
+          <w:b/>
+          <w:bCs/>
+        </w:rPr>
+        <w:t xml:space="preserve">`GenerationMetadata.milesDavisContext`</w:t>
+      </w:r>
+      <w:r>
+        <w:t xml:space="preserve"> selects the period (</w:t>
+      </w:r>
+      <w:r>
+        <w:rPr>
+          <w:b/>
+          <w:bCs/>
+        </w:rPr>
+        <w:t xml:space="preserve">default `modal_1959`</w:t>
+      </w:r>
+      <w:r>
+        <w:t xml:space="preserve">): </w:t>
+      </w:r>
+      <w:r>
+        <w:rPr>
+          <w:b/>
+          <w:bCs/>
+        </w:rPr>
+        <w:t xml:space="preserve">`modal_1959`</w:t>
+      </w:r>
+      <w:r>
+        <w:t xml:space="preserve"> · </w:t>
+      </w:r>
+      <w:r>
+        <w:rPr>
+          <w:b/>
+          <w:bCs/>
+        </w:rPr>
+        <w:t xml:space="preserve">`quintet_1965`</w:t>
+      </w:r>
+      <w:r>
+        <w:t xml:space="preserve"> · </w:t>
+      </w:r>
+      <w:r>
+        <w:rPr>
+          <w:b/>
+          <w:bCs/>
+        </w:rPr>
+        <w:t xml:space="preserve">`electric_1970`</w:t>
+      </w:r>
+      <w:r>
+        <w:t xml:space="preserve">. API contract: </w:t>
+      </w:r>
+      <w:r>
+        <w:rPr>
+          <w:b/>
+          <w:bCs/>
+        </w:rPr>
+        <w:t xml:space="preserve">`GenerateRequest.milesDavisContext`</w:t>
+      </w:r>
+      <w:r>
+        <w:t xml:space="preserve"> (echoed on manifests). Receipts use prefix </w:t>
+      </w:r>
+      <w:r>
+        <w:rPr>
+          <w:b/>
+          <w:bCs/>
+        </w:rPr>
+        <w:t xml:space="preserve">`md:`</w:t>
+      </w:r>
+      <w:r>
+        <w:t xml:space="preserve">. Alias </w:t>
+      </w:r>
+      <w:r>
+        <w:rPr>
+          <w:b/>
+          <w:bCs/>
+        </w:rPr>
+        <w:t xml:space="preserve">`miles`</w:t>
+      </w:r>
+      <w:r>
+        <w:t xml:space="preserve"> → </w:t>
+      </w:r>
+      <w:r>
+        <w:rPr>
+          <w:b/>
+          <w:bCs/>
+        </w:rPr>
+        <w:t xml:space="preserve">`miles_davis`</w:t>
+      </w:r>
+      <w:r>
+        <w:t xml:space="preserve"> via </w:t>
+      </w:r>
+      <w:r>
+        <w:rPr>
+          <w:b/>
+          <w:bCs/>
+        </w:rPr>
+        <w:t xml:space="preserve">`normalizeSongwriterStyleKey`</w:t>
+      </w:r>
+      <w:r>
+        <w:t xml:space="preserve">.</w:t>
+      </w:r>
+    </w:p>
+    <w:p>
+      <w:pPr>
+        <w:pStyle w:val="Heading2"/>
+        <w:spacing w:after="100" w:before="160"/>
+      </w:pPr>
+      <w:r>
+        <w:t xml:space="preserve">Period contexts (harmonic bias)</w:t>
+      </w:r>
+    </w:p>
+    <w:tbl>
+      <w:tblPr>
+        <w:tblW w:type="pct" w:w="100%"/>
+        <w:tblBorders>
+          <w:top w:val="single" w:color="auto" w:sz="4"/>
+          <w:left w:val="single" w:color="auto" w:sz="4"/>
+          <w:bottom w:val="single" w:color="auto" w:sz="4"/>
+          <w:right w:val="single" w:color="auto" w:sz="4"/>
+          <w:insideH w:val="single" w:color="auto" w:sz="4"/>
+          <w:insideV w:val="single" w:color="auto" w:sz="4"/>
+        </w:tblBorders>
+      </w:tblPr>
+      <w:tblGrid>
+        <w:gridCol w:w="4500"/>
+        <w:gridCol w:w="4500"/>
+      </w:tblGrid>
+      <w:tr>
+        <w:tc>
+          <w:tcPr>
+            <w:tcW w:type="pct" w:w="4500%"/>
+          </w:tcPr>
+          <w:p>
+            <w:pPr>
+              <w:spacing w:after="60"/>
+            </w:pPr>
+            <w:r>
+              <w:t xml:space="preserve">Context</w:t>
+            </w:r>
+          </w:p>
+        </w:tc>
+        <w:tc>
+          <w:tcPr>
+            <w:tcW w:type="pct" w:w="4500%"/>
+          </w:tcPr>
+          <w:p>
+            <w:pPr>
+              <w:spacing w:after="60"/>
+            </w:pPr>
+            <w:r>
+              <w:t xml:space="preserve">Role</w:t>
+            </w:r>
+          </w:p>
+        </w:tc>
+      </w:tr>
+      <w:tr>
+        <w:tc>
+          <w:tcPr>
+            <w:tcW w:type="pct" w:w="4500%"/>
+          </w:tcPr>
+          <w:p>
+            <w:pPr>
+              <w:spacing w:after="60"/>
+            </w:pPr>
+            <w:r>
+              <w:rPr>
+                <w:b/>
+                <w:bCs/>
+              </w:rPr>
+              <w:t xml:space="preserve">`modal_1959`</w:t>
+            </w:r>
+          </w:p>
+        </w:tc>
+        <w:tc>
+          <w:tcPr>
+            <w:tcW w:type="pct" w:w="4500%"/>
+          </w:tcPr>
+          <w:p>
+            <w:pPr>
+              <w:spacing w:after="60"/>
+            </w:pPr>
+            <w:r>
+              <w:t xml:space="preserve">Stage‑1 enrichments favour </w:t>
+            </w:r>
+            <w:r>
+              <w:rPr>
+                <w:b/>
+                <w:bCs/>
+              </w:rPr>
+              <w:t xml:space="preserve">Dorian / Lydian–Mixolydian</w:t>
+            </w:r>
+            <w:r>
+              <w:t xml:space="preserve"> colours; </w:t>
+            </w:r>
+            <w:r>
+              <w:rPr>
+                <w:b/>
+                <w:bCs/>
+              </w:rPr>
+              <w:t xml:space="preserve">d1</w:t>
+            </w:r>
+            <w:r>
+              <w:t xml:space="preserve"> </w:t>
+            </w:r>
+            <w:r>
+              <w:rPr>
+                <w:b/>
+                <w:bCs/>
+              </w:rPr>
+              <w:t xml:space="preserve">`applyModalCenterPass`</w:t>
+            </w:r>
+            <w:r>
+              <w:t xml:space="preserve"> (85% attempt) tags </w:t>
+            </w:r>
+            <w:r>
+              <w:rPr>
+                <w:b/>
+                <w:bCs/>
+              </w:rPr>
+              <w:t xml:space="preserve">`md:modal_center@bar{N}`</w:t>
+            </w:r>
+            <w:r>
+              <w:t xml:space="preserve"> and fills </w:t>
+            </w:r>
+            <w:r>
+              <w:rPr>
+                <w:b/>
+                <w:bCs/>
+              </w:rPr>
+              <w:t xml:space="preserve">`milesDavisModalCenterBars`</w:t>
+            </w:r>
+            <w:r>
+              <w:t xml:space="preserve"> with per-bar modal labels. Phrase lengths weighted </w:t>
+            </w:r>
+            <w:r>
+              <w:rPr>
+                <w:b/>
+                <w:bCs/>
+              </w:rPr>
+              <w:t xml:space="preserve">4 / 2 / 6 / 8</w:t>
+            </w:r>
+            <w:r>
+              <w:t xml:space="preserve"> bars (</w:t>
+            </w:r>
+            <w:r>
+              <w:rPr>
+                <w:b/>
+                <w:bCs/>
+              </w:rPr>
+              <w:t xml:space="preserve">55% / 28% / 12% / 5%</w:t>
+            </w:r>
+            <w:r>
+              <w:t xml:space="preserve">).</w:t>
+            </w:r>
+          </w:p>
+        </w:tc>
+      </w:tr>
+      <w:tr>
+        <w:tc>
+          <w:tcPr>
+            <w:tcW w:type="pct" w:w="4500%"/>
+          </w:tcPr>
+          <w:p>
+            <w:pPr>
+              <w:spacing w:after="60"/>
+            </w:pPr>
+            <w:r>
+              <w:rPr>
+                <w:b/>
+                <w:bCs/>
+              </w:rPr>
+              <w:t xml:space="preserve">`quintet_1965`</w:t>
+            </w:r>
+          </w:p>
+        </w:tc>
+        <w:tc>
+          <w:tcPr>
+            <w:tcW w:type="pct" w:w="4500%"/>
+          </w:tcPr>
+          <w:p>
+            <w:pPr>
+              <w:spacing w:after="60"/>
+            </w:pPr>
+            <w:r>
+              <w:t xml:space="preserve">More chromatic </w:t>
+            </w:r>
+            <w:r>
+              <w:rPr>
+                <w:b/>
+                <w:bCs/>
+              </w:rPr>
+              <w:t xml:space="preserve">tonic/dominant</w:t>
+            </w:r>
+            <w:r>
+              <w:t xml:space="preserve"> dressing; </w:t>
+            </w:r>
+            <w:r>
+              <w:rPr>
+                <w:b/>
+                <w:bCs/>
+              </w:rPr>
+              <w:t xml:space="preserve">d2</w:t>
+            </w:r>
+            <w:r>
+              <w:t xml:space="preserve"> </w:t>
+            </w:r>
+            <w:r>
+              <w:rPr>
+                <w:b/>
+                <w:bCs/>
+              </w:rPr>
+              <w:t xml:space="preserve">`applyTimeNoChangesPass`</w:t>
+            </w:r>
+            <w:r>
+              <w:t xml:space="preserve"> (45%) rewrites bars toward </w:t>
+            </w:r>
+            <w:r>
+              <w:rPr>
+                <w:b/>
+                <w:bCs/>
+              </w:rPr>
+              <w:t xml:space="preserve">sus / 7sus4</w:t>
+            </w:r>
+            <w:r>
+              <w:t xml:space="preserve"> ambiguity — </w:t>
+            </w:r>
+            <w:r>
+              <w:rPr>
+                <w:b/>
+                <w:bCs/>
+              </w:rPr>
+              <w:t xml:space="preserve">`md:time_no_changes@bar{N}`</w:t>
+            </w:r>
+            <w:r>
+              <w:t xml:space="preserve">, </w:t>
+            </w:r>
+            <w:r>
+              <w:rPr>
+                <w:b/>
+                <w:bCs/>
+              </w:rPr>
+              <w:t xml:space="preserve">`milesDavisTimeNoChangesBars`</w:t>
+            </w:r>
+            <w:r>
+              <w:t xml:space="preserve">. Phrase grid </w:t>
+            </w:r>
+            <w:r>
+              <w:rPr>
+                <w:b/>
+                <w:bCs/>
+              </w:rPr>
+              <w:t xml:space="preserve">4 / 2 / 6 / 8</w:t>
+            </w:r>
+            <w:r>
+              <w:t xml:space="preserve"> (</w:t>
+            </w:r>
+            <w:r>
+              <w:rPr>
+                <w:b/>
+                <w:bCs/>
+              </w:rPr>
+              <w:t xml:space="preserve">45% / 35% / 15% / 5%</w:t>
+            </w:r>
+            <w:r>
+              <w:t xml:space="preserve">).</w:t>
+            </w:r>
+          </w:p>
+        </w:tc>
+      </w:tr>
+      <w:tr>
+        <w:tc>
+          <w:tcPr>
+            <w:tcW w:type="pct" w:w="4500%"/>
+          </w:tcPr>
+          <w:p>
+            <w:pPr>
+              <w:spacing w:after="60"/>
+            </w:pPr>
+            <w:r>
+              <w:rPr>
+                <w:b/>
+                <w:bCs/>
+              </w:rPr>
+              <w:t xml:space="preserve">`electric_1970`</w:t>
+            </w:r>
+          </w:p>
+        </w:tc>
+        <w:tc>
+          <w:tcPr>
+            <w:tcW w:type="pct" w:w="4500%"/>
+          </w:tcPr>
+          <w:p>
+            <w:pPr>
+              <w:spacing w:after="60"/>
+            </w:pPr>
+            <w:r>
+              <w:t xml:space="preserve">Shell chords skew </w:t>
+            </w:r>
+            <w:r>
+              <w:rPr>
+                <w:b/>
+                <w:bCs/>
+              </w:rPr>
+              <w:t xml:space="preserve">7sus4 / m7sus / 7(#9)</w:t>
+            </w:r>
+            <w:r>
+              <w:t xml:space="preserve">; </w:t>
+            </w:r>
+            <w:r>
+              <w:rPr>
+                <w:b/>
+                <w:bCs/>
+              </w:rPr>
+              <w:t xml:space="preserve">d3</w:t>
+            </w:r>
+            <w:r>
+              <w:t xml:space="preserve"> </w:t>
+            </w:r>
+            <w:r>
+              <w:rPr>
+                <w:b/>
+                <w:bCs/>
+              </w:rPr>
+              <w:t xml:space="preserve">`applyGrooveVampPass`</w:t>
+            </w:r>
+            <w:r>
+              <w:t xml:space="preserve"> (75% attempt, chart ≥16 bars) locks </w:t>
+            </w:r>
+            <w:r>
+              <w:rPr>
+                <w:b/>
+                <w:bCs/>
+              </w:rPr>
+              <w:t xml:space="preserve">16–32</w:t>
+            </w:r>
+            <w:r>
+              <w:t xml:space="preserve"> consecutive bars to a vamp centre — </w:t>
+            </w:r>
+            <w:r>
+              <w:rPr>
+                <w:b/>
+                <w:bCs/>
+              </w:rPr>
+              <w:t xml:space="preserve">`md:groove_vamp@bar{N}`</w:t>
+            </w:r>
+            <w:r>
+              <w:t xml:space="preserve">, </w:t>
+            </w:r>
+            <w:r>
+              <w:rPr>
+                <w:b/>
+                <w:bCs/>
+              </w:rPr>
+              <w:t xml:space="preserve">`milesDavisVampBars`</w:t>
+            </w:r>
+            <w:r>
+              <w:t xml:space="preserve">. Phrase grid favours longer spans: </w:t>
+            </w:r>
+            <w:r>
+              <w:rPr>
+                <w:b/>
+                <w:bCs/>
+              </w:rPr>
+              <w:t xml:space="preserve">4 / 8 / 16 / 2</w:t>
+            </w:r>
+            <w:r>
+              <w:t xml:space="preserve"> (</w:t>
+            </w:r>
+            <w:r>
+              <w:rPr>
+                <w:b/>
+                <w:bCs/>
+              </w:rPr>
+              <w:t xml:space="preserve">40% / 35% / 20% / 5%</w:t>
+            </w:r>
+            <w:r>
+              <w:t xml:space="preserve">).</w:t>
+            </w:r>
+          </w:p>
+        </w:tc>
+      </w:tr>
+    </w:tbl>
+    <w:p>
+      <w:pPr>
+        <w:spacing w:after="160"/>
+      </w:pPr>
+    </w:p>
+    <w:p>
+      <w:pPr>
+        <w:pStyle w:val="Heading2"/>
+        <w:spacing w:after="100" w:before="160"/>
+      </w:pPr>
+      <w:r>
+        <w:t xml:space="preserve">Stage 1 — bare-symbol enrichment (no receipts)</w:t>
+      </w:r>
+    </w:p>
+    <w:p>
+      <w:pPr>
+        <w:spacing w:after="80"/>
+        <w:ind w:left="360" w:hanging="260"/>
+      </w:pPr>
+      <w:r>
+        <w:t xml:space="preserve">• </w:t>
+      </w:r>
+      <w:r>
+        <w:rPr>
+          <w:b/>
+          <w:bCs/>
+        </w:rPr>
+        <w:t xml:space="preserve">Tonic / electric shells:</w:t>
+      </w:r>
+      <w:r>
+        <w:t xml:space="preserve"> period-specific splits for bare </w:t>
+      </w:r>
+      <w:r>
+        <w:rPr>
+          <w:b/>
+          <w:bCs/>
+        </w:rPr>
+        <w:t xml:space="preserve">major</w:t>
+      </w:r>
+      <w:r>
+        <w:t xml:space="preserve"> / </w:t>
+      </w:r>
+      <w:r>
+        <w:rPr>
+          <w:b/>
+          <w:bCs/>
+        </w:rPr>
+        <w:t xml:space="preserve">minor</w:t>
+      </w:r>
+      <w:r>
+        <w:t xml:space="preserve"> / </w:t>
+      </w:r>
+      <w:r>
+        <w:rPr>
+          <w:b/>
+          <w:bCs/>
+        </w:rPr>
+        <w:t xml:space="preserve">triads</w:t>
+      </w:r>
+      <w:r>
+        <w:t xml:space="preserve"> (see </w:t>
+      </w:r>
+      <w:r>
+        <w:rPr>
+          <w:b/>
+          <w:bCs/>
+        </w:rPr>
+        <w:t xml:space="preserve">`enrichMilesDavisTonic`</w:t>
+      </w:r>
+      <w:r>
+        <w:t xml:space="preserve"> — electric era pushes </w:t>
+      </w:r>
+      <w:r>
+        <w:rPr>
+          <w:b/>
+          <w:bCs/>
+        </w:rPr>
+        <w:t xml:space="preserve">dom7sus4</w:t>
+      </w:r>
+      <w:r>
+        <w:t xml:space="preserve">, </w:t>
+      </w:r>
+      <w:r>
+        <w:rPr>
+          <w:b/>
+          <w:bCs/>
+        </w:rPr>
+        <w:t xml:space="preserve">m7sus</w:t>
+      </w:r>
+      <w:r>
+        <w:t xml:space="preserve">, </w:t>
+      </w:r>
+      <w:r>
+        <w:rPr>
+          <w:b/>
+          <w:bCs/>
+        </w:rPr>
+        <w:t xml:space="preserve">7(#9)</w:t>
+      </w:r>
+      <w:r>
+        <w:t xml:space="preserve"> families).</w:t>
+      </w:r>
+    </w:p>
+    <w:p>
+      <w:pPr>
+        <w:spacing w:after="80"/>
+        <w:ind w:left="360" w:hanging="260"/>
+      </w:pPr>
+      <w:r>
+        <w:t xml:space="preserve">• </w:t>
+      </w:r>
+      <w:r>
+        <w:rPr>
+          <w:b/>
+          <w:bCs/>
+        </w:rPr>
+        <w:t xml:space="preserve">Dominant:</w:t>
+      </w:r>
+      <w:r>
+        <w:t xml:space="preserve"> </w:t>
+      </w:r>
+      <w:r>
+        <w:rPr>
+          <w:b/>
+          <w:bCs/>
+        </w:rPr>
+        <w:t xml:space="preserve">`modal_1959`</w:t>
+      </w:r>
+      <w:r>
+        <w:t xml:space="preserve"> → </w:t>
+      </w:r>
+      <w:r>
+        <w:rPr>
+          <w:b/>
+          <w:bCs/>
+        </w:rPr>
+        <w:t xml:space="preserve">7(9,#11,13)</w:t>
+      </w:r>
+      <w:r>
+        <w:t xml:space="preserve"> / </w:t>
+      </w:r>
+      <w:r>
+        <w:rPr>
+          <w:b/>
+          <w:bCs/>
+        </w:rPr>
+        <w:t xml:space="preserve">7(b9)</w:t>
+      </w:r>
+      <w:r>
+        <w:t xml:space="preserve"> / </w:t>
+      </w:r>
+      <w:r>
+        <w:rPr>
+          <w:b/>
+          <w:bCs/>
+        </w:rPr>
+        <w:t xml:space="preserve">9</w:t>
+      </w:r>
+      <w:r>
+        <w:t xml:space="preserve">; </w:t>
+      </w:r>
+      <w:r>
+        <w:rPr>
+          <w:b/>
+          <w:bCs/>
+        </w:rPr>
+        <w:t xml:space="preserve">`quintet_1965`</w:t>
+      </w:r>
+      <w:r>
+        <w:t xml:space="preserve"> → </w:t>
+      </w:r>
+      <w:r>
+        <w:rPr>
+          <w:b/>
+          <w:bCs/>
+        </w:rPr>
+        <w:t xml:space="preserve">7alt</w:t>
+      </w:r>
+      <w:r>
+        <w:t xml:space="preserve"> / </w:t>
+      </w:r>
+      <w:r>
+        <w:rPr>
+          <w:b/>
+          <w:bCs/>
+        </w:rPr>
+        <w:t xml:space="preserve">tritone sub</w:t>
+      </w:r>
+      <w:r>
+        <w:t xml:space="preserve"> / </w:t>
+      </w:r>
+      <w:r>
+        <w:rPr>
+          <w:b/>
+          <w:bCs/>
+        </w:rPr>
+        <w:t xml:space="preserve">13</w:t>
+      </w:r>
+      <w:r>
+        <w:t xml:space="preserve">; </w:t>
+      </w:r>
+      <w:r>
+        <w:rPr>
+          <w:b/>
+          <w:bCs/>
+        </w:rPr>
+        <w:t xml:space="preserve">`electric_1970`</w:t>
+      </w:r>
+      <w:r>
+        <w:t xml:space="preserve"> → </w:t>
+      </w:r>
+      <w:r>
+        <w:rPr>
+          <w:b/>
+          <w:bCs/>
+        </w:rPr>
+        <w:t xml:space="preserve">7sus4</w:t>
+      </w:r>
+      <w:r>
+        <w:t xml:space="preserve"> / </w:t>
+      </w:r>
+      <w:r>
+        <w:rPr>
+          <w:b/>
+          <w:bCs/>
+        </w:rPr>
+        <w:t xml:space="preserve">7(#9)</w:t>
+      </w:r>
+      <w:r>
+        <w:t xml:space="preserve"> / </w:t>
+      </w:r>
+      <w:r>
+        <w:rPr>
+          <w:b/>
+          <w:bCs/>
+        </w:rPr>
+        <w:t xml:space="preserve">13</w:t>
+      </w:r>
+      <w:r>
+        <w:t xml:space="preserve">.</w:t>
+      </w:r>
+    </w:p>
+    <w:p>
+      <w:pPr>
+        <w:spacing w:after="80"/>
+        <w:ind w:left="360" w:hanging="260"/>
+      </w:pPr>
+      <w:r>
+        <w:t xml:space="preserve">• </w:t>
+      </w:r>
+      <w:r>
+        <w:rPr>
+          <w:b/>
+          <w:bCs/>
+        </w:rPr>
+        <w:t xml:space="preserve">Minor (all contexts):</w:t>
+      </w:r>
+      <w:r>
+        <w:t xml:space="preserve"> bare minor → </w:t>
+      </w:r>
+      <w:r>
+        <w:rPr>
+          <w:b/>
+          <w:bCs/>
+        </w:rPr>
+        <w:t xml:space="preserve">m7</w:t>
+      </w:r>
+      <w:r>
+        <w:t xml:space="preserve"> / </w:t>
+      </w:r>
+      <w:r>
+        <w:rPr>
+          <w:b/>
+          <w:bCs/>
+        </w:rPr>
+        <w:t xml:space="preserve">m9</w:t>
+      </w:r>
+      <w:r>
+        <w:t xml:space="preserve"> / </w:t>
+      </w:r>
+      <w:r>
+        <w:rPr>
+          <w:b/>
+          <w:bCs/>
+        </w:rPr>
+        <w:t xml:space="preserve">m11</w:t>
+      </w:r>
+      <w:r>
+        <w:t xml:space="preserve"> mix (</w:t>
+      </w:r>
+      <w:r>
+        <w:rPr>
+          <w:b/>
+          <w:bCs/>
+        </w:rPr>
+        <w:t xml:space="preserve">`enrichMilesDavisMinor`</w:t>
+      </w:r>
+      <w:r>
+        <w:t xml:space="preserve">).</w:t>
+      </w:r>
+    </w:p>
+    <w:p>
+      <w:pPr>
+        <w:pStyle w:val="Heading2"/>
+        <w:spacing w:after="100" w:before="160"/>
+      </w:pPr>
+      <w:r>
+        <w:t xml:space="preserve">Stage 2 — harmonic devices (receipts)</w:t>
+      </w:r>
+    </w:p>
+    <w:tbl>
+      <w:tblPr>
+        <w:tblW w:type="pct" w:w="100%"/>
+        <w:tblBorders>
+          <w:top w:val="single" w:color="auto" w:sz="4"/>
+          <w:left w:val="single" w:color="auto" w:sz="4"/>
+          <w:bottom w:val="single" w:color="auto" w:sz="4"/>
+          <w:right w:val="single" w:color="auto" w:sz="4"/>
+          <w:insideH w:val="single" w:color="auto" w:sz="4"/>
+          <w:insideV w:val="single" w:color="auto" w:sz="4"/>
+        </w:tblBorders>
+      </w:tblPr>
+      <w:tblGrid>
+        <w:gridCol w:w="1800"/>
+        <w:gridCol w:w="1800"/>
+        <w:gridCol w:w="1800"/>
+        <w:gridCol w:w="1800"/>
+        <w:gridCol w:w="1800"/>
+      </w:tblGrid>
+      <w:tr>
+        <w:tc>
+          <w:tcPr>
+            <w:tcW w:type="pct" w:w="1800%"/>
+          </w:tcPr>
+          <w:p>
+            <w:pPr>
+              <w:spacing w:after="60"/>
+            </w:pPr>
+            <w:r>
+              <w:t xml:space="preserve">Id</w:t>
+            </w:r>
+          </w:p>
+        </w:tc>
+        <w:tc>
+          <w:tcPr>
+            <w:tcW w:type="pct" w:w="1800%"/>
+          </w:tcPr>
+          <w:p>
+            <w:pPr>
+              <w:spacing w:after="60"/>
+            </w:pPr>
+            <w:r>
+              <w:t xml:space="preserve">Pass</w:t>
+            </w:r>
+          </w:p>
+        </w:tc>
+        <w:tc>
+          <w:tcPr>
+            <w:tcW w:type="pct" w:w="1800%"/>
+          </w:tcPr>
+          <w:p>
+            <w:pPr>
+              <w:spacing w:after="60"/>
+            </w:pPr>
+            <w:r>
+              <w:t xml:space="preserve">Gate</w:t>
+            </w:r>
+          </w:p>
+        </w:tc>
+        <w:tc>
+          <w:tcPr>
+            <w:tcW w:type="pct" w:w="1800%"/>
+          </w:tcPr>
+          <w:p>
+            <w:pPr>
+              <w:spacing w:after="60"/>
+            </w:pPr>
+            <w:r>
+              <w:t xml:space="preserve">Receipt</w:t>
+            </w:r>
+          </w:p>
+        </w:tc>
+        <w:tc>
+          <w:tcPr>
+            <w:tcW w:type="pct" w:w="1800%"/>
+          </w:tcPr>
+          <w:p>
+            <w:pPr>
+              <w:spacing w:after="60"/>
+            </w:pPr>
+            <w:r>
+              <w:t xml:space="preserve">Metadata</w:t>
+            </w:r>
+          </w:p>
+        </w:tc>
+      </w:tr>
+      <w:tr>
+        <w:tc>
+          <w:tcPr>
+            <w:tcW w:type="pct" w:w="1800%"/>
+          </w:tcPr>
+          <w:p>
+            <w:pPr>
+              <w:spacing w:after="60"/>
+            </w:pPr>
+            <w:r>
+              <w:rPr>
+                <w:b/>
+                <w:bCs/>
+              </w:rPr>
+              <w:t xml:space="preserve">d1</w:t>
+            </w:r>
+          </w:p>
+        </w:tc>
+        <w:tc>
+          <w:tcPr>
+            <w:tcW w:type="pct" w:w="1800%"/>
+          </w:tcPr>
+          <w:p>
+            <w:pPr>
+              <w:spacing w:after="60"/>
+            </w:pPr>
+            <w:r>
+              <w:t xml:space="preserve">Modal centre</w:t>
+            </w:r>
+          </w:p>
+        </w:tc>
+        <w:tc>
+          <w:tcPr>
+            <w:tcW w:type="pct" w:w="1800%"/>
+          </w:tcPr>
+          <w:p>
+            <w:pPr>
+              <w:spacing w:after="60"/>
+            </w:pPr>
+            <w:r>
+              <w:rPr>
+                <w:b/>
+                <w:bCs/>
+              </w:rPr>
+              <w:t xml:space="preserve">`modal_1959` only</w:t>
+            </w:r>
+          </w:p>
+        </w:tc>
+        <w:tc>
+          <w:tcPr>
+            <w:tcW w:type="pct" w:w="1800%"/>
+          </w:tcPr>
+          <w:p>
+            <w:pPr>
+              <w:spacing w:after="60"/>
+            </w:pPr>
+            <w:r>
+              <w:rPr>
+                <w:b/>
+                <w:bCs/>
+              </w:rPr>
+              <w:t xml:space="preserve">`md:modal_center@bar{N}`</w:t>
+            </w:r>
+          </w:p>
+        </w:tc>
+        <w:tc>
+          <w:tcPr>
+            <w:tcW w:type="pct" w:w="1800%"/>
+          </w:tcPr>
+          <w:p>
+            <w:pPr>
+              <w:spacing w:after="60"/>
+            </w:pPr>
+            <w:r>
+              <w:rPr>
+                <w:b/>
+                <w:bCs/>
+              </w:rPr>
+              <w:t xml:space="preserve">`milesDavisModalCenterBars`</w:t>
+            </w:r>
+          </w:p>
+        </w:tc>
+      </w:tr>
+      <w:tr>
+        <w:tc>
+          <w:tcPr>
+            <w:tcW w:type="pct" w:w="1800%"/>
+          </w:tcPr>
+          <w:p>
+            <w:pPr>
+              <w:spacing w:after="60"/>
+            </w:pPr>
+            <w:r>
+              <w:rPr>
+                <w:b/>
+                <w:bCs/>
+              </w:rPr>
+              <w:t xml:space="preserve">d2</w:t>
+            </w:r>
+          </w:p>
+        </w:tc>
+        <w:tc>
+          <w:tcPr>
+            <w:tcW w:type="pct" w:w="1800%"/>
+          </w:tcPr>
+          <w:p>
+            <w:pPr>
+              <w:spacing w:after="60"/>
+            </w:pPr>
+            <w:r>
+              <w:t xml:space="preserve">Time no changes</w:t>
+            </w:r>
+          </w:p>
+        </w:tc>
+        <w:tc>
+          <w:tcPr>
+            <w:tcW w:type="pct" w:w="1800%"/>
+          </w:tcPr>
+          <w:p>
+            <w:pPr>
+              <w:spacing w:after="60"/>
+            </w:pPr>
+            <w:r>
+              <w:rPr>
+                <w:b/>
+                <w:bCs/>
+              </w:rPr>
+              <w:t xml:space="preserve">`quintet_1965` only</w:t>
+            </w:r>
+          </w:p>
+        </w:tc>
+        <w:tc>
+          <w:tcPr>
+            <w:tcW w:type="pct" w:w="1800%"/>
+          </w:tcPr>
+          <w:p>
+            <w:pPr>
+              <w:spacing w:after="60"/>
+            </w:pPr>
+            <w:r>
+              <w:rPr>
+                <w:b/>
+                <w:bCs/>
+              </w:rPr>
+              <w:t xml:space="preserve">`md:time_no_changes@bar{N}`</w:t>
+            </w:r>
+          </w:p>
+        </w:tc>
+        <w:tc>
+          <w:tcPr>
+            <w:tcW w:type="pct" w:w="1800%"/>
+          </w:tcPr>
+          <w:p>
+            <w:pPr>
+              <w:spacing w:after="60"/>
+            </w:pPr>
+            <w:r>
+              <w:rPr>
+                <w:b/>
+                <w:bCs/>
+              </w:rPr>
+              <w:t xml:space="preserve">`milesDavisTimeNoChangesBars`</w:t>
+            </w:r>
+          </w:p>
+        </w:tc>
+      </w:tr>
+      <w:tr>
+        <w:tc>
+          <w:tcPr>
+            <w:tcW w:type="pct" w:w="1800%"/>
+          </w:tcPr>
+          <w:p>
+            <w:pPr>
+              <w:spacing w:after="60"/>
+            </w:pPr>
+            <w:r>
+              <w:rPr>
+                <w:b/>
+                <w:bCs/>
+              </w:rPr>
+              <w:t xml:space="preserve">d3</w:t>
+            </w:r>
+          </w:p>
+        </w:tc>
+        <w:tc>
+          <w:tcPr>
+            <w:tcW w:type="pct" w:w="1800%"/>
+          </w:tcPr>
+          <w:p>
+            <w:pPr>
+              <w:spacing w:after="60"/>
+            </w:pPr>
+            <w:r>
+              <w:t xml:space="preserve">Groove vamp</w:t>
+            </w:r>
+          </w:p>
+        </w:tc>
+        <w:tc>
+          <w:tcPr>
+            <w:tcW w:type="pct" w:w="1800%"/>
+          </w:tcPr>
+          <w:p>
+            <w:pPr>
+              <w:spacing w:after="60"/>
+            </w:pPr>
+            <w:r>
+              <w:rPr>
+                <w:b/>
+                <w:bCs/>
+              </w:rPr>
+              <w:t xml:space="preserve">`electric_1970`</w:t>
+            </w:r>
+            <w:r>
+              <w:t xml:space="preserve">, </w:t>
+            </w:r>
+            <w:r>
+              <w:rPr>
+                <w:b/>
+                <w:bCs/>
+              </w:rPr>
+              <w:t xml:space="preserve">tb ≥ 16</w:t>
+            </w:r>
+          </w:p>
+        </w:tc>
+        <w:tc>
+          <w:tcPr>
+            <w:tcW w:type="pct" w:w="1800%"/>
+          </w:tcPr>
+          <w:p>
+            <w:pPr>
+              <w:spacing w:after="60"/>
+            </w:pPr>
+            <w:r>
+              <w:rPr>
+                <w:b/>
+                <w:bCs/>
+              </w:rPr>
+              <w:t xml:space="preserve">`md:groove_vamp@bar{N}`</w:t>
+            </w:r>
+          </w:p>
+        </w:tc>
+        <w:tc>
+          <w:tcPr>
+            <w:tcW w:type="pct" w:w="1800%"/>
+          </w:tcPr>
+          <w:p>
+            <w:pPr>
+              <w:spacing w:after="60"/>
+            </w:pPr>
+            <w:r>
+              <w:rPr>
+                <w:b/>
+                <w:bCs/>
+              </w:rPr>
+              <w:t xml:space="preserve">`milesDavisVampBars`</w:t>
+            </w:r>
+          </w:p>
+        </w:tc>
+      </w:tr>
+      <w:tr>
+        <w:tc>
+          <w:tcPr>
+            <w:tcW w:type="pct" w:w="1800%"/>
+          </w:tcPr>
+          <w:p>
+            <w:pPr>
+              <w:spacing w:after="60"/>
+            </w:pPr>
+            <w:r>
+              <w:rPr>
+                <w:b/>
+                <w:bCs/>
+              </w:rPr>
+              <w:t xml:space="preserve">d4</w:t>
+            </w:r>
+          </w:p>
+        </w:tc>
+        <w:tc>
+          <w:tcPr>
+            <w:tcW w:type="pct" w:w="1800%"/>
+          </w:tcPr>
+          <w:p>
+            <w:pPr>
+              <w:spacing w:after="60"/>
+            </w:pPr>
+            <w:r>
+              <w:t xml:space="preserve">Cool phrasing</w:t>
+            </w:r>
+          </w:p>
+        </w:tc>
+        <w:tc>
+          <w:tcPr>
+            <w:tcW w:type="pct" w:w="1800%"/>
+          </w:tcPr>
+          <w:p>
+            <w:pPr>
+              <w:spacing w:after="60"/>
+            </w:pPr>
+            <w:r>
+              <w:t xml:space="preserve">all contexts</w:t>
+            </w:r>
+          </w:p>
+        </w:tc>
+        <w:tc>
+          <w:tcPr>
+            <w:tcW w:type="pct" w:w="1800%"/>
+          </w:tcPr>
+          <w:p>
+            <w:pPr>
+              <w:spacing w:after="60"/>
+            </w:pPr>
+            <w:r>
+              <w:rPr>
+                <w:b/>
+                <w:bCs/>
+              </w:rPr>
+              <w:t xml:space="preserve">`md:cool_phrase@bar{N}`</w:t>
+            </w:r>
+          </w:p>
+        </w:tc>
+        <w:tc>
+          <w:tcPr>
+            <w:tcW w:type="pct" w:w="1800%"/>
+          </w:tcPr>
+          <w:p>
+            <w:pPr>
+              <w:spacing w:after="60"/>
+            </w:pPr>
+            <w:r>
+              <w:rPr>
+                <w:b/>
+                <w:bCs/>
+              </w:rPr>
+              <w:t xml:space="preserve">`milesDavisCoolMode`</w:t>
+            </w:r>
+            <w:r>
+              <w:t xml:space="preserve"> when any fire</w:t>
+            </w:r>
+          </w:p>
+        </w:tc>
+      </w:tr>
+      <w:tr>
+        <w:tc>
+          <w:tcPr>
+            <w:tcW w:type="pct" w:w="1800%"/>
+          </w:tcPr>
+          <w:p>
+            <w:pPr>
+              <w:spacing w:after="60"/>
+            </w:pPr>
+            <w:r>
+              <w:rPr>
+                <w:b/>
+                <w:bCs/>
+              </w:rPr>
+              <w:t xml:space="preserve">d5</w:t>
+            </w:r>
+          </w:p>
+        </w:tc>
+        <w:tc>
+          <w:tcPr>
+            <w:tcW w:type="pct" w:w="1800%"/>
+          </w:tcPr>
+          <w:p>
+            <w:pPr>
+              <w:spacing w:after="60"/>
+            </w:pPr>
+            <w:r>
+              <w:t xml:space="preserve">Harmon-mute colour</w:t>
+            </w:r>
+          </w:p>
+        </w:tc>
+        <w:tc>
+          <w:tcPr>
+            <w:tcW w:type="pct" w:w="1800%"/>
+          </w:tcPr>
+          <w:p>
+            <w:pPr>
+              <w:spacing w:after="60"/>
+            </w:pPr>
+            <w:r>
+              <w:t xml:space="preserve">phrase endings + slow-pass gate (</w:t>
+            </w:r>
+            <w:r>
+              <w:rPr>
+                <w:b/>
+                <w:bCs/>
+              </w:rPr>
+              <w:t xml:space="preserve">35%</w:t>
+            </w:r>
+            <w:r>
+              <w:t xml:space="preserve">)</w:t>
+            </w:r>
+          </w:p>
+        </w:tc>
+        <w:tc>
+          <w:tcPr>
+            <w:tcW w:type="pct" w:w="1800%"/>
+          </w:tcPr>
+          <w:p>
+            <w:pPr>
+              <w:spacing w:after="60"/>
+            </w:pPr>
+            <w:r>
+              <w:rPr>
+                <w:b/>
+                <w:bCs/>
+              </w:rPr>
+              <w:t xml:space="preserve">`md:harmon_color@bar{N}`</w:t>
+            </w:r>
+          </w:p>
+        </w:tc>
+        <w:tc>
+          <w:tcPr>
+            <w:tcW w:type="pct" w:w="1800%"/>
+          </w:tcPr>
+          <w:p>
+            <w:pPr>
+              <w:spacing w:after="60"/>
+            </w:pPr>
+            <w:r>
+              <w:t xml:space="preserve">extends </w:t>
+            </w:r>
+            <w:r>
+              <w:rPr>
+                <w:b/>
+                <w:bCs/>
+              </w:rPr>
+              <w:t xml:space="preserve">maj9(#11)</w:t>
+            </w:r>
+            <w:r>
+              <w:t xml:space="preserve">, </w:t>
+            </w:r>
+            <w:r>
+              <w:rPr>
+                <w:b/>
+                <w:bCs/>
+              </w:rPr>
+              <w:t xml:space="preserve">m9/m11</w:t>
+            </w:r>
+            <w:r>
+              <w:t xml:space="preserve">, </w:t>
+            </w:r>
+            <w:r>
+              <w:rPr>
+                <w:b/>
+                <w:bCs/>
+              </w:rPr>
+              <w:t xml:space="preserve">7(9,13)</w:t>
+            </w:r>
+          </w:p>
+        </w:tc>
+      </w:tr>
+    </w:tbl>
+    <w:p>
+      <w:pPr>
+        <w:spacing w:after="160"/>
+      </w:pPr>
+    </w:p>
+    <w:p>
+      <w:pPr>
+        <w:pStyle w:val="Heading2"/>
+        <w:spacing w:after="100" w:before="160"/>
+      </w:pPr>
+      <w:r>
+        <w:t xml:space="preserve">Style surface (period nudges)</w:t>
+      </w:r>
+    </w:p>
+    <w:p>
+      <w:pPr>
+        <w:spacing w:after="160"/>
+      </w:pPr>
+      <w:r>
+        <w:rPr>
+          <w:b/>
+          <w:bCs/>
+        </w:rPr>
+        <w:t xml:space="preserve">`applyMilesDavisStyleSurface`</w:t>
+      </w:r>
+      <w:r>
+        <w:t xml:space="preserve"> runs for primary </w:t>
+      </w:r>
+      <w:r>
+        <w:rPr>
+          <w:b/>
+          <w:bCs/>
+        </w:rPr>
+        <w:t xml:space="preserve">`miles_davis`</w:t>
+      </w:r>
+      <w:r>
+        <w:t xml:space="preserve"> (after Monk / Zappa surfaces in the stack): </w:t>
+      </w:r>
+      <w:r>
+        <w:rPr>
+          <w:b/>
+          <w:bCs/>
+        </w:rPr>
+        <w:t xml:space="preserve">`modal_1959`</w:t>
+      </w:r>
+      <w:r>
+        <w:t xml:space="preserve"> → density </w:t>
+      </w:r>
+      <w:r>
+        <w:rPr>
+          <w:b/>
+          <w:bCs/>
+        </w:rPr>
+        <w:t xml:space="preserve">−0.25</w:t>
+      </w:r>
+      <w:r>
+        <w:t xml:space="preserve">, syncopation </w:t>
+      </w:r>
+      <w:r>
+        <w:rPr>
+          <w:b/>
+          <w:bCs/>
+        </w:rPr>
+        <w:t xml:space="preserve">−0.05</w:t>
+      </w:r>
+      <w:r>
+        <w:t xml:space="preserve">, space </w:t>
+      </w:r>
+      <w:r>
+        <w:rPr>
+          <w:b/>
+          <w:bCs/>
+        </w:rPr>
+        <w:t xml:space="preserve">+0.35</w:t>
+      </w:r>
+      <w:r>
+        <w:t xml:space="preserve">, cadence softness </w:t>
+      </w:r>
+      <w:r>
+        <w:rPr>
+          <w:b/>
+          <w:bCs/>
+        </w:rPr>
+        <w:t xml:space="preserve">+0.30</w:t>
+      </w:r>
+      <w:r>
+        <w:t xml:space="preserve">; </w:t>
+      </w:r>
+      <w:r>
+        <w:rPr>
+          <w:b/>
+          <w:bCs/>
+        </w:rPr>
+        <w:t xml:space="preserve">`quintet_1965`</w:t>
+      </w:r>
+      <w:r>
+        <w:t xml:space="preserve"> → </w:t>
+      </w:r>
+      <w:r>
+        <w:rPr>
+          <w:b/>
+          <w:bCs/>
+        </w:rPr>
+        <w:t xml:space="preserve">−0.12</w:t>
+      </w:r>
+      <w:r>
+        <w:t xml:space="preserve"> / </w:t>
+      </w:r>
+      <w:r>
+        <w:rPr>
+          <w:b/>
+          <w:bCs/>
+        </w:rPr>
+        <w:t xml:space="preserve">+0.10</w:t>
+      </w:r>
+      <w:r>
+        <w:t xml:space="preserve"> / </w:t>
+      </w:r>
+      <w:r>
+        <w:rPr>
+          <w:b/>
+          <w:bCs/>
+        </w:rPr>
+        <w:t xml:space="preserve">+0.25</w:t>
+      </w:r>
+      <w:r>
+        <w:t xml:space="preserve"> / </w:t>
+      </w:r>
+      <w:r>
+        <w:rPr>
+          <w:b/>
+          <w:bCs/>
+        </w:rPr>
+        <w:t xml:space="preserve">+0.20</w:t>
+      </w:r>
+      <w:r>
+        <w:t xml:space="preserve">; </w:t>
+      </w:r>
+      <w:r>
+        <w:rPr>
+          <w:b/>
+          <w:bCs/>
+        </w:rPr>
+        <w:t xml:space="preserve">`electric_1970`</w:t>
+      </w:r>
+      <w:r>
+        <w:t xml:space="preserve"> → </w:t>
+      </w:r>
+      <w:r>
+        <w:rPr>
+          <w:b/>
+          <w:bCs/>
+        </w:rPr>
+        <w:t xml:space="preserve">+0.08</w:t>
+      </w:r>
+      <w:r>
+        <w:t xml:space="preserve"> / </w:t>
+      </w:r>
+      <w:r>
+        <w:rPr>
+          <w:b/>
+          <w:bCs/>
+        </w:rPr>
+        <w:t xml:space="preserve">+0.22</w:t>
+      </w:r>
+      <w:r>
+        <w:t xml:space="preserve"> / </w:t>
+      </w:r>
+      <w:r>
+        <w:rPr>
+          <w:b/>
+          <w:bCs/>
+        </w:rPr>
+        <w:t xml:space="preserve">+0.10</w:t>
+      </w:r>
+      <w:r>
+        <w:t xml:space="preserve"> / </w:t>
+      </w:r>
+      <w:r>
+        <w:rPr>
+          <w:b/>
+          <w:bCs/>
+        </w:rPr>
+        <w:t xml:space="preserve">+0.15</w:t>
+      </w:r>
+      <w:r>
+        <w:t xml:space="preserve">.</w:t>
+      </w:r>
+    </w:p>
+    <w:p>
+      <w:pPr>
+        <w:pStyle w:val="Heading2"/>
+        <w:spacing w:after="100" w:before="160"/>
+      </w:pPr>
+      <w:r>
+        <w:t xml:space="preserve">Melody planner row</w:t>
+      </w:r>
+    </w:p>
+    <w:p>
+      <w:pPr>
+        <w:spacing w:after="160"/>
+      </w:pPr>
+      <w:r>
+        <w:rPr>
+          <w:b/>
+          <w:bCs/>
+        </w:rPr>
+        <w:t xml:space="preserve">`MELODY_PROFILES['miles_davis']`</w:t>
+      </w:r>
+      <w:r>
+        <w:t xml:space="preserve"> — stepwise · mixed rhythm · </w:t>
+      </w:r>
+      <w:r>
+        <w:rPr>
+          <w:b/>
+          <w:bCs/>
+        </w:rPr>
+        <w:t xml:space="preserve">repetitionVsVariationBias 0.72</w:t>
+      </w:r>
+      <w:r>
+        <w:t xml:space="preserve"> · phrase </w:t>
+      </w:r>
+      <w:r>
+        <w:rPr>
+          <w:b/>
+          <w:bCs/>
+        </w:rPr>
+        <w:t xml:space="preserve">4</w:t>
+      </w:r>
+      <w:r>
+        <w:t xml:space="preserve"> · arch contour · cadence </w:t>
+      </w:r>
+      <w:r>
+        <w:rPr>
+          <w:b/>
+          <w:bCs/>
+        </w:rPr>
+        <w:t xml:space="preserve">low</w:t>
+      </w:r>
+      <w:r>
+        <w:t xml:space="preserve"> · devices </w:t>
+      </w:r>
+      <w:r>
+        <w:rPr>
+          <w:b/>
+          <w:bCs/>
+        </w:rPr>
+        <w:t xml:space="preserve">`modal_field`</w:t>
+      </w:r>
+      <w:r>
+        <w:t xml:space="preserve">, </w:t>
+      </w:r>
+      <w:r>
+        <w:rPr>
+          <w:b/>
+          <w:bCs/>
+        </w:rPr>
+        <w:t xml:space="preserve">`breath_space`</w:t>
+      </w:r>
+      <w:r>
+        <w:t xml:space="preserve">, </w:t>
+      </w:r>
+      <w:r>
+        <w:rPr>
+          <w:b/>
+          <w:bCs/>
+        </w:rPr>
+        <w:t xml:space="preserve">`deliberate_silence`</w:t>
+      </w:r>
+      <w:r>
+        <w:t xml:space="preserve">, </w:t>
+      </w:r>
+      <w:r>
+        <w:rPr>
+          <w:b/>
+          <w:bCs/>
+        </w:rPr>
+        <w:t xml:space="preserve">`cool_phrasing`</w:t>
+      </w:r>
+      <w:r>
+        <w:t xml:space="preserve">, </w:t>
+      </w:r>
+      <w:r>
+        <w:rPr>
+          <w:b/>
+          <w:bCs/>
+        </w:rPr>
+        <w:t xml:space="preserve">`motivic_cell`</w:t>
+      </w:r>
+      <w:r>
+        <w:t xml:space="preserve">.</w:t>
+      </w:r>
+    </w:p>
+    <w:p>
+      <w:pPr>
+        <w:pStyle w:val="Heading2"/>
+        <w:spacing w:after="100" w:before="160"/>
+      </w:pPr>
+      <w:r>
+        <w:t xml:space="preserve">Six example applications (pick context before locking harmony)</w:t>
+      </w:r>
+    </w:p>
+    <w:p>
+      <w:pPr>
+        <w:spacing w:after="160"/>
+      </w:pPr>
+      <w:r>
+        <w:t xml:space="preserve">1. </w:t>
+      </w:r>
+      <w:r>
+        <w:rPr>
+          <w:b/>
+          <w:bCs/>
+        </w:rPr>
+        <w:t xml:space="preserve">Modal plate (`modal_1959`)</w:t>
+      </w:r>
+      <w:r>
+        <w:t xml:space="preserve"> — </w:t>
+      </w:r>
+      <w:r>
+        <w:rPr>
+          <w:b/>
+          <w:bCs/>
+        </w:rPr>
+        <w:t xml:space="preserve">32-bar</w:t>
+      </w:r>
+      <w:r>
+        <w:t xml:space="preserve"> chart, moderate tempo, </w:t>
+      </w:r>
+      <w:r>
+        <w:rPr>
+          <w:b/>
+          <w:bCs/>
+        </w:rPr>
+        <w:t xml:space="preserve">custom_locked</w:t>
+      </w:r>
+      <w:r>
+        <w:t xml:space="preserve"> or built-in progression with clear </w:t>
+      </w:r>
+      <w:r>
+        <w:rPr>
+          <w:b/>
+          <w:bCs/>
+        </w:rPr>
+        <w:t xml:space="preserve">tonic minor / Mixolydian dominant</w:t>
+      </w:r>
+      <w:r>
+        <w:t xml:space="preserve"> poles. Expect </w:t>
+      </w:r>
+      <w:r>
+        <w:rPr>
+          <w:b/>
+          <w:bCs/>
+        </w:rPr>
+        <w:t xml:space="preserve">`md:modal_center`</w:t>
+      </w:r>
+      <w:r>
+        <w:t xml:space="preserve"> receipts + </w:t>
+      </w:r>
+      <w:r>
+        <w:rPr>
+          <w:b/>
+          <w:bCs/>
+        </w:rPr>
+        <w:t xml:space="preserve">long 4-bar phrases</w:t>
+      </w:r>
+      <w:r>
+        <w:t xml:space="preserve"> weighting; use when the lesson is </w:t>
+      </w:r>
+      <w:r>
+        <w:rPr>
+          <w:b/>
+          <w:bCs/>
+        </w:rPr>
+        <w:t xml:space="preserve">static modality</w:t>
+      </w:r>
+      <w:r>
+        <w:t xml:space="preserve">, not turnaround velocity. 2. </w:t>
+      </w:r>
+      <w:r>
+        <w:rPr>
+          <w:b/>
+          <w:bCs/>
+        </w:rPr>
+        <w:t xml:space="preserve">Quintet ambiguity (`quintet_1965`)</w:t>
+      </w:r>
+      <w:r>
+        <w:t xml:space="preserve"> — Same chart length; flip </w:t>
+      </w:r>
+      <w:r>
+        <w:rPr>
+          <w:b/>
+          <w:bCs/>
+        </w:rPr>
+        <w:t xml:space="preserve">`milesDavisContext`</w:t>
+      </w:r>
+      <w:r>
+        <w:t xml:space="preserve"> to </w:t>
+      </w:r>
+      <w:r>
+        <w:rPr>
+          <w:b/>
+          <w:bCs/>
+        </w:rPr>
+        <w:t xml:space="preserve">`quintet_1965`</w:t>
+      </w:r>
+      <w:r>
+        <w:t xml:space="preserve">. Watch </w:t>
+      </w:r>
+      <w:r>
+        <w:rPr>
+          <w:b/>
+          <w:bCs/>
+        </w:rPr>
+        <w:t xml:space="preserve">`md:time_no_changes`</w:t>
+      </w:r>
+      <w:r>
+        <w:t xml:space="preserve"> on bars rewritten to </w:t>
+      </w:r>
+      <w:r>
+        <w:rPr>
+          <w:b/>
+          <w:bCs/>
+        </w:rPr>
+        <w:t xml:space="preserve">sus</w:t>
+      </w:r>
+      <w:r>
+        <w:t xml:space="preserve"> families — good for </w:t>
+      </w:r>
+      <w:r>
+        <w:rPr>
+          <w:b/>
+          <w:bCs/>
+        </w:rPr>
+        <w:t xml:space="preserve">harmonic float</w:t>
+      </w:r>
+      <w:r>
+        <w:t xml:space="preserve"> and </w:t>
+      </w:r>
+      <w:r>
+        <w:rPr>
+          <w:b/>
+          <w:bCs/>
+        </w:rPr>
+        <w:t xml:space="preserve">fewer iii–VI–ii–V clichés</w:t>
+      </w:r>
+      <w:r>
+        <w:t xml:space="preserve"> on the lead sheet. 3. </w:t>
+      </w:r>
+      <w:r>
+        <w:rPr>
+          <w:b/>
+          <w:bCs/>
+        </w:rPr>
+        <w:t xml:space="preserve">Electric vamp (`electric_1970`)</w:t>
+      </w:r>
+      <w:r>
+        <w:t xml:space="preserve"> — </w:t>
+      </w:r>
+      <w:r>
+        <w:rPr>
+          <w:b/>
+          <w:bCs/>
+        </w:rPr>
+        <w:t xml:space="preserve">≥16 bars</w:t>
+      </w:r>
+      <w:r>
+        <w:t xml:space="preserve">, slower groove preset if available; </w:t>
+      </w:r>
+      <w:r>
+        <w:rPr>
+          <w:b/>
+          <w:bCs/>
+        </w:rPr>
+        <w:t xml:space="preserve">`md:groove_vamp`</w:t>
+      </w:r>
+      <w:r>
+        <w:t xml:space="preserve"> spans </w:t>
+      </w:r>
+      <w:r>
+        <w:rPr>
+          <w:b/>
+          <w:bCs/>
+        </w:rPr>
+        <w:t xml:space="preserve">16–32</w:t>
+      </w:r>
+      <w:r>
+        <w:t xml:space="preserve"> bars of </w:t>
+      </w:r>
+      <w:r>
+        <w:rPr>
+          <w:b/>
+          <w:bCs/>
+        </w:rPr>
+        <w:t xml:space="preserve">one harmonic centre</w:t>
+      </w:r>
+      <w:r>
+        <w:t xml:space="preserve">. Pair with </w:t>
+      </w:r>
+      <w:r>
+        <w:rPr>
+          <w:b/>
+          <w:bCs/>
+        </w:rPr>
+        <w:t xml:space="preserve">electric-era surface</w:t>
+      </w:r>
+      <w:r>
+        <w:t xml:space="preserve"> (density/sync lifts) when you need </w:t>
+      </w:r>
+      <w:r>
+        <w:rPr>
+          <w:b/>
+          <w:bCs/>
+        </w:rPr>
+        <w:t xml:space="preserve">repetition as composition</w:t>
+      </w:r>
+      <w:r>
+        <w:t xml:space="preserve">, not small-form bebop motion. 4. </w:t>
+      </w:r>
+      <w:r>
+        <w:rPr>
+          <w:b/>
+          <w:bCs/>
+        </w:rPr>
+        <w:t xml:space="preserve">Cool vs electric contrast</w:t>
+      </w:r>
+      <w:r>
+        <w:t xml:space="preserve"> — Same </w:t>
+      </w:r>
+      <w:r>
+        <w:rPr>
+          <w:b/>
+          <w:bCs/>
+        </w:rPr>
+        <w:t xml:space="preserve">seed + locked chords</w:t>
+      </w:r>
+      <w:r>
+        <w:t xml:space="preserve">, run </w:t>
+      </w:r>
+      <w:r>
+        <w:rPr>
+          <w:b/>
+          <w:bCs/>
+        </w:rPr>
+        <w:t xml:space="preserve">Generate twice</w:t>
+      </w:r>
+      <w:r>
+        <w:t xml:space="preserve">: </w:t>
+      </w:r>
+      <w:r>
+        <w:rPr>
+          <w:b/>
+          <w:bCs/>
+        </w:rPr>
+        <w:t xml:space="preserve">`modal_1959`</w:t>
+      </w:r>
+      <w:r>
+        <w:t xml:space="preserve"> vs </w:t>
+      </w:r>
+      <w:r>
+        <w:rPr>
+          <w:b/>
+          <w:bCs/>
+        </w:rPr>
+        <w:t xml:space="preserve">`electric_1970`</w:t>
+      </w:r>
+      <w:r>
+        <w:t xml:space="preserve">. Compare </w:t>
+      </w:r>
+      <w:r>
+        <w:rPr>
+          <w:b/>
+          <w:bCs/>
+        </w:rPr>
+        <w:t xml:space="preserve">`md:cool_phrase`</w:t>
+      </w:r>
+      <w:r>
+        <w:t xml:space="preserve"> density + </w:t>
+      </w:r>
+      <w:r>
+        <w:rPr>
+          <w:b/>
+          <w:bCs/>
+        </w:rPr>
+        <w:t xml:space="preserve">`milesDavisCoolMode`</w:t>
+      </w:r>
+      <w:r>
+        <w:t xml:space="preserve"> vs </w:t>
+      </w:r>
+      <w:r>
+        <w:rPr>
+          <w:b/>
+          <w:bCs/>
+        </w:rPr>
+        <w:t xml:space="preserve">`milesDavisVampBars`</w:t>
+      </w:r>
+      <w:r>
+        <w:t xml:space="preserve"> — documents how </w:t>
+      </w:r>
+      <w:r>
+        <w:rPr>
+          <w:b/>
+          <w:bCs/>
+        </w:rPr>
+        <w:t xml:space="preserve">period metadata</w:t>
+      </w:r>
+      <w:r>
+        <w:t xml:space="preserve"> steers </w:t>
+      </w:r>
+      <w:r>
+        <w:rPr>
+          <w:b/>
+          <w:bCs/>
+        </w:rPr>
+        <w:t xml:space="preserve">space vs ostinato</w:t>
+      </w:r>
+      <w:r>
+        <w:t xml:space="preserve"> without changing your pasted symbols. 5. </w:t>
+      </w:r>
+      <w:r>
+        <w:rPr>
+          <w:b/>
+          <w:bCs/>
+        </w:rPr>
+        <w:t xml:space="preserve">Harmon colour on ballad sections</w:t>
+      </w:r>
+      <w:r>
+        <w:t xml:space="preserve"> — Slow tempo + </w:t>
+      </w:r>
+      <w:r>
+        <w:rPr>
+          <w:b/>
+          <w:bCs/>
+        </w:rPr>
+        <w:t xml:space="preserve">phrase-final</w:t>
+      </w:r>
+      <w:r>
+        <w:t xml:space="preserve"> weighting: </w:t>
+      </w:r>
+      <w:r>
+        <w:rPr>
+          <w:b/>
+          <w:bCs/>
+        </w:rPr>
+        <w:t xml:space="preserve">`md:harmon_color`</w:t>
+      </w:r>
+      <w:r>
+        <w:t xml:space="preserve"> stacks </w:t>
+      </w:r>
+      <w:r>
+        <w:rPr>
+          <w:b/>
+          <w:bCs/>
+        </w:rPr>
+        <w:t xml:space="preserve">maj9(#11)</w:t>
+      </w:r>
+      <w:r>
+        <w:t xml:space="preserve">, </w:t>
+      </w:r>
+      <w:r>
+        <w:rPr>
+          <w:b/>
+          <w:bCs/>
+        </w:rPr>
+        <w:t xml:space="preserve">m9/m11</w:t>
+      </w:r>
+      <w:r>
+        <w:t xml:space="preserve">, </w:t>
+      </w:r>
+      <w:r>
+        <w:rPr>
+          <w:b/>
+          <w:bCs/>
+        </w:rPr>
+        <w:t xml:space="preserve">7(9,13)</w:t>
+      </w:r>
+      <w:r>
+        <w:t xml:space="preserve"> on cadential bars </w:t>
+      </w:r>
+      <w:r>
+        <w:rPr>
+          <w:b/>
+          <w:bCs/>
+        </w:rPr>
+        <w:t xml:space="preserve">without</w:t>
+      </w:r>
+      <w:r>
+        <w:t xml:space="preserve"> forcing a faster harmonic rhythm. 6. </w:t>
+      </w:r>
+      <w:r>
+        <w:rPr>
+          <w:b/>
+          <w:bCs/>
+        </w:rPr>
+        <w:t xml:space="preserve">Chord pools per era</w:t>
+      </w:r>
+      <w:r>
+        <w:t xml:space="preserve"> — </w:t>
+      </w:r>
+      <w:r>
+        <w:rPr>
+          <w:b/>
+          <w:bCs/>
+        </w:rPr>
+        <w:t xml:space="preserve">`songModeBuilder`</w:t>
+      </w:r>
+      <w:r>
+        <w:t xml:space="preserve"> exposes </w:t>
+      </w:r>
+      <w:r>
+        <w:rPr>
+          <w:b/>
+          <w:bCs/>
+        </w:rPr>
+        <w:t xml:space="preserve">`miles_davis_modal_1959`</w:t>
+      </w:r>
+      <w:r>
+        <w:t xml:space="preserve">, </w:t>
+      </w:r>
+      <w:r>
+        <w:rPr>
+          <w:b/>
+          <w:bCs/>
+        </w:rPr>
+        <w:t xml:space="preserve">`miles_davis_quintet_1965`</w:t>
+      </w:r>
+      <w:r>
+        <w:t xml:space="preserve">, </w:t>
+      </w:r>
+      <w:r>
+        <w:rPr>
+          <w:b/>
+          <w:bCs/>
+        </w:rPr>
+        <w:t xml:space="preserve">`miles_davis_electric_1970`</w:t>
+      </w:r>
+      <w:r>
+        <w:t xml:space="preserve"> pools when </w:t>
+      </w:r>
+      <w:r>
+        <w:rPr>
+          <w:b/>
+          <w:bCs/>
+        </w:rPr>
+        <w:t xml:space="preserve">`primarySongwriterStyle === miles_davis`</w:t>
+      </w:r>
+      <w:r>
+        <w:t xml:space="preserve"> (deterministic pick). Use when teaching </w:t>
+      </w:r>
+      <w:r>
+        <w:rPr>
+          <w:b/>
+          <w:bCs/>
+        </w:rPr>
+        <w:t xml:space="preserve">one writer id</w:t>
+      </w:r>
+      <w:r>
+        <w:t xml:space="preserve"> but </w:t>
+      </w:r>
+      <w:r>
+        <w:rPr>
+          <w:b/>
+          <w:bCs/>
+        </w:rPr>
+        <w:t xml:space="preserve">three harmonic dialects</w:t>
       </w:r>
       <w:r>
         <w:t xml:space="preserve">.</w:t>

</xml_diff>

<commit_message>
docs: Ornette Coleman — handbook section + README update
Co-authored-by: Cursor <cursoragent@cursor.com>
</commit_message>
<xml_diff>
--- a/docs/COMPOSER_OS_PLAYBOOK.docx
+++ b/docs/COMPOSER_OS_PLAYBOOK.docx
@@ -2598,7 +2598,7 @@
         <w:spacing w:after="100" w:before="160"/>
       </w:pPr>
       <w:r>
-        <w:t xml:space="preserve">Per-composer profile table (37 research rows)</w:t>
+        <w:t xml:space="preserve">Per-composer profile table (38 research rows)</w:t>
       </w:r>
     </w:p>
     <w:tbl>
@@ -5422,6 +5422,99 @@
               <w:spacing w:after="60"/>
             </w:pPr>
             <w:r>
+              <w:t xml:space="preserve">`ornette_coleman`</w:t>
+            </w:r>
+          </w:p>
+        </w:tc>
+        <w:tc>
+          <w:tcPr>
+            <w:tcW w:type="pct" w:w="1285%"/>
+          </w:tcPr>
+          <w:p>
+            <w:pPr>
+              <w:spacing w:after="60"/>
+            </w:pPr>
+            <w:r>
+              <w:t xml:space="preserve">angular</w:t>
+            </w:r>
+          </w:p>
+        </w:tc>
+        <w:tc>
+          <w:tcPr>
+            <w:tcW w:type="pct" w:w="1285%"/>
+          </w:tcPr>
+          <w:p>
+            <w:pPr>
+              <w:spacing w:after="60"/>
+            </w:pPr>
+            <w:r>
+              <w:t xml:space="preserve">whole_bar</w:t>
+            </w:r>
+          </w:p>
+        </w:tc>
+        <w:tc>
+          <w:tcPr>
+            <w:tcW w:type="pct" w:w="1285%"/>
+          </w:tcPr>
+          <w:p>
+            <w:pPr>
+              <w:spacing w:after="60"/>
+            </w:pPr>
+            <w:r>
+              <w:t xml:space="preserve">5</w:t>
+            </w:r>
+          </w:p>
+        </w:tc>
+        <w:tc>
+          <w:tcPr>
+            <w:tcW w:type="pct" w:w="1285%"/>
+          </w:tcPr>
+          <w:p>
+            <w:pPr>
+              <w:spacing w:after="60"/>
+            </w:pPr>
+            <w:r>
+              <w:t xml:space="preserve">0.42</w:t>
+            </w:r>
+          </w:p>
+        </w:tc>
+        <w:tc>
+          <w:tcPr>
+            <w:tcW w:type="pct" w:w="1285%"/>
+          </w:tcPr>
+          <w:p>
+            <w:pPr>
+              <w:spacing w:after="60"/>
+            </w:pPr>
+            <w:r>
+              <w:t xml:space="preserve">irregular</w:t>
+            </w:r>
+          </w:p>
+        </w:tc>
+        <w:tc>
+          <w:tcPr>
+            <w:tcW w:type="pct" w:w="1285%"/>
+          </w:tcPr>
+          <w:p>
+            <w:pPr>
+              <w:spacing w:after="60"/>
+            </w:pPr>
+            <w:r>
+              <w:t xml:space="preserve">melody_over_harmony; asymmetric_contour; minor_third_departure; tritone_sidestep; low_syncopation; breath_space</w:t>
+            </w:r>
+          </w:p>
+        </w:tc>
+      </w:tr>
+      <w:tr>
+        <w:tc>
+          <w:tcPr>
+            <w:tcW w:type="pct" w:w="1285%"/>
+          </w:tcPr>
+          <w:p>
+            <w:pPr>
+              <w:spacing w:after="60"/>
+            </w:pPr>
+            <w:r>
               <w:t xml:space="preserve">`duke_ellington`</w:t>
             </w:r>
           </w:p>
@@ -15022,6 +15115,1136 @@
       </w:r>
       <w:r>
         <w:t xml:space="preserve"> blurred cadence — same classroom chart, two writers.</w:t>
+      </w:r>
+    </w:p>
+    <w:p>
+      <w:pPr>
+        <w:pStyle w:val="Heading1"/>
+        <w:spacing w:after="120" w:before="200"/>
+      </w:pPr>
+      <w:r>
+        <w:t xml:space="preserve">Ornette Coleman (`ornette_coleman`) — Song Mode harmony slice</w:t>
+      </w:r>
+    </w:p>
+    <w:p>
+      <w:pPr>
+        <w:pStyle w:val="Heading2"/>
+        <w:spacing w:after="100" w:before="160"/>
+      </w:pPr>
+      <w:r>
+        <w:t xml:space="preserve">Period contexts (`ornetteColemanContext`)</w:t>
+      </w:r>
+    </w:p>
+    <w:p>
+      <w:pPr>
+        <w:spacing w:after="160"/>
+      </w:pPr>
+      <w:r>
+        <w:rPr>
+          <w:b/>
+          <w:bCs/>
+        </w:rPr>
+        <w:t xml:space="preserve">API / metadata</w:t>
+      </w:r>
+      <w:r>
+        <w:t xml:space="preserve"> — </w:t>
+      </w:r>
+      <w:r>
+        <w:rPr>
+          <w:b/>
+          <w:bCs/>
+        </w:rPr>
+        <w:t xml:space="preserve">`GenerateRequest.ornetteColemanContext`</w:t>
+      </w:r>
+      <w:r>
+        <w:t xml:space="preserve"> → </w:t>
+      </w:r>
+      <w:r>
+        <w:rPr>
+          <w:b/>
+          <w:bCs/>
+        </w:rPr>
+        <w:t xml:space="preserve">`generationMetadata.ornetteColemanContext`</w:t>
+      </w:r>
+      <w:r>
+        <w:t xml:space="preserve">: </w:t>
+      </w:r>
+      <w:r>
+        <w:rPr>
+          <w:b/>
+          <w:bCs/>
+        </w:rPr>
+        <w:t xml:space="preserve">`shape_1959`</w:t>
+      </w:r>
+      <w:r>
+        <w:t xml:space="preserve"> \| </w:t>
+      </w:r>
+      <w:r>
+        <w:rPr>
+          <w:b/>
+          <w:bCs/>
+        </w:rPr>
+        <w:t xml:space="preserve">`free_1961`</w:t>
+      </w:r>
+      <w:r>
+        <w:t xml:space="preserve"> \| </w:t>
+      </w:r>
+      <w:r>
+        <w:rPr>
+          <w:b/>
+          <w:bCs/>
+        </w:rPr>
+        <w:t xml:space="preserve">`science_1971`</w:t>
+      </w:r>
+      <w:r>
+        <w:t xml:space="preserve"> (default </w:t>
+      </w:r>
+      <w:r>
+        <w:rPr>
+          <w:b/>
+          <w:bCs/>
+        </w:rPr>
+        <w:t xml:space="preserve">`shape_1959`</w:t>
+      </w:r>
+      <w:r>
+        <w:t xml:space="preserve"> when omitted).</w:t>
+      </w:r>
+    </w:p>
+    <w:p>
+      <w:pPr>
+        <w:spacing w:after="80"/>
+        <w:ind w:left="360" w:hanging="260"/>
+      </w:pPr>
+      <w:r>
+        <w:t xml:space="preserve">• </w:t>
+      </w:r>
+      <w:r>
+        <w:rPr>
+          <w:b/>
+          <w:bCs/>
+        </w:rPr>
+        <w:t xml:space="preserve">`shape_1959`</w:t>
+      </w:r>
+      <w:r>
+        <w:t xml:space="preserve"> — Loose changes with song-form phrase windows; harmolodic centre labels without forcing cadential closure.</w:t>
+      </w:r>
+    </w:p>
+    <w:p>
+      <w:pPr>
+        <w:spacing w:after="80"/>
+        <w:ind w:left="360" w:hanging="260"/>
+      </w:pPr>
+      <w:r>
+        <w:t xml:space="preserve">• </w:t>
+      </w:r>
+      <w:r>
+        <w:rPr>
+          <w:b/>
+          <w:bCs/>
+        </w:rPr>
+        <w:t xml:space="preserve">`free_1961`</w:t>
+      </w:r>
+      <w:r>
+        <w:t xml:space="preserve"> — Longer asymmetric phrases and wide collective-density spans (phrase grid reads “collective,” not bar-clock funk).</w:t>
+      </w:r>
+    </w:p>
+    <w:p>
+      <w:pPr>
+        <w:spacing w:after="80"/>
+        <w:ind w:left="360" w:hanging="260"/>
+      </w:pPr>
+      <w:r>
+        <w:t xml:space="preserve">• </w:t>
+      </w:r>
+      <w:r>
+        <w:rPr>
+          <w:b/>
+          <w:bCs/>
+        </w:rPr>
+        <w:t xml:space="preserve">`science_1971`</w:t>
+      </w:r>
+      <w:r>
+        <w:t xml:space="preserve"> — Short ostinato-feel phrase cells (2–4 bars) and tighter alternating density windows for groove-forward harmolodic spelling.</w:t>
+      </w:r>
+    </w:p>
+    <w:p>
+      <w:pPr>
+        <w:pStyle w:val="Heading2"/>
+        <w:spacing w:after="100" w:before="160"/>
+      </w:pPr>
+      <w:r>
+        <w:t xml:space="preserve">Harmolodic chord pools</w:t>
+      </w:r>
+    </w:p>
+    <w:p>
+      <w:pPr>
+        <w:spacing w:after="160"/>
+      </w:pPr>
+      <w:r>
+        <w:t xml:space="preserve">Built-in </w:t>
+      </w:r>
+      <w:r>
+        <w:rPr>
+          <w:b/>
+          <w:bCs/>
+        </w:rPr>
+        <w:t xml:space="preserve">`SONGWRITER_CHORD_POOLS`</w:t>
+      </w:r>
+      <w:r>
+        <w:t xml:space="preserve"> in </w:t>
+      </w:r>
+      <w:r>
+        <w:rPr>
+          <w:b/>
+          <w:bCs/>
+        </w:rPr>
+        <w:t xml:space="preserve">`songModeBuilder.ts`</w:t>
+      </w:r>
+      <w:r>
+        <w:t xml:space="preserve"> resolve from primary </w:t>
+      </w:r>
+      <w:r>
+        <w:rPr>
+          <w:b/>
+          <w:bCs/>
+        </w:rPr>
+        <w:t xml:space="preserve">`ornette_coleman`</w:t>
+      </w:r>
+      <w:r>
+        <w:t xml:space="preserve"> via </w:t>
+      </w:r>
+      <w:r>
+        <w:rPr>
+          <w:b/>
+          <w:bCs/>
+        </w:rPr>
+        <w:t xml:space="preserve">`seed % 3`</w:t>
+      </w:r>
+      <w:r>
+        <w:t xml:space="preserve">: </w:t>
+      </w:r>
+      <w:r>
+        <w:rPr>
+          <w:b/>
+          <w:bCs/>
+        </w:rPr>
+        <w:t xml:space="preserve">`ornette_coleman_shape_1959`</w:t>
+      </w:r>
+      <w:r>
+        <w:t xml:space="preserve">, </w:t>
+      </w:r>
+      <w:r>
+        <w:rPr>
+          <w:b/>
+          <w:bCs/>
+        </w:rPr>
+        <w:t xml:space="preserve">`ornette_coleman_free_1961`</w:t>
+      </w:r>
+      <w:r>
+        <w:t xml:space="preserve">, </w:t>
+      </w:r>
+      <w:r>
+        <w:rPr>
+          <w:b/>
+          <w:bCs/>
+        </w:rPr>
+        <w:t xml:space="preserve">`ornette_coleman_science_1971`</w:t>
+      </w:r>
+      <w:r>
+        <w:t xml:space="preserve">. Rows emphasize </w:t>
+      </w:r>
+      <w:r>
+        <w:rPr>
+          <w:b/>
+          <w:bCs/>
+        </w:rPr>
+        <w:t xml:space="preserve">loose tonal axes</w:t>
+      </w:r>
+      <w:r>
+        <w:t xml:space="preserve"> (root / fifth / ninth / minor-third relationships), </w:t>
+      </w:r>
+      <w:r>
+        <w:rPr>
+          <w:b/>
+          <w:bCs/>
+        </w:rPr>
+        <w:t xml:space="preserve">non-resolving</w:t>
+      </w:r>
+      <w:r>
+        <w:t xml:space="preserve"> minor-seventh cycles (e.g. </w:t>
+      </w:r>
+      <w:r>
+        <w:rPr>
+          <w:b/>
+          <w:bCs/>
+        </w:rPr>
+        <w:t xml:space="preserve">Cm7 → Ebm7 → F#m7 → Am7</w:t>
+      </w:r>
+      <w:r>
+        <w:t xml:space="preserve">), tagged </w:t>
+      </w:r>
+      <w:r>
+        <w:rPr>
+          <w:b/>
+          <w:bCs/>
+        </w:rPr>
+        <w:t xml:space="preserve">`no_ii_v_i`</w:t>
+      </w:r>
+      <w:r>
+        <w:t xml:space="preserve">, optional </w:t>
+      </w:r>
+      <w:r>
+        <w:rPr>
+          <w:b/>
+          <w:bCs/>
+        </w:rPr>
+        <w:t xml:space="preserve">`centre:`</w:t>
+      </w:r>
+      <w:r>
+        <w:t xml:space="preserve"> / </w:t>
+      </w:r>
+      <w:r>
+        <w:rPr>
+          <w:b/>
+          <w:bCs/>
+        </w:rPr>
+        <w:t xml:space="preserve">`looseAxes:`</w:t>
+      </w:r>
+      <w:r>
+        <w:t xml:space="preserve"> / </w:t>
+      </w:r>
+      <w:r>
+        <w:rPr>
+          <w:b/>
+          <w:bCs/>
+        </w:rPr>
+        <w:t xml:space="preserve">`rogueChromatics:`</w:t>
+      </w:r>
+      <w:r>
+        <w:t xml:space="preserve"> on </w:t>
+      </w:r>
+      <w:r>
+        <w:rPr>
+          <w:b/>
+          <w:bCs/>
+        </w:rPr>
+        <w:t xml:space="preserve">`chosenRowTags`</w:t>
+      </w:r>
+      <w:r>
+        <w:t xml:space="preserve">. Built-in harmony also runs </w:t>
+      </w:r>
+      <w:r>
+        <w:rPr>
+          <w:b/>
+          <w:bCs/>
+        </w:rPr>
+        <w:t xml:space="preserve">`breakFrankZappaIiViProgressions`</w:t>
+      </w:r>
+      <w:r>
+        <w:t xml:space="preserve"> so rolling ii–V–I triples do not survive unchanged.</w:t>
+      </w:r>
+    </w:p>
+    <w:p>
+      <w:pPr>
+        <w:pStyle w:val="Heading2"/>
+        <w:spacing w:after="100" w:before="160"/>
+      </w:pPr>
+      <w:r>
+        <w:t xml:space="preserve">How Composer OS implements it</w:t>
+      </w:r>
+    </w:p>
+    <w:p>
+      <w:pPr>
+        <w:spacing w:after="160"/>
+      </w:pPr>
+      <w:r>
+        <w:rPr>
+          <w:b/>
+          <w:bCs/>
+        </w:rPr>
+        <w:t xml:space="preserve">`ornetteColemanSlice.ts`</w:t>
+      </w:r>
+      <w:r>
+        <w:t xml:space="preserve"> (re-export </w:t>
+      </w:r>
+      <w:r>
+        <w:rPr>
+          <w:b/>
+          <w:bCs/>
+        </w:rPr>
+        <w:t xml:space="preserve">`engines/composer-os-v2/core/goldenPath/ornetteColemanSlice.ts`</w:t>
+      </w:r>
+      <w:r>
+        <w:t xml:space="preserve">). </w:t>
+      </w:r>
+      <w:r>
+        <w:rPr>
+          <w:b/>
+          <w:bCs/>
+        </w:rPr>
+        <w:t xml:space="preserve">`precomputeOrnetteColemanEffectiveHarmonyBars`</w:t>
+      </w:r>
+      <w:r>
+        <w:t xml:space="preserve"> → </w:t>
+      </w:r>
+      <w:r>
+        <w:rPr>
+          <w:b/>
+          <w:bCs/>
+        </w:rPr>
+        <w:t xml:space="preserve">`ornetteColemanEffectiveHarmonyBars`</w:t>
+      </w:r>
+      <w:r>
+        <w:t xml:space="preserve">, device receipts </w:t>
+      </w:r>
+      <w:r>
+        <w:rPr>
+          <w:b/>
+          <w:bCs/>
+        </w:rPr>
+        <w:t xml:space="preserve">`oc:*`</w:t>
+      </w:r>
+      <w:r>
+        <w:t xml:space="preserve">:</w:t>
+      </w:r>
+    </w:p>
+    <w:tbl>
+      <w:tblPr>
+        <w:tblW w:type="pct" w:w="100%"/>
+        <w:tblBorders>
+          <w:top w:val="single" w:color="auto" w:sz="4"/>
+          <w:left w:val="single" w:color="auto" w:sz="4"/>
+          <w:bottom w:val="single" w:color="auto" w:sz="4"/>
+          <w:right w:val="single" w:color="auto" w:sz="4"/>
+          <w:insideH w:val="single" w:color="auto" w:sz="4"/>
+          <w:insideV w:val="single" w:color="auto" w:sz="4"/>
+        </w:tblBorders>
+      </w:tblPr>
+      <w:tblGrid>
+        <w:gridCol w:w="3000"/>
+        <w:gridCol w:w="3000"/>
+        <w:gridCol w:w="3000"/>
+      </w:tblGrid>
+      <w:tr>
+        <w:tc>
+          <w:tcPr>
+            <w:tcW w:type="pct" w:w="3000%"/>
+          </w:tcPr>
+          <w:p>
+            <w:pPr>
+              <w:spacing w:after="60"/>
+            </w:pPr>
+            <w:r>
+              <w:t xml:space="preserve">Device</w:t>
+            </w:r>
+          </w:p>
+        </w:tc>
+        <w:tc>
+          <w:tcPr>
+            <w:tcW w:type="pct" w:w="3000%"/>
+          </w:tcPr>
+          <w:p>
+            <w:pPr>
+              <w:spacing w:after="60"/>
+            </w:pPr>
+            <w:r>
+              <w:t xml:space="preserve">Receipt prefix</w:t>
+            </w:r>
+          </w:p>
+        </w:tc>
+        <w:tc>
+          <w:tcPr>
+            <w:tcW w:type="pct" w:w="3000%"/>
+          </w:tcPr>
+          <w:p>
+            <w:pPr>
+              <w:spacing w:after="60"/>
+            </w:pPr>
+            <w:r>
+              <w:t xml:space="preserve">Role</w:t>
+            </w:r>
+          </w:p>
+        </w:tc>
+      </w:tr>
+      <w:tr>
+        <w:tc>
+          <w:tcPr>
+            <w:tcW w:type="pct" w:w="3000%"/>
+          </w:tcPr>
+          <w:p>
+            <w:pPr>
+              <w:spacing w:after="60"/>
+            </w:pPr>
+            <w:r>
+              <w:t xml:space="preserve">d1</w:t>
+            </w:r>
+          </w:p>
+        </w:tc>
+        <w:tc>
+          <w:tcPr>
+            <w:tcW w:type="pct" w:w="3000%"/>
+          </w:tcPr>
+          <w:p>
+            <w:pPr>
+              <w:spacing w:after="60"/>
+            </w:pPr>
+            <w:r>
+              <w:rPr>
+                <w:b/>
+                <w:bCs/>
+              </w:rPr>
+              <w:t xml:space="preserve">`oc:d1_harmolodic_center`</w:t>
+            </w:r>
+          </w:p>
+        </w:tc>
+        <w:tc>
+          <w:tcPr>
+            <w:tcW w:type="pct" w:w="3000%"/>
+          </w:tcPr>
+          <w:p>
+            <w:pPr>
+              <w:spacing w:after="60"/>
+            </w:pPr>
+            <w:r>
+              <w:t xml:space="preserve">Floating / harmolodic centre fields (`ornetteColemanHarmolodicCentreLabels` when present).</w:t>
+            </w:r>
+          </w:p>
+        </w:tc>
+      </w:tr>
+      <w:tr>
+        <w:tc>
+          <w:tcPr>
+            <w:tcW w:type="pct" w:w="3000%"/>
+          </w:tcPr>
+          <w:p>
+            <w:pPr>
+              <w:spacing w:after="60"/>
+            </w:pPr>
+            <w:r>
+              <w:t xml:space="preserve">d2</w:t>
+            </w:r>
+          </w:p>
+        </w:tc>
+        <w:tc>
+          <w:tcPr>
+            <w:tcW w:type="pct" w:w="3000%"/>
+          </w:tcPr>
+          <w:p>
+            <w:pPr>
+              <w:spacing w:after="60"/>
+            </w:pPr>
+            <w:r>
+              <w:rPr>
+                <w:b/>
+                <w:bCs/>
+              </w:rPr>
+              <w:t xml:space="preserve">`oc:d2_asymmetric_phrase_grid`</w:t>
+            </w:r>
+          </w:p>
+        </w:tc>
+        <w:tc>
+          <w:tcPr>
+            <w:tcW w:type="pct" w:w="3000%"/>
+          </w:tcPr>
+          <w:p>
+            <w:pPr>
+              <w:spacing w:after="60"/>
+            </w:pPr>
+            <w:r>
+              <w:t xml:space="preserve">Phrase-start ticks on the asymmetric phrase grid.</w:t>
+            </w:r>
+          </w:p>
+        </w:tc>
+      </w:tr>
+      <w:tr>
+        <w:tc>
+          <w:tcPr>
+            <w:tcW w:type="pct" w:w="3000%"/>
+          </w:tcPr>
+          <w:p>
+            <w:pPr>
+              <w:spacing w:after="60"/>
+            </w:pPr>
+            <w:r>
+              <w:t xml:space="preserve">d3</w:t>
+            </w:r>
+          </w:p>
+        </w:tc>
+        <w:tc>
+          <w:tcPr>
+            <w:tcW w:type="pct" w:w="3000%"/>
+          </w:tcPr>
+          <w:p>
+            <w:pPr>
+              <w:spacing w:after="60"/>
+            </w:pPr>
+            <w:r>
+              <w:rPr>
+                <w:b/>
+                <w:bCs/>
+              </w:rPr>
+              <w:t xml:space="preserve">`oc:d3_non_resolving_turnaround`</w:t>
+            </w:r>
+          </w:p>
+        </w:tc>
+        <w:tc>
+          <w:tcPr>
+            <w:tcW w:type="pct" w:w="3000%"/>
+          </w:tcPr>
+          <w:p>
+            <w:pPr>
+              <w:spacing w:after="60"/>
+            </w:pPr>
+            <w:r>
+              <w:t xml:space="preserve">Break functional ii–V–I chains + soften phrase-final dominants so turns do not cadence.</w:t>
+            </w:r>
+          </w:p>
+        </w:tc>
+      </w:tr>
+      <w:tr>
+        <w:tc>
+          <w:tcPr>
+            <w:tcW w:type="pct" w:w="3000%"/>
+          </w:tcPr>
+          <w:p>
+            <w:pPr>
+              <w:spacing w:after="60"/>
+            </w:pPr>
+            <w:r>
+              <w:t xml:space="preserve">d4</w:t>
+            </w:r>
+          </w:p>
+        </w:tc>
+        <w:tc>
+          <w:tcPr>
+            <w:tcW w:type="pct" w:w="3000%"/>
+          </w:tcPr>
+          <w:p>
+            <w:pPr>
+              <w:spacing w:after="60"/>
+            </w:pPr>
+            <w:r>
+              <w:rPr>
+                <w:b/>
+                <w:bCs/>
+              </w:rPr>
+              <w:t xml:space="preserve">`oc:d4_chromatic_departure`</w:t>
+            </w:r>
+          </w:p>
+        </w:tc>
+        <w:tc>
+          <w:tcPr>
+            <w:tcW w:type="pct" w:w="3000%"/>
+          </w:tcPr>
+          <w:p>
+            <w:pPr>
+              <w:spacing w:after="60"/>
+            </w:pPr>
+            <w:r>
+              <w:t xml:space="preserve">Chromatic root moves (minor-third / tritone bias in the departure pool).</w:t>
+            </w:r>
+          </w:p>
+        </w:tc>
+      </w:tr>
+      <w:tr>
+        <w:tc>
+          <w:tcPr>
+            <w:tcW w:type="pct" w:w="3000%"/>
+          </w:tcPr>
+          <w:p>
+            <w:pPr>
+              <w:spacing w:after="60"/>
+            </w:pPr>
+            <w:r>
+              <w:t xml:space="preserve">d5</w:t>
+            </w:r>
+          </w:p>
+        </w:tc>
+        <w:tc>
+          <w:tcPr>
+            <w:tcW w:type="pct" w:w="3000%"/>
+          </w:tcPr>
+          <w:p>
+            <w:pPr>
+              <w:spacing w:after="60"/>
+            </w:pPr>
+            <w:r>
+              <w:rPr>
+                <w:b/>
+                <w:bCs/>
+              </w:rPr>
+              <w:t xml:space="preserve">`oc:d5_collective_density_shift`</w:t>
+            </w:r>
+          </w:p>
+        </w:tc>
+        <w:tc>
+          <w:tcPr>
+            <w:tcW w:type="pct" w:w="3000%"/>
+          </w:tcPr>
+          <w:p>
+            <w:pPr>
+              <w:spacing w:after="60"/>
+            </w:pPr>
+            <w:r>
+              <w:t xml:space="preserve">Alternating dense / sparse harmonic spelling bands (span scales by context).</w:t>
+            </w:r>
+          </w:p>
+        </w:tc>
+      </w:tr>
+    </w:tbl>
+    <w:p>
+      <w:pPr>
+        <w:spacing w:after="160"/>
+      </w:pPr>
+    </w:p>
+    <w:p>
+      <w:pPr>
+        <w:spacing w:after="160"/>
+      </w:pPr>
+      <w:r>
+        <w:rPr>
+          <w:b/>
+          <w:bCs/>
+        </w:rPr>
+        <w:t xml:space="preserve">Diagnostics</w:t>
+      </w:r>
+      <w:r>
+        <w:t xml:space="preserve"> — </w:t>
+      </w:r>
+      <w:r>
+        <w:rPr>
+          <w:b/>
+          <w:bCs/>
+        </w:rPr>
+        <w:t xml:space="preserve">`ornetteColemanDiagnostics`</w:t>
+      </w:r>
+      <w:r>
+        <w:t xml:space="preserve">, </w:t>
+      </w:r>
+      <w:r>
+        <w:rPr>
+          <w:b/>
+          <w:bCs/>
+        </w:rPr>
+        <w:t xml:space="preserve">`ornetteColemanSliceReceipt`</w:t>
+      </w:r>
+      <w:r>
+        <w:t xml:space="preserve">, </w:t>
+      </w:r>
+      <w:r>
+        <w:rPr>
+          <w:b/>
+          <w:bCs/>
+        </w:rPr>
+        <w:t xml:space="preserve">`ornetteColemanAntiElaborationGuards`</w:t>
+      </w:r>
+      <w:r>
+        <w:t xml:space="preserve"> (`iiViChainsBroken`).</w:t>
+      </w:r>
+    </w:p>
+    <w:p>
+      <w:pPr>
+        <w:pStyle w:val="Heading2"/>
+        <w:spacing w:after="100" w:before="160"/>
+      </w:pPr>
+      <w:r>
+        <w:t xml:space="preserve">Style surface</w:t>
+      </w:r>
+    </w:p>
+    <w:p>
+      <w:pPr>
+        <w:spacing w:after="160"/>
+      </w:pPr>
+      <w:r>
+        <w:rPr>
+          <w:b/>
+          <w:bCs/>
+        </w:rPr>
+        <w:t xml:space="preserve">`applyOrnetteColemanStyleSurface`</w:t>
+      </w:r>
+      <w:r>
+        <w:t xml:space="preserve"> — space </w:t>
+      </w:r>
+      <w:r>
+        <w:rPr>
+          <w:b/>
+          <w:bCs/>
+        </w:rPr>
+        <w:t xml:space="preserve">+0.35</w:t>
+      </w:r>
+      <w:r>
+        <w:t xml:space="preserve">, density </w:t>
+      </w:r>
+      <w:r>
+        <w:rPr>
+          <w:b/>
+          <w:bCs/>
+        </w:rPr>
+        <w:t xml:space="preserve">−0.12</w:t>
+      </w:r>
+      <w:r>
+        <w:t xml:space="preserve">, syncopation </w:t>
+      </w:r>
+      <w:r>
+        <w:rPr>
+          <w:b/>
+          <w:bCs/>
+        </w:rPr>
+        <w:t xml:space="preserve">+0.04</w:t>
+      </w:r>
+      <w:r>
+        <w:t xml:space="preserve">, cadence softness </w:t>
+      </w:r>
+      <w:r>
+        <w:rPr>
+          <w:b/>
+          <w:bCs/>
+        </w:rPr>
+        <w:t xml:space="preserve">+0.28</w:t>
+      </w:r>
+      <w:r>
+        <w:t xml:space="preserve"> (melody-forward metadata; separate from </w:t>
+      </w:r>
+      <w:r>
+        <w:rPr>
+          <w:b/>
+          <w:bCs/>
+        </w:rPr>
+        <w:t xml:space="preserve">`oc:*`</w:t>
+      </w:r>
+      <w:r>
+        <w:t xml:space="preserve"> harmony passes).</w:t>
+      </w:r>
+    </w:p>
+    <w:p>
+      <w:pPr>
+        <w:pStyle w:val="Heading2"/>
+        <w:spacing w:after="100" w:before="160"/>
+      </w:pPr>
+      <w:r>
+        <w:t xml:space="preserve">Melody planner row</w:t>
+      </w:r>
+    </w:p>
+    <w:p>
+      <w:pPr>
+        <w:spacing w:after="160"/>
+      </w:pPr>
+      <w:r>
+        <w:rPr>
+          <w:b/>
+          <w:bCs/>
+        </w:rPr>
+        <w:t xml:space="preserve">`MELODY_PROFILES['ornette_coleman']`</w:t>
+      </w:r>
+      <w:r>
+        <w:t xml:space="preserve"> — angular · </w:t>
+      </w:r>
+      <w:r>
+        <w:rPr>
+          <w:b/>
+          <w:bCs/>
+        </w:rPr>
+        <w:t xml:space="preserve">`whole_bar`</w:t>
+      </w:r>
+      <w:r>
+        <w:t xml:space="preserve"> · </w:t>
+      </w:r>
+      <w:r>
+        <w:rPr>
+          <w:b/>
+          <w:bCs/>
+        </w:rPr>
+        <w:t xml:space="preserve">repetitionVsVariationBias 0.42</w:t>
+      </w:r>
+      <w:r>
+        <w:t xml:space="preserve"> · phrase </w:t>
+      </w:r>
+      <w:r>
+        <w:rPr>
+          <w:b/>
+          <w:bCs/>
+        </w:rPr>
+        <w:t xml:space="preserve">5</w:t>
+      </w:r>
+      <w:r>
+        <w:t xml:space="preserve"> · </w:t>
+      </w:r>
+      <w:r>
+        <w:rPr>
+          <w:b/>
+          <w:bCs/>
+        </w:rPr>
+        <w:t xml:space="preserve">`irregular`</w:t>
+      </w:r>
+      <w:r>
+        <w:t xml:space="preserve"> contour · devices </w:t>
+      </w:r>
+      <w:r>
+        <w:rPr>
+          <w:b/>
+          <w:bCs/>
+        </w:rPr>
+        <w:t xml:space="preserve">`melody_over_harmony`</w:t>
+      </w:r>
+      <w:r>
+        <w:t xml:space="preserve">, </w:t>
+      </w:r>
+      <w:r>
+        <w:rPr>
+          <w:b/>
+          <w:bCs/>
+        </w:rPr>
+        <w:t xml:space="preserve">`asymmetric_contour`</w:t>
+      </w:r>
+      <w:r>
+        <w:t xml:space="preserve">, </w:t>
+      </w:r>
+      <w:r>
+        <w:rPr>
+          <w:b/>
+          <w:bCs/>
+        </w:rPr>
+        <w:t xml:space="preserve">`minor_third_departure`</w:t>
+      </w:r>
+      <w:r>
+        <w:t xml:space="preserve">, </w:t>
+      </w:r>
+      <w:r>
+        <w:rPr>
+          <w:b/>
+          <w:bCs/>
+        </w:rPr>
+        <w:t xml:space="preserve">`tritone_sidestep`</w:t>
+      </w:r>
+      <w:r>
+        <w:t xml:space="preserve">, </w:t>
+      </w:r>
+      <w:r>
+        <w:rPr>
+          <w:b/>
+          <w:bCs/>
+        </w:rPr>
+        <w:t xml:space="preserve">`low_syncopation`</w:t>
+      </w:r>
+      <w:r>
+        <w:t xml:space="preserve">, </w:t>
+      </w:r>
+      <w:r>
+        <w:rPr>
+          <w:b/>
+          <w:bCs/>
+        </w:rPr>
+        <w:t xml:space="preserve">`breath_space`</w:t>
+      </w:r>
+      <w:r>
+        <w:t xml:space="preserve">.</w:t>
+      </w:r>
+    </w:p>
+    <w:p>
+      <w:pPr>
+        <w:pStyle w:val="Heading2"/>
+        <w:spacing w:after="100" w:before="160"/>
+      </w:pPr>
+      <w:r>
+        <w:t xml:space="preserve">Four example applications</w:t>
+      </w:r>
+    </w:p>
+    <w:p>
+      <w:pPr>
+        <w:spacing w:after="160"/>
+      </w:pPr>
+      <w:r>
+        <w:t xml:space="preserve">1. </w:t>
+      </w:r>
+      <w:r>
+        <w:rPr>
+          <w:b/>
+          <w:bCs/>
+        </w:rPr>
+        <w:t xml:space="preserve">Context A/B</w:t>
+      </w:r>
+      <w:r>
+        <w:t xml:space="preserve"> — Fix seed; switch </w:t>
+      </w:r>
+      <w:r>
+        <w:rPr>
+          <w:b/>
+          <w:bCs/>
+        </w:rPr>
+        <w:t xml:space="preserve">`ornetteColemanContext`</w:t>
+      </w:r>
+      <w:r>
+        <w:t xml:space="preserve"> </w:t>
+      </w:r>
+      <w:r>
+        <w:rPr>
+          <w:b/>
+          <w:bCs/>
+        </w:rPr>
+        <w:t xml:space="preserve">`shape_1959`</w:t>
+      </w:r>
+      <w:r>
+        <w:t xml:space="preserve"> ↔ </w:t>
+      </w:r>
+      <w:r>
+        <w:rPr>
+          <w:b/>
+          <w:bCs/>
+        </w:rPr>
+        <w:t xml:space="preserve">`science_1971`</w:t>
+      </w:r>
+      <w:r>
+        <w:t xml:space="preserve"> and compare </w:t>
+      </w:r>
+      <w:r>
+        <w:rPr>
+          <w:b/>
+          <w:bCs/>
+        </w:rPr>
+        <w:t xml:space="preserve">`ornetteColemanDeviceReceipts`</w:t>
+      </w:r>
+      <w:r>
+        <w:t xml:space="preserve"> / phrase receipts (</w:t>
+      </w:r>
+      <w:r>
+        <w:rPr>
+          <w:b/>
+          <w:bCs/>
+        </w:rPr>
+        <w:t xml:space="preserve">`oc:d2_*`</w:t>
+      </w:r>
+      <w:r>
+        <w:t xml:space="preserve"> vs </w:t>
+      </w:r>
+      <w:r>
+        <w:rPr>
+          <w:b/>
+          <w:bCs/>
+        </w:rPr>
+        <w:t xml:space="preserve">`oc:d5_*`</w:t>
+      </w:r>
+      <w:r>
+        <w:t xml:space="preserve"> density bands). 2. </w:t>
+      </w:r>
+      <w:r>
+        <w:rPr>
+          <w:b/>
+          <w:bCs/>
+        </w:rPr>
+        <w:t xml:space="preserve">Locked harmony QA</w:t>
+      </w:r>
+      <w:r>
+        <w:t xml:space="preserve"> — </w:t>
+      </w:r>
+      <w:r>
+        <w:rPr>
+          <w:b/>
+          <w:bCs/>
+        </w:rPr>
+        <w:t xml:space="preserve">`ornette_coleman`</w:t>
+      </w:r>
+      <w:r>
+        <w:t xml:space="preserve"> participates in locked export truth (</w:t>
+      </w:r>
+      <w:r>
+        <w:rPr>
+          <w:b/>
+          <w:bCs/>
+        </w:rPr>
+        <w:t xml:space="preserve">`customLockedHarmonyRouting`</w:t>
+      </w:r>
+      <w:r>
+        <w:t xml:space="preserve">, </w:t>
+      </w:r>
+      <w:r>
+        <w:rPr>
+          <w:b/>
+          <w:bCs/>
+        </w:rPr>
+        <w:t xml:space="preserve">`composerOsAppGeneration`</w:t>
+      </w:r>
+      <w:r>
+        <w:t xml:space="preserve">) like other slice primaries. 3. </w:t>
+      </w:r>
+      <w:r>
+        <w:rPr>
+          <w:b/>
+          <w:bCs/>
+        </w:rPr>
+        <w:t xml:space="preserve">Pool pedagogy</w:t>
+      </w:r>
+      <w:r>
+        <w:t xml:space="preserve"> — Inspect manifest </w:t>
+      </w:r>
+      <w:r>
+        <w:rPr>
+          <w:b/>
+          <w:bCs/>
+        </w:rPr>
+        <w:t xml:space="preserve">`chosenRowTags`</w:t>
+      </w:r>
+      <w:r>
+        <w:t xml:space="preserve"> for </w:t>
+      </w:r>
+      <w:r>
+        <w:rPr>
+          <w:b/>
+          <w:bCs/>
+        </w:rPr>
+        <w:t xml:space="preserve">`centre:`</w:t>
+      </w:r>
+      <w:r>
+        <w:t xml:space="preserve">, </w:t>
+      </w:r>
+      <w:r>
+        <w:rPr>
+          <w:b/>
+          <w:bCs/>
+        </w:rPr>
+        <w:t xml:space="preserve">`looseAxes:`</w:t>
+      </w:r>
+      <w:r>
+        <w:t xml:space="preserve">, </w:t>
+      </w:r>
+      <w:r>
+        <w:rPr>
+          <w:b/>
+          <w:bCs/>
+        </w:rPr>
+        <w:t xml:space="preserve">`rogueChromatics:`</w:t>
+      </w:r>
+      <w:r>
+        <w:t xml:space="preserve"> on harmolodic rows. 4. </w:t>
+      </w:r>
+      <w:r>
+        <w:rPr>
+          <w:b/>
+          <w:bCs/>
+        </w:rPr>
+        <w:t xml:space="preserve">Contrast Miles</w:t>
+      </w:r>
+      <w:r>
+        <w:t xml:space="preserve"> — </w:t>
+      </w:r>
+      <w:r>
+        <w:rPr>
+          <w:b/>
+          <w:bCs/>
+        </w:rPr>
+        <w:t xml:space="preserve">`md:*`</w:t>
+      </w:r>
+      <w:r>
+        <w:t xml:space="preserve"> modal / cool pocket vs </w:t>
+      </w:r>
+      <w:r>
+        <w:rPr>
+          <w:b/>
+          <w:bCs/>
+        </w:rPr>
+        <w:t xml:space="preserve">`oc:*`</w:t>
+      </w:r>
+      <w:r>
+        <w:t xml:space="preserve"> harmolodic non-resolution — same Song Mode form, different grammar.</w:t>
       </w:r>
     </w:p>
     <w:p>

</xml_diff>

<commit_message>
docs: Bartók — handbook section + README update
Co-authored-by: Cursor <cursoragent@cursor.com>
</commit_message>
<xml_diff>
--- a/docs/COMPOSER_OS_PLAYBOOK.docx
+++ b/docs/COMPOSER_OS_PLAYBOOK.docx
@@ -5515,7 +5515,7 @@
               <w:spacing w:after="60"/>
             </w:pPr>
             <w:r>
-              <w:t xml:space="preserve">`duke_ellington`</w:t>
+              <w:t xml:space="preserve">`bartok`</w:t>
             </w:r>
           </w:p>
         </w:tc>
@@ -5528,6 +5528,19 @@
               <w:spacing w:after="60"/>
             </w:pPr>
             <w:r>
+              <w:t xml:space="preserve">angular</w:t>
+            </w:r>
+          </w:p>
+        </w:tc>
+        <w:tc>
+          <w:tcPr>
+            <w:tcW w:type="pct" w:w="1285%"/>
+          </w:tcPr>
+          <w:p>
+            <w:pPr>
+              <w:spacing w:after="60"/>
+            </w:pPr>
+            <w:r>
               <w:t xml:space="preserve">mixed</w:t>
             </w:r>
           </w:p>
@@ -5541,7 +5554,7 @@
               <w:spacing w:after="60"/>
             </w:pPr>
             <w:r>
-              <w:t xml:space="preserve">eighth_patterns</w:t>
+              <w:t xml:space="preserve">5</w:t>
             </w:r>
           </w:p>
         </w:tc>
@@ -5554,7 +5567,7 @@
               <w:spacing w:after="60"/>
             </w:pPr>
             <w:r>
-              <w:t xml:space="preserve">4</w:t>
+              <w:t xml:space="preserve">0.35</w:t>
             </w:r>
           </w:p>
         </w:tc>
@@ -5567,7 +5580,7 @@
               <w:spacing w:after="60"/>
             </w:pPr>
             <w:r>
-              <w:t xml:space="preserve">0.6</w:t>
+              <w:t xml:space="preserve">arch</w:t>
             </w:r>
           </w:p>
         </w:tc>
@@ -5580,20 +5593,7 @@
               <w:spacing w:after="60"/>
             </w:pPr>
             <w:r>
-              <w:t xml:space="preserve">riff</w:t>
-            </w:r>
-          </w:p>
-        </w:tc>
-        <w:tc>
-          <w:tcPr>
-            <w:tcW w:type="pct" w:w="1285%"/>
-          </w:tcPr>
-          <w:p>
-            <w:pPr>
-              <w:spacing w:after="60"/>
-            </w:pPr>
-            <w:r>
-              <w:t xml:space="preserve">blues_riff; call_response; chromatic_inner_voice; plunger_color; sectional_shout</w:t>
+              <w:t xml:space="preserve">folk_pentatonic_cell; axis_motion; bulgarian_cell; mirror_fragment; cluster_passing</w:t>
             </w:r>
           </w:p>
         </w:tc>
@@ -5608,7 +5608,7 @@
               <w:spacing w:after="60"/>
             </w:pPr>
             <w:r>
-              <w:t xml:space="preserve">`maria_schneider`</w:t>
+              <w:t xml:space="preserve">`duke_ellington`</w:t>
             </w:r>
           </w:p>
         </w:tc>
@@ -5621,7 +5621,7 @@
               <w:spacing w:after="60"/>
             </w:pPr>
             <w:r>
-              <w:t xml:space="preserve">stepwise</w:t>
+              <w:t xml:space="preserve">mixed</w:t>
             </w:r>
           </w:p>
         </w:tc>
@@ -5634,7 +5634,7 @@
               <w:spacing w:after="60"/>
             </w:pPr>
             <w:r>
-              <w:t xml:space="preserve">mixed</w:t>
+              <w:t xml:space="preserve">eighth_patterns</w:t>
             </w:r>
           </w:p>
         </w:tc>
@@ -5647,7 +5647,7 @@
               <w:spacing w:after="60"/>
             </w:pPr>
             <w:r>
-              <w:t xml:space="preserve">7</w:t>
+              <w:t xml:space="preserve">4</w:t>
             </w:r>
           </w:p>
         </w:tc>
@@ -5660,7 +5660,7 @@
               <w:spacing w:after="60"/>
             </w:pPr>
             <w:r>
-              <w:t xml:space="preserve">0.85</w:t>
+              <w:t xml:space="preserve">0.6</w:t>
             </w:r>
           </w:p>
         </w:tc>
@@ -5673,7 +5673,7 @@
               <w:spacing w:after="60"/>
             </w:pPr>
             <w:r>
-              <w:t xml:space="preserve">arch</w:t>
+              <w:t xml:space="preserve">riff</w:t>
             </w:r>
           </w:p>
         </w:tc>
@@ -5686,7 +5686,7 @@
               <w:spacing w:after="60"/>
             </w:pPr>
             <w:r>
-              <w:t xml:space="preserve">sparse_phrase; modal_field; breath_space; nature_arc; chamber_texture</w:t>
+              <w:t xml:space="preserve">blues_riff; call_response; chromatic_inner_voice; plunger_color; sectional_shout</w:t>
             </w:r>
           </w:p>
         </w:tc>
@@ -5701,7 +5701,7 @@
               <w:spacing w:after="60"/>
             </w:pPr>
             <w:r>
-              <w:t xml:space="preserve">`miles_davis`</w:t>
+              <w:t xml:space="preserve">`maria_schneider`</w:t>
             </w:r>
           </w:p>
         </w:tc>
@@ -5740,7 +5740,7 @@
               <w:spacing w:after="60"/>
             </w:pPr>
             <w:r>
-              <w:t xml:space="preserve">4</w:t>
+              <w:t xml:space="preserve">7</w:t>
             </w:r>
           </w:p>
         </w:tc>
@@ -5753,7 +5753,7 @@
               <w:spacing w:after="60"/>
             </w:pPr>
             <w:r>
-              <w:t xml:space="preserve">0.72</w:t>
+              <w:t xml:space="preserve">0.85</w:t>
             </w:r>
           </w:p>
         </w:tc>
@@ -5779,7 +5779,7 @@
               <w:spacing w:after="60"/>
             </w:pPr>
             <w:r>
-              <w:t xml:space="preserve">modal_field; breath_space; deliberate_silence; cool_phrasing; motivic_cell</w:t>
+              <w:t xml:space="preserve">sparse_phrase; modal_field; breath_space; nature_arc; chamber_texture</w:t>
             </w:r>
           </w:p>
         </w:tc>
@@ -5794,7 +5794,7 @@
               <w:spacing w:after="60"/>
             </w:pPr>
             <w:r>
-              <w:t xml:space="preserve">`holland_dozier_holland`</w:t>
+              <w:t xml:space="preserve">`miles_davis`</w:t>
             </w:r>
           </w:p>
         </w:tc>
@@ -5820,7 +5820,7 @@
               <w:spacing w:after="60"/>
             </w:pPr>
             <w:r>
-              <w:t xml:space="preserve">eighth_patterns</w:t>
+              <w:t xml:space="preserve">mixed</w:t>
             </w:r>
           </w:p>
         </w:tc>
@@ -5833,7 +5833,7 @@
               <w:spacing w:after="60"/>
             </w:pPr>
             <w:r>
-              <w:t xml:space="preserve">2</w:t>
+              <w:t xml:space="preserve">4</w:t>
             </w:r>
           </w:p>
         </w:tc>
@@ -5846,7 +5846,7 @@
               <w:spacing w:after="60"/>
             </w:pPr>
             <w:r>
-              <w:t xml:space="preserve">0.7</w:t>
+              <w:t xml:space="preserve">0.72</w:t>
             </w:r>
           </w:p>
         </w:tc>
@@ -5859,7 +5859,7 @@
               <w:spacing w:after="60"/>
             </w:pPr>
             <w:r>
-              <w:t xml:space="preserve">rising</w:t>
+              <w:t xml:space="preserve">arch</w:t>
             </w:r>
           </w:p>
         </w:tc>
@@ -5872,7 +5872,7 @@
               <w:spacing w:after="60"/>
             </w:pPr>
             <w:r>
-              <w:t xml:space="preserve">call_response_hook; repeated_title_phrase; tambourine_anticipation; backing_vocal_echo</w:t>
+              <w:t xml:space="preserve">modal_field; breath_space; deliberate_silence; cool_phrasing; motivic_cell</w:t>
             </w:r>
           </w:p>
         </w:tc>
@@ -5887,7 +5887,7 @@
               <w:spacing w:after="60"/>
             </w:pPr>
             <w:r>
-              <w:t xml:space="preserve">`jeff_lynne`</w:t>
+              <w:t xml:space="preserve">`holland_dozier_holland`</w:t>
             </w:r>
           </w:p>
         </w:tc>
@@ -5913,7 +5913,7 @@
               <w:spacing w:after="60"/>
             </w:pPr>
             <w:r>
-              <w:t xml:space="preserve">mixed</w:t>
+              <w:t xml:space="preserve">eighth_patterns</w:t>
             </w:r>
           </w:p>
         </w:tc>
@@ -5926,7 +5926,7 @@
               <w:spacing w:after="60"/>
             </w:pPr>
             <w:r>
-              <w:t xml:space="preserve">4</w:t>
+              <w:t xml:space="preserve">2</w:t>
             </w:r>
           </w:p>
         </w:tc>
@@ -5939,7 +5939,7 @@
               <w:spacing w:after="60"/>
             </w:pPr>
             <w:r>
-              <w:t xml:space="preserve">0.6</w:t>
+              <w:t xml:space="preserve">0.7</w:t>
             </w:r>
           </w:p>
         </w:tc>
@@ -5952,7 +5952,7 @@
               <w:spacing w:after="60"/>
             </w:pPr>
             <w:r>
-              <w:t xml:space="preserve">arch</w:t>
+              <w:t xml:space="preserve">rising</w:t>
             </w:r>
           </w:p>
         </w:tc>
@@ -5965,7 +5965,7 @@
               <w:spacing w:after="60"/>
             </w:pPr>
             <w:r>
-              <w:t xml:space="preserve">stacked_harmony_hook; octave_doubled_melody; string_countermelody; descending_bass_hook</w:t>
+              <w:t xml:space="preserve">call_response_hook; repeated_title_phrase; tambourine_anticipation; backing_vocal_echo</w:t>
             </w:r>
           </w:p>
         </w:tc>
@@ -5980,7 +5980,7 @@
               <w:spacing w:after="60"/>
             </w:pPr>
             <w:r>
-              <w:t xml:space="preserve">`jeff_tweedy`</w:t>
+              <w:t xml:space="preserve">`jeff_lynne`</w:t>
             </w:r>
           </w:p>
         </w:tc>
@@ -6032,7 +6032,7 @@
               <w:spacing w:after="60"/>
             </w:pPr>
             <w:r>
-              <w:t xml:space="preserve">0.7</w:t>
+              <w:t xml:space="preserve">0.6</w:t>
             </w:r>
           </w:p>
         </w:tc>
@@ -6045,7 +6045,7 @@
               <w:spacing w:after="60"/>
             </w:pPr>
             <w:r>
-              <w:t xml:space="preserve">flat</w:t>
+              <w:t xml:space="preserve">arch</w:t>
             </w:r>
           </w:p>
         </w:tc>
@@ -6058,7 +6058,7 @@
               <w:spacing w:after="60"/>
             </w:pPr>
             <w:r>
-              <w:t xml:space="preserve">deadpan_repeated_note; modal_bVII; unresolved_suspension; folk_drone; understated_chorus</w:t>
+              <w:t xml:space="preserve">stacked_harmony_hook; octave_doubled_melody; string_countermelody; descending_bass_hook</w:t>
             </w:r>
           </w:p>
         </w:tc>
@@ -6073,7 +6073,7 @@
               <w:spacing w:after="60"/>
             </w:pPr>
             <w:r>
-              <w:t xml:space="preserve">`kendrick_lamar`</w:t>
+              <w:t xml:space="preserve">`jeff_tweedy`</w:t>
             </w:r>
           </w:p>
         </w:tc>
@@ -6099,7 +6099,7 @@
               <w:spacing w:after="60"/>
             </w:pPr>
             <w:r>
-              <w:t xml:space="preserve">eighth_patterns</w:t>
+              <w:t xml:space="preserve">mixed</w:t>
             </w:r>
           </w:p>
         </w:tc>
@@ -6112,7 +6112,7 @@
               <w:spacing w:after="60"/>
             </w:pPr>
             <w:r>
-              <w:t xml:space="preserve">3</w:t>
+              <w:t xml:space="preserve">4</w:t>
             </w:r>
           </w:p>
         </w:tc>
@@ -6125,7 +6125,7 @@
               <w:spacing w:after="60"/>
             </w:pPr>
             <w:r>
-              <w:t xml:space="preserve">0.5</w:t>
+              <w:t xml:space="preserve">0.7</w:t>
             </w:r>
           </w:p>
         </w:tc>
@@ -6138,7 +6138,7 @@
               <w:spacing w:after="60"/>
             </w:pPr>
             <w:r>
-              <w:t xml:space="preserve">speech_contour</w:t>
+              <w:t xml:space="preserve">flat</w:t>
             </w:r>
           </w:p>
         </w:tc>
@@ -6151,7 +6151,7 @@
               <w:spacing w:after="60"/>
             </w:pPr>
             <w:r>
-              <w:t xml:space="preserve">flow_modulation; syllabic_ostinato; pitch_zone_contrast; barline_displacement; triplet_switch</w:t>
+              <w:t xml:space="preserve">deadpan_repeated_note; modal_bVII; unresolved_suspension; folk_drone; understated_chorus</w:t>
             </w:r>
           </w:p>
         </w:tc>
@@ -6166,6 +6166,99 @@
               <w:spacing w:after="60"/>
             </w:pPr>
             <w:r>
+              <w:t xml:space="preserve">`kendrick_lamar`</w:t>
+            </w:r>
+          </w:p>
+        </w:tc>
+        <w:tc>
+          <w:tcPr>
+            <w:tcW w:type="pct" w:w="1285%"/>
+          </w:tcPr>
+          <w:p>
+            <w:pPr>
+              <w:spacing w:after="60"/>
+            </w:pPr>
+            <w:r>
+              <w:t xml:space="preserve">stepwise</w:t>
+            </w:r>
+          </w:p>
+        </w:tc>
+        <w:tc>
+          <w:tcPr>
+            <w:tcW w:type="pct" w:w="1285%"/>
+          </w:tcPr>
+          <w:p>
+            <w:pPr>
+              <w:spacing w:after="60"/>
+            </w:pPr>
+            <w:r>
+              <w:t xml:space="preserve">eighth_patterns</w:t>
+            </w:r>
+          </w:p>
+        </w:tc>
+        <w:tc>
+          <w:tcPr>
+            <w:tcW w:type="pct" w:w="1285%"/>
+          </w:tcPr>
+          <w:p>
+            <w:pPr>
+              <w:spacing w:after="60"/>
+            </w:pPr>
+            <w:r>
+              <w:t xml:space="preserve">3</w:t>
+            </w:r>
+          </w:p>
+        </w:tc>
+        <w:tc>
+          <w:tcPr>
+            <w:tcW w:type="pct" w:w="1285%"/>
+          </w:tcPr>
+          <w:p>
+            <w:pPr>
+              <w:spacing w:after="60"/>
+            </w:pPr>
+            <w:r>
+              <w:t xml:space="preserve">0.5</w:t>
+            </w:r>
+          </w:p>
+        </w:tc>
+        <w:tc>
+          <w:tcPr>
+            <w:tcW w:type="pct" w:w="1285%"/>
+          </w:tcPr>
+          <w:p>
+            <w:pPr>
+              <w:spacing w:after="60"/>
+            </w:pPr>
+            <w:r>
+              <w:t xml:space="preserve">speech_contour</w:t>
+            </w:r>
+          </w:p>
+        </w:tc>
+        <w:tc>
+          <w:tcPr>
+            <w:tcW w:type="pct" w:w="1285%"/>
+          </w:tcPr>
+          <w:p>
+            <w:pPr>
+              <w:spacing w:after="60"/>
+            </w:pPr>
+            <w:r>
+              <w:t xml:space="preserve">flow_modulation; syllabic_ostinato; pitch_zone_contrast; barline_displacement; triplet_switch</w:t>
+            </w:r>
+          </w:p>
+        </w:tc>
+      </w:tr>
+      <w:tr>
+        <w:tc>
+          <w:tcPr>
+            <w:tcW w:type="pct" w:w="1285%"/>
+          </w:tcPr>
+          <w:p>
+            <w:pPr>
+              <w:spacing w:after="60"/>
+            </w:pPr>
+            <w:r>
               <w:t xml:space="preserve">`kurt_weill`</w:t>
             </w:r>
           </w:p>
@@ -6306,7 +6399,7 @@
         <w:t xml:space="preserve">`MELODY_PROFILES`</w:t>
       </w:r>
       <w:r>
-        <w:t xml:space="preserve"> cardinality (≥37 keys), distinct </w:t>
+        <w:t xml:space="preserve"> cardinality (≥38 keys), distinct </w:t>
       </w:r>
       <w:r>
         <w:rPr>
@@ -9303,6 +9396,1369 @@
           <w:bCs/>
         </w:rPr>
         <w:t xml:space="preserve">three harmonic dialects</w:t>
+      </w:r>
+      <w:r>
+        <w:t xml:space="preserve">.</w:t>
+      </w:r>
+    </w:p>
+    <w:p>
+      <w:pPr>
+        <w:pStyle w:val="Heading1"/>
+        <w:spacing w:after="120" w:before="200"/>
+      </w:pPr>
+      <w:r>
+        <w:t xml:space="preserve">Béla Bartók (`bartok`) — Song Mode harmony slice (three contexts)</w:t>
+      </w:r>
+    </w:p>
+    <w:p>
+      <w:pPr>
+        <w:spacing w:after="160"/>
+      </w:pPr>
+      <w:r>
+        <w:t xml:space="preserve">Primary songwriter </w:t>
+      </w:r>
+      <w:r>
+        <w:rPr>
+          <w:b/>
+          <w:bCs/>
+        </w:rPr>
+        <w:t xml:space="preserve">`bartok`</w:t>
+      </w:r>
+      <w:r>
+        <w:t xml:space="preserve"> runs </w:t>
+      </w:r>
+      <w:r>
+        <w:rPr>
+          <w:b/>
+          <w:bCs/>
+        </w:rPr>
+        <w:t xml:space="preserve">`bartokSlice.ts`</w:t>
+      </w:r>
+      <w:r>
+        <w:t xml:space="preserve"> on the golden-path duo timeline (</w:t>
+      </w:r>
+      <w:r>
+        <w:rPr>
+          <w:b/>
+          <w:bCs/>
+        </w:rPr>
+        <w:t xml:space="preserve">`precomputeBartokEffectiveHarmonyBars`</w:t>
+      </w:r>
+      <w:r>
+        <w:t xml:space="preserve"> → </w:t>
+      </w:r>
+      <w:r>
+        <w:rPr>
+          <w:b/>
+          <w:bCs/>
+        </w:rPr>
+        <w:t xml:space="preserve">`bartokEffectiveHarmonyBars`</w:t>
+      </w:r>
+      <w:r>
+        <w:t xml:space="preserve"> for </w:t>
+      </w:r>
+      <w:r>
+        <w:rPr>
+          <w:b/>
+          <w:bCs/>
+        </w:rPr>
+        <w:t xml:space="preserve">`getChordForBar`</w:t>
+      </w:r>
+      <w:r>
+        <w:t xml:space="preserve">, </w:t>
+      </w:r>
+      <w:r>
+        <w:rPr>
+          <w:b/>
+          <w:bCs/>
+        </w:rPr>
+        <w:t xml:space="preserve">`customLockedHarmonyRouting`</w:t>
+      </w:r>
+      <w:r>
+        <w:t xml:space="preserve">, </w:t>
+      </w:r>
+      <w:r>
+        <w:rPr>
+          <w:b/>
+          <w:bCs/>
+        </w:rPr>
+        <w:t xml:space="preserve">`runGoldenPath`</w:t>
+      </w:r>
+      <w:r>
+        <w:t xml:space="preserve"> locked export truth, </w:t>
+      </w:r>
+      <w:r>
+        <w:rPr>
+          <w:b/>
+          <w:bCs/>
+        </w:rPr>
+        <w:t xml:space="preserve">`composerOsAppGeneration`</w:t>
+      </w:r>
+      <w:r>
+        <w:t xml:space="preserve">). </w:t>
+      </w:r>
+      <w:r>
+        <w:rPr>
+          <w:b/>
+          <w:bCs/>
+        </w:rPr>
+        <w:t xml:space="preserve">`GenerationMetadata.bartokContext`</w:t>
+      </w:r>
+      <w:r>
+        <w:t xml:space="preserve"> selects the surface (</w:t>
+      </w:r>
+      <w:r>
+        <w:rPr>
+          <w:b/>
+          <w:bCs/>
+        </w:rPr>
+        <w:t xml:space="preserve">default `mikrokosmos`</w:t>
+      </w:r>
+      <w:r>
+        <w:t xml:space="preserve">): </w:t>
+      </w:r>
+      <w:r>
+        <w:rPr>
+          <w:b/>
+          <w:bCs/>
+        </w:rPr>
+        <w:t xml:space="preserve">`mikrokosmos`</w:t>
+      </w:r>
+      <w:r>
+        <w:t xml:space="preserve"> · </w:t>
+      </w:r>
+      <w:r>
+        <w:rPr>
+          <w:b/>
+          <w:bCs/>
+        </w:rPr>
+        <w:t xml:space="preserve">`string_quartet`</w:t>
+      </w:r>
+      <w:r>
+        <w:t xml:space="preserve"> · </w:t>
+      </w:r>
+      <w:r>
+        <w:rPr>
+          <w:b/>
+          <w:bCs/>
+        </w:rPr>
+        <w:t xml:space="preserve">`music_for_strings`</w:t>
+      </w:r>
+      <w:r>
+        <w:t xml:space="preserve">. API contract: </w:t>
+      </w:r>
+      <w:r>
+        <w:rPr>
+          <w:b/>
+          <w:bCs/>
+        </w:rPr>
+        <w:t xml:space="preserve">`GenerateRequest.bartokContext`</w:t>
+      </w:r>
+      <w:r>
+        <w:t xml:space="preserve">. Receipts use prefix </w:t>
+      </w:r>
+      <w:r>
+        <w:rPr>
+          <w:b/>
+          <w:bCs/>
+        </w:rPr>
+        <w:t xml:space="preserve">`bk:`</w:t>
+      </w:r>
+      <w:r>
+        <w:t xml:space="preserve">. Aliases </w:t>
+      </w:r>
+      <w:r>
+        <w:rPr>
+          <w:b/>
+          <w:bCs/>
+        </w:rPr>
+        <w:t xml:space="preserve">`bela_bartok`</w:t>
+      </w:r>
+      <w:r>
+        <w:t xml:space="preserve">, </w:t>
+      </w:r>
+      <w:r>
+        <w:rPr>
+          <w:b/>
+          <w:bCs/>
+        </w:rPr>
+        <w:t xml:space="preserve">`bela`</w:t>
+      </w:r>
+      <w:r>
+        <w:t xml:space="preserve"> → </w:t>
+      </w:r>
+      <w:r>
+        <w:rPr>
+          <w:b/>
+          <w:bCs/>
+        </w:rPr>
+        <w:t xml:space="preserve">`bartok`</w:t>
+      </w:r>
+      <w:r>
+        <w:t xml:space="preserve"> via </w:t>
+      </w:r>
+      <w:r>
+        <w:rPr>
+          <w:b/>
+          <w:bCs/>
+        </w:rPr>
+        <w:t xml:space="preserve">`normalizeSongwriterStyleKey`</w:t>
+      </w:r>
+      <w:r>
+        <w:t xml:space="preserve">.</w:t>
+      </w:r>
+    </w:p>
+    <w:p>
+      <w:pPr>
+        <w:spacing w:after="160"/>
+      </w:pPr>
+      <w:r>
+        <w:rPr>
+          <w:b/>
+          <w:bCs/>
+        </w:rPr>
+        <w:t xml:space="preserve">Chord pools (axis / modal / orchestral bias)</w:t>
+      </w:r>
+      <w:r>
+        <w:t xml:space="preserve"> — Song Mode scaffold rows in </w:t>
+      </w:r>
+      <w:r>
+        <w:rPr>
+          <w:b/>
+          <w:bCs/>
+        </w:rPr>
+        <w:t xml:space="preserve">`SONGWRITER_CHORD_POOLS`</w:t>
+      </w:r>
+      <w:r>
+        <w:t xml:space="preserve">: </w:t>
+      </w:r>
+      <w:r>
+        <w:rPr>
+          <w:b/>
+          <w:bCs/>
+        </w:rPr>
+        <w:t xml:space="preserve">`bartok_mikrokosmos`</w:t>
+      </w:r>
+      <w:r>
+        <w:t xml:space="preserve">, </w:t>
+      </w:r>
+      <w:r>
+        <w:rPr>
+          <w:b/>
+          <w:bCs/>
+        </w:rPr>
+        <w:t xml:space="preserve">`bartok_string_quartet`</w:t>
+      </w:r>
+      <w:r>
+        <w:t xml:space="preserve">, </w:t>
+      </w:r>
+      <w:r>
+        <w:rPr>
+          <w:b/>
+          <w:bCs/>
+        </w:rPr>
+        <w:t xml:space="preserve">`bartok_music_for_strings`</w:t>
+      </w:r>
+      <w:r>
+        <w:t xml:space="preserve">. When </w:t>
+      </w:r>
+      <w:r>
+        <w:rPr>
+          <w:b/>
+          <w:bCs/>
+        </w:rPr>
+        <w:t xml:space="preserve">`primarySongwriterStyle === bartok`</w:t>
+      </w:r>
+      <w:r>
+        <w:t xml:space="preserve">, </w:t>
+      </w:r>
+      <w:r>
+        <w:rPr>
+          <w:b/>
+          <w:bCs/>
+        </w:rPr>
+        <w:t xml:space="preserve">`chordSymbolsForSection`</w:t>
+      </w:r>
+      <w:r>
+        <w:t xml:space="preserve"> resolves the pool with the same </w:t>
+      </w:r>
+      <w:r>
+        <w:rPr>
+          <w:b/>
+          <w:bCs/>
+        </w:rPr>
+        <w:t xml:space="preserve">seed-tier</w:t>
+      </w:r>
+      <w:r>
+        <w:t xml:space="preserve"> pattern as Miles (</w:t>
+      </w:r>
+      <w:r>
+        <w:rPr>
+          <w:b/>
+          <w:bCs/>
+        </w:rPr>
+        <w:t xml:space="preserve">`Math.abs(seed) % 3`</w:t>
+      </w:r>
+      <w:r>
+        <w:t xml:space="preserve">). Vocabulary leans </w:t>
+      </w:r>
+      <w:r>
+        <w:rPr>
+          <w:b/>
+          <w:bCs/>
+        </w:rPr>
+        <w:t xml:space="preserve">axis motion</w:t>
+      </w:r>
+      <w:r>
+        <w:t xml:space="preserve"> (minor-third / symmetric root moves), </w:t>
+      </w:r>
+      <w:r>
+        <w:rPr>
+          <w:b/>
+          <w:bCs/>
+        </w:rPr>
+        <w:t xml:space="preserve">quartal / add9 / #11</w:t>
+      </w:r>
+      <w:r>
+        <w:t xml:space="preserve"> colours, </w:t>
+      </w:r>
+      <w:r>
+        <w:rPr>
+          <w:b/>
+          <w:bCs/>
+        </w:rPr>
+        <w:t xml:space="preserve">cluster / alt-dominant</w:t>
+      </w:r>
+      <w:r>
+        <w:t xml:space="preserve"> spellings, and </w:t>
+      </w:r>
+      <w:r>
+        <w:rPr>
+          <w:b/>
+          <w:bCs/>
+        </w:rPr>
+        <w:t xml:space="preserve">folk-pentatonic</w:t>
+      </w:r>
+      <w:r>
+        <w:t xml:space="preserve"> substrate symbols — not functional </w:t>
+      </w:r>
+      <w:r>
+        <w:rPr>
+          <w:b/>
+          <w:bCs/>
+        </w:rPr>
+        <w:t xml:space="preserve">ii–V–I</w:t>
+      </w:r>
+      <w:r>
+        <w:t xml:space="preserve"> chains: </w:t>
+      </w:r>
+      <w:r>
+        <w:rPr>
+          <w:b/>
+          <w:bCs/>
+        </w:rPr>
+        <w:t xml:space="preserve">`breakFrankZappaIiViProgressions`</w:t>
+      </w:r>
+      <w:r>
+        <w:t xml:space="preserve"> runs on the </w:t>
+      </w:r>
+      <w:r>
+        <w:rPr>
+          <w:b/>
+          <w:bCs/>
+        </w:rPr>
+        <w:t xml:space="preserve">four-bar</w:t>
+      </w:r>
+      <w:r>
+        <w:t xml:space="preserve"> row after harmonic rhythm, same guard class as Zappa / Joni pools.</w:t>
+      </w:r>
+    </w:p>
+    <w:p>
+      <w:pPr>
+        <w:pStyle w:val="Heading2"/>
+        <w:spacing w:after="100" w:before="160"/>
+      </w:pPr>
+      <w:r>
+        <w:t xml:space="preserve">Contexts (harmonic / density bias)</w:t>
+      </w:r>
+    </w:p>
+    <w:tbl>
+      <w:tblPr>
+        <w:tblW w:type="pct" w:w="100%"/>
+        <w:tblBorders>
+          <w:top w:val="single" w:color="auto" w:sz="4"/>
+          <w:left w:val="single" w:color="auto" w:sz="4"/>
+          <w:bottom w:val="single" w:color="auto" w:sz="4"/>
+          <w:right w:val="single" w:color="auto" w:sz="4"/>
+          <w:insideH w:val="single" w:color="auto" w:sz="4"/>
+          <w:insideV w:val="single" w:color="auto" w:sz="4"/>
+        </w:tblBorders>
+      </w:tblPr>
+      <w:tblGrid>
+        <w:gridCol w:w="4500"/>
+        <w:gridCol w:w="4500"/>
+      </w:tblGrid>
+      <w:tr>
+        <w:tc>
+          <w:tcPr>
+            <w:tcW w:type="pct" w:w="4500%"/>
+          </w:tcPr>
+          <w:p>
+            <w:pPr>
+              <w:spacing w:after="60"/>
+            </w:pPr>
+            <w:r>
+              <w:t xml:space="preserve">Context</w:t>
+            </w:r>
+          </w:p>
+        </w:tc>
+        <w:tc>
+          <w:tcPr>
+            <w:tcW w:type="pct" w:w="4500%"/>
+          </w:tcPr>
+          <w:p>
+            <w:pPr>
+              <w:spacing w:after="60"/>
+            </w:pPr>
+            <w:r>
+              <w:t xml:space="preserve">Role</w:t>
+            </w:r>
+          </w:p>
+        </w:tc>
+      </w:tr>
+      <w:tr>
+        <w:tc>
+          <w:tcPr>
+            <w:tcW w:type="pct" w:w="4500%"/>
+          </w:tcPr>
+          <w:p>
+            <w:pPr>
+              <w:spacing w:after="60"/>
+            </w:pPr>
+            <w:r>
+              <w:rPr>
+                <w:b/>
+                <w:bCs/>
+              </w:rPr>
+              <w:t xml:space="preserve">`mikrokosmos`</w:t>
+            </w:r>
+          </w:p>
+        </w:tc>
+        <w:tc>
+          <w:tcPr>
+            <w:tcW w:type="pct" w:w="4500%"/>
+          </w:tcPr>
+          <w:p>
+            <w:pPr>
+              <w:spacing w:after="60"/>
+            </w:pPr>
+            <w:r>
+              <w:t xml:space="preserve">Piano-study bias: </w:t>
+            </w:r>
+            <w:r>
+              <w:rPr>
+                <w:b/>
+                <w:bCs/>
+              </w:rPr>
+              <w:t xml:space="preserve">quartal</w:t>
+            </w:r>
+            <w:r>
+              <w:t xml:space="preserve"> / </w:t>
+            </w:r>
+            <w:r>
+              <w:rPr>
+                <w:b/>
+                <w:bCs/>
+              </w:rPr>
+              <w:t xml:space="preserve">sus4/</w:t>
+            </w:r>
+            <w:r>
+              <w:t xml:space="preserve"> slash colours, </w:t>
+            </w:r>
+            <w:r>
+              <w:rPr>
+                <w:b/>
+                <w:bCs/>
+              </w:rPr>
+              <w:t xml:space="preserve">m11</w:t>
+            </w:r>
+            <w:r>
+              <w:t xml:space="preserve"> / </w:t>
+            </w:r>
+            <w:r>
+              <w:rPr>
+                <w:b/>
+                <w:bCs/>
+              </w:rPr>
+              <w:t xml:space="preserve">add9</w:t>
+            </w:r>
+            <w:r>
+              <w:t xml:space="preserve"> enrichment; </w:t>
+            </w:r>
+            <w:r>
+              <w:rPr>
+                <w:b/>
+                <w:bCs/>
+              </w:rPr>
+              <w:t xml:space="preserve">d1</w:t>
+            </w:r>
+            <w:r>
+              <w:t xml:space="preserve"> axis substitution uses </w:t>
+            </w:r>
+            <w:r>
+              <w:rPr>
+                <w:b/>
+                <w:bCs/>
+              </w:rPr>
+              <w:t xml:space="preserve">±3</w:t>
+            </w:r>
+            <w:r>
+              <w:t xml:space="preserve"> semitone-class moves on eligible bars (</w:t>
+            </w:r>
+            <w:r>
+              <w:rPr>
+                <w:b/>
+                <w:bCs/>
+              </w:rPr>
+              <w:t xml:space="preserve">`bk:axis_substitution@bar{N}`</w:t>
+            </w:r>
+            <w:r>
+              <w:t xml:space="preserve">).</w:t>
+            </w:r>
+          </w:p>
+        </w:tc>
+      </w:tr>
+      <w:tr>
+        <w:tc>
+          <w:tcPr>
+            <w:tcW w:type="pct" w:w="4500%"/>
+          </w:tcPr>
+          <w:p>
+            <w:pPr>
+              <w:spacing w:after="60"/>
+            </w:pPr>
+            <w:r>
+              <w:rPr>
+                <w:b/>
+                <w:bCs/>
+              </w:rPr>
+              <w:t xml:space="preserve">`string_quartet`</w:t>
+            </w:r>
+          </w:p>
+        </w:tc>
+        <w:tc>
+          <w:tcPr>
+            <w:tcW w:type="pct" w:w="4500%"/>
+          </w:tcPr>
+          <w:p>
+            <w:pPr>
+              <w:spacing w:after="60"/>
+            </w:pPr>
+            <w:r>
+              <w:t xml:space="preserve">Chamber spacing: </w:t>
+            </w:r>
+            <w:r>
+              <w:rPr>
+                <w:b/>
+                <w:bCs/>
+              </w:rPr>
+              <w:t xml:space="preserve">add9</w:t>
+            </w:r>
+            <w:r>
+              <w:t xml:space="preserve">, </w:t>
+            </w:r>
+            <w:r>
+              <w:rPr>
+                <w:b/>
+                <w:bCs/>
+              </w:rPr>
+              <w:t xml:space="preserve">maj7#11</w:t>
+            </w:r>
+            <w:r>
+              <w:t xml:space="preserve">, </w:t>
+            </w:r>
+            <w:r>
+              <w:rPr>
+                <w:b/>
+                <w:bCs/>
+              </w:rPr>
+              <w:t xml:space="preserve">m11</w:t>
+            </w:r>
+            <w:r>
+              <w:t xml:space="preserve"> surfaces; </w:t>
+            </w:r>
+            <w:r>
+              <w:rPr>
+                <w:b/>
+                <w:bCs/>
+              </w:rPr>
+              <w:t xml:space="preserve">d1</w:t>
+            </w:r>
+            <w:r>
+              <w:t xml:space="preserve"> axis substitution uses </w:t>
+            </w:r>
+            <w:r>
+              <w:rPr>
+                <w:b/>
+                <w:bCs/>
+              </w:rPr>
+              <w:t xml:space="preserve">±6</w:t>
+            </w:r>
+            <w:r>
+              <w:t xml:space="preserve"> (tritone-axis) moves on eligible bars.</w:t>
+            </w:r>
+          </w:p>
+        </w:tc>
+      </w:tr>
+      <w:tr>
+        <w:tc>
+          <w:tcPr>
+            <w:tcW w:type="pct" w:w="4500%"/>
+          </w:tcPr>
+          <w:p>
+            <w:pPr>
+              <w:spacing w:after="60"/>
+            </w:pPr>
+            <w:r>
+              <w:rPr>
+                <w:b/>
+                <w:bCs/>
+              </w:rPr>
+              <w:t xml:space="preserve">`music_for_strings`</w:t>
+            </w:r>
+          </w:p>
+        </w:tc>
+        <w:tc>
+          <w:tcPr>
+            <w:tcW w:type="pct" w:w="4500%"/>
+          </w:tcPr>
+          <w:p>
+            <w:pPr>
+              <w:spacing w:after="60"/>
+            </w:pPr>
+            <w:r>
+              <w:t xml:space="preserve">Orchestral weight: </w:t>
+            </w:r>
+            <w:r>
+              <w:rPr>
+                <w:b/>
+                <w:bCs/>
+              </w:rPr>
+              <w:t xml:space="preserve">dominant alt</w:t>
+            </w:r>
+            <w:r>
+              <w:t xml:space="preserve"> (</w:t>
+            </w:r>
+            <w:r>
+              <w:rPr>
+                <w:b/>
+                <w:bCs/>
+              </w:rPr>
+              <w:t xml:space="preserve">7(b9,b13)</w:t>
+            </w:r>
+            <w:r>
+              <w:t xml:space="preserve">), </w:t>
+            </w:r>
+            <w:r>
+              <w:rPr>
+                <w:b/>
+                <w:bCs/>
+              </w:rPr>
+              <w:t xml:space="preserve">maj7#11</w:t>
+            </w:r>
+            <w:r>
+              <w:t xml:space="preserve"> peaks; </w:t>
+            </w:r>
+            <w:r>
+              <w:rPr>
+                <w:b/>
+                <w:bCs/>
+              </w:rPr>
+              <w:t xml:space="preserve">d1</w:t>
+            </w:r>
+            <w:r>
+              <w:t xml:space="preserve"> axis substitution uses </w:t>
+            </w:r>
+            <w:r>
+              <w:rPr>
+                <w:b/>
+                <w:bCs/>
+              </w:rPr>
+              <w:t xml:space="preserve">±4</w:t>
+            </w:r>
+            <w:r>
+              <w:t xml:space="preserve"> semitone-class moves.</w:t>
+            </w:r>
+          </w:p>
+        </w:tc>
+      </w:tr>
+    </w:tbl>
+    <w:p>
+      <w:pPr>
+        <w:spacing w:after="160"/>
+      </w:pPr>
+    </w:p>
+    <w:p>
+      <w:pPr>
+        <w:pStyle w:val="Heading2"/>
+        <w:spacing w:after="100" w:before="160"/>
+      </w:pPr>
+      <w:r>
+        <w:t xml:space="preserve">Harmonic devices (receipts **`bk:`**)</w:t>
+      </w:r>
+    </w:p>
+    <w:tbl>
+      <w:tblPr>
+        <w:tblW w:type="pct" w:w="100%"/>
+        <w:tblBorders>
+          <w:top w:val="single" w:color="auto" w:sz="4"/>
+          <w:left w:val="single" w:color="auto" w:sz="4"/>
+          <w:bottom w:val="single" w:color="auto" w:sz="4"/>
+          <w:right w:val="single" w:color="auto" w:sz="4"/>
+          <w:insideH w:val="single" w:color="auto" w:sz="4"/>
+          <w:insideV w:val="single" w:color="auto" w:sz="4"/>
+        </w:tblBorders>
+      </w:tblPr>
+      <w:tblGrid>
+        <w:gridCol w:w="3000"/>
+        <w:gridCol w:w="3000"/>
+        <w:gridCol w:w="3000"/>
+      </w:tblGrid>
+      <w:tr>
+        <w:tc>
+          <w:tcPr>
+            <w:tcW w:type="pct" w:w="3000%"/>
+          </w:tcPr>
+          <w:p>
+            <w:pPr>
+              <w:spacing w:after="60"/>
+            </w:pPr>
+            <w:r>
+              <w:t xml:space="preserve">Id</w:t>
+            </w:r>
+          </w:p>
+        </w:tc>
+        <w:tc>
+          <w:tcPr>
+            <w:tcW w:type="pct" w:w="3000%"/>
+          </w:tcPr>
+          <w:p>
+            <w:pPr>
+              <w:spacing w:after="60"/>
+            </w:pPr>
+            <w:r>
+              <w:t xml:space="preserve">Pass</w:t>
+            </w:r>
+          </w:p>
+        </w:tc>
+        <w:tc>
+          <w:tcPr>
+            <w:tcW w:type="pct" w:w="3000%"/>
+          </w:tcPr>
+          <w:p>
+            <w:pPr>
+              <w:spacing w:after="60"/>
+            </w:pPr>
+            <w:r>
+              <w:t xml:space="preserve">Receipt</w:t>
+            </w:r>
+          </w:p>
+        </w:tc>
+      </w:tr>
+      <w:tr>
+        <w:tc>
+          <w:tcPr>
+            <w:tcW w:type="pct" w:w="3000%"/>
+          </w:tcPr>
+          <w:p>
+            <w:pPr>
+              <w:spacing w:after="60"/>
+            </w:pPr>
+            <w:r>
+              <w:rPr>
+                <w:b/>
+                <w:bCs/>
+              </w:rPr>
+              <w:t xml:space="preserve">d1</w:t>
+            </w:r>
+          </w:p>
+        </w:tc>
+        <w:tc>
+          <w:tcPr>
+            <w:tcW w:type="pct" w:w="3000%"/>
+          </w:tcPr>
+          <w:p>
+            <w:pPr>
+              <w:spacing w:after="60"/>
+            </w:pPr>
+            <w:r>
+              <w:t xml:space="preserve">Axis substitution (context step)</w:t>
+            </w:r>
+          </w:p>
+        </w:tc>
+        <w:tc>
+          <w:tcPr>
+            <w:tcW w:type="pct" w:w="3000%"/>
+          </w:tcPr>
+          <w:p>
+            <w:pPr>
+              <w:spacing w:after="60"/>
+            </w:pPr>
+            <w:r>
+              <w:rPr>
+                <w:b/>
+                <w:bCs/>
+              </w:rPr>
+              <w:t xml:space="preserve">`bk:axis_substitution@bar{N}`</w:t>
+            </w:r>
+          </w:p>
+        </w:tc>
+      </w:tr>
+      <w:tr>
+        <w:tc>
+          <w:tcPr>
+            <w:tcW w:type="pct" w:w="3000%"/>
+          </w:tcPr>
+          <w:p>
+            <w:pPr>
+              <w:spacing w:after="60"/>
+            </w:pPr>
+            <w:r>
+              <w:rPr>
+                <w:b/>
+                <w:bCs/>
+              </w:rPr>
+              <w:t xml:space="preserve">d2</w:t>
+            </w:r>
+          </w:p>
+        </w:tc>
+        <w:tc>
+          <w:tcPr>
+            <w:tcW w:type="pct" w:w="3000%"/>
+          </w:tcPr>
+          <w:p>
+            <w:pPr>
+              <w:spacing w:after="60"/>
+            </w:pPr>
+            <w:r>
+              <w:t xml:space="preserve">Golden-section climax (~</w:t>
+            </w:r>
+            <w:r>
+              <w:rPr>
+                <w:b/>
+                <w:bCs/>
+              </w:rPr>
+              <w:t xml:space="preserve">0.618 × totalBars</w:t>
+            </w:r>
+            <w:r>
+              <w:t xml:space="preserve"> bar, chart </w:t>
+            </w:r>
+            <w:r>
+              <w:rPr>
+                <w:b/>
+                <w:bCs/>
+              </w:rPr>
+              <w:t xml:space="preserve">≥8</w:t>
+            </w:r>
+            <w:r>
+              <w:t xml:space="preserve">)</w:t>
+            </w:r>
+          </w:p>
+        </w:tc>
+        <w:tc>
+          <w:tcPr>
+            <w:tcW w:type="pct" w:w="3000%"/>
+          </w:tcPr>
+          <w:p>
+            <w:pPr>
+              <w:spacing w:after="60"/>
+            </w:pPr>
+            <w:r>
+              <w:rPr>
+                <w:b/>
+                <w:bCs/>
+              </w:rPr>
+              <w:t xml:space="preserve">`bk:golden_section_climax@bar{N}`</w:t>
+            </w:r>
+          </w:p>
+        </w:tc>
+      </w:tr>
+      <w:tr>
+        <w:tc>
+          <w:tcPr>
+            <w:tcW w:type="pct" w:w="3000%"/>
+          </w:tcPr>
+          <w:p>
+            <w:pPr>
+              <w:spacing w:after="60"/>
+            </w:pPr>
+            <w:r>
+              <w:rPr>
+                <w:b/>
+                <w:bCs/>
+              </w:rPr>
+              <w:t xml:space="preserve">d3</w:t>
+            </w:r>
+          </w:p>
+        </w:tc>
+        <w:tc>
+          <w:tcPr>
+            <w:tcW w:type="pct" w:w="3000%"/>
+          </w:tcPr>
+          <w:p>
+            <w:pPr>
+              <w:spacing w:after="60"/>
+            </w:pPr>
+            <w:r>
+              <w:t xml:space="preserve">Bulgarian-style additive </w:t>
+            </w:r>
+            <w:r>
+              <w:rPr>
+                <w:b/>
+                <w:bCs/>
+              </w:rPr>
+              <w:t xml:space="preserve">accent</w:t>
+            </w:r>
+            <w:r>
+              <w:t xml:space="preserve"> grid (4/4 scaffold; </w:t>
+            </w:r>
+            <w:r>
+              <w:rPr>
+                <w:b/>
+                <w:bCs/>
+              </w:rPr>
+              <w:t xml:space="preserve">metadata / receipt</w:t>
+            </w:r>
+            <w:r>
+              <w:t xml:space="preserve"> only)</w:t>
+            </w:r>
+          </w:p>
+        </w:tc>
+        <w:tc>
+          <w:tcPr>
+            <w:tcW w:type="pct" w:w="3000%"/>
+          </w:tcPr>
+          <w:p>
+            <w:pPr>
+              <w:spacing w:after="60"/>
+            </w:pPr>
+            <w:r>
+              <w:rPr>
+                <w:b/>
+                <w:bCs/>
+              </w:rPr>
+              <w:t xml:space="preserve">`bk:bulgarian_rhythm@bar{N}`</w:t>
+            </w:r>
+          </w:p>
+        </w:tc>
+      </w:tr>
+      <w:tr>
+        <w:tc>
+          <w:tcPr>
+            <w:tcW w:type="pct" w:w="3000%"/>
+          </w:tcPr>
+          <w:p>
+            <w:pPr>
+              <w:spacing w:after="60"/>
+            </w:pPr>
+            <w:r>
+              <w:rPr>
+                <w:b/>
+                <w:bCs/>
+              </w:rPr>
+              <w:t xml:space="preserve">d4</w:t>
+            </w:r>
+          </w:p>
+        </w:tc>
+        <w:tc>
+          <w:tcPr>
+            <w:tcW w:type="pct" w:w="3000%"/>
+          </w:tcPr>
+          <w:p>
+            <w:pPr>
+              <w:spacing w:after="60"/>
+            </w:pPr>
+            <w:r>
+              <w:t xml:space="preserve">Interval-cell transpose on phrase grid (</w:t>
+            </w:r>
+            <w:r>
+              <w:rPr>
+                <w:b/>
+                <w:bCs/>
+              </w:rPr>
+              <w:t xml:space="preserve">2,5,1</w:t>
+            </w:r>
+            <w:r>
+              <w:t xml:space="preserve"> / </w:t>
+            </w:r>
+            <w:r>
+              <w:rPr>
+                <w:b/>
+                <w:bCs/>
+              </w:rPr>
+              <w:t xml:space="preserve">3,4,1</w:t>
+            </w:r>
+            <w:r>
+              <w:t xml:space="preserve"> / </w:t>
+            </w:r>
+            <w:r>
+              <w:rPr>
+                <w:b/>
+                <w:bCs/>
+              </w:rPr>
+              <w:t xml:space="preserve">4,3,2</w:t>
+            </w:r>
+            <w:r>
+              <w:t xml:space="preserve"> by context)</w:t>
+            </w:r>
+          </w:p>
+        </w:tc>
+        <w:tc>
+          <w:tcPr>
+            <w:tcW w:type="pct" w:w="3000%"/>
+          </w:tcPr>
+          <w:p>
+            <w:pPr>
+              <w:spacing w:after="60"/>
+            </w:pPr>
+            <w:r>
+              <w:rPr>
+                <w:b/>
+                <w:bCs/>
+              </w:rPr>
+              <w:t xml:space="preserve">`bk:interval_cell_transform@bar{N}`</w:t>
+            </w:r>
+          </w:p>
+        </w:tc>
+      </w:tr>
+      <w:tr>
+        <w:tc>
+          <w:tcPr>
+            <w:tcW w:type="pct" w:w="3000%"/>
+          </w:tcPr>
+          <w:p>
+            <w:pPr>
+              <w:spacing w:after="60"/>
+            </w:pPr>
+            <w:r>
+              <w:rPr>
+                <w:b/>
+                <w:bCs/>
+              </w:rPr>
+              <w:t xml:space="preserve">d5</w:t>
+            </w:r>
+          </w:p>
+        </w:tc>
+        <w:tc>
+          <w:tcPr>
+            <w:tcW w:type="pct" w:w="3000%"/>
+          </w:tcPr>
+          <w:p>
+            <w:pPr>
+              <w:spacing w:after="60"/>
+            </w:pPr>
+            <w:r>
+              <w:t xml:space="preserve">Arch-form mirror (swap pairs around </w:t>
+            </w:r>
+            <w:r>
+              <w:rPr>
+                <w:b/>
+                <w:bCs/>
+              </w:rPr>
+              <w:t xml:space="preserve">pivot</w:t>
+            </w:r>
+            <w:r>
+              <w:t xml:space="preserve"> on long forms)</w:t>
+            </w:r>
+          </w:p>
+        </w:tc>
+        <w:tc>
+          <w:tcPr>
+            <w:tcW w:type="pct" w:w="3000%"/>
+          </w:tcPr>
+          <w:p>
+            <w:pPr>
+              <w:spacing w:after="60"/>
+            </w:pPr>
+            <w:r>
+              <w:rPr>
+                <w:b/>
+                <w:bCs/>
+              </w:rPr>
+              <w:t xml:space="preserve">`bk:arch_form_mirror@bar{N}`</w:t>
+            </w:r>
+          </w:p>
+        </w:tc>
+      </w:tr>
+    </w:tbl>
+    <w:p>
+      <w:pPr>
+        <w:spacing w:after="160"/>
+      </w:pPr>
+    </w:p>
+    <w:p>
+      <w:pPr>
+        <w:pStyle w:val="Heading2"/>
+        <w:spacing w:after="100" w:before="160"/>
+      </w:pPr>
+      <w:r>
+        <w:t xml:space="preserve">Style surface (metadata nudges)</w:t>
+      </w:r>
+    </w:p>
+    <w:p>
+      <w:pPr>
+        <w:spacing w:after="160"/>
+      </w:pPr>
+      <w:r>
+        <w:rPr>
+          <w:b/>
+          <w:bCs/>
+        </w:rPr>
+        <w:t xml:space="preserve">`applyBartokStyleSurface`</w:t>
+      </w:r>
+      <w:r>
+        <w:t xml:space="preserve"> — for all contexts: </w:t>
+      </w:r>
+      <w:r>
+        <w:rPr>
+          <w:b/>
+          <w:bCs/>
+        </w:rPr>
+        <w:t xml:space="preserve">space +0.28</w:t>
+      </w:r>
+      <w:r>
+        <w:t xml:space="preserve">, </w:t>
+      </w:r>
+      <w:r>
+        <w:rPr>
+          <w:b/>
+          <w:bCs/>
+        </w:rPr>
+        <w:t xml:space="preserve">syncopation +0.18</w:t>
+      </w:r>
+      <w:r>
+        <w:t xml:space="preserve">, </w:t>
+      </w:r>
+      <w:r>
+        <w:rPr>
+          <w:b/>
+          <w:bCs/>
+        </w:rPr>
+        <w:t xml:space="preserve">cadence softness +0.22</w:t>
+      </w:r>
+      <w:r>
+        <w:t xml:space="preserve"> (clamped </w:t>
+      </w:r>
+      <w:r>
+        <w:rPr>
+          <w:b/>
+          <w:bCs/>
+        </w:rPr>
+        <w:t xml:space="preserve">0–1</w:t>
+      </w:r>
+      <w:r>
+        <w:t xml:space="preserve">). </w:t>
+      </w:r>
+      <w:r>
+        <w:rPr>
+          <w:b/>
+          <w:bCs/>
+        </w:rPr>
+        <w:t xml:space="preserve">Density</w:t>
+      </w:r>
+      <w:r>
+        <w:t xml:space="preserve"> delta by context: </w:t>
+      </w:r>
+      <w:r>
+        <w:rPr>
+          <w:b/>
+          <w:bCs/>
+        </w:rPr>
+        <w:t xml:space="preserve">`mikrokosmos`</w:t>
+      </w:r>
+      <w:r>
+        <w:t xml:space="preserve"> </w:t>
+      </w:r>
+      <w:r>
+        <w:rPr>
+          <w:b/>
+          <w:bCs/>
+        </w:rPr>
+        <w:t xml:space="preserve">+0.06</w:t>
+      </w:r>
+      <w:r>
+        <w:t xml:space="preserve">, </w:t>
+      </w:r>
+      <w:r>
+        <w:rPr>
+          <w:b/>
+          <w:bCs/>
+        </w:rPr>
+        <w:t xml:space="preserve">`string_quartet`</w:t>
+      </w:r>
+      <w:r>
+        <w:t xml:space="preserve"> </w:t>
+      </w:r>
+      <w:r>
+        <w:rPr>
+          <w:b/>
+          <w:bCs/>
+        </w:rPr>
+        <w:t xml:space="preserve">−0.08</w:t>
+      </w:r>
+      <w:r>
+        <w:t xml:space="preserve">, </w:t>
+      </w:r>
+      <w:r>
+        <w:rPr>
+          <w:b/>
+          <w:bCs/>
+        </w:rPr>
+        <w:t xml:space="preserve">`music_for_strings`</w:t>
+      </w:r>
+      <w:r>
+        <w:t xml:space="preserve"> </w:t>
+      </w:r>
+      <w:r>
+        <w:rPr>
+          <w:b/>
+          <w:bCs/>
+        </w:rPr>
+        <w:t xml:space="preserve">+0.02</w:t>
+      </w:r>
+      <w:r>
+        <w:t xml:space="preserve"> (from prior </w:t>
+      </w:r>
+      <w:r>
+        <w:rPr>
+          <w:b/>
+          <w:bCs/>
+        </w:rPr>
+        <w:t xml:space="preserve">`songwriterDensityBias`</w:t>
+      </w:r>
+      <w:r>
+        <w:t xml:space="preserve"> default </w:t>
+      </w:r>
+      <w:r>
+        <w:rPr>
+          <w:b/>
+          <w:bCs/>
+        </w:rPr>
+        <w:t xml:space="preserve">0.5</w:t>
+      </w:r>
+      <w:r>
+        <w:t xml:space="preserve"> when unset).</w:t>
+      </w:r>
+    </w:p>
+    <w:p>
+      <w:pPr>
+        <w:pStyle w:val="Heading2"/>
+        <w:spacing w:after="100" w:before="160"/>
+      </w:pPr>
+      <w:r>
+        <w:t xml:space="preserve">Melody planner row</w:t>
+      </w:r>
+    </w:p>
+    <w:p>
+      <w:pPr>
+        <w:spacing w:after="160"/>
+      </w:pPr>
+      <w:r>
+        <w:rPr>
+          <w:b/>
+          <w:bCs/>
+        </w:rPr>
+        <w:t xml:space="preserve">`MELODY_PROFILES['bartok']`</w:t>
+      </w:r>
+      <w:r>
+        <w:t xml:space="preserve"> — angular · mixed rhythm · </w:t>
+      </w:r>
+      <w:r>
+        <w:rPr>
+          <w:b/>
+          <w:bCs/>
+        </w:rPr>
+        <w:t xml:space="preserve">repetitionVsVariationBias 0.35</w:t>
+      </w:r>
+      <w:r>
+        <w:t xml:space="preserve"> · phrase </w:t>
+      </w:r>
+      <w:r>
+        <w:rPr>
+          <w:b/>
+          <w:bCs/>
+        </w:rPr>
+        <w:t xml:space="preserve">5</w:t>
+      </w:r>
+      <w:r>
+        <w:t xml:space="preserve"> · </w:t>
+      </w:r>
+      <w:r>
+        <w:rPr>
+          <w:b/>
+          <w:bCs/>
+        </w:rPr>
+        <w:t xml:space="preserve">arch</w:t>
+      </w:r>
+      <w:r>
+        <w:t xml:space="preserve"> contour · cadence </w:t>
+      </w:r>
+      <w:r>
+        <w:rPr>
+          <w:b/>
+          <w:bCs/>
+        </w:rPr>
+        <w:t xml:space="preserve">low</w:t>
+      </w:r>
+      <w:r>
+        <w:t xml:space="preserve"> · devices </w:t>
+      </w:r>
+      <w:r>
+        <w:rPr>
+          <w:b/>
+          <w:bCs/>
+        </w:rPr>
+        <w:t xml:space="preserve">`folk_pentatonic_cell`</w:t>
+      </w:r>
+      <w:r>
+        <w:t xml:space="preserve">, </w:t>
+      </w:r>
+      <w:r>
+        <w:rPr>
+          <w:b/>
+          <w:bCs/>
+        </w:rPr>
+        <w:t xml:space="preserve">`axis_motion`</w:t>
+      </w:r>
+      <w:r>
+        <w:t xml:space="preserve">, </w:t>
+      </w:r>
+      <w:r>
+        <w:rPr>
+          <w:b/>
+          <w:bCs/>
+        </w:rPr>
+        <w:t xml:space="preserve">`bulgarian_cell`</w:t>
+      </w:r>
+      <w:r>
+        <w:t xml:space="preserve">, </w:t>
+      </w:r>
+      <w:r>
+        <w:rPr>
+          <w:b/>
+          <w:bCs/>
+        </w:rPr>
+        <w:t xml:space="preserve">`mirror_fragment`</w:t>
+      </w:r>
+      <w:r>
+        <w:t xml:space="preserve">, </w:t>
+      </w:r>
+      <w:r>
+        <w:rPr>
+          <w:b/>
+          <w:bCs/>
+        </w:rPr>
+        <w:t xml:space="preserve">`cluster_passing`</w:t>
       </w:r>
       <w:r>
         <w:t xml:space="preserve">.</w:t>

</xml_diff>

<commit_message>
docs: Gershwin — handbook section + README update
Co-authored-by: Cursor <cursoragent@cursor.com>
</commit_message>
<xml_diff>
--- a/docs/COMPOSER_OS_PLAYBOOK.docx
+++ b/docs/COMPOSER_OS_PLAYBOOK.docx
@@ -5608,6 +5608,99 @@
               <w:spacing w:after="60"/>
             </w:pPr>
             <w:r>
+              <w:t xml:space="preserve">`gershwin`</w:t>
+            </w:r>
+          </w:p>
+        </w:tc>
+        <w:tc>
+          <w:tcPr>
+            <w:tcW w:type="pct" w:w="1285%"/>
+          </w:tcPr>
+          <w:p>
+            <w:pPr>
+              <w:spacing w:after="60"/>
+            </w:pPr>
+            <w:r>
+              <w:t xml:space="preserve">mixed</w:t>
+            </w:r>
+          </w:p>
+        </w:tc>
+        <w:tc>
+          <w:tcPr>
+            <w:tcW w:type="pct" w:w="1285%"/>
+          </w:tcPr>
+          <w:p>
+            <w:pPr>
+              <w:spacing w:after="60"/>
+            </w:pPr>
+            <w:r>
+              <w:t xml:space="preserve">eighth_patterns</w:t>
+            </w:r>
+          </w:p>
+        </w:tc>
+        <w:tc>
+          <w:tcPr>
+            <w:tcW w:type="pct" w:w="1285%"/>
+          </w:tcPr>
+          <w:p>
+            <w:pPr>
+              <w:spacing w:after="60"/>
+            </w:pPr>
+            <w:r>
+              <w:t xml:space="preserve">8</w:t>
+            </w:r>
+          </w:p>
+        </w:tc>
+        <w:tc>
+          <w:tcPr>
+            <w:tcW w:type="pct" w:w="1285%"/>
+          </w:tcPr>
+          <w:p>
+            <w:pPr>
+              <w:spacing w:after="60"/>
+            </w:pPr>
+            <w:r>
+              <w:t xml:space="preserve">0.38</w:t>
+            </w:r>
+          </w:p>
+        </w:tc>
+        <w:tc>
+          <w:tcPr>
+            <w:tcW w:type="pct" w:w="1285%"/>
+          </w:tcPr>
+          <w:p>
+            <w:pPr>
+              <w:spacing w:after="60"/>
+            </w:pPr>
+            <w:r>
+              <w:t xml:space="preserve">cabaret_arc</w:t>
+            </w:r>
+          </w:p>
+        </w:tc>
+        <w:tc>
+          <w:tcPr>
+            <w:tcW w:type="pct" w:w="1285%"/>
+          </w:tcPr>
+          <w:p>
+            <w:pPr>
+              <w:spacing w:after="60"/>
+            </w:pPr>
+            <w:r>
+              <w:t xml:space="preserve">aaba_form; blue_note_color; syncopated_anticipation; chromatic_passing; minor_third_modulation</w:t>
+            </w:r>
+          </w:p>
+        </w:tc>
+      </w:tr>
+      <w:tr>
+        <w:tc>
+          <w:tcPr>
+            <w:tcW w:type="pct" w:w="1285%"/>
+          </w:tcPr>
+          <w:p>
+            <w:pPr>
+              <w:spacing w:after="60"/>
+            </w:pPr>
+            <w:r>
               <w:t xml:space="preserve">`duke_ellington`</w:t>
             </w:r>
           </w:p>
@@ -10759,6 +10852,1256 @@
           <w:bCs/>
         </w:rPr>
         <w:t xml:space="preserve">`cluster_passing`</w:t>
+      </w:r>
+      <w:r>
+        <w:t xml:space="preserve">.</w:t>
+      </w:r>
+    </w:p>
+    <w:p>
+      <w:pPr>
+        <w:pStyle w:val="Heading1"/>
+        <w:spacing w:after="120" w:before="200"/>
+      </w:pPr>
+      <w:r>
+        <w:t xml:space="preserve">George Gershwin (`gershwin`) — Song Mode harmony slice (three contexts)</w:t>
+      </w:r>
+    </w:p>
+    <w:p>
+      <w:pPr>
+        <w:spacing w:after="160"/>
+      </w:pPr>
+      <w:r>
+        <w:t xml:space="preserve">Primary songwriter </w:t>
+      </w:r>
+      <w:r>
+        <w:rPr>
+          <w:b/>
+          <w:bCs/>
+        </w:rPr>
+        <w:t xml:space="preserve">`gershwin`</w:t>
+      </w:r>
+      <w:r>
+        <w:t xml:space="preserve"> runs </w:t>
+      </w:r>
+      <w:r>
+        <w:rPr>
+          <w:b/>
+          <w:bCs/>
+        </w:rPr>
+        <w:t xml:space="preserve">`gershwinSlice.ts`</w:t>
+      </w:r>
+      <w:r>
+        <w:t xml:space="preserve"> on the golden-path duo timeline (</w:t>
+      </w:r>
+      <w:r>
+        <w:rPr>
+          <w:b/>
+          <w:bCs/>
+        </w:rPr>
+        <w:t xml:space="preserve">`precomputeGershwinEffectiveHarmonyBars`</w:t>
+      </w:r>
+      <w:r>
+        <w:t xml:space="preserve"> → </w:t>
+      </w:r>
+      <w:r>
+        <w:rPr>
+          <w:b/>
+          <w:bCs/>
+        </w:rPr>
+        <w:t xml:space="preserve">`gershwinEffectiveHarmonyBars`</w:t>
+      </w:r>
+      <w:r>
+        <w:t xml:space="preserve"> for </w:t>
+      </w:r>
+      <w:r>
+        <w:rPr>
+          <w:b/>
+          <w:bCs/>
+        </w:rPr>
+        <w:t xml:space="preserve">`getChordForBar`</w:t>
+      </w:r>
+      <w:r>
+        <w:t xml:space="preserve">, </w:t>
+      </w:r>
+      <w:r>
+        <w:rPr>
+          <w:b/>
+          <w:bCs/>
+        </w:rPr>
+        <w:t xml:space="preserve">`customLockedHarmonyRouting`</w:t>
+      </w:r>
+      <w:r>
+        <w:t xml:space="preserve">, </w:t>
+      </w:r>
+      <w:r>
+        <w:rPr>
+          <w:b/>
+          <w:bCs/>
+        </w:rPr>
+        <w:t xml:space="preserve">`runGoldenPath`</w:t>
+      </w:r>
+      <w:r>
+        <w:t xml:space="preserve"> locked export truth, </w:t>
+      </w:r>
+      <w:r>
+        <w:rPr>
+          <w:b/>
+          <w:bCs/>
+        </w:rPr>
+        <w:t xml:space="preserve">`composerOsAppGeneration`</w:t>
+      </w:r>
+      <w:r>
+        <w:t xml:space="preserve">). </w:t>
+      </w:r>
+      <w:r>
+        <w:rPr>
+          <w:b/>
+          <w:bCs/>
+        </w:rPr>
+        <w:t xml:space="preserve">`GenerationMetadata.gershwinContext`</w:t>
+      </w:r>
+      <w:r>
+        <w:t xml:space="preserve"> selects the surface (</w:t>
+      </w:r>
+      <w:r>
+        <w:rPr>
+          <w:b/>
+          <w:bCs/>
+        </w:rPr>
+        <w:t xml:space="preserve">default `song_aaba`</w:t>
+      </w:r>
+      <w:r>
+        <w:t xml:space="preserve">): </w:t>
+      </w:r>
+      <w:r>
+        <w:rPr>
+          <w:b/>
+          <w:bCs/>
+        </w:rPr>
+        <w:t xml:space="preserve">`song_aaba`</w:t>
+      </w:r>
+      <w:r>
+        <w:t xml:space="preserve"> · </w:t>
+      </w:r>
+      <w:r>
+        <w:rPr>
+          <w:b/>
+          <w:bCs/>
+        </w:rPr>
+        <w:t xml:space="preserve">`rhapsody`</w:t>
+      </w:r>
+      <w:r>
+        <w:t xml:space="preserve"> · </w:t>
+      </w:r>
+      <w:r>
+        <w:rPr>
+          <w:b/>
+          <w:bCs/>
+        </w:rPr>
+        <w:t xml:space="preserve">`rhythm_changes`</w:t>
+      </w:r>
+      <w:r>
+        <w:t xml:space="preserve">. API contract: </w:t>
+      </w:r>
+      <w:r>
+        <w:rPr>
+          <w:b/>
+          <w:bCs/>
+        </w:rPr>
+        <w:t xml:space="preserve">`GenerateRequest.gershwinContext`</w:t>
+      </w:r>
+      <w:r>
+        <w:t xml:space="preserve">. Receipts use prefix </w:t>
+      </w:r>
+      <w:r>
+        <w:rPr>
+          <w:b/>
+          <w:bCs/>
+        </w:rPr>
+        <w:t xml:space="preserve">`gg:`</w:t>
+      </w:r>
+      <w:r>
+        <w:t xml:space="preserve">. Aliases </w:t>
+      </w:r>
+      <w:r>
+        <w:rPr>
+          <w:b/>
+          <w:bCs/>
+        </w:rPr>
+        <w:t xml:space="preserve">`george_gershwin`</w:t>
+      </w:r>
+      <w:r>
+        <w:t xml:space="preserve"> → </w:t>
+      </w:r>
+      <w:r>
+        <w:rPr>
+          <w:b/>
+          <w:bCs/>
+        </w:rPr>
+        <w:t xml:space="preserve">`gershwin`</w:t>
+      </w:r>
+      <w:r>
+        <w:t xml:space="preserve"> via </w:t>
+      </w:r>
+      <w:r>
+        <w:rPr>
+          <w:b/>
+          <w:bCs/>
+        </w:rPr>
+        <w:t xml:space="preserve">`normalizeSongwriterStyleKey`</w:t>
+      </w:r>
+      <w:r>
+        <w:t xml:space="preserve">.</w:t>
+      </w:r>
+    </w:p>
+    <w:p>
+      <w:pPr>
+        <w:spacing w:after="160"/>
+      </w:pPr>
+      <w:r>
+        <w:rPr>
+          <w:b/>
+          <w:bCs/>
+        </w:rPr>
+        <w:t xml:space="preserve">Chord pools (functional backbone + jazz extensions)</w:t>
+      </w:r>
+      <w:r>
+        <w:t xml:space="preserve"> — Song Mode scaffold rows in </w:t>
+      </w:r>
+      <w:r>
+        <w:rPr>
+          <w:b/>
+          <w:bCs/>
+        </w:rPr>
+        <w:t xml:space="preserve">`SONGWRITER_CHORD_POOLS`</w:t>
+      </w:r>
+      <w:r>
+        <w:t xml:space="preserve">: </w:t>
+      </w:r>
+      <w:r>
+        <w:rPr>
+          <w:b/>
+          <w:bCs/>
+        </w:rPr>
+        <w:t xml:space="preserve">`gershwin_song_aaba`</w:t>
+      </w:r>
+      <w:r>
+        <w:t xml:space="preserve">, </w:t>
+      </w:r>
+      <w:r>
+        <w:rPr>
+          <w:b/>
+          <w:bCs/>
+        </w:rPr>
+        <w:t xml:space="preserve">`gershwin_rhapsody`</w:t>
+      </w:r>
+      <w:r>
+        <w:t xml:space="preserve">, </w:t>
+      </w:r>
+      <w:r>
+        <w:rPr>
+          <w:b/>
+          <w:bCs/>
+        </w:rPr>
+        <w:t xml:space="preserve">`gershwin_rhythm_changes`</w:t>
+      </w:r>
+      <w:r>
+        <w:t xml:space="preserve">. When </w:t>
+      </w:r>
+      <w:r>
+        <w:rPr>
+          <w:b/>
+          <w:bCs/>
+        </w:rPr>
+        <w:t xml:space="preserve">`primarySongwriterStyle === gershwin`</w:t>
+      </w:r>
+      <w:r>
+        <w:t xml:space="preserve">, </w:t>
+      </w:r>
+      <w:r>
+        <w:rPr>
+          <w:b/>
+          <w:bCs/>
+        </w:rPr>
+        <w:t xml:space="preserve">`chordSymbolsForSection`</w:t>
+      </w:r>
+      <w:r>
+        <w:t xml:space="preserve"> picks a pool with the same </w:t>
+      </w:r>
+      <w:r>
+        <w:rPr>
+          <w:b/>
+          <w:bCs/>
+        </w:rPr>
+        <w:t xml:space="preserve">seed-tier</w:t>
+      </w:r>
+      <w:r>
+        <w:t xml:space="preserve"> pattern as Miles / Bartók (</w:t>
+      </w:r>
+      <w:r>
+        <w:rPr>
+          <w:b/>
+          <w:bCs/>
+        </w:rPr>
+        <w:t xml:space="preserve">`Math.abs(seed) % 3`</w:t>
+      </w:r>
+      <w:r>
+        <w:t xml:space="preserve">). Vocabulary blends </w:t>
+      </w:r>
+      <w:r>
+        <w:rPr>
+          <w:b/>
+          <w:bCs/>
+        </w:rPr>
+        <w:t xml:space="preserve">I / ii7 / IV6(9) / V7(9)</w:t>
+      </w:r>
+      <w:r>
+        <w:t xml:space="preserve">-style functions with </w:t>
+      </w:r>
+      <w:r>
+        <w:rPr>
+          <w:b/>
+          <w:bCs/>
+        </w:rPr>
+        <w:t xml:space="preserve">Imaj7 / I6 / V7b9 / V7#5#9</w:t>
+      </w:r>
+      <w:r>
+        <w:t xml:space="preserve"> colours, </w:t>
+      </w:r>
+      <w:r>
+        <w:rPr>
+          <w:b/>
+          <w:bCs/>
+        </w:rPr>
+        <w:t xml:space="preserve">secondary-dominant</w:t>
+      </w:r>
+      <w:r>
+        <w:t xml:space="preserve"> approach, </w:t>
+      </w:r>
+      <w:r>
+        <w:rPr>
+          <w:b/>
+          <w:bCs/>
+        </w:rPr>
+        <w:t xml:space="preserve">chromatic passing</w:t>
+      </w:r>
+      <w:r>
+        <w:t xml:space="preserve"> spellings, </w:t>
+      </w:r>
+      <w:r>
+        <w:rPr>
+          <w:b/>
+          <w:bCs/>
+        </w:rPr>
+        <w:t xml:space="preserve">augmented</w:t>
+      </w:r>
+      <w:r>
+        <w:t xml:space="preserve"> and </w:t>
+      </w:r>
+      <w:r>
+        <w:rPr>
+          <w:b/>
+          <w:bCs/>
+        </w:rPr>
+        <w:t xml:space="preserve">diminished</w:t>
+      </w:r>
+      <w:r>
+        <w:t xml:space="preserve"> connectors — not rolling textbook </w:t>
+      </w:r>
+      <w:r>
+        <w:rPr>
+          <w:b/>
+          <w:bCs/>
+        </w:rPr>
+        <w:t xml:space="preserve">ii–V–I</w:t>
+      </w:r>
+      <w:r>
+        <w:t xml:space="preserve"> chains: </w:t>
+      </w:r>
+      <w:r>
+        <w:rPr>
+          <w:b/>
+          <w:bCs/>
+        </w:rPr>
+        <w:t xml:space="preserve">`breakFrankZappaIiViProgressions`</w:t>
+      </w:r>
+      <w:r>
+        <w:t xml:space="preserve"> runs on the row after harmonic rhythm, same guard class as Zappa / Joni / Bartók pools.</w:t>
+      </w:r>
+    </w:p>
+    <w:p>
+      <w:pPr>
+        <w:pStyle w:val="Heading2"/>
+        <w:spacing w:after="100" w:before="160"/>
+      </w:pPr>
+      <w:r>
+        <w:t xml:space="preserve">Contexts (form / grid bias)</w:t>
+      </w:r>
+    </w:p>
+    <w:tbl>
+      <w:tblPr>
+        <w:tblW w:type="pct" w:w="100%"/>
+        <w:tblBorders>
+          <w:top w:val="single" w:color="auto" w:sz="4"/>
+          <w:left w:val="single" w:color="auto" w:sz="4"/>
+          <w:bottom w:val="single" w:color="auto" w:sz="4"/>
+          <w:right w:val="single" w:color="auto" w:sz="4"/>
+          <w:insideH w:val="single" w:color="auto" w:sz="4"/>
+          <w:insideV w:val="single" w:color="auto" w:sz="4"/>
+        </w:tblBorders>
+      </w:tblPr>
+      <w:tblGrid>
+        <w:gridCol w:w="4500"/>
+        <w:gridCol w:w="4500"/>
+      </w:tblGrid>
+      <w:tr>
+        <w:tc>
+          <w:tcPr>
+            <w:tcW w:type="pct" w:w="4500%"/>
+          </w:tcPr>
+          <w:p>
+            <w:pPr>
+              <w:spacing w:after="60"/>
+            </w:pPr>
+            <w:r>
+              <w:t xml:space="preserve">Context</w:t>
+            </w:r>
+          </w:p>
+        </w:tc>
+        <w:tc>
+          <w:tcPr>
+            <w:tcW w:type="pct" w:w="4500%"/>
+          </w:tcPr>
+          <w:p>
+            <w:pPr>
+              <w:spacing w:after="60"/>
+            </w:pPr>
+            <w:r>
+              <w:t xml:space="preserve">Role</w:t>
+            </w:r>
+          </w:p>
+        </w:tc>
+      </w:tr>
+      <w:tr>
+        <w:tc>
+          <w:tcPr>
+            <w:tcW w:type="pct" w:w="4500%"/>
+          </w:tcPr>
+          <w:p>
+            <w:pPr>
+              <w:spacing w:after="60"/>
+            </w:pPr>
+            <w:r>
+              <w:rPr>
+                <w:b/>
+                <w:bCs/>
+              </w:rPr>
+              <w:t xml:space="preserve">`song_aaba`</w:t>
+            </w:r>
+          </w:p>
+        </w:tc>
+        <w:tc>
+          <w:tcPr>
+            <w:tcW w:type="pct" w:w="4500%"/>
+          </w:tcPr>
+          <w:p>
+            <w:pPr>
+              <w:spacing w:after="60"/>
+            </w:pPr>
+            <w:r>
+              <w:t xml:space="preserve">Songbook </w:t>
+            </w:r>
+            <w:r>
+              <w:rPr>
+                <w:b/>
+                <w:bCs/>
+              </w:rPr>
+              <w:t xml:space="preserve">AABA</w:t>
+            </w:r>
+            <w:r>
+              <w:t xml:space="preserve">-leaning pool: </w:t>
+            </w:r>
+            <w:r>
+              <w:rPr>
+                <w:b/>
+                <w:bCs/>
+              </w:rPr>
+              <w:t xml:space="preserve">8-bar</w:t>
+            </w:r>
+            <w:r>
+              <w:t xml:space="preserve">-friendly rows, bridge contrast rows, </w:t>
+            </w:r>
+            <w:r>
+              <w:rPr>
+                <w:b/>
+                <w:bCs/>
+              </w:rPr>
+              <w:t xml:space="preserve">I maj7 / ii7 / V(9) / IV6(9)</w:t>
+            </w:r>
+            <w:r>
+              <w:t xml:space="preserve">-flavoured spellings. </w:t>
+            </w:r>
+            <w:r>
+              <w:rPr>
+                <w:b/>
+                <w:bCs/>
+              </w:rPr>
+              <w:t xml:space="preserve">d1</w:t>
+            </w:r>
+            <w:r>
+              <w:t xml:space="preserve"> tags </w:t>
+            </w:r>
+            <w:r>
+              <w:rPr>
+                <w:b/>
+                <w:bCs/>
+              </w:rPr>
+              <w:t xml:space="preserve">AABA</w:t>
+            </w:r>
+            <w:r>
+              <w:t xml:space="preserve"> / return anchors in metadata (`gg:d1_aaba_form@…`).</w:t>
+            </w:r>
+          </w:p>
+        </w:tc>
+      </w:tr>
+      <w:tr>
+        <w:tc>
+          <w:tcPr>
+            <w:tcW w:type="pct" w:w="4500%"/>
+          </w:tcPr>
+          <w:p>
+            <w:pPr>
+              <w:spacing w:after="60"/>
+            </w:pPr>
+            <w:r>
+              <w:rPr>
+                <w:b/>
+                <w:bCs/>
+              </w:rPr>
+              <w:t xml:space="preserve">`rhapsody`</w:t>
+            </w:r>
+          </w:p>
+        </w:tc>
+        <w:tc>
+          <w:tcPr>
+            <w:tcW w:type="pct" w:w="4500%"/>
+          </w:tcPr>
+          <w:p>
+            <w:pPr>
+              <w:spacing w:after="60"/>
+            </w:pPr>
+            <w:r>
+              <w:t xml:space="preserve">Concert </w:t>
+            </w:r>
+            <w:r>
+              <w:rPr>
+                <w:b/>
+                <w:bCs/>
+              </w:rPr>
+              <w:t xml:space="preserve">rhapsody</w:t>
+            </w:r>
+            <w:r>
+              <w:t xml:space="preserve"> arc: wider </w:t>
+            </w:r>
+            <w:r>
+              <w:rPr>
+                <w:b/>
+                <w:bCs/>
+              </w:rPr>
+              <w:t xml:space="preserve">chromatic</w:t>
+            </w:r>
+            <w:r>
+              <w:t xml:space="preserve"> / </w:t>
+            </w:r>
+            <w:r>
+              <w:rPr>
+                <w:b/>
+                <w:bCs/>
+              </w:rPr>
+              <w:t xml:space="preserve">dim</w:t>
+            </w:r>
+            <w:r>
+              <w:t xml:space="preserve"> / </w:t>
+            </w:r>
+            <w:r>
+              <w:rPr>
+                <w:b/>
+                <w:bCs/>
+              </w:rPr>
+              <w:t xml:space="preserve">alt-dominant</w:t>
+            </w:r>
+            <w:r>
+              <w:t xml:space="preserve"> pool rows; </w:t>
+            </w:r>
+            <w:r>
+              <w:rPr>
+                <w:b/>
+                <w:bCs/>
+              </w:rPr>
+              <w:t xml:space="preserve">d1</w:t>
+            </w:r>
+            <w:r>
+              <w:t xml:space="preserve"> tags a </w:t>
+            </w:r>
+            <w:r>
+              <w:rPr>
+                <w:b/>
+                <w:bCs/>
+              </w:rPr>
+              <w:t xml:space="preserve">rhapsody_arc</w:t>
+            </w:r>
+            <w:r>
+              <w:t xml:space="preserve"> pivot bar for long forms.</w:t>
+            </w:r>
+          </w:p>
+        </w:tc>
+      </w:tr>
+      <w:tr>
+        <w:tc>
+          <w:tcPr>
+            <w:tcW w:type="pct" w:w="4500%"/>
+          </w:tcPr>
+          <w:p>
+            <w:pPr>
+              <w:spacing w:after="60"/>
+            </w:pPr>
+            <w:r>
+              <w:rPr>
+                <w:b/>
+                <w:bCs/>
+              </w:rPr>
+              <w:t xml:space="preserve">`rhythm_changes`</w:t>
+            </w:r>
+          </w:p>
+        </w:tc>
+        <w:tc>
+          <w:tcPr>
+            <w:tcW w:type="pct" w:w="4500%"/>
+          </w:tcPr>
+          <w:p>
+            <w:pPr>
+              <w:spacing w:after="60"/>
+            </w:pPr>
+            <w:r>
+              <w:rPr>
+                <w:b/>
+                <w:bCs/>
+              </w:rPr>
+              <w:t xml:space="preserve">Rhythm-changes</w:t>
+            </w:r>
+            <w:r>
+              <w:t xml:space="preserve"> grid: </w:t>
+            </w:r>
+            <w:r>
+              <w:rPr>
+                <w:b/>
+                <w:bCs/>
+              </w:rPr>
+              <w:t xml:space="preserve">I–vi–ii–V</w:t>
+            </w:r>
+            <w:r>
+              <w:t xml:space="preserve">-flavoured and </w:t>
+            </w:r>
+            <w:r>
+              <w:rPr>
+                <w:b/>
+                <w:bCs/>
+              </w:rPr>
+              <w:t xml:space="preserve">turnaround</w:t>
+            </w:r>
+            <w:r>
+              <w:t xml:space="preserve">-biased pool rows; </w:t>
+            </w:r>
+            <w:r>
+              <w:rPr>
+                <w:b/>
+                <w:bCs/>
+              </w:rPr>
+              <w:t xml:space="preserve">d1</w:t>
+            </w:r>
+            <w:r>
+              <w:t xml:space="preserve"> records </w:t>
+            </w:r>
+            <w:r>
+              <w:rPr>
+                <w:b/>
+                <w:bCs/>
+              </w:rPr>
+              <w:t xml:space="preserve">rhythm_changes</w:t>
+            </w:r>
+            <w:r>
+              <w:t xml:space="preserve"> mode for the generation.</w:t>
+            </w:r>
+          </w:p>
+        </w:tc>
+      </w:tr>
+    </w:tbl>
+    <w:p>
+      <w:pPr>
+        <w:spacing w:after="160"/>
+      </w:pPr>
+    </w:p>
+    <w:p>
+      <w:pPr>
+        <w:pStyle w:val="Heading2"/>
+        <w:spacing w:after="100" w:before="160"/>
+      </w:pPr>
+      <w:r>
+        <w:t xml:space="preserve">Harmonic devices (receipts **`gg:`**)</w:t>
+      </w:r>
+    </w:p>
+    <w:tbl>
+      <w:tblPr>
+        <w:tblW w:type="pct" w:w="100%"/>
+        <w:tblBorders>
+          <w:top w:val="single" w:color="auto" w:sz="4"/>
+          <w:left w:val="single" w:color="auto" w:sz="4"/>
+          <w:bottom w:val="single" w:color="auto" w:sz="4"/>
+          <w:right w:val="single" w:color="auto" w:sz="4"/>
+          <w:insideH w:val="single" w:color="auto" w:sz="4"/>
+          <w:insideV w:val="single" w:color="auto" w:sz="4"/>
+        </w:tblBorders>
+      </w:tblPr>
+      <w:tblGrid>
+        <w:gridCol w:w="3000"/>
+        <w:gridCol w:w="3000"/>
+        <w:gridCol w:w="3000"/>
+      </w:tblGrid>
+      <w:tr>
+        <w:tc>
+          <w:tcPr>
+            <w:tcW w:type="pct" w:w="3000%"/>
+          </w:tcPr>
+          <w:p>
+            <w:pPr>
+              <w:spacing w:after="60"/>
+            </w:pPr>
+            <w:r>
+              <w:t xml:space="preserve">Id</w:t>
+            </w:r>
+          </w:p>
+        </w:tc>
+        <w:tc>
+          <w:tcPr>
+            <w:tcW w:type="pct" w:w="3000%"/>
+          </w:tcPr>
+          <w:p>
+            <w:pPr>
+              <w:spacing w:after="60"/>
+            </w:pPr>
+            <w:r>
+              <w:t xml:space="preserve">Pass</w:t>
+            </w:r>
+          </w:p>
+        </w:tc>
+        <w:tc>
+          <w:tcPr>
+            <w:tcW w:type="pct" w:w="3000%"/>
+          </w:tcPr>
+          <w:p>
+            <w:pPr>
+              <w:spacing w:after="60"/>
+            </w:pPr>
+            <w:r>
+              <w:t xml:space="preserve">Receipt (examples)</w:t>
+            </w:r>
+          </w:p>
+        </w:tc>
+      </w:tr>
+      <w:tr>
+        <w:tc>
+          <w:tcPr>
+            <w:tcW w:type="pct" w:w="3000%"/>
+          </w:tcPr>
+          <w:p>
+            <w:pPr>
+              <w:spacing w:after="60"/>
+            </w:pPr>
+            <w:r>
+              <w:rPr>
+                <w:b/>
+                <w:bCs/>
+              </w:rPr>
+              <w:t xml:space="preserve">d1</w:t>
+            </w:r>
+          </w:p>
+        </w:tc>
+        <w:tc>
+          <w:tcPr>
+            <w:tcW w:type="pct" w:w="3000%"/>
+          </w:tcPr>
+          <w:p>
+            <w:pPr>
+              <w:spacing w:after="60"/>
+            </w:pPr>
+            <w:r>
+              <w:t xml:space="preserve">AABA / rhapsody / rhythm grid anchors</w:t>
+            </w:r>
+          </w:p>
+        </w:tc>
+        <w:tc>
+          <w:tcPr>
+            <w:tcW w:type="pct" w:w="3000%"/>
+          </w:tcPr>
+          <w:p>
+            <w:pPr>
+              <w:spacing w:after="60"/>
+            </w:pPr>
+            <w:r>
+              <w:rPr>
+                <w:b/>
+                <w:bCs/>
+              </w:rPr>
+              <w:t xml:space="preserve">`gg:d1_aaba_form:…@…`</w:t>
+            </w:r>
+            <w:r>
+              <w:t xml:space="preserve">, </w:t>
+            </w:r>
+            <w:r>
+              <w:rPr>
+                <w:b/>
+                <w:bCs/>
+              </w:rPr>
+              <w:t xml:space="preserve">`gg:d1_aaba_form:rhapsody_arc@bar{N}`</w:t>
+            </w:r>
+            <w:r>
+              <w:t xml:space="preserve">, </w:t>
+            </w:r>
+            <w:r>
+              <w:rPr>
+                <w:b/>
+                <w:bCs/>
+              </w:rPr>
+              <w:t xml:space="preserve">`gg:d1_aaba_form:rhythm_changes@{totalBars}`</w:t>
+            </w:r>
+          </w:p>
+        </w:tc>
+      </w:tr>
+      <w:tr>
+        <w:tc>
+          <w:tcPr>
+            <w:tcW w:type="pct" w:w="3000%"/>
+          </w:tcPr>
+          <w:p>
+            <w:pPr>
+              <w:spacing w:after="60"/>
+            </w:pPr>
+            <w:r>
+              <w:rPr>
+                <w:b/>
+                <w:bCs/>
+              </w:rPr>
+              <w:t xml:space="preserve">d2</w:t>
+            </w:r>
+          </w:p>
+        </w:tc>
+        <w:tc>
+          <w:tcPr>
+            <w:tcW w:type="pct" w:w="3000%"/>
+          </w:tcPr>
+          <w:p>
+            <w:pPr>
+              <w:spacing w:after="60"/>
+            </w:pPr>
+            <w:r>
+              <w:t xml:space="preserve">Blue-note colour (altered / #11 on dominants and colour on tonics)</w:t>
+            </w:r>
+          </w:p>
+        </w:tc>
+        <w:tc>
+          <w:tcPr>
+            <w:tcW w:type="pct" w:w="3000%"/>
+          </w:tcPr>
+          <w:p>
+            <w:pPr>
+              <w:spacing w:after="60"/>
+            </w:pPr>
+            <w:r>
+              <w:rPr>
+                <w:b/>
+                <w:bCs/>
+              </w:rPr>
+              <w:t xml:space="preserve">`gg:d2_blue_note_color@bar{N}`</w:t>
+            </w:r>
+          </w:p>
+        </w:tc>
+      </w:tr>
+      <w:tr>
+        <w:tc>
+          <w:tcPr>
+            <w:tcW w:type="pct" w:w="3000%"/>
+          </w:tcPr>
+          <w:p>
+            <w:pPr>
+              <w:spacing w:after="60"/>
+            </w:pPr>
+            <w:r>
+              <w:rPr>
+                <w:b/>
+                <w:bCs/>
+              </w:rPr>
+              <w:t xml:space="preserve">d3</w:t>
+            </w:r>
+          </w:p>
+        </w:tc>
+        <w:tc>
+          <w:tcPr>
+            <w:tcW w:type="pct" w:w="3000%"/>
+          </w:tcPr>
+          <w:p>
+            <w:pPr>
+              <w:spacing w:after="60"/>
+            </w:pPr>
+            <w:r>
+              <w:t xml:space="preserve">Syncopated anticipation (secondary-dominant lead-in to the next bar)</w:t>
+            </w:r>
+          </w:p>
+        </w:tc>
+        <w:tc>
+          <w:tcPr>
+            <w:tcW w:type="pct" w:w="3000%"/>
+          </w:tcPr>
+          <w:p>
+            <w:pPr>
+              <w:spacing w:after="60"/>
+            </w:pPr>
+            <w:r>
+              <w:rPr>
+                <w:b/>
+                <w:bCs/>
+              </w:rPr>
+              <w:t xml:space="preserve">`gg:d3_syncopated_anticipation@bar{N}`</w:t>
+            </w:r>
+          </w:p>
+        </w:tc>
+      </w:tr>
+      <w:tr>
+        <w:tc>
+          <w:tcPr>
+            <w:tcW w:type="pct" w:w="3000%"/>
+          </w:tcPr>
+          <w:p>
+            <w:pPr>
+              <w:spacing w:after="60"/>
+            </w:pPr>
+            <w:r>
+              <w:rPr>
+                <w:b/>
+                <w:bCs/>
+              </w:rPr>
+              <w:t xml:space="preserve">d4</w:t>
+            </w:r>
+          </w:p>
+        </w:tc>
+        <w:tc>
+          <w:tcPr>
+            <w:tcW w:type="pct" w:w="3000%"/>
+          </w:tcPr>
+          <w:p>
+            <w:pPr>
+              <w:spacing w:after="60"/>
+            </w:pPr>
+            <w:r>
+              <w:t xml:space="preserve">Chromatic passing (diminished connector on eligible bars)</w:t>
+            </w:r>
+          </w:p>
+        </w:tc>
+        <w:tc>
+          <w:tcPr>
+            <w:tcW w:type="pct" w:w="3000%"/>
+          </w:tcPr>
+          <w:p>
+            <w:pPr>
+              <w:spacing w:after="60"/>
+            </w:pPr>
+            <w:r>
+              <w:rPr>
+                <w:b/>
+                <w:bCs/>
+              </w:rPr>
+              <w:t xml:space="preserve">`gg:d4_chromatic_passing@bar{N}`</w:t>
+            </w:r>
+          </w:p>
+        </w:tc>
+      </w:tr>
+      <w:tr>
+        <w:tc>
+          <w:tcPr>
+            <w:tcW w:type="pct" w:w="3000%"/>
+          </w:tcPr>
+          <w:p>
+            <w:pPr>
+              <w:spacing w:after="60"/>
+            </w:pPr>
+            <w:r>
+              <w:rPr>
+                <w:b/>
+                <w:bCs/>
+              </w:rPr>
+              <w:t xml:space="preserve">d5</w:t>
+            </w:r>
+          </w:p>
+        </w:tc>
+        <w:tc>
+          <w:tcPr>
+            <w:tcW w:type="pct" w:w="3000%"/>
+          </w:tcPr>
+          <w:p>
+            <w:pPr>
+              <w:spacing w:after="60"/>
+            </w:pPr>
+            <w:r>
+              <w:t xml:space="preserve">Minor-third modulation (brief </w:t>
+            </w:r>
+            <w:r>
+              <w:rPr>
+                <w:b/>
+                <w:bCs/>
+              </w:rPr>
+              <w:t xml:space="preserve">+3</w:t>
+            </w:r>
+            <w:r>
+              <w:t xml:space="preserve"> semitone transpose window)</w:t>
+            </w:r>
+          </w:p>
+        </w:tc>
+        <w:tc>
+          <w:tcPr>
+            <w:tcW w:type="pct" w:w="3000%"/>
+          </w:tcPr>
+          <w:p>
+            <w:pPr>
+              <w:spacing w:after="60"/>
+            </w:pPr>
+            <w:r>
+              <w:rPr>
+                <w:b/>
+                <w:bCs/>
+              </w:rPr>
+              <w:t xml:space="preserve">`gg:d5_minor_third_modulation@bar{N}`</w:t>
+            </w:r>
+          </w:p>
+        </w:tc>
+      </w:tr>
+    </w:tbl>
+    <w:p>
+      <w:pPr>
+        <w:spacing w:after="160"/>
+      </w:pPr>
+    </w:p>
+    <w:p>
+      <w:pPr>
+        <w:pStyle w:val="Heading2"/>
+        <w:spacing w:after="100" w:before="160"/>
+      </w:pPr>
+      <w:r>
+        <w:t xml:space="preserve">Style surface (metadata nudges)</w:t>
+      </w:r>
+    </w:p>
+    <w:p>
+      <w:pPr>
+        <w:spacing w:after="160"/>
+      </w:pPr>
+      <w:r>
+        <w:rPr>
+          <w:b/>
+          <w:bCs/>
+        </w:rPr>
+        <w:t xml:space="preserve">`applyGershwinStyleSurface`</w:t>
+      </w:r>
+      <w:r>
+        <w:t xml:space="preserve"> — for all contexts: </w:t>
+      </w:r>
+      <w:r>
+        <w:rPr>
+          <w:b/>
+          <w:bCs/>
+        </w:rPr>
+        <w:t xml:space="preserve">syncopation +0.26</w:t>
+      </w:r>
+      <w:r>
+        <w:t xml:space="preserve">, </w:t>
+      </w:r>
+      <w:r>
+        <w:rPr>
+          <w:b/>
+          <w:bCs/>
+        </w:rPr>
+        <w:t xml:space="preserve">density +0.12</w:t>
+      </w:r>
+      <w:r>
+        <w:t xml:space="preserve">, </w:t>
+      </w:r>
+      <w:r>
+        <w:rPr>
+          <w:b/>
+          <w:bCs/>
+        </w:rPr>
+        <w:t xml:space="preserve">space +0.14</w:t>
+      </w:r>
+      <w:r>
+        <w:t xml:space="preserve">, </w:t>
+      </w:r>
+      <w:r>
+        <w:rPr>
+          <w:b/>
+          <w:bCs/>
+        </w:rPr>
+        <w:t xml:space="preserve">cadence softness +0.18</w:t>
+      </w:r>
+      <w:r>
+        <w:t xml:space="preserve"> (clamped </w:t>
+      </w:r>
+      <w:r>
+        <w:rPr>
+          <w:b/>
+          <w:bCs/>
+        </w:rPr>
+        <w:t xml:space="preserve">0–1</w:t>
+      </w:r>
+      <w:r>
+        <w:t xml:space="preserve"> from prior </w:t>
+      </w:r>
+      <w:r>
+        <w:rPr>
+          <w:b/>
+          <w:bCs/>
+        </w:rPr>
+        <w:t xml:space="preserve">`songwriter*Bias`</w:t>
+      </w:r>
+      <w:r>
+        <w:t xml:space="preserve"> defaults </w:t>
+      </w:r>
+      <w:r>
+        <w:rPr>
+          <w:b/>
+          <w:bCs/>
+        </w:rPr>
+        <w:t xml:space="preserve">0.5</w:t>
+      </w:r>
+      <w:r>
+        <w:t xml:space="preserve"> when unset).</w:t>
+      </w:r>
+    </w:p>
+    <w:p>
+      <w:pPr>
+        <w:pStyle w:val="Heading2"/>
+        <w:spacing w:after="100" w:before="160"/>
+      </w:pPr>
+      <w:r>
+        <w:t xml:space="preserve">Melody planner row</w:t>
+      </w:r>
+    </w:p>
+    <w:p>
+      <w:pPr>
+        <w:spacing w:after="160"/>
+      </w:pPr>
+      <w:r>
+        <w:rPr>
+          <w:b/>
+          <w:bCs/>
+        </w:rPr>
+        <w:t xml:space="preserve">`MELODY_PROFILES['gershwin']`</w:t>
+      </w:r>
+      <w:r>
+        <w:t xml:space="preserve"> — mixed intervals · </w:t>
+      </w:r>
+      <w:r>
+        <w:rPr>
+          <w:b/>
+          <w:bCs/>
+        </w:rPr>
+        <w:t xml:space="preserve">`eighth_patterns`</w:t>
+      </w:r>
+      <w:r>
+        <w:t xml:space="preserve"> · </w:t>
+      </w:r>
+      <w:r>
+        <w:rPr>
+          <w:b/>
+          <w:bCs/>
+        </w:rPr>
+        <w:t xml:space="preserve">repetitionVsVariationBias 0.38</w:t>
+      </w:r>
+      <w:r>
+        <w:t xml:space="preserve"> · phrase </w:t>
+      </w:r>
+      <w:r>
+        <w:rPr>
+          <w:b/>
+          <w:bCs/>
+        </w:rPr>
+        <w:t xml:space="preserve">8</w:t>
+      </w:r>
+      <w:r>
+        <w:t xml:space="preserve"> · </w:t>
+      </w:r>
+      <w:r>
+        <w:rPr>
+          <w:b/>
+          <w:bCs/>
+        </w:rPr>
+        <w:t xml:space="preserve">cabaret_arc</w:t>
+      </w:r>
+      <w:r>
+        <w:t xml:space="preserve"> contour · cadence </w:t>
+      </w:r>
+      <w:r>
+        <w:rPr>
+          <w:b/>
+          <w:bCs/>
+        </w:rPr>
+        <w:t xml:space="preserve">high</w:t>
+      </w:r>
+      <w:r>
+        <w:t xml:space="preserve"> · devices </w:t>
+      </w:r>
+      <w:r>
+        <w:rPr>
+          <w:b/>
+          <w:bCs/>
+        </w:rPr>
+        <w:t xml:space="preserve">`aaba_form`</w:t>
+      </w:r>
+      <w:r>
+        <w:t xml:space="preserve">, </w:t>
+      </w:r>
+      <w:r>
+        <w:rPr>
+          <w:b/>
+          <w:bCs/>
+        </w:rPr>
+        <w:t xml:space="preserve">`blue_note_color`</w:t>
+      </w:r>
+      <w:r>
+        <w:t xml:space="preserve">, </w:t>
+      </w:r>
+      <w:r>
+        <w:rPr>
+          <w:b/>
+          <w:bCs/>
+        </w:rPr>
+        <w:t xml:space="preserve">`syncopated_anticipation`</w:t>
+      </w:r>
+      <w:r>
+        <w:t xml:space="preserve">, </w:t>
+      </w:r>
+      <w:r>
+        <w:rPr>
+          <w:b/>
+          <w:bCs/>
+        </w:rPr>
+        <w:t xml:space="preserve">`chromatic_passing`</w:t>
+      </w:r>
+      <w:r>
+        <w:t xml:space="preserve">, </w:t>
+      </w:r>
+      <w:r>
+        <w:rPr>
+          <w:b/>
+          <w:bCs/>
+        </w:rPr>
+        <w:t xml:space="preserve">`minor_third_modulation`</w:t>
       </w:r>
       <w:r>
         <w:t xml:space="preserve">.</w:t>

</xml_diff>

<commit_message>
fix: reliable dotenv loading via app.isPackaged + extraResources
Co-authored-by: Cursor <cursoragent@cursor.com>
</commit_message>
<xml_diff>
--- a/docs/COMPOSER_OS_PLAYBOOK.docx
+++ b/docs/COMPOSER_OS_PLAYBOOK.docx
@@ -12102,6 +12102,1408 @@
           <w:bCs/>
         </w:rPr>
         <w:t xml:space="preserve">`minor_third_modulation`</w:t>
+      </w:r>
+      <w:r>
+        <w:t xml:space="preserve">.</w:t>
+      </w:r>
+    </w:p>
+    <w:p>
+      <w:pPr>
+        <w:pStyle w:val="Heading1"/>
+        <w:spacing w:after="120" w:before="200"/>
+      </w:pPr>
+      <w:r>
+        <w:t xml:space="preserve">Arvo Pärt (`arvo_part`) — Song Mode harmony slice (three contexts)</w:t>
+      </w:r>
+    </w:p>
+    <w:p>
+      <w:pPr>
+        <w:spacing w:after="160"/>
+      </w:pPr>
+      <w:r>
+        <w:t xml:space="preserve">Primary songwriter </w:t>
+      </w:r>
+      <w:r>
+        <w:rPr>
+          <w:b/>
+          <w:bCs/>
+        </w:rPr>
+        <w:t xml:space="preserve">`arvo_part`</w:t>
+      </w:r>
+      <w:r>
+        <w:t xml:space="preserve"> runs </w:t>
+      </w:r>
+      <w:r>
+        <w:rPr>
+          <w:b/>
+          <w:bCs/>
+        </w:rPr>
+        <w:t xml:space="preserve">`arvoPartSlice.ts`</w:t>
+      </w:r>
+      <w:r>
+        <w:t xml:space="preserve"> on the golden-path duo timeline (</w:t>
+      </w:r>
+      <w:r>
+        <w:rPr>
+          <w:b/>
+          <w:bCs/>
+        </w:rPr>
+        <w:t xml:space="preserve">`precomputeArvoPartEffectiveHarmonyBars`</w:t>
+      </w:r>
+      <w:r>
+        <w:t xml:space="preserve"> → </w:t>
+      </w:r>
+      <w:r>
+        <w:rPr>
+          <w:b/>
+          <w:bCs/>
+        </w:rPr>
+        <w:t xml:space="preserve">`arvoPartEffectiveHarmonyBars`</w:t>
+      </w:r>
+      <w:r>
+        <w:t xml:space="preserve"> for </w:t>
+      </w:r>
+      <w:r>
+        <w:rPr>
+          <w:b/>
+          <w:bCs/>
+        </w:rPr>
+        <w:t xml:space="preserve">`getChordForBar`</w:t>
+      </w:r>
+      <w:r>
+        <w:t xml:space="preserve">, </w:t>
+      </w:r>
+      <w:r>
+        <w:rPr>
+          <w:b/>
+          <w:bCs/>
+        </w:rPr>
+        <w:t xml:space="preserve">`customLockedHarmonyRouting`</w:t>
+      </w:r>
+      <w:r>
+        <w:t xml:space="preserve">, </w:t>
+      </w:r>
+      <w:r>
+        <w:rPr>
+          <w:b/>
+          <w:bCs/>
+        </w:rPr>
+        <w:t xml:space="preserve">`runGoldenPath`</w:t>
+      </w:r>
+      <w:r>
+        <w:t xml:space="preserve"> locked export truth, </w:t>
+      </w:r>
+      <w:r>
+        <w:rPr>
+          <w:b/>
+          <w:bCs/>
+        </w:rPr>
+        <w:t xml:space="preserve">`composerOsAppGeneration`</w:t>
+      </w:r>
+      <w:r>
+        <w:t xml:space="preserve">). </w:t>
+      </w:r>
+      <w:r>
+        <w:rPr>
+          <w:b/>
+          <w:bCs/>
+        </w:rPr>
+        <w:t xml:space="preserve">`GenerationMetadata.arvoPartContext`</w:t>
+      </w:r>
+      <w:r>
+        <w:t xml:space="preserve"> selects the posture (</w:t>
+      </w:r>
+      <w:r>
+        <w:rPr>
+          <w:b/>
+          <w:bCs/>
+        </w:rPr>
+        <w:t xml:space="preserve">default `fur_alina`</w:t>
+      </w:r>
+      <w:r>
+        <w:t xml:space="preserve">): </w:t>
+      </w:r>
+      <w:r>
+        <w:rPr>
+          <w:b/>
+          <w:bCs/>
+        </w:rPr>
+        <w:t xml:space="preserve">`fur_alina`</w:t>
+      </w:r>
+      <w:r>
+        <w:t xml:space="preserve"> · </w:t>
+      </w:r>
+      <w:r>
+        <w:rPr>
+          <w:b/>
+          <w:bCs/>
+        </w:rPr>
+        <w:t xml:space="preserve">`spiegel`</w:t>
+      </w:r>
+      <w:r>
+        <w:t xml:space="preserve"> · </w:t>
+      </w:r>
+      <w:r>
+        <w:rPr>
+          <w:b/>
+          <w:bCs/>
+        </w:rPr>
+        <w:t xml:space="preserve">`fratres`</w:t>
+      </w:r>
+      <w:r>
+        <w:t xml:space="preserve">. API contract: </w:t>
+      </w:r>
+      <w:r>
+        <w:rPr>
+          <w:b/>
+          <w:bCs/>
+        </w:rPr>
+        <w:t xml:space="preserve">`GenerateRequest.arvoPartContext`</w:t>
+      </w:r>
+      <w:r>
+        <w:t xml:space="preserve">. Receipts use prefix </w:t>
+      </w:r>
+      <w:r>
+        <w:rPr>
+          <w:b/>
+          <w:bCs/>
+        </w:rPr>
+        <w:t xml:space="preserve">`ap:`</w:t>
+      </w:r>
+      <w:r>
+        <w:t xml:space="preserve">. Aliases </w:t>
+      </w:r>
+      <w:r>
+        <w:rPr>
+          <w:b/>
+          <w:bCs/>
+        </w:rPr>
+        <w:t xml:space="preserve">`arvo`</w:t>
+      </w:r>
+      <w:r>
+        <w:t xml:space="preserve">, </w:t>
+      </w:r>
+      <w:r>
+        <w:rPr>
+          <w:b/>
+          <w:bCs/>
+        </w:rPr>
+        <w:t xml:space="preserve">`part`</w:t>
+      </w:r>
+      <w:r>
+        <w:t xml:space="preserve"> → </w:t>
+      </w:r>
+      <w:r>
+        <w:rPr>
+          <w:b/>
+          <w:bCs/>
+        </w:rPr>
+        <w:t xml:space="preserve">`arvo_part`</w:t>
+      </w:r>
+      <w:r>
+        <w:t xml:space="preserve"> via </w:t>
+      </w:r>
+      <w:r>
+        <w:rPr>
+          <w:b/>
+          <w:bCs/>
+        </w:rPr>
+        <w:t xml:space="preserve">`normalizeSongwriterStyleKey`</w:t>
+      </w:r>
+      <w:r>
+        <w:t xml:space="preserve">.</w:t>
+      </w:r>
+    </w:p>
+    <w:p>
+      <w:pPr>
+        <w:spacing w:after="160"/>
+      </w:pPr>
+      <w:r>
+        <w:rPr>
+          <w:b/>
+          <w:bCs/>
+        </w:rPr>
+        <w:t xml:space="preserve">Chord pools (triads only)</w:t>
+      </w:r>
+      <w:r>
+        <w:t xml:space="preserve"> — Song Mode scaffold rows in </w:t>
+      </w:r>
+      <w:r>
+        <w:rPr>
+          <w:b/>
+          <w:bCs/>
+        </w:rPr>
+        <w:t xml:space="preserve">`SONGWRITER_CHORD_POOLS`</w:t>
+      </w:r>
+      <w:r>
+        <w:t xml:space="preserve">: </w:t>
+      </w:r>
+      <w:r>
+        <w:rPr>
+          <w:b/>
+          <w:bCs/>
+        </w:rPr>
+        <w:t xml:space="preserve">`arvo_part_fur_alina`</w:t>
+      </w:r>
+      <w:r>
+        <w:t xml:space="preserve">, </w:t>
+      </w:r>
+      <w:r>
+        <w:rPr>
+          <w:b/>
+          <w:bCs/>
+        </w:rPr>
+        <w:t xml:space="preserve">`arvo_part_spiegel`</w:t>
+      </w:r>
+      <w:r>
+        <w:t xml:space="preserve">, </w:t>
+      </w:r>
+      <w:r>
+        <w:rPr>
+          <w:b/>
+          <w:bCs/>
+        </w:rPr>
+        <w:t xml:space="preserve">`arvo_part_fratres`</w:t>
+      </w:r>
+      <w:r>
+        <w:t xml:space="preserve">. Rows use </w:t>
+      </w:r>
+      <w:r>
+        <w:rPr>
+          <w:b/>
+          <w:bCs/>
+        </w:rPr>
+        <w:t xml:space="preserve">tertian triad symbols only</w:t>
+      </w:r>
+      <w:r>
+        <w:t xml:space="preserve"> (major / minor / dim / aug); the slice </w:t>
+      </w:r>
+      <w:r>
+        <w:rPr>
+          <w:b/>
+          <w:bCs/>
+        </w:rPr>
+        <w:t xml:space="preserve">`stripChordToTriad`</w:t>
+      </w:r>
+      <w:r>
+        <w:t xml:space="preserve"> strips </w:t>
+      </w:r>
+      <w:r>
+        <w:rPr>
+          <w:b/>
+          <w:bCs/>
+        </w:rPr>
+        <w:t xml:space="preserve">7ths, sus, and extensions</w:t>
+      </w:r>
+      <w:r>
+        <w:t xml:space="preserve"> from any upstream symbol before passes. When </w:t>
+      </w:r>
+      <w:r>
+        <w:rPr>
+          <w:b/>
+          <w:bCs/>
+        </w:rPr>
+        <w:t xml:space="preserve">`primarySongwriterStyle === arvo_part`</w:t>
+      </w:r>
+      <w:r>
+        <w:t xml:space="preserve">, </w:t>
+      </w:r>
+      <w:r>
+        <w:rPr>
+          <w:b/>
+          <w:bCs/>
+        </w:rPr>
+        <w:t xml:space="preserve">`chordSymbolsForSection`</w:t>
+      </w:r>
+      <w:r>
+        <w:t xml:space="preserve"> picks a pool with the same </w:t>
+      </w:r>
+      <w:r>
+        <w:rPr>
+          <w:b/>
+          <w:bCs/>
+        </w:rPr>
+        <w:t xml:space="preserve">seed-tier</w:t>
+      </w:r>
+      <w:r>
+        <w:t xml:space="preserve"> pattern as Miles / Bartók / Gershwin (</w:t>
+      </w:r>
+      <w:r>
+        <w:rPr>
+          <w:b/>
+          <w:bCs/>
+        </w:rPr>
+        <w:t xml:space="preserve">`Math.abs(seed) % 3`</w:t>
+      </w:r>
+      <w:r>
+        <w:t xml:space="preserve">). </w:t>
+      </w:r>
+      <w:r>
+        <w:rPr>
+          <w:b/>
+          <w:bCs/>
+        </w:rPr>
+        <w:t xml:space="preserve">`breakFrankZappaIiViProgressions`</w:t>
+      </w:r>
+      <w:r>
+        <w:t xml:space="preserve"> does </w:t>
+      </w:r>
+      <w:r>
+        <w:rPr>
+          <w:b/>
+          <w:bCs/>
+        </w:rPr>
+        <w:t xml:space="preserve">not</w:t>
+      </w:r>
+      <w:r>
+        <w:t xml:space="preserve"> run on these pools (slow triadic motion; avoid jazz-cycle substitutions).</w:t>
+      </w:r>
+    </w:p>
+    <w:p>
+      <w:pPr>
+        <w:pStyle w:val="Heading2"/>
+        <w:spacing w:after="100" w:before="160"/>
+      </w:pPr>
+      <w:r>
+        <w:t xml:space="preserve">Tintinnabuli M + T rule (metadata)</w:t>
+      </w:r>
+    </w:p>
+    <w:p>
+      <w:pPr>
+        <w:spacing w:after="160"/>
+      </w:pPr>
+      <w:r>
+        <w:t xml:space="preserve">The slice does </w:t>
+      </w:r>
+      <w:r>
+        <w:rPr>
+          <w:b/>
+          <w:bCs/>
+        </w:rPr>
+        <w:t xml:space="preserve">not</w:t>
+      </w:r>
+      <w:r>
+        <w:t xml:space="preserve"> emit separate M/T MIDI voices; </w:t>
+      </w:r>
+      <w:r>
+        <w:rPr>
+          <w:b/>
+          <w:bCs/>
+        </w:rPr>
+        <w:t xml:space="preserve">`ap:d1_tintinnabuli_voice`</w:t>
+      </w:r>
+      <w:r>
+        <w:t xml:space="preserve"> receipts document the </w:t>
+      </w:r>
+      <w:r>
+        <w:rPr>
+          <w:b/>
+          <w:bCs/>
+        </w:rPr>
+        <w:t xml:space="preserve">tintinnabuli pairing</w:t>
+      </w:r>
+      <w:r>
+        <w:t xml:space="preserve">: a deterministic </w:t>
+      </w:r>
+      <w:r>
+        <w:rPr>
+          <w:b/>
+          <w:bCs/>
+        </w:rPr>
+        <w:t xml:space="preserve">M-voice proxy</w:t>
+      </w:r>
+      <w:r>
+        <w:t xml:space="preserve"> pitch class per bar (seeded) maps to a </w:t>
+      </w:r>
+      <w:r>
+        <w:rPr>
+          <w:b/>
+          <w:bCs/>
+        </w:rPr>
+        <w:t xml:space="preserve">T-voice</w:t>
+      </w:r>
+      <w:r>
+        <w:t xml:space="preserve"> pitch class as the </w:t>
+      </w:r>
+      <w:r>
+        <w:rPr>
+          <w:b/>
+          <w:bCs/>
+        </w:rPr>
+        <w:t xml:space="preserve">nearest triad chord tone</w:t>
+      </w:r>
+      <w:r>
+        <w:t xml:space="preserve"> — per-bar mode cycles </w:t>
+      </w:r>
+      <w:r>
+        <w:rPr>
+          <w:b/>
+          <w:bCs/>
+        </w:rPr>
+        <w:t xml:space="preserve">above</w:t>
+      </w:r>
+      <w:r>
+        <w:t xml:space="preserve"> / </w:t>
+      </w:r>
+      <w:r>
+        <w:rPr>
+          <w:b/>
+          <w:bCs/>
+        </w:rPr>
+        <w:t xml:space="preserve">below</w:t>
+      </w:r>
+      <w:r>
+        <w:t xml:space="preserve"> / </w:t>
+      </w:r>
+      <w:r>
+        <w:rPr>
+          <w:b/>
+          <w:bCs/>
+        </w:rPr>
+        <w:t xml:space="preserve">indexed</w:t>
+      </w:r>
+      <w:r>
+        <w:t xml:space="preserve"> selection among the triad’s root–third–fifth pitch classes. Harmony symbols on the lead sheet remain triadic; pairing is for manifests / pedagogy.</w:t>
+      </w:r>
+    </w:p>
+    <w:p>
+      <w:pPr>
+        <w:pStyle w:val="Heading2"/>
+        <w:spacing w:after="100" w:before="160"/>
+      </w:pPr>
+      <w:r>
+        <w:t xml:space="preserve">Contexts</w:t>
+      </w:r>
+    </w:p>
+    <w:tbl>
+      <w:tblPr>
+        <w:tblW w:type="pct" w:w="100%"/>
+        <w:tblBorders>
+          <w:top w:val="single" w:color="auto" w:sz="4"/>
+          <w:left w:val="single" w:color="auto" w:sz="4"/>
+          <w:bottom w:val="single" w:color="auto" w:sz="4"/>
+          <w:right w:val="single" w:color="auto" w:sz="4"/>
+          <w:insideH w:val="single" w:color="auto" w:sz="4"/>
+          <w:insideV w:val="single" w:color="auto" w:sz="4"/>
+        </w:tblBorders>
+      </w:tblPr>
+      <w:tblGrid>
+        <w:gridCol w:w="4500"/>
+        <w:gridCol w:w="4500"/>
+      </w:tblGrid>
+      <w:tr>
+        <w:tc>
+          <w:tcPr>
+            <w:tcW w:type="pct" w:w="4500%"/>
+          </w:tcPr>
+          <w:p>
+            <w:pPr>
+              <w:spacing w:after="60"/>
+            </w:pPr>
+            <w:r>
+              <w:t xml:space="preserve">Context</w:t>
+            </w:r>
+          </w:p>
+        </w:tc>
+        <w:tc>
+          <w:tcPr>
+            <w:tcW w:type="pct" w:w="4500%"/>
+          </w:tcPr>
+          <w:p>
+            <w:pPr>
+              <w:spacing w:after="60"/>
+            </w:pPr>
+            <w:r>
+              <w:t xml:space="preserve">Role</w:t>
+            </w:r>
+          </w:p>
+        </w:tc>
+      </w:tr>
+      <w:tr>
+        <w:tc>
+          <w:tcPr>
+            <w:tcW w:type="pct" w:w="4500%"/>
+          </w:tcPr>
+          <w:p>
+            <w:pPr>
+              <w:spacing w:after="60"/>
+            </w:pPr>
+            <w:r>
+              <w:rPr>
+                <w:b/>
+                <w:bCs/>
+              </w:rPr>
+              <w:t xml:space="preserve">`fur_alina`</w:t>
+            </w:r>
+          </w:p>
+        </w:tc>
+        <w:tc>
+          <w:tcPr>
+            <w:tcW w:type="pct" w:w="4500%"/>
+          </w:tcPr>
+          <w:p>
+            <w:pPr>
+              <w:spacing w:after="60"/>
+            </w:pPr>
+            <w:r>
+              <w:t xml:space="preserve">Sparse </w:t>
+            </w:r>
+            <w:r>
+              <w:rPr>
+                <w:b/>
+                <w:bCs/>
+              </w:rPr>
+              <w:t xml:space="preserve">Fratres / Für Alina</w:t>
+            </w:r>
+            <w:r>
+              <w:t xml:space="preserve">-leaning pools; </w:t>
+            </w:r>
+            <w:r>
+              <w:rPr>
+                <w:b/>
+                <w:bCs/>
+              </w:rPr>
+              <w:t xml:space="preserve">triadic transformation</w:t>
+            </w:r>
+            <w:r>
+              <w:t xml:space="preserve"> pass favours </w:t>
+            </w:r>
+            <w:r>
+              <w:rPr>
+                <w:b/>
+                <w:bCs/>
+              </w:rPr>
+              <w:t xml:space="preserve">±3</w:t>
+            </w:r>
+            <w:r>
+              <w:t xml:space="preserve"> semitone root moves; additive receipt cells </w:t>
+            </w:r>
+            <w:r>
+              <w:rPr>
+                <w:b/>
+                <w:bCs/>
+              </w:rPr>
+              <w:t xml:space="preserve">`3+3+2`</w:t>
+            </w:r>
+            <w:r>
+              <w:t xml:space="preserve">.</w:t>
+            </w:r>
+          </w:p>
+        </w:tc>
+      </w:tr>
+      <w:tr>
+        <w:tc>
+          <w:tcPr>
+            <w:tcW w:type="pct" w:w="4500%"/>
+          </w:tcPr>
+          <w:p>
+            <w:pPr>
+              <w:spacing w:after="60"/>
+            </w:pPr>
+            <w:r>
+              <w:rPr>
+                <w:b/>
+                <w:bCs/>
+              </w:rPr>
+              <w:t xml:space="preserve">`spiegel`</w:t>
+            </w:r>
+          </w:p>
+        </w:tc>
+        <w:tc>
+          <w:tcPr>
+            <w:tcW w:type="pct" w:w="4500%"/>
+          </w:tcPr>
+          <w:p>
+            <w:pPr>
+              <w:spacing w:after="60"/>
+            </w:pPr>
+            <w:r>
+              <w:rPr>
+                <w:b/>
+                <w:bCs/>
+              </w:rPr>
+              <w:t xml:space="preserve">Spiegel im Spiegel</w:t>
+            </w:r>
+            <w:r>
+              <w:t xml:space="preserve">-leaning mirrored rows; occasional </w:t>
+            </w:r>
+            <w:r>
+              <w:rPr>
+                <w:b/>
+                <w:bCs/>
+              </w:rPr>
+              <w:t xml:space="preserve">parallel major ↔ minor</w:t>
+            </w:r>
+            <w:r>
+              <w:t xml:space="preserve"> toggle on the same root (</w:t>
+            </w:r>
+            <w:r>
+              <w:rPr>
+                <w:b/>
+                <w:bCs/>
+              </w:rPr>
+              <w:t xml:space="preserve">d5</w:t>
+            </w:r>
+            <w:r>
+              <w:t xml:space="preserve">); additive receipt </w:t>
+            </w:r>
+            <w:r>
+              <w:rPr>
+                <w:b/>
+                <w:bCs/>
+              </w:rPr>
+              <w:t xml:space="preserve">`2+2+2+2`</w:t>
+            </w:r>
+            <w:r>
+              <w:t xml:space="preserve">.</w:t>
+            </w:r>
+          </w:p>
+        </w:tc>
+      </w:tr>
+      <w:tr>
+        <w:tc>
+          <w:tcPr>
+            <w:tcW w:type="pct" w:w="4500%"/>
+          </w:tcPr>
+          <w:p>
+            <w:pPr>
+              <w:spacing w:after="60"/>
+            </w:pPr>
+            <w:r>
+              <w:rPr>
+                <w:b/>
+                <w:bCs/>
+              </w:rPr>
+              <w:t xml:space="preserve">`fratres`</w:t>
+            </w:r>
+          </w:p>
+        </w:tc>
+        <w:tc>
+          <w:tcPr>
+            <w:tcW w:type="pct" w:w="4500%"/>
+          </w:tcPr>
+          <w:p>
+            <w:pPr>
+              <w:spacing w:after="60"/>
+            </w:pPr>
+            <w:r>
+              <w:t xml:space="preserve">Oscillating / pedal-leaning rows; transformation pass favours </w:t>
+            </w:r>
+            <w:r>
+              <w:rPr>
+                <w:b/>
+                <w:bCs/>
+              </w:rPr>
+              <w:t xml:space="preserve">±5</w:t>
+            </w:r>
+            <w:r>
+              <w:t xml:space="preserve"> semitone moves; additive receipt </w:t>
+            </w:r>
+            <w:r>
+              <w:rPr>
+                <w:b/>
+                <w:bCs/>
+              </w:rPr>
+              <w:t xml:space="preserve">`5+3`</w:t>
+            </w:r>
+            <w:r>
+              <w:t xml:space="preserve">.</w:t>
+            </w:r>
+          </w:p>
+        </w:tc>
+      </w:tr>
+    </w:tbl>
+    <w:p>
+      <w:pPr>
+        <w:spacing w:after="160"/>
+      </w:pPr>
+    </w:p>
+    <w:p>
+      <w:pPr>
+        <w:pStyle w:val="Heading2"/>
+        <w:spacing w:after="100" w:before="160"/>
+      </w:pPr>
+      <w:r>
+        <w:t xml:space="preserve">Harmonic devices (receipts **`ap:`**)</w:t>
+      </w:r>
+    </w:p>
+    <w:tbl>
+      <w:tblPr>
+        <w:tblW w:type="pct" w:w="100%"/>
+        <w:tblBorders>
+          <w:top w:val="single" w:color="auto" w:sz="4"/>
+          <w:left w:val="single" w:color="auto" w:sz="4"/>
+          <w:bottom w:val="single" w:color="auto" w:sz="4"/>
+          <w:right w:val="single" w:color="auto" w:sz="4"/>
+          <w:insideH w:val="single" w:color="auto" w:sz="4"/>
+          <w:insideV w:val="single" w:color="auto" w:sz="4"/>
+        </w:tblBorders>
+      </w:tblPr>
+      <w:tblGrid>
+        <w:gridCol w:w="1125"/>
+        <w:gridCol w:w="1125"/>
+        <w:gridCol w:w="1125"/>
+        <w:gridCol w:w="1125"/>
+        <w:gridCol w:w="1125"/>
+        <w:gridCol w:w="1125"/>
+        <w:gridCol w:w="1125"/>
+        <w:gridCol w:w="1125"/>
+      </w:tblGrid>
+      <w:tr>
+        <w:tc>
+          <w:tcPr>
+            <w:tcW w:type="pct" w:w="1125%"/>
+          </w:tcPr>
+          <w:p>
+            <w:pPr>
+              <w:spacing w:after="60"/>
+            </w:pPr>
+            <w:r>
+              <w:t xml:space="preserve">Id</w:t>
+            </w:r>
+          </w:p>
+        </w:tc>
+        <w:tc>
+          <w:tcPr>
+            <w:tcW w:type="pct" w:w="1125%"/>
+          </w:tcPr>
+          <w:p>
+            <w:pPr>
+              <w:spacing w:after="60"/>
+            </w:pPr>
+            <w:r>
+              <w:t xml:space="preserve">Pass</w:t>
+            </w:r>
+          </w:p>
+        </w:tc>
+        <w:tc>
+          <w:tcPr>
+            <w:tcW w:type="pct" w:w="1125%"/>
+          </w:tcPr>
+          <w:p>
+            <w:pPr>
+              <w:spacing w:after="60"/>
+            </w:pPr>
+            <w:r>
+              <w:t xml:space="preserve">Receipt (examples)</w:t>
+            </w:r>
+          </w:p>
+        </w:tc>
+      </w:tr>
+      <w:tr>
+        <w:tc>
+          <w:tcPr>
+            <w:tcW w:type="pct" w:w="1125%"/>
+          </w:tcPr>
+          <w:p>
+            <w:pPr>
+              <w:spacing w:after="60"/>
+            </w:pPr>
+            <w:r>
+              <w:rPr>
+                <w:b/>
+                <w:bCs/>
+              </w:rPr>
+              <w:t xml:space="preserve">d1</w:t>
+            </w:r>
+          </w:p>
+        </w:tc>
+        <w:tc>
+          <w:tcPr>
+            <w:tcW w:type="pct" w:w="1125%"/>
+          </w:tcPr>
+          <w:p>
+            <w:pPr>
+              <w:spacing w:after="60"/>
+            </w:pPr>
+            <w:r>
+              <w:t xml:space="preserve">Tintinnabuli voice (M→T mapping metadata)</w:t>
+            </w:r>
+          </w:p>
+        </w:tc>
+        <w:tc>
+          <w:tcPr>
+            <w:tcW w:type="pct" w:w="1125%"/>
+          </w:tcPr>
+          <w:p>
+            <w:pPr>
+              <w:spacing w:after="60"/>
+            </w:pPr>
+            <w:r>
+              <w:t xml:space="preserve">**`ap:d1_tintinnabuli_voice@bar{N}</w:t>
+            </w:r>
+          </w:p>
+        </w:tc>
+        <w:tc>
+          <w:tcPr>
+            <w:tcW w:type="pct" w:w="1125%"/>
+          </w:tcPr>
+          <w:p>
+            <w:pPr>
+              <w:spacing w:after="60"/>
+            </w:pPr>
+            <w:r>
+              <w:t xml:space="preserve">m=…</w:t>
+            </w:r>
+          </w:p>
+        </w:tc>
+        <w:tc>
+          <w:tcPr>
+            <w:tcW w:type="pct" w:w="1125%"/>
+          </w:tcPr>
+          <w:p>
+            <w:pPr>
+              <w:spacing w:after="60"/>
+            </w:pPr>
+            <w:r>
+              <w:t xml:space="preserve">t=…</w:t>
+            </w:r>
+          </w:p>
+        </w:tc>
+        <w:tc>
+          <w:tcPr>
+            <w:tcW w:type="pct" w:w="1125%"/>
+          </w:tcPr>
+          <w:p>
+            <w:pPr>
+              <w:spacing w:after="60"/>
+            </w:pPr>
+            <w:r>
+              <w:t xml:space="preserve">mode=above\</w:t>
+            </w:r>
+          </w:p>
+        </w:tc>
+        <w:tc>
+          <w:tcPr>
+            <w:tcW w:type="pct" w:w="1125%"/>
+          </w:tcPr>
+          <w:p>
+            <w:pPr>
+              <w:spacing w:after="60"/>
+            </w:pPr>
+            <w:r>
+              <w:t xml:space="preserve">below\</w:t>
+            </w:r>
+          </w:p>
+        </w:tc>
+        <w:tc>
+          <w:tcPr>
+            <w:tcW w:type="pct" w:w="1125%"/>
+          </w:tcPr>
+          <w:p>
+            <w:pPr>
+              <w:spacing w:after="60"/>
+            </w:pPr>
+            <w:r>
+              <w:t xml:space="preserve">indexed`**</w:t>
+            </w:r>
+          </w:p>
+        </w:tc>
+      </w:tr>
+      <w:tr>
+        <w:tc>
+          <w:tcPr>
+            <w:tcW w:type="pct" w:w="1125%"/>
+          </w:tcPr>
+          <w:p>
+            <w:pPr>
+              <w:spacing w:after="60"/>
+            </w:pPr>
+            <w:r>
+              <w:rPr>
+                <w:b/>
+                <w:bCs/>
+              </w:rPr>
+              <w:t xml:space="preserve">d2</w:t>
+            </w:r>
+          </w:p>
+        </w:tc>
+        <w:tc>
+          <w:tcPr>
+            <w:tcW w:type="pct" w:w="1125%"/>
+          </w:tcPr>
+          <w:p>
+            <w:pPr>
+              <w:spacing w:after="60"/>
+            </w:pPr>
+            <w:r>
+              <w:t xml:space="preserve">Silence as structure (hold previous harmony)</w:t>
+            </w:r>
+          </w:p>
+        </w:tc>
+        <w:tc>
+          <w:tcPr>
+            <w:tcW w:type="pct" w:w="1125%"/>
+          </w:tcPr>
+          <w:p>
+            <w:pPr>
+              <w:spacing w:after="60"/>
+            </w:pPr>
+            <w:r>
+              <w:rPr>
+                <w:b/>
+                <w:bCs/>
+              </w:rPr>
+              <w:t xml:space="preserve">`ap:d2_silence_as_structure@bar{N}`</w:t>
+            </w:r>
+          </w:p>
+        </w:tc>
+      </w:tr>
+      <w:tr>
+        <w:tc>
+          <w:tcPr>
+            <w:tcW w:type="pct" w:w="1125%"/>
+          </w:tcPr>
+          <w:p>
+            <w:pPr>
+              <w:spacing w:after="60"/>
+            </w:pPr>
+            <w:r>
+              <w:rPr>
+                <w:b/>
+                <w:bCs/>
+              </w:rPr>
+              <w:t xml:space="preserve">d3</w:t>
+            </w:r>
+          </w:p>
+        </w:tc>
+        <w:tc>
+          <w:tcPr>
+            <w:tcW w:type="pct" w:w="1125%"/>
+          </w:tcPr>
+          <w:p>
+            <w:pPr>
+              <w:spacing w:after="60"/>
+            </w:pPr>
+            <w:r>
+              <w:t xml:space="preserve">Additive rhythm (form-level scaffolding)</w:t>
+            </w:r>
+          </w:p>
+        </w:tc>
+        <w:tc>
+          <w:tcPr>
+            <w:tcW w:type="pct" w:w="1125%"/>
+          </w:tcPr>
+          <w:p>
+            <w:pPr>
+              <w:spacing w:after="60"/>
+            </w:pPr>
+            <w:r>
+              <w:t xml:space="preserve">**`ap:d3_additive_rhythm</w:t>
+            </w:r>
+          </w:p>
+        </w:tc>
+        <w:tc>
+          <w:tcPr>
+            <w:tcW w:type="pct" w:w="1125%"/>
+          </w:tcPr>
+          <w:p>
+            <w:pPr>
+              <w:spacing w:after="60"/>
+            </w:pPr>
+            <w:r>
+              <w:t xml:space="preserve">cells=…</w:t>
+            </w:r>
+          </w:p>
+        </w:tc>
+        <w:tc>
+          <w:tcPr>
+            <w:tcW w:type="pct" w:w="1125%"/>
+          </w:tcPr>
+          <w:p>
+            <w:pPr>
+              <w:spacing w:after="60"/>
+            </w:pPr>
+            <w:r>
+              <w:t xml:space="preserve">tb=…`**</w:t>
+            </w:r>
+          </w:p>
+        </w:tc>
+      </w:tr>
+      <w:tr>
+        <w:tc>
+          <w:tcPr>
+            <w:tcW w:type="pct" w:w="1125%"/>
+          </w:tcPr>
+          <w:p>
+            <w:pPr>
+              <w:spacing w:after="60"/>
+            </w:pPr>
+            <w:r>
+              <w:rPr>
+                <w:b/>
+                <w:bCs/>
+              </w:rPr>
+              <w:t xml:space="preserve">d4</w:t>
+            </w:r>
+          </w:p>
+        </w:tc>
+        <w:tc>
+          <w:tcPr>
+            <w:tcW w:type="pct" w:w="1125%"/>
+          </w:tcPr>
+          <w:p>
+            <w:pPr>
+              <w:spacing w:after="60"/>
+            </w:pPr>
+            <w:r>
+              <w:t xml:space="preserve">Register arch (golden-section climax hint)</w:t>
+            </w:r>
+          </w:p>
+        </w:tc>
+        <w:tc>
+          <w:tcPr>
+            <w:tcW w:type="pct" w:w="1125%"/>
+          </w:tcPr>
+          <w:p>
+            <w:pPr>
+              <w:spacing w:after="60"/>
+            </w:pPr>
+            <w:r>
+              <w:rPr>
+                <w:b/>
+                <w:bCs/>
+              </w:rPr>
+              <w:t xml:space="preserve">`ap:d4_register_arch@bar{N}`</w:t>
+            </w:r>
+          </w:p>
+        </w:tc>
+      </w:tr>
+      <w:tr>
+        <w:tc>
+          <w:tcPr>
+            <w:tcW w:type="pct" w:w="1125%"/>
+          </w:tcPr>
+          <w:p>
+            <w:pPr>
+              <w:spacing w:after="60"/>
+            </w:pPr>
+            <w:r>
+              <w:rPr>
+                <w:b/>
+                <w:bCs/>
+              </w:rPr>
+              <w:t xml:space="preserve">d5</w:t>
+            </w:r>
+          </w:p>
+        </w:tc>
+        <w:tc>
+          <w:tcPr>
+            <w:tcW w:type="pct" w:w="1125%"/>
+          </w:tcPr>
+          <w:p>
+            <w:pPr>
+              <w:spacing w:after="60"/>
+            </w:pPr>
+            <w:r>
+              <w:t xml:space="preserve">Triadic transformation (transpose / parallel toggle)</w:t>
+            </w:r>
+          </w:p>
+        </w:tc>
+        <w:tc>
+          <w:tcPr>
+            <w:tcW w:type="pct" w:w="1125%"/>
+          </w:tcPr>
+          <w:p>
+            <w:pPr>
+              <w:spacing w:after="60"/>
+            </w:pPr>
+            <w:r>
+              <w:t xml:space="preserve">**`ap:d5_triadic_transformation@bar{N}</w:t>
+            </w:r>
+          </w:p>
+        </w:tc>
+        <w:tc>
+          <w:tcPr>
+            <w:tcW w:type="pct" w:w="1125%"/>
+          </w:tcPr>
+          <w:p>
+            <w:pPr>
+              <w:spacing w:after="60"/>
+            </w:pPr>
+            <w:r>
+              <w:t xml:space="preserve">transpose=…`</w:t>
+            </w:r>
+            <w:r>
+              <w:rPr>
+                <w:b/>
+                <w:bCs/>
+              </w:rPr>
+              <w:t xml:space="preserve"> or </w:t>
+            </w:r>
+            <w:r>
+              <w:t xml:space="preserve">`…</w:t>
+            </w:r>
+          </w:p>
+        </w:tc>
+        <w:tc>
+          <w:tcPr>
+            <w:tcW w:type="pct" w:w="1125%"/>
+          </w:tcPr>
+          <w:p>
+            <w:pPr>
+              <w:spacing w:after="60"/>
+            </w:pPr>
+            <w:r>
+              <w:t xml:space="preserve">parallel`**</w:t>
+            </w:r>
+          </w:p>
+        </w:tc>
+      </w:tr>
+    </w:tbl>
+    <w:p>
+      <w:pPr>
+        <w:spacing w:after="160"/>
+      </w:pPr>
+    </w:p>
+    <w:p>
+      <w:pPr>
+        <w:spacing w:after="160"/>
+      </w:pPr>
+      <w:r>
+        <w:rPr>
+          <w:b/>
+          <w:bCs/>
+        </w:rPr>
+        <w:t xml:space="preserve">Drone / pedal bass</w:t>
+      </w:r>
+      <w:r>
+        <w:t xml:space="preserve"> — </w:t>
+      </w:r>
+      <w:r>
+        <w:rPr>
+          <w:b/>
+          <w:bCs/>
+        </w:rPr>
+        <w:t xml:space="preserve">`ap:pedal_bass@bar{N}`</w:t>
+      </w:r>
+      <w:r>
+        <w:t xml:space="preserve"> when a </w:t>
+      </w:r>
+      <w:r>
+        <w:rPr>
+          <w:b/>
+          <w:bCs/>
+        </w:rPr>
+        <w:t xml:space="preserve">tonic slash bass</w:t>
+      </w:r>
+      <w:r>
+        <w:t xml:space="preserve"> is applied under shifting triads (`inferTonicPitchClassFromBar1`).</w:t>
+      </w:r>
+    </w:p>
+    <w:p>
+      <w:pPr>
+        <w:pStyle w:val="Heading2"/>
+        <w:spacing w:after="100" w:before="160"/>
+      </w:pPr>
+      <w:r>
+        <w:t xml:space="preserve">Style surface (metadata nudges)</w:t>
+      </w:r>
+    </w:p>
+    <w:p>
+      <w:pPr>
+        <w:spacing w:after="160"/>
+      </w:pPr>
+      <w:r>
+        <w:rPr>
+          <w:b/>
+          <w:bCs/>
+        </w:rPr>
+        <w:t xml:space="preserve">`applyArvoPartStyleSurface`</w:t>
+      </w:r>
+      <w:r>
+        <w:t xml:space="preserve"> — for all contexts: </w:t>
+      </w:r>
+      <w:r>
+        <w:rPr>
+          <w:b/>
+          <w:bCs/>
+        </w:rPr>
+        <w:t xml:space="preserve">space +0.45</w:t>
+      </w:r>
+      <w:r>
+        <w:t xml:space="preserve">, </w:t>
+      </w:r>
+      <w:r>
+        <w:rPr>
+          <w:b/>
+          <w:bCs/>
+        </w:rPr>
+        <w:t xml:space="preserve">density −0.28</w:t>
+      </w:r>
+      <w:r>
+        <w:t xml:space="preserve">, </w:t>
+      </w:r>
+      <w:r>
+        <w:rPr>
+          <w:b/>
+          <w:bCs/>
+        </w:rPr>
+        <w:t xml:space="preserve">syncopation −0.22</w:t>
+      </w:r>
+      <w:r>
+        <w:t xml:space="preserve">, </w:t>
+      </w:r>
+      <w:r>
+        <w:rPr>
+          <w:b/>
+          <w:bCs/>
+        </w:rPr>
+        <w:t xml:space="preserve">cadence softness +0.38</w:t>
+      </w:r>
+      <w:r>
+        <w:t xml:space="preserve"> (clamped </w:t>
+      </w:r>
+      <w:r>
+        <w:rPr>
+          <w:b/>
+          <w:bCs/>
+        </w:rPr>
+        <w:t xml:space="preserve">0–1</w:t>
+      </w:r>
+      <w:r>
+        <w:t xml:space="preserve"> from prior </w:t>
+      </w:r>
+      <w:r>
+        <w:rPr>
+          <w:b/>
+          <w:bCs/>
+        </w:rPr>
+        <w:t xml:space="preserve">`songwriter*Bias`</w:t>
+      </w:r>
+      <w:r>
+        <w:t xml:space="preserve"> defaults </w:t>
+      </w:r>
+      <w:r>
+        <w:rPr>
+          <w:b/>
+          <w:bCs/>
+        </w:rPr>
+        <w:t xml:space="preserve">0.5</w:t>
+      </w:r>
+      <w:r>
+        <w:t xml:space="preserve"> when unset).</w:t>
+      </w:r>
+    </w:p>
+    <w:p>
+      <w:pPr>
+        <w:pStyle w:val="Heading2"/>
+        <w:spacing w:after="100" w:before="160"/>
+      </w:pPr>
+      <w:r>
+        <w:t xml:space="preserve">Melody planner row</w:t>
+      </w:r>
+    </w:p>
+    <w:p>
+      <w:pPr>
+        <w:spacing w:after="160"/>
+      </w:pPr>
+      <w:r>
+        <w:rPr>
+          <w:b/>
+          <w:bCs/>
+        </w:rPr>
+        <w:t xml:space="preserve">`MELODY_PROFILES['arvo_part']`</w:t>
+      </w:r>
+      <w:r>
+        <w:t xml:space="preserve"> — stepwise · </w:t>
+      </w:r>
+      <w:r>
+        <w:rPr>
+          <w:b/>
+          <w:bCs/>
+        </w:rPr>
+        <w:t xml:space="preserve">`whole_bar`</w:t>
+      </w:r>
+      <w:r>
+        <w:t xml:space="preserve"> rhythm · </w:t>
+      </w:r>
+      <w:r>
+        <w:rPr>
+          <w:b/>
+          <w:bCs/>
+        </w:rPr>
+        <w:t xml:space="preserve">repetitionVsVariationBias 0.55</w:t>
+      </w:r>
+      <w:r>
+        <w:t xml:space="preserve"> · phrase </w:t>
+      </w:r>
+      <w:r>
+        <w:rPr>
+          <w:b/>
+          <w:bCs/>
+        </w:rPr>
+        <w:t xml:space="preserve">4</w:t>
+      </w:r>
+      <w:r>
+        <w:t xml:space="preserve"> · </w:t>
+      </w:r>
+      <w:r>
+        <w:rPr>
+          <w:b/>
+          <w:bCs/>
+        </w:rPr>
+        <w:t xml:space="preserve">flat_with_terminal_climax</w:t>
+      </w:r>
+      <w:r>
+        <w:t xml:space="preserve"> contour · cadence </w:t>
+      </w:r>
+      <w:r>
+        <w:rPr>
+          <w:b/>
+          <w:bCs/>
+        </w:rPr>
+        <w:t xml:space="preserve">low</w:t>
+      </w:r>
+      <w:r>
+        <w:t xml:space="preserve"> · devices </w:t>
+      </w:r>
+      <w:r>
+        <w:rPr>
+          <w:b/>
+          <w:bCs/>
+        </w:rPr>
+        <w:t xml:space="preserve">`tintinnabuli_voice`</w:t>
+      </w:r>
+      <w:r>
+        <w:t xml:space="preserve">, </w:t>
+      </w:r>
+      <w:r>
+        <w:rPr>
+          <w:b/>
+          <w:bCs/>
+        </w:rPr>
+        <w:t xml:space="preserve">`silence_as_structure`</w:t>
+      </w:r>
+      <w:r>
+        <w:t xml:space="preserve">, </w:t>
+      </w:r>
+      <w:r>
+        <w:rPr>
+          <w:b/>
+          <w:bCs/>
+        </w:rPr>
+        <w:t xml:space="preserve">`additive_cell`</w:t>
+      </w:r>
+      <w:r>
+        <w:t xml:space="preserve">, </w:t>
+      </w:r>
+      <w:r>
+        <w:rPr>
+          <w:b/>
+          <w:bCs/>
+        </w:rPr>
+        <w:t xml:space="preserve">`register_arch`</w:t>
+      </w:r>
+      <w:r>
+        <w:t xml:space="preserve">, </w:t>
+      </w:r>
+      <w:r>
+        <w:rPr>
+          <w:b/>
+          <w:bCs/>
+        </w:rPr>
+        <w:t xml:space="preserve">`triadic_transform`</w:t>
       </w:r>
       <w:r>
         <w:t xml:space="preserve">.</w:t>

</xml_diff>

<commit_message>
docs: Fela Kuti — handbook section + README update
</commit_message>
<xml_diff>
--- a/docs/COMPOSER_OS_PLAYBOOK.docx
+++ b/docs/COMPOSER_OS_PLAYBOOK.docx
@@ -15915,6 +15915,1289 @@
           <w:bCs/>
         </w:rPr>
         <w:t xml:space="preserve">`suite_form`</w:t>
+      </w:r>
+      <w:r>
+        <w:t xml:space="preserve">.</w:t>
+      </w:r>
+    </w:p>
+    <w:p>
+      <w:pPr>
+        <w:pStyle w:val="Heading1"/>
+        <w:spacing w:after="120" w:before="200"/>
+      </w:pPr>
+      <w:r>
+        <w:t xml:space="preserve">Fela Kuti (`fela_kuti`) — Song Mode harmony slice (three contexts)</w:t>
+      </w:r>
+    </w:p>
+    <w:p>
+      <w:pPr>
+        <w:spacing w:after="160"/>
+      </w:pPr>
+      <w:r>
+        <w:t xml:space="preserve">Primary songwriter </w:t>
+      </w:r>
+      <w:r>
+        <w:rPr>
+          <w:b/>
+          <w:bCs/>
+        </w:rPr>
+        <w:t xml:space="preserve">`fela_kuti`</w:t>
+      </w:r>
+      <w:r>
+        <w:t xml:space="preserve"> runs </w:t>
+      </w:r>
+      <w:r>
+        <w:rPr>
+          <w:b/>
+          <w:bCs/>
+        </w:rPr>
+        <w:t xml:space="preserve">`felaKutiSlice.ts`</w:t>
+      </w:r>
+      <w:r>
+        <w:t xml:space="preserve"> on the golden-path duo timeline (</w:t>
+      </w:r>
+      <w:r>
+        <w:rPr>
+          <w:b/>
+          <w:bCs/>
+        </w:rPr>
+        <w:t xml:space="preserve">`precomputeFelaKutiEffectiveHarmonyBars`</w:t>
+      </w:r>
+      <w:r>
+        <w:t xml:space="preserve"> → </w:t>
+      </w:r>
+      <w:r>
+        <w:rPr>
+          <w:b/>
+          <w:bCs/>
+        </w:rPr>
+        <w:t xml:space="preserve">`felaKutiEffectiveHarmonyBars`</w:t>
+      </w:r>
+      <w:r>
+        <w:t xml:space="preserve"> for </w:t>
+      </w:r>
+      <w:r>
+        <w:rPr>
+          <w:b/>
+          <w:bCs/>
+        </w:rPr>
+        <w:t xml:space="preserve">`getChordForBar`</w:t>
+      </w:r>
+      <w:r>
+        <w:t xml:space="preserve">, </w:t>
+      </w:r>
+      <w:r>
+        <w:rPr>
+          <w:b/>
+          <w:bCs/>
+        </w:rPr>
+        <w:t xml:space="preserve">`customLockedHarmonyRouting`</w:t>
+      </w:r>
+      <w:r>
+        <w:t xml:space="preserve">, </w:t>
+      </w:r>
+      <w:r>
+        <w:rPr>
+          <w:b/>
+          <w:bCs/>
+        </w:rPr>
+        <w:t xml:space="preserve">`runGoldenPath`</w:t>
+      </w:r>
+      <w:r>
+        <w:t xml:space="preserve"> locked export truth, </w:t>
+      </w:r>
+      <w:r>
+        <w:rPr>
+          <w:b/>
+          <w:bCs/>
+        </w:rPr>
+        <w:t xml:space="preserve">`composerOsAppGeneration`</w:t>
+      </w:r>
+      <w:r>
+        <w:t xml:space="preserve">). </w:t>
+      </w:r>
+      <w:r>
+        <w:rPr>
+          <w:b/>
+          <w:bCs/>
+        </w:rPr>
+        <w:t xml:space="preserve">`GenerationMetadata.felaKutiContext`</w:t>
+      </w:r>
+      <w:r>
+        <w:t xml:space="preserve"> selects the era (</w:t>
+      </w:r>
+      <w:r>
+        <w:rPr>
+          <w:b/>
+          <w:bCs/>
+        </w:rPr>
+        <w:t xml:space="preserve">default `zombie_1977`</w:t>
+      </w:r>
+      <w:r>
+        <w:t xml:space="preserve">): </w:t>
+      </w:r>
+      <w:r>
+        <w:rPr>
+          <w:b/>
+          <w:bCs/>
+        </w:rPr>
+        <w:t xml:space="preserve">`zombie_1977`</w:t>
+      </w:r>
+      <w:r>
+        <w:t xml:space="preserve"> · </w:t>
+      </w:r>
+      <w:r>
+        <w:rPr>
+          <w:b/>
+          <w:bCs/>
+        </w:rPr>
+        <w:t xml:space="preserve">`water_no_get_enemy`</w:t>
+      </w:r>
+      <w:r>
+        <w:t xml:space="preserve"> · </w:t>
+      </w:r>
+      <w:r>
+        <w:rPr>
+          <w:b/>
+          <w:bCs/>
+        </w:rPr>
+        <w:t xml:space="preserve">`lady_1972`</w:t>
+      </w:r>
+      <w:r>
+        <w:t xml:space="preserve">. API contract: </w:t>
+      </w:r>
+      <w:r>
+        <w:rPr>
+          <w:b/>
+          <w:bCs/>
+        </w:rPr>
+        <w:t xml:space="preserve">`GenerateRequest.felaKutiContext`</w:t>
+      </w:r>
+      <w:r>
+        <w:t xml:space="preserve">. Receipts use prefix </w:t>
+      </w:r>
+      <w:r>
+        <w:rPr>
+          <w:b/>
+          <w:bCs/>
+        </w:rPr>
+        <w:t xml:space="preserve">`fk:`</w:t>
+      </w:r>
+      <w:r>
+        <w:t xml:space="preserve"> for numbered devices </w:t>
+      </w:r>
+      <w:r>
+        <w:rPr>
+          <w:b/>
+          <w:bCs/>
+        </w:rPr>
+        <w:t xml:space="preserve">`d1`–`d5`</w:t>
+      </w:r>
+      <w:r>
+        <w:t xml:space="preserve"> (see table); </w:t>
+      </w:r>
+      <w:r>
+        <w:rPr>
+          <w:b/>
+          <w:bCs/>
+        </w:rPr>
+        <w:t xml:space="preserve">`applyFelaKutiDeviceReceiptPasses`</w:t>
+      </w:r>
+      <w:r>
+        <w:t xml:space="preserve"> may tag </w:t>
+      </w:r>
+      <w:r>
+        <w:rPr>
+          <w:b/>
+          <w:bCs/>
+        </w:rPr>
+        <w:t xml:space="preserve">`@sectionB`</w:t>
+      </w:r>
+      <w:r>
+        <w:t xml:space="preserve"> on </w:t>
+      </w:r>
+      <w:r>
+        <w:rPr>
+          <w:b/>
+          <w:bCs/>
+        </w:rPr>
+        <w:t xml:space="preserve">`B`</w:t>
+      </w:r>
+      <w:r>
+        <w:t xml:space="preserve"> sections.</w:t>
+      </w:r>
+    </w:p>
+    <w:p>
+      <w:pPr>
+        <w:spacing w:after="160"/>
+      </w:pPr>
+      <w:r>
+        <w:rPr>
+          <w:b/>
+          <w:bCs/>
+        </w:rPr>
+        <w:t xml:space="preserve">Chord pools (static vamps)</w:t>
+      </w:r>
+      <w:r>
+        <w:t xml:space="preserve"> — Song Mode scaffold rows in </w:t>
+      </w:r>
+      <w:r>
+        <w:rPr>
+          <w:b/>
+          <w:bCs/>
+        </w:rPr>
+        <w:t xml:space="preserve">`SONGWRITER_CHORD_POOLS`</w:t>
+      </w:r>
+      <w:r>
+        <w:t xml:space="preserve">: </w:t>
+      </w:r>
+      <w:r>
+        <w:rPr>
+          <w:b/>
+          <w:bCs/>
+        </w:rPr>
+        <w:t xml:space="preserve">`fela_kuti_zombie_1977`</w:t>
+      </w:r>
+      <w:r>
+        <w:t xml:space="preserve">, </w:t>
+      </w:r>
+      <w:r>
+        <w:rPr>
+          <w:b/>
+          <w:bCs/>
+        </w:rPr>
+        <w:t xml:space="preserve">`fela_kuti_water_no_get_enemy`</w:t>
+      </w:r>
+      <w:r>
+        <w:t xml:space="preserve">, </w:t>
+      </w:r>
+      <w:r>
+        <w:rPr>
+          <w:b/>
+          <w:bCs/>
+        </w:rPr>
+        <w:t xml:space="preserve">`fela_kuti_lady_1972`</w:t>
+      </w:r>
+      <w:r>
+        <w:t xml:space="preserve">. Vocabulary is </w:t>
+      </w:r>
+      <w:r>
+        <w:rPr>
+          <w:b/>
+          <w:bCs/>
+        </w:rPr>
+        <w:t xml:space="preserve">non-cadential</w:t>
+      </w:r>
+      <w:r>
+        <w:t xml:space="preserve">: cycling </w:t>
+      </w:r>
+      <w:r>
+        <w:rPr>
+          <w:b/>
+          <w:bCs/>
+        </w:rPr>
+        <w:t xml:space="preserve">Im7</w:t>
+      </w:r>
+      <w:r>
+        <w:t xml:space="preserve">, </w:t>
+      </w:r>
+      <w:r>
+        <w:rPr>
+          <w:b/>
+          <w:bCs/>
+        </w:rPr>
+        <w:t xml:space="preserve">♭VII7</w:t>
+      </w:r>
+      <w:r>
+        <w:t xml:space="preserve">, </w:t>
+      </w:r>
+      <w:r>
+        <w:rPr>
+          <w:b/>
+          <w:bCs/>
+        </w:rPr>
+        <w:t xml:space="preserve">IV7</w:t>
+      </w:r>
+      <w:r>
+        <w:t xml:space="preserve"> (lead-sheet roots relative to minor tonic, e.g. </w:t>
+      </w:r>
+      <w:r>
+        <w:rPr>
+          <w:b/>
+          <w:bCs/>
+        </w:rPr>
+        <w:t xml:space="preserve">Am7 / G7 / D7</w:t>
+      </w:r>
+      <w:r>
+        <w:t xml:space="preserve">); optional </w:t>
+      </w:r>
+      <w:r>
+        <w:rPr>
+          <w:b/>
+          <w:bCs/>
+        </w:rPr>
+        <w:t xml:space="preserve">♭IIImaj7</w:t>
+      </w:r>
+      <w:r>
+        <w:t xml:space="preserve"> (e.g. </w:t>
+      </w:r>
+      <w:r>
+        <w:rPr>
+          <w:b/>
+          <w:bCs/>
+        </w:rPr>
+        <w:t xml:space="preserve">Cmaj7</w:t>
+      </w:r>
+      <w:r>
+        <w:t xml:space="preserve">) as colour only — no textbook </w:t>
+      </w:r>
+      <w:r>
+        <w:rPr>
+          <w:b/>
+          <w:bCs/>
+        </w:rPr>
+        <w:t xml:space="preserve">V7→i</w:t>
+      </w:r>
+      <w:r>
+        <w:t xml:space="preserve"> closure rows. When </w:t>
+      </w:r>
+      <w:r>
+        <w:rPr>
+          <w:b/>
+          <w:bCs/>
+        </w:rPr>
+        <w:t xml:space="preserve">`primarySongwriterStyle === fela_kuti`</w:t>
+      </w:r>
+      <w:r>
+        <w:t xml:space="preserve">, </w:t>
+      </w:r>
+      <w:r>
+        <w:rPr>
+          <w:b/>
+          <w:bCs/>
+        </w:rPr>
+        <w:t xml:space="preserve">`resolveFelaKutiChordPoolId`</w:t>
+      </w:r>
+      <w:r>
+        <w:t xml:space="preserve"> picks a pool with </w:t>
+      </w:r>
+      <w:r>
+        <w:rPr>
+          <w:b/>
+          <w:bCs/>
+        </w:rPr>
+        <w:t xml:space="preserve">`Math.abs(seed) % 3`</w:t>
+      </w:r>
+      <w:r>
+        <w:t xml:space="preserve"> → tier maps </w:t>
+      </w:r>
+      <w:r>
+        <w:rPr>
+          <w:b/>
+          <w:bCs/>
+        </w:rPr>
+        <w:t xml:space="preserve">zombie_1977 / water_no_get_enemy / lady_1972</w:t>
+      </w:r>
+      <w:r>
+        <w:t xml:space="preserve">.</w:t>
+      </w:r>
+    </w:p>
+    <w:p>
+      <w:pPr>
+        <w:spacing w:after="160"/>
+      </w:pPr>
+      <w:r>
+        <w:rPr>
+          <w:b/>
+          <w:bCs/>
+        </w:rPr>
+        <w:t xml:space="preserve">Yoruba pentatonic pitch pool</w:t>
+      </w:r>
+      <w:r>
+        <w:t xml:space="preserve"> — analytical degree set </w:t>
+      </w:r>
+      <w:r>
+        <w:rPr>
+          <w:b/>
+          <w:bCs/>
+        </w:rPr>
+        <w:t xml:space="preserve">`FELA_YORUBA_PENTATONIC_DEGREES`</w:t>
+      </w:r>
+      <w:r>
+        <w:t xml:space="preserve"> in </w:t>
+      </w:r>
+      <w:r>
+        <w:rPr>
+          <w:b/>
+          <w:bCs/>
+        </w:rPr>
+        <w:t xml:space="preserve">`felaKutiSlice.ts`</w:t>
+      </w:r>
+      <w:r>
+        <w:t xml:space="preserve">: </w:t>
+      </w:r>
+      <w:r>
+        <w:rPr>
+          <w:b/>
+          <w:bCs/>
+        </w:rPr>
+        <w:t xml:space="preserve">{ 1, 2, ♭3, 4, 5, 6, ♭7 }</w:t>
+      </w:r>
+      <w:r>
+        <w:t xml:space="preserve"> (seven pitch classes); structural emphasis </w:t>
+      </w:r>
+      <w:r>
+        <w:rPr>
+          <w:b/>
+          <w:bCs/>
+        </w:rPr>
+        <w:t xml:space="preserve">1–5–♭7</w:t>
+      </w:r>
+      <w:r>
+        <w:t xml:space="preserve">. Copied to </w:t>
+      </w:r>
+      <w:r>
+        <w:rPr>
+          <w:b/>
+          <w:bCs/>
+        </w:rPr>
+        <w:t xml:space="preserve">`generationMetadata.felaKutiYorubaPentatonicDegrees`</w:t>
+      </w:r>
+      <w:r>
+        <w:t xml:space="preserve"> during precompute for melody / receipt diagnostics.</w:t>
+      </w:r>
+    </w:p>
+    <w:p>
+      <w:pPr>
+        <w:spacing w:after="160"/>
+      </w:pPr>
+      <w:r>
+        <w:rPr>
+          <w:b/>
+          <w:bCs/>
+        </w:rPr>
+        <w:t xml:space="preserve">Implementation scope</w:t>
+      </w:r>
+      <w:r>
+        <w:t xml:space="preserve"> — Harmony + melodic behaviour / metadata only. A dedicated </w:t>
+      </w:r>
+      <w:r>
+        <w:rPr>
+          <w:b/>
+          <w:bCs/>
+        </w:rPr>
+        <w:t xml:space="preserve">percussion / Afrobeat drum engine</w:t>
+      </w:r>
+      <w:r>
+        <w:t xml:space="preserve"> is </w:t>
+      </w:r>
+      <w:r>
+        <w:rPr>
+          <w:b/>
+          <w:bCs/>
+        </w:rPr>
+        <w:t xml:space="preserve">not</w:t>
+      </w:r>
+      <w:r>
+        <w:t xml:space="preserve"> part of this slice; treat as a </w:t>
+      </w:r>
+      <w:r>
+        <w:rPr>
+          <w:b/>
+          <w:bCs/>
+        </w:rPr>
+        <w:t xml:space="preserve">future sprint</w:t>
+      </w:r>
+      <w:r>
+        <w:t xml:space="preserve"> if layered kit logic is required beyond harmony receipts.</w:t>
+      </w:r>
+    </w:p>
+    <w:p>
+      <w:pPr>
+        <w:pStyle w:val="Heading2"/>
+        <w:spacing w:after="100" w:before="160"/>
+      </w:pPr>
+      <w:r>
+        <w:t xml:space="preserve">Contexts</w:t>
+      </w:r>
+    </w:p>
+    <w:tbl>
+      <w:tblPr>
+        <w:tblW w:type="pct" w:w="100%"/>
+        <w:tblBorders>
+          <w:top w:val="single" w:color="auto" w:sz="4"/>
+          <w:left w:val="single" w:color="auto" w:sz="4"/>
+          <w:bottom w:val="single" w:color="auto" w:sz="4"/>
+          <w:right w:val="single" w:color="auto" w:sz="4"/>
+          <w:insideH w:val="single" w:color="auto" w:sz="4"/>
+          <w:insideV w:val="single" w:color="auto" w:sz="4"/>
+        </w:tblBorders>
+      </w:tblPr>
+      <w:tblGrid>
+        <w:gridCol w:w="4500"/>
+        <w:gridCol w:w="4500"/>
+      </w:tblGrid>
+      <w:tr>
+        <w:tc>
+          <w:tcPr>
+            <w:tcW w:type="pct" w:w="4500%"/>
+          </w:tcPr>
+          <w:p>
+            <w:pPr>
+              <w:spacing w:after="60"/>
+            </w:pPr>
+            <w:r>
+              <w:t xml:space="preserve">Context</w:t>
+            </w:r>
+          </w:p>
+        </w:tc>
+        <w:tc>
+          <w:tcPr>
+            <w:tcW w:type="pct" w:w="4500%"/>
+          </w:tcPr>
+          <w:p>
+            <w:pPr>
+              <w:spacing w:after="60"/>
+            </w:pPr>
+            <w:r>
+              <w:t xml:space="preserve">Role</w:t>
+            </w:r>
+          </w:p>
+        </w:tc>
+      </w:tr>
+      <w:tr>
+        <w:tc>
+          <w:tcPr>
+            <w:tcW w:type="pct" w:w="4500%"/>
+          </w:tcPr>
+          <w:p>
+            <w:pPr>
+              <w:spacing w:after="60"/>
+            </w:pPr>
+            <w:r>
+              <w:rPr>
+                <w:b/>
+                <w:bCs/>
+              </w:rPr>
+              <w:t xml:space="preserve">`zombie_1977`</w:t>
+            </w:r>
+          </w:p>
+        </w:tc>
+        <w:tc>
+          <w:tcPr>
+            <w:tcW w:type="pct" w:w="4500%"/>
+          </w:tcPr>
+          <w:p>
+            <w:pPr>
+              <w:spacing w:after="60"/>
+            </w:pPr>
+            <w:r>
+              <w:t xml:space="preserve">Long-form vamp emphasis — device receipts favour </w:t>
+            </w:r>
+            <w:r>
+              <w:rPr>
+                <w:b/>
+                <w:bCs/>
+              </w:rPr>
+              <w:t xml:space="preserve">`fk:d1`</w:t>
+            </w:r>
+            <w:r>
+              <w:t xml:space="preserve"> / </w:t>
+            </w:r>
+            <w:r>
+              <w:rPr>
+                <w:b/>
+                <w:bCs/>
+              </w:rPr>
+              <w:t xml:space="preserve">`fk:d2`</w:t>
+            </w:r>
+            <w:r>
+              <w:t xml:space="preserve">.</w:t>
+            </w:r>
+          </w:p>
+        </w:tc>
+      </w:tr>
+      <w:tr>
+        <w:tc>
+          <w:tcPr>
+            <w:tcW w:type="pct" w:w="4500%"/>
+          </w:tcPr>
+          <w:p>
+            <w:pPr>
+              <w:spacing w:after="60"/>
+            </w:pPr>
+            <w:r>
+              <w:rPr>
+                <w:b/>
+                <w:bCs/>
+              </w:rPr>
+              <w:t xml:space="preserve">`water_no_get_enemy`</w:t>
+            </w:r>
+          </w:p>
+        </w:tc>
+        <w:tc>
+          <w:tcPr>
+            <w:tcW w:type="pct" w:w="4500%"/>
+          </w:tcPr>
+          <w:p>
+            <w:pPr>
+              <w:spacing w:after="60"/>
+            </w:pPr>
+            <w:r>
+              <w:t xml:space="preserve">Call–response + pentatonic layer — </w:t>
+            </w:r>
+            <w:r>
+              <w:rPr>
+                <w:b/>
+                <w:bCs/>
+              </w:rPr>
+              <w:t xml:space="preserve">`fk:d2`</w:t>
+            </w:r>
+            <w:r>
+              <w:t xml:space="preserve"> + </w:t>
+            </w:r>
+            <w:r>
+              <w:rPr>
+                <w:b/>
+                <w:bCs/>
+              </w:rPr>
+              <w:t xml:space="preserve">`fk:d3`</w:t>
+            </w:r>
+            <w:r>
+              <w:t xml:space="preserve"> weighted.</w:t>
+            </w:r>
+          </w:p>
+        </w:tc>
+      </w:tr>
+      <w:tr>
+        <w:tc>
+          <w:tcPr>
+            <w:tcW w:type="pct" w:w="4500%"/>
+          </w:tcPr>
+          <w:p>
+            <w:pPr>
+              <w:spacing w:after="60"/>
+            </w:pPr>
+            <w:r>
+              <w:rPr>
+                <w:b/>
+                <w:bCs/>
+              </w:rPr>
+              <w:t xml:space="preserve">`lady_1972`</w:t>
+            </w:r>
+          </w:p>
+        </w:tc>
+        <w:tc>
+          <w:tcPr>
+            <w:tcW w:type="pct" w:w="4500%"/>
+          </w:tcPr>
+          <w:p>
+            <w:pPr>
+              <w:spacing w:after="60"/>
+            </w:pPr>
+            <w:r>
+              <w:t xml:space="preserve">Horn-stack / polymetric stress — </w:t>
+            </w:r>
+            <w:r>
+              <w:rPr>
+                <w:b/>
+                <w:bCs/>
+              </w:rPr>
+              <w:t xml:space="preserve">`fk:d4`</w:t>
+            </w:r>
+            <w:r>
+              <w:t xml:space="preserve">, </w:t>
+            </w:r>
+            <w:r>
+              <w:rPr>
+                <w:b/>
+                <w:bCs/>
+              </w:rPr>
+              <w:t xml:space="preserve">`fk:d5`</w:t>
+            </w:r>
+            <w:r>
+              <w:t xml:space="preserve">, </w:t>
+            </w:r>
+            <w:r>
+              <w:rPr>
+                <w:b/>
+                <w:bCs/>
+              </w:rPr>
+              <w:t xml:space="preserve">`fk:d3`</w:t>
+            </w:r>
+            <w:r>
+              <w:t xml:space="preserve"> weighted.</w:t>
+            </w:r>
+          </w:p>
+        </w:tc>
+      </w:tr>
+    </w:tbl>
+    <w:p>
+      <w:pPr>
+        <w:spacing w:after="160"/>
+      </w:pPr>
+    </w:p>
+    <w:p>
+      <w:pPr>
+        <w:pStyle w:val="Heading2"/>
+        <w:spacing w:after="100" w:before="160"/>
+      </w:pPr>
+      <w:r>
+        <w:t xml:space="preserve">Harmonic devices (receipts **`fk:`**)</w:t>
+      </w:r>
+    </w:p>
+    <w:tbl>
+      <w:tblPr>
+        <w:tblW w:type="pct" w:w="100%"/>
+        <w:tblBorders>
+          <w:top w:val="single" w:color="auto" w:sz="4"/>
+          <w:left w:val="single" w:color="auto" w:sz="4"/>
+          <w:bottom w:val="single" w:color="auto" w:sz="4"/>
+          <w:right w:val="single" w:color="auto" w:sz="4"/>
+          <w:insideH w:val="single" w:color="auto" w:sz="4"/>
+          <w:insideV w:val="single" w:color="auto" w:sz="4"/>
+        </w:tblBorders>
+      </w:tblPr>
+      <w:tblGrid>
+        <w:gridCol w:w="3000"/>
+        <w:gridCol w:w="3000"/>
+        <w:gridCol w:w="3000"/>
+      </w:tblGrid>
+      <w:tr>
+        <w:tc>
+          <w:tcPr>
+            <w:tcW w:type="pct" w:w="3000%"/>
+          </w:tcPr>
+          <w:p>
+            <w:pPr>
+              <w:spacing w:after="60"/>
+            </w:pPr>
+            <w:r>
+              <w:t xml:space="preserve">Id</w:t>
+            </w:r>
+          </w:p>
+        </w:tc>
+        <w:tc>
+          <w:tcPr>
+            <w:tcW w:type="pct" w:w="3000%"/>
+          </w:tcPr>
+          <w:p>
+            <w:pPr>
+              <w:spacing w:after="60"/>
+            </w:pPr>
+            <w:r>
+              <w:t xml:space="preserve">Planner device</w:t>
+            </w:r>
+          </w:p>
+        </w:tc>
+        <w:tc>
+          <w:tcPr>
+            <w:tcW w:type="pct" w:w="3000%"/>
+          </w:tcPr>
+          <w:p>
+            <w:pPr>
+              <w:spacing w:after="60"/>
+            </w:pPr>
+            <w:r>
+              <w:t xml:space="preserve">Receipt (examples)</w:t>
+            </w:r>
+          </w:p>
+        </w:tc>
+      </w:tr>
+      <w:tr>
+        <w:tc>
+          <w:tcPr>
+            <w:tcW w:type="pct" w:w="3000%"/>
+          </w:tcPr>
+          <w:p>
+            <w:pPr>
+              <w:spacing w:after="60"/>
+            </w:pPr>
+            <w:r>
+              <w:rPr>
+                <w:b/>
+                <w:bCs/>
+              </w:rPr>
+              <w:t xml:space="preserve">d1</w:t>
+            </w:r>
+          </w:p>
+        </w:tc>
+        <w:tc>
+          <w:tcPr>
+            <w:tcW w:type="pct" w:w="3000%"/>
+          </w:tcPr>
+          <w:p>
+            <w:pPr>
+              <w:spacing w:after="60"/>
+            </w:pPr>
+            <w:r>
+              <w:t xml:space="preserve">Static vamp</w:t>
+            </w:r>
+          </w:p>
+        </w:tc>
+        <w:tc>
+          <w:tcPr>
+            <w:tcW w:type="pct" w:w="3000%"/>
+          </w:tcPr>
+          <w:p>
+            <w:pPr>
+              <w:spacing w:after="60"/>
+            </w:pPr>
+            <w:r>
+              <w:rPr>
+                <w:b/>
+                <w:bCs/>
+              </w:rPr>
+              <w:t xml:space="preserve">`fk:d1_static_vamp@bar{N}`</w:t>
+            </w:r>
+          </w:p>
+        </w:tc>
+      </w:tr>
+      <w:tr>
+        <w:tc>
+          <w:tcPr>
+            <w:tcW w:type="pct" w:w="3000%"/>
+          </w:tcPr>
+          <w:p>
+            <w:pPr>
+              <w:spacing w:after="60"/>
+            </w:pPr>
+            <w:r>
+              <w:rPr>
+                <w:b/>
+                <w:bCs/>
+              </w:rPr>
+              <w:t xml:space="preserve">d2</w:t>
+            </w:r>
+          </w:p>
+        </w:tc>
+        <w:tc>
+          <w:tcPr>
+            <w:tcW w:type="pct" w:w="3000%"/>
+          </w:tcPr>
+          <w:p>
+            <w:pPr>
+              <w:spacing w:after="60"/>
+            </w:pPr>
+            <w:r>
+              <w:t xml:space="preserve">Call–response</w:t>
+            </w:r>
+          </w:p>
+        </w:tc>
+        <w:tc>
+          <w:tcPr>
+            <w:tcW w:type="pct" w:w="3000%"/>
+          </w:tcPr>
+          <w:p>
+            <w:pPr>
+              <w:spacing w:after="60"/>
+            </w:pPr>
+            <w:r>
+              <w:rPr>
+                <w:b/>
+                <w:bCs/>
+              </w:rPr>
+              <w:t xml:space="preserve">`fk:d2_call_response@bar{N}`</w:t>
+            </w:r>
+            <w:r>
+              <w:t xml:space="preserve">, </w:t>
+            </w:r>
+            <w:r>
+              <w:rPr>
+                <w:b/>
+                <w:bCs/>
+              </w:rPr>
+              <w:t xml:space="preserve">`fk:d2_call_response@sectionB@bar{N}`</w:t>
+            </w:r>
+          </w:p>
+        </w:tc>
+      </w:tr>
+      <w:tr>
+        <w:tc>
+          <w:tcPr>
+            <w:tcW w:type="pct" w:w="3000%"/>
+          </w:tcPr>
+          <w:p>
+            <w:pPr>
+              <w:spacing w:after="60"/>
+            </w:pPr>
+            <w:r>
+              <w:rPr>
+                <w:b/>
+                <w:bCs/>
+              </w:rPr>
+              <w:t xml:space="preserve">d3</w:t>
+            </w:r>
+          </w:p>
+        </w:tc>
+        <w:tc>
+          <w:tcPr>
+            <w:tcW w:type="pct" w:w="3000%"/>
+          </w:tcPr>
+          <w:p>
+            <w:pPr>
+              <w:spacing w:after="60"/>
+            </w:pPr>
+            <w:r>
+              <w:t xml:space="preserve">Pentatonic layer</w:t>
+            </w:r>
+          </w:p>
+        </w:tc>
+        <w:tc>
+          <w:tcPr>
+            <w:tcW w:type="pct" w:w="3000%"/>
+          </w:tcPr>
+          <w:p>
+            <w:pPr>
+              <w:spacing w:after="60"/>
+            </w:pPr>
+            <w:r>
+              <w:rPr>
+                <w:b/>
+                <w:bCs/>
+              </w:rPr>
+              <w:t xml:space="preserve">`fk:d3_pentatonic_layer@bar{N}`</w:t>
+            </w:r>
+          </w:p>
+        </w:tc>
+      </w:tr>
+      <w:tr>
+        <w:tc>
+          <w:tcPr>
+            <w:tcW w:type="pct" w:w="3000%"/>
+          </w:tcPr>
+          <w:p>
+            <w:pPr>
+              <w:spacing w:after="60"/>
+            </w:pPr>
+            <w:r>
+              <w:rPr>
+                <w:b/>
+                <w:bCs/>
+              </w:rPr>
+              <w:t xml:space="preserve">d4</w:t>
+            </w:r>
+          </w:p>
+        </w:tc>
+        <w:tc>
+          <w:tcPr>
+            <w:tcW w:type="pct" w:w="3000%"/>
+          </w:tcPr>
+          <w:p>
+            <w:pPr>
+              <w:spacing w:after="60"/>
+            </w:pPr>
+            <w:r>
+              <w:t xml:space="preserve">Parallel horns</w:t>
+            </w:r>
+          </w:p>
+        </w:tc>
+        <w:tc>
+          <w:tcPr>
+            <w:tcW w:type="pct" w:w="3000%"/>
+          </w:tcPr>
+          <w:p>
+            <w:pPr>
+              <w:spacing w:after="60"/>
+            </w:pPr>
+            <w:r>
+              <w:rPr>
+                <w:b/>
+                <w:bCs/>
+              </w:rPr>
+              <w:t xml:space="preserve">`fk:d4_parallel_horns@bar{N}`</w:t>
+            </w:r>
+          </w:p>
+        </w:tc>
+      </w:tr>
+      <w:tr>
+        <w:tc>
+          <w:tcPr>
+            <w:tcW w:type="pct" w:w="3000%"/>
+          </w:tcPr>
+          <w:p>
+            <w:pPr>
+              <w:spacing w:after="60"/>
+            </w:pPr>
+            <w:r>
+              <w:rPr>
+                <w:b/>
+                <w:bCs/>
+              </w:rPr>
+              <w:t xml:space="preserve">d5</w:t>
+            </w:r>
+          </w:p>
+        </w:tc>
+        <w:tc>
+          <w:tcPr>
+            <w:tcW w:type="pct" w:w="3000%"/>
+          </w:tcPr>
+          <w:p>
+            <w:pPr>
+              <w:spacing w:after="60"/>
+            </w:pPr>
+            <w:r>
+              <w:t xml:space="preserve">Polymetric grid</w:t>
+            </w:r>
+          </w:p>
+        </w:tc>
+        <w:tc>
+          <w:tcPr>
+            <w:tcW w:type="pct" w:w="3000%"/>
+          </w:tcPr>
+          <w:p>
+            <w:pPr>
+              <w:spacing w:after="60"/>
+            </w:pPr>
+            <w:r>
+              <w:rPr>
+                <w:b/>
+                <w:bCs/>
+              </w:rPr>
+              <w:t xml:space="preserve">`fk:d5_polymetric_grid@bar{N}`</w:t>
+            </w:r>
+          </w:p>
+        </w:tc>
+      </w:tr>
+    </w:tbl>
+    <w:p>
+      <w:pPr>
+        <w:spacing w:after="160"/>
+      </w:pPr>
+    </w:p>
+    <w:p>
+      <w:pPr>
+        <w:pStyle w:val="Heading2"/>
+        <w:spacing w:after="100" w:before="160"/>
+      </w:pPr>
+      <w:r>
+        <w:t xml:space="preserve">Style surface (metadata nudges)</w:t>
+      </w:r>
+    </w:p>
+    <w:p>
+      <w:pPr>
+        <w:spacing w:after="160"/>
+      </w:pPr>
+      <w:r>
+        <w:rPr>
+          <w:b/>
+          <w:bCs/>
+        </w:rPr>
+        <w:t xml:space="preserve">`applyFelaKutiStyleSurface`</w:t>
+      </w:r>
+      <w:r>
+        <w:t xml:space="preserve"> — for all contexts: </w:t>
+      </w:r>
+      <w:r>
+        <w:rPr>
+          <w:b/>
+          <w:bCs/>
+        </w:rPr>
+        <w:t xml:space="preserve">syncopation +0.32</w:t>
+      </w:r>
+      <w:r>
+        <w:t xml:space="preserve">, </w:t>
+      </w:r>
+      <w:r>
+        <w:rPr>
+          <w:b/>
+          <w:bCs/>
+        </w:rPr>
+        <w:t xml:space="preserve">density +0.18</w:t>
+      </w:r>
+      <w:r>
+        <w:t xml:space="preserve">, </w:t>
+      </w:r>
+      <w:r>
+        <w:rPr>
+          <w:b/>
+          <w:bCs/>
+        </w:rPr>
+        <w:t xml:space="preserve">space −0.14</w:t>
+      </w:r>
+      <w:r>
+        <w:t xml:space="preserve">, </w:t>
+      </w:r>
+      <w:r>
+        <w:rPr>
+          <w:b/>
+          <w:bCs/>
+        </w:rPr>
+        <w:t xml:space="preserve">cadence softness +0.38</w:t>
+      </w:r>
+      <w:r>
+        <w:t xml:space="preserve"> (clamped </w:t>
+      </w:r>
+      <w:r>
+        <w:rPr>
+          <w:b/>
+          <w:bCs/>
+        </w:rPr>
+        <w:t xml:space="preserve">0–1</w:t>
+      </w:r>
+      <w:r>
+        <w:t xml:space="preserve"> from prior </w:t>
+      </w:r>
+      <w:r>
+        <w:rPr>
+          <w:b/>
+          <w:bCs/>
+        </w:rPr>
+        <w:t xml:space="preserve">`songwriter*Bias`</w:t>
+      </w:r>
+      <w:r>
+        <w:t xml:space="preserve"> defaults </w:t>
+      </w:r>
+      <w:r>
+        <w:rPr>
+          <w:b/>
+          <w:bCs/>
+        </w:rPr>
+        <w:t xml:space="preserve">0.5</w:t>
+      </w:r>
+      <w:r>
+        <w:t xml:space="preserve"> when unset; aligns with </w:t>
+      </w:r>
+      <w:r>
+        <w:rPr>
+          <w:b/>
+          <w:bCs/>
+        </w:rPr>
+        <w:t xml:space="preserve">`felaKutiStyleSurface`</w:t>
+      </w:r>
+      <w:r>
+        <w:t xml:space="preserve"> in </w:t>
+      </w:r>
+      <w:r>
+        <w:rPr>
+          <w:b/>
+          <w:bCs/>
+        </w:rPr>
+        <w:t xml:space="preserve">`felaKutiSlice.ts`</w:t>
+      </w:r>
+      <w:r>
+        <w:t xml:space="preserve">).</w:t>
+      </w:r>
+    </w:p>
+    <w:p>
+      <w:pPr>
+        <w:pStyle w:val="Heading2"/>
+        <w:spacing w:after="100" w:before="160"/>
+      </w:pPr>
+      <w:r>
+        <w:t xml:space="preserve">Melody planner row</w:t>
+      </w:r>
+    </w:p>
+    <w:p>
+      <w:pPr>
+        <w:spacing w:after="160"/>
+      </w:pPr>
+      <w:r>
+        <w:rPr>
+          <w:b/>
+          <w:bCs/>
+        </w:rPr>
+        <w:t xml:space="preserve">`MELODY_PROFILES['fela_kuti']`</w:t>
+      </w:r>
+      <w:r>
+        <w:t xml:space="preserve"> — mixed intervals · </w:t>
+      </w:r>
+      <w:r>
+        <w:rPr>
+          <w:b/>
+          <w:bCs/>
+        </w:rPr>
+        <w:t xml:space="preserve">`mixed`</w:t>
+      </w:r>
+      <w:r>
+        <w:t xml:space="preserve"> rhythm · </w:t>
+      </w:r>
+      <w:r>
+        <w:rPr>
+          <w:b/>
+          <w:bCs/>
+        </w:rPr>
+        <w:t xml:space="preserve">repetitionVsVariationBias 0.52</w:t>
+      </w:r>
+      <w:r>
+        <w:t xml:space="preserve"> · phrase </w:t>
+      </w:r>
+      <w:r>
+        <w:rPr>
+          <w:b/>
+          <w:bCs/>
+        </w:rPr>
+        <w:t xml:space="preserve">4</w:t>
+      </w:r>
+      <w:r>
+        <w:t xml:space="preserve"> · </w:t>
+      </w:r>
+      <w:r>
+        <w:rPr>
+          <w:b/>
+          <w:bCs/>
+        </w:rPr>
+        <w:t xml:space="preserve">groove_arc</w:t>
+      </w:r>
+      <w:r>
+        <w:t xml:space="preserve"> contour · cadence </w:t>
+      </w:r>
+      <w:r>
+        <w:rPr>
+          <w:b/>
+          <w:bCs/>
+        </w:rPr>
+        <w:t xml:space="preserve">low</w:t>
+      </w:r>
+      <w:r>
+        <w:t xml:space="preserve"> · devices </w:t>
+      </w:r>
+      <w:r>
+        <w:rPr>
+          <w:b/>
+          <w:bCs/>
+        </w:rPr>
+        <w:t xml:space="preserve">`static_vamp`</w:t>
+      </w:r>
+      <w:r>
+        <w:t xml:space="preserve">, </w:t>
+      </w:r>
+      <w:r>
+        <w:rPr>
+          <w:b/>
+          <w:bCs/>
+        </w:rPr>
+        <w:t xml:space="preserve">`call_response`</w:t>
+      </w:r>
+      <w:r>
+        <w:t xml:space="preserve">, </w:t>
+      </w:r>
+      <w:r>
+        <w:rPr>
+          <w:b/>
+          <w:bCs/>
+        </w:rPr>
+        <w:t xml:space="preserve">`pentatonic_layer`</w:t>
+      </w:r>
+      <w:r>
+        <w:t xml:space="preserve">, </w:t>
+      </w:r>
+      <w:r>
+        <w:rPr>
+          <w:b/>
+          <w:bCs/>
+        </w:rPr>
+        <w:t xml:space="preserve">`parallel_horns`</w:t>
+      </w:r>
+      <w:r>
+        <w:t xml:space="preserve">, </w:t>
+      </w:r>
+      <w:r>
+        <w:rPr>
+          <w:b/>
+          <w:bCs/>
+        </w:rPr>
+        <w:t xml:space="preserve">`polymetric_grid`</w:t>
       </w:r>
       <w:r>
         <w:t xml:space="preserve">.</w:t>

</xml_diff>

<commit_message>
docs: add fallback build sequence to PLAYBOOK
Co-authored-by: Cursor <cursoragent@cursor.com>
</commit_message>
<xml_diff>
--- a/docs/COMPOSER_OS_PLAYBOOK.docx
+++ b/docs/COMPOSER_OS_PLAYBOOK.docx
@@ -45719,6 +45719,31 @@
       </w:r>
       <w:r>
         <w:t xml:space="preserve">—don’t mix manual Electron flags with the repo’s pinned versions.</w:t>
+      </w:r>
+    </w:p>
+    <w:p>
+      <w:pPr>
+        <w:pStyle w:val="Heading3"/>
+        <w:spacing w:after="80" w:before="120"/>
+      </w:pPr>
+      <w:r>
+        <w:t xml:space="preserve">Build: locked `release` tree (fallback)</w:t>
+      </w:r>
+    </w:p>
+    <w:p>
+      <w:pPr>
+        <w:spacing w:after="160"/>
+      </w:pPr>
+      <w:r>
+        <w:t xml:space="preserve">If `desktop:package-no-bump` fails due to a locked `release` tree (for example electron-builder cannot remove `release\win-unpacked\resources\app.asar`):</w:t>
+      </w:r>
+    </w:p>
+    <w:p>
+      <w:pPr>
+        <w:spacing w:after="160"/>
+      </w:pPr>
+      <w:r>
+        <w:t xml:space="preserve">1. Run `npm run desktop:build` in `apps/composer-os-desktop` (rebuilds IPC bundle). 2. Run: `electron-builder --win --config.directories.output=dist-electron-release` (from `apps/composer-os-desktop`; use the same environment as `desktop:package-no-bump`, e.g. `CSC_IDENTITY_AUTO_DISCOVERY=false` via `cross-env` if you rely on that script). 3. Copy `Composer-OS.exe` from `dist-electron-release\` over `release\Composer-OS.exe`. 4. Launch from `release\Composer-OS.exe` as normal. 5. If packaging fails again: close anything touching `release\win-unpacked`, delete or rename that folder, then rerun `npm run desktop:package-no-bump` (from `apps/composer-os-desktop`).</w:t>
       </w:r>
     </w:p>
     <w:p>

</xml_diff>

<commit_message>
docs: add Deep Harmonic Voices Guide — two-layer system, per-voice profiles, GCE impact table, combination guide, HARMONIC_RHYTHM_COMBINATIONS update
Co-authored-by: Cursor <cursoragent@cursor.com>
</commit_message>
<xml_diff>
--- a/docs/COMPOSER_OS_PLAYBOOK.docx
+++ b/docs/COMPOSER_OS_PLAYBOOK.docx
@@ -51333,6 +51333,1208 @@
       </w:r>
       <w:r>
         <w:t xml:space="preserve"> allowlist).</w:t>
+      </w:r>
+    </w:p>
+    <w:p>
+      <w:pPr>
+        <w:pStyle w:val="Heading1"/>
+        <w:spacing w:after="120" w:before="200"/>
+      </w:pPr>
+      <w:r>
+        <w:t xml:space="preserve">GCE 9.0 Engineering Roadmap</w:t>
+      </w:r>
+    </w:p>
+    <w:p>
+      <w:pPr>
+        <w:spacing w:after="160"/>
+      </w:pPr>
+      <w:r>
+        <w:t xml:space="preserve">Current benchmark (seed 50021, April 2026): 8.4/10 best, 7.9/10 worst. Universal weakness: Melodic Identity. Gap to target: 0.6-1.2 points.</w:t>
+      </w:r>
+    </w:p>
+    <w:p>
+      <w:pPr>
+        <w:spacing w:after="160"/>
+      </w:pPr>
+      <w:r>
+        <w:t xml:space="preserve">Core principle: Every generated note must be explainable by one of four authorities — motif, harmonic scene, rhythmic DNA, or form role. Notes belonging to none of these are suppressing the 9.0 ceiling.</w:t>
+      </w:r>
+    </w:p>
+    <w:p>
+      <w:pPr>
+        <w:pStyle w:val="Heading2"/>
+        <w:spacing w:after="100" w:before="160"/>
+      </w:pPr>
+      <w:r>
+        <w:t xml:space="preserve">Phase 1 — Motif Authority Layer (target: 8.4 → 8.7)</w:t>
+      </w:r>
+    </w:p>
+    <w:p>
+      <w:pPr>
+        <w:spacing w:after="160"/>
+      </w:pPr>
+      <w:r>
+        <w:t xml:space="preserve">Highest-yield single change. Directly fixes universal Melodic Identity weakness and improves Thematic Recall simultaneously.</w:t>
+      </w:r>
+    </w:p>
+    <w:p>
+      <w:pPr>
+        <w:spacing w:after="160"/>
+      </w:pPr>
+      <w:r>
+        <w:t xml:space="preserve">ThemeGenome structure per piece:</w:t>
+      </w:r>
+    </w:p>
+    <w:p>
+      <w:pPr>
+        <w:spacing w:after="80"/>
+        <w:ind w:left="360" w:hanging="260"/>
+      </w:pPr>
+      <w:r>
+        <w:t xml:space="preserve">• </w:t>
+      </w:r>
+      <w:r>
+        <w:t xml:space="preserve">2-4 primary MotifCell objects</w:t>
+      </w:r>
+    </w:p>
+    <w:p>
+      <w:pPr>
+        <w:spacing w:after="80"/>
+        <w:ind w:left="360" w:hanging="260"/>
+      </w:pPr>
+      <w:r>
+        <w:t xml:space="preserve">• </w:t>
+      </w:r>
+      <w:r>
+        <w:t xml:space="preserve">Each with: interval profile, rhythmic cell, contour code, accent map,</w:t>
+      </w:r>
+    </w:p>
+    <w:p>
+      <w:pPr>
+        <w:spacing w:after="160"/>
+      </w:pPr>
+      <w:r>
+        <w:t xml:space="preserve">register band, harmonic tolerance mask, transform budget</w:t>
+      </w:r>
+    </w:p>
+    <w:p>
+      <w:pPr>
+        <w:spacing w:after="80"/>
+        <w:ind w:left="360" w:hanging="260"/>
+      </w:pPr>
+      <w:r>
+        <w:t xml:space="preserve">• </w:t>
+      </w:r>
+      <w:r>
+        <w:t xml:space="preserve">Three linked levels: seed (raw identity), phrase-form (section variants),</w:t>
+      </w:r>
+    </w:p>
+    <w:p>
+      <w:pPr>
+        <w:spacing w:after="160"/>
+      </w:pPr>
+      <w:r>
+        <w:t xml:space="preserve">surface (rendered notes)</w:t>
+      </w:r>
+    </w:p>
+    <w:p>
+      <w:pPr>
+        <w:spacing w:after="160"/>
+      </w:pPr>
+      <w:r>
+        <w:t xml:space="preserve">MotifCell similarity scoring (S = 0.35I + 0.30R + 0.20C + 0.15G):</w:t>
+      </w:r>
+    </w:p>
+    <w:p>
+      <w:pPr>
+        <w:spacing w:after="80"/>
+        <w:ind w:left="360" w:hanging="260"/>
+      </w:pPr>
+      <w:r>
+        <w:t xml:space="preserve">• </w:t>
+      </w:r>
+      <w:r>
+        <w:t xml:space="preserve">I: interval spine similarity (35%)</w:t>
+      </w:r>
+    </w:p>
+    <w:p>
+      <w:pPr>
+        <w:spacing w:after="80"/>
+        <w:ind w:left="360" w:hanging="260"/>
+      </w:pPr>
+      <w:r>
+        <w:t xml:space="preserve">• </w:t>
+      </w:r>
+      <w:r>
+        <w:t xml:space="preserve">R: rhythmic cell similarity (30%)</w:t>
+      </w:r>
+    </w:p>
+    <w:p>
+      <w:pPr>
+        <w:spacing w:after="80"/>
+        <w:ind w:left="360" w:hanging="260"/>
+      </w:pPr>
+      <w:r>
+        <w:t xml:space="preserve">• </w:t>
+      </w:r>
+      <w:r>
+        <w:t xml:space="preserve">C: contour similarity (20%)</w:t>
+      </w:r>
+    </w:p>
+    <w:p>
+      <w:pPr>
+        <w:spacing w:after="80"/>
+        <w:ind w:left="360" w:hanging="260"/>
+      </w:pPr>
+      <w:r>
+        <w:t xml:space="preserve">• </w:t>
+      </w:r>
+      <w:r>
+        <w:t xml:space="preserve">G: register-band adherence (15%)</w:t>
+      </w:r>
+    </w:p>
+    <w:p>
+      <w:pPr>
+        <w:spacing w:after="160"/>
+      </w:pPr>
+      <w:r>
+        <w:t xml:space="preserve">Section recall contract:</w:t>
+      </w:r>
+    </w:p>
+    <w:p>
+      <w:pPr>
+        <w:spacing w:after="80"/>
+        <w:ind w:left="360" w:hanging="260"/>
+      </w:pPr>
+      <w:r>
+        <w:t xml:space="preserve">• </w:t>
+      </w:r>
+      <w:r>
+        <w:t xml:space="preserve">A section: present primary motif within first 4-8 bars</w:t>
+      </w:r>
+    </w:p>
+    <w:p>
+      <w:pPr>
+        <w:spacing w:after="80"/>
+        <w:ind w:left="360" w:hanging="260"/>
+      </w:pPr>
+      <w:r>
+        <w:t xml:space="preserve">• </w:t>
+      </w:r>
+      <w:r>
+        <w:t xml:space="preserve">A2/repeat: near-literal restatement with orchestration refresh</w:t>
+      </w:r>
+    </w:p>
+    <w:p>
+      <w:pPr>
+        <w:spacing w:after="80"/>
+        <w:ind w:left="360" w:hanging="260"/>
+      </w:pPr>
+      <w:r>
+        <w:t xml:space="preserve">• </w:t>
+      </w:r>
+      <w:r>
+        <w:t xml:space="preserve">B/bridge: transform 2+ of contour, harmonic setting, register, density</w:t>
+      </w:r>
+    </w:p>
+    <w:p>
+      <w:pPr>
+        <w:spacing w:after="80"/>
+        <w:ind w:left="360" w:hanging="260"/>
+      </w:pPr>
+      <w:r>
+        <w:t xml:space="preserve">• </w:t>
+      </w:r>
+      <w:r>
+        <w:t xml:space="preserve">Coda: recover head interval spine or rhythm spine within final 8 bars</w:t>
+      </w:r>
+    </w:p>
+    <w:p>
+      <w:pPr>
+        <w:spacing w:after="80"/>
+        <w:ind w:left="360" w:hanging="260"/>
+      </w:pPr>
+      <w:r>
+        <w:t xml:space="preserve">• </w:t>
+      </w:r>
+      <w:r>
+        <w:t xml:space="preserve">Recall quota: 55-65% of phrase starts tied to stored motif material</w:t>
+      </w:r>
+    </w:p>
+    <w:p>
+      <w:pPr>
+        <w:spacing w:after="160"/>
+      </w:pPr>
+      <w:r>
+        <w:t xml:space="preserve">Minimum architecture to move Melodic Identity 8.0 → 9.0+:</w:t>
+      </w:r>
+    </w:p>
+    <w:p>
+      <w:pPr>
+        <w:spacing w:after="80"/>
+        <w:ind w:left="360" w:hanging="260"/>
+      </w:pPr>
+      <w:r>
+        <w:t xml:space="preserve">• </w:t>
+      </w:r>
+      <w:r>
+        <w:t xml:space="preserve">One primary motif (3-7 notes)</w:t>
+      </w:r>
+    </w:p>
+    <w:p>
+      <w:pPr>
+        <w:spacing w:after="80"/>
+        <w:ind w:left="360" w:hanging="260"/>
+      </w:pPr>
+      <w:r>
+        <w:t xml:space="preserve">• </w:t>
+      </w:r>
+      <w:r>
+        <w:t xml:space="preserve">One contrast motif or cadential tail</w:t>
+      </w:r>
+    </w:p>
+    <w:p>
+      <w:pPr>
+        <w:spacing w:after="80"/>
+        <w:ind w:left="360" w:hanging="260"/>
+      </w:pPr>
+      <w:r>
+        <w:t xml:space="preserve">• </w:t>
+      </w:r>
+      <w:r>
+        <w:t xml:space="preserve">Mandatory motif at section openings, cadences, one inner-voice echo</w:t>
+      </w:r>
+    </w:p>
+    <w:p>
+      <w:pPr>
+        <w:spacing w:after="80"/>
+        <w:ind w:left="360" w:hanging="260"/>
+      </w:pPr>
+      <w:r>
+        <w:t xml:space="preserve">• </w:t>
+      </w:r>
+      <w:r>
+        <w:t xml:space="preserve">At least 3 transformations: sequence, augmentation/diminution,</w:t>
+      </w:r>
+    </w:p>
+    <w:p>
+      <w:pPr>
+        <w:spacing w:after="160"/>
+      </w:pPr>
+      <w:r>
+        <w:t xml:space="preserve">registral displacement</w:t>
+      </w:r>
+    </w:p>
+    <w:p>
+      <w:pPr>
+        <w:spacing w:after="160"/>
+      </w:pPr>
+      <w:r>
+        <w:t xml:space="preserve">Voice-specific motif defaults:</w:t>
+      </w:r>
+    </w:p>
+    <w:p>
+      <w:pPr>
+        <w:spacing w:after="80"/>
+        <w:ind w:left="360" w:hanging="260"/>
+      </w:pPr>
+      <w:r>
+        <w:t xml:space="preserve">• </w:t>
+      </w:r>
+      <w:r>
+        <w:t xml:space="preserve">Evans: sparse durations, modal interval pool, hovering neighbors,</w:t>
+      </w:r>
+    </w:p>
+    <w:p>
+      <w:pPr>
+        <w:spacing w:after="160"/>
+      </w:pPr>
+      <w:r>
+        <w:t xml:space="preserve">low attack density, wide inter-onset spacing</w:t>
+      </w:r>
+    </w:p>
+    <w:p>
+      <w:pPr>
+        <w:spacing w:after="80"/>
+        <w:ind w:left="360" w:hanging="260"/>
+      </w:pPr>
+      <w:r>
+        <w:t xml:space="preserve">• </w:t>
+      </w:r>
+      <w:r>
+        <w:t xml:space="preserve">Schneider: lyrical arcs, interval-seeded, common-tone pivots,</w:t>
+      </w:r>
+    </w:p>
+    <w:p>
+      <w:pPr>
+        <w:spacing w:after="160"/>
+      </w:pPr>
+      <w:r>
+        <w:t xml:space="preserve">longer breath units, smooth registral climbs tied to narrative growth</w:t>
+      </w:r>
+    </w:p>
+    <w:p>
+      <w:pPr>
+        <w:spacing w:after="80"/>
+        <w:ind w:left="360" w:hanging="260"/>
+      </w:pPr>
+      <w:r>
+        <w:t xml:space="preserve">• </w:t>
+      </w:r>
+      <w:r>
+        <w:t xml:space="preserve">Coltrane: short dense cells, chromatic side-slips, thirds-cycle</w:t>
+      </w:r>
+    </w:p>
+    <w:p>
+      <w:pPr>
+        <w:spacing w:after="160"/>
+      </w:pPr>
+      <w:r>
+        <w:t xml:space="preserve">compatible intervals, pentatonic fragments, sequential compression, high note density</w:t>
+      </w:r>
+    </w:p>
+    <w:p>
+      <w:pPr>
+        <w:pStyle w:val="Heading2"/>
+        <w:spacing w:after="100" w:before="160"/>
+      </w:pPr>
+      <w:r>
+        <w:t xml:space="preserve">Phase 2 — Voice Rule Compiler (target: 8.7 → 8.9)</w:t>
+      </w:r>
+    </w:p>
+    <w:p>
+      <w:pPr>
+        <w:spacing w:after="160"/>
+      </w:pPr>
+      <w:r>
+        <w:t xml:space="preserve">Replace passive context tags with compiled VoiceRuleBundle per composer. Each bundle defines: harmonicRhythm, bassPolicy, voicingPolicy, melodicPolicy, orchestrationPolicy, formPolicy, rhythmPolicy, repairPolicy.</w:t>
+      </w:r>
+    </w:p>
+    <w:p>
+      <w:pPr>
+        <w:spacing w:after="160"/>
+      </w:pPr>
+      <w:r>
+        <w:t xml:space="preserve">Gil Evans concrete rules:</w:t>
+      </w:r>
+    </w:p>
+    <w:p>
+      <w:pPr>
+        <w:spacing w:after="80"/>
+        <w:ind w:left="360" w:hanging="260"/>
+      </w:pPr>
+      <w:r>
+        <w:t xml:space="preserve">• </w:t>
+      </w:r>
+      <w:r>
+        <w:t xml:space="preserve">Harmonic rhythm: 1 sonority per 1-2 bars in A sections, 2-4 bars</w:t>
+      </w:r>
+    </w:p>
+    <w:p>
+      <w:pPr>
+        <w:spacing w:after="160"/>
+      </w:pPr>
+      <w:r>
+        <w:t xml:space="preserve">during suspended tableaux</w:t>
+      </w:r>
+    </w:p>
+    <w:p>
+      <w:pPr>
+        <w:spacing w:after="80"/>
+        <w:ind w:left="360" w:hanging="260"/>
+      </w:pPr>
+      <w:r>
+        <w:t xml:space="preserve">• </w:t>
+      </w:r>
+      <w:r>
+        <w:t xml:space="preserve">Bass: melodic counterline first; root alignment only at phrase boundary</w:t>
+      </w:r>
+    </w:p>
+    <w:p>
+      <w:pPr>
+        <w:spacing w:after="160"/>
+      </w:pPr>
+      <w:r>
+        <w:t xml:space="preserve">or cadence; 40-60% non-cadential bass notes as stepwise neighbors</w:t>
+      </w:r>
+    </w:p>
+    <w:p>
+      <w:pPr>
+        <w:spacing w:after="80"/>
+        <w:ind w:left="360" w:hanging="260"/>
+      </w:pPr>
+      <w:r>
+        <w:t xml:space="preserve">• </w:t>
+      </w:r>
+      <w:r>
+        <w:t xml:space="preserve">Voicings: bass low, 10-20 semitone gap, 4-6 notes mid-register,</w:t>
+      </w:r>
+    </w:p>
+    <w:p>
+      <w:pPr>
+        <w:spacing w:after="160"/>
+      </w:pPr>
+      <w:r>
+        <w:t xml:space="preserve">at least one adjacent second, non-root top note</w:t>
+      </w:r>
+    </w:p>
+    <w:p>
+      <w:pPr>
+        <w:spacing w:after="80"/>
+        <w:ind w:left="360" w:hanging="260"/>
+      </w:pPr>
+      <w:r>
+        <w:t xml:space="preserve">• </w:t>
+      </w:r>
+      <w:r>
+        <w:t xml:space="preserve">Chord construction: omit 5th often, omit 3rd for modal ambiguity;</w:t>
+      </w:r>
+    </w:p>
+    <w:p>
+      <w:pPr>
+        <w:spacing w:after="160"/>
+      </w:pPr>
+      <w:r>
+        <w:t xml:space="preserve">modal subsets: 1-2-3-#4-6 Lydian, 1-b2-4-5-b7 Phrygian over pedal</w:t>
+      </w:r>
+    </w:p>
+    <w:p>
+      <w:pPr>
+        <w:spacing w:after="80"/>
+        <w:ind w:left="360" w:hanging="260"/>
+      </w:pPr>
+      <w:r>
+        <w:t xml:space="preserve">• </w:t>
+      </w:r>
+      <w:r>
+        <w:t xml:space="preserve">Parallel planing allowed if modal color preserved</w:t>
+      </w:r>
+    </w:p>
+    <w:p>
+      <w:pPr>
+        <w:spacing w:after="80"/>
+        <w:ind w:left="360" w:hanging="260"/>
+      </w:pPr>
+      <w:r>
+        <w:t xml:space="preserve">• </w:t>
+      </w:r>
+      <w:r>
+        <w:t xml:space="preserve">Reject functional dominant clichés unless cadential repair requires</w:t>
+      </w:r>
+    </w:p>
+    <w:p>
+      <w:pPr>
+        <w:spacing w:after="160"/>
+      </w:pPr>
+      <w:r>
+        <w:t xml:space="preserve">Evans voicing algorithm:</w:t>
+      </w:r>
+    </w:p>
+    <w:p>
+      <w:pPr>
+        <w:spacing w:after="160"/>
+      </w:pPr>
+      <w:r>
+        <w:t xml:space="preserve">1. Choose pedal/root below C3 2. Choose modal subset of 4-5 tones 3. Place cluster center between C4 and A5 4. Enforce one top minor second or inner adjacent second 5. Mixed-family spacing, not sax soli block logic</w:t>
+      </w:r>
+    </w:p>
+    <w:p>
+      <w:pPr>
+        <w:spacing w:after="160"/>
+      </w:pPr>
+      <w:r>
+        <w:t xml:space="preserve">Maria Schneider concrete rules:</w:t>
+      </w:r>
+    </w:p>
+    <w:p>
+      <w:pPr>
+        <w:spacing w:after="80"/>
+        <w:ind w:left="360" w:hanging="260"/>
+      </w:pPr>
+      <w:r>
+        <w:t xml:space="preserve">• </w:t>
+      </w:r>
+      <w:r>
+        <w:t xml:space="preserve">Harmonic rhythm: 1 chord/bar or 2 chords across 3 bars in lyrical zones</w:t>
+      </w:r>
+    </w:p>
+    <w:p>
+      <w:pPr>
+        <w:spacing w:after="80"/>
+        <w:ind w:left="360" w:hanging="260"/>
+      </w:pPr>
+      <w:r>
+        <w:t xml:space="preserve">• </w:t>
+      </w:r>
+      <w:r>
+        <w:t xml:space="preserve">Chord morphing: mutate previous voicing by moving one voice stepwise,</w:t>
+      </w:r>
+    </w:p>
+    <w:p>
+      <w:pPr>
+        <w:spacing w:after="160"/>
+      </w:pPr>
+      <w:r>
+        <w:t xml:space="preserve">then another — never replace entire sonority</w:t>
+      </w:r>
+    </w:p>
+    <w:p>
+      <w:pPr>
+        <w:spacing w:after="80"/>
+        <w:ind w:left="360" w:hanging="260"/>
+      </w:pPr>
+      <w:r>
+        <w:t xml:space="preserve">• </w:t>
+      </w:r>
+      <w:r>
+        <w:t xml:space="preserve">Common-tone engine: identify 2 anchor tones, preserve across 1-3 events,</w:t>
+      </w:r>
+    </w:p>
+    <w:p>
+      <w:pPr>
+        <w:spacing w:after="160"/>
+      </w:pPr>
+      <w:r>
+        <w:t xml:space="preserve">reinterpret function around them</w:t>
+      </w:r>
+    </w:p>
+    <w:p>
+      <w:pPr>
+        <w:spacing w:after="80"/>
+        <w:ind w:left="360" w:hanging="260"/>
+      </w:pPr>
+      <w:r>
+        <w:t xml:space="preserve">• </w:t>
+      </w:r>
+      <w:r>
+        <w:t xml:space="preserve">Narrative arc: continuous curves for density, register ceiling,</w:t>
+      </w:r>
+    </w:p>
+    <w:p>
+      <w:pPr>
+        <w:spacing w:after="160"/>
+      </w:pPr>
+      <w:r>
+        <w:t xml:space="preserve">dissonance index, attack rate — rise together toward recapitulation</w:t>
+      </w:r>
+    </w:p>
+    <w:p>
+      <w:pPr>
+        <w:spacing w:after="80"/>
+        <w:ind w:left="360" w:hanging="260"/>
+      </w:pPr>
+      <w:r>
+        <w:t xml:space="preserve">• </w:t>
+      </w:r>
+      <w:r>
+        <w:t xml:space="preserve">Voicing: hybrid quartal/tertian, 4ths in inner voices, color tone on top</w:t>
+      </w:r>
+    </w:p>
+    <w:p>
+      <w:pPr>
+        <w:spacing w:after="160"/>
+      </w:pPr>
+      <w:r>
+        <w:t xml:space="preserve">Schneider voicing algorithm:</w:t>
+      </w:r>
+    </w:p>
+    <w:p>
+      <w:pPr>
+        <w:spacing w:after="160"/>
+      </w:pPr>
+      <w:r>
+        <w:t xml:space="preserve">1. Start from prior voicing 2. Lock common tones with highest melodic salience 3. Move remaining voices by step or minor third 4. Permit one quartal insertion in middle voices 5. Expand top register near peak; contract for recapitulation reset</w:t>
+      </w:r>
+    </w:p>
+    <w:p>
+      <w:pPr>
+        <w:spacing w:after="160"/>
+      </w:pPr>
+      <w:r>
+        <w:t xml:space="preserve">John Coltrane concrete rules:</w:t>
+      </w:r>
+    </w:p>
+    <w:p>
+      <w:pPr>
+        <w:spacing w:after="80"/>
+        <w:ind w:left="360" w:hanging="260"/>
+      </w:pPr>
+      <w:r>
+        <w:t xml:space="preserve">• </w:t>
+      </w:r>
+      <w:r>
+        <w:t xml:space="preserve">Harmonic rhythm: 2 chord events/bar minimum; up to 4 in transitions</w:t>
+      </w:r>
+    </w:p>
+    <w:p>
+      <w:pPr>
+        <w:spacing w:after="80"/>
+        <w:ind w:left="360" w:hanging="260"/>
+      </w:pPr>
+      <w:r>
+        <w:t xml:space="preserve">• </w:t>
+      </w:r>
+      <w:r>
+        <w:t xml:space="preserve">Root system: augmented-triad tonal center lattice + ii-V connectors</w:t>
+      </w:r>
+    </w:p>
+    <w:p>
+      <w:pPr>
+        <w:spacing w:after="80"/>
+        <w:ind w:left="360" w:hanging="260"/>
+      </w:pPr>
+      <w:r>
+        <w:t xml:space="preserve">• </w:t>
+      </w:r>
+      <w:r>
+        <w:t xml:space="preserve">Motif cells: 3-5 note cells from pentatonic/arpeggio, sequenced</w:t>
+      </w:r>
+    </w:p>
+    <w:p>
+      <w:pPr>
+        <w:spacing w:after="160"/>
+      </w:pPr>
+      <w:r>
+        <w:t xml:space="preserve">through cycle</w:t>
+      </w:r>
+    </w:p>
+    <w:p>
+      <w:pPr>
+        <w:spacing w:after="80"/>
+        <w:ind w:left="360" w:hanging="260"/>
+      </w:pPr>
+      <w:r>
+        <w:t xml:space="preserve">• </w:t>
+      </w:r>
+      <w:r>
+        <w:t xml:space="preserve">Sheets-of-sound: rapid arpeggio/scale hybrids implying substitutions;</w:t>
+      </w:r>
+    </w:p>
+    <w:p>
+      <w:pPr>
+        <w:spacing w:after="160"/>
+      </w:pPr>
+      <w:r>
+        <w:t xml:space="preserve">quantize phrase-start and phrase-end anchors for Phrase Grammar survival</w:t>
+      </w:r>
+    </w:p>
+    <w:p>
+      <w:pPr>
+        <w:spacing w:after="80"/>
+        <w:ind w:left="360" w:hanging="260"/>
+      </w:pPr>
+      <w:r>
+        <w:t xml:space="preserve">• </w:t>
+      </w:r>
+      <w:r>
+        <w:t xml:space="preserve">Superimposition maps: approved pentatonic by chord class stored in data</w:t>
+      </w:r>
+    </w:p>
+    <w:p>
+      <w:pPr>
+        <w:spacing w:after="160"/>
+      </w:pPr>
+      <w:r>
+        <w:t xml:space="preserve">Coltrane cell generator alternates:</w:t>
+      </w:r>
+    </w:p>
+    <w:p>
+      <w:pPr>
+        <w:spacing w:after="80"/>
+        <w:ind w:left="360" w:hanging="260"/>
+      </w:pPr>
+      <w:r>
+        <w:t xml:space="preserve">• </w:t>
+      </w:r>
+      <w:r>
+        <w:t xml:space="preserve">Chordal cell: 1-3-5-7-9</w:t>
+      </w:r>
+    </w:p>
+    <w:p>
+      <w:pPr>
+        <w:spacing w:after="80"/>
+        <w:ind w:left="360" w:hanging="260"/>
+      </w:pPr>
+      <w:r>
+        <w:t xml:space="preserve">• </w:t>
+      </w:r>
+      <w:r>
+        <w:t xml:space="preserve">Pentatonic cell: 1-2-3-5-6 or altered equivalent</w:t>
+      </w:r>
+    </w:p>
+    <w:p>
+      <w:pPr>
+        <w:spacing w:after="80"/>
+        <w:ind w:left="360" w:hanging="260"/>
+      </w:pPr>
+      <w:r>
+        <w:t xml:space="preserve">• </w:t>
+      </w:r>
+      <w:r>
+        <w:t xml:space="preserve">Symmetric connector: chromatic enclosure or diminished fragment</w:t>
+      </w:r>
+    </w:p>
+    <w:p>
+      <w:pPr>
+        <w:spacing w:after="80"/>
+        <w:ind w:left="360" w:hanging="260"/>
+      </w:pPr>
+      <w:r>
+        <w:t xml:space="preserve">• </w:t>
+      </w:r>
+      <w:r>
+        <w:t xml:space="preserve">Sequenced displacement: same cell on new thirds-cycle target</w:t>
+      </w:r>
+    </w:p>
+    <w:p>
+      <w:pPr>
+        <w:pStyle w:val="Heading2"/>
+        <w:spacing w:after="100" w:before="160"/>
+      </w:pPr>
+      <w:r>
+        <w:t xml:space="preserve">Phase 3 — Harmonic Scene Engine + Voice-Leading Solver (target: 8.9 → 9.0)</w:t>
+      </w:r>
+    </w:p>
+    <w:p>
+      <w:pPr>
+        <w:spacing w:after="160"/>
+      </w:pPr>
+      <w:r>
+        <w:t xml:space="preserve">Replace chord-label generation with harmonic scene pipeline: harmonic scene → voice-led realization → orchestration</w:t>
+      </w:r>
+    </w:p>
+    <w:p>
+      <w:pPr>
+        <w:spacing w:after="160"/>
+      </w:pPr>
+      <w:r>
+        <w:t xml:space="preserve">Scene types:</w:t>
+      </w:r>
+    </w:p>
+    <w:p>
+      <w:pPr>
+        <w:spacing w:after="80"/>
+        <w:ind w:left="360" w:hanging="260"/>
+      </w:pPr>
+      <w:r>
+        <w:t xml:space="preserve">• </w:t>
+      </w:r>
+      <w:r>
+        <w:t xml:space="preserve">functional_progression</w:t>
+      </w:r>
+    </w:p>
+    <w:p>
+      <w:pPr>
+        <w:spacing w:after="80"/>
+        <w:ind w:left="360" w:hanging="260"/>
+      </w:pPr>
+      <w:r>
+        <w:t xml:space="preserve">• </w:t>
+      </w:r>
+      <w:r>
+        <w:t xml:space="preserve">modal_pedal_scene</w:t>
+      </w:r>
+    </w:p>
+    <w:p>
+      <w:pPr>
+        <w:spacing w:after="80"/>
+        <w:ind w:left="360" w:hanging="260"/>
+      </w:pPr>
+      <w:r>
+        <w:t xml:space="preserve">• </w:t>
+      </w:r>
+      <w:r>
+        <w:t xml:space="preserve">morph_scene</w:t>
+      </w:r>
+    </w:p>
+    <w:p>
+      <w:pPr>
+        <w:spacing w:after="80"/>
+        <w:ind w:left="360" w:hanging="260"/>
+      </w:pPr>
+      <w:r>
+        <w:t xml:space="preserve">• </w:t>
+      </w:r>
+      <w:r>
+        <w:t xml:space="preserve">third_cycle_scene</w:t>
+      </w:r>
+    </w:p>
+    <w:p>
+      <w:pPr>
+        <w:spacing w:after="80"/>
+        <w:ind w:left="360" w:hanging="260"/>
+      </w:pPr>
+      <w:r>
+        <w:t xml:space="preserve">• </w:t>
+      </w:r>
+      <w:r>
+        <w:t xml:space="preserve">planed_color_scene</w:t>
+      </w:r>
+    </w:p>
+    <w:p>
+      <w:pPr>
+        <w:spacing w:after="80"/>
+        <w:ind w:left="360" w:hanging="260"/>
+      </w:pPr>
+      <w:r>
+        <w:t xml:space="preserve">• </w:t>
+      </w:r>
+      <w:r>
+        <w:t xml:space="preserve">cadential_lock_scene</w:t>
+      </w:r>
+    </w:p>
+    <w:p>
+      <w:pPr>
+        <w:spacing w:after="160"/>
+      </w:pPr>
+      <w:r>
+        <w:t xml:space="preserve">Voice-leading cost function penalties:</w:t>
+      </w:r>
+    </w:p>
+    <w:p>
+      <w:pPr>
+        <w:spacing w:after="80"/>
+        <w:ind w:left="360" w:hanging="260"/>
+      </w:pPr>
+      <w:r>
+        <w:t xml:space="preserve">• </w:t>
+      </w:r>
+      <w:r>
+        <w:t xml:space="preserve">Large leap in inner voice: +3 above 4th, +6 above 6th</w:t>
+      </w:r>
+    </w:p>
+    <w:p>
+      <w:pPr>
+        <w:spacing w:after="80"/>
+        <w:ind w:left="360" w:hanging="260"/>
+      </w:pPr>
+      <w:r>
+        <w:t xml:space="preserve">• </w:t>
+      </w:r>
+      <w:r>
+        <w:t xml:space="preserve">Parallel perfect 5ths/octaves in exposed texture: +5</w:t>
+      </w:r>
+    </w:p>
+    <w:p>
+      <w:pPr>
+        <w:spacing w:after="80"/>
+        <w:ind w:left="360" w:hanging="260"/>
+      </w:pPr>
+      <w:r>
+        <w:t xml:space="preserve">• </w:t>
+      </w:r>
+      <w:r>
+        <w:t xml:space="preserve">Lost common tone when one exists nearby: +4</w:t>
+      </w:r>
+    </w:p>
+    <w:p>
+      <w:pPr>
+        <w:spacing w:after="80"/>
+        <w:ind w:left="360" w:hanging="260"/>
+      </w:pPr>
+      <w:r>
+        <w:t xml:space="preserve">• </w:t>
+      </w:r>
+      <w:r>
+        <w:t xml:space="preserve">Unresolved tendency tone at cadence: +4</w:t>
+      </w:r>
+    </w:p>
+    <w:p>
+      <w:pPr>
+        <w:spacing w:after="80"/>
+        <w:ind w:left="360" w:hanging="260"/>
+      </w:pPr>
+      <w:r>
+        <w:t xml:space="preserve">• </w:t>
+      </w:r>
+      <w:r>
+        <w:t xml:space="preserve">Muddy cluster below register threshold: +5</w:t>
+      </w:r>
+    </w:p>
+    <w:p>
+      <w:pPr>
+        <w:spacing w:after="80"/>
+        <w:ind w:left="360" w:hanging="260"/>
+      </w:pPr>
+      <w:r>
+        <w:t xml:space="preserve">• </w:t>
+      </w:r>
+      <w:r>
+        <w:t xml:space="preserve">Stepwise contrary motion into cadence: -3 (reward)</w:t>
+      </w:r>
+    </w:p>
+    <w:p>
+      <w:pPr>
+        <w:spacing w:after="80"/>
+        <w:ind w:left="360" w:hanging="260"/>
+      </w:pPr>
+      <w:r>
+        <w:t xml:space="preserve">• </w:t>
+      </w:r>
+      <w:r>
+        <w:t xml:space="preserve">Preserved motif fragment in inner voice: -4 (reward)</w:t>
+      </w:r>
+    </w:p>
+    <w:p>
+      <w:pPr>
+        <w:spacing w:after="160"/>
+      </w:pPr>
+      <w:r>
+        <w:t xml:space="preserve">Pedal/modal drift bar-by-bar algorithm:</w:t>
+      </w:r>
+    </w:p>
+    <w:p>
+      <w:pPr>
+        <w:spacing w:after="160"/>
+      </w:pPr>
+      <w:r>
+        <w:t xml:space="preserve">1. Declare pedal anchor + expected duration range 2. Per bar: choose modal focus subset relative to pedal 3. Mutate only 1-2 upper tones per event unless at sectional seam 4. Insert cadence repair if tension exceeds threshold near ending</w:t>
+      </w:r>
+    </w:p>
+    <w:p>
+      <w:pPr>
+        <w:spacing w:after="160"/>
+      </w:pPr>
+      <w:r>
+        <w:t xml:space="preserve">Chord morphing graph: nodes = voiced sonorities, edges labeled by moved voices, semitone travel, retained common tones, dissonance delta. Evans: low-motion/high-common-tone edges. Schneider: stepwise mutation edges. Coltrane: harmonic target cycling edges regardless of voice-leading cost.</w:t>
+      </w:r>
+    </w:p>
+    <w:p>
+      <w:pPr>
+        <w:pStyle w:val="Heading2"/>
+        <w:spacing w:after="100" w:before="160"/>
+      </w:pPr>
+      <w:r>
+        <w:t xml:space="preserve">Phase 4 — RhythmDNA (target: 9.0+)</w:t>
+      </w:r>
+    </w:p>
+    <w:p>
+      <w:pPr>
+        <w:spacing w:after="160"/>
+      </w:pPr>
+      <w:r>
+        <w:t xml:space="preserve">Each preset owns a RhythmDNA: onset histogram, syncopation window, beat-avoidance pattern, tuplet tolerance, cross-rhythm palette, cadence compression profile. Motif durations sampled from DNA before pitch realization.</w:t>
+      </w:r>
+    </w:p>
+    <w:p>
+      <w:pPr>
+        <w:spacing w:after="160"/>
+      </w:pPr>
+      <w:r>
+        <w:t xml:space="preserve">Composer rhythmic defaults:</w:t>
+      </w:r>
+    </w:p>
+    <w:p>
+      <w:pPr>
+        <w:spacing w:after="80"/>
+        <w:ind w:left="360" w:hanging="260"/>
+      </w:pPr>
+      <w:r>
+        <w:t xml:space="preserve">• </w:t>
+      </w:r>
+      <w:r>
+        <w:t xml:space="preserve">Evans: floating entrances, low onset density, delayed downbeat,</w:t>
+      </w:r>
+    </w:p>
+    <w:p>
+      <w:pPr>
+        <w:spacing w:after="160"/>
+      </w:pPr>
+      <w:r>
+        <w:t xml:space="preserve">occasional bass/pad polyrhythm, slow harmony over active percussion</w:t>
+      </w:r>
+    </w:p>
+    <w:p>
+      <w:pPr>
+        <w:spacing w:after="80"/>
+        <w:ind w:left="360" w:hanging="260"/>
+      </w:pPr>
+      <w:r>
+        <w:t xml:space="preserve">• </w:t>
+      </w:r>
+      <w:r>
+        <w:t xml:space="preserve">Schneider: normative 4/8-bar hypermeter, hemiola near transitions,</w:t>
+      </w:r>
+    </w:p>
+    <w:p>
+      <w:pPr>
+        <w:spacing w:after="160"/>
+      </w:pPr>
+      <w:r>
+        <w:t xml:space="preserve">Brazilian subdivision in selected pieces, intensification aligned to Solo-Recapitulation trajectory</w:t>
+      </w:r>
+    </w:p>
+    <w:p>
+      <w:pPr>
+        <w:spacing w:after="80"/>
+        <w:ind w:left="360" w:hanging="260"/>
+      </w:pPr>
+      <w:r>
+        <w:t xml:space="preserve">• </w:t>
+      </w:r>
+      <w:r>
+        <w:t xml:space="preserve">Coltrane: high subdivision pressure, sequential cells across barlines,</w:t>
+      </w:r>
+    </w:p>
+    <w:p>
+      <w:pPr>
+        <w:spacing w:after="160"/>
+      </w:pPr>
+      <w:r>
+        <w:t xml:space="preserve">dense pickup behavior, tension through continuation not suspension</w:t>
+      </w:r>
+    </w:p>
+    <w:p>
+      <w:pPr>
+        <w:spacing w:after="160"/>
+      </w:pPr>
+      <w:r>
+        <w:t xml:space="preserve">Cross-rhythm/hemiola rules without breaking Phrase Grammar:</w:t>
+      </w:r>
+    </w:p>
+    <w:p>
+      <w:pPr>
+        <w:spacing w:after="80"/>
+        <w:ind w:left="360" w:hanging="260"/>
+      </w:pPr>
+      <w:r>
+        <w:t xml:space="preserve">• </w:t>
+      </w:r>
+      <w:r>
+        <w:t xml:space="preserve">3:2 or 2:3 overlays only when phrase accents remain legible every 2/4 bars</w:t>
+      </w:r>
+    </w:p>
+    <w:p>
+      <w:pPr>
+        <w:spacing w:after="80"/>
+        <w:ind w:left="360" w:hanging="260"/>
+      </w:pPr>
+      <w:r>
+        <w:t xml:space="preserve">• </w:t>
+      </w:r>
+      <w:r>
+        <w:t xml:space="preserve">Local hemiola windows of 1-2 bars then restore meter-confirming cadence</w:t>
+      </w:r>
+    </w:p>
+    <w:p>
+      <w:pPr>
+        <w:spacing w:after="80"/>
+        <w:ind w:left="360" w:hanging="260"/>
+      </w:pPr>
+      <w:r>
+        <w:t xml:space="preserve">• </w:t>
+      </w:r>
+      <w:r>
+        <w:t xml:space="preserve">Reject cross-rhythm obscuring cadential arrival unless harmonic lock</w:t>
+      </w:r>
+    </w:p>
+    <w:p>
+      <w:pPr>
+        <w:spacing w:after="160"/>
+      </w:pPr>
+      <w:r>
+        <w:t xml:space="preserve">and registral thinning support it</w:t>
+      </w:r>
+    </w:p>
+    <w:p>
+      <w:pPr>
+        <w:pStyle w:val="Heading2"/>
+        <w:spacing w:after="100" w:before="160"/>
+      </w:pPr>
+      <w:r>
+        <w:t xml:space="preserve">Phase 5 — Form Controller + Tension Scheduler (target: 9.0+)</w:t>
+      </w:r>
+    </w:p>
+    <w:p>
+      <w:pPr>
+        <w:spacing w:after="160"/>
+      </w:pPr>
+      <w:r>
+        <w:t xml:space="preserve">Best-scoring formal architectures: AABA, Schneider three-space trajectory, arch form with audible A-material transformation and return.</w:t>
+      </w:r>
+    </w:p>
+    <w:p>
+      <w:pPr>
+        <w:spacing w:after="160"/>
+      </w:pPr>
+      <w:r>
+        <w:t xml:space="preserve">Schneider Solo-Recapitulation model:</w:t>
+      </w:r>
+    </w:p>
+    <w:p>
+      <w:pPr>
+        <w:spacing w:after="160"/>
+      </w:pPr>
+      <w:r>
+        <w:t xml:space="preserve">1. Exposition: primary motif clear, moderate density 2. Solo: motif fragmented into accompaniment/riffs; intensity rises 3. Pre-recap: peak ensemble feature or deliberate deflation 4. Recapitulation: motif returns recognizably; softened cadence before coda</w:t>
+      </w:r>
+    </w:p>
+    <w:p>
+      <w:pPr>
+        <w:spacing w:after="160"/>
+      </w:pPr>
+      <w:r>
+        <w:t xml:space="preserve">Tension arc targets (normalized 0-1):</w:t>
+      </w:r>
+    </w:p>
+    <w:p>
+      <w:pPr>
+        <w:spacing w:after="80"/>
+        <w:ind w:left="360" w:hanging="260"/>
+      </w:pPr>
+      <w:r>
+        <w:t xml:space="preserve">• </w:t>
+      </w:r>
+      <w:r>
+        <w:t xml:space="preserve">Intro/setup: 0.20</w:t>
+      </w:r>
+    </w:p>
+    <w:p>
+      <w:pPr>
+        <w:spacing w:after="80"/>
+        <w:ind w:left="360" w:hanging="260"/>
+      </w:pPr>
+      <w:r>
+        <w:t xml:space="preserve">• </w:t>
+      </w:r>
+      <w:r>
+        <w:t xml:space="preserve">Sectional expansion: 0.45</w:t>
+      </w:r>
+    </w:p>
+    <w:p>
+      <w:pPr>
+        <w:spacing w:after="80"/>
+        <w:ind w:left="360" w:hanging="260"/>
+      </w:pPr>
+      <w:r>
+        <w:t xml:space="preserve">• </w:t>
+      </w:r>
+      <w:r>
+        <w:t xml:space="preserve">Pre-recap/bridge peak: 0.80</w:t>
+      </w:r>
+    </w:p>
+    <w:p>
+      <w:pPr>
+        <w:spacing w:after="80"/>
+        <w:ind w:left="360" w:hanging="260"/>
+      </w:pPr>
+      <w:r>
+        <w:t xml:space="preserve">• </w:t>
+      </w:r>
+      <w:r>
+        <w:t xml:space="preserve">Recapitulation reset: 0.35</w:t>
+      </w:r>
+    </w:p>
+    <w:p>
+      <w:pPr>
+        <w:spacing w:after="80"/>
+        <w:ind w:left="360" w:hanging="260"/>
+      </w:pPr>
+      <w:r>
+        <w:t xml:space="preserve">• </w:t>
+      </w:r>
+      <w:r>
+        <w:t xml:space="preserve">Final cadential bloom: 0.60 (must end below GCE final-bar tension gate)</w:t>
       </w:r>
     </w:p>
     <w:p>

</xml_diff>

<commit_message>
docs: update smoke baseline to 233/50, GCE status May 2026
Co-authored-by: Cursor <cursoragent@cursor.com>
</commit_message>
<xml_diff>
--- a/docs/COMPOSER_OS_PLAYBOOK.docx
+++ b/docs/COMPOSER_OS_PLAYBOOK.docx
@@ -51309,7 +51309,7 @@
           <w:b/>
           <w:bCs/>
         </w:rPr>
-        <w:t xml:space="preserve">157</w:t>
+        <w:t xml:space="preserve">233</w:t>
       </w:r>
       <w:r>
         <w:t xml:space="preserve"> PASS rows, </w:t>
@@ -51319,7 +51319,7 @@
           <w:b/>
           <w:bCs/>
         </w:rPr>
-        <w:t xml:space="preserve">41</w:t>
+        <w:t xml:space="preserve">50</w:t>
       </w:r>
       <w:r>
         <w:t xml:space="preserve"> suites (</w:t>
@@ -51349,7 +51349,7 @@
         <w:spacing w:after="160"/>
       </w:pPr>
       <w:r>
-        <w:t xml:space="preserve">Current benchmark (seed 50021, April 2026): 8.4/10 best, 7.9/10 worst. Universal weakness: Melodic Identity. Gap to target: 0.6-1.2 points.</w:t>
+        <w:t xml:space="preserve">Current benchmark (seed 50021, May 2026): 8.4/10 best, 7.9/10 worst. Melodic Identity (~5.7–5.9) is the universal bottleneck. Target: 8.7–8.9 overall, MI 7.5+. Universal weakness: Melodic Identity. Gap to target: 0.6-1.2 points.</w:t>
       </w:r>
     </w:p>
     <w:p>

</xml_diff>

<commit_message>
docs(playbook): seal reharm panel — all phases + LOCK fix
Co-authored-by: Cursor <cursoragent@cursor.com>
</commit_message>
<xml_diff>
--- a/docs/COMPOSER_OS_PLAYBOOK.docx
+++ b/docs/COMPOSER_OS_PLAYBOOK.docx
@@ -45606,50 +45606,90 @@
           <w:b/>
           <w:bCs/>
         </w:rPr>
-        <w:t xml:space="preserve">LOCK reality (must-read):</w:t>
-      </w:r>
-      <w:r>
-        <w:t xml:space="preserve"> Apply updates the </w:t>
-      </w:r>
-      <w:r>
-        <w:rPr>
-          <w:b/>
-          <w:bCs/>
-        </w:rPr>
-        <w:t xml:space="preserve">pasted wire</w:t>
-      </w:r>
-      <w:r>
-        <w:t xml:space="preserve">. Slice </w:t>
-      </w:r>
-      <w:r>
-        <w:rPr>
-          <w:b/>
-          <w:bCs/>
-        </w:rPr>
-        <w:t xml:space="preserve">effective harmony</w:t>
-      </w:r>
-      <w:r>
-        <w:t xml:space="preserve"> metadata may still diverge until LOCK reconciliation is wired—see code </w:t>
-      </w:r>
-      <w:r>
-        <w:rPr>
-          <w:b/>
-          <w:bCs/>
-        </w:rPr>
-        <w:t xml:space="preserve">`// TODO: LOCK reconciliation needed`</w:t>
-      </w:r>
-      <w:r>
-        <w:t xml:space="preserve"> at the apply site. Treat Apply as </w:t>
-      </w:r>
-      <w:r>
-        <w:rPr>
-          <w:b/>
-          <w:bCs/>
-        </w:rPr>
-        <w:t xml:space="preserve">authoritative paste edit</w:t>
-      </w:r>
-      <w:r>
-        <w:t xml:space="preserve">, then verify notation vs ear on the next export.</w:t>
+        <w:t xml:space="preserve">LOCK (after reconciliation):</w:t>
+      </w:r>
+      <w:r>
+        <w:t xml:space="preserve"> </w:t>
+      </w:r>
+      <w:r>
+        <w:rPr>
+          <w:b/>
+          <w:bCs/>
+        </w:rPr>
+        <w:t xml:space="preserve">Apply</w:t>
+      </w:r>
+      <w:r>
+        <w:t xml:space="preserve"> updates </w:t>
+      </w:r>
+      <w:r>
+        <w:rPr>
+          <w:b/>
+          <w:bCs/>
+        </w:rPr>
+        <w:t xml:space="preserve">`chordProgressionText`</w:t>
+      </w:r>
+      <w:r>
+        <w:t xml:space="preserve">; the following </w:t>
+      </w:r>
+      <w:r>
+        <w:rPr>
+          <w:b/>
+          <w:bCs/>
+        </w:rPr>
+        <w:t xml:space="preserve">Generate</w:t>
+      </w:r>
+      <w:r>
+        <w:t xml:space="preserve"> uses </w:t>
+      </w:r>
+      <w:r>
+        <w:rPr>
+          <w:b/>
+          <w:bCs/>
+        </w:rPr>
+        <w:t xml:space="preserve">`harmonyMode: custom`</w:t>
+      </w:r>
+      <w:r>
+        <w:t xml:space="preserve"> once when the UI would otherwise send </w:t>
+      </w:r>
+      <w:r>
+        <w:rPr>
+          <w:b/>
+          <w:bCs/>
+        </w:rPr>
+        <w:t xml:space="preserve">`custom_locked`</w:t>
+      </w:r>
+      <w:r>
+        <w:t xml:space="preserve">, so </w:t>
+      </w:r>
+      <w:r>
+        <w:rPr>
+          <w:b/>
+          <w:bCs/>
+        </w:rPr>
+        <w:t xml:space="preserve">`lockedHarmonyBarsRaw`</w:t>
+      </w:r>
+      <w:r>
+        <w:t xml:space="preserve"> / </w:t>
+      </w:r>
+      <w:r>
+        <w:rPr>
+          <w:b/>
+          <w:bCs/>
+        </w:rPr>
+        <w:t xml:space="preserve">`parsedChordBars`</w:t>
+      </w:r>
+      <w:r>
+        <w:t xml:space="preserve"> reparse from the edited text before </w:t>
+      </w:r>
+      <w:r>
+        <w:rPr>
+          <w:b/>
+          <w:bCs/>
+        </w:rPr>
+        <w:t xml:space="preserve">`assertScoreMatchesLockedHarmonyWire`</w:t>
+      </w:r>
+      <w:r>
+        <w:t xml:space="preserve">. Still verify notation vs ear in the host after export.</w:t>
       </w:r>
     </w:p>
     <w:p>

</xml_diff>

<commit_message>
docs(playbook): document 5 new composer slices + regenerate docx
Co-authored-by: Cursor <cursoragent@cursor.com>
</commit_message>
<xml_diff>
--- a/docs/COMPOSER_OS_PLAYBOOK.docx
+++ b/docs/COMPOSER_OS_PLAYBOOK.docx
@@ -19210,6 +19210,1884 @@
       </w:r>
       <w:r>
         <w:t xml:space="preserve"> pedal rows.</w:t>
+      </w:r>
+    </w:p>
+    <w:p>
+      <w:pPr>
+        <w:pStyle w:val="Heading1"/>
+        <w:spacing w:after="120" w:before="200"/>
+      </w:pPr>
+      <w:r>
+        <w:t xml:space="preserve">New Composer Slices — Shipped (Session 2)</w:t>
+      </w:r>
+    </w:p>
+    <w:p>
+      <w:pPr>
+        <w:spacing w:after="160"/>
+      </w:pPr>
+      <w:r>
+        <w:t xml:space="preserve">Five Song Mode / duo golden-path </w:t>
+      </w:r>
+      <w:r>
+        <w:rPr>
+          <w:b/>
+          <w:bCs/>
+        </w:rPr>
+        <w:t xml:space="preserve">harmony slices</w:t>
+      </w:r>
+      <w:r>
+        <w:t xml:space="preserve"> landed in one engineering batch (slice modules under </w:t>
+      </w:r>
+      <w:r>
+        <w:rPr>
+          <w:b/>
+          <w:bCs/>
+        </w:rPr>
+        <w:t xml:space="preserve">`engines/composer-os-v2/core/song-mode/`</w:t>
+      </w:r>
+      <w:r>
+        <w:t xml:space="preserve">, golden-path barrels under </w:t>
+      </w:r>
+      <w:r>
+        <w:rPr>
+          <w:b/>
+          <w:bCs/>
+        </w:rPr>
+        <w:t xml:space="preserve">`core/goldenPath/`</w:t>
+      </w:r>
+      <w:r>
+        <w:t xml:space="preserve">, </w:t>
+      </w:r>
+      <w:r>
+        <w:rPr>
+          <w:b/>
+          <w:bCs/>
+        </w:rPr>
+        <w:t xml:space="preserve">`buildReharmLensConfig`</w:t>
+      </w:r>
+      <w:r>
+        <w:t xml:space="preserve">, </w:t>
+      </w:r>
+      <w:r>
+        <w:rPr>
+          <w:b/>
+          <w:bCs/>
+        </w:rPr>
+        <w:t xml:space="preserve">`SONGWRITER_CHORD_POOLS`</w:t>
+      </w:r>
+      <w:r>
+        <w:t xml:space="preserve">, </w:t>
+      </w:r>
+      <w:r>
+        <w:rPr>
+          <w:b/>
+          <w:bCs/>
+        </w:rPr>
+        <w:t xml:space="preserve">`buildAllVaultChordRuleSets`</w:t>
+      </w:r>
+      <w:r>
+        <w:t xml:space="preserve"> phrase bias). Below: </w:t>
+      </w:r>
+      <w:r>
+        <w:rPr>
+          <w:b/>
+          <w:bCs/>
+        </w:rPr>
+        <w:t xml:space="preserve">git commit</w:t>
+      </w:r>
+      <w:r>
+        <w:t xml:space="preserve"> for the slice integration, </w:t>
+      </w:r>
+      <w:r>
+        <w:rPr>
+          <w:b/>
+          <w:bCs/>
+        </w:rPr>
+        <w:t xml:space="preserve">phase / posture</w:t>
+      </w:r>
+      <w:r>
+        <w:t xml:space="preserve">, </w:t>
+      </w:r>
+      <w:r>
+        <w:rPr>
+          <w:b/>
+          <w:bCs/>
+        </w:rPr>
+        <w:t xml:space="preserve">reharm lens triad</w:t>
+      </w:r>
+      <w:r>
+        <w:t xml:space="preserve"> (</w:t>
+      </w:r>
+      <w:r>
+        <w:rPr>
+          <w:b/>
+          <w:bCs/>
+        </w:rPr>
+        <w:t xml:space="preserve">tritoneRate</w:t>
+      </w:r>
+      <w:r>
+        <w:t xml:space="preserve">, </w:t>
+      </w:r>
+      <w:r>
+        <w:rPr>
+          <w:b/>
+          <w:bCs/>
+        </w:rPr>
+        <w:t xml:space="preserve">susBias</w:t>
+      </w:r>
+      <w:r>
+        <w:t xml:space="preserve">, </w:t>
+      </w:r>
+      <w:r>
+        <w:rPr>
+          <w:b/>
+          <w:bCs/>
+        </w:rPr>
+        <w:t xml:space="preserve">chromaticMediantBias</w:t>
+      </w:r>
+      <w:r>
+        <w:t xml:space="preserve"> where applicable), </w:t>
+      </w:r>
+      <w:r>
+        <w:rPr>
+          <w:b/>
+          <w:bCs/>
+        </w:rPr>
+        <w:t xml:space="preserve">core device</w:t>
+      </w:r>
+      <w:r>
+        <w:t xml:space="preserve">, and </w:t>
+      </w:r>
+      <w:r>
+        <w:rPr>
+          <w:b/>
+          <w:bCs/>
+        </w:rPr>
+        <w:t xml:space="preserve">phrase templates</w:t>
+      </w:r>
+      <w:r>
+        <w:t xml:space="preserve"> (research labels → vault / slice metadata).</w:t>
+      </w:r>
+    </w:p>
+    <w:p>
+      <w:pPr>
+        <w:pStyle w:val="Heading2"/>
+        <w:spacing w:after="100" w:before="160"/>
+      </w:pPr>
+      <w:r>
+        <w:t xml:space="preserve">`thelonious_monk` — **dac9251f**</w:t>
+      </w:r>
+    </w:p>
+    <w:tbl>
+      <w:tblPr>
+        <w:tblW w:type="pct" w:w="100%"/>
+        <w:tblBorders>
+          <w:top w:val="single" w:color="auto" w:sz="4"/>
+          <w:left w:val="single" w:color="auto" w:sz="4"/>
+          <w:bottom w:val="single" w:color="auto" w:sz="4"/>
+          <w:right w:val="single" w:color="auto" w:sz="4"/>
+          <w:insideH w:val="single" w:color="auto" w:sz="4"/>
+          <w:insideV w:val="single" w:color="auto" w:sz="4"/>
+        </w:tblBorders>
+      </w:tblPr>
+      <w:tblGrid>
+        <w:gridCol w:w="4500"/>
+        <w:gridCol w:w="4500"/>
+      </w:tblGrid>
+      <w:tr>
+        <w:tc>
+          <w:tcPr>
+            <w:tcW w:type="pct" w:w="4500%"/>
+          </w:tcPr>
+          <w:p>
+            <w:pPr>
+              <w:spacing w:after="60"/>
+            </w:pPr>
+            <w:r>
+              <w:t xml:space="preserve">Field</w:t>
+            </w:r>
+          </w:p>
+        </w:tc>
+        <w:tc>
+          <w:tcPr>
+            <w:tcW w:type="pct" w:w="4500%"/>
+          </w:tcPr>
+          <w:p>
+            <w:pPr>
+              <w:spacing w:after="60"/>
+            </w:pPr>
+            <w:r>
+              <w:t xml:space="preserve">Value</w:t>
+            </w:r>
+          </w:p>
+        </w:tc>
+      </w:tr>
+      <w:tr>
+        <w:tc>
+          <w:tcPr>
+            <w:tcW w:type="pct" w:w="4500%"/>
+          </w:tcPr>
+          <w:p>
+            <w:pPr>
+              <w:spacing w:after="60"/>
+            </w:pPr>
+            <w:r>
+              <w:rPr>
+                <w:b/>
+                <w:bCs/>
+              </w:rPr>
+              <w:t xml:space="preserve">Phase / posture</w:t>
+            </w:r>
+          </w:p>
+        </w:tc>
+        <w:tc>
+          <w:tcPr>
+            <w:tcW w:type="pct" w:w="4500%"/>
+          </w:tcPr>
+          <w:p>
+            <w:pPr>
+              <w:spacing w:after="60"/>
+            </w:pPr>
+            <w:r>
+              <w:t xml:space="preserve">No era phase — angular Monk grammar (</w:t>
+            </w:r>
+            <w:r>
+              <w:rPr>
+                <w:b/>
+                <w:bCs/>
+              </w:rPr>
+              <w:t xml:space="preserve">`MONK_SLICE_PARAMETERS`</w:t>
+            </w:r>
+            <w:r>
+              <w:t xml:space="preserve">).</w:t>
+            </w:r>
+          </w:p>
+        </w:tc>
+      </w:tr>
+      <w:tr>
+        <w:tc>
+          <w:tcPr>
+            <w:tcW w:type="pct" w:w="4500%"/>
+          </w:tcPr>
+          <w:p>
+            <w:pPr>
+              <w:spacing w:after="60"/>
+            </w:pPr>
+            <w:r>
+              <w:rPr>
+                <w:b/>
+                <w:bCs/>
+              </w:rPr>
+              <w:t xml:space="preserve">Tritone / sus / chromatic mediant</w:t>
+            </w:r>
+          </w:p>
+        </w:tc>
+        <w:tc>
+          <w:tcPr>
+            <w:tcW w:type="pct" w:w="4500%"/>
+          </w:tcPr>
+          <w:p>
+            <w:pPr>
+              <w:spacing w:after="60"/>
+            </w:pPr>
+            <w:r>
+              <w:rPr>
+                <w:b/>
+                <w:bCs/>
+              </w:rPr>
+              <w:t xml:space="preserve">0.35</w:t>
+            </w:r>
+            <w:r>
+              <w:t xml:space="preserve"> / </w:t>
+            </w:r>
+            <w:r>
+              <w:rPr>
+                <w:b/>
+                <w:bCs/>
+              </w:rPr>
+              <w:t xml:space="preserve">0.05</w:t>
+            </w:r>
+            <w:r>
+              <w:t xml:space="preserve"> / </w:t>
+            </w:r>
+            <w:r>
+              <w:rPr>
+                <w:b/>
+                <w:bCs/>
+              </w:rPr>
+              <w:t xml:space="preserve">0.75</w:t>
+            </w:r>
+          </w:p>
+        </w:tc>
+      </w:tr>
+      <w:tr>
+        <w:tc>
+          <w:tcPr>
+            <w:tcW w:type="pct" w:w="4500%"/>
+          </w:tcPr>
+          <w:p>
+            <w:pPr>
+              <w:spacing w:after="60"/>
+            </w:pPr>
+            <w:r>
+              <w:rPr>
+                <w:b/>
+                <w:bCs/>
+              </w:rPr>
+              <w:t xml:space="preserve">Core device</w:t>
+            </w:r>
+          </w:p>
+        </w:tc>
+        <w:tc>
+          <w:tcPr>
+            <w:tcW w:type="pct" w:w="4500%"/>
+          </w:tcPr>
+          <w:p>
+            <w:pPr>
+              <w:spacing w:after="60"/>
+            </w:pPr>
+            <w:r>
+              <w:t xml:space="preserve">♭9 dominants, tonic </w:t>
+            </w:r>
+            <w:r>
+              <w:rPr>
+                <w:b/>
+                <w:bCs/>
+              </w:rPr>
+              <w:t xml:space="preserve">maj7/#11</w:t>
+            </w:r>
+            <w:r>
+              <w:t xml:space="preserve">, strip lush stacks, deferred cadence (</w:t>
+            </w:r>
+            <w:r>
+              <w:rPr>
+                <w:b/>
+                <w:bCs/>
+              </w:rPr>
+              <w:t xml:space="preserve">`tm:*`</w:t>
+            </w:r>
+            <w:r>
+              <w:t xml:space="preserve"> receipts).</w:t>
+            </w:r>
+          </w:p>
+        </w:tc>
+      </w:tr>
+      <w:tr>
+        <w:tc>
+          <w:tcPr>
+            <w:tcW w:type="pct" w:w="4500%"/>
+          </w:tcPr>
+          <w:p>
+            <w:pPr>
+              <w:spacing w:after="60"/>
+            </w:pPr>
+            <w:r>
+              <w:rPr>
+                <w:b/>
+                <w:bCs/>
+              </w:rPr>
+              <w:t xml:space="preserve">Phrase templates</w:t>
+            </w:r>
+          </w:p>
+        </w:tc>
+        <w:tc>
+          <w:tcPr>
+            <w:tcW w:type="pct" w:w="4500%"/>
+          </w:tcPr>
+          <w:p>
+            <w:pPr>
+              <w:spacing w:after="60"/>
+            </w:pPr>
+            <w:r>
+              <w:rPr>
+                <w:b/>
+                <w:bCs/>
+              </w:rPr>
+              <w:t xml:space="preserve">`angular`</w:t>
+            </w:r>
+            <w:r>
+              <w:t xml:space="preserve">, </w:t>
+            </w:r>
+            <w:r>
+              <w:rPr>
+                <w:b/>
+                <w:bCs/>
+              </w:rPr>
+              <w:t xml:space="preserve">`displaced`</w:t>
+            </w:r>
+            <w:r>
+              <w:t xml:space="preserve"> (`vaultPhraseTemplates` / vault </w:t>
+            </w:r>
+            <w:r>
+              <w:rPr>
+                <w:b/>
+                <w:bCs/>
+              </w:rPr>
+              <w:t xml:space="preserve">`phraseTemplatesForChordTheloniousMonk`</w:t>
+            </w:r>
+            <w:r>
+              <w:t xml:space="preserve">).</w:t>
+            </w:r>
+          </w:p>
+        </w:tc>
+      </w:tr>
+    </w:tbl>
+    <w:p>
+      <w:pPr>
+        <w:spacing w:after="160"/>
+      </w:pPr>
+    </w:p>
+    <w:p>
+      <w:pPr>
+        <w:spacing w:after="160"/>
+      </w:pPr>
+      <w:r>
+        <w:t xml:space="preserve">Primary implementation: </w:t>
+      </w:r>
+      <w:r>
+        <w:rPr>
+          <w:b/>
+          <w:bCs/>
+        </w:rPr>
+        <w:t xml:space="preserve">`theloniousMonkSlice.ts`</w:t>
+      </w:r>
+      <w:r>
+        <w:t xml:space="preserve">, </w:t>
+      </w:r>
+      <w:r>
+        <w:rPr>
+          <w:b/>
+          <w:bCs/>
+        </w:rPr>
+        <w:t xml:space="preserve">`precomputeTheloniousMonkEffectiveHarmonyBars`</w:t>
+      </w:r>
+      <w:r>
+        <w:t xml:space="preserve"> → </w:t>
+      </w:r>
+      <w:r>
+        <w:rPr>
+          <w:b/>
+          <w:bCs/>
+        </w:rPr>
+        <w:t xml:space="preserve">`theloniousMonkEffectiveHarmonyBars`</w:t>
+      </w:r>
+      <w:r>
+        <w:t xml:space="preserve">. Aliases </w:t>
+      </w:r>
+      <w:r>
+        <w:rPr>
+          <w:b/>
+          <w:bCs/>
+        </w:rPr>
+        <w:t xml:space="preserve">`monk`</w:t>
+      </w:r>
+      <w:r>
+        <w:t xml:space="preserve">, </w:t>
+      </w:r>
+      <w:r>
+        <w:rPr>
+          <w:b/>
+          <w:bCs/>
+        </w:rPr>
+        <w:t xml:space="preserve">`thelonious`</w:t>
+      </w:r>
+      <w:r>
+        <w:t xml:space="preserve">.</w:t>
+      </w:r>
+    </w:p>
+    <w:p>
+      <w:pPr>
+        <w:pStyle w:val="Heading2"/>
+        <w:spacing w:after="100" w:before="160"/>
+      </w:pPr>
+      <w:r>
+        <w:t xml:space="preserve">`john_coltrane` — **3da53e5f**</w:t>
+      </w:r>
+    </w:p>
+    <w:tbl>
+      <w:tblPr>
+        <w:tblW w:type="pct" w:w="100%"/>
+        <w:tblBorders>
+          <w:top w:val="single" w:color="auto" w:sz="4"/>
+          <w:left w:val="single" w:color="auto" w:sz="4"/>
+          <w:bottom w:val="single" w:color="auto" w:sz="4"/>
+          <w:right w:val="single" w:color="auto" w:sz="4"/>
+          <w:insideH w:val="single" w:color="auto" w:sz="4"/>
+          <w:insideV w:val="single" w:color="auto" w:sz="4"/>
+        </w:tblBorders>
+      </w:tblPr>
+      <w:tblGrid>
+        <w:gridCol w:w="4500"/>
+        <w:gridCol w:w="4500"/>
+      </w:tblGrid>
+      <w:tr>
+        <w:tc>
+          <w:tcPr>
+            <w:tcW w:type="pct" w:w="4500%"/>
+          </w:tcPr>
+          <w:p>
+            <w:pPr>
+              <w:spacing w:after="60"/>
+            </w:pPr>
+            <w:r>
+              <w:t xml:space="preserve">Field</w:t>
+            </w:r>
+          </w:p>
+        </w:tc>
+        <w:tc>
+          <w:tcPr>
+            <w:tcW w:type="pct" w:w="4500%"/>
+          </w:tcPr>
+          <w:p>
+            <w:pPr>
+              <w:spacing w:after="60"/>
+            </w:pPr>
+            <w:r>
+              <w:t xml:space="preserve">Value</w:t>
+            </w:r>
+          </w:p>
+        </w:tc>
+      </w:tr>
+      <w:tr>
+        <w:tc>
+          <w:tcPr>
+            <w:tcW w:type="pct" w:w="4500%"/>
+          </w:tcPr>
+          <w:p>
+            <w:pPr>
+              <w:spacing w:after="60"/>
+            </w:pPr>
+            <w:r>
+              <w:rPr>
+                <w:b/>
+                <w:bCs/>
+              </w:rPr>
+              <w:t xml:space="preserve">Phase / posture</w:t>
+            </w:r>
+          </w:p>
+        </w:tc>
+        <w:tc>
+          <w:tcPr>
+            <w:tcW w:type="pct" w:w="4500%"/>
+          </w:tcPr>
+          <w:p>
+            <w:pPr>
+              <w:spacing w:after="60"/>
+            </w:pPr>
+            <w:r>
+              <w:rPr>
+                <w:b/>
+                <w:bCs/>
+              </w:rPr>
+              <w:t xml:space="preserve">`coltranePhase`</w:t>
+            </w:r>
+            <w:r>
+              <w:t xml:space="preserve">: </w:t>
+            </w:r>
+            <w:r>
+              <w:rPr>
+                <w:b/>
+                <w:bCs/>
+              </w:rPr>
+              <w:t xml:space="preserve">`changes`</w:t>
+            </w:r>
+            <w:r>
+              <w:t xml:space="preserve"> (dense third-cycle, default) vs </w:t>
+            </w:r>
+            <w:r>
+              <w:rPr>
+                <w:b/>
+                <w:bCs/>
+              </w:rPr>
+              <w:t xml:space="preserve">`modal`</w:t>
+            </w:r>
+            <w:r>
+              <w:t xml:space="preserve"> (long vamp / quartal) — </w:t>
+            </w:r>
+            <w:r>
+              <w:rPr>
+                <w:b/>
+                <w:bCs/>
+              </w:rPr>
+              <w:t xml:space="preserve">`COLTRANE_SLICE_PARAMETERS.defaultPhase`</w:t>
+            </w:r>
+            <w:r>
+              <w:t xml:space="preserve"> </w:t>
+            </w:r>
+            <w:r>
+              <w:rPr>
+                <w:b/>
+                <w:bCs/>
+              </w:rPr>
+              <w:t xml:space="preserve">`changes`</w:t>
+            </w:r>
+            <w:r>
+              <w:t xml:space="preserve">.</w:t>
+            </w:r>
+          </w:p>
+        </w:tc>
+      </w:tr>
+      <w:tr>
+        <w:tc>
+          <w:tcPr>
+            <w:tcW w:type="pct" w:w="4500%"/>
+          </w:tcPr>
+          <w:p>
+            <w:pPr>
+              <w:spacing w:after="60"/>
+            </w:pPr>
+            <w:r>
+              <w:rPr>
+                <w:b/>
+                <w:bCs/>
+              </w:rPr>
+              <w:t xml:space="preserve">Tritone / sus / chromatic mediant</w:t>
+            </w:r>
+          </w:p>
+        </w:tc>
+        <w:tc>
+          <w:tcPr>
+            <w:tcW w:type="pct" w:w="4500%"/>
+          </w:tcPr>
+          <w:p>
+            <w:pPr>
+              <w:spacing w:after="60"/>
+            </w:pPr>
+            <w:r>
+              <w:rPr>
+                <w:b/>
+                <w:bCs/>
+              </w:rPr>
+              <w:t xml:space="preserve">0.15</w:t>
+            </w:r>
+            <w:r>
+              <w:t xml:space="preserve"> / </w:t>
+            </w:r>
+            <w:r>
+              <w:rPr>
+                <w:b/>
+                <w:bCs/>
+              </w:rPr>
+              <w:t xml:space="preserve">0.5</w:t>
+            </w:r>
+            <w:r>
+              <w:t xml:space="preserve"> / </w:t>
+            </w:r>
+            <w:r>
+              <w:rPr>
+                <w:b/>
+                <w:bCs/>
+              </w:rPr>
+              <w:t xml:space="preserve">0.95</w:t>
+            </w:r>
+          </w:p>
+        </w:tc>
+      </w:tr>
+      <w:tr>
+        <w:tc>
+          <w:tcPr>
+            <w:tcW w:type="pct" w:w="4500%"/>
+          </w:tcPr>
+          <w:p>
+            <w:pPr>
+              <w:spacing w:after="60"/>
+            </w:pPr>
+            <w:r>
+              <w:rPr>
+                <w:b/>
+                <w:bCs/>
+              </w:rPr>
+              <w:t xml:space="preserve">Core device</w:t>
+            </w:r>
+          </w:p>
+        </w:tc>
+        <w:tc>
+          <w:tcPr>
+            <w:tcW w:type="pct" w:w="4500%"/>
+          </w:tcPr>
+          <w:p>
+            <w:pPr>
+              <w:spacing w:after="60"/>
+            </w:pPr>
+            <w:r>
+              <w:t xml:space="preserve">Three-tonic augmented cycle + optional modal quartal pedals (</w:t>
+            </w:r>
+            <w:r>
+              <w:rPr>
+                <w:b/>
+                <w:bCs/>
+              </w:rPr>
+              <w:t xml:space="preserve">`jc:*`</w:t>
+            </w:r>
+            <w:r>
+              <w:t xml:space="preserve">).</w:t>
+            </w:r>
+          </w:p>
+        </w:tc>
+      </w:tr>
+      <w:tr>
+        <w:tc>
+          <w:tcPr>
+            <w:tcW w:type="pct" w:w="4500%"/>
+          </w:tcPr>
+          <w:p>
+            <w:pPr>
+              <w:spacing w:after="60"/>
+            </w:pPr>
+            <w:r>
+              <w:rPr>
+                <w:b/>
+                <w:bCs/>
+              </w:rPr>
+              <w:t xml:space="preserve">Phrase templates</w:t>
+            </w:r>
+          </w:p>
+        </w:tc>
+        <w:tc>
+          <w:tcPr>
+            <w:tcW w:type="pct" w:w="4500%"/>
+          </w:tcPr>
+          <w:p>
+            <w:pPr>
+              <w:spacing w:after="60"/>
+            </w:pPr>
+            <w:r>
+              <w:rPr>
+                <w:b/>
+                <w:bCs/>
+              </w:rPr>
+              <w:t xml:space="preserve">`ascending_thirds`</w:t>
+            </w:r>
+            <w:r>
+              <w:t xml:space="preserve">, </w:t>
+            </w:r>
+            <w:r>
+              <w:rPr>
+                <w:b/>
+                <w:bCs/>
+              </w:rPr>
+              <w:t xml:space="preserve">`quartal`</w:t>
+            </w:r>
+            <w:r>
+              <w:t xml:space="preserve"> (`vaultPhraseTemplates`; vault </w:t>
+            </w:r>
+            <w:r>
+              <w:rPr>
+                <w:b/>
+                <w:bCs/>
+              </w:rPr>
+              <w:t xml:space="preserve">`phraseTemplatesForChordJohnColtrane`</w:t>
+            </w:r>
+            <w:r>
+              <w:t xml:space="preserve">).</w:t>
+            </w:r>
+          </w:p>
+        </w:tc>
+      </w:tr>
+    </w:tbl>
+    <w:p>
+      <w:pPr>
+        <w:spacing w:after="160"/>
+      </w:pPr>
+    </w:p>
+    <w:p>
+      <w:pPr>
+        <w:spacing w:after="160"/>
+      </w:pPr>
+      <w:r>
+        <w:t xml:space="preserve">Primary implementation: </w:t>
+      </w:r>
+      <w:r>
+        <w:rPr>
+          <w:b/>
+          <w:bCs/>
+        </w:rPr>
+        <w:t xml:space="preserve">`johnColtraneSlice.ts`</w:t>
+      </w:r>
+      <w:r>
+        <w:t xml:space="preserve">, </w:t>
+      </w:r>
+      <w:r>
+        <w:rPr>
+          <w:b/>
+          <w:bCs/>
+        </w:rPr>
+        <w:t xml:space="preserve">`precomputeJohnColtraneEffectiveHarmonyBars`</w:t>
+      </w:r>
+      <w:r>
+        <w:t xml:space="preserve"> → </w:t>
+      </w:r>
+      <w:r>
+        <w:rPr>
+          <w:b/>
+          <w:bCs/>
+        </w:rPr>
+        <w:t xml:space="preserve">`johnColtraneEffectiveHarmonyBars`</w:t>
+      </w:r>
+      <w:r>
+        <w:t xml:space="preserve">.</w:t>
+      </w:r>
+    </w:p>
+    <w:p>
+      <w:pPr>
+        <w:pStyle w:val="Heading2"/>
+        <w:spacing w:after="100" w:before="160"/>
+      </w:pPr>
+      <w:r>
+        <w:t xml:space="preserve">`herbie_hancock` — **bcffe159**</w:t>
+      </w:r>
+    </w:p>
+    <w:tbl>
+      <w:tblPr>
+        <w:tblW w:type="pct" w:w="100%"/>
+        <w:tblBorders>
+          <w:top w:val="single" w:color="auto" w:sz="4"/>
+          <w:left w:val="single" w:color="auto" w:sz="4"/>
+          <w:bottom w:val="single" w:color="auto" w:sz="4"/>
+          <w:right w:val="single" w:color="auto" w:sz="4"/>
+          <w:insideH w:val="single" w:color="auto" w:sz="4"/>
+          <w:insideV w:val="single" w:color="auto" w:sz="4"/>
+        </w:tblBorders>
+      </w:tblPr>
+      <w:tblGrid>
+        <w:gridCol w:w="4500"/>
+        <w:gridCol w:w="4500"/>
+      </w:tblGrid>
+      <w:tr>
+        <w:tc>
+          <w:tcPr>
+            <w:tcW w:type="pct" w:w="4500%"/>
+          </w:tcPr>
+          <w:p>
+            <w:pPr>
+              <w:spacing w:after="60"/>
+            </w:pPr>
+            <w:r>
+              <w:t xml:space="preserve">Field</w:t>
+            </w:r>
+          </w:p>
+        </w:tc>
+        <w:tc>
+          <w:tcPr>
+            <w:tcW w:type="pct" w:w="4500%"/>
+          </w:tcPr>
+          <w:p>
+            <w:pPr>
+              <w:spacing w:after="60"/>
+            </w:pPr>
+            <w:r>
+              <w:t xml:space="preserve">Value</w:t>
+            </w:r>
+          </w:p>
+        </w:tc>
+      </w:tr>
+      <w:tr>
+        <w:tc>
+          <w:tcPr>
+            <w:tcW w:type="pct" w:w="4500%"/>
+          </w:tcPr>
+          <w:p>
+            <w:pPr>
+              <w:spacing w:after="60"/>
+            </w:pPr>
+            <w:r>
+              <w:rPr>
+                <w:b/>
+                <w:bCs/>
+              </w:rPr>
+              <w:t xml:space="preserve">Phase / posture</w:t>
+            </w:r>
+          </w:p>
+        </w:tc>
+        <w:tc>
+          <w:tcPr>
+            <w:tcW w:type="pct" w:w="4500%"/>
+          </w:tcPr>
+          <w:p>
+            <w:pPr>
+              <w:spacing w:after="60"/>
+            </w:pPr>
+            <w:r>
+              <w:rPr>
+                <w:b/>
+                <w:bCs/>
+              </w:rPr>
+              <w:t xml:space="preserve">`hancockPhase`</w:t>
+            </w:r>
+            <w:r>
+              <w:t xml:space="preserve">: </w:t>
+            </w:r>
+            <w:r>
+              <w:rPr>
+                <w:b/>
+                <w:bCs/>
+              </w:rPr>
+              <w:t xml:space="preserve">`modal`</w:t>
+            </w:r>
+            <w:r>
+              <w:t xml:space="preserve"> (default) · </w:t>
+            </w:r>
+            <w:r>
+              <w:rPr>
+                <w:b/>
+                <w:bCs/>
+              </w:rPr>
+              <w:t xml:space="preserve">`funk`</w:t>
+            </w:r>
+            <w:r>
+              <w:t xml:space="preserve"> · </w:t>
+            </w:r>
+            <w:r>
+              <w:rPr>
+                <w:b/>
+                <w:bCs/>
+              </w:rPr>
+              <w:t xml:space="preserve">`vsop`</w:t>
+            </w:r>
+            <w:r>
+              <w:t xml:space="preserve"> — </w:t>
+            </w:r>
+            <w:r>
+              <w:rPr>
+                <w:b/>
+                <w:bCs/>
+              </w:rPr>
+              <w:t xml:space="preserve">`HANCOCK_SLICE_PARAMETERS.defaultPhase`</w:t>
+            </w:r>
+            <w:r>
+              <w:t xml:space="preserve"> </w:t>
+            </w:r>
+            <w:r>
+              <w:rPr>
+                <w:b/>
+                <w:bCs/>
+              </w:rPr>
+              <w:t xml:space="preserve">`modal`</w:t>
+            </w:r>
+            <w:r>
+              <w:t xml:space="preserve">.</w:t>
+            </w:r>
+          </w:p>
+        </w:tc>
+      </w:tr>
+      <w:tr>
+        <w:tc>
+          <w:tcPr>
+            <w:tcW w:type="pct" w:w="4500%"/>
+          </w:tcPr>
+          <w:p>
+            <w:pPr>
+              <w:spacing w:after="60"/>
+            </w:pPr>
+            <w:r>
+              <w:rPr>
+                <w:b/>
+                <w:bCs/>
+              </w:rPr>
+              <w:t xml:space="preserve">Tritone / sus / chromatic mediant</w:t>
+            </w:r>
+          </w:p>
+        </w:tc>
+        <w:tc>
+          <w:tcPr>
+            <w:tcW w:type="pct" w:w="4500%"/>
+          </w:tcPr>
+          <w:p>
+            <w:pPr>
+              <w:spacing w:after="60"/>
+            </w:pPr>
+            <w:r>
+              <w:rPr>
+                <w:b/>
+                <w:bCs/>
+              </w:rPr>
+              <w:t xml:space="preserve">0.15</w:t>
+            </w:r>
+            <w:r>
+              <w:t xml:space="preserve"> / </w:t>
+            </w:r>
+            <w:r>
+              <w:rPr>
+                <w:b/>
+                <w:bCs/>
+              </w:rPr>
+              <w:t xml:space="preserve">0.85</w:t>
+            </w:r>
+            <w:r>
+              <w:t xml:space="preserve"> / </w:t>
+            </w:r>
+            <w:r>
+              <w:rPr>
+                <w:b/>
+                <w:bCs/>
+              </w:rPr>
+              <w:t xml:space="preserve">0.6</w:t>
+            </w:r>
+          </w:p>
+        </w:tc>
+      </w:tr>
+      <w:tr>
+        <w:tc>
+          <w:tcPr>
+            <w:tcW w:type="pct" w:w="4500%"/>
+          </w:tcPr>
+          <w:p>
+            <w:pPr>
+              <w:spacing w:after="60"/>
+            </w:pPr>
+            <w:r>
+              <w:rPr>
+                <w:b/>
+                <w:bCs/>
+              </w:rPr>
+              <w:t xml:space="preserve">Core device</w:t>
+            </w:r>
+          </w:p>
+        </w:tc>
+        <w:tc>
+          <w:tcPr>
+            <w:tcW w:type="pct" w:w="4500%"/>
+          </w:tcPr>
+          <w:p>
+            <w:pPr>
+              <w:spacing w:after="60"/>
+            </w:pPr>
+            <w:r>
+              <w:t xml:space="preserve">Quartal / sus9 modal pedals, side-slip chromaticism, fusion upper-structure (</w:t>
+            </w:r>
+            <w:r>
+              <w:rPr>
+                <w:b/>
+                <w:bCs/>
+              </w:rPr>
+              <w:t xml:space="preserve">`hh:*`</w:t>
+            </w:r>
+            <w:r>
+              <w:t xml:space="preserve">).</w:t>
+            </w:r>
+          </w:p>
+        </w:tc>
+      </w:tr>
+      <w:tr>
+        <w:tc>
+          <w:tcPr>
+            <w:tcW w:type="pct" w:w="4500%"/>
+          </w:tcPr>
+          <w:p>
+            <w:pPr>
+              <w:spacing w:after="60"/>
+            </w:pPr>
+            <w:r>
+              <w:rPr>
+                <w:b/>
+                <w:bCs/>
+              </w:rPr>
+              <w:t xml:space="preserve">Phrase templates</w:t>
+            </w:r>
+          </w:p>
+        </w:tc>
+        <w:tc>
+          <w:tcPr>
+            <w:tcW w:type="pct" w:w="4500%"/>
+          </w:tcPr>
+          <w:p>
+            <w:pPr>
+              <w:spacing w:after="60"/>
+            </w:pPr>
+            <w:r>
+              <w:t xml:space="preserve">Quartal / modal pedal / side-slip — </w:t>
+            </w:r>
+            <w:r>
+              <w:rPr>
+                <w:b/>
+                <w:bCs/>
+              </w:rPr>
+              <w:t xml:space="preserve">`phraseTemplatesForChordHerbieHancock`</w:t>
+            </w:r>
+            <w:r>
+              <w:t xml:space="preserve"> (no bebop-insertion sweep).</w:t>
+            </w:r>
+          </w:p>
+        </w:tc>
+      </w:tr>
+    </w:tbl>
+    <w:p>
+      <w:pPr>
+        <w:spacing w:after="160"/>
+      </w:pPr>
+    </w:p>
+    <w:p>
+      <w:pPr>
+        <w:spacing w:after="160"/>
+      </w:pPr>
+      <w:r>
+        <w:t xml:space="preserve">Primary implementation: </w:t>
+      </w:r>
+      <w:r>
+        <w:rPr>
+          <w:b/>
+          <w:bCs/>
+        </w:rPr>
+        <w:t xml:space="preserve">`herbieHancockSlice.ts`</w:t>
+      </w:r>
+      <w:r>
+        <w:t xml:space="preserve">, barrel </w:t>
+      </w:r>
+      <w:r>
+        <w:rPr>
+          <w:b/>
+          <w:bCs/>
+        </w:rPr>
+        <w:t xml:space="preserve">`goldenPath/herbie_hancock.ts`</w:t>
+      </w:r>
+      <w:r>
+        <w:t xml:space="preserve">, </w:t>
+      </w:r>
+      <w:r>
+        <w:rPr>
+          <w:b/>
+          <w:bCs/>
+        </w:rPr>
+        <w:t xml:space="preserve">`precomputeHerbieHancockEffectiveHarmonyBars`</w:t>
+      </w:r>
+      <w:r>
+        <w:t xml:space="preserve"> → </w:t>
+      </w:r>
+      <w:r>
+        <w:rPr>
+          <w:b/>
+          <w:bCs/>
+        </w:rPr>
+        <w:t xml:space="preserve">`herbieHancockEffectiveHarmonyBars`</w:t>
+      </w:r>
+      <w:r>
+        <w:t xml:space="preserve">.</w:t>
+      </w:r>
+    </w:p>
+    <w:p>
+      <w:pPr>
+        <w:pStyle w:val="Heading2"/>
+        <w:spacing w:after="100" w:before="160"/>
+      </w:pPr>
+      <w:r>
+        <w:t xml:space="preserve">`wayne_shorter` — **ce688b70**</w:t>
+      </w:r>
+    </w:p>
+    <w:tbl>
+      <w:tblPr>
+        <w:tblW w:type="pct" w:w="100%"/>
+        <w:tblBorders>
+          <w:top w:val="single" w:color="auto" w:sz="4"/>
+          <w:left w:val="single" w:color="auto" w:sz="4"/>
+          <w:bottom w:val="single" w:color="auto" w:sz="4"/>
+          <w:right w:val="single" w:color="auto" w:sz="4"/>
+          <w:insideH w:val="single" w:color="auto" w:sz="4"/>
+          <w:insideV w:val="single" w:color="auto" w:sz="4"/>
+        </w:tblBorders>
+      </w:tblPr>
+      <w:tblGrid>
+        <w:gridCol w:w="4500"/>
+        <w:gridCol w:w="4500"/>
+      </w:tblGrid>
+      <w:tr>
+        <w:tc>
+          <w:tcPr>
+            <w:tcW w:type="pct" w:w="4500%"/>
+          </w:tcPr>
+          <w:p>
+            <w:pPr>
+              <w:spacing w:after="60"/>
+            </w:pPr>
+            <w:r>
+              <w:t xml:space="preserve">Field</w:t>
+            </w:r>
+          </w:p>
+        </w:tc>
+        <w:tc>
+          <w:tcPr>
+            <w:tcW w:type="pct" w:w="4500%"/>
+          </w:tcPr>
+          <w:p>
+            <w:pPr>
+              <w:spacing w:after="60"/>
+            </w:pPr>
+            <w:r>
+              <w:t xml:space="preserve">Value</w:t>
+            </w:r>
+          </w:p>
+        </w:tc>
+      </w:tr>
+      <w:tr>
+        <w:tc>
+          <w:tcPr>
+            <w:tcW w:type="pct" w:w="4500%"/>
+          </w:tcPr>
+          <w:p>
+            <w:pPr>
+              <w:spacing w:after="60"/>
+            </w:pPr>
+            <w:r>
+              <w:rPr>
+                <w:b/>
+                <w:bCs/>
+              </w:rPr>
+              <w:t xml:space="preserve">Phase / posture</w:t>
+            </w:r>
+          </w:p>
+        </w:tc>
+        <w:tc>
+          <w:tcPr>
+            <w:tcW w:type="pct" w:w="4500%"/>
+          </w:tcPr>
+          <w:p>
+            <w:pPr>
+              <w:spacing w:after="60"/>
+            </w:pPr>
+            <w:r>
+              <w:rPr>
+                <w:b/>
+                <w:bCs/>
+              </w:rPr>
+              <w:t xml:space="preserve">`shorterPhase`</w:t>
+            </w:r>
+            <w:r>
+              <w:t xml:space="preserve">: </w:t>
+            </w:r>
+            <w:r>
+              <w:rPr>
+                <w:b/>
+                <w:bCs/>
+              </w:rPr>
+              <w:t xml:space="preserve">`hardbop+`</w:t>
+            </w:r>
+            <w:r>
+              <w:t xml:space="preserve"> · </w:t>
+            </w:r>
+            <w:r>
+              <w:rPr>
+                <w:b/>
+                <w:bCs/>
+              </w:rPr>
+              <w:t xml:space="preserve">`mid60s`</w:t>
+            </w:r>
+            <w:r>
+              <w:t xml:space="preserve"> (default) · </w:t>
+            </w:r>
+            <w:r>
+              <w:rPr>
+                <w:b/>
+                <w:bCs/>
+              </w:rPr>
+              <w:t xml:space="preserve">`fusion`</w:t>
+            </w:r>
+            <w:r>
+              <w:t xml:space="preserve"> · </w:t>
+            </w:r>
+            <w:r>
+              <w:rPr>
+                <w:b/>
+                <w:bCs/>
+              </w:rPr>
+              <w:t xml:space="preserve">`late`</w:t>
+            </w:r>
+            <w:r>
+              <w:t xml:space="preserve"> — </w:t>
+            </w:r>
+            <w:r>
+              <w:rPr>
+                <w:b/>
+                <w:bCs/>
+              </w:rPr>
+              <w:t xml:space="preserve">`SHORTER_SLICE_PARAMETERS.defaultPhase`</w:t>
+            </w:r>
+            <w:r>
+              <w:t xml:space="preserve"> </w:t>
+            </w:r>
+            <w:r>
+              <w:rPr>
+                <w:b/>
+                <w:bCs/>
+              </w:rPr>
+              <w:t xml:space="preserve">`mid60s`</w:t>
+            </w:r>
+            <w:r>
+              <w:t xml:space="preserve">.</w:t>
+            </w:r>
+          </w:p>
+        </w:tc>
+      </w:tr>
+      <w:tr>
+        <w:tc>
+          <w:tcPr>
+            <w:tcW w:type="pct" w:w="4500%"/>
+          </w:tcPr>
+          <w:p>
+            <w:pPr>
+              <w:spacing w:after="60"/>
+            </w:pPr>
+            <w:r>
+              <w:rPr>
+                <w:b/>
+                <w:bCs/>
+              </w:rPr>
+              <w:t xml:space="preserve">Tritone / sus / chromatic mediant</w:t>
+            </w:r>
+          </w:p>
+        </w:tc>
+        <w:tc>
+          <w:tcPr>
+            <w:tcW w:type="pct" w:w="4500%"/>
+          </w:tcPr>
+          <w:p>
+            <w:pPr>
+              <w:spacing w:after="60"/>
+            </w:pPr>
+            <w:r>
+              <w:rPr>
+                <w:b/>
+                <w:bCs/>
+              </w:rPr>
+              <w:t xml:space="preserve">0.2</w:t>
+            </w:r>
+            <w:r>
+              <w:t xml:space="preserve"> / </w:t>
+            </w:r>
+            <w:r>
+              <w:rPr>
+                <w:b/>
+                <w:bCs/>
+              </w:rPr>
+              <w:t xml:space="preserve">0.45</w:t>
+            </w:r>
+            <w:r>
+              <w:t xml:space="preserve"> / </w:t>
+            </w:r>
+            <w:r>
+              <w:rPr>
+                <w:b/>
+                <w:bCs/>
+              </w:rPr>
+              <w:t xml:space="preserve">0.85</w:t>
+            </w:r>
+          </w:p>
+        </w:tc>
+      </w:tr>
+      <w:tr>
+        <w:tc>
+          <w:tcPr>
+            <w:tcW w:type="pct" w:w="4500%"/>
+          </w:tcPr>
+          <w:p>
+            <w:pPr>
+              <w:spacing w:after="60"/>
+            </w:pPr>
+            <w:r>
+              <w:rPr>
+                <w:b/>
+                <w:bCs/>
+              </w:rPr>
+              <w:t xml:space="preserve">Core device</w:t>
+            </w:r>
+          </w:p>
+        </w:tc>
+        <w:tc>
+          <w:tcPr>
+            <w:tcW w:type="pct" w:w="4500%"/>
+          </w:tcPr>
+          <w:p>
+            <w:pPr>
+              <w:spacing w:after="60"/>
+            </w:pPr>
+            <w:r>
+              <w:t xml:space="preserve">Chromatic mediant root motion + chord-scale networks; chromatic wedge (</w:t>
+            </w:r>
+            <w:r>
+              <w:rPr>
+                <w:b/>
+                <w:bCs/>
+              </w:rPr>
+              <w:t xml:space="preserve">`ws:*`</w:t>
+            </w:r>
+            <w:r>
+              <w:t xml:space="preserve"> / </w:t>
+            </w:r>
+            <w:r>
+              <w:rPr>
+                <w:b/>
+                <w:bCs/>
+              </w:rPr>
+              <w:t xml:space="preserve">`ws:wedge:*`</w:t>
+            </w:r>
+            <w:r>
+              <w:t xml:space="preserve">).</w:t>
+            </w:r>
+          </w:p>
+        </w:tc>
+      </w:tr>
+      <w:tr>
+        <w:tc>
+          <w:tcPr>
+            <w:tcW w:type="pct" w:w="4500%"/>
+          </w:tcPr>
+          <w:p>
+            <w:pPr>
+              <w:spacing w:after="60"/>
+            </w:pPr>
+            <w:r>
+              <w:rPr>
+                <w:b/>
+                <w:bCs/>
+              </w:rPr>
+              <w:t xml:space="preserve">Phrase templates</w:t>
+            </w:r>
+          </w:p>
+        </w:tc>
+        <w:tc>
+          <w:tcPr>
+            <w:tcW w:type="pct" w:w="4500%"/>
+          </w:tcPr>
+          <w:p>
+            <w:pPr>
+              <w:spacing w:after="60"/>
+            </w:pPr>
+            <w:r>
+              <w:rPr>
+                <w:b/>
+                <w:bCs/>
+              </w:rPr>
+              <w:t xml:space="preserve">`floating`</w:t>
+            </w:r>
+            <w:r>
+              <w:t xml:space="preserve"> / </w:t>
+            </w:r>
+            <w:r>
+              <w:rPr>
+                <w:b/>
+                <w:bCs/>
+              </w:rPr>
+              <w:t xml:space="preserve">`mediant_chain`</w:t>
+            </w:r>
+            <w:r>
+              <w:t xml:space="preserve"> / </w:t>
+            </w:r>
+            <w:r>
+              <w:rPr>
+                <w:b/>
+                <w:bCs/>
+              </w:rPr>
+              <w:t xml:space="preserve">`wedge_pass`</w:t>
+            </w:r>
+            <w:r>
+              <w:t xml:space="preserve"> (mapped in vault via </w:t>
+            </w:r>
+            <w:r>
+              <w:rPr>
+                <w:b/>
+                <w:bCs/>
+              </w:rPr>
+              <w:t xml:space="preserve">`phraseTemplatesForChordWayneShorter`</w:t>
+            </w:r>
+            <w:r>
+              <w:t xml:space="preserve">).</w:t>
+            </w:r>
+          </w:p>
+        </w:tc>
+      </w:tr>
+    </w:tbl>
+    <w:p>
+      <w:pPr>
+        <w:spacing w:after="160"/>
+      </w:pPr>
+    </w:p>
+    <w:p>
+      <w:pPr>
+        <w:spacing w:after="160"/>
+      </w:pPr>
+      <w:r>
+        <w:t xml:space="preserve">Primary implementation: </w:t>
+      </w:r>
+      <w:r>
+        <w:rPr>
+          <w:b/>
+          <w:bCs/>
+        </w:rPr>
+        <w:t xml:space="preserve">`wayneShorterSlice.ts`</w:t>
+      </w:r>
+      <w:r>
+        <w:t xml:space="preserve">, barrel </w:t>
+      </w:r>
+      <w:r>
+        <w:rPr>
+          <w:b/>
+          <w:bCs/>
+        </w:rPr>
+        <w:t xml:space="preserve">`goldenPath/wayne_shorter.ts`</w:t>
+      </w:r>
+      <w:r>
+        <w:t xml:space="preserve">, </w:t>
+      </w:r>
+      <w:r>
+        <w:rPr>
+          <w:b/>
+          <w:bCs/>
+        </w:rPr>
+        <w:t xml:space="preserve">`precomputeWayneShorterEffectiveHarmonyBars`</w:t>
+      </w:r>
+      <w:r>
+        <w:t xml:space="preserve"> → </w:t>
+      </w:r>
+      <w:r>
+        <w:rPr>
+          <w:b/>
+          <w:bCs/>
+        </w:rPr>
+        <w:t xml:space="preserve">`wayneShorterEffectiveHarmonyBars`</w:t>
+      </w:r>
+      <w:r>
+        <w:t xml:space="preserve">.</w:t>
+      </w:r>
+    </w:p>
+    <w:p>
+      <w:pPr>
+        <w:pStyle w:val="Heading2"/>
+        <w:spacing w:after="100" w:before="160"/>
+      </w:pPr>
+      <w:r>
+        <w:t xml:space="preserve">`andrew_hill` — **db2a3183**</w:t>
+      </w:r>
+    </w:p>
+    <w:tbl>
+      <w:tblPr>
+        <w:tblW w:type="pct" w:w="100%"/>
+        <w:tblBorders>
+          <w:top w:val="single" w:color="auto" w:sz="4"/>
+          <w:left w:val="single" w:color="auto" w:sz="4"/>
+          <w:bottom w:val="single" w:color="auto" w:sz="4"/>
+          <w:right w:val="single" w:color="auto" w:sz="4"/>
+          <w:insideH w:val="single" w:color="auto" w:sz="4"/>
+          <w:insideV w:val="single" w:color="auto" w:sz="4"/>
+        </w:tblBorders>
+      </w:tblPr>
+      <w:tblGrid>
+        <w:gridCol w:w="4500"/>
+        <w:gridCol w:w="4500"/>
+      </w:tblGrid>
+      <w:tr>
+        <w:tc>
+          <w:tcPr>
+            <w:tcW w:type="pct" w:w="4500%"/>
+          </w:tcPr>
+          <w:p>
+            <w:pPr>
+              <w:spacing w:after="60"/>
+            </w:pPr>
+            <w:r>
+              <w:t xml:space="preserve">Field</w:t>
+            </w:r>
+          </w:p>
+        </w:tc>
+        <w:tc>
+          <w:tcPr>
+            <w:tcW w:type="pct" w:w="4500%"/>
+          </w:tcPr>
+          <w:p>
+            <w:pPr>
+              <w:spacing w:after="60"/>
+            </w:pPr>
+            <w:r>
+              <w:t xml:space="preserve">Value</w:t>
+            </w:r>
+          </w:p>
+        </w:tc>
+      </w:tr>
+      <w:tr>
+        <w:tc>
+          <w:tcPr>
+            <w:tcW w:type="pct" w:w="4500%"/>
+          </w:tcPr>
+          <w:p>
+            <w:pPr>
+              <w:spacing w:after="60"/>
+            </w:pPr>
+            <w:r>
+              <w:rPr>
+                <w:b/>
+                <w:bCs/>
+              </w:rPr>
+              <w:t xml:space="preserve">Phase / posture</w:t>
+            </w:r>
+          </w:p>
+        </w:tc>
+        <w:tc>
+          <w:tcPr>
+            <w:tcW w:type="pct" w:w="4500%"/>
+          </w:tcPr>
+          <w:p>
+            <w:pPr>
+              <w:spacing w:after="60"/>
+            </w:pPr>
+            <w:r>
+              <w:rPr>
+                <w:b/>
+                <w:bCs/>
+              </w:rPr>
+              <w:t xml:space="preserve">`hillMode`</w:t>
+            </w:r>
+            <w:r>
+              <w:t xml:space="preserve">: </w:t>
+            </w:r>
+            <w:r>
+              <w:rPr>
+                <w:b/>
+                <w:bCs/>
+              </w:rPr>
+              <w:t xml:space="preserve">`postbop_free`</w:t>
+            </w:r>
+            <w:r>
+              <w:t xml:space="preserve"> (default) vs </w:t>
+            </w:r>
+            <w:r>
+              <w:rPr>
+                <w:b/>
+                <w:bCs/>
+              </w:rPr>
+              <w:t xml:space="preserve">`modal_cluster`</w:t>
+            </w:r>
+            <w:r>
+              <w:t xml:space="preserve"> — </w:t>
+            </w:r>
+            <w:r>
+              <w:rPr>
+                <w:b/>
+                <w:bCs/>
+              </w:rPr>
+              <w:t xml:space="preserve">`HILL_SLICE_PARAMETERS.defaultMode`</w:t>
+            </w:r>
+            <w:r>
+              <w:t xml:space="preserve">.</w:t>
+            </w:r>
+          </w:p>
+        </w:tc>
+      </w:tr>
+      <w:tr>
+        <w:tc>
+          <w:tcPr>
+            <w:tcW w:type="pct" w:w="4500%"/>
+          </w:tcPr>
+          <w:p>
+            <w:pPr>
+              <w:spacing w:after="60"/>
+            </w:pPr>
+            <w:r>
+              <w:rPr>
+                <w:b/>
+                <w:bCs/>
+              </w:rPr>
+              <w:t xml:space="preserve">Tritone / sus / chromatic mediant</w:t>
+            </w:r>
+          </w:p>
+        </w:tc>
+        <w:tc>
+          <w:tcPr>
+            <w:tcW w:type="pct" w:w="4500%"/>
+          </w:tcPr>
+          <w:p>
+            <w:pPr>
+              <w:spacing w:after="60"/>
+            </w:pPr>
+            <w:r>
+              <w:rPr>
+                <w:b/>
+                <w:bCs/>
+              </w:rPr>
+              <w:t xml:space="preserve">0.4</w:t>
+            </w:r>
+            <w:r>
+              <w:t xml:space="preserve"> / </w:t>
+            </w:r>
+            <w:r>
+              <w:rPr>
+                <w:b/>
+                <w:bCs/>
+              </w:rPr>
+              <w:t xml:space="preserve">0.15</w:t>
+            </w:r>
+            <w:r>
+              <w:t xml:space="preserve"> / </w:t>
+            </w:r>
+            <w:r>
+              <w:rPr>
+                <w:b/>
+                <w:bCs/>
+              </w:rPr>
+              <w:t xml:space="preserve">0.7</w:t>
+            </w:r>
+          </w:p>
+        </w:tc>
+      </w:tr>
+      <w:tr>
+        <w:tc>
+          <w:tcPr>
+            <w:tcW w:type="pct" w:w="4500%"/>
+          </w:tcPr>
+          <w:p>
+            <w:pPr>
+              <w:spacing w:after="60"/>
+            </w:pPr>
+            <w:r>
+              <w:rPr>
+                <w:b/>
+                <w:bCs/>
+              </w:rPr>
+              <w:t xml:space="preserve">Core device</w:t>
+            </w:r>
+          </w:p>
+        </w:tc>
+        <w:tc>
+          <w:tcPr>
+            <w:tcW w:type="pct" w:w="4500%"/>
+          </w:tcPr>
+          <w:p>
+            <w:pPr>
+              <w:spacing w:after="60"/>
+            </w:pPr>
+            <w:r>
+              <w:t xml:space="preserve">Hybrid cluster voicings over pitch fields; loose function (</w:t>
+            </w:r>
+            <w:r>
+              <w:rPr>
+                <w:b/>
+                <w:bCs/>
+              </w:rPr>
+              <w:t xml:space="preserve">`ah:*`</w:t>
+            </w:r>
+            <w:r>
+              <w:t xml:space="preserve">).</w:t>
+            </w:r>
+          </w:p>
+        </w:tc>
+      </w:tr>
+      <w:tr>
+        <w:tc>
+          <w:tcPr>
+            <w:tcW w:type="pct" w:w="4500%"/>
+          </w:tcPr>
+          <w:p>
+            <w:pPr>
+              <w:spacing w:after="60"/>
+            </w:pPr>
+            <w:r>
+              <w:rPr>
+                <w:b/>
+                <w:bCs/>
+              </w:rPr>
+              <w:t xml:space="preserve">Phrase templates</w:t>
+            </w:r>
+          </w:p>
+        </w:tc>
+        <w:tc>
+          <w:tcPr>
+            <w:tcW w:type="pct" w:w="4500%"/>
+          </w:tcPr>
+          <w:p>
+            <w:pPr>
+              <w:spacing w:after="60"/>
+            </w:pPr>
+            <w:r>
+              <w:rPr>
+                <w:b/>
+                <w:bCs/>
+              </w:rPr>
+              <w:t xml:space="preserve">`angular`</w:t>
+            </w:r>
+            <w:r>
+              <w:t xml:space="preserve"> / </w:t>
+            </w:r>
+            <w:r>
+              <w:rPr>
+                <w:b/>
+                <w:bCs/>
+              </w:rPr>
+              <w:t xml:space="preserve">`cluster_field`</w:t>
+            </w:r>
+            <w:r>
+              <w:t xml:space="preserve"> / </w:t>
+            </w:r>
+            <w:r>
+              <w:rPr>
+                <w:b/>
+                <w:bCs/>
+              </w:rPr>
+              <w:t xml:space="preserve">`displaced`</w:t>
+            </w:r>
+            <w:r>
+              <w:t xml:space="preserve"> (</w:t>
+            </w:r>
+            <w:r>
+              <w:rPr>
+                <w:b/>
+                <w:bCs/>
+              </w:rPr>
+              <w:t xml:space="preserve">`phraseTemplatesForChordAndrewHill`</w:t>
+            </w:r>
+            <w:r>
+              <w:t xml:space="preserve">).</w:t>
+            </w:r>
+          </w:p>
+        </w:tc>
+      </w:tr>
+    </w:tbl>
+    <w:p>
+      <w:pPr>
+        <w:spacing w:after="160"/>
+      </w:pPr>
+    </w:p>
+    <w:p>
+      <w:pPr>
+        <w:spacing w:after="160"/>
+      </w:pPr>
+      <w:r>
+        <w:t xml:space="preserve">Primary implementation: </w:t>
+      </w:r>
+      <w:r>
+        <w:rPr>
+          <w:b/>
+          <w:bCs/>
+        </w:rPr>
+        <w:t xml:space="preserve">`andrewHillSlice.ts`</w:t>
+      </w:r>
+      <w:r>
+        <w:t xml:space="preserve">, barrel </w:t>
+      </w:r>
+      <w:r>
+        <w:rPr>
+          <w:b/>
+          <w:bCs/>
+        </w:rPr>
+        <w:t xml:space="preserve">`goldenPath/andrew_hill.ts`</w:t>
+      </w:r>
+      <w:r>
+        <w:t xml:space="preserve">, </w:t>
+      </w:r>
+      <w:r>
+        <w:rPr>
+          <w:b/>
+          <w:bCs/>
+        </w:rPr>
+        <w:t xml:space="preserve">`precomputeAndrewHillEffectiveHarmonyBars`</w:t>
+      </w:r>
+      <w:r>
+        <w:t xml:space="preserve"> → </w:t>
+      </w:r>
+      <w:r>
+        <w:rPr>
+          <w:b/>
+          <w:bCs/>
+        </w:rPr>
+        <w:t xml:space="preserve">`andrewHillEffectiveHarmonyBars`</w:t>
+      </w:r>
+      <w:r>
+        <w:t xml:space="preserve">.</w:t>
       </w:r>
     </w:p>
     <w:p>

</xml_diff>

<commit_message>
docs(playbook): document Session 3 slices — reich, hall, thad, joni + regenerate docx
Co-authored-by: Cursor <cursoragent@cursor.com>
</commit_message>
<xml_diff>
--- a/docs/COMPOSER_OS_PLAYBOOK.docx
+++ b/docs/COMPOSER_OS_PLAYBOOK.docx
@@ -21085,6 +21085,2344 @@
           <w:bCs/>
         </w:rPr>
         <w:t xml:space="preserve">`andrewHillEffectiveHarmonyBars`</w:t>
+      </w:r>
+      <w:r>
+        <w:t xml:space="preserve">.</w:t>
+      </w:r>
+    </w:p>
+    <w:p>
+      <w:pPr>
+        <w:pStyle w:val="Heading1"/>
+        <w:spacing w:after="120" w:before="200"/>
+      </w:pPr>
+      <w:r>
+        <w:t xml:space="preserve">New Composer Slices — Shipped (Session 3)</w:t>
+      </w:r>
+    </w:p>
+    <w:p>
+      <w:pPr>
+        <w:spacing w:after="160"/>
+      </w:pPr>
+      <w:r>
+        <w:t xml:space="preserve">Four Song Mode / duo golden-path </w:t>
+      </w:r>
+      <w:r>
+        <w:rPr>
+          <w:b/>
+          <w:bCs/>
+        </w:rPr>
+        <w:t xml:space="preserve">harmony slices</w:t>
+      </w:r>
+      <w:r>
+        <w:t xml:space="preserve"> (plus infrastructure above): slice modules under </w:t>
+      </w:r>
+      <w:r>
+        <w:rPr>
+          <w:b/>
+          <w:bCs/>
+        </w:rPr>
+        <w:t xml:space="preserve">`engines/composer-os-v2/core/song-mode/`</w:t>
+      </w:r>
+      <w:r>
+        <w:t xml:space="preserve">, golden-path barrels </w:t>
+      </w:r>
+      <w:r>
+        <w:rPr>
+          <w:b/>
+          <w:bCs/>
+        </w:rPr>
+        <w:t xml:space="preserve">`core/goldenPath/{steve_reich,jim_hall,thad_jones,joni_mitchell}.ts`</w:t>
+      </w:r>
+      <w:r>
+        <w:t xml:space="preserve">, </w:t>
+      </w:r>
+      <w:r>
+        <w:rPr>
+          <w:b/>
+          <w:bCs/>
+        </w:rPr>
+        <w:t xml:space="preserve">`buildReharmLensConfig`</w:t>
+      </w:r>
+      <w:r>
+        <w:t xml:space="preserve">, </w:t>
+      </w:r>
+      <w:r>
+        <w:rPr>
+          <w:b/>
+          <w:bCs/>
+        </w:rPr>
+        <w:t xml:space="preserve">`SONGWRITER_CHORD_POOLS`</w:t>
+      </w:r>
+      <w:r>
+        <w:t xml:space="preserve">, </w:t>
+      </w:r>
+      <w:r>
+        <w:rPr>
+          <w:b/>
+          <w:bCs/>
+        </w:rPr>
+        <w:t xml:space="preserve">`buildAllVaultChordRuleSets`</w:t>
+      </w:r>
+      <w:r>
+        <w:t xml:space="preserve"> (`phraseTemplatesForChordSteveReich` · </w:t>
+      </w:r>
+      <w:r>
+        <w:rPr>
+          <w:b/>
+          <w:bCs/>
+        </w:rPr>
+        <w:t xml:space="preserve">`JimHall`</w:t>
+      </w:r>
+      <w:r>
+        <w:t xml:space="preserve"> · </w:t>
+      </w:r>
+      <w:r>
+        <w:rPr>
+          <w:b/>
+          <w:bCs/>
+        </w:rPr>
+        <w:t xml:space="preserve">`ThadJones`</w:t>
+      </w:r>
+      <w:r>
+        <w:t xml:space="preserve"> · </w:t>
+      </w:r>
+      <w:r>
+        <w:rPr>
+          <w:b/>
+          <w:bCs/>
+        </w:rPr>
+        <w:t xml:space="preserve">`JoniMitchellVault`</w:t>
+      </w:r>
+      <w:r>
+        <w:t xml:space="preserve">). Commits on </w:t>
+      </w:r>
+      <w:r>
+        <w:rPr>
+          <w:b/>
+          <w:bCs/>
+        </w:rPr>
+        <w:t xml:space="preserve">`main`</w:t>
+      </w:r>
+      <w:r>
+        <w:t xml:space="preserve">:</w:t>
+      </w:r>
+    </w:p>
+    <w:p>
+      <w:pPr>
+        <w:pStyle w:val="Heading2"/>
+        <w:spacing w:after="100" w:before="160"/>
+      </w:pPr>
+      <w:r>
+        <w:t xml:space="preserve">`steve_reich` — **`8b9dfad57e3b26d1055886ee4880de97feec61d3`** (short: **`8b9dfad5`**)</w:t>
+      </w:r>
+    </w:p>
+    <w:tbl>
+      <w:tblPr>
+        <w:tblW w:type="pct" w:w="100%"/>
+        <w:tblBorders>
+          <w:top w:val="single" w:color="auto" w:sz="4"/>
+          <w:left w:val="single" w:color="auto" w:sz="4"/>
+          <w:bottom w:val="single" w:color="auto" w:sz="4"/>
+          <w:right w:val="single" w:color="auto" w:sz="4"/>
+          <w:insideH w:val="single" w:color="auto" w:sz="4"/>
+          <w:insideV w:val="single" w:color="auto" w:sz="4"/>
+        </w:tblBorders>
+      </w:tblPr>
+      <w:tblGrid>
+        <w:gridCol w:w="2250"/>
+        <w:gridCol w:w="2250"/>
+        <w:gridCol w:w="2250"/>
+        <w:gridCol w:w="2250"/>
+      </w:tblGrid>
+      <w:tr>
+        <w:tc>
+          <w:tcPr>
+            <w:tcW w:type="pct" w:w="2250%"/>
+          </w:tcPr>
+          <w:p>
+            <w:pPr>
+              <w:spacing w:after="60"/>
+            </w:pPr>
+            <w:r>
+              <w:t xml:space="preserve">Field</w:t>
+            </w:r>
+          </w:p>
+        </w:tc>
+        <w:tc>
+          <w:tcPr>
+            <w:tcW w:type="pct" w:w="2250%"/>
+          </w:tcPr>
+          <w:p>
+            <w:pPr>
+              <w:spacing w:after="60"/>
+            </w:pPr>
+            <w:r>
+              <w:t xml:space="preserve">Value</w:t>
+            </w:r>
+          </w:p>
+        </w:tc>
+      </w:tr>
+      <w:tr>
+        <w:tc>
+          <w:tcPr>
+            <w:tcW w:type="pct" w:w="2250%"/>
+          </w:tcPr>
+          <w:p>
+            <w:pPr>
+              <w:spacing w:after="60"/>
+            </w:pPr>
+            <w:r>
+              <w:rPr>
+                <w:b/>
+                <w:bCs/>
+              </w:rPr>
+              <w:t xml:space="preserve">Phase / posture</w:t>
+            </w:r>
+          </w:p>
+        </w:tc>
+        <w:tc>
+          <w:tcPr>
+            <w:tcW w:type="pct" w:w="2250%"/>
+          </w:tcPr>
+          <w:p>
+            <w:pPr>
+              <w:spacing w:after="60"/>
+            </w:pPr>
+            <w:r>
+              <w:rPr>
+                <w:b/>
+                <w:bCs/>
+              </w:rPr>
+              <w:t xml:space="preserve">`reichProcess`</w:t>
+            </w:r>
+            <w:r>
+              <w:t xml:space="preserve">: </w:t>
+            </w:r>
+            <w:r>
+              <w:rPr>
+                <w:b/>
+                <w:bCs/>
+              </w:rPr>
+              <w:t xml:space="preserve">`phasing`</w:t>
+            </w:r>
+            <w:r>
+              <w:t xml:space="preserve"> (default) · </w:t>
+            </w:r>
+            <w:r>
+              <w:rPr>
+                <w:b/>
+                <w:bCs/>
+              </w:rPr>
+              <w:t xml:space="preserve">`additive`</w:t>
+            </w:r>
+            <w:r>
+              <w:t xml:space="preserve"> · </w:t>
+            </w:r>
+            <w:r>
+              <w:rPr>
+                <w:b/>
+                <w:bCs/>
+              </w:rPr>
+              <w:t xml:space="preserve">`cycle`</w:t>
+            </w:r>
+            <w:r>
+              <w:t xml:space="preserve"> — </w:t>
+            </w:r>
+            <w:r>
+              <w:rPr>
+                <w:b/>
+                <w:bCs/>
+              </w:rPr>
+              <w:t xml:space="preserve">`STEVE_REICH_SLICE_PARAMETERS.defaultProcess`</w:t>
+            </w:r>
+            <w:r>
+              <w:t xml:space="preserve"> </w:t>
+            </w:r>
+            <w:r>
+              <w:rPr>
+                <w:b/>
+                <w:bCs/>
+              </w:rPr>
+              <w:t xml:space="preserve">`phasing`</w:t>
+            </w:r>
+            <w:r>
+              <w:t xml:space="preserve">.</w:t>
+            </w:r>
+          </w:p>
+        </w:tc>
+      </w:tr>
+      <w:tr>
+        <w:tc>
+          <w:tcPr>
+            <w:tcW w:type="pct" w:w="2250%"/>
+          </w:tcPr>
+          <w:p>
+            <w:pPr>
+              <w:spacing w:after="60"/>
+            </w:pPr>
+            <w:r>
+              <w:rPr>
+                <w:b/>
+                <w:bCs/>
+              </w:rPr>
+              <w:t xml:space="preserve">Tritone / sus / chromatic mediant</w:t>
+            </w:r>
+          </w:p>
+        </w:tc>
+        <w:tc>
+          <w:tcPr>
+            <w:tcW w:type="pct" w:w="2250%"/>
+          </w:tcPr>
+          <w:p>
+            <w:pPr>
+              <w:spacing w:after="60"/>
+            </w:pPr>
+            <w:r>
+              <w:rPr>
+                <w:b/>
+                <w:bCs/>
+              </w:rPr>
+              <w:t xml:space="preserve">0.02</w:t>
+            </w:r>
+            <w:r>
+              <w:t xml:space="preserve"> / </w:t>
+            </w:r>
+            <w:r>
+              <w:rPr>
+                <w:b/>
+                <w:bCs/>
+              </w:rPr>
+              <w:t xml:space="preserve">0.4</w:t>
+            </w:r>
+            <w:r>
+              <w:t xml:space="preserve"> / </w:t>
+            </w:r>
+            <w:r>
+              <w:rPr>
+                <w:b/>
+                <w:bCs/>
+              </w:rPr>
+              <w:t xml:space="preserve">0.05</w:t>
+            </w:r>
+          </w:p>
+        </w:tc>
+      </w:tr>
+      <w:tr>
+        <w:tc>
+          <w:tcPr>
+            <w:tcW w:type="pct" w:w="2250%"/>
+          </w:tcPr>
+          <w:p>
+            <w:pPr>
+              <w:spacing w:after="60"/>
+            </w:pPr>
+            <w:r>
+              <w:rPr>
+                <w:b/>
+                <w:bCs/>
+              </w:rPr>
+              <w:t xml:space="preserve">Static dominant bias</w:t>
+            </w:r>
+          </w:p>
+        </w:tc>
+        <w:tc>
+          <w:tcPr>
+            <w:tcW w:type="pct" w:w="2250%"/>
+          </w:tcPr>
+          <w:p>
+            <w:pPr>
+              <w:spacing w:after="60"/>
+            </w:pPr>
+            <w:r>
+              <w:rPr>
+                <w:b/>
+                <w:bCs/>
+              </w:rPr>
+              <w:t xml:space="preserve">0.95</w:t>
+            </w:r>
+            <w:r>
+              <w:t xml:space="preserve"> (long pedal / slow functional motion in lens terms).</w:t>
+            </w:r>
+          </w:p>
+        </w:tc>
+      </w:tr>
+      <w:tr>
+        <w:tc>
+          <w:tcPr>
+            <w:tcW w:type="pct" w:w="2250%"/>
+          </w:tcPr>
+          <w:p>
+            <w:pPr>
+              <w:spacing w:after="60"/>
+            </w:pPr>
+            <w:r>
+              <w:rPr>
+                <w:b/>
+                <w:bCs/>
+              </w:rPr>
+              <w:t xml:space="preserve">Core device</w:t>
+            </w:r>
+          </w:p>
+        </w:tc>
+        <w:tc>
+          <w:tcPr>
+            <w:tcW w:type="pct" w:w="2250%"/>
+          </w:tcPr>
+          <w:p>
+            <w:pPr>
+              <w:spacing w:after="60"/>
+            </w:pPr>
+            <w:r>
+              <w:rPr>
+                <w:b/>
+                <w:bCs/>
+              </w:rPr>
+              <w:t xml:space="preserve">`pitch_field_process`</w:t>
+            </w:r>
+            <w:r>
+              <w:t xml:space="preserve"> — one diatonic field + rhythmic/phasing process (</w:t>
+            </w:r>
+            <w:r>
+              <w:rPr>
+                <w:b/>
+                <w:bCs/>
+              </w:rPr>
+              <w:t xml:space="preserve">`sr:*`</w:t>
+            </w:r>
+            <w:r>
+              <w:t xml:space="preserve">); </w:t>
+            </w:r>
+            <w:r>
+              <w:rPr>
+                <w:b/>
+                <w:bCs/>
+              </w:rPr>
+              <w:t xml:space="preserve">not</w:t>
+            </w:r>
+            <w:r>
+              <w:t xml:space="preserve"> Glass-like modular chord streams (</w:t>
+            </w:r>
+            <w:r>
+              <w:rPr>
+                <w:b/>
+                <w:bCs/>
+              </w:rPr>
+              <w:t xml:space="preserve">distinction:</w:t>
+            </w:r>
+            <w:r>
+              <w:t xml:space="preserve"> Glass = more changes + sequences; Reich = single field + process).</w:t>
+            </w:r>
+          </w:p>
+        </w:tc>
+      </w:tr>
+      <w:tr>
+        <w:tc>
+          <w:tcPr>
+            <w:tcW w:type="pct" w:w="2250%"/>
+          </w:tcPr>
+          <w:p>
+            <w:pPr>
+              <w:spacing w:after="60"/>
+            </w:pPr>
+            <w:r>
+              <w:rPr>
+                <w:b/>
+                <w:bCs/>
+              </w:rPr>
+              <w:t xml:space="preserve">Phrase templates (research → vault)</w:t>
+            </w:r>
+          </w:p>
+        </w:tc>
+        <w:tc>
+          <w:tcPr>
+            <w:tcW w:type="pct" w:w="2250%"/>
+          </w:tcPr>
+          <w:p>
+            <w:pPr>
+              <w:spacing w:after="60"/>
+            </w:pPr>
+            <w:r>
+              <w:t xml:space="preserve">**`additive_build` \</w:t>
+            </w:r>
+          </w:p>
+        </w:tc>
+        <w:tc>
+          <w:tcPr>
+            <w:tcW w:type="pct" w:w="2250%"/>
+          </w:tcPr>
+          <w:p>
+            <w:pPr>
+              <w:spacing w:after="60"/>
+            </w:pPr>
+            <w:r>
+              <w:t xml:space="preserve">`phase_drift` \</w:t>
+            </w:r>
+          </w:p>
+        </w:tc>
+        <w:tc>
+          <w:tcPr>
+            <w:tcW w:type="pct" w:w="2250%"/>
+          </w:tcPr>
+          <w:p>
+            <w:pPr>
+              <w:spacing w:after="60"/>
+            </w:pPr>
+            <w:r>
+              <w:t xml:space="preserve">`drone_field`</w:t>
+            </w:r>
+            <w:r>
+              <w:rPr>
+                <w:b/>
+                <w:bCs/>
+              </w:rPr>
+              <w:t xml:space="preserve"> — vault prefers </w:t>
+            </w:r>
+            <w:r>
+              <w:t xml:space="preserve">`modal_pedal`</w:t>
+            </w:r>
+            <w:r>
+              <w:rPr>
+                <w:b/>
+                <w:bCs/>
+              </w:rPr>
+              <w:t xml:space="preserve">, </w:t>
+            </w:r>
+            <w:r>
+              <w:t xml:space="preserve">`quartal`</w:t>
+            </w:r>
+            <w:r>
+              <w:rPr>
+                <w:b/>
+                <w:bCs/>
+              </w:rPr>
+              <w:t xml:space="preserve">, </w:t>
+            </w:r>
+            <w:r>
+              <w:t xml:space="preserve">`triad-sweep`</w:t>
+            </w:r>
+            <w:r>
+              <w:rPr>
+                <w:b/>
+                <w:bCs/>
+              </w:rPr>
+              <w:t xml:space="preserve">, </w:t>
+            </w:r>
+            <w:r>
+              <w:t xml:space="preserve">`dyad-bounce`</w:t>
+            </w:r>
+            <w:r>
+              <w:rPr>
+                <w:b/>
+                <w:bCs/>
+              </w:rPr>
+              <w:t xml:space="preserve">, </w:t>
+            </w:r>
+            <w:r>
+              <w:t xml:space="preserve">`side_slip`</w:t>
+            </w:r>
+            <w:r>
+              <w:rPr>
+                <w:b/>
+                <w:bCs/>
+              </w:rPr>
+              <w:t xml:space="preserve">; strips </w:t>
+            </w:r>
+            <w:r>
+              <w:t xml:space="preserve">`bebop-insertion`</w:t>
+            </w:r>
+            <w:r>
+              <w:rPr>
+                <w:b/>
+                <w:bCs/>
+              </w:rPr>
+              <w:t xml:space="preserve"> / </w:t>
+            </w:r>
+            <w:r>
+              <w:t xml:space="preserve">`liquid-resolution`**.</w:t>
+            </w:r>
+          </w:p>
+        </w:tc>
+      </w:tr>
+    </w:tbl>
+    <w:p>
+      <w:pPr>
+        <w:spacing w:after="160"/>
+      </w:pPr>
+    </w:p>
+    <w:p>
+      <w:pPr>
+        <w:spacing w:after="160"/>
+      </w:pPr>
+      <w:r>
+        <w:t xml:space="preserve">Primary implementation: </w:t>
+      </w:r>
+      <w:r>
+        <w:rPr>
+          <w:b/>
+          <w:bCs/>
+        </w:rPr>
+        <w:t xml:space="preserve">`steveReichSlice.ts`</w:t>
+      </w:r>
+      <w:r>
+        <w:t xml:space="preserve">, </w:t>
+      </w:r>
+      <w:r>
+        <w:rPr>
+          <w:b/>
+          <w:bCs/>
+        </w:rPr>
+        <w:t xml:space="preserve">`precomputeSteveReichEffectiveHarmonyBars`</w:t>
+      </w:r>
+      <w:r>
+        <w:t xml:space="preserve"> → </w:t>
+      </w:r>
+      <w:r>
+        <w:rPr>
+          <w:b/>
+          <w:bCs/>
+        </w:rPr>
+        <w:t xml:space="preserve">`steveReichEffectiveHarmonyBars`</w:t>
+      </w:r>
+      <w:r>
+        <w:t xml:space="preserve">. </w:t>
+      </w:r>
+      <w:r>
+        <w:rPr>
+          <w:b/>
+          <w:bCs/>
+        </w:rPr>
+        <w:t xml:space="preserve">Closest neighbour:</w:t>
+      </w:r>
+      <w:r>
+        <w:t xml:space="preserve"> </w:t>
+      </w:r>
+      <w:r>
+        <w:rPr>
+          <w:b/>
+          <w:bCs/>
+        </w:rPr>
+        <w:t xml:space="preserve">`philip_glass`</w:t>
+      </w:r>
+      <w:r>
+        <w:t xml:space="preserve"> — Reich keeps </w:t>
+      </w:r>
+      <w:r>
+        <w:rPr>
+          <w:b/>
+          <w:bCs/>
+        </w:rPr>
+        <w:t xml:space="preserve">high pulse density under one field</w:t>
+      </w:r>
+      <w:r>
+        <w:t xml:space="preserve"> vs Glass </w:t>
+      </w:r>
+      <w:r>
+        <w:rPr>
+          <w:b/>
+          <w:bCs/>
+        </w:rPr>
+        <w:t xml:space="preserve">modular harmonic rhythm</w:t>
+      </w:r>
+      <w:r>
+        <w:t xml:space="preserve">; </w:t>
+      </w:r>
+      <w:r>
+        <w:rPr>
+          <w:b/>
+          <w:bCs/>
+        </w:rPr>
+        <w:t xml:space="preserve">`arvo_part`</w:t>
+      </w:r>
+      <w:r>
+        <w:t xml:space="preserve"> — tintinnabuli / silence grid vs Reich </w:t>
+      </w:r>
+      <w:r>
+        <w:rPr>
+          <w:b/>
+          <w:bCs/>
+        </w:rPr>
+        <w:t xml:space="preserve">rhythm-busy process</w:t>
+      </w:r>
+      <w:r>
+        <w:t xml:space="preserve">.</w:t>
+      </w:r>
+    </w:p>
+    <w:p>
+      <w:pPr>
+        <w:pStyle w:val="Heading2"/>
+        <w:spacing w:after="100" w:before="160"/>
+      </w:pPr>
+      <w:r>
+        <w:t xml:space="preserve">`jim_hall` — **`f516d22d56c51777e7214152a775dba93436fa6e`** (short: **`f516d22d`**)</w:t>
+      </w:r>
+    </w:p>
+    <w:tbl>
+      <w:tblPr>
+        <w:tblW w:type="pct" w:w="100%"/>
+        <w:tblBorders>
+          <w:top w:val="single" w:color="auto" w:sz="4"/>
+          <w:left w:val="single" w:color="auto" w:sz="4"/>
+          <w:bottom w:val="single" w:color="auto" w:sz="4"/>
+          <w:right w:val="single" w:color="auto" w:sz="4"/>
+          <w:insideH w:val="single" w:color="auto" w:sz="4"/>
+          <w:insideV w:val="single" w:color="auto" w:sz="4"/>
+        </w:tblBorders>
+      </w:tblPr>
+      <w:tblGrid>
+        <w:gridCol w:w="2250"/>
+        <w:gridCol w:w="2250"/>
+        <w:gridCol w:w="2250"/>
+        <w:gridCol w:w="2250"/>
+      </w:tblGrid>
+      <w:tr>
+        <w:tc>
+          <w:tcPr>
+            <w:tcW w:type="pct" w:w="2250%"/>
+          </w:tcPr>
+          <w:p>
+            <w:pPr>
+              <w:spacing w:after="60"/>
+            </w:pPr>
+            <w:r>
+              <w:t xml:space="preserve">Field</w:t>
+            </w:r>
+          </w:p>
+        </w:tc>
+        <w:tc>
+          <w:tcPr>
+            <w:tcW w:type="pct" w:w="2250%"/>
+          </w:tcPr>
+          <w:p>
+            <w:pPr>
+              <w:spacing w:after="60"/>
+            </w:pPr>
+            <w:r>
+              <w:t xml:space="preserve">Value</w:t>
+            </w:r>
+          </w:p>
+        </w:tc>
+      </w:tr>
+      <w:tr>
+        <w:tc>
+          <w:tcPr>
+            <w:tcW w:type="pct" w:w="2250%"/>
+          </w:tcPr>
+          <w:p>
+            <w:pPr>
+              <w:spacing w:after="60"/>
+            </w:pPr>
+            <w:r>
+              <w:rPr>
+                <w:b/>
+                <w:bCs/>
+              </w:rPr>
+              <w:t xml:space="preserve">Phase / posture</w:t>
+            </w:r>
+          </w:p>
+        </w:tc>
+        <w:tc>
+          <w:tcPr>
+            <w:tcW w:type="pct" w:w="2250%"/>
+          </w:tcPr>
+          <w:p>
+            <w:pPr>
+              <w:spacing w:after="60"/>
+            </w:pPr>
+            <w:r>
+              <w:rPr>
+                <w:b/>
+                <w:bCs/>
+              </w:rPr>
+              <w:t xml:space="preserve">`jimHallMode`</w:t>
+            </w:r>
+            <w:r>
+              <w:t xml:space="preserve">: </w:t>
+            </w:r>
+            <w:r>
+              <w:rPr>
+                <w:b/>
+                <w:bCs/>
+              </w:rPr>
+              <w:t xml:space="preserve">`duo`</w:t>
+            </w:r>
+            <w:r>
+              <w:t xml:space="preserve"> (default) · </w:t>
+            </w:r>
+            <w:r>
+              <w:rPr>
+                <w:b/>
+                <w:bCs/>
+              </w:rPr>
+              <w:t xml:space="preserve">`trio`</w:t>
+            </w:r>
+            <w:r>
+              <w:t xml:space="preserve"> · </w:t>
+            </w:r>
+            <w:r>
+              <w:rPr>
+                <w:b/>
+                <w:bCs/>
+              </w:rPr>
+              <w:t xml:space="preserve">`solo`</w:t>
+            </w:r>
+            <w:r>
+              <w:t xml:space="preserve"> — </w:t>
+            </w:r>
+            <w:r>
+              <w:rPr>
+                <w:b/>
+                <w:bCs/>
+              </w:rPr>
+              <w:t xml:space="preserve">`JIM_HALL_SLICE_PARAMETERS.defaultMode`</w:t>
+            </w:r>
+            <w:r>
+              <w:t xml:space="preserve"> </w:t>
+            </w:r>
+            <w:r>
+              <w:rPr>
+                <w:b/>
+                <w:bCs/>
+              </w:rPr>
+              <w:t xml:space="preserve">`duo`</w:t>
+            </w:r>
+            <w:r>
+              <w:t xml:space="preserve">.</w:t>
+            </w:r>
+          </w:p>
+        </w:tc>
+      </w:tr>
+      <w:tr>
+        <w:tc>
+          <w:tcPr>
+            <w:tcW w:type="pct" w:w="2250%"/>
+          </w:tcPr>
+          <w:p>
+            <w:pPr>
+              <w:spacing w:after="60"/>
+            </w:pPr>
+            <w:r>
+              <w:rPr>
+                <w:b/>
+                <w:bCs/>
+              </w:rPr>
+              <w:t xml:space="preserve">Tritone / sus / chromatic mediant</w:t>
+            </w:r>
+          </w:p>
+        </w:tc>
+        <w:tc>
+          <w:tcPr>
+            <w:tcW w:type="pct" w:w="2250%"/>
+          </w:tcPr>
+          <w:p>
+            <w:pPr>
+              <w:spacing w:after="60"/>
+            </w:pPr>
+            <w:r>
+              <w:rPr>
+                <w:b/>
+                <w:bCs/>
+              </w:rPr>
+              <w:t xml:space="preserve">0.25</w:t>
+            </w:r>
+            <w:r>
+              <w:t xml:space="preserve"> / </w:t>
+            </w:r>
+            <w:r>
+              <w:rPr>
+                <w:b/>
+                <w:bCs/>
+              </w:rPr>
+              <w:t xml:space="preserve">0.3</w:t>
+            </w:r>
+            <w:r>
+              <w:t xml:space="preserve"> / </w:t>
+            </w:r>
+            <w:r>
+              <w:rPr>
+                <w:b/>
+                <w:bCs/>
+              </w:rPr>
+              <w:t xml:space="preserve">0.35</w:t>
+            </w:r>
+          </w:p>
+        </w:tc>
+      </w:tr>
+      <w:tr>
+        <w:tc>
+          <w:tcPr>
+            <w:tcW w:type="pct" w:w="2250%"/>
+          </w:tcPr>
+          <w:p>
+            <w:pPr>
+              <w:spacing w:after="60"/>
+            </w:pPr>
+            <w:r>
+              <w:rPr>
+                <w:b/>
+                <w:bCs/>
+              </w:rPr>
+              <w:t xml:space="preserve">Static dominant bias</w:t>
+            </w:r>
+          </w:p>
+        </w:tc>
+        <w:tc>
+          <w:tcPr>
+            <w:tcW w:type="pct" w:w="2250%"/>
+          </w:tcPr>
+          <w:p>
+            <w:pPr>
+              <w:spacing w:after="60"/>
+            </w:pPr>
+            <w:r>
+              <w:rPr>
+                <w:b/>
+                <w:bCs/>
+              </w:rPr>
+              <w:t xml:space="preserve">0.3</w:t>
+            </w:r>
+          </w:p>
+        </w:tc>
+      </w:tr>
+      <w:tr>
+        <w:tc>
+          <w:tcPr>
+            <w:tcW w:type="pct" w:w="2250%"/>
+          </w:tcPr>
+          <w:p>
+            <w:pPr>
+              <w:spacing w:after="60"/>
+            </w:pPr>
+            <w:r>
+              <w:rPr>
+                <w:b/>
+                <w:bCs/>
+              </w:rPr>
+              <w:t xml:space="preserve">Core device</w:t>
+            </w:r>
+          </w:p>
+        </w:tc>
+        <w:tc>
+          <w:tcPr>
+            <w:tcW w:type="pct" w:w="2250%"/>
+          </w:tcPr>
+          <w:p>
+            <w:pPr>
+              <w:spacing w:after="60"/>
+            </w:pPr>
+            <w:r>
+              <w:rPr>
+                <w:b/>
+                <w:bCs/>
+              </w:rPr>
+              <w:t xml:space="preserve">`interval_first_guitar`</w:t>
+            </w:r>
+            <w:r>
+              <w:t xml:space="preserve"> — shell+one comping, warm extensions, inner-voice chromaticism as colour (</w:t>
+            </w:r>
+            <w:r>
+              <w:rPr>
+                <w:b/>
+                <w:bCs/>
+              </w:rPr>
+              <w:t xml:space="preserve">`jh:*`</w:t>
+            </w:r>
+            <w:r>
+              <w:t xml:space="preserve">). </w:t>
+            </w:r>
+            <w:r>
+              <w:rPr>
+                <w:b/>
+                <w:bCs/>
+              </w:rPr>
+              <w:t xml:space="preserve">`maxVoicingNotes`</w:t>
+            </w:r>
+            <w:r>
+              <w:t xml:space="preserve">: </w:t>
+            </w:r>
+            <w:r>
+              <w:rPr>
+                <w:b/>
+                <w:bCs/>
+              </w:rPr>
+              <w:t xml:space="preserve">3</w:t>
+            </w:r>
+            <w:r>
+              <w:t xml:space="preserve">.</w:t>
+            </w:r>
+          </w:p>
+        </w:tc>
+      </w:tr>
+      <w:tr>
+        <w:tc>
+          <w:tcPr>
+            <w:tcW w:type="pct" w:w="2250%"/>
+          </w:tcPr>
+          <w:p>
+            <w:pPr>
+              <w:spacing w:after="60"/>
+            </w:pPr>
+            <w:r>
+              <w:rPr>
+                <w:b/>
+                <w:bCs/>
+              </w:rPr>
+              <w:t xml:space="preserve">Phrase templates (research → vault)</w:t>
+            </w:r>
+          </w:p>
+        </w:tc>
+        <w:tc>
+          <w:tcPr>
+            <w:tcW w:type="pct" w:w="2250%"/>
+          </w:tcPr>
+          <w:p>
+            <w:pPr>
+              <w:spacing w:after="60"/>
+            </w:pPr>
+            <w:r>
+              <w:t xml:space="preserve">**`sparse_interval` \</w:t>
+            </w:r>
+          </w:p>
+        </w:tc>
+        <w:tc>
+          <w:tcPr>
+            <w:tcW w:type="pct" w:w="2250%"/>
+          </w:tcPr>
+          <w:p>
+            <w:pPr>
+              <w:spacing w:after="60"/>
+            </w:pPr>
+            <w:r>
+              <w:t xml:space="preserve">`inner_chromatic` \</w:t>
+            </w:r>
+          </w:p>
+        </w:tc>
+        <w:tc>
+          <w:tcPr>
+            <w:tcW w:type="pct" w:w="2250%"/>
+          </w:tcPr>
+          <w:p>
+            <w:pPr>
+              <w:spacing w:after="60"/>
+            </w:pPr>
+            <w:r>
+              <w:t xml:space="preserve">`counter_melody`</w:t>
+            </w:r>
+            <w:r>
+              <w:rPr>
+                <w:b/>
+                <w:bCs/>
+              </w:rPr>
+              <w:t xml:space="preserve"> — vault adds </w:t>
+            </w:r>
+            <w:r>
+              <w:t xml:space="preserve">`triad-sweep`</w:t>
+            </w:r>
+            <w:r>
+              <w:rPr>
+                <w:b/>
+                <w:bCs/>
+              </w:rPr>
+              <w:t xml:space="preserve">, </w:t>
+            </w:r>
+            <w:r>
+              <w:t xml:space="preserve">`dyad-bounce`</w:t>
+            </w:r>
+            <w:r>
+              <w:rPr>
+                <w:b/>
+                <w:bCs/>
+              </w:rPr>
+              <w:t xml:space="preserve">, </w:t>
+            </w:r>
+            <w:r>
+              <w:t xml:space="preserve">`quadratonic-enclosure`</w:t>
+            </w:r>
+            <w:r>
+              <w:rPr>
+                <w:b/>
+                <w:bCs/>
+              </w:rPr>
+              <w:t xml:space="preserve">, </w:t>
+            </w:r>
+            <w:r>
+              <w:t xml:space="preserve">`modal_pedal`</w:t>
+            </w:r>
+            <w:r>
+              <w:rPr>
+                <w:b/>
+                <w:bCs/>
+              </w:rPr>
+              <w:t xml:space="preserve">, </w:t>
+            </w:r>
+            <w:r>
+              <w:t xml:space="preserve">`side_slip`</w:t>
+            </w:r>
+            <w:r>
+              <w:rPr>
+                <w:b/>
+                <w:bCs/>
+              </w:rPr>
+              <w:t xml:space="preserve">, </w:t>
+            </w:r>
+            <w:r>
+              <w:t xml:space="preserve">`tension-climb`</w:t>
+            </w:r>
+            <w:r>
+              <w:rPr>
+                <w:b/>
+                <w:bCs/>
+              </w:rPr>
+              <w:t xml:space="preserve">; drops </w:t>
+            </w:r>
+            <w:r>
+              <w:t xml:space="preserve">`bebop-insertion`**.</w:t>
+            </w:r>
+          </w:p>
+        </w:tc>
+      </w:tr>
+    </w:tbl>
+    <w:p>
+      <w:pPr>
+        <w:spacing w:after="160"/>
+      </w:pPr>
+    </w:p>
+    <w:p>
+      <w:pPr>
+        <w:spacing w:after="160"/>
+      </w:pPr>
+      <w:r>
+        <w:t xml:space="preserve">Primary implementation: </w:t>
+      </w:r>
+      <w:r>
+        <w:rPr>
+          <w:b/>
+          <w:bCs/>
+        </w:rPr>
+        <w:t xml:space="preserve">`jimHallSlice.ts`</w:t>
+      </w:r>
+      <w:r>
+        <w:t xml:space="preserve">, </w:t>
+      </w:r>
+      <w:r>
+        <w:rPr>
+          <w:b/>
+          <w:bCs/>
+        </w:rPr>
+        <w:t xml:space="preserve">`precomputeJimHallEffectiveHarmonyBars`</w:t>
+      </w:r>
+      <w:r>
+        <w:t xml:space="preserve"> → </w:t>
+      </w:r>
+      <w:r>
+        <w:rPr>
+          <w:b/>
+          <w:bCs/>
+        </w:rPr>
+        <w:t xml:space="preserve">`jimHallEffectiveHarmonyBars`</w:t>
+      </w:r>
+      <w:r>
+        <w:t xml:space="preserve">. </w:t>
+      </w:r>
+      <w:r>
+        <w:rPr>
+          <w:b/>
+          <w:bCs/>
+        </w:rPr>
+        <w:t xml:space="preserve">Closest neighbour:</w:t>
+      </w:r>
+      <w:r>
+        <w:t xml:space="preserve"> </w:t>
+      </w:r>
+      <w:r>
+        <w:rPr>
+          <w:b/>
+          <w:bCs/>
+        </w:rPr>
+        <w:t xml:space="preserve">`pat_metheny`</w:t>
+      </w:r>
+      <w:r>
+        <w:t xml:space="preserve"> — Hall is </w:t>
+      </w:r>
+      <w:r>
+        <w:rPr>
+          <w:b/>
+          <w:bCs/>
+        </w:rPr>
+        <w:t xml:space="preserve">sparse interval economy + duo counter-melody</w:t>
+      </w:r>
+      <w:r>
+        <w:t xml:space="preserve">; Metheny allows </w:t>
+      </w:r>
+      <w:r>
+        <w:rPr>
+          <w:b/>
+          <w:bCs/>
+        </w:rPr>
+        <w:t xml:space="preserve">wider voicing spread / ECM lyrical arcs</w:t>
+      </w:r>
+      <w:r>
+        <w:t xml:space="preserve">. </w:t>
+      </w:r>
+      <w:r>
+        <w:rPr>
+          <w:b/>
+          <w:bCs/>
+        </w:rPr>
+        <w:t xml:space="preserve">`bill_evans`</w:t>
+      </w:r>
+      <w:r>
+        <w:t xml:space="preserve"> — Evans stacks </w:t>
+      </w:r>
+      <w:r>
+        <w:rPr>
+          <w:b/>
+          <w:bCs/>
+        </w:rPr>
+        <w:t xml:space="preserve">voice-led seventh colours</w:t>
+      </w:r>
+      <w:r>
+        <w:t xml:space="preserve">; Hall </w:t>
+      </w:r>
+      <w:r>
+        <w:rPr>
+          <w:b/>
+          <w:bCs/>
+        </w:rPr>
+        <w:t xml:space="preserve">limits vertical density</w:t>
+      </w:r>
+      <w:r>
+        <w:t xml:space="preserve"> and favours </w:t>
+      </w:r>
+      <w:r>
+        <w:rPr>
+          <w:b/>
+          <w:bCs/>
+        </w:rPr>
+        <w:t xml:space="preserve">guide-tone + one colour</w:t>
+      </w:r>
+      <w:r>
+        <w:t xml:space="preserve">.</w:t>
+      </w:r>
+    </w:p>
+    <w:p>
+      <w:pPr>
+        <w:pStyle w:val="Heading2"/>
+        <w:spacing w:after="100" w:before="160"/>
+      </w:pPr>
+      <w:r>
+        <w:t xml:space="preserve">`thad_jones` — **`aa2172c30dd59aa9ebb60ec5e1c6dd089ea1d154`** (short: **`aa2172c3`**)</w:t>
+      </w:r>
+    </w:p>
+    <w:tbl>
+      <w:tblPr>
+        <w:tblW w:type="pct" w:w="100%"/>
+        <w:tblBorders>
+          <w:top w:val="single" w:color="auto" w:sz="4"/>
+          <w:left w:val="single" w:color="auto" w:sz="4"/>
+          <w:bottom w:val="single" w:color="auto" w:sz="4"/>
+          <w:right w:val="single" w:color="auto" w:sz="4"/>
+          <w:insideH w:val="single" w:color="auto" w:sz="4"/>
+          <w:insideV w:val="single" w:color="auto" w:sz="4"/>
+        </w:tblBorders>
+      </w:tblPr>
+      <w:tblGrid>
+        <w:gridCol w:w="2250"/>
+        <w:gridCol w:w="2250"/>
+        <w:gridCol w:w="2250"/>
+        <w:gridCol w:w="2250"/>
+      </w:tblGrid>
+      <w:tr>
+        <w:tc>
+          <w:tcPr>
+            <w:tcW w:type="pct" w:w="2250%"/>
+          </w:tcPr>
+          <w:p>
+            <w:pPr>
+              <w:spacing w:after="60"/>
+            </w:pPr>
+            <w:r>
+              <w:t xml:space="preserve">Field</w:t>
+            </w:r>
+          </w:p>
+        </w:tc>
+        <w:tc>
+          <w:tcPr>
+            <w:tcW w:type="pct" w:w="2250%"/>
+          </w:tcPr>
+          <w:p>
+            <w:pPr>
+              <w:spacing w:after="60"/>
+            </w:pPr>
+            <w:r>
+              <w:t xml:space="preserve">Value</w:t>
+            </w:r>
+          </w:p>
+        </w:tc>
+      </w:tr>
+      <w:tr>
+        <w:tc>
+          <w:tcPr>
+            <w:tcW w:type="pct" w:w="2250%"/>
+          </w:tcPr>
+          <w:p>
+            <w:pPr>
+              <w:spacing w:after="60"/>
+            </w:pPr>
+            <w:r>
+              <w:rPr>
+                <w:b/>
+                <w:bCs/>
+              </w:rPr>
+              <w:t xml:space="preserve">Phase / posture</w:t>
+            </w:r>
+          </w:p>
+        </w:tc>
+        <w:tc>
+          <w:tcPr>
+            <w:tcW w:type="pct" w:w="2250%"/>
+          </w:tcPr>
+          <w:p>
+            <w:pPr>
+              <w:spacing w:after="60"/>
+            </w:pPr>
+            <w:r>
+              <w:rPr>
+                <w:b/>
+                <w:bCs/>
+              </w:rPr>
+              <w:t xml:space="preserve">`thadPhase`</w:t>
+            </w:r>
+            <w:r>
+              <w:t xml:space="preserve">: </w:t>
+            </w:r>
+            <w:r>
+              <w:rPr>
+                <w:b/>
+                <w:bCs/>
+              </w:rPr>
+              <w:t xml:space="preserve">`swing`</w:t>
+            </w:r>
+            <w:r>
+              <w:t xml:space="preserve"> (default) · </w:t>
+            </w:r>
+            <w:r>
+              <w:rPr>
+                <w:b/>
+                <w:bCs/>
+              </w:rPr>
+              <w:t xml:space="preserve">`ballad`</w:t>
+            </w:r>
+            <w:r>
+              <w:t xml:space="preserve"> · </w:t>
+            </w:r>
+            <w:r>
+              <w:rPr>
+                <w:b/>
+                <w:bCs/>
+              </w:rPr>
+              <w:t xml:space="preserve">`groove`</w:t>
+            </w:r>
+            <w:r>
+              <w:t xml:space="preserve"> — </w:t>
+            </w:r>
+            <w:r>
+              <w:rPr>
+                <w:b/>
+                <w:bCs/>
+              </w:rPr>
+              <w:t xml:space="preserve">`THAD_JONES_SLICE_PARAMETERS.defaultPhase`</w:t>
+            </w:r>
+            <w:r>
+              <w:t xml:space="preserve"> </w:t>
+            </w:r>
+            <w:r>
+              <w:rPr>
+                <w:b/>
+                <w:bCs/>
+              </w:rPr>
+              <w:t xml:space="preserve">`swing`</w:t>
+            </w:r>
+            <w:r>
+              <w:t xml:space="preserve">.</w:t>
+            </w:r>
+          </w:p>
+        </w:tc>
+      </w:tr>
+      <w:tr>
+        <w:tc>
+          <w:tcPr>
+            <w:tcW w:type="pct" w:w="2250%"/>
+          </w:tcPr>
+          <w:p>
+            <w:pPr>
+              <w:spacing w:after="60"/>
+            </w:pPr>
+            <w:r>
+              <w:rPr>
+                <w:b/>
+                <w:bCs/>
+              </w:rPr>
+              <w:t xml:space="preserve">Tritone / sus / chromatic mediant</w:t>
+            </w:r>
+          </w:p>
+        </w:tc>
+        <w:tc>
+          <w:tcPr>
+            <w:tcW w:type="pct" w:w="2250%"/>
+          </w:tcPr>
+          <w:p>
+            <w:pPr>
+              <w:spacing w:after="60"/>
+            </w:pPr>
+            <w:r>
+              <w:rPr>
+                <w:b/>
+                <w:bCs/>
+              </w:rPr>
+              <w:t xml:space="preserve">0.45</w:t>
+            </w:r>
+            <w:r>
+              <w:t xml:space="preserve"> / </w:t>
+            </w:r>
+            <w:r>
+              <w:rPr>
+                <w:b/>
+                <w:bCs/>
+              </w:rPr>
+              <w:t xml:space="preserve">0.1</w:t>
+            </w:r>
+            <w:r>
+              <w:t xml:space="preserve"> / </w:t>
+            </w:r>
+            <w:r>
+              <w:rPr>
+                <w:b/>
+                <w:bCs/>
+              </w:rPr>
+              <w:t xml:space="preserve">0.3</w:t>
+            </w:r>
+          </w:p>
+        </w:tc>
+      </w:tr>
+      <w:tr>
+        <w:tc>
+          <w:tcPr>
+            <w:tcW w:type="pct" w:w="2250%"/>
+          </w:tcPr>
+          <w:p>
+            <w:pPr>
+              <w:spacing w:after="60"/>
+            </w:pPr>
+            <w:r>
+              <w:rPr>
+                <w:b/>
+                <w:bCs/>
+              </w:rPr>
+              <w:t xml:space="preserve">Static dominant bias</w:t>
+            </w:r>
+          </w:p>
+        </w:tc>
+        <w:tc>
+          <w:tcPr>
+            <w:tcW w:type="pct" w:w="2250%"/>
+          </w:tcPr>
+          <w:p>
+            <w:pPr>
+              <w:spacing w:after="60"/>
+            </w:pPr>
+            <w:r>
+              <w:rPr>
+                <w:b/>
+                <w:bCs/>
+              </w:rPr>
+              <w:t xml:space="preserve">0.2</w:t>
+            </w:r>
+          </w:p>
+        </w:tc>
+      </w:tr>
+      <w:tr>
+        <w:tc>
+          <w:tcPr>
+            <w:tcW w:type="pct" w:w="2250%"/>
+          </w:tcPr>
+          <w:p>
+            <w:pPr>
+              <w:spacing w:after="60"/>
+            </w:pPr>
+            <w:r>
+              <w:rPr>
+                <w:b/>
+                <w:bCs/>
+              </w:rPr>
+              <w:t xml:space="preserve">Core device</w:t>
+            </w:r>
+          </w:p>
+        </w:tc>
+        <w:tc>
+          <w:tcPr>
+            <w:tcW w:type="pct" w:w="2250%"/>
+          </w:tcPr>
+          <w:p>
+            <w:pPr>
+              <w:spacing w:after="60"/>
+            </w:pPr>
+            <w:r>
+              <w:rPr>
+                <w:b/>
+                <w:bCs/>
+              </w:rPr>
+              <w:t xml:space="preserve">`extended_common_practice_big_band`</w:t>
+            </w:r>
+            <w:r>
+              <w:t xml:space="preserve"> — nonachord / poly-chord default stacks; </w:t>
+            </w:r>
+            <w:r>
+              <w:rPr>
+                <w:b/>
+                <w:bCs/>
+              </w:rPr>
+              <w:t xml:space="preserve">SOLI</w:t>
+            </w:r>
+            <w:r>
+              <w:t xml:space="preserve"> vs </w:t>
+            </w:r>
+            <w:r>
+              <w:rPr>
+                <w:b/>
+                <w:bCs/>
+              </w:rPr>
+              <w:t xml:space="preserve">SHOUT</w:t>
+            </w:r>
+            <w:r>
+              <w:t xml:space="preserve"> regions (</w:t>
+            </w:r>
+            <w:r>
+              <w:rPr>
+                <w:b/>
+                <w:bCs/>
+              </w:rPr>
+              <w:t xml:space="preserve">`tj:*`</w:t>
+            </w:r>
+            <w:r>
+              <w:t xml:space="preserve">), side-slip on dominants, blues IVm borrow. </w:t>
+            </w:r>
+            <w:r>
+              <w:rPr>
+                <w:b/>
+                <w:bCs/>
+              </w:rPr>
+              <w:t xml:space="preserve">`nonachordBias`</w:t>
+            </w:r>
+            <w:r>
+              <w:t xml:space="preserve">: </w:t>
+            </w:r>
+            <w:r>
+              <w:rPr>
+                <w:b/>
+                <w:bCs/>
+              </w:rPr>
+              <w:t xml:space="preserve">0.7</w:t>
+            </w:r>
+            <w:r>
+              <w:t xml:space="preserve">.</w:t>
+            </w:r>
+          </w:p>
+        </w:tc>
+      </w:tr>
+      <w:tr>
+        <w:tc>
+          <w:tcPr>
+            <w:tcW w:type="pct" w:w="2250%"/>
+          </w:tcPr>
+          <w:p>
+            <w:pPr>
+              <w:spacing w:after="60"/>
+            </w:pPr>
+            <w:r>
+              <w:rPr>
+                <w:b/>
+                <w:bCs/>
+              </w:rPr>
+              <w:t xml:space="preserve">Phrase templates (research → vault)</w:t>
+            </w:r>
+          </w:p>
+        </w:tc>
+        <w:tc>
+          <w:tcPr>
+            <w:tcW w:type="pct" w:w="2250%"/>
+          </w:tcPr>
+          <w:p>
+            <w:pPr>
+              <w:spacing w:after="60"/>
+            </w:pPr>
+            <w:r>
+              <w:t xml:space="preserve">**`nonachord_stack` \</w:t>
+            </w:r>
+          </w:p>
+        </w:tc>
+        <w:tc>
+          <w:tcPr>
+            <w:tcW w:type="pct" w:w="2250%"/>
+          </w:tcPr>
+          <w:p>
+            <w:pPr>
+              <w:spacing w:after="60"/>
+            </w:pPr>
+            <w:r>
+              <w:t xml:space="preserve">`bebop_soli` \</w:t>
+            </w:r>
+          </w:p>
+        </w:tc>
+        <w:tc>
+          <w:tcPr>
+            <w:tcW w:type="pct" w:w="2250%"/>
+          </w:tcPr>
+          <w:p>
+            <w:pPr>
+              <w:spacing w:after="60"/>
+            </w:pPr>
+            <w:r>
+              <w:t xml:space="preserve">`shout_chorus`</w:t>
+            </w:r>
+            <w:r>
+              <w:rPr>
+                <w:b/>
+                <w:bCs/>
+              </w:rPr>
+              <w:t xml:space="preserve"> — vault </w:t>
+            </w:r>
+            <w:r>
+              <w:t xml:space="preserve">`phraseTemplatesForChordThadJones`</w:t>
+            </w:r>
+            <w:r>
+              <w:rPr>
+                <w:b/>
+                <w:bCs/>
+              </w:rPr>
+              <w:t xml:space="preserve">: </w:t>
+            </w:r>
+            <w:r>
+              <w:t xml:space="preserve">`bebop-insertion`</w:t>
+            </w:r>
+            <w:r>
+              <w:rPr>
+                <w:b/>
+                <w:bCs/>
+              </w:rPr>
+              <w:t xml:space="preserve">, </w:t>
+            </w:r>
+            <w:r>
+              <w:t xml:space="preserve">`tension-climb`</w:t>
+            </w:r>
+            <w:r>
+              <w:rPr>
+                <w:b/>
+                <w:bCs/>
+              </w:rPr>
+              <w:t xml:space="preserve">, </w:t>
+            </w:r>
+            <w:r>
+              <w:t xml:space="preserve">`dyad-bounce`</w:t>
+            </w:r>
+            <w:r>
+              <w:rPr>
+                <w:b/>
+                <w:bCs/>
+              </w:rPr>
+              <w:t xml:space="preserve">, </w:t>
+            </w:r>
+            <w:r>
+              <w:t xml:space="preserve">`quadratonic-enclosure`</w:t>
+            </w:r>
+            <w:r>
+              <w:rPr>
+                <w:b/>
+                <w:bCs/>
+              </w:rPr>
+              <w:t xml:space="preserve">, </w:t>
+            </w:r>
+            <w:r>
+              <w:t xml:space="preserve">`side_slip`**.</w:t>
+            </w:r>
+          </w:p>
+        </w:tc>
+      </w:tr>
+    </w:tbl>
+    <w:p>
+      <w:pPr>
+        <w:spacing w:after="160"/>
+      </w:pPr>
+    </w:p>
+    <w:p>
+      <w:pPr>
+        <w:spacing w:after="160"/>
+      </w:pPr>
+      <w:r>
+        <w:t xml:space="preserve">Primary implementation: </w:t>
+      </w:r>
+      <w:r>
+        <w:rPr>
+          <w:b/>
+          <w:bCs/>
+        </w:rPr>
+        <w:t xml:space="preserve">`thadJonesSlice.ts`</w:t>
+      </w:r>
+      <w:r>
+        <w:t xml:space="preserve">, barrel </w:t>
+      </w:r>
+      <w:r>
+        <w:rPr>
+          <w:b/>
+          <w:bCs/>
+        </w:rPr>
+        <w:t xml:space="preserve">`goldenPath/thad_jones.ts`</w:t>
+      </w:r>
+      <w:r>
+        <w:t xml:space="preserve">, </w:t>
+      </w:r>
+      <w:r>
+        <w:rPr>
+          <w:b/>
+          <w:bCs/>
+        </w:rPr>
+        <w:t xml:space="preserve">`precomputeThadJonesEffectiveHarmonyBars`</w:t>
+      </w:r>
+      <w:r>
+        <w:t xml:space="preserve"> → </w:t>
+      </w:r>
+      <w:r>
+        <w:rPr>
+          <w:b/>
+          <w:bCs/>
+        </w:rPr>
+        <w:t xml:space="preserve">`thadJonesEffectiveHarmonyBars`</w:t>
+      </w:r>
+      <w:r>
+        <w:t xml:space="preserve">. </w:t>
+      </w:r>
+      <w:r>
+        <w:rPr>
+          <w:b/>
+          <w:bCs/>
+        </w:rPr>
+        <w:t xml:space="preserve">Closest neighbour:</w:t>
+      </w:r>
+      <w:r>
+        <w:t xml:space="preserve"> </w:t>
+      </w:r>
+      <w:r>
+        <w:rPr>
+          <w:b/>
+          <w:bCs/>
+        </w:rPr>
+        <w:t xml:space="preserve">`duke_ellington`</w:t>
+      </w:r>
+      <w:r>
+        <w:t xml:space="preserve"> — Duke maps </w:t>
+      </w:r>
+      <w:r>
+        <w:rPr>
+          <w:b/>
+          <w:bCs/>
+        </w:rPr>
+        <w:t xml:space="preserve">call/response / jungle / orchestral shout staging</w:t>
+      </w:r>
+      <w:r>
+        <w:t xml:space="preserve">; Thad defaults </w:t>
+      </w:r>
+      <w:r>
+        <w:rPr>
+          <w:b/>
+          <w:bCs/>
+        </w:rPr>
+        <w:t xml:space="preserve">bebop-era vertical density</w:t>
+      </w:r>
+      <w:r>
+        <w:t xml:space="preserve"> (nonachord everyday) and </w:t>
+      </w:r>
+      <w:r>
+        <w:rPr>
+          <w:b/>
+          <w:bCs/>
+        </w:rPr>
+        <w:t xml:space="preserve">explicit SOLI vs SHOUT</w:t>
+      </w:r>
+      <w:r>
+        <w:t xml:space="preserve"> alteration tiers.</w:t>
+      </w:r>
+    </w:p>
+    <w:p>
+      <w:pPr>
+        <w:pStyle w:val="Heading2"/>
+        <w:spacing w:after="100" w:before="160"/>
+      </w:pPr>
+      <w:r>
+        <w:t xml:space="preserve">`joni_mitchell` — **`35e18bdb1bba782ec20b85b47babfb88f45c286c`** (short: **`35e18bdb`**)</w:t>
+      </w:r>
+    </w:p>
+    <w:tbl>
+      <w:tblPr>
+        <w:tblW w:type="pct" w:w="100%"/>
+        <w:tblBorders>
+          <w:top w:val="single" w:color="auto" w:sz="4"/>
+          <w:left w:val="single" w:color="auto" w:sz="4"/>
+          <w:bottom w:val="single" w:color="auto" w:sz="4"/>
+          <w:right w:val="single" w:color="auto" w:sz="4"/>
+          <w:insideH w:val="single" w:color="auto" w:sz="4"/>
+          <w:insideV w:val="single" w:color="auto" w:sz="4"/>
+        </w:tblBorders>
+      </w:tblPr>
+      <w:tblGrid>
+        <w:gridCol w:w="2250"/>
+        <w:gridCol w:w="2250"/>
+        <w:gridCol w:w="2250"/>
+        <w:gridCol w:w="2250"/>
+      </w:tblGrid>
+      <w:tr>
+        <w:tc>
+          <w:tcPr>
+            <w:tcW w:type="pct" w:w="2250%"/>
+          </w:tcPr>
+          <w:p>
+            <w:pPr>
+              <w:spacing w:after="60"/>
+            </w:pPr>
+            <w:r>
+              <w:t xml:space="preserve">Field</w:t>
+            </w:r>
+          </w:p>
+        </w:tc>
+        <w:tc>
+          <w:tcPr>
+            <w:tcW w:type="pct" w:w="2250%"/>
+          </w:tcPr>
+          <w:p>
+            <w:pPr>
+              <w:spacing w:after="60"/>
+            </w:pPr>
+            <w:r>
+              <w:t xml:space="preserve">Value</w:t>
+            </w:r>
+          </w:p>
+        </w:tc>
+      </w:tr>
+      <w:tr>
+        <w:tc>
+          <w:tcPr>
+            <w:tcW w:type="pct" w:w="2250%"/>
+          </w:tcPr>
+          <w:p>
+            <w:pPr>
+              <w:spacing w:after="60"/>
+            </w:pPr>
+            <w:r>
+              <w:rPr>
+                <w:b/>
+                <w:bCs/>
+              </w:rPr>
+              <w:t xml:space="preserve">Phase / posture</w:t>
+            </w:r>
+          </w:p>
+        </w:tc>
+        <w:tc>
+          <w:tcPr>
+            <w:tcW w:type="pct" w:w="2250%"/>
+          </w:tcPr>
+          <w:p>
+            <w:pPr>
+              <w:spacing w:after="60"/>
+            </w:pPr>
+            <w:r>
+              <w:rPr>
+                <w:b/>
+                <w:bCs/>
+              </w:rPr>
+              <w:t xml:space="preserve">`joniPhase`</w:t>
+            </w:r>
+            <w:r>
+              <w:t xml:space="preserve">: </w:t>
+            </w:r>
+            <w:r>
+              <w:rPr>
+                <w:b/>
+                <w:bCs/>
+              </w:rPr>
+              <w:t xml:space="preserve">`folk_modal`</w:t>
+            </w:r>
+            <w:r>
+              <w:t xml:space="preserve"> (default) · </w:t>
+            </w:r>
+            <w:r>
+              <w:rPr>
+                <w:b/>
+                <w:bCs/>
+              </w:rPr>
+              <w:t xml:space="preserve">`jazz_folk`</w:t>
+            </w:r>
+            <w:r>
+              <w:t xml:space="preserve"> · </w:t>
+            </w:r>
+            <w:r>
+              <w:rPr>
+                <w:b/>
+                <w:bCs/>
+              </w:rPr>
+              <w:t xml:space="preserve">`modal_jazz`</w:t>
+            </w:r>
+            <w:r>
+              <w:t xml:space="preserve"> — </w:t>
+            </w:r>
+            <w:r>
+              <w:rPr>
+                <w:b/>
+                <w:bCs/>
+              </w:rPr>
+              <w:t xml:space="preserve">`JONI_MITCHELL_SLICE_PARAMETERS.defaultPhase`</w:t>
+            </w:r>
+            <w:r>
+              <w:t xml:space="preserve"> </w:t>
+            </w:r>
+            <w:r>
+              <w:rPr>
+                <w:b/>
+                <w:bCs/>
+              </w:rPr>
+              <w:t xml:space="preserve">`folk_modal`</w:t>
+            </w:r>
+            <w:r>
+              <w:t xml:space="preserve">.</w:t>
+            </w:r>
+          </w:p>
+        </w:tc>
+      </w:tr>
+      <w:tr>
+        <w:tc>
+          <w:tcPr>
+            <w:tcW w:type="pct" w:w="2250%"/>
+          </w:tcPr>
+          <w:p>
+            <w:pPr>
+              <w:spacing w:after="60"/>
+            </w:pPr>
+            <w:r>
+              <w:rPr>
+                <w:b/>
+                <w:bCs/>
+              </w:rPr>
+              <w:t xml:space="preserve">Tritone / sus / chromatic mediant</w:t>
+            </w:r>
+          </w:p>
+        </w:tc>
+        <w:tc>
+          <w:tcPr>
+            <w:tcW w:type="pct" w:w="2250%"/>
+          </w:tcPr>
+          <w:p>
+            <w:pPr>
+              <w:spacing w:after="60"/>
+            </w:pPr>
+            <w:r>
+              <w:rPr>
+                <w:b/>
+                <w:bCs/>
+              </w:rPr>
+              <w:t xml:space="preserve">0.05</w:t>
+            </w:r>
+            <w:r>
+              <w:t xml:space="preserve"> / </w:t>
+            </w:r>
+            <w:r>
+              <w:rPr>
+                <w:b/>
+                <w:bCs/>
+              </w:rPr>
+              <w:t xml:space="preserve">0.9</w:t>
+            </w:r>
+            <w:r>
+              <w:t xml:space="preserve"> / </w:t>
+            </w:r>
+            <w:r>
+              <w:rPr>
+                <w:b/>
+                <w:bCs/>
+              </w:rPr>
+              <w:t xml:space="preserve">0.15</w:t>
+            </w:r>
+          </w:p>
+        </w:tc>
+      </w:tr>
+      <w:tr>
+        <w:tc>
+          <w:tcPr>
+            <w:tcW w:type="pct" w:w="2250%"/>
+          </w:tcPr>
+          <w:p>
+            <w:pPr>
+              <w:spacing w:after="60"/>
+            </w:pPr>
+            <w:r>
+              <w:rPr>
+                <w:b/>
+                <w:bCs/>
+              </w:rPr>
+              <w:t xml:space="preserve">Static dominant bias</w:t>
+            </w:r>
+          </w:p>
+        </w:tc>
+        <w:tc>
+          <w:tcPr>
+            <w:tcW w:type="pct" w:w="2250%"/>
+          </w:tcPr>
+          <w:p>
+            <w:pPr>
+              <w:spacing w:after="60"/>
+            </w:pPr>
+            <w:r>
+              <w:rPr>
+                <w:b/>
+                <w:bCs/>
+              </w:rPr>
+              <w:t xml:space="preserve">0.65</w:t>
+            </w:r>
+          </w:p>
+        </w:tc>
+      </w:tr>
+      <w:tr>
+        <w:tc>
+          <w:tcPr>
+            <w:tcW w:type="pct" w:w="2250%"/>
+          </w:tcPr>
+          <w:p>
+            <w:pPr>
+              <w:spacing w:after="60"/>
+            </w:pPr>
+            <w:r>
+              <w:rPr>
+                <w:b/>
+                <w:bCs/>
+              </w:rPr>
+              <w:t xml:space="preserve">Core device</w:t>
+            </w:r>
+          </w:p>
+        </w:tc>
+        <w:tc>
+          <w:tcPr>
+            <w:tcW w:type="pct" w:w="2250%"/>
+          </w:tcPr>
+          <w:p>
+            <w:pPr>
+              <w:spacing w:after="60"/>
+            </w:pPr>
+            <w:r>
+              <w:rPr>
+                <w:b/>
+                <w:bCs/>
+              </w:rPr>
+              <w:t xml:space="preserve">`sus_to_sus_motion`</w:t>
+            </w:r>
+            <w:r>
+              <w:t xml:space="preserve"> — tuning-derived pitch-field voicings; </w:t>
+            </w:r>
+            <w:r>
+              <w:rPr>
+                <w:b/>
+                <w:bCs/>
+              </w:rPr>
+              <w:t xml:space="preserve">`pitchFieldAnchor`</w:t>
+            </w:r>
+            <w:r>
+              <w:t xml:space="preserve">, </w:t>
+            </w:r>
+            <w:r>
+              <w:rPr>
+                <w:b/>
+                <w:bCs/>
+              </w:rPr>
+              <w:t xml:space="preserve">`openStringSimulation`</w:t>
+            </w:r>
+            <w:r>
+              <w:t xml:space="preserve">; sus resolves to plain triads mainly at cadences (</w:t>
+            </w:r>
+            <w:r>
+              <w:rPr>
+                <w:b/>
+                <w:bCs/>
+              </w:rPr>
+              <w:t xml:space="preserve">`susResolutionRate`</w:t>
+            </w:r>
+            <w:r>
+              <w:t xml:space="preserve"> </w:t>
+            </w:r>
+            <w:r>
+              <w:rPr>
+                <w:b/>
+                <w:bCs/>
+              </w:rPr>
+              <w:t xml:space="preserve">0.15</w:t>
+            </w:r>
+            <w:r>
+              <w:t xml:space="preserve">).</w:t>
+            </w:r>
+          </w:p>
+        </w:tc>
+      </w:tr>
+      <w:tr>
+        <w:tc>
+          <w:tcPr>
+            <w:tcW w:type="pct" w:w="2250%"/>
+          </w:tcPr>
+          <w:p>
+            <w:pPr>
+              <w:spacing w:after="60"/>
+            </w:pPr>
+            <w:r>
+              <w:rPr>
+                <w:b/>
+                <w:bCs/>
+              </w:rPr>
+              <w:t xml:space="preserve">Phrase templates (research → vault)</w:t>
+            </w:r>
+          </w:p>
+        </w:tc>
+        <w:tc>
+          <w:tcPr>
+            <w:tcW w:type="pct" w:w="2250%"/>
+          </w:tcPr>
+          <w:p>
+            <w:pPr>
+              <w:spacing w:after="60"/>
+            </w:pPr>
+            <w:r>
+              <w:t xml:space="preserve">**`sus_cluster` \</w:t>
+            </w:r>
+          </w:p>
+        </w:tc>
+        <w:tc>
+          <w:tcPr>
+            <w:tcW w:type="pct" w:w="2250%"/>
+          </w:tcPr>
+          <w:p>
+            <w:pPr>
+              <w:spacing w:after="60"/>
+            </w:pPr>
+            <w:r>
+              <w:t xml:space="preserve">`modal_vamp` \</w:t>
+            </w:r>
+          </w:p>
+        </w:tc>
+        <w:tc>
+          <w:tcPr>
+            <w:tcW w:type="pct" w:w="2250%"/>
+          </w:tcPr>
+          <w:p>
+            <w:pPr>
+              <w:spacing w:after="60"/>
+            </w:pPr>
+            <w:r>
+              <w:t xml:space="preserve">`melody_led`</w:t>
+            </w:r>
+            <w:r>
+              <w:rPr>
+                <w:b/>
+                <w:bCs/>
+              </w:rPr>
+              <w:t xml:space="preserve"> — vault </w:t>
+            </w:r>
+            <w:r>
+              <w:t xml:space="preserve">`phraseTemplatesForChordJoniMitchellVault`</w:t>
+            </w:r>
+            <w:r>
+              <w:rPr>
+                <w:b/>
+                <w:bCs/>
+              </w:rPr>
+              <w:t xml:space="preserve">: </w:t>
+            </w:r>
+            <w:r>
+              <w:t xml:space="preserve">`quartal`</w:t>
+            </w:r>
+            <w:r>
+              <w:rPr>
+                <w:b/>
+                <w:bCs/>
+              </w:rPr>
+              <w:t xml:space="preserve">, </w:t>
+            </w:r>
+            <w:r>
+              <w:t xml:space="preserve">`modal_pedal`</w:t>
+            </w:r>
+            <w:r>
+              <w:rPr>
+                <w:b/>
+                <w:bCs/>
+              </w:rPr>
+              <w:t xml:space="preserve">, </w:t>
+            </w:r>
+            <w:r>
+              <w:t xml:space="preserve">`liquid-resolution`</w:t>
+            </w:r>
+            <w:r>
+              <w:rPr>
+                <w:b/>
+                <w:bCs/>
+              </w:rPr>
+              <w:t xml:space="preserve">, </w:t>
+            </w:r>
+            <w:r>
+              <w:t xml:space="preserve">`dyad-bounce`</w:t>
+            </w:r>
+            <w:r>
+              <w:rPr>
+                <w:b/>
+                <w:bCs/>
+              </w:rPr>
+              <w:t xml:space="preserve">, </w:t>
+            </w:r>
+            <w:r>
+              <w:t xml:space="preserve">`triad-sweep`</w:t>
+            </w:r>
+            <w:r>
+              <w:rPr>
+                <w:b/>
+                <w:bCs/>
+              </w:rPr>
+              <w:t xml:space="preserve">; </w:t>
+            </w:r>
+            <w:r>
+              <w:t xml:space="preserve">removes `bebop-insertion`**.</w:t>
+            </w:r>
+          </w:p>
+        </w:tc>
+      </w:tr>
+    </w:tbl>
+    <w:p>
+      <w:pPr>
+        <w:spacing w:after="160"/>
+      </w:pPr>
+    </w:p>
+    <w:p>
+      <w:pPr>
+        <w:spacing w:after="160"/>
+      </w:pPr>
+      <w:r>
+        <w:t xml:space="preserve">Primary implementation: </w:t>
+      </w:r>
+      <w:r>
+        <w:rPr>
+          <w:b/>
+          <w:bCs/>
+        </w:rPr>
+        <w:t xml:space="preserve">`joniMitchellSlice.ts`</w:t>
+      </w:r>
+      <w:r>
+        <w:t xml:space="preserve">, barrel </w:t>
+      </w:r>
+      <w:r>
+        <w:rPr>
+          <w:b/>
+          <w:bCs/>
+        </w:rPr>
+        <w:t xml:space="preserve">`goldenPath/joni_mitchell.ts`</w:t>
+      </w:r>
+      <w:r>
+        <w:t xml:space="preserve">, </w:t>
+      </w:r>
+      <w:r>
+        <w:rPr>
+          <w:b/>
+          <w:bCs/>
+        </w:rPr>
+        <w:t xml:space="preserve">`precomputeJoniMitchellEffectiveHarmonyBars`</w:t>
+      </w:r>
+      <w:r>
+        <w:t xml:space="preserve"> → </w:t>
+      </w:r>
+      <w:r>
+        <w:rPr>
+          <w:b/>
+          <w:bCs/>
+        </w:rPr>
+        <w:t xml:space="preserve">`joniMitchellEffectiveHarmonyBars`</w:t>
+      </w:r>
+      <w:r>
+        <w:t xml:space="preserve">. </w:t>
+      </w:r>
+      <w:r>
+        <w:rPr>
+          <w:b/>
+          <w:bCs/>
+        </w:rPr>
+        <w:t xml:space="preserve">Closest neighbour:</w:t>
+      </w:r>
+      <w:r>
+        <w:t xml:space="preserve"> </w:t>
+      </w:r>
+      <w:r>
+        <w:rPr>
+          <w:b/>
+          <w:bCs/>
+        </w:rPr>
+        <w:t xml:space="preserve">`radiohead`</w:t>
+      </w:r>
+      <w:r>
+        <w:t xml:space="preserve"> — both use </w:t>
+      </w:r>
+      <w:r>
+        <w:rPr>
+          <w:b/>
+          <w:bCs/>
+        </w:rPr>
+        <w:t xml:space="preserve">modal colour + pedals</w:t>
+      </w:r>
+      <w:r>
+        <w:t xml:space="preserve">; Joni is </w:t>
+      </w:r>
+      <w:r>
+        <w:rPr>
+          <w:b/>
+          <w:bCs/>
+        </w:rPr>
+        <w:t xml:space="preserve">sus-first songwriter pitch-field / tuning metaphor</w:t>
+      </w:r>
+      <w:r>
+        <w:t xml:space="preserve"> vs Radiohead </w:t>
+      </w:r>
+      <w:r>
+        <w:rPr>
+          <w:b/>
+          <w:bCs/>
+        </w:rPr>
+        <w:t xml:space="preserve">Phrygian pedal + rock chromatic insertion</w:t>
+      </w:r>
+      <w:r>
+        <w:t xml:space="preserve">. </w:t>
+      </w:r>
+      <w:r>
+        <w:rPr>
+          <w:b/>
+          <w:bCs/>
+        </w:rPr>
+        <w:t xml:space="preserve">`steve_reich`</w:t>
+      </w:r>
+      <w:r>
+        <w:t xml:space="preserve"> — both can sit on fields; Joni is </w:t>
+      </w:r>
+      <w:r>
+        <w:rPr>
+          <w:b/>
+          <w:bCs/>
+        </w:rPr>
+        <w:t xml:space="preserve">harmony led by melody + sus grammar</w:t>
+      </w:r>
+      <w:r>
+        <w:t xml:space="preserve">, Reich by </w:t>
+      </w:r>
+      <w:r>
+        <w:rPr>
+          <w:b/>
+          <w:bCs/>
+        </w:rPr>
+        <w:t xml:space="preserve">additive/phasing process</w:t>
       </w:r>
       <w:r>
         <w:t xml:space="preserve">.</w:t>

</xml_diff>

<commit_message>
feat(composer-os): Count Basie Song Mode stack (count_basie)
Add basie slice, chord pools, harmony rail, VoiceRuleBundle, BB rules (10),
manifest/output types, testament mode wiring; fix StructuralFingerprintMeta
pass-through in validateAgainstFingerprint; extend SongwriterPrimaryInstrumentKind
with ensemble. Docs: CHANGELOG, architecture, playbook+docx, roadmap, CLAUDE smoke counts.
Smoke: 243 PASS rows, 58 suites.

Co-authored-by: Cursor <cursoragent@cursor.com>
</commit_message>
<xml_diff>
--- a/docs/COMPOSER_OS_PLAYBOOK.docx
+++ b/docs/COMPOSER_OS_PLAYBOOK.docx
@@ -30307,7 +30307,241 @@
         <w:t xml:space="preserve">Aliases:</w:t>
       </w:r>
       <w:r>
-        <w:t xml:space="preserve"> Many writers register shortcuts (`monk`, `bird`, `fz`, …)—try them in quick experiments.</w:t>
+        <w:t xml:space="preserve"> Many writers register shortcuts (`monk`, `bird`, `fz`, `basie`, `count basie`, …)—try them in quick experiments.</w:t>
+      </w:r>
+    </w:p>
+    <w:p>
+      <w:pPr>
+        <w:pStyle w:val="Heading2"/>
+        <w:spacing w:after="100" w:before="160"/>
+      </w:pPr>
+      <w:r>
+        <w:t xml:space="preserve">Count Basie (`count_basie`)</w:t>
+      </w:r>
+    </w:p>
+    <w:p>
+      <w:pPr>
+        <w:spacing w:after="160"/>
+      </w:pPr>
+      <w:r>
+        <w:rPr>
+          <w:b/>
+          <w:bCs/>
+        </w:rPr>
+        <w:t xml:space="preserve">Shipped slice:</w:t>
+      </w:r>
+      <w:r>
+        <w:t xml:space="preserve"> </w:t>
+      </w:r>
+      <w:r>
+        <w:rPr>
+          <w:b/>
+          <w:bCs/>
+        </w:rPr>
+        <w:t xml:space="preserve">`basieSlice.ts`</w:t>
+      </w:r>
+      <w:r>
+        <w:t xml:space="preserve"> — </w:t>
+      </w:r>
+      <w:r>
+        <w:rPr>
+          <w:b/>
+          <w:bCs/>
+        </w:rPr>
+        <w:t xml:space="preserve">`cb:*`</w:t>
+      </w:r>
+      <w:r>
+        <w:t xml:space="preserve"> receipts, </w:t>
+      </w:r>
+      <w:r>
+        <w:rPr>
+          <w:b/>
+          <w:bCs/>
+        </w:rPr>
+        <w:t xml:space="preserve">`basieEffectiveHarmonyBars`</w:t>
+      </w:r>
+      <w:r>
+        <w:t xml:space="preserve"> authority in </w:t>
+      </w:r>
+      <w:r>
+        <w:rPr>
+          <w:b/>
+          <w:bCs/>
+        </w:rPr>
+        <w:t xml:space="preserve">`getChordForBar`</w:t>
+      </w:r>
+      <w:r>
+        <w:t xml:space="preserve"> / locked export truth (same wiring as Thad Jones / Mingus). </w:t>
+      </w:r>
+      <w:r>
+        <w:rPr>
+          <w:b/>
+          <w:bCs/>
+        </w:rPr>
+        <w:t xml:space="preserve">Chord pools:</w:t>
+      </w:r>
+      <w:r>
+        <w:t xml:space="preserve"> </w:t>
+      </w:r>
+      <w:r>
+        <w:rPr>
+          <w:b/>
+          <w:bCs/>
+        </w:rPr>
+        <w:t xml:space="preserve">`basie_blues`</w:t>
+      </w:r>
+      <w:r>
+        <w:t xml:space="preserve">, </w:t>
+      </w:r>
+      <w:r>
+        <w:rPr>
+          <w:b/>
+          <w:bCs/>
+        </w:rPr>
+        <w:t xml:space="preserve">`basie_swing`</w:t>
+      </w:r>
+      <w:r>
+        <w:t xml:space="preserve">, </w:t>
+      </w:r>
+      <w:r>
+        <w:rPr>
+          <w:b/>
+          <w:bCs/>
+        </w:rPr>
+        <w:t xml:space="preserve">`basie_ballad`</w:t>
+      </w:r>
+      <w:r>
+        <w:t xml:space="preserve"> (</w:t>
+      </w:r>
+      <w:r>
+        <w:rPr>
+          <w:b/>
+          <w:bCs/>
+        </w:rPr>
+        <w:t xml:space="preserve">`seed % 3`</w:t>
+      </w:r>
+      <w:r>
+        <w:t xml:space="preserve">). </w:t>
+      </w:r>
+      <w:r>
+        <w:rPr>
+          <w:b/>
+          <w:bCs/>
+        </w:rPr>
+        <w:t xml:space="preserve">Episodes:</w:t>
+      </w:r>
+      <w:r>
+        <w:t xml:space="preserve"> </w:t>
+      </w:r>
+      <w:r>
+        <w:rPr>
+          <w:b/>
+          <w:bCs/>
+        </w:rPr>
+        <w:t xml:space="preserve">`riff_head`</w:t>
+      </w:r>
+      <w:r>
+        <w:t xml:space="preserve">, </w:t>
+      </w:r>
+      <w:r>
+        <w:rPr>
+          <w:b/>
+          <w:bCs/>
+        </w:rPr>
+        <w:t xml:space="preserve">`solo_background`</w:t>
+      </w:r>
+      <w:r>
+        <w:t xml:space="preserve">, </w:t>
+      </w:r>
+      <w:r>
+        <w:rPr>
+          <w:b/>
+          <w:bCs/>
+        </w:rPr>
+        <w:t xml:space="preserve">`shout`</w:t>
+      </w:r>
+      <w:r>
+        <w:t xml:space="preserve">, </w:t>
+      </w:r>
+      <w:r>
+        <w:rPr>
+          <w:b/>
+          <w:bCs/>
+        </w:rPr>
+        <w:t xml:space="preserve">`tag`</w:t>
+      </w:r>
+      <w:r>
+        <w:t xml:space="preserve"> (shout reuses head riff material). Optional </w:t>
+      </w:r>
+      <w:r>
+        <w:rPr>
+          <w:b/>
+          <w:bCs/>
+        </w:rPr>
+        <w:t xml:space="preserve">`basieTestamentMode`</w:t>
+      </w:r>
+      <w:r>
+        <w:t xml:space="preserve"> (</w:t>
+      </w:r>
+      <w:r>
+        <w:rPr>
+          <w:b/>
+          <w:bCs/>
+        </w:rPr>
+        <w:t xml:space="preserve">Old Testament</w:t>
+      </w:r>
+      <w:r>
+        <w:t xml:space="preserve"> vs </w:t>
+      </w:r>
+      <w:r>
+        <w:rPr>
+          <w:b/>
+          <w:bCs/>
+        </w:rPr>
+        <w:t xml:space="preserve">New Testament</w:t>
+      </w:r>
+      <w:r>
+        <w:t xml:space="preserve">) weights </w:t>
+      </w:r>
+      <w:r>
+        <w:rPr>
+          <w:b/>
+          <w:bCs/>
+        </w:rPr>
+        <w:t xml:space="preserve">`basieStyleProfile`</w:t>
+      </w:r>
+      <w:r>
+        <w:t xml:space="preserve"> / </w:t>
+      </w:r>
+      <w:r>
+        <w:rPr>
+          <w:b/>
+          <w:bCs/>
+        </w:rPr>
+        <w:t xml:space="preserve">`CompositionContext`</w:t>
+      </w:r>
+      <w:r>
+        <w:t xml:space="preserve"> — not a separate songwriter id. Big Band arranger </w:t>
+      </w:r>
+      <w:r>
+        <w:rPr>
+          <w:b/>
+          <w:bCs/>
+        </w:rPr>
+        <w:t xml:space="preserve">`basie`</w:t>
+      </w:r>
+      <w:r>
+        <w:t xml:space="preserve"> shares expanded registry rules with Song Mode fingerprint bundle </w:t>
+      </w:r>
+      <w:r>
+        <w:rPr>
+          <w:b/>
+          <w:bCs/>
+        </w:rPr>
+        <w:t xml:space="preserve">`count_basie`</w:t>
+      </w:r>
+      <w:r>
+        <w:t xml:space="preserve">.</w:t>
       </w:r>
     </w:p>
     <w:p>

</xml_diff>

<commit_message>
docs: VRB handbook table, playbook evaluation notes, roadmap DONE (4aa848a5)
- COMPOSER_HANDBOOK: VoiceRuleBundle fingerprint status (deep 11 vs thin 6)
- PLAYBOOK: lens + Style Profile registry VRB labels; Wayne Shorter note
- ROADMAP: VRB deepening bullet DONE + commit ref
- CHANGELOG: anchor VRB entry to 4aa848a5 + doc paths
- Regenerate COMPOSER_OS_PLAYBOOK.docx

Co-authored-by: Cursor <cursoragent@cursor.com>
</commit_message>
<xml_diff>
--- a/docs/COMPOSER_OS_PLAYBOOK.docx
+++ b/docs/COMPOSER_OS_PLAYBOOK.docx
@@ -50396,7 +50396,37 @@
               <w:spacing w:after="60"/>
             </w:pPr>
             <w:r>
-              <w:t xml:space="preserve">Post-bop lateral roots + modal plateaus; balanced tri/tension.</w:t>
+              <w:t xml:space="preserve">Post-bop lateral roots + modal plateaus; balanced tri/tension. </w:t>
+            </w:r>
+            <w:r>
+              <w:rPr>
+                <w:b/>
+                <w:bCs/>
+              </w:rPr>
+              <w:t xml:space="preserve">VRB:</w:t>
+            </w:r>
+            <w:r>
+              <w:t xml:space="preserve"> </w:t>
+            </w:r>
+            <w:r>
+              <w:rPr>
+                <w:b/>
+                <w:bCs/>
+              </w:rPr>
+              <w:t xml:space="preserve">`wayne_shorter`</w:t>
+            </w:r>
+            <w:r>
+              <w:t xml:space="preserve"> bundle — </w:t>
+            </w:r>
+            <w:r>
+              <w:rPr>
+                <w:b/>
+                <w:bCs/>
+              </w:rPr>
+              <w:t xml:space="preserve">11</w:t>
+            </w:r>
+            <w:r>
+              <w:t xml:space="preserve"> `fingerprintReceipts` active (not neutral).</w:t>
             </w:r>
           </w:p>
         </w:tc>
@@ -50734,7 +50764,47 @@
               <w:t xml:space="preserve">poolSampling</w:t>
             </w:r>
             <w:r>
-              <w:t xml:space="preserve">.</w:t>
+              <w:t xml:space="preserve">. </w:t>
+            </w:r>
+            <w:r>
+              <w:rPr>
+                <w:b/>
+                <w:bCs/>
+              </w:rPr>
+              <w:t xml:space="preserve">VRB:</w:t>
+            </w:r>
+            <w:r>
+              <w:t xml:space="preserve"> </w:t>
+            </w:r>
+            <w:r>
+              <w:rPr>
+                <w:b/>
+                <w:bCs/>
+              </w:rPr>
+              <w:t xml:space="preserve">`duke_ellington`</w:t>
+            </w:r>
+            <w:r>
+              <w:t xml:space="preserve"> / </w:t>
+            </w:r>
+            <w:r>
+              <w:rPr>
+                <w:b/>
+                <w:bCs/>
+              </w:rPr>
+              <w:t xml:space="preserve">`ellington`</w:t>
+            </w:r>
+            <w:r>
+              <w:t xml:space="preserve"> — </w:t>
+            </w:r>
+            <w:r>
+              <w:rPr>
+                <w:b/>
+                <w:bCs/>
+              </w:rPr>
+              <w:t xml:space="preserve">11</w:t>
+            </w:r>
+            <w:r>
+              <w:t xml:space="preserve"> `fingerprintReceipts` active (not neutral).</w:t>
             </w:r>
           </w:p>
         </w:tc>
@@ -50782,7 +50852,37 @@
               <w:spacing w:after="60"/>
             </w:pPr>
             <w:r>
-              <w:t xml:space="preserve">Large-ensemble colour washes—high chromatic-mediant bias.</w:t>
+              <w:t xml:space="preserve">Large-ensemble colour washes—high chromatic-mediant bias. </w:t>
+            </w:r>
+            <w:r>
+              <w:rPr>
+                <w:b/>
+                <w:bCs/>
+              </w:rPr>
+              <w:t xml:space="preserve">VRB:</w:t>
+            </w:r>
+            <w:r>
+              <w:t xml:space="preserve"> </w:t>
+            </w:r>
+            <w:r>
+              <w:rPr>
+                <w:b/>
+                <w:bCs/>
+              </w:rPr>
+              <w:t xml:space="preserve">`maria_schneider`</w:t>
+            </w:r>
+            <w:r>
+              <w:t xml:space="preserve"> — </w:t>
+            </w:r>
+            <w:r>
+              <w:rPr>
+                <w:b/>
+                <w:bCs/>
+              </w:rPr>
+              <w:t xml:space="preserve">11</w:t>
+            </w:r>
+            <w:r>
+              <w:t xml:space="preserve"> `fingerprintReceipts` active (not neutral).</w:t>
             </w:r>
           </w:p>
         </w:tc>
@@ -50840,7 +50940,37 @@
               <w:t xml:space="preserve">high</w:t>
             </w:r>
             <w:r>
-              <w:t xml:space="preserve"> chromatic-mediant bias.</w:t>
+              <w:t xml:space="preserve"> chromatic-mediant bias. </w:t>
+            </w:r>
+            <w:r>
+              <w:rPr>
+                <w:b/>
+                <w:bCs/>
+              </w:rPr>
+              <w:t xml:space="preserve">VRB:</w:t>
+            </w:r>
+            <w:r>
+              <w:t xml:space="preserve"> </w:t>
+            </w:r>
+            <w:r>
+              <w:rPr>
+                <w:b/>
+                <w:bCs/>
+              </w:rPr>
+              <w:t xml:space="preserve">`gil_evans`</w:t>
+            </w:r>
+            <w:r>
+              <w:t xml:space="preserve"> — </w:t>
+            </w:r>
+            <w:r>
+              <w:rPr>
+                <w:b/>
+                <w:bCs/>
+              </w:rPr>
+              <w:t xml:space="preserve">11</w:t>
+            </w:r>
+            <w:r>
+              <w:t xml:space="preserve"> `fingerprintReceipts` active (not neutral).</w:t>
             </w:r>
           </w:p>
         </w:tc>
@@ -59932,6 +60062,49 @@
               </w:rPr>
               <w:t xml:space="preserve">0.20</w:t>
             </w:r>
+            <w:r>
+              <w:t xml:space="preserve"> — </w:t>
+            </w:r>
+            <w:r>
+              <w:rPr>
+                <w:b/>
+                <w:bCs/>
+              </w:rPr>
+              <w:t xml:space="preserve">VRB deep</w:t>
+            </w:r>
+            <w:r>
+              <w:t xml:space="preserve"> (</w:t>
+            </w:r>
+            <w:r>
+              <w:rPr>
+                <w:b/>
+                <w:bCs/>
+              </w:rPr>
+              <w:t xml:space="preserve">11</w:t>
+            </w:r>
+            <w:r>
+              <w:t xml:space="preserve"> `fingerprintReceipts` on </w:t>
+            </w:r>
+            <w:r>
+              <w:rPr>
+                <w:b/>
+                <w:bCs/>
+              </w:rPr>
+              <w:t xml:space="preserve">`duke_ellington`</w:t>
+            </w:r>
+            <w:r>
+              <w:t xml:space="preserve"> / </w:t>
+            </w:r>
+            <w:r>
+              <w:rPr>
+                <w:b/>
+                <w:bCs/>
+              </w:rPr>
+              <w:t xml:space="preserve">`ellington`</w:t>
+            </w:r>
+            <w:r>
+              <w:t xml:space="preserve"> bundle).</w:t>
+            </w:r>
           </w:p>
         </w:tc>
       </w:tr>
@@ -60027,6 +60200,39 @@
               </w:rPr>
               <w:t xml:space="preserve">0.15</w:t>
             </w:r>
+            <w:r>
+              <w:t xml:space="preserve"> — </w:t>
+            </w:r>
+            <w:r>
+              <w:rPr>
+                <w:b/>
+                <w:bCs/>
+              </w:rPr>
+              <w:t xml:space="preserve">VRB deep</w:t>
+            </w:r>
+            <w:r>
+              <w:t xml:space="preserve"> (</w:t>
+            </w:r>
+            <w:r>
+              <w:rPr>
+                <w:b/>
+                <w:bCs/>
+              </w:rPr>
+              <w:t xml:space="preserve">11</w:t>
+            </w:r>
+            <w:r>
+              <w:t xml:space="preserve"> on </w:t>
+            </w:r>
+            <w:r>
+              <w:rPr>
+                <w:b/>
+                <w:bCs/>
+              </w:rPr>
+              <w:t xml:space="preserve">`maria_schneider`</w:t>
+            </w:r>
+            <w:r>
+              <w:t xml:space="preserve">).</w:t>
+            </w:r>
           </w:p>
         </w:tc>
       </w:tr>
@@ -60122,6 +60328,39 @@
               </w:rPr>
               <w:t xml:space="preserve">0.15</w:t>
             </w:r>
+            <w:r>
+              <w:t xml:space="preserve"> — </w:t>
+            </w:r>
+            <w:r>
+              <w:rPr>
+                <w:b/>
+                <w:bCs/>
+              </w:rPr>
+              <w:t xml:space="preserve">VRB thin</w:t>
+            </w:r>
+            <w:r>
+              <w:t xml:space="preserve"> (</w:t>
+            </w:r>
+            <w:r>
+              <w:rPr>
+                <w:b/>
+                <w:bCs/>
+              </w:rPr>
+              <w:t xml:space="preserve">6</w:t>
+            </w:r>
+            <w:r>
+              <w:t xml:space="preserve"> on </w:t>
+            </w:r>
+            <w:r>
+              <w:rPr>
+                <w:b/>
+                <w:bCs/>
+              </w:rPr>
+              <w:t xml:space="preserve">`quincy_jones`</w:t>
+            </w:r>
+            <w:r>
+              <w:t xml:space="preserve">).</w:t>
+            </w:r>
           </w:p>
         </w:tc>
       </w:tr>
@@ -60312,6 +60551,39 @@
               </w:rPr>
               <w:t xml:space="preserve">0.10</w:t>
             </w:r>
+            <w:r>
+              <w:t xml:space="preserve"> — </w:t>
+            </w:r>
+            <w:r>
+              <w:rPr>
+                <w:b/>
+                <w:bCs/>
+              </w:rPr>
+              <w:t xml:space="preserve">VRB deep</w:t>
+            </w:r>
+            <w:r>
+              <w:t xml:space="preserve"> (</w:t>
+            </w:r>
+            <w:r>
+              <w:rPr>
+                <w:b/>
+                <w:bCs/>
+              </w:rPr>
+              <w:t xml:space="preserve">11</w:t>
+            </w:r>
+            <w:r>
+              <w:t xml:space="preserve"> on </w:t>
+            </w:r>
+            <w:r>
+              <w:rPr>
+                <w:b/>
+                <w:bCs/>
+              </w:rPr>
+              <w:t xml:space="preserve">`gil_evans`</w:t>
+            </w:r>
+            <w:r>
+              <w:t xml:space="preserve">).</w:t>
+            </w:r>
           </w:p>
         </w:tc>
       </w:tr>
@@ -60407,6 +60679,29 @@
               </w:rPr>
               <w:t xml:space="preserve">0.15</w:t>
             </w:r>
+            <w:r>
+              <w:t xml:space="preserve"> — </w:t>
+            </w:r>
+            <w:r>
+              <w:rPr>
+                <w:b/>
+                <w:bCs/>
+              </w:rPr>
+              <w:t xml:space="preserve">VRB thin</w:t>
+            </w:r>
+            <w:r>
+              <w:t xml:space="preserve"> (</w:t>
+            </w:r>
+            <w:r>
+              <w:rPr>
+                <w:b/>
+                <w:bCs/>
+              </w:rPr>
+              <w:t xml:space="preserve">6</w:t>
+            </w:r>
+            <w:r>
+              <w:t xml:space="preserve">).</w:t>
+            </w:r>
           </w:p>
         </w:tc>
       </w:tr>
@@ -60502,6 +60797,29 @@
               </w:rPr>
               <w:t xml:space="preserve">0.15</w:t>
             </w:r>
+            <w:r>
+              <w:t xml:space="preserve"> — </w:t>
+            </w:r>
+            <w:r>
+              <w:rPr>
+                <w:b/>
+                <w:bCs/>
+              </w:rPr>
+              <w:t xml:space="preserve">VRB thin</w:t>
+            </w:r>
+            <w:r>
+              <w:t xml:space="preserve"> (</w:t>
+            </w:r>
+            <w:r>
+              <w:rPr>
+                <w:b/>
+                <w:bCs/>
+              </w:rPr>
+              <w:t xml:space="preserve">6</w:t>
+            </w:r>
+            <w:r>
+              <w:t xml:space="preserve">).</w:t>
+            </w:r>
           </w:p>
         </w:tc>
       </w:tr>
@@ -60597,6 +60915,29 @@
               </w:rPr>
               <w:t xml:space="preserve">0.15</w:t>
             </w:r>
+            <w:r>
+              <w:t xml:space="preserve"> — </w:t>
+            </w:r>
+            <w:r>
+              <w:rPr>
+                <w:b/>
+                <w:bCs/>
+              </w:rPr>
+              <w:t xml:space="preserve">VRB thin</w:t>
+            </w:r>
+            <w:r>
+              <w:t xml:space="preserve"> (</w:t>
+            </w:r>
+            <w:r>
+              <w:rPr>
+                <w:b/>
+                <w:bCs/>
+              </w:rPr>
+              <w:t xml:space="preserve">6</w:t>
+            </w:r>
+            <w:r>
+              <w:t xml:space="preserve">).</w:t>
+            </w:r>
           </w:p>
         </w:tc>
       </w:tr>
@@ -60692,6 +61033,29 @@
               </w:rPr>
               <w:t xml:space="preserve">0.15</w:t>
             </w:r>
+            <w:r>
+              <w:t xml:space="preserve"> — </w:t>
+            </w:r>
+            <w:r>
+              <w:rPr>
+                <w:b/>
+                <w:bCs/>
+              </w:rPr>
+              <w:t xml:space="preserve">VRB thin</w:t>
+            </w:r>
+            <w:r>
+              <w:t xml:space="preserve"> (</w:t>
+            </w:r>
+            <w:r>
+              <w:rPr>
+                <w:b/>
+                <w:bCs/>
+              </w:rPr>
+              <w:t xml:space="preserve">6</w:t>
+            </w:r>
+            <w:r>
+              <w:t xml:space="preserve">).</w:t>
+            </w:r>
           </w:p>
         </w:tc>
       </w:tr>
@@ -60700,6 +61064,81 @@
       <w:pPr>
         <w:spacing w:after="160"/>
       </w:pPr>
+    </w:p>
+    <w:p>
+      <w:pPr>
+        <w:spacing w:after="160"/>
+      </w:pPr>
+      <w:r>
+        <w:rPr>
+          <w:b/>
+          <w:bCs/>
+        </w:rPr>
+        <w:t xml:space="preserve">Wayne Shorter</w:t>
+      </w:r>
+      <w:r>
+        <w:t xml:space="preserve"> (`wayne_shorter`) is </w:t>
+      </w:r>
+      <w:r>
+        <w:rPr>
+          <w:b/>
+          <w:bCs/>
+        </w:rPr>
+        <w:t xml:space="preserve">not</w:t>
+      </w:r>
+      <w:r>
+        <w:t xml:space="preserve"> a row in this Big Band </w:t>
+      </w:r>
+      <w:r>
+        <w:rPr>
+          <w:b/>
+          <w:bCs/>
+        </w:rPr>
+        <w:t xml:space="preserve">`StyleProfile`</w:t>
+      </w:r>
+      <w:r>
+        <w:t xml:space="preserve"> table; as Song Mode primary / harmonic voice it still resolves </w:t>
+      </w:r>
+      <w:r>
+        <w:rPr>
+          <w:b/>
+          <w:bCs/>
+        </w:rPr>
+        <w:t xml:space="preserve">`getVoiceRuleBundle('wayne_shorter')`</w:t>
+      </w:r>
+      <w:r>
+        <w:t xml:space="preserve"> with </w:t>
+      </w:r>
+      <w:r>
+        <w:rPr>
+          <w:b/>
+          <w:bCs/>
+        </w:rPr>
+        <w:t xml:space="preserve">VRB deep</w:t>
+      </w:r>
+      <w:r>
+        <w:t xml:space="preserve"> (</w:t>
+      </w:r>
+      <w:r>
+        <w:rPr>
+          <w:b/>
+          <w:bCs/>
+        </w:rPr>
+        <w:t xml:space="preserve">11</w:t>
+      </w:r>
+      <w:r>
+        <w:t xml:space="preserve"> `fingerprintReceipts`) — same ship as </w:t>
+      </w:r>
+      <w:r>
+        <w:rPr>
+          <w:b/>
+          <w:bCs/>
+        </w:rPr>
+        <w:t xml:space="preserve">`4aa848a5`</w:t>
+      </w:r>
+      <w:r>
+        <w:t xml:space="preserve">.</w:t>
+      </w:r>
     </w:p>
     <w:p>
       <w:pPr>

</xml_diff>

<commit_message>
docs: Messiaen handbook, roadmap (DONE a4ae08de), playbook + CHANGELOG
- COMPOSER_HANDBOOK: VRB messiaen 12/deep, messiaenPeriodMode, colour stub table; ship refs
- COMPOSER_OS_ROADMAP: Messiaen slice section + NEXT Ligeti; shipped slice count 23; Current row
- COMPOSER_OS_PLAYBOOK: messiaen melody row + spine cadence note; regenerate docx
- CHANGELOG: Messiaen commit hash on slice bullet; doc-sync Added line

Co-authored-by: Cursor <cursoragent@cursor.com>
</commit_message>
<xml_diff>
--- a/docs/COMPOSER_OS_PLAYBOOK.docx
+++ b/docs/COMPOSER_OS_PLAYBOOK.docx
@@ -2598,7 +2598,7 @@
         <w:spacing w:after="100" w:before="160"/>
       </w:pPr>
       <w:r>
-        <w:t xml:space="preserve">Per-composer profile table (38 research rows)</w:t>
+        <w:t xml:space="preserve">Per-composer profile table (39 research rows)</w:t>
       </w:r>
     </w:p>
     <w:tbl>
@@ -6435,11 +6435,179 @@
           </w:p>
         </w:tc>
       </w:tr>
+      <w:tr>
+        <w:tc>
+          <w:tcPr>
+            <w:tcW w:type="pct" w:w="1285%"/>
+          </w:tcPr>
+          <w:p>
+            <w:pPr>
+              <w:spacing w:after="60"/>
+            </w:pPr>
+            <w:r>
+              <w:t xml:space="preserve">`messiaen`</w:t>
+            </w:r>
+          </w:p>
+        </w:tc>
+        <w:tc>
+          <w:tcPr>
+            <w:tcW w:type="pct" w:w="1285%"/>
+          </w:tcPr>
+          <w:p>
+            <w:pPr>
+              <w:spacing w:after="60"/>
+            </w:pPr>
+            <w:r>
+              <w:t xml:space="preserve">angular</w:t>
+            </w:r>
+          </w:p>
+        </w:tc>
+        <w:tc>
+          <w:tcPr>
+            <w:tcW w:type="pct" w:w="1285%"/>
+          </w:tcPr>
+          <w:p>
+            <w:pPr>
+              <w:spacing w:after="60"/>
+            </w:pPr>
+            <w:r>
+              <w:t xml:space="preserve">mixed</w:t>
+            </w:r>
+          </w:p>
+        </w:tc>
+        <w:tc>
+          <w:tcPr>
+            <w:tcW w:type="pct" w:w="1285%"/>
+          </w:tcPr>
+          <w:p>
+            <w:pPr>
+              <w:spacing w:after="60"/>
+            </w:pPr>
+            <w:r>
+              <w:t xml:space="preserve">7</w:t>
+            </w:r>
+          </w:p>
+        </w:tc>
+        <w:tc>
+          <w:tcPr>
+            <w:tcW w:type="pct" w:w="1285%"/>
+          </w:tcPr>
+          <w:p>
+            <w:pPr>
+              <w:spacing w:after="60"/>
+            </w:pPr>
+            <w:r>
+              <w:t xml:space="preserve">0.55</w:t>
+            </w:r>
+          </w:p>
+        </w:tc>
+        <w:tc>
+          <w:tcPr>
+            <w:tcW w:type="pct" w:w="1285%"/>
+          </w:tcPr>
+          <w:p>
+            <w:pPr>
+              <w:spacing w:after="60"/>
+            </w:pPr>
+            <w:r>
+              <w:t xml:space="preserve">irregular</w:t>
+            </w:r>
+          </w:p>
+        </w:tc>
+        <w:tc>
+          <w:tcPr>
+            <w:tcW w:type="pct" w:w="1285%"/>
+          </w:tcPr>
+          <w:p>
+            <w:pPr>
+              <w:spacing w:after="60"/>
+            </w:pPr>
+            <w:r>
+              <w:t xml:space="preserve">mode_colour_field; birdsong_ornament; non_retrogradable_cell; additive_prime_pulse</w:t>
+            </w:r>
+          </w:p>
+        </w:tc>
+      </w:tr>
     </w:tbl>
     <w:p>
       <w:pPr>
         <w:spacing w:after="160"/>
       </w:pPr>
+    </w:p>
+    <w:p>
+      <w:pPr>
+        <w:spacing w:after="160"/>
+      </w:pPr>
+      <w:r>
+        <w:rPr>
+          <w:b/>
+          <w:bCs/>
+        </w:rPr>
+        <w:t xml:space="preserve">Olivier Messiaen (`messiaen`) — harmony rail:</w:t>
+      </w:r>
+      <w:r>
+        <w:t xml:space="preserve"> </w:t>
+      </w:r>
+      <w:r>
+        <w:rPr>
+          <w:b/>
+          <w:bCs/>
+        </w:rPr>
+        <w:t xml:space="preserve">`messiaenEffectiveHarmonyBars`</w:t>
+      </w:r>
+      <w:r>
+        <w:t xml:space="preserve"> enforces </w:t>
+      </w:r>
+      <w:r>
+        <w:rPr>
+          <w:b/>
+          <w:bCs/>
+        </w:rPr>
+        <w:t xml:space="preserve">slow harmonic rhythm</w:t>
+      </w:r>
+      <w:r>
+        <w:t xml:space="preserve"> at the spine (</w:t>
+      </w:r>
+      <w:r>
+        <w:rPr>
+          <w:b/>
+          <w:bCs/>
+        </w:rPr>
+        <w:t xml:space="preserve">minimum ~2 bars per chord</w:t>
+      </w:r>
+      <w:r>
+        <w:t xml:space="preserve">). </w:t>
+      </w:r>
+      <w:r>
+        <w:rPr>
+          <w:b/>
+          <w:bCs/>
+        </w:rPr>
+        <w:t xml:space="preserve">No functional cadential resolution</w:t>
+      </w:r>
+      <w:r>
+        <w:t xml:space="preserve"> (</w:t>
+      </w:r>
+      <w:r>
+        <w:rPr>
+          <w:b/>
+          <w:bCs/>
+        </w:rPr>
+        <w:t xml:space="preserve">V→I</w:t>
+      </w:r>
+      <w:r>
+        <w:t xml:space="preserve"> and similar) on the locked rail—motion is </w:t>
+      </w:r>
+      <w:r>
+        <w:rPr>
+          <w:b/>
+          <w:bCs/>
+        </w:rPr>
+        <w:t xml:space="preserve">colour-field</w:t>
+      </w:r>
+      <w:r>
+        <w:t xml:space="preserve"> oriented.</w:t>
+      </w:r>
     </w:p>
     <w:p>
       <w:pPr>

</xml_diff>

<commit_message>
docs: sync handbook, playbook, roadmap, architecture, changelog + playbook docx
Co-authored-by: Cursor <cursoragent@cursor.com>
</commit_message>
<xml_diff>
--- a/docs/COMPOSER_OS_PLAYBOOK.docx
+++ b/docs/COMPOSER_OS_PLAYBOOK.docx
@@ -2598,7 +2598,7 @@
         <w:spacing w:after="100" w:before="160"/>
       </w:pPr>
       <w:r>
-        <w:t xml:space="preserve">Per-composer profile table (39 research rows)</w:t>
+        <w:t xml:space="preserve">Per-composer profile table (`MELODY_PROFILES` — **56** research rows)</w:t>
       </w:r>
     </w:p>
     <w:tbl>
@@ -6536,85 +6536,838 @@
     </w:p>
     <w:p>
       <w:pPr>
-        <w:spacing w:after="160"/>
-      </w:pPr>
-      <w:r>
-        <w:rPr>
-          <w:b/>
-          <w:bCs/>
-        </w:rPr>
-        <w:t xml:space="preserve">Olivier Messiaen (`messiaen`) — harmony rail:</w:t>
-      </w:r>
-      <w:r>
-        <w:t xml:space="preserve"> </w:t>
-      </w:r>
-      <w:r>
-        <w:rPr>
-          <w:b/>
-          <w:bCs/>
-        </w:rPr>
-        <w:t xml:space="preserve">`messiaenEffectiveHarmonyBars`</w:t>
-      </w:r>
-      <w:r>
-        <w:t xml:space="preserve"> enforces </w:t>
-      </w:r>
-      <w:r>
-        <w:rPr>
-          <w:b/>
-          <w:bCs/>
-        </w:rPr>
-        <w:t xml:space="preserve">slow harmonic rhythm</w:t>
-      </w:r>
-      <w:r>
-        <w:t xml:space="preserve"> at the spine (</w:t>
-      </w:r>
-      <w:r>
-        <w:rPr>
-          <w:b/>
-          <w:bCs/>
-        </w:rPr>
-        <w:t xml:space="preserve">minimum ~2 bars per chord</w:t>
-      </w:r>
-      <w:r>
-        <w:t xml:space="preserve">). </w:t>
-      </w:r>
-      <w:r>
-        <w:rPr>
-          <w:b/>
-          <w:bCs/>
-        </w:rPr>
-        <w:t xml:space="preserve">No functional cadential resolution</w:t>
-      </w:r>
-      <w:r>
-        <w:t xml:space="preserve"> (</w:t>
-      </w:r>
-      <w:r>
-        <w:rPr>
-          <w:b/>
-          <w:bCs/>
-        </w:rPr>
-        <w:t xml:space="preserve">V→I</w:t>
-      </w:r>
-      <w:r>
-        <w:t xml:space="preserve"> and similar) on the locked rail—motion is </w:t>
-      </w:r>
-      <w:r>
-        <w:rPr>
-          <w:b/>
-          <w:bCs/>
-        </w:rPr>
-        <w:t xml:space="preserve">colour-field</w:t>
-      </w:r>
-      <w:r>
-        <w:t xml:space="preserve"> oriented.</w:t>
-      </w:r>
-    </w:p>
-    <w:p>
-      <w:pPr>
         <w:pStyle w:val="Heading2"/>
         <w:spacing w:after="100" w:before="160"/>
       </w:pPr>
       <w:r>
+        <w:t xml:space="preserve">Song Mode slice + VRB status (recent ships)</w:t>
+      </w:r>
+    </w:p>
+    <w:tbl>
+      <w:tblPr>
+        <w:tblW w:type="pct" w:w="100%"/>
+        <w:tblBorders>
+          <w:top w:val="single" w:color="auto" w:sz="4"/>
+          <w:left w:val="single" w:color="auto" w:sz="4"/>
+          <w:bottom w:val="single" w:color="auto" w:sz="4"/>
+          <w:right w:val="single" w:color="auto" w:sz="4"/>
+          <w:insideH w:val="single" w:color="auto" w:sz="4"/>
+          <w:insideV w:val="single" w:color="auto" w:sz="4"/>
+        </w:tblBorders>
+      </w:tblPr>
+      <w:tblGrid>
+        <w:gridCol w:w="2250"/>
+        <w:gridCol w:w="2250"/>
+        <w:gridCol w:w="2250"/>
+        <w:gridCol w:w="2250"/>
+      </w:tblGrid>
+      <w:tr>
+        <w:tc>
+          <w:tcPr>
+            <w:tcW w:type="pct" w:w="2250%"/>
+          </w:tcPr>
+          <w:p>
+            <w:pPr>
+              <w:spacing w:after="60"/>
+            </w:pPr>
+            <w:r>
+              <w:t xml:space="preserve">Primary id</w:t>
+            </w:r>
+          </w:p>
+        </w:tc>
+        <w:tc>
+          <w:tcPr>
+            <w:tcW w:type="pct" w:w="2250%"/>
+          </w:tcPr>
+          <w:p>
+            <w:pPr>
+              <w:spacing w:after="60"/>
+            </w:pPr>
+            <w:r>
+              <w:t xml:space="preserve">VRB tier (fingerprints)</w:t>
+            </w:r>
+          </w:p>
+        </w:tc>
+        <w:tc>
+          <w:tcPr>
+            <w:tcW w:type="pct" w:w="2250%"/>
+          </w:tcPr>
+          <w:p>
+            <w:pPr>
+              <w:spacing w:after="60"/>
+            </w:pPr>
+            <w:r>
+              <w:t xml:space="preserve">Locked harmony</w:t>
+            </w:r>
+          </w:p>
+        </w:tc>
+        <w:tc>
+          <w:tcPr>
+            <w:tcW w:type="pct" w:w="2250%"/>
+          </w:tcPr>
+          <w:p>
+            <w:pPr>
+              <w:spacing w:after="60"/>
+            </w:pPr>
+            <w:r>
+              <w:t xml:space="preserve">Key API / metadata</w:t>
+            </w:r>
+          </w:p>
+        </w:tc>
+      </w:tr>
+      <w:tr>
+        <w:tc>
+          <w:tcPr>
+            <w:tcW w:type="pct" w:w="2250%"/>
+          </w:tcPr>
+          <w:p>
+            <w:pPr>
+              <w:spacing w:after="60"/>
+            </w:pPr>
+            <w:r>
+              <w:rPr>
+                <w:b/>
+                <w:bCs/>
+              </w:rPr>
+              <w:t xml:space="preserve">`count_basie`</w:t>
+            </w:r>
+          </w:p>
+        </w:tc>
+        <w:tc>
+          <w:tcPr>
+            <w:tcW w:type="pct" w:w="2250%"/>
+          </w:tcPr>
+          <w:p>
+            <w:pPr>
+              <w:spacing w:after="60"/>
+            </w:pPr>
+            <w:r>
+              <w:rPr>
+                <w:b/>
+                <w:bCs/>
+              </w:rPr>
+              <w:t xml:space="preserve">extended</w:t>
+            </w:r>
+            <w:r>
+              <w:t xml:space="preserve"> (</w:t>
+            </w:r>
+            <w:r>
+              <w:rPr>
+                <w:b/>
+                <w:bCs/>
+              </w:rPr>
+              <w:t xml:space="preserve">8</w:t>
+            </w:r>
+            <w:r>
+              <w:t xml:space="preserve">)</w:t>
+            </w:r>
+          </w:p>
+        </w:tc>
+        <w:tc>
+          <w:tcPr>
+            <w:tcW w:type="pct" w:w="2250%"/>
+          </w:tcPr>
+          <w:p>
+            <w:pPr>
+              <w:spacing w:after="60"/>
+            </w:pPr>
+            <w:r>
+              <w:rPr>
+                <w:b/>
+                <w:bCs/>
+              </w:rPr>
+              <w:t xml:space="preserve">`basieEffectiveHarmonyBars`</w:t>
+            </w:r>
+            <w:r>
+              <w:t xml:space="preserve"> </w:t>
+            </w:r>
+            <w:r>
+              <w:rPr>
+                <w:b/>
+                <w:bCs/>
+              </w:rPr>
+              <w:t xml:space="preserve">`cb:*`</w:t>
+            </w:r>
+          </w:p>
+        </w:tc>
+        <w:tc>
+          <w:tcPr>
+            <w:tcW w:type="pct" w:w="2250%"/>
+          </w:tcPr>
+          <w:p>
+            <w:pPr>
+              <w:spacing w:after="60"/>
+            </w:pPr>
+            <w:r>
+              <w:rPr>
+                <w:b/>
+                <w:bCs/>
+              </w:rPr>
+              <w:t xml:space="preserve">`basieTestamentMode`</w:t>
+            </w:r>
+            <w:r>
+              <w:t xml:space="preserve"> (Old/New Testament); </w:t>
+            </w:r>
+            <w:r>
+              <w:rPr>
+                <w:b/>
+                <w:bCs/>
+              </w:rPr>
+              <w:t xml:space="preserve">`basieEpisodePlan`</w:t>
+            </w:r>
+            <w:r>
+              <w:t xml:space="preserve"> / </w:t>
+            </w:r>
+            <w:r>
+              <w:rPr>
+                <w:b/>
+                <w:bCs/>
+              </w:rPr>
+              <w:t xml:space="preserve">`basieShoutBars`</w:t>
+            </w:r>
+          </w:p>
+        </w:tc>
+      </w:tr>
+      <w:tr>
+        <w:tc>
+          <w:tcPr>
+            <w:tcW w:type="pct" w:w="2250%"/>
+          </w:tcPr>
+          <w:p>
+            <w:pPr>
+              <w:spacing w:after="60"/>
+            </w:pPr>
+            <w:r>
+              <w:rPr>
+                <w:b/>
+                <w:bCs/>
+              </w:rPr>
+              <w:t xml:space="preserve">`bob_brookmeyer`</w:t>
+            </w:r>
+          </w:p>
+        </w:tc>
+        <w:tc>
+          <w:tcPr>
+            <w:tcW w:type="pct" w:w="2250%"/>
+          </w:tcPr>
+          <w:p>
+            <w:pPr>
+              <w:spacing w:after="60"/>
+            </w:pPr>
+            <w:r>
+              <w:rPr>
+                <w:b/>
+                <w:bCs/>
+              </w:rPr>
+              <w:t xml:space="preserve">deep</w:t>
+            </w:r>
+            <w:r>
+              <w:t xml:space="preserve"> (</w:t>
+            </w:r>
+            <w:r>
+              <w:rPr>
+                <w:b/>
+                <w:bCs/>
+              </w:rPr>
+              <w:t xml:space="preserve">12</w:t>
+            </w:r>
+            <w:r>
+              <w:t xml:space="preserve">)</w:t>
+            </w:r>
+          </w:p>
+        </w:tc>
+        <w:tc>
+          <w:tcPr>
+            <w:tcW w:type="pct" w:w="2250%"/>
+          </w:tcPr>
+          <w:p>
+            <w:pPr>
+              <w:spacing w:after="60"/>
+            </w:pPr>
+            <w:r>
+              <w:rPr>
+                <w:b/>
+                <w:bCs/>
+              </w:rPr>
+              <w:t xml:space="preserve">`bobBrookmeyerEffectiveHarmonyBars`</w:t>
+            </w:r>
+            <w:r>
+              <w:t xml:space="preserve"> </w:t>
+            </w:r>
+            <w:r>
+              <w:rPr>
+                <w:b/>
+                <w:bCs/>
+              </w:rPr>
+              <w:t xml:space="preserve">`brk:*`</w:t>
+            </w:r>
+          </w:p>
+        </w:tc>
+        <w:tc>
+          <w:tcPr>
+            <w:tcW w:type="pct" w:w="2250%"/>
+          </w:tcPr>
+          <w:p>
+            <w:pPr>
+              <w:spacing w:after="60"/>
+            </w:pPr>
+            <w:r>
+              <w:rPr>
+                <w:b/>
+                <w:bCs/>
+              </w:rPr>
+              <w:t xml:space="preserve">`brookmeyerPeriodMode`</w:t>
+            </w:r>
+            <w:r>
+              <w:t xml:space="preserve">; </w:t>
+            </w:r>
+            <w:r>
+              <w:rPr>
+                <w:b/>
+                <w:bCs/>
+              </w:rPr>
+              <w:t xml:space="preserve">`lineFirstHierarchy`</w:t>
+            </w:r>
+            <w:r>
+              <w:t xml:space="preserve"> on bundle → </w:t>
+            </w:r>
+            <w:r>
+              <w:rPr>
+                <w:b/>
+                <w:bCs/>
+              </w:rPr>
+              <w:t xml:space="preserve">`voiceLeadingSolver`</w:t>
+            </w:r>
+            <w:r>
+              <w:t xml:space="preserve"> defers harmony to pitch-module </w:t>
+            </w:r>
+            <w:r>
+              <w:rPr>
+                <w:b/>
+                <w:bCs/>
+              </w:rPr>
+              <w:t xml:space="preserve">line-first</w:t>
+            </w:r>
+            <w:r>
+              <w:t xml:space="preserve">; slice </w:t>
+            </w:r>
+            <w:r>
+              <w:rPr>
+                <w:b/>
+                <w:bCs/>
+              </w:rPr>
+              <w:t xml:space="preserve">solo gate</w:t>
+            </w:r>
+            <w:r>
+              <w:t xml:space="preserve"> defers solo episodes until composed episodes satisfy </w:t>
+            </w:r>
+            <w:r>
+              <w:rPr>
+                <w:b/>
+                <w:bCs/>
+              </w:rPr>
+              <w:t xml:space="preserve">`brk:*`</w:t>
+            </w:r>
+            <w:r>
+              <w:t xml:space="preserve"> receipts</w:t>
+            </w:r>
+          </w:p>
+        </w:tc>
+      </w:tr>
+      <w:tr>
+        <w:tc>
+          <w:tcPr>
+            <w:tcW w:type="pct" w:w="2250%"/>
+          </w:tcPr>
+          <w:p>
+            <w:pPr>
+              <w:spacing w:after="60"/>
+            </w:pPr>
+            <w:r>
+              <w:rPr>
+                <w:b/>
+                <w:bCs/>
+              </w:rPr>
+              <w:t xml:space="preserve">`oliver_nelson`</w:t>
+            </w:r>
+          </w:p>
+        </w:tc>
+        <w:tc>
+          <w:tcPr>
+            <w:tcW w:type="pct" w:w="2250%"/>
+          </w:tcPr>
+          <w:p>
+            <w:pPr>
+              <w:spacing w:after="60"/>
+            </w:pPr>
+            <w:r>
+              <w:rPr>
+                <w:b/>
+                <w:bCs/>
+              </w:rPr>
+              <w:t xml:space="preserve">deep</w:t>
+            </w:r>
+            <w:r>
+              <w:t xml:space="preserve"> (</w:t>
+            </w:r>
+            <w:r>
+              <w:rPr>
+                <w:b/>
+                <w:bCs/>
+              </w:rPr>
+              <w:t xml:space="preserve">12</w:t>
+            </w:r>
+            <w:r>
+              <w:t xml:space="preserve">)</w:t>
+            </w:r>
+          </w:p>
+        </w:tc>
+        <w:tc>
+          <w:tcPr>
+            <w:tcW w:type="pct" w:w="2250%"/>
+          </w:tcPr>
+          <w:p>
+            <w:pPr>
+              <w:spacing w:after="60"/>
+            </w:pPr>
+            <w:r>
+              <w:rPr>
+                <w:b/>
+                <w:bCs/>
+              </w:rPr>
+              <w:t xml:space="preserve">`oliverNelsonEffectiveHarmonyBars`</w:t>
+            </w:r>
+            <w:r>
+              <w:t xml:space="preserve"> </w:t>
+            </w:r>
+            <w:r>
+              <w:rPr>
+                <w:b/>
+                <w:bCs/>
+              </w:rPr>
+              <w:t xml:space="preserve">`on:*`</w:t>
+            </w:r>
+          </w:p>
+        </w:tc>
+        <w:tc>
+          <w:tcPr>
+            <w:tcW w:type="pct" w:w="2250%"/>
+          </w:tcPr>
+          <w:p>
+            <w:pPr>
+              <w:spacing w:after="60"/>
+            </w:pPr>
+            <w:r>
+              <w:t xml:space="preserve">Planner </w:t>
+            </w:r>
+            <w:r>
+              <w:rPr>
+                <w:b/>
+                <w:bCs/>
+              </w:rPr>
+              <w:t xml:space="preserve">`pedalBased` / `bluesModalHybrid` / `twoLayerForm`</w:t>
+            </w:r>
+            <w:r>
+              <w:t xml:space="preserve">; </w:t>
+            </w:r>
+            <w:r>
+              <w:rPr>
+                <w:b/>
+                <w:bCs/>
+              </w:rPr>
+              <w:t xml:space="preserve">`nelsonPeriodMode`</w:t>
+            </w:r>
+            <w:r>
+              <w:t xml:space="preserve"> · </w:t>
+            </w:r>
+            <w:r>
+              <w:rPr>
+                <w:b/>
+                <w:bCs/>
+              </w:rPr>
+              <w:t xml:space="preserve">`nelsonBluesFormVariant`</w:t>
+            </w:r>
+            <w:r>
+              <w:t xml:space="preserve"> · </w:t>
+            </w:r>
+            <w:r>
+              <w:rPr>
+                <w:b/>
+                <w:bCs/>
+              </w:rPr>
+              <w:t xml:space="preserve">`activePedal`</w:t>
+            </w:r>
+            <w:r>
+              <w:t xml:space="preserve"> · </w:t>
+            </w:r>
+            <w:r>
+              <w:rPr>
+                <w:b/>
+                <w:bCs/>
+              </w:rPr>
+              <w:t xml:space="preserve">`upperModalChords`</w:t>
+            </w:r>
+            <w:r>
+              <w:t xml:space="preserve"> · </w:t>
+            </w:r>
+            <w:r>
+              <w:rPr>
+                <w:b/>
+                <w:bCs/>
+              </w:rPr>
+              <w:t xml:space="preserve">`nelsonTwoLayerForm`</w:t>
+            </w:r>
+            <w:r>
+              <w:t xml:space="preserve"> on </w:t>
+            </w:r>
+            <w:r>
+              <w:rPr>
+                <w:b/>
+                <w:bCs/>
+              </w:rPr>
+              <w:t xml:space="preserve">`GenerationMetadata`</w:t>
+            </w:r>
+            <w:r>
+              <w:t xml:space="preserve"> / manifests</w:t>
+            </w:r>
+          </w:p>
+        </w:tc>
+      </w:tr>
+      <w:tr>
+        <w:tc>
+          <w:tcPr>
+            <w:tcW w:type="pct" w:w="2250%"/>
+          </w:tcPr>
+          <w:p>
+            <w:pPr>
+              <w:spacing w:after="60"/>
+            </w:pPr>
+            <w:r>
+              <w:rPr>
+                <w:b/>
+                <w:bCs/>
+              </w:rPr>
+              <w:t xml:space="preserve">`messiaen`</w:t>
+            </w:r>
+          </w:p>
+        </w:tc>
+        <w:tc>
+          <w:tcPr>
+            <w:tcW w:type="pct" w:w="2250%"/>
+          </w:tcPr>
+          <w:p>
+            <w:pPr>
+              <w:spacing w:after="60"/>
+            </w:pPr>
+            <w:r>
+              <w:rPr>
+                <w:b/>
+                <w:bCs/>
+              </w:rPr>
+              <w:t xml:space="preserve">deep</w:t>
+            </w:r>
+            <w:r>
+              <w:t xml:space="preserve"> (</w:t>
+            </w:r>
+            <w:r>
+              <w:rPr>
+                <w:b/>
+                <w:bCs/>
+              </w:rPr>
+              <w:t xml:space="preserve">12</w:t>
+            </w:r>
+            <w:r>
+              <w:t xml:space="preserve">)</w:t>
+            </w:r>
+          </w:p>
+        </w:tc>
+        <w:tc>
+          <w:tcPr>
+            <w:tcW w:type="pct" w:w="2250%"/>
+          </w:tcPr>
+          <w:p>
+            <w:pPr>
+              <w:spacing w:after="60"/>
+            </w:pPr>
+            <w:r>
+              <w:rPr>
+                <w:b/>
+                <w:bCs/>
+              </w:rPr>
+              <w:t xml:space="preserve">`messiaenEffectiveHarmonyBars`</w:t>
+            </w:r>
+            <w:r>
+              <w:t xml:space="preserve"> </w:t>
+            </w:r>
+            <w:r>
+              <w:rPr>
+                <w:b/>
+                <w:bCs/>
+              </w:rPr>
+              <w:t xml:space="preserve">`om:*`</w:t>
+            </w:r>
+          </w:p>
+        </w:tc>
+        <w:tc>
+          <w:tcPr>
+            <w:tcW w:type="pct" w:w="2250%"/>
+          </w:tcPr>
+          <w:p>
+            <w:pPr>
+              <w:spacing w:after="60"/>
+            </w:pPr>
+            <w:r>
+              <w:rPr>
+                <w:b/>
+                <w:bCs/>
+              </w:rPr>
+              <w:t xml:space="preserve">`messiaenPeriodMode`</w:t>
+            </w:r>
+            <w:r>
+              <w:t xml:space="preserve">; </w:t>
+            </w:r>
+            <w:r>
+              <w:rPr>
+                <w:b/>
+                <w:bCs/>
+              </w:rPr>
+              <w:t xml:space="preserve">`colourTag`</w:t>
+            </w:r>
+            <w:r>
+              <w:t xml:space="preserve"> stub on </w:t>
+            </w:r>
+            <w:r>
+              <w:rPr>
+                <w:b/>
+                <w:bCs/>
+              </w:rPr>
+              <w:t xml:space="preserve">`generationMetadata`</w:t>
+            </w:r>
+            <w:r>
+              <w:t xml:space="preserve">; spine </w:t>
+            </w:r>
+            <w:r>
+              <w:rPr>
+                <w:b/>
+                <w:bCs/>
+              </w:rPr>
+              <w:t xml:space="preserve">≥~2 bars/chord</w:t>
+            </w:r>
+            <w:r>
+              <w:t xml:space="preserve">; </w:t>
+            </w:r>
+            <w:r>
+              <w:rPr>
+                <w:b/>
+                <w:bCs/>
+              </w:rPr>
+              <w:t xml:space="preserve">no</w:t>
+            </w:r>
+            <w:r>
+              <w:t xml:space="preserve"> bare functional </w:t>
+            </w:r>
+            <w:r>
+              <w:rPr>
+                <w:b/>
+                <w:bCs/>
+              </w:rPr>
+              <w:t xml:space="preserve">V→I</w:t>
+            </w:r>
+            <w:r>
+              <w:t xml:space="preserve"> on rail</w:t>
+            </w:r>
+          </w:p>
+        </w:tc>
+      </w:tr>
+      <w:tr>
+        <w:tc>
+          <w:tcPr>
+            <w:tcW w:type="pct" w:w="2250%"/>
+          </w:tcPr>
+          <w:p>
+            <w:pPr>
+              <w:spacing w:after="60"/>
+            </w:pPr>
+            <w:r>
+              <w:rPr>
+                <w:b/>
+                <w:bCs/>
+              </w:rPr>
+              <w:t xml:space="preserve">`quincy_jones`</w:t>
+            </w:r>
+          </w:p>
+        </w:tc>
+        <w:tc>
+          <w:tcPr>
+            <w:tcW w:type="pct" w:w="2250%"/>
+          </w:tcPr>
+          <w:p>
+            <w:pPr>
+              <w:spacing w:after="60"/>
+            </w:pPr>
+            <w:r>
+              <w:rPr>
+                <w:b/>
+                <w:bCs/>
+              </w:rPr>
+              <w:t xml:space="preserve">thin</w:t>
+            </w:r>
+            <w:r>
+              <w:t xml:space="preserve"> (</w:t>
+            </w:r>
+            <w:r>
+              <w:rPr>
+                <w:b/>
+                <w:bCs/>
+              </w:rPr>
+              <w:t xml:space="preserve">6</w:t>
+            </w:r>
+            <w:r>
+              <w:t xml:space="preserve">)</w:t>
+            </w:r>
+          </w:p>
+        </w:tc>
+        <w:tc>
+          <w:tcPr>
+            <w:tcW w:type="pct" w:w="2250%"/>
+          </w:tcPr>
+          <w:p>
+            <w:pPr>
+              <w:spacing w:after="60"/>
+            </w:pPr>
+            <w:r>
+              <w:rPr>
+                <w:b/>
+                <w:bCs/>
+              </w:rPr>
+              <w:t xml:space="preserve">`quincyJonesEffectiveHarmonyBars`</w:t>
+            </w:r>
+            <w:r>
+              <w:t xml:space="preserve"> (Song Mode + BB registry </w:t>
+            </w:r>
+            <w:r>
+              <w:rPr>
+                <w:b/>
+                <w:bCs/>
+              </w:rPr>
+              <w:t xml:space="preserve">`8b8775e4`</w:t>
+            </w:r>
+            <w:r>
+              <w:t xml:space="preserve">)</w:t>
+            </w:r>
+          </w:p>
+        </w:tc>
+        <w:tc>
+          <w:tcPr>
+            <w:tcW w:type="pct" w:w="2250%"/>
+          </w:tcPr>
+          <w:p>
+            <w:pPr>
+              <w:spacing w:after="60"/>
+            </w:pPr>
+            <w:r>
+              <w:t xml:space="preserve">VRB deepening queued (</w:t>
+            </w:r>
+            <w:r>
+              <w:rPr>
+                <w:b/>
+                <w:bCs/>
+              </w:rPr>
+              <w:t xml:space="preserve">Perplexity</w:t>
+            </w:r>
+            <w:r>
+              <w:t xml:space="preserve"> research pass)</w:t>
+            </w:r>
+          </w:p>
+        </w:tc>
+      </w:tr>
+    </w:tbl>
+    <w:p>
+      <w:pPr>
+        <w:spacing w:after="160"/>
+      </w:pPr>
+    </w:p>
+    <w:p>
+      <w:pPr>
+        <w:spacing w:after="160"/>
+      </w:pPr>
+      <w:r>
+        <w:rPr>
+          <w:b/>
+          <w:bCs/>
+        </w:rPr>
+        <w:t xml:space="preserve">Olivier Messiaen (`messiaen`) — harmony rail:</w:t>
+      </w:r>
+      <w:r>
+        <w:t xml:space="preserve"> </w:t>
+      </w:r>
+      <w:r>
+        <w:rPr>
+          <w:b/>
+          <w:bCs/>
+        </w:rPr>
+        <w:t xml:space="preserve">`messiaenEffectiveHarmonyBars`</w:t>
+      </w:r>
+      <w:r>
+        <w:t xml:space="preserve"> enforces </w:t>
+      </w:r>
+      <w:r>
+        <w:rPr>
+          <w:b/>
+          <w:bCs/>
+        </w:rPr>
+        <w:t xml:space="preserve">slow harmonic rhythm</w:t>
+      </w:r>
+      <w:r>
+        <w:t xml:space="preserve"> at the spine (</w:t>
+      </w:r>
+      <w:r>
+        <w:rPr>
+          <w:b/>
+          <w:bCs/>
+        </w:rPr>
+        <w:t xml:space="preserve">minimum ~2 bars per chord</w:t>
+      </w:r>
+      <w:r>
+        <w:t xml:space="preserve">). </w:t>
+      </w:r>
+      <w:r>
+        <w:rPr>
+          <w:b/>
+          <w:bCs/>
+        </w:rPr>
+        <w:t xml:space="preserve">No functional cadential resolution</w:t>
+      </w:r>
+      <w:r>
+        <w:t xml:space="preserve"> (</w:t>
+      </w:r>
+      <w:r>
+        <w:rPr>
+          <w:b/>
+          <w:bCs/>
+        </w:rPr>
+        <w:t xml:space="preserve">V→I</w:t>
+      </w:r>
+      <w:r>
+        <w:t xml:space="preserve"> and similar) on the locked rail—motion is </w:t>
+      </w:r>
+      <w:r>
+        <w:rPr>
+          <w:b/>
+          <w:bCs/>
+        </w:rPr>
+        <w:t xml:space="preserve">colour-field</w:t>
+      </w:r>
+      <w:r>
+        <w:t xml:space="preserve"> oriented.</w:t>
+      </w:r>
+    </w:p>
+    <w:p>
+      <w:pPr>
+        <w:pStyle w:val="Heading2"/>
+        <w:spacing w:after="100" w:before="160"/>
+      </w:pPr>
+      <w:r>
         <w:t xml:space="preserve">Smoke coverage</w:t>
       </w:r>
     </w:p>
@@ -6660,7 +7413,17 @@
         <w:t xml:space="preserve">`MELODY_PROFILES`</w:t>
       </w:r>
       <w:r>
-        <w:t xml:space="preserve"> cardinality (≥38 keys), distinct </w:t>
+        <w:t xml:space="preserve"> cardinality (≥35 keys in harness; </w:t>
+      </w:r>
+      <w:r>
+        <w:rPr>
+          <w:b/>
+          <w:bCs/>
+        </w:rPr>
+        <w:t xml:space="preserve">56</w:t>
+      </w:r>
+      <w:r>
+        <w:t xml:space="preserve"> rows in source), distinct </w:t>
       </w:r>
       <w:r>
         <w:rPr>

</xml_diff>